<commit_message>
docs: align oracle workflow with verifier design
</commit_message>
<xml_diff>
--- a/docs/开题报告/DeFuzz-开题报告.docx
+++ b/docs/开题报告/DeFuzz-开题报告.docx
@@ -2937,7 +2937,7 @@
                 <w:kern w:val="0"/>
                 <w:sz w:val="24"/>
               </w:rPr>
-              <w:t xml:space="preserve">(2) 不变量到预言机的工程化落地。把 (1) 中的不变量翻译为可在二进制层面或运行行为上判定的检查器。框架按检查阶段分为启用性、静态、动态三类：启用性检查确认机制确实开启，避免 flag 失误导致的误报；静态检查通过 ELF 符号、指令流模式、属性 note 做断言式判定；动态检查通过受控执行（如对 buffer 填充长度做二分搜索）观察运行时行为。预言机判据完全建立在二进制和运行行为之上，与产生该二进制的具体编译器解耦——GCC 与 LLVM 产物共用同一套检查器。每个机制配置一个聚合器，按 BLOCKING + OR 策略综合判定结果；检查器标注极性敏感性，配合负控（关闭机制的 flag profile）保证翻转语义一致；条件不满足时返回"不可断言"以抑制误报。</w:t>
+              <w:t xml:space="preserve">(2) 不变量到预言机的工程化落地。把 (1) 中的不变量翻译为可在二进制层面或运行行为上判定的检查器。框架将检查器分为静态与动态两类：静态检查通过 ELF 符号、指令流模式、属性 note 做断言式判定；动态检查通过受控执行（如对 buffer 填充长度做二分搜索）观察运行时行为。预言机判据完全建立在二进制和运行行为之上，与产生该二进制的具体编译器解耦，GCC 与 LLVM 产物共用同一套检查器。每个机制配置一个聚合器，任一检查器返回 Fail 即记机制级违例并附带证据；检查器标注极性敏感性，配合负控（关闭机制的 flag profile）保证翻转语义一致。</w:t>
             </w:r>
           </w:p>
           <w:p>
@@ -3082,7 +3082,7 @@
                 <w:kern w:val="0"/>
                 <w:sz w:val="24"/>
               </w:rPr>
-              <w:t xml:space="preserve">每个机制对应一个聚合器，内部按启用性、静态、动态三阶段调度检查器。每个检查器返回 Pass / Fail / NotApplicable / Error 四态：NotApplicable 用于条件不满足时抑制误报，Error 仅记录基础设施故障。聚合策略为 BLOCKING + OR——启用性阶段任一 Fail 即视为机制未启用、提前返回；静态与动态阶段任一 Fail 汇聚为机制级违例，同时输出证据字段。极性模型区分正控（机制应生效）与负控（已显式关闭）下的判定语义：检查器默认对极性不敏感，仅当标注 polarity_sensitive 时按表翻转 Pass / Fail。预言机内部维护按调度周期共享的缓存，使二分搜索、动态符号查询等开销较大的过程在多个检查器间复用。调度路径见图 3。</w:t>
+              <w:t xml:space="preserve">每个机制对应一个聚合器，下挂若干检查器。检查器分为静态与动态两类：静态检查器读 ELF 符号表、指令字节模式与 .note 段做断言式判定，例如确认间接跳转目标处的 ENDBR 字节、_chk 接口被正确链接；动态检查器通过受控执行观察运行时行为，典型做法是对溢出 buffer 的填充长度做二分搜索，定位 canary 触发的实际边界。每个检查器返回 Pass、Fail、Error 三态，Error 仅用于隔离基础设施故障，不参与机制级判定；聚合时任一 Fail 即视为机制级违例，并把触发证据回写到种子记录。极性模型区分正控（机制应生效）与负控（已显式关闭）两种语义：检查器默认对极性不敏感，仅当标注 polarity_sensitive 时按正控 / 负控翻转 Pass / Fail。预言机按种子级缓存复用二分搜索结果与动态符号查询，避免同一颗二进制被多次解析或执行。判定流程见图 3。</w:t>
             </w:r>
           </w:p>
           <w:p>
@@ -3247,7 +3247,7 @@
               <w:rPr/>
               <w:drawing>
                 <wp:inline xmlns:wp="http://schemas.openxmlformats.org/drawingml/2006/wordprocessingDrawing" distT="0" distB="0" distL="0" distR="0">
-                  <wp:extent cx="3094070" cy="6725183"/>
+                  <wp:extent cx="4284090" cy="6117069"/>
                   <wp:effectExtent l="0" t="0" r="0" b="0"/>
                   <wp:docPr id="25" name="Figure25"/>
                   <wp:cNvGraphicFramePr>
@@ -3269,7 +3269,7 @@
                         <pic:spPr>
                           <a:xfrm>
                             <a:off x="0" y="0"/>
-                            <a:ext cx="3094070" cy="6725183"/>
+                            <a:ext cx="4284090" cy="6117069"/>
                           </a:xfrm>
                           <a:prstGeom prst="rect">
                             <a:avLst/>
@@ -3299,7 +3299,7 @@
                 <w:i/>
                 <w:sz w:val="20"/>
               </w:rPr>
-              <w:t>图 3  防御机制不变量预言机三阶段调度</w:t>
+              <w:t>图 3  防御机制不变量预言机判定流程</w:t>
             </w:r>
           </w:p>
           <w:p>

</xml_diff>

<commit_message>
docs: reorganize proposal figures by chapter
</commit_message>
<xml_diff>
--- a/docs/开题报告/DeFuzz-开题报告.docx
+++ b/docs/开题报告/DeFuzz-开题报告.docx
@@ -2379,61 +2379,7 @@
                 <w:kern w:val="0"/>
                 <w:sz w:val="24"/>
               </w:rPr>
-              <w:t xml:space="preserve">CVE-2023-4039 暴露了 GCC 在 AArch64 上栈保护机制的一处长期失效：当函数使用变长数组（VLA）或 alloca 时，编译器把栈金丝雀放在 VLA 之上、保存的返回地址却落在 VLA 之下，越界写入可以先于金丝雀检查改写返回地址，-fstack-protector 因此形同虚设。编译过程不报错，二进制能通过功能测试，缺陷只在攻击者构造特定输入时才显现。该漏洞自 GCC 早期版本即已存在，直到 2023 年才由外部研究者系统分析并修复。这一案例暴露的问题具有共性：编译器侧的防御机制依赖前端识别、中端 pass 与后端代码生成共同维护一组安全不变量，其中任何一处与具体 ISA 的栈布局、寄存器分配或指令编码假设不一致，防御机制就会悄然失效——对外仍然"存在"，对攻击者不再有效。</w:t>
-            </w:r>
-          </w:p>
-          <w:p>
-            <w:pPr>
-              <w:pStyle w:val="Normal"/>
-              <w:spacing w:lineRule="auto" w:line="360"/>
-              <w:ind w:firstLineChars="200" w:startChars="0" w:start="0" w:endChars="0" w:end="0"/>
-              <w:rPr>
-                <w:kern w:val="0"/>
-                <w:sz w:val="24"/>
-              </w:rPr>
-            </w:pPr>
-            <w:r>
-              <w:rPr>
-                <w:kern w:val="0"/>
-                <w:sz w:val="24"/>
-              </w:rPr>
-              <w:t xml:space="preserve">编译器所承载的防御机制数量本身已相当庞大：栈金丝雀、_FORTIFY_SOURCE、Intel CET 中的 IBT 与 SHSTK、AArch64 的 BTI 与 PAC、Shadow Stack、SafeStack、KCFI、CFI、HCFR 等，分别保护栈完整性、控制流、对象边界，且仍在扩展。目标 ISA 方面，x86-64、AArch64、RISC-V、LoongArch、MIPS、PowerPC 等架构在调用约定、寄存器分配与指令编码上差异显著，每种机制在各 ISA 上对应若干份独立的后端模板与中端 pass 实现。二者构成"防御机制 × ISA"的矩阵，每一格对应一组需联合维护的安全不变量。</w:t>
-            </w:r>
-          </w:p>
-          <w:p>
-            <w:pPr>
-              <w:pStyle w:val="Normal"/>
-              <w:spacing w:lineRule="auto" w:line="360"/>
-              <w:ind w:firstLineChars="200" w:startChars="0" w:start="0" w:endChars="0" w:end="0"/>
-              <w:rPr>
-                <w:kern w:val="0"/>
-                <w:sz w:val="24"/>
-              </w:rPr>
-            </w:pPr>
-            <w:r>
-              <w:rPr>
-                <w:kern w:val="0"/>
-                <w:sz w:val="24"/>
-              </w:rPr>
-              <w:t xml:space="preserve">这个矩阵的规模使人工审计难以全面覆盖。与 CVE-2023-4039 同源的 PR-96191（AArch64 / ARM 上栈金丝雀寄存器残留）2020 年修复时，就未涉及 MIPS、LoongArch、Xtensa、CSKY 等 fallback 后端；单点防御机制上的实现疏忽，往往同时存在于矩阵中其他格点而长期不被发现。本课题初步实验阶段已对若干格点做了试探性验证，向 GCC 上游报告并确认了多例同类形态的真实漏洞，印证了这一判断。</w:t>
-            </w:r>
-          </w:p>
-          <w:p>
-            <w:pPr>
-              <w:pStyle w:val="Normal"/>
-              <w:spacing w:lineRule="auto" w:line="360"/>
-              <w:ind w:firstLineChars="200" w:startChars="0" w:start="0" w:endChars="0" w:end="0"/>
-              <w:rPr>
-                <w:kern w:val="0"/>
-                <w:sz w:val="24"/>
-              </w:rPr>
-            </w:pPr>
-            <w:r>
-              <w:rPr>
-                <w:kern w:val="0"/>
-                <w:sz w:val="24"/>
-              </w:rPr>
-              <w:t xml:space="preserve">上述失效有一个共同特征：编译过程不出错、二进制正常运行，缺陷仅在特定输入下显现——即"静默失效（silent failure）"。Csmith、YARPGen 等以差分输出或编译器崩溃为信号的工具对此类缺陷几乎不敏感；覆盖率引导的模糊测试虽然可以把执行推进到相关代码路径，但缺少判断该路径是否仍满足安全契约的预言机。问题由此浮现：编译器是绝大多数软件防御机制的实际载体，矩阵中的静默失效直接削弱整个软件生态的运行时安全保障，而现有自动化测试方法尚未把"防御机制的安全契约"纳入判定体系。如果能把矩阵格点上的不变量翻译为可测断言，并主动引导编译器走到对应代码路径，就既可覆盖既有缺陷家族的同类变种，也有望在后续优化引入同类回归时及早暴露。本研究以此为出发点，结合大语言模型的代码理解能力与覆盖率反馈，构建一条针对编译器防御机制静默失效的模糊测试方法。</w:t>
+              <w:t xml:space="preserve">CVE-2023-4039 暴露了 GCC 在 AArch64 上栈保护机制的一处长期失效。当函数使用变长数组（VLA）或 alloca 时，编译器把栈金丝雀放在 VLA 之上、保存的返回地址却落在 VLA 之下，越界写入可以先于金丝雀检查改写返回地址，-fstack-protector 因此形同虚设——这种 buggy 状态下的栈帧布局可参见图 1。编译过程不报错，二进制能通过功能测试，缺陷只在攻击者构造特定输入时才显现。该漏洞自 GCC 早期版本即已存在，直到 2023 年才由外部研究者系统分析并修复。问题的共性也由此显现：编译器侧的防御机制依赖前端识别、中端 pass 与后端代码生成共同维护一组安全不变量，其中任何一处与具体 ISA 的栈布局、寄存器分配或指令编码假设不一致，防御机制就会悄然失效——对外仍然"存在"，对攻击者不再有效。</w:t>
             </w:r>
           </w:p>
           <w:p>
@@ -2446,7 +2392,7 @@
               <w:rPr/>
               <w:drawing>
                 <wp:inline xmlns:wp="http://schemas.openxmlformats.org/drawingml/2006/wordprocessingDrawing" distT="0" distB="0" distL="0" distR="0">
-                  <wp:extent cx="5385714" cy="5193367"/>
+                  <wp:extent cx="3435597" cy="6725183"/>
                   <wp:effectExtent l="0" t="0" r="0" b="0"/>
                   <wp:docPr id="21" name="Figure21"/>
                   <wp:cNvGraphicFramePr>
@@ -2456,7 +2402,7 @@
                     <a:graphicData uri="http://schemas.openxmlformats.org/drawingml/2006/picture">
                       <pic:pic xmlns:pic="http://schemas.openxmlformats.org/drawingml/2006/picture">
                         <pic:nvPicPr>
-                          <pic:cNvPr id="21" name="silent-failure.png"/>
+                          <pic:cNvPr id="21" name="stack-layout.png"/>
                           <pic:cNvPicPr/>
                         </pic:nvPicPr>
                         <pic:blipFill>
@@ -2468,7 +2414,7 @@
                         <pic:spPr>
                           <a:xfrm>
                             <a:off x="0" y="0"/>
-                            <a:ext cx="5385714" cy="5193367"/>
+                            <a:ext cx="3435597" cy="6725183"/>
                           </a:xfrm>
                           <a:prstGeom prst="rect">
                             <a:avLst/>
@@ -2498,17 +2444,35 @@
                 <w:i/>
                 <w:sz w:val="20"/>
               </w:rPr>
-              <w:t>图 6  隐式信任链中的 silent failure 概念示意</w:t>
-            </w:r>
-          </w:p>
-          <w:p>
-            <w:pPr>
-              <w:pStyle w:val="Normal"/>
-              <w:spacing w:lineRule="auto" w:line="360"/>
-              <w:rPr>
-                <w:sz w:val="24"/>
-              </w:rPr>
-            </w:pPr>
+              <w:t>图 1  CVE-2023-4039 buggy 栈帧布局</w:t>
+            </w:r>
+          </w:p>
+          <w:p>
+            <w:pPr>
+              <w:pStyle w:val="Normal"/>
+              <w:spacing w:lineRule="auto" w:line="360"/>
+              <w:rPr>
+                <w:sz w:val="24"/>
+              </w:rPr>
+            </w:pPr>
+          </w:p>
+          <w:p>
+            <w:pPr>
+              <w:pStyle w:val="Normal"/>
+              <w:spacing w:lineRule="auto" w:line="360"/>
+              <w:ind w:firstLineChars="200" w:startChars="0" w:start="0" w:endChars="0" w:end="0"/>
+              <w:rPr>
+                <w:kern w:val="0"/>
+                <w:sz w:val="24"/>
+              </w:rPr>
+            </w:pPr>
+            <w:r>
+              <w:rPr>
+                <w:kern w:val="0"/>
+                <w:sz w:val="24"/>
+              </w:rPr>
+              <w:t xml:space="preserve">编译器所承载的防御机制数量本身已相当庞大：栈金丝雀、_FORTIFY_SOURCE、Intel CET 中的 IBT 与 SHSTK、AArch64 的 BTI 与 PAC、Shadow Stack、SafeStack、KCFI、CFI、HCFR 等，分别保护栈完整性、控制流、对象边界，且仍在扩展。目标 ISA 方面，x86-64、AArch64、RISC-V、LoongArch、MIPS、PowerPC 等架构在调用约定、寄存器分配与指令编码上差异显著，每种机制在各 ISA 上对应若干份独立的后端模板与中端 pass 实现。二者构成"防御机制 × ISA"的二维研究空间（见图 2），每一格对应一组需联合维护的安全不变量，目前已被覆盖的格点仍只是其中很小一部分。</w:t>
+            </w:r>
           </w:p>
           <w:p>
             <w:pPr>
@@ -2520,7 +2484,7 @@
               <w:rPr/>
               <w:drawing>
                 <wp:inline xmlns:wp="http://schemas.openxmlformats.org/drawingml/2006/wordprocessingDrawing" distT="0" distB="0" distL="0" distR="0">
-                  <wp:extent cx="3776866" cy="6725183"/>
+                  <wp:extent cx="5385714" cy="5180383"/>
                   <wp:effectExtent l="0" t="0" r="0" b="0"/>
                   <wp:docPr id="22" name="Figure22"/>
                   <wp:cNvGraphicFramePr>
@@ -2542,7 +2506,7 @@
                         <pic:spPr>
                           <a:xfrm>
                             <a:off x="0" y="0"/>
-                            <a:ext cx="3776866" cy="6725183"/>
+                            <a:ext cx="5385714" cy="5180383"/>
                           </a:xfrm>
                           <a:prstGeom prst="rect">
                             <a:avLst/>
@@ -2572,17 +2536,53 @@
                 <w:i/>
                 <w:sz w:val="20"/>
               </w:rPr>
-              <w:t>图 1  防御机制 × ISA 二维研究空间矩阵</w:t>
-            </w:r>
-          </w:p>
-          <w:p>
-            <w:pPr>
-              <w:pStyle w:val="Normal"/>
-              <w:spacing w:lineRule="auto" w:line="360"/>
-              <w:rPr>
-                <w:sz w:val="24"/>
-              </w:rPr>
-            </w:pPr>
+              <w:t>图 2  防御机制 × ISA 二维研究空间</w:t>
+            </w:r>
+          </w:p>
+          <w:p>
+            <w:pPr>
+              <w:pStyle w:val="Normal"/>
+              <w:spacing w:lineRule="auto" w:line="360"/>
+              <w:rPr>
+                <w:sz w:val="24"/>
+              </w:rPr>
+            </w:pPr>
+          </w:p>
+          <w:p>
+            <w:pPr>
+              <w:pStyle w:val="Normal"/>
+              <w:spacing w:lineRule="auto" w:line="360"/>
+              <w:ind w:firstLineChars="200" w:startChars="0" w:start="0" w:endChars="0" w:end="0"/>
+              <w:rPr>
+                <w:kern w:val="0"/>
+                <w:sz w:val="24"/>
+              </w:rPr>
+            </w:pPr>
+            <w:r>
+              <w:rPr>
+                <w:kern w:val="0"/>
+                <w:sz w:val="24"/>
+              </w:rPr>
+              <w:t xml:space="preserve">这个矩阵的规模使人工审计难以全面覆盖。与 CVE-2023-4039 同源的 PR-96191（AArch64 / ARM 上栈金丝雀寄存器残留）2020 年修复时，就未涉及 MIPS、LoongArch、Xtensa、CSKY 等 fallback 后端；单点防御机制上的实现疏忽，往往同时存在于矩阵中其他格点而长期不被发现。本课题初步实验阶段已对若干格点做了试探性验证，向 GCC 上游报告并确认了多例同类形态的真实漏洞，第五章将给出具体案例。</w:t>
+            </w:r>
+          </w:p>
+          <w:p>
+            <w:pPr>
+              <w:pStyle w:val="Normal"/>
+              <w:spacing w:lineRule="auto" w:line="360"/>
+              <w:ind w:firstLineChars="200" w:startChars="0" w:start="0" w:endChars="0" w:end="0"/>
+              <w:rPr>
+                <w:kern w:val="0"/>
+                <w:sz w:val="24"/>
+              </w:rPr>
+            </w:pPr>
+            <w:r>
+              <w:rPr>
+                <w:kern w:val="0"/>
+                <w:sz w:val="24"/>
+              </w:rPr>
+              <w:t xml:space="preserve">上述失效有一个共同特征：编译过程不出错、二进制正常运行，缺陷仅在特定输入下显现——即"静默失效（silent failure）"。Csmith、YARPGen 等以差分输出或编译器崩溃为信号的工具对此类缺陷几乎不敏感；覆盖率引导的模糊测试虽然可以把执行推进到相关代码路径，但缺少判断该路径是否仍满足安全契约的预言机。问题由此浮现：编译器是绝大多数软件防御机制的实际载体，矩阵中的静默失效直接削弱整个软件生态的运行时安全保障，而现有自动化测试方法尚未把"防御机制的安全契约"纳入判定体系。如果能把矩阵格点上的不变量翻译为可测断言，并主动引导编译器走到对应代码路径，就既可覆盖既有缺陷家族的同类变种，也有望在后续优化引入同类回归时及早暴露。本研究以此为出发点，结合大语言模型的代码理解能力与覆盖率反馈，构建一条针对编译器防御机制静默失效的模糊测试方法。</w:t>
+            </w:r>
           </w:p>
           <w:p>
             <w:pPr>
@@ -2862,7 +2862,7 @@
                 <w:kern w:val="0"/>
                 <w:sz w:val="24"/>
               </w:rPr>
-              <w:t xml:space="preserve">本课题要构建一种面向编译器自身防御机制的模糊测试方法，并在 GCC 与 LLVM 上完成端到端验证。与以崩溃或差分输出为信号的传统编译器 fuzzer 不同，本方法以"防御机制是否仍满足其安全契约"为判据，自动暴露编译器仍能正常生成代码、但运行时保护已被静默削弱的失效。具体目标如下：(a) 形成一套覆盖主流防御机制的不变量集合，每条不变量具备可由二进制或运行行为判定的证据形式，在 GCC 与 LLVM 上保持一致的描述结构；(b) 构建一个可同时面向 GCC 与 LLVM、跨架构运行的 fuzzer 原型，以防御机制相关代码的源代码覆盖率为推进信号，用大模型完成种子精细变异；(c) 通过该原型在 GCC 与 LLVM 上发现可被上游确认的真实缺陷，验证方法有效性与跨编译器迁移性。</w:t>
+              <w:t xml:space="preserve">本课题要构建一种面向编译器自身防御机制的模糊测试方法，并在 GCC 与 LLVM 上完成端到端验证。与以崩溃或差分输出为信号的传统编译器 fuzzer 不同，本方法以"防御机制是否仍满足其安全契约"为判据，自动暴露编译器仍能正常生成代码、但运行时保护已被静默削弱的失效。具体目标如下：(a) 形成一套覆盖主流防御机制的不变量集合，每条不变量具备可由二进制或运行行为判定的证据形式，在 GCC 与 LLVM 上保持一致的描述结构；(b) 构建一个可同时面向 GCC 与 LLVM、跨架构运行的 fuzzer 原型，以防御机制相关代码的源代码覆盖率为推进信号，用大模型完成种子精细变异；(c) 通过该原型在 GCC 与 LLVM 上发现可被上游确认的真实缺陷，验证方法有效性与跨编译器迁移性。三个目标依次推进，其依赖关系与对应的工作内容在 3.2 节中呈现（见图 3）。</w:t>
             </w:r>
           </w:p>
           <w:p>
@@ -2901,266 +2901,7 @@
                 <w:kern w:val="0"/>
                 <w:sz w:val="24"/>
               </w:rPr>
-              <w:t xml:space="preserve">本课题分为以下三部分，彼此存在依赖关系：不变量形式化是预言机与种子目标选择的事实基础；预言机为 fuzz 主循环提供安全判定接口；覆盖率驱动的种子生成则负责把 fuzzing 推进到能触发不变量的代码路径上。</w:t>
-            </w:r>
-          </w:p>
-          <w:p>
-            <w:pPr>
-              <w:pStyle w:val="Normal"/>
-              <w:spacing w:lineRule="auto" w:line="360"/>
-              <w:ind w:firstLineChars="200" w:startChars="0" w:start="0" w:endChars="0" w:end="0"/>
-              <w:rPr>
-                <w:kern w:val="0"/>
-                <w:sz w:val="24"/>
-              </w:rPr>
-            </w:pPr>
-            <w:r>
-              <w:rPr>
-                <w:kern w:val="0"/>
-                <w:sz w:val="24"/>
-              </w:rPr>
-              <w:t xml:space="preserve">(1) 防御机制不变量的调研与形式化。针对 stack canary、_FORTIFY_SOURCE、IBT 等机制，从三类来源提炼其安全不变量：一是编译器源码中的注释与断言，如 GCC 中 AArch64 后端关于 canary 槽位置关系的安全注释、ix86 关于 ENDBR 立即数禁止的谓词，以及 LLVM 中 lib/CodeGen/StackProtector 与 X86InstrInfo 等模块的对应实现；二是 GCC、LLVM 自身文档（Clang Command Line Reference、Attribute Reference、CFI Design 等）以及 glibc 与 ABI 文档对开关 flag、_chk 接口、CET ELF property 等的规定；三是已确认的历史 bug 与对应 patch——从修补点反推被违反的不变量。每条不变量按统一字段记录陈述、所属编译器与版本、证据片段、信息源及版本敏感性，便于机械检索与跨版本回归。</w:t>
-            </w:r>
-          </w:p>
-          <w:p>
-            <w:pPr>
-              <w:pStyle w:val="Normal"/>
-              <w:spacing w:lineRule="auto" w:line="360"/>
-              <w:ind w:firstLineChars="200" w:startChars="0" w:start="0" w:endChars="0" w:end="0"/>
-              <w:rPr>
-                <w:kern w:val="0"/>
-                <w:sz w:val="24"/>
-              </w:rPr>
-            </w:pPr>
-            <w:r>
-              <w:rPr>
-                <w:kern w:val="0"/>
-                <w:sz w:val="24"/>
-              </w:rPr>
-              <w:t xml:space="preserve">(2) 不变量到预言机的工程化落地。把 (1) 中的不变量翻译为可在二进制层面或运行行为上判定的检查器。框架将检查器分为静态与动态两类：静态检查通过 ELF 符号、指令流模式、属性 note 做断言式判定；动态检查通过受控执行（如对 buffer 填充长度做二分搜索）观察运行时行为。预言机判据完全建立在二进制和运行行为之上，与产生该二进制的具体编译器解耦，GCC 与 LLVM 产物共用同一套检查器。每个机制配置一个聚合器，任一检查器返回 Fail 即记机制级违例并附带证据；检查器标注极性敏感性，配合负控（关闭机制的 flag profile）保证翻转语义一致。</w:t>
-            </w:r>
-          </w:p>
-          <w:p>
-            <w:pPr>
-              <w:pStyle w:val="Normal"/>
-              <w:spacing w:lineRule="auto" w:line="360"/>
-              <w:ind w:firstLineChars="200" w:startChars="0" w:start="0" w:endChars="0" w:end="0"/>
-              <w:rPr>
-                <w:kern w:val="0"/>
-                <w:sz w:val="24"/>
-              </w:rPr>
-            </w:pPr>
-            <w:r>
-              <w:rPr>
-                <w:kern w:val="0"/>
-                <w:sz w:val="24"/>
-              </w:rPr>
-              <w:t xml:space="preserve">(3) 大模型与覆盖率联合驱动的种子生成。以 GCC 与 LLVM 中防御机制相关代码的源代码覆盖率为目标信号（GCC 侧 gcov，LLVM 侧 SanitizerCoverage / source-based coverage），结合控制流图选取后继最多、当前未覆盖的基本块作为约束求解目标。每轮求解的流程：构造目标上下文（目标函数源码、目标基本块标注、覆盖前驱的种子作为示例），调用大模型生成新 C 种子，编译产物经覆盖率与预言机检查后按三方决策表决定是否进入语料库。种子未命中目标时，通过轻量级调用追踪定位与基线种子的发散点，把发散函数源码作为额外上下文反馈给大模型进入下一轮变异。整个过程把覆盖率推进与安全契约判定统一在同一条主循环中，大模型的生成始终被防御机制相关代码路径所牵引。</w:t>
-            </w:r>
-          </w:p>
-          <w:p>
-            <w:pPr>
-              <w:pStyle w:val="Normal"/>
-              <w:spacing w:lineRule="auto" w:line="360"/>
-              <w:rPr>
-                <w:sz w:val="24"/>
-              </w:rPr>
-            </w:pPr>
-          </w:p>
-          <w:p>
-            <w:pPr>
-              <w:pStyle w:val="Normal"/>
-              <w:widowControl/>
-              <w:jc w:val="start"/>
-              <w:rPr>
-                <w:b/>
-                <w:bCs/>
-                <w:kern w:val="0"/>
-                <w:sz w:val="24"/>
-              </w:rPr>
-            </w:pPr>
-            <w:r>
-              <w:rPr>
-                <w:b/>
-                <w:bCs/>
-                <w:kern w:val="0"/>
-                <w:sz w:val="24"/>
-              </w:rPr>
-              <w:t>四、技术路线</w:t>
-            </w:r>
-          </w:p>
-          <w:p>
-            <w:pPr>
-              <w:pStyle w:val="Normal"/>
-              <w:spacing w:lineRule="auto" w:line="360"/>
-              <w:ind w:firstLineChars="200" w:startChars="0" w:start="0" w:endChars="0" w:end="0"/>
-              <w:rPr>
-                <w:kern w:val="0"/>
-                <w:sz w:val="24"/>
-              </w:rPr>
-            </w:pPr>
-            <w:r>
-              <w:rPr>
-                <w:kern w:val="0"/>
-                <w:sz w:val="24"/>
-              </w:rPr>
-              <w:t xml:space="preserve">技术路线分为总体架构、不变量预言机框架、大模型约束求解主循环、跨架构与编译选项调度四部分，对应研究内容 (1)–(3) 的工程实现。GCC 上的初步验证证据见第五章。</w:t>
-            </w:r>
-          </w:p>
-          <w:p>
-            <w:pPr>
-              <w:pStyle w:val="Normal"/>
-              <w:spacing w:lineRule="auto" w:line="360"/>
-              <w:rPr>
-                <w:b/>
-                <w:bCs/>
-                <w:kern w:val="0"/>
-                <w:sz w:val="24"/>
-              </w:rPr>
-            </w:pPr>
-            <w:r>
-              <w:rPr>
-                <w:b/>
-                <w:bCs/>
-                <w:kern w:val="0"/>
-                <w:sz w:val="24"/>
-              </w:rPr>
-              <w:t>1. 总体架构</w:t>
-            </w:r>
-          </w:p>
-          <w:p>
-            <w:pPr>
-              <w:pStyle w:val="Normal"/>
-              <w:spacing w:lineRule="auto" w:line="360"/>
-              <w:ind w:firstLineChars="200" w:startChars="0" w:start="0" w:endChars="0" w:end="0"/>
-              <w:rPr>
-                <w:kern w:val="0"/>
-                <w:sz w:val="24"/>
-              </w:rPr>
-            </w:pPr>
-            <w:r>
-              <w:rPr>
-                <w:kern w:val="0"/>
-                <w:sz w:val="24"/>
-              </w:rPr>
-              <w:t xml:space="preserve">系统以一条 fuzz 主循环为骨架，周围由若干子系统支撑。编译器子系统封装预先插桩的 GCC 与 LLVM 构建——GCC 侧通过 gcov 采集 .gcda 覆盖率数据，LLVM 侧通过 SanitizerCoverage 与 source-based coverage 采集 .profraw 数据，二者经统一接口归并为同构的"行级覆盖 → 种子 ID"映射，主循环对底层编译器无感知。预言机子系统按防御机制聚合不变量检查器，对每颗成功编译的种子做安全契约判定，判据建立在 ELF 二进制与运行行为之上，GCC 与 LLVM 产物共用同一套检查器。提示词子系统按"基础提示词 + 编译器内部知识"两层装配后提交给远端模型；语料库子系统持久化满足质量阈值的种子并维护家系信息。组件依赖与数据流见图 2。</w:t>
-            </w:r>
-          </w:p>
-          <w:p>
-            <w:pPr>
-              <w:pStyle w:val="Normal"/>
-              <w:spacing w:lineRule="auto" w:line="360"/>
-              <w:rPr>
-                <w:b/>
-                <w:bCs/>
-                <w:kern w:val="0"/>
-                <w:sz w:val="24"/>
-              </w:rPr>
-            </w:pPr>
-            <w:r>
-              <w:rPr>
-                <w:b/>
-                <w:bCs/>
-                <w:kern w:val="0"/>
-                <w:sz w:val="24"/>
-              </w:rPr>
-              <w:t>2. 防御机制不变量预言机框架</w:t>
-            </w:r>
-          </w:p>
-          <w:p>
-            <w:pPr>
-              <w:pStyle w:val="Normal"/>
-              <w:spacing w:lineRule="auto" w:line="360"/>
-              <w:ind w:firstLineChars="200" w:startChars="0" w:start="0" w:endChars="0" w:end="0"/>
-              <w:rPr>
-                <w:kern w:val="0"/>
-                <w:sz w:val="24"/>
-              </w:rPr>
-            </w:pPr>
-            <w:r>
-              <w:rPr>
-                <w:kern w:val="0"/>
-                <w:sz w:val="24"/>
-              </w:rPr>
-              <w:t xml:space="preserve">每个机制对应一个聚合器，下挂若干检查器。检查器分为静态与动态两类：静态检查器读 ELF 符号表、指令字节模式与 .note 段做断言式判定，例如确认间接跳转目标处的 ENDBR 字节、_chk 接口被正确链接；动态检查器通过受控执行观察运行时行为，典型做法是对溢出 buffer 的填充长度做二分搜索，定位 canary 触发的实际边界。每个检查器返回 Pass、Fail、Error 三态，Error 仅用于隔离基础设施故障，不参与机制级判定；聚合时任一 Fail 即视为机制级违例，并把触发证据回写到种子记录。极性模型区分正控（机制应生效）与负控（已显式关闭）两种语义：检查器默认对极性不敏感，仅当标注 polarity_sensitive 时按正控 / 负控翻转 Pass / Fail。预言机按种子级缓存复用二分搜索结果与动态符号查询，避免同一颗二进制被多次解析或执行。判定流程见图 3。</w:t>
-            </w:r>
-          </w:p>
-          <w:p>
-            <w:pPr>
-              <w:pStyle w:val="Normal"/>
-              <w:spacing w:lineRule="auto" w:line="360"/>
-              <w:rPr>
-                <w:b/>
-                <w:bCs/>
-                <w:kern w:val="0"/>
-                <w:sz w:val="24"/>
-              </w:rPr>
-            </w:pPr>
-            <w:r>
-              <w:rPr>
-                <w:b/>
-                <w:bCs/>
-                <w:kern w:val="0"/>
-                <w:sz w:val="24"/>
-              </w:rPr>
-              <w:t>3. 大模型约束求解主循环</w:t>
-            </w:r>
-          </w:p>
-          <w:p>
-            <w:pPr>
-              <w:pStyle w:val="Normal"/>
-              <w:spacing w:lineRule="auto" w:line="360"/>
-              <w:ind w:firstLineChars="200" w:startChars="0" w:start="0" w:endChars="0" w:end="0"/>
-              <w:rPr>
-                <w:kern w:val="0"/>
-                <w:sz w:val="24"/>
-              </w:rPr>
-            </w:pPr>
-            <w:r>
-              <w:rPr>
-                <w:kern w:val="0"/>
-                <w:sz w:val="24"/>
-              </w:rPr>
-              <w:t xml:space="preserve">主循环输入为当前覆盖率映射与编译器源码控制流图。每轮先按"未覆盖且后继分支数最大"策略选取目标基本块，然后构造目标上下文：目标函数源码片段（来自当前所测的 GCC 或 LLVM 版本）、逐行覆盖标注、目标基本块位置，以及覆盖目标前驱的若干种子作为示例。提示词组装层把上下文拼接到基础约束求解提示词与机制契约要求之后，提交给大模型生成新 C 种子。编译失败时把错误信息与上一版源码反馈进入下一轮；编译成功后覆盖率分析器判断是否命中目标，预言机给出安全判定。种子去留由覆盖增量、是否命中目标、是否触发 bug 三方信号决定（三方决策表）。种子未命中目标但带来新覆盖时，轻量级动态追踪定位它与基线种子在调用序列上的首个发散点，把发散函数源码作为额外上下文构造"错题解析"提示词，再次请求模型做精细变异。目标基本块全部覆盖后，主循环可切换到随机变异阶段，仅以预言机为持久化条件继续探索。流程见图 4。</w:t>
-            </w:r>
-          </w:p>
-          <w:p>
-            <w:pPr>
-              <w:pStyle w:val="Normal"/>
-              <w:spacing w:lineRule="auto" w:line="360"/>
-              <w:rPr>
-                <w:b/>
-                <w:bCs/>
-                <w:kern w:val="0"/>
-                <w:sz w:val="24"/>
-              </w:rPr>
-            </w:pPr>
-            <w:r>
-              <w:rPr>
-                <w:b/>
-                <w:bCs/>
-                <w:kern w:val="0"/>
-                <w:sz w:val="24"/>
-              </w:rPr>
-              <w:t>4. 跨架构与编译选项调度</w:t>
-            </w:r>
-          </w:p>
-          <w:p>
-            <w:pPr>
-              <w:pStyle w:val="Normal"/>
-              <w:spacing w:lineRule="auto" w:line="360"/>
-              <w:ind w:firstLineChars="200" w:startChars="0" w:start="0" w:endChars="0" w:end="0"/>
-              <w:rPr>
-                <w:kern w:val="0"/>
-                <w:sz w:val="24"/>
-              </w:rPr>
-            </w:pPr>
-            <w:r>
-              <w:rPr>
-                <w:kern w:val="0"/>
-                <w:sz w:val="24"/>
-              </w:rPr>
-              <w:t xml:space="preserve">编译命令被参数化为编译器（GCC / LLVM）、ISA、架构相关 flag、策略相关 flag profile 四元组，同一份种子按四元组分发给不同工具链，目标二进制通过 QEMU 用户态执行。flag profile 同时包含正控（如 -fstack-protector-strong）和负控（如 -fno-stack-protector），使预言机能按极性模型对同一颗种子做对照判断；负控产物不进入主语料库，仅用于交叉验证。GCC 与 LLVM 在防御机制 flag 拼写上的差异（如 -fcf-protection 对 -fsanitize=cfi）由 FlagScheduler 统一抽象为"机制级"配置，向上层屏蔽。BinaryInspector 屏蔽 ISA 差异：通过 Go 标准库读取 ELF 符号表与 .note 段，为检查器提供导入函数列表、ENDBR 字节模式扫描、栈布局采样等能力。</w:t>
+              <w:t xml:space="preserve">本课题分为以下三部分（见图 3），彼此存在依赖关系：不变量形式化是预言机与种子目标选择的事实基础；预言机为 fuzz 主循环提供安全判定接口；覆盖率驱动的种子生成则负责把 fuzzing 推进到能触发不变量的代码路径上。</w:t>
             </w:r>
           </w:p>
           <w:p>
@@ -3173,7 +2914,223 @@
               <w:rPr/>
               <w:drawing>
                 <wp:inline xmlns:wp="http://schemas.openxmlformats.org/drawingml/2006/wordprocessingDrawing" distT="0" distB="0" distL="0" distR="0">
-                  <wp:extent cx="5385714" cy="2716793"/>
+                  <wp:extent cx="5385714" cy="1246792"/>
+                  <wp:effectExtent l="0" t="0" r="0" b="0"/>
+                  <wp:docPr id="23" name="Figure23"/>
+                  <wp:cNvGraphicFramePr>
+                    <a:graphicFrameLocks xmlns:a="http://schemas.openxmlformats.org/drawingml/2006/main" noChangeAspect="1"/>
+                  </wp:cNvGraphicFramePr>
+                  <a:graphic xmlns:a="http://schemas.openxmlformats.org/drawingml/2006/main">
+                    <a:graphicData uri="http://schemas.openxmlformats.org/drawingml/2006/picture">
+                      <pic:pic xmlns:pic="http://schemas.openxmlformats.org/drawingml/2006/picture">
+                        <pic:nvPicPr>
+                          <pic:cNvPr id="23" name="pipeline.png"/>
+                          <pic:cNvPicPr/>
+                        </pic:nvPicPr>
+                        <pic:blipFill>
+                          <a:blip xmlns:r="http://schemas.openxmlformats.org/officeDocument/2006/relationships" r:embed="rId23"/>
+                          <a:stretch>
+                            <a:fillRect/>
+                          </a:stretch>
+                        </pic:blipFill>
+                        <pic:spPr>
+                          <a:xfrm>
+                            <a:off x="0" y="0"/>
+                            <a:ext cx="5385714" cy="1246792"/>
+                          </a:xfrm>
+                          <a:prstGeom prst="rect">
+                            <a:avLst/>
+                          </a:prstGeom>
+                        </pic:spPr>
+                      </pic:pic>
+                    </a:graphicData>
+                  </a:graphic>
+                </wp:inline>
+              </w:drawing>
+            </w:r>
+          </w:p>
+          <w:p>
+            <w:pPr>
+              <w:pStyle w:val="Normal"/>
+              <w:spacing w:lineRule="auto" w:line="300"/>
+              <w:jc w:val="center"/>
+              <w:rPr>
+                <w:rFonts w:ascii="宋体" w:hAnsi="宋体" w:eastAsia="宋体"/>
+                <w:i/>
+                <w:sz w:val="20"/>
+              </w:rPr>
+            </w:pPr>
+            <w:r>
+              <w:rPr>
+                <w:rFonts w:ascii="宋体" w:hAnsi="宋体" w:eastAsia="宋体"/>
+                <w:i/>
+                <w:sz w:val="20"/>
+              </w:rPr>
+              <w:t>图 3  研究内容工作链条</w:t>
+            </w:r>
+          </w:p>
+          <w:p>
+            <w:pPr>
+              <w:pStyle w:val="Normal"/>
+              <w:spacing w:lineRule="auto" w:line="360"/>
+              <w:rPr>
+                <w:sz w:val="24"/>
+              </w:rPr>
+            </w:pPr>
+          </w:p>
+          <w:p>
+            <w:pPr>
+              <w:pStyle w:val="Normal"/>
+              <w:spacing w:lineRule="auto" w:line="360"/>
+              <w:ind w:firstLineChars="200" w:startChars="0" w:start="0" w:endChars="0" w:end="0"/>
+              <w:rPr>
+                <w:kern w:val="0"/>
+                <w:sz w:val="24"/>
+              </w:rPr>
+            </w:pPr>
+            <w:r>
+              <w:rPr>
+                <w:kern w:val="0"/>
+                <w:sz w:val="24"/>
+              </w:rPr>
+              <w:t xml:space="preserve">(1) 防御机制不变量的调研与形式化。针对 stack canary、_FORTIFY_SOURCE、IBT 等机制，从三类来源提炼其安全不变量：一是编译器源码中的注释与断言，如 GCC 中 AArch64 后端关于 canary 槽位置关系的安全注释、ix86 关于 ENDBR 立即数禁止的谓词，以及 LLVM 中 lib/CodeGen/StackProtector 与 X86InstrInfo 等模块的对应实现；二是 GCC、LLVM 自身文档（Clang Command Line Reference、Attribute Reference、CFI Design 等）以及 glibc 与 ABI 文档对开关 flag、_chk 接口、CET ELF property 等的规定；三是已确认的历史 bug 与对应 patch——从修补点反推被违反的不变量。每条不变量按统一字段记录陈述、所属编译器与版本、证据片段、信息源及版本敏感性，便于机械检索与跨版本回归。</w:t>
+            </w:r>
+          </w:p>
+          <w:p>
+            <w:pPr>
+              <w:pStyle w:val="Normal"/>
+              <w:spacing w:lineRule="auto" w:line="360"/>
+              <w:ind w:firstLineChars="200" w:startChars="0" w:start="0" w:endChars="0" w:end="0"/>
+              <w:rPr>
+                <w:kern w:val="0"/>
+                <w:sz w:val="24"/>
+              </w:rPr>
+            </w:pPr>
+            <w:r>
+              <w:rPr>
+                <w:kern w:val="0"/>
+                <w:sz w:val="24"/>
+              </w:rPr>
+              <w:t xml:space="preserve">(2) 不变量到预言机的工程化落地。把 (1) 中的不变量翻译为可在二进制层面或运行行为上判定的检查器。框架将检查器分为静态与动态两类：静态检查通过 ELF 符号、指令流模式、属性 note 做断言式判定；动态检查通过受控执行（如对 buffer 填充长度做二分搜索）观察运行时行为。预言机判据完全建立在二进制和运行行为之上，与产生该二进制的具体编译器解耦，GCC 与 LLVM 产物共用同一套检查器。每个机制配置一个聚合器，任一检查器返回 Fail 即记机制级违例并附带证据；同时为每个机制记录开机制 / 关机制两套 flag profile，框架据此对同一颗种子做对照判定，避免与编译器自身缺省行为混淆。</w:t>
+            </w:r>
+          </w:p>
+          <w:p>
+            <w:pPr>
+              <w:pStyle w:val="Normal"/>
+              <w:spacing w:lineRule="auto" w:line="360"/>
+              <w:ind w:firstLineChars="200" w:startChars="0" w:start="0" w:endChars="0" w:end="0"/>
+              <w:rPr>
+                <w:kern w:val="0"/>
+                <w:sz w:val="24"/>
+              </w:rPr>
+            </w:pPr>
+            <w:r>
+              <w:rPr>
+                <w:kern w:val="0"/>
+                <w:sz w:val="24"/>
+              </w:rPr>
+              <w:t xml:space="preserve">(3) 大模型与覆盖率联合驱动的种子生成。以 GCC 与 LLVM 中防御机制相关代码的源代码覆盖率为目标信号（GCC 侧 gcov，LLVM 侧 SanitizerCoverage / source-based coverage），结合控制流图选取后继最多、当前未覆盖的基本块作为约束求解目标。每轮求解的流程：构造目标上下文（目标函数源码、目标基本块标注、覆盖前驱的种子作为示例），调用大模型生成新 C 种子，编译产物经覆盖率与预言机检查后按三方决策表决定是否进入语料库。种子未命中目标时，通过轻量级调用追踪定位与基线种子的发散点，把发散函数源码作为额外上下文反馈给大模型进入下一轮变异。整个过程把覆盖率推进与安全契约判定统一在同一条主循环中，大模型的生成始终被防御机制相关代码路径所牵引。</w:t>
+            </w:r>
+          </w:p>
+          <w:p>
+            <w:pPr>
+              <w:pStyle w:val="Normal"/>
+              <w:spacing w:lineRule="auto" w:line="360"/>
+              <w:rPr>
+                <w:sz w:val="24"/>
+              </w:rPr>
+            </w:pPr>
+          </w:p>
+          <w:p>
+            <w:pPr>
+              <w:pStyle w:val="Normal"/>
+              <w:widowControl/>
+              <w:jc w:val="start"/>
+              <w:rPr>
+                <w:b/>
+                <w:bCs/>
+                <w:kern w:val="0"/>
+                <w:sz w:val="24"/>
+              </w:rPr>
+            </w:pPr>
+            <w:r>
+              <w:rPr>
+                <w:b/>
+                <w:bCs/>
+                <w:kern w:val="0"/>
+                <w:sz w:val="24"/>
+              </w:rPr>
+              <w:t>四、技术路线</w:t>
+            </w:r>
+          </w:p>
+          <w:p>
+            <w:pPr>
+              <w:pStyle w:val="Normal"/>
+              <w:spacing w:lineRule="auto" w:line="360"/>
+              <w:ind w:firstLineChars="200" w:startChars="0" w:start="0" w:endChars="0" w:end="0"/>
+              <w:rPr>
+                <w:kern w:val="0"/>
+                <w:sz w:val="24"/>
+              </w:rPr>
+            </w:pPr>
+            <w:r>
+              <w:rPr>
+                <w:kern w:val="0"/>
+                <w:sz w:val="24"/>
+              </w:rPr>
+              <w:t xml:space="preserve">技术路线分为总体架构、不变量预言机框架、大模型约束求解主循环、跨架构与编译选项调度四部分，对应研究内容 (1)–(3) 的工程实现。GCC 上的初步验证证据见第五章。</w:t>
+            </w:r>
+          </w:p>
+          <w:p>
+            <w:pPr>
+              <w:pStyle w:val="Normal"/>
+              <w:spacing w:lineRule="auto" w:line="360"/>
+              <w:rPr>
+                <w:b/>
+                <w:bCs/>
+                <w:kern w:val="0"/>
+                <w:sz w:val="24"/>
+              </w:rPr>
+            </w:pPr>
+            <w:r>
+              <w:rPr>
+                <w:b/>
+                <w:bCs/>
+                <w:kern w:val="0"/>
+                <w:sz w:val="24"/>
+              </w:rPr>
+              <w:t>1. 总体架构</w:t>
+            </w:r>
+          </w:p>
+          <w:p>
+            <w:pPr>
+              <w:pStyle w:val="Normal"/>
+              <w:spacing w:lineRule="auto" w:line="360"/>
+              <w:ind w:firstLineChars="200" w:startChars="0" w:start="0" w:endChars="0" w:end="0"/>
+              <w:rPr>
+                <w:kern w:val="0"/>
+                <w:sz w:val="24"/>
+              </w:rPr>
+            </w:pPr>
+            <w:r>
+              <w:rPr>
+                <w:kern w:val="0"/>
+                <w:sz w:val="24"/>
+              </w:rPr>
+              <w:t xml:space="preserve">系统以一条 fuzz 主循环为骨架，周围由若干子系统支撑（总体结构见图 4）。编译器子系统封装预先插桩的 GCC 与 LLVM 构建：GCC 侧通过 gcov 采集 .gcda 覆盖率数据，LLVM 侧通过 SanitizerCoverage 与 source-based coverage 采集 .profraw 数据，二者经统一接口归并为同构的"行级覆盖 → 种子 ID"映射，主循环对底层编译器无感知。预言机子系统按防御机制聚合不变量检查器，对每颗成功编译的种子做安全契约判定，判据建立在 ELF 二进制与运行行为之上，GCC 与 LLVM 产物共用同一套检查器。提示词子系统按"基础提示词 + 编译器内部知识"两层装配后提交给远端模型；语料库子系统持久化满足质量阈值的种子并维护家系信息；策略调度器把 ISA、编译选项与 flag profile 按四元组下发给编译器和预言机。</w:t>
+            </w:r>
+          </w:p>
+          <w:p>
+            <w:pPr>
+              <w:pStyle w:val="Normal"/>
+              <w:spacing w:lineRule="auto" w:line="360"/>
+              <w:jc w:val="center"/>
+            </w:pPr>
+            <w:r>
+              <w:rPr/>
+              <w:drawing>
+                <wp:inline xmlns:wp="http://schemas.openxmlformats.org/drawingml/2006/wordprocessingDrawing" distT="0" distB="0" distL="0" distR="0">
+                  <wp:extent cx="5385714" cy="2279952"/>
                   <wp:effectExtent l="0" t="0" r="0" b="0"/>
                   <wp:docPr id="24" name="Figure24"/>
                   <wp:cNvGraphicFramePr>
@@ -3195,7 +3152,7 @@
                         <pic:spPr>
                           <a:xfrm>
                             <a:off x="0" y="0"/>
-                            <a:ext cx="5385714" cy="2716793"/>
+                            <a:ext cx="5385714" cy="2279952"/>
                           </a:xfrm>
                           <a:prstGeom prst="rect">
                             <a:avLst/>
@@ -3225,17 +3182,56 @@
                 <w:i/>
                 <w:sz w:val="20"/>
               </w:rPr>
-              <w:t>图 2  DeFuzz 总体架构</w:t>
-            </w:r>
-          </w:p>
-          <w:p>
-            <w:pPr>
-              <w:pStyle w:val="Normal"/>
-              <w:spacing w:lineRule="auto" w:line="360"/>
-              <w:rPr>
-                <w:sz w:val="24"/>
-              </w:rPr>
-            </w:pPr>
+              <w:t>图 4  DeFuzz 总体架构</w:t>
+            </w:r>
+          </w:p>
+          <w:p>
+            <w:pPr>
+              <w:pStyle w:val="Normal"/>
+              <w:spacing w:lineRule="auto" w:line="360"/>
+              <w:rPr>
+                <w:sz w:val="24"/>
+              </w:rPr>
+            </w:pPr>
+          </w:p>
+          <w:p>
+            <w:pPr>
+              <w:pStyle w:val="Normal"/>
+              <w:spacing w:lineRule="auto" w:line="360"/>
+              <w:rPr>
+                <w:b/>
+                <w:bCs/>
+                <w:kern w:val="0"/>
+                <w:sz w:val="24"/>
+              </w:rPr>
+            </w:pPr>
+            <w:r>
+              <w:rPr>
+                <w:b/>
+                <w:bCs/>
+                <w:kern w:val="0"/>
+                <w:sz w:val="24"/>
+              </w:rPr>
+              <w:t>2. 防御机制不变量预言机框架</w:t>
+            </w:r>
+          </w:p>
+          <w:p>
+            <w:pPr>
+              <w:pStyle w:val="Normal"/>
+              <w:spacing w:lineRule="auto" w:line="360"/>
+              <w:ind w:firstLineChars="200" w:startChars="0" w:start="0" w:endChars="0" w:end="0"/>
+              <w:rPr>
+                <w:kern w:val="0"/>
+                <w:sz w:val="24"/>
+              </w:rPr>
+            </w:pPr>
+            <w:r>
+              <w:rPr>
+                <w:kern w:val="0"/>
+                <w:sz w:val="24"/>
+              </w:rPr>
+              <w:t xml:space="preserve">每个机制对应一个聚合器，下挂若干检查器（判定流程见图 5）。检查器分为静态与动态两类：静态检查器读 ELF 符号表、指令字节模式与 .note 段做断言式判定，例如确认间接跳转目标处的 ENDBR 字节、_chk 接口被正确链接；动态检查器通过受控执行观察运行时行为，典型做法是对溢出 buffer 的填充长度做二分搜索，定位 canary 触发的实际边界。每个检查器返回 Pass、Fail、Error 三态，Error 仅用于隔离基础设施故障，不参与机制级判定；聚合时任一 Fail 即视为机制级违例，并把触发证据回写到种子记录。对易与编译器缺省行为混淆的检查器，框架同时跑开机制与关机制两套 flag profile，比对两次判定的差异，确保 Pass / Fail 反映的是机制本身。预言机按种子级缓存复用二分搜索结果与动态符号查询，避免同一颗二进制被多次解析或执行。</w:t>
+            </w:r>
           </w:p>
           <w:p>
             <w:pPr>
@@ -3247,7 +3243,7 @@
               <w:rPr/>
               <w:drawing>
                 <wp:inline xmlns:wp="http://schemas.openxmlformats.org/drawingml/2006/wordprocessingDrawing" distT="0" distB="0" distL="0" distR="0">
-                  <wp:extent cx="4284090" cy="6117069"/>
+                  <wp:extent cx="4284090" cy="5606039"/>
                   <wp:effectExtent l="0" t="0" r="0" b="0"/>
                   <wp:docPr id="25" name="Figure25"/>
                   <wp:cNvGraphicFramePr>
@@ -3269,7 +3265,7 @@
                         <pic:spPr>
                           <a:xfrm>
                             <a:off x="0" y="0"/>
-                            <a:ext cx="4284090" cy="6117069"/>
+                            <a:ext cx="4284090" cy="5606039"/>
                           </a:xfrm>
                           <a:prstGeom prst="rect">
                             <a:avLst/>
@@ -3299,17 +3295,56 @@
                 <w:i/>
                 <w:sz w:val="20"/>
               </w:rPr>
-              <w:t>图 3  防御机制不变量预言机判定流程</w:t>
-            </w:r>
-          </w:p>
-          <w:p>
-            <w:pPr>
-              <w:pStyle w:val="Normal"/>
-              <w:spacing w:lineRule="auto" w:line="360"/>
-              <w:rPr>
-                <w:sz w:val="24"/>
-              </w:rPr>
-            </w:pPr>
+              <w:t>图 5  防御机制不变量预言机判定流程</w:t>
+            </w:r>
+          </w:p>
+          <w:p>
+            <w:pPr>
+              <w:pStyle w:val="Normal"/>
+              <w:spacing w:lineRule="auto" w:line="360"/>
+              <w:rPr>
+                <w:sz w:val="24"/>
+              </w:rPr>
+            </w:pPr>
+          </w:p>
+          <w:p>
+            <w:pPr>
+              <w:pStyle w:val="Normal"/>
+              <w:spacing w:lineRule="auto" w:line="360"/>
+              <w:rPr>
+                <w:b/>
+                <w:bCs/>
+                <w:kern w:val="0"/>
+                <w:sz w:val="24"/>
+              </w:rPr>
+            </w:pPr>
+            <w:r>
+              <w:rPr>
+                <w:b/>
+                <w:bCs/>
+                <w:kern w:val="0"/>
+                <w:sz w:val="24"/>
+              </w:rPr>
+              <w:t>3. 大模型约束求解主循环</w:t>
+            </w:r>
+          </w:p>
+          <w:p>
+            <w:pPr>
+              <w:pStyle w:val="Normal"/>
+              <w:spacing w:lineRule="auto" w:line="360"/>
+              <w:ind w:firstLineChars="200" w:startChars="0" w:start="0" w:endChars="0" w:end="0"/>
+              <w:rPr>
+                <w:kern w:val="0"/>
+                <w:sz w:val="24"/>
+              </w:rPr>
+            </w:pPr>
+            <w:r>
+              <w:rPr>
+                <w:kern w:val="0"/>
+                <w:sz w:val="24"/>
+              </w:rPr>
+              <w:t xml:space="preserve">主循环输入为当前覆盖率映射与编译器源码控制流图（迭代过程见图 6）。每轮先按"未覆盖且后继分支数最大"策略选取目标基本块，然后构造目标上下文：目标函数源码片段（来自当前所测的 GCC 或 LLVM 版本）、逐行覆盖标注、目标基本块位置，以及覆盖目标前驱的若干种子作为示例。提示词组装层把上下文拼接到基础约束求解提示词与机制契约要求之后，提交给大模型生成新 C 种子。编译失败时把错误信息与上一版源码反馈进入下一轮；编译成功后覆盖率分析器判断是否命中目标，预言机给出安全判定。种子去留由覆盖增量、是否命中目标、是否触发 bug 三方信号决定（三方决策表）。种子未命中目标但带来新覆盖时，轻量级动态追踪定位它与基线种子在调用序列上的首个发散点，把发散函数源码作为额外上下文构造"错题解析"提示词，再次请求模型做精细变异。目标基本块全部覆盖后，主循环可切换到随机变异阶段，仅以预言机为持久化条件继续探索。</w:t>
+            </w:r>
           </w:p>
           <w:p>
             <w:pPr>
@@ -3321,7 +3356,7 @@
               <w:rPr/>
               <w:drawing>
                 <wp:inline xmlns:wp="http://schemas.openxmlformats.org/drawingml/2006/wordprocessingDrawing" distT="0" distB="0" distL="0" distR="0">
-                  <wp:extent cx="3223574" cy="6725183"/>
+                  <wp:extent cx="3664949" cy="6725183"/>
                   <wp:effectExtent l="0" t="0" r="0" b="0"/>
                   <wp:docPr id="26" name="Figure26"/>
                   <wp:cNvGraphicFramePr>
@@ -3343,7 +3378,7 @@
                         <pic:spPr>
                           <a:xfrm>
                             <a:off x="0" y="0"/>
-                            <a:ext cx="3223574" cy="6725183"/>
+                            <a:ext cx="3664949" cy="6725183"/>
                           </a:xfrm>
                           <a:prstGeom prst="rect">
                             <a:avLst/>
@@ -3373,17 +3408,56 @@
                 <w:i/>
                 <w:sz w:val="20"/>
               </w:rPr>
-              <w:t>图 4  大模型约束求解主循环</w:t>
-            </w:r>
-          </w:p>
-          <w:p>
-            <w:pPr>
-              <w:pStyle w:val="Normal"/>
-              <w:spacing w:lineRule="auto" w:line="360"/>
-              <w:rPr>
-                <w:sz w:val="24"/>
-              </w:rPr>
-            </w:pPr>
+              <w:t>图 6  大模型约束求解主循环</w:t>
+            </w:r>
+          </w:p>
+          <w:p>
+            <w:pPr>
+              <w:pStyle w:val="Normal"/>
+              <w:spacing w:lineRule="auto" w:line="360"/>
+              <w:rPr>
+                <w:sz w:val="24"/>
+              </w:rPr>
+            </w:pPr>
+          </w:p>
+          <w:p>
+            <w:pPr>
+              <w:pStyle w:val="Normal"/>
+              <w:spacing w:lineRule="auto" w:line="360"/>
+              <w:rPr>
+                <w:b/>
+                <w:bCs/>
+                <w:kern w:val="0"/>
+                <w:sz w:val="24"/>
+              </w:rPr>
+            </w:pPr>
+            <w:r>
+              <w:rPr>
+                <w:b/>
+                <w:bCs/>
+                <w:kern w:val="0"/>
+                <w:sz w:val="24"/>
+              </w:rPr>
+              <w:t>4. 跨架构与编译选项调度</w:t>
+            </w:r>
+          </w:p>
+          <w:p>
+            <w:pPr>
+              <w:pStyle w:val="Normal"/>
+              <w:spacing w:lineRule="auto" w:line="360"/>
+              <w:ind w:firstLineChars="200" w:startChars="0" w:start="0" w:endChars="0" w:end="0"/>
+              <w:rPr>
+                <w:kern w:val="0"/>
+                <w:sz w:val="24"/>
+              </w:rPr>
+            </w:pPr>
+            <w:r>
+              <w:rPr>
+                <w:kern w:val="0"/>
+                <w:sz w:val="24"/>
+              </w:rPr>
+              <w:t xml:space="preserve">编译命令被参数化为编译器（GCC / LLVM）、ISA、架构相关 flag、策略相关 flag profile 四元组，同一份种子按四元组分发给不同工具链，目标二进制通过 QEMU 用户态执行。flag profile 同时包含开机制（如 -fstack-protector-strong）与关机制（如 -fno-stack-protector）两套，预言机据此对同一颗种子做对照判定；关机制产物仅用于交叉验证，不进入主语料库。GCC 与 LLVM 在防御机制 flag 拼写上的差异（如 -fcf-protection 对 -fsanitize=cfi）由 FlagScheduler 统一抽象为"机制级"配置，向上层屏蔽。BinaryInspector 屏蔽 ISA 差异：通过 Go 标准库读取 ELF 符号表与 .note 段，为检查器提供导入函数列表、ENDBR 字节模式扫描、栈布局采样等能力。</w:t>
+            </w:r>
           </w:p>
           <w:p>
             <w:pPr>
@@ -3497,160 +3571,7 @@
                 <w:kern w:val="0"/>
                 <w:sz w:val="24"/>
               </w:rPr>
-              <w:t xml:space="preserve">预言机方面，本例命中"FORTIFY 调用点的 size 参数下界推断"不变量，证据为静态符号 + 反汇编，在静态阶段判定。优化路径演化关系见图 5。</w:t>
-            </w:r>
-          </w:p>
-          <w:p>
-            <w:pPr>
-              <w:pStyle w:val="Normal"/>
-              <w:spacing w:lineRule="auto" w:line="360"/>
-              <w:rPr>
-                <w:b/>
-                <w:bCs/>
-                <w:kern w:val="0"/>
-                <w:sz w:val="24"/>
-              </w:rPr>
-            </w:pPr>
-            <w:r>
-              <w:rPr>
-                <w:b/>
-                <w:bCs/>
-                <w:kern w:val="0"/>
-                <w:sz w:val="24"/>
-              </w:rPr>
-              <w:t>5.2 案例二：IBT 立即数中嵌入的伪 landing pad</w:t>
-            </w:r>
-          </w:p>
-          <w:p>
-            <w:pPr>
-              <w:pStyle w:val="Normal"/>
-              <w:spacing w:lineRule="auto" w:line="360"/>
-              <w:ind w:firstLineChars="200" w:startChars="0" w:start="0" w:endChars="0" w:end="0"/>
-              <w:rPr>
-                <w:kern w:val="0"/>
-                <w:sz w:val="24"/>
-              </w:rPr>
-            </w:pPr>
-            <w:r>
-              <w:rPr>
-                <w:kern w:val="0"/>
-                <w:sz w:val="24"/>
-              </w:rPr>
-              <w:t xml:space="preserve">IBT（Indirect Branch Tracking）是 Intel CET 中针对间接跳转的保护机制：硬件要求间接跳转或调用的目标地址必须以 endbr 指令开头，否则触发异常。endbr 在二进制中是固定的四字节值（endbr64 = F3 0F 1E FA、endbr32 = F3 0F 1E FB），按设计只应作为合法间接跳转入口出现在代码段。如果这四个字节以其他形式出现——比如作为 movabsq 指令的 64 位立即数的一部分嵌入 .text——攻击者就可以把控制流劫持到该处，硬件会将其识别为合法 landing pad，IBT 语义被绕过。</w:t>
-            </w:r>
-          </w:p>
-          <w:p>
-            <w:pPr>
-              <w:pStyle w:val="Normal"/>
-              <w:spacing w:lineRule="auto" w:line="360"/>
-              <w:ind w:firstLineChars="200" w:startChars="0" w:start="0" w:endChars="0" w:end="0"/>
-              <w:rPr>
-                <w:kern w:val="0"/>
-                <w:sz w:val="24"/>
-              </w:rPr>
-            </w:pPr>
-            <w:r>
-              <w:rPr>
-                <w:kern w:val="0"/>
-                <w:sz w:val="24"/>
-              </w:rPr>
-              <w:t xml:space="preserve">GCC 在 x86 后端用 ix86_endbr_immediate_operand 谓词做字节级检测：当目标启用 IBT 时，谓词扫描立即数中是否存在 endbr 模式，含该模式的立即数会被拒绝。本方法在该谓词实现中发现一个逻辑漏洞：扫描循环对"高位非零"的 64 位立即数提前退出，只要 endbr 字节排布在立即数高位，扫描就走不到对应位置。这类立即数被错误接受，进而在 .text 中嵌入了不受控的伪 landing pad。该缺陷已上报上游，等待维护者回复。</w:t>
-            </w:r>
-          </w:p>
-          <w:p>
-            <w:pPr>
-              <w:pStyle w:val="Normal"/>
-              <w:spacing w:lineRule="auto" w:line="360"/>
-              <w:ind w:firstLineChars="200" w:startChars="0" w:start="0" w:endChars="0" w:end="0"/>
-              <w:rPr>
-                <w:kern w:val="0"/>
-                <w:sz w:val="24"/>
-              </w:rPr>
-            </w:pPr>
-            <w:r>
-              <w:rPr>
-                <w:kern w:val="0"/>
-                <w:sz w:val="24"/>
-              </w:rPr>
-              <w:t xml:space="preserve">预言机方面，本例命中"endbr 字节模式不应出现在非跳转目标的指令中"不变量，证据为代码段内 endbr 模式扫描，属静态指令流检查。</w:t>
-            </w:r>
-          </w:p>
-          <w:p>
-            <w:pPr>
-              <w:pStyle w:val="Normal"/>
-              <w:spacing w:lineRule="auto" w:line="360"/>
-              <w:rPr>
-                <w:b/>
-                <w:bCs/>
-                <w:kern w:val="0"/>
-                <w:sz w:val="24"/>
-              </w:rPr>
-            </w:pPr>
-            <w:r>
-              <w:rPr>
-                <w:b/>
-                <w:bCs/>
-                <w:kern w:val="0"/>
-                <w:sz w:val="24"/>
-              </w:rPr>
-              <w:t>5.3 案例三：跨 fallback ISA 的 canary 寄存器残留</w:t>
-            </w:r>
-          </w:p>
-          <w:p>
-            <w:pPr>
-              <w:pStyle w:val="Normal"/>
-              <w:spacing w:lineRule="auto" w:line="360"/>
-              <w:ind w:firstLineChars="200" w:startChars="0" w:start="0" w:endChars="0" w:end="0"/>
-              <w:rPr>
-                <w:kern w:val="0"/>
-                <w:sz w:val="24"/>
-              </w:rPr>
-            </w:pPr>
-            <w:r>
-              <w:rPr>
-                <w:kern w:val="0"/>
-                <w:sz w:val="24"/>
-              </w:rPr>
-              <w:t xml:space="preserve">本方法在 GCC 通用栈保护后端的 fallback 路径上还找到一例同类失效：MIPS、LoongArch、Xtensa、CSKY 等 ISA 的 fallback 后端未提供专用 epilogue 模板，函数返回时金丝雀寄存器未显式清零，进程级 __stack_chk_guard 值在调用者的可见寄存器中残留。该问题与 2020 年针对 AArch64 / ARM 的 PR-96191 同源，当年修复未覆盖上述后端。缺陷已上报并被确认、合入修复。</w:t>
-            </w:r>
-          </w:p>
-          <w:p>
-            <w:pPr>
-              <w:pStyle w:val="Normal"/>
-              <w:spacing w:lineRule="auto" w:line="360"/>
-              <w:rPr>
-                <w:b/>
-                <w:bCs/>
-                <w:kern w:val="0"/>
-                <w:sz w:val="24"/>
-              </w:rPr>
-            </w:pPr>
-            <w:r>
-              <w:rPr>
-                <w:b/>
-                <w:bCs/>
-                <w:kern w:val="0"/>
-                <w:sz w:val="24"/>
-              </w:rPr>
-              <w:t>5.4 小结</w:t>
-            </w:r>
-          </w:p>
-          <w:p>
-            <w:pPr>
-              <w:pStyle w:val="Normal"/>
-              <w:spacing w:lineRule="auto" w:line="360"/>
-              <w:ind w:firstLineChars="200" w:startChars="0" w:start="0" w:endChars="0" w:end="0"/>
-              <w:rPr>
-                <w:kern w:val="0"/>
-                <w:sz w:val="24"/>
-              </w:rPr>
-            </w:pPr>
-            <w:r>
-              <w:rPr>
-                <w:kern w:val="0"/>
-                <w:sz w:val="24"/>
-              </w:rPr>
-              <w:t xml:space="preserve">三例分别覆盖静态符号、动态行为、指令流字节模式三类不变量形态，共同特征是：二进制看起来带有保护，但编译器代码路径某一处的安全不变量已失去维护。方法在不修改编译器的前提下，通过约束求解与不变量预言机组合把这类差异在自动化流程中暴露出来。LLVM 侧实验预计在后续阶段以同一预言机框架补全。</w:t>
+              <w:t xml:space="preserve">预言机方面，本例命中"FORTIFY 调用点的 size 参数下界推断"不变量，证据为静态符号 + 反汇编，在静态阶段判定；该优化路径与 size 静默放宽的位置见图 7。</w:t>
             </w:r>
           </w:p>
           <w:p>
@@ -3663,9 +3584,9 @@
               <w:rPr/>
               <w:drawing>
                 <wp:inline xmlns:wp="http://schemas.openxmlformats.org/drawingml/2006/wordprocessingDrawing" distT="0" distB="0" distL="0" distR="0">
-                  <wp:extent cx="5385714" cy="2636007"/>
+                  <wp:extent cx="4284090" cy="6352694"/>
                   <wp:effectExtent l="0" t="0" r="0" b="0"/>
-                  <wp:docPr id="23" name="Figure23"/>
+                  <wp:docPr id="27" name="Figure27"/>
                   <wp:cNvGraphicFramePr>
                     <a:graphicFrameLocks xmlns:a="http://schemas.openxmlformats.org/drawingml/2006/main" noChangeAspect="1"/>
                   </wp:cNvGraphicFramePr>
@@ -3673,11 +3594,11 @@
                     <a:graphicData uri="http://schemas.openxmlformats.org/drawingml/2006/picture">
                       <pic:pic xmlns:pic="http://schemas.openxmlformats.org/drawingml/2006/picture">
                         <pic:nvPicPr>
-                          <pic:cNvPr id="23" name="fortify-path.png"/>
+                          <pic:cNvPr id="27" name="fortify-path.png"/>
                           <pic:cNvPicPr/>
                         </pic:nvPicPr>
                         <pic:blipFill>
-                          <a:blip xmlns:r="http://schemas.openxmlformats.org/officeDocument/2006/relationships" r:embed="rId23"/>
+                          <a:blip xmlns:r="http://schemas.openxmlformats.org/officeDocument/2006/relationships" r:embed="rId27"/>
                           <a:stretch>
                             <a:fillRect/>
                           </a:stretch>
@@ -3685,7 +3606,7 @@
                         <pic:spPr>
                           <a:xfrm>
                             <a:off x="0" y="0"/>
-                            <a:ext cx="5385714" cy="2636007"/>
+                            <a:ext cx="4284090" cy="6352694"/>
                           </a:xfrm>
                           <a:prstGeom prst="rect">
                             <a:avLst/>
@@ -3715,17 +3636,170 @@
                 <w:i/>
                 <w:sz w:val="20"/>
               </w:rPr>
-              <w:t>图 5  _FORTIFY_SOURCE 优化路径与 size silent gap</w:t>
-            </w:r>
-          </w:p>
-          <w:p>
-            <w:pPr>
-              <w:pStyle w:val="Normal"/>
-              <w:spacing w:lineRule="auto" w:line="360"/>
-              <w:rPr>
-                <w:sz w:val="24"/>
-              </w:rPr>
-            </w:pPr>
+              <w:t>图 7  _FORTIFY_SOURCE 优化路径与 size 静默放宽</w:t>
+            </w:r>
+          </w:p>
+          <w:p>
+            <w:pPr>
+              <w:pStyle w:val="Normal"/>
+              <w:spacing w:lineRule="auto" w:line="360"/>
+              <w:rPr>
+                <w:sz w:val="24"/>
+              </w:rPr>
+            </w:pPr>
+          </w:p>
+          <w:p>
+            <w:pPr>
+              <w:pStyle w:val="Normal"/>
+              <w:spacing w:lineRule="auto" w:line="360"/>
+              <w:rPr>
+                <w:b/>
+                <w:bCs/>
+                <w:kern w:val="0"/>
+                <w:sz w:val="24"/>
+              </w:rPr>
+            </w:pPr>
+            <w:r>
+              <w:rPr>
+                <w:b/>
+                <w:bCs/>
+                <w:kern w:val="0"/>
+                <w:sz w:val="24"/>
+              </w:rPr>
+              <w:t>5.2 案例二：IBT 立即数中嵌入的伪 landing pad</w:t>
+            </w:r>
+          </w:p>
+          <w:p>
+            <w:pPr>
+              <w:pStyle w:val="Normal"/>
+              <w:spacing w:lineRule="auto" w:line="360"/>
+              <w:ind w:firstLineChars="200" w:startChars="0" w:start="0" w:endChars="0" w:end="0"/>
+              <w:rPr>
+                <w:kern w:val="0"/>
+                <w:sz w:val="24"/>
+              </w:rPr>
+            </w:pPr>
+            <w:r>
+              <w:rPr>
+                <w:kern w:val="0"/>
+                <w:sz w:val="24"/>
+              </w:rPr>
+              <w:t xml:space="preserve">IBT（Indirect Branch Tracking）是 Intel CET 中针对间接跳转的保护机制：硬件要求间接跳转或调用的目标地址必须以 endbr 指令开头，否则触发异常。endbr 在二进制中是固定的四字节值（endbr64 = F3 0F 1E FA、endbr32 = F3 0F 1E FB），按设计只应作为合法间接跳转入口出现在代码段。如果这四个字节以其他形式出现——比如作为 movabsq 指令的 64 位立即数的一部分嵌入 .text——攻击者就可以把控制流劫持到该处，硬件会将其识别为合法 landing pad，IBT 语义被绕过。</w:t>
+            </w:r>
+          </w:p>
+          <w:p>
+            <w:pPr>
+              <w:pStyle w:val="Normal"/>
+              <w:spacing w:lineRule="auto" w:line="360"/>
+              <w:ind w:firstLineChars="200" w:startChars="0" w:start="0" w:endChars="0" w:end="0"/>
+              <w:rPr>
+                <w:kern w:val="0"/>
+                <w:sz w:val="24"/>
+              </w:rPr>
+            </w:pPr>
+            <w:r>
+              <w:rPr>
+                <w:kern w:val="0"/>
+                <w:sz w:val="24"/>
+              </w:rPr>
+              <w:t xml:space="preserve">GCC 在 x86 后端用 ix86_endbr_immediate_operand 谓词做字节级检测：当目标启用 IBT 时，谓词扫描立即数中是否存在 endbr 模式，含该模式的立即数会被拒绝。本方法在该谓词实现中发现一个逻辑漏洞：扫描循环对"高位非零"的 64 位立即数提前退出，只要 endbr 字节排布在立即数高位，扫描就走不到对应位置。这类立即数被错误接受，进而在 .text 中嵌入了不受控的伪 landing pad。该缺陷已上报上游，等待维护者回复。</w:t>
+            </w:r>
+          </w:p>
+          <w:p>
+            <w:pPr>
+              <w:pStyle w:val="Normal"/>
+              <w:spacing w:lineRule="auto" w:line="360"/>
+              <w:ind w:firstLineChars="200" w:startChars="0" w:start="0" w:endChars="0" w:end="0"/>
+              <w:rPr>
+                <w:kern w:val="0"/>
+                <w:sz w:val="24"/>
+              </w:rPr>
+            </w:pPr>
+            <w:r>
+              <w:rPr>
+                <w:kern w:val="0"/>
+                <w:sz w:val="24"/>
+              </w:rPr>
+              <w:t xml:space="preserve">预言机方面，本例命中"endbr 字节模式不应出现在非跳转目标的指令中"不变量，证据为代码段内 endbr 模式扫描，属静态指令流检查。</w:t>
+            </w:r>
+          </w:p>
+          <w:p>
+            <w:pPr>
+              <w:pStyle w:val="Normal"/>
+              <w:spacing w:lineRule="auto" w:line="360"/>
+              <w:rPr>
+                <w:b/>
+                <w:bCs/>
+                <w:kern w:val="0"/>
+                <w:sz w:val="24"/>
+              </w:rPr>
+            </w:pPr>
+            <w:r>
+              <w:rPr>
+                <w:b/>
+                <w:bCs/>
+                <w:kern w:val="0"/>
+                <w:sz w:val="24"/>
+              </w:rPr>
+              <w:t>5.3 案例三：跨 fallback ISA 的 canary 寄存器残留</w:t>
+            </w:r>
+          </w:p>
+          <w:p>
+            <w:pPr>
+              <w:pStyle w:val="Normal"/>
+              <w:spacing w:lineRule="auto" w:line="360"/>
+              <w:ind w:firstLineChars="200" w:startChars="0" w:start="0" w:endChars="0" w:end="0"/>
+              <w:rPr>
+                <w:kern w:val="0"/>
+                <w:sz w:val="24"/>
+              </w:rPr>
+            </w:pPr>
+            <w:r>
+              <w:rPr>
+                <w:kern w:val="0"/>
+                <w:sz w:val="24"/>
+              </w:rPr>
+              <w:t xml:space="preserve">本方法在 GCC 通用栈保护后端的 fallback 路径上还找到一例同类失效：MIPS、LoongArch、Xtensa、CSKY 等 ISA 的 fallback 后端未提供专用 epilogue 模板，函数返回时金丝雀寄存器未显式清零，进程级 __stack_chk_guard 值在调用者的可见寄存器中残留。该问题与 2020 年针对 AArch64 / ARM 的 PR-96191 同源，当年修复未覆盖上述后端。缺陷已上报并被确认、合入修复。</w:t>
+            </w:r>
+          </w:p>
+          <w:p>
+            <w:pPr>
+              <w:pStyle w:val="Normal"/>
+              <w:spacing w:lineRule="auto" w:line="360"/>
+              <w:rPr>
+                <w:b/>
+                <w:bCs/>
+                <w:kern w:val="0"/>
+                <w:sz w:val="24"/>
+              </w:rPr>
+            </w:pPr>
+            <w:r>
+              <w:rPr>
+                <w:b/>
+                <w:bCs/>
+                <w:kern w:val="0"/>
+                <w:sz w:val="24"/>
+              </w:rPr>
+              <w:t>5.4 小结</w:t>
+            </w:r>
+          </w:p>
+          <w:p>
+            <w:pPr>
+              <w:pStyle w:val="Normal"/>
+              <w:spacing w:lineRule="auto" w:line="360"/>
+              <w:ind w:firstLineChars="200" w:startChars="0" w:start="0" w:endChars="0" w:end="0"/>
+              <w:rPr>
+                <w:kern w:val="0"/>
+                <w:sz w:val="24"/>
+              </w:rPr>
+            </w:pPr>
+            <w:r>
+              <w:rPr>
+                <w:kern w:val="0"/>
+                <w:sz w:val="24"/>
+              </w:rPr>
+              <w:t xml:space="preserve">三例分别覆盖静态符号、动态行为、指令流字节模式三类不变量形态，共同特征是：二进制看起来带有保护，但编译器代码路径某一处的安全不变量已失去维护。方法在不修改编译器的前提下，通过约束求解与不变量预言机组合把这类差异在自动化流程中暴露出来。LLVM 侧实验预计在后续阶段以同一预言机框架补全。</w:t>
+            </w:r>
           </w:p>
           <w:p>
             <w:pPr>

</xml_diff>

<commit_message>
docs: unify proposal figure palette
Drop purple from the opening-report figures, apply a paper-style red/yellow/blue/green palette across the D2 assets, and regenerate the report images so the docx stays in sync.
</commit_message>
<xml_diff>
--- a/docs/开题报告/DeFuzz-开题报告.docx
+++ b/docs/开题报告/DeFuzz-开题报告.docx
@@ -2392,7 +2392,7 @@
               <w:rPr/>
               <w:drawing>
                 <wp:inline xmlns:wp="http://schemas.openxmlformats.org/drawingml/2006/wordprocessingDrawing" distT="0" distB="0" distL="0" distR="0">
-                  <wp:extent cx="3435597" cy="6725183"/>
+                  <wp:extent cx="4284090" cy="5326553"/>
                   <wp:effectExtent l="0" t="0" r="0" b="0"/>
                   <wp:docPr id="21" name="Figure21"/>
                   <wp:cNvGraphicFramePr>
@@ -2414,7 +2414,7 @@
                         <pic:spPr>
                           <a:xfrm>
                             <a:off x="0" y="0"/>
-                            <a:ext cx="3435597" cy="6725183"/>
+                            <a:ext cx="4284090" cy="5326553"/>
                           </a:xfrm>
                           <a:prstGeom prst="rect">
                             <a:avLst/>
@@ -2484,7 +2484,7 @@
               <w:rPr/>
               <w:drawing>
                 <wp:inline xmlns:wp="http://schemas.openxmlformats.org/drawingml/2006/wordprocessingDrawing" distT="0" distB="0" distL="0" distR="0">
-                  <wp:extent cx="5385714" cy="5180383"/>
+                  <wp:extent cx="5385714" cy="2709687"/>
                   <wp:effectExtent l="0" t="0" r="0" b="0"/>
                   <wp:docPr id="22" name="Figure22"/>
                   <wp:cNvGraphicFramePr>
@@ -2506,7 +2506,7 @@
                         <pic:spPr>
                           <a:xfrm>
                             <a:off x="0" y="0"/>
-                            <a:ext cx="5385714" cy="5180383"/>
+                            <a:ext cx="5385714" cy="2709687"/>
                           </a:xfrm>
                           <a:prstGeom prst="rect">
                             <a:avLst/>
@@ -2914,7 +2914,7 @@
               <w:rPr/>
               <w:drawing>
                 <wp:inline xmlns:wp="http://schemas.openxmlformats.org/drawingml/2006/wordprocessingDrawing" distT="0" distB="0" distL="0" distR="0">
-                  <wp:extent cx="5385714" cy="1246792"/>
+                  <wp:extent cx="5385714" cy="1236021"/>
                   <wp:effectExtent l="0" t="0" r="0" b="0"/>
                   <wp:docPr id="23" name="Figure23"/>
                   <wp:cNvGraphicFramePr>
@@ -2936,7 +2936,7 @@
                         <pic:spPr>
                           <a:xfrm>
                             <a:off x="0" y="0"/>
-                            <a:ext cx="5385714" cy="1246792"/>
+                            <a:ext cx="5385714" cy="1236021"/>
                           </a:xfrm>
                           <a:prstGeom prst="rect">
                             <a:avLst/>
@@ -3584,7 +3584,7 @@
               <w:rPr/>
               <w:drawing>
                 <wp:inline xmlns:wp="http://schemas.openxmlformats.org/drawingml/2006/wordprocessingDrawing" distT="0" distB="0" distL="0" distR="0">
-                  <wp:extent cx="4284090" cy="6352694"/>
+                  <wp:extent cx="4284090" cy="6361875"/>
                   <wp:effectExtent l="0" t="0" r="0" b="0"/>
                   <wp:docPr id="27" name="Figure27"/>
                   <wp:cNvGraphicFramePr>
@@ -3606,7 +3606,7 @@
                         <pic:spPr>
                           <a:xfrm>
                             <a:off x="0" y="0"/>
-                            <a:ext cx="4284090" cy="6352694"/>
+                            <a:ext cx="4284090" cy="6361875"/>
                           </a:xfrm>
                           <a:prstGeom prst="rect">
                             <a:avLst/>

</xml_diff>

<commit_message>
update: change IBT.SHSTK to IBT
</commit_message>
<xml_diff>
--- a/docs/开题报告/DeFuzz-开题报告.docx
+++ b/docs/开题报告/DeFuzz-开题报告.docx
@@ -250,7 +250,6 @@
           <w:u w:val="single"/>
         </w:rPr>
         <w:tab/>
-        <w:tab/>
       </w:r>
       <w:r>
         <w:rPr>
@@ -259,9 +258,8 @@
           <w:kern w:val="2"/>
           <w:sz w:val="28"/>
           <w:u w:val="single"/>
-          <w:lang w:val="en-US" w:eastAsia="zh-CN"/>
-        </w:rPr>
-        <w:t xml:space="preserve">  </w:t>
+        </w:rPr>
+        <w:tab/>
       </w:r>
       <w:r>
         <w:rPr>
@@ -270,9 +268,9 @@
           <w:kern w:val="2"/>
           <w:sz w:val="28"/>
           <w:u w:val="single"/>
-          <w:lang w:eastAsia="zh-CN"/>
-        </w:rPr>
-        <w:t>专业硕士</w:t>
+          <w:lang w:val="en-US" w:eastAsia="zh-CN"/>
+        </w:rPr>
+        <w:t xml:space="preserve">  </w:t>
       </w:r>
       <w:r>
         <w:rPr>
@@ -281,9 +279,38 @@
           <w:kern w:val="2"/>
           <w:sz w:val="28"/>
           <w:u w:val="single"/>
+          <w:lang w:eastAsia="zh-CN"/>
+        </w:rPr>
+        <w:t>专业硕士</w:t>
+      </w:r>
+      <w:r>
+        <w:rPr>
+          <w:rFonts w:hint="eastAsia" w:ascii="宋体" w:hAnsi="宋体"/>
+          <w:spacing w:val="40"/>
+          <w:kern w:val="2"/>
+          <w:sz w:val="28"/>
+          <w:u w:val="single"/>
         </w:rPr>
         <w:tab/>
+      </w:r>
+      <w:r>
+        <w:rPr>
+          <w:rFonts w:hint="eastAsia" w:ascii="宋体" w:hAnsi="宋体"/>
+          <w:spacing w:val="40"/>
+          <w:kern w:val="2"/>
+          <w:sz w:val="28"/>
+          <w:u w:val="single"/>
+        </w:rPr>
         <w:tab/>
+      </w:r>
+      <w:r>
+        <w:rPr>
+          <w:rFonts w:hint="eastAsia" w:ascii="宋体" w:hAnsi="宋体"/>
+          <w:spacing w:val="40"/>
+          <w:kern w:val="2"/>
+          <w:sz w:val="28"/>
+          <w:u w:val="single"/>
+        </w:rPr>
         <w:tab/>
       </w:r>
       <w:r>
@@ -415,9 +442,45 @@
           <w:u w:val="single"/>
         </w:rPr>
         <w:tab/>
+      </w:r>
+      <w:r>
+        <w:rPr>
+          <w:rFonts w:hint="eastAsia" w:ascii="宋体" w:hAnsi="宋体"/>
+          <w:spacing w:val="40"/>
+          <w:kern w:val="2"/>
+          <w:sz w:val="28"/>
+          <w:u w:val="single"/>
+        </w:rPr>
         <w:tab/>
+      </w:r>
+      <w:r>
+        <w:rPr>
+          <w:rFonts w:hint="eastAsia" w:ascii="宋体" w:hAnsi="宋体"/>
+          <w:spacing w:val="40"/>
+          <w:kern w:val="2"/>
+          <w:sz w:val="28"/>
+          <w:u w:val="single"/>
+        </w:rPr>
         <w:t>电子信息</w:t>
+      </w:r>
+      <w:r>
+        <w:rPr>
+          <w:rFonts w:hint="eastAsia" w:ascii="宋体" w:hAnsi="宋体"/>
+          <w:spacing w:val="40"/>
+          <w:kern w:val="2"/>
+          <w:sz w:val="28"/>
+          <w:u w:val="single"/>
+        </w:rPr>
         <w:tab/>
+      </w:r>
+      <w:r>
+        <w:rPr>
+          <w:rFonts w:hint="eastAsia" w:ascii="宋体" w:hAnsi="宋体"/>
+          <w:spacing w:val="40"/>
+          <w:kern w:val="2"/>
+          <w:sz w:val="28"/>
+          <w:u w:val="single"/>
+        </w:rPr>
         <w:tab/>
       </w:r>
     </w:p>
@@ -477,7 +540,6 @@
           <w:u w:val="single"/>
         </w:rPr>
         <w:tab/>
-        <w:tab/>
       </w:r>
       <w:r>
         <w:rPr>
@@ -486,9 +548,8 @@
           <w:kern w:val="2"/>
           <w:sz w:val="28"/>
           <w:u w:val="single"/>
-          <w:lang w:val="en-US" w:eastAsia="zh-CN"/>
-        </w:rPr>
-        <w:t xml:space="preserve"> </w:t>
+        </w:rPr>
+        <w:tab/>
       </w:r>
       <w:r>
         <w:rPr>
@@ -497,9 +558,9 @@
           <w:kern w:val="2"/>
           <w:sz w:val="28"/>
           <w:u w:val="single"/>
-          <w:lang w:eastAsia="zh-CN"/>
-        </w:rPr>
-        <w:t>张景耀</w:t>
+          <w:lang w:val="en-US" w:eastAsia="zh-CN"/>
+        </w:rPr>
+        <w:t xml:space="preserve"> </w:t>
       </w:r>
       <w:r>
         <w:rPr>
@@ -508,12 +569,10 @@
           <w:kern w:val="2"/>
           <w:sz w:val="28"/>
           <w:u w:val="single"/>
-          <w:lang w:val="en-US" w:eastAsia="zh-CN"/>
-        </w:rPr>
-        <w:t xml:space="preserve">  </w:t>
-      </w:r>
-      <w:bookmarkStart w:id="0" w:name="_GoBack"/>
-      <w:bookmarkEnd w:id="0"/>
+          <w:lang w:eastAsia="zh-CN"/>
+        </w:rPr>
+        <w:t>张景耀</w:t>
+      </w:r>
       <w:r>
         <w:rPr>
           <w:rFonts w:hint="eastAsia" w:ascii="宋体" w:hAnsi="宋体"/>
@@ -521,8 +580,28 @@
           <w:kern w:val="2"/>
           <w:sz w:val="28"/>
           <w:u w:val="single"/>
+          <w:lang w:val="en-US" w:eastAsia="zh-CN"/>
+        </w:rPr>
+        <w:t xml:space="preserve">  </w:t>
+      </w:r>
+      <w:r>
+        <w:rPr>
+          <w:rFonts w:hint="eastAsia" w:ascii="宋体" w:hAnsi="宋体"/>
+          <w:spacing w:val="40"/>
+          <w:kern w:val="2"/>
+          <w:sz w:val="28"/>
+          <w:u w:val="single"/>
         </w:rPr>
         <w:tab/>
+      </w:r>
+      <w:r>
+        <w:rPr>
+          <w:rFonts w:hint="eastAsia" w:ascii="宋体" w:hAnsi="宋体"/>
+          <w:spacing w:val="40"/>
+          <w:kern w:val="2"/>
+          <w:sz w:val="28"/>
+          <w:u w:val="single"/>
+        </w:rPr>
         <w:tab/>
       </w:r>
       <w:r>
@@ -583,7 +662,6 @@
           <w:u w:val="single"/>
         </w:rPr>
         <w:tab/>
-        <w:tab/>
       </w:r>
       <w:r>
         <w:rPr>
@@ -592,9 +670,8 @@
           <w:kern w:val="2"/>
           <w:sz w:val="28"/>
           <w:u w:val="single"/>
-          <w:lang w:val="en-US" w:eastAsia="zh-CN"/>
-        </w:rPr>
-        <w:t xml:space="preserve"> </w:t>
+        </w:rPr>
+        <w:tab/>
       </w:r>
       <w:r>
         <w:rPr>
@@ -603,9 +680,9 @@
           <w:kern w:val="2"/>
           <w:sz w:val="28"/>
           <w:u w:val="single"/>
-          <w:lang w:eastAsia="zh-CN"/>
-        </w:rPr>
-        <w:t>徐坚皓</w:t>
+          <w:lang w:val="en-US" w:eastAsia="zh-CN"/>
+        </w:rPr>
+        <w:t xml:space="preserve"> </w:t>
       </w:r>
       <w:r>
         <w:rPr>
@@ -614,9 +691,9 @@
           <w:kern w:val="2"/>
           <w:sz w:val="28"/>
           <w:u w:val="single"/>
-          <w:lang w:val="en-US" w:eastAsia="zh-CN"/>
-        </w:rPr>
-        <w:t xml:space="preserve">  </w:t>
+          <w:lang w:eastAsia="zh-CN"/>
+        </w:rPr>
+        <w:t>徐坚皓</w:t>
       </w:r>
       <w:r>
         <w:rPr>
@@ -625,8 +702,28 @@
           <w:kern w:val="2"/>
           <w:sz w:val="28"/>
           <w:u w:val="single"/>
+          <w:lang w:val="en-US" w:eastAsia="zh-CN"/>
+        </w:rPr>
+        <w:t xml:space="preserve">  </w:t>
+      </w:r>
+      <w:r>
+        <w:rPr>
+          <w:rFonts w:hint="eastAsia" w:ascii="宋体" w:hAnsi="宋体"/>
+          <w:spacing w:val="40"/>
+          <w:kern w:val="2"/>
+          <w:sz w:val="28"/>
+          <w:u w:val="single"/>
         </w:rPr>
         <w:tab/>
+      </w:r>
+      <w:r>
+        <w:rPr>
+          <w:rFonts w:hint="eastAsia" w:ascii="宋体" w:hAnsi="宋体"/>
+          <w:spacing w:val="40"/>
+          <w:kern w:val="2"/>
+          <w:sz w:val="28"/>
+          <w:u w:val="single"/>
+        </w:rPr>
         <w:tab/>
       </w:r>
       <w:r>
@@ -685,6 +782,15 @@
           <w:u w:val="single"/>
         </w:rPr>
         <w:tab/>
+      </w:r>
+      <w:r>
+        <w:rPr>
+          <w:rFonts w:hint="eastAsia" w:ascii="宋体" w:hAnsi="宋体"/>
+          <w:spacing w:val="40"/>
+          <w:kern w:val="2"/>
+          <w:sz w:val="28"/>
+          <w:u w:val="single"/>
+        </w:rPr>
         <w:tab/>
       </w:r>
       <w:r>
@@ -791,7 +897,21 @@
           <w:u w:val="single"/>
         </w:rPr>
         <w:tab/>
+      </w:r>
+      <w:r>
+        <w:rPr>
+          <w:rFonts w:hint="eastAsia" w:ascii="宋体" w:hAnsi="宋体"/>
+          <w:sz w:val="28"/>
+          <w:u w:val="single"/>
+        </w:rPr>
         <w:tab/>
+      </w:r>
+      <w:r>
+        <w:rPr>
+          <w:rFonts w:hint="eastAsia" w:ascii="宋体" w:hAnsi="宋体"/>
+          <w:sz w:val="28"/>
+          <w:u w:val="single"/>
+        </w:rPr>
         <w:tab/>
       </w:r>
       <w:r>
@@ -818,6 +938,13 @@
           <w:u w:val="single"/>
         </w:rPr>
         <w:tab/>
+      </w:r>
+      <w:r>
+        <w:rPr>
+          <w:rFonts w:hint="eastAsia" w:ascii="宋体" w:hAnsi="宋体"/>
+          <w:sz w:val="28"/>
+          <w:u w:val="single"/>
+        </w:rPr>
         <w:tab/>
       </w:r>
       <w:r>
@@ -1368,6 +1495,26 @@
             </w:pPr>
             <w:r>
               <w:rPr>
+                <w:rFonts w:hint="default"/>
+                <w:kern w:val="0"/>
+                <w:sz w:val="24"/>
+                <w:lang w:val="en-US"/>
+              </w:rPr>
+              <w:t>DeFuzz</w:t>
+            </w:r>
+            <w:r>
+              <w:rPr>
+                <w:rFonts w:hint="eastAsia"/>
+                <w:kern w:val="0"/>
+                <w:sz w:val="24"/>
+                <w:lang w:val="en-US" w:eastAsia="zh-CN"/>
+              </w:rPr>
+              <w:t>：</w:t>
+            </w:r>
+            <w:bookmarkStart w:id="0" w:name="_GoBack"/>
+            <w:bookmarkEnd w:id="0"/>
+            <w:r>
+              <w:rPr>
                 <w:rFonts w:hint="eastAsia"/>
                 <w:kern w:val="0"/>
                 <w:sz w:val="24"/>
@@ -1771,6 +1918,14 @@
         </w:tc>
       </w:tr>
       <w:tr>
+        <w:tblPrEx>
+          <w:tblCellMar>
+            <w:top w:w="0" w:type="dxa"/>
+            <w:left w:w="56" w:type="dxa"/>
+            <w:bottom w:w="0" w:type="dxa"/>
+            <w:right w:w="56" w:type="dxa"/>
+          </w:tblCellMar>
+        </w:tblPrEx>
         <w:trPr>
           <w:jc w:val="center"/>
         </w:trPr>
@@ -2344,9 +2499,8 @@
           </w:p>
           <w:p>
             <w:pPr>
-              <w:pStyle w:val="Normal"/>
               <w:widowControl/>
-              <w:jc w:val="start"/>
+              <w:jc w:val="left"/>
               <w:rPr>
                 <w:b/>
                 <w:bCs/>
@@ -2366,33 +2520,30 @@
           </w:p>
           <w:p>
             <w:pPr>
-              <w:pStyle w:val="Normal"/>
-              <w:spacing w:lineRule="auto" w:line="360"/>
-              <w:ind w:firstLineChars="200" w:startChars="0" w:start="0" w:endChars="0" w:end="0"/>
-              <w:rPr>
-                <w:kern w:val="0"/>
-                <w:sz w:val="24"/>
-              </w:rPr>
-            </w:pPr>
-            <w:r>
-              <w:rPr>
-                <w:kern w:val="0"/>
-                <w:sz w:val="24"/>
-              </w:rPr>
-              <w:t xml:space="preserve">CVE-2023-4039 暴露了 GCC 在 AArch64 上栈保护机制的一处长期失效。当函数使用变长数组（VLA）或 alloca 时，编译器把栈金丝雀放在 VLA 之上、保存的返回地址却落在 VLA 之下，越界写入可以先于金丝雀检查改写返回地址，-fstack-protector 因此形同虚设——这种 buggy 状态下的栈帧布局可参见图 1。编译过程不报错，二进制能通过功能测试，缺陷只在攻击者构造特定输入时才显现。该漏洞自 GCC 早期版本即已存在，直到 2023 年才由外部研究者系统分析并修复。问题的共性也由此显现：编译器侧的防御机制依赖前端识别、中端 pass 与后端代码生成共同维护一组安全不变量，其中任何一处与具体 ISA 的栈布局、寄存器分配或指令编码假设不一致，防御机制就会悄然失效——对外仍然"存在"，对攻击者不再有效。</w:t>
-            </w:r>
-          </w:p>
-          <w:p>
-            <w:pPr>
-              <w:pStyle w:val="Normal"/>
-              <w:spacing w:lineRule="auto" w:line="360"/>
-              <w:jc w:val="center"/>
-            </w:pPr>
-            <w:r>
-              <w:rPr/>
+              <w:spacing w:line="360" w:lineRule="auto"/>
+              <w:ind w:left="0" w:leftChars="0" w:right="0" w:rightChars="0" w:firstLineChars="200"/>
+              <w:rPr>
+                <w:kern w:val="0"/>
+                <w:sz w:val="24"/>
+              </w:rPr>
+            </w:pPr>
+            <w:r>
+              <w:rPr>
+                <w:kern w:val="0"/>
+                <w:sz w:val="24"/>
+              </w:rPr>
+              <w:t>CVE-2023-4039 暴露了 GCC 在 AArch64 上栈保护机制的一处长期失效。当函数使用变长数组（VLA）或 alloca 时，编译器把栈金丝雀放在 VLA 之上、保存的返回地址却落在 VLA 之下，越界写入可以先于金丝雀检查改写返回地址，-fstack-protector 因此形同虚设——这种 buggy 状态下的栈帧布局可参见图 1。编译过程不报错，二进制能通过功能测试，缺陷只在攻击者构造特定输入时才显现。该漏洞自 GCC 早期版本即已存在，直到 2023 年才由外部研究者系统分析并修复。问题的共性也由此显现：编译器侧的防御机制依赖前端识别、中端 pass 与后端代码生成共同维护一组安全不变量，其中任何一处与具体 ISA 的栈布局、寄存器分配或指令编码假设不一致，防御机制就会悄然失效——对外仍然"存在"，对攻击者不再有效。</w:t>
+            </w:r>
+          </w:p>
+          <w:p>
+            <w:pPr>
+              <w:spacing w:line="360" w:lineRule="auto"/>
+              <w:jc w:val="center"/>
+            </w:pPr>
+            <w:r>
               <w:drawing>
-                <wp:inline xmlns:wp="http://schemas.openxmlformats.org/drawingml/2006/wordprocessingDrawing" distT="0" distB="0" distL="0" distR="0">
-                  <wp:extent cx="4284090" cy="5326553"/>
+                <wp:inline distT="0" distB="0" distL="0" distR="0">
+                  <wp:extent cx="4283710" cy="5326380"/>
                   <wp:effectExtent l="0" t="0" r="0" b="0"/>
                   <wp:docPr id="21" name="Figure21"/>
                   <wp:cNvGraphicFramePr>
@@ -2402,11 +2553,13 @@
                     <a:graphicData uri="http://schemas.openxmlformats.org/drawingml/2006/picture">
                       <pic:pic xmlns:pic="http://schemas.openxmlformats.org/drawingml/2006/picture">
                         <pic:nvPicPr>
-                          <pic:cNvPr id="21" name="stack-layout.png"/>
-                          <pic:cNvPicPr/>
+                          <pic:cNvPr id="21" name="Figure21"/>
+                          <pic:cNvPicPr>
+                            <a:picLocks noChangeAspect="1"/>
+                          </pic:cNvPicPr>
                         </pic:nvPicPr>
                         <pic:blipFill>
-                          <a:blip xmlns:r="http://schemas.openxmlformats.org/officeDocument/2006/relationships" r:embed="rId21"/>
+                          <a:blip r:embed="rId6"/>
                           <a:stretch>
                             <a:fillRect/>
                           </a:stretch>
@@ -2429,8 +2582,7 @@
           </w:p>
           <w:p>
             <w:pPr>
-              <w:pStyle w:val="Normal"/>
-              <w:spacing w:lineRule="auto" w:line="300"/>
+              <w:spacing w:line="300" w:lineRule="auto"/>
               <w:jc w:val="center"/>
               <w:rPr>
                 <w:rFonts w:ascii="宋体" w:hAnsi="宋体" w:eastAsia="宋体"/>
@@ -2449,42 +2601,38 @@
           </w:p>
           <w:p>
             <w:pPr>
-              <w:pStyle w:val="Normal"/>
-              <w:spacing w:lineRule="auto" w:line="360"/>
-              <w:rPr>
-                <w:sz w:val="24"/>
-              </w:rPr>
-            </w:pPr>
-          </w:p>
-          <w:p>
-            <w:pPr>
-              <w:pStyle w:val="Normal"/>
-              <w:spacing w:lineRule="auto" w:line="360"/>
-              <w:ind w:firstLineChars="200" w:startChars="0" w:start="0" w:endChars="0" w:end="0"/>
-              <w:rPr>
-                <w:kern w:val="0"/>
-                <w:sz w:val="24"/>
-              </w:rPr>
-            </w:pPr>
-            <w:r>
-              <w:rPr>
-                <w:kern w:val="0"/>
-                <w:sz w:val="24"/>
-              </w:rPr>
-              <w:t xml:space="preserve">编译器所承载的防御机制数量本身已相当庞大：栈金丝雀、_FORTIFY_SOURCE、Intel CET 中的 IBT 与 SHSTK、AArch64 的 BTI 与 PAC、Shadow Stack、SafeStack、KCFI、CFI、HCFR 等，分别保护栈完整性、控制流、对象边界，且仍在扩展。目标 ISA 方面，x86-64、AArch64、RISC-V、LoongArch、MIPS、PowerPC 等架构在调用约定、寄存器分配与指令编码上差异显著，每种机制在各 ISA 上对应若干份独立的后端模板与中端 pass 实现。二者构成"防御机制 × ISA"的二维研究空间（见图 2），每一格对应一组需联合维护的安全不变量，目前已被覆盖的格点仍只是其中很小一部分。</w:t>
-            </w:r>
-          </w:p>
-          <w:p>
-            <w:pPr>
-              <w:pStyle w:val="Normal"/>
-              <w:spacing w:lineRule="auto" w:line="360"/>
-              <w:jc w:val="center"/>
-            </w:pPr>
-            <w:r>
-              <w:rPr/>
+              <w:spacing w:line="360" w:lineRule="auto"/>
+              <w:rPr>
+                <w:sz w:val="24"/>
+              </w:rPr>
+            </w:pPr>
+          </w:p>
+          <w:p>
+            <w:pPr>
+              <w:spacing w:line="360" w:lineRule="auto"/>
+              <w:ind w:left="0" w:leftChars="0" w:right="0" w:rightChars="0" w:firstLineChars="200"/>
+              <w:rPr>
+                <w:kern w:val="0"/>
+                <w:sz w:val="24"/>
+              </w:rPr>
+            </w:pPr>
+            <w:r>
+              <w:rPr>
+                <w:kern w:val="0"/>
+                <w:sz w:val="24"/>
+              </w:rPr>
+              <w:t>编译器所承载的防御机制数量本身已相当庞大：栈金丝雀、_FORTIFY_SOURCE、Intel CET 中的 IBT 与 SHSTK、AArch64 的 BTI 与 PAC、Shadow Stack、SafeStack、KCFI、CFI、HCFR 等，分别保护栈完整性、控制流、对象边界，且仍在扩展。目标 ISA 方面，x86-64、AArch64、RISC-V、LoongArch、MIPS、PowerPC 等架构在调用约定、寄存器分配与指令编码上差异显著，每种机制在各 ISA 上对应若干份独立的后端模板与中端 pass 实现。二者构成"防御机制 × ISA"的二维研究空间（见图 2），每一格对应一组需联合维护的安全不变量，目前已被覆盖的格点仍只是其中很小一部分。</w:t>
+            </w:r>
+          </w:p>
+          <w:p>
+            <w:pPr>
+              <w:spacing w:line="360" w:lineRule="auto"/>
+              <w:jc w:val="center"/>
+            </w:pPr>
+            <w:r>
               <w:drawing>
-                <wp:inline xmlns:wp="http://schemas.openxmlformats.org/drawingml/2006/wordprocessingDrawing" distT="0" distB="0" distL="0" distR="0">
-                  <wp:extent cx="5385714" cy="2709687"/>
+                <wp:inline distT="0" distB="0" distL="0" distR="0">
+                  <wp:extent cx="5385435" cy="2709545"/>
                   <wp:effectExtent l="0" t="0" r="0" b="0"/>
                   <wp:docPr id="22" name="Figure22"/>
                   <wp:cNvGraphicFramePr>
@@ -2494,11 +2642,13 @@
                     <a:graphicData uri="http://schemas.openxmlformats.org/drawingml/2006/picture">
                       <pic:pic xmlns:pic="http://schemas.openxmlformats.org/drawingml/2006/picture">
                         <pic:nvPicPr>
-                          <pic:cNvPr id="22" name="defense-matrix.png"/>
-                          <pic:cNvPicPr/>
+                          <pic:cNvPr id="22" name="Figure22"/>
+                          <pic:cNvPicPr>
+                            <a:picLocks noChangeAspect="1"/>
+                          </pic:cNvPicPr>
                         </pic:nvPicPr>
                         <pic:blipFill>
-                          <a:blip xmlns:r="http://schemas.openxmlformats.org/officeDocument/2006/relationships" r:embed="rId22"/>
+                          <a:blip r:embed="rId7"/>
                           <a:stretch>
                             <a:fillRect/>
                           </a:stretch>
@@ -2521,8 +2671,7 @@
           </w:p>
           <w:p>
             <w:pPr>
-              <w:pStyle w:val="Normal"/>
-              <w:spacing w:lineRule="auto" w:line="300"/>
+              <w:spacing w:line="300" w:lineRule="auto"/>
               <w:jc w:val="center"/>
               <w:rPr>
                 <w:rFonts w:ascii="宋体" w:hAnsi="宋体" w:eastAsia="宋体"/>
@@ -2541,54 +2690,50 @@
           </w:p>
           <w:p>
             <w:pPr>
-              <w:pStyle w:val="Normal"/>
-              <w:spacing w:lineRule="auto" w:line="360"/>
-              <w:rPr>
-                <w:sz w:val="24"/>
-              </w:rPr>
-            </w:pPr>
-          </w:p>
-          <w:p>
-            <w:pPr>
-              <w:pStyle w:val="Normal"/>
-              <w:spacing w:lineRule="auto" w:line="360"/>
-              <w:ind w:firstLineChars="200" w:startChars="0" w:start="0" w:endChars="0" w:end="0"/>
-              <w:rPr>
-                <w:kern w:val="0"/>
-                <w:sz w:val="24"/>
-              </w:rPr>
-            </w:pPr>
-            <w:r>
-              <w:rPr>
-                <w:kern w:val="0"/>
-                <w:sz w:val="24"/>
-              </w:rPr>
-              <w:t xml:space="preserve">这个矩阵的规模使人工审计难以全面覆盖。与 CVE-2023-4039 同源的 PR-96191（AArch64 / ARM 上栈金丝雀寄存器残留）2020 年修复时，就未涉及 MIPS、LoongArch、Xtensa、CSKY 等 fallback 后端；单点防御机制上的实现疏忽，往往同时存在于矩阵中其他格点而长期不被发现。本课题初步实验阶段已对若干格点做了试探性验证，向 GCC 上游报告并确认了多例同类形态的真实漏洞，第五章将给出具体案例。</w:t>
-            </w:r>
-          </w:p>
-          <w:p>
-            <w:pPr>
-              <w:pStyle w:val="Normal"/>
-              <w:spacing w:lineRule="auto" w:line="360"/>
-              <w:ind w:firstLineChars="200" w:startChars="0" w:start="0" w:endChars="0" w:end="0"/>
-              <w:rPr>
-                <w:kern w:val="0"/>
-                <w:sz w:val="24"/>
-              </w:rPr>
-            </w:pPr>
-            <w:r>
-              <w:rPr>
-                <w:kern w:val="0"/>
-                <w:sz w:val="24"/>
-              </w:rPr>
-              <w:t xml:space="preserve">上述失效有一个共同特征：编译过程不出错、二进制正常运行，缺陷仅在特定输入下显现——即"静默失效（silent failure）"。Csmith、YARPGen 等以差分输出或编译器崩溃为信号的工具对此类缺陷几乎不敏感；覆盖率引导的模糊测试虽然可以把执行推进到相关代码路径，但缺少判断该路径是否仍满足安全契约的预言机。问题由此浮现：编译器是绝大多数软件防御机制的实际载体，矩阵中的静默失效直接削弱整个软件生态的运行时安全保障，而现有自动化测试方法尚未把"防御机制的安全契约"纳入判定体系。如果能把矩阵格点上的不变量翻译为可测断言，并主动引导编译器走到对应代码路径，就既可覆盖既有缺陷家族的同类变种，也有望在后续优化引入同类回归时及早暴露。本研究以此为出发点，结合大语言模型的代码理解能力与覆盖率反馈，构建一条针对编译器防御机制静默失效的模糊测试方法。</w:t>
-            </w:r>
-          </w:p>
-          <w:p>
-            <w:pPr>
-              <w:pStyle w:val="Normal"/>
+              <w:spacing w:line="360" w:lineRule="auto"/>
+              <w:rPr>
+                <w:sz w:val="24"/>
+              </w:rPr>
+            </w:pPr>
+          </w:p>
+          <w:p>
+            <w:pPr>
+              <w:spacing w:line="360" w:lineRule="auto"/>
+              <w:ind w:left="0" w:leftChars="0" w:right="0" w:rightChars="0" w:firstLineChars="200"/>
+              <w:rPr>
+                <w:kern w:val="0"/>
+                <w:sz w:val="24"/>
+              </w:rPr>
+            </w:pPr>
+            <w:r>
+              <w:rPr>
+                <w:kern w:val="0"/>
+                <w:sz w:val="24"/>
+              </w:rPr>
+              <w:t>这个矩阵的规模使人工审计难以全面覆盖。与 CVE-2023-4039 同源的 PR-96191（AArch64 / ARM 上栈金丝雀寄存器残留）2020 年修复时，就未涉及 MIPS、LoongArch、Xtensa、CSKY 等 fallback 后端；单点防御机制上的实现疏忽，往往同时存在于矩阵中其他格点而长期不被发现。本课题初步实验阶段已对若干格点做了试探性验证，向 GCC 上游报告并确认了多例同类形态的真实漏洞，第五章将给出具体案例。</w:t>
+            </w:r>
+          </w:p>
+          <w:p>
+            <w:pPr>
+              <w:spacing w:line="360" w:lineRule="auto"/>
+              <w:ind w:left="0" w:leftChars="0" w:right="0" w:rightChars="0" w:firstLineChars="200"/>
+              <w:rPr>
+                <w:kern w:val="0"/>
+                <w:sz w:val="24"/>
+              </w:rPr>
+            </w:pPr>
+            <w:r>
+              <w:rPr>
+                <w:kern w:val="0"/>
+                <w:sz w:val="24"/>
+              </w:rPr>
+              <w:t>上述失效有一个共同特征：编译过程不出错、二进制正常运行，缺陷仅在特定输入下显现——即"静默失效（silent failure）"。Csmith、YARPGen 等以差分输出或编译器崩溃为信号的工具对此类缺陷几乎不敏感；覆盖率引导的模糊测试虽然可以把执行推进到相关代码路径，但缺少判断该路径是否仍满足安全契约的预言机。问题由此浮现：编译器是绝大多数软件防御机制的实际载体，矩阵中的静默失效直接削弱整个软件生态的运行时安全保障，而现有自动化测试方法尚未把"防御机制的安全契约"纳入判定体系。如果能把矩阵格点上的不变量翻译为可测断言，并主动引导编译器走到对应代码路径，就既可覆盖既有缺陷家族的同类变种，也有望在后续优化引入同类回归时及早暴露。本研究以此为出发点，结合大语言模型的代码理解能力与覆盖率反馈，构建一条针对编译器防御机制静默失效的模糊测试方法。</w:t>
+            </w:r>
+          </w:p>
+          <w:p>
+            <w:pPr>
               <w:widowControl/>
-              <w:jc w:val="start"/>
+              <w:jc w:val="left"/>
               <w:rPr>
                 <w:b/>
                 <w:bCs/>
@@ -2608,26 +2753,24 @@
           </w:p>
           <w:p>
             <w:pPr>
-              <w:pStyle w:val="Normal"/>
-              <w:spacing w:lineRule="auto" w:line="360"/>
-              <w:ind w:firstLineChars="200" w:startChars="0" w:start="0" w:endChars="0" w:end="0"/>
-              <w:rPr>
-                <w:kern w:val="0"/>
-                <w:sz w:val="24"/>
-              </w:rPr>
-            </w:pPr>
-            <w:r>
-              <w:rPr>
-                <w:kern w:val="0"/>
-                <w:sz w:val="24"/>
-              </w:rPr>
-              <w:t xml:space="preserve">编译器模糊测试的研究可以从两个角度来看：一是预言机（oracle），决定什么算缺陷；二是种子变异方法，决定测试输入怎么产生。早期工作以崩溃或输出差异为信号、以随机或文法规则生成种子；覆盖率引导与大语言模型的引入分别使二者向目标导向和语义理解方向演进。下文沿这两个维度梳理现状。</w:t>
-            </w:r>
-          </w:p>
-          <w:p>
-            <w:pPr>
-              <w:pStyle w:val="Normal"/>
-              <w:spacing w:lineRule="auto" w:line="360"/>
+              <w:spacing w:line="360" w:lineRule="auto"/>
+              <w:ind w:left="0" w:leftChars="0" w:right="0" w:rightChars="0" w:firstLineChars="200"/>
+              <w:rPr>
+                <w:kern w:val="0"/>
+                <w:sz w:val="24"/>
+              </w:rPr>
+            </w:pPr>
+            <w:r>
+              <w:rPr>
+                <w:kern w:val="0"/>
+                <w:sz w:val="24"/>
+              </w:rPr>
+              <w:t>编译器模糊测试的研究可以从两个角度来看：一是预言机（oracle），决定什么算缺陷；二是种子变异方法，决定测试输入怎么产生。早期工作以崩溃或输出差异为信号、以随机或文法规则生成种子；覆盖率引导与大语言模型的引入分别使二者向目标导向和语义理解方向演进。下文沿这两个维度梳理现状。</w:t>
+            </w:r>
+          </w:p>
+          <w:p>
+            <w:pPr>
+              <w:spacing w:line="360" w:lineRule="auto"/>
               <w:rPr>
                 <w:b/>
                 <w:bCs/>
@@ -2647,62 +2790,58 @@
           </w:p>
           <w:p>
             <w:pPr>
-              <w:pStyle w:val="Normal"/>
-              <w:spacing w:lineRule="auto" w:line="360"/>
-              <w:ind w:firstLineChars="200" w:startChars="0" w:start="0" w:endChars="0" w:end="0"/>
-              <w:rPr>
-                <w:kern w:val="0"/>
-                <w:sz w:val="24"/>
-              </w:rPr>
-            </w:pPr>
-            <w:r>
-              <w:rPr>
-                <w:kern w:val="0"/>
-                <w:sz w:val="24"/>
-              </w:rPr>
-              <w:t xml:space="preserve">预言机回答"什么样的执行结果算缺陷"，现有工作大致可分五类。</w:t>
-            </w:r>
-          </w:p>
-          <w:p>
-            <w:pPr>
-              <w:pStyle w:val="Normal"/>
-              <w:spacing w:lineRule="auto" w:line="360"/>
-              <w:ind w:firstLineChars="200" w:startChars="0" w:start="0" w:endChars="0" w:end="0"/>
-              <w:rPr>
-                <w:kern w:val="0"/>
-                <w:sz w:val="24"/>
-              </w:rPr>
-            </w:pPr>
-            <w:r>
-              <w:rPr>
-                <w:kern w:val="0"/>
-                <w:sz w:val="24"/>
-              </w:rPr>
-              <w:t xml:space="preserve">崩溃预言机[1,3,4]以编译期或运行期的崩溃（ICE、断言、segfault、超时）为信号，实现简单，是 AFL、libFuzzer 迁移到编译器后的默认选择。差分预言机[1,2]对若干编译器（或同一编译器不同优化等级）就同一程序的运行结果做交叉比对，差异即为 mis-compile；Csmith、YARPGen 围绕"避免未定义行为"这一前提大规模生成 C 程序来驱动差分。变形测试预言机以 Le 等提出的 EMI[11] 为代表：对同一输入下未执行的代码做删改，新程序应产生相同结果，差异即为 mis-compile，后续工作继续在 live region 等价变换上探索。Sanitizer 预言机借助 ASan、UBSan、MSan 把内存破坏与未定义行为转为显式信号；UBfuzz[12] 进一步用 crash-site mapping 反向定位 sanitizer 自身实现缺陷。还有面向子领域的复合预言机，如 HirGen[13] 在 IR 层同时使用差分与变形来提高对深度学习编译器深层优化错误的敏感度。</w:t>
-            </w:r>
-          </w:p>
-          <w:p>
-            <w:pPr>
-              <w:pStyle w:val="Normal"/>
-              <w:spacing w:lineRule="auto" w:line="360"/>
-              <w:ind w:firstLineChars="200" w:startChars="0" w:start="0" w:endChars="0" w:end="0"/>
-              <w:rPr>
-                <w:kern w:val="0"/>
-                <w:sz w:val="24"/>
-              </w:rPr>
-            </w:pPr>
-            <w:r>
-              <w:rPr>
-                <w:kern w:val="0"/>
-                <w:sz w:val="24"/>
-              </w:rPr>
-              <w:t xml:space="preserve">这些预言机的判据都建立在"崩溃"或"可观察的输出差异"之上。当缺陷的形态是"代码正常编译运行，但运行时保护已被静默削弱"时，它们无法触发。</w:t>
-            </w:r>
-          </w:p>
-          <w:p>
-            <w:pPr>
-              <w:pStyle w:val="Normal"/>
-              <w:spacing w:lineRule="auto" w:line="360"/>
+              <w:spacing w:line="360" w:lineRule="auto"/>
+              <w:ind w:left="0" w:leftChars="0" w:right="0" w:rightChars="0" w:firstLineChars="200"/>
+              <w:rPr>
+                <w:kern w:val="0"/>
+                <w:sz w:val="24"/>
+              </w:rPr>
+            </w:pPr>
+            <w:r>
+              <w:rPr>
+                <w:kern w:val="0"/>
+                <w:sz w:val="24"/>
+              </w:rPr>
+              <w:t>预言机回答"什么样的执行结果算缺陷"，现有工作大致可分五类。</w:t>
+            </w:r>
+          </w:p>
+          <w:p>
+            <w:pPr>
+              <w:spacing w:line="360" w:lineRule="auto"/>
+              <w:ind w:left="0" w:leftChars="0" w:right="0" w:rightChars="0" w:firstLineChars="200"/>
+              <w:rPr>
+                <w:kern w:val="0"/>
+                <w:sz w:val="24"/>
+              </w:rPr>
+            </w:pPr>
+            <w:r>
+              <w:rPr>
+                <w:kern w:val="0"/>
+                <w:sz w:val="24"/>
+              </w:rPr>
+              <w:t>崩溃预言机[1,3,4]以编译期或运行期的崩溃（ICE、断言、segfault、超时）为信号，实现简单，是 AFL、libFuzzer 迁移到编译器后的默认选择。差分预言机[1,2]对若干编译器（或同一编译器不同优化等级）就同一程序的运行结果做交叉比对，差异即为 mis-compile；Csmith、YARPGen 围绕"避免未定义行为"这一前提大规模生成 C 程序来驱动差分。变形测试预言机以 Le 等提出的 EMI[11] 为代表：对同一输入下未执行的代码做删改，新程序应产生相同结果，差异即为 mis-compile，后续工作继续在 live region 等价变换上探索。Sanitizer 预言机借助 ASan、UBSan、MSan 把内存破坏与未定义行为转为显式信号；UBfuzz[12] 进一步用 crash-site mapping 反向定位 sanitizer 自身实现缺陷。还有面向子领域的复合预言机，如 HirGen[13] 在 IR 层同时使用差分与变形来提高对深度学习编译器深层优化错误的敏感度。</w:t>
+            </w:r>
+          </w:p>
+          <w:p>
+            <w:pPr>
+              <w:spacing w:line="360" w:lineRule="auto"/>
+              <w:ind w:left="0" w:leftChars="0" w:right="0" w:rightChars="0" w:firstLineChars="200"/>
+              <w:rPr>
+                <w:kern w:val="0"/>
+                <w:sz w:val="24"/>
+              </w:rPr>
+            </w:pPr>
+            <w:r>
+              <w:rPr>
+                <w:kern w:val="0"/>
+                <w:sz w:val="24"/>
+              </w:rPr>
+              <w:t>这些预言机的判据都建立在"崩溃"或"可观察的输出差异"之上。当缺陷的形态是"代码正常编译运行，但运行时保护已被静默削弱"时，它们无法触发。</w:t>
+            </w:r>
+          </w:p>
+          <w:p>
+            <w:pPr>
+              <w:spacing w:line="360" w:lineRule="auto"/>
               <w:rPr>
                 <w:b/>
                 <w:bCs/>
@@ -2722,26 +2861,24 @@
           </w:p>
           <w:p>
             <w:pPr>
-              <w:pStyle w:val="Normal"/>
-              <w:spacing w:lineRule="auto" w:line="360"/>
-              <w:ind w:firstLineChars="200" w:startChars="0" w:start="0" w:endChars="0" w:end="0"/>
-              <w:rPr>
-                <w:kern w:val="0"/>
-                <w:sz w:val="24"/>
-              </w:rPr>
-            </w:pPr>
-            <w:r>
-              <w:rPr>
-                <w:kern w:val="0"/>
-                <w:sz w:val="24"/>
-              </w:rPr>
-              <w:t xml:space="preserve">传统路线上，覆盖率作为推进信号已是主流。Csmith[1] 与 YARPGen[2] 基于概率文法从空白合成不含未定义行为的 C 程序，再靠差分预言机发现 mis-compile。LangFuzz 类工作记录种子语法树后做子树替换式的 grammar-aware 变异，多用于 JavaScript 引擎。AFL、libFuzzer[3,4] 以字节级覆盖率反馈为导向，被广泛用于编译器的解析与优化组件，但难以保证生成程序的语法和语义合法性。GrayC[14] 把覆盖率引导与一组保持语义合法性的源码级变异（表达式替换、控制结构改写）相结合，专门面向 C 编译器与分析器，覆盖率和缺陷发现率均优于纯生成式工具。EMI 系列[11]在已有种子的未执行区域做语义保持变换，可视作变异与变形预言机的组合。这条路线的局限在于：变异规则由人工先验定义，覆盖率只提供"是否走入新代码"的近似进度信号，变异本身缺乏对目标代码语义的理解。</w:t>
-            </w:r>
-          </w:p>
-          <w:p>
-            <w:pPr>
-              <w:pStyle w:val="Normal"/>
-              <w:spacing w:lineRule="auto" w:line="360"/>
+              <w:spacing w:line="360" w:lineRule="auto"/>
+              <w:ind w:left="0" w:leftChars="0" w:right="0" w:rightChars="0" w:firstLineChars="200"/>
+              <w:rPr>
+                <w:kern w:val="0"/>
+                <w:sz w:val="24"/>
+              </w:rPr>
+            </w:pPr>
+            <w:r>
+              <w:rPr>
+                <w:kern w:val="0"/>
+                <w:sz w:val="24"/>
+              </w:rPr>
+              <w:t>传统路线上，覆盖率作为推进信号已是主流。Csmith[1] 与 YARPGen[2] 基于概率文法从空白合成不含未定义行为的 C 程序，再靠差分预言机发现 mis-compile。LangFuzz 类工作记录种子语法树后做子树替换式的 grammar-aware 变异，多用于 JavaScript 引擎。AFL、libFuzzer[3,4] 以字节级覆盖率反馈为导向，被广泛用于编译器的解析与优化组件，但难以保证生成程序的语法和语义合法性。GrayC[14] 把覆盖率引导与一组保持语义合法性的源码级变异（表达式替换、控制结构改写）相结合，专门面向 C 编译器与分析器，覆盖率和缺陷发现率均优于纯生成式工具。EMI 系列[11]在已有种子的未执行区域做语义保持变换，可视作变异与变形预言机的组合。这条路线的局限在于：变异规则由人工先验定义，覆盖率只提供"是否走入新代码"的近似进度信号，变异本身缺乏对目标代码语义的理解。</w:t>
+            </w:r>
+          </w:p>
+          <w:p>
+            <w:pPr>
+              <w:spacing w:line="360" w:lineRule="auto"/>
               <w:rPr>
                 <w:b/>
                 <w:bCs/>
@@ -2761,54 +2898,50 @@
           </w:p>
           <w:p>
             <w:pPr>
-              <w:pStyle w:val="Normal"/>
-              <w:spacing w:lineRule="auto" w:line="360"/>
-              <w:ind w:firstLineChars="200" w:startChars="0" w:start="0" w:endChars="0" w:end="0"/>
-              <w:rPr>
-                <w:kern w:val="0"/>
-                <w:sz w:val="24"/>
-              </w:rPr>
-            </w:pPr>
-            <w:r>
-              <w:rPr>
-                <w:kern w:val="0"/>
-                <w:sz w:val="24"/>
-              </w:rPr>
-              <w:t xml:space="preserve">大模型在代码理解与生成上的能力近年被引入以缓解传统变异在质量上的瓶颈。WhiteFox[5] 从编译器优化 pass 源码出发，先用大模型归纳触发该优化的输入模式（requirement summarization），再据此生成测试用例，使种子生成具备对编译器内部逻辑的感知；该方法在 PyTorch、TVM 等深度学习编译器上发现了若干优化路径深处的 bug。HLPFuzz[15] 进一步把大模型与覆盖率反馈耦合：在灰盒主循环之外引入白盒求解器，按"未覆盖且后继最多"的策略选取目标基本块，把单基本块翻译为约束求解任务交由大模型完成，并通过渐进式上下文构建缓解注意力衰减。这些工作表明大模型可以充当语义感知的变异引擎，但它们的目标设定仍是常规可达性——"让程序走到某个未覆盖位置"，并不关心目标路径所承担的安全契约。</w:t>
-            </w:r>
-          </w:p>
-          <w:p>
-            <w:pPr>
-              <w:pStyle w:val="Normal"/>
-              <w:spacing w:lineRule="auto" w:line="360"/>
-              <w:ind w:firstLineChars="200" w:startChars="0" w:start="0" w:endChars="0" w:end="0"/>
-              <w:rPr>
-                <w:kern w:val="0"/>
-                <w:sz w:val="24"/>
-              </w:rPr>
-            </w:pPr>
-            <w:r>
-              <w:rPr>
-                <w:kern w:val="0"/>
-                <w:sz w:val="24"/>
-              </w:rPr>
-              <w:t xml:space="preserve">综合来看，针对编译器自身防御机制的自动化测试在公开文献中仍然稀少：少数工作面向单一机制做差分测试（如扫描 IBT landing pad 存在性），另一些工作从二进制层面做事后审计，但难以反向定位到引入缺陷的编译器代码路径。本课题在变异方法上沿用大模型与覆盖率联合驱动的思路，但把推进目标限定在"防御机制相关代码"；在预言机上把机制不变量翻译为 fuzz 框架可直接使用的判定接口，使方法对静默失效保持敏感。</w:t>
-            </w:r>
-          </w:p>
-          <w:p>
-            <w:pPr>
-              <w:pStyle w:val="Normal"/>
-              <w:spacing w:lineRule="auto" w:line="360"/>
-              <w:rPr>
-                <w:sz w:val="24"/>
-              </w:rPr>
-            </w:pPr>
-          </w:p>
-          <w:p>
-            <w:pPr>
-              <w:pStyle w:val="Normal"/>
+              <w:spacing w:line="360" w:lineRule="auto"/>
+              <w:ind w:left="0" w:leftChars="0" w:right="0" w:rightChars="0" w:firstLineChars="200"/>
+              <w:rPr>
+                <w:kern w:val="0"/>
+                <w:sz w:val="24"/>
+              </w:rPr>
+            </w:pPr>
+            <w:r>
+              <w:rPr>
+                <w:kern w:val="0"/>
+                <w:sz w:val="24"/>
+              </w:rPr>
+              <w:t>大模型在代码理解与生成上的能力近年被引入以缓解传统变异在质量上的瓶颈。WhiteFox[5] 从编译器优化 pass 源码出发，先用大模型归纳触发该优化的输入模式（requirement summarization），再据此生成测试用例，使种子生成具备对编译器内部逻辑的感知；该方法在 PyTorch、TVM 等深度学习编译器上发现了若干优化路径深处的 bug。HLPFuzz[15] 进一步把大模型与覆盖率反馈耦合：在灰盒主循环之外引入白盒求解器，按"未覆盖且后继最多"的策略选取目标基本块，把单基本块翻译为约束求解任务交由大模型完成，并通过渐进式上下文构建缓解注意力衰减。这些工作表明大模型可以充当语义感知的变异引擎，但它们的目标设定仍是常规可达性——"让程序走到某个未覆盖位置"，并不关心目标路径所承担的安全契约。</w:t>
+            </w:r>
+          </w:p>
+          <w:p>
+            <w:pPr>
+              <w:spacing w:line="360" w:lineRule="auto"/>
+              <w:ind w:left="0" w:leftChars="0" w:right="0" w:rightChars="0" w:firstLineChars="200"/>
+              <w:rPr>
+                <w:kern w:val="0"/>
+                <w:sz w:val="24"/>
+              </w:rPr>
+            </w:pPr>
+            <w:r>
+              <w:rPr>
+                <w:kern w:val="0"/>
+                <w:sz w:val="24"/>
+              </w:rPr>
+              <w:t>综合来看，针对编译器自身防御机制的自动化测试在公开文献中仍然稀少：少数工作面向单一机制做差分测试（如扫描 IBT landing pad 存在性），另一些工作从二进制层面做事后审计，但难以反向定位到引入缺陷的编译器代码路径。本课题在变异方法上沿用大模型与覆盖率联合驱动的思路，但把推进目标限定在"防御机制相关代码"；在预言机上把机制不变量翻译为 fuzz 框架可直接使用的判定接口，使方法对静默失效保持敏感。</w:t>
+            </w:r>
+          </w:p>
+          <w:p>
+            <w:pPr>
+              <w:spacing w:line="360" w:lineRule="auto"/>
+              <w:rPr>
+                <w:sz w:val="24"/>
+              </w:rPr>
+            </w:pPr>
+          </w:p>
+          <w:p>
+            <w:pPr>
               <w:widowControl/>
-              <w:jc w:val="start"/>
+              <w:jc w:val="left"/>
               <w:rPr>
                 <w:b/>
                 <w:bCs/>
@@ -2828,8 +2961,7 @@
           </w:p>
           <w:p>
             <w:pPr>
-              <w:pStyle w:val="Normal"/>
-              <w:spacing w:lineRule="auto" w:line="360"/>
+              <w:spacing w:line="360" w:lineRule="auto"/>
               <w:rPr>
                 <w:b/>
                 <w:bCs/>
@@ -2849,26 +2981,24 @@
           </w:p>
           <w:p>
             <w:pPr>
-              <w:pStyle w:val="Normal"/>
-              <w:spacing w:lineRule="auto" w:line="360"/>
-              <w:ind w:firstLineChars="200" w:startChars="0" w:start="0" w:endChars="0" w:end="0"/>
-              <w:rPr>
-                <w:kern w:val="0"/>
-                <w:sz w:val="24"/>
-              </w:rPr>
-            </w:pPr>
-            <w:r>
-              <w:rPr>
-                <w:kern w:val="0"/>
-                <w:sz w:val="24"/>
-              </w:rPr>
-              <w:t xml:space="preserve">本课题要构建一种面向编译器自身防御机制的模糊测试方法，并在 GCC 与 LLVM 上完成端到端验证。与以崩溃或差分输出为信号的传统编译器 fuzzer 不同，本方法以"防御机制是否仍满足其安全契约"为判据，自动暴露编译器仍能正常生成代码、但运行时保护已被静默削弱的失效。具体目标如下：(a) 形成一套覆盖主流防御机制的不变量集合，每条不变量具备可由二进制或运行行为判定的证据形式，在 GCC 与 LLVM 上保持一致的描述结构；(b) 构建一个可同时面向 GCC 与 LLVM、跨架构运行的 fuzzer 原型，以防御机制相关代码的源代码覆盖率为推进信号，用大模型完成种子精细变异；(c) 通过该原型在 GCC 与 LLVM 上发现可被上游确认的真实缺陷，验证方法有效性与跨编译器迁移性。三个目标依次推进，其依赖关系与对应的工作内容在 3.2 节中呈现（见图 3）。</w:t>
-            </w:r>
-          </w:p>
-          <w:p>
-            <w:pPr>
-              <w:pStyle w:val="Normal"/>
-              <w:spacing w:lineRule="auto" w:line="360"/>
+              <w:spacing w:line="360" w:lineRule="auto"/>
+              <w:ind w:left="0" w:leftChars="0" w:right="0" w:rightChars="0" w:firstLineChars="200"/>
+              <w:rPr>
+                <w:kern w:val="0"/>
+                <w:sz w:val="24"/>
+              </w:rPr>
+            </w:pPr>
+            <w:r>
+              <w:rPr>
+                <w:kern w:val="0"/>
+                <w:sz w:val="24"/>
+              </w:rPr>
+              <w:t>本课题要构建一种面向编译器自身防御机制的模糊测试方法，并在 GCC 与 LLVM 上完成端到端验证。与以崩溃或差分输出为信号的传统编译器 fuzzer 不同，本方法以"防御机制是否仍满足其安全契约"为判据，自动暴露编译器仍能正常生成代码、但运行时保护已被静默削弱的失效。具体目标如下：(a) 形成一套覆盖主流防御机制的不变量集合，每条不变量具备可由二进制或运行行为判定的证据形式，在 GCC 与 LLVM 上保持一致的描述结构；(b) 构建一个可同时面向 GCC 与 LLVM、跨架构运行的 fuzzer 原型，以防御机制相关代码的源代码覆盖率为推进信号，用大模型完成种子精细变异；(c) 通过该原型在 GCC 与 LLVM 上发现可被上游确认的真实缺陷，验证方法有效性与跨编译器迁移性。三个目标依次推进，其依赖关系与对应的工作内容在 3.2 节中呈现（见图 3）。</w:t>
+            </w:r>
+          </w:p>
+          <w:p>
+            <w:pPr>
+              <w:spacing w:line="360" w:lineRule="auto"/>
               <w:rPr>
                 <w:b/>
                 <w:bCs/>
@@ -2888,33 +3018,30 @@
           </w:p>
           <w:p>
             <w:pPr>
-              <w:pStyle w:val="Normal"/>
-              <w:spacing w:lineRule="auto" w:line="360"/>
-              <w:ind w:firstLineChars="200" w:startChars="0" w:start="0" w:endChars="0" w:end="0"/>
-              <w:rPr>
-                <w:kern w:val="0"/>
-                <w:sz w:val="24"/>
-              </w:rPr>
-            </w:pPr>
-            <w:r>
-              <w:rPr>
-                <w:kern w:val="0"/>
-                <w:sz w:val="24"/>
-              </w:rPr>
-              <w:t xml:space="preserve">本课题分为以下三部分（见图 3），彼此存在依赖关系：不变量形式化是预言机与种子目标选择的事实基础；预言机为 fuzz 主循环提供安全判定接口；覆盖率驱动的种子生成则负责把 fuzzing 推进到能触发不变量的代码路径上。</w:t>
-            </w:r>
-          </w:p>
-          <w:p>
-            <w:pPr>
-              <w:pStyle w:val="Normal"/>
-              <w:spacing w:lineRule="auto" w:line="360"/>
-              <w:jc w:val="center"/>
-            </w:pPr>
-            <w:r>
-              <w:rPr/>
+              <w:spacing w:line="360" w:lineRule="auto"/>
+              <w:ind w:left="0" w:leftChars="0" w:right="0" w:rightChars="0" w:firstLineChars="200"/>
+              <w:rPr>
+                <w:kern w:val="0"/>
+                <w:sz w:val="24"/>
+              </w:rPr>
+            </w:pPr>
+            <w:r>
+              <w:rPr>
+                <w:kern w:val="0"/>
+                <w:sz w:val="24"/>
+              </w:rPr>
+              <w:t>本课题分为以下三部分（见图 3），彼此存在依赖关系：不变量形式化是预言机与种子目标选择的事实基础；预言机为 fuzz 主循环提供安全判定接口；覆盖率驱动的种子生成则负责把 fuzzing 推进到能触发不变量的代码路径上。</w:t>
+            </w:r>
+          </w:p>
+          <w:p>
+            <w:pPr>
+              <w:spacing w:line="360" w:lineRule="auto"/>
+              <w:jc w:val="center"/>
+            </w:pPr>
+            <w:r>
               <w:drawing>
-                <wp:inline xmlns:wp="http://schemas.openxmlformats.org/drawingml/2006/wordprocessingDrawing" distT="0" distB="0" distL="0" distR="0">
-                  <wp:extent cx="5385714" cy="1236021"/>
+                <wp:inline distT="0" distB="0" distL="0" distR="0">
+                  <wp:extent cx="5385435" cy="1235710"/>
                   <wp:effectExtent l="0" t="0" r="0" b="0"/>
                   <wp:docPr id="23" name="Figure23"/>
                   <wp:cNvGraphicFramePr>
@@ -2924,11 +3051,13 @@
                     <a:graphicData uri="http://schemas.openxmlformats.org/drawingml/2006/picture">
                       <pic:pic xmlns:pic="http://schemas.openxmlformats.org/drawingml/2006/picture">
                         <pic:nvPicPr>
-                          <pic:cNvPr id="23" name="pipeline.png"/>
-                          <pic:cNvPicPr/>
+                          <pic:cNvPr id="23" name="Figure23"/>
+                          <pic:cNvPicPr>
+                            <a:picLocks noChangeAspect="1"/>
+                          </pic:cNvPicPr>
                         </pic:nvPicPr>
                         <pic:blipFill>
-                          <a:blip xmlns:r="http://schemas.openxmlformats.org/officeDocument/2006/relationships" r:embed="rId23"/>
+                          <a:blip r:embed="rId8"/>
                           <a:stretch>
                             <a:fillRect/>
                           </a:stretch>
@@ -2951,8 +3080,7 @@
           </w:p>
           <w:p>
             <w:pPr>
-              <w:pStyle w:val="Normal"/>
-              <w:spacing w:lineRule="auto" w:line="300"/>
+              <w:spacing w:line="300" w:lineRule="auto"/>
               <w:jc w:val="center"/>
               <w:rPr>
                 <w:rFonts w:ascii="宋体" w:hAnsi="宋体" w:eastAsia="宋体"/>
@@ -2971,81 +3099,75 @@
           </w:p>
           <w:p>
             <w:pPr>
-              <w:pStyle w:val="Normal"/>
-              <w:spacing w:lineRule="auto" w:line="360"/>
-              <w:rPr>
-                <w:sz w:val="24"/>
-              </w:rPr>
-            </w:pPr>
-          </w:p>
-          <w:p>
-            <w:pPr>
-              <w:pStyle w:val="Normal"/>
-              <w:spacing w:lineRule="auto" w:line="360"/>
-              <w:ind w:firstLineChars="200" w:startChars="0" w:start="0" w:endChars="0" w:end="0"/>
-              <w:rPr>
-                <w:kern w:val="0"/>
-                <w:sz w:val="24"/>
-              </w:rPr>
-            </w:pPr>
-            <w:r>
-              <w:rPr>
-                <w:kern w:val="0"/>
-                <w:sz w:val="24"/>
-              </w:rPr>
-              <w:t xml:space="preserve">(1) 防御机制不变量的调研与形式化。针对 stack canary、_FORTIFY_SOURCE、IBT 等机制，从三类来源提炼其安全不变量：一是编译器源码中的注释与断言，如 GCC 中 AArch64 后端关于 canary 槽位置关系的安全注释、ix86 关于 ENDBR 立即数禁止的谓词，以及 LLVM 中 lib/CodeGen/StackProtector 与 X86InstrInfo 等模块的对应实现；二是 GCC、LLVM 自身文档（Clang Command Line Reference、Attribute Reference、CFI Design 等）以及 glibc 与 ABI 文档对开关 flag、_chk 接口、CET ELF property 等的规定；三是已确认的历史 bug 与对应 patch——从修补点反推被违反的不变量。每条不变量按统一字段记录陈述、所属编译器与版本、证据片段、信息源及版本敏感性，便于机械检索与跨版本回归。</w:t>
-            </w:r>
-          </w:p>
-          <w:p>
-            <w:pPr>
-              <w:pStyle w:val="Normal"/>
-              <w:spacing w:lineRule="auto" w:line="360"/>
-              <w:ind w:firstLineChars="200" w:startChars="0" w:start="0" w:endChars="0" w:end="0"/>
-              <w:rPr>
-                <w:kern w:val="0"/>
-                <w:sz w:val="24"/>
-              </w:rPr>
-            </w:pPr>
-            <w:r>
-              <w:rPr>
-                <w:kern w:val="0"/>
-                <w:sz w:val="24"/>
-              </w:rPr>
-              <w:t xml:space="preserve">(2) 不变量到预言机的工程化落地。把 (1) 中的不变量翻译为可在二进制层面或运行行为上判定的检查器。框架将检查器分为静态与动态两类：静态检查通过 ELF 符号、指令流模式、属性 note 做断言式判定；动态检查通过受控执行（如对 buffer 填充长度做二分搜索）观察运行时行为。预言机判据完全建立在二进制和运行行为之上，与产生该二进制的具体编译器解耦，GCC 与 LLVM 产物共用同一套检查器。每个机制配置一个聚合器，任一检查器返回 Fail 即记机制级违例并附带证据；同时为每个机制记录开机制 / 关机制两套 flag profile，框架据此对同一颗种子做对照判定，避免与编译器自身缺省行为混淆。</w:t>
-            </w:r>
-          </w:p>
-          <w:p>
-            <w:pPr>
-              <w:pStyle w:val="Normal"/>
-              <w:spacing w:lineRule="auto" w:line="360"/>
-              <w:ind w:firstLineChars="200" w:startChars="0" w:start="0" w:endChars="0" w:end="0"/>
-              <w:rPr>
-                <w:kern w:val="0"/>
-                <w:sz w:val="24"/>
-              </w:rPr>
-            </w:pPr>
-            <w:r>
-              <w:rPr>
-                <w:kern w:val="0"/>
-                <w:sz w:val="24"/>
-              </w:rPr>
-              <w:t xml:space="preserve">(3) 大模型与覆盖率联合驱动的种子生成。以 GCC 与 LLVM 中防御机制相关代码的源代码覆盖率为目标信号（GCC 侧 gcov，LLVM 侧 SanitizerCoverage / source-based coverage），结合控制流图选取后继最多、当前未覆盖的基本块作为约束求解目标。每轮求解的流程：构造目标上下文（目标函数源码、目标基本块标注、覆盖前驱的种子作为示例），调用大模型生成新 C 种子，编译产物经覆盖率与预言机检查后按三方决策表决定是否进入语料库。种子未命中目标时，通过轻量级调用追踪定位与基线种子的发散点，把发散函数源码作为额外上下文反馈给大模型进入下一轮变异。整个过程把覆盖率推进与安全契约判定统一在同一条主循环中，大模型的生成始终被防御机制相关代码路径所牵引。</w:t>
-            </w:r>
-          </w:p>
-          <w:p>
-            <w:pPr>
-              <w:pStyle w:val="Normal"/>
-              <w:spacing w:lineRule="auto" w:line="360"/>
-              <w:rPr>
-                <w:sz w:val="24"/>
-              </w:rPr>
-            </w:pPr>
-          </w:p>
-          <w:p>
-            <w:pPr>
-              <w:pStyle w:val="Normal"/>
+              <w:spacing w:line="360" w:lineRule="auto"/>
+              <w:rPr>
+                <w:sz w:val="24"/>
+              </w:rPr>
+            </w:pPr>
+          </w:p>
+          <w:p>
+            <w:pPr>
+              <w:spacing w:line="360" w:lineRule="auto"/>
+              <w:ind w:left="0" w:leftChars="0" w:right="0" w:rightChars="0" w:firstLineChars="200"/>
+              <w:rPr>
+                <w:kern w:val="0"/>
+                <w:sz w:val="24"/>
+              </w:rPr>
+            </w:pPr>
+            <w:r>
+              <w:rPr>
+                <w:kern w:val="0"/>
+                <w:sz w:val="24"/>
+              </w:rPr>
+              <w:t>(1) 防御机制不变量的调研与形式化。针对 stack canary、_FORTIFY_SOURCE、IBT 等机制，从三类来源提炼其安全不变量：一是编译器源码中的注释与断言，如 GCC 中 AArch64 后端关于 canary 槽位置关系的安全注释、ix86 关于 ENDBR 立即数禁止的谓词，以及 LLVM 中 lib/CodeGen/StackProtector 与 X86InstrInfo 等模块的对应实现；二是 GCC、LLVM 自身文档（Clang Command Line Reference、Attribute Reference、CFI Design 等）以及 glibc 与 ABI 文档对开关 flag、_chk 接口、CET ELF property 等的规定；三是已确认的历史 bug 与对应 patch——从修补点反推被违反的不变量。每条不变量按统一字段记录陈述、所属编译器与版本、证据片段、信息源及版本敏感性，便于机械检索与跨版本回归。</w:t>
+            </w:r>
+          </w:p>
+          <w:p>
+            <w:pPr>
+              <w:spacing w:line="360" w:lineRule="auto"/>
+              <w:ind w:left="0" w:leftChars="0" w:right="0" w:rightChars="0" w:firstLineChars="200"/>
+              <w:rPr>
+                <w:kern w:val="0"/>
+                <w:sz w:val="24"/>
+              </w:rPr>
+            </w:pPr>
+            <w:r>
+              <w:rPr>
+                <w:kern w:val="0"/>
+                <w:sz w:val="24"/>
+              </w:rPr>
+              <w:t>(2) 不变量到预言机的工程化落地。把 (1) 中的不变量翻译为可在二进制层面或运行行为上判定的检查器。框架将检查器分为静态与动态两类：静态检查通过 ELF 符号、指令流模式、属性 note 做断言式判定；动态检查通过受控执行（如对 buffer 填充长度做二分搜索）观察运行时行为。预言机判据完全建立在二进制和运行行为之上，与产生该二进制的具体编译器解耦，GCC 与 LLVM 产物共用同一套检查器。每个机制配置一个聚合器，任一检查器返回 Fail 即记机制级违例并附带证据；同时为每个机制记录开机制 / 关机制两套 flag profile，框架据此对同一颗种子做对照判定，避免与编译器自身缺省行为混淆。</w:t>
+            </w:r>
+          </w:p>
+          <w:p>
+            <w:pPr>
+              <w:spacing w:line="360" w:lineRule="auto"/>
+              <w:ind w:left="0" w:leftChars="0" w:right="0" w:rightChars="0" w:firstLineChars="200"/>
+              <w:rPr>
+                <w:kern w:val="0"/>
+                <w:sz w:val="24"/>
+              </w:rPr>
+            </w:pPr>
+            <w:r>
+              <w:rPr>
+                <w:kern w:val="0"/>
+                <w:sz w:val="24"/>
+              </w:rPr>
+              <w:t>(3) 大模型与覆盖率联合驱动的种子生成。以 GCC 与 LLVM 中防御机制相关代码的源代码覆盖率为目标信号（GCC 侧 gcov，LLVM 侧 SanitizerCoverage / source-based coverage），结合控制流图选取后继最多、当前未覆盖的基本块作为约束求解目标。每轮求解的流程：构造目标上下文（目标函数源码、目标基本块标注、覆盖前驱的种子作为示例），调用大模型生成新 C 种子，编译产物经覆盖率与预言机检查后按三方决策表决定是否进入语料库。种子未命中目标时，通过轻量级调用追踪定位与基线种子的发散点，把发散函数源码作为额外上下文反馈给大模型进入下一轮变异。整个过程把覆盖率推进与安全契约判定统一在同一条主循环中，大模型的生成始终被防御机制相关代码路径所牵引。</w:t>
+            </w:r>
+          </w:p>
+          <w:p>
+            <w:pPr>
+              <w:spacing w:line="360" w:lineRule="auto"/>
+              <w:rPr>
+                <w:sz w:val="24"/>
+              </w:rPr>
+            </w:pPr>
+          </w:p>
+          <w:p>
+            <w:pPr>
               <w:widowControl/>
-              <w:jc w:val="start"/>
+              <w:jc w:val="left"/>
               <w:rPr>
                 <w:b/>
                 <w:bCs/>
@@ -3065,26 +3187,24 @@
           </w:p>
           <w:p>
             <w:pPr>
-              <w:pStyle w:val="Normal"/>
-              <w:spacing w:lineRule="auto" w:line="360"/>
-              <w:ind w:firstLineChars="200" w:startChars="0" w:start="0" w:endChars="0" w:end="0"/>
-              <w:rPr>
-                <w:kern w:val="0"/>
-                <w:sz w:val="24"/>
-              </w:rPr>
-            </w:pPr>
-            <w:r>
-              <w:rPr>
-                <w:kern w:val="0"/>
-                <w:sz w:val="24"/>
-              </w:rPr>
-              <w:t xml:space="preserve">技术路线分为总体架构、不变量预言机框架、大模型约束求解主循环、跨架构与编译选项调度四部分，对应研究内容 (1)–(3) 的工程实现。GCC 上的初步验证证据见第五章。</w:t>
-            </w:r>
-          </w:p>
-          <w:p>
-            <w:pPr>
-              <w:pStyle w:val="Normal"/>
-              <w:spacing w:lineRule="auto" w:line="360"/>
+              <w:spacing w:line="360" w:lineRule="auto"/>
+              <w:ind w:left="0" w:leftChars="0" w:right="0" w:rightChars="0" w:firstLineChars="200"/>
+              <w:rPr>
+                <w:kern w:val="0"/>
+                <w:sz w:val="24"/>
+              </w:rPr>
+            </w:pPr>
+            <w:r>
+              <w:rPr>
+                <w:kern w:val="0"/>
+                <w:sz w:val="24"/>
+              </w:rPr>
+              <w:t>技术路线分为总体架构、不变量预言机框架、大模型约束求解主循环、跨架构与编译选项调度四部分，对应研究内容 (1)–(3) 的工程实现。GCC 上的初步验证证据见第五章。</w:t>
+            </w:r>
+          </w:p>
+          <w:p>
+            <w:pPr>
+              <w:spacing w:line="360" w:lineRule="auto"/>
               <w:rPr>
                 <w:b/>
                 <w:bCs/>
@@ -3104,33 +3224,30 @@
           </w:p>
           <w:p>
             <w:pPr>
-              <w:pStyle w:val="Normal"/>
-              <w:spacing w:lineRule="auto" w:line="360"/>
-              <w:ind w:firstLineChars="200" w:startChars="0" w:start="0" w:endChars="0" w:end="0"/>
-              <w:rPr>
-                <w:kern w:val="0"/>
-                <w:sz w:val="24"/>
-              </w:rPr>
-            </w:pPr>
-            <w:r>
-              <w:rPr>
-                <w:kern w:val="0"/>
-                <w:sz w:val="24"/>
-              </w:rPr>
-              <w:t xml:space="preserve">系统以一条 fuzz 主循环为骨架，周围由若干子系统支撑（总体结构见图 4）。编译器子系统封装预先插桩的 GCC 与 LLVM 构建：GCC 侧通过 gcov 采集 .gcda 覆盖率数据，LLVM 侧通过 SanitizerCoverage 与 source-based coverage 采集 .profraw 数据，二者经统一接口归并为同构的"行级覆盖 → 种子 ID"映射，主循环对底层编译器无感知。预言机子系统按防御机制聚合不变量检查器，对每颗成功编译的种子做安全契约判定，判据建立在 ELF 二进制与运行行为之上，GCC 与 LLVM 产物共用同一套检查器。提示词子系统按"基础提示词 + 编译器内部知识"两层装配后提交给远端模型；语料库子系统持久化满足质量阈值的种子并维护家系信息；策略调度器把 ISA、编译选项与 flag profile 按四元组下发给编译器和预言机。</w:t>
-            </w:r>
-          </w:p>
-          <w:p>
-            <w:pPr>
-              <w:pStyle w:val="Normal"/>
-              <w:spacing w:lineRule="auto" w:line="360"/>
-              <w:jc w:val="center"/>
-            </w:pPr>
-            <w:r>
-              <w:rPr/>
+              <w:spacing w:line="360" w:lineRule="auto"/>
+              <w:ind w:left="0" w:leftChars="0" w:right="0" w:rightChars="0" w:firstLineChars="200"/>
+              <w:rPr>
+                <w:kern w:val="0"/>
+                <w:sz w:val="24"/>
+              </w:rPr>
+            </w:pPr>
+            <w:r>
+              <w:rPr>
+                <w:kern w:val="0"/>
+                <w:sz w:val="24"/>
+              </w:rPr>
+              <w:t>系统以一条 fuzz 主循环为骨架，周围由若干子系统支撑（总体结构见图 4）。编译器子系统封装预先插桩的 GCC 与 LLVM 构建：GCC 侧通过 gcov 采集 .gcda 覆盖率数据，LLVM 侧通过 SanitizerCoverage 与 source-based coverage 采集 .profraw 数据，二者经统一接口归并为同构的"行级覆盖 → 种子 ID"映射，主循环对底层编译器无感知。预言机子系统按防御机制聚合不变量检查器，对每颗成功编译的种子做安全契约判定，判据建立在 ELF 二进制与运行行为之上，GCC 与 LLVM 产物共用同一套检查器。提示词子系统按"基础提示词 + 编译器内部知识"两层装配后提交给远端模型；语料库子系统持久化满足质量阈值的种子并维护家系信息；策略调度器把 ISA、编译选项与 flag profile 按四元组下发给编译器和预言机。</w:t>
+            </w:r>
+          </w:p>
+          <w:p>
+            <w:pPr>
+              <w:spacing w:line="360" w:lineRule="auto"/>
+              <w:jc w:val="center"/>
+            </w:pPr>
+            <w:r>
               <w:drawing>
-                <wp:inline xmlns:wp="http://schemas.openxmlformats.org/drawingml/2006/wordprocessingDrawing" distT="0" distB="0" distL="0" distR="0">
-                  <wp:extent cx="5385714" cy="2279952"/>
+                <wp:inline distT="0" distB="0" distL="0" distR="0">
+                  <wp:extent cx="5385435" cy="2279650"/>
                   <wp:effectExtent l="0" t="0" r="0" b="0"/>
                   <wp:docPr id="24" name="Figure24"/>
                   <wp:cNvGraphicFramePr>
@@ -3140,11 +3257,13 @@
                     <a:graphicData uri="http://schemas.openxmlformats.org/drawingml/2006/picture">
                       <pic:pic xmlns:pic="http://schemas.openxmlformats.org/drawingml/2006/picture">
                         <pic:nvPicPr>
-                          <pic:cNvPr id="24" name="architecture.png"/>
-                          <pic:cNvPicPr/>
+                          <pic:cNvPr id="24" name="Figure24"/>
+                          <pic:cNvPicPr>
+                            <a:picLocks noChangeAspect="1"/>
+                          </pic:cNvPicPr>
                         </pic:nvPicPr>
                         <pic:blipFill>
-                          <a:blip xmlns:r="http://schemas.openxmlformats.org/officeDocument/2006/relationships" r:embed="rId24"/>
+                          <a:blip r:embed="rId9"/>
                           <a:stretch>
                             <a:fillRect/>
                           </a:stretch>
@@ -3167,8 +3286,7 @@
           </w:p>
           <w:p>
             <w:pPr>
-              <w:pStyle w:val="Normal"/>
-              <w:spacing w:lineRule="auto" w:line="300"/>
+              <w:spacing w:line="300" w:lineRule="auto"/>
               <w:jc w:val="center"/>
               <w:rPr>
                 <w:rFonts w:ascii="宋体" w:hAnsi="宋体" w:eastAsia="宋体"/>
@@ -3187,17 +3305,15 @@
           </w:p>
           <w:p>
             <w:pPr>
-              <w:pStyle w:val="Normal"/>
-              <w:spacing w:lineRule="auto" w:line="360"/>
-              <w:rPr>
-                <w:sz w:val="24"/>
-              </w:rPr>
-            </w:pPr>
-          </w:p>
-          <w:p>
-            <w:pPr>
-              <w:pStyle w:val="Normal"/>
-              <w:spacing w:lineRule="auto" w:line="360"/>
+              <w:spacing w:line="360" w:lineRule="auto"/>
+              <w:rPr>
+                <w:sz w:val="24"/>
+              </w:rPr>
+            </w:pPr>
+          </w:p>
+          <w:p>
+            <w:pPr>
+              <w:spacing w:line="360" w:lineRule="auto"/>
               <w:rPr>
                 <w:b/>
                 <w:bCs/>
@@ -3217,33 +3333,30 @@
           </w:p>
           <w:p>
             <w:pPr>
-              <w:pStyle w:val="Normal"/>
-              <w:spacing w:lineRule="auto" w:line="360"/>
-              <w:ind w:firstLineChars="200" w:startChars="0" w:start="0" w:endChars="0" w:end="0"/>
-              <w:rPr>
-                <w:kern w:val="0"/>
-                <w:sz w:val="24"/>
-              </w:rPr>
-            </w:pPr>
-            <w:r>
-              <w:rPr>
-                <w:kern w:val="0"/>
-                <w:sz w:val="24"/>
-              </w:rPr>
-              <w:t xml:space="preserve">每个机制对应一个聚合器，下挂若干检查器（判定流程见图 5）。检查器分为静态与动态两类：静态检查器读 ELF 符号表、指令字节模式与 .note 段做断言式判定，例如确认间接跳转目标处的 ENDBR 字节、_chk 接口被正确链接；动态检查器通过受控执行观察运行时行为，典型做法是对溢出 buffer 的填充长度做二分搜索，定位 canary 触发的实际边界。每个检查器返回 Pass、Fail、Error 三态，Error 仅用于隔离基础设施故障，不参与机制级判定；聚合时任一 Fail 即视为机制级违例，并把触发证据回写到种子记录。对易与编译器缺省行为混淆的检查器，框架同时跑开机制与关机制两套 flag profile，比对两次判定的差异，确保 Pass / Fail 反映的是机制本身。预言机按种子级缓存复用二分搜索结果与动态符号查询，避免同一颗二进制被多次解析或执行。</w:t>
-            </w:r>
-          </w:p>
-          <w:p>
-            <w:pPr>
-              <w:pStyle w:val="Normal"/>
-              <w:spacing w:lineRule="auto" w:line="360"/>
-              <w:jc w:val="center"/>
-            </w:pPr>
-            <w:r>
-              <w:rPr/>
+              <w:spacing w:line="360" w:lineRule="auto"/>
+              <w:ind w:left="0" w:leftChars="0" w:right="0" w:rightChars="0" w:firstLineChars="200"/>
+              <w:rPr>
+                <w:kern w:val="0"/>
+                <w:sz w:val="24"/>
+              </w:rPr>
+            </w:pPr>
+            <w:r>
+              <w:rPr>
+                <w:kern w:val="0"/>
+                <w:sz w:val="24"/>
+              </w:rPr>
+              <w:t>每个机制对应一个聚合器，下挂若干检查器（判定流程见图 5）。检查器分为静态与动态两类：静态检查器读 ELF 符号表、指令字节模式与 .note 段做断言式判定，例如确认间接跳转目标处的 ENDBR 字节、_chk 接口被正确链接；动态检查器通过受控执行观察运行时行为，典型做法是对溢出 buffer 的填充长度做二分搜索，定位 canary 触发的实际边界。每个检查器返回 Pass、Fail、Error 三态，Error 仅用于隔离基础设施故障，不参与机制级判定；聚合时任一 Fail 即视为机制级违例，并把触发证据回写到种子记录。对易与编译器缺省行为混淆的检查器，框架同时跑开机制与关机制两套 flag profile，比对两次判定的差异，确保 Pass / Fail 反映的是机制本身。预言机按种子级缓存复用二分搜索结果与动态符号查询，避免同一颗二进制被多次解析或执行。</w:t>
+            </w:r>
+          </w:p>
+          <w:p>
+            <w:pPr>
+              <w:spacing w:line="360" w:lineRule="auto"/>
+              <w:jc w:val="center"/>
+            </w:pPr>
+            <w:r>
               <w:drawing>
-                <wp:inline xmlns:wp="http://schemas.openxmlformats.org/drawingml/2006/wordprocessingDrawing" distT="0" distB="0" distL="0" distR="0">
-                  <wp:extent cx="4284090" cy="5606039"/>
+                <wp:inline distT="0" distB="0" distL="0" distR="0">
+                  <wp:extent cx="4283710" cy="5605780"/>
                   <wp:effectExtent l="0" t="0" r="0" b="0"/>
                   <wp:docPr id="25" name="Figure25"/>
                   <wp:cNvGraphicFramePr>
@@ -3253,11 +3366,13 @@
                     <a:graphicData uri="http://schemas.openxmlformats.org/drawingml/2006/picture">
                       <pic:pic xmlns:pic="http://schemas.openxmlformats.org/drawingml/2006/picture">
                         <pic:nvPicPr>
-                          <pic:cNvPr id="25" name="oracle-flow.png"/>
-                          <pic:cNvPicPr/>
+                          <pic:cNvPr id="25" name="Figure25"/>
+                          <pic:cNvPicPr>
+                            <a:picLocks noChangeAspect="1"/>
+                          </pic:cNvPicPr>
                         </pic:nvPicPr>
                         <pic:blipFill>
-                          <a:blip xmlns:r="http://schemas.openxmlformats.org/officeDocument/2006/relationships" r:embed="rId25"/>
+                          <a:blip r:embed="rId10"/>
                           <a:stretch>
                             <a:fillRect/>
                           </a:stretch>
@@ -3280,8 +3395,7 @@
           </w:p>
           <w:p>
             <w:pPr>
-              <w:pStyle w:val="Normal"/>
-              <w:spacing w:lineRule="auto" w:line="300"/>
+              <w:spacing w:line="300" w:lineRule="auto"/>
               <w:jc w:val="center"/>
               <w:rPr>
                 <w:rFonts w:ascii="宋体" w:hAnsi="宋体" w:eastAsia="宋体"/>
@@ -3300,17 +3414,15 @@
           </w:p>
           <w:p>
             <w:pPr>
-              <w:pStyle w:val="Normal"/>
-              <w:spacing w:lineRule="auto" w:line="360"/>
-              <w:rPr>
-                <w:sz w:val="24"/>
-              </w:rPr>
-            </w:pPr>
-          </w:p>
-          <w:p>
-            <w:pPr>
-              <w:pStyle w:val="Normal"/>
-              <w:spacing w:lineRule="auto" w:line="360"/>
+              <w:spacing w:line="360" w:lineRule="auto"/>
+              <w:rPr>
+                <w:sz w:val="24"/>
+              </w:rPr>
+            </w:pPr>
+          </w:p>
+          <w:p>
+            <w:pPr>
+              <w:spacing w:line="360" w:lineRule="auto"/>
               <w:rPr>
                 <w:b/>
                 <w:bCs/>
@@ -3330,33 +3442,30 @@
           </w:p>
           <w:p>
             <w:pPr>
-              <w:pStyle w:val="Normal"/>
-              <w:spacing w:lineRule="auto" w:line="360"/>
-              <w:ind w:firstLineChars="200" w:startChars="0" w:start="0" w:endChars="0" w:end="0"/>
-              <w:rPr>
-                <w:kern w:val="0"/>
-                <w:sz w:val="24"/>
-              </w:rPr>
-            </w:pPr>
-            <w:r>
-              <w:rPr>
-                <w:kern w:val="0"/>
-                <w:sz w:val="24"/>
-              </w:rPr>
-              <w:t xml:space="preserve">主循环输入为当前覆盖率映射与编译器源码控制流图（迭代过程见图 6）。每轮先按"未覆盖且后继分支数最大"策略选取目标基本块，然后构造目标上下文：目标函数源码片段（来自当前所测的 GCC 或 LLVM 版本）、逐行覆盖标注、目标基本块位置，以及覆盖目标前驱的若干种子作为示例。提示词组装层把上下文拼接到基础约束求解提示词与机制契约要求之后，提交给大模型生成新 C 种子。编译失败时把错误信息与上一版源码反馈进入下一轮；编译成功后覆盖率分析器判断是否命中目标，预言机给出安全判定。种子去留由覆盖增量、是否命中目标、是否触发 bug 三方信号决定（三方决策表）。种子未命中目标但带来新覆盖时，轻量级动态追踪定位它与基线种子在调用序列上的首个发散点，把发散函数源码作为额外上下文构造"错题解析"提示词，再次请求模型做精细变异。目标基本块全部覆盖后，主循环可切换到随机变异阶段，仅以预言机为持久化条件继续探索。</w:t>
-            </w:r>
-          </w:p>
-          <w:p>
-            <w:pPr>
-              <w:pStyle w:val="Normal"/>
-              <w:spacing w:lineRule="auto" w:line="360"/>
-              <w:jc w:val="center"/>
-            </w:pPr>
-            <w:r>
-              <w:rPr/>
+              <w:spacing w:line="360" w:lineRule="auto"/>
+              <w:ind w:left="0" w:leftChars="0" w:right="0" w:rightChars="0" w:firstLineChars="200"/>
+              <w:rPr>
+                <w:kern w:val="0"/>
+                <w:sz w:val="24"/>
+              </w:rPr>
+            </w:pPr>
+            <w:r>
+              <w:rPr>
+                <w:kern w:val="0"/>
+                <w:sz w:val="24"/>
+              </w:rPr>
+              <w:t>主循环输入为当前覆盖率映射与编译器源码控制流图（迭代过程见图 6）。每轮先按"未覆盖且后继分支数最大"策略选取目标基本块，然后构造目标上下文：目标函数源码片段（来自当前所测的 GCC 或 LLVM 版本）、逐行覆盖标注、目标基本块位置，以及覆盖目标前驱的若干种子作为示例。提示词组装层把上下文拼接到基础约束求解提示词与机制契约要求之后，提交给大模型生成新 C 种子。编译失败时把错误信息与上一版源码反馈进入下一轮；编译成功后覆盖率分析器判断是否命中目标，预言机给出安全判定。种子去留由覆盖增量、是否命中目标、是否触发 bug 三方信号决定（三方决策表）。种子未命中目标但带来新覆盖时，轻量级动态追踪定位它与基线种子在调用序列上的首个发散点，把发散函数源码作为额外上下文构造"错题解析"提示词，再次请求模型做精细变异。目标基本块全部覆盖后，主循环可切换到随机变异阶段，仅以预言机为持久化条件继续探索。</w:t>
+            </w:r>
+          </w:p>
+          <w:p>
+            <w:pPr>
+              <w:spacing w:line="360" w:lineRule="auto"/>
+              <w:jc w:val="center"/>
+            </w:pPr>
+            <w:r>
               <w:drawing>
-                <wp:inline xmlns:wp="http://schemas.openxmlformats.org/drawingml/2006/wordprocessingDrawing" distT="0" distB="0" distL="0" distR="0">
-                  <wp:extent cx="3664949" cy="6725183"/>
+                <wp:inline distT="0" distB="0" distL="0" distR="0">
+                  <wp:extent cx="3664585" cy="6724650"/>
                   <wp:effectExtent l="0" t="0" r="0" b="0"/>
                   <wp:docPr id="26" name="Figure26"/>
                   <wp:cNvGraphicFramePr>
@@ -3366,11 +3475,13 @@
                     <a:graphicData uri="http://schemas.openxmlformats.org/drawingml/2006/picture">
                       <pic:pic xmlns:pic="http://schemas.openxmlformats.org/drawingml/2006/picture">
                         <pic:nvPicPr>
-                          <pic:cNvPr id="26" name="main-loop.png"/>
-                          <pic:cNvPicPr/>
+                          <pic:cNvPr id="26" name="Figure26"/>
+                          <pic:cNvPicPr>
+                            <a:picLocks noChangeAspect="1"/>
+                          </pic:cNvPicPr>
                         </pic:nvPicPr>
                         <pic:blipFill>
-                          <a:blip xmlns:r="http://schemas.openxmlformats.org/officeDocument/2006/relationships" r:embed="rId26"/>
+                          <a:blip r:embed="rId11"/>
                           <a:stretch>
                             <a:fillRect/>
                           </a:stretch>
@@ -3393,8 +3504,7 @@
           </w:p>
           <w:p>
             <w:pPr>
-              <w:pStyle w:val="Normal"/>
-              <w:spacing w:lineRule="auto" w:line="300"/>
+              <w:spacing w:line="300" w:lineRule="auto"/>
               <w:jc w:val="center"/>
               <w:rPr>
                 <w:rFonts w:ascii="宋体" w:hAnsi="宋体" w:eastAsia="宋体"/>
@@ -3413,17 +3523,15 @@
           </w:p>
           <w:p>
             <w:pPr>
-              <w:pStyle w:val="Normal"/>
-              <w:spacing w:lineRule="auto" w:line="360"/>
-              <w:rPr>
-                <w:sz w:val="24"/>
-              </w:rPr>
-            </w:pPr>
-          </w:p>
-          <w:p>
-            <w:pPr>
-              <w:pStyle w:val="Normal"/>
-              <w:spacing w:lineRule="auto" w:line="360"/>
+              <w:spacing w:line="360" w:lineRule="auto"/>
+              <w:rPr>
+                <w:sz w:val="24"/>
+              </w:rPr>
+            </w:pPr>
+          </w:p>
+          <w:p>
+            <w:pPr>
+              <w:spacing w:line="360" w:lineRule="auto"/>
               <w:rPr>
                 <w:b/>
                 <w:bCs/>
@@ -3443,27 +3551,25 @@
           </w:p>
           <w:p>
             <w:pPr>
-              <w:pStyle w:val="Normal"/>
-              <w:spacing w:lineRule="auto" w:line="360"/>
-              <w:ind w:firstLineChars="200" w:startChars="0" w:start="0" w:endChars="0" w:end="0"/>
-              <w:rPr>
-                <w:kern w:val="0"/>
-                <w:sz w:val="24"/>
-              </w:rPr>
-            </w:pPr>
-            <w:r>
-              <w:rPr>
-                <w:kern w:val="0"/>
-                <w:sz w:val="24"/>
-              </w:rPr>
-              <w:t xml:space="preserve">编译命令被参数化为编译器（GCC / LLVM）、ISA、架构相关 flag、策略相关 flag profile 四元组，同一份种子按四元组分发给不同工具链，目标二进制通过 QEMU 用户态执行。flag profile 同时包含开机制（如 -fstack-protector-strong）与关机制（如 -fno-stack-protector）两套，预言机据此对同一颗种子做对照判定；关机制产物仅用于交叉验证，不进入主语料库。GCC 与 LLVM 在防御机制 flag 拼写上的差异（如 -fcf-protection 对 -fsanitize=cfi）由 FlagScheduler 统一抽象为"机制级"配置，向上层屏蔽。BinaryInspector 屏蔽 ISA 差异：通过 Go 标准库读取 ELF 符号表与 .note 段，为检查器提供导入函数列表、ENDBR 字节模式扫描、栈布局采样等能力。</w:t>
-            </w:r>
-          </w:p>
-          <w:p>
-            <w:pPr>
-              <w:pStyle w:val="Normal"/>
+              <w:spacing w:line="360" w:lineRule="auto"/>
+              <w:ind w:left="0" w:leftChars="0" w:right="0" w:rightChars="0" w:firstLineChars="200"/>
+              <w:rPr>
+                <w:kern w:val="0"/>
+                <w:sz w:val="24"/>
+              </w:rPr>
+            </w:pPr>
+            <w:r>
+              <w:rPr>
+                <w:kern w:val="0"/>
+                <w:sz w:val="24"/>
+              </w:rPr>
+              <w:t>编译命令被参数化为编译器（GCC / LLVM）、ISA、架构相关 flag、策略相关 flag profile 四元组，同一份种子按四元组分发给不同工具链，目标二进制通过 QEMU 用户态执行。flag profile 同时包含开机制（如 -fstack-protector-strong）与关机制（如 -fno-stack-protector）两套，预言机据此对同一颗种子做对照判定；关机制产物仅用于交叉验证，不进入主语料库。GCC 与 LLVM 在防御机制 flag 拼写上的差异（如 -fcf-protection 对 -fsanitize=cfi）由 FlagScheduler 统一抽象为"机制级"配置，向上层屏蔽。BinaryInspector 屏蔽 ISA 差异：通过 Go 标准库读取 ELF 符号表与 .note 段，为检查器提供导入函数列表、ENDBR 字节模式扫描、栈布局采样等能力。</w:t>
+            </w:r>
+          </w:p>
+          <w:p>
+            <w:pPr>
               <w:widowControl/>
-              <w:jc w:val="start"/>
+              <w:jc w:val="left"/>
               <w:rPr>
                 <w:b/>
                 <w:bCs/>
@@ -3483,26 +3589,24 @@
           </w:p>
           <w:p>
             <w:pPr>
-              <w:pStyle w:val="Normal"/>
-              <w:spacing w:lineRule="auto" w:line="360"/>
-              <w:ind w:firstLineChars="200" w:startChars="0" w:start="0" w:endChars="0" w:end="0"/>
-              <w:rPr>
-                <w:kern w:val="0"/>
-                <w:sz w:val="24"/>
-              </w:rPr>
-            </w:pPr>
-            <w:r>
-              <w:rPr>
-                <w:kern w:val="0"/>
-                <w:sz w:val="24"/>
-              </w:rPr>
-              <w:t xml:space="preserve">目前已在 GCC 多个版本（若干稳定版与一个本地构建的 master 快照）上对栈金丝雀、_FORTIFY_SOURCE、IBT 等部分防御机制做了实验，LLVM 侧同类实验纳入下一阶段。已完成实验共发现 3 例可被上游确认的 silent failure；下文展开其中两例，第三例（栈金丝雀在若干 fallback ISA 上 epilogue 残留寄存器未清零，与 PR-96191 同源）篇幅较短，在 5.3 节简述。</w:t>
-            </w:r>
-          </w:p>
-          <w:p>
-            <w:pPr>
-              <w:pStyle w:val="Normal"/>
-              <w:spacing w:lineRule="auto" w:line="360"/>
+              <w:spacing w:line="360" w:lineRule="auto"/>
+              <w:ind w:left="0" w:leftChars="0" w:right="0" w:rightChars="0" w:firstLineChars="200"/>
+              <w:rPr>
+                <w:kern w:val="0"/>
+                <w:sz w:val="24"/>
+              </w:rPr>
+            </w:pPr>
+            <w:r>
+              <w:rPr>
+                <w:kern w:val="0"/>
+                <w:sz w:val="24"/>
+              </w:rPr>
+              <w:t>目前已在 GCC 多个版本（若干稳定版与一个本地构建的 master 快照）上对栈金丝雀、_FORTIFY_SOURCE、IBT 等部分防御机制做了实验，LLVM 侧同类实验纳入下一阶段。已完成实验共发现 3 例可被上游确认的 silent failure；下文展开其中两例，第三例（栈金丝雀在若干 fallback ISA 上 epilogue 残留寄存器未清零，与 PR-96191 同源）篇幅较短，在 5.3 节简述。</w:t>
+            </w:r>
+          </w:p>
+          <w:p>
+            <w:pPr>
+              <w:spacing w:line="360" w:lineRule="auto"/>
               <w:rPr>
                 <w:b/>
                 <w:bCs/>
@@ -3522,69 +3626,64 @@
           </w:p>
           <w:p>
             <w:pPr>
-              <w:pStyle w:val="Normal"/>
-              <w:spacing w:lineRule="auto" w:line="360"/>
-              <w:ind w:firstLineChars="200" w:startChars="0" w:start="0" w:endChars="0" w:end="0"/>
-              <w:rPr>
-                <w:kern w:val="0"/>
-                <w:sz w:val="24"/>
-              </w:rPr>
-            </w:pPr>
-            <w:r>
-              <w:rPr>
-                <w:kern w:val="0"/>
-                <w:sz w:val="24"/>
-              </w:rPr>
-              <w:t xml:space="preserve">_FORTIFY_SOURCE 是 GCC 与 glibc 配合的源代码加固机制。开启后，glibc 头文件在预处理阶段把 strcat 等危险接口重写为带 size 参数的 __strcat_chk，运行时据此检查目的缓冲区上限。GCC 的 strlen pass 进一步识别已知前缀长度的目的指针，将 __strcat_chk 改写为性能更优的 __stpcpy_chk，并把目的指针前移 strlen(dst) 字节。这里的安全不变量是：目的指针前移后，传给 __stpcpy_chk 的 size 参数必须由原始 objsize 减去 strlen(dst)，否则运行时上限就被静默放宽 strlen(dst) 字节。</w:t>
-            </w:r>
-          </w:p>
-          <w:p>
-            <w:pPr>
-              <w:pStyle w:val="Normal"/>
-              <w:spacing w:lineRule="auto" w:line="360"/>
-              <w:ind w:firstLineChars="200" w:startChars="0" w:start="0" w:endChars="0" w:end="0"/>
-              <w:rPr>
-                <w:kern w:val="0"/>
-                <w:sz w:val="24"/>
-              </w:rPr>
-            </w:pPr>
-            <w:r>
-              <w:rPr>
-                <w:kern w:val="0"/>
-                <w:sz w:val="24"/>
-              </w:rPr>
-              <w:t xml:space="preserve">实测中，本方法构造的种子在该路径上稳定触发了 size 参数未相应减小的实例。反汇编层面 strcat → __strcat_chk → __stpcpy_chk 整条链条仍然出现，看似 FORTIFY 仍在生效，但"按 dst 剩余空间收紧上限"那一步已被丢弃。该缺陷自 GCC 4.7 起存在，跨越十余年未被发现；上报后已被确认并合入主分支，预计随 GCC 16.1 发布，开发团队同时计划向 GCC 13、14、15 回送补丁。这条路径与 2018 年的 PR-87672 处于同一文件：当年的修复只覆盖了一个对称分支，另一支被遗漏至今——这本身就是第一章所述"矩阵同源遗漏"的又一例证。</w:t>
-            </w:r>
-          </w:p>
-          <w:p>
-            <w:pPr>
-              <w:pStyle w:val="Normal"/>
-              <w:spacing w:lineRule="auto" w:line="360"/>
-              <w:ind w:firstLineChars="200" w:startChars="0" w:start="0" w:endChars="0" w:end="0"/>
-              <w:rPr>
-                <w:kern w:val="0"/>
-                <w:sz w:val="24"/>
-              </w:rPr>
-            </w:pPr>
-            <w:r>
-              <w:rPr>
-                <w:kern w:val="0"/>
-                <w:sz w:val="24"/>
-              </w:rPr>
-              <w:t xml:space="preserve">预言机方面，本例命中"FORTIFY 调用点的 size 参数下界推断"不变量，证据为静态符号 + 反汇编，在静态阶段判定；该优化路径与 size 静默放宽的位置见图 7。</w:t>
-            </w:r>
-          </w:p>
-          <w:p>
-            <w:pPr>
-              <w:pStyle w:val="Normal"/>
-              <w:spacing w:lineRule="auto" w:line="360"/>
-              <w:jc w:val="center"/>
-            </w:pPr>
-            <w:r>
-              <w:rPr/>
+              <w:spacing w:line="360" w:lineRule="auto"/>
+              <w:ind w:left="0" w:leftChars="0" w:right="0" w:rightChars="0" w:firstLineChars="200"/>
+              <w:rPr>
+                <w:kern w:val="0"/>
+                <w:sz w:val="24"/>
+              </w:rPr>
+            </w:pPr>
+            <w:r>
+              <w:rPr>
+                <w:kern w:val="0"/>
+                <w:sz w:val="24"/>
+              </w:rPr>
+              <w:t>_FORTIFY_SOURCE 是 GCC 与 glibc 配合的源代码加固机制。开启后，glibc 头文件在预处理阶段把 strcat 等危险接口重写为带 size 参数的 __strcat_chk，运行时据此检查目的缓冲区上限。GCC 的 strlen pass 进一步识别已知前缀长度的目的指针，将 __strcat_chk 改写为性能更优的 __stpcpy_chk，并把目的指针前移 strlen(dst) 字节。这里的安全不变量是：目的指针前移后，传给 __stpcpy_chk 的 size 参数必须由原始 objsize 减去 strlen(dst)，否则运行时上限就被静默放宽 strlen(dst) 字节。</w:t>
+            </w:r>
+          </w:p>
+          <w:p>
+            <w:pPr>
+              <w:spacing w:line="360" w:lineRule="auto"/>
+              <w:ind w:left="0" w:leftChars="0" w:right="0" w:rightChars="0" w:firstLineChars="200"/>
+              <w:rPr>
+                <w:kern w:val="0"/>
+                <w:sz w:val="24"/>
+              </w:rPr>
+            </w:pPr>
+            <w:r>
+              <w:rPr>
+                <w:kern w:val="0"/>
+                <w:sz w:val="24"/>
+              </w:rPr>
+              <w:t>实测中，本方法构造的种子在该路径上稳定触发了 size 参数未相应减小的实例。反汇编层面 strcat → __strcat_chk → __stpcpy_chk 整条链条仍然出现，看似 FORTIFY 仍在生效，但"按 dst 剩余空间收紧上限"那一步已被丢弃。该缺陷自 GCC 4.7 起存在，跨越十余年未被发现；上报后已被确认并合入主分支，预计随 GCC 16.1 发布，开发团队同时计划向 GCC 13、14、15 回送补丁。这条路径与 2018 年的 PR-87672 处于同一文件：当年的修复只覆盖了一个对称分支，另一支被遗漏至今——这本身就是第一章所述"矩阵同源遗漏"的又一例证。</w:t>
+            </w:r>
+          </w:p>
+          <w:p>
+            <w:pPr>
+              <w:spacing w:line="360" w:lineRule="auto"/>
+              <w:ind w:left="0" w:leftChars="0" w:right="0" w:rightChars="0" w:firstLineChars="200"/>
+              <w:rPr>
+                <w:kern w:val="0"/>
+                <w:sz w:val="24"/>
+              </w:rPr>
+            </w:pPr>
+            <w:r>
+              <w:rPr>
+                <w:kern w:val="0"/>
+                <w:sz w:val="24"/>
+              </w:rPr>
+              <w:t>预言机方面，本例命中"FORTIFY 调用点的 size 参数下界推断"不变量，证据为静态符号 + 反汇编，在静态阶段判定；该优化路径与 size 静默放宽的位置见图 7。</w:t>
+            </w:r>
+          </w:p>
+          <w:p>
+            <w:pPr>
+              <w:spacing w:line="360" w:lineRule="auto"/>
+              <w:jc w:val="center"/>
+            </w:pPr>
+            <w:r>
               <w:drawing>
-                <wp:inline xmlns:wp="http://schemas.openxmlformats.org/drawingml/2006/wordprocessingDrawing" distT="0" distB="0" distL="0" distR="0">
-                  <wp:extent cx="4284090" cy="6361875"/>
+                <wp:inline distT="0" distB="0" distL="0" distR="0">
+                  <wp:extent cx="4283710" cy="6361430"/>
                   <wp:effectExtent l="0" t="0" r="0" b="0"/>
                   <wp:docPr id="27" name="Figure27"/>
                   <wp:cNvGraphicFramePr>
@@ -3594,11 +3693,13 @@
                     <a:graphicData uri="http://schemas.openxmlformats.org/drawingml/2006/picture">
                       <pic:pic xmlns:pic="http://schemas.openxmlformats.org/drawingml/2006/picture">
                         <pic:nvPicPr>
-                          <pic:cNvPr id="27" name="fortify-path.png"/>
-                          <pic:cNvPicPr/>
+                          <pic:cNvPr id="27" name="Figure27"/>
+                          <pic:cNvPicPr>
+                            <a:picLocks noChangeAspect="1"/>
+                          </pic:cNvPicPr>
                         </pic:nvPicPr>
                         <pic:blipFill>
-                          <a:blip xmlns:r="http://schemas.openxmlformats.org/officeDocument/2006/relationships" r:embed="rId27"/>
+                          <a:blip r:embed="rId12"/>
                           <a:stretch>
                             <a:fillRect/>
                           </a:stretch>
@@ -3621,8 +3722,7 @@
           </w:p>
           <w:p>
             <w:pPr>
-              <w:pStyle w:val="Normal"/>
-              <w:spacing w:lineRule="auto" w:line="300"/>
+              <w:spacing w:line="300" w:lineRule="auto"/>
               <w:jc w:val="center"/>
               <w:rPr>
                 <w:rFonts w:ascii="宋体" w:hAnsi="宋体" w:eastAsia="宋体"/>
@@ -3641,17 +3741,15 @@
           </w:p>
           <w:p>
             <w:pPr>
-              <w:pStyle w:val="Normal"/>
-              <w:spacing w:lineRule="auto" w:line="360"/>
-              <w:rPr>
-                <w:sz w:val="24"/>
-              </w:rPr>
-            </w:pPr>
-          </w:p>
-          <w:p>
-            <w:pPr>
-              <w:pStyle w:val="Normal"/>
-              <w:spacing w:lineRule="auto" w:line="360"/>
+              <w:spacing w:line="360" w:lineRule="auto"/>
+              <w:rPr>
+                <w:sz w:val="24"/>
+              </w:rPr>
+            </w:pPr>
+          </w:p>
+          <w:p>
+            <w:pPr>
+              <w:spacing w:line="360" w:lineRule="auto"/>
               <w:rPr>
                 <w:b/>
                 <w:bCs/>
@@ -3671,62 +3769,58 @@
           </w:p>
           <w:p>
             <w:pPr>
-              <w:pStyle w:val="Normal"/>
-              <w:spacing w:lineRule="auto" w:line="360"/>
-              <w:ind w:firstLineChars="200" w:startChars="0" w:start="0" w:endChars="0" w:end="0"/>
-              <w:rPr>
-                <w:kern w:val="0"/>
-                <w:sz w:val="24"/>
-              </w:rPr>
-            </w:pPr>
-            <w:r>
-              <w:rPr>
-                <w:kern w:val="0"/>
-                <w:sz w:val="24"/>
-              </w:rPr>
-              <w:t xml:space="preserve">IBT（Indirect Branch Tracking）是 Intel CET 中针对间接跳转的保护机制：硬件要求间接跳转或调用的目标地址必须以 endbr 指令开头，否则触发异常。endbr 在二进制中是固定的四字节值（endbr64 = F3 0F 1E FA、endbr32 = F3 0F 1E FB），按设计只应作为合法间接跳转入口出现在代码段。如果这四个字节以其他形式出现——比如作为 movabsq 指令的 64 位立即数的一部分嵌入 .text——攻击者就可以把控制流劫持到该处，硬件会将其识别为合法 landing pad，IBT 语义被绕过。</w:t>
-            </w:r>
-          </w:p>
-          <w:p>
-            <w:pPr>
-              <w:pStyle w:val="Normal"/>
-              <w:spacing w:lineRule="auto" w:line="360"/>
-              <w:ind w:firstLineChars="200" w:startChars="0" w:start="0" w:endChars="0" w:end="0"/>
-              <w:rPr>
-                <w:kern w:val="0"/>
-                <w:sz w:val="24"/>
-              </w:rPr>
-            </w:pPr>
-            <w:r>
-              <w:rPr>
-                <w:kern w:val="0"/>
-                <w:sz w:val="24"/>
-              </w:rPr>
-              <w:t xml:space="preserve">GCC 在 x86 后端用 ix86_endbr_immediate_operand 谓词做字节级检测：当目标启用 IBT 时，谓词扫描立即数中是否存在 endbr 模式，含该模式的立即数会被拒绝。本方法在该谓词实现中发现一个逻辑漏洞：扫描循环对"高位非零"的 64 位立即数提前退出，只要 endbr 字节排布在立即数高位，扫描就走不到对应位置。这类立即数被错误接受，进而在 .text 中嵌入了不受控的伪 landing pad。该缺陷已上报上游，等待维护者回复。</w:t>
-            </w:r>
-          </w:p>
-          <w:p>
-            <w:pPr>
-              <w:pStyle w:val="Normal"/>
-              <w:spacing w:lineRule="auto" w:line="360"/>
-              <w:ind w:firstLineChars="200" w:startChars="0" w:start="0" w:endChars="0" w:end="0"/>
-              <w:rPr>
-                <w:kern w:val="0"/>
-                <w:sz w:val="24"/>
-              </w:rPr>
-            </w:pPr>
-            <w:r>
-              <w:rPr>
-                <w:kern w:val="0"/>
-                <w:sz w:val="24"/>
-              </w:rPr>
-              <w:t xml:space="preserve">预言机方面，本例命中"endbr 字节模式不应出现在非跳转目标的指令中"不变量，证据为代码段内 endbr 模式扫描，属静态指令流检查。</w:t>
-            </w:r>
-          </w:p>
-          <w:p>
-            <w:pPr>
-              <w:pStyle w:val="Normal"/>
-              <w:spacing w:lineRule="auto" w:line="360"/>
+              <w:spacing w:line="360" w:lineRule="auto"/>
+              <w:ind w:left="0" w:leftChars="0" w:right="0" w:rightChars="0" w:firstLineChars="200"/>
+              <w:rPr>
+                <w:kern w:val="0"/>
+                <w:sz w:val="24"/>
+              </w:rPr>
+            </w:pPr>
+            <w:r>
+              <w:rPr>
+                <w:kern w:val="0"/>
+                <w:sz w:val="24"/>
+              </w:rPr>
+              <w:t>IBT（Indirect Branch Tracking）是 Intel CET 中针对间接跳转的保护机制：硬件要求间接跳转或调用的目标地址必须以 endbr 指令开头，否则触发异常。endbr 在二进制中是固定的四字节值（endbr64 = F3 0F 1E FA、endbr32 = F3 0F 1E FB），按设计只应作为合法间接跳转入口出现在代码段。如果这四个字节以其他形式出现——比如作为 movabsq 指令的 64 位立即数的一部分嵌入 .text——攻击者就可以把控制流劫持到该处，硬件会将其识别为合法 landing pad，IBT 语义被绕过。</w:t>
+            </w:r>
+          </w:p>
+          <w:p>
+            <w:pPr>
+              <w:spacing w:line="360" w:lineRule="auto"/>
+              <w:ind w:left="0" w:leftChars="0" w:right="0" w:rightChars="0" w:firstLineChars="200"/>
+              <w:rPr>
+                <w:kern w:val="0"/>
+                <w:sz w:val="24"/>
+              </w:rPr>
+            </w:pPr>
+            <w:r>
+              <w:rPr>
+                <w:kern w:val="0"/>
+                <w:sz w:val="24"/>
+              </w:rPr>
+              <w:t>GCC 在 x86 后端用 ix86_endbr_immediate_operand 谓词做字节级检测：当目标启用 IBT 时，谓词扫描立即数中是否存在 endbr 模式，含该模式的立即数会被拒绝。本方法在该谓词实现中发现一个逻辑漏洞：扫描循环对"高位非零"的 64 位立即数提前退出，只要 endbr 字节排布在立即数高位，扫描就走不到对应位置。这类立即数被错误接受，进而在 .text 中嵌入了不受控的伪 landing pad。该缺陷已上报上游，等待维护者回复。</w:t>
+            </w:r>
+          </w:p>
+          <w:p>
+            <w:pPr>
+              <w:spacing w:line="360" w:lineRule="auto"/>
+              <w:ind w:left="0" w:leftChars="0" w:right="0" w:rightChars="0" w:firstLineChars="200"/>
+              <w:rPr>
+                <w:kern w:val="0"/>
+                <w:sz w:val="24"/>
+              </w:rPr>
+            </w:pPr>
+            <w:r>
+              <w:rPr>
+                <w:kern w:val="0"/>
+                <w:sz w:val="24"/>
+              </w:rPr>
+              <w:t>预言机方面，本例命中"endbr 字节模式不应出现在非跳转目标的指令中"不变量，证据为代码段内 endbr 模式扫描，属静态指令流检查。</w:t>
+            </w:r>
+          </w:p>
+          <w:p>
+            <w:pPr>
+              <w:spacing w:line="360" w:lineRule="auto"/>
               <w:rPr>
                 <w:b/>
                 <w:bCs/>
@@ -3746,26 +3840,24 @@
           </w:p>
           <w:p>
             <w:pPr>
-              <w:pStyle w:val="Normal"/>
-              <w:spacing w:lineRule="auto" w:line="360"/>
-              <w:ind w:firstLineChars="200" w:startChars="0" w:start="0" w:endChars="0" w:end="0"/>
-              <w:rPr>
-                <w:kern w:val="0"/>
-                <w:sz w:val="24"/>
-              </w:rPr>
-            </w:pPr>
-            <w:r>
-              <w:rPr>
-                <w:kern w:val="0"/>
-                <w:sz w:val="24"/>
-              </w:rPr>
-              <w:t xml:space="preserve">本方法在 GCC 通用栈保护后端的 fallback 路径上还找到一例同类失效：MIPS、LoongArch、Xtensa、CSKY 等 ISA 的 fallback 后端未提供专用 epilogue 模板，函数返回时金丝雀寄存器未显式清零，进程级 __stack_chk_guard 值在调用者的可见寄存器中残留。该问题与 2020 年针对 AArch64 / ARM 的 PR-96191 同源，当年修复未覆盖上述后端。缺陷已上报并被确认、合入修复。</w:t>
-            </w:r>
-          </w:p>
-          <w:p>
-            <w:pPr>
-              <w:pStyle w:val="Normal"/>
-              <w:spacing w:lineRule="auto" w:line="360"/>
+              <w:spacing w:line="360" w:lineRule="auto"/>
+              <w:ind w:left="0" w:leftChars="0" w:right="0" w:rightChars="0" w:firstLineChars="200"/>
+              <w:rPr>
+                <w:kern w:val="0"/>
+                <w:sz w:val="24"/>
+              </w:rPr>
+            </w:pPr>
+            <w:r>
+              <w:rPr>
+                <w:kern w:val="0"/>
+                <w:sz w:val="24"/>
+              </w:rPr>
+              <w:t>本方法在 GCC 通用栈保护后端的 fallback 路径上还找到一例同类失效：MIPS、LoongArch、Xtensa、CSKY 等 ISA 的 fallback 后端未提供专用 epilogue 模板，函数返回时金丝雀寄存器未显式清零，进程级 __stack_chk_guard 值在调用者的可见寄存器中残留。该问题与 2020 年针对 AArch64 / ARM 的 PR-96191 同源，当年修复未覆盖上述后端。缺陷已上报并被确认、合入修复。</w:t>
+            </w:r>
+          </w:p>
+          <w:p>
+            <w:pPr>
+              <w:spacing w:line="360" w:lineRule="auto"/>
               <w:rPr>
                 <w:b/>
                 <w:bCs/>
@@ -3785,27 +3877,25 @@
           </w:p>
           <w:p>
             <w:pPr>
-              <w:pStyle w:val="Normal"/>
-              <w:spacing w:lineRule="auto" w:line="360"/>
-              <w:ind w:firstLineChars="200" w:startChars="0" w:start="0" w:endChars="0" w:end="0"/>
-              <w:rPr>
-                <w:kern w:val="0"/>
-                <w:sz w:val="24"/>
-              </w:rPr>
-            </w:pPr>
-            <w:r>
-              <w:rPr>
-                <w:kern w:val="0"/>
-                <w:sz w:val="24"/>
-              </w:rPr>
-              <w:t xml:space="preserve">三例分别覆盖静态符号、动态行为、指令流字节模式三类不变量形态，共同特征是：二进制看起来带有保护，但编译器代码路径某一处的安全不变量已失去维护。方法在不修改编译器的前提下，通过约束求解与不变量预言机组合把这类差异在自动化流程中暴露出来。LLVM 侧实验预计在后续阶段以同一预言机框架补全。</w:t>
-            </w:r>
-          </w:p>
-          <w:p>
-            <w:pPr>
-              <w:pStyle w:val="Normal"/>
+              <w:spacing w:line="360" w:lineRule="auto"/>
+              <w:ind w:left="0" w:leftChars="0" w:right="0" w:rightChars="0" w:firstLineChars="200"/>
+              <w:rPr>
+                <w:kern w:val="0"/>
+                <w:sz w:val="24"/>
+              </w:rPr>
+            </w:pPr>
+            <w:r>
+              <w:rPr>
+                <w:kern w:val="0"/>
+                <w:sz w:val="24"/>
+              </w:rPr>
+              <w:t>三例分别覆盖静态符号、动态行为、指令流字节模式三类不变量形态，共同特征是：二进制看起来带有保护，但编译器代码路径某一处的安全不变量已失去维护。方法在不修改编译器的前提下，通过约束求解与不变量预言机组合把这类差异在自动化流程中暴露出来。LLVM 侧实验预计在后续阶段以同一预言机框架补全。</w:t>
+            </w:r>
+          </w:p>
+          <w:p>
+            <w:pPr>
               <w:widowControl/>
-              <w:jc w:val="start"/>
+              <w:jc w:val="left"/>
               <w:rPr>
                 <w:b/>
                 <w:bCs/>
@@ -3825,274 +3915,258 @@
           </w:p>
           <w:p>
             <w:pPr>
-              <w:pStyle w:val="Normal"/>
-              <w:spacing w:lineRule="auto" w:line="360"/>
-              <w:rPr>
-                <w:kern w:val="0"/>
-                <w:sz w:val="24"/>
-              </w:rPr>
-            </w:pPr>
-            <w:r>
-              <w:rPr>
-                <w:kern w:val="0"/>
-                <w:sz w:val="24"/>
-              </w:rPr>
-              <w:t xml:space="preserve">[1] Yang X, Chen Y, Eide E, et al. Finding and understanding bugs in C compilers[C]//Proceedings of the 32nd ACM SIGPLAN Conference on Programming Language Design and Implementation (PLDI). 2011: 283-294.</w:t>
-            </w:r>
-          </w:p>
-          <w:p>
-            <w:pPr>
-              <w:pStyle w:val="Normal"/>
-              <w:spacing w:lineRule="auto" w:line="360"/>
-              <w:rPr>
-                <w:kern w:val="0"/>
-                <w:sz w:val="24"/>
-              </w:rPr>
-            </w:pPr>
-            <w:r>
-              <w:rPr>
-                <w:kern w:val="0"/>
-                <w:sz w:val="24"/>
-              </w:rPr>
-              <w:t xml:space="preserve">[2] Livinskii V, Babokin D, Regehr J. Random testing for C and C++ compilers with YARPGen[C]//Proceedings of the ACM on Programming Languages (OOPSLA). 2020, 4: 1-25.</w:t>
-            </w:r>
-          </w:p>
-          <w:p>
-            <w:pPr>
-              <w:pStyle w:val="Normal"/>
-              <w:spacing w:lineRule="auto" w:line="360"/>
-              <w:rPr>
-                <w:kern w:val="0"/>
-                <w:sz w:val="24"/>
-              </w:rPr>
-            </w:pPr>
-            <w:r>
-              <w:rPr>
-                <w:kern w:val="0"/>
-                <w:sz w:val="24"/>
-              </w:rPr>
-              <w:t xml:space="preserve">[3] Zalewski M. American Fuzzy Lop (AFL)[EB/OL]. (2014)[2026-02-15]. https://lcamtuf.coredump.cx/afl/.</w:t>
-            </w:r>
-          </w:p>
-          <w:p>
-            <w:pPr>
-              <w:pStyle w:val="Normal"/>
-              <w:spacing w:lineRule="auto" w:line="360"/>
-              <w:rPr>
-                <w:kern w:val="0"/>
-                <w:sz w:val="24"/>
-              </w:rPr>
-            </w:pPr>
-            <w:r>
-              <w:rPr>
-                <w:kern w:val="0"/>
-                <w:sz w:val="24"/>
-              </w:rPr>
-              <w:t xml:space="preserve">[4] Serebryany K. Continuous fuzzing with libFuzzer and AddressSanitizer[C]//IEEE Cybersecurity Development (SecDev). 2016: 157.</w:t>
-            </w:r>
-          </w:p>
-          <w:p>
-            <w:pPr>
-              <w:pStyle w:val="Normal"/>
-              <w:spacing w:lineRule="auto" w:line="360"/>
-              <w:rPr>
-                <w:kern w:val="0"/>
-                <w:sz w:val="24"/>
-              </w:rPr>
-            </w:pPr>
-            <w:r>
-              <w:rPr>
-                <w:kern w:val="0"/>
-                <w:sz w:val="24"/>
-              </w:rPr>
-              <w:t xml:space="preserve">[5] Yang C, Deng Y, Lu R, et al. WhiteFox: White-box compiler fuzzing empowered by large language models[C]//Proceedings of the ACM on Programming Languages (OOPSLA). 2024.</w:t>
-            </w:r>
-          </w:p>
-          <w:p>
-            <w:pPr>
-              <w:pStyle w:val="Normal"/>
-              <w:spacing w:lineRule="auto" w:line="360"/>
-              <w:rPr>
-                <w:kern w:val="0"/>
-                <w:sz w:val="24"/>
-              </w:rPr>
-            </w:pPr>
-            <w:r>
-              <w:rPr>
-                <w:kern w:val="0"/>
-                <w:sz w:val="24"/>
-              </w:rPr>
-              <w:t xml:space="preserve">[6] GNU Project. GCC Bugzilla PR 87672 — tree-ssa-strlen: __strcat_chk to __stpcpy_chk drops bound subtract[EB/OL]. (2018)[2026-02-15]. https://gcc.gnu.org/bugzilla/show_bug.cgi?id=87672.</w:t>
-            </w:r>
-          </w:p>
-          <w:p>
-            <w:pPr>
-              <w:pStyle w:val="Normal"/>
-              <w:spacing w:lineRule="auto" w:line="360"/>
-              <w:rPr>
-                <w:kern w:val="0"/>
-                <w:sz w:val="24"/>
-              </w:rPr>
-            </w:pPr>
-            <w:r>
-              <w:rPr>
-                <w:kern w:val="0"/>
-                <w:sz w:val="24"/>
-              </w:rPr>
-              <w:t xml:space="preserve">[7] GNU Project. GCC Bugzilla PR 96191 — stack-protector leaves canary in caller-saved register on AArch64/ARM[EB/OL]. (2020)[2026-02-15]. https://gcc.gnu.org/bugzilla/show_bug.cgi?id=96191.</w:t>
-            </w:r>
-          </w:p>
-          <w:p>
-            <w:pPr>
-              <w:pStyle w:val="Normal"/>
-              <w:spacing w:lineRule="auto" w:line="360"/>
-              <w:rPr>
-                <w:kern w:val="0"/>
-                <w:sz w:val="24"/>
-              </w:rPr>
-            </w:pPr>
-            <w:r>
-              <w:rPr>
-                <w:kern w:val="0"/>
-                <w:sz w:val="24"/>
-              </w:rPr>
-              <w:t xml:space="preserve">[8] GNU Project. GCC Bugzilla PR 96350 — i386: reject ENDBR pattern in immediate operands under -fcf-protection=branch[EB/OL]. (2020)[2026-02-15]. https://gcc.gnu.org/bugzilla/show_bug.cgi?id=96350.</w:t>
-            </w:r>
-          </w:p>
-          <w:p>
-            <w:pPr>
-              <w:pStyle w:val="Normal"/>
-              <w:spacing w:lineRule="auto" w:line="360"/>
-              <w:rPr>
-                <w:kern w:val="0"/>
-                <w:sz w:val="24"/>
-              </w:rPr>
-            </w:pPr>
-            <w:r>
-              <w:rPr>
-                <w:kern w:val="0"/>
-                <w:sz w:val="24"/>
-              </w:rPr>
-              <w:t xml:space="preserve">[9] Intel Corporation. Control-flow Enforcement Technology Specification[R/OL]. (2019)[2026-02-15]. https://www.intel.com/content/www/us/en/developer/articles/technical/technical-look-control-flow-enforcement-technology.html.</w:t>
-            </w:r>
-          </w:p>
-          <w:p>
-            <w:pPr>
-              <w:pStyle w:val="Normal"/>
-              <w:spacing w:lineRule="auto" w:line="360"/>
-              <w:rPr>
-                <w:kern w:val="0"/>
-                <w:sz w:val="24"/>
-              </w:rPr>
-            </w:pPr>
-            <w:r>
-              <w:rPr>
-                <w:kern w:val="0"/>
-                <w:sz w:val="24"/>
-              </w:rPr>
-              <w:t xml:space="preserve">[10] Free Software Foundation. The GNU C Library Reference Manual: Source Fortification[EB/OL]. (2024)[2026-02-15]. https://sourceware.org/glibc/manual/latest/html_node/Source-Fortification.html.</w:t>
-            </w:r>
-          </w:p>
-          <w:p>
-            <w:pPr>
-              <w:pStyle w:val="Normal"/>
-              <w:spacing w:lineRule="auto" w:line="360"/>
-              <w:rPr>
-                <w:kern w:val="0"/>
-                <w:sz w:val="24"/>
-              </w:rPr>
-            </w:pPr>
-            <w:r>
-              <w:rPr>
-                <w:kern w:val="0"/>
-                <w:sz w:val="24"/>
-              </w:rPr>
-              <w:t xml:space="preserve">[11] Le V, Afshari M, Su Z. Compiler validation via equivalence modulo inputs[C]//Proceedings of the 35th ACM SIGPLAN Conference on Programming Language Design and Implementation (PLDI). 2014: 216-226.</w:t>
-            </w:r>
-          </w:p>
-          <w:p>
-            <w:pPr>
-              <w:pStyle w:val="Normal"/>
-              <w:spacing w:lineRule="auto" w:line="360"/>
-              <w:rPr>
-                <w:kern w:val="0"/>
-                <w:sz w:val="24"/>
-              </w:rPr>
-            </w:pPr>
-            <w:r>
-              <w:rPr>
-                <w:kern w:val="0"/>
-                <w:sz w:val="24"/>
-              </w:rPr>
-              <w:t xml:space="preserve">[12] Li S, Su Z. UBfuzz: Finding bugs in sanitizer implementations[C]//Proceedings of the 29th ACM International Conference on Architectural Support for Programming Languages and Operating Systems (ASPLOS). 2024.</w:t>
-            </w:r>
-          </w:p>
-          <w:p>
-            <w:pPr>
-              <w:pStyle w:val="Normal"/>
-              <w:spacing w:lineRule="auto" w:line="360"/>
-              <w:rPr>
-                <w:kern w:val="0"/>
-                <w:sz w:val="24"/>
-              </w:rPr>
-            </w:pPr>
-            <w:r>
-              <w:rPr>
-                <w:kern w:val="0"/>
-                <w:sz w:val="24"/>
-              </w:rPr>
-              <w:t xml:space="preserve">[13] Ma H, Shen Q, Tian Y, et al. Fuzzing deep learning compilers with HirGen[C]//Proceedings of the 32nd ACM SIGSOFT International Symposium on Software Testing and Analysis (ISSTA). 2023.</w:t>
-            </w:r>
-          </w:p>
-          <w:p>
-            <w:pPr>
-              <w:pStyle w:val="Normal"/>
-              <w:spacing w:lineRule="auto" w:line="360"/>
-              <w:rPr>
-                <w:kern w:val="0"/>
-                <w:sz w:val="24"/>
-              </w:rPr>
-            </w:pPr>
-            <w:r>
-              <w:rPr>
-                <w:kern w:val="0"/>
-                <w:sz w:val="24"/>
-              </w:rPr>
-              <w:t xml:space="preserve">[14] Even-Mendoza K, Sharma A, Donaldson A F, et al. GrayC: Greybox fuzzing of compilers and analysers for C[C]//Proceedings of the 32nd ACM SIGSOFT International Symposium on Software Testing and Analysis (ISSTA). 2023: 1219-1231.</w:t>
-            </w:r>
-          </w:p>
-          <w:p>
-            <w:pPr>
-              <w:pStyle w:val="Normal"/>
-              <w:spacing w:lineRule="auto" w:line="360"/>
-              <w:rPr>
-                <w:kern w:val="0"/>
-                <w:sz w:val="24"/>
-              </w:rPr>
-            </w:pPr>
-            <w:r>
-              <w:rPr>
-                <w:kern w:val="0"/>
-                <w:sz w:val="24"/>
-              </w:rPr>
-              <w:t xml:space="preserve">[15] Yang Y, Zhang H, Ren Z, et al. Hybrid language processor fuzzing via LLM-based constraint solving[C]//Proceedings of the 34th USENIX Security Symposium (USENIX Security). 2025.</w:t>
-            </w:r>
-          </w:p>
-          <w:p>
-            <w:pPr>
-              <w:pStyle w:val="Normal"/>
-              <w:spacing w:lineRule="auto" w:line="360"/>
-              <w:rPr>
-                <w:kern w:val="0"/>
-                <w:sz w:val="24"/>
-              </w:rPr>
-            </w:pPr>
-            <w:r>
-              <w:rPr>
-                <w:kern w:val="0"/>
-                <w:sz w:val="24"/>
-              </w:rPr>
-              <w:t xml:space="preserve">[16] Meta Security. CVE-2023-4039: GCC's -fstack-protector fails to guard dynamic stack allocations on AArch64[EB/OL]. (2023)[2026-02-15]. https://rtx.meta.security/mitigation/2023/09/12/CVE-2023-4039.html.</w:t>
+              <w:spacing w:line="360" w:lineRule="auto"/>
+              <w:rPr>
+                <w:kern w:val="0"/>
+                <w:sz w:val="24"/>
+              </w:rPr>
+            </w:pPr>
+            <w:r>
+              <w:rPr>
+                <w:kern w:val="0"/>
+                <w:sz w:val="24"/>
+              </w:rPr>
+              <w:t>[1] Yang X, Chen Y, Eide E, et al. Finding and understanding bugs in C compilers[C]//Proceedings of the 32nd ACM SIGPLAN Conference on Programming Language Design and Implementation (PLDI). 2011: 283-294.</w:t>
+            </w:r>
+          </w:p>
+          <w:p>
+            <w:pPr>
+              <w:spacing w:line="360" w:lineRule="auto"/>
+              <w:rPr>
+                <w:kern w:val="0"/>
+                <w:sz w:val="24"/>
+              </w:rPr>
+            </w:pPr>
+            <w:r>
+              <w:rPr>
+                <w:kern w:val="0"/>
+                <w:sz w:val="24"/>
+              </w:rPr>
+              <w:t>[2] Livinskii V, Babokin D, Regehr J. Random testing for C and C++ compilers with YARPGen[C]//Proceedings of the ACM on Programming Languages (OOPSLA). 2020, 4: 1-25.</w:t>
+            </w:r>
+          </w:p>
+          <w:p>
+            <w:pPr>
+              <w:spacing w:line="360" w:lineRule="auto"/>
+              <w:rPr>
+                <w:kern w:val="0"/>
+                <w:sz w:val="24"/>
+              </w:rPr>
+            </w:pPr>
+            <w:r>
+              <w:rPr>
+                <w:kern w:val="0"/>
+                <w:sz w:val="24"/>
+              </w:rPr>
+              <w:t>[3] Zalewski M. American Fuzzy Lop (AFL)[EB/OL]. (2014)[2026-02-15]. https://lcamtuf.coredump.cx/afl/.</w:t>
+            </w:r>
+          </w:p>
+          <w:p>
+            <w:pPr>
+              <w:spacing w:line="360" w:lineRule="auto"/>
+              <w:rPr>
+                <w:kern w:val="0"/>
+                <w:sz w:val="24"/>
+              </w:rPr>
+            </w:pPr>
+            <w:r>
+              <w:rPr>
+                <w:kern w:val="0"/>
+                <w:sz w:val="24"/>
+              </w:rPr>
+              <w:t>[4] Serebryany K. Continuous fuzzing with libFuzzer and AddressSanitizer[C]//IEEE Cybersecurity Development (SecDev). 2016: 157.</w:t>
+            </w:r>
+          </w:p>
+          <w:p>
+            <w:pPr>
+              <w:spacing w:line="360" w:lineRule="auto"/>
+              <w:rPr>
+                <w:kern w:val="0"/>
+                <w:sz w:val="24"/>
+              </w:rPr>
+            </w:pPr>
+            <w:r>
+              <w:rPr>
+                <w:kern w:val="0"/>
+                <w:sz w:val="24"/>
+              </w:rPr>
+              <w:t>[5] Yang C, Deng Y, Lu R, et al. WhiteFox: White-box compiler fuzzing empowered by large language models[C]//Proceedings of the ACM on Programming Languages (OOPSLA). 2024.</w:t>
+            </w:r>
+          </w:p>
+          <w:p>
+            <w:pPr>
+              <w:spacing w:line="360" w:lineRule="auto"/>
+              <w:rPr>
+                <w:kern w:val="0"/>
+                <w:sz w:val="24"/>
+              </w:rPr>
+            </w:pPr>
+            <w:r>
+              <w:rPr>
+                <w:kern w:val="0"/>
+                <w:sz w:val="24"/>
+              </w:rPr>
+              <w:t>[6] GNU Project. GCC Bugzilla PR 87672 — tree-ssa-strlen: __strcat_chk to __stpcpy_chk drops bound subtract[EB/OL]. (2018)[2026-02-15]. https://gcc.gnu.org/bugzilla/show_bug.cgi?id=87672.</w:t>
+            </w:r>
+          </w:p>
+          <w:p>
+            <w:pPr>
+              <w:spacing w:line="360" w:lineRule="auto"/>
+              <w:rPr>
+                <w:kern w:val="0"/>
+                <w:sz w:val="24"/>
+              </w:rPr>
+            </w:pPr>
+            <w:r>
+              <w:rPr>
+                <w:kern w:val="0"/>
+                <w:sz w:val="24"/>
+              </w:rPr>
+              <w:t>[7] GNU Project. GCC Bugzilla PR 96191 — stack-protector leaves canary in caller-saved register on AArch64/ARM[EB/OL]. (2020)[2026-02-15]. https://gcc.gnu.org/bugzilla/show_bug.cgi?id=96191.</w:t>
+            </w:r>
+          </w:p>
+          <w:p>
+            <w:pPr>
+              <w:spacing w:line="360" w:lineRule="auto"/>
+              <w:rPr>
+                <w:kern w:val="0"/>
+                <w:sz w:val="24"/>
+              </w:rPr>
+            </w:pPr>
+            <w:r>
+              <w:rPr>
+                <w:kern w:val="0"/>
+                <w:sz w:val="24"/>
+              </w:rPr>
+              <w:t>[8] GNU Project. GCC Bugzilla PR 96350 — i386: reject ENDBR pattern in immediate operands under -fcf-protection=branch[EB/OL]. (2020)[2026-02-15]. https://gcc.gnu.org/bugzilla/show_bug.cgi?id=96350.</w:t>
+            </w:r>
+          </w:p>
+          <w:p>
+            <w:pPr>
+              <w:spacing w:line="360" w:lineRule="auto"/>
+              <w:rPr>
+                <w:kern w:val="0"/>
+                <w:sz w:val="24"/>
+              </w:rPr>
+            </w:pPr>
+            <w:r>
+              <w:rPr>
+                <w:kern w:val="0"/>
+                <w:sz w:val="24"/>
+              </w:rPr>
+              <w:t>[9] Intel Corporation. Control-flow Enforcement Technology Specification[R/OL]. (2019)[2026-02-15]. https://www.intel.com/content/www/us/en/developer/articles/technical/technical-look-control-flow-enforcement-technology.html.</w:t>
+            </w:r>
+          </w:p>
+          <w:p>
+            <w:pPr>
+              <w:spacing w:line="360" w:lineRule="auto"/>
+              <w:rPr>
+                <w:kern w:val="0"/>
+                <w:sz w:val="24"/>
+              </w:rPr>
+            </w:pPr>
+            <w:r>
+              <w:rPr>
+                <w:kern w:val="0"/>
+                <w:sz w:val="24"/>
+              </w:rPr>
+              <w:t>[10] Free Software Foundation. The GNU C Library Reference Manual: Source Fortification[EB/OL]. (2024)[2026-02-15]. https://sourceware.org/glibc/manual/latest/html_node/Source-Fortification.html.</w:t>
+            </w:r>
+          </w:p>
+          <w:p>
+            <w:pPr>
+              <w:spacing w:line="360" w:lineRule="auto"/>
+              <w:rPr>
+                <w:kern w:val="0"/>
+                <w:sz w:val="24"/>
+              </w:rPr>
+            </w:pPr>
+            <w:r>
+              <w:rPr>
+                <w:kern w:val="0"/>
+                <w:sz w:val="24"/>
+              </w:rPr>
+              <w:t>[11] Le V, Afshari M, Su Z. Compiler validation via equivalence modulo inputs[C]//Proceedings of the 35th ACM SIGPLAN Conference on Programming Language Design and Implementation (PLDI). 2014: 216-226.</w:t>
+            </w:r>
+          </w:p>
+          <w:p>
+            <w:pPr>
+              <w:spacing w:line="360" w:lineRule="auto"/>
+              <w:rPr>
+                <w:kern w:val="0"/>
+                <w:sz w:val="24"/>
+              </w:rPr>
+            </w:pPr>
+            <w:r>
+              <w:rPr>
+                <w:kern w:val="0"/>
+                <w:sz w:val="24"/>
+              </w:rPr>
+              <w:t>[12] Li S, Su Z. UBfuzz: Finding bugs in sanitizer implementations[C]//Proceedings of the 29th ACM International Conference on Architectural Support for Programming Languages and Operating Systems (ASPLOS). 2024.</w:t>
+            </w:r>
+          </w:p>
+          <w:p>
+            <w:pPr>
+              <w:spacing w:line="360" w:lineRule="auto"/>
+              <w:rPr>
+                <w:kern w:val="0"/>
+                <w:sz w:val="24"/>
+              </w:rPr>
+            </w:pPr>
+            <w:r>
+              <w:rPr>
+                <w:kern w:val="0"/>
+                <w:sz w:val="24"/>
+              </w:rPr>
+              <w:t>[13] Ma H, Shen Q, Tian Y, et al. Fuzzing deep learning compilers with HirGen[C]//Proceedings of the 32nd ACM SIGSOFT International Symposium on Software Testing and Analysis (ISSTA). 2023.</w:t>
+            </w:r>
+          </w:p>
+          <w:p>
+            <w:pPr>
+              <w:spacing w:line="360" w:lineRule="auto"/>
+              <w:rPr>
+                <w:kern w:val="0"/>
+                <w:sz w:val="24"/>
+              </w:rPr>
+            </w:pPr>
+            <w:r>
+              <w:rPr>
+                <w:kern w:val="0"/>
+                <w:sz w:val="24"/>
+              </w:rPr>
+              <w:t>[14] Even-Mendoza K, Sharma A, Donaldson A F, et al. GrayC: Greybox fuzzing of compilers and analysers for C[C]//Proceedings of the 32nd ACM SIGSOFT International Symposium on Software Testing and Analysis (ISSTA). 2023: 1219-1231.</w:t>
+            </w:r>
+          </w:p>
+          <w:p>
+            <w:pPr>
+              <w:spacing w:line="360" w:lineRule="auto"/>
+              <w:rPr>
+                <w:kern w:val="0"/>
+                <w:sz w:val="24"/>
+              </w:rPr>
+            </w:pPr>
+            <w:r>
+              <w:rPr>
+                <w:kern w:val="0"/>
+                <w:sz w:val="24"/>
+              </w:rPr>
+              <w:t>[15] Yang Y, Zhang H, Ren Z, et al. Hybrid language processor fuzzing via LLM-based constraint solving[C]//Proceedings of the 34th USENIX Security Symposium (USENIX Security). 2025.</w:t>
+            </w:r>
+          </w:p>
+          <w:p>
+            <w:pPr>
+              <w:spacing w:line="360" w:lineRule="auto"/>
+              <w:rPr>
+                <w:kern w:val="0"/>
+                <w:sz w:val="24"/>
+              </w:rPr>
+            </w:pPr>
+            <w:r>
+              <w:rPr>
+                <w:kern w:val="0"/>
+                <w:sz w:val="24"/>
+              </w:rPr>
+              <w:t>[16] Meta Security. CVE-2023-4039: GCC's -fstack-protector fails to guard dynamic stack allocations on AArch64[EB/OL]. (2023)[2026-02-15]. https://rtx.meta.security/mitigation/2023/09/12/CVE-2023-4039.html.</w:t>
             </w:r>
           </w:p>
         </w:tc>
@@ -4190,20 +4264,19 @@
           </w:tcPr>
           <w:p>
             <w:pPr>
-              <w:pStyle w:val="Normal"/>
-              <w:spacing w:lineRule="auto" w:line="360"/>
-              <w:ind w:firstLineChars="200" w:startChars="0" w:start="0" w:endChars="0" w:end="0"/>
-              <w:rPr>
-                <w:kern w:val="0"/>
-                <w:sz w:val="24"/>
-              </w:rPr>
-            </w:pPr>
-            <w:r>
-              <w:rPr>
-                <w:kern w:val="0"/>
-                <w:sz w:val="24"/>
-              </w:rPr>
-              <w:t xml:space="preserve">理论分析涉及三方面：编译器主流防御机制的安全不变量及其证据形式、覆盖率与控制流图引导的目标基本块选择策略、大模型生成能力与预言机判定的耦合方式。预期产出包括：一套覆盖至少三种主流防御机制的不变量集合、一套可扩展的预言机框架、一个可面向 GCC 与 LLVM 跨架构运行的 fuzzer 原型；通过在 GCC 与 LLVM 主流版本上发现真实 silent failure 来验证有效性。硬件方面，开发与实验依托一台 64 位 Linux 工作站（不少于 32 GB 内存、百 GB 级 SSD），用于 GCC / LLVM 多版本本地构建、覆盖率数据缓存与跨架构 QEMU 用户态执行；大模型推理通过远程 API 完成，本机不需要独立 GPU。</w:t>
+              <w:spacing w:line="360" w:lineRule="auto"/>
+              <w:ind w:left="0" w:leftChars="0" w:right="0" w:rightChars="0" w:firstLineChars="200"/>
+              <w:rPr>
+                <w:kern w:val="0"/>
+                <w:sz w:val="24"/>
+              </w:rPr>
+            </w:pPr>
+            <w:r>
+              <w:rPr>
+                <w:kern w:val="0"/>
+                <w:sz w:val="24"/>
+              </w:rPr>
+              <w:t>理论分析涉及三方面：编译器主流防御机制的安全不变量及其证据形式、覆盖率与控制流图引导的目标基本块选择策略、大模型生成能力与预言机判定的耦合方式。预期产出包括：一套覆盖至少三种主流防御机制的不变量集合、一套可扩展的预言机框架、一个可面向 GCC 与 LLVM 跨架构运行的 fuzzer 原型；通过在 GCC 与 LLVM 主流版本上发现真实 silent failure 来验证有效性。硬件方面，开发与实验依托一台 64 位 Linux 工作站（不少于 32 GB 内存、百 GB 级 SSD），用于 GCC / LLVM 多版本本地构建、覆盖率数据缓存与跨架构 QEMU 用户态执行；大模型推理通过远程 API 完成，本机不需要独立 GPU。</w:t>
             </w:r>
           </w:p>
         </w:tc>
@@ -4240,7 +4313,7 @@
       </w:tblPr>
       <w:tblGrid>
         <w:gridCol w:w="2124"/>
-        <w:gridCol w:w="5283"/>
+        <w:gridCol w:w="5282"/>
         <w:gridCol w:w="2349"/>
       </w:tblGrid>
       <w:tr>
@@ -4345,24 +4418,32 @@
         </w:tc>
       </w:tr>
       <w:tr>
+        <w:tblPrEx>
+          <w:tblCellMar>
+            <w:top w:w="0" w:type="dxa"/>
+            <w:left w:w="108" w:type="dxa"/>
+            <w:bottom w:w="0" w:type="dxa"/>
+            <w:right w:w="108" w:type="dxa"/>
+          </w:tblCellMar>
+        </w:tblPrEx>
         <w:trPr>
           <w:trHeight w:val="480" w:hRule="atLeast"/>
+          <w:jc w:val="center"/>
         </w:trPr>
         <w:tc>
           <w:tcPr>
             <w:tcW w:w="2077" w:type="dxa"/>
             <w:tcBorders>
-              <w:top w:val="single" w:sz="4" w:space="0" w:color="000000"/>
-              <w:start w:val="single" w:sz="4" w:space="0" w:color="000000"/>
-              <w:bottom w:val="single" w:sz="4" w:space="0" w:color="000000"/>
-              <w:end w:val="single" w:sz="4" w:space="0" w:color="000000"/>
+              <w:top w:val="single" w:color="000000" w:sz="4" w:space="0"/>
+              <w:left w:val="single" w:color="000000" w:sz="4" w:space="0"/>
+              <w:bottom w:val="single" w:color="000000" w:sz="4" w:space="0"/>
+              <w:right w:val="single" w:color="000000" w:sz="4" w:space="0"/>
             </w:tcBorders>
             <w:vAlign w:val="center"/>
           </w:tcPr>
           <w:p>
             <w:pPr>
-              <w:pStyle w:val="Normal"/>
-              <w:spacing w:lineRule="exact" w:line="320"/>
+              <w:spacing w:line="320" w:lineRule="exact"/>
               <w:jc w:val="center"/>
               <w:rPr>
                 <w:rFonts w:ascii="宋体" w:hAnsi="宋体" w:eastAsia="宋体"/>
@@ -4374,7 +4455,7 @@
                 <w:rFonts w:ascii="宋体" w:hAnsi="宋体" w:eastAsia="宋体"/>
                 <w:sz w:val="24"/>
               </w:rPr>
-              <w:t xml:space="preserve">2026.02-2026.03</w:t>
+              <w:t>2026.02-2026.03</w:t>
             </w:r>
           </w:p>
         </w:tc>
@@ -4382,17 +4463,16 @@
           <w:tcPr>
             <w:tcW w:w="5167" w:type="dxa"/>
             <w:tcBorders>
-              <w:top w:val="single" w:sz="4" w:space="0" w:color="000000"/>
-              <w:start w:val="single" w:sz="4" w:space="0" w:color="000000"/>
-              <w:bottom w:val="single" w:sz="4" w:space="0" w:color="000000"/>
-              <w:end w:val="single" w:sz="4" w:space="0" w:color="000000"/>
+              <w:top w:val="single" w:color="000000" w:sz="4" w:space="0"/>
+              <w:left w:val="single" w:color="000000" w:sz="4" w:space="0"/>
+              <w:bottom w:val="single" w:color="000000" w:sz="4" w:space="0"/>
+              <w:right w:val="single" w:color="000000" w:sz="4" w:space="0"/>
             </w:tcBorders>
             <w:vAlign w:val="center"/>
           </w:tcPr>
           <w:p>
             <w:pPr>
-              <w:pStyle w:val="Normal"/>
-              <w:spacing w:lineRule="exact" w:line="320"/>
+              <w:spacing w:line="320" w:lineRule="exact"/>
               <w:jc w:val="center"/>
               <w:rPr>
                 <w:rFonts w:ascii="宋体" w:hAnsi="宋体" w:eastAsia="宋体"/>
@@ -4404,7 +4484,7 @@
                 <w:rFonts w:ascii="宋体" w:hAnsi="宋体" w:eastAsia="宋体"/>
                 <w:sz w:val="24"/>
               </w:rPr>
-              <w:t xml:space="preserve">完成防御机制不变量调研，建立统一记录格式</w:t>
+              <w:t>完成防御机制不变量调研，建立统一记录格式</w:t>
             </w:r>
           </w:p>
         </w:tc>
@@ -4412,52 +4492,52 @@
           <w:tcPr>
             <w:tcW w:w="2297" w:type="dxa"/>
             <w:tcBorders>
-              <w:top w:val="single" w:sz="4" w:space="0" w:color="000000"/>
-              <w:start w:val="single" w:sz="4" w:space="0" w:color="000000"/>
-              <w:bottom w:val="single" w:sz="4" w:space="0" w:color="000000"/>
-              <w:end w:val="single" w:sz="4" w:space="0" w:color="000000"/>
+              <w:top w:val="single" w:color="000000" w:sz="4" w:space="0"/>
+              <w:left w:val="single" w:color="000000" w:sz="4" w:space="0"/>
+              <w:bottom w:val="single" w:color="000000" w:sz="4" w:space="0"/>
+              <w:right w:val="single" w:color="000000" w:sz="4" w:space="0"/>
             </w:tcBorders>
             <w:vAlign w:val="center"/>
           </w:tcPr>
           <w:p>
             <w:pPr>
-              <w:pStyle w:val="Normal"/>
-              <w:spacing w:lineRule="exact" w:line="320"/>
+              <w:spacing w:line="320" w:lineRule="exact"/>
               <w:jc w:val="center"/>
               <w:rPr>
                 <w:rFonts w:ascii="宋体" w:hAnsi="宋体" w:eastAsia="宋体"/>
                 <w:sz w:val="24"/>
               </w:rPr>
             </w:pPr>
-            <w:r>
-              <w:rPr>
-                <w:rFonts w:ascii="宋体" w:hAnsi="宋体" w:eastAsia="宋体"/>
-                <w:sz w:val="24"/>
-              </w:rPr>
-              <w:t xml:space="preserve"/>
-            </w:r>
           </w:p>
         </w:tc>
       </w:tr>
       <w:tr>
+        <w:tblPrEx>
+          <w:tblCellMar>
+            <w:top w:w="0" w:type="dxa"/>
+            <w:left w:w="108" w:type="dxa"/>
+            <w:bottom w:w="0" w:type="dxa"/>
+            <w:right w:w="108" w:type="dxa"/>
+          </w:tblCellMar>
+        </w:tblPrEx>
         <w:trPr>
           <w:trHeight w:val="480" w:hRule="atLeast"/>
+          <w:jc w:val="center"/>
         </w:trPr>
         <w:tc>
           <w:tcPr>
             <w:tcW w:w="2077" w:type="dxa"/>
             <w:tcBorders>
-              <w:top w:val="single" w:sz="4" w:space="0" w:color="000000"/>
-              <w:start w:val="single" w:sz="4" w:space="0" w:color="000000"/>
-              <w:bottom w:val="single" w:sz="4" w:space="0" w:color="000000"/>
-              <w:end w:val="single" w:sz="4" w:space="0" w:color="000000"/>
+              <w:top w:val="single" w:color="000000" w:sz="4" w:space="0"/>
+              <w:left w:val="single" w:color="000000" w:sz="4" w:space="0"/>
+              <w:bottom w:val="single" w:color="000000" w:sz="4" w:space="0"/>
+              <w:right w:val="single" w:color="000000" w:sz="4" w:space="0"/>
             </w:tcBorders>
             <w:vAlign w:val="center"/>
           </w:tcPr>
           <w:p>
             <w:pPr>
-              <w:pStyle w:val="Normal"/>
-              <w:spacing w:lineRule="exact" w:line="320"/>
+              <w:spacing w:line="320" w:lineRule="exact"/>
               <w:jc w:val="center"/>
               <w:rPr>
                 <w:rFonts w:ascii="宋体" w:hAnsi="宋体" w:eastAsia="宋体"/>
@@ -4469,7 +4549,7 @@
                 <w:rFonts w:ascii="宋体" w:hAnsi="宋体" w:eastAsia="宋体"/>
                 <w:sz w:val="24"/>
               </w:rPr>
-              <w:t xml:space="preserve">2026.03-2026.04</w:t>
+              <w:t>2026.03-2026.04</w:t>
             </w:r>
           </w:p>
         </w:tc>
@@ -4477,17 +4557,16 @@
           <w:tcPr>
             <w:tcW w:w="5167" w:type="dxa"/>
             <w:tcBorders>
-              <w:top w:val="single" w:sz="4" w:space="0" w:color="000000"/>
-              <w:start w:val="single" w:sz="4" w:space="0" w:color="000000"/>
-              <w:bottom w:val="single" w:sz="4" w:space="0" w:color="000000"/>
-              <w:end w:val="single" w:sz="4" w:space="0" w:color="000000"/>
+              <w:top w:val="single" w:color="000000" w:sz="4" w:space="0"/>
+              <w:left w:val="single" w:color="000000" w:sz="4" w:space="0"/>
+              <w:bottom w:val="single" w:color="000000" w:sz="4" w:space="0"/>
+              <w:right w:val="single" w:color="000000" w:sz="4" w:space="0"/>
             </w:tcBorders>
             <w:vAlign w:val="center"/>
           </w:tcPr>
           <w:p>
             <w:pPr>
-              <w:pStyle w:val="Normal"/>
-              <w:spacing w:lineRule="exact" w:line="320"/>
+              <w:spacing w:line="320" w:lineRule="exact"/>
               <w:jc w:val="center"/>
               <w:rPr>
                 <w:rFonts w:ascii="宋体" w:hAnsi="宋体" w:eastAsia="宋体"/>
@@ -4499,7 +4578,7 @@
                 <w:rFonts w:ascii="宋体" w:hAnsi="宋体" w:eastAsia="宋体"/>
                 <w:sz w:val="24"/>
               </w:rPr>
-              <w:t xml:space="preserve">扩展预言机框架到 _FORTIFY_SOURCE 与 IBT，完善大模型提示词流水线</w:t>
+              <w:t>扩展预言机框架到 _FORTIFY_SOURCE 与 IBT，完善大模型提示词流水线</w:t>
             </w:r>
           </w:p>
         </w:tc>
@@ -4507,52 +4586,52 @@
           <w:tcPr>
             <w:tcW w:w="2297" w:type="dxa"/>
             <w:tcBorders>
-              <w:top w:val="single" w:sz="4" w:space="0" w:color="000000"/>
-              <w:start w:val="single" w:sz="4" w:space="0" w:color="000000"/>
-              <w:bottom w:val="single" w:sz="4" w:space="0" w:color="000000"/>
-              <w:end w:val="single" w:sz="4" w:space="0" w:color="000000"/>
+              <w:top w:val="single" w:color="000000" w:sz="4" w:space="0"/>
+              <w:left w:val="single" w:color="000000" w:sz="4" w:space="0"/>
+              <w:bottom w:val="single" w:color="000000" w:sz="4" w:space="0"/>
+              <w:right w:val="single" w:color="000000" w:sz="4" w:space="0"/>
             </w:tcBorders>
             <w:vAlign w:val="center"/>
           </w:tcPr>
           <w:p>
             <w:pPr>
-              <w:pStyle w:val="Normal"/>
-              <w:spacing w:lineRule="exact" w:line="320"/>
+              <w:spacing w:line="320" w:lineRule="exact"/>
               <w:jc w:val="center"/>
               <w:rPr>
                 <w:rFonts w:ascii="宋体" w:hAnsi="宋体" w:eastAsia="宋体"/>
                 <w:sz w:val="24"/>
               </w:rPr>
             </w:pPr>
-            <w:r>
-              <w:rPr>
-                <w:rFonts w:ascii="宋体" w:hAnsi="宋体" w:eastAsia="宋体"/>
-                <w:sz w:val="24"/>
-              </w:rPr>
-              <w:t xml:space="preserve"/>
-            </w:r>
           </w:p>
         </w:tc>
       </w:tr>
       <w:tr>
+        <w:tblPrEx>
+          <w:tblCellMar>
+            <w:top w:w="0" w:type="dxa"/>
+            <w:left w:w="108" w:type="dxa"/>
+            <w:bottom w:w="0" w:type="dxa"/>
+            <w:right w:w="108" w:type="dxa"/>
+          </w:tblCellMar>
+        </w:tblPrEx>
         <w:trPr>
           <w:trHeight w:val="480" w:hRule="atLeast"/>
+          <w:jc w:val="center"/>
         </w:trPr>
         <w:tc>
           <w:tcPr>
             <w:tcW w:w="2077" w:type="dxa"/>
             <w:tcBorders>
-              <w:top w:val="single" w:sz="4" w:space="0" w:color="000000"/>
-              <w:start w:val="single" w:sz="4" w:space="0" w:color="000000"/>
-              <w:bottom w:val="single" w:sz="4" w:space="0" w:color="000000"/>
-              <w:end w:val="single" w:sz="4" w:space="0" w:color="000000"/>
+              <w:top w:val="single" w:color="000000" w:sz="4" w:space="0"/>
+              <w:left w:val="single" w:color="000000" w:sz="4" w:space="0"/>
+              <w:bottom w:val="single" w:color="000000" w:sz="4" w:space="0"/>
+              <w:right w:val="single" w:color="000000" w:sz="4" w:space="0"/>
             </w:tcBorders>
             <w:vAlign w:val="center"/>
           </w:tcPr>
           <w:p>
             <w:pPr>
-              <w:pStyle w:val="Normal"/>
-              <w:spacing w:lineRule="exact" w:line="320"/>
+              <w:spacing w:line="320" w:lineRule="exact"/>
               <w:jc w:val="center"/>
               <w:rPr>
                 <w:rFonts w:ascii="宋体" w:hAnsi="宋体" w:eastAsia="宋体"/>
@@ -4564,7 +4643,7 @@
                 <w:rFonts w:ascii="宋体" w:hAnsi="宋体" w:eastAsia="宋体"/>
                 <w:sz w:val="24"/>
               </w:rPr>
-              <w:t xml:space="preserve">2026.04-2026.05</w:t>
+              <w:t>2026.04-2026.05</w:t>
             </w:r>
           </w:p>
         </w:tc>
@@ -4572,17 +4651,16 @@
           <w:tcPr>
             <w:tcW w:w="5167" w:type="dxa"/>
             <w:tcBorders>
-              <w:top w:val="single" w:sz="4" w:space="0" w:color="000000"/>
-              <w:start w:val="single" w:sz="4" w:space="0" w:color="000000"/>
-              <w:bottom w:val="single" w:sz="4" w:space="0" w:color="000000"/>
-              <w:end w:val="single" w:sz="4" w:space="0" w:color="000000"/>
+              <w:top w:val="single" w:color="000000" w:sz="4" w:space="0"/>
+              <w:left w:val="single" w:color="000000" w:sz="4" w:space="0"/>
+              <w:bottom w:val="single" w:color="000000" w:sz="4" w:space="0"/>
+              <w:right w:val="single" w:color="000000" w:sz="4" w:space="0"/>
             </w:tcBorders>
             <w:vAlign w:val="center"/>
           </w:tcPr>
           <w:p>
             <w:pPr>
-              <w:pStyle w:val="Normal"/>
-              <w:spacing w:lineRule="exact" w:line="320"/>
+              <w:spacing w:line="320" w:lineRule="exact"/>
               <w:jc w:val="center"/>
               <w:rPr>
                 <w:rFonts w:ascii="宋体" w:hAnsi="宋体" w:eastAsia="宋体"/>
@@ -4594,7 +4672,7 @@
                 <w:rFonts w:ascii="宋体" w:hAnsi="宋体" w:eastAsia="宋体"/>
                 <w:sz w:val="24"/>
               </w:rPr>
-              <w:t xml:space="preserve">跨架构 flag profile 实验框架定型，在 GCC 上完成全机制端到端实验</w:t>
+              <w:t>跨架构 flag profile 实验框架定型，在 GCC 上完成全机制端到端实验</w:t>
             </w:r>
           </w:p>
         </w:tc>
@@ -4602,52 +4680,52 @@
           <w:tcPr>
             <w:tcW w:w="2297" w:type="dxa"/>
             <w:tcBorders>
-              <w:top w:val="single" w:sz="4" w:space="0" w:color="000000"/>
-              <w:start w:val="single" w:sz="4" w:space="0" w:color="000000"/>
-              <w:bottom w:val="single" w:sz="4" w:space="0" w:color="000000"/>
-              <w:end w:val="single" w:sz="4" w:space="0" w:color="000000"/>
+              <w:top w:val="single" w:color="000000" w:sz="4" w:space="0"/>
+              <w:left w:val="single" w:color="000000" w:sz="4" w:space="0"/>
+              <w:bottom w:val="single" w:color="000000" w:sz="4" w:space="0"/>
+              <w:right w:val="single" w:color="000000" w:sz="4" w:space="0"/>
             </w:tcBorders>
             <w:vAlign w:val="center"/>
           </w:tcPr>
           <w:p>
             <w:pPr>
-              <w:pStyle w:val="Normal"/>
-              <w:spacing w:lineRule="exact" w:line="320"/>
+              <w:spacing w:line="320" w:lineRule="exact"/>
               <w:jc w:val="center"/>
               <w:rPr>
                 <w:rFonts w:ascii="宋体" w:hAnsi="宋体" w:eastAsia="宋体"/>
                 <w:sz w:val="24"/>
               </w:rPr>
             </w:pPr>
-            <w:r>
-              <w:rPr>
-                <w:rFonts w:ascii="宋体" w:hAnsi="宋体" w:eastAsia="宋体"/>
-                <w:sz w:val="24"/>
-              </w:rPr>
-              <w:t xml:space="preserve"/>
-            </w:r>
           </w:p>
         </w:tc>
       </w:tr>
       <w:tr>
+        <w:tblPrEx>
+          <w:tblCellMar>
+            <w:top w:w="0" w:type="dxa"/>
+            <w:left w:w="108" w:type="dxa"/>
+            <w:bottom w:w="0" w:type="dxa"/>
+            <w:right w:w="108" w:type="dxa"/>
+          </w:tblCellMar>
+        </w:tblPrEx>
         <w:trPr>
           <w:trHeight w:val="480" w:hRule="atLeast"/>
+          <w:jc w:val="center"/>
         </w:trPr>
         <w:tc>
           <w:tcPr>
             <w:tcW w:w="2077" w:type="dxa"/>
             <w:tcBorders>
-              <w:top w:val="single" w:sz="4" w:space="0" w:color="000000"/>
-              <w:start w:val="single" w:sz="4" w:space="0" w:color="000000"/>
-              <w:bottom w:val="single" w:sz="4" w:space="0" w:color="000000"/>
-              <w:end w:val="single" w:sz="4" w:space="0" w:color="000000"/>
+              <w:top w:val="single" w:color="000000" w:sz="4" w:space="0"/>
+              <w:left w:val="single" w:color="000000" w:sz="4" w:space="0"/>
+              <w:bottom w:val="single" w:color="000000" w:sz="4" w:space="0"/>
+              <w:right w:val="single" w:color="000000" w:sz="4" w:space="0"/>
             </w:tcBorders>
             <w:vAlign w:val="center"/>
           </w:tcPr>
           <w:p>
             <w:pPr>
-              <w:pStyle w:val="Normal"/>
-              <w:spacing w:lineRule="exact" w:line="320"/>
+              <w:spacing w:line="320" w:lineRule="exact"/>
               <w:jc w:val="center"/>
               <w:rPr>
                 <w:rFonts w:ascii="宋体" w:hAnsi="宋体" w:eastAsia="宋体"/>
@@ -4659,7 +4737,7 @@
                 <w:rFonts w:ascii="宋体" w:hAnsi="宋体" w:eastAsia="宋体"/>
                 <w:sz w:val="24"/>
               </w:rPr>
-              <w:t xml:space="preserve">2026.04-2026.05</w:t>
+              <w:t>2026.04-2026.05</w:t>
             </w:r>
           </w:p>
         </w:tc>
@@ -4667,17 +4745,16 @@
           <w:tcPr>
             <w:tcW w:w="5167" w:type="dxa"/>
             <w:tcBorders>
-              <w:top w:val="single" w:sz="4" w:space="0" w:color="000000"/>
-              <w:start w:val="single" w:sz="4" w:space="0" w:color="000000"/>
-              <w:bottom w:val="single" w:sz="4" w:space="0" w:color="000000"/>
-              <w:end w:val="single" w:sz="4" w:space="0" w:color="000000"/>
+              <w:top w:val="single" w:color="000000" w:sz="4" w:space="0"/>
+              <w:left w:val="single" w:color="000000" w:sz="4" w:space="0"/>
+              <w:bottom w:val="single" w:color="000000" w:sz="4" w:space="0"/>
+              <w:right w:val="single" w:color="000000" w:sz="4" w:space="0"/>
             </w:tcBorders>
             <w:vAlign w:val="center"/>
           </w:tcPr>
           <w:p>
             <w:pPr>
-              <w:pStyle w:val="Normal"/>
-              <w:spacing w:lineRule="exact" w:line="320"/>
+              <w:spacing w:line="320" w:lineRule="exact"/>
               <w:jc w:val="center"/>
               <w:rPr>
                 <w:rFonts w:ascii="宋体" w:hAnsi="宋体" w:eastAsia="宋体"/>
@@ -4689,7 +4766,7 @@
                 <w:rFonts w:ascii="宋体" w:hAnsi="宋体" w:eastAsia="宋体"/>
                 <w:sz w:val="24"/>
               </w:rPr>
-              <w:t xml:space="preserve">把编译器子系统与覆盖率适配层扩展到 LLVM 工具链</w:t>
+              <w:t>把编译器子系统与覆盖率适配层扩展到 LLVM 工具链</w:t>
             </w:r>
           </w:p>
         </w:tc>
@@ -4697,52 +4774,52 @@
           <w:tcPr>
             <w:tcW w:w="2297" w:type="dxa"/>
             <w:tcBorders>
-              <w:top w:val="single" w:sz="4" w:space="0" w:color="000000"/>
-              <w:start w:val="single" w:sz="4" w:space="0" w:color="000000"/>
-              <w:bottom w:val="single" w:sz="4" w:space="0" w:color="000000"/>
-              <w:end w:val="single" w:sz="4" w:space="0" w:color="000000"/>
+              <w:top w:val="single" w:color="000000" w:sz="4" w:space="0"/>
+              <w:left w:val="single" w:color="000000" w:sz="4" w:space="0"/>
+              <w:bottom w:val="single" w:color="000000" w:sz="4" w:space="0"/>
+              <w:right w:val="single" w:color="000000" w:sz="4" w:space="0"/>
             </w:tcBorders>
             <w:vAlign w:val="center"/>
           </w:tcPr>
           <w:p>
             <w:pPr>
-              <w:pStyle w:val="Normal"/>
-              <w:spacing w:lineRule="exact" w:line="320"/>
+              <w:spacing w:line="320" w:lineRule="exact"/>
               <w:jc w:val="center"/>
               <w:rPr>
                 <w:rFonts w:ascii="宋体" w:hAnsi="宋体" w:eastAsia="宋体"/>
                 <w:sz w:val="24"/>
               </w:rPr>
             </w:pPr>
-            <w:r>
-              <w:rPr>
-                <w:rFonts w:ascii="宋体" w:hAnsi="宋体" w:eastAsia="宋体"/>
-                <w:sz w:val="24"/>
-              </w:rPr>
-              <w:t xml:space="preserve"/>
-            </w:r>
           </w:p>
         </w:tc>
       </w:tr>
       <w:tr>
+        <w:tblPrEx>
+          <w:tblCellMar>
+            <w:top w:w="0" w:type="dxa"/>
+            <w:left w:w="108" w:type="dxa"/>
+            <w:bottom w:w="0" w:type="dxa"/>
+            <w:right w:w="108" w:type="dxa"/>
+          </w:tblCellMar>
+        </w:tblPrEx>
         <w:trPr>
           <w:trHeight w:val="480" w:hRule="atLeast"/>
+          <w:jc w:val="center"/>
         </w:trPr>
         <w:tc>
           <w:tcPr>
             <w:tcW w:w="2077" w:type="dxa"/>
             <w:tcBorders>
-              <w:top w:val="single" w:sz="4" w:space="0" w:color="000000"/>
-              <w:start w:val="single" w:sz="4" w:space="0" w:color="000000"/>
-              <w:bottom w:val="single" w:sz="4" w:space="0" w:color="000000"/>
-              <w:end w:val="single" w:sz="4" w:space="0" w:color="000000"/>
+              <w:top w:val="single" w:color="000000" w:sz="4" w:space="0"/>
+              <w:left w:val="single" w:color="000000" w:sz="4" w:space="0"/>
+              <w:bottom w:val="single" w:color="000000" w:sz="4" w:space="0"/>
+              <w:right w:val="single" w:color="000000" w:sz="4" w:space="0"/>
             </w:tcBorders>
             <w:vAlign w:val="center"/>
           </w:tcPr>
           <w:p>
             <w:pPr>
-              <w:pStyle w:val="Normal"/>
-              <w:spacing w:lineRule="exact" w:line="320"/>
+              <w:spacing w:line="320" w:lineRule="exact"/>
               <w:jc w:val="center"/>
               <w:rPr>
                 <w:rFonts w:ascii="宋体" w:hAnsi="宋体" w:eastAsia="宋体"/>
@@ -4754,7 +4831,7 @@
                 <w:rFonts w:ascii="宋体" w:hAnsi="宋体" w:eastAsia="宋体"/>
                 <w:sz w:val="24"/>
               </w:rPr>
-              <w:t xml:space="preserve">2026.05-2026.06</w:t>
+              <w:t>2026.05-2026.06</w:t>
             </w:r>
           </w:p>
         </w:tc>
@@ -4762,17 +4839,16 @@
           <w:tcPr>
             <w:tcW w:w="5167" w:type="dxa"/>
             <w:tcBorders>
-              <w:top w:val="single" w:sz="4" w:space="0" w:color="000000"/>
-              <w:start w:val="single" w:sz="4" w:space="0" w:color="000000"/>
-              <w:bottom w:val="single" w:sz="4" w:space="0" w:color="000000"/>
-              <w:end w:val="single" w:sz="4" w:space="0" w:color="000000"/>
+              <w:top w:val="single" w:color="000000" w:sz="4" w:space="0"/>
+              <w:left w:val="single" w:color="000000" w:sz="4" w:space="0"/>
+              <w:bottom w:val="single" w:color="000000" w:sz="4" w:space="0"/>
+              <w:right w:val="single" w:color="000000" w:sz="4" w:space="0"/>
             </w:tcBorders>
             <w:vAlign w:val="center"/>
           </w:tcPr>
           <w:p>
             <w:pPr>
-              <w:pStyle w:val="Normal"/>
-              <w:spacing w:lineRule="exact" w:line="320"/>
+              <w:spacing w:line="320" w:lineRule="exact"/>
               <w:jc w:val="center"/>
               <w:rPr>
                 <w:rFonts w:ascii="宋体" w:hAnsi="宋体" w:eastAsia="宋体"/>
@@ -4784,7 +4860,7 @@
                 <w:rFonts w:ascii="宋体" w:hAnsi="宋体" w:eastAsia="宋体"/>
                 <w:sz w:val="24"/>
               </w:rPr>
-              <w:t xml:space="preserve">在 LLVM 上复用预言机框架开展对照实验，形成缺陷上报闭环</w:t>
+              <w:t>在 LLVM 上复用预言机框架开展对照实验，形成缺陷上报闭环</w:t>
             </w:r>
           </w:p>
         </w:tc>
@@ -4792,52 +4868,52 @@
           <w:tcPr>
             <w:tcW w:w="2297" w:type="dxa"/>
             <w:tcBorders>
-              <w:top w:val="single" w:sz="4" w:space="0" w:color="000000"/>
-              <w:start w:val="single" w:sz="4" w:space="0" w:color="000000"/>
-              <w:bottom w:val="single" w:sz="4" w:space="0" w:color="000000"/>
-              <w:end w:val="single" w:sz="4" w:space="0" w:color="000000"/>
+              <w:top w:val="single" w:color="000000" w:sz="4" w:space="0"/>
+              <w:left w:val="single" w:color="000000" w:sz="4" w:space="0"/>
+              <w:bottom w:val="single" w:color="000000" w:sz="4" w:space="0"/>
+              <w:right w:val="single" w:color="000000" w:sz="4" w:space="0"/>
             </w:tcBorders>
             <w:vAlign w:val="center"/>
           </w:tcPr>
           <w:p>
             <w:pPr>
-              <w:pStyle w:val="Normal"/>
-              <w:spacing w:lineRule="exact" w:line="320"/>
+              <w:spacing w:line="320" w:lineRule="exact"/>
               <w:jc w:val="center"/>
               <w:rPr>
                 <w:rFonts w:ascii="宋体" w:hAnsi="宋体" w:eastAsia="宋体"/>
                 <w:sz w:val="24"/>
               </w:rPr>
             </w:pPr>
-            <w:r>
-              <w:rPr>
-                <w:rFonts w:ascii="宋体" w:hAnsi="宋体" w:eastAsia="宋体"/>
-                <w:sz w:val="24"/>
-              </w:rPr>
-              <w:t xml:space="preserve"/>
-            </w:r>
           </w:p>
         </w:tc>
       </w:tr>
       <w:tr>
+        <w:tblPrEx>
+          <w:tblCellMar>
+            <w:top w:w="0" w:type="dxa"/>
+            <w:left w:w="108" w:type="dxa"/>
+            <w:bottom w:w="0" w:type="dxa"/>
+            <w:right w:w="108" w:type="dxa"/>
+          </w:tblCellMar>
+        </w:tblPrEx>
         <w:trPr>
           <w:trHeight w:val="480" w:hRule="atLeast"/>
+          <w:jc w:val="center"/>
         </w:trPr>
         <w:tc>
           <w:tcPr>
             <w:tcW w:w="2077" w:type="dxa"/>
             <w:tcBorders>
-              <w:top w:val="single" w:sz="4" w:space="0" w:color="000000"/>
-              <w:start w:val="single" w:sz="4" w:space="0" w:color="000000"/>
-              <w:bottom w:val="single" w:sz="4" w:space="0" w:color="000000"/>
-              <w:end w:val="single" w:sz="4" w:space="0" w:color="000000"/>
+              <w:top w:val="single" w:color="000000" w:sz="4" w:space="0"/>
+              <w:left w:val="single" w:color="000000" w:sz="4" w:space="0"/>
+              <w:bottom w:val="single" w:color="000000" w:sz="4" w:space="0"/>
+              <w:right w:val="single" w:color="000000" w:sz="4" w:space="0"/>
             </w:tcBorders>
             <w:vAlign w:val="center"/>
           </w:tcPr>
           <w:p>
             <w:pPr>
-              <w:pStyle w:val="Normal"/>
-              <w:spacing w:lineRule="exact" w:line="320"/>
+              <w:spacing w:line="320" w:lineRule="exact"/>
               <w:jc w:val="center"/>
               <w:rPr>
                 <w:rFonts w:ascii="宋体" w:hAnsi="宋体" w:eastAsia="宋体"/>
@@ -4849,7 +4925,7 @@
                 <w:rFonts w:ascii="宋体" w:hAnsi="宋体" w:eastAsia="宋体"/>
                 <w:sz w:val="24"/>
               </w:rPr>
-              <w:t xml:space="preserve">2026.05-2026.06</w:t>
+              <w:t>2026.05-2026.06</w:t>
             </w:r>
           </w:p>
         </w:tc>
@@ -4857,17 +4933,16 @@
           <w:tcPr>
             <w:tcW w:w="5167" w:type="dxa"/>
             <w:tcBorders>
-              <w:top w:val="single" w:sz="4" w:space="0" w:color="000000"/>
-              <w:start w:val="single" w:sz="4" w:space="0" w:color="000000"/>
-              <w:bottom w:val="single" w:sz="4" w:space="0" w:color="000000"/>
-              <w:end w:val="single" w:sz="4" w:space="0" w:color="000000"/>
+              <w:top w:val="single" w:color="000000" w:sz="4" w:space="0"/>
+              <w:left w:val="single" w:color="000000" w:sz="4" w:space="0"/>
+              <w:bottom w:val="single" w:color="000000" w:sz="4" w:space="0"/>
+              <w:right w:val="single" w:color="000000" w:sz="4" w:space="0"/>
             </w:tcBorders>
             <w:vAlign w:val="center"/>
           </w:tcPr>
           <w:p>
             <w:pPr>
-              <w:pStyle w:val="Normal"/>
-              <w:spacing w:lineRule="exact" w:line="320"/>
+              <w:spacing w:line="320" w:lineRule="exact"/>
               <w:jc w:val="center"/>
               <w:rPr>
                 <w:rFonts w:ascii="宋体" w:hAnsi="宋体" w:eastAsia="宋体"/>
@@ -4879,7 +4954,7 @@
                 <w:rFonts w:ascii="宋体" w:hAnsi="宋体" w:eastAsia="宋体"/>
                 <w:sz w:val="24"/>
               </w:rPr>
-              <w:t xml:space="preserve">撰写学位论文，整理实验数据与图表，准备投稿</w:t>
+              <w:t>撰写学位论文，整理实验数据与图表，准备投稿</w:t>
             </w:r>
           </w:p>
         </w:tc>
@@ -4887,52 +4962,52 @@
           <w:tcPr>
             <w:tcW w:w="2297" w:type="dxa"/>
             <w:tcBorders>
-              <w:top w:val="single" w:sz="4" w:space="0" w:color="000000"/>
-              <w:start w:val="single" w:sz="4" w:space="0" w:color="000000"/>
-              <w:bottom w:val="single" w:sz="4" w:space="0" w:color="000000"/>
-              <w:end w:val="single" w:sz="4" w:space="0" w:color="000000"/>
+              <w:top w:val="single" w:color="000000" w:sz="4" w:space="0"/>
+              <w:left w:val="single" w:color="000000" w:sz="4" w:space="0"/>
+              <w:bottom w:val="single" w:color="000000" w:sz="4" w:space="0"/>
+              <w:right w:val="single" w:color="000000" w:sz="4" w:space="0"/>
             </w:tcBorders>
             <w:vAlign w:val="center"/>
           </w:tcPr>
           <w:p>
             <w:pPr>
-              <w:pStyle w:val="Normal"/>
-              <w:spacing w:lineRule="exact" w:line="320"/>
+              <w:spacing w:line="320" w:lineRule="exact"/>
               <w:jc w:val="center"/>
               <w:rPr>
                 <w:rFonts w:ascii="宋体" w:hAnsi="宋体" w:eastAsia="宋体"/>
                 <w:sz w:val="24"/>
               </w:rPr>
             </w:pPr>
-            <w:r>
-              <w:rPr>
-                <w:rFonts w:ascii="宋体" w:hAnsi="宋体" w:eastAsia="宋体"/>
-                <w:sz w:val="24"/>
-              </w:rPr>
-              <w:t xml:space="preserve"/>
-            </w:r>
           </w:p>
         </w:tc>
       </w:tr>
       <w:tr>
+        <w:tblPrEx>
+          <w:tblCellMar>
+            <w:top w:w="0" w:type="dxa"/>
+            <w:left w:w="108" w:type="dxa"/>
+            <w:bottom w:w="0" w:type="dxa"/>
+            <w:right w:w="108" w:type="dxa"/>
+          </w:tblCellMar>
+        </w:tblPrEx>
         <w:trPr>
           <w:trHeight w:val="480" w:hRule="atLeast"/>
+          <w:jc w:val="center"/>
         </w:trPr>
         <w:tc>
           <w:tcPr>
             <w:tcW w:w="2077" w:type="dxa"/>
             <w:tcBorders>
-              <w:top w:val="single" w:sz="4" w:space="0" w:color="000000"/>
-              <w:start w:val="single" w:sz="4" w:space="0" w:color="000000"/>
-              <w:bottom w:val="single" w:sz="4" w:space="0" w:color="000000"/>
-              <w:end w:val="single" w:sz="4" w:space="0" w:color="000000"/>
+              <w:top w:val="single" w:color="000000" w:sz="4" w:space="0"/>
+              <w:left w:val="single" w:color="000000" w:sz="4" w:space="0"/>
+              <w:bottom w:val="single" w:color="000000" w:sz="4" w:space="0"/>
+              <w:right w:val="single" w:color="000000" w:sz="4" w:space="0"/>
             </w:tcBorders>
             <w:vAlign w:val="center"/>
           </w:tcPr>
           <w:p>
             <w:pPr>
-              <w:pStyle w:val="Normal"/>
-              <w:spacing w:lineRule="exact" w:line="320"/>
+              <w:spacing w:line="320" w:lineRule="exact"/>
               <w:jc w:val="center"/>
               <w:rPr>
                 <w:rFonts w:ascii="宋体" w:hAnsi="宋体" w:eastAsia="宋体"/>
@@ -4944,7 +5019,7 @@
                 <w:rFonts w:ascii="宋体" w:hAnsi="宋体" w:eastAsia="宋体"/>
                 <w:sz w:val="24"/>
               </w:rPr>
-              <w:t xml:space="preserve">2026.06</w:t>
+              <w:t>2026.06</w:t>
             </w:r>
           </w:p>
         </w:tc>
@@ -4952,17 +5027,16 @@
           <w:tcPr>
             <w:tcW w:w="5167" w:type="dxa"/>
             <w:tcBorders>
-              <w:top w:val="single" w:sz="4" w:space="0" w:color="000000"/>
-              <w:start w:val="single" w:sz="4" w:space="0" w:color="000000"/>
-              <w:bottom w:val="single" w:sz="4" w:space="0" w:color="000000"/>
-              <w:end w:val="single" w:sz="4" w:space="0" w:color="000000"/>
+              <w:top w:val="single" w:color="000000" w:sz="4" w:space="0"/>
+              <w:left w:val="single" w:color="000000" w:sz="4" w:space="0"/>
+              <w:bottom w:val="single" w:color="000000" w:sz="4" w:space="0"/>
+              <w:right w:val="single" w:color="000000" w:sz="4" w:space="0"/>
             </w:tcBorders>
             <w:vAlign w:val="center"/>
           </w:tcPr>
           <w:p>
             <w:pPr>
-              <w:pStyle w:val="Normal"/>
-              <w:spacing w:lineRule="exact" w:line="320"/>
+              <w:spacing w:line="320" w:lineRule="exact"/>
               <w:jc w:val="center"/>
               <w:rPr>
                 <w:rFonts w:ascii="宋体" w:hAnsi="宋体" w:eastAsia="宋体"/>
@@ -4974,7 +5048,7 @@
                 <w:rFonts w:ascii="宋体" w:hAnsi="宋体" w:eastAsia="宋体"/>
                 <w:sz w:val="24"/>
               </w:rPr>
-              <w:t xml:space="preserve">学位论文答辩</w:t>
+              <w:t>学位论文答辩</w:t>
             </w:r>
           </w:p>
         </w:tc>
@@ -4982,30 +5056,22 @@
           <w:tcPr>
             <w:tcW w:w="2297" w:type="dxa"/>
             <w:tcBorders>
-              <w:top w:val="single" w:sz="4" w:space="0" w:color="000000"/>
-              <w:start w:val="single" w:sz="4" w:space="0" w:color="000000"/>
-              <w:bottom w:val="single" w:sz="4" w:space="0" w:color="000000"/>
-              <w:end w:val="single" w:sz="4" w:space="0" w:color="000000"/>
+              <w:top w:val="single" w:color="000000" w:sz="4" w:space="0"/>
+              <w:left w:val="single" w:color="000000" w:sz="4" w:space="0"/>
+              <w:bottom w:val="single" w:color="000000" w:sz="4" w:space="0"/>
+              <w:right w:val="single" w:color="000000" w:sz="4" w:space="0"/>
             </w:tcBorders>
             <w:vAlign w:val="center"/>
           </w:tcPr>
           <w:p>
             <w:pPr>
-              <w:pStyle w:val="Normal"/>
-              <w:spacing w:lineRule="exact" w:line="320"/>
+              <w:spacing w:line="320" w:lineRule="exact"/>
               <w:jc w:val="center"/>
               <w:rPr>
                 <w:rFonts w:ascii="宋体" w:hAnsi="宋体" w:eastAsia="宋体"/>
                 <w:sz w:val="24"/>
               </w:rPr>
             </w:pPr>
-            <w:r>
-              <w:rPr>
-                <w:rFonts w:ascii="宋体" w:hAnsi="宋体" w:eastAsia="宋体"/>
-                <w:sz w:val="24"/>
-              </w:rPr>
-              <w:t xml:space="preserve"/>
-            </w:r>
           </w:p>
         </w:tc>
       </w:tr>
@@ -6679,8 +6745,8 @@
     <w:lsdException w:unhideWhenUsed="0" w:uiPriority="0" w:semiHidden="0" w:name="Normal Indent"/>
     <w:lsdException w:unhideWhenUsed="0" w:uiPriority="0" w:semiHidden="0" w:name="footnote text"/>
     <w:lsdException w:unhideWhenUsed="0" w:uiPriority="0" w:semiHidden="0" w:name="annotation text"/>
-    <w:lsdException w:unhideWhenUsed="0" w:uiPriority="0" w:semiHidden="0" w:name="header"/>
-    <w:lsdException w:unhideWhenUsed="0" w:uiPriority="0" w:semiHidden="0" w:name="footer"/>
+    <w:lsdException w:qFormat="1" w:unhideWhenUsed="0" w:uiPriority="0" w:semiHidden="0" w:name="header"/>
+    <w:lsdException w:qFormat="1" w:unhideWhenUsed="0" w:uiPriority="0" w:semiHidden="0" w:name="footer"/>
     <w:lsdException w:unhideWhenUsed="0" w:uiPriority="0" w:semiHidden="0" w:name="index heading"/>
     <w:lsdException w:qFormat="1" w:unhideWhenUsed="0" w:uiPriority="0" w:semiHidden="0" w:name="caption"/>
     <w:lsdException w:unhideWhenUsed="0" w:uiPriority="0" w:semiHidden="0" w:name="table of figures"/>
@@ -6689,13 +6755,13 @@
     <w:lsdException w:unhideWhenUsed="0" w:uiPriority="0" w:semiHidden="0" w:name="footnote reference"/>
     <w:lsdException w:unhideWhenUsed="0" w:uiPriority="0" w:semiHidden="0" w:name="annotation reference"/>
     <w:lsdException w:unhideWhenUsed="0" w:uiPriority="0" w:semiHidden="0" w:name="line number"/>
-    <w:lsdException w:unhideWhenUsed="0" w:uiPriority="0" w:semiHidden="0" w:name="page number"/>
+    <w:lsdException w:qFormat="1" w:unhideWhenUsed="0" w:uiPriority="0" w:semiHidden="0" w:name="page number"/>
     <w:lsdException w:unhideWhenUsed="0" w:uiPriority="0" w:semiHidden="0" w:name="endnote reference"/>
     <w:lsdException w:unhideWhenUsed="0" w:uiPriority="0" w:semiHidden="0" w:name="endnote text"/>
     <w:lsdException w:unhideWhenUsed="0" w:uiPriority="0" w:semiHidden="0" w:name="table of authorities"/>
     <w:lsdException w:unhideWhenUsed="0" w:uiPriority="0" w:semiHidden="0" w:name="macro"/>
     <w:lsdException w:unhideWhenUsed="0" w:uiPriority="0" w:semiHidden="0" w:name="toa heading"/>
-    <w:lsdException w:unhideWhenUsed="0" w:uiPriority="0" w:semiHidden="0" w:name="List"/>
+    <w:lsdException w:qFormat="1" w:unhideWhenUsed="0" w:uiPriority="0" w:semiHidden="0" w:name="List"/>
     <w:lsdException w:unhideWhenUsed="0" w:uiPriority="0" w:semiHidden="0" w:name="List Bullet"/>
     <w:lsdException w:unhideWhenUsed="0" w:uiPriority="0" w:semiHidden="0" w:name="List Number"/>
     <w:lsdException w:unhideWhenUsed="0" w:uiPriority="0" w:semiHidden="0" w:name="List 2"/>
@@ -6714,7 +6780,7 @@
     <w:lsdException w:unhideWhenUsed="0" w:uiPriority="0" w:semiHidden="0" w:name="Closing"/>
     <w:lsdException w:unhideWhenUsed="0" w:uiPriority="0" w:semiHidden="0" w:name="Signature"/>
     <w:lsdException w:qFormat="1" w:unhideWhenUsed="0" w:uiPriority="0" w:semiHidden="0" w:name="Default Paragraph Font"/>
-    <w:lsdException w:unhideWhenUsed="0" w:uiPriority="0" w:semiHidden="0" w:name="Body Text"/>
+    <w:lsdException w:qFormat="1" w:unhideWhenUsed="0" w:uiPriority="0" w:semiHidden="0" w:name="Body Text"/>
     <w:lsdException w:unhideWhenUsed="0" w:uiPriority="0" w:semiHidden="0" w:name="Body Text Indent"/>
     <w:lsdException w:unhideWhenUsed="0" w:uiPriority="0" w:semiHidden="0" w:name="List Continue"/>
     <w:lsdException w:unhideWhenUsed="0" w:uiPriority="0" w:semiHidden="0" w:name="List Continue 2"/>
@@ -6733,7 +6799,7 @@
     <w:lsdException w:unhideWhenUsed="0" w:uiPriority="0" w:semiHidden="0" w:name="Body Text Indent 2"/>
     <w:lsdException w:unhideWhenUsed="0" w:uiPriority="0" w:semiHidden="0" w:name="Body Text Indent 3"/>
     <w:lsdException w:unhideWhenUsed="0" w:uiPriority="0" w:semiHidden="0" w:name="Block Text"/>
-    <w:lsdException w:unhideWhenUsed="0" w:uiPriority="0" w:semiHidden="0" w:name="Hyperlink"/>
+    <w:lsdException w:qFormat="1" w:unhideWhenUsed="0" w:uiPriority="0" w:semiHidden="0" w:name="Hyperlink"/>
     <w:lsdException w:unhideWhenUsed="0" w:uiPriority="0" w:semiHidden="0" w:name="FollowedHyperlink"/>
     <w:lsdException w:qFormat="1" w:unhideWhenUsed="0" w:uiPriority="0" w:semiHidden="0" w:name="Strong"/>
     <w:lsdException w:qFormat="1" w:unhideWhenUsed="0" w:uiPriority="0" w:semiHidden="0" w:name="Emphasis"/>
@@ -6751,7 +6817,7 @@
     <w:lsdException w:unhideWhenUsed="0" w:uiPriority="0" w:semiHidden="0" w:name="HTML Sample"/>
     <w:lsdException w:unhideWhenUsed="0" w:uiPriority="0" w:semiHidden="0" w:name="HTML Typewriter"/>
     <w:lsdException w:unhideWhenUsed="0" w:uiPriority="0" w:semiHidden="0" w:name="HTML Variable"/>
-    <w:lsdException w:unhideWhenUsed="0" w:uiPriority="0" w:name="Normal Table"/>
+    <w:lsdException w:qFormat="1" w:unhideWhenUsed="0" w:uiPriority="0" w:name="Normal Table"/>
     <w:lsdException w:unhideWhenUsed="0" w:uiPriority="0" w:semiHidden="0" w:name="annotation subject"/>
     <w:lsdException w:unhideWhenUsed="0" w:uiPriority="0" w:semiHidden="0" w:name="Table Simple 1"/>
     <w:lsdException w:unhideWhenUsed="0" w:uiPriority="0" w:semiHidden="0" w:name="Table Simple 2"/>
@@ -6949,6 +7015,7 @@
   <w:style w:type="table" w:default="1" w:styleId="9">
     <w:name w:val="Normal Table"/>
     <w:semiHidden/>
+    <w:qFormat/>
     <w:uiPriority w:val="0"/>
     <w:tblPr>
       <w:tblCellMar>
@@ -6962,6 +7029,7 @@
   <w:style w:type="paragraph" w:styleId="3">
     <w:name w:val="Body Text"/>
     <w:basedOn w:val="1"/>
+    <w:qFormat/>
     <w:uiPriority w:val="0"/>
     <w:pPr>
       <w:spacing w:line="400" w:lineRule="exact"/>
@@ -6992,6 +7060,7 @@
   <w:style w:type="paragraph" w:styleId="5">
     <w:name w:val="footer"/>
     <w:basedOn w:val="1"/>
+    <w:qFormat/>
     <w:uiPriority w:val="0"/>
     <w:pPr>
       <w:tabs>
@@ -7009,6 +7078,7 @@
   <w:style w:type="paragraph" w:styleId="6">
     <w:name w:val="header"/>
     <w:basedOn w:val="1"/>
+    <w:qFormat/>
     <w:uiPriority w:val="0"/>
     <w:pPr>
       <w:pBdr>
@@ -7029,6 +7099,7 @@
   <w:style w:type="paragraph" w:styleId="7">
     <w:name w:val="List"/>
     <w:basedOn w:val="3"/>
+    <w:qFormat/>
     <w:uiPriority w:val="0"/>
     <w:rPr>
       <w:rFonts w:cs="Noto Sans Devanagari"/>
@@ -7062,10 +7133,12 @@
   <w:style w:type="character" w:styleId="12">
     <w:name w:val="page number"/>
     <w:basedOn w:val="10"/>
+    <w:qFormat/>
     <w:uiPriority w:val="0"/>
   </w:style>
   <w:style w:type="character" w:styleId="13">
     <w:name w:val="Hyperlink"/>
+    <w:qFormat/>
     <w:uiPriority w:val="0"/>
     <w:rPr>
       <w:color w:val="0000FF"/>

</xml_diff>

<commit_message>
fix(defense-matrix): FORTIFY row should be all-green (cross-ISA universal bug)
_FORTIFY_SOURCE is ISA-agnostic; mark all five ISA columns as
confirmed/merged (#228833) instead of only x86-64.
</commit_message>
<xml_diff>
--- a/docs/开题报告/DeFuzz-开题报告.docx
+++ b/docs/开题报告/DeFuzz-开题报告.docx
@@ -250,6 +250,7 @@
           <w:u w:val="single"/>
         </w:rPr>
         <w:tab/>
+        <w:tab/>
       </w:r>
       <w:r>
         <w:rPr>
@@ -258,8 +259,9 @@
           <w:kern w:val="2"/>
           <w:sz w:val="28"/>
           <w:u w:val="single"/>
-        </w:rPr>
-        <w:tab/>
+          <w:lang w:val="en-US" w:eastAsia="zh-CN"/>
+        </w:rPr>
+        <w:t xml:space="preserve">  </w:t>
       </w:r>
       <w:r>
         <w:rPr>
@@ -268,9 +270,9 @@
           <w:kern w:val="2"/>
           <w:sz w:val="28"/>
           <w:u w:val="single"/>
-          <w:lang w:val="en-US" w:eastAsia="zh-CN"/>
-        </w:rPr>
-        <w:t xml:space="preserve">  </w:t>
+          <w:lang w:eastAsia="zh-CN"/>
+        </w:rPr>
+        <w:t>专业硕士</w:t>
       </w:r>
       <w:r>
         <w:rPr>
@@ -279,38 +281,9 @@
           <w:kern w:val="2"/>
           <w:sz w:val="28"/>
           <w:u w:val="single"/>
-          <w:lang w:eastAsia="zh-CN"/>
-        </w:rPr>
-        <w:t>专业硕士</w:t>
-      </w:r>
-      <w:r>
-        <w:rPr>
-          <w:rFonts w:hint="eastAsia" w:ascii="宋体" w:hAnsi="宋体"/>
-          <w:spacing w:val="40"/>
-          <w:kern w:val="2"/>
-          <w:sz w:val="28"/>
-          <w:u w:val="single"/>
         </w:rPr>
         <w:tab/>
-      </w:r>
-      <w:r>
-        <w:rPr>
-          <w:rFonts w:hint="eastAsia" w:ascii="宋体" w:hAnsi="宋体"/>
-          <w:spacing w:val="40"/>
-          <w:kern w:val="2"/>
-          <w:sz w:val="28"/>
-          <w:u w:val="single"/>
-        </w:rPr>
         <w:tab/>
-      </w:r>
-      <w:r>
-        <w:rPr>
-          <w:rFonts w:hint="eastAsia" w:ascii="宋体" w:hAnsi="宋体"/>
-          <w:spacing w:val="40"/>
-          <w:kern w:val="2"/>
-          <w:sz w:val="28"/>
-          <w:u w:val="single"/>
-        </w:rPr>
         <w:tab/>
       </w:r>
       <w:r>
@@ -442,45 +415,9 @@
           <w:u w:val="single"/>
         </w:rPr>
         <w:tab/>
-      </w:r>
-      <w:r>
-        <w:rPr>
-          <w:rFonts w:hint="eastAsia" w:ascii="宋体" w:hAnsi="宋体"/>
-          <w:spacing w:val="40"/>
-          <w:kern w:val="2"/>
-          <w:sz w:val="28"/>
-          <w:u w:val="single"/>
-        </w:rPr>
         <w:tab/>
-      </w:r>
-      <w:r>
-        <w:rPr>
-          <w:rFonts w:hint="eastAsia" w:ascii="宋体" w:hAnsi="宋体"/>
-          <w:spacing w:val="40"/>
-          <w:kern w:val="2"/>
-          <w:sz w:val="28"/>
-          <w:u w:val="single"/>
-        </w:rPr>
         <w:t>电子信息</w:t>
-      </w:r>
-      <w:r>
-        <w:rPr>
-          <w:rFonts w:hint="eastAsia" w:ascii="宋体" w:hAnsi="宋体"/>
-          <w:spacing w:val="40"/>
-          <w:kern w:val="2"/>
-          <w:sz w:val="28"/>
-          <w:u w:val="single"/>
-        </w:rPr>
         <w:tab/>
-      </w:r>
-      <w:r>
-        <w:rPr>
-          <w:rFonts w:hint="eastAsia" w:ascii="宋体" w:hAnsi="宋体"/>
-          <w:spacing w:val="40"/>
-          <w:kern w:val="2"/>
-          <w:sz w:val="28"/>
-          <w:u w:val="single"/>
-        </w:rPr>
         <w:tab/>
       </w:r>
     </w:p>
@@ -540,6 +477,7 @@
           <w:u w:val="single"/>
         </w:rPr>
         <w:tab/>
+        <w:tab/>
       </w:r>
       <w:r>
         <w:rPr>
@@ -548,8 +486,9 @@
           <w:kern w:val="2"/>
           <w:sz w:val="28"/>
           <w:u w:val="single"/>
-        </w:rPr>
-        <w:tab/>
+          <w:lang w:val="en-US" w:eastAsia="zh-CN"/>
+        </w:rPr>
+        <w:t xml:space="preserve"> </w:t>
       </w:r>
       <w:r>
         <w:rPr>
@@ -558,9 +497,9 @@
           <w:kern w:val="2"/>
           <w:sz w:val="28"/>
           <w:u w:val="single"/>
-          <w:lang w:val="en-US" w:eastAsia="zh-CN"/>
-        </w:rPr>
-        <w:t xml:space="preserve"> </w:t>
+          <w:lang w:eastAsia="zh-CN"/>
+        </w:rPr>
+        <w:t>张景耀</w:t>
       </w:r>
       <w:r>
         <w:rPr>
@@ -569,10 +508,12 @@
           <w:kern w:val="2"/>
           <w:sz w:val="28"/>
           <w:u w:val="single"/>
-          <w:lang w:eastAsia="zh-CN"/>
-        </w:rPr>
-        <w:t>张景耀</w:t>
-      </w:r>
+          <w:lang w:val="en-US" w:eastAsia="zh-CN"/>
+        </w:rPr>
+        <w:t xml:space="preserve">  </w:t>
+      </w:r>
+      <w:bookmarkStart w:id="0" w:name="_GoBack"/>
+      <w:bookmarkEnd w:id="0"/>
       <w:r>
         <w:rPr>
           <w:rFonts w:hint="eastAsia" w:ascii="宋体" w:hAnsi="宋体"/>
@@ -580,28 +521,8 @@
           <w:kern w:val="2"/>
           <w:sz w:val="28"/>
           <w:u w:val="single"/>
-          <w:lang w:val="en-US" w:eastAsia="zh-CN"/>
-        </w:rPr>
-        <w:t xml:space="preserve">  </w:t>
-      </w:r>
-      <w:r>
-        <w:rPr>
-          <w:rFonts w:hint="eastAsia" w:ascii="宋体" w:hAnsi="宋体"/>
-          <w:spacing w:val="40"/>
-          <w:kern w:val="2"/>
-          <w:sz w:val="28"/>
-          <w:u w:val="single"/>
         </w:rPr>
         <w:tab/>
-      </w:r>
-      <w:r>
-        <w:rPr>
-          <w:rFonts w:hint="eastAsia" w:ascii="宋体" w:hAnsi="宋体"/>
-          <w:spacing w:val="40"/>
-          <w:kern w:val="2"/>
-          <w:sz w:val="28"/>
-          <w:u w:val="single"/>
-        </w:rPr>
         <w:tab/>
       </w:r>
       <w:r>
@@ -662,6 +583,7 @@
           <w:u w:val="single"/>
         </w:rPr>
         <w:tab/>
+        <w:tab/>
       </w:r>
       <w:r>
         <w:rPr>
@@ -670,8 +592,9 @@
           <w:kern w:val="2"/>
           <w:sz w:val="28"/>
           <w:u w:val="single"/>
-        </w:rPr>
-        <w:tab/>
+          <w:lang w:val="en-US" w:eastAsia="zh-CN"/>
+        </w:rPr>
+        <w:t xml:space="preserve"> </w:t>
       </w:r>
       <w:r>
         <w:rPr>
@@ -680,9 +603,9 @@
           <w:kern w:val="2"/>
           <w:sz w:val="28"/>
           <w:u w:val="single"/>
-          <w:lang w:val="en-US" w:eastAsia="zh-CN"/>
-        </w:rPr>
-        <w:t xml:space="preserve"> </w:t>
+          <w:lang w:eastAsia="zh-CN"/>
+        </w:rPr>
+        <w:t>徐坚皓</w:t>
       </w:r>
       <w:r>
         <w:rPr>
@@ -691,9 +614,9 @@
           <w:kern w:val="2"/>
           <w:sz w:val="28"/>
           <w:u w:val="single"/>
-          <w:lang w:eastAsia="zh-CN"/>
-        </w:rPr>
-        <w:t>徐坚皓</w:t>
+          <w:lang w:val="en-US" w:eastAsia="zh-CN"/>
+        </w:rPr>
+        <w:t xml:space="preserve">  </w:t>
       </w:r>
       <w:r>
         <w:rPr>
@@ -702,28 +625,8 @@
           <w:kern w:val="2"/>
           <w:sz w:val="28"/>
           <w:u w:val="single"/>
-          <w:lang w:val="en-US" w:eastAsia="zh-CN"/>
-        </w:rPr>
-        <w:t xml:space="preserve">  </w:t>
-      </w:r>
-      <w:r>
-        <w:rPr>
-          <w:rFonts w:hint="eastAsia" w:ascii="宋体" w:hAnsi="宋体"/>
-          <w:spacing w:val="40"/>
-          <w:kern w:val="2"/>
-          <w:sz w:val="28"/>
-          <w:u w:val="single"/>
         </w:rPr>
         <w:tab/>
-      </w:r>
-      <w:r>
-        <w:rPr>
-          <w:rFonts w:hint="eastAsia" w:ascii="宋体" w:hAnsi="宋体"/>
-          <w:spacing w:val="40"/>
-          <w:kern w:val="2"/>
-          <w:sz w:val="28"/>
-          <w:u w:val="single"/>
-        </w:rPr>
         <w:tab/>
       </w:r>
       <w:r>
@@ -782,15 +685,6 @@
           <w:u w:val="single"/>
         </w:rPr>
         <w:tab/>
-      </w:r>
-      <w:r>
-        <w:rPr>
-          <w:rFonts w:hint="eastAsia" w:ascii="宋体" w:hAnsi="宋体"/>
-          <w:spacing w:val="40"/>
-          <w:kern w:val="2"/>
-          <w:sz w:val="28"/>
-          <w:u w:val="single"/>
-        </w:rPr>
         <w:tab/>
       </w:r>
       <w:r>
@@ -897,21 +791,7 @@
           <w:u w:val="single"/>
         </w:rPr>
         <w:tab/>
-      </w:r>
-      <w:r>
-        <w:rPr>
-          <w:rFonts w:hint="eastAsia" w:ascii="宋体" w:hAnsi="宋体"/>
-          <w:sz w:val="28"/>
-          <w:u w:val="single"/>
-        </w:rPr>
         <w:tab/>
-      </w:r>
-      <w:r>
-        <w:rPr>
-          <w:rFonts w:hint="eastAsia" w:ascii="宋体" w:hAnsi="宋体"/>
-          <w:sz w:val="28"/>
-          <w:u w:val="single"/>
-        </w:rPr>
         <w:tab/>
       </w:r>
       <w:r>
@@ -938,13 +818,6 @@
           <w:u w:val="single"/>
         </w:rPr>
         <w:tab/>
-      </w:r>
-      <w:r>
-        <w:rPr>
-          <w:rFonts w:hint="eastAsia" w:ascii="宋体" w:hAnsi="宋体"/>
-          <w:sz w:val="28"/>
-          <w:u w:val="single"/>
-        </w:rPr>
         <w:tab/>
       </w:r>
       <w:r>
@@ -1495,26 +1368,6 @@
             </w:pPr>
             <w:r>
               <w:rPr>
-                <w:rFonts w:hint="default"/>
-                <w:kern w:val="0"/>
-                <w:sz w:val="24"/>
-                <w:lang w:val="en-US"/>
-              </w:rPr>
-              <w:t>DeFuzz</w:t>
-            </w:r>
-            <w:r>
-              <w:rPr>
-                <w:rFonts w:hint="eastAsia"/>
-                <w:kern w:val="0"/>
-                <w:sz w:val="24"/>
-                <w:lang w:val="en-US" w:eastAsia="zh-CN"/>
-              </w:rPr>
-              <w:t>：</w:t>
-            </w:r>
-            <w:bookmarkStart w:id="0" w:name="_GoBack"/>
-            <w:bookmarkEnd w:id="0"/>
-            <w:r>
-              <w:rPr>
                 <w:rFonts w:hint="eastAsia"/>
                 <w:kern w:val="0"/>
                 <w:sz w:val="24"/>
@@ -1918,14 +1771,6 @@
         </w:tc>
       </w:tr>
       <w:tr>
-        <w:tblPrEx>
-          <w:tblCellMar>
-            <w:top w:w="0" w:type="dxa"/>
-            <w:left w:w="56" w:type="dxa"/>
-            <w:bottom w:w="0" w:type="dxa"/>
-            <w:right w:w="56" w:type="dxa"/>
-          </w:tblCellMar>
-        </w:tblPrEx>
         <w:trPr>
           <w:jc w:val="center"/>
         </w:trPr>
@@ -2499,8 +2344,9 @@
           </w:p>
           <w:p>
             <w:pPr>
+              <w:pStyle w:val="Normal"/>
               <w:widowControl/>
-              <w:jc w:val="left"/>
+              <w:jc w:val="start"/>
               <w:rPr>
                 <w:b/>
                 <w:bCs/>
@@ -2520,30 +2366,33 @@
           </w:p>
           <w:p>
             <w:pPr>
-              <w:spacing w:line="360" w:lineRule="auto"/>
-              <w:ind w:left="0" w:leftChars="0" w:right="0" w:rightChars="0" w:firstLineChars="200"/>
-              <w:rPr>
-                <w:kern w:val="0"/>
-                <w:sz w:val="24"/>
-              </w:rPr>
-            </w:pPr>
-            <w:r>
-              <w:rPr>
-                <w:kern w:val="0"/>
-                <w:sz w:val="24"/>
-              </w:rPr>
-              <w:t>CVE-2023-4039 暴露了 GCC 在 AArch64 上栈保护机制的一处长期失效。当函数使用变长数组（VLA）或 alloca 时，编译器把栈金丝雀放在 VLA 之上、保存的返回地址却落在 VLA 之下，越界写入可以先于金丝雀检查改写返回地址，-fstack-protector 因此形同虚设——这种 buggy 状态下的栈帧布局可参见图 1。编译过程不报错，二进制能通过功能测试，缺陷只在攻击者构造特定输入时才显现。该漏洞自 GCC 早期版本即已存在，直到 2023 年才由外部研究者系统分析并修复。问题的共性也由此显现：编译器侧的防御机制依赖前端识别、中端 pass 与后端代码生成共同维护一组安全不变量，其中任何一处与具体 ISA 的栈布局、寄存器分配或指令编码假设不一致，防御机制就会悄然失效——对外仍然"存在"，对攻击者不再有效。</w:t>
-            </w:r>
-          </w:p>
-          <w:p>
-            <w:pPr>
-              <w:spacing w:line="360" w:lineRule="auto"/>
-              <w:jc w:val="center"/>
-            </w:pPr>
-            <w:r>
+              <w:pStyle w:val="Normal"/>
+              <w:spacing w:lineRule="auto" w:line="360"/>
+              <w:ind w:firstLineChars="200" w:startChars="0" w:start="0" w:endChars="0" w:end="0"/>
+              <w:rPr>
+                <w:kern w:val="0"/>
+                <w:sz w:val="24"/>
+              </w:rPr>
+            </w:pPr>
+            <w:r>
+              <w:rPr>
+                <w:kern w:val="0"/>
+                <w:sz w:val="24"/>
+              </w:rPr>
+              <w:t xml:space="preserve">CVE-2023-4039 暴露了 GCC 在 AArch64 上栈保护机制的一处长期失效。当函数使用变长数组（VLA）或 alloca 时，编译器把栈金丝雀放在 VLA 之上、保存的返回地址却落在 VLA 之下，越界写入可以先于金丝雀检查改写返回地址，-fstack-protector 因此形同虚设——这种 buggy 状态下的栈帧布局可参见图 1。编译过程不报错，二进制能通过功能测试，缺陷只在攻击者构造特定输入时才显现。该漏洞自 GCC 早期版本即已存在，直到 2023 年才由外部研究者系统分析并修复。问题的共性也由此显现：编译器侧的防御机制依赖前端识别、中端 pass 与后端代码生成共同维护一组安全不变量，其中任何一处与具体 ISA 的栈布局、寄存器分配或指令编码假设不一致，防御机制就会悄然失效——对外仍然"存在"，对攻击者不再有效。</w:t>
+            </w:r>
+          </w:p>
+          <w:p>
+            <w:pPr>
+              <w:pStyle w:val="Normal"/>
+              <w:spacing w:lineRule="auto" w:line="360"/>
+              <w:jc w:val="center"/>
+            </w:pPr>
+            <w:r>
+              <w:rPr/>
               <w:drawing>
-                <wp:inline distT="0" distB="0" distL="0" distR="0">
-                  <wp:extent cx="4283710" cy="5326380"/>
+                <wp:inline xmlns:wp="http://schemas.openxmlformats.org/drawingml/2006/wordprocessingDrawing" distT="0" distB="0" distL="0" distR="0">
+                  <wp:extent cx="4284090" cy="5326553"/>
                   <wp:effectExtent l="0" t="0" r="0" b="0"/>
                   <wp:docPr id="21" name="Figure21"/>
                   <wp:cNvGraphicFramePr>
@@ -2553,13 +2402,11 @@
                     <a:graphicData uri="http://schemas.openxmlformats.org/drawingml/2006/picture">
                       <pic:pic xmlns:pic="http://schemas.openxmlformats.org/drawingml/2006/picture">
                         <pic:nvPicPr>
-                          <pic:cNvPr id="21" name="Figure21"/>
-                          <pic:cNvPicPr>
-                            <a:picLocks noChangeAspect="1"/>
-                          </pic:cNvPicPr>
+                          <pic:cNvPr id="21" name="stack-layout.png"/>
+                          <pic:cNvPicPr/>
                         </pic:nvPicPr>
                         <pic:blipFill>
-                          <a:blip r:embed="rId6"/>
+                          <a:blip xmlns:r="http://schemas.openxmlformats.org/officeDocument/2006/relationships" r:embed="rId21"/>
                           <a:stretch>
                             <a:fillRect/>
                           </a:stretch>
@@ -2582,7 +2429,8 @@
           </w:p>
           <w:p>
             <w:pPr>
-              <w:spacing w:line="300" w:lineRule="auto"/>
+              <w:pStyle w:val="Normal"/>
+              <w:spacing w:lineRule="auto" w:line="300"/>
               <w:jc w:val="center"/>
               <w:rPr>
                 <w:rFonts w:ascii="宋体" w:hAnsi="宋体" w:eastAsia="宋体"/>
@@ -2601,38 +2449,42 @@
           </w:p>
           <w:p>
             <w:pPr>
-              <w:spacing w:line="360" w:lineRule="auto"/>
-              <w:rPr>
-                <w:sz w:val="24"/>
-              </w:rPr>
-            </w:pPr>
-          </w:p>
-          <w:p>
-            <w:pPr>
-              <w:spacing w:line="360" w:lineRule="auto"/>
-              <w:ind w:left="0" w:leftChars="0" w:right="0" w:rightChars="0" w:firstLineChars="200"/>
-              <w:rPr>
-                <w:kern w:val="0"/>
-                <w:sz w:val="24"/>
-              </w:rPr>
-            </w:pPr>
-            <w:r>
-              <w:rPr>
-                <w:kern w:val="0"/>
-                <w:sz w:val="24"/>
-              </w:rPr>
-              <w:t>编译器所承载的防御机制数量本身已相当庞大：栈金丝雀、_FORTIFY_SOURCE、Intel CET 中的 IBT 与 SHSTK、AArch64 的 BTI 与 PAC、Shadow Stack、SafeStack、KCFI、CFI、HCFR 等，分别保护栈完整性、控制流、对象边界，且仍在扩展。目标 ISA 方面，x86-64、AArch64、RISC-V、LoongArch、MIPS、PowerPC 等架构在调用约定、寄存器分配与指令编码上差异显著，每种机制在各 ISA 上对应若干份独立的后端模板与中端 pass 实现。二者构成"防御机制 × ISA"的二维研究空间（见图 2），每一格对应一组需联合维护的安全不变量，目前已被覆盖的格点仍只是其中很小一部分。</w:t>
-            </w:r>
-          </w:p>
-          <w:p>
-            <w:pPr>
-              <w:spacing w:line="360" w:lineRule="auto"/>
-              <w:jc w:val="center"/>
-            </w:pPr>
-            <w:r>
+              <w:pStyle w:val="Normal"/>
+              <w:spacing w:lineRule="auto" w:line="360"/>
+              <w:rPr>
+                <w:sz w:val="24"/>
+              </w:rPr>
+            </w:pPr>
+          </w:p>
+          <w:p>
+            <w:pPr>
+              <w:pStyle w:val="Normal"/>
+              <w:spacing w:lineRule="auto" w:line="360"/>
+              <w:ind w:firstLineChars="200" w:startChars="0" w:start="0" w:endChars="0" w:end="0"/>
+              <w:rPr>
+                <w:kern w:val="0"/>
+                <w:sz w:val="24"/>
+              </w:rPr>
+            </w:pPr>
+            <w:r>
+              <w:rPr>
+                <w:kern w:val="0"/>
+                <w:sz w:val="24"/>
+              </w:rPr>
+              <w:t xml:space="preserve">编译器所承载的防御机制数量本身已相当庞大：栈金丝雀、_FORTIFY_SOURCE、Intel CET 中的 IBT 与 SHSTK、AArch64 的 BTI 与 PAC、Shadow Stack、SafeStack、KCFI、CFI、HCFR 等，分别保护栈完整性、控制流、对象边界，且仍在扩展。目标 ISA 方面，x86-64、AArch64、RISC-V、LoongArch、MIPS、PowerPC 等架构在调用约定、寄存器分配与指令编码上差异显著，每种机制在各 ISA 上对应若干份独立的后端模板与中端 pass 实现。二者构成"防御机制 × ISA"的二维研究空间（见图 2），每一格对应一组需联合维护的安全不变量，目前已被覆盖的格点仍只是其中很小一部分。</w:t>
+            </w:r>
+          </w:p>
+          <w:p>
+            <w:pPr>
+              <w:pStyle w:val="Normal"/>
+              <w:spacing w:lineRule="auto" w:line="360"/>
+              <w:jc w:val="center"/>
+            </w:pPr>
+            <w:r>
+              <w:rPr/>
               <w:drawing>
-                <wp:inline distT="0" distB="0" distL="0" distR="0">
-                  <wp:extent cx="5385435" cy="2709545"/>
+                <wp:inline xmlns:wp="http://schemas.openxmlformats.org/drawingml/2006/wordprocessingDrawing" distT="0" distB="0" distL="0" distR="0">
+                  <wp:extent cx="5385714" cy="2709687"/>
                   <wp:effectExtent l="0" t="0" r="0" b="0"/>
                   <wp:docPr id="22" name="Figure22"/>
                   <wp:cNvGraphicFramePr>
@@ -2642,13 +2494,11 @@
                     <a:graphicData uri="http://schemas.openxmlformats.org/drawingml/2006/picture">
                       <pic:pic xmlns:pic="http://schemas.openxmlformats.org/drawingml/2006/picture">
                         <pic:nvPicPr>
-                          <pic:cNvPr id="22" name="Figure22"/>
-                          <pic:cNvPicPr>
-                            <a:picLocks noChangeAspect="1"/>
-                          </pic:cNvPicPr>
+                          <pic:cNvPr id="22" name="defense-matrix.png"/>
+                          <pic:cNvPicPr/>
                         </pic:nvPicPr>
                         <pic:blipFill>
-                          <a:blip r:embed="rId7"/>
+                          <a:blip xmlns:r="http://schemas.openxmlformats.org/officeDocument/2006/relationships" r:embed="rId22"/>
                           <a:stretch>
                             <a:fillRect/>
                           </a:stretch>
@@ -2671,7 +2521,8 @@
           </w:p>
           <w:p>
             <w:pPr>
-              <w:spacing w:line="300" w:lineRule="auto"/>
+              <w:pStyle w:val="Normal"/>
+              <w:spacing w:lineRule="auto" w:line="300"/>
               <w:jc w:val="center"/>
               <w:rPr>
                 <w:rFonts w:ascii="宋体" w:hAnsi="宋体" w:eastAsia="宋体"/>
@@ -2690,50 +2541,54 @@
           </w:p>
           <w:p>
             <w:pPr>
-              <w:spacing w:line="360" w:lineRule="auto"/>
-              <w:rPr>
-                <w:sz w:val="24"/>
-              </w:rPr>
-            </w:pPr>
-          </w:p>
-          <w:p>
-            <w:pPr>
-              <w:spacing w:line="360" w:lineRule="auto"/>
-              <w:ind w:left="0" w:leftChars="0" w:right="0" w:rightChars="0" w:firstLineChars="200"/>
-              <w:rPr>
-                <w:kern w:val="0"/>
-                <w:sz w:val="24"/>
-              </w:rPr>
-            </w:pPr>
-            <w:r>
-              <w:rPr>
-                <w:kern w:val="0"/>
-                <w:sz w:val="24"/>
-              </w:rPr>
-              <w:t>这个矩阵的规模使人工审计难以全面覆盖。与 CVE-2023-4039 同源的 PR-96191（AArch64 / ARM 上栈金丝雀寄存器残留）2020 年修复时，就未涉及 MIPS、LoongArch、Xtensa、CSKY 等 fallback 后端；单点防御机制上的实现疏忽，往往同时存在于矩阵中其他格点而长期不被发现。本课题初步实验阶段已对若干格点做了试探性验证，向 GCC 上游报告并确认了多例同类形态的真实漏洞，第五章将给出具体案例。</w:t>
-            </w:r>
-          </w:p>
-          <w:p>
-            <w:pPr>
-              <w:spacing w:line="360" w:lineRule="auto"/>
-              <w:ind w:left="0" w:leftChars="0" w:right="0" w:rightChars="0" w:firstLineChars="200"/>
-              <w:rPr>
-                <w:kern w:val="0"/>
-                <w:sz w:val="24"/>
-              </w:rPr>
-            </w:pPr>
-            <w:r>
-              <w:rPr>
-                <w:kern w:val="0"/>
-                <w:sz w:val="24"/>
-              </w:rPr>
-              <w:t>上述失效有一个共同特征：编译过程不出错、二进制正常运行，缺陷仅在特定输入下显现——即"静默失效（silent failure）"。Csmith、YARPGen 等以差分输出或编译器崩溃为信号的工具对此类缺陷几乎不敏感；覆盖率引导的模糊测试虽然可以把执行推进到相关代码路径，但缺少判断该路径是否仍满足安全契约的预言机。问题由此浮现：编译器是绝大多数软件防御机制的实际载体，矩阵中的静默失效直接削弱整个软件生态的运行时安全保障，而现有自动化测试方法尚未把"防御机制的安全契约"纳入判定体系。如果能把矩阵格点上的不变量翻译为可测断言，并主动引导编译器走到对应代码路径，就既可覆盖既有缺陷家族的同类变种，也有望在后续优化引入同类回归时及早暴露。本研究以此为出发点，结合大语言模型的代码理解能力与覆盖率反馈，构建一条针对编译器防御机制静默失效的模糊测试方法。</w:t>
-            </w:r>
-          </w:p>
-          <w:p>
-            <w:pPr>
+              <w:pStyle w:val="Normal"/>
+              <w:spacing w:lineRule="auto" w:line="360"/>
+              <w:rPr>
+                <w:sz w:val="24"/>
+              </w:rPr>
+            </w:pPr>
+          </w:p>
+          <w:p>
+            <w:pPr>
+              <w:pStyle w:val="Normal"/>
+              <w:spacing w:lineRule="auto" w:line="360"/>
+              <w:ind w:firstLineChars="200" w:startChars="0" w:start="0" w:endChars="0" w:end="0"/>
+              <w:rPr>
+                <w:kern w:val="0"/>
+                <w:sz w:val="24"/>
+              </w:rPr>
+            </w:pPr>
+            <w:r>
+              <w:rPr>
+                <w:kern w:val="0"/>
+                <w:sz w:val="24"/>
+              </w:rPr>
+              <w:t xml:space="preserve">这个矩阵的规模使人工审计难以全面覆盖。与 CVE-2023-4039 同源的 PR-96191（AArch64 / ARM 上栈金丝雀寄存器残留）2020 年修复时，就未涉及 MIPS、LoongArch、Xtensa、CSKY 等 fallback 后端；单点防御机制上的实现疏忽，往往同时存在于矩阵中其他格点而长期不被发现。本课题初步实验阶段已对若干格点做了试探性验证，向 GCC 上游报告并确认了多例同类形态的真实漏洞，第五章将给出具体案例。</w:t>
+            </w:r>
+          </w:p>
+          <w:p>
+            <w:pPr>
+              <w:pStyle w:val="Normal"/>
+              <w:spacing w:lineRule="auto" w:line="360"/>
+              <w:ind w:firstLineChars="200" w:startChars="0" w:start="0" w:endChars="0" w:end="0"/>
+              <w:rPr>
+                <w:kern w:val="0"/>
+                <w:sz w:val="24"/>
+              </w:rPr>
+            </w:pPr>
+            <w:r>
+              <w:rPr>
+                <w:kern w:val="0"/>
+                <w:sz w:val="24"/>
+              </w:rPr>
+              <w:t xml:space="preserve">上述失效有一个共同特征：编译过程不出错、二进制正常运行，缺陷仅在特定输入下显现——即"静默失效（silent failure）"。Csmith、YARPGen 等以差分输出或编译器崩溃为信号的工具对此类缺陷几乎不敏感；覆盖率引导的模糊测试虽然可以把执行推进到相关代码路径，但缺少判断该路径是否仍满足安全契约的预言机。问题由此浮现：编译器是绝大多数软件防御机制的实际载体，矩阵中的静默失效直接削弱整个软件生态的运行时安全保障，而现有自动化测试方法尚未把"防御机制的安全契约"纳入判定体系。如果能把矩阵格点上的不变量翻译为可测断言，并主动引导编译器走到对应代码路径，就既可覆盖既有缺陷家族的同类变种，也有望在后续优化引入同类回归时及早暴露。本研究以此为出发点，结合大语言模型的代码理解能力与覆盖率反馈，构建一条针对编译器防御机制静默失效的模糊测试方法。</w:t>
+            </w:r>
+          </w:p>
+          <w:p>
+            <w:pPr>
+              <w:pStyle w:val="Normal"/>
               <w:widowControl/>
-              <w:jc w:val="left"/>
+              <w:jc w:val="start"/>
               <w:rPr>
                 <w:b/>
                 <w:bCs/>
@@ -2753,24 +2608,26 @@
           </w:p>
           <w:p>
             <w:pPr>
-              <w:spacing w:line="360" w:lineRule="auto"/>
-              <w:ind w:left="0" w:leftChars="0" w:right="0" w:rightChars="0" w:firstLineChars="200"/>
-              <w:rPr>
-                <w:kern w:val="0"/>
-                <w:sz w:val="24"/>
-              </w:rPr>
-            </w:pPr>
-            <w:r>
-              <w:rPr>
-                <w:kern w:val="0"/>
-                <w:sz w:val="24"/>
-              </w:rPr>
-              <w:t>编译器模糊测试的研究可以从两个角度来看：一是预言机（oracle），决定什么算缺陷；二是种子变异方法，决定测试输入怎么产生。早期工作以崩溃或输出差异为信号、以随机或文法规则生成种子；覆盖率引导与大语言模型的引入分别使二者向目标导向和语义理解方向演进。下文沿这两个维度梳理现状。</w:t>
-            </w:r>
-          </w:p>
-          <w:p>
-            <w:pPr>
-              <w:spacing w:line="360" w:lineRule="auto"/>
+              <w:pStyle w:val="Normal"/>
+              <w:spacing w:lineRule="auto" w:line="360"/>
+              <w:ind w:firstLineChars="200" w:startChars="0" w:start="0" w:endChars="0" w:end="0"/>
+              <w:rPr>
+                <w:kern w:val="0"/>
+                <w:sz w:val="24"/>
+              </w:rPr>
+            </w:pPr>
+            <w:r>
+              <w:rPr>
+                <w:kern w:val="0"/>
+                <w:sz w:val="24"/>
+              </w:rPr>
+              <w:t xml:space="preserve">编译器模糊测试的研究可以从两个角度来看：一是预言机（oracle），决定什么算缺陷；二是种子变异方法，决定测试输入怎么产生。早期工作以崩溃或输出差异为信号、以随机或文法规则生成种子；覆盖率引导与大语言模型的引入分别使二者向目标导向和语义理解方向演进。下文沿这两个维度梳理现状。</w:t>
+            </w:r>
+          </w:p>
+          <w:p>
+            <w:pPr>
+              <w:pStyle w:val="Normal"/>
+              <w:spacing w:lineRule="auto" w:line="360"/>
               <w:rPr>
                 <w:b/>
                 <w:bCs/>
@@ -2790,58 +2647,62 @@
           </w:p>
           <w:p>
             <w:pPr>
-              <w:spacing w:line="360" w:lineRule="auto"/>
-              <w:ind w:left="0" w:leftChars="0" w:right="0" w:rightChars="0" w:firstLineChars="200"/>
-              <w:rPr>
-                <w:kern w:val="0"/>
-                <w:sz w:val="24"/>
-              </w:rPr>
-            </w:pPr>
-            <w:r>
-              <w:rPr>
-                <w:kern w:val="0"/>
-                <w:sz w:val="24"/>
-              </w:rPr>
-              <w:t>预言机回答"什么样的执行结果算缺陷"，现有工作大致可分五类。</w:t>
-            </w:r>
-          </w:p>
-          <w:p>
-            <w:pPr>
-              <w:spacing w:line="360" w:lineRule="auto"/>
-              <w:ind w:left="0" w:leftChars="0" w:right="0" w:rightChars="0" w:firstLineChars="200"/>
-              <w:rPr>
-                <w:kern w:val="0"/>
-                <w:sz w:val="24"/>
-              </w:rPr>
-            </w:pPr>
-            <w:r>
-              <w:rPr>
-                <w:kern w:val="0"/>
-                <w:sz w:val="24"/>
-              </w:rPr>
-              <w:t>崩溃预言机[1,3,4]以编译期或运行期的崩溃（ICE、断言、segfault、超时）为信号，实现简单，是 AFL、libFuzzer 迁移到编译器后的默认选择。差分预言机[1,2]对若干编译器（或同一编译器不同优化等级）就同一程序的运行结果做交叉比对，差异即为 mis-compile；Csmith、YARPGen 围绕"避免未定义行为"这一前提大规模生成 C 程序来驱动差分。变形测试预言机以 Le 等提出的 EMI[11] 为代表：对同一输入下未执行的代码做删改，新程序应产生相同结果，差异即为 mis-compile，后续工作继续在 live region 等价变换上探索。Sanitizer 预言机借助 ASan、UBSan、MSan 把内存破坏与未定义行为转为显式信号；UBfuzz[12] 进一步用 crash-site mapping 反向定位 sanitizer 自身实现缺陷。还有面向子领域的复合预言机，如 HirGen[13] 在 IR 层同时使用差分与变形来提高对深度学习编译器深层优化错误的敏感度。</w:t>
-            </w:r>
-          </w:p>
-          <w:p>
-            <w:pPr>
-              <w:spacing w:line="360" w:lineRule="auto"/>
-              <w:ind w:left="0" w:leftChars="0" w:right="0" w:rightChars="0" w:firstLineChars="200"/>
-              <w:rPr>
-                <w:kern w:val="0"/>
-                <w:sz w:val="24"/>
-              </w:rPr>
-            </w:pPr>
-            <w:r>
-              <w:rPr>
-                <w:kern w:val="0"/>
-                <w:sz w:val="24"/>
-              </w:rPr>
-              <w:t>这些预言机的判据都建立在"崩溃"或"可观察的输出差异"之上。当缺陷的形态是"代码正常编译运行，但运行时保护已被静默削弱"时，它们无法触发。</w:t>
-            </w:r>
-          </w:p>
-          <w:p>
-            <w:pPr>
-              <w:spacing w:line="360" w:lineRule="auto"/>
+              <w:pStyle w:val="Normal"/>
+              <w:spacing w:lineRule="auto" w:line="360"/>
+              <w:ind w:firstLineChars="200" w:startChars="0" w:start="0" w:endChars="0" w:end="0"/>
+              <w:rPr>
+                <w:kern w:val="0"/>
+                <w:sz w:val="24"/>
+              </w:rPr>
+            </w:pPr>
+            <w:r>
+              <w:rPr>
+                <w:kern w:val="0"/>
+                <w:sz w:val="24"/>
+              </w:rPr>
+              <w:t xml:space="preserve">预言机回答"什么样的执行结果算缺陷"，现有工作大致可分五类。</w:t>
+            </w:r>
+          </w:p>
+          <w:p>
+            <w:pPr>
+              <w:pStyle w:val="Normal"/>
+              <w:spacing w:lineRule="auto" w:line="360"/>
+              <w:ind w:firstLineChars="200" w:startChars="0" w:start="0" w:endChars="0" w:end="0"/>
+              <w:rPr>
+                <w:kern w:val="0"/>
+                <w:sz w:val="24"/>
+              </w:rPr>
+            </w:pPr>
+            <w:r>
+              <w:rPr>
+                <w:kern w:val="0"/>
+                <w:sz w:val="24"/>
+              </w:rPr>
+              <w:t xml:space="preserve">崩溃预言机[1,3,4]以编译期或运行期的崩溃（ICE、断言、segfault、超时）为信号，实现简单，是 AFL、libFuzzer 迁移到编译器后的默认选择。差分预言机[1,2]对若干编译器（或同一编译器不同优化等级）就同一程序的运行结果做交叉比对，差异即为 mis-compile；Csmith、YARPGen 围绕"避免未定义行为"这一前提大规模生成 C 程序来驱动差分。变形测试预言机以 Le 等提出的 EMI[11] 为代表：对同一输入下未执行的代码做删改，新程序应产生相同结果，差异即为 mis-compile，后续工作继续在 live region 等价变换上探索。Sanitizer 预言机借助 ASan、UBSan、MSan 把内存破坏与未定义行为转为显式信号；UBfuzz[12] 进一步用 crash-site mapping 反向定位 sanitizer 自身实现缺陷。还有面向子领域的复合预言机，如 HirGen[13] 在 IR 层同时使用差分与变形来提高对深度学习编译器深层优化错误的敏感度。</w:t>
+            </w:r>
+          </w:p>
+          <w:p>
+            <w:pPr>
+              <w:pStyle w:val="Normal"/>
+              <w:spacing w:lineRule="auto" w:line="360"/>
+              <w:ind w:firstLineChars="200" w:startChars="0" w:start="0" w:endChars="0" w:end="0"/>
+              <w:rPr>
+                <w:kern w:val="0"/>
+                <w:sz w:val="24"/>
+              </w:rPr>
+            </w:pPr>
+            <w:r>
+              <w:rPr>
+                <w:kern w:val="0"/>
+                <w:sz w:val="24"/>
+              </w:rPr>
+              <w:t xml:space="preserve">这些预言机的判据都建立在"崩溃"或"可观察的输出差异"之上。当缺陷的形态是"代码正常编译运行，但运行时保护已被静默削弱"时，它们无法触发。</w:t>
+            </w:r>
+          </w:p>
+          <w:p>
+            <w:pPr>
+              <w:pStyle w:val="Normal"/>
+              <w:spacing w:lineRule="auto" w:line="360"/>
               <w:rPr>
                 <w:b/>
                 <w:bCs/>
@@ -2861,24 +2722,26 @@
           </w:p>
           <w:p>
             <w:pPr>
-              <w:spacing w:line="360" w:lineRule="auto"/>
-              <w:ind w:left="0" w:leftChars="0" w:right="0" w:rightChars="0" w:firstLineChars="200"/>
-              <w:rPr>
-                <w:kern w:val="0"/>
-                <w:sz w:val="24"/>
-              </w:rPr>
-            </w:pPr>
-            <w:r>
-              <w:rPr>
-                <w:kern w:val="0"/>
-                <w:sz w:val="24"/>
-              </w:rPr>
-              <w:t>传统路线上，覆盖率作为推进信号已是主流。Csmith[1] 与 YARPGen[2] 基于概率文法从空白合成不含未定义行为的 C 程序，再靠差分预言机发现 mis-compile。LangFuzz 类工作记录种子语法树后做子树替换式的 grammar-aware 变异，多用于 JavaScript 引擎。AFL、libFuzzer[3,4] 以字节级覆盖率反馈为导向，被广泛用于编译器的解析与优化组件，但难以保证生成程序的语法和语义合法性。GrayC[14] 把覆盖率引导与一组保持语义合法性的源码级变异（表达式替换、控制结构改写）相结合，专门面向 C 编译器与分析器，覆盖率和缺陷发现率均优于纯生成式工具。EMI 系列[11]在已有种子的未执行区域做语义保持变换，可视作变异与变形预言机的组合。这条路线的局限在于：变异规则由人工先验定义，覆盖率只提供"是否走入新代码"的近似进度信号，变异本身缺乏对目标代码语义的理解。</w:t>
-            </w:r>
-          </w:p>
-          <w:p>
-            <w:pPr>
-              <w:spacing w:line="360" w:lineRule="auto"/>
+              <w:pStyle w:val="Normal"/>
+              <w:spacing w:lineRule="auto" w:line="360"/>
+              <w:ind w:firstLineChars="200" w:startChars="0" w:start="0" w:endChars="0" w:end="0"/>
+              <w:rPr>
+                <w:kern w:val="0"/>
+                <w:sz w:val="24"/>
+              </w:rPr>
+            </w:pPr>
+            <w:r>
+              <w:rPr>
+                <w:kern w:val="0"/>
+                <w:sz w:val="24"/>
+              </w:rPr>
+              <w:t xml:space="preserve">传统路线上，覆盖率作为推进信号已是主流。Csmith[1] 与 YARPGen[2] 基于概率文法从空白合成不含未定义行为的 C 程序，再靠差分预言机发现 mis-compile。LangFuzz 类工作记录种子语法树后做子树替换式的 grammar-aware 变异，多用于 JavaScript 引擎。AFL、libFuzzer[3,4] 以字节级覆盖率反馈为导向，被广泛用于编译器的解析与优化组件，但难以保证生成程序的语法和语义合法性。GrayC[14] 把覆盖率引导与一组保持语义合法性的源码级变异（表达式替换、控制结构改写）相结合，专门面向 C 编译器与分析器，覆盖率和缺陷发现率均优于纯生成式工具。EMI 系列[11]在已有种子的未执行区域做语义保持变换，可视作变异与变形预言机的组合。这条路线的局限在于：变异规则由人工先验定义，覆盖率只提供"是否走入新代码"的近似进度信号，变异本身缺乏对目标代码语义的理解。</w:t>
+            </w:r>
+          </w:p>
+          <w:p>
+            <w:pPr>
+              <w:pStyle w:val="Normal"/>
+              <w:spacing w:lineRule="auto" w:line="360"/>
               <w:rPr>
                 <w:b/>
                 <w:bCs/>
@@ -2898,50 +2761,54 @@
           </w:p>
           <w:p>
             <w:pPr>
-              <w:spacing w:line="360" w:lineRule="auto"/>
-              <w:ind w:left="0" w:leftChars="0" w:right="0" w:rightChars="0" w:firstLineChars="200"/>
-              <w:rPr>
-                <w:kern w:val="0"/>
-                <w:sz w:val="24"/>
-              </w:rPr>
-            </w:pPr>
-            <w:r>
-              <w:rPr>
-                <w:kern w:val="0"/>
-                <w:sz w:val="24"/>
-              </w:rPr>
-              <w:t>大模型在代码理解与生成上的能力近年被引入以缓解传统变异在质量上的瓶颈。WhiteFox[5] 从编译器优化 pass 源码出发，先用大模型归纳触发该优化的输入模式（requirement summarization），再据此生成测试用例，使种子生成具备对编译器内部逻辑的感知；该方法在 PyTorch、TVM 等深度学习编译器上发现了若干优化路径深处的 bug。HLPFuzz[15] 进一步把大模型与覆盖率反馈耦合：在灰盒主循环之外引入白盒求解器，按"未覆盖且后继最多"的策略选取目标基本块，把单基本块翻译为约束求解任务交由大模型完成，并通过渐进式上下文构建缓解注意力衰减。这些工作表明大模型可以充当语义感知的变异引擎，但它们的目标设定仍是常规可达性——"让程序走到某个未覆盖位置"，并不关心目标路径所承担的安全契约。</w:t>
-            </w:r>
-          </w:p>
-          <w:p>
-            <w:pPr>
-              <w:spacing w:line="360" w:lineRule="auto"/>
-              <w:ind w:left="0" w:leftChars="0" w:right="0" w:rightChars="0" w:firstLineChars="200"/>
-              <w:rPr>
-                <w:kern w:val="0"/>
-                <w:sz w:val="24"/>
-              </w:rPr>
-            </w:pPr>
-            <w:r>
-              <w:rPr>
-                <w:kern w:val="0"/>
-                <w:sz w:val="24"/>
-              </w:rPr>
-              <w:t>综合来看，针对编译器自身防御机制的自动化测试在公开文献中仍然稀少：少数工作面向单一机制做差分测试（如扫描 IBT landing pad 存在性），另一些工作从二进制层面做事后审计，但难以反向定位到引入缺陷的编译器代码路径。本课题在变异方法上沿用大模型与覆盖率联合驱动的思路，但把推进目标限定在"防御机制相关代码"；在预言机上把机制不变量翻译为 fuzz 框架可直接使用的判定接口，使方法对静默失效保持敏感。</w:t>
-            </w:r>
-          </w:p>
-          <w:p>
-            <w:pPr>
-              <w:spacing w:line="360" w:lineRule="auto"/>
-              <w:rPr>
-                <w:sz w:val="24"/>
-              </w:rPr>
-            </w:pPr>
-          </w:p>
-          <w:p>
-            <w:pPr>
+              <w:pStyle w:val="Normal"/>
+              <w:spacing w:lineRule="auto" w:line="360"/>
+              <w:ind w:firstLineChars="200" w:startChars="0" w:start="0" w:endChars="0" w:end="0"/>
+              <w:rPr>
+                <w:kern w:val="0"/>
+                <w:sz w:val="24"/>
+              </w:rPr>
+            </w:pPr>
+            <w:r>
+              <w:rPr>
+                <w:kern w:val="0"/>
+                <w:sz w:val="24"/>
+              </w:rPr>
+              <w:t xml:space="preserve">大模型在代码理解与生成上的能力近年被引入以缓解传统变异在质量上的瓶颈。WhiteFox[5] 从编译器优化 pass 源码出发，先用大模型归纳触发该优化的输入模式（requirement summarization），再据此生成测试用例，使种子生成具备对编译器内部逻辑的感知；该方法在 PyTorch、TVM 等深度学习编译器上发现了若干优化路径深处的 bug。HLPFuzz[15] 进一步把大模型与覆盖率反馈耦合：在灰盒主循环之外引入白盒求解器，按"未覆盖且后继最多"的策略选取目标基本块，把单基本块翻译为约束求解任务交由大模型完成，并通过渐进式上下文构建缓解注意力衰减。这些工作表明大模型可以充当语义感知的变异引擎，但它们的目标设定仍是常规可达性——"让程序走到某个未覆盖位置"，并不关心目标路径所承担的安全契约。</w:t>
+            </w:r>
+          </w:p>
+          <w:p>
+            <w:pPr>
+              <w:pStyle w:val="Normal"/>
+              <w:spacing w:lineRule="auto" w:line="360"/>
+              <w:ind w:firstLineChars="200" w:startChars="0" w:start="0" w:endChars="0" w:end="0"/>
+              <w:rPr>
+                <w:kern w:val="0"/>
+                <w:sz w:val="24"/>
+              </w:rPr>
+            </w:pPr>
+            <w:r>
+              <w:rPr>
+                <w:kern w:val="0"/>
+                <w:sz w:val="24"/>
+              </w:rPr>
+              <w:t xml:space="preserve">综合来看，针对编译器自身防御机制的自动化测试在公开文献中仍然稀少：少数工作面向单一机制做差分测试（如扫描 IBT landing pad 存在性），另一些工作从二进制层面做事后审计，但难以反向定位到引入缺陷的编译器代码路径。本课题在变异方法上沿用大模型与覆盖率联合驱动的思路，但把推进目标限定在"防御机制相关代码"；在预言机上把机制不变量翻译为 fuzz 框架可直接使用的判定接口，使方法对静默失效保持敏感。</w:t>
+            </w:r>
+          </w:p>
+          <w:p>
+            <w:pPr>
+              <w:pStyle w:val="Normal"/>
+              <w:spacing w:lineRule="auto" w:line="360"/>
+              <w:rPr>
+                <w:sz w:val="24"/>
+              </w:rPr>
+            </w:pPr>
+          </w:p>
+          <w:p>
+            <w:pPr>
+              <w:pStyle w:val="Normal"/>
               <w:widowControl/>
-              <w:jc w:val="left"/>
+              <w:jc w:val="start"/>
               <w:rPr>
                 <w:b/>
                 <w:bCs/>
@@ -2961,7 +2828,8 @@
           </w:p>
           <w:p>
             <w:pPr>
-              <w:spacing w:line="360" w:lineRule="auto"/>
+              <w:pStyle w:val="Normal"/>
+              <w:spacing w:lineRule="auto" w:line="360"/>
               <w:rPr>
                 <w:b/>
                 <w:bCs/>
@@ -2981,24 +2849,26 @@
           </w:p>
           <w:p>
             <w:pPr>
-              <w:spacing w:line="360" w:lineRule="auto"/>
-              <w:ind w:left="0" w:leftChars="0" w:right="0" w:rightChars="0" w:firstLineChars="200"/>
-              <w:rPr>
-                <w:kern w:val="0"/>
-                <w:sz w:val="24"/>
-              </w:rPr>
-            </w:pPr>
-            <w:r>
-              <w:rPr>
-                <w:kern w:val="0"/>
-                <w:sz w:val="24"/>
-              </w:rPr>
-              <w:t>本课题要构建一种面向编译器自身防御机制的模糊测试方法，并在 GCC 与 LLVM 上完成端到端验证。与以崩溃或差分输出为信号的传统编译器 fuzzer 不同，本方法以"防御机制是否仍满足其安全契约"为判据，自动暴露编译器仍能正常生成代码、但运行时保护已被静默削弱的失效。具体目标如下：(a) 形成一套覆盖主流防御机制的不变量集合，每条不变量具备可由二进制或运行行为判定的证据形式，在 GCC 与 LLVM 上保持一致的描述结构；(b) 构建一个可同时面向 GCC 与 LLVM、跨架构运行的 fuzzer 原型，以防御机制相关代码的源代码覆盖率为推进信号，用大模型完成种子精细变异；(c) 通过该原型在 GCC 与 LLVM 上发现可被上游确认的真实缺陷，验证方法有效性与跨编译器迁移性。三个目标依次推进，其依赖关系与对应的工作内容在 3.2 节中呈现（见图 3）。</w:t>
-            </w:r>
-          </w:p>
-          <w:p>
-            <w:pPr>
-              <w:spacing w:line="360" w:lineRule="auto"/>
+              <w:pStyle w:val="Normal"/>
+              <w:spacing w:lineRule="auto" w:line="360"/>
+              <w:ind w:firstLineChars="200" w:startChars="0" w:start="0" w:endChars="0" w:end="0"/>
+              <w:rPr>
+                <w:kern w:val="0"/>
+                <w:sz w:val="24"/>
+              </w:rPr>
+            </w:pPr>
+            <w:r>
+              <w:rPr>
+                <w:kern w:val="0"/>
+                <w:sz w:val="24"/>
+              </w:rPr>
+              <w:t xml:space="preserve">本课题要构建一种面向编译器自身防御机制的模糊测试方法，并在 GCC 与 LLVM 上完成端到端验证。与以崩溃或差分输出为信号的传统编译器 fuzzer 不同，本方法以"防御机制是否仍满足其安全契约"为判据，自动暴露编译器仍能正常生成代码、但运行时保护已被静默削弱的失效。具体目标如下：(a) 形成一套覆盖主流防御机制的不变量集合，每条不变量具备可由二进制或运行行为判定的证据形式，在 GCC 与 LLVM 上保持一致的描述结构；(b) 构建一个可同时面向 GCC 与 LLVM、跨架构运行的 fuzzer 原型，以防御机制相关代码的源代码覆盖率为推进信号，用大模型完成种子精细变异；(c) 通过该原型在 GCC 与 LLVM 上发现可被上游确认的真实缺陷，验证方法有效性与跨编译器迁移性。三个目标依次推进，其依赖关系与对应的工作内容在 3.2 节中呈现（见图 3）。</w:t>
+            </w:r>
+          </w:p>
+          <w:p>
+            <w:pPr>
+              <w:pStyle w:val="Normal"/>
+              <w:spacing w:lineRule="auto" w:line="360"/>
               <w:rPr>
                 <w:b/>
                 <w:bCs/>
@@ -3018,30 +2888,33 @@
           </w:p>
           <w:p>
             <w:pPr>
-              <w:spacing w:line="360" w:lineRule="auto"/>
-              <w:ind w:left="0" w:leftChars="0" w:right="0" w:rightChars="0" w:firstLineChars="200"/>
-              <w:rPr>
-                <w:kern w:val="0"/>
-                <w:sz w:val="24"/>
-              </w:rPr>
-            </w:pPr>
-            <w:r>
-              <w:rPr>
-                <w:kern w:val="0"/>
-                <w:sz w:val="24"/>
-              </w:rPr>
-              <w:t>本课题分为以下三部分（见图 3），彼此存在依赖关系：不变量形式化是预言机与种子目标选择的事实基础；预言机为 fuzz 主循环提供安全判定接口；覆盖率驱动的种子生成则负责把 fuzzing 推进到能触发不变量的代码路径上。</w:t>
-            </w:r>
-          </w:p>
-          <w:p>
-            <w:pPr>
-              <w:spacing w:line="360" w:lineRule="auto"/>
-              <w:jc w:val="center"/>
-            </w:pPr>
-            <w:r>
+              <w:pStyle w:val="Normal"/>
+              <w:spacing w:lineRule="auto" w:line="360"/>
+              <w:ind w:firstLineChars="200" w:startChars="0" w:start="0" w:endChars="0" w:end="0"/>
+              <w:rPr>
+                <w:kern w:val="0"/>
+                <w:sz w:val="24"/>
+              </w:rPr>
+            </w:pPr>
+            <w:r>
+              <w:rPr>
+                <w:kern w:val="0"/>
+                <w:sz w:val="24"/>
+              </w:rPr>
+              <w:t xml:space="preserve">本课题分为以下三部分（见图 3），彼此存在依赖关系：不变量形式化是预言机与种子目标选择的事实基础；预言机为 fuzz 主循环提供安全判定接口；覆盖率驱动的种子生成则负责把 fuzzing 推进到能触发不变量的代码路径上。</w:t>
+            </w:r>
+          </w:p>
+          <w:p>
+            <w:pPr>
+              <w:pStyle w:val="Normal"/>
+              <w:spacing w:lineRule="auto" w:line="360"/>
+              <w:jc w:val="center"/>
+            </w:pPr>
+            <w:r>
+              <w:rPr/>
               <w:drawing>
-                <wp:inline distT="0" distB="0" distL="0" distR="0">
-                  <wp:extent cx="5385435" cy="1235710"/>
+                <wp:inline xmlns:wp="http://schemas.openxmlformats.org/drawingml/2006/wordprocessingDrawing" distT="0" distB="0" distL="0" distR="0">
+                  <wp:extent cx="5385714" cy="1236021"/>
                   <wp:effectExtent l="0" t="0" r="0" b="0"/>
                   <wp:docPr id="23" name="Figure23"/>
                   <wp:cNvGraphicFramePr>
@@ -3051,13 +2924,11 @@
                     <a:graphicData uri="http://schemas.openxmlformats.org/drawingml/2006/picture">
                       <pic:pic xmlns:pic="http://schemas.openxmlformats.org/drawingml/2006/picture">
                         <pic:nvPicPr>
-                          <pic:cNvPr id="23" name="Figure23"/>
-                          <pic:cNvPicPr>
-                            <a:picLocks noChangeAspect="1"/>
-                          </pic:cNvPicPr>
+                          <pic:cNvPr id="23" name="pipeline.png"/>
+                          <pic:cNvPicPr/>
                         </pic:nvPicPr>
                         <pic:blipFill>
-                          <a:blip r:embed="rId8"/>
+                          <a:blip xmlns:r="http://schemas.openxmlformats.org/officeDocument/2006/relationships" r:embed="rId23"/>
                           <a:stretch>
                             <a:fillRect/>
                           </a:stretch>
@@ -3080,7 +2951,8 @@
           </w:p>
           <w:p>
             <w:pPr>
-              <w:spacing w:line="300" w:lineRule="auto"/>
+              <w:pStyle w:val="Normal"/>
+              <w:spacing w:lineRule="auto" w:line="300"/>
               <w:jc w:val="center"/>
               <w:rPr>
                 <w:rFonts w:ascii="宋体" w:hAnsi="宋体" w:eastAsia="宋体"/>
@@ -3099,75 +2971,81 @@
           </w:p>
           <w:p>
             <w:pPr>
-              <w:spacing w:line="360" w:lineRule="auto"/>
-              <w:rPr>
-                <w:sz w:val="24"/>
-              </w:rPr>
-            </w:pPr>
-          </w:p>
-          <w:p>
-            <w:pPr>
-              <w:spacing w:line="360" w:lineRule="auto"/>
-              <w:ind w:left="0" w:leftChars="0" w:right="0" w:rightChars="0" w:firstLineChars="200"/>
-              <w:rPr>
-                <w:kern w:val="0"/>
-                <w:sz w:val="24"/>
-              </w:rPr>
-            </w:pPr>
-            <w:r>
-              <w:rPr>
-                <w:kern w:val="0"/>
-                <w:sz w:val="24"/>
-              </w:rPr>
-              <w:t>(1) 防御机制不变量的调研与形式化。针对 stack canary、_FORTIFY_SOURCE、IBT 等机制，从三类来源提炼其安全不变量：一是编译器源码中的注释与断言，如 GCC 中 AArch64 后端关于 canary 槽位置关系的安全注释、ix86 关于 ENDBR 立即数禁止的谓词，以及 LLVM 中 lib/CodeGen/StackProtector 与 X86InstrInfo 等模块的对应实现；二是 GCC、LLVM 自身文档（Clang Command Line Reference、Attribute Reference、CFI Design 等）以及 glibc 与 ABI 文档对开关 flag、_chk 接口、CET ELF property 等的规定；三是已确认的历史 bug 与对应 patch——从修补点反推被违反的不变量。每条不变量按统一字段记录陈述、所属编译器与版本、证据片段、信息源及版本敏感性，便于机械检索与跨版本回归。</w:t>
-            </w:r>
-          </w:p>
-          <w:p>
-            <w:pPr>
-              <w:spacing w:line="360" w:lineRule="auto"/>
-              <w:ind w:left="0" w:leftChars="0" w:right="0" w:rightChars="0" w:firstLineChars="200"/>
-              <w:rPr>
-                <w:kern w:val="0"/>
-                <w:sz w:val="24"/>
-              </w:rPr>
-            </w:pPr>
-            <w:r>
-              <w:rPr>
-                <w:kern w:val="0"/>
-                <w:sz w:val="24"/>
-              </w:rPr>
-              <w:t>(2) 不变量到预言机的工程化落地。把 (1) 中的不变量翻译为可在二进制层面或运行行为上判定的检查器。框架将检查器分为静态与动态两类：静态检查通过 ELF 符号、指令流模式、属性 note 做断言式判定；动态检查通过受控执行（如对 buffer 填充长度做二分搜索）观察运行时行为。预言机判据完全建立在二进制和运行行为之上，与产生该二进制的具体编译器解耦，GCC 与 LLVM 产物共用同一套检查器。每个机制配置一个聚合器，任一检查器返回 Fail 即记机制级违例并附带证据；同时为每个机制记录开机制 / 关机制两套 flag profile，框架据此对同一颗种子做对照判定，避免与编译器自身缺省行为混淆。</w:t>
-            </w:r>
-          </w:p>
-          <w:p>
-            <w:pPr>
-              <w:spacing w:line="360" w:lineRule="auto"/>
-              <w:ind w:left="0" w:leftChars="0" w:right="0" w:rightChars="0" w:firstLineChars="200"/>
-              <w:rPr>
-                <w:kern w:val="0"/>
-                <w:sz w:val="24"/>
-              </w:rPr>
-            </w:pPr>
-            <w:r>
-              <w:rPr>
-                <w:kern w:val="0"/>
-                <w:sz w:val="24"/>
-              </w:rPr>
-              <w:t>(3) 大模型与覆盖率联合驱动的种子生成。以 GCC 与 LLVM 中防御机制相关代码的源代码覆盖率为目标信号（GCC 侧 gcov，LLVM 侧 SanitizerCoverage / source-based coverage），结合控制流图选取后继最多、当前未覆盖的基本块作为约束求解目标。每轮求解的流程：构造目标上下文（目标函数源码、目标基本块标注、覆盖前驱的种子作为示例），调用大模型生成新 C 种子，编译产物经覆盖率与预言机检查后按三方决策表决定是否进入语料库。种子未命中目标时，通过轻量级调用追踪定位与基线种子的发散点，把发散函数源码作为额外上下文反馈给大模型进入下一轮变异。整个过程把覆盖率推进与安全契约判定统一在同一条主循环中，大模型的生成始终被防御机制相关代码路径所牵引。</w:t>
-            </w:r>
-          </w:p>
-          <w:p>
-            <w:pPr>
-              <w:spacing w:line="360" w:lineRule="auto"/>
-              <w:rPr>
-                <w:sz w:val="24"/>
-              </w:rPr>
-            </w:pPr>
-          </w:p>
-          <w:p>
-            <w:pPr>
+              <w:pStyle w:val="Normal"/>
+              <w:spacing w:lineRule="auto" w:line="360"/>
+              <w:rPr>
+                <w:sz w:val="24"/>
+              </w:rPr>
+            </w:pPr>
+          </w:p>
+          <w:p>
+            <w:pPr>
+              <w:pStyle w:val="Normal"/>
+              <w:spacing w:lineRule="auto" w:line="360"/>
+              <w:ind w:firstLineChars="200" w:startChars="0" w:start="0" w:endChars="0" w:end="0"/>
+              <w:rPr>
+                <w:kern w:val="0"/>
+                <w:sz w:val="24"/>
+              </w:rPr>
+            </w:pPr>
+            <w:r>
+              <w:rPr>
+                <w:kern w:val="0"/>
+                <w:sz w:val="24"/>
+              </w:rPr>
+              <w:t xml:space="preserve">(1) 防御机制不变量的调研与形式化。针对 stack canary、_FORTIFY_SOURCE、IBT 等机制，从三类来源提炼其安全不变量：一是编译器源码中的注释与断言，如 GCC 中 AArch64 后端关于 canary 槽位置关系的安全注释、ix86 关于 ENDBR 立即数禁止的谓词，以及 LLVM 中 lib/CodeGen/StackProtector 与 X86InstrInfo 等模块的对应实现；二是 GCC、LLVM 自身文档（Clang Command Line Reference、Attribute Reference、CFI Design 等）以及 glibc 与 ABI 文档对开关 flag、_chk 接口、CET ELF property 等的规定；三是已确认的历史 bug 与对应 patch——从修补点反推被违反的不变量。每条不变量按统一字段记录陈述、所属编译器与版本、证据片段、信息源及版本敏感性，便于机械检索与跨版本回归。</w:t>
+            </w:r>
+          </w:p>
+          <w:p>
+            <w:pPr>
+              <w:pStyle w:val="Normal"/>
+              <w:spacing w:lineRule="auto" w:line="360"/>
+              <w:ind w:firstLineChars="200" w:startChars="0" w:start="0" w:endChars="0" w:end="0"/>
+              <w:rPr>
+                <w:kern w:val="0"/>
+                <w:sz w:val="24"/>
+              </w:rPr>
+            </w:pPr>
+            <w:r>
+              <w:rPr>
+                <w:kern w:val="0"/>
+                <w:sz w:val="24"/>
+              </w:rPr>
+              <w:t xml:space="preserve">(2) 不变量到预言机的工程化落地。把 (1) 中的不变量翻译为可在二进制层面或运行行为上判定的检查器。框架将检查器分为静态与动态两类：静态检查通过 ELF 符号、指令流模式、属性 note 做断言式判定；动态检查通过受控执行（如对 buffer 填充长度做二分搜索）观察运行时行为。预言机判据完全建立在二进制和运行行为之上，与产生该二进制的具体编译器解耦，GCC 与 LLVM 产物共用同一套检查器。每个机制配置一个聚合器，任一检查器返回 Fail 即记机制级违例并附带证据；同时为每个机制记录开机制 / 关机制两套 flag profile，框架据此对同一颗种子做对照判定，避免与编译器自身缺省行为混淆。</w:t>
+            </w:r>
+          </w:p>
+          <w:p>
+            <w:pPr>
+              <w:pStyle w:val="Normal"/>
+              <w:spacing w:lineRule="auto" w:line="360"/>
+              <w:ind w:firstLineChars="200" w:startChars="0" w:start="0" w:endChars="0" w:end="0"/>
+              <w:rPr>
+                <w:kern w:val="0"/>
+                <w:sz w:val="24"/>
+              </w:rPr>
+            </w:pPr>
+            <w:r>
+              <w:rPr>
+                <w:kern w:val="0"/>
+                <w:sz w:val="24"/>
+              </w:rPr>
+              <w:t xml:space="preserve">(3) 大模型与覆盖率联合驱动的种子生成。以 GCC 与 LLVM 中防御机制相关代码的源代码覆盖率为目标信号（GCC 侧 gcov，LLVM 侧 SanitizerCoverage / source-based coverage），结合控制流图选取后继最多、当前未覆盖的基本块作为约束求解目标。每轮求解的流程：构造目标上下文（目标函数源码、目标基本块标注、覆盖前驱的种子作为示例），调用大模型生成新 C 种子，编译产物经覆盖率与预言机检查后按三方决策表决定是否进入语料库。种子未命中目标时，通过轻量级调用追踪定位与基线种子的发散点，把发散函数源码作为额外上下文反馈给大模型进入下一轮变异。整个过程把覆盖率推进与安全契约判定统一在同一条主循环中，大模型的生成始终被防御机制相关代码路径所牵引。</w:t>
+            </w:r>
+          </w:p>
+          <w:p>
+            <w:pPr>
+              <w:pStyle w:val="Normal"/>
+              <w:spacing w:lineRule="auto" w:line="360"/>
+              <w:rPr>
+                <w:sz w:val="24"/>
+              </w:rPr>
+            </w:pPr>
+          </w:p>
+          <w:p>
+            <w:pPr>
+              <w:pStyle w:val="Normal"/>
               <w:widowControl/>
-              <w:jc w:val="left"/>
+              <w:jc w:val="start"/>
               <w:rPr>
                 <w:b/>
                 <w:bCs/>
@@ -3187,24 +3065,26 @@
           </w:p>
           <w:p>
             <w:pPr>
-              <w:spacing w:line="360" w:lineRule="auto"/>
-              <w:ind w:left="0" w:leftChars="0" w:right="0" w:rightChars="0" w:firstLineChars="200"/>
-              <w:rPr>
-                <w:kern w:val="0"/>
-                <w:sz w:val="24"/>
-              </w:rPr>
-            </w:pPr>
-            <w:r>
-              <w:rPr>
-                <w:kern w:val="0"/>
-                <w:sz w:val="24"/>
-              </w:rPr>
-              <w:t>技术路线分为总体架构、不变量预言机框架、大模型约束求解主循环、跨架构与编译选项调度四部分，对应研究内容 (1)–(3) 的工程实现。GCC 上的初步验证证据见第五章。</w:t>
-            </w:r>
-          </w:p>
-          <w:p>
-            <w:pPr>
-              <w:spacing w:line="360" w:lineRule="auto"/>
+              <w:pStyle w:val="Normal"/>
+              <w:spacing w:lineRule="auto" w:line="360"/>
+              <w:ind w:firstLineChars="200" w:startChars="0" w:start="0" w:endChars="0" w:end="0"/>
+              <w:rPr>
+                <w:kern w:val="0"/>
+                <w:sz w:val="24"/>
+              </w:rPr>
+            </w:pPr>
+            <w:r>
+              <w:rPr>
+                <w:kern w:val="0"/>
+                <w:sz w:val="24"/>
+              </w:rPr>
+              <w:t xml:space="preserve">技术路线分为总体架构、不变量预言机框架、大模型约束求解主循环、跨架构与编译选项调度四部分，对应研究内容 (1)–(3) 的工程实现。GCC 上的初步验证证据见第五章。</w:t>
+            </w:r>
+          </w:p>
+          <w:p>
+            <w:pPr>
+              <w:pStyle w:val="Normal"/>
+              <w:spacing w:lineRule="auto" w:line="360"/>
               <w:rPr>
                 <w:b/>
                 <w:bCs/>
@@ -3224,30 +3104,33 @@
           </w:p>
           <w:p>
             <w:pPr>
-              <w:spacing w:line="360" w:lineRule="auto"/>
-              <w:ind w:left="0" w:leftChars="0" w:right="0" w:rightChars="0" w:firstLineChars="200"/>
-              <w:rPr>
-                <w:kern w:val="0"/>
-                <w:sz w:val="24"/>
-              </w:rPr>
-            </w:pPr>
-            <w:r>
-              <w:rPr>
-                <w:kern w:val="0"/>
-                <w:sz w:val="24"/>
-              </w:rPr>
-              <w:t>系统以一条 fuzz 主循环为骨架，周围由若干子系统支撑（总体结构见图 4）。编译器子系统封装预先插桩的 GCC 与 LLVM 构建：GCC 侧通过 gcov 采集 .gcda 覆盖率数据，LLVM 侧通过 SanitizerCoverage 与 source-based coverage 采集 .profraw 数据，二者经统一接口归并为同构的"行级覆盖 → 种子 ID"映射，主循环对底层编译器无感知。预言机子系统按防御机制聚合不变量检查器，对每颗成功编译的种子做安全契约判定，判据建立在 ELF 二进制与运行行为之上，GCC 与 LLVM 产物共用同一套检查器。提示词子系统按"基础提示词 + 编译器内部知识"两层装配后提交给远端模型；语料库子系统持久化满足质量阈值的种子并维护家系信息；策略调度器把 ISA、编译选项与 flag profile 按四元组下发给编译器和预言机。</w:t>
-            </w:r>
-          </w:p>
-          <w:p>
-            <w:pPr>
-              <w:spacing w:line="360" w:lineRule="auto"/>
-              <w:jc w:val="center"/>
-            </w:pPr>
-            <w:r>
+              <w:pStyle w:val="Normal"/>
+              <w:spacing w:lineRule="auto" w:line="360"/>
+              <w:ind w:firstLineChars="200" w:startChars="0" w:start="0" w:endChars="0" w:end="0"/>
+              <w:rPr>
+                <w:kern w:val="0"/>
+                <w:sz w:val="24"/>
+              </w:rPr>
+            </w:pPr>
+            <w:r>
+              <w:rPr>
+                <w:kern w:val="0"/>
+                <w:sz w:val="24"/>
+              </w:rPr>
+              <w:t xml:space="preserve">系统以一条 fuzz 主循环为骨架，周围由若干子系统支撑（总体结构见图 4）。编译器子系统封装预先插桩的 GCC 与 LLVM 构建：GCC 侧通过 gcov 采集 .gcda 覆盖率数据，LLVM 侧通过 SanitizerCoverage 与 source-based coverage 采集 .profraw 数据，二者经统一接口归并为同构的"行级覆盖 → 种子 ID"映射，主循环对底层编译器无感知。预言机子系统按防御机制聚合不变量检查器，对每颗成功编译的种子做安全契约判定，判据建立在 ELF 二进制与运行行为之上，GCC 与 LLVM 产物共用同一套检查器。提示词子系统按"基础提示词 + 编译器内部知识"两层装配后提交给远端模型；语料库子系统持久化满足质量阈值的种子并维护家系信息；策略调度器把 ISA、编译选项与 flag profile 按四元组下发给编译器和预言机。</w:t>
+            </w:r>
+          </w:p>
+          <w:p>
+            <w:pPr>
+              <w:pStyle w:val="Normal"/>
+              <w:spacing w:lineRule="auto" w:line="360"/>
+              <w:jc w:val="center"/>
+            </w:pPr>
+            <w:r>
+              <w:rPr/>
               <w:drawing>
-                <wp:inline distT="0" distB="0" distL="0" distR="0">
-                  <wp:extent cx="5385435" cy="2279650"/>
+                <wp:inline xmlns:wp="http://schemas.openxmlformats.org/drawingml/2006/wordprocessingDrawing" distT="0" distB="0" distL="0" distR="0">
+                  <wp:extent cx="5385714" cy="2279952"/>
                   <wp:effectExtent l="0" t="0" r="0" b="0"/>
                   <wp:docPr id="24" name="Figure24"/>
                   <wp:cNvGraphicFramePr>
@@ -3257,13 +3140,11 @@
                     <a:graphicData uri="http://schemas.openxmlformats.org/drawingml/2006/picture">
                       <pic:pic xmlns:pic="http://schemas.openxmlformats.org/drawingml/2006/picture">
                         <pic:nvPicPr>
-                          <pic:cNvPr id="24" name="Figure24"/>
-                          <pic:cNvPicPr>
-                            <a:picLocks noChangeAspect="1"/>
-                          </pic:cNvPicPr>
+                          <pic:cNvPr id="24" name="architecture.png"/>
+                          <pic:cNvPicPr/>
                         </pic:nvPicPr>
                         <pic:blipFill>
-                          <a:blip r:embed="rId9"/>
+                          <a:blip xmlns:r="http://schemas.openxmlformats.org/officeDocument/2006/relationships" r:embed="rId24"/>
                           <a:stretch>
                             <a:fillRect/>
                           </a:stretch>
@@ -3286,7 +3167,8 @@
           </w:p>
           <w:p>
             <w:pPr>
-              <w:spacing w:line="300" w:lineRule="auto"/>
+              <w:pStyle w:val="Normal"/>
+              <w:spacing w:lineRule="auto" w:line="300"/>
               <w:jc w:val="center"/>
               <w:rPr>
                 <w:rFonts w:ascii="宋体" w:hAnsi="宋体" w:eastAsia="宋体"/>
@@ -3305,15 +3187,17 @@
           </w:p>
           <w:p>
             <w:pPr>
-              <w:spacing w:line="360" w:lineRule="auto"/>
-              <w:rPr>
-                <w:sz w:val="24"/>
-              </w:rPr>
-            </w:pPr>
-          </w:p>
-          <w:p>
-            <w:pPr>
-              <w:spacing w:line="360" w:lineRule="auto"/>
+              <w:pStyle w:val="Normal"/>
+              <w:spacing w:lineRule="auto" w:line="360"/>
+              <w:rPr>
+                <w:sz w:val="24"/>
+              </w:rPr>
+            </w:pPr>
+          </w:p>
+          <w:p>
+            <w:pPr>
+              <w:pStyle w:val="Normal"/>
+              <w:spacing w:lineRule="auto" w:line="360"/>
               <w:rPr>
                 <w:b/>
                 <w:bCs/>
@@ -3333,30 +3217,33 @@
           </w:p>
           <w:p>
             <w:pPr>
-              <w:spacing w:line="360" w:lineRule="auto"/>
-              <w:ind w:left="0" w:leftChars="0" w:right="0" w:rightChars="0" w:firstLineChars="200"/>
-              <w:rPr>
-                <w:kern w:val="0"/>
-                <w:sz w:val="24"/>
-              </w:rPr>
-            </w:pPr>
-            <w:r>
-              <w:rPr>
-                <w:kern w:val="0"/>
-                <w:sz w:val="24"/>
-              </w:rPr>
-              <w:t>每个机制对应一个聚合器，下挂若干检查器（判定流程见图 5）。检查器分为静态与动态两类：静态检查器读 ELF 符号表、指令字节模式与 .note 段做断言式判定，例如确认间接跳转目标处的 ENDBR 字节、_chk 接口被正确链接；动态检查器通过受控执行观察运行时行为，典型做法是对溢出 buffer 的填充长度做二分搜索，定位 canary 触发的实际边界。每个检查器返回 Pass、Fail、Error 三态，Error 仅用于隔离基础设施故障，不参与机制级判定；聚合时任一 Fail 即视为机制级违例，并把触发证据回写到种子记录。对易与编译器缺省行为混淆的检查器，框架同时跑开机制与关机制两套 flag profile，比对两次判定的差异，确保 Pass / Fail 反映的是机制本身。预言机按种子级缓存复用二分搜索结果与动态符号查询，避免同一颗二进制被多次解析或执行。</w:t>
-            </w:r>
-          </w:p>
-          <w:p>
-            <w:pPr>
-              <w:spacing w:line="360" w:lineRule="auto"/>
-              <w:jc w:val="center"/>
-            </w:pPr>
-            <w:r>
+              <w:pStyle w:val="Normal"/>
+              <w:spacing w:lineRule="auto" w:line="360"/>
+              <w:ind w:firstLineChars="200" w:startChars="0" w:start="0" w:endChars="0" w:end="0"/>
+              <w:rPr>
+                <w:kern w:val="0"/>
+                <w:sz w:val="24"/>
+              </w:rPr>
+            </w:pPr>
+            <w:r>
+              <w:rPr>
+                <w:kern w:val="0"/>
+                <w:sz w:val="24"/>
+              </w:rPr>
+              <w:t xml:space="preserve">每个机制对应一个聚合器，下挂若干检查器（判定流程见图 5）。检查器分为静态与动态两类：静态检查器读 ELF 符号表、指令字节模式与 .note 段做断言式判定，例如确认间接跳转目标处的 ENDBR 字节、_chk 接口被正确链接；动态检查器通过受控执行观察运行时行为，典型做法是对溢出 buffer 的填充长度做二分搜索，定位 canary 触发的实际边界。每个检查器返回 Pass、Fail、Error 三态，Error 仅用于隔离基础设施故障，不参与机制级判定；聚合时任一 Fail 即视为机制级违例，并把触发证据回写到种子记录。对易与编译器缺省行为混淆的检查器，框架同时跑开机制与关机制两套 flag profile，比对两次判定的差异，确保 Pass / Fail 反映的是机制本身。预言机按种子级缓存复用二分搜索结果与动态符号查询，避免同一颗二进制被多次解析或执行。</w:t>
+            </w:r>
+          </w:p>
+          <w:p>
+            <w:pPr>
+              <w:pStyle w:val="Normal"/>
+              <w:spacing w:lineRule="auto" w:line="360"/>
+              <w:jc w:val="center"/>
+            </w:pPr>
+            <w:r>
+              <w:rPr/>
               <w:drawing>
-                <wp:inline distT="0" distB="0" distL="0" distR="0">
-                  <wp:extent cx="4283710" cy="5605780"/>
+                <wp:inline xmlns:wp="http://schemas.openxmlformats.org/drawingml/2006/wordprocessingDrawing" distT="0" distB="0" distL="0" distR="0">
+                  <wp:extent cx="4284090" cy="5606039"/>
                   <wp:effectExtent l="0" t="0" r="0" b="0"/>
                   <wp:docPr id="25" name="Figure25"/>
                   <wp:cNvGraphicFramePr>
@@ -3366,13 +3253,11 @@
                     <a:graphicData uri="http://schemas.openxmlformats.org/drawingml/2006/picture">
                       <pic:pic xmlns:pic="http://schemas.openxmlformats.org/drawingml/2006/picture">
                         <pic:nvPicPr>
-                          <pic:cNvPr id="25" name="Figure25"/>
-                          <pic:cNvPicPr>
-                            <a:picLocks noChangeAspect="1"/>
-                          </pic:cNvPicPr>
+                          <pic:cNvPr id="25" name="oracle-flow.png"/>
+                          <pic:cNvPicPr/>
                         </pic:nvPicPr>
                         <pic:blipFill>
-                          <a:blip r:embed="rId10"/>
+                          <a:blip xmlns:r="http://schemas.openxmlformats.org/officeDocument/2006/relationships" r:embed="rId25"/>
                           <a:stretch>
                             <a:fillRect/>
                           </a:stretch>
@@ -3395,7 +3280,8 @@
           </w:p>
           <w:p>
             <w:pPr>
-              <w:spacing w:line="300" w:lineRule="auto"/>
+              <w:pStyle w:val="Normal"/>
+              <w:spacing w:lineRule="auto" w:line="300"/>
               <w:jc w:val="center"/>
               <w:rPr>
                 <w:rFonts w:ascii="宋体" w:hAnsi="宋体" w:eastAsia="宋体"/>
@@ -3414,15 +3300,17 @@
           </w:p>
           <w:p>
             <w:pPr>
-              <w:spacing w:line="360" w:lineRule="auto"/>
-              <w:rPr>
-                <w:sz w:val="24"/>
-              </w:rPr>
-            </w:pPr>
-          </w:p>
-          <w:p>
-            <w:pPr>
-              <w:spacing w:line="360" w:lineRule="auto"/>
+              <w:pStyle w:val="Normal"/>
+              <w:spacing w:lineRule="auto" w:line="360"/>
+              <w:rPr>
+                <w:sz w:val="24"/>
+              </w:rPr>
+            </w:pPr>
+          </w:p>
+          <w:p>
+            <w:pPr>
+              <w:pStyle w:val="Normal"/>
+              <w:spacing w:lineRule="auto" w:line="360"/>
               <w:rPr>
                 <w:b/>
                 <w:bCs/>
@@ -3442,30 +3330,33 @@
           </w:p>
           <w:p>
             <w:pPr>
-              <w:spacing w:line="360" w:lineRule="auto"/>
-              <w:ind w:left="0" w:leftChars="0" w:right="0" w:rightChars="0" w:firstLineChars="200"/>
-              <w:rPr>
-                <w:kern w:val="0"/>
-                <w:sz w:val="24"/>
-              </w:rPr>
-            </w:pPr>
-            <w:r>
-              <w:rPr>
-                <w:kern w:val="0"/>
-                <w:sz w:val="24"/>
-              </w:rPr>
-              <w:t>主循环输入为当前覆盖率映射与编译器源码控制流图（迭代过程见图 6）。每轮先按"未覆盖且后继分支数最大"策略选取目标基本块，然后构造目标上下文：目标函数源码片段（来自当前所测的 GCC 或 LLVM 版本）、逐行覆盖标注、目标基本块位置，以及覆盖目标前驱的若干种子作为示例。提示词组装层把上下文拼接到基础约束求解提示词与机制契约要求之后，提交给大模型生成新 C 种子。编译失败时把错误信息与上一版源码反馈进入下一轮；编译成功后覆盖率分析器判断是否命中目标，预言机给出安全判定。种子去留由覆盖增量、是否命中目标、是否触发 bug 三方信号决定（三方决策表）。种子未命中目标但带来新覆盖时，轻量级动态追踪定位它与基线种子在调用序列上的首个发散点，把发散函数源码作为额外上下文构造"错题解析"提示词，再次请求模型做精细变异。目标基本块全部覆盖后，主循环可切换到随机变异阶段，仅以预言机为持久化条件继续探索。</w:t>
-            </w:r>
-          </w:p>
-          <w:p>
-            <w:pPr>
-              <w:spacing w:line="360" w:lineRule="auto"/>
-              <w:jc w:val="center"/>
-            </w:pPr>
-            <w:r>
+              <w:pStyle w:val="Normal"/>
+              <w:spacing w:lineRule="auto" w:line="360"/>
+              <w:ind w:firstLineChars="200" w:startChars="0" w:start="0" w:endChars="0" w:end="0"/>
+              <w:rPr>
+                <w:kern w:val="0"/>
+                <w:sz w:val="24"/>
+              </w:rPr>
+            </w:pPr>
+            <w:r>
+              <w:rPr>
+                <w:kern w:val="0"/>
+                <w:sz w:val="24"/>
+              </w:rPr>
+              <w:t xml:space="preserve">主循环输入为当前覆盖率映射与编译器源码控制流图（迭代过程见图 6）。每轮先按"未覆盖且后继分支数最大"策略选取目标基本块，然后构造目标上下文：目标函数源码片段（来自当前所测的 GCC 或 LLVM 版本）、逐行覆盖标注、目标基本块位置，以及覆盖目标前驱的若干种子作为示例。提示词组装层把上下文拼接到基础约束求解提示词与机制契约要求之后，提交给大模型生成新 C 种子。编译失败时把错误信息与上一版源码反馈进入下一轮；编译成功后覆盖率分析器判断是否命中目标，预言机给出安全判定。种子去留由覆盖增量、是否命中目标、是否触发 bug 三方信号决定（三方决策表）。种子未命中目标但带来新覆盖时，轻量级动态追踪定位它与基线种子在调用序列上的首个发散点，把发散函数源码作为额外上下文构造"错题解析"提示词，再次请求模型做精细变异。目标基本块全部覆盖后，主循环可切换到随机变异阶段，仅以预言机为持久化条件继续探索。</w:t>
+            </w:r>
+          </w:p>
+          <w:p>
+            <w:pPr>
+              <w:pStyle w:val="Normal"/>
+              <w:spacing w:lineRule="auto" w:line="360"/>
+              <w:jc w:val="center"/>
+            </w:pPr>
+            <w:r>
+              <w:rPr/>
               <w:drawing>
-                <wp:inline distT="0" distB="0" distL="0" distR="0">
-                  <wp:extent cx="3664585" cy="6724650"/>
+                <wp:inline xmlns:wp="http://schemas.openxmlformats.org/drawingml/2006/wordprocessingDrawing" distT="0" distB="0" distL="0" distR="0">
+                  <wp:extent cx="3664949" cy="6725183"/>
                   <wp:effectExtent l="0" t="0" r="0" b="0"/>
                   <wp:docPr id="26" name="Figure26"/>
                   <wp:cNvGraphicFramePr>
@@ -3475,13 +3366,11 @@
                     <a:graphicData uri="http://schemas.openxmlformats.org/drawingml/2006/picture">
                       <pic:pic xmlns:pic="http://schemas.openxmlformats.org/drawingml/2006/picture">
                         <pic:nvPicPr>
-                          <pic:cNvPr id="26" name="Figure26"/>
-                          <pic:cNvPicPr>
-                            <a:picLocks noChangeAspect="1"/>
-                          </pic:cNvPicPr>
+                          <pic:cNvPr id="26" name="main-loop.png"/>
+                          <pic:cNvPicPr/>
                         </pic:nvPicPr>
                         <pic:blipFill>
-                          <a:blip r:embed="rId11"/>
+                          <a:blip xmlns:r="http://schemas.openxmlformats.org/officeDocument/2006/relationships" r:embed="rId26"/>
                           <a:stretch>
                             <a:fillRect/>
                           </a:stretch>
@@ -3504,7 +3393,8 @@
           </w:p>
           <w:p>
             <w:pPr>
-              <w:spacing w:line="300" w:lineRule="auto"/>
+              <w:pStyle w:val="Normal"/>
+              <w:spacing w:lineRule="auto" w:line="300"/>
               <w:jc w:val="center"/>
               <w:rPr>
                 <w:rFonts w:ascii="宋体" w:hAnsi="宋体" w:eastAsia="宋体"/>
@@ -3523,15 +3413,17 @@
           </w:p>
           <w:p>
             <w:pPr>
-              <w:spacing w:line="360" w:lineRule="auto"/>
-              <w:rPr>
-                <w:sz w:val="24"/>
-              </w:rPr>
-            </w:pPr>
-          </w:p>
-          <w:p>
-            <w:pPr>
-              <w:spacing w:line="360" w:lineRule="auto"/>
+              <w:pStyle w:val="Normal"/>
+              <w:spacing w:lineRule="auto" w:line="360"/>
+              <w:rPr>
+                <w:sz w:val="24"/>
+              </w:rPr>
+            </w:pPr>
+          </w:p>
+          <w:p>
+            <w:pPr>
+              <w:pStyle w:val="Normal"/>
+              <w:spacing w:lineRule="auto" w:line="360"/>
               <w:rPr>
                 <w:b/>
                 <w:bCs/>
@@ -3551,25 +3443,27 @@
           </w:p>
           <w:p>
             <w:pPr>
-              <w:spacing w:line="360" w:lineRule="auto"/>
-              <w:ind w:left="0" w:leftChars="0" w:right="0" w:rightChars="0" w:firstLineChars="200"/>
-              <w:rPr>
-                <w:kern w:val="0"/>
-                <w:sz w:val="24"/>
-              </w:rPr>
-            </w:pPr>
-            <w:r>
-              <w:rPr>
-                <w:kern w:val="0"/>
-                <w:sz w:val="24"/>
-              </w:rPr>
-              <w:t>编译命令被参数化为编译器（GCC / LLVM）、ISA、架构相关 flag、策略相关 flag profile 四元组，同一份种子按四元组分发给不同工具链，目标二进制通过 QEMU 用户态执行。flag profile 同时包含开机制（如 -fstack-protector-strong）与关机制（如 -fno-stack-protector）两套，预言机据此对同一颗种子做对照判定；关机制产物仅用于交叉验证，不进入主语料库。GCC 与 LLVM 在防御机制 flag 拼写上的差异（如 -fcf-protection 对 -fsanitize=cfi）由 FlagScheduler 统一抽象为"机制级"配置，向上层屏蔽。BinaryInspector 屏蔽 ISA 差异：通过 Go 标准库读取 ELF 符号表与 .note 段，为检查器提供导入函数列表、ENDBR 字节模式扫描、栈布局采样等能力。</w:t>
-            </w:r>
-          </w:p>
-          <w:p>
-            <w:pPr>
+              <w:pStyle w:val="Normal"/>
+              <w:spacing w:lineRule="auto" w:line="360"/>
+              <w:ind w:firstLineChars="200" w:startChars="0" w:start="0" w:endChars="0" w:end="0"/>
+              <w:rPr>
+                <w:kern w:val="0"/>
+                <w:sz w:val="24"/>
+              </w:rPr>
+            </w:pPr>
+            <w:r>
+              <w:rPr>
+                <w:kern w:val="0"/>
+                <w:sz w:val="24"/>
+              </w:rPr>
+              <w:t xml:space="preserve">编译命令被参数化为编译器（GCC / LLVM）、ISA、架构相关 flag、策略相关 flag profile 四元组，同一份种子按四元组分发给不同工具链，目标二进制通过 QEMU 用户态执行。flag profile 同时包含开机制（如 -fstack-protector-strong）与关机制（如 -fno-stack-protector）两套，预言机据此对同一颗种子做对照判定；关机制产物仅用于交叉验证，不进入主语料库。GCC 与 LLVM 在防御机制 flag 拼写上的差异（如 -fcf-protection 对 -fsanitize=cfi）由 FlagScheduler 统一抽象为"机制级"配置，向上层屏蔽。BinaryInspector 屏蔽 ISA 差异：通过 Go 标准库读取 ELF 符号表与 .note 段，为检查器提供导入函数列表、ENDBR 字节模式扫描、栈布局采样等能力。</w:t>
+            </w:r>
+          </w:p>
+          <w:p>
+            <w:pPr>
+              <w:pStyle w:val="Normal"/>
               <w:widowControl/>
-              <w:jc w:val="left"/>
+              <w:jc w:val="start"/>
               <w:rPr>
                 <w:b/>
                 <w:bCs/>
@@ -3589,24 +3483,26 @@
           </w:p>
           <w:p>
             <w:pPr>
-              <w:spacing w:line="360" w:lineRule="auto"/>
-              <w:ind w:left="0" w:leftChars="0" w:right="0" w:rightChars="0" w:firstLineChars="200"/>
-              <w:rPr>
-                <w:kern w:val="0"/>
-                <w:sz w:val="24"/>
-              </w:rPr>
-            </w:pPr>
-            <w:r>
-              <w:rPr>
-                <w:kern w:val="0"/>
-                <w:sz w:val="24"/>
-              </w:rPr>
-              <w:t>目前已在 GCC 多个版本（若干稳定版与一个本地构建的 master 快照）上对栈金丝雀、_FORTIFY_SOURCE、IBT 等部分防御机制做了实验，LLVM 侧同类实验纳入下一阶段。已完成实验共发现 3 例可被上游确认的 silent failure；下文展开其中两例，第三例（栈金丝雀在若干 fallback ISA 上 epilogue 残留寄存器未清零，与 PR-96191 同源）篇幅较短，在 5.3 节简述。</w:t>
-            </w:r>
-          </w:p>
-          <w:p>
-            <w:pPr>
-              <w:spacing w:line="360" w:lineRule="auto"/>
+              <w:pStyle w:val="Normal"/>
+              <w:spacing w:lineRule="auto" w:line="360"/>
+              <w:ind w:firstLineChars="200" w:startChars="0" w:start="0" w:endChars="0" w:end="0"/>
+              <w:rPr>
+                <w:kern w:val="0"/>
+                <w:sz w:val="24"/>
+              </w:rPr>
+            </w:pPr>
+            <w:r>
+              <w:rPr>
+                <w:kern w:val="0"/>
+                <w:sz w:val="24"/>
+              </w:rPr>
+              <w:t xml:space="preserve">目前已在 GCC 多个版本（若干稳定版与一个本地构建的 master 快照）上对栈金丝雀、_FORTIFY_SOURCE、IBT 等部分防御机制做了实验，LLVM 侧同类实验纳入下一阶段。已完成实验共发现 3 例可被上游确认的 silent failure；下文展开其中两例，第三例（栈金丝雀在若干 fallback ISA 上 epilogue 残留寄存器未清零，与 PR-96191 同源）篇幅较短，在 5.3 节简述。</w:t>
+            </w:r>
+          </w:p>
+          <w:p>
+            <w:pPr>
+              <w:pStyle w:val="Normal"/>
+              <w:spacing w:lineRule="auto" w:line="360"/>
               <w:rPr>
                 <w:b/>
                 <w:bCs/>
@@ -3626,64 +3522,69 @@
           </w:p>
           <w:p>
             <w:pPr>
-              <w:spacing w:line="360" w:lineRule="auto"/>
-              <w:ind w:left="0" w:leftChars="0" w:right="0" w:rightChars="0" w:firstLineChars="200"/>
-              <w:rPr>
-                <w:kern w:val="0"/>
-                <w:sz w:val="24"/>
-              </w:rPr>
-            </w:pPr>
-            <w:r>
-              <w:rPr>
-                <w:kern w:val="0"/>
-                <w:sz w:val="24"/>
-              </w:rPr>
-              <w:t>_FORTIFY_SOURCE 是 GCC 与 glibc 配合的源代码加固机制。开启后，glibc 头文件在预处理阶段把 strcat 等危险接口重写为带 size 参数的 __strcat_chk，运行时据此检查目的缓冲区上限。GCC 的 strlen pass 进一步识别已知前缀长度的目的指针，将 __strcat_chk 改写为性能更优的 __stpcpy_chk，并把目的指针前移 strlen(dst) 字节。这里的安全不变量是：目的指针前移后，传给 __stpcpy_chk 的 size 参数必须由原始 objsize 减去 strlen(dst)，否则运行时上限就被静默放宽 strlen(dst) 字节。</w:t>
-            </w:r>
-          </w:p>
-          <w:p>
-            <w:pPr>
-              <w:spacing w:line="360" w:lineRule="auto"/>
-              <w:ind w:left="0" w:leftChars="0" w:right="0" w:rightChars="0" w:firstLineChars="200"/>
-              <w:rPr>
-                <w:kern w:val="0"/>
-                <w:sz w:val="24"/>
-              </w:rPr>
-            </w:pPr>
-            <w:r>
-              <w:rPr>
-                <w:kern w:val="0"/>
-                <w:sz w:val="24"/>
-              </w:rPr>
-              <w:t>实测中，本方法构造的种子在该路径上稳定触发了 size 参数未相应减小的实例。反汇编层面 strcat → __strcat_chk → __stpcpy_chk 整条链条仍然出现，看似 FORTIFY 仍在生效，但"按 dst 剩余空间收紧上限"那一步已被丢弃。该缺陷自 GCC 4.7 起存在，跨越十余年未被发现；上报后已被确认并合入主分支，预计随 GCC 16.1 发布，开发团队同时计划向 GCC 13、14、15 回送补丁。这条路径与 2018 年的 PR-87672 处于同一文件：当年的修复只覆盖了一个对称分支，另一支被遗漏至今——这本身就是第一章所述"矩阵同源遗漏"的又一例证。</w:t>
-            </w:r>
-          </w:p>
-          <w:p>
-            <w:pPr>
-              <w:spacing w:line="360" w:lineRule="auto"/>
-              <w:ind w:left="0" w:leftChars="0" w:right="0" w:rightChars="0" w:firstLineChars="200"/>
-              <w:rPr>
-                <w:kern w:val="0"/>
-                <w:sz w:val="24"/>
-              </w:rPr>
-            </w:pPr>
-            <w:r>
-              <w:rPr>
-                <w:kern w:val="0"/>
-                <w:sz w:val="24"/>
-              </w:rPr>
-              <w:t>预言机方面，本例命中"FORTIFY 调用点的 size 参数下界推断"不变量，证据为静态符号 + 反汇编，在静态阶段判定；该优化路径与 size 静默放宽的位置见图 7。</w:t>
-            </w:r>
-          </w:p>
-          <w:p>
-            <w:pPr>
-              <w:spacing w:line="360" w:lineRule="auto"/>
-              <w:jc w:val="center"/>
-            </w:pPr>
-            <w:r>
+              <w:pStyle w:val="Normal"/>
+              <w:spacing w:lineRule="auto" w:line="360"/>
+              <w:ind w:firstLineChars="200" w:startChars="0" w:start="0" w:endChars="0" w:end="0"/>
+              <w:rPr>
+                <w:kern w:val="0"/>
+                <w:sz w:val="24"/>
+              </w:rPr>
+            </w:pPr>
+            <w:r>
+              <w:rPr>
+                <w:kern w:val="0"/>
+                <w:sz w:val="24"/>
+              </w:rPr>
+              <w:t xml:space="preserve">_FORTIFY_SOURCE 是 GCC 与 glibc 配合的源代码加固机制。开启后，glibc 头文件在预处理阶段把 strcat 等危险接口重写为带 size 参数的 __strcat_chk，运行时据此检查目的缓冲区上限。GCC 的 strlen pass 进一步识别已知前缀长度的目的指针，将 __strcat_chk 改写为性能更优的 __stpcpy_chk，并把目的指针前移 strlen(dst) 字节。这里的安全不变量是：目的指针前移后，传给 __stpcpy_chk 的 size 参数必须由原始 objsize 减去 strlen(dst)，否则运行时上限就被静默放宽 strlen(dst) 字节。</w:t>
+            </w:r>
+          </w:p>
+          <w:p>
+            <w:pPr>
+              <w:pStyle w:val="Normal"/>
+              <w:spacing w:lineRule="auto" w:line="360"/>
+              <w:ind w:firstLineChars="200" w:startChars="0" w:start="0" w:endChars="0" w:end="0"/>
+              <w:rPr>
+                <w:kern w:val="0"/>
+                <w:sz w:val="24"/>
+              </w:rPr>
+            </w:pPr>
+            <w:r>
+              <w:rPr>
+                <w:kern w:val="0"/>
+                <w:sz w:val="24"/>
+              </w:rPr>
+              <w:t xml:space="preserve">实测中，本方法构造的种子在该路径上稳定触发了 size 参数未相应减小的实例。反汇编层面 strcat → __strcat_chk → __stpcpy_chk 整条链条仍然出现，看似 FORTIFY 仍在生效，但"按 dst 剩余空间收紧上限"那一步已被丢弃。该缺陷自 GCC 4.7 起存在，跨越十余年未被发现；上报后已被确认并合入主分支，预计随 GCC 16.1 发布，开发团队同时计划向 GCC 13、14、15 回送补丁。这条路径与 2018 年的 PR-87672 处于同一文件：当年的修复只覆盖了一个对称分支，另一支被遗漏至今——这本身就是第一章所述"矩阵同源遗漏"的又一例证。</w:t>
+            </w:r>
+          </w:p>
+          <w:p>
+            <w:pPr>
+              <w:pStyle w:val="Normal"/>
+              <w:spacing w:lineRule="auto" w:line="360"/>
+              <w:ind w:firstLineChars="200" w:startChars="0" w:start="0" w:endChars="0" w:end="0"/>
+              <w:rPr>
+                <w:kern w:val="0"/>
+                <w:sz w:val="24"/>
+              </w:rPr>
+            </w:pPr>
+            <w:r>
+              <w:rPr>
+                <w:kern w:val="0"/>
+                <w:sz w:val="24"/>
+              </w:rPr>
+              <w:t xml:space="preserve">预言机方面，本例命中"FORTIFY 调用点的 size 参数下界推断"不变量，证据为静态符号 + 反汇编，在静态阶段判定；该优化路径与 size 静默放宽的位置见图 7。</w:t>
+            </w:r>
+          </w:p>
+          <w:p>
+            <w:pPr>
+              <w:pStyle w:val="Normal"/>
+              <w:spacing w:lineRule="auto" w:line="360"/>
+              <w:jc w:val="center"/>
+            </w:pPr>
+            <w:r>
+              <w:rPr/>
               <w:drawing>
-                <wp:inline distT="0" distB="0" distL="0" distR="0">
-                  <wp:extent cx="4283710" cy="6361430"/>
+                <wp:inline xmlns:wp="http://schemas.openxmlformats.org/drawingml/2006/wordprocessingDrawing" distT="0" distB="0" distL="0" distR="0">
+                  <wp:extent cx="4284090" cy="6361875"/>
                   <wp:effectExtent l="0" t="0" r="0" b="0"/>
                   <wp:docPr id="27" name="Figure27"/>
                   <wp:cNvGraphicFramePr>
@@ -3693,13 +3594,11 @@
                     <a:graphicData uri="http://schemas.openxmlformats.org/drawingml/2006/picture">
                       <pic:pic xmlns:pic="http://schemas.openxmlformats.org/drawingml/2006/picture">
                         <pic:nvPicPr>
-                          <pic:cNvPr id="27" name="Figure27"/>
-                          <pic:cNvPicPr>
-                            <a:picLocks noChangeAspect="1"/>
-                          </pic:cNvPicPr>
+                          <pic:cNvPr id="27" name="fortify-path.png"/>
+                          <pic:cNvPicPr/>
                         </pic:nvPicPr>
                         <pic:blipFill>
-                          <a:blip r:embed="rId12"/>
+                          <a:blip xmlns:r="http://schemas.openxmlformats.org/officeDocument/2006/relationships" r:embed="rId27"/>
                           <a:stretch>
                             <a:fillRect/>
                           </a:stretch>
@@ -3722,7 +3621,8 @@
           </w:p>
           <w:p>
             <w:pPr>
-              <w:spacing w:line="300" w:lineRule="auto"/>
+              <w:pStyle w:val="Normal"/>
+              <w:spacing w:lineRule="auto" w:line="300"/>
               <w:jc w:val="center"/>
               <w:rPr>
                 <w:rFonts w:ascii="宋体" w:hAnsi="宋体" w:eastAsia="宋体"/>
@@ -3741,15 +3641,17 @@
           </w:p>
           <w:p>
             <w:pPr>
-              <w:spacing w:line="360" w:lineRule="auto"/>
-              <w:rPr>
-                <w:sz w:val="24"/>
-              </w:rPr>
-            </w:pPr>
-          </w:p>
-          <w:p>
-            <w:pPr>
-              <w:spacing w:line="360" w:lineRule="auto"/>
+              <w:pStyle w:val="Normal"/>
+              <w:spacing w:lineRule="auto" w:line="360"/>
+              <w:rPr>
+                <w:sz w:val="24"/>
+              </w:rPr>
+            </w:pPr>
+          </w:p>
+          <w:p>
+            <w:pPr>
+              <w:pStyle w:val="Normal"/>
+              <w:spacing w:lineRule="auto" w:line="360"/>
               <w:rPr>
                 <w:b/>
                 <w:bCs/>
@@ -3769,58 +3671,62 @@
           </w:p>
           <w:p>
             <w:pPr>
-              <w:spacing w:line="360" w:lineRule="auto"/>
-              <w:ind w:left="0" w:leftChars="0" w:right="0" w:rightChars="0" w:firstLineChars="200"/>
-              <w:rPr>
-                <w:kern w:val="0"/>
-                <w:sz w:val="24"/>
-              </w:rPr>
-            </w:pPr>
-            <w:r>
-              <w:rPr>
-                <w:kern w:val="0"/>
-                <w:sz w:val="24"/>
-              </w:rPr>
-              <w:t>IBT（Indirect Branch Tracking）是 Intel CET 中针对间接跳转的保护机制：硬件要求间接跳转或调用的目标地址必须以 endbr 指令开头，否则触发异常。endbr 在二进制中是固定的四字节值（endbr64 = F3 0F 1E FA、endbr32 = F3 0F 1E FB），按设计只应作为合法间接跳转入口出现在代码段。如果这四个字节以其他形式出现——比如作为 movabsq 指令的 64 位立即数的一部分嵌入 .text——攻击者就可以把控制流劫持到该处，硬件会将其识别为合法 landing pad，IBT 语义被绕过。</w:t>
-            </w:r>
-          </w:p>
-          <w:p>
-            <w:pPr>
-              <w:spacing w:line="360" w:lineRule="auto"/>
-              <w:ind w:left="0" w:leftChars="0" w:right="0" w:rightChars="0" w:firstLineChars="200"/>
-              <w:rPr>
-                <w:kern w:val="0"/>
-                <w:sz w:val="24"/>
-              </w:rPr>
-            </w:pPr>
-            <w:r>
-              <w:rPr>
-                <w:kern w:val="0"/>
-                <w:sz w:val="24"/>
-              </w:rPr>
-              <w:t>GCC 在 x86 后端用 ix86_endbr_immediate_operand 谓词做字节级检测：当目标启用 IBT 时，谓词扫描立即数中是否存在 endbr 模式，含该模式的立即数会被拒绝。本方法在该谓词实现中发现一个逻辑漏洞：扫描循环对"高位非零"的 64 位立即数提前退出，只要 endbr 字节排布在立即数高位，扫描就走不到对应位置。这类立即数被错误接受，进而在 .text 中嵌入了不受控的伪 landing pad。该缺陷已上报上游，等待维护者回复。</w:t>
-            </w:r>
-          </w:p>
-          <w:p>
-            <w:pPr>
-              <w:spacing w:line="360" w:lineRule="auto"/>
-              <w:ind w:left="0" w:leftChars="0" w:right="0" w:rightChars="0" w:firstLineChars="200"/>
-              <w:rPr>
-                <w:kern w:val="0"/>
-                <w:sz w:val="24"/>
-              </w:rPr>
-            </w:pPr>
-            <w:r>
-              <w:rPr>
-                <w:kern w:val="0"/>
-                <w:sz w:val="24"/>
-              </w:rPr>
-              <w:t>预言机方面，本例命中"endbr 字节模式不应出现在非跳转目标的指令中"不变量，证据为代码段内 endbr 模式扫描，属静态指令流检查。</w:t>
-            </w:r>
-          </w:p>
-          <w:p>
-            <w:pPr>
-              <w:spacing w:line="360" w:lineRule="auto"/>
+              <w:pStyle w:val="Normal"/>
+              <w:spacing w:lineRule="auto" w:line="360"/>
+              <w:ind w:firstLineChars="200" w:startChars="0" w:start="0" w:endChars="0" w:end="0"/>
+              <w:rPr>
+                <w:kern w:val="0"/>
+                <w:sz w:val="24"/>
+              </w:rPr>
+            </w:pPr>
+            <w:r>
+              <w:rPr>
+                <w:kern w:val="0"/>
+                <w:sz w:val="24"/>
+              </w:rPr>
+              <w:t xml:space="preserve">IBT（Indirect Branch Tracking）是 Intel CET 中针对间接跳转的保护机制：硬件要求间接跳转或调用的目标地址必须以 endbr 指令开头，否则触发异常。endbr 在二进制中是固定的四字节值（endbr64 = F3 0F 1E FA、endbr32 = F3 0F 1E FB），按设计只应作为合法间接跳转入口出现在代码段。如果这四个字节以其他形式出现——比如作为 movabsq 指令的 64 位立即数的一部分嵌入 .text——攻击者就可以把控制流劫持到该处，硬件会将其识别为合法 landing pad，IBT 语义被绕过。</w:t>
+            </w:r>
+          </w:p>
+          <w:p>
+            <w:pPr>
+              <w:pStyle w:val="Normal"/>
+              <w:spacing w:lineRule="auto" w:line="360"/>
+              <w:ind w:firstLineChars="200" w:startChars="0" w:start="0" w:endChars="0" w:end="0"/>
+              <w:rPr>
+                <w:kern w:val="0"/>
+                <w:sz w:val="24"/>
+              </w:rPr>
+            </w:pPr>
+            <w:r>
+              <w:rPr>
+                <w:kern w:val="0"/>
+                <w:sz w:val="24"/>
+              </w:rPr>
+              <w:t xml:space="preserve">GCC 在 x86 后端用 ix86_endbr_immediate_operand 谓词做字节级检测：当目标启用 IBT 时，谓词扫描立即数中是否存在 endbr 模式，含该模式的立即数会被拒绝。本方法在该谓词实现中发现一个逻辑漏洞：扫描循环对"高位非零"的 64 位立即数提前退出，只要 endbr 字节排布在立即数高位，扫描就走不到对应位置。这类立即数被错误接受，进而在 .text 中嵌入了不受控的伪 landing pad。该缺陷已上报上游，等待维护者回复。</w:t>
+            </w:r>
+          </w:p>
+          <w:p>
+            <w:pPr>
+              <w:pStyle w:val="Normal"/>
+              <w:spacing w:lineRule="auto" w:line="360"/>
+              <w:ind w:firstLineChars="200" w:startChars="0" w:start="0" w:endChars="0" w:end="0"/>
+              <w:rPr>
+                <w:kern w:val="0"/>
+                <w:sz w:val="24"/>
+              </w:rPr>
+            </w:pPr>
+            <w:r>
+              <w:rPr>
+                <w:kern w:val="0"/>
+                <w:sz w:val="24"/>
+              </w:rPr>
+              <w:t xml:space="preserve">预言机方面，本例命中"endbr 字节模式不应出现在非跳转目标的指令中"不变量，证据为代码段内 endbr 模式扫描，属静态指令流检查。</w:t>
+            </w:r>
+          </w:p>
+          <w:p>
+            <w:pPr>
+              <w:pStyle w:val="Normal"/>
+              <w:spacing w:lineRule="auto" w:line="360"/>
               <w:rPr>
                 <w:b/>
                 <w:bCs/>
@@ -3840,24 +3746,26 @@
           </w:p>
           <w:p>
             <w:pPr>
-              <w:spacing w:line="360" w:lineRule="auto"/>
-              <w:ind w:left="0" w:leftChars="0" w:right="0" w:rightChars="0" w:firstLineChars="200"/>
-              <w:rPr>
-                <w:kern w:val="0"/>
-                <w:sz w:val="24"/>
-              </w:rPr>
-            </w:pPr>
-            <w:r>
-              <w:rPr>
-                <w:kern w:val="0"/>
-                <w:sz w:val="24"/>
-              </w:rPr>
-              <w:t>本方法在 GCC 通用栈保护后端的 fallback 路径上还找到一例同类失效：MIPS、LoongArch、Xtensa、CSKY 等 ISA 的 fallback 后端未提供专用 epilogue 模板，函数返回时金丝雀寄存器未显式清零，进程级 __stack_chk_guard 值在调用者的可见寄存器中残留。该问题与 2020 年针对 AArch64 / ARM 的 PR-96191 同源，当年修复未覆盖上述后端。缺陷已上报并被确认、合入修复。</w:t>
-            </w:r>
-          </w:p>
-          <w:p>
-            <w:pPr>
-              <w:spacing w:line="360" w:lineRule="auto"/>
+              <w:pStyle w:val="Normal"/>
+              <w:spacing w:lineRule="auto" w:line="360"/>
+              <w:ind w:firstLineChars="200" w:startChars="0" w:start="0" w:endChars="0" w:end="0"/>
+              <w:rPr>
+                <w:kern w:val="0"/>
+                <w:sz w:val="24"/>
+              </w:rPr>
+            </w:pPr>
+            <w:r>
+              <w:rPr>
+                <w:kern w:val="0"/>
+                <w:sz w:val="24"/>
+              </w:rPr>
+              <w:t xml:space="preserve">本方法在 GCC 通用栈保护后端的 fallback 路径上还找到一例同类失效：MIPS、LoongArch、Xtensa、CSKY 等 ISA 的 fallback 后端未提供专用 epilogue 模板，函数返回时金丝雀寄存器未显式清零，进程级 __stack_chk_guard 值在调用者的可见寄存器中残留。该问题与 2020 年针对 AArch64 / ARM 的 PR-96191 同源，当年修复未覆盖上述后端。缺陷已上报并被确认、合入修复。</w:t>
+            </w:r>
+          </w:p>
+          <w:p>
+            <w:pPr>
+              <w:pStyle w:val="Normal"/>
+              <w:spacing w:lineRule="auto" w:line="360"/>
               <w:rPr>
                 <w:b/>
                 <w:bCs/>
@@ -3877,25 +3785,27 @@
           </w:p>
           <w:p>
             <w:pPr>
-              <w:spacing w:line="360" w:lineRule="auto"/>
-              <w:ind w:left="0" w:leftChars="0" w:right="0" w:rightChars="0" w:firstLineChars="200"/>
-              <w:rPr>
-                <w:kern w:val="0"/>
-                <w:sz w:val="24"/>
-              </w:rPr>
-            </w:pPr>
-            <w:r>
-              <w:rPr>
-                <w:kern w:val="0"/>
-                <w:sz w:val="24"/>
-              </w:rPr>
-              <w:t>三例分别覆盖静态符号、动态行为、指令流字节模式三类不变量形态，共同特征是：二进制看起来带有保护，但编译器代码路径某一处的安全不变量已失去维护。方法在不修改编译器的前提下，通过约束求解与不变量预言机组合把这类差异在自动化流程中暴露出来。LLVM 侧实验预计在后续阶段以同一预言机框架补全。</w:t>
-            </w:r>
-          </w:p>
-          <w:p>
-            <w:pPr>
+              <w:pStyle w:val="Normal"/>
+              <w:spacing w:lineRule="auto" w:line="360"/>
+              <w:ind w:firstLineChars="200" w:startChars="0" w:start="0" w:endChars="0" w:end="0"/>
+              <w:rPr>
+                <w:kern w:val="0"/>
+                <w:sz w:val="24"/>
+              </w:rPr>
+            </w:pPr>
+            <w:r>
+              <w:rPr>
+                <w:kern w:val="0"/>
+                <w:sz w:val="24"/>
+              </w:rPr>
+              <w:t xml:space="preserve">三例分别覆盖静态符号、动态行为、指令流字节模式三类不变量形态，共同特征是：二进制看起来带有保护，但编译器代码路径某一处的安全不变量已失去维护。方法在不修改编译器的前提下，通过约束求解与不变量预言机组合把这类差异在自动化流程中暴露出来。LLVM 侧实验预计在后续阶段以同一预言机框架补全。</w:t>
+            </w:r>
+          </w:p>
+          <w:p>
+            <w:pPr>
+              <w:pStyle w:val="Normal"/>
               <w:widowControl/>
-              <w:jc w:val="left"/>
+              <w:jc w:val="start"/>
               <w:rPr>
                 <w:b/>
                 <w:bCs/>
@@ -3915,258 +3825,274 @@
           </w:p>
           <w:p>
             <w:pPr>
-              <w:spacing w:line="360" w:lineRule="auto"/>
-              <w:rPr>
-                <w:kern w:val="0"/>
-                <w:sz w:val="24"/>
-              </w:rPr>
-            </w:pPr>
-            <w:r>
-              <w:rPr>
-                <w:kern w:val="0"/>
-                <w:sz w:val="24"/>
-              </w:rPr>
-              <w:t>[1] Yang X, Chen Y, Eide E, et al. Finding and understanding bugs in C compilers[C]//Proceedings of the 32nd ACM SIGPLAN Conference on Programming Language Design and Implementation (PLDI). 2011: 283-294.</w:t>
-            </w:r>
-          </w:p>
-          <w:p>
-            <w:pPr>
-              <w:spacing w:line="360" w:lineRule="auto"/>
-              <w:rPr>
-                <w:kern w:val="0"/>
-                <w:sz w:val="24"/>
-              </w:rPr>
-            </w:pPr>
-            <w:r>
-              <w:rPr>
-                <w:kern w:val="0"/>
-                <w:sz w:val="24"/>
-              </w:rPr>
-              <w:t>[2] Livinskii V, Babokin D, Regehr J. Random testing for C and C++ compilers with YARPGen[C]//Proceedings of the ACM on Programming Languages (OOPSLA). 2020, 4: 1-25.</w:t>
-            </w:r>
-          </w:p>
-          <w:p>
-            <w:pPr>
-              <w:spacing w:line="360" w:lineRule="auto"/>
-              <w:rPr>
-                <w:kern w:val="0"/>
-                <w:sz w:val="24"/>
-              </w:rPr>
-            </w:pPr>
-            <w:r>
-              <w:rPr>
-                <w:kern w:val="0"/>
-                <w:sz w:val="24"/>
-              </w:rPr>
-              <w:t>[3] Zalewski M. American Fuzzy Lop (AFL)[EB/OL]. (2014)[2026-02-15]. https://lcamtuf.coredump.cx/afl/.</w:t>
-            </w:r>
-          </w:p>
-          <w:p>
-            <w:pPr>
-              <w:spacing w:line="360" w:lineRule="auto"/>
-              <w:rPr>
-                <w:kern w:val="0"/>
-                <w:sz w:val="24"/>
-              </w:rPr>
-            </w:pPr>
-            <w:r>
-              <w:rPr>
-                <w:kern w:val="0"/>
-                <w:sz w:val="24"/>
-              </w:rPr>
-              <w:t>[4] Serebryany K. Continuous fuzzing with libFuzzer and AddressSanitizer[C]//IEEE Cybersecurity Development (SecDev). 2016: 157.</w:t>
-            </w:r>
-          </w:p>
-          <w:p>
-            <w:pPr>
-              <w:spacing w:line="360" w:lineRule="auto"/>
-              <w:rPr>
-                <w:kern w:val="0"/>
-                <w:sz w:val="24"/>
-              </w:rPr>
-            </w:pPr>
-            <w:r>
-              <w:rPr>
-                <w:kern w:val="0"/>
-                <w:sz w:val="24"/>
-              </w:rPr>
-              <w:t>[5] Yang C, Deng Y, Lu R, et al. WhiteFox: White-box compiler fuzzing empowered by large language models[C]//Proceedings of the ACM on Programming Languages (OOPSLA). 2024.</w:t>
-            </w:r>
-          </w:p>
-          <w:p>
-            <w:pPr>
-              <w:spacing w:line="360" w:lineRule="auto"/>
-              <w:rPr>
-                <w:kern w:val="0"/>
-                <w:sz w:val="24"/>
-              </w:rPr>
-            </w:pPr>
-            <w:r>
-              <w:rPr>
-                <w:kern w:val="0"/>
-                <w:sz w:val="24"/>
-              </w:rPr>
-              <w:t>[6] GNU Project. GCC Bugzilla PR 87672 — tree-ssa-strlen: __strcat_chk to __stpcpy_chk drops bound subtract[EB/OL]. (2018)[2026-02-15]. https://gcc.gnu.org/bugzilla/show_bug.cgi?id=87672.</w:t>
-            </w:r>
-          </w:p>
-          <w:p>
-            <w:pPr>
-              <w:spacing w:line="360" w:lineRule="auto"/>
-              <w:rPr>
-                <w:kern w:val="0"/>
-                <w:sz w:val="24"/>
-              </w:rPr>
-            </w:pPr>
-            <w:r>
-              <w:rPr>
-                <w:kern w:val="0"/>
-                <w:sz w:val="24"/>
-              </w:rPr>
-              <w:t>[7] GNU Project. GCC Bugzilla PR 96191 — stack-protector leaves canary in caller-saved register on AArch64/ARM[EB/OL]. (2020)[2026-02-15]. https://gcc.gnu.org/bugzilla/show_bug.cgi?id=96191.</w:t>
-            </w:r>
-          </w:p>
-          <w:p>
-            <w:pPr>
-              <w:spacing w:line="360" w:lineRule="auto"/>
-              <w:rPr>
-                <w:kern w:val="0"/>
-                <w:sz w:val="24"/>
-              </w:rPr>
-            </w:pPr>
-            <w:r>
-              <w:rPr>
-                <w:kern w:val="0"/>
-                <w:sz w:val="24"/>
-              </w:rPr>
-              <w:t>[8] GNU Project. GCC Bugzilla PR 96350 — i386: reject ENDBR pattern in immediate operands under -fcf-protection=branch[EB/OL]. (2020)[2026-02-15]. https://gcc.gnu.org/bugzilla/show_bug.cgi?id=96350.</w:t>
-            </w:r>
-          </w:p>
-          <w:p>
-            <w:pPr>
-              <w:spacing w:line="360" w:lineRule="auto"/>
-              <w:rPr>
-                <w:kern w:val="0"/>
-                <w:sz w:val="24"/>
-              </w:rPr>
-            </w:pPr>
-            <w:r>
-              <w:rPr>
-                <w:kern w:val="0"/>
-                <w:sz w:val="24"/>
-              </w:rPr>
-              <w:t>[9] Intel Corporation. Control-flow Enforcement Technology Specification[R/OL]. (2019)[2026-02-15]. https://www.intel.com/content/www/us/en/developer/articles/technical/technical-look-control-flow-enforcement-technology.html.</w:t>
-            </w:r>
-          </w:p>
-          <w:p>
-            <w:pPr>
-              <w:spacing w:line="360" w:lineRule="auto"/>
-              <w:rPr>
-                <w:kern w:val="0"/>
-                <w:sz w:val="24"/>
-              </w:rPr>
-            </w:pPr>
-            <w:r>
-              <w:rPr>
-                <w:kern w:val="0"/>
-                <w:sz w:val="24"/>
-              </w:rPr>
-              <w:t>[10] Free Software Foundation. The GNU C Library Reference Manual: Source Fortification[EB/OL]. (2024)[2026-02-15]. https://sourceware.org/glibc/manual/latest/html_node/Source-Fortification.html.</w:t>
-            </w:r>
-          </w:p>
-          <w:p>
-            <w:pPr>
-              <w:spacing w:line="360" w:lineRule="auto"/>
-              <w:rPr>
-                <w:kern w:val="0"/>
-                <w:sz w:val="24"/>
-              </w:rPr>
-            </w:pPr>
-            <w:r>
-              <w:rPr>
-                <w:kern w:val="0"/>
-                <w:sz w:val="24"/>
-              </w:rPr>
-              <w:t>[11] Le V, Afshari M, Su Z. Compiler validation via equivalence modulo inputs[C]//Proceedings of the 35th ACM SIGPLAN Conference on Programming Language Design and Implementation (PLDI). 2014: 216-226.</w:t>
-            </w:r>
-          </w:p>
-          <w:p>
-            <w:pPr>
-              <w:spacing w:line="360" w:lineRule="auto"/>
-              <w:rPr>
-                <w:kern w:val="0"/>
-                <w:sz w:val="24"/>
-              </w:rPr>
-            </w:pPr>
-            <w:r>
-              <w:rPr>
-                <w:kern w:val="0"/>
-                <w:sz w:val="24"/>
-              </w:rPr>
-              <w:t>[12] Li S, Su Z. UBfuzz: Finding bugs in sanitizer implementations[C]//Proceedings of the 29th ACM International Conference on Architectural Support for Programming Languages and Operating Systems (ASPLOS). 2024.</w:t>
-            </w:r>
-          </w:p>
-          <w:p>
-            <w:pPr>
-              <w:spacing w:line="360" w:lineRule="auto"/>
-              <w:rPr>
-                <w:kern w:val="0"/>
-                <w:sz w:val="24"/>
-              </w:rPr>
-            </w:pPr>
-            <w:r>
-              <w:rPr>
-                <w:kern w:val="0"/>
-                <w:sz w:val="24"/>
-              </w:rPr>
-              <w:t>[13] Ma H, Shen Q, Tian Y, et al. Fuzzing deep learning compilers with HirGen[C]//Proceedings of the 32nd ACM SIGSOFT International Symposium on Software Testing and Analysis (ISSTA). 2023.</w:t>
-            </w:r>
-          </w:p>
-          <w:p>
-            <w:pPr>
-              <w:spacing w:line="360" w:lineRule="auto"/>
-              <w:rPr>
-                <w:kern w:val="0"/>
-                <w:sz w:val="24"/>
-              </w:rPr>
-            </w:pPr>
-            <w:r>
-              <w:rPr>
-                <w:kern w:val="0"/>
-                <w:sz w:val="24"/>
-              </w:rPr>
-              <w:t>[14] Even-Mendoza K, Sharma A, Donaldson A F, et al. GrayC: Greybox fuzzing of compilers and analysers for C[C]//Proceedings of the 32nd ACM SIGSOFT International Symposium on Software Testing and Analysis (ISSTA). 2023: 1219-1231.</w:t>
-            </w:r>
-          </w:p>
-          <w:p>
-            <w:pPr>
-              <w:spacing w:line="360" w:lineRule="auto"/>
-              <w:rPr>
-                <w:kern w:val="0"/>
-                <w:sz w:val="24"/>
-              </w:rPr>
-            </w:pPr>
-            <w:r>
-              <w:rPr>
-                <w:kern w:val="0"/>
-                <w:sz w:val="24"/>
-              </w:rPr>
-              <w:t>[15] Yang Y, Zhang H, Ren Z, et al. Hybrid language processor fuzzing via LLM-based constraint solving[C]//Proceedings of the 34th USENIX Security Symposium (USENIX Security). 2025.</w:t>
-            </w:r>
-          </w:p>
-          <w:p>
-            <w:pPr>
-              <w:spacing w:line="360" w:lineRule="auto"/>
-              <w:rPr>
-                <w:kern w:val="0"/>
-                <w:sz w:val="24"/>
-              </w:rPr>
-            </w:pPr>
-            <w:r>
-              <w:rPr>
-                <w:kern w:val="0"/>
-                <w:sz w:val="24"/>
-              </w:rPr>
-              <w:t>[16] Meta Security. CVE-2023-4039: GCC's -fstack-protector fails to guard dynamic stack allocations on AArch64[EB/OL]. (2023)[2026-02-15]. https://rtx.meta.security/mitigation/2023/09/12/CVE-2023-4039.html.</w:t>
+              <w:pStyle w:val="Normal"/>
+              <w:spacing w:lineRule="auto" w:line="360"/>
+              <w:rPr>
+                <w:kern w:val="0"/>
+                <w:sz w:val="24"/>
+              </w:rPr>
+            </w:pPr>
+            <w:r>
+              <w:rPr>
+                <w:kern w:val="0"/>
+                <w:sz w:val="24"/>
+              </w:rPr>
+              <w:t xml:space="preserve">[1] Yang X, Chen Y, Eide E, et al. Finding and understanding bugs in C compilers[C]//Proceedings of the 32nd ACM SIGPLAN Conference on Programming Language Design and Implementation (PLDI). 2011: 283-294.</w:t>
+            </w:r>
+          </w:p>
+          <w:p>
+            <w:pPr>
+              <w:pStyle w:val="Normal"/>
+              <w:spacing w:lineRule="auto" w:line="360"/>
+              <w:rPr>
+                <w:kern w:val="0"/>
+                <w:sz w:val="24"/>
+              </w:rPr>
+            </w:pPr>
+            <w:r>
+              <w:rPr>
+                <w:kern w:val="0"/>
+                <w:sz w:val="24"/>
+              </w:rPr>
+              <w:t xml:space="preserve">[2] Livinskii V, Babokin D, Regehr J. Random testing for C and C++ compilers with YARPGen[C]//Proceedings of the ACM on Programming Languages (OOPSLA). 2020, 4: 1-25.</w:t>
+            </w:r>
+          </w:p>
+          <w:p>
+            <w:pPr>
+              <w:pStyle w:val="Normal"/>
+              <w:spacing w:lineRule="auto" w:line="360"/>
+              <w:rPr>
+                <w:kern w:val="0"/>
+                <w:sz w:val="24"/>
+              </w:rPr>
+            </w:pPr>
+            <w:r>
+              <w:rPr>
+                <w:kern w:val="0"/>
+                <w:sz w:val="24"/>
+              </w:rPr>
+              <w:t xml:space="preserve">[3] Zalewski M. American Fuzzy Lop (AFL)[EB/OL]. (2014)[2026-02-15]. https://lcamtuf.coredump.cx/afl/.</w:t>
+            </w:r>
+          </w:p>
+          <w:p>
+            <w:pPr>
+              <w:pStyle w:val="Normal"/>
+              <w:spacing w:lineRule="auto" w:line="360"/>
+              <w:rPr>
+                <w:kern w:val="0"/>
+                <w:sz w:val="24"/>
+              </w:rPr>
+            </w:pPr>
+            <w:r>
+              <w:rPr>
+                <w:kern w:val="0"/>
+                <w:sz w:val="24"/>
+              </w:rPr>
+              <w:t xml:space="preserve">[4] Serebryany K. Continuous fuzzing with libFuzzer and AddressSanitizer[C]//IEEE Cybersecurity Development (SecDev). 2016: 157.</w:t>
+            </w:r>
+          </w:p>
+          <w:p>
+            <w:pPr>
+              <w:pStyle w:val="Normal"/>
+              <w:spacing w:lineRule="auto" w:line="360"/>
+              <w:rPr>
+                <w:kern w:val="0"/>
+                <w:sz w:val="24"/>
+              </w:rPr>
+            </w:pPr>
+            <w:r>
+              <w:rPr>
+                <w:kern w:val="0"/>
+                <w:sz w:val="24"/>
+              </w:rPr>
+              <w:t xml:space="preserve">[5] Yang C, Deng Y, Lu R, et al. WhiteFox: White-box compiler fuzzing empowered by large language models[C]//Proceedings of the ACM on Programming Languages (OOPSLA). 2024.</w:t>
+            </w:r>
+          </w:p>
+          <w:p>
+            <w:pPr>
+              <w:pStyle w:val="Normal"/>
+              <w:spacing w:lineRule="auto" w:line="360"/>
+              <w:rPr>
+                <w:kern w:val="0"/>
+                <w:sz w:val="24"/>
+              </w:rPr>
+            </w:pPr>
+            <w:r>
+              <w:rPr>
+                <w:kern w:val="0"/>
+                <w:sz w:val="24"/>
+              </w:rPr>
+              <w:t xml:space="preserve">[6] GNU Project. GCC Bugzilla PR 87672 — tree-ssa-strlen: __strcat_chk to __stpcpy_chk drops bound subtract[EB/OL]. (2018)[2026-02-15]. https://gcc.gnu.org/bugzilla/show_bug.cgi?id=87672.</w:t>
+            </w:r>
+          </w:p>
+          <w:p>
+            <w:pPr>
+              <w:pStyle w:val="Normal"/>
+              <w:spacing w:lineRule="auto" w:line="360"/>
+              <w:rPr>
+                <w:kern w:val="0"/>
+                <w:sz w:val="24"/>
+              </w:rPr>
+            </w:pPr>
+            <w:r>
+              <w:rPr>
+                <w:kern w:val="0"/>
+                <w:sz w:val="24"/>
+              </w:rPr>
+              <w:t xml:space="preserve">[7] GNU Project. GCC Bugzilla PR 96191 — stack-protector leaves canary in caller-saved register on AArch64/ARM[EB/OL]. (2020)[2026-02-15]. https://gcc.gnu.org/bugzilla/show_bug.cgi?id=96191.</w:t>
+            </w:r>
+          </w:p>
+          <w:p>
+            <w:pPr>
+              <w:pStyle w:val="Normal"/>
+              <w:spacing w:lineRule="auto" w:line="360"/>
+              <w:rPr>
+                <w:kern w:val="0"/>
+                <w:sz w:val="24"/>
+              </w:rPr>
+            </w:pPr>
+            <w:r>
+              <w:rPr>
+                <w:kern w:val="0"/>
+                <w:sz w:val="24"/>
+              </w:rPr>
+              <w:t xml:space="preserve">[8] GNU Project. GCC Bugzilla PR 96350 — i386: reject ENDBR pattern in immediate operands under -fcf-protection=branch[EB/OL]. (2020)[2026-02-15]. https://gcc.gnu.org/bugzilla/show_bug.cgi?id=96350.</w:t>
+            </w:r>
+          </w:p>
+          <w:p>
+            <w:pPr>
+              <w:pStyle w:val="Normal"/>
+              <w:spacing w:lineRule="auto" w:line="360"/>
+              <w:rPr>
+                <w:kern w:val="0"/>
+                <w:sz w:val="24"/>
+              </w:rPr>
+            </w:pPr>
+            <w:r>
+              <w:rPr>
+                <w:kern w:val="0"/>
+                <w:sz w:val="24"/>
+              </w:rPr>
+              <w:t xml:space="preserve">[9] Intel Corporation. Control-flow Enforcement Technology Specification[R/OL]. (2019)[2026-02-15]. https://www.intel.com/content/www/us/en/developer/articles/technical/technical-look-control-flow-enforcement-technology.html.</w:t>
+            </w:r>
+          </w:p>
+          <w:p>
+            <w:pPr>
+              <w:pStyle w:val="Normal"/>
+              <w:spacing w:lineRule="auto" w:line="360"/>
+              <w:rPr>
+                <w:kern w:val="0"/>
+                <w:sz w:val="24"/>
+              </w:rPr>
+            </w:pPr>
+            <w:r>
+              <w:rPr>
+                <w:kern w:val="0"/>
+                <w:sz w:val="24"/>
+              </w:rPr>
+              <w:t xml:space="preserve">[10] Free Software Foundation. The GNU C Library Reference Manual: Source Fortification[EB/OL]. (2024)[2026-02-15]. https://sourceware.org/glibc/manual/latest/html_node/Source-Fortification.html.</w:t>
+            </w:r>
+          </w:p>
+          <w:p>
+            <w:pPr>
+              <w:pStyle w:val="Normal"/>
+              <w:spacing w:lineRule="auto" w:line="360"/>
+              <w:rPr>
+                <w:kern w:val="0"/>
+                <w:sz w:val="24"/>
+              </w:rPr>
+            </w:pPr>
+            <w:r>
+              <w:rPr>
+                <w:kern w:val="0"/>
+                <w:sz w:val="24"/>
+              </w:rPr>
+              <w:t xml:space="preserve">[11] Le V, Afshari M, Su Z. Compiler validation via equivalence modulo inputs[C]//Proceedings of the 35th ACM SIGPLAN Conference on Programming Language Design and Implementation (PLDI). 2014: 216-226.</w:t>
+            </w:r>
+          </w:p>
+          <w:p>
+            <w:pPr>
+              <w:pStyle w:val="Normal"/>
+              <w:spacing w:lineRule="auto" w:line="360"/>
+              <w:rPr>
+                <w:kern w:val="0"/>
+                <w:sz w:val="24"/>
+              </w:rPr>
+            </w:pPr>
+            <w:r>
+              <w:rPr>
+                <w:kern w:val="0"/>
+                <w:sz w:val="24"/>
+              </w:rPr>
+              <w:t xml:space="preserve">[12] Li S, Su Z. UBfuzz: Finding bugs in sanitizer implementations[C]//Proceedings of the 29th ACM International Conference on Architectural Support for Programming Languages and Operating Systems (ASPLOS). 2024.</w:t>
+            </w:r>
+          </w:p>
+          <w:p>
+            <w:pPr>
+              <w:pStyle w:val="Normal"/>
+              <w:spacing w:lineRule="auto" w:line="360"/>
+              <w:rPr>
+                <w:kern w:val="0"/>
+                <w:sz w:val="24"/>
+              </w:rPr>
+            </w:pPr>
+            <w:r>
+              <w:rPr>
+                <w:kern w:val="0"/>
+                <w:sz w:val="24"/>
+              </w:rPr>
+              <w:t xml:space="preserve">[13] Ma H, Shen Q, Tian Y, et al. Fuzzing deep learning compilers with HirGen[C]//Proceedings of the 32nd ACM SIGSOFT International Symposium on Software Testing and Analysis (ISSTA). 2023.</w:t>
+            </w:r>
+          </w:p>
+          <w:p>
+            <w:pPr>
+              <w:pStyle w:val="Normal"/>
+              <w:spacing w:lineRule="auto" w:line="360"/>
+              <w:rPr>
+                <w:kern w:val="0"/>
+                <w:sz w:val="24"/>
+              </w:rPr>
+            </w:pPr>
+            <w:r>
+              <w:rPr>
+                <w:kern w:val="0"/>
+                <w:sz w:val="24"/>
+              </w:rPr>
+              <w:t xml:space="preserve">[14] Even-Mendoza K, Sharma A, Donaldson A F, et al. GrayC: Greybox fuzzing of compilers and analysers for C[C]//Proceedings of the 32nd ACM SIGSOFT International Symposium on Software Testing and Analysis (ISSTA). 2023: 1219-1231.</w:t>
+            </w:r>
+          </w:p>
+          <w:p>
+            <w:pPr>
+              <w:pStyle w:val="Normal"/>
+              <w:spacing w:lineRule="auto" w:line="360"/>
+              <w:rPr>
+                <w:kern w:val="0"/>
+                <w:sz w:val="24"/>
+              </w:rPr>
+            </w:pPr>
+            <w:r>
+              <w:rPr>
+                <w:kern w:val="0"/>
+                <w:sz w:val="24"/>
+              </w:rPr>
+              <w:t xml:space="preserve">[15] Yang Y, Zhang H, Ren Z, et al. Hybrid language processor fuzzing via LLM-based constraint solving[C]//Proceedings of the 34th USENIX Security Symposium (USENIX Security). 2025.</w:t>
+            </w:r>
+          </w:p>
+          <w:p>
+            <w:pPr>
+              <w:pStyle w:val="Normal"/>
+              <w:spacing w:lineRule="auto" w:line="360"/>
+              <w:rPr>
+                <w:kern w:val="0"/>
+                <w:sz w:val="24"/>
+              </w:rPr>
+            </w:pPr>
+            <w:r>
+              <w:rPr>
+                <w:kern w:val="0"/>
+                <w:sz w:val="24"/>
+              </w:rPr>
+              <w:t xml:space="preserve">[16] Meta Security. CVE-2023-4039: GCC's -fstack-protector fails to guard dynamic stack allocations on AArch64[EB/OL]. (2023)[2026-02-15]. https://rtx.meta.security/mitigation/2023/09/12/CVE-2023-4039.html.</w:t>
             </w:r>
           </w:p>
         </w:tc>
@@ -4264,19 +4190,20 @@
           </w:tcPr>
           <w:p>
             <w:pPr>
-              <w:spacing w:line="360" w:lineRule="auto"/>
-              <w:ind w:left="0" w:leftChars="0" w:right="0" w:rightChars="0" w:firstLineChars="200"/>
-              <w:rPr>
-                <w:kern w:val="0"/>
-                <w:sz w:val="24"/>
-              </w:rPr>
-            </w:pPr>
-            <w:r>
-              <w:rPr>
-                <w:kern w:val="0"/>
-                <w:sz w:val="24"/>
-              </w:rPr>
-              <w:t>理论分析涉及三方面：编译器主流防御机制的安全不变量及其证据形式、覆盖率与控制流图引导的目标基本块选择策略、大模型生成能力与预言机判定的耦合方式。预期产出包括：一套覆盖至少三种主流防御机制的不变量集合、一套可扩展的预言机框架、一个可面向 GCC 与 LLVM 跨架构运行的 fuzzer 原型；通过在 GCC 与 LLVM 主流版本上发现真实 silent failure 来验证有效性。硬件方面，开发与实验依托一台 64 位 Linux 工作站（不少于 32 GB 内存、百 GB 级 SSD），用于 GCC / LLVM 多版本本地构建、覆盖率数据缓存与跨架构 QEMU 用户态执行；大模型推理通过远程 API 完成，本机不需要独立 GPU。</w:t>
+              <w:pStyle w:val="Normal"/>
+              <w:spacing w:lineRule="auto" w:line="360"/>
+              <w:ind w:firstLineChars="200" w:startChars="0" w:start="0" w:endChars="0" w:end="0"/>
+              <w:rPr>
+                <w:kern w:val="0"/>
+                <w:sz w:val="24"/>
+              </w:rPr>
+            </w:pPr>
+            <w:r>
+              <w:rPr>
+                <w:kern w:val="0"/>
+                <w:sz w:val="24"/>
+              </w:rPr>
+              <w:t xml:space="preserve">理论分析涉及三方面：编译器主流防御机制的安全不变量及其证据形式、覆盖率与控制流图引导的目标基本块选择策略、大模型生成能力与预言机判定的耦合方式。预期产出包括：一套覆盖至少三种主流防御机制的不变量集合、一套可扩展的预言机框架、一个可面向 GCC 与 LLVM 跨架构运行的 fuzzer 原型；通过在 GCC 与 LLVM 主流版本上发现真实 silent failure 来验证有效性。硬件方面，开发与实验依托一台 64 位 Linux 工作站（不少于 32 GB 内存、百 GB 级 SSD），用于 GCC / LLVM 多版本本地构建、覆盖率数据缓存与跨架构 QEMU 用户态执行；大模型推理通过远程 API 完成，本机不需要独立 GPU。</w:t>
             </w:r>
           </w:p>
         </w:tc>
@@ -4313,7 +4240,7 @@
       </w:tblPr>
       <w:tblGrid>
         <w:gridCol w:w="2124"/>
-        <w:gridCol w:w="5282"/>
+        <w:gridCol w:w="5283"/>
         <w:gridCol w:w="2349"/>
       </w:tblGrid>
       <w:tr>
@@ -4418,32 +4345,24 @@
         </w:tc>
       </w:tr>
       <w:tr>
-        <w:tblPrEx>
-          <w:tblCellMar>
-            <w:top w:w="0" w:type="dxa"/>
-            <w:left w:w="108" w:type="dxa"/>
-            <w:bottom w:w="0" w:type="dxa"/>
-            <w:right w:w="108" w:type="dxa"/>
-          </w:tblCellMar>
-        </w:tblPrEx>
         <w:trPr>
           <w:trHeight w:val="480" w:hRule="atLeast"/>
-          <w:jc w:val="center"/>
         </w:trPr>
         <w:tc>
           <w:tcPr>
             <w:tcW w:w="2077" w:type="dxa"/>
             <w:tcBorders>
-              <w:top w:val="single" w:color="000000" w:sz="4" w:space="0"/>
-              <w:left w:val="single" w:color="000000" w:sz="4" w:space="0"/>
-              <w:bottom w:val="single" w:color="000000" w:sz="4" w:space="0"/>
-              <w:right w:val="single" w:color="000000" w:sz="4" w:space="0"/>
+              <w:top w:val="single" w:sz="4" w:space="0" w:color="000000"/>
+              <w:start w:val="single" w:sz="4" w:space="0" w:color="000000"/>
+              <w:bottom w:val="single" w:sz="4" w:space="0" w:color="000000"/>
+              <w:end w:val="single" w:sz="4" w:space="0" w:color="000000"/>
             </w:tcBorders>
             <w:vAlign w:val="center"/>
           </w:tcPr>
           <w:p>
             <w:pPr>
-              <w:spacing w:line="320" w:lineRule="exact"/>
+              <w:pStyle w:val="Normal"/>
+              <w:spacing w:lineRule="exact" w:line="320"/>
               <w:jc w:val="center"/>
               <w:rPr>
                 <w:rFonts w:ascii="宋体" w:hAnsi="宋体" w:eastAsia="宋体"/>
@@ -4455,7 +4374,7 @@
                 <w:rFonts w:ascii="宋体" w:hAnsi="宋体" w:eastAsia="宋体"/>
                 <w:sz w:val="24"/>
               </w:rPr>
-              <w:t>2026.02-2026.03</w:t>
+              <w:t xml:space="preserve">2026.02-2026.03</w:t>
             </w:r>
           </w:p>
         </w:tc>
@@ -4463,16 +4382,17 @@
           <w:tcPr>
             <w:tcW w:w="5167" w:type="dxa"/>
             <w:tcBorders>
-              <w:top w:val="single" w:color="000000" w:sz="4" w:space="0"/>
-              <w:left w:val="single" w:color="000000" w:sz="4" w:space="0"/>
-              <w:bottom w:val="single" w:color="000000" w:sz="4" w:space="0"/>
-              <w:right w:val="single" w:color="000000" w:sz="4" w:space="0"/>
+              <w:top w:val="single" w:sz="4" w:space="0" w:color="000000"/>
+              <w:start w:val="single" w:sz="4" w:space="0" w:color="000000"/>
+              <w:bottom w:val="single" w:sz="4" w:space="0" w:color="000000"/>
+              <w:end w:val="single" w:sz="4" w:space="0" w:color="000000"/>
             </w:tcBorders>
             <w:vAlign w:val="center"/>
           </w:tcPr>
           <w:p>
             <w:pPr>
-              <w:spacing w:line="320" w:lineRule="exact"/>
+              <w:pStyle w:val="Normal"/>
+              <w:spacing w:lineRule="exact" w:line="320"/>
               <w:jc w:val="center"/>
               <w:rPr>
                 <w:rFonts w:ascii="宋体" w:hAnsi="宋体" w:eastAsia="宋体"/>
@@ -4484,7 +4404,7 @@
                 <w:rFonts w:ascii="宋体" w:hAnsi="宋体" w:eastAsia="宋体"/>
                 <w:sz w:val="24"/>
               </w:rPr>
-              <w:t>完成防御机制不变量调研，建立统一记录格式</w:t>
+              <w:t xml:space="preserve">完成防御机制不变量调研，建立统一记录格式</w:t>
             </w:r>
           </w:p>
         </w:tc>
@@ -4492,52 +4412,52 @@
           <w:tcPr>
             <w:tcW w:w="2297" w:type="dxa"/>
             <w:tcBorders>
-              <w:top w:val="single" w:color="000000" w:sz="4" w:space="0"/>
-              <w:left w:val="single" w:color="000000" w:sz="4" w:space="0"/>
-              <w:bottom w:val="single" w:color="000000" w:sz="4" w:space="0"/>
-              <w:right w:val="single" w:color="000000" w:sz="4" w:space="0"/>
+              <w:top w:val="single" w:sz="4" w:space="0" w:color="000000"/>
+              <w:start w:val="single" w:sz="4" w:space="0" w:color="000000"/>
+              <w:bottom w:val="single" w:sz="4" w:space="0" w:color="000000"/>
+              <w:end w:val="single" w:sz="4" w:space="0" w:color="000000"/>
             </w:tcBorders>
             <w:vAlign w:val="center"/>
           </w:tcPr>
           <w:p>
             <w:pPr>
-              <w:spacing w:line="320" w:lineRule="exact"/>
+              <w:pStyle w:val="Normal"/>
+              <w:spacing w:lineRule="exact" w:line="320"/>
               <w:jc w:val="center"/>
               <w:rPr>
                 <w:rFonts w:ascii="宋体" w:hAnsi="宋体" w:eastAsia="宋体"/>
                 <w:sz w:val="24"/>
               </w:rPr>
             </w:pPr>
+            <w:r>
+              <w:rPr>
+                <w:rFonts w:ascii="宋体" w:hAnsi="宋体" w:eastAsia="宋体"/>
+                <w:sz w:val="24"/>
+              </w:rPr>
+              <w:t xml:space="preserve"/>
+            </w:r>
           </w:p>
         </w:tc>
       </w:tr>
       <w:tr>
-        <w:tblPrEx>
-          <w:tblCellMar>
-            <w:top w:w="0" w:type="dxa"/>
-            <w:left w:w="108" w:type="dxa"/>
-            <w:bottom w:w="0" w:type="dxa"/>
-            <w:right w:w="108" w:type="dxa"/>
-          </w:tblCellMar>
-        </w:tblPrEx>
         <w:trPr>
           <w:trHeight w:val="480" w:hRule="atLeast"/>
-          <w:jc w:val="center"/>
         </w:trPr>
         <w:tc>
           <w:tcPr>
             <w:tcW w:w="2077" w:type="dxa"/>
             <w:tcBorders>
-              <w:top w:val="single" w:color="000000" w:sz="4" w:space="0"/>
-              <w:left w:val="single" w:color="000000" w:sz="4" w:space="0"/>
-              <w:bottom w:val="single" w:color="000000" w:sz="4" w:space="0"/>
-              <w:right w:val="single" w:color="000000" w:sz="4" w:space="0"/>
+              <w:top w:val="single" w:sz="4" w:space="0" w:color="000000"/>
+              <w:start w:val="single" w:sz="4" w:space="0" w:color="000000"/>
+              <w:bottom w:val="single" w:sz="4" w:space="0" w:color="000000"/>
+              <w:end w:val="single" w:sz="4" w:space="0" w:color="000000"/>
             </w:tcBorders>
             <w:vAlign w:val="center"/>
           </w:tcPr>
           <w:p>
             <w:pPr>
-              <w:spacing w:line="320" w:lineRule="exact"/>
+              <w:pStyle w:val="Normal"/>
+              <w:spacing w:lineRule="exact" w:line="320"/>
               <w:jc w:val="center"/>
               <w:rPr>
                 <w:rFonts w:ascii="宋体" w:hAnsi="宋体" w:eastAsia="宋体"/>
@@ -4549,7 +4469,7 @@
                 <w:rFonts w:ascii="宋体" w:hAnsi="宋体" w:eastAsia="宋体"/>
                 <w:sz w:val="24"/>
               </w:rPr>
-              <w:t>2026.03-2026.04</w:t>
+              <w:t xml:space="preserve">2026.03-2026.04</w:t>
             </w:r>
           </w:p>
         </w:tc>
@@ -4557,16 +4477,17 @@
           <w:tcPr>
             <w:tcW w:w="5167" w:type="dxa"/>
             <w:tcBorders>
-              <w:top w:val="single" w:color="000000" w:sz="4" w:space="0"/>
-              <w:left w:val="single" w:color="000000" w:sz="4" w:space="0"/>
-              <w:bottom w:val="single" w:color="000000" w:sz="4" w:space="0"/>
-              <w:right w:val="single" w:color="000000" w:sz="4" w:space="0"/>
+              <w:top w:val="single" w:sz="4" w:space="0" w:color="000000"/>
+              <w:start w:val="single" w:sz="4" w:space="0" w:color="000000"/>
+              <w:bottom w:val="single" w:sz="4" w:space="0" w:color="000000"/>
+              <w:end w:val="single" w:sz="4" w:space="0" w:color="000000"/>
             </w:tcBorders>
             <w:vAlign w:val="center"/>
           </w:tcPr>
           <w:p>
             <w:pPr>
-              <w:spacing w:line="320" w:lineRule="exact"/>
+              <w:pStyle w:val="Normal"/>
+              <w:spacing w:lineRule="exact" w:line="320"/>
               <w:jc w:val="center"/>
               <w:rPr>
                 <w:rFonts w:ascii="宋体" w:hAnsi="宋体" w:eastAsia="宋体"/>
@@ -4578,7 +4499,7 @@
                 <w:rFonts w:ascii="宋体" w:hAnsi="宋体" w:eastAsia="宋体"/>
                 <w:sz w:val="24"/>
               </w:rPr>
-              <w:t>扩展预言机框架到 _FORTIFY_SOURCE 与 IBT，完善大模型提示词流水线</w:t>
+              <w:t xml:space="preserve">扩展预言机框架到 _FORTIFY_SOURCE 与 IBT，完善大模型提示词流水线</w:t>
             </w:r>
           </w:p>
         </w:tc>
@@ -4586,52 +4507,52 @@
           <w:tcPr>
             <w:tcW w:w="2297" w:type="dxa"/>
             <w:tcBorders>
-              <w:top w:val="single" w:color="000000" w:sz="4" w:space="0"/>
-              <w:left w:val="single" w:color="000000" w:sz="4" w:space="0"/>
-              <w:bottom w:val="single" w:color="000000" w:sz="4" w:space="0"/>
-              <w:right w:val="single" w:color="000000" w:sz="4" w:space="0"/>
+              <w:top w:val="single" w:sz="4" w:space="0" w:color="000000"/>
+              <w:start w:val="single" w:sz="4" w:space="0" w:color="000000"/>
+              <w:bottom w:val="single" w:sz="4" w:space="0" w:color="000000"/>
+              <w:end w:val="single" w:sz="4" w:space="0" w:color="000000"/>
             </w:tcBorders>
             <w:vAlign w:val="center"/>
           </w:tcPr>
           <w:p>
             <w:pPr>
-              <w:spacing w:line="320" w:lineRule="exact"/>
+              <w:pStyle w:val="Normal"/>
+              <w:spacing w:lineRule="exact" w:line="320"/>
               <w:jc w:val="center"/>
               <w:rPr>
                 <w:rFonts w:ascii="宋体" w:hAnsi="宋体" w:eastAsia="宋体"/>
                 <w:sz w:val="24"/>
               </w:rPr>
             </w:pPr>
+            <w:r>
+              <w:rPr>
+                <w:rFonts w:ascii="宋体" w:hAnsi="宋体" w:eastAsia="宋体"/>
+                <w:sz w:val="24"/>
+              </w:rPr>
+              <w:t xml:space="preserve"/>
+            </w:r>
           </w:p>
         </w:tc>
       </w:tr>
       <w:tr>
-        <w:tblPrEx>
-          <w:tblCellMar>
-            <w:top w:w="0" w:type="dxa"/>
-            <w:left w:w="108" w:type="dxa"/>
-            <w:bottom w:w="0" w:type="dxa"/>
-            <w:right w:w="108" w:type="dxa"/>
-          </w:tblCellMar>
-        </w:tblPrEx>
         <w:trPr>
           <w:trHeight w:val="480" w:hRule="atLeast"/>
-          <w:jc w:val="center"/>
         </w:trPr>
         <w:tc>
           <w:tcPr>
             <w:tcW w:w="2077" w:type="dxa"/>
             <w:tcBorders>
-              <w:top w:val="single" w:color="000000" w:sz="4" w:space="0"/>
-              <w:left w:val="single" w:color="000000" w:sz="4" w:space="0"/>
-              <w:bottom w:val="single" w:color="000000" w:sz="4" w:space="0"/>
-              <w:right w:val="single" w:color="000000" w:sz="4" w:space="0"/>
+              <w:top w:val="single" w:sz="4" w:space="0" w:color="000000"/>
+              <w:start w:val="single" w:sz="4" w:space="0" w:color="000000"/>
+              <w:bottom w:val="single" w:sz="4" w:space="0" w:color="000000"/>
+              <w:end w:val="single" w:sz="4" w:space="0" w:color="000000"/>
             </w:tcBorders>
             <w:vAlign w:val="center"/>
           </w:tcPr>
           <w:p>
             <w:pPr>
-              <w:spacing w:line="320" w:lineRule="exact"/>
+              <w:pStyle w:val="Normal"/>
+              <w:spacing w:lineRule="exact" w:line="320"/>
               <w:jc w:val="center"/>
               <w:rPr>
                 <w:rFonts w:ascii="宋体" w:hAnsi="宋体" w:eastAsia="宋体"/>
@@ -4643,7 +4564,7 @@
                 <w:rFonts w:ascii="宋体" w:hAnsi="宋体" w:eastAsia="宋体"/>
                 <w:sz w:val="24"/>
               </w:rPr>
-              <w:t>2026.04-2026.05</w:t>
+              <w:t xml:space="preserve">2026.04-2026.05</w:t>
             </w:r>
           </w:p>
         </w:tc>
@@ -4651,16 +4572,17 @@
           <w:tcPr>
             <w:tcW w:w="5167" w:type="dxa"/>
             <w:tcBorders>
-              <w:top w:val="single" w:color="000000" w:sz="4" w:space="0"/>
-              <w:left w:val="single" w:color="000000" w:sz="4" w:space="0"/>
-              <w:bottom w:val="single" w:color="000000" w:sz="4" w:space="0"/>
-              <w:right w:val="single" w:color="000000" w:sz="4" w:space="0"/>
+              <w:top w:val="single" w:sz="4" w:space="0" w:color="000000"/>
+              <w:start w:val="single" w:sz="4" w:space="0" w:color="000000"/>
+              <w:bottom w:val="single" w:sz="4" w:space="0" w:color="000000"/>
+              <w:end w:val="single" w:sz="4" w:space="0" w:color="000000"/>
             </w:tcBorders>
             <w:vAlign w:val="center"/>
           </w:tcPr>
           <w:p>
             <w:pPr>
-              <w:spacing w:line="320" w:lineRule="exact"/>
+              <w:pStyle w:val="Normal"/>
+              <w:spacing w:lineRule="exact" w:line="320"/>
               <w:jc w:val="center"/>
               <w:rPr>
                 <w:rFonts w:ascii="宋体" w:hAnsi="宋体" w:eastAsia="宋体"/>
@@ -4672,7 +4594,7 @@
                 <w:rFonts w:ascii="宋体" w:hAnsi="宋体" w:eastAsia="宋体"/>
                 <w:sz w:val="24"/>
               </w:rPr>
-              <w:t>跨架构 flag profile 实验框架定型，在 GCC 上完成全机制端到端实验</w:t>
+              <w:t xml:space="preserve">跨架构 flag profile 实验框架定型，在 GCC 上完成全机制端到端实验</w:t>
             </w:r>
           </w:p>
         </w:tc>
@@ -4680,52 +4602,52 @@
           <w:tcPr>
             <w:tcW w:w="2297" w:type="dxa"/>
             <w:tcBorders>
-              <w:top w:val="single" w:color="000000" w:sz="4" w:space="0"/>
-              <w:left w:val="single" w:color="000000" w:sz="4" w:space="0"/>
-              <w:bottom w:val="single" w:color="000000" w:sz="4" w:space="0"/>
-              <w:right w:val="single" w:color="000000" w:sz="4" w:space="0"/>
+              <w:top w:val="single" w:sz="4" w:space="0" w:color="000000"/>
+              <w:start w:val="single" w:sz="4" w:space="0" w:color="000000"/>
+              <w:bottom w:val="single" w:sz="4" w:space="0" w:color="000000"/>
+              <w:end w:val="single" w:sz="4" w:space="0" w:color="000000"/>
             </w:tcBorders>
             <w:vAlign w:val="center"/>
           </w:tcPr>
           <w:p>
             <w:pPr>
-              <w:spacing w:line="320" w:lineRule="exact"/>
+              <w:pStyle w:val="Normal"/>
+              <w:spacing w:lineRule="exact" w:line="320"/>
               <w:jc w:val="center"/>
               <w:rPr>
                 <w:rFonts w:ascii="宋体" w:hAnsi="宋体" w:eastAsia="宋体"/>
                 <w:sz w:val="24"/>
               </w:rPr>
             </w:pPr>
+            <w:r>
+              <w:rPr>
+                <w:rFonts w:ascii="宋体" w:hAnsi="宋体" w:eastAsia="宋体"/>
+                <w:sz w:val="24"/>
+              </w:rPr>
+              <w:t xml:space="preserve"/>
+            </w:r>
           </w:p>
         </w:tc>
       </w:tr>
       <w:tr>
-        <w:tblPrEx>
-          <w:tblCellMar>
-            <w:top w:w="0" w:type="dxa"/>
-            <w:left w:w="108" w:type="dxa"/>
-            <w:bottom w:w="0" w:type="dxa"/>
-            <w:right w:w="108" w:type="dxa"/>
-          </w:tblCellMar>
-        </w:tblPrEx>
         <w:trPr>
           <w:trHeight w:val="480" w:hRule="atLeast"/>
-          <w:jc w:val="center"/>
         </w:trPr>
         <w:tc>
           <w:tcPr>
             <w:tcW w:w="2077" w:type="dxa"/>
             <w:tcBorders>
-              <w:top w:val="single" w:color="000000" w:sz="4" w:space="0"/>
-              <w:left w:val="single" w:color="000000" w:sz="4" w:space="0"/>
-              <w:bottom w:val="single" w:color="000000" w:sz="4" w:space="0"/>
-              <w:right w:val="single" w:color="000000" w:sz="4" w:space="0"/>
+              <w:top w:val="single" w:sz="4" w:space="0" w:color="000000"/>
+              <w:start w:val="single" w:sz="4" w:space="0" w:color="000000"/>
+              <w:bottom w:val="single" w:sz="4" w:space="0" w:color="000000"/>
+              <w:end w:val="single" w:sz="4" w:space="0" w:color="000000"/>
             </w:tcBorders>
             <w:vAlign w:val="center"/>
           </w:tcPr>
           <w:p>
             <w:pPr>
-              <w:spacing w:line="320" w:lineRule="exact"/>
+              <w:pStyle w:val="Normal"/>
+              <w:spacing w:lineRule="exact" w:line="320"/>
               <w:jc w:val="center"/>
               <w:rPr>
                 <w:rFonts w:ascii="宋体" w:hAnsi="宋体" w:eastAsia="宋体"/>
@@ -4737,7 +4659,7 @@
                 <w:rFonts w:ascii="宋体" w:hAnsi="宋体" w:eastAsia="宋体"/>
                 <w:sz w:val="24"/>
               </w:rPr>
-              <w:t>2026.04-2026.05</w:t>
+              <w:t xml:space="preserve">2026.04-2026.05</w:t>
             </w:r>
           </w:p>
         </w:tc>
@@ -4745,16 +4667,17 @@
           <w:tcPr>
             <w:tcW w:w="5167" w:type="dxa"/>
             <w:tcBorders>
-              <w:top w:val="single" w:color="000000" w:sz="4" w:space="0"/>
-              <w:left w:val="single" w:color="000000" w:sz="4" w:space="0"/>
-              <w:bottom w:val="single" w:color="000000" w:sz="4" w:space="0"/>
-              <w:right w:val="single" w:color="000000" w:sz="4" w:space="0"/>
+              <w:top w:val="single" w:sz="4" w:space="0" w:color="000000"/>
+              <w:start w:val="single" w:sz="4" w:space="0" w:color="000000"/>
+              <w:bottom w:val="single" w:sz="4" w:space="0" w:color="000000"/>
+              <w:end w:val="single" w:sz="4" w:space="0" w:color="000000"/>
             </w:tcBorders>
             <w:vAlign w:val="center"/>
           </w:tcPr>
           <w:p>
             <w:pPr>
-              <w:spacing w:line="320" w:lineRule="exact"/>
+              <w:pStyle w:val="Normal"/>
+              <w:spacing w:lineRule="exact" w:line="320"/>
               <w:jc w:val="center"/>
               <w:rPr>
                 <w:rFonts w:ascii="宋体" w:hAnsi="宋体" w:eastAsia="宋体"/>
@@ -4766,7 +4689,7 @@
                 <w:rFonts w:ascii="宋体" w:hAnsi="宋体" w:eastAsia="宋体"/>
                 <w:sz w:val="24"/>
               </w:rPr>
-              <w:t>把编译器子系统与覆盖率适配层扩展到 LLVM 工具链</w:t>
+              <w:t xml:space="preserve">把编译器子系统与覆盖率适配层扩展到 LLVM 工具链</w:t>
             </w:r>
           </w:p>
         </w:tc>
@@ -4774,52 +4697,52 @@
           <w:tcPr>
             <w:tcW w:w="2297" w:type="dxa"/>
             <w:tcBorders>
-              <w:top w:val="single" w:color="000000" w:sz="4" w:space="0"/>
-              <w:left w:val="single" w:color="000000" w:sz="4" w:space="0"/>
-              <w:bottom w:val="single" w:color="000000" w:sz="4" w:space="0"/>
-              <w:right w:val="single" w:color="000000" w:sz="4" w:space="0"/>
+              <w:top w:val="single" w:sz="4" w:space="0" w:color="000000"/>
+              <w:start w:val="single" w:sz="4" w:space="0" w:color="000000"/>
+              <w:bottom w:val="single" w:sz="4" w:space="0" w:color="000000"/>
+              <w:end w:val="single" w:sz="4" w:space="0" w:color="000000"/>
             </w:tcBorders>
             <w:vAlign w:val="center"/>
           </w:tcPr>
           <w:p>
             <w:pPr>
-              <w:spacing w:line="320" w:lineRule="exact"/>
+              <w:pStyle w:val="Normal"/>
+              <w:spacing w:lineRule="exact" w:line="320"/>
               <w:jc w:val="center"/>
               <w:rPr>
                 <w:rFonts w:ascii="宋体" w:hAnsi="宋体" w:eastAsia="宋体"/>
                 <w:sz w:val="24"/>
               </w:rPr>
             </w:pPr>
+            <w:r>
+              <w:rPr>
+                <w:rFonts w:ascii="宋体" w:hAnsi="宋体" w:eastAsia="宋体"/>
+                <w:sz w:val="24"/>
+              </w:rPr>
+              <w:t xml:space="preserve"/>
+            </w:r>
           </w:p>
         </w:tc>
       </w:tr>
       <w:tr>
-        <w:tblPrEx>
-          <w:tblCellMar>
-            <w:top w:w="0" w:type="dxa"/>
-            <w:left w:w="108" w:type="dxa"/>
-            <w:bottom w:w="0" w:type="dxa"/>
-            <w:right w:w="108" w:type="dxa"/>
-          </w:tblCellMar>
-        </w:tblPrEx>
         <w:trPr>
           <w:trHeight w:val="480" w:hRule="atLeast"/>
-          <w:jc w:val="center"/>
         </w:trPr>
         <w:tc>
           <w:tcPr>
             <w:tcW w:w="2077" w:type="dxa"/>
             <w:tcBorders>
-              <w:top w:val="single" w:color="000000" w:sz="4" w:space="0"/>
-              <w:left w:val="single" w:color="000000" w:sz="4" w:space="0"/>
-              <w:bottom w:val="single" w:color="000000" w:sz="4" w:space="0"/>
-              <w:right w:val="single" w:color="000000" w:sz="4" w:space="0"/>
+              <w:top w:val="single" w:sz="4" w:space="0" w:color="000000"/>
+              <w:start w:val="single" w:sz="4" w:space="0" w:color="000000"/>
+              <w:bottom w:val="single" w:sz="4" w:space="0" w:color="000000"/>
+              <w:end w:val="single" w:sz="4" w:space="0" w:color="000000"/>
             </w:tcBorders>
             <w:vAlign w:val="center"/>
           </w:tcPr>
           <w:p>
             <w:pPr>
-              <w:spacing w:line="320" w:lineRule="exact"/>
+              <w:pStyle w:val="Normal"/>
+              <w:spacing w:lineRule="exact" w:line="320"/>
               <w:jc w:val="center"/>
               <w:rPr>
                 <w:rFonts w:ascii="宋体" w:hAnsi="宋体" w:eastAsia="宋体"/>
@@ -4831,7 +4754,7 @@
                 <w:rFonts w:ascii="宋体" w:hAnsi="宋体" w:eastAsia="宋体"/>
                 <w:sz w:val="24"/>
               </w:rPr>
-              <w:t>2026.05-2026.06</w:t>
+              <w:t xml:space="preserve">2026.05-2026.06</w:t>
             </w:r>
           </w:p>
         </w:tc>
@@ -4839,16 +4762,17 @@
           <w:tcPr>
             <w:tcW w:w="5167" w:type="dxa"/>
             <w:tcBorders>
-              <w:top w:val="single" w:color="000000" w:sz="4" w:space="0"/>
-              <w:left w:val="single" w:color="000000" w:sz="4" w:space="0"/>
-              <w:bottom w:val="single" w:color="000000" w:sz="4" w:space="0"/>
-              <w:right w:val="single" w:color="000000" w:sz="4" w:space="0"/>
+              <w:top w:val="single" w:sz="4" w:space="0" w:color="000000"/>
+              <w:start w:val="single" w:sz="4" w:space="0" w:color="000000"/>
+              <w:bottom w:val="single" w:sz="4" w:space="0" w:color="000000"/>
+              <w:end w:val="single" w:sz="4" w:space="0" w:color="000000"/>
             </w:tcBorders>
             <w:vAlign w:val="center"/>
           </w:tcPr>
           <w:p>
             <w:pPr>
-              <w:spacing w:line="320" w:lineRule="exact"/>
+              <w:pStyle w:val="Normal"/>
+              <w:spacing w:lineRule="exact" w:line="320"/>
               <w:jc w:val="center"/>
               <w:rPr>
                 <w:rFonts w:ascii="宋体" w:hAnsi="宋体" w:eastAsia="宋体"/>
@@ -4860,7 +4784,7 @@
                 <w:rFonts w:ascii="宋体" w:hAnsi="宋体" w:eastAsia="宋体"/>
                 <w:sz w:val="24"/>
               </w:rPr>
-              <w:t>在 LLVM 上复用预言机框架开展对照实验，形成缺陷上报闭环</w:t>
+              <w:t xml:space="preserve">在 LLVM 上复用预言机框架开展对照实验，形成缺陷上报闭环</w:t>
             </w:r>
           </w:p>
         </w:tc>
@@ -4868,52 +4792,52 @@
           <w:tcPr>
             <w:tcW w:w="2297" w:type="dxa"/>
             <w:tcBorders>
-              <w:top w:val="single" w:color="000000" w:sz="4" w:space="0"/>
-              <w:left w:val="single" w:color="000000" w:sz="4" w:space="0"/>
-              <w:bottom w:val="single" w:color="000000" w:sz="4" w:space="0"/>
-              <w:right w:val="single" w:color="000000" w:sz="4" w:space="0"/>
+              <w:top w:val="single" w:sz="4" w:space="0" w:color="000000"/>
+              <w:start w:val="single" w:sz="4" w:space="0" w:color="000000"/>
+              <w:bottom w:val="single" w:sz="4" w:space="0" w:color="000000"/>
+              <w:end w:val="single" w:sz="4" w:space="0" w:color="000000"/>
             </w:tcBorders>
             <w:vAlign w:val="center"/>
           </w:tcPr>
           <w:p>
             <w:pPr>
-              <w:spacing w:line="320" w:lineRule="exact"/>
+              <w:pStyle w:val="Normal"/>
+              <w:spacing w:lineRule="exact" w:line="320"/>
               <w:jc w:val="center"/>
               <w:rPr>
                 <w:rFonts w:ascii="宋体" w:hAnsi="宋体" w:eastAsia="宋体"/>
                 <w:sz w:val="24"/>
               </w:rPr>
             </w:pPr>
+            <w:r>
+              <w:rPr>
+                <w:rFonts w:ascii="宋体" w:hAnsi="宋体" w:eastAsia="宋体"/>
+                <w:sz w:val="24"/>
+              </w:rPr>
+              <w:t xml:space="preserve"/>
+            </w:r>
           </w:p>
         </w:tc>
       </w:tr>
       <w:tr>
-        <w:tblPrEx>
-          <w:tblCellMar>
-            <w:top w:w="0" w:type="dxa"/>
-            <w:left w:w="108" w:type="dxa"/>
-            <w:bottom w:w="0" w:type="dxa"/>
-            <w:right w:w="108" w:type="dxa"/>
-          </w:tblCellMar>
-        </w:tblPrEx>
         <w:trPr>
           <w:trHeight w:val="480" w:hRule="atLeast"/>
-          <w:jc w:val="center"/>
         </w:trPr>
         <w:tc>
           <w:tcPr>
             <w:tcW w:w="2077" w:type="dxa"/>
             <w:tcBorders>
-              <w:top w:val="single" w:color="000000" w:sz="4" w:space="0"/>
-              <w:left w:val="single" w:color="000000" w:sz="4" w:space="0"/>
-              <w:bottom w:val="single" w:color="000000" w:sz="4" w:space="0"/>
-              <w:right w:val="single" w:color="000000" w:sz="4" w:space="0"/>
+              <w:top w:val="single" w:sz="4" w:space="0" w:color="000000"/>
+              <w:start w:val="single" w:sz="4" w:space="0" w:color="000000"/>
+              <w:bottom w:val="single" w:sz="4" w:space="0" w:color="000000"/>
+              <w:end w:val="single" w:sz="4" w:space="0" w:color="000000"/>
             </w:tcBorders>
             <w:vAlign w:val="center"/>
           </w:tcPr>
           <w:p>
             <w:pPr>
-              <w:spacing w:line="320" w:lineRule="exact"/>
+              <w:pStyle w:val="Normal"/>
+              <w:spacing w:lineRule="exact" w:line="320"/>
               <w:jc w:val="center"/>
               <w:rPr>
                 <w:rFonts w:ascii="宋体" w:hAnsi="宋体" w:eastAsia="宋体"/>
@@ -4925,7 +4849,7 @@
                 <w:rFonts w:ascii="宋体" w:hAnsi="宋体" w:eastAsia="宋体"/>
                 <w:sz w:val="24"/>
               </w:rPr>
-              <w:t>2026.05-2026.06</w:t>
+              <w:t xml:space="preserve">2026.05-2026.06</w:t>
             </w:r>
           </w:p>
         </w:tc>
@@ -4933,16 +4857,17 @@
           <w:tcPr>
             <w:tcW w:w="5167" w:type="dxa"/>
             <w:tcBorders>
-              <w:top w:val="single" w:color="000000" w:sz="4" w:space="0"/>
-              <w:left w:val="single" w:color="000000" w:sz="4" w:space="0"/>
-              <w:bottom w:val="single" w:color="000000" w:sz="4" w:space="0"/>
-              <w:right w:val="single" w:color="000000" w:sz="4" w:space="0"/>
+              <w:top w:val="single" w:sz="4" w:space="0" w:color="000000"/>
+              <w:start w:val="single" w:sz="4" w:space="0" w:color="000000"/>
+              <w:bottom w:val="single" w:sz="4" w:space="0" w:color="000000"/>
+              <w:end w:val="single" w:sz="4" w:space="0" w:color="000000"/>
             </w:tcBorders>
             <w:vAlign w:val="center"/>
           </w:tcPr>
           <w:p>
             <w:pPr>
-              <w:spacing w:line="320" w:lineRule="exact"/>
+              <w:pStyle w:val="Normal"/>
+              <w:spacing w:lineRule="exact" w:line="320"/>
               <w:jc w:val="center"/>
               <w:rPr>
                 <w:rFonts w:ascii="宋体" w:hAnsi="宋体" w:eastAsia="宋体"/>
@@ -4954,7 +4879,7 @@
                 <w:rFonts w:ascii="宋体" w:hAnsi="宋体" w:eastAsia="宋体"/>
                 <w:sz w:val="24"/>
               </w:rPr>
-              <w:t>撰写学位论文，整理实验数据与图表，准备投稿</w:t>
+              <w:t xml:space="preserve">撰写学位论文，整理实验数据与图表，准备投稿</w:t>
             </w:r>
           </w:p>
         </w:tc>
@@ -4962,52 +4887,52 @@
           <w:tcPr>
             <w:tcW w:w="2297" w:type="dxa"/>
             <w:tcBorders>
-              <w:top w:val="single" w:color="000000" w:sz="4" w:space="0"/>
-              <w:left w:val="single" w:color="000000" w:sz="4" w:space="0"/>
-              <w:bottom w:val="single" w:color="000000" w:sz="4" w:space="0"/>
-              <w:right w:val="single" w:color="000000" w:sz="4" w:space="0"/>
+              <w:top w:val="single" w:sz="4" w:space="0" w:color="000000"/>
+              <w:start w:val="single" w:sz="4" w:space="0" w:color="000000"/>
+              <w:bottom w:val="single" w:sz="4" w:space="0" w:color="000000"/>
+              <w:end w:val="single" w:sz="4" w:space="0" w:color="000000"/>
             </w:tcBorders>
             <w:vAlign w:val="center"/>
           </w:tcPr>
           <w:p>
             <w:pPr>
-              <w:spacing w:line="320" w:lineRule="exact"/>
+              <w:pStyle w:val="Normal"/>
+              <w:spacing w:lineRule="exact" w:line="320"/>
               <w:jc w:val="center"/>
               <w:rPr>
                 <w:rFonts w:ascii="宋体" w:hAnsi="宋体" w:eastAsia="宋体"/>
                 <w:sz w:val="24"/>
               </w:rPr>
             </w:pPr>
+            <w:r>
+              <w:rPr>
+                <w:rFonts w:ascii="宋体" w:hAnsi="宋体" w:eastAsia="宋体"/>
+                <w:sz w:val="24"/>
+              </w:rPr>
+              <w:t xml:space="preserve"/>
+            </w:r>
           </w:p>
         </w:tc>
       </w:tr>
       <w:tr>
-        <w:tblPrEx>
-          <w:tblCellMar>
-            <w:top w:w="0" w:type="dxa"/>
-            <w:left w:w="108" w:type="dxa"/>
-            <w:bottom w:w="0" w:type="dxa"/>
-            <w:right w:w="108" w:type="dxa"/>
-          </w:tblCellMar>
-        </w:tblPrEx>
         <w:trPr>
           <w:trHeight w:val="480" w:hRule="atLeast"/>
-          <w:jc w:val="center"/>
         </w:trPr>
         <w:tc>
           <w:tcPr>
             <w:tcW w:w="2077" w:type="dxa"/>
             <w:tcBorders>
-              <w:top w:val="single" w:color="000000" w:sz="4" w:space="0"/>
-              <w:left w:val="single" w:color="000000" w:sz="4" w:space="0"/>
-              <w:bottom w:val="single" w:color="000000" w:sz="4" w:space="0"/>
-              <w:right w:val="single" w:color="000000" w:sz="4" w:space="0"/>
+              <w:top w:val="single" w:sz="4" w:space="0" w:color="000000"/>
+              <w:start w:val="single" w:sz="4" w:space="0" w:color="000000"/>
+              <w:bottom w:val="single" w:sz="4" w:space="0" w:color="000000"/>
+              <w:end w:val="single" w:sz="4" w:space="0" w:color="000000"/>
             </w:tcBorders>
             <w:vAlign w:val="center"/>
           </w:tcPr>
           <w:p>
             <w:pPr>
-              <w:spacing w:line="320" w:lineRule="exact"/>
+              <w:pStyle w:val="Normal"/>
+              <w:spacing w:lineRule="exact" w:line="320"/>
               <w:jc w:val="center"/>
               <w:rPr>
                 <w:rFonts w:ascii="宋体" w:hAnsi="宋体" w:eastAsia="宋体"/>
@@ -5019,7 +4944,7 @@
                 <w:rFonts w:ascii="宋体" w:hAnsi="宋体" w:eastAsia="宋体"/>
                 <w:sz w:val="24"/>
               </w:rPr>
-              <w:t>2026.06</w:t>
+              <w:t xml:space="preserve">2026.06</w:t>
             </w:r>
           </w:p>
         </w:tc>
@@ -5027,16 +4952,17 @@
           <w:tcPr>
             <w:tcW w:w="5167" w:type="dxa"/>
             <w:tcBorders>
-              <w:top w:val="single" w:color="000000" w:sz="4" w:space="0"/>
-              <w:left w:val="single" w:color="000000" w:sz="4" w:space="0"/>
-              <w:bottom w:val="single" w:color="000000" w:sz="4" w:space="0"/>
-              <w:right w:val="single" w:color="000000" w:sz="4" w:space="0"/>
+              <w:top w:val="single" w:sz="4" w:space="0" w:color="000000"/>
+              <w:start w:val="single" w:sz="4" w:space="0" w:color="000000"/>
+              <w:bottom w:val="single" w:sz="4" w:space="0" w:color="000000"/>
+              <w:end w:val="single" w:sz="4" w:space="0" w:color="000000"/>
             </w:tcBorders>
             <w:vAlign w:val="center"/>
           </w:tcPr>
           <w:p>
             <w:pPr>
-              <w:spacing w:line="320" w:lineRule="exact"/>
+              <w:pStyle w:val="Normal"/>
+              <w:spacing w:lineRule="exact" w:line="320"/>
               <w:jc w:val="center"/>
               <w:rPr>
                 <w:rFonts w:ascii="宋体" w:hAnsi="宋体" w:eastAsia="宋体"/>
@@ -5048,7 +4974,7 @@
                 <w:rFonts w:ascii="宋体" w:hAnsi="宋体" w:eastAsia="宋体"/>
                 <w:sz w:val="24"/>
               </w:rPr>
-              <w:t>学位论文答辩</w:t>
+              <w:t xml:space="preserve">学位论文答辩</w:t>
             </w:r>
           </w:p>
         </w:tc>
@@ -5056,22 +4982,30 @@
           <w:tcPr>
             <w:tcW w:w="2297" w:type="dxa"/>
             <w:tcBorders>
-              <w:top w:val="single" w:color="000000" w:sz="4" w:space="0"/>
-              <w:left w:val="single" w:color="000000" w:sz="4" w:space="0"/>
-              <w:bottom w:val="single" w:color="000000" w:sz="4" w:space="0"/>
-              <w:right w:val="single" w:color="000000" w:sz="4" w:space="0"/>
+              <w:top w:val="single" w:sz="4" w:space="0" w:color="000000"/>
+              <w:start w:val="single" w:sz="4" w:space="0" w:color="000000"/>
+              <w:bottom w:val="single" w:sz="4" w:space="0" w:color="000000"/>
+              <w:end w:val="single" w:sz="4" w:space="0" w:color="000000"/>
             </w:tcBorders>
             <w:vAlign w:val="center"/>
           </w:tcPr>
           <w:p>
             <w:pPr>
-              <w:spacing w:line="320" w:lineRule="exact"/>
+              <w:pStyle w:val="Normal"/>
+              <w:spacing w:lineRule="exact" w:line="320"/>
               <w:jc w:val="center"/>
               <w:rPr>
                 <w:rFonts w:ascii="宋体" w:hAnsi="宋体" w:eastAsia="宋体"/>
                 <w:sz w:val="24"/>
               </w:rPr>
             </w:pPr>
+            <w:r>
+              <w:rPr>
+                <w:rFonts w:ascii="宋体" w:hAnsi="宋体" w:eastAsia="宋体"/>
+                <w:sz w:val="24"/>
+              </w:rPr>
+              <w:t xml:space="preserve"/>
+            </w:r>
           </w:p>
         </w:tc>
       </w:tr>
@@ -6745,8 +6679,8 @@
     <w:lsdException w:unhideWhenUsed="0" w:uiPriority="0" w:semiHidden="0" w:name="Normal Indent"/>
     <w:lsdException w:unhideWhenUsed="0" w:uiPriority="0" w:semiHidden="0" w:name="footnote text"/>
     <w:lsdException w:unhideWhenUsed="0" w:uiPriority="0" w:semiHidden="0" w:name="annotation text"/>
-    <w:lsdException w:qFormat="1" w:unhideWhenUsed="0" w:uiPriority="0" w:semiHidden="0" w:name="header"/>
-    <w:lsdException w:qFormat="1" w:unhideWhenUsed="0" w:uiPriority="0" w:semiHidden="0" w:name="footer"/>
+    <w:lsdException w:unhideWhenUsed="0" w:uiPriority="0" w:semiHidden="0" w:name="header"/>
+    <w:lsdException w:unhideWhenUsed="0" w:uiPriority="0" w:semiHidden="0" w:name="footer"/>
     <w:lsdException w:unhideWhenUsed="0" w:uiPriority="0" w:semiHidden="0" w:name="index heading"/>
     <w:lsdException w:qFormat="1" w:unhideWhenUsed="0" w:uiPriority="0" w:semiHidden="0" w:name="caption"/>
     <w:lsdException w:unhideWhenUsed="0" w:uiPriority="0" w:semiHidden="0" w:name="table of figures"/>
@@ -6755,13 +6689,13 @@
     <w:lsdException w:unhideWhenUsed="0" w:uiPriority="0" w:semiHidden="0" w:name="footnote reference"/>
     <w:lsdException w:unhideWhenUsed="0" w:uiPriority="0" w:semiHidden="0" w:name="annotation reference"/>
     <w:lsdException w:unhideWhenUsed="0" w:uiPriority="0" w:semiHidden="0" w:name="line number"/>
-    <w:lsdException w:qFormat="1" w:unhideWhenUsed="0" w:uiPriority="0" w:semiHidden="0" w:name="page number"/>
+    <w:lsdException w:unhideWhenUsed="0" w:uiPriority="0" w:semiHidden="0" w:name="page number"/>
     <w:lsdException w:unhideWhenUsed="0" w:uiPriority="0" w:semiHidden="0" w:name="endnote reference"/>
     <w:lsdException w:unhideWhenUsed="0" w:uiPriority="0" w:semiHidden="0" w:name="endnote text"/>
     <w:lsdException w:unhideWhenUsed="0" w:uiPriority="0" w:semiHidden="0" w:name="table of authorities"/>
     <w:lsdException w:unhideWhenUsed="0" w:uiPriority="0" w:semiHidden="0" w:name="macro"/>
     <w:lsdException w:unhideWhenUsed="0" w:uiPriority="0" w:semiHidden="0" w:name="toa heading"/>
-    <w:lsdException w:qFormat="1" w:unhideWhenUsed="0" w:uiPriority="0" w:semiHidden="0" w:name="List"/>
+    <w:lsdException w:unhideWhenUsed="0" w:uiPriority="0" w:semiHidden="0" w:name="List"/>
     <w:lsdException w:unhideWhenUsed="0" w:uiPriority="0" w:semiHidden="0" w:name="List Bullet"/>
     <w:lsdException w:unhideWhenUsed="0" w:uiPriority="0" w:semiHidden="0" w:name="List Number"/>
     <w:lsdException w:unhideWhenUsed="0" w:uiPriority="0" w:semiHidden="0" w:name="List 2"/>
@@ -6780,7 +6714,7 @@
     <w:lsdException w:unhideWhenUsed="0" w:uiPriority="0" w:semiHidden="0" w:name="Closing"/>
     <w:lsdException w:unhideWhenUsed="0" w:uiPriority="0" w:semiHidden="0" w:name="Signature"/>
     <w:lsdException w:qFormat="1" w:unhideWhenUsed="0" w:uiPriority="0" w:semiHidden="0" w:name="Default Paragraph Font"/>
-    <w:lsdException w:qFormat="1" w:unhideWhenUsed="0" w:uiPriority="0" w:semiHidden="0" w:name="Body Text"/>
+    <w:lsdException w:unhideWhenUsed="0" w:uiPriority="0" w:semiHidden="0" w:name="Body Text"/>
     <w:lsdException w:unhideWhenUsed="0" w:uiPriority="0" w:semiHidden="0" w:name="Body Text Indent"/>
     <w:lsdException w:unhideWhenUsed="0" w:uiPriority="0" w:semiHidden="0" w:name="List Continue"/>
     <w:lsdException w:unhideWhenUsed="0" w:uiPriority="0" w:semiHidden="0" w:name="List Continue 2"/>
@@ -6799,7 +6733,7 @@
     <w:lsdException w:unhideWhenUsed="0" w:uiPriority="0" w:semiHidden="0" w:name="Body Text Indent 2"/>
     <w:lsdException w:unhideWhenUsed="0" w:uiPriority="0" w:semiHidden="0" w:name="Body Text Indent 3"/>
     <w:lsdException w:unhideWhenUsed="0" w:uiPriority="0" w:semiHidden="0" w:name="Block Text"/>
-    <w:lsdException w:qFormat="1" w:unhideWhenUsed="0" w:uiPriority="0" w:semiHidden="0" w:name="Hyperlink"/>
+    <w:lsdException w:unhideWhenUsed="0" w:uiPriority="0" w:semiHidden="0" w:name="Hyperlink"/>
     <w:lsdException w:unhideWhenUsed="0" w:uiPriority="0" w:semiHidden="0" w:name="FollowedHyperlink"/>
     <w:lsdException w:qFormat="1" w:unhideWhenUsed="0" w:uiPriority="0" w:semiHidden="0" w:name="Strong"/>
     <w:lsdException w:qFormat="1" w:unhideWhenUsed="0" w:uiPriority="0" w:semiHidden="0" w:name="Emphasis"/>
@@ -6817,7 +6751,7 @@
     <w:lsdException w:unhideWhenUsed="0" w:uiPriority="0" w:semiHidden="0" w:name="HTML Sample"/>
     <w:lsdException w:unhideWhenUsed="0" w:uiPriority="0" w:semiHidden="0" w:name="HTML Typewriter"/>
     <w:lsdException w:unhideWhenUsed="0" w:uiPriority="0" w:semiHidden="0" w:name="HTML Variable"/>
-    <w:lsdException w:qFormat="1" w:unhideWhenUsed="0" w:uiPriority="0" w:name="Normal Table"/>
+    <w:lsdException w:unhideWhenUsed="0" w:uiPriority="0" w:name="Normal Table"/>
     <w:lsdException w:unhideWhenUsed="0" w:uiPriority="0" w:semiHidden="0" w:name="annotation subject"/>
     <w:lsdException w:unhideWhenUsed="0" w:uiPriority="0" w:semiHidden="0" w:name="Table Simple 1"/>
     <w:lsdException w:unhideWhenUsed="0" w:uiPriority="0" w:semiHidden="0" w:name="Table Simple 2"/>
@@ -7015,7 +6949,6 @@
   <w:style w:type="table" w:default="1" w:styleId="9">
     <w:name w:val="Normal Table"/>
     <w:semiHidden/>
-    <w:qFormat/>
     <w:uiPriority w:val="0"/>
     <w:tblPr>
       <w:tblCellMar>
@@ -7029,7 +6962,6 @@
   <w:style w:type="paragraph" w:styleId="3">
     <w:name w:val="Body Text"/>
     <w:basedOn w:val="1"/>
-    <w:qFormat/>
     <w:uiPriority w:val="0"/>
     <w:pPr>
       <w:spacing w:line="400" w:lineRule="exact"/>
@@ -7060,7 +6992,6 @@
   <w:style w:type="paragraph" w:styleId="5">
     <w:name w:val="footer"/>
     <w:basedOn w:val="1"/>
-    <w:qFormat/>
     <w:uiPriority w:val="0"/>
     <w:pPr>
       <w:tabs>
@@ -7078,7 +7009,6 @@
   <w:style w:type="paragraph" w:styleId="6">
     <w:name w:val="header"/>
     <w:basedOn w:val="1"/>
-    <w:qFormat/>
     <w:uiPriority w:val="0"/>
     <w:pPr>
       <w:pBdr>
@@ -7099,7 +7029,6 @@
   <w:style w:type="paragraph" w:styleId="7">
     <w:name w:val="List"/>
     <w:basedOn w:val="3"/>
-    <w:qFormat/>
     <w:uiPriority w:val="0"/>
     <w:rPr>
       <w:rFonts w:cs="Noto Sans Devanagari"/>
@@ -7133,12 +7062,10 @@
   <w:style w:type="character" w:styleId="12">
     <w:name w:val="page number"/>
     <w:basedOn w:val="10"/>
-    <w:qFormat/>
     <w:uiPriority w:val="0"/>
   </w:style>
   <w:style w:type="character" w:styleId="13">
     <w:name w:val="Hyperlink"/>
-    <w:qFormat/>
     <w:uiPriority w:val="0"/>
     <w:rPr>
       <w:color w:val="0000FF"/>

</xml_diff>

<commit_message>
docs: sync architecture figure labels and rebuild proposal docx
</commit_message>
<xml_diff>
--- a/docs/开题报告/DeFuzz-开题报告.docx
+++ b/docs/开题报告/DeFuzz-开题报告.docx
@@ -3130,7 +3130,7 @@
               <w:rPr/>
               <w:drawing>
                 <wp:inline xmlns:wp="http://schemas.openxmlformats.org/drawingml/2006/wordprocessingDrawing" distT="0" distB="0" distL="0" distR="0">
-                  <wp:extent cx="5385714" cy="2279952"/>
+                  <wp:extent cx="5385714" cy="2369714"/>
                   <wp:effectExtent l="0" t="0" r="0" b="0"/>
                   <wp:docPr id="24" name="Figure24"/>
                   <wp:cNvGraphicFramePr>
@@ -3152,7 +3152,7 @@
                         <pic:spPr>
                           <a:xfrm>
                             <a:off x="0" y="0"/>
-                            <a:ext cx="5385714" cy="2279952"/>
+                            <a:ext cx="5385714" cy="2369714"/>
                           </a:xfrm>
                           <a:prstGeom prst="rect">
                             <a:avLst/>

</xml_diff>

<commit_message>
docs: reorganize proposal assets and refresh architecture labels
</commit_message>
<xml_diff>
--- a/docs/开题报告/DeFuzz-开题报告.docx
+++ b/docs/开题报告/DeFuzz-开题报告.docx
@@ -3130,7 +3130,7 @@
               <w:rPr/>
               <w:drawing>
                 <wp:inline xmlns:wp="http://schemas.openxmlformats.org/drawingml/2006/wordprocessingDrawing" distT="0" distB="0" distL="0" distR="0">
-                  <wp:extent cx="5385714" cy="2369714"/>
+                  <wp:extent cx="5385714" cy="2474436"/>
                   <wp:effectExtent l="0" t="0" r="0" b="0"/>
                   <wp:docPr id="24" name="Figure24"/>
                   <wp:cNvGraphicFramePr>
@@ -3152,7 +3152,7 @@
                         <pic:spPr>
                           <a:xfrm>
                             <a:off x="0" y="0"/>
-                            <a:ext cx="5385714" cy="2369714"/>
+                            <a:ext cx="5385714" cy="2474436"/>
                           </a:xfrm>
                           <a:prstGeom prst="rect">
                             <a:avLst/>

</xml_diff>

<commit_message>
docs(arch-figure): align English control-plane labels
Keep the English architecture diagram consistent with the revised Chinese control-plane labels. Regenerate the rendered assets and proposal docx so the bilingual figure set stays in sync.
</commit_message>
<xml_diff>
--- a/docs/开题报告/DeFuzz-开题报告.docx
+++ b/docs/开题报告/DeFuzz-开题报告.docx
@@ -3130,7 +3130,7 @@
               <w:rPr/>
               <w:drawing>
                 <wp:inline xmlns:wp="http://schemas.openxmlformats.org/drawingml/2006/wordprocessingDrawing" distT="0" distB="0" distL="0" distR="0">
-                  <wp:extent cx="5385714" cy="2474436"/>
+                  <wp:extent cx="5385714" cy="2609079"/>
                   <wp:effectExtent l="0" t="0" r="0" b="0"/>
                   <wp:docPr id="24" name="Figure24"/>
                   <wp:cNvGraphicFramePr>
@@ -3152,7 +3152,7 @@
                         <pic:spPr>
                           <a:xfrm>
                             <a:off x="0" y="0"/>
-                            <a:ext cx="5385714" cy="2474436"/>
+                            <a:ext cx="5385714" cy="2609079"/>
                           </a:xfrm>
                           <a:prstGeom prst="rect">
                             <a:avLst/>

</xml_diff>

<commit_message>
docs(proposal): clarify oracle and fuzz-loop design
Tighten the proposal's technical route so the diagrams and text describe the same execution model, cache usage, and seed selection rules.
</commit_message>
<xml_diff>
--- a/docs/开题报告/DeFuzz-开题报告.docx
+++ b/docs/开题报告/DeFuzz-开题报告.docx
@@ -250,7 +250,6 @@
           <w:u w:val="single"/>
         </w:rPr>
         <w:tab/>
-        <w:tab/>
       </w:r>
       <w:r>
         <w:rPr>
@@ -259,9 +258,8 @@
           <w:kern w:val="2"/>
           <w:sz w:val="28"/>
           <w:u w:val="single"/>
-          <w:lang w:val="en-US" w:eastAsia="zh-CN"/>
-        </w:rPr>
-        <w:t xml:space="preserve">  </w:t>
+        </w:rPr>
+        <w:tab/>
       </w:r>
       <w:r>
         <w:rPr>
@@ -270,9 +268,9 @@
           <w:kern w:val="2"/>
           <w:sz w:val="28"/>
           <w:u w:val="single"/>
-          <w:lang w:eastAsia="zh-CN"/>
-        </w:rPr>
-        <w:t>专业硕士</w:t>
+          <w:lang w:val="en-US" w:eastAsia="zh-CN"/>
+        </w:rPr>
+        <w:t xml:space="preserve">  </w:t>
       </w:r>
       <w:r>
         <w:rPr>
@@ -281,9 +279,38 @@
           <w:kern w:val="2"/>
           <w:sz w:val="28"/>
           <w:u w:val="single"/>
+          <w:lang w:eastAsia="zh-CN"/>
+        </w:rPr>
+        <w:t>专业硕士</w:t>
+      </w:r>
+      <w:r>
+        <w:rPr>
+          <w:rFonts w:hint="eastAsia" w:ascii="宋体" w:hAnsi="宋体"/>
+          <w:spacing w:val="40"/>
+          <w:kern w:val="2"/>
+          <w:sz w:val="28"/>
+          <w:u w:val="single"/>
         </w:rPr>
         <w:tab/>
+      </w:r>
+      <w:r>
+        <w:rPr>
+          <w:rFonts w:hint="eastAsia" w:ascii="宋体" w:hAnsi="宋体"/>
+          <w:spacing w:val="40"/>
+          <w:kern w:val="2"/>
+          <w:sz w:val="28"/>
+          <w:u w:val="single"/>
+        </w:rPr>
         <w:tab/>
+      </w:r>
+      <w:r>
+        <w:rPr>
+          <w:rFonts w:hint="eastAsia" w:ascii="宋体" w:hAnsi="宋体"/>
+          <w:spacing w:val="40"/>
+          <w:kern w:val="2"/>
+          <w:sz w:val="28"/>
+          <w:u w:val="single"/>
+        </w:rPr>
         <w:tab/>
       </w:r>
       <w:r>
@@ -415,9 +442,45 @@
           <w:u w:val="single"/>
         </w:rPr>
         <w:tab/>
+      </w:r>
+      <w:r>
+        <w:rPr>
+          <w:rFonts w:hint="eastAsia" w:ascii="宋体" w:hAnsi="宋体"/>
+          <w:spacing w:val="40"/>
+          <w:kern w:val="2"/>
+          <w:sz w:val="28"/>
+          <w:u w:val="single"/>
+        </w:rPr>
         <w:tab/>
+      </w:r>
+      <w:r>
+        <w:rPr>
+          <w:rFonts w:hint="eastAsia" w:ascii="宋体" w:hAnsi="宋体"/>
+          <w:spacing w:val="40"/>
+          <w:kern w:val="2"/>
+          <w:sz w:val="28"/>
+          <w:u w:val="single"/>
+        </w:rPr>
         <w:t>电子信息</w:t>
+      </w:r>
+      <w:r>
+        <w:rPr>
+          <w:rFonts w:hint="eastAsia" w:ascii="宋体" w:hAnsi="宋体"/>
+          <w:spacing w:val="40"/>
+          <w:kern w:val="2"/>
+          <w:sz w:val="28"/>
+          <w:u w:val="single"/>
+        </w:rPr>
         <w:tab/>
+      </w:r>
+      <w:r>
+        <w:rPr>
+          <w:rFonts w:hint="eastAsia" w:ascii="宋体" w:hAnsi="宋体"/>
+          <w:spacing w:val="40"/>
+          <w:kern w:val="2"/>
+          <w:sz w:val="28"/>
+          <w:u w:val="single"/>
+        </w:rPr>
         <w:tab/>
       </w:r>
     </w:p>
@@ -477,7 +540,6 @@
           <w:u w:val="single"/>
         </w:rPr>
         <w:tab/>
-        <w:tab/>
       </w:r>
       <w:r>
         <w:rPr>
@@ -486,9 +548,8 @@
           <w:kern w:val="2"/>
           <w:sz w:val="28"/>
           <w:u w:val="single"/>
-          <w:lang w:val="en-US" w:eastAsia="zh-CN"/>
-        </w:rPr>
-        <w:t xml:space="preserve"> </w:t>
+        </w:rPr>
+        <w:tab/>
       </w:r>
       <w:r>
         <w:rPr>
@@ -497,9 +558,9 @@
           <w:kern w:val="2"/>
           <w:sz w:val="28"/>
           <w:u w:val="single"/>
-          <w:lang w:eastAsia="zh-CN"/>
-        </w:rPr>
-        <w:t>张景耀</w:t>
+          <w:lang w:val="en-US" w:eastAsia="zh-CN"/>
+        </w:rPr>
+        <w:t xml:space="preserve"> </w:t>
       </w:r>
       <w:r>
         <w:rPr>
@@ -508,12 +569,10 @@
           <w:kern w:val="2"/>
           <w:sz w:val="28"/>
           <w:u w:val="single"/>
-          <w:lang w:val="en-US" w:eastAsia="zh-CN"/>
-        </w:rPr>
-        <w:t xml:space="preserve">  </w:t>
-      </w:r>
-      <w:bookmarkStart w:id="0" w:name="_GoBack"/>
-      <w:bookmarkEnd w:id="0"/>
+          <w:lang w:eastAsia="zh-CN"/>
+        </w:rPr>
+        <w:t>张景耀</w:t>
+      </w:r>
       <w:r>
         <w:rPr>
           <w:rFonts w:hint="eastAsia" w:ascii="宋体" w:hAnsi="宋体"/>
@@ -521,8 +580,28 @@
           <w:kern w:val="2"/>
           <w:sz w:val="28"/>
           <w:u w:val="single"/>
+          <w:lang w:val="en-US" w:eastAsia="zh-CN"/>
+        </w:rPr>
+        <w:t xml:space="preserve">  </w:t>
+      </w:r>
+      <w:r>
+        <w:rPr>
+          <w:rFonts w:hint="eastAsia" w:ascii="宋体" w:hAnsi="宋体"/>
+          <w:spacing w:val="40"/>
+          <w:kern w:val="2"/>
+          <w:sz w:val="28"/>
+          <w:u w:val="single"/>
         </w:rPr>
         <w:tab/>
+      </w:r>
+      <w:r>
+        <w:rPr>
+          <w:rFonts w:hint="eastAsia" w:ascii="宋体" w:hAnsi="宋体"/>
+          <w:spacing w:val="40"/>
+          <w:kern w:val="2"/>
+          <w:sz w:val="28"/>
+          <w:u w:val="single"/>
+        </w:rPr>
         <w:tab/>
       </w:r>
       <w:r>
@@ -583,7 +662,6 @@
           <w:u w:val="single"/>
         </w:rPr>
         <w:tab/>
-        <w:tab/>
       </w:r>
       <w:r>
         <w:rPr>
@@ -592,9 +670,8 @@
           <w:kern w:val="2"/>
           <w:sz w:val="28"/>
           <w:u w:val="single"/>
-          <w:lang w:val="en-US" w:eastAsia="zh-CN"/>
-        </w:rPr>
-        <w:t xml:space="preserve"> </w:t>
+        </w:rPr>
+        <w:tab/>
       </w:r>
       <w:r>
         <w:rPr>
@@ -603,9 +680,9 @@
           <w:kern w:val="2"/>
           <w:sz w:val="28"/>
           <w:u w:val="single"/>
-          <w:lang w:eastAsia="zh-CN"/>
-        </w:rPr>
-        <w:t>徐坚皓</w:t>
+          <w:lang w:val="en-US" w:eastAsia="zh-CN"/>
+        </w:rPr>
+        <w:t xml:space="preserve"> </w:t>
       </w:r>
       <w:r>
         <w:rPr>
@@ -614,9 +691,9 @@
           <w:kern w:val="2"/>
           <w:sz w:val="28"/>
           <w:u w:val="single"/>
-          <w:lang w:val="en-US" w:eastAsia="zh-CN"/>
-        </w:rPr>
-        <w:t xml:space="preserve">  </w:t>
+          <w:lang w:eastAsia="zh-CN"/>
+        </w:rPr>
+        <w:t>徐坚皓</w:t>
       </w:r>
       <w:r>
         <w:rPr>
@@ -625,8 +702,28 @@
           <w:kern w:val="2"/>
           <w:sz w:val="28"/>
           <w:u w:val="single"/>
+          <w:lang w:val="en-US" w:eastAsia="zh-CN"/>
+        </w:rPr>
+        <w:t xml:space="preserve">  </w:t>
+      </w:r>
+      <w:r>
+        <w:rPr>
+          <w:rFonts w:hint="eastAsia" w:ascii="宋体" w:hAnsi="宋体"/>
+          <w:spacing w:val="40"/>
+          <w:kern w:val="2"/>
+          <w:sz w:val="28"/>
+          <w:u w:val="single"/>
         </w:rPr>
         <w:tab/>
+      </w:r>
+      <w:r>
+        <w:rPr>
+          <w:rFonts w:hint="eastAsia" w:ascii="宋体" w:hAnsi="宋体"/>
+          <w:spacing w:val="40"/>
+          <w:kern w:val="2"/>
+          <w:sz w:val="28"/>
+          <w:u w:val="single"/>
+        </w:rPr>
         <w:tab/>
       </w:r>
       <w:r>
@@ -685,6 +782,15 @@
           <w:u w:val="single"/>
         </w:rPr>
         <w:tab/>
+      </w:r>
+      <w:r>
+        <w:rPr>
+          <w:rFonts w:hint="eastAsia" w:ascii="宋体" w:hAnsi="宋体"/>
+          <w:spacing w:val="40"/>
+          <w:kern w:val="2"/>
+          <w:sz w:val="28"/>
+          <w:u w:val="single"/>
+        </w:rPr>
         <w:tab/>
       </w:r>
       <w:r>
@@ -791,7 +897,21 @@
           <w:u w:val="single"/>
         </w:rPr>
         <w:tab/>
+      </w:r>
+      <w:r>
+        <w:rPr>
+          <w:rFonts w:hint="eastAsia" w:ascii="宋体" w:hAnsi="宋体"/>
+          <w:sz w:val="28"/>
+          <w:u w:val="single"/>
+        </w:rPr>
         <w:tab/>
+      </w:r>
+      <w:r>
+        <w:rPr>
+          <w:rFonts w:hint="eastAsia" w:ascii="宋体" w:hAnsi="宋体"/>
+          <w:sz w:val="28"/>
+          <w:u w:val="single"/>
+        </w:rPr>
         <w:tab/>
       </w:r>
       <w:r>
@@ -818,6 +938,13 @@
           <w:u w:val="single"/>
         </w:rPr>
         <w:tab/>
+      </w:r>
+      <w:r>
+        <w:rPr>
+          <w:rFonts w:hint="eastAsia" w:ascii="宋体" w:hAnsi="宋体"/>
+          <w:sz w:val="28"/>
+          <w:u w:val="single"/>
+        </w:rPr>
         <w:tab/>
       </w:r>
       <w:r>
@@ -2344,9 +2471,8 @@
           </w:p>
           <w:p>
             <w:pPr>
-              <w:pStyle w:val="Normal"/>
               <w:widowControl/>
-              <w:jc w:val="start"/>
+              <w:jc w:val="left"/>
               <w:rPr>
                 <w:b/>
                 <w:bCs/>
@@ -2366,33 +2492,30 @@
           </w:p>
           <w:p>
             <w:pPr>
-              <w:pStyle w:val="Normal"/>
-              <w:spacing w:lineRule="auto" w:line="360"/>
-              <w:ind w:firstLineChars="200" w:startChars="0" w:start="0" w:endChars="0" w:end="0"/>
-              <w:rPr>
-                <w:kern w:val="0"/>
-                <w:sz w:val="24"/>
-              </w:rPr>
-            </w:pPr>
-            <w:r>
-              <w:rPr>
-                <w:kern w:val="0"/>
-                <w:sz w:val="24"/>
-              </w:rPr>
-              <w:t xml:space="preserve">CVE-2023-4039 暴露了 GCC 在 AArch64 上栈保护机制的一处长期失效。当函数使用变长数组（VLA）或 alloca 时，编译器把栈金丝雀放在 VLA 之上、保存的返回地址却落在 VLA 之下，越界写入可以先于金丝雀检查改写返回地址，-fstack-protector 因此形同虚设——这种 buggy 状态下的栈帧布局可参见图 1。编译过程不报错，二进制能通过功能测试，缺陷只在攻击者构造特定输入时才显现。该漏洞自 GCC 早期版本即已存在，直到 2023 年才由外部研究者系统分析并修复。问题的共性也由此显现：编译器侧的防御机制依赖前端识别、中端 pass 与后端代码生成共同维护一组安全不变量，其中任何一处与具体 ISA 的栈布局、寄存器分配或指令编码假设不一致，防御机制就会悄然失效——对外仍然"存在"，对攻击者不再有效。</w:t>
-            </w:r>
-          </w:p>
-          <w:p>
-            <w:pPr>
-              <w:pStyle w:val="Normal"/>
-              <w:spacing w:lineRule="auto" w:line="360"/>
-              <w:jc w:val="center"/>
-            </w:pPr>
-            <w:r>
-              <w:rPr/>
+              <w:spacing w:line="360" w:lineRule="auto"/>
+              <w:ind w:left="0" w:leftChars="0" w:right="0" w:rightChars="0" w:firstLineChars="200"/>
+              <w:rPr>
+                <w:kern w:val="0"/>
+                <w:sz w:val="24"/>
+              </w:rPr>
+            </w:pPr>
+            <w:r>
+              <w:rPr>
+                <w:kern w:val="0"/>
+                <w:sz w:val="24"/>
+              </w:rPr>
+              <w:t>CVE-2023-4039 暴露了 GCC 在 AArch64 上栈保护机制的一处长期失效。当函数使用变长数组（VLA）或 alloca 时，编译器把栈金丝雀放在 VLA 之上、保存的返回地址却落在 VLA 之下，越界写入可以先于金丝雀检查改写返回地址，-fstack-protector 因此形同虚设——这种 buggy 状态下的栈帧布局可参见图 1。编译过程不报错，二进制能通过功能测试，缺陷只在攻击者构造特定输入时才显现。该漏洞自 GCC 早期版本即已存在，直到 2023 年才由外部研究者系统分析并修复。问题的共性也由此显现：编译器侧的防御机制依赖前端识别、中端 pass 与后端代码生成共同维护一组安全不变量，其中任何一处与具体 ISA 的栈布局、寄存器分配或指令编码假设不一致，防御机制就会悄然失效——对外仍然"存在"，对攻击者不再有效。</w:t>
+            </w:r>
+          </w:p>
+          <w:p>
+            <w:pPr>
+              <w:spacing w:line="360" w:lineRule="auto"/>
+              <w:jc w:val="center"/>
+            </w:pPr>
+            <w:r>
               <w:drawing>
-                <wp:inline xmlns:wp="http://schemas.openxmlformats.org/drawingml/2006/wordprocessingDrawing" distT="0" distB="0" distL="0" distR="0">
-                  <wp:extent cx="4284090" cy="5326553"/>
+                <wp:inline distT="0" distB="0" distL="0" distR="0">
+                  <wp:extent cx="4283710" cy="5326380"/>
                   <wp:effectExtent l="0" t="0" r="0" b="0"/>
                   <wp:docPr id="21" name="Figure21"/>
                   <wp:cNvGraphicFramePr>
@@ -2402,11 +2525,13 @@
                     <a:graphicData uri="http://schemas.openxmlformats.org/drawingml/2006/picture">
                       <pic:pic xmlns:pic="http://schemas.openxmlformats.org/drawingml/2006/picture">
                         <pic:nvPicPr>
-                          <pic:cNvPr id="21" name="stack-layout.png"/>
-                          <pic:cNvPicPr/>
+                          <pic:cNvPr id="21" name="Figure21"/>
+                          <pic:cNvPicPr>
+                            <a:picLocks noChangeAspect="1"/>
+                          </pic:cNvPicPr>
                         </pic:nvPicPr>
                         <pic:blipFill>
-                          <a:blip xmlns:r="http://schemas.openxmlformats.org/officeDocument/2006/relationships" r:embed="rId21"/>
+                          <a:blip r:embed="rId6"/>
                           <a:stretch>
                             <a:fillRect/>
                           </a:stretch>
@@ -2429,8 +2554,7 @@
           </w:p>
           <w:p>
             <w:pPr>
-              <w:pStyle w:val="Normal"/>
-              <w:spacing w:lineRule="auto" w:line="300"/>
+              <w:spacing w:line="300" w:lineRule="auto"/>
               <w:jc w:val="center"/>
               <w:rPr>
                 <w:rFonts w:ascii="宋体" w:hAnsi="宋体" w:eastAsia="宋体"/>
@@ -2449,42 +2573,38 @@
           </w:p>
           <w:p>
             <w:pPr>
-              <w:pStyle w:val="Normal"/>
-              <w:spacing w:lineRule="auto" w:line="360"/>
-              <w:rPr>
-                <w:sz w:val="24"/>
-              </w:rPr>
-            </w:pPr>
-          </w:p>
-          <w:p>
-            <w:pPr>
-              <w:pStyle w:val="Normal"/>
-              <w:spacing w:lineRule="auto" w:line="360"/>
-              <w:ind w:firstLineChars="200" w:startChars="0" w:start="0" w:endChars="0" w:end="0"/>
-              <w:rPr>
-                <w:kern w:val="0"/>
-                <w:sz w:val="24"/>
-              </w:rPr>
-            </w:pPr>
-            <w:r>
-              <w:rPr>
-                <w:kern w:val="0"/>
-                <w:sz w:val="24"/>
-              </w:rPr>
-              <w:t xml:space="preserve">编译器所承载的防御机制数量本身已相当庞大：栈金丝雀、_FORTIFY_SOURCE、Intel CET 中的 IBT 与 SHSTK、AArch64 的 BTI 与 PAC、Shadow Stack、SafeStack、KCFI、CFI、HCFR 等，分别保护栈完整性、控制流、对象边界，且仍在扩展。目标 ISA 方面，x86-64、AArch64、RISC-V、LoongArch、MIPS、PowerPC 等架构在调用约定、寄存器分配与指令编码上差异显著，每种机制在各 ISA 上对应若干份独立的后端模板与中端 pass 实现。二者构成"防御机制 × ISA"的二维研究空间（见图 2），每一格对应一组需联合维护的安全不变量，目前已被覆盖的格点仍只是其中很小一部分。</w:t>
-            </w:r>
-          </w:p>
-          <w:p>
-            <w:pPr>
-              <w:pStyle w:val="Normal"/>
-              <w:spacing w:lineRule="auto" w:line="360"/>
-              <w:jc w:val="center"/>
-            </w:pPr>
-            <w:r>
-              <w:rPr/>
+              <w:spacing w:line="360" w:lineRule="auto"/>
+              <w:rPr>
+                <w:sz w:val="24"/>
+              </w:rPr>
+            </w:pPr>
+          </w:p>
+          <w:p>
+            <w:pPr>
+              <w:spacing w:line="360" w:lineRule="auto"/>
+              <w:ind w:left="0" w:leftChars="0" w:right="0" w:rightChars="0" w:firstLineChars="200"/>
+              <w:rPr>
+                <w:kern w:val="0"/>
+                <w:sz w:val="24"/>
+              </w:rPr>
+            </w:pPr>
+            <w:r>
+              <w:rPr>
+                <w:kern w:val="0"/>
+                <w:sz w:val="24"/>
+              </w:rPr>
+              <w:t>编译器所承载的防御机制数量本身已相当庞大：栈金丝雀、_FORTIFY_SOURCE、Intel CET 中的 IBT、AArch64 的 BTI 与 PAC、Shadow Stack、SafeStack、KCFI、CFI、HCFR 等，分别保护栈完整性、控制流、对象边界，且仍在扩展。目标 ISA 方面，x86-64、AArch64、RISC-V、LoongArch、MIPS、PowerPC 等架构在调用约定、寄存器分配与指令编码上差异显著，每种机制在各 ISA 上对应若干份独立的后端模板与中端 pass 实现。二者构成"防御机制 × ISA"的二维研究空间（见图 2），每一格对应一组需联合维护的安全不变量，目前已被覆盖的格点仍只是其中很小一部分。</w:t>
+            </w:r>
+          </w:p>
+          <w:p>
+            <w:pPr>
+              <w:spacing w:line="360" w:lineRule="auto"/>
+              <w:jc w:val="center"/>
+            </w:pPr>
+            <w:r>
               <w:drawing>
-                <wp:inline xmlns:wp="http://schemas.openxmlformats.org/drawingml/2006/wordprocessingDrawing" distT="0" distB="0" distL="0" distR="0">
-                  <wp:extent cx="5385714" cy="2709687"/>
+                <wp:inline distT="0" distB="0" distL="0" distR="0">
+                  <wp:extent cx="5385435" cy="2709545"/>
                   <wp:effectExtent l="0" t="0" r="0" b="0"/>
                   <wp:docPr id="22" name="Figure22"/>
                   <wp:cNvGraphicFramePr>
@@ -2494,11 +2614,13 @@
                     <a:graphicData uri="http://schemas.openxmlformats.org/drawingml/2006/picture">
                       <pic:pic xmlns:pic="http://schemas.openxmlformats.org/drawingml/2006/picture">
                         <pic:nvPicPr>
-                          <pic:cNvPr id="22" name="defense-matrix.png"/>
-                          <pic:cNvPicPr/>
+                          <pic:cNvPr id="22" name="Figure22"/>
+                          <pic:cNvPicPr>
+                            <a:picLocks noChangeAspect="1"/>
+                          </pic:cNvPicPr>
                         </pic:nvPicPr>
                         <pic:blipFill>
-                          <a:blip xmlns:r="http://schemas.openxmlformats.org/officeDocument/2006/relationships" r:embed="rId22"/>
+                          <a:blip r:embed="rId7"/>
                           <a:stretch>
                             <a:fillRect/>
                           </a:stretch>
@@ -2521,8 +2643,7 @@
           </w:p>
           <w:p>
             <w:pPr>
-              <w:pStyle w:val="Normal"/>
-              <w:spacing w:lineRule="auto" w:line="300"/>
+              <w:spacing w:line="300" w:lineRule="auto"/>
               <w:jc w:val="center"/>
               <w:rPr>
                 <w:rFonts w:ascii="宋体" w:hAnsi="宋体" w:eastAsia="宋体"/>
@@ -2541,54 +2662,50 @@
           </w:p>
           <w:p>
             <w:pPr>
-              <w:pStyle w:val="Normal"/>
-              <w:spacing w:lineRule="auto" w:line="360"/>
-              <w:rPr>
-                <w:sz w:val="24"/>
-              </w:rPr>
-            </w:pPr>
-          </w:p>
-          <w:p>
-            <w:pPr>
-              <w:pStyle w:val="Normal"/>
-              <w:spacing w:lineRule="auto" w:line="360"/>
-              <w:ind w:firstLineChars="200" w:startChars="0" w:start="0" w:endChars="0" w:end="0"/>
-              <w:rPr>
-                <w:kern w:val="0"/>
-                <w:sz w:val="24"/>
-              </w:rPr>
-            </w:pPr>
-            <w:r>
-              <w:rPr>
-                <w:kern w:val="0"/>
-                <w:sz w:val="24"/>
-              </w:rPr>
-              <w:t xml:space="preserve">这个矩阵的规模使人工审计难以全面覆盖。与 CVE-2023-4039 同源的 PR-96191（AArch64 / ARM 上栈金丝雀寄存器残留）2020 年修复时，就未涉及 MIPS、LoongArch、Xtensa、CSKY 等 fallback 后端；单点防御机制上的实现疏忽，往往同时存在于矩阵中其他格点而长期不被发现。本课题初步实验阶段已对若干格点做了试探性验证，向 GCC 上游报告并确认了多例同类形态的真实漏洞，第五章将给出具体案例。</w:t>
-            </w:r>
-          </w:p>
-          <w:p>
-            <w:pPr>
-              <w:pStyle w:val="Normal"/>
-              <w:spacing w:lineRule="auto" w:line="360"/>
-              <w:ind w:firstLineChars="200" w:startChars="0" w:start="0" w:endChars="0" w:end="0"/>
-              <w:rPr>
-                <w:kern w:val="0"/>
-                <w:sz w:val="24"/>
-              </w:rPr>
-            </w:pPr>
-            <w:r>
-              <w:rPr>
-                <w:kern w:val="0"/>
-                <w:sz w:val="24"/>
-              </w:rPr>
-              <w:t xml:space="preserve">上述失效有一个共同特征：编译过程不出错、二进制正常运行，缺陷仅在特定输入下显现——即"静默失效（silent failure）"。Csmith、YARPGen 等以差分输出或编译器崩溃为信号的工具对此类缺陷几乎不敏感；覆盖率引导的模糊测试虽然可以把执行推进到相关代码路径，但缺少判断该路径是否仍满足安全契约的预言机。问题由此浮现：编译器是绝大多数软件防御机制的实际载体，矩阵中的静默失效直接削弱整个软件生态的运行时安全保障，而现有自动化测试方法尚未把"防御机制的安全契约"纳入判定体系。如果能把矩阵格点上的不变量翻译为可测断言，并主动引导编译器走到对应代码路径，就既可覆盖既有缺陷家族的同类变种，也有望在后续优化引入同类回归时及早暴露。本研究以此为出发点，结合大语言模型的代码理解能力与覆盖率反馈，构建一条针对编译器防御机制静默失效的模糊测试方法。</w:t>
-            </w:r>
-          </w:p>
-          <w:p>
-            <w:pPr>
-              <w:pStyle w:val="Normal"/>
+              <w:spacing w:line="360" w:lineRule="auto"/>
+              <w:rPr>
+                <w:sz w:val="24"/>
+              </w:rPr>
+            </w:pPr>
+          </w:p>
+          <w:p>
+            <w:pPr>
+              <w:spacing w:line="360" w:lineRule="auto"/>
+              <w:ind w:left="0" w:leftChars="0" w:right="0" w:rightChars="0" w:firstLineChars="200"/>
+              <w:rPr>
+                <w:kern w:val="0"/>
+                <w:sz w:val="24"/>
+              </w:rPr>
+            </w:pPr>
+            <w:r>
+              <w:rPr>
+                <w:kern w:val="0"/>
+                <w:sz w:val="24"/>
+              </w:rPr>
+              <w:t>这个矩阵的规模使人工审计难以全面覆盖。与 CVE-2023-4039 同源的 PR-96191（AArch64 / ARM 上栈金丝雀寄存器残留）2020 年修复时，就未涉及 MIPS、LoongArch、Xtensa、CSKY 等 fallback 后端；单点防御机制上的实现疏忽，往往同时存在于矩阵中其他格点而长期不被发现。本课题初步实验阶段已对若干格点做了试探性验证，向 GCC 上游报告并确认了多例同类形态的真实漏洞，第五章将给出具体案例。</w:t>
+            </w:r>
+          </w:p>
+          <w:p>
+            <w:pPr>
+              <w:spacing w:line="360" w:lineRule="auto"/>
+              <w:ind w:left="0" w:leftChars="0" w:right="0" w:rightChars="0" w:firstLineChars="200"/>
+              <w:rPr>
+                <w:kern w:val="0"/>
+                <w:sz w:val="24"/>
+              </w:rPr>
+            </w:pPr>
+            <w:r>
+              <w:rPr>
+                <w:kern w:val="0"/>
+                <w:sz w:val="24"/>
+              </w:rPr>
+              <w:t>上述失效有一个共同特征：编译过程不出错、二进制正常运行，缺陷仅在特定输入下显现——即"静默失效（silent failure）"。Csmith、YARPGen 等以差分输出或编译器崩溃为信号的工具对此类缺陷几乎不敏感；覆盖率引导的模糊测试虽然可以把执行推进到相关代码路径，但缺少判断该路径是否仍满足安全契约的预言机。问题由此浮现：编译器是绝大多数软件防御机制的实际载体，矩阵中的静默失效直接削弱整个软件生态的运行时安全保障，而现有自动化测试方法尚未把"防御机制的安全契约"纳入判定体系。如果能把矩阵格点上的不变量翻译为可测断言，并主动引导编译器走到对应代码路径，就既可覆盖既有缺陷家族的同类变种，也有望在后续优化引入同类回归时及早暴露。本研究以此为出发点，结合大语言模型的代码理解能力与覆盖率反馈，构建一条针对编译器防御机制静默失效的模糊测试方法。</w:t>
+            </w:r>
+          </w:p>
+          <w:p>
+            <w:pPr>
               <w:widowControl/>
-              <w:jc w:val="start"/>
+              <w:jc w:val="left"/>
               <w:rPr>
                 <w:b/>
                 <w:bCs/>
@@ -2608,26 +2725,24 @@
           </w:p>
           <w:p>
             <w:pPr>
-              <w:pStyle w:val="Normal"/>
-              <w:spacing w:lineRule="auto" w:line="360"/>
-              <w:ind w:firstLineChars="200" w:startChars="0" w:start="0" w:endChars="0" w:end="0"/>
-              <w:rPr>
-                <w:kern w:val="0"/>
-                <w:sz w:val="24"/>
-              </w:rPr>
-            </w:pPr>
-            <w:r>
-              <w:rPr>
-                <w:kern w:val="0"/>
-                <w:sz w:val="24"/>
-              </w:rPr>
-              <w:t xml:space="preserve">编译器模糊测试的研究可以从两个角度来看：一是预言机（oracle），决定什么算缺陷；二是种子变异方法，决定测试输入怎么产生。早期工作以崩溃或输出差异为信号、以随机或文法规则生成种子；覆盖率引导与大语言模型的引入分别使二者向目标导向和语义理解方向演进。下文沿这两个维度梳理现状。</w:t>
-            </w:r>
-          </w:p>
-          <w:p>
-            <w:pPr>
-              <w:pStyle w:val="Normal"/>
-              <w:spacing w:lineRule="auto" w:line="360"/>
+              <w:spacing w:line="360" w:lineRule="auto"/>
+              <w:ind w:left="0" w:leftChars="0" w:right="0" w:rightChars="0" w:firstLineChars="200"/>
+              <w:rPr>
+                <w:kern w:val="0"/>
+                <w:sz w:val="24"/>
+              </w:rPr>
+            </w:pPr>
+            <w:r>
+              <w:rPr>
+                <w:kern w:val="0"/>
+                <w:sz w:val="24"/>
+              </w:rPr>
+              <w:t>编译器模糊测试的研究可以从两个角度来看：一是预言机（oracle），决定什么算缺陷；二是种子变异方法，决定测试输入怎么产生。早期工作以崩溃或输出差异为信号、以随机或文法规则生成种子；覆盖率引导与大语言模型的引入分别使二者向目标导向和语义理解方向演进。下文沿这两个维度梳理现状。</w:t>
+            </w:r>
+          </w:p>
+          <w:p>
+            <w:pPr>
+              <w:spacing w:line="360" w:lineRule="auto"/>
               <w:rPr>
                 <w:b/>
                 <w:bCs/>
@@ -2647,62 +2762,58 @@
           </w:p>
           <w:p>
             <w:pPr>
-              <w:pStyle w:val="Normal"/>
-              <w:spacing w:lineRule="auto" w:line="360"/>
-              <w:ind w:firstLineChars="200" w:startChars="0" w:start="0" w:endChars="0" w:end="0"/>
-              <w:rPr>
-                <w:kern w:val="0"/>
-                <w:sz w:val="24"/>
-              </w:rPr>
-            </w:pPr>
-            <w:r>
-              <w:rPr>
-                <w:kern w:val="0"/>
-                <w:sz w:val="24"/>
-              </w:rPr>
-              <w:t xml:space="preserve">预言机回答"什么样的执行结果算缺陷"，现有工作大致可分五类。</w:t>
-            </w:r>
-          </w:p>
-          <w:p>
-            <w:pPr>
-              <w:pStyle w:val="Normal"/>
-              <w:spacing w:lineRule="auto" w:line="360"/>
-              <w:ind w:firstLineChars="200" w:startChars="0" w:start="0" w:endChars="0" w:end="0"/>
-              <w:rPr>
-                <w:kern w:val="0"/>
-                <w:sz w:val="24"/>
-              </w:rPr>
-            </w:pPr>
-            <w:r>
-              <w:rPr>
-                <w:kern w:val="0"/>
-                <w:sz w:val="24"/>
-              </w:rPr>
-              <w:t xml:space="preserve">崩溃预言机[1,3,4]以编译期或运行期的崩溃（ICE、断言、segfault、超时）为信号，实现简单，是 AFL、libFuzzer 迁移到编译器后的默认选择。差分预言机[1,2]对若干编译器（或同一编译器不同优化等级）就同一程序的运行结果做交叉比对，差异即为 mis-compile；Csmith、YARPGen 围绕"避免未定义行为"这一前提大规模生成 C 程序来驱动差分。变形测试预言机以 Le 等提出的 EMI[11] 为代表：对同一输入下未执行的代码做删改，新程序应产生相同结果，差异即为 mis-compile，后续工作继续在 live region 等价变换上探索。Sanitizer 预言机借助 ASan、UBSan、MSan 把内存破坏与未定义行为转为显式信号；UBfuzz[12] 进一步用 crash-site mapping 反向定位 sanitizer 自身实现缺陷。还有面向子领域的复合预言机，如 HirGen[13] 在 IR 层同时使用差分与变形来提高对深度学习编译器深层优化错误的敏感度。</w:t>
-            </w:r>
-          </w:p>
-          <w:p>
-            <w:pPr>
-              <w:pStyle w:val="Normal"/>
-              <w:spacing w:lineRule="auto" w:line="360"/>
-              <w:ind w:firstLineChars="200" w:startChars="0" w:start="0" w:endChars="0" w:end="0"/>
-              <w:rPr>
-                <w:kern w:val="0"/>
-                <w:sz w:val="24"/>
-              </w:rPr>
-            </w:pPr>
-            <w:r>
-              <w:rPr>
-                <w:kern w:val="0"/>
-                <w:sz w:val="24"/>
-              </w:rPr>
-              <w:t xml:space="preserve">这些预言机的判据都建立在"崩溃"或"可观察的输出差异"之上。当缺陷的形态是"代码正常编译运行，但运行时保护已被静默削弱"时，它们无法触发。</w:t>
-            </w:r>
-          </w:p>
-          <w:p>
-            <w:pPr>
-              <w:pStyle w:val="Normal"/>
-              <w:spacing w:lineRule="auto" w:line="360"/>
+              <w:spacing w:line="360" w:lineRule="auto"/>
+              <w:ind w:left="0" w:leftChars="0" w:right="0" w:rightChars="0" w:firstLineChars="200"/>
+              <w:rPr>
+                <w:kern w:val="0"/>
+                <w:sz w:val="24"/>
+              </w:rPr>
+            </w:pPr>
+            <w:r>
+              <w:rPr>
+                <w:kern w:val="0"/>
+                <w:sz w:val="24"/>
+              </w:rPr>
+              <w:t>预言机回答"什么样的执行结果算缺陷"，现有工作大致可分五类。</w:t>
+            </w:r>
+          </w:p>
+          <w:p>
+            <w:pPr>
+              <w:spacing w:line="360" w:lineRule="auto"/>
+              <w:ind w:left="0" w:leftChars="0" w:right="0" w:rightChars="0" w:firstLineChars="200"/>
+              <w:rPr>
+                <w:kern w:val="0"/>
+                <w:sz w:val="24"/>
+              </w:rPr>
+            </w:pPr>
+            <w:r>
+              <w:rPr>
+                <w:kern w:val="0"/>
+                <w:sz w:val="24"/>
+              </w:rPr>
+              <w:t>崩溃预言机[1,3,4]以编译期或运行期的崩溃（ICE、断言、segfault、超时）为信号，实现简单，是 AFL、libFuzzer 迁移到编译器后的默认选择。差分预言机[1,2]对若干编译器（或同一编译器不同优化等级）就同一程序的运行结果做交叉比对，差异即为 mis-compile；Csmith、YARPGen 围绕"避免未定义行为"这一前提大规模生成 C 程序来驱动差分。变形测试预言机以 Le 等提出的 EMI[11] 为代表：对同一输入下未执行的代码做删改，新程序应产生相同结果，差异即为 mis-compile，后续工作继续在 live region 等价变换上探索。Sanitizer 预言机借助 ASan、UBSan、MSan 把内存破坏与未定义行为转为显式信号；UBfuzz[12] 进一步用 crash-site mapping 反向定位 sanitizer 自身实现缺陷。还有面向子领域的复合预言机，如 HirGen[13] 在 IR 层同时使用差分与变形来提高对深度学习编译器深层优化错误的敏感度。</w:t>
+            </w:r>
+          </w:p>
+          <w:p>
+            <w:pPr>
+              <w:spacing w:line="360" w:lineRule="auto"/>
+              <w:ind w:left="0" w:leftChars="0" w:right="0" w:rightChars="0" w:firstLineChars="200"/>
+              <w:rPr>
+                <w:kern w:val="0"/>
+                <w:sz w:val="24"/>
+              </w:rPr>
+            </w:pPr>
+            <w:r>
+              <w:rPr>
+                <w:kern w:val="0"/>
+                <w:sz w:val="24"/>
+              </w:rPr>
+              <w:t>这些预言机的判据都建立在"崩溃"或"可观察的输出差异"之上。当缺陷的形态是"代码正常编译运行，但运行时保护已被静默削弱"时，它们无法触发。</w:t>
+            </w:r>
+          </w:p>
+          <w:p>
+            <w:pPr>
+              <w:spacing w:line="360" w:lineRule="auto"/>
               <w:rPr>
                 <w:b/>
                 <w:bCs/>
@@ -2722,26 +2833,24 @@
           </w:p>
           <w:p>
             <w:pPr>
-              <w:pStyle w:val="Normal"/>
-              <w:spacing w:lineRule="auto" w:line="360"/>
-              <w:ind w:firstLineChars="200" w:startChars="0" w:start="0" w:endChars="0" w:end="0"/>
-              <w:rPr>
-                <w:kern w:val="0"/>
-                <w:sz w:val="24"/>
-              </w:rPr>
-            </w:pPr>
-            <w:r>
-              <w:rPr>
-                <w:kern w:val="0"/>
-                <w:sz w:val="24"/>
-              </w:rPr>
-              <w:t xml:space="preserve">传统路线上，覆盖率作为推进信号已是主流。Csmith[1] 与 YARPGen[2] 基于概率文法从空白合成不含未定义行为的 C 程序，再靠差分预言机发现 mis-compile。LangFuzz 类工作记录种子语法树后做子树替换式的 grammar-aware 变异，多用于 JavaScript 引擎。AFL、libFuzzer[3,4] 以字节级覆盖率反馈为导向，被广泛用于编译器的解析与优化组件，但难以保证生成程序的语法和语义合法性。GrayC[14] 把覆盖率引导与一组保持语义合法性的源码级变异（表达式替换、控制结构改写）相结合，专门面向 C 编译器与分析器，覆盖率和缺陷发现率均优于纯生成式工具。EMI 系列[11]在已有种子的未执行区域做语义保持变换，可视作变异与变形预言机的组合。这条路线的局限在于：变异规则由人工先验定义，覆盖率只提供"是否走入新代码"的近似进度信号，变异本身缺乏对目标代码语义的理解。</w:t>
-            </w:r>
-          </w:p>
-          <w:p>
-            <w:pPr>
-              <w:pStyle w:val="Normal"/>
-              <w:spacing w:lineRule="auto" w:line="360"/>
+              <w:spacing w:line="360" w:lineRule="auto"/>
+              <w:ind w:left="0" w:leftChars="0" w:right="0" w:rightChars="0" w:firstLineChars="200"/>
+              <w:rPr>
+                <w:kern w:val="0"/>
+                <w:sz w:val="24"/>
+              </w:rPr>
+            </w:pPr>
+            <w:r>
+              <w:rPr>
+                <w:kern w:val="0"/>
+                <w:sz w:val="24"/>
+              </w:rPr>
+              <w:t>传统路线上，覆盖率作为推进信号已是主流。Csmith[1] 与 YARPGen[2] 基于概率文法从空白合成不含未定义行为的 C 程序，再靠差分预言机发现 mis-compile。LangFuzz 类工作记录种子语法树后做子树替换式的 grammar-aware 变异，多用于 JavaScript 引擎。AFL、libFuzzer[3,4] 以字节级覆盖率反馈为导向，被广泛用于编译器的解析与优化组件，但难以保证生成程序的语法和语义合法性。GrayC[14] 把覆盖率引导与一组保持语义合法性的源码级变异（表达式替换、控制结构改写）相结合，专门面向 C 编译器与分析器，覆盖率和缺陷发现率均优于纯生成式工具。EMI 系列[11]在已有种子的未执行区域做语义保持变换，可视作变异与变形预言机的组合。这条路线的局限在于：变异规则由人工先验定义，覆盖率只提供"是否走入新代码"的近似进度信号，变异本身缺乏对目标代码语义的理解。</w:t>
+            </w:r>
+          </w:p>
+          <w:p>
+            <w:pPr>
+              <w:spacing w:line="360" w:lineRule="auto"/>
               <w:rPr>
                 <w:b/>
                 <w:bCs/>
@@ -2761,54 +2870,50 @@
           </w:p>
           <w:p>
             <w:pPr>
-              <w:pStyle w:val="Normal"/>
-              <w:spacing w:lineRule="auto" w:line="360"/>
-              <w:ind w:firstLineChars="200" w:startChars="0" w:start="0" w:endChars="0" w:end="0"/>
-              <w:rPr>
-                <w:kern w:val="0"/>
-                <w:sz w:val="24"/>
-              </w:rPr>
-            </w:pPr>
-            <w:r>
-              <w:rPr>
-                <w:kern w:val="0"/>
-                <w:sz w:val="24"/>
-              </w:rPr>
-              <w:t xml:space="preserve">大模型在代码理解与生成上的能力近年被引入以缓解传统变异在质量上的瓶颈。WhiteFox[5] 从编译器优化 pass 源码出发，先用大模型归纳触发该优化的输入模式（requirement summarization），再据此生成测试用例，使种子生成具备对编译器内部逻辑的感知；该方法在 PyTorch、TVM 等深度学习编译器上发现了若干优化路径深处的 bug。HLPFuzz[15] 进一步把大模型与覆盖率反馈耦合：在灰盒主循环之外引入白盒求解器，按"未覆盖且后继最多"的策略选取目标基本块，把单基本块翻译为约束求解任务交由大模型完成，并通过渐进式上下文构建缓解注意力衰减。这些工作表明大模型可以充当语义感知的变异引擎，但它们的目标设定仍是常规可达性——"让程序走到某个未覆盖位置"，并不关心目标路径所承担的安全契约。</w:t>
-            </w:r>
-          </w:p>
-          <w:p>
-            <w:pPr>
-              <w:pStyle w:val="Normal"/>
-              <w:spacing w:lineRule="auto" w:line="360"/>
-              <w:ind w:firstLineChars="200" w:startChars="0" w:start="0" w:endChars="0" w:end="0"/>
-              <w:rPr>
-                <w:kern w:val="0"/>
-                <w:sz w:val="24"/>
-              </w:rPr>
-            </w:pPr>
-            <w:r>
-              <w:rPr>
-                <w:kern w:val="0"/>
-                <w:sz w:val="24"/>
-              </w:rPr>
-              <w:t xml:space="preserve">综合来看，针对编译器自身防御机制的自动化测试在公开文献中仍然稀少：少数工作面向单一机制做差分测试（如扫描 IBT landing pad 存在性），另一些工作从二进制层面做事后审计，但难以反向定位到引入缺陷的编译器代码路径。本课题在变异方法上沿用大模型与覆盖率联合驱动的思路，但把推进目标限定在"防御机制相关代码"；在预言机上把机制不变量翻译为 fuzz 框架可直接使用的判定接口，使方法对静默失效保持敏感。</w:t>
-            </w:r>
-          </w:p>
-          <w:p>
-            <w:pPr>
-              <w:pStyle w:val="Normal"/>
-              <w:spacing w:lineRule="auto" w:line="360"/>
-              <w:rPr>
-                <w:sz w:val="24"/>
-              </w:rPr>
-            </w:pPr>
-          </w:p>
-          <w:p>
-            <w:pPr>
-              <w:pStyle w:val="Normal"/>
+              <w:spacing w:line="360" w:lineRule="auto"/>
+              <w:ind w:left="0" w:leftChars="0" w:right="0" w:rightChars="0" w:firstLineChars="200"/>
+              <w:rPr>
+                <w:kern w:val="0"/>
+                <w:sz w:val="24"/>
+              </w:rPr>
+            </w:pPr>
+            <w:r>
+              <w:rPr>
+                <w:kern w:val="0"/>
+                <w:sz w:val="24"/>
+              </w:rPr>
+              <w:t>大模型在代码理解与生成上的能力近年被引入以缓解传统变异在质量上的瓶颈。WhiteFox[5] 从编译器优化 pass 源码出发，先用大模型归纳触发该优化的输入模式（requirement summarization），再据此生成测试用例，使种子生成具备对编译器内部逻辑的感知；该方法在 PyTorch、TVM 等深度学习编译器上发现了若干优化路径深处的 bug。HLPFuzz[15] 进一步把大模型与覆盖率反馈耦合：在灰盒主循环之外引入白盒求解器，按"未覆盖且后继最多"的策略选取目标基本块，把单基本块翻译为约束求解任务交由大模型完成，并通过渐进式上下文构建缓解注意力衰减。这些工作表明大模型可以充当语义感知的变异引擎，但它们的目标设定仍是常规可达性——"让程序走到某个未覆盖位置"，并不关心目标路径所承担的安全契约。</w:t>
+            </w:r>
+          </w:p>
+          <w:p>
+            <w:pPr>
+              <w:spacing w:line="360" w:lineRule="auto"/>
+              <w:ind w:left="0" w:leftChars="0" w:right="0" w:rightChars="0" w:firstLineChars="200"/>
+              <w:rPr>
+                <w:kern w:val="0"/>
+                <w:sz w:val="24"/>
+              </w:rPr>
+            </w:pPr>
+            <w:r>
+              <w:rPr>
+                <w:kern w:val="0"/>
+                <w:sz w:val="24"/>
+              </w:rPr>
+              <w:t>综合来看，针对编译器自身防御机制的自动化测试在公开文献中仍然稀少：少数工作面向单一机制做差分测试（如扫描 IBT landing pad 存在性），另一些工作从二进制层面做事后审计，但难以反向定位到引入缺陷的编译器代码路径。本课题在变异方法上沿用大模型与覆盖率联合驱动的思路，但把推进目标限定在"防御机制相关代码"；在预言机上把机制不变量翻译为 fuzz 框架可直接使用的判定接口，使方法对静默失效保持敏感。</w:t>
+            </w:r>
+          </w:p>
+          <w:p>
+            <w:pPr>
+              <w:spacing w:line="360" w:lineRule="auto"/>
+              <w:rPr>
+                <w:sz w:val="24"/>
+              </w:rPr>
+            </w:pPr>
+          </w:p>
+          <w:p>
+            <w:pPr>
               <w:widowControl/>
-              <w:jc w:val="start"/>
+              <w:jc w:val="left"/>
               <w:rPr>
                 <w:b/>
                 <w:bCs/>
@@ -2828,8 +2933,7 @@
           </w:p>
           <w:p>
             <w:pPr>
-              <w:pStyle w:val="Normal"/>
-              <w:spacing w:lineRule="auto" w:line="360"/>
+              <w:spacing w:line="360" w:lineRule="auto"/>
               <w:rPr>
                 <w:b/>
                 <w:bCs/>
@@ -2849,26 +2953,24 @@
           </w:p>
           <w:p>
             <w:pPr>
-              <w:pStyle w:val="Normal"/>
-              <w:spacing w:lineRule="auto" w:line="360"/>
-              <w:ind w:firstLineChars="200" w:startChars="0" w:start="0" w:endChars="0" w:end="0"/>
-              <w:rPr>
-                <w:kern w:val="0"/>
-                <w:sz w:val="24"/>
-              </w:rPr>
-            </w:pPr>
-            <w:r>
-              <w:rPr>
-                <w:kern w:val="0"/>
-                <w:sz w:val="24"/>
-              </w:rPr>
-              <w:t xml:space="preserve">本课题要构建一种面向编译器自身防御机制的模糊测试方法，并在 GCC 与 LLVM 上完成端到端验证。与以崩溃或差分输出为信号的传统编译器 fuzzer 不同，本方法以"防御机制是否仍满足其安全契约"为判据，自动暴露编译器仍能正常生成代码、但运行时保护已被静默削弱的失效。具体目标如下：(a) 形成一套覆盖主流防御机制的不变量集合，每条不变量具备可由二进制或运行行为判定的证据形式，在 GCC 与 LLVM 上保持一致的描述结构；(b) 构建一个可同时面向 GCC 与 LLVM、跨架构运行的 fuzzer 原型，以防御机制相关代码的源代码覆盖率为推进信号，用大模型完成种子精细变异；(c) 通过该原型在 GCC 与 LLVM 上发现可被上游确认的真实缺陷，验证方法有效性与跨编译器迁移性。三个目标依次推进，其依赖关系与对应的工作内容在 3.2 节中呈现（见图 3）。</w:t>
-            </w:r>
-          </w:p>
-          <w:p>
-            <w:pPr>
-              <w:pStyle w:val="Normal"/>
-              <w:spacing w:lineRule="auto" w:line="360"/>
+              <w:spacing w:line="360" w:lineRule="auto"/>
+              <w:ind w:left="0" w:leftChars="0" w:right="0" w:rightChars="0" w:firstLineChars="200"/>
+              <w:rPr>
+                <w:kern w:val="0"/>
+                <w:sz w:val="24"/>
+              </w:rPr>
+            </w:pPr>
+            <w:r>
+              <w:rPr>
+                <w:kern w:val="0"/>
+                <w:sz w:val="24"/>
+              </w:rPr>
+              <w:t>本课题要构建一种面向编译器自身防御机制的模糊测试方法，并在 GCC 与 LLVM 上完成端到端验证。与以崩溃或差分输出为信号的传统编译器 fuzzer 不同，本方法以"防御机制是否仍满足其安全契约"为判据，自动暴露编译器仍能正常生成代码、但运行时保护已被静默削弱的失效。具体目标如下：(a) 形成一套覆盖主流防御机制的不变量集合，每条不变量具备可由二进制或运行行为判定的证据形式，在 GCC 与 LLVM 上保持一致的描述结构；(b) 构建一个可同时面向 GCC 与 LLVM、跨架构运行的 fuzzer 原型，以防御机制相关代码的源代码覆盖率为推进信号，用大模型完成种子精细变异；(c) 通过该原型在 GCC 与 LLVM 上发现可被上游确认的真实缺陷，验证方法有效性与跨编译器迁移性。三个目标依次推进，其依赖关系与对应的工作内容在 3.2 节中呈现（见图 3）。</w:t>
+            </w:r>
+          </w:p>
+          <w:p>
+            <w:pPr>
+              <w:spacing w:line="360" w:lineRule="auto"/>
               <w:rPr>
                 <w:b/>
                 <w:bCs/>
@@ -2888,33 +2990,30 @@
           </w:p>
           <w:p>
             <w:pPr>
-              <w:pStyle w:val="Normal"/>
-              <w:spacing w:lineRule="auto" w:line="360"/>
-              <w:ind w:firstLineChars="200" w:startChars="0" w:start="0" w:endChars="0" w:end="0"/>
-              <w:rPr>
-                <w:kern w:val="0"/>
-                <w:sz w:val="24"/>
-              </w:rPr>
-            </w:pPr>
-            <w:r>
-              <w:rPr>
-                <w:kern w:val="0"/>
-                <w:sz w:val="24"/>
-              </w:rPr>
-              <w:t xml:space="preserve">本课题分为以下三部分（见图 3），彼此存在依赖关系：不变量形式化是预言机与种子目标选择的事实基础；预言机为 fuzz 主循环提供安全判定接口；覆盖率驱动的种子生成则负责把 fuzzing 推进到能触发不变量的代码路径上。</w:t>
-            </w:r>
-          </w:p>
-          <w:p>
-            <w:pPr>
-              <w:pStyle w:val="Normal"/>
-              <w:spacing w:lineRule="auto" w:line="360"/>
-              <w:jc w:val="center"/>
-            </w:pPr>
-            <w:r>
-              <w:rPr/>
+              <w:spacing w:line="360" w:lineRule="auto"/>
+              <w:ind w:left="0" w:leftChars="0" w:right="0" w:rightChars="0" w:firstLineChars="200"/>
+              <w:rPr>
+                <w:kern w:val="0"/>
+                <w:sz w:val="24"/>
+              </w:rPr>
+            </w:pPr>
+            <w:r>
+              <w:rPr>
+                <w:kern w:val="0"/>
+                <w:sz w:val="24"/>
+              </w:rPr>
+              <w:t>本课题分为以下三部分（见图 3），彼此存在依赖关系：不变量形式化是预言机与种子目标选择的事实基础；预言机为 fuzz 主循环提供安全判定接口；覆盖率驱动的种子生成则负责把 fuzzing 推进到能触发不变量的代码路径上。</w:t>
+            </w:r>
+          </w:p>
+          <w:p>
+            <w:pPr>
+              <w:spacing w:line="360" w:lineRule="auto"/>
+              <w:jc w:val="center"/>
+            </w:pPr>
+            <w:r>
               <w:drawing>
-                <wp:inline xmlns:wp="http://schemas.openxmlformats.org/drawingml/2006/wordprocessingDrawing" distT="0" distB="0" distL="0" distR="0">
-                  <wp:extent cx="5385714" cy="1236021"/>
+                <wp:inline distT="0" distB="0" distL="0" distR="0">
+                  <wp:extent cx="5385435" cy="1235710"/>
                   <wp:effectExtent l="0" t="0" r="0" b="0"/>
                   <wp:docPr id="23" name="Figure23"/>
                   <wp:cNvGraphicFramePr>
@@ -2924,11 +3023,13 @@
                     <a:graphicData uri="http://schemas.openxmlformats.org/drawingml/2006/picture">
                       <pic:pic xmlns:pic="http://schemas.openxmlformats.org/drawingml/2006/picture">
                         <pic:nvPicPr>
-                          <pic:cNvPr id="23" name="pipeline.png"/>
-                          <pic:cNvPicPr/>
+                          <pic:cNvPr id="23" name="Figure23"/>
+                          <pic:cNvPicPr>
+                            <a:picLocks noChangeAspect="1"/>
+                          </pic:cNvPicPr>
                         </pic:nvPicPr>
                         <pic:blipFill>
-                          <a:blip xmlns:r="http://schemas.openxmlformats.org/officeDocument/2006/relationships" r:embed="rId23"/>
+                          <a:blip r:embed="rId8"/>
                           <a:stretch>
                             <a:fillRect/>
                           </a:stretch>
@@ -2951,8 +3052,7 @@
           </w:p>
           <w:p>
             <w:pPr>
-              <w:pStyle w:val="Normal"/>
-              <w:spacing w:lineRule="auto" w:line="300"/>
+              <w:spacing w:line="300" w:lineRule="auto"/>
               <w:jc w:val="center"/>
               <w:rPr>
                 <w:rFonts w:ascii="宋体" w:hAnsi="宋体" w:eastAsia="宋体"/>
@@ -2971,81 +3071,75 @@
           </w:p>
           <w:p>
             <w:pPr>
-              <w:pStyle w:val="Normal"/>
-              <w:spacing w:lineRule="auto" w:line="360"/>
-              <w:rPr>
-                <w:sz w:val="24"/>
-              </w:rPr>
-            </w:pPr>
-          </w:p>
-          <w:p>
-            <w:pPr>
-              <w:pStyle w:val="Normal"/>
-              <w:spacing w:lineRule="auto" w:line="360"/>
-              <w:ind w:firstLineChars="200" w:startChars="0" w:start="0" w:endChars="0" w:end="0"/>
-              <w:rPr>
-                <w:kern w:val="0"/>
-                <w:sz w:val="24"/>
-              </w:rPr>
-            </w:pPr>
-            <w:r>
-              <w:rPr>
-                <w:kern w:val="0"/>
-                <w:sz w:val="24"/>
-              </w:rPr>
-              <w:t xml:space="preserve">(1) 防御机制不变量的调研与形式化。针对 stack canary、_FORTIFY_SOURCE、IBT 等机制，从三类来源提炼其安全不变量：一是编译器源码中的注释与断言，如 GCC 中 AArch64 后端关于 canary 槽位置关系的安全注释、ix86 关于 ENDBR 立即数禁止的谓词，以及 LLVM 中 lib/CodeGen/StackProtector 与 X86InstrInfo 等模块的对应实现；二是 GCC、LLVM 自身文档（Clang Command Line Reference、Attribute Reference、CFI Design 等）以及 glibc 与 ABI 文档对开关 flag、_chk 接口、CET ELF property 等的规定；三是已确认的历史 bug 与对应 patch——从修补点反推被违反的不变量。每条不变量按统一字段记录陈述、所属编译器与版本、证据片段、信息源及版本敏感性，便于机械检索与跨版本回归。</w:t>
-            </w:r>
-          </w:p>
-          <w:p>
-            <w:pPr>
-              <w:pStyle w:val="Normal"/>
-              <w:spacing w:lineRule="auto" w:line="360"/>
-              <w:ind w:firstLineChars="200" w:startChars="0" w:start="0" w:endChars="0" w:end="0"/>
-              <w:rPr>
-                <w:kern w:val="0"/>
-                <w:sz w:val="24"/>
-              </w:rPr>
-            </w:pPr>
-            <w:r>
-              <w:rPr>
-                <w:kern w:val="0"/>
-                <w:sz w:val="24"/>
-              </w:rPr>
-              <w:t xml:space="preserve">(2) 不变量到预言机的工程化落地。把 (1) 中的不变量翻译为可在二进制层面或运行行为上判定的检查器。框架将检查器分为静态与动态两类：静态检查通过 ELF 符号、指令流模式、属性 note 做断言式判定；动态检查通过受控执行（如对 buffer 填充长度做二分搜索）观察运行时行为。预言机判据完全建立在二进制和运行行为之上，与产生该二进制的具体编译器解耦，GCC 与 LLVM 产物共用同一套检查器。每个机制配置一个聚合器，任一检查器返回 Fail 即记机制级违例并附带证据；同时为每个机制记录开机制 / 关机制两套 flag profile，框架据此对同一颗种子做对照判定，避免与编译器自身缺省行为混淆。</w:t>
-            </w:r>
-          </w:p>
-          <w:p>
-            <w:pPr>
-              <w:pStyle w:val="Normal"/>
-              <w:spacing w:lineRule="auto" w:line="360"/>
-              <w:ind w:firstLineChars="200" w:startChars="0" w:start="0" w:endChars="0" w:end="0"/>
-              <w:rPr>
-                <w:kern w:val="0"/>
-                <w:sz w:val="24"/>
-              </w:rPr>
-            </w:pPr>
-            <w:r>
-              <w:rPr>
-                <w:kern w:val="0"/>
-                <w:sz w:val="24"/>
-              </w:rPr>
-              <w:t xml:space="preserve">(3) 大模型与覆盖率联合驱动的种子生成。以 GCC 与 LLVM 中防御机制相关代码的源代码覆盖率为目标信号（GCC 侧 gcov，LLVM 侧 SanitizerCoverage / source-based coverage），结合控制流图选取后继最多、当前未覆盖的基本块作为约束求解目标。每轮求解的流程：构造目标上下文（目标函数源码、目标基本块标注、覆盖前驱的种子作为示例），调用大模型生成新 C 种子，编译产物经覆盖率与预言机检查后按三方决策表决定是否进入语料库。种子未命中目标时，通过轻量级调用追踪定位与基线种子的发散点，把发散函数源码作为额外上下文反馈给大模型进入下一轮变异。整个过程把覆盖率推进与安全契约判定统一在同一条主循环中，大模型的生成始终被防御机制相关代码路径所牵引。</w:t>
-            </w:r>
-          </w:p>
-          <w:p>
-            <w:pPr>
-              <w:pStyle w:val="Normal"/>
-              <w:spacing w:lineRule="auto" w:line="360"/>
-              <w:rPr>
-                <w:sz w:val="24"/>
-              </w:rPr>
-            </w:pPr>
-          </w:p>
-          <w:p>
-            <w:pPr>
-              <w:pStyle w:val="Normal"/>
+              <w:spacing w:line="360" w:lineRule="auto"/>
+              <w:rPr>
+                <w:sz w:val="24"/>
+              </w:rPr>
+            </w:pPr>
+          </w:p>
+          <w:p>
+            <w:pPr>
+              <w:spacing w:line="360" w:lineRule="auto"/>
+              <w:ind w:left="0" w:leftChars="0" w:right="0" w:rightChars="0" w:firstLineChars="200"/>
+              <w:rPr>
+                <w:kern w:val="0"/>
+                <w:sz w:val="24"/>
+              </w:rPr>
+            </w:pPr>
+            <w:r>
+              <w:rPr>
+                <w:kern w:val="0"/>
+                <w:sz w:val="24"/>
+              </w:rPr>
+              <w:t>(1) 防御机制不变量的调研与形式化。针对 stack canary、_FORTIFY_SOURCE、IBT 等机制，从三类来源提炼其安全不变量：一是编译器源码中的注释与断言，如 GCC 中 AArch64 后端关于 canary 槽位置关系的安全注释、ix86 关于 ENDBR 立即数禁止的谓词，以及 LLVM 中 lib/CodeGen/StackProtector 与 X86InstrInfo 等模块的对应实现；二是 GCC、LLVM 自身文档（Clang Command Line Reference、Attribute Reference、CFI Design 等）以及 glibc 与 ABI 文档对开关 flag、_chk 接口、CET ELF property 等的规定；三是已确认的历史 bug 与对应 patch——从修补点反推被违反的不变量。每条不变量按统一字段记录陈述、所属编译器与版本、证据片段、信息源及版本敏感性，便于机械检索与跨版本回归。</w:t>
+            </w:r>
+          </w:p>
+          <w:p>
+            <w:pPr>
+              <w:spacing w:line="360" w:lineRule="auto"/>
+              <w:ind w:left="0" w:leftChars="0" w:right="0" w:rightChars="0" w:firstLineChars="200"/>
+              <w:rPr>
+                <w:kern w:val="0"/>
+                <w:sz w:val="24"/>
+              </w:rPr>
+            </w:pPr>
+            <w:r>
+              <w:rPr>
+                <w:kern w:val="0"/>
+                <w:sz w:val="24"/>
+              </w:rPr>
+              <w:t>(2) 不变量到预言机的工程化落地。把 (1) 中的不变量翻译为可在二进制层面或运行行为上判定的检查器。框架将检查器分为静态与动态两类：静态检查通过 ELF 符号、指令流模式、属性 note 做断言式判定；动态检查通过受控执行（如对 buffer 填充长度做二分搜索）观察运行时行为。预言机判据完全建立在二进制和运行行为之上，与产生该二进制的具体编译器解耦，GCC 与 LLVM 产物共用同一套检查器。每个机制配置一个聚合器，任一检查器返回 Fail 即记机制级违例并附带证据；同时为每个机制记录开机制 / 关机制两套 flag profile，框架据此对同一颗种子做对照判定，避免与编译器自身缺省行为混淆。</w:t>
+            </w:r>
+          </w:p>
+          <w:p>
+            <w:pPr>
+              <w:spacing w:line="360" w:lineRule="auto"/>
+              <w:ind w:left="0" w:leftChars="0" w:right="0" w:rightChars="0" w:firstLineChars="200"/>
+              <w:rPr>
+                <w:kern w:val="0"/>
+                <w:sz w:val="24"/>
+              </w:rPr>
+            </w:pPr>
+            <w:r>
+              <w:rPr>
+                <w:kern w:val="0"/>
+                <w:sz w:val="24"/>
+              </w:rPr>
+              <w:t>(3) 大模型与覆盖率联合驱动的种子生成。以 GCC 与 LLVM 中防御机制相关代码的源代码覆盖率为目标信号（GCC 侧 gcov，LLVM 侧 SanitizerCoverage / source-based coverage），结合控制流图按"未覆盖且与防御机制相关性高"的策略选取基本块作为约束求解目标，相关性由 CFG 后继分支数与所在代码区域的防御机制权重共同决定。每轮求解的流程：构造目标上下文（目标函数源码、目标基本块标注、覆盖前驱的种子作为示例），调用大模型生成新 C 种子，编译产物再经覆盖率与预言机检查；结果分析阶段同时看覆盖增量、是否命中目标、是否触发 bug 三个信号，任一为真即把种子纳入语料库。种子未命中目标时，通过轻量级调用追踪定位与基线种子的发散点，把发散函数源码作为额外上下文反馈给大模型进入下一轮变异。整个过程把覆盖率推进与安全契约判定统一在同一条主循环中，大模型的生成始终被防御机制相关代码路径所牵引。</w:t>
+            </w:r>
+          </w:p>
+          <w:p>
+            <w:pPr>
+              <w:spacing w:line="360" w:lineRule="auto"/>
+              <w:rPr>
+                <w:sz w:val="24"/>
+              </w:rPr>
+            </w:pPr>
+          </w:p>
+          <w:p>
+            <w:pPr>
               <w:widowControl/>
-              <w:jc w:val="start"/>
+              <w:jc w:val="left"/>
               <w:rPr>
                 <w:b/>
                 <w:bCs/>
@@ -3065,26 +3159,24 @@
           </w:p>
           <w:p>
             <w:pPr>
-              <w:pStyle w:val="Normal"/>
-              <w:spacing w:lineRule="auto" w:line="360"/>
-              <w:ind w:firstLineChars="200" w:startChars="0" w:start="0" w:endChars="0" w:end="0"/>
-              <w:rPr>
-                <w:kern w:val="0"/>
-                <w:sz w:val="24"/>
-              </w:rPr>
-            </w:pPr>
-            <w:r>
-              <w:rPr>
-                <w:kern w:val="0"/>
-                <w:sz w:val="24"/>
-              </w:rPr>
-              <w:t xml:space="preserve">技术路线分为总体架构、不变量预言机框架、大模型约束求解主循环、跨架构与编译选项调度四部分，对应研究内容 (1)–(3) 的工程实现。GCC 上的初步验证证据见第五章。</w:t>
-            </w:r>
-          </w:p>
-          <w:p>
-            <w:pPr>
-              <w:pStyle w:val="Normal"/>
-              <w:spacing w:lineRule="auto" w:line="360"/>
+              <w:spacing w:line="360" w:lineRule="auto"/>
+              <w:ind w:left="0" w:leftChars="0" w:right="0" w:rightChars="0" w:firstLineChars="200"/>
+              <w:rPr>
+                <w:kern w:val="0"/>
+                <w:sz w:val="24"/>
+              </w:rPr>
+            </w:pPr>
+            <w:r>
+              <w:rPr>
+                <w:kern w:val="0"/>
+                <w:sz w:val="24"/>
+              </w:rPr>
+              <w:t>技术路线分为总体架构、不变量预言机框架、大模型约束求解主循环、跨架构与编译选项调度四部分，对应研究内容 (1)–(3) 的工程实现。GCC 上的初步验证证据见第五章。</w:t>
+            </w:r>
+          </w:p>
+          <w:p>
+            <w:pPr>
+              <w:spacing w:line="360" w:lineRule="auto"/>
               <w:rPr>
                 <w:b/>
                 <w:bCs/>
@@ -3104,33 +3196,30 @@
           </w:p>
           <w:p>
             <w:pPr>
-              <w:pStyle w:val="Normal"/>
-              <w:spacing w:lineRule="auto" w:line="360"/>
-              <w:ind w:firstLineChars="200" w:startChars="0" w:start="0" w:endChars="0" w:end="0"/>
-              <w:rPr>
-                <w:kern w:val="0"/>
-                <w:sz w:val="24"/>
-              </w:rPr>
-            </w:pPr>
-            <w:r>
-              <w:rPr>
-                <w:kern w:val="0"/>
-                <w:sz w:val="24"/>
-              </w:rPr>
-              <w:t xml:space="preserve">系统以一条 fuzz 主循环为骨架，周围由若干子系统支撑（总体结构见图 4）。编译器子系统封装预先插桩的 GCC 与 LLVM 构建：GCC 侧通过 gcov 采集 .gcda 覆盖率数据，LLVM 侧通过 SanitizerCoverage 与 source-based coverage 采集 .profraw 数据，二者经统一接口归并为同构的"行级覆盖 → 种子 ID"映射，主循环对底层编译器无感知。预言机子系统按防御机制聚合不变量检查器，对每颗成功编译的种子做安全契约判定，判据建立在 ELF 二进制与运行行为之上，GCC 与 LLVM 产物共用同一套检查器。提示词子系统按"基础提示词 + 编译器内部知识"两层装配后提交给远端模型；语料库子系统持久化满足质量阈值的种子并维护家系信息；策略调度器把 ISA、编译选项与 flag profile 按四元组下发给编译器和预言机。</w:t>
-            </w:r>
-          </w:p>
-          <w:p>
-            <w:pPr>
-              <w:pStyle w:val="Normal"/>
-              <w:spacing w:lineRule="auto" w:line="360"/>
-              <w:jc w:val="center"/>
-            </w:pPr>
-            <w:r>
-              <w:rPr/>
+              <w:spacing w:line="360" w:lineRule="auto"/>
+              <w:ind w:left="0" w:leftChars="0" w:right="0" w:rightChars="0" w:firstLineChars="200"/>
+              <w:rPr>
+                <w:kern w:val="0"/>
+                <w:sz w:val="24"/>
+              </w:rPr>
+            </w:pPr>
+            <w:r>
+              <w:rPr>
+                <w:kern w:val="0"/>
+                <w:sz w:val="24"/>
+              </w:rPr>
+              <w:t>系统以一条 fuzz 主循环为骨架，由 LLM 变异、编译器、预言机三个子系统加种子语料库、配置模块共同支撑（总体结构见图 4）。Fuzz 引擎承担主循环调度与提示词组装两项职能，把当前覆盖率、目标基本块和已有种子拼装成提示词后交给 LLM 变异子系统调用远端模型，再把返回的新种子分发给后续环节。编译器子系统封装预先插桩的 GCC 与 LLVM 构建：GCC 侧通过 gcov 采集 .gcda 覆盖率数据，LLVM 侧通过 SanitizerCoverage 与 source-based coverage 采集 .profraw 数据，二者经统一接口归并为同构的"行级覆盖 → 种子 ID"映射，主循环对底层编译器无感知。预言机子系统按防御机制聚合不变量检查器，对每颗成功编译的种子做安全契约判定，判据建立在 ELF 二进制与运行行为之上，GCC 与 LLVM 产物共用同一套检查器。种子语料库持久化满足质量阈值的种子并维护家系信息。配置模块按"防御机制 · ISA · flag"三元组下发任务：把工具链选择（GCC / LLVM）与对应 flag 交给编译器子系统，把目标 ISA 对应的 QEMU 工具链交给预言机的执行层，使同一份种子能在不同后端上做对照实验。</w:t>
+            </w:r>
+          </w:p>
+          <w:p>
+            <w:pPr>
+              <w:spacing w:line="360" w:lineRule="auto"/>
+              <w:jc w:val="center"/>
+            </w:pPr>
+            <w:r>
               <w:drawing>
-                <wp:inline xmlns:wp="http://schemas.openxmlformats.org/drawingml/2006/wordprocessingDrawing" distT="0" distB="0" distL="0" distR="0">
-                  <wp:extent cx="5385714" cy="2609079"/>
+                <wp:inline distT="0" distB="0" distL="0" distR="0">
+                  <wp:extent cx="5385435" cy="2608580"/>
                   <wp:effectExtent l="0" t="0" r="0" b="0"/>
                   <wp:docPr id="24" name="Figure24"/>
                   <wp:cNvGraphicFramePr>
@@ -3140,11 +3229,13 @@
                     <a:graphicData uri="http://schemas.openxmlformats.org/drawingml/2006/picture">
                       <pic:pic xmlns:pic="http://schemas.openxmlformats.org/drawingml/2006/picture">
                         <pic:nvPicPr>
-                          <pic:cNvPr id="24" name="architecture.png"/>
-                          <pic:cNvPicPr/>
+                          <pic:cNvPr id="24" name="Figure24"/>
+                          <pic:cNvPicPr>
+                            <a:picLocks noChangeAspect="1"/>
+                          </pic:cNvPicPr>
                         </pic:nvPicPr>
                         <pic:blipFill>
-                          <a:blip xmlns:r="http://schemas.openxmlformats.org/officeDocument/2006/relationships" r:embed="rId24"/>
+                          <a:blip r:embed="rId9"/>
                           <a:stretch>
                             <a:fillRect/>
                           </a:stretch>
@@ -3167,8 +3258,7 @@
           </w:p>
           <w:p>
             <w:pPr>
-              <w:pStyle w:val="Normal"/>
-              <w:spacing w:lineRule="auto" w:line="300"/>
+              <w:spacing w:line="300" w:lineRule="auto"/>
               <w:jc w:val="center"/>
               <w:rPr>
                 <w:rFonts w:ascii="宋体" w:hAnsi="宋体" w:eastAsia="宋体"/>
@@ -3187,17 +3277,15 @@
           </w:p>
           <w:p>
             <w:pPr>
-              <w:pStyle w:val="Normal"/>
-              <w:spacing w:lineRule="auto" w:line="360"/>
-              <w:rPr>
-                <w:sz w:val="24"/>
-              </w:rPr>
-            </w:pPr>
-          </w:p>
-          <w:p>
-            <w:pPr>
-              <w:pStyle w:val="Normal"/>
-              <w:spacing w:lineRule="auto" w:line="360"/>
+              <w:spacing w:line="360" w:lineRule="auto"/>
+              <w:rPr>
+                <w:sz w:val="24"/>
+              </w:rPr>
+            </w:pPr>
+          </w:p>
+          <w:p>
+            <w:pPr>
+              <w:spacing w:line="360" w:lineRule="auto"/>
               <w:rPr>
                 <w:b/>
                 <w:bCs/>
@@ -3217,33 +3305,30 @@
           </w:p>
           <w:p>
             <w:pPr>
-              <w:pStyle w:val="Normal"/>
-              <w:spacing w:lineRule="auto" w:line="360"/>
-              <w:ind w:firstLineChars="200" w:startChars="0" w:start="0" w:endChars="0" w:end="0"/>
-              <w:rPr>
-                <w:kern w:val="0"/>
-                <w:sz w:val="24"/>
-              </w:rPr>
-            </w:pPr>
-            <w:r>
-              <w:rPr>
-                <w:kern w:val="0"/>
-                <w:sz w:val="24"/>
-              </w:rPr>
-              <w:t xml:space="preserve">每个机制对应一个聚合器，下挂若干检查器（判定流程见图 5）。检查器分为静态与动态两类：静态检查器读 ELF 符号表、指令字节模式与 .note 段做断言式判定，例如确认间接跳转目标处的 ENDBR 字节、_chk 接口被正确链接；动态检查器通过受控执行观察运行时行为，典型做法是对溢出 buffer 的填充长度做二分搜索，定位 canary 触发的实际边界。每个检查器返回 Pass、Fail、Error 三态，Error 仅用于隔离基础设施故障，不参与机制级判定；聚合时任一 Fail 即视为机制级违例，并把触发证据回写到种子记录。对易与编译器缺省行为混淆的检查器，框架同时跑开机制与关机制两套 flag profile，比对两次判定的差异，确保 Pass / Fail 反映的是机制本身。预言机按种子级缓存复用二分搜索结果与动态符号查询，避免同一颗二进制被多次解析或执行。</w:t>
-            </w:r>
-          </w:p>
-          <w:p>
-            <w:pPr>
-              <w:pStyle w:val="Normal"/>
-              <w:spacing w:lineRule="auto" w:line="360"/>
-              <w:jc w:val="center"/>
-            </w:pPr>
-            <w:r>
-              <w:rPr/>
+              <w:spacing w:line="360" w:lineRule="auto"/>
+              <w:ind w:left="0" w:leftChars="0" w:right="0" w:rightChars="0" w:firstLineChars="200"/>
+              <w:rPr>
+                <w:kern w:val="0"/>
+                <w:sz w:val="24"/>
+              </w:rPr>
+            </w:pPr>
+            <w:r>
+              <w:rPr>
+                <w:kern w:val="0"/>
+                <w:sz w:val="24"/>
+              </w:rPr>
+              <w:t>每个机制对应一个聚合器，下挂若干检查器，输入端把同一颗种子的源码、汇编与最终二进制一并交给检查器（判定流程见图 5）。检查器分为静态与动态两类：静态检查器走汇编分析与字节检查路径，读 ELF 符号表、指令字节模式与 .note 段做断言式判定，例如确认间接跳转目标处的 ENDBR 字节、_chk 接口被正确链接；动态检查器以插桩检测和二分搜索为主要手段，通过受控执行观察运行时行为，典型做法是对溢出 buffer 的填充长度做二分搜索，定位 canary 触发的实际边界。每个检查器返回 Pass、Fail、Error 三态，Error 仅用于隔离基础设施故障，不参与机制级判定；聚合时任一 Fail 即视为机制级违例，并把触发证据回写到种子记录。对易与编译器缺省行为混淆的检查器，框架同时跑开机制与关机制两套 flag profile，比对两次判定的差异，确保 Pass / Fail 反映的是机制本身。预言机维护一份元信息缓存，复用二分搜索结果与动态符号查询，避免同一颗二进制被多次解析或执行。</w:t>
+            </w:r>
+          </w:p>
+          <w:p>
+            <w:pPr>
+              <w:spacing w:line="360" w:lineRule="auto"/>
+              <w:jc w:val="center"/>
+            </w:pPr>
+            <w:r>
               <w:drawing>
-                <wp:inline xmlns:wp="http://schemas.openxmlformats.org/drawingml/2006/wordprocessingDrawing" distT="0" distB="0" distL="0" distR="0">
-                  <wp:extent cx="4284090" cy="5606039"/>
+                <wp:inline distT="0" distB="0" distL="0" distR="0">
+                  <wp:extent cx="4283710" cy="5612130"/>
                   <wp:effectExtent l="0" t="0" r="0" b="0"/>
                   <wp:docPr id="25" name="Figure25"/>
                   <wp:cNvGraphicFramePr>
@@ -3253,11 +3338,13 @@
                     <a:graphicData uri="http://schemas.openxmlformats.org/drawingml/2006/picture">
                       <pic:pic xmlns:pic="http://schemas.openxmlformats.org/drawingml/2006/picture">
                         <pic:nvPicPr>
-                          <pic:cNvPr id="25" name="oracle-flow.png"/>
-                          <pic:cNvPicPr/>
+                          <pic:cNvPr id="25" name="Figure25"/>
+                          <pic:cNvPicPr>
+                            <a:picLocks noChangeAspect="1"/>
+                          </pic:cNvPicPr>
                         </pic:nvPicPr>
                         <pic:blipFill>
-                          <a:blip xmlns:r="http://schemas.openxmlformats.org/officeDocument/2006/relationships" r:embed="rId25"/>
+                          <a:blip r:embed="rId10"/>
                           <a:stretch>
                             <a:fillRect/>
                           </a:stretch>
@@ -3265,7 +3352,7 @@
                         <pic:spPr>
                           <a:xfrm>
                             <a:off x="0" y="0"/>
-                            <a:ext cx="4284090" cy="5606039"/>
+                            <a:ext cx="4284090" cy="5612159"/>
                           </a:xfrm>
                           <a:prstGeom prst="rect">
                             <a:avLst/>
@@ -3280,8 +3367,7 @@
           </w:p>
           <w:p>
             <w:pPr>
-              <w:pStyle w:val="Normal"/>
-              <w:spacing w:lineRule="auto" w:line="300"/>
+              <w:spacing w:line="300" w:lineRule="auto"/>
               <w:jc w:val="center"/>
               <w:rPr>
                 <w:rFonts w:ascii="宋体" w:hAnsi="宋体" w:eastAsia="宋体"/>
@@ -3300,17 +3386,15 @@
           </w:p>
           <w:p>
             <w:pPr>
-              <w:pStyle w:val="Normal"/>
-              <w:spacing w:lineRule="auto" w:line="360"/>
-              <w:rPr>
-                <w:sz w:val="24"/>
-              </w:rPr>
-            </w:pPr>
-          </w:p>
-          <w:p>
-            <w:pPr>
-              <w:pStyle w:val="Normal"/>
-              <w:spacing w:lineRule="auto" w:line="360"/>
+              <w:spacing w:line="360" w:lineRule="auto"/>
+              <w:rPr>
+                <w:sz w:val="24"/>
+              </w:rPr>
+            </w:pPr>
+          </w:p>
+          <w:p>
+            <w:pPr>
+              <w:spacing w:line="360" w:lineRule="auto"/>
               <w:rPr>
                 <w:b/>
                 <w:bCs/>
@@ -3330,33 +3414,30 @@
           </w:p>
           <w:p>
             <w:pPr>
-              <w:pStyle w:val="Normal"/>
-              <w:spacing w:lineRule="auto" w:line="360"/>
-              <w:ind w:firstLineChars="200" w:startChars="0" w:start="0" w:endChars="0" w:end="0"/>
-              <w:rPr>
-                <w:kern w:val="0"/>
-                <w:sz w:val="24"/>
-              </w:rPr>
-            </w:pPr>
-            <w:r>
-              <w:rPr>
-                <w:kern w:val="0"/>
-                <w:sz w:val="24"/>
-              </w:rPr>
-              <w:t xml:space="preserve">主循环输入为当前覆盖率映射与编译器源码控制流图（迭代过程见图 6）。每轮先按"未覆盖且后继分支数最大"策略选取目标基本块，然后构造目标上下文：目标函数源码片段（来自当前所测的 GCC 或 LLVM 版本）、逐行覆盖标注、目标基本块位置，以及覆盖目标前驱的若干种子作为示例。提示词组装层把上下文拼接到基础约束求解提示词与机制契约要求之后，提交给大模型生成新 C 种子。编译失败时把错误信息与上一版源码反馈进入下一轮；编译成功后覆盖率分析器判断是否命中目标，预言机给出安全判定。种子去留由覆盖增量、是否命中目标、是否触发 bug 三方信号决定（三方决策表）。种子未命中目标但带来新覆盖时，轻量级动态追踪定位它与基线种子在调用序列上的首个发散点，把发散函数源码作为额外上下文构造"错题解析"提示词，再次请求模型做精细变异。目标基本块全部覆盖后，主循环可切换到随机变异阶段，仅以预言机为持久化条件继续探索。</w:t>
-            </w:r>
-          </w:p>
-          <w:p>
-            <w:pPr>
-              <w:pStyle w:val="Normal"/>
-              <w:spacing w:lineRule="auto" w:line="360"/>
-              <w:jc w:val="center"/>
-            </w:pPr>
-            <w:r>
-              <w:rPr/>
+              <w:spacing w:line="360" w:lineRule="auto"/>
+              <w:ind w:left="0" w:leftChars="0" w:right="0" w:rightChars="0" w:firstLineChars="200"/>
+              <w:rPr>
+                <w:kern w:val="0"/>
+                <w:sz w:val="24"/>
+              </w:rPr>
+            </w:pPr>
+            <w:r>
+              <w:rPr>
+                <w:kern w:val="0"/>
+                <w:sz w:val="24"/>
+              </w:rPr>
+              <w:t>主循环输入为当前覆盖率映射与编译器源码控制流图（迭代过程见图 6）。每轮先在未覆盖基本块中按相关性挑出一个目标，相关性由该基本块在 CFG 上的后继分支数和所属代码区域对防御机制的关联程度共同决定，使搜索集中在尚未触达且与防御逻辑相关的代码上；随后构造目标上下文：目标函数源码片段（来自当前所测的 GCC 或 LLVM 版本）、逐行覆盖标注、目标基本块位置，以及覆盖目标前驱的若干种子作为示例。提示词组装层把上下文拼接到基础约束求解提示词与机制契约要求之后，提交给大模型生成新 C 种子。编译失败时把错误信息与上一版源码反馈进入下一轮；编译成功后覆盖率分析器判断是否命中目标，预言机给出安全判定。结果分析阶段同时看覆盖增量、是否命中目标、是否触发 bug 三个信号，任一为真即把该种子纳入语料库。种子未命中目标但带来新覆盖时，轻量级动态追踪定位它与基线种子在调用序列上的首个发散点，把发散函数源码作为额外上下文回喂提示词组装层，再次请求模型做精细变异。目标基本块全部覆盖后，主循环可切换到随机变异阶段，仅以预言机为持久化条件继续探索。</w:t>
+            </w:r>
+          </w:p>
+          <w:p>
+            <w:pPr>
+              <w:spacing w:line="360" w:lineRule="auto"/>
+              <w:jc w:val="center"/>
+            </w:pPr>
+            <w:r>
               <w:drawing>
-                <wp:inline xmlns:wp="http://schemas.openxmlformats.org/drawingml/2006/wordprocessingDrawing" distT="0" distB="0" distL="0" distR="0">
-                  <wp:extent cx="3664949" cy="6725183"/>
+                <wp:inline distT="0" distB="0" distL="0" distR="0">
+                  <wp:extent cx="3501390" cy="6724650"/>
                   <wp:effectExtent l="0" t="0" r="0" b="0"/>
                   <wp:docPr id="26" name="Figure26"/>
                   <wp:cNvGraphicFramePr>
@@ -3366,11 +3447,13 @@
                     <a:graphicData uri="http://schemas.openxmlformats.org/drawingml/2006/picture">
                       <pic:pic xmlns:pic="http://schemas.openxmlformats.org/drawingml/2006/picture">
                         <pic:nvPicPr>
-                          <pic:cNvPr id="26" name="main-loop.png"/>
-                          <pic:cNvPicPr/>
+                          <pic:cNvPr id="26" name="Figure26"/>
+                          <pic:cNvPicPr>
+                            <a:picLocks noChangeAspect="1"/>
+                          </pic:cNvPicPr>
                         </pic:nvPicPr>
                         <pic:blipFill>
-                          <a:blip xmlns:r="http://schemas.openxmlformats.org/officeDocument/2006/relationships" r:embed="rId26"/>
+                          <a:blip r:embed="rId11"/>
                           <a:stretch>
                             <a:fillRect/>
                           </a:stretch>
@@ -3378,7 +3461,7 @@
                         <pic:spPr>
                           <a:xfrm>
                             <a:off x="0" y="0"/>
-                            <a:ext cx="3664949" cy="6725183"/>
+                            <a:ext cx="3501559" cy="6725183"/>
                           </a:xfrm>
                           <a:prstGeom prst="rect">
                             <a:avLst/>
@@ -3393,8 +3476,7 @@
           </w:p>
           <w:p>
             <w:pPr>
-              <w:pStyle w:val="Normal"/>
-              <w:spacing w:lineRule="auto" w:line="300"/>
+              <w:spacing w:line="300" w:lineRule="auto"/>
               <w:jc w:val="center"/>
               <w:rPr>
                 <w:rFonts w:ascii="宋体" w:hAnsi="宋体" w:eastAsia="宋体"/>
@@ -3413,17 +3495,15 @@
           </w:p>
           <w:p>
             <w:pPr>
-              <w:pStyle w:val="Normal"/>
-              <w:spacing w:lineRule="auto" w:line="360"/>
-              <w:rPr>
-                <w:sz w:val="24"/>
-              </w:rPr>
-            </w:pPr>
-          </w:p>
-          <w:p>
-            <w:pPr>
-              <w:pStyle w:val="Normal"/>
-              <w:spacing w:lineRule="auto" w:line="360"/>
+              <w:spacing w:line="360" w:lineRule="auto"/>
+              <w:rPr>
+                <w:sz w:val="24"/>
+              </w:rPr>
+            </w:pPr>
+          </w:p>
+          <w:p>
+            <w:pPr>
+              <w:spacing w:line="360" w:lineRule="auto"/>
               <w:rPr>
                 <w:b/>
                 <w:bCs/>
@@ -3443,27 +3523,25 @@
           </w:p>
           <w:p>
             <w:pPr>
-              <w:pStyle w:val="Normal"/>
-              <w:spacing w:lineRule="auto" w:line="360"/>
-              <w:ind w:firstLineChars="200" w:startChars="0" w:start="0" w:endChars="0" w:end="0"/>
-              <w:rPr>
-                <w:kern w:val="0"/>
-                <w:sz w:val="24"/>
-              </w:rPr>
-            </w:pPr>
-            <w:r>
-              <w:rPr>
-                <w:kern w:val="0"/>
-                <w:sz w:val="24"/>
-              </w:rPr>
-              <w:t xml:space="preserve">编译命令被参数化为编译器（GCC / LLVM）、ISA、架构相关 flag、策略相关 flag profile 四元组，同一份种子按四元组分发给不同工具链，目标二进制通过 QEMU 用户态执行。flag profile 同时包含开机制（如 -fstack-protector-strong）与关机制（如 -fno-stack-protector）两套，预言机据此对同一颗种子做对照判定；关机制产物仅用于交叉验证，不进入主语料库。GCC 与 LLVM 在防御机制 flag 拼写上的差异（如 -fcf-protection 对 -fsanitize=cfi）由 FlagScheduler 统一抽象为"机制级"配置，向上层屏蔽。BinaryInspector 屏蔽 ISA 差异：通过 Go 标准库读取 ELF 符号表与 .note 段，为检查器提供导入函数列表、ENDBR 字节模式扫描、栈布局采样等能力。</w:t>
-            </w:r>
-          </w:p>
-          <w:p>
-            <w:pPr>
-              <w:pStyle w:val="Normal"/>
+              <w:spacing w:line="360" w:lineRule="auto"/>
+              <w:ind w:left="0" w:leftChars="0" w:right="0" w:rightChars="0" w:firstLineChars="200"/>
+              <w:rPr>
+                <w:kern w:val="0"/>
+                <w:sz w:val="24"/>
+              </w:rPr>
+            </w:pPr>
+            <w:r>
+              <w:rPr>
+                <w:kern w:val="0"/>
+                <w:sz w:val="24"/>
+              </w:rPr>
+              <w:t>配置模块把编译命令参数化为编译器（GCC / LLVM）、ISA、架构相关 flag、策略相关 flag profile 四元组，向编译器子系统下发工具链与 flag，向预言机执行层下发对应 ISA 的 QEMU 工具链，同一份种子据此分发给不同后端，目标二进制通过 QEMU 用户态执行。flag profile 同时包含开机制（如 -fstack-protector-strong）与关机制（如 -fno-stack-protector）两套，预言机据此对同一颗种子做对照判定；关机制产物仅用于交叉验证，不进入主语料库。GCC 与 LLVM 在防御机制 flag 拼写上的差异（如 -fcf-protection 对 -fsanitize=cfi）由 FlagScheduler 统一抽象为"机制级"配置，向上层屏蔽。BinaryInspector 屏蔽 ISA 差异：通过 Go 标准库读取 ELF 符号表与 .note 段，为检查器提供导入函数列表、ENDBR 字节模式扫描、栈布局采样等能力。</w:t>
+            </w:r>
+          </w:p>
+          <w:p>
+            <w:pPr>
               <w:widowControl/>
-              <w:jc w:val="start"/>
+              <w:jc w:val="left"/>
               <w:rPr>
                 <w:b/>
                 <w:bCs/>
@@ -3483,31 +3561,31 @@
           </w:p>
           <w:p>
             <w:pPr>
-              <w:pStyle w:val="Normal"/>
-              <w:spacing w:lineRule="auto" w:line="360"/>
-              <w:ind w:firstLineChars="200" w:startChars="0" w:start="0" w:endChars="0" w:end="0"/>
-              <w:rPr>
-                <w:kern w:val="0"/>
-                <w:sz w:val="24"/>
-              </w:rPr>
-            </w:pPr>
-            <w:r>
-              <w:rPr>
-                <w:kern w:val="0"/>
-                <w:sz w:val="24"/>
-              </w:rPr>
-              <w:t xml:space="preserve">目前已在 GCC 多个版本（若干稳定版与一个本地构建的 master 快照）上对栈金丝雀、_FORTIFY_SOURCE、IBT 等部分防御机制做了实验，LLVM 侧同类实验纳入下一阶段。已完成实验共发现 3 例可被上游确认的 silent failure；下文展开其中两例，第三例（栈金丝雀在若干 fallback ISA 上 epilogue 残留寄存器未清零，与 PR-96191 同源）篇幅较短，在 5.3 节简述。</w:t>
-            </w:r>
-          </w:p>
-          <w:p>
-            <w:pPr>
-              <w:pStyle w:val="Normal"/>
-              <w:spacing w:lineRule="auto" w:line="360"/>
-              <w:rPr>
+              <w:spacing w:line="360" w:lineRule="auto"/>
+              <w:ind w:left="0" w:leftChars="0" w:right="0" w:rightChars="0" w:firstLineChars="200"/>
+              <w:rPr>
+                <w:kern w:val="0"/>
+                <w:sz w:val="24"/>
+              </w:rPr>
+            </w:pPr>
+            <w:r>
+              <w:rPr>
+                <w:kern w:val="0"/>
+                <w:sz w:val="24"/>
+              </w:rPr>
+              <w:t>目前已在 GCC 多个版本（若干稳定版与一个本地构建的 master 快照）上对栈金丝雀、_FORTIFY_SOURCE、IBT 等部分防御机制做了实验，LLVM 侧同类实验纳入下一阶段。已完成实验共发现 3 例可被上游确认的 silent failure；下文展开其中两例，第三例（栈金丝雀在若干 fallback ISA 上 epilogue 残留寄存器未清零，与 PR-96191 同源）篇幅较短，在 5.3 节简述。</w:t>
+            </w:r>
+          </w:p>
+          <w:p>
+            <w:pPr>
+              <w:spacing w:line="360" w:lineRule="auto"/>
+              <w:rPr>
+                <w:rFonts w:hint="eastAsia" w:eastAsia="宋体"/>
                 <w:b/>
                 <w:bCs/>
                 <w:kern w:val="0"/>
                 <w:sz w:val="24"/>
+                <w:lang w:eastAsia="zh-CN"/>
               </w:rPr>
             </w:pPr>
             <w:r>
@@ -3517,74 +3595,82 @@
                 <w:kern w:val="0"/>
                 <w:sz w:val="24"/>
               </w:rPr>
-              <w:t>5.1 案例一：_FORTIFY_SOURCE 优化路径中的 size 参数遗漏</w:t>
-            </w:r>
-          </w:p>
-          <w:p>
-            <w:pPr>
-              <w:pStyle w:val="Normal"/>
-              <w:spacing w:lineRule="auto" w:line="360"/>
-              <w:ind w:firstLineChars="200" w:startChars="0" w:start="0" w:endChars="0" w:end="0"/>
-              <w:rPr>
-                <w:kern w:val="0"/>
-                <w:sz w:val="24"/>
-              </w:rPr>
-            </w:pPr>
-            <w:r>
-              <w:rPr>
-                <w:kern w:val="0"/>
-                <w:sz w:val="24"/>
-              </w:rPr>
-              <w:t xml:space="preserve">_FORTIFY_SOURCE 是 GCC 与 glibc 配合的源代码加固机制。开启后，glibc 头文件在预处理阶段把 strcat 等危险接口重写为带 size 参数的 __strcat_chk，运行时据此检查目的缓冲区上限。GCC 的 strlen pass 进一步识别已知前缀长度的目的指针，将 __strcat_chk 改写为性能更优的 __stpcpy_chk，并把目的指针前移 strlen(dst) 字节。这里的安全不变量是：目的指针前移后，传给 __stpcpy_chk 的 size 参数必须由原始 objsize 减去 strlen(dst)，否则运行时上限就被静默放宽 strlen(dst) 字节。</w:t>
-            </w:r>
-          </w:p>
-          <w:p>
-            <w:pPr>
-              <w:pStyle w:val="Normal"/>
-              <w:spacing w:lineRule="auto" w:line="360"/>
-              <w:ind w:firstLineChars="200" w:startChars="0" w:start="0" w:endChars="0" w:end="0"/>
-              <w:rPr>
-                <w:kern w:val="0"/>
-                <w:sz w:val="24"/>
-              </w:rPr>
-            </w:pPr>
-            <w:r>
-              <w:rPr>
-                <w:kern w:val="0"/>
-                <w:sz w:val="24"/>
-              </w:rPr>
-              <w:t xml:space="preserve">实测中，本方法构造的种子在该路径上稳定触发了 size 参数未相应减小的实例。反汇编层面 strcat → __strcat_chk → __stpcpy_chk 整条链条仍然出现，看似 FORTIFY 仍在生效，但"按 dst 剩余空间收紧上限"那一步已被丢弃。该缺陷自 GCC 4.7 起存在，跨越十余年未被发现；上报后已被确认并合入主分支，预计随 GCC 16.1 发布，开发团队同时计划向 GCC 13、14、15 回送补丁。这条路径与 2018 年的 PR-87672 处于同一文件：当年的修复只覆盖了一个对称分支，另一支被遗漏至今——这本身就是第一章所述"矩阵同源遗漏"的又一例证。</w:t>
-            </w:r>
-          </w:p>
-          <w:p>
-            <w:pPr>
-              <w:pStyle w:val="Normal"/>
-              <w:spacing w:lineRule="auto" w:line="360"/>
-              <w:ind w:firstLineChars="200" w:startChars="0" w:start="0" w:endChars="0" w:end="0"/>
-              <w:rPr>
-                <w:kern w:val="0"/>
-                <w:sz w:val="24"/>
-              </w:rPr>
-            </w:pPr>
-            <w:r>
-              <w:rPr>
-                <w:kern w:val="0"/>
-                <w:sz w:val="24"/>
-              </w:rPr>
-              <w:t xml:space="preserve">预言机方面，本例命中"FORTIFY 调用点的 size 参数下界推断"不变量，证据为静态符号 + 反汇编，在静态阶段判定；该优化路径与 size 静默放宽的位置见图 7。</w:t>
-            </w:r>
-          </w:p>
-          <w:p>
-            <w:pPr>
-              <w:pStyle w:val="Normal"/>
-              <w:spacing w:lineRule="auto" w:line="360"/>
-              <w:jc w:val="center"/>
-            </w:pPr>
-            <w:r>
-              <w:rPr/>
+              <w:t>5.1 案例一：_FORTIFY_SOURCE 优化路径中的 size 参数</w:t>
+            </w:r>
+            <w:r>
+              <w:rPr>
+                <w:rFonts w:hint="eastAsia"/>
+                <w:b/>
+                <w:bCs/>
+                <w:kern w:val="0"/>
+                <w:sz w:val="24"/>
+                <w:lang w:eastAsia="zh-CN"/>
+              </w:rPr>
+              <w:t>错误</w:t>
+            </w:r>
+            <w:bookmarkStart w:id="0" w:name="_GoBack"/>
+            <w:bookmarkEnd w:id="0"/>
+          </w:p>
+          <w:p>
+            <w:pPr>
+              <w:spacing w:line="360" w:lineRule="auto"/>
+              <w:ind w:left="0" w:leftChars="0" w:right="0" w:rightChars="0" w:firstLineChars="200"/>
+              <w:rPr>
+                <w:kern w:val="0"/>
+                <w:sz w:val="24"/>
+              </w:rPr>
+            </w:pPr>
+            <w:r>
+              <w:rPr>
+                <w:kern w:val="0"/>
+                <w:sz w:val="24"/>
+              </w:rPr>
+              <w:t>_FORTIFY_SOURCE 是 GCC 与 glibc 配合的源代码加固机制。开启后，glibc 头文件在预处理阶段把 strcat 等危险接口重写为带 size 参数的 __strcat_chk，运行时据此检查目的缓冲区上限。GCC 的 strlen pass 进一步识别已知前缀长度的目的指针，将 __strcat_chk 改写为性能更优的 __stpcpy_chk，并把目的指针前移 strlen(dst) 字节。这里的安全不变量是：目的指针前移后，传给 __stpcpy_chk 的 size 参数必须由原始 objsize 减去 strlen(dst)，否则运行时上限就被静默放宽 strlen(dst) 字节。</w:t>
+            </w:r>
+          </w:p>
+          <w:p>
+            <w:pPr>
+              <w:spacing w:line="360" w:lineRule="auto"/>
+              <w:ind w:left="0" w:leftChars="0" w:right="0" w:rightChars="0" w:firstLineChars="200"/>
+              <w:rPr>
+                <w:kern w:val="0"/>
+                <w:sz w:val="24"/>
+              </w:rPr>
+            </w:pPr>
+            <w:r>
+              <w:rPr>
+                <w:kern w:val="0"/>
+                <w:sz w:val="24"/>
+              </w:rPr>
+              <w:t>实测中，本方法构造的种子在该路径上稳定触发了 size 参数未相应减小的实例。反汇编层面 strcat → __strcat_chk → __stpcpy_chk 整条链条仍然出现，看似 FORTIFY 仍在生效，但"按 dst 剩余空间收紧上限"那一步已被丢弃。该缺陷自 GCC 4.7 起存在，跨越十余年未被发现；上报后已被确认并合入主分支，预计随 GCC 16.1 发布，开发团队同时计划向 GCC 13、14、15 回送补丁。这条路径与 2018 年的 PR-87672 处于同一文件：当年的修复只覆盖了一个对称分支，另一支被遗漏至今——这本身就是第一章所述"矩阵同源遗漏"的又一例证。</w:t>
+            </w:r>
+          </w:p>
+          <w:p>
+            <w:pPr>
+              <w:spacing w:line="360" w:lineRule="auto"/>
+              <w:ind w:left="0" w:leftChars="0" w:right="0" w:rightChars="0" w:firstLineChars="200"/>
+              <w:rPr>
+                <w:kern w:val="0"/>
+                <w:sz w:val="24"/>
+              </w:rPr>
+            </w:pPr>
+            <w:r>
+              <w:rPr>
+                <w:kern w:val="0"/>
+                <w:sz w:val="24"/>
+              </w:rPr>
+              <w:t>预言机方面，本例命中"FORTIFY 调用点的 size 参数下界推断"不变量，证据为静态符号 + 反汇编，在静态阶段判定；该优化路径与 size 静默放宽的位置见图 7。</w:t>
+            </w:r>
+          </w:p>
+          <w:p>
+            <w:pPr>
+              <w:spacing w:line="360" w:lineRule="auto"/>
+              <w:jc w:val="center"/>
+            </w:pPr>
+            <w:r>
               <w:drawing>
-                <wp:inline xmlns:wp="http://schemas.openxmlformats.org/drawingml/2006/wordprocessingDrawing" distT="0" distB="0" distL="0" distR="0">
-                  <wp:extent cx="4284090" cy="6361875"/>
+                <wp:inline distT="0" distB="0" distL="0" distR="0">
+                  <wp:extent cx="4283710" cy="6361430"/>
                   <wp:effectExtent l="0" t="0" r="0" b="0"/>
                   <wp:docPr id="27" name="Figure27"/>
                   <wp:cNvGraphicFramePr>
@@ -3594,11 +3680,13 @@
                     <a:graphicData uri="http://schemas.openxmlformats.org/drawingml/2006/picture">
                       <pic:pic xmlns:pic="http://schemas.openxmlformats.org/drawingml/2006/picture">
                         <pic:nvPicPr>
-                          <pic:cNvPr id="27" name="fortify-path.png"/>
-                          <pic:cNvPicPr/>
+                          <pic:cNvPr id="27" name="Figure27"/>
+                          <pic:cNvPicPr>
+                            <a:picLocks noChangeAspect="1"/>
+                          </pic:cNvPicPr>
                         </pic:nvPicPr>
                         <pic:blipFill>
-                          <a:blip xmlns:r="http://schemas.openxmlformats.org/officeDocument/2006/relationships" r:embed="rId27"/>
+                          <a:blip r:embed="rId12"/>
                           <a:stretch>
                             <a:fillRect/>
                           </a:stretch>
@@ -3621,8 +3709,7 @@
           </w:p>
           <w:p>
             <w:pPr>
-              <w:pStyle w:val="Normal"/>
-              <w:spacing w:lineRule="auto" w:line="300"/>
+              <w:spacing w:line="300" w:lineRule="auto"/>
               <w:jc w:val="center"/>
               <w:rPr>
                 <w:rFonts w:ascii="宋体" w:hAnsi="宋体" w:eastAsia="宋体"/>
@@ -3641,17 +3728,15 @@
           </w:p>
           <w:p>
             <w:pPr>
-              <w:pStyle w:val="Normal"/>
-              <w:spacing w:lineRule="auto" w:line="360"/>
-              <w:rPr>
-                <w:sz w:val="24"/>
-              </w:rPr>
-            </w:pPr>
-          </w:p>
-          <w:p>
-            <w:pPr>
-              <w:pStyle w:val="Normal"/>
-              <w:spacing w:lineRule="auto" w:line="360"/>
+              <w:spacing w:line="360" w:lineRule="auto"/>
+              <w:rPr>
+                <w:sz w:val="24"/>
+              </w:rPr>
+            </w:pPr>
+          </w:p>
+          <w:p>
+            <w:pPr>
+              <w:spacing w:line="360" w:lineRule="auto"/>
               <w:rPr>
                 <w:b/>
                 <w:bCs/>
@@ -3671,62 +3756,58 @@
           </w:p>
           <w:p>
             <w:pPr>
-              <w:pStyle w:val="Normal"/>
-              <w:spacing w:lineRule="auto" w:line="360"/>
-              <w:ind w:firstLineChars="200" w:startChars="0" w:start="0" w:endChars="0" w:end="0"/>
-              <w:rPr>
-                <w:kern w:val="0"/>
-                <w:sz w:val="24"/>
-              </w:rPr>
-            </w:pPr>
-            <w:r>
-              <w:rPr>
-                <w:kern w:val="0"/>
-                <w:sz w:val="24"/>
-              </w:rPr>
-              <w:t xml:space="preserve">IBT（Indirect Branch Tracking）是 Intel CET 中针对间接跳转的保护机制：硬件要求间接跳转或调用的目标地址必须以 endbr 指令开头，否则触发异常。endbr 在二进制中是固定的四字节值（endbr64 = F3 0F 1E FA、endbr32 = F3 0F 1E FB），按设计只应作为合法间接跳转入口出现在代码段。如果这四个字节以其他形式出现——比如作为 movabsq 指令的 64 位立即数的一部分嵌入 .text——攻击者就可以把控制流劫持到该处，硬件会将其识别为合法 landing pad，IBT 语义被绕过。</w:t>
-            </w:r>
-          </w:p>
-          <w:p>
-            <w:pPr>
-              <w:pStyle w:val="Normal"/>
-              <w:spacing w:lineRule="auto" w:line="360"/>
-              <w:ind w:firstLineChars="200" w:startChars="0" w:start="0" w:endChars="0" w:end="0"/>
-              <w:rPr>
-                <w:kern w:val="0"/>
-                <w:sz w:val="24"/>
-              </w:rPr>
-            </w:pPr>
-            <w:r>
-              <w:rPr>
-                <w:kern w:val="0"/>
-                <w:sz w:val="24"/>
-              </w:rPr>
-              <w:t xml:space="preserve">GCC 在 x86 后端用 ix86_endbr_immediate_operand 谓词做字节级检测：当目标启用 IBT 时，谓词扫描立即数中是否存在 endbr 模式，含该模式的立即数会被拒绝。本方法在该谓词实现中发现一个逻辑漏洞：扫描循环对"高位非零"的 64 位立即数提前退出，只要 endbr 字节排布在立即数高位，扫描就走不到对应位置。这类立即数被错误接受，进而在 .text 中嵌入了不受控的伪 landing pad。该缺陷已上报上游，等待维护者回复。</w:t>
-            </w:r>
-          </w:p>
-          <w:p>
-            <w:pPr>
-              <w:pStyle w:val="Normal"/>
-              <w:spacing w:lineRule="auto" w:line="360"/>
-              <w:ind w:firstLineChars="200" w:startChars="0" w:start="0" w:endChars="0" w:end="0"/>
-              <w:rPr>
-                <w:kern w:val="0"/>
-                <w:sz w:val="24"/>
-              </w:rPr>
-            </w:pPr>
-            <w:r>
-              <w:rPr>
-                <w:kern w:val="0"/>
-                <w:sz w:val="24"/>
-              </w:rPr>
-              <w:t xml:space="preserve">预言机方面，本例命中"endbr 字节模式不应出现在非跳转目标的指令中"不变量，证据为代码段内 endbr 模式扫描，属静态指令流检查。</w:t>
-            </w:r>
-          </w:p>
-          <w:p>
-            <w:pPr>
-              <w:pStyle w:val="Normal"/>
-              <w:spacing w:lineRule="auto" w:line="360"/>
+              <w:spacing w:line="360" w:lineRule="auto"/>
+              <w:ind w:left="0" w:leftChars="0" w:right="0" w:rightChars="0" w:firstLineChars="200"/>
+              <w:rPr>
+                <w:kern w:val="0"/>
+                <w:sz w:val="24"/>
+              </w:rPr>
+            </w:pPr>
+            <w:r>
+              <w:rPr>
+                <w:kern w:val="0"/>
+                <w:sz w:val="24"/>
+              </w:rPr>
+              <w:t>IBT（Indirect Branch Tracking）是 Intel CET 中针对间接跳转的保护机制：硬件要求间接跳转或调用的目标地址必须以 endbr 指令开头，否则触发异常。endbr 在二进制中是固定的四字节值（endbr64 = F3 0F 1E FA、endbr32 = F3 0F 1E FB），按设计只应作为合法间接跳转入口出现在代码段。如果这四个字节以其他形式出现——比如作为 movabsq 指令的 64 位立即数的一部分嵌入 .text——攻击者就可以把控制流劫持到该处，硬件会将其识别为合法 landing pad，IBT 语义被绕过。</w:t>
+            </w:r>
+          </w:p>
+          <w:p>
+            <w:pPr>
+              <w:spacing w:line="360" w:lineRule="auto"/>
+              <w:ind w:left="0" w:leftChars="0" w:right="0" w:rightChars="0" w:firstLineChars="200"/>
+              <w:rPr>
+                <w:kern w:val="0"/>
+                <w:sz w:val="24"/>
+              </w:rPr>
+            </w:pPr>
+            <w:r>
+              <w:rPr>
+                <w:kern w:val="0"/>
+                <w:sz w:val="24"/>
+              </w:rPr>
+              <w:t>GCC 在 x86 后端用 ix86_endbr_immediate_operand 谓词做字节级检测：当目标启用 IBT 时，谓词扫描立即数中是否存在 endbr 模式，含该模式的立即数会被拒绝。本方法在该谓词实现中发现一个逻辑漏洞：扫描循环对"高位非零"的 64 位立即数提前退出，只要 endbr 字节排布在立即数高位，扫描就走不到对应位置。这类立即数被错误接受，进而在 .text 中嵌入了不受控的伪 landing pad。该缺陷已上报上游，等待维护者回复。</w:t>
+            </w:r>
+          </w:p>
+          <w:p>
+            <w:pPr>
+              <w:spacing w:line="360" w:lineRule="auto"/>
+              <w:ind w:left="0" w:leftChars="0" w:right="0" w:rightChars="0" w:firstLineChars="200"/>
+              <w:rPr>
+                <w:kern w:val="0"/>
+                <w:sz w:val="24"/>
+              </w:rPr>
+            </w:pPr>
+            <w:r>
+              <w:rPr>
+                <w:kern w:val="0"/>
+                <w:sz w:val="24"/>
+              </w:rPr>
+              <w:t>预言机方面，本例命中"endbr 字节模式不应出现在非跳转目标的指令中"不变量，证据为代码段内 endbr 模式扫描，属静态指令流检查。</w:t>
+            </w:r>
+          </w:p>
+          <w:p>
+            <w:pPr>
+              <w:spacing w:line="360" w:lineRule="auto"/>
               <w:rPr>
                 <w:b/>
                 <w:bCs/>
@@ -3746,26 +3827,24 @@
           </w:p>
           <w:p>
             <w:pPr>
-              <w:pStyle w:val="Normal"/>
-              <w:spacing w:lineRule="auto" w:line="360"/>
-              <w:ind w:firstLineChars="200" w:startChars="0" w:start="0" w:endChars="0" w:end="0"/>
-              <w:rPr>
-                <w:kern w:val="0"/>
-                <w:sz w:val="24"/>
-              </w:rPr>
-            </w:pPr>
-            <w:r>
-              <w:rPr>
-                <w:kern w:val="0"/>
-                <w:sz w:val="24"/>
-              </w:rPr>
-              <w:t xml:space="preserve">本方法在 GCC 通用栈保护后端的 fallback 路径上还找到一例同类失效：MIPS、LoongArch、Xtensa、CSKY 等 ISA 的 fallback 后端未提供专用 epilogue 模板，函数返回时金丝雀寄存器未显式清零，进程级 __stack_chk_guard 值在调用者的可见寄存器中残留。该问题与 2020 年针对 AArch64 / ARM 的 PR-96191 同源，当年修复未覆盖上述后端。缺陷已上报并被确认、合入修复。</w:t>
-            </w:r>
-          </w:p>
-          <w:p>
-            <w:pPr>
-              <w:pStyle w:val="Normal"/>
-              <w:spacing w:lineRule="auto" w:line="360"/>
+              <w:spacing w:line="360" w:lineRule="auto"/>
+              <w:ind w:left="0" w:leftChars="0" w:right="0" w:rightChars="0" w:firstLineChars="200"/>
+              <w:rPr>
+                <w:kern w:val="0"/>
+                <w:sz w:val="24"/>
+              </w:rPr>
+            </w:pPr>
+            <w:r>
+              <w:rPr>
+                <w:kern w:val="0"/>
+                <w:sz w:val="24"/>
+              </w:rPr>
+              <w:t>本方法在 GCC 通用栈保护后端的 fallback 路径上还找到一例同类失效：MIPS、LoongArch、Xtensa、CSKY 等 ISA 的 fallback 后端未提供专用 epilogue 模板，函数返回时金丝雀寄存器未显式清零，进程级 __stack_chk_guard 值在调用者的可见寄存器中残留。该问题与 2020 年针对 AArch64 / ARM 的 PR-96191 同源，当年修复未覆盖上述后端。缺陷已上报并被确认、合入修复。</w:t>
+            </w:r>
+          </w:p>
+          <w:p>
+            <w:pPr>
+              <w:spacing w:line="360" w:lineRule="auto"/>
               <w:rPr>
                 <w:b/>
                 <w:bCs/>
@@ -3785,27 +3864,25 @@
           </w:p>
           <w:p>
             <w:pPr>
-              <w:pStyle w:val="Normal"/>
-              <w:spacing w:lineRule="auto" w:line="360"/>
-              <w:ind w:firstLineChars="200" w:startChars="0" w:start="0" w:endChars="0" w:end="0"/>
-              <w:rPr>
-                <w:kern w:val="0"/>
-                <w:sz w:val="24"/>
-              </w:rPr>
-            </w:pPr>
-            <w:r>
-              <w:rPr>
-                <w:kern w:val="0"/>
-                <w:sz w:val="24"/>
-              </w:rPr>
-              <w:t xml:space="preserve">三例分别覆盖静态符号、动态行为、指令流字节模式三类不变量形态，共同特征是：二进制看起来带有保护，但编译器代码路径某一处的安全不变量已失去维护。方法在不修改编译器的前提下，通过约束求解与不变量预言机组合把这类差异在自动化流程中暴露出来。LLVM 侧实验预计在后续阶段以同一预言机框架补全。</w:t>
-            </w:r>
-          </w:p>
-          <w:p>
-            <w:pPr>
-              <w:pStyle w:val="Normal"/>
+              <w:spacing w:line="360" w:lineRule="auto"/>
+              <w:ind w:left="0" w:leftChars="0" w:right="0" w:rightChars="0" w:firstLineChars="200"/>
+              <w:rPr>
+                <w:kern w:val="0"/>
+                <w:sz w:val="24"/>
+              </w:rPr>
+            </w:pPr>
+            <w:r>
+              <w:rPr>
+                <w:kern w:val="0"/>
+                <w:sz w:val="24"/>
+              </w:rPr>
+              <w:t>三例分别覆盖静态符号、动态行为、指令流字节模式三类不变量形态，共同特征是：二进制看起来带有保护，但编译器代码路径某一处的安全不变量已失去维护。方法在不修改编译器的前提下，通过约束求解与不变量预言机组合把这类差异在自动化流程中暴露出来。LLVM 侧实验预计在后续阶段以同一预言机框架补全。</w:t>
+            </w:r>
+          </w:p>
+          <w:p>
+            <w:pPr>
               <w:widowControl/>
-              <w:jc w:val="start"/>
+              <w:jc w:val="left"/>
               <w:rPr>
                 <w:b/>
                 <w:bCs/>
@@ -3825,274 +3902,258 @@
           </w:p>
           <w:p>
             <w:pPr>
-              <w:pStyle w:val="Normal"/>
-              <w:spacing w:lineRule="auto" w:line="360"/>
-              <w:rPr>
-                <w:kern w:val="0"/>
-                <w:sz w:val="24"/>
-              </w:rPr>
-            </w:pPr>
-            <w:r>
-              <w:rPr>
-                <w:kern w:val="0"/>
-                <w:sz w:val="24"/>
-              </w:rPr>
-              <w:t xml:space="preserve">[1] Yang X, Chen Y, Eide E, et al. Finding and understanding bugs in C compilers[C]//Proceedings of the 32nd ACM SIGPLAN Conference on Programming Language Design and Implementation (PLDI). 2011: 283-294.</w:t>
-            </w:r>
-          </w:p>
-          <w:p>
-            <w:pPr>
-              <w:pStyle w:val="Normal"/>
-              <w:spacing w:lineRule="auto" w:line="360"/>
-              <w:rPr>
-                <w:kern w:val="0"/>
-                <w:sz w:val="24"/>
-              </w:rPr>
-            </w:pPr>
-            <w:r>
-              <w:rPr>
-                <w:kern w:val="0"/>
-                <w:sz w:val="24"/>
-              </w:rPr>
-              <w:t xml:space="preserve">[2] Livinskii V, Babokin D, Regehr J. Random testing for C and C++ compilers with YARPGen[C]//Proceedings of the ACM on Programming Languages (OOPSLA). 2020, 4: 1-25.</w:t>
-            </w:r>
-          </w:p>
-          <w:p>
-            <w:pPr>
-              <w:pStyle w:val="Normal"/>
-              <w:spacing w:lineRule="auto" w:line="360"/>
-              <w:rPr>
-                <w:kern w:val="0"/>
-                <w:sz w:val="24"/>
-              </w:rPr>
-            </w:pPr>
-            <w:r>
-              <w:rPr>
-                <w:kern w:val="0"/>
-                <w:sz w:val="24"/>
-              </w:rPr>
-              <w:t xml:space="preserve">[3] Zalewski M. American Fuzzy Lop (AFL)[EB/OL]. (2014)[2026-02-15]. https://lcamtuf.coredump.cx/afl/.</w:t>
-            </w:r>
-          </w:p>
-          <w:p>
-            <w:pPr>
-              <w:pStyle w:val="Normal"/>
-              <w:spacing w:lineRule="auto" w:line="360"/>
-              <w:rPr>
-                <w:kern w:val="0"/>
-                <w:sz w:val="24"/>
-              </w:rPr>
-            </w:pPr>
-            <w:r>
-              <w:rPr>
-                <w:kern w:val="0"/>
-                <w:sz w:val="24"/>
-              </w:rPr>
-              <w:t xml:space="preserve">[4] Serebryany K. Continuous fuzzing with libFuzzer and AddressSanitizer[C]//IEEE Cybersecurity Development (SecDev). 2016: 157.</w:t>
-            </w:r>
-          </w:p>
-          <w:p>
-            <w:pPr>
-              <w:pStyle w:val="Normal"/>
-              <w:spacing w:lineRule="auto" w:line="360"/>
-              <w:rPr>
-                <w:kern w:val="0"/>
-                <w:sz w:val="24"/>
-              </w:rPr>
-            </w:pPr>
-            <w:r>
-              <w:rPr>
-                <w:kern w:val="0"/>
-                <w:sz w:val="24"/>
-              </w:rPr>
-              <w:t xml:space="preserve">[5] Yang C, Deng Y, Lu R, et al. WhiteFox: White-box compiler fuzzing empowered by large language models[C]//Proceedings of the ACM on Programming Languages (OOPSLA). 2024.</w:t>
-            </w:r>
-          </w:p>
-          <w:p>
-            <w:pPr>
-              <w:pStyle w:val="Normal"/>
-              <w:spacing w:lineRule="auto" w:line="360"/>
-              <w:rPr>
-                <w:kern w:val="0"/>
-                <w:sz w:val="24"/>
-              </w:rPr>
-            </w:pPr>
-            <w:r>
-              <w:rPr>
-                <w:kern w:val="0"/>
-                <w:sz w:val="24"/>
-              </w:rPr>
-              <w:t xml:space="preserve">[6] GNU Project. GCC Bugzilla PR 87672 — tree-ssa-strlen: __strcat_chk to __stpcpy_chk drops bound subtract[EB/OL]. (2018)[2026-02-15]. https://gcc.gnu.org/bugzilla/show_bug.cgi?id=87672.</w:t>
-            </w:r>
-          </w:p>
-          <w:p>
-            <w:pPr>
-              <w:pStyle w:val="Normal"/>
-              <w:spacing w:lineRule="auto" w:line="360"/>
-              <w:rPr>
-                <w:kern w:val="0"/>
-                <w:sz w:val="24"/>
-              </w:rPr>
-            </w:pPr>
-            <w:r>
-              <w:rPr>
-                <w:kern w:val="0"/>
-                <w:sz w:val="24"/>
-              </w:rPr>
-              <w:t xml:space="preserve">[7] GNU Project. GCC Bugzilla PR 96191 — stack-protector leaves canary in caller-saved register on AArch64/ARM[EB/OL]. (2020)[2026-02-15]. https://gcc.gnu.org/bugzilla/show_bug.cgi?id=96191.</w:t>
-            </w:r>
-          </w:p>
-          <w:p>
-            <w:pPr>
-              <w:pStyle w:val="Normal"/>
-              <w:spacing w:lineRule="auto" w:line="360"/>
-              <w:rPr>
-                <w:kern w:val="0"/>
-                <w:sz w:val="24"/>
-              </w:rPr>
-            </w:pPr>
-            <w:r>
-              <w:rPr>
-                <w:kern w:val="0"/>
-                <w:sz w:val="24"/>
-              </w:rPr>
-              <w:t xml:space="preserve">[8] GNU Project. GCC Bugzilla PR 96350 — i386: reject ENDBR pattern in immediate operands under -fcf-protection=branch[EB/OL]. (2020)[2026-02-15]. https://gcc.gnu.org/bugzilla/show_bug.cgi?id=96350.</w:t>
-            </w:r>
-          </w:p>
-          <w:p>
-            <w:pPr>
-              <w:pStyle w:val="Normal"/>
-              <w:spacing w:lineRule="auto" w:line="360"/>
-              <w:rPr>
-                <w:kern w:val="0"/>
-                <w:sz w:val="24"/>
-              </w:rPr>
-            </w:pPr>
-            <w:r>
-              <w:rPr>
-                <w:kern w:val="0"/>
-                <w:sz w:val="24"/>
-              </w:rPr>
-              <w:t xml:space="preserve">[9] Intel Corporation. Control-flow Enforcement Technology Specification[R/OL]. (2019)[2026-02-15]. https://www.intel.com/content/www/us/en/developer/articles/technical/technical-look-control-flow-enforcement-technology.html.</w:t>
-            </w:r>
-          </w:p>
-          <w:p>
-            <w:pPr>
-              <w:pStyle w:val="Normal"/>
-              <w:spacing w:lineRule="auto" w:line="360"/>
-              <w:rPr>
-                <w:kern w:val="0"/>
-                <w:sz w:val="24"/>
-              </w:rPr>
-            </w:pPr>
-            <w:r>
-              <w:rPr>
-                <w:kern w:val="0"/>
-                <w:sz w:val="24"/>
-              </w:rPr>
-              <w:t xml:space="preserve">[10] Free Software Foundation. The GNU C Library Reference Manual: Source Fortification[EB/OL]. (2024)[2026-02-15]. https://sourceware.org/glibc/manual/latest/html_node/Source-Fortification.html.</w:t>
-            </w:r>
-          </w:p>
-          <w:p>
-            <w:pPr>
-              <w:pStyle w:val="Normal"/>
-              <w:spacing w:lineRule="auto" w:line="360"/>
-              <w:rPr>
-                <w:kern w:val="0"/>
-                <w:sz w:val="24"/>
-              </w:rPr>
-            </w:pPr>
-            <w:r>
-              <w:rPr>
-                <w:kern w:val="0"/>
-                <w:sz w:val="24"/>
-              </w:rPr>
-              <w:t xml:space="preserve">[11] Le V, Afshari M, Su Z. Compiler validation via equivalence modulo inputs[C]//Proceedings of the 35th ACM SIGPLAN Conference on Programming Language Design and Implementation (PLDI). 2014: 216-226.</w:t>
-            </w:r>
-          </w:p>
-          <w:p>
-            <w:pPr>
-              <w:pStyle w:val="Normal"/>
-              <w:spacing w:lineRule="auto" w:line="360"/>
-              <w:rPr>
-                <w:kern w:val="0"/>
-                <w:sz w:val="24"/>
-              </w:rPr>
-            </w:pPr>
-            <w:r>
-              <w:rPr>
-                <w:kern w:val="0"/>
-                <w:sz w:val="24"/>
-              </w:rPr>
-              <w:t xml:space="preserve">[12] Li S, Su Z. UBfuzz: Finding bugs in sanitizer implementations[C]//Proceedings of the 29th ACM International Conference on Architectural Support for Programming Languages and Operating Systems (ASPLOS). 2024.</w:t>
-            </w:r>
-          </w:p>
-          <w:p>
-            <w:pPr>
-              <w:pStyle w:val="Normal"/>
-              <w:spacing w:lineRule="auto" w:line="360"/>
-              <w:rPr>
-                <w:kern w:val="0"/>
-                <w:sz w:val="24"/>
-              </w:rPr>
-            </w:pPr>
-            <w:r>
-              <w:rPr>
-                <w:kern w:val="0"/>
-                <w:sz w:val="24"/>
-              </w:rPr>
-              <w:t xml:space="preserve">[13] Ma H, Shen Q, Tian Y, et al. Fuzzing deep learning compilers with HirGen[C]//Proceedings of the 32nd ACM SIGSOFT International Symposium on Software Testing and Analysis (ISSTA). 2023.</w:t>
-            </w:r>
-          </w:p>
-          <w:p>
-            <w:pPr>
-              <w:pStyle w:val="Normal"/>
-              <w:spacing w:lineRule="auto" w:line="360"/>
-              <w:rPr>
-                <w:kern w:val="0"/>
-                <w:sz w:val="24"/>
-              </w:rPr>
-            </w:pPr>
-            <w:r>
-              <w:rPr>
-                <w:kern w:val="0"/>
-                <w:sz w:val="24"/>
-              </w:rPr>
-              <w:t xml:space="preserve">[14] Even-Mendoza K, Sharma A, Donaldson A F, et al. GrayC: Greybox fuzzing of compilers and analysers for C[C]//Proceedings of the 32nd ACM SIGSOFT International Symposium on Software Testing and Analysis (ISSTA). 2023: 1219-1231.</w:t>
-            </w:r>
-          </w:p>
-          <w:p>
-            <w:pPr>
-              <w:pStyle w:val="Normal"/>
-              <w:spacing w:lineRule="auto" w:line="360"/>
-              <w:rPr>
-                <w:kern w:val="0"/>
-                <w:sz w:val="24"/>
-              </w:rPr>
-            </w:pPr>
-            <w:r>
-              <w:rPr>
-                <w:kern w:val="0"/>
-                <w:sz w:val="24"/>
-              </w:rPr>
-              <w:t xml:space="preserve">[15] Yang Y, Zhang H, Ren Z, et al. Hybrid language processor fuzzing via LLM-based constraint solving[C]//Proceedings of the 34th USENIX Security Symposium (USENIX Security). 2025.</w:t>
-            </w:r>
-          </w:p>
-          <w:p>
-            <w:pPr>
-              <w:pStyle w:val="Normal"/>
-              <w:spacing w:lineRule="auto" w:line="360"/>
-              <w:rPr>
-                <w:kern w:val="0"/>
-                <w:sz w:val="24"/>
-              </w:rPr>
-            </w:pPr>
-            <w:r>
-              <w:rPr>
-                <w:kern w:val="0"/>
-                <w:sz w:val="24"/>
-              </w:rPr>
-              <w:t xml:space="preserve">[16] Meta Security. CVE-2023-4039: GCC's -fstack-protector fails to guard dynamic stack allocations on AArch64[EB/OL]. (2023)[2026-02-15]. https://rtx.meta.security/mitigation/2023/09/12/CVE-2023-4039.html.</w:t>
+              <w:spacing w:line="360" w:lineRule="auto"/>
+              <w:rPr>
+                <w:kern w:val="0"/>
+                <w:sz w:val="24"/>
+              </w:rPr>
+            </w:pPr>
+            <w:r>
+              <w:rPr>
+                <w:kern w:val="0"/>
+                <w:sz w:val="24"/>
+              </w:rPr>
+              <w:t>[1] Yang X, Chen Y, Eide E, et al. Finding and understanding bugs in C compilers[C]//Proceedings of the 32nd ACM SIGPLAN Conference on Programming Language Design and Implementation (PLDI). 2011: 283-294.</w:t>
+            </w:r>
+          </w:p>
+          <w:p>
+            <w:pPr>
+              <w:spacing w:line="360" w:lineRule="auto"/>
+              <w:rPr>
+                <w:kern w:val="0"/>
+                <w:sz w:val="24"/>
+              </w:rPr>
+            </w:pPr>
+            <w:r>
+              <w:rPr>
+                <w:kern w:val="0"/>
+                <w:sz w:val="24"/>
+              </w:rPr>
+              <w:t>[2] Livinskii V, Babokin D, Regehr J. Random testing for C and C++ compilers with YARPGen[C]//Proceedings of the ACM on Programming Languages (OOPSLA). 2020, 4: 1-25.</w:t>
+            </w:r>
+          </w:p>
+          <w:p>
+            <w:pPr>
+              <w:spacing w:line="360" w:lineRule="auto"/>
+              <w:rPr>
+                <w:kern w:val="0"/>
+                <w:sz w:val="24"/>
+              </w:rPr>
+            </w:pPr>
+            <w:r>
+              <w:rPr>
+                <w:kern w:val="0"/>
+                <w:sz w:val="24"/>
+              </w:rPr>
+              <w:t>[3] Zalewski M. American Fuzzy Lop (AFL)[EB/OL]. (2014)[2026-02-15]. https://lcamtuf.coredump.cx/afl/.</w:t>
+            </w:r>
+          </w:p>
+          <w:p>
+            <w:pPr>
+              <w:spacing w:line="360" w:lineRule="auto"/>
+              <w:rPr>
+                <w:kern w:val="0"/>
+                <w:sz w:val="24"/>
+              </w:rPr>
+            </w:pPr>
+            <w:r>
+              <w:rPr>
+                <w:kern w:val="0"/>
+                <w:sz w:val="24"/>
+              </w:rPr>
+              <w:t>[4] Serebryany K. Continuous fuzzing with libFuzzer and AddressSanitizer[C]//IEEE Cybersecurity Development (SecDev). 2016: 157.</w:t>
+            </w:r>
+          </w:p>
+          <w:p>
+            <w:pPr>
+              <w:spacing w:line="360" w:lineRule="auto"/>
+              <w:rPr>
+                <w:kern w:val="0"/>
+                <w:sz w:val="24"/>
+              </w:rPr>
+            </w:pPr>
+            <w:r>
+              <w:rPr>
+                <w:kern w:val="0"/>
+                <w:sz w:val="24"/>
+              </w:rPr>
+              <w:t>[5] Yang C, Deng Y, Lu R, et al. WhiteFox: White-box compiler fuzzing empowered by large language models[C]//Proceedings of the ACM on Programming Languages (OOPSLA). 2024.</w:t>
+            </w:r>
+          </w:p>
+          <w:p>
+            <w:pPr>
+              <w:spacing w:line="360" w:lineRule="auto"/>
+              <w:rPr>
+                <w:kern w:val="0"/>
+                <w:sz w:val="24"/>
+              </w:rPr>
+            </w:pPr>
+            <w:r>
+              <w:rPr>
+                <w:kern w:val="0"/>
+                <w:sz w:val="24"/>
+              </w:rPr>
+              <w:t>[6] GNU Project. GCC Bugzilla PR 87672 — tree-ssa-strlen: __strcat_chk to __stpcpy_chk drops bound subtract[EB/OL]. (2018)[2026-02-15]. https://gcc.gnu.org/bugzilla/show_bug.cgi?id=87672.</w:t>
+            </w:r>
+          </w:p>
+          <w:p>
+            <w:pPr>
+              <w:spacing w:line="360" w:lineRule="auto"/>
+              <w:rPr>
+                <w:kern w:val="0"/>
+                <w:sz w:val="24"/>
+              </w:rPr>
+            </w:pPr>
+            <w:r>
+              <w:rPr>
+                <w:kern w:val="0"/>
+                <w:sz w:val="24"/>
+              </w:rPr>
+              <w:t>[7] GNU Project. GCC Bugzilla PR 96191 — stack-protector leaves canary in caller-saved register on AArch64/ARM[EB/OL]. (2020)[2026-02-15]. https://gcc.gnu.org/bugzilla/show_bug.cgi?id=96191.</w:t>
+            </w:r>
+          </w:p>
+          <w:p>
+            <w:pPr>
+              <w:spacing w:line="360" w:lineRule="auto"/>
+              <w:rPr>
+                <w:kern w:val="0"/>
+                <w:sz w:val="24"/>
+              </w:rPr>
+            </w:pPr>
+            <w:r>
+              <w:rPr>
+                <w:kern w:val="0"/>
+                <w:sz w:val="24"/>
+              </w:rPr>
+              <w:t>[8] GNU Project. GCC Bugzilla PR 96350 — i386: reject ENDBR pattern in immediate operands under -fcf-protection=branch[EB/OL]. (2020)[2026-02-15]. https://gcc.gnu.org/bugzilla/show_bug.cgi?id=96350.</w:t>
+            </w:r>
+          </w:p>
+          <w:p>
+            <w:pPr>
+              <w:spacing w:line="360" w:lineRule="auto"/>
+              <w:rPr>
+                <w:kern w:val="0"/>
+                <w:sz w:val="24"/>
+              </w:rPr>
+            </w:pPr>
+            <w:r>
+              <w:rPr>
+                <w:kern w:val="0"/>
+                <w:sz w:val="24"/>
+              </w:rPr>
+              <w:t>[9] Intel Corporation. Control-flow Enforcement Technology Specification[R/OL]. (2019)[2026-02-15]. https://www.intel.com/content/www/us/en/developer/articles/technical/technical-look-control-flow-enforcement-technology.html.</w:t>
+            </w:r>
+          </w:p>
+          <w:p>
+            <w:pPr>
+              <w:spacing w:line="360" w:lineRule="auto"/>
+              <w:rPr>
+                <w:kern w:val="0"/>
+                <w:sz w:val="24"/>
+              </w:rPr>
+            </w:pPr>
+            <w:r>
+              <w:rPr>
+                <w:kern w:val="0"/>
+                <w:sz w:val="24"/>
+              </w:rPr>
+              <w:t>[10] Free Software Foundation. The GNU C Library Reference Manual: Source Fortification[EB/OL]. (2024)[2026-02-15]. https://sourceware.org/glibc/manual/latest/html_node/Source-Fortification.html.</w:t>
+            </w:r>
+          </w:p>
+          <w:p>
+            <w:pPr>
+              <w:spacing w:line="360" w:lineRule="auto"/>
+              <w:rPr>
+                <w:kern w:val="0"/>
+                <w:sz w:val="24"/>
+              </w:rPr>
+            </w:pPr>
+            <w:r>
+              <w:rPr>
+                <w:kern w:val="0"/>
+                <w:sz w:val="24"/>
+              </w:rPr>
+              <w:t>[11] Le V, Afshari M, Su Z. Compiler validation via equivalence modulo inputs[C]//Proceedings of the 35th ACM SIGPLAN Conference on Programming Language Design and Implementation (PLDI). 2014: 216-226.</w:t>
+            </w:r>
+          </w:p>
+          <w:p>
+            <w:pPr>
+              <w:spacing w:line="360" w:lineRule="auto"/>
+              <w:rPr>
+                <w:kern w:val="0"/>
+                <w:sz w:val="24"/>
+              </w:rPr>
+            </w:pPr>
+            <w:r>
+              <w:rPr>
+                <w:kern w:val="0"/>
+                <w:sz w:val="24"/>
+              </w:rPr>
+              <w:t>[12] Li S, Su Z. UBfuzz: Finding bugs in sanitizer implementations[C]//Proceedings of the 29th ACM International Conference on Architectural Support for Programming Languages and Operating Systems (ASPLOS). 2024.</w:t>
+            </w:r>
+          </w:p>
+          <w:p>
+            <w:pPr>
+              <w:spacing w:line="360" w:lineRule="auto"/>
+              <w:rPr>
+                <w:kern w:val="0"/>
+                <w:sz w:val="24"/>
+              </w:rPr>
+            </w:pPr>
+            <w:r>
+              <w:rPr>
+                <w:kern w:val="0"/>
+                <w:sz w:val="24"/>
+              </w:rPr>
+              <w:t>[13] Ma H, Shen Q, Tian Y, et al. Fuzzing deep learning compilers with HirGen[C]//Proceedings of the 32nd ACM SIGSOFT International Symposium on Software Testing and Analysis (ISSTA). 2023.</w:t>
+            </w:r>
+          </w:p>
+          <w:p>
+            <w:pPr>
+              <w:spacing w:line="360" w:lineRule="auto"/>
+              <w:rPr>
+                <w:kern w:val="0"/>
+                <w:sz w:val="24"/>
+              </w:rPr>
+            </w:pPr>
+            <w:r>
+              <w:rPr>
+                <w:kern w:val="0"/>
+                <w:sz w:val="24"/>
+              </w:rPr>
+              <w:t>[14] Even-Mendoza K, Sharma A, Donaldson A F, et al. GrayC: Greybox fuzzing of compilers and analysers for C[C]//Proceedings of the 32nd ACM SIGSOFT International Symposium on Software Testing and Analysis (ISSTA). 2023: 1219-1231.</w:t>
+            </w:r>
+          </w:p>
+          <w:p>
+            <w:pPr>
+              <w:spacing w:line="360" w:lineRule="auto"/>
+              <w:rPr>
+                <w:kern w:val="0"/>
+                <w:sz w:val="24"/>
+              </w:rPr>
+            </w:pPr>
+            <w:r>
+              <w:rPr>
+                <w:kern w:val="0"/>
+                <w:sz w:val="24"/>
+              </w:rPr>
+              <w:t>[15] Yang Y, Zhang H, Ren Z, et al. Hybrid language processor fuzzing via LLM-based constraint solving[C]//Proceedings of the 34th USENIX Security Symposium (USENIX Security). 2025.</w:t>
+            </w:r>
+          </w:p>
+          <w:p>
+            <w:pPr>
+              <w:spacing w:line="360" w:lineRule="auto"/>
+              <w:rPr>
+                <w:kern w:val="0"/>
+                <w:sz w:val="24"/>
+              </w:rPr>
+            </w:pPr>
+            <w:r>
+              <w:rPr>
+                <w:kern w:val="0"/>
+                <w:sz w:val="24"/>
+              </w:rPr>
+              <w:t>[16] Meta Security. CVE-2023-4039: GCC's -fstack-protector fails to guard dynamic stack allocations on AArch64[EB/OL]. (2023)[2026-02-15]. https://rtx.meta.security/mitigation/2023/09/12/CVE-2023-4039.html.</w:t>
             </w:r>
           </w:p>
         </w:tc>
@@ -4190,20 +4251,19 @@
           </w:tcPr>
           <w:p>
             <w:pPr>
-              <w:pStyle w:val="Normal"/>
-              <w:spacing w:lineRule="auto" w:line="360"/>
-              <w:ind w:firstLineChars="200" w:startChars="0" w:start="0" w:endChars="0" w:end="0"/>
-              <w:rPr>
-                <w:kern w:val="0"/>
-                <w:sz w:val="24"/>
-              </w:rPr>
-            </w:pPr>
-            <w:r>
-              <w:rPr>
-                <w:kern w:val="0"/>
-                <w:sz w:val="24"/>
-              </w:rPr>
-              <w:t xml:space="preserve">理论分析涉及三方面：编译器主流防御机制的安全不变量及其证据形式、覆盖率与控制流图引导的目标基本块选择策略、大模型生成能力与预言机判定的耦合方式。预期产出包括：一套覆盖至少三种主流防御机制的不变量集合、一套可扩展的预言机框架、一个可面向 GCC 与 LLVM 跨架构运行的 fuzzer 原型；通过在 GCC 与 LLVM 主流版本上发现真实 silent failure 来验证有效性。硬件方面，开发与实验依托一台 64 位 Linux 工作站（不少于 32 GB 内存、百 GB 级 SSD），用于 GCC / LLVM 多版本本地构建、覆盖率数据缓存与跨架构 QEMU 用户态执行；大模型推理通过远程 API 完成，本机不需要独立 GPU。</w:t>
+              <w:spacing w:line="360" w:lineRule="auto"/>
+              <w:ind w:left="0" w:leftChars="0" w:right="0" w:rightChars="0" w:firstLineChars="200"/>
+              <w:rPr>
+                <w:kern w:val="0"/>
+                <w:sz w:val="24"/>
+              </w:rPr>
+            </w:pPr>
+            <w:r>
+              <w:rPr>
+                <w:kern w:val="0"/>
+                <w:sz w:val="24"/>
+              </w:rPr>
+              <w:t>理论分析涉及三方面：编译器主流防御机制的安全不变量及其证据形式、覆盖率与控制流图引导的目标基本块选择策略、大模型生成能力与预言机判定的耦合方式。预期产出包括：一套覆盖至少三种主流防御机制的不变量集合、一套可扩展的预言机框架、一个可面向 GCC 与 LLVM 跨架构运行的 fuzzer 原型；通过在 GCC 与 LLVM 主流版本上发现真实 silent failure 来验证有效性。硬件方面，开发与实验依托一台 64 位 Linux 工作站（不少于 32 GB 内存、百 GB 级 SSD），用于 GCC / LLVM 多版本本地构建、覆盖率数据缓存与跨架构 QEMU 用户态执行；大模型推理通过远程 API 完成，本机不需要独立 GPU。</w:t>
             </w:r>
           </w:p>
         </w:tc>
@@ -4240,7 +4300,7 @@
       </w:tblPr>
       <w:tblGrid>
         <w:gridCol w:w="2124"/>
-        <w:gridCol w:w="5283"/>
+        <w:gridCol w:w="5282"/>
         <w:gridCol w:w="2349"/>
       </w:tblGrid>
       <w:tr>
@@ -4345,24 +4405,32 @@
         </w:tc>
       </w:tr>
       <w:tr>
+        <w:tblPrEx>
+          <w:tblCellMar>
+            <w:top w:w="0" w:type="dxa"/>
+            <w:left w:w="108" w:type="dxa"/>
+            <w:bottom w:w="0" w:type="dxa"/>
+            <w:right w:w="108" w:type="dxa"/>
+          </w:tblCellMar>
+        </w:tblPrEx>
         <w:trPr>
           <w:trHeight w:val="480" w:hRule="atLeast"/>
+          <w:jc w:val="center"/>
         </w:trPr>
         <w:tc>
           <w:tcPr>
             <w:tcW w:w="2077" w:type="dxa"/>
             <w:tcBorders>
-              <w:top w:val="single" w:sz="4" w:space="0" w:color="000000"/>
-              <w:start w:val="single" w:sz="4" w:space="0" w:color="000000"/>
-              <w:bottom w:val="single" w:sz="4" w:space="0" w:color="000000"/>
-              <w:end w:val="single" w:sz="4" w:space="0" w:color="000000"/>
+              <w:top w:val="single" w:color="000000" w:sz="4" w:space="0"/>
+              <w:left w:val="single" w:color="000000" w:sz="4" w:space="0"/>
+              <w:bottom w:val="single" w:color="000000" w:sz="4" w:space="0"/>
+              <w:right w:val="single" w:color="000000" w:sz="4" w:space="0"/>
             </w:tcBorders>
             <w:vAlign w:val="center"/>
           </w:tcPr>
           <w:p>
             <w:pPr>
-              <w:pStyle w:val="Normal"/>
-              <w:spacing w:lineRule="exact" w:line="320"/>
+              <w:spacing w:line="320" w:lineRule="exact"/>
               <w:jc w:val="center"/>
               <w:rPr>
                 <w:rFonts w:ascii="宋体" w:hAnsi="宋体" w:eastAsia="宋体"/>
@@ -4374,7 +4442,7 @@
                 <w:rFonts w:ascii="宋体" w:hAnsi="宋体" w:eastAsia="宋体"/>
                 <w:sz w:val="24"/>
               </w:rPr>
-              <w:t xml:space="preserve">2026.02-2026.03</w:t>
+              <w:t>2026.02-2026.03</w:t>
             </w:r>
           </w:p>
         </w:tc>
@@ -4382,17 +4450,16 @@
           <w:tcPr>
             <w:tcW w:w="5167" w:type="dxa"/>
             <w:tcBorders>
-              <w:top w:val="single" w:sz="4" w:space="0" w:color="000000"/>
-              <w:start w:val="single" w:sz="4" w:space="0" w:color="000000"/>
-              <w:bottom w:val="single" w:sz="4" w:space="0" w:color="000000"/>
-              <w:end w:val="single" w:sz="4" w:space="0" w:color="000000"/>
+              <w:top w:val="single" w:color="000000" w:sz="4" w:space="0"/>
+              <w:left w:val="single" w:color="000000" w:sz="4" w:space="0"/>
+              <w:bottom w:val="single" w:color="000000" w:sz="4" w:space="0"/>
+              <w:right w:val="single" w:color="000000" w:sz="4" w:space="0"/>
             </w:tcBorders>
             <w:vAlign w:val="center"/>
           </w:tcPr>
           <w:p>
             <w:pPr>
-              <w:pStyle w:val="Normal"/>
-              <w:spacing w:lineRule="exact" w:line="320"/>
+              <w:spacing w:line="320" w:lineRule="exact"/>
               <w:jc w:val="center"/>
               <w:rPr>
                 <w:rFonts w:ascii="宋体" w:hAnsi="宋体" w:eastAsia="宋体"/>
@@ -4404,7 +4471,7 @@
                 <w:rFonts w:ascii="宋体" w:hAnsi="宋体" w:eastAsia="宋体"/>
                 <w:sz w:val="24"/>
               </w:rPr>
-              <w:t xml:space="preserve">完成防御机制不变量调研，建立统一记录格式</w:t>
+              <w:t>完成防御机制不变量调研，建立统一记录格式</w:t>
             </w:r>
           </w:p>
         </w:tc>
@@ -4412,52 +4479,52 @@
           <w:tcPr>
             <w:tcW w:w="2297" w:type="dxa"/>
             <w:tcBorders>
-              <w:top w:val="single" w:sz="4" w:space="0" w:color="000000"/>
-              <w:start w:val="single" w:sz="4" w:space="0" w:color="000000"/>
-              <w:bottom w:val="single" w:sz="4" w:space="0" w:color="000000"/>
-              <w:end w:val="single" w:sz="4" w:space="0" w:color="000000"/>
+              <w:top w:val="single" w:color="000000" w:sz="4" w:space="0"/>
+              <w:left w:val="single" w:color="000000" w:sz="4" w:space="0"/>
+              <w:bottom w:val="single" w:color="000000" w:sz="4" w:space="0"/>
+              <w:right w:val="single" w:color="000000" w:sz="4" w:space="0"/>
             </w:tcBorders>
             <w:vAlign w:val="center"/>
           </w:tcPr>
           <w:p>
             <w:pPr>
-              <w:pStyle w:val="Normal"/>
-              <w:spacing w:lineRule="exact" w:line="320"/>
+              <w:spacing w:line="320" w:lineRule="exact"/>
               <w:jc w:val="center"/>
               <w:rPr>
                 <w:rFonts w:ascii="宋体" w:hAnsi="宋体" w:eastAsia="宋体"/>
                 <w:sz w:val="24"/>
               </w:rPr>
             </w:pPr>
-            <w:r>
-              <w:rPr>
-                <w:rFonts w:ascii="宋体" w:hAnsi="宋体" w:eastAsia="宋体"/>
-                <w:sz w:val="24"/>
-              </w:rPr>
-              <w:t xml:space="preserve"/>
-            </w:r>
           </w:p>
         </w:tc>
       </w:tr>
       <w:tr>
+        <w:tblPrEx>
+          <w:tblCellMar>
+            <w:top w:w="0" w:type="dxa"/>
+            <w:left w:w="108" w:type="dxa"/>
+            <w:bottom w:w="0" w:type="dxa"/>
+            <w:right w:w="108" w:type="dxa"/>
+          </w:tblCellMar>
+        </w:tblPrEx>
         <w:trPr>
           <w:trHeight w:val="480" w:hRule="atLeast"/>
+          <w:jc w:val="center"/>
         </w:trPr>
         <w:tc>
           <w:tcPr>
             <w:tcW w:w="2077" w:type="dxa"/>
             <w:tcBorders>
-              <w:top w:val="single" w:sz="4" w:space="0" w:color="000000"/>
-              <w:start w:val="single" w:sz="4" w:space="0" w:color="000000"/>
-              <w:bottom w:val="single" w:sz="4" w:space="0" w:color="000000"/>
-              <w:end w:val="single" w:sz="4" w:space="0" w:color="000000"/>
+              <w:top w:val="single" w:color="000000" w:sz="4" w:space="0"/>
+              <w:left w:val="single" w:color="000000" w:sz="4" w:space="0"/>
+              <w:bottom w:val="single" w:color="000000" w:sz="4" w:space="0"/>
+              <w:right w:val="single" w:color="000000" w:sz="4" w:space="0"/>
             </w:tcBorders>
             <w:vAlign w:val="center"/>
           </w:tcPr>
           <w:p>
             <w:pPr>
-              <w:pStyle w:val="Normal"/>
-              <w:spacing w:lineRule="exact" w:line="320"/>
+              <w:spacing w:line="320" w:lineRule="exact"/>
               <w:jc w:val="center"/>
               <w:rPr>
                 <w:rFonts w:ascii="宋体" w:hAnsi="宋体" w:eastAsia="宋体"/>
@@ -4469,7 +4536,7 @@
                 <w:rFonts w:ascii="宋体" w:hAnsi="宋体" w:eastAsia="宋体"/>
                 <w:sz w:val="24"/>
               </w:rPr>
-              <w:t xml:space="preserve">2026.03-2026.04</w:t>
+              <w:t>2026.03-2026.04</w:t>
             </w:r>
           </w:p>
         </w:tc>
@@ -4477,17 +4544,16 @@
           <w:tcPr>
             <w:tcW w:w="5167" w:type="dxa"/>
             <w:tcBorders>
-              <w:top w:val="single" w:sz="4" w:space="0" w:color="000000"/>
-              <w:start w:val="single" w:sz="4" w:space="0" w:color="000000"/>
-              <w:bottom w:val="single" w:sz="4" w:space="0" w:color="000000"/>
-              <w:end w:val="single" w:sz="4" w:space="0" w:color="000000"/>
+              <w:top w:val="single" w:color="000000" w:sz="4" w:space="0"/>
+              <w:left w:val="single" w:color="000000" w:sz="4" w:space="0"/>
+              <w:bottom w:val="single" w:color="000000" w:sz="4" w:space="0"/>
+              <w:right w:val="single" w:color="000000" w:sz="4" w:space="0"/>
             </w:tcBorders>
             <w:vAlign w:val="center"/>
           </w:tcPr>
           <w:p>
             <w:pPr>
-              <w:pStyle w:val="Normal"/>
-              <w:spacing w:lineRule="exact" w:line="320"/>
+              <w:spacing w:line="320" w:lineRule="exact"/>
               <w:jc w:val="center"/>
               <w:rPr>
                 <w:rFonts w:ascii="宋体" w:hAnsi="宋体" w:eastAsia="宋体"/>
@@ -4499,7 +4565,7 @@
                 <w:rFonts w:ascii="宋体" w:hAnsi="宋体" w:eastAsia="宋体"/>
                 <w:sz w:val="24"/>
               </w:rPr>
-              <w:t xml:space="preserve">扩展预言机框架到 _FORTIFY_SOURCE 与 IBT，完善大模型提示词流水线</w:t>
+              <w:t>扩展预言机框架到 _FORTIFY_SOURCE 与 IBT，完善大模型提示词流水线</w:t>
             </w:r>
           </w:p>
         </w:tc>
@@ -4507,52 +4573,52 @@
           <w:tcPr>
             <w:tcW w:w="2297" w:type="dxa"/>
             <w:tcBorders>
-              <w:top w:val="single" w:sz="4" w:space="0" w:color="000000"/>
-              <w:start w:val="single" w:sz="4" w:space="0" w:color="000000"/>
-              <w:bottom w:val="single" w:sz="4" w:space="0" w:color="000000"/>
-              <w:end w:val="single" w:sz="4" w:space="0" w:color="000000"/>
+              <w:top w:val="single" w:color="000000" w:sz="4" w:space="0"/>
+              <w:left w:val="single" w:color="000000" w:sz="4" w:space="0"/>
+              <w:bottom w:val="single" w:color="000000" w:sz="4" w:space="0"/>
+              <w:right w:val="single" w:color="000000" w:sz="4" w:space="0"/>
             </w:tcBorders>
             <w:vAlign w:val="center"/>
           </w:tcPr>
           <w:p>
             <w:pPr>
-              <w:pStyle w:val="Normal"/>
-              <w:spacing w:lineRule="exact" w:line="320"/>
+              <w:spacing w:line="320" w:lineRule="exact"/>
               <w:jc w:val="center"/>
               <w:rPr>
                 <w:rFonts w:ascii="宋体" w:hAnsi="宋体" w:eastAsia="宋体"/>
                 <w:sz w:val="24"/>
               </w:rPr>
             </w:pPr>
-            <w:r>
-              <w:rPr>
-                <w:rFonts w:ascii="宋体" w:hAnsi="宋体" w:eastAsia="宋体"/>
-                <w:sz w:val="24"/>
-              </w:rPr>
-              <w:t xml:space="preserve"/>
-            </w:r>
           </w:p>
         </w:tc>
       </w:tr>
       <w:tr>
+        <w:tblPrEx>
+          <w:tblCellMar>
+            <w:top w:w="0" w:type="dxa"/>
+            <w:left w:w="108" w:type="dxa"/>
+            <w:bottom w:w="0" w:type="dxa"/>
+            <w:right w:w="108" w:type="dxa"/>
+          </w:tblCellMar>
+        </w:tblPrEx>
         <w:trPr>
           <w:trHeight w:val="480" w:hRule="atLeast"/>
+          <w:jc w:val="center"/>
         </w:trPr>
         <w:tc>
           <w:tcPr>
             <w:tcW w:w="2077" w:type="dxa"/>
             <w:tcBorders>
-              <w:top w:val="single" w:sz="4" w:space="0" w:color="000000"/>
-              <w:start w:val="single" w:sz="4" w:space="0" w:color="000000"/>
-              <w:bottom w:val="single" w:sz="4" w:space="0" w:color="000000"/>
-              <w:end w:val="single" w:sz="4" w:space="0" w:color="000000"/>
+              <w:top w:val="single" w:color="000000" w:sz="4" w:space="0"/>
+              <w:left w:val="single" w:color="000000" w:sz="4" w:space="0"/>
+              <w:bottom w:val="single" w:color="000000" w:sz="4" w:space="0"/>
+              <w:right w:val="single" w:color="000000" w:sz="4" w:space="0"/>
             </w:tcBorders>
             <w:vAlign w:val="center"/>
           </w:tcPr>
           <w:p>
             <w:pPr>
-              <w:pStyle w:val="Normal"/>
-              <w:spacing w:lineRule="exact" w:line="320"/>
+              <w:spacing w:line="320" w:lineRule="exact"/>
               <w:jc w:val="center"/>
               <w:rPr>
                 <w:rFonts w:ascii="宋体" w:hAnsi="宋体" w:eastAsia="宋体"/>
@@ -4564,7 +4630,7 @@
                 <w:rFonts w:ascii="宋体" w:hAnsi="宋体" w:eastAsia="宋体"/>
                 <w:sz w:val="24"/>
               </w:rPr>
-              <w:t xml:space="preserve">2026.04-2026.05</w:t>
+              <w:t>2026.04-2026.05</w:t>
             </w:r>
           </w:p>
         </w:tc>
@@ -4572,17 +4638,16 @@
           <w:tcPr>
             <w:tcW w:w="5167" w:type="dxa"/>
             <w:tcBorders>
-              <w:top w:val="single" w:sz="4" w:space="0" w:color="000000"/>
-              <w:start w:val="single" w:sz="4" w:space="0" w:color="000000"/>
-              <w:bottom w:val="single" w:sz="4" w:space="0" w:color="000000"/>
-              <w:end w:val="single" w:sz="4" w:space="0" w:color="000000"/>
+              <w:top w:val="single" w:color="000000" w:sz="4" w:space="0"/>
+              <w:left w:val="single" w:color="000000" w:sz="4" w:space="0"/>
+              <w:bottom w:val="single" w:color="000000" w:sz="4" w:space="0"/>
+              <w:right w:val="single" w:color="000000" w:sz="4" w:space="0"/>
             </w:tcBorders>
             <w:vAlign w:val="center"/>
           </w:tcPr>
           <w:p>
             <w:pPr>
-              <w:pStyle w:val="Normal"/>
-              <w:spacing w:lineRule="exact" w:line="320"/>
+              <w:spacing w:line="320" w:lineRule="exact"/>
               <w:jc w:val="center"/>
               <w:rPr>
                 <w:rFonts w:ascii="宋体" w:hAnsi="宋体" w:eastAsia="宋体"/>
@@ -4594,7 +4659,7 @@
                 <w:rFonts w:ascii="宋体" w:hAnsi="宋体" w:eastAsia="宋体"/>
                 <w:sz w:val="24"/>
               </w:rPr>
-              <w:t xml:space="preserve">跨架构 flag profile 实验框架定型，在 GCC 上完成全机制端到端实验</w:t>
+              <w:t>跨架构 flag profile 实验框架定型，在 GCC 上完成全机制端到端实验</w:t>
             </w:r>
           </w:p>
         </w:tc>
@@ -4602,52 +4667,52 @@
           <w:tcPr>
             <w:tcW w:w="2297" w:type="dxa"/>
             <w:tcBorders>
-              <w:top w:val="single" w:sz="4" w:space="0" w:color="000000"/>
-              <w:start w:val="single" w:sz="4" w:space="0" w:color="000000"/>
-              <w:bottom w:val="single" w:sz="4" w:space="0" w:color="000000"/>
-              <w:end w:val="single" w:sz="4" w:space="0" w:color="000000"/>
+              <w:top w:val="single" w:color="000000" w:sz="4" w:space="0"/>
+              <w:left w:val="single" w:color="000000" w:sz="4" w:space="0"/>
+              <w:bottom w:val="single" w:color="000000" w:sz="4" w:space="0"/>
+              <w:right w:val="single" w:color="000000" w:sz="4" w:space="0"/>
             </w:tcBorders>
             <w:vAlign w:val="center"/>
           </w:tcPr>
           <w:p>
             <w:pPr>
-              <w:pStyle w:val="Normal"/>
-              <w:spacing w:lineRule="exact" w:line="320"/>
+              <w:spacing w:line="320" w:lineRule="exact"/>
               <w:jc w:val="center"/>
               <w:rPr>
                 <w:rFonts w:ascii="宋体" w:hAnsi="宋体" w:eastAsia="宋体"/>
                 <w:sz w:val="24"/>
               </w:rPr>
             </w:pPr>
-            <w:r>
-              <w:rPr>
-                <w:rFonts w:ascii="宋体" w:hAnsi="宋体" w:eastAsia="宋体"/>
-                <w:sz w:val="24"/>
-              </w:rPr>
-              <w:t xml:space="preserve"/>
-            </w:r>
           </w:p>
         </w:tc>
       </w:tr>
       <w:tr>
+        <w:tblPrEx>
+          <w:tblCellMar>
+            <w:top w:w="0" w:type="dxa"/>
+            <w:left w:w="108" w:type="dxa"/>
+            <w:bottom w:w="0" w:type="dxa"/>
+            <w:right w:w="108" w:type="dxa"/>
+          </w:tblCellMar>
+        </w:tblPrEx>
         <w:trPr>
           <w:trHeight w:val="480" w:hRule="atLeast"/>
+          <w:jc w:val="center"/>
         </w:trPr>
         <w:tc>
           <w:tcPr>
             <w:tcW w:w="2077" w:type="dxa"/>
             <w:tcBorders>
-              <w:top w:val="single" w:sz="4" w:space="0" w:color="000000"/>
-              <w:start w:val="single" w:sz="4" w:space="0" w:color="000000"/>
-              <w:bottom w:val="single" w:sz="4" w:space="0" w:color="000000"/>
-              <w:end w:val="single" w:sz="4" w:space="0" w:color="000000"/>
+              <w:top w:val="single" w:color="000000" w:sz="4" w:space="0"/>
+              <w:left w:val="single" w:color="000000" w:sz="4" w:space="0"/>
+              <w:bottom w:val="single" w:color="000000" w:sz="4" w:space="0"/>
+              <w:right w:val="single" w:color="000000" w:sz="4" w:space="0"/>
             </w:tcBorders>
             <w:vAlign w:val="center"/>
           </w:tcPr>
           <w:p>
             <w:pPr>
-              <w:pStyle w:val="Normal"/>
-              <w:spacing w:lineRule="exact" w:line="320"/>
+              <w:spacing w:line="320" w:lineRule="exact"/>
               <w:jc w:val="center"/>
               <w:rPr>
                 <w:rFonts w:ascii="宋体" w:hAnsi="宋体" w:eastAsia="宋体"/>
@@ -4659,7 +4724,7 @@
                 <w:rFonts w:ascii="宋体" w:hAnsi="宋体" w:eastAsia="宋体"/>
                 <w:sz w:val="24"/>
               </w:rPr>
-              <w:t xml:space="preserve">2026.04-2026.05</w:t>
+              <w:t>2026.04-2026.05</w:t>
             </w:r>
           </w:p>
         </w:tc>
@@ -4667,17 +4732,16 @@
           <w:tcPr>
             <w:tcW w:w="5167" w:type="dxa"/>
             <w:tcBorders>
-              <w:top w:val="single" w:sz="4" w:space="0" w:color="000000"/>
-              <w:start w:val="single" w:sz="4" w:space="0" w:color="000000"/>
-              <w:bottom w:val="single" w:sz="4" w:space="0" w:color="000000"/>
-              <w:end w:val="single" w:sz="4" w:space="0" w:color="000000"/>
+              <w:top w:val="single" w:color="000000" w:sz="4" w:space="0"/>
+              <w:left w:val="single" w:color="000000" w:sz="4" w:space="0"/>
+              <w:bottom w:val="single" w:color="000000" w:sz="4" w:space="0"/>
+              <w:right w:val="single" w:color="000000" w:sz="4" w:space="0"/>
             </w:tcBorders>
             <w:vAlign w:val="center"/>
           </w:tcPr>
           <w:p>
             <w:pPr>
-              <w:pStyle w:val="Normal"/>
-              <w:spacing w:lineRule="exact" w:line="320"/>
+              <w:spacing w:line="320" w:lineRule="exact"/>
               <w:jc w:val="center"/>
               <w:rPr>
                 <w:rFonts w:ascii="宋体" w:hAnsi="宋体" w:eastAsia="宋体"/>
@@ -4689,7 +4753,7 @@
                 <w:rFonts w:ascii="宋体" w:hAnsi="宋体" w:eastAsia="宋体"/>
                 <w:sz w:val="24"/>
               </w:rPr>
-              <w:t xml:space="preserve">把编译器子系统与覆盖率适配层扩展到 LLVM 工具链</w:t>
+              <w:t>把编译器子系统与覆盖率适配层扩展到 LLVM 工具链</w:t>
             </w:r>
           </w:p>
         </w:tc>
@@ -4697,52 +4761,52 @@
           <w:tcPr>
             <w:tcW w:w="2297" w:type="dxa"/>
             <w:tcBorders>
-              <w:top w:val="single" w:sz="4" w:space="0" w:color="000000"/>
-              <w:start w:val="single" w:sz="4" w:space="0" w:color="000000"/>
-              <w:bottom w:val="single" w:sz="4" w:space="0" w:color="000000"/>
-              <w:end w:val="single" w:sz="4" w:space="0" w:color="000000"/>
+              <w:top w:val="single" w:color="000000" w:sz="4" w:space="0"/>
+              <w:left w:val="single" w:color="000000" w:sz="4" w:space="0"/>
+              <w:bottom w:val="single" w:color="000000" w:sz="4" w:space="0"/>
+              <w:right w:val="single" w:color="000000" w:sz="4" w:space="0"/>
             </w:tcBorders>
             <w:vAlign w:val="center"/>
           </w:tcPr>
           <w:p>
             <w:pPr>
-              <w:pStyle w:val="Normal"/>
-              <w:spacing w:lineRule="exact" w:line="320"/>
+              <w:spacing w:line="320" w:lineRule="exact"/>
               <w:jc w:val="center"/>
               <w:rPr>
                 <w:rFonts w:ascii="宋体" w:hAnsi="宋体" w:eastAsia="宋体"/>
                 <w:sz w:val="24"/>
               </w:rPr>
             </w:pPr>
-            <w:r>
-              <w:rPr>
-                <w:rFonts w:ascii="宋体" w:hAnsi="宋体" w:eastAsia="宋体"/>
-                <w:sz w:val="24"/>
-              </w:rPr>
-              <w:t xml:space="preserve"/>
-            </w:r>
           </w:p>
         </w:tc>
       </w:tr>
       <w:tr>
+        <w:tblPrEx>
+          <w:tblCellMar>
+            <w:top w:w="0" w:type="dxa"/>
+            <w:left w:w="108" w:type="dxa"/>
+            <w:bottom w:w="0" w:type="dxa"/>
+            <w:right w:w="108" w:type="dxa"/>
+          </w:tblCellMar>
+        </w:tblPrEx>
         <w:trPr>
           <w:trHeight w:val="480" w:hRule="atLeast"/>
+          <w:jc w:val="center"/>
         </w:trPr>
         <w:tc>
           <w:tcPr>
             <w:tcW w:w="2077" w:type="dxa"/>
             <w:tcBorders>
-              <w:top w:val="single" w:sz="4" w:space="0" w:color="000000"/>
-              <w:start w:val="single" w:sz="4" w:space="0" w:color="000000"/>
-              <w:bottom w:val="single" w:sz="4" w:space="0" w:color="000000"/>
-              <w:end w:val="single" w:sz="4" w:space="0" w:color="000000"/>
+              <w:top w:val="single" w:color="000000" w:sz="4" w:space="0"/>
+              <w:left w:val="single" w:color="000000" w:sz="4" w:space="0"/>
+              <w:bottom w:val="single" w:color="000000" w:sz="4" w:space="0"/>
+              <w:right w:val="single" w:color="000000" w:sz="4" w:space="0"/>
             </w:tcBorders>
             <w:vAlign w:val="center"/>
           </w:tcPr>
           <w:p>
             <w:pPr>
-              <w:pStyle w:val="Normal"/>
-              <w:spacing w:lineRule="exact" w:line="320"/>
+              <w:spacing w:line="320" w:lineRule="exact"/>
               <w:jc w:val="center"/>
               <w:rPr>
                 <w:rFonts w:ascii="宋体" w:hAnsi="宋体" w:eastAsia="宋体"/>
@@ -4754,7 +4818,7 @@
                 <w:rFonts w:ascii="宋体" w:hAnsi="宋体" w:eastAsia="宋体"/>
                 <w:sz w:val="24"/>
               </w:rPr>
-              <w:t xml:space="preserve">2026.05-2026.06</w:t>
+              <w:t>2026.05-2026.06</w:t>
             </w:r>
           </w:p>
         </w:tc>
@@ -4762,17 +4826,16 @@
           <w:tcPr>
             <w:tcW w:w="5167" w:type="dxa"/>
             <w:tcBorders>
-              <w:top w:val="single" w:sz="4" w:space="0" w:color="000000"/>
-              <w:start w:val="single" w:sz="4" w:space="0" w:color="000000"/>
-              <w:bottom w:val="single" w:sz="4" w:space="0" w:color="000000"/>
-              <w:end w:val="single" w:sz="4" w:space="0" w:color="000000"/>
+              <w:top w:val="single" w:color="000000" w:sz="4" w:space="0"/>
+              <w:left w:val="single" w:color="000000" w:sz="4" w:space="0"/>
+              <w:bottom w:val="single" w:color="000000" w:sz="4" w:space="0"/>
+              <w:right w:val="single" w:color="000000" w:sz="4" w:space="0"/>
             </w:tcBorders>
             <w:vAlign w:val="center"/>
           </w:tcPr>
           <w:p>
             <w:pPr>
-              <w:pStyle w:val="Normal"/>
-              <w:spacing w:lineRule="exact" w:line="320"/>
+              <w:spacing w:line="320" w:lineRule="exact"/>
               <w:jc w:val="center"/>
               <w:rPr>
                 <w:rFonts w:ascii="宋体" w:hAnsi="宋体" w:eastAsia="宋体"/>
@@ -4784,7 +4847,7 @@
                 <w:rFonts w:ascii="宋体" w:hAnsi="宋体" w:eastAsia="宋体"/>
                 <w:sz w:val="24"/>
               </w:rPr>
-              <w:t xml:space="preserve">在 LLVM 上复用预言机框架开展对照实验，形成缺陷上报闭环</w:t>
+              <w:t>在 LLVM 上复用预言机框架开展对照实验，形成缺陷上报闭环</w:t>
             </w:r>
           </w:p>
         </w:tc>
@@ -4792,52 +4855,52 @@
           <w:tcPr>
             <w:tcW w:w="2297" w:type="dxa"/>
             <w:tcBorders>
-              <w:top w:val="single" w:sz="4" w:space="0" w:color="000000"/>
-              <w:start w:val="single" w:sz="4" w:space="0" w:color="000000"/>
-              <w:bottom w:val="single" w:sz="4" w:space="0" w:color="000000"/>
-              <w:end w:val="single" w:sz="4" w:space="0" w:color="000000"/>
+              <w:top w:val="single" w:color="000000" w:sz="4" w:space="0"/>
+              <w:left w:val="single" w:color="000000" w:sz="4" w:space="0"/>
+              <w:bottom w:val="single" w:color="000000" w:sz="4" w:space="0"/>
+              <w:right w:val="single" w:color="000000" w:sz="4" w:space="0"/>
             </w:tcBorders>
             <w:vAlign w:val="center"/>
           </w:tcPr>
           <w:p>
             <w:pPr>
-              <w:pStyle w:val="Normal"/>
-              <w:spacing w:lineRule="exact" w:line="320"/>
+              <w:spacing w:line="320" w:lineRule="exact"/>
               <w:jc w:val="center"/>
               <w:rPr>
                 <w:rFonts w:ascii="宋体" w:hAnsi="宋体" w:eastAsia="宋体"/>
                 <w:sz w:val="24"/>
               </w:rPr>
             </w:pPr>
-            <w:r>
-              <w:rPr>
-                <w:rFonts w:ascii="宋体" w:hAnsi="宋体" w:eastAsia="宋体"/>
-                <w:sz w:val="24"/>
-              </w:rPr>
-              <w:t xml:space="preserve"/>
-            </w:r>
           </w:p>
         </w:tc>
       </w:tr>
       <w:tr>
+        <w:tblPrEx>
+          <w:tblCellMar>
+            <w:top w:w="0" w:type="dxa"/>
+            <w:left w:w="108" w:type="dxa"/>
+            <w:bottom w:w="0" w:type="dxa"/>
+            <w:right w:w="108" w:type="dxa"/>
+          </w:tblCellMar>
+        </w:tblPrEx>
         <w:trPr>
           <w:trHeight w:val="480" w:hRule="atLeast"/>
+          <w:jc w:val="center"/>
         </w:trPr>
         <w:tc>
           <w:tcPr>
             <w:tcW w:w="2077" w:type="dxa"/>
             <w:tcBorders>
-              <w:top w:val="single" w:sz="4" w:space="0" w:color="000000"/>
-              <w:start w:val="single" w:sz="4" w:space="0" w:color="000000"/>
-              <w:bottom w:val="single" w:sz="4" w:space="0" w:color="000000"/>
-              <w:end w:val="single" w:sz="4" w:space="0" w:color="000000"/>
+              <w:top w:val="single" w:color="000000" w:sz="4" w:space="0"/>
+              <w:left w:val="single" w:color="000000" w:sz="4" w:space="0"/>
+              <w:bottom w:val="single" w:color="000000" w:sz="4" w:space="0"/>
+              <w:right w:val="single" w:color="000000" w:sz="4" w:space="0"/>
             </w:tcBorders>
             <w:vAlign w:val="center"/>
           </w:tcPr>
           <w:p>
             <w:pPr>
-              <w:pStyle w:val="Normal"/>
-              <w:spacing w:lineRule="exact" w:line="320"/>
+              <w:spacing w:line="320" w:lineRule="exact"/>
               <w:jc w:val="center"/>
               <w:rPr>
                 <w:rFonts w:ascii="宋体" w:hAnsi="宋体" w:eastAsia="宋体"/>
@@ -4849,7 +4912,7 @@
                 <w:rFonts w:ascii="宋体" w:hAnsi="宋体" w:eastAsia="宋体"/>
                 <w:sz w:val="24"/>
               </w:rPr>
-              <w:t xml:space="preserve">2026.05-2026.06</w:t>
+              <w:t>2026.05-2026.06</w:t>
             </w:r>
           </w:p>
         </w:tc>
@@ -4857,17 +4920,16 @@
           <w:tcPr>
             <w:tcW w:w="5167" w:type="dxa"/>
             <w:tcBorders>
-              <w:top w:val="single" w:sz="4" w:space="0" w:color="000000"/>
-              <w:start w:val="single" w:sz="4" w:space="0" w:color="000000"/>
-              <w:bottom w:val="single" w:sz="4" w:space="0" w:color="000000"/>
-              <w:end w:val="single" w:sz="4" w:space="0" w:color="000000"/>
+              <w:top w:val="single" w:color="000000" w:sz="4" w:space="0"/>
+              <w:left w:val="single" w:color="000000" w:sz="4" w:space="0"/>
+              <w:bottom w:val="single" w:color="000000" w:sz="4" w:space="0"/>
+              <w:right w:val="single" w:color="000000" w:sz="4" w:space="0"/>
             </w:tcBorders>
             <w:vAlign w:val="center"/>
           </w:tcPr>
           <w:p>
             <w:pPr>
-              <w:pStyle w:val="Normal"/>
-              <w:spacing w:lineRule="exact" w:line="320"/>
+              <w:spacing w:line="320" w:lineRule="exact"/>
               <w:jc w:val="center"/>
               <w:rPr>
                 <w:rFonts w:ascii="宋体" w:hAnsi="宋体" w:eastAsia="宋体"/>
@@ -4879,7 +4941,7 @@
                 <w:rFonts w:ascii="宋体" w:hAnsi="宋体" w:eastAsia="宋体"/>
                 <w:sz w:val="24"/>
               </w:rPr>
-              <w:t xml:space="preserve">撰写学位论文，整理实验数据与图表，准备投稿</w:t>
+              <w:t>撰写学位论文，整理实验数据与图表，准备投稿</w:t>
             </w:r>
           </w:p>
         </w:tc>
@@ -4887,52 +4949,52 @@
           <w:tcPr>
             <w:tcW w:w="2297" w:type="dxa"/>
             <w:tcBorders>
-              <w:top w:val="single" w:sz="4" w:space="0" w:color="000000"/>
-              <w:start w:val="single" w:sz="4" w:space="0" w:color="000000"/>
-              <w:bottom w:val="single" w:sz="4" w:space="0" w:color="000000"/>
-              <w:end w:val="single" w:sz="4" w:space="0" w:color="000000"/>
+              <w:top w:val="single" w:color="000000" w:sz="4" w:space="0"/>
+              <w:left w:val="single" w:color="000000" w:sz="4" w:space="0"/>
+              <w:bottom w:val="single" w:color="000000" w:sz="4" w:space="0"/>
+              <w:right w:val="single" w:color="000000" w:sz="4" w:space="0"/>
             </w:tcBorders>
             <w:vAlign w:val="center"/>
           </w:tcPr>
           <w:p>
             <w:pPr>
-              <w:pStyle w:val="Normal"/>
-              <w:spacing w:lineRule="exact" w:line="320"/>
+              <w:spacing w:line="320" w:lineRule="exact"/>
               <w:jc w:val="center"/>
               <w:rPr>
                 <w:rFonts w:ascii="宋体" w:hAnsi="宋体" w:eastAsia="宋体"/>
                 <w:sz w:val="24"/>
               </w:rPr>
             </w:pPr>
-            <w:r>
-              <w:rPr>
-                <w:rFonts w:ascii="宋体" w:hAnsi="宋体" w:eastAsia="宋体"/>
-                <w:sz w:val="24"/>
-              </w:rPr>
-              <w:t xml:space="preserve"/>
-            </w:r>
           </w:p>
         </w:tc>
       </w:tr>
       <w:tr>
+        <w:tblPrEx>
+          <w:tblCellMar>
+            <w:top w:w="0" w:type="dxa"/>
+            <w:left w:w="108" w:type="dxa"/>
+            <w:bottom w:w="0" w:type="dxa"/>
+            <w:right w:w="108" w:type="dxa"/>
+          </w:tblCellMar>
+        </w:tblPrEx>
         <w:trPr>
           <w:trHeight w:val="480" w:hRule="atLeast"/>
+          <w:jc w:val="center"/>
         </w:trPr>
         <w:tc>
           <w:tcPr>
             <w:tcW w:w="2077" w:type="dxa"/>
             <w:tcBorders>
-              <w:top w:val="single" w:sz="4" w:space="0" w:color="000000"/>
-              <w:start w:val="single" w:sz="4" w:space="0" w:color="000000"/>
-              <w:bottom w:val="single" w:sz="4" w:space="0" w:color="000000"/>
-              <w:end w:val="single" w:sz="4" w:space="0" w:color="000000"/>
+              <w:top w:val="single" w:color="000000" w:sz="4" w:space="0"/>
+              <w:left w:val="single" w:color="000000" w:sz="4" w:space="0"/>
+              <w:bottom w:val="single" w:color="000000" w:sz="4" w:space="0"/>
+              <w:right w:val="single" w:color="000000" w:sz="4" w:space="0"/>
             </w:tcBorders>
             <w:vAlign w:val="center"/>
           </w:tcPr>
           <w:p>
             <w:pPr>
-              <w:pStyle w:val="Normal"/>
-              <w:spacing w:lineRule="exact" w:line="320"/>
+              <w:spacing w:line="320" w:lineRule="exact"/>
               <w:jc w:val="center"/>
               <w:rPr>
                 <w:rFonts w:ascii="宋体" w:hAnsi="宋体" w:eastAsia="宋体"/>
@@ -4944,7 +5006,7 @@
                 <w:rFonts w:ascii="宋体" w:hAnsi="宋体" w:eastAsia="宋体"/>
                 <w:sz w:val="24"/>
               </w:rPr>
-              <w:t xml:space="preserve">2026.06</w:t>
+              <w:t>2026.06</w:t>
             </w:r>
           </w:p>
         </w:tc>
@@ -4952,17 +5014,16 @@
           <w:tcPr>
             <w:tcW w:w="5167" w:type="dxa"/>
             <w:tcBorders>
-              <w:top w:val="single" w:sz="4" w:space="0" w:color="000000"/>
-              <w:start w:val="single" w:sz="4" w:space="0" w:color="000000"/>
-              <w:bottom w:val="single" w:sz="4" w:space="0" w:color="000000"/>
-              <w:end w:val="single" w:sz="4" w:space="0" w:color="000000"/>
+              <w:top w:val="single" w:color="000000" w:sz="4" w:space="0"/>
+              <w:left w:val="single" w:color="000000" w:sz="4" w:space="0"/>
+              <w:bottom w:val="single" w:color="000000" w:sz="4" w:space="0"/>
+              <w:right w:val="single" w:color="000000" w:sz="4" w:space="0"/>
             </w:tcBorders>
             <w:vAlign w:val="center"/>
           </w:tcPr>
           <w:p>
             <w:pPr>
-              <w:pStyle w:val="Normal"/>
-              <w:spacing w:lineRule="exact" w:line="320"/>
+              <w:spacing w:line="320" w:lineRule="exact"/>
               <w:jc w:val="center"/>
               <w:rPr>
                 <w:rFonts w:ascii="宋体" w:hAnsi="宋体" w:eastAsia="宋体"/>
@@ -4974,7 +5035,7 @@
                 <w:rFonts w:ascii="宋体" w:hAnsi="宋体" w:eastAsia="宋体"/>
                 <w:sz w:val="24"/>
               </w:rPr>
-              <w:t xml:space="preserve">学位论文答辩</w:t>
+              <w:t>学位论文答辩</w:t>
             </w:r>
           </w:p>
         </w:tc>
@@ -4982,30 +5043,22 @@
           <w:tcPr>
             <w:tcW w:w="2297" w:type="dxa"/>
             <w:tcBorders>
-              <w:top w:val="single" w:sz="4" w:space="0" w:color="000000"/>
-              <w:start w:val="single" w:sz="4" w:space="0" w:color="000000"/>
-              <w:bottom w:val="single" w:sz="4" w:space="0" w:color="000000"/>
-              <w:end w:val="single" w:sz="4" w:space="0" w:color="000000"/>
+              <w:top w:val="single" w:color="000000" w:sz="4" w:space="0"/>
+              <w:left w:val="single" w:color="000000" w:sz="4" w:space="0"/>
+              <w:bottom w:val="single" w:color="000000" w:sz="4" w:space="0"/>
+              <w:right w:val="single" w:color="000000" w:sz="4" w:space="0"/>
             </w:tcBorders>
             <w:vAlign w:val="center"/>
           </w:tcPr>
           <w:p>
             <w:pPr>
-              <w:pStyle w:val="Normal"/>
-              <w:spacing w:lineRule="exact" w:line="320"/>
+              <w:spacing w:line="320" w:lineRule="exact"/>
               <w:jc w:val="center"/>
               <w:rPr>
                 <w:rFonts w:ascii="宋体" w:hAnsi="宋体" w:eastAsia="宋体"/>
                 <w:sz w:val="24"/>
               </w:rPr>
             </w:pPr>
-            <w:r>
-              <w:rPr>
-                <w:rFonts w:ascii="宋体" w:hAnsi="宋体" w:eastAsia="宋体"/>
-                <w:sz w:val="24"/>
-              </w:rPr>
-              <w:t xml:space="preserve"/>
-            </w:r>
           </w:p>
         </w:tc>
       </w:tr>
@@ -6679,8 +6732,8 @@
     <w:lsdException w:unhideWhenUsed="0" w:uiPriority="0" w:semiHidden="0" w:name="Normal Indent"/>
     <w:lsdException w:unhideWhenUsed="0" w:uiPriority="0" w:semiHidden="0" w:name="footnote text"/>
     <w:lsdException w:unhideWhenUsed="0" w:uiPriority="0" w:semiHidden="0" w:name="annotation text"/>
-    <w:lsdException w:unhideWhenUsed="0" w:uiPriority="0" w:semiHidden="0" w:name="header"/>
-    <w:lsdException w:unhideWhenUsed="0" w:uiPriority="0" w:semiHidden="0" w:name="footer"/>
+    <w:lsdException w:qFormat="1" w:unhideWhenUsed="0" w:uiPriority="0" w:semiHidden="0" w:name="header"/>
+    <w:lsdException w:qFormat="1" w:unhideWhenUsed="0" w:uiPriority="0" w:semiHidden="0" w:name="footer"/>
     <w:lsdException w:unhideWhenUsed="0" w:uiPriority="0" w:semiHidden="0" w:name="index heading"/>
     <w:lsdException w:qFormat="1" w:unhideWhenUsed="0" w:uiPriority="0" w:semiHidden="0" w:name="caption"/>
     <w:lsdException w:unhideWhenUsed="0" w:uiPriority="0" w:semiHidden="0" w:name="table of figures"/>
@@ -6689,13 +6742,13 @@
     <w:lsdException w:unhideWhenUsed="0" w:uiPriority="0" w:semiHidden="0" w:name="footnote reference"/>
     <w:lsdException w:unhideWhenUsed="0" w:uiPriority="0" w:semiHidden="0" w:name="annotation reference"/>
     <w:lsdException w:unhideWhenUsed="0" w:uiPriority="0" w:semiHidden="0" w:name="line number"/>
-    <w:lsdException w:unhideWhenUsed="0" w:uiPriority="0" w:semiHidden="0" w:name="page number"/>
+    <w:lsdException w:qFormat="1" w:unhideWhenUsed="0" w:uiPriority="0" w:semiHidden="0" w:name="page number"/>
     <w:lsdException w:unhideWhenUsed="0" w:uiPriority="0" w:semiHidden="0" w:name="endnote reference"/>
     <w:lsdException w:unhideWhenUsed="0" w:uiPriority="0" w:semiHidden="0" w:name="endnote text"/>
     <w:lsdException w:unhideWhenUsed="0" w:uiPriority="0" w:semiHidden="0" w:name="table of authorities"/>
     <w:lsdException w:unhideWhenUsed="0" w:uiPriority="0" w:semiHidden="0" w:name="macro"/>
     <w:lsdException w:unhideWhenUsed="0" w:uiPriority="0" w:semiHidden="0" w:name="toa heading"/>
-    <w:lsdException w:unhideWhenUsed="0" w:uiPriority="0" w:semiHidden="0" w:name="List"/>
+    <w:lsdException w:qFormat="1" w:unhideWhenUsed="0" w:uiPriority="0" w:semiHidden="0" w:name="List"/>
     <w:lsdException w:unhideWhenUsed="0" w:uiPriority="0" w:semiHidden="0" w:name="List Bullet"/>
     <w:lsdException w:unhideWhenUsed="0" w:uiPriority="0" w:semiHidden="0" w:name="List Number"/>
     <w:lsdException w:unhideWhenUsed="0" w:uiPriority="0" w:semiHidden="0" w:name="List 2"/>
@@ -6733,7 +6786,7 @@
     <w:lsdException w:unhideWhenUsed="0" w:uiPriority="0" w:semiHidden="0" w:name="Body Text Indent 2"/>
     <w:lsdException w:unhideWhenUsed="0" w:uiPriority="0" w:semiHidden="0" w:name="Body Text Indent 3"/>
     <w:lsdException w:unhideWhenUsed="0" w:uiPriority="0" w:semiHidden="0" w:name="Block Text"/>
-    <w:lsdException w:unhideWhenUsed="0" w:uiPriority="0" w:semiHidden="0" w:name="Hyperlink"/>
+    <w:lsdException w:qFormat="1" w:unhideWhenUsed="0" w:uiPriority="0" w:semiHidden="0" w:name="Hyperlink"/>
     <w:lsdException w:unhideWhenUsed="0" w:uiPriority="0" w:semiHidden="0" w:name="FollowedHyperlink"/>
     <w:lsdException w:qFormat="1" w:unhideWhenUsed="0" w:uiPriority="0" w:semiHidden="0" w:name="Strong"/>
     <w:lsdException w:qFormat="1" w:unhideWhenUsed="0" w:uiPriority="0" w:semiHidden="0" w:name="Emphasis"/>
@@ -6751,7 +6804,7 @@
     <w:lsdException w:unhideWhenUsed="0" w:uiPriority="0" w:semiHidden="0" w:name="HTML Sample"/>
     <w:lsdException w:unhideWhenUsed="0" w:uiPriority="0" w:semiHidden="0" w:name="HTML Typewriter"/>
     <w:lsdException w:unhideWhenUsed="0" w:uiPriority="0" w:semiHidden="0" w:name="HTML Variable"/>
-    <w:lsdException w:unhideWhenUsed="0" w:uiPriority="0" w:name="Normal Table"/>
+    <w:lsdException w:qFormat="1" w:unhideWhenUsed="0" w:uiPriority="0" w:name="Normal Table"/>
     <w:lsdException w:unhideWhenUsed="0" w:uiPriority="0" w:semiHidden="0" w:name="annotation subject"/>
     <w:lsdException w:unhideWhenUsed="0" w:uiPriority="0" w:semiHidden="0" w:name="Table Simple 1"/>
     <w:lsdException w:unhideWhenUsed="0" w:uiPriority="0" w:semiHidden="0" w:name="Table Simple 2"/>
@@ -6949,6 +7002,7 @@
   <w:style w:type="table" w:default="1" w:styleId="9">
     <w:name w:val="Normal Table"/>
     <w:semiHidden/>
+    <w:qFormat/>
     <w:uiPriority w:val="0"/>
     <w:tblPr>
       <w:tblCellMar>
@@ -6992,6 +7046,7 @@
   <w:style w:type="paragraph" w:styleId="5">
     <w:name w:val="footer"/>
     <w:basedOn w:val="1"/>
+    <w:qFormat/>
     <w:uiPriority w:val="0"/>
     <w:pPr>
       <w:tabs>
@@ -7009,6 +7064,7 @@
   <w:style w:type="paragraph" w:styleId="6">
     <w:name w:val="header"/>
     <w:basedOn w:val="1"/>
+    <w:qFormat/>
     <w:uiPriority w:val="0"/>
     <w:pPr>
       <w:pBdr>
@@ -7029,6 +7085,7 @@
   <w:style w:type="paragraph" w:styleId="7">
     <w:name w:val="List"/>
     <w:basedOn w:val="3"/>
+    <w:qFormat/>
     <w:uiPriority w:val="0"/>
     <w:rPr>
       <w:rFonts w:cs="Noto Sans Devanagari"/>
@@ -7062,10 +7119,12 @@
   <w:style w:type="character" w:styleId="12">
     <w:name w:val="page number"/>
     <w:basedOn w:val="10"/>
+    <w:qFormat/>
     <w:uiPriority w:val="0"/>
   </w:style>
   <w:style w:type="character" w:styleId="13">
     <w:name w:val="Hyperlink"/>
+    <w:qFormat/>
     <w:uiPriority w:val="0"/>
     <w:rPr>
       <w:color w:val="0000FF"/>

</xml_diff>

<commit_message>
docs(proposal): refocus thesis framing and sync generated document
Align the proposal text, title, and generated Word output around the vulnerability-analysis framing so the written materials stay consistent.
</commit_message>
<xml_diff>
--- a/docs/开题报告/DeFuzz-开题报告.docx
+++ b/docs/开题报告/DeFuzz-开题报告.docx
@@ -1372,7 +1372,7 @@
                 <w:kern w:val="0"/>
                 <w:sz w:val="24"/>
               </w:rPr>
-              <w:t>基于 LLM 约束求解的编译器防御机制模糊测试方法研究</w:t>
+              <w:t>基于大语言模型的编译器防御机制脆弱性分析方法研究</w:t>
             </w:r>
           </w:p>
         </w:tc>
@@ -2368,6 +2368,27 @@
             <w:pPr>
               <w:pStyle w:val="Normal"/>
               <w:spacing w:lineRule="auto" w:line="360"/>
+              <w:rPr>
+                <w:b/>
+                <w:bCs/>
+                <w:kern w:val="0"/>
+                <w:sz w:val="24"/>
+              </w:rPr>
+            </w:pPr>
+            <w:r>
+              <w:rPr>
+                <w:b/>
+                <w:bCs/>
+                <w:kern w:val="0"/>
+                <w:sz w:val="24"/>
+              </w:rPr>
+              <w:t>1.1 漏洞过载年代下编译器防御机制的兜底地位</w:t>
+            </w:r>
+          </w:p>
+          <w:p>
+            <w:pPr>
+              <w:pStyle w:val="Normal"/>
+              <w:spacing w:lineRule="auto" w:line="360"/>
               <w:ind w:firstLineChars="200" w:startChars="0" w:start="0" w:endChars="0" w:end="0"/>
               <w:rPr>
                 <w:kern w:val="0"/>
@@ -2379,7 +2400,64 @@
                 <w:kern w:val="0"/>
                 <w:sz w:val="24"/>
               </w:rPr>
-              <w:t xml:space="preserve">CVE-2023-4039 暴露了 GCC 在 AArch64 上栈保护机制的一处长期失效。当函数使用变长数组（VLA）或 alloca 时，编译器把栈金丝雀放在 VLA 之上、保存的返回地址却落在 VLA 之下，越界写入可以先于金丝雀检查改写返回地址，-fstack-protector 因此形同虚设——这种 buggy 状态下的栈帧布局可参见图 1。编译过程不报错，二进制能通过功能测试，缺陷只在攻击者构造特定输入时才显现。该漏洞自 GCC 早期版本即已存在，直到 2023 年才由外部研究者系统分析并修复。问题的共性也由此显现：编译器侧的防御机制依赖前端识别、中端 pass 与后端代码生成共同维护一组安全不变量，其中任何一处与具体 ISA 的栈布局、寄存器分配或指令编码假设不一致，防御机制就会悄然失效——对外仍然"存在"，对攻击者不再有效。</w:t>
+              <w:t xml:space="preserve">近十年来，被公开披露的安全漏洞数量持续攀升。截至 2025 年，CVE 漏洞库每年新登记的条目稳定在两万条以上，且仍在快速增长[21]。Microsoft、Google 等厂商陆续公开承认，仅依靠人工审计与安全编程规范并不足以彻底清除上层代码中的内存安全 Bug。在这一前提下，工业界与学术界把更多重心放到了"漏洞被触发后能否拦下攻击者"这一问题上：栈金丝雀（stack canary）、源代码加固（_FORTIFY_SOURCE）、间接跳转跟踪（indirect branch tracking, IBT）、控制流完整性（control-flow integrity, CFI）、指针认证（pointer authentication, PAC）、分支目标识别（branch target identification, BTI）、影子栈（shadow stack）等多项防御机制由编译器与运行时共同叠加部署，在漏洞被触发的瞬间承担起兜底防线的角色。</w:t>
+            </w:r>
+          </w:p>
+          <w:p>
+            <w:pPr>
+              <w:pStyle w:val="Normal"/>
+              <w:spacing w:lineRule="auto" w:line="360"/>
+              <w:ind w:firstLineChars="200" w:startChars="0" w:start="0" w:endChars="0" w:end="0"/>
+              <w:rPr>
+                <w:kern w:val="0"/>
+                <w:sz w:val="24"/>
+              </w:rPr>
+            </w:pPr>
+            <w:r>
+              <w:rPr>
+                <w:kern w:val="0"/>
+                <w:sz w:val="24"/>
+              </w:rPr>
+              <w:t xml:space="preserve">由编译器承担的兜底机制有一个共同的工作模式：在编译期向二进制中插入检查指令、布局约束或元数据，使运行期一旦偏离预定义的合法行为即可被发现并立即终止程序。以栈金丝雀为例，编译器在易受溢出影响的栈帧中插入随机值哨位，并在函数返回前比对其是否被改写。由此可见，兜底防线的有效性不仅取决于编译器中前端、中端与后端能否生成对应代码，还取决于这些代码所依赖的指令集架构（instruction set architecture, ISA）假设是否成立。</w:t>
+            </w:r>
+          </w:p>
+          <w:p>
+            <w:pPr>
+              <w:pStyle w:val="Normal"/>
+              <w:spacing w:lineRule="auto" w:line="360"/>
+              <w:rPr>
+                <w:b/>
+                <w:bCs/>
+                <w:kern w:val="0"/>
+                <w:sz w:val="24"/>
+              </w:rPr>
+            </w:pPr>
+            <w:r>
+              <w:rPr>
+                <w:b/>
+                <w:bCs/>
+                <w:kern w:val="0"/>
+                <w:sz w:val="24"/>
+              </w:rPr>
+              <w:t>1.2 引子：CVE-2023-4039 揭示的跨架构脆弱性</w:t>
+            </w:r>
+          </w:p>
+          <w:p>
+            <w:pPr>
+              <w:pStyle w:val="Normal"/>
+              <w:spacing w:lineRule="auto" w:line="360"/>
+              <w:ind w:firstLineChars="200" w:startChars="0" w:start="0" w:endChars="0" w:end="0"/>
+              <w:rPr>
+                <w:kern w:val="0"/>
+                <w:sz w:val="24"/>
+              </w:rPr>
+            </w:pPr>
+            <w:r>
+              <w:rPr>
+                <w:kern w:val="0"/>
+                <w:sz w:val="24"/>
+              </w:rPr>
+              <w:t xml:space="preserve">2023 年披露的 CVE-2023-4039[16] 是一个具有代表性的案例。GCC 在 AArch64 上的 -fstack-protector 选项长期失效：当函数使用变长数组（variable-length array, VLA）或 alloca 时，编译器把栈金丝雀放在 VLA 之上、保存的返回地址却落在 VLA 之下，越界写入会先于金丝雀检查改写返回地址，本应兜底的保护因此被绕过。该漏洞在 GCC 早期版本即已存在，直到 2023 年才由外部研究者系统分析并修复。这种 buggy 状态下的栈帧布局如下图 1 所示。</w:t>
             </w:r>
           </w:p>
           <w:p>
@@ -2430,19 +2508,21 @@
           <w:p>
             <w:pPr>
               <w:pStyle w:val="Normal"/>
-              <w:spacing w:lineRule="auto" w:line="300"/>
+              <w:spacing w:lineRule="auto" w:line="360"/>
               <w:jc w:val="center"/>
               <w:rPr>
                 <w:rFonts w:ascii="宋体" w:hAnsi="宋体" w:eastAsia="宋体"/>
-                <w:i/>
-                <w:sz w:val="20"/>
+                <w:b/>
+                <w:bCs/>
+                <w:sz w:val="22"/>
               </w:rPr>
             </w:pPr>
             <w:r>
               <w:rPr>
                 <w:rFonts w:ascii="宋体" w:hAnsi="宋体" w:eastAsia="宋体"/>
-                <w:i/>
-                <w:sz w:val="20"/>
+                <w:b/>
+                <w:bCs/>
+                <w:sz w:val="22"/>
               </w:rPr>
               <w:t>图 1  CVE-2023-4039 buggy 栈帧布局</w:t>
             </w:r>
@@ -2471,7 +2551,64 @@
                 <w:kern w:val="0"/>
                 <w:sz w:val="24"/>
               </w:rPr>
-              <w:t xml:space="preserve">编译器所承载的防御机制数量本身已相当庞大：栈金丝雀、_FORTIFY_SOURCE、Intel CET 中的 IBT、AArch64 的 BTI 与 PAC、Shadow Stack、SafeStack、KCFI、CFI、HCFR 等，分别保护栈完整性、控制流、对象边界，且仍在扩展。目标 ISA 方面，x86-64、AArch64、RISC-V、LoongArch、MIPS、PowerPC 等架构在调用约定、寄存器分配与指令编码上差异显著，每种机制在各 ISA 上对应若干份独立的后端模板与中端 pass 实现。二者构成"防御机制 × ISA"的二维研究空间（见图 2），每一格对应一组需联合维护的安全不变量，目前已被覆盖的格点仍只是其中很小一部分。</w:t>
+              <w:t xml:space="preserve">CVE-2023-4039 直观地揭示了一个共性问题：编译器侧防御机制的有效性强依赖于具体 ISA 上的栈布局、寄存器分配与指令编码假设。一旦防御设计中的某项假设与某套 ISA 不一致，运行期保护就会悄然失效。这种失效具有"双重无声"特征：编译时不报错（工具链与功能测试都察觉不到），运行时也能产生正确的功能结果（程序行为也察觉不到），但其安全契约已经被打破。本课题把这种形态的失效称为静默失效（silent failure）——编译产物看起来仍然带着完整的防线，攻击者却能直接绕过它。</w:t>
+            </w:r>
+          </w:p>
+          <w:p>
+            <w:pPr>
+              <w:pStyle w:val="Normal"/>
+              <w:spacing w:lineRule="auto" w:line="360"/>
+              <w:rPr>
+                <w:b/>
+                <w:bCs/>
+                <w:kern w:val="0"/>
+                <w:sz w:val="24"/>
+              </w:rPr>
+            </w:pPr>
+            <w:r>
+              <w:rPr>
+                <w:b/>
+                <w:bCs/>
+                <w:kern w:val="0"/>
+                <w:sz w:val="24"/>
+              </w:rPr>
+              <w:t>1.3 核心挑战：搜索空间巨大且失效难以判定</w:t>
+            </w:r>
+          </w:p>
+          <w:p>
+            <w:pPr>
+              <w:pStyle w:val="Normal"/>
+              <w:spacing w:lineRule="auto" w:line="360"/>
+              <w:ind w:firstLineChars="200" w:startChars="0" w:start="0" w:endChars="0" w:end="0"/>
+              <w:rPr>
+                <w:kern w:val="0"/>
+                <w:sz w:val="24"/>
+              </w:rPr>
+            </w:pPr>
+            <w:r>
+              <w:rPr>
+                <w:kern w:val="0"/>
+                <w:sz w:val="24"/>
+              </w:rPr>
+              <w:t xml:space="preserve">要在编译器中系统性地暴露此类静默失效，本课题面临两个相互纠缠的挑战。</w:t>
+            </w:r>
+          </w:p>
+          <w:p>
+            <w:pPr>
+              <w:pStyle w:val="Normal"/>
+              <w:spacing w:lineRule="auto" w:line="360"/>
+              <w:ind w:firstLineChars="200" w:startChars="0" w:start="0" w:endChars="0" w:end="0"/>
+              <w:rPr>
+                <w:kern w:val="0"/>
+                <w:sz w:val="24"/>
+              </w:rPr>
+            </w:pPr>
+            <w:r>
+              <w:rPr>
+                <w:kern w:val="0"/>
+                <w:sz w:val="24"/>
+              </w:rPr>
+              <w:t xml:space="preserve">第一是搜索空间巨大。如下图 2 所示，编译器需要在多种防御机制与多套 ISA 构成的二维空间中维护安全契约：纵向上至少包含栈金丝雀、_FORTIFY_SOURCE、IBT、CFI、BTI、PAC、影子栈等机制；横向上至少包含 x86-64、AArch64、RISC-V、LoongArch、MIPS、PowerPC 等架构。每个格点对应一份独立的中端 pass 或后端模板，调用约定、寄存器分配、指令编码上的任意细节都可能影响该机制能否兑现其安全契约。已确认的同源遗漏并不少见：与 CVE-2023-4039 同源的 PR-96191[7] 在 2020 年修复时仅覆盖 AArch64 / ARM，未触及 MIPS、LoongArch、Xtensa、CSKY 等 fallback 后端，因此同一类失效在这些架构上又静静地存在了若干年。本课题在初步实验阶段已向 GCC 上游报告并确认了多例此类同源失效[17-20]，第五章将给出具体案例。</w:t>
             </w:r>
           </w:p>
           <w:p>
@@ -2522,19 +2659,21 @@
           <w:p>
             <w:pPr>
               <w:pStyle w:val="Normal"/>
-              <w:spacing w:lineRule="auto" w:line="300"/>
+              <w:spacing w:lineRule="auto" w:line="360"/>
               <w:jc w:val="center"/>
               <w:rPr>
                 <w:rFonts w:ascii="宋体" w:hAnsi="宋体" w:eastAsia="宋体"/>
-                <w:i/>
-                <w:sz w:val="20"/>
+                <w:b/>
+                <w:bCs/>
+                <w:sz w:val="22"/>
               </w:rPr>
             </w:pPr>
             <w:r>
               <w:rPr>
                 <w:rFonts w:ascii="宋体" w:hAnsi="宋体" w:eastAsia="宋体"/>
-                <w:i/>
-                <w:sz w:val="20"/>
+                <w:b/>
+                <w:bCs/>
+                <w:sz w:val="22"/>
               </w:rPr>
               <w:t>图 2  防御机制 × ISA 二维研究空间</w:t>
             </w:r>
@@ -2563,7 +2702,7 @@
                 <w:kern w:val="0"/>
                 <w:sz w:val="24"/>
               </w:rPr>
-              <w:t xml:space="preserve">这个矩阵的规模使人工审计难以全面覆盖。与 CVE-2023-4039[16] 同源的 PR-96191[7]（AArch64 / ARM 上栈金丝雀寄存器残留）2020 年修复时，就未涉及 MIPS、LoongArch、Xtensa、CSKY 等 fallback 后端；单点防御机制上的实现疏忽，往往同时存在于矩阵中其他格点而长期不被发现。本课题初步实验阶段已对若干格点做了试探性验证，向 GCC 上游报告并确认了多例同类形态的真实漏洞[17-20]，第五章将给出具体案例。</w:t>
+              <w:t xml:space="preserve">第二是失效难以判定。即便测试输入已把执行推进到防御机制相关代码路径，"防御是否仍满足其安全契约"也很难直接观察到：程序通常不会崩溃，与其他编译器的输出也保持一致，看似一切正常，而契约本身已经失守。本课题把每条防御机制运行期间必须始终成立的若干静态或动态性质统称为安全不变量（safety invariant，亦可理解为该机制的"安全规则"，例如金丝雀必须位于所有可被越界写入的栈对象与返回地址之间）。一旦这些性质被破坏，便对应一次静默失效。然而已有的自动化手段对此并不敏感：以差分输出或编译器崩溃为信号的工具（如 Csmith、YARPGen）几乎不会触发；覆盖率引导的模糊测试（fuzzing）虽然能把执行推进到相关代码路径，但本身并不携带判断该路径是否仍维护安全不变量的预言机（oracle）。这一判定空白决定了即便穷举搜索空间，也无法自动判别每一格点的状态。</w:t>
             </w:r>
           </w:p>
           <w:p>
@@ -2581,7 +2720,46 @@
                 <w:kern w:val="0"/>
                 <w:sz w:val="24"/>
               </w:rPr>
-              <w:t xml:space="preserve">上述失效有一个共同特征：编译过程不出错、二进制正常运行，缺陷仅在特定输入下显现——即"静默失效（silent failure）"。Csmith、YARPGen 等以差分输出或编译器崩溃为信号的工具对此类缺陷几乎不敏感；覆盖率引导的模糊测试虽然可以把执行推进到相关代码路径，但缺少判断该路径是否仍满足安全契约的预言机。问题由此浮现：编译器是绝大多数软件防御机制的实际载体，矩阵中的静默失效直接削弱整个软件生态的运行时安全保障，而现有自动化测试方法尚未把"防御机制的安全契约"纳入判定体系。如果能把矩阵格点上的不变量翻译为可测断言，并主动引导编译器走到对应代码路径，就既可覆盖既有缺陷家族的同类变种，也有望在后续优化引入同类回归时及早暴露。本研究以此为出发点，结合大语言模型的代码理解能力与覆盖率反馈，构建一条针对编译器防御机制静默失效的模糊测试方法。</w:t>
+              <w:t xml:space="preserve">值得注意的是，搜索空间巨大也意味着 fuzzing 自身在该问题上同样面临覆盖效率的考验。本课题对此的应对思路是把推进目标显式限定在"防御机制相关代码"，让覆盖率反馈与大语言模型驱动的种子变异共同约束搜索方向，详见第三、四章。</w:t>
+            </w:r>
+          </w:p>
+          <w:p>
+            <w:pPr>
+              <w:pStyle w:val="Normal"/>
+              <w:spacing w:lineRule="auto" w:line="360"/>
+              <w:rPr>
+                <w:b/>
+                <w:bCs/>
+                <w:kern w:val="0"/>
+                <w:sz w:val="24"/>
+              </w:rPr>
+            </w:pPr>
+            <w:r>
+              <w:rPr>
+                <w:b/>
+                <w:bCs/>
+                <w:kern w:val="0"/>
+                <w:sz w:val="24"/>
+              </w:rPr>
+              <w:t>1.4 本章小结</w:t>
+            </w:r>
+          </w:p>
+          <w:p>
+            <w:pPr>
+              <w:pStyle w:val="Normal"/>
+              <w:spacing w:lineRule="auto" w:line="360"/>
+              <w:ind w:firstLineChars="200" w:startChars="0" w:start="0" w:endChars="0" w:end="0"/>
+              <w:rPr>
+                <w:kern w:val="0"/>
+                <w:sz w:val="24"/>
+              </w:rPr>
+            </w:pPr>
+            <w:r>
+              <w:rPr>
+                <w:kern w:val="0"/>
+                <w:sz w:val="24"/>
+              </w:rPr>
+              <w:t xml:space="preserve">编译器是绝大多数软件防御机制的实际载体，其在"防御机制 × ISA"二维矩阵上的静默失效会直接削弱整个软件生态的运行时安全保障。然而，现有自动化测试方法既未把搜索空间约束到防御机制相关代码，也未把安全不变量纳入判定体系。如果能把矩阵格点上的安全不变量翻译为可机器判定的检查器，并主动引导编译器走到相应代码路径，就既可暴露既有缺陷家族的同类变种，也有望在后续优化引入同类回归时及早发现。本研究以此为出发点，结合大语言模型的代码理解能力与覆盖率反馈，构建一种面向编译器防御机制脆弱性的分析方法。</w:t>
             </w:r>
           </w:p>
           <w:p>
@@ -2619,24 +2797,6 @@
             <w:pPr>
               <w:pStyle w:val="Normal"/>
               <w:spacing w:lineRule="auto" w:line="360"/>
-              <w:ind w:firstLineChars="200" w:startChars="0" w:start="0" w:endChars="0" w:end="0"/>
-              <w:rPr>
-                <w:kern w:val="0"/>
-                <w:sz w:val="24"/>
-              </w:rPr>
-            </w:pPr>
-            <w:r>
-              <w:rPr>
-                <w:kern w:val="0"/>
-                <w:sz w:val="24"/>
-              </w:rPr>
-              <w:t xml:space="preserve">编译器模糊测试的研究可以从两个角度来看：一是预言机（oracle），决定什么算缺陷；二是种子变异方法，决定测试输入怎么产生。早期工作以崩溃或输出差异为信号、以随机或文法规则生成种子；覆盖率引导与大语言模型的引入分别使二者向目标导向和语义理解方向演进。下文沿这两个维度梳理现状。</w:t>
-            </w:r>
-          </w:p>
-          <w:p>
-            <w:pPr>
-              <w:pStyle w:val="Normal"/>
-              <w:spacing w:lineRule="auto" w:line="360"/>
               <w:rPr>
                 <w:b/>
                 <w:bCs/>
@@ -2651,7 +2811,7 @@
                 <w:kern w:val="0"/>
                 <w:sz w:val="24"/>
               </w:rPr>
-              <w:t>2.1 编译器模糊测试预言机</w:t>
+              <w:t>2.1 概述</w:t>
             </w:r>
           </w:p>
           <w:p>
@@ -2669,7 +2829,7 @@
                 <w:kern w:val="0"/>
                 <w:sz w:val="24"/>
               </w:rPr>
-              <w:t xml:space="preserve">预言机回答"什么样的执行结果算缺陷"，现有工作大致可分五类。</w:t>
+              <w:t xml:space="preserve">第一章已说明，自动检测编译器防御机制的静默失效面临两个挑战：搜索空间巨大、失效难以判定。围绕这两条挑战梳理现有方法可以发现，此前的工作或针对其中之一做出推进，或停留在与编译器自身防御机制弱相关的常规缺陷上，目前尚未出现同时直面两条挑战的成熟方案。下文按这两个维度组织文献，并讨论各自的覆盖范围与遗留空白。</w:t>
             </w:r>
           </w:p>
           <w:p>
@@ -2687,25 +2847,7 @@
                 <w:kern w:val="0"/>
                 <w:sz w:val="24"/>
               </w:rPr>
-              <w:t xml:space="preserve">崩溃预言机[1,3,4]以编译期或运行期的崩溃（ICE、断言、segfault、超时）为信号，实现简单，是 AFL、libFuzzer 迁移到编译器后的默认选择。差分预言机[1,2]对若干编译器（或同一编译器不同优化等级）就同一程序的运行结果做交叉比对，差异即为 mis-compile；Csmith、YARPGen 围绕"避免未定义行为"这一前提大规模生成 C 程序来驱动差分。变形测试预言机以 Le 等提出的 EMI[11] 为代表：对同一输入下未执行的代码做删改，新程序应产生相同结果，差异即为 mis-compile，后续工作继续在 live region 等价变换上探索。Sanitizer 预言机借助 ASan、UBSan、MSan 把内存破坏与未定义行为转为显式信号；UBfuzz[12] 进一步用 crash-site mapping 反向定位 sanitizer 自身实现缺陷。还有面向子领域的复合预言机，如 HirGen[13] 在 IR 层同时使用差分与变形来提高对深度学习编译器深层优化错误的敏感度。</w:t>
-            </w:r>
-          </w:p>
-          <w:p>
-            <w:pPr>
-              <w:pStyle w:val="Normal"/>
-              <w:spacing w:lineRule="auto" w:line="360"/>
-              <w:ind w:firstLineChars="200" w:startChars="0" w:start="0" w:endChars="0" w:end="0"/>
-              <w:rPr>
-                <w:kern w:val="0"/>
-                <w:sz w:val="24"/>
-              </w:rPr>
-            </w:pPr>
-            <w:r>
-              <w:rPr>
-                <w:kern w:val="0"/>
-                <w:sz w:val="24"/>
-              </w:rPr>
-              <w:t xml:space="preserve">这些预言机的判据都建立在"崩溃"或"可观察的输出差异"之上。当缺陷的形态是"代码正常编译运行，但运行时保护已被静默削弱"时，它们无法触发。</w:t>
+              <w:t xml:space="preserve">需要指出的是，模糊测试（fuzzing）并非解决该问题的唯一路径。静态分析、形式化验证、人工审计在原则上也可以参与判定一条防御机制是否在某 ISA 上仍维持其安全契约。然而，受限于安全契约本身缺乏统一的可形式化描述，以及防御机制实现散落在编译器中端 pass 与若干后端模板中的工程现实，目前与覆盖率证据耦合最紧、最容易把搜索空间显式收敛到目标代码区域的方案仍然是覆盖率引导的模糊测试。本章对相关工作的取舍即基于此判断。</w:t>
             </w:r>
           </w:p>
           <w:p>
@@ -2726,7 +2868,7 @@
                 <w:kern w:val="0"/>
                 <w:sz w:val="24"/>
               </w:rPr>
-              <w:t>2.2 传统种子变异方法</w:t>
+              <w:t>2.2 应对搜索空间挑战的现有工作</w:t>
             </w:r>
           </w:p>
           <w:p>
@@ -2744,7 +2886,97 @@
                 <w:kern w:val="0"/>
                 <w:sz w:val="24"/>
               </w:rPr>
-              <w:t xml:space="preserve">传统路线上，覆盖率作为推进信号已是主流。Csmith[1] 与 YARPGen[2] 基于概率文法从空白合成不含未定义行为的 C 程序，再靠差分预言机发现 mis-compile。LangFuzz 类工作记录种子语法树后做子树替换式的 grammar-aware 变异，多用于 JavaScript 引擎。AFL、libFuzzer[3,4] 以字节级覆盖率反馈为导向，被广泛用于编译器的解析与优化组件，但难以保证生成程序的语法和语义合法性。GrayC[14] 把覆盖率引导与一组保持语义合法性的源码级变异（表达式替换、控制结构改写）相结合，专门面向 C 编译器与分析器，覆盖率和缺陷发现率均优于纯生成式工具。EMI 系列[11]在已有种子的未执行区域做语义保持变换，可视作变异与变形预言机的组合。这条路线的局限在于：变异规则由人工先验定义，覆盖率只提供"是否走入新代码"的近似进度信号，变异本身缺乏对目标代码语义的理解。</w:t>
+              <w:t xml:space="preserve">针对"如何把测试输入有目标地推到防御机制相关代码"的问题，现有方法大致可划分为四类。</w:t>
+            </w:r>
+          </w:p>
+          <w:p>
+            <w:pPr>
+              <w:pStyle w:val="Normal"/>
+              <w:spacing w:lineRule="auto" w:line="360"/>
+              <w:ind w:firstLineChars="200" w:startChars="0" w:start="0" w:endChars="0" w:end="0"/>
+              <w:rPr>
+                <w:kern w:val="0"/>
+                <w:sz w:val="24"/>
+              </w:rPr>
+            </w:pPr>
+            <w:r>
+              <w:rPr>
+                <w:kern w:val="0"/>
+                <w:sz w:val="24"/>
+              </w:rPr>
+              <w:t xml:space="preserve">随机生成与文法生成。Csmith[1] 与 YARPGen[2] 基于概率文法从空白合成不含未定义行为的 C 程序，再以差分输出驱动测试。这类方法对编译器整体覆盖良好，但生成过程不带任何防御机制的语义偏好，实测中很难自然落到栈金丝雀、IBT 等机制相关的代码路径上。</w:t>
+            </w:r>
+          </w:p>
+          <w:p>
+            <w:pPr>
+              <w:pStyle w:val="Normal"/>
+              <w:spacing w:lineRule="auto" w:line="360"/>
+              <w:ind w:firstLineChars="200" w:startChars="0" w:start="0" w:endChars="0" w:end="0"/>
+              <w:rPr>
+                <w:kern w:val="0"/>
+                <w:sz w:val="24"/>
+              </w:rPr>
+            </w:pPr>
+            <w:r>
+              <w:rPr>
+                <w:kern w:val="0"/>
+                <w:sz w:val="24"/>
+              </w:rPr>
+              <w:t xml:space="preserve">字节级覆盖率引导。AFL[3]、libFuzzer[4] 等以字节级覆盖率反馈为导向的工具被广泛用于编译器解析与优化组件。它们能感知"是否走入新代码"，但对生成程序的语法语义合法性约束有限，且覆盖率信号无差别对待所有代码区域，无法天然把推进目标限定到防御机制相关代码。</w:t>
+            </w:r>
+          </w:p>
+          <w:p>
+            <w:pPr>
+              <w:pStyle w:val="Normal"/>
+              <w:spacing w:lineRule="auto" w:line="360"/>
+              <w:ind w:firstLineChars="200" w:startChars="0" w:start="0" w:endChars="0" w:end="0"/>
+              <w:rPr>
+                <w:kern w:val="0"/>
+                <w:sz w:val="24"/>
+              </w:rPr>
+            </w:pPr>
+            <w:r>
+              <w:rPr>
+                <w:kern w:val="0"/>
+                <w:sz w:val="24"/>
+              </w:rPr>
+              <w:t xml:space="preserve">源码级语义保持变异。GrayC[14] 把覆盖率引导与一组保持语义合法性的源码级变异相结合，在覆盖率推进与缺陷发现率上均优于纯生成式工具；EMI 系列[11] 在已有种子的未执行区域做语义保持变换，可视作变异与变形预言机的组合。这类方法已具备相当强的工程实用性，但变异规则仍由人工先验定义，未利用目标代码自身的语义信息来引导变异方向。</w:t>
+            </w:r>
+          </w:p>
+          <w:p>
+            <w:pPr>
+              <w:pStyle w:val="Normal"/>
+              <w:spacing w:lineRule="auto" w:line="360"/>
+              <w:ind w:firstLineChars="200" w:startChars="0" w:start="0" w:endChars="0" w:end="0"/>
+              <w:rPr>
+                <w:kern w:val="0"/>
+                <w:sz w:val="24"/>
+              </w:rPr>
+            </w:pPr>
+            <w:r>
+              <w:rPr>
+                <w:kern w:val="0"/>
+                <w:sz w:val="24"/>
+              </w:rPr>
+              <w:t xml:space="preserve">大语言模型驱动的变异。WhiteFox[5] 从编译器优化 pass 源码出发，让大模型先归纳触发该优化的输入模式，再据此生成测试用例，使种子生成具备对编译器内部逻辑的感知；HLPFuzz[15] 进一步把大模型与覆盖率反馈耦合，按"未覆盖且后继最多"的策略选取目标基本块，把单基本块翻译为约束求解任务交由大模型完成，并通过渐进式上下文构建缓解注意力衰减。这条路线已经表明大模型可作为语义感知的变异引擎，但目前的工作所定义的目标仍是常规可达性——"让程序走到某个未覆盖位置"，并不关心目标路径所承担的安全契约。</w:t>
+            </w:r>
+          </w:p>
+          <w:p>
+            <w:pPr>
+              <w:pStyle w:val="Normal"/>
+              <w:spacing w:lineRule="auto" w:line="360"/>
+              <w:ind w:firstLineChars="200" w:startChars="0" w:start="0" w:endChars="0" w:end="0"/>
+              <w:rPr>
+                <w:kern w:val="0"/>
+                <w:sz w:val="24"/>
+              </w:rPr>
+            </w:pPr>
+            <w:r>
+              <w:rPr>
+                <w:kern w:val="0"/>
+                <w:sz w:val="24"/>
+              </w:rPr>
+              <w:t xml:space="preserve">综合来看，现有方法在搜索空间一侧已积累了较成熟的覆盖率推进手段，若能把"防御机制相关性"作为目标基本块挑选的额外维度并复用大语言模型的代码理解能力，就有望显著提高在防御机制 × ISA 矩阵中的有效采样密度。</w:t>
             </w:r>
           </w:p>
           <w:p>
@@ -2765,7 +2997,7 @@
                 <w:kern w:val="0"/>
                 <w:sz w:val="24"/>
               </w:rPr>
-              <w:t>2.3 大模型驱动的种子变异方法</w:t>
+              <w:t>2.3 应对失效判定挑战的现有工作</w:t>
             </w:r>
           </w:p>
           <w:p>
@@ -2783,7 +3015,7 @@
                 <w:kern w:val="0"/>
                 <w:sz w:val="24"/>
               </w:rPr>
-              <w:t xml:space="preserve">大模型在代码理解与生成上的能力近年被引入以缓解传统变异在质量上的瓶颈。WhiteFox[5] 从编译器优化 pass 源码出发，先用大模型归纳触发该优化的输入模式（requirement summarization），再据此生成测试用例，使种子生成具备对编译器内部逻辑的感知；该方法在 PyTorch、TVM 等深度学习编译器上发现了若干优化路径深处的 bug。HLPFuzz[15] 进一步把大模型与覆盖率反馈耦合：在灰盒主循环之外引入白盒求解器，按"未覆盖且后继最多"的策略选取目标基本块，把单基本块翻译为约束求解任务交由大模型完成，并通过渐进式上下文构建缓解注意力衰减。这些工作表明大模型可以充当语义感知的变异引擎，但它们的目标设定仍是常规可达性——"让程序走到某个未覆盖位置"，并不关心目标路径所承担的安全契约。</w:t>
+              <w:t xml:space="preserve">针对"如何判断一颗成功编译并运行的二进制是否仍满足防御机制安全契约"，现有预言机大致分为四类。</w:t>
             </w:r>
           </w:p>
           <w:p>
@@ -2801,7 +3033,118 @@
                 <w:kern w:val="0"/>
                 <w:sz w:val="24"/>
               </w:rPr>
-              <w:t xml:space="preserve">综合来看，针对编译器自身防御机制的自动化测试在公开文献中仍然稀少：少数工作面向单一机制做差分测试（如扫描 IBT landing pad 存在性），另一些工作从二进制层面做事后审计，但难以反向定位到引入缺陷的编译器代码路径。本课题在变异方法上沿用大模型与覆盖率联合驱动的思路，但把推进目标限定在"防御机制相关代码"；在预言机上把机制不变量翻译为 fuzz 框架可直接使用的判定接口，使方法对静默失效保持敏感。</w:t>
+              <w:t xml:space="preserve">崩溃预言机[1,3,4] 以编译期或运行期的崩溃（ICE、断言、segfault、超时）为信号，是 AFL、libFuzzer 迁移到编译器后的默认选择。但静默失效的产物在编译期与运行期均不会崩溃，该类预言机本质上对其不可见。</w:t>
+            </w:r>
+          </w:p>
+          <w:p>
+            <w:pPr>
+              <w:pStyle w:val="Normal"/>
+              <w:spacing w:lineRule="auto" w:line="360"/>
+              <w:ind w:firstLineChars="200" w:startChars="0" w:start="0" w:endChars="0" w:end="0"/>
+              <w:rPr>
+                <w:kern w:val="0"/>
+                <w:sz w:val="24"/>
+              </w:rPr>
+            </w:pPr>
+            <w:r>
+              <w:rPr>
+                <w:kern w:val="0"/>
+                <w:sz w:val="24"/>
+              </w:rPr>
+              <w:t xml:space="preserve">差分预言机[1,2] 对若干编译器或同一编译器不同优化等级就同一程序的运行结果做交叉比对，差异即为 mis-compile。然而，静默失效的二进制功能行为与正常产物一致，不同编译器之间也保持一致输出，因此不会产生可观察的差异。</w:t>
+            </w:r>
+          </w:p>
+          <w:p>
+            <w:pPr>
+              <w:pStyle w:val="Normal"/>
+              <w:spacing w:lineRule="auto" w:line="360"/>
+              <w:ind w:firstLineChars="200" w:startChars="0" w:start="0" w:endChars="0" w:end="0"/>
+              <w:rPr>
+                <w:kern w:val="0"/>
+                <w:sz w:val="24"/>
+              </w:rPr>
+            </w:pPr>
+            <w:r>
+              <w:rPr>
+                <w:kern w:val="0"/>
+                <w:sz w:val="24"/>
+              </w:rPr>
+              <w:t xml:space="preserve">变形预言机以 Le 等提出的 EMI[11] 为代表，对同一输入下未执行的代码做删改，新程序应产生相同结果，差异即为 mis-compile。该类预言机围绕"语义保持"组织判据，仍然在功能输出层面观察，无法触及运行期防御契约。</w:t>
+            </w:r>
+          </w:p>
+          <w:p>
+            <w:pPr>
+              <w:pStyle w:val="Normal"/>
+              <w:spacing w:lineRule="auto" w:line="360"/>
+              <w:ind w:firstLineChars="200" w:startChars="0" w:start="0" w:endChars="0" w:end="0"/>
+              <w:rPr>
+                <w:kern w:val="0"/>
+                <w:sz w:val="24"/>
+              </w:rPr>
+            </w:pPr>
+            <w:r>
+              <w:rPr>
+                <w:kern w:val="0"/>
+                <w:sz w:val="24"/>
+              </w:rPr>
+              <w:t xml:space="preserve">Sanitizer 预言机借助 ASan、UBSan、MSan 把内存破坏与未定义行为转为显式信号；UBfuzz[12] 进一步用 crash-site mapping 反向定位 sanitizer 自身实现缺陷。Sanitizer 关心的是程序自身的内存安全与未定义行为，覆盖范围与"编译器内置防御机制是否仍生效"并不重叠：一颗带正确金丝雀检查、却把哨位放错位置的二进制，sanitizer 不会报告任何异常。面向子领域的复合预言机如 HirGen[13] 在 IR 层同时使用差分与变形以提高对深度学习编译器优化错误的敏感度，但同样不针对编译器自身的防御机制。</w:t>
+            </w:r>
+          </w:p>
+          <w:p>
+            <w:pPr>
+              <w:pStyle w:val="Normal"/>
+              <w:spacing w:lineRule="auto" w:line="360"/>
+              <w:ind w:firstLineChars="200" w:startChars="0" w:start="0" w:endChars="0" w:end="0"/>
+              <w:rPr>
+                <w:kern w:val="0"/>
+                <w:sz w:val="24"/>
+              </w:rPr>
+            </w:pPr>
+            <w:r>
+              <w:rPr>
+                <w:kern w:val="0"/>
+                <w:sz w:val="24"/>
+              </w:rPr>
+              <w:t xml:space="preserve">可以看到，现有预言机的判据全部建立在"崩溃"或"可观察输出差异"之上。当缺陷的形态是"代码正常编译运行、运行时保护已被静默削弱"时，它们均无法触发。这正是第一章所述判定空白的来源。</w:t>
+            </w:r>
+          </w:p>
+          <w:p>
+            <w:pPr>
+              <w:pStyle w:val="Normal"/>
+              <w:spacing w:lineRule="auto" w:line="360"/>
+              <w:rPr>
+                <w:b/>
+                <w:bCs/>
+                <w:kern w:val="0"/>
+                <w:sz w:val="24"/>
+              </w:rPr>
+            </w:pPr>
+            <w:r>
+              <w:rPr>
+                <w:b/>
+                <w:bCs/>
+                <w:kern w:val="0"/>
+                <w:sz w:val="24"/>
+              </w:rPr>
+              <w:t>2.4 本章小结</w:t>
+            </w:r>
+          </w:p>
+          <w:p>
+            <w:pPr>
+              <w:pStyle w:val="Normal"/>
+              <w:spacing w:lineRule="auto" w:line="360"/>
+              <w:ind w:firstLineChars="200" w:startChars="0" w:start="0" w:endChars="0" w:end="0"/>
+              <w:rPr>
+                <w:kern w:val="0"/>
+                <w:sz w:val="24"/>
+              </w:rPr>
+            </w:pPr>
+            <w:r>
+              <w:rPr>
+                <w:kern w:val="0"/>
+                <w:sz w:val="24"/>
+              </w:rPr>
+              <w:t xml:space="preserve">把研究现状放回第一章给出的两条挑战上，现有方法在搜索空间一侧已具备较成熟的覆盖率推进与大模型变异手段，但所有这些手段的推进目标都不针对防御机制相关代码；在失效判定一侧，所有主流预言机均建立在崩溃或可观察输出差异上，无法识别防御契约的静默失效。少数面向编译器自身防御机制的工作或局限于单一机制的差分测试，或停留在二进制层面的事后审计，难以反向定位到引入缺陷的编译器代码路径。本课题在第三、四章给出对应的解法：把每条防御机制的安全不变量翻译为可机器判定的检查器以填补预言机空白；在大模型与覆盖率联合驱动的种子生成主循环中，把目标基本块选择限定在防御机制相关代码区域，使搜索空间被显式压缩到矩阵中那些尚未触达的格点附近。</w:t>
             </w:r>
           </w:p>
           <w:p>
@@ -2871,7 +3214,79 @@
                 <w:kern w:val="0"/>
                 <w:sz w:val="24"/>
               </w:rPr>
-              <w:t xml:space="preserve">本课题要构建一种面向编译器自身防御机制的模糊测试方法，并在 GCC 与 LLVM 上完成端到端验证。与以崩溃或差分输出为信号的传统编译器 fuzzer 不同，本方法以"防御机制是否仍满足其安全契约"为判据，自动暴露编译器仍能正常生成代码、但运行时保护已被静默削弱的失效。具体目标如下：(a) 形成一套覆盖主流防御机制的不变量集合，每条不变量具备可由二进制或运行行为判定的证据形式，在 GCC 与 LLVM 上保持一致的描述结构；(b) 构建一个可同时面向 GCC 与 LLVM、跨架构运行的 fuzzer 原型，以防御机制相关代码的源代码覆盖率为推进信号，用大模型完成种子精细变异；(c) 通过该原型在 GCC 与 LLVM 上发现可被上游确认的真实缺陷，验证方法有效性与跨编译器迁移性。三个目标依次推进，其依赖关系与对应的工作内容在 3.2 节中呈现（见图 3）。</w:t>
+              <w:t xml:space="preserve">本课题要构建一种面向编译器自身防御机制的脆弱性分析方法，并在 GCC 与 LLVM 上完成端到端验证。与以崩溃或差分输出为信号的传统编译器 fuzzer 不同，本方法以"防御机制是否仍满足其安全契约"为判据，自动暴露第一章所述的静默失效。具体目标分为以下三项：</w:t>
+            </w:r>
+          </w:p>
+          <w:p>
+            <w:pPr>
+              <w:pStyle w:val="Normal"/>
+              <w:spacing w:lineRule="auto" w:line="360"/>
+              <w:ind w:firstLineChars="200" w:startChars="0" w:start="0" w:endChars="0" w:end="0"/>
+              <w:rPr>
+                <w:kern w:val="0"/>
+                <w:sz w:val="24"/>
+              </w:rPr>
+            </w:pPr>
+            <w:r>
+              <w:rPr>
+                <w:kern w:val="0"/>
+                <w:sz w:val="24"/>
+              </w:rPr>
+              <w:t xml:space="preserve">(a) 形成一套覆盖主流防御机制的安全不变量集合，每条不变量具备可由二进制或运行行为判定的证据形式，在 GCC 与 LLVM 上保持一致的描述结构；</w:t>
+            </w:r>
+          </w:p>
+          <w:p>
+            <w:pPr>
+              <w:pStyle w:val="Normal"/>
+              <w:spacing w:lineRule="auto" w:line="360"/>
+              <w:ind w:firstLineChars="200" w:startChars="0" w:start="0" w:endChars="0" w:end="0"/>
+              <w:rPr>
+                <w:kern w:val="0"/>
+                <w:sz w:val="24"/>
+              </w:rPr>
+            </w:pPr>
+            <w:r>
+              <w:rPr>
+                <w:kern w:val="0"/>
+                <w:sz w:val="24"/>
+              </w:rPr>
+              <w:t xml:space="preserve">(b) 构建一个可同时面向 GCC 与 LLVM、跨架构运行的 fuzzer 原型，以防御机制相关代码的源代码覆盖率为推进信号，由大语言模型完成种子精细变异；</w:t>
+            </w:r>
+          </w:p>
+          <w:p>
+            <w:pPr>
+              <w:pStyle w:val="Normal"/>
+              <w:spacing w:lineRule="auto" w:line="360"/>
+              <w:ind w:firstLineChars="200" w:startChars="0" w:start="0" w:endChars="0" w:end="0"/>
+              <w:rPr>
+                <w:kern w:val="0"/>
+                <w:sz w:val="24"/>
+              </w:rPr>
+            </w:pPr>
+            <w:r>
+              <w:rPr>
+                <w:kern w:val="0"/>
+                <w:sz w:val="24"/>
+              </w:rPr>
+              <w:t xml:space="preserve">(c) 通过该原型在 GCC 与 LLVM 上发现可被上游确认的真实缺陷，验证方法的有效性与跨编译器迁移性。</w:t>
+            </w:r>
+          </w:p>
+          <w:p>
+            <w:pPr>
+              <w:pStyle w:val="Normal"/>
+              <w:spacing w:lineRule="auto" w:line="360"/>
+              <w:ind w:firstLineChars="200" w:startChars="0" w:start="0" w:endChars="0" w:end="0"/>
+              <w:rPr>
+                <w:kern w:val="0"/>
+                <w:sz w:val="24"/>
+              </w:rPr>
+            </w:pPr>
+            <w:r>
+              <w:rPr>
+                <w:kern w:val="0"/>
+                <w:sz w:val="24"/>
+              </w:rPr>
+              <w:t xml:space="preserve">三个目标依次推进：(a) 提供事实基础，(b) 在此基础上构建原型，(c) 借助该原型完成实证。其依赖关系与对应的工作内容在 3.2 节中展开。</w:t>
             </w:r>
           </w:p>
           <w:p>
@@ -2910,7 +3325,7 @@
                 <w:kern w:val="0"/>
                 <w:sz w:val="24"/>
               </w:rPr>
-              <w:t xml:space="preserve">本课题分为以下三部分（见图 3），彼此存在依赖关系：不变量形式化是预言机与种子目标选择的事实基础；预言机为 fuzz 主循环提供安全判定接口；覆盖率驱动的种子生成则负责把 fuzzing 推进到能触发不变量的代码路径上。</w:t>
+              <w:t xml:space="preserve">为依次达成 3.1 节的三项目标，本课题划分为三部分工作，其相互依赖关系如下图 3 所示：不变量形式化是预言机与种子目标选择的事实基础；预言机为 fuzz 主循环提供安全判定接口；覆盖率驱动的种子生成则负责把测试输入推进到能触发不变量的代码路径上。</w:t>
             </w:r>
           </w:p>
           <w:p>
@@ -2961,19 +3376,21 @@
           <w:p>
             <w:pPr>
               <w:pStyle w:val="Normal"/>
-              <w:spacing w:lineRule="auto" w:line="300"/>
+              <w:spacing w:lineRule="auto" w:line="360"/>
               <w:jc w:val="center"/>
               <w:rPr>
                 <w:rFonts w:ascii="宋体" w:hAnsi="宋体" w:eastAsia="宋体"/>
-                <w:i/>
-                <w:sz w:val="20"/>
+                <w:b/>
+                <w:bCs/>
+                <w:sz w:val="22"/>
               </w:rPr>
             </w:pPr>
             <w:r>
               <w:rPr>
                 <w:rFonts w:ascii="宋体" w:hAnsi="宋体" w:eastAsia="宋体"/>
-                <w:i/>
-                <w:sz w:val="20"/>
+                <w:b/>
+                <w:bCs/>
+                <w:sz w:val="22"/>
               </w:rPr>
               <w:t>图 3  研究内容工作链条</w:t>
             </w:r>
@@ -3002,7 +3419,7 @@
                 <w:kern w:val="0"/>
                 <w:sz w:val="24"/>
               </w:rPr>
-              <w:t xml:space="preserve">(1) 防御机制不变量的调研与形式化。针对 stack canary、_FORTIFY_SOURCE、IBT 等机制，从三类来源提炼其安全不变量：一是编译器源码中的注释与断言，如 GCC 中 AArch64 后端关于 canary 槽位置关系的安全注释、ix86 关于 ENDBR 立即数禁止的谓词，以及 LLVM 中 lib/CodeGen/StackProtector 与 X86InstrInfo 等模块的对应实现；二是 GCC、LLVM 自身文档（Clang Command Line Reference、Attribute Reference、CFI Design 等）以及 glibc 与 ABI 文档对开关 flag、_chk 接口、CET ELF property 等的规定；三是已确认的历史 bug 与对应 patch——从修补点反推被违反的不变量。每条不变量按统一字段记录陈述、所属编译器与版本、证据片段、信息源及版本敏感性，便于机械检索与跨版本回归。</w:t>
+              <w:t xml:space="preserve">(1) 防御机制安全不变量的调研与形式化。针对栈金丝雀、_FORTIFY_SOURCE、IBT 等机制，从三类来源提炼其安全不变量：一是编译器源码中的注释与断言，例如 GCC 中 AArch64 后端关于 canary 槽位置关系的安全注释、ix86 关于 ENDBR 立即数禁止的谓词，以及 LLVM 中 lib/CodeGen/StackProtector 与 X86InstrInfo 等模块的对应实现；二是 GCC、LLVM 自身文档（Clang Command Line Reference、Attribute Reference、CFI Design 等）以及 glibc 与 ABI 文档对开关 flag、_chk 接口、CET ELF property 等的规定；三是已确认的历史 bug 与对应 patch，从修补点反推被违反的不变量。每条不变量按统一字段记录陈述、所属编译器与版本、证据片段、信息源及版本敏感性，便于机械检索与跨版本回归。</w:t>
             </w:r>
           </w:p>
           <w:p>
@@ -3038,7 +3455,7 @@
                 <w:kern w:val="0"/>
                 <w:sz w:val="24"/>
               </w:rPr>
-              <w:t xml:space="preserve">(3) 大模型与覆盖率联合驱动的种子生成。以 GCC 与 LLVM 中防御机制相关代码的源代码覆盖率为目标信号（GCC 侧 gcov，LLVM 侧 SanitizerCoverage / source-based coverage），结合控制流图按"未覆盖且与防御机制相关性高"的策略选取基本块作为约束求解目标，相关性由 CFG 后继分支数与所在代码区域的防御机制权重共同决定。每轮求解的流程：构造目标上下文（目标函数源码、目标基本块标注、覆盖前驱的种子作为示例），调用大模型生成新 C 种子，编译产物再经覆盖率与预言机检查；结果分析阶段同时看覆盖增量、是否命中目标、是否触发 bug 三个信号，任一为真即把种子纳入语料库。种子未命中目标时，通过轻量级调用追踪定位与基线种子的发散点，把发散函数源码作为额外上下文反馈给大模型进入下一轮变异。整个过程把覆盖率推进与安全契约判定统一在同一条主循环中，大模型的生成始终被防御机制相关代码路径所牵引。</w:t>
+              <w:t xml:space="preserve">(3) 大语言模型与覆盖率联合驱动的种子生成。以 GCC 与 LLVM 中防御机制相关代码的源代码覆盖率为目标信号（GCC 侧 gcov，LLVM 侧 SanitizerCoverage 与 source-based coverage），结合控制流图按"未覆盖且与防御机制相关性高"的策略选取基本块作为变异目标，相关性由 CFG 后继分支数与所在代码区域的防御机制权重共同决定。每轮变异的流程是：构造目标上下文（目标函数源码、目标基本块标注、覆盖前驱的种子作为示例），调用大语言模型生成新 C 种子，编译产物再经覆盖率与预言机检查；结果分析阶段同时观察覆盖增量、是否命中目标、是否触发 bug 三个信号，任一为真即把种子纳入语料库。种子未命中目标时，通过轻量级调用追踪定位它与基线种子的发散点，把发散函数源码作为额外上下文回喂给变异提示，进入下一轮迭代。整个过程把覆盖率推进与安全契约判定统一在同一条主循环中，使大语言模型的生成始终被防御机制相关代码路径所牵引。</w:t>
             </w:r>
           </w:p>
           <w:p>
@@ -3087,7 +3504,7 @@
                 <w:kern w:val="0"/>
                 <w:sz w:val="24"/>
               </w:rPr>
-              <w:t xml:space="preserve">技术路线分为总体架构、不变量预言机框架、大模型约束求解主循环、跨架构与编译选项调度四部分，对应研究内容 (1)–(3) 的工程实现。GCC 上的初步验证证据见第五章。</w:t>
+              <w:t xml:space="preserve">技术路线分为总体架构、防御机制不变量预言机框架、大语言模型驱动的种子变异主循环、跨架构与编译选项调度四部分，对应研究内容 (1)–(3) 的工程实现。GCC 上的初步验证证据见第五章。</w:t>
             </w:r>
           </w:p>
           <w:p>
@@ -3126,7 +3543,7 @@
                 <w:kern w:val="0"/>
                 <w:sz w:val="24"/>
               </w:rPr>
-              <w:t xml:space="preserve">系统以一条 fuzz 主循环为骨架，由 LLM 变异、编译器、预言机三个子系统加种子语料库、配置模块共同支撑（总体结构见图 4）。Fuzz 引擎承担主循环调度与提示词组装两项职能，把当前覆盖率、目标基本块和已有种子拼装成提示词后交给 LLM 变异子系统调用远端模型，再把返回的新种子分发给后续环节。编译器子系统封装预先插桩的 GCC 与 LLVM 构建：GCC 侧通过 gcov 采集 .gcda 覆盖率数据，LLVM 侧通过 SanitizerCoverage 与 source-based coverage 采集 .profraw 数据，二者经统一接口归并为同构的"行级覆盖 → 种子 ID"映射，主循环对底层编译器无感知。预言机子系统按防御机制聚合不变量检查器，对每颗成功编译的种子做安全契约判定，判据建立在 ELF 二进制与运行行为之上，GCC 与 LLVM 产物共用同一套检查器。种子语料库持久化满足质量阈值的种子并维护家系信息。配置模块按"防御机制 · ISA · flag"三元组下发任务：把工具链选择（GCC / LLVM）与对应 flag 交给编译器子系统，把目标 ISA 对应的 QEMU 工具链交给预言机的执行层，使同一份种子能在不同后端上做对照实验。</w:t>
+              <w:t xml:space="preserve">系统以一条 fuzz 主循环为骨架，由 LLM 变异、编译器、预言机三个子系统加种子语料库、配置模块共同支撑，总体结构如下图 4 所示。Fuzz 引擎承担主循环调度与提示词组装两项职能，把当前覆盖率、目标基本块和已有种子拼装成提示词后交给 LLM 变异子系统调用远端模型，再把返回的新种子分发给后续环节。编译器子系统封装预先插桩的 GCC 与 LLVM 构建：GCC 侧通过 gcov 采集 .gcda 覆盖率数据，LLVM 侧通过 SanitizerCoverage 与 source-based coverage 采集 .profraw 数据，二者经统一接口归并为同构的"行级覆盖 → 种子 ID"映射，主循环对底层编译器无感知。预言机子系统按防御机制聚合不变量检查器，对每颗成功编译的种子做安全契约判定，判据建立在 ELF 二进制与运行行为之上，GCC 与 LLVM 产物共用同一套检查器。种子语料库持久化满足质量阈值的种子并维护家系信息。配置模块按"防御机制 · ISA · flag"三元组下发任务：把工具链选择（GCC / LLVM）与对应 flag 交给编译器子系统，把目标 ISA 对应的 QEMU 工具链交给预言机的执行层，使同一份种子可在不同后端上做对照实验，从而以可重复的方式覆盖第一章所述的"防御机制 × ISA"矩阵。</w:t>
             </w:r>
           </w:p>
           <w:p>
@@ -3177,47 +3594,49 @@
           <w:p>
             <w:pPr>
               <w:pStyle w:val="Normal"/>
-              <w:spacing w:lineRule="auto" w:line="300"/>
+              <w:spacing w:lineRule="auto" w:line="360"/>
               <w:jc w:val="center"/>
               <w:rPr>
                 <w:rFonts w:ascii="宋体" w:hAnsi="宋体" w:eastAsia="宋体"/>
-                <w:i/>
-                <w:sz w:val="20"/>
-              </w:rPr>
-            </w:pPr>
-            <w:r>
-              <w:rPr>
-                <w:rFonts w:ascii="宋体" w:hAnsi="宋体" w:eastAsia="宋体"/>
-                <w:i/>
-                <w:sz w:val="20"/>
-              </w:rPr>
-              <w:t>图 4  DeFuzz 总体架构</w:t>
-            </w:r>
-          </w:p>
-          <w:p>
-            <w:pPr>
-              <w:pStyle w:val="Normal"/>
-              <w:spacing w:lineRule="auto" w:line="360"/>
-              <w:rPr>
-                <w:sz w:val="24"/>
-              </w:rPr>
-            </w:pPr>
-          </w:p>
-          <w:p>
-            <w:pPr>
-              <w:pStyle w:val="Normal"/>
-              <w:spacing w:lineRule="auto" w:line="360"/>
-              <w:rPr>
                 <w:b/>
                 <w:bCs/>
-                <w:kern w:val="0"/>
-                <w:sz w:val="24"/>
-              </w:rPr>
-            </w:pPr>
-            <w:r>
-              <w:rPr>
+                <w:sz w:val="22"/>
+              </w:rPr>
+            </w:pPr>
+            <w:r>
+              <w:rPr>
+                <w:rFonts w:ascii="宋体" w:hAnsi="宋体" w:eastAsia="宋体"/>
                 <w:b/>
                 <w:bCs/>
+                <w:sz w:val="22"/>
+              </w:rPr>
+              <w:t>图 4  DeFuzz 总体架构</w:t>
+            </w:r>
+          </w:p>
+          <w:p>
+            <w:pPr>
+              <w:pStyle w:val="Normal"/>
+              <w:spacing w:lineRule="auto" w:line="360"/>
+              <w:rPr>
+                <w:sz w:val="24"/>
+              </w:rPr>
+            </w:pPr>
+          </w:p>
+          <w:p>
+            <w:pPr>
+              <w:pStyle w:val="Normal"/>
+              <w:spacing w:lineRule="auto" w:line="360"/>
+              <w:rPr>
+                <w:b/>
+                <w:bCs/>
+                <w:kern w:val="0"/>
+                <w:sz w:val="24"/>
+              </w:rPr>
+            </w:pPr>
+            <w:r>
+              <w:rPr>
+                <w:b/>
+                <w:bCs/>
                 <w:kern w:val="0"/>
                 <w:sz w:val="24"/>
               </w:rPr>
@@ -3239,7 +3658,7 @@
                 <w:kern w:val="0"/>
                 <w:sz w:val="24"/>
               </w:rPr>
-              <w:t xml:space="preserve">每个机制对应一个聚合器，下挂若干检查器，输入端把同一颗种子的源码、汇编与最终二进制一并交给检查器（判定流程见图 5）。检查器分为静态与动态两类：静态检查器走汇编分析与字节检查路径，读 ELF 符号表、指令字节模式与 .note 段做断言式判定，例如确认间接跳转目标处的 ENDBR 字节、_chk 接口被正确链接；动态检查器以插桩检测和二分搜索为主要手段，通过受控执行观察运行时行为，典型做法是对溢出 buffer 的填充长度做二分搜索，定位 canary 触发的实际边界。每个检查器返回 Pass、Fail、Error 三态，Error 仅用于隔离基础设施故障，不参与机制级判定；聚合时任一 Fail 即视为机制级违例，并把触发证据回写到种子记录。对易与编译器缺省行为混淆的检查器，框架同时跑开机制与关机制两套 flag profile，比对两次判定的差异，确保 Pass / Fail 反映的是机制本身。预言机维护一份元信息缓存，复用二分搜索结果与动态符号查询，避免同一颗二进制被多次解析或执行。</w:t>
+              <w:t xml:space="preserve">每个机制对应一个聚合器，下挂若干检查器，输入端把同一颗种子的源码、汇编与最终二进制一并交给检查器，判定流程如下图 5 所示。检查器分为静态与动态两类：静态检查器走汇编分析与字节检查路径，读 ELF 符号表、指令字节模式与 .note 段做断言式判定，例如确认间接跳转目标处的 ENDBR 字节、_chk 接口被正确链接；动态检查器以插桩检测和二分搜索为主要手段，通过受控执行观察运行时行为，典型做法是对溢出 buffer 的填充长度做二分搜索，定位 canary 触发的实际边界。每个检查器返回 Pass、Fail、Error 三态，Error 仅用于隔离基础设施故障，不参与机制级判定；聚合时任一 Fail 即视为机制级违例，并把触发证据回写到种子记录。对易与编译器缺省行为混淆的检查器，框架同时跑开机制与关机制两套 flag profile，比对两次判定的差异，确保 Pass / Fail 反映的是机制本身。预言机维护一份元信息缓存，复用二分搜索结果与动态符号查询，避免同一颗二进制被多次解析或执行。</w:t>
             </w:r>
           </w:p>
           <w:p>
@@ -3290,51 +3709,53 @@
           <w:p>
             <w:pPr>
               <w:pStyle w:val="Normal"/>
-              <w:spacing w:lineRule="auto" w:line="300"/>
+              <w:spacing w:lineRule="auto" w:line="360"/>
               <w:jc w:val="center"/>
               <w:rPr>
                 <w:rFonts w:ascii="宋体" w:hAnsi="宋体" w:eastAsia="宋体"/>
-                <w:i/>
-                <w:sz w:val="20"/>
-              </w:rPr>
-            </w:pPr>
-            <w:r>
-              <w:rPr>
-                <w:rFonts w:ascii="宋体" w:hAnsi="宋体" w:eastAsia="宋体"/>
-                <w:i/>
-                <w:sz w:val="20"/>
-              </w:rPr>
-              <w:t>图 5  防御机制不变量预言机判定流程</w:t>
-            </w:r>
-          </w:p>
-          <w:p>
-            <w:pPr>
-              <w:pStyle w:val="Normal"/>
-              <w:spacing w:lineRule="auto" w:line="360"/>
-              <w:rPr>
-                <w:sz w:val="24"/>
-              </w:rPr>
-            </w:pPr>
-          </w:p>
-          <w:p>
-            <w:pPr>
-              <w:pStyle w:val="Normal"/>
-              <w:spacing w:lineRule="auto" w:line="360"/>
-              <w:rPr>
                 <w:b/>
                 <w:bCs/>
-                <w:kern w:val="0"/>
-                <w:sz w:val="24"/>
-              </w:rPr>
-            </w:pPr>
-            <w:r>
-              <w:rPr>
+                <w:sz w:val="22"/>
+              </w:rPr>
+            </w:pPr>
+            <w:r>
+              <w:rPr>
+                <w:rFonts w:ascii="宋体" w:hAnsi="宋体" w:eastAsia="宋体"/>
                 <w:b/>
                 <w:bCs/>
-                <w:kern w:val="0"/>
-                <w:sz w:val="24"/>
-              </w:rPr>
-              <w:t>3. 大模型约束求解主循环</w:t>
+                <w:sz w:val="22"/>
+              </w:rPr>
+              <w:t>图 5  防御机制不变量预言机判定流程</w:t>
+            </w:r>
+          </w:p>
+          <w:p>
+            <w:pPr>
+              <w:pStyle w:val="Normal"/>
+              <w:spacing w:lineRule="auto" w:line="360"/>
+              <w:rPr>
+                <w:sz w:val="24"/>
+              </w:rPr>
+            </w:pPr>
+          </w:p>
+          <w:p>
+            <w:pPr>
+              <w:pStyle w:val="Normal"/>
+              <w:spacing w:lineRule="auto" w:line="360"/>
+              <w:rPr>
+                <w:b/>
+                <w:bCs/>
+                <w:kern w:val="0"/>
+                <w:sz w:val="24"/>
+              </w:rPr>
+            </w:pPr>
+            <w:r>
+              <w:rPr>
+                <w:b/>
+                <w:bCs/>
+                <w:kern w:val="0"/>
+                <w:sz w:val="24"/>
+              </w:rPr>
+              <w:t>3. 大语言模型驱动的种子变异主循环</w:t>
             </w:r>
           </w:p>
           <w:p>
@@ -3352,7 +3773,7 @@
                 <w:kern w:val="0"/>
                 <w:sz w:val="24"/>
               </w:rPr>
-              <w:t xml:space="preserve">主循环输入为当前覆盖率映射与编译器源码控制流图（迭代过程见图 6）。每轮先在未覆盖基本块中按相关性挑出一个目标，相关性由该基本块在 CFG 上的后继分支数和所属代码区域对防御机制的关联程度共同决定，使搜索集中在尚未触达且与防御逻辑相关的代码上；随后构造目标上下文：目标函数源码片段（来自当前所测的 GCC 或 LLVM 版本）、逐行覆盖标注、目标基本块位置，以及覆盖目标前驱的若干种子作为示例。提示词组装层把上下文拼接到基础约束求解提示词与机制契约要求之后，提交给大模型生成新 C 种子。编译失败时把错误信息与上一版源码反馈进入下一轮；编译成功后覆盖率分析器判断是否命中目标，预言机给出安全判定。结果分析阶段同时看覆盖增量、是否命中目标、是否触发 bug 三个信号，任一为真即把该种子纳入语料库。种子未命中目标但带来新覆盖时，轻量级动态追踪定位它与基线种子在调用序列上的首个发散点，把发散函数源码作为额外上下文回喂提示词组装层，再次请求模型做精细变异。目标基本块全部覆盖后，主循环可切换到随机变异阶段，仅以预言机为持久化条件继续探索。</w:t>
+              <w:t xml:space="preserve">主循环的输入为当前覆盖率映射与编译器源码控制流图，单轮迭代过程如下图 6 所示。每轮先在未覆盖基本块中按相关性挑出一个目标，相关性由该基本块在 CFG 上的后继分支数和所属代码区域对防御机制的关联程度共同决定，使搜索集中在尚未触达且与防御逻辑相关的代码上。随后构造目标上下文：目标函数源码片段（来自当前所测的 GCC 或 LLVM 版本）、逐行覆盖标注、目标基本块位置，以及覆盖目标前驱的若干种子作为示例。提示词组装层把上下文拼接到基础变异提示词与机制契约要求之后，提交给大语言模型生成新 C 种子。编译失败时把错误信息与上一版源码反馈进入下一轮；编译成功后覆盖率分析器判断是否命中目标，预言机给出安全判定。结果分析阶段同时观察覆盖增量、是否命中目标、是否触发 bug 三个信号，任一为真即把该种子纳入语料库。种子未命中目标但带来新覆盖时，轻量级动态追踪定位它与基线种子在调用序列上的首个发散点，把发散函数源码作为额外上下文回喂提示词组装层，再次请求模型做精细变异。目标基本块全部覆盖后，主循环可切换到随机变异阶段，仅以预言机为持久化条件继续探索。</w:t>
             </w:r>
           </w:p>
           <w:p>
@@ -3403,47 +3824,49 @@
           <w:p>
             <w:pPr>
               <w:pStyle w:val="Normal"/>
-              <w:spacing w:lineRule="auto" w:line="300"/>
+              <w:spacing w:lineRule="auto" w:line="360"/>
               <w:jc w:val="center"/>
               <w:rPr>
                 <w:rFonts w:ascii="宋体" w:hAnsi="宋体" w:eastAsia="宋体"/>
-                <w:i/>
-                <w:sz w:val="20"/>
-              </w:rPr>
-            </w:pPr>
-            <w:r>
-              <w:rPr>
-                <w:rFonts w:ascii="宋体" w:hAnsi="宋体" w:eastAsia="宋体"/>
-                <w:i/>
-                <w:sz w:val="20"/>
-              </w:rPr>
-              <w:t>图 6  大模型约束求解主循环</w:t>
-            </w:r>
-          </w:p>
-          <w:p>
-            <w:pPr>
-              <w:pStyle w:val="Normal"/>
-              <w:spacing w:lineRule="auto" w:line="360"/>
-              <w:rPr>
-                <w:sz w:val="24"/>
-              </w:rPr>
-            </w:pPr>
-          </w:p>
-          <w:p>
-            <w:pPr>
-              <w:pStyle w:val="Normal"/>
-              <w:spacing w:lineRule="auto" w:line="360"/>
-              <w:rPr>
                 <w:b/>
                 <w:bCs/>
-                <w:kern w:val="0"/>
-                <w:sz w:val="24"/>
-              </w:rPr>
-            </w:pPr>
-            <w:r>
-              <w:rPr>
+                <w:sz w:val="22"/>
+              </w:rPr>
+            </w:pPr>
+            <w:r>
+              <w:rPr>
+                <w:rFonts w:ascii="宋体" w:hAnsi="宋体" w:eastAsia="宋体"/>
                 <w:b/>
                 <w:bCs/>
+                <w:sz w:val="22"/>
+              </w:rPr>
+              <w:t>图 6  大语言模型驱动的种子变异主循环</w:t>
+            </w:r>
+          </w:p>
+          <w:p>
+            <w:pPr>
+              <w:pStyle w:val="Normal"/>
+              <w:spacing w:lineRule="auto" w:line="360"/>
+              <w:rPr>
+                <w:sz w:val="24"/>
+              </w:rPr>
+            </w:pPr>
+          </w:p>
+          <w:p>
+            <w:pPr>
+              <w:pStyle w:val="Normal"/>
+              <w:spacing w:lineRule="auto" w:line="360"/>
+              <w:rPr>
+                <w:b/>
+                <w:bCs/>
+                <w:kern w:val="0"/>
+                <w:sz w:val="24"/>
+              </w:rPr>
+            </w:pPr>
+            <w:r>
+              <w:rPr>
+                <w:b/>
+                <w:bCs/>
                 <w:kern w:val="0"/>
                 <w:sz w:val="24"/>
               </w:rPr>
@@ -3514,7 +3937,7 @@
                 <w:kern w:val="0"/>
                 <w:sz w:val="24"/>
               </w:rPr>
-              <w:t xml:space="preserve">目前已在 GCC 多个版本（若干稳定版与一个本地构建的 master 快照）上对栈金丝雀、_FORTIFY_SOURCE、IBT 等部分防御机制做了实验，LLVM 侧同类实验纳入下一阶段。已完成实验共发现 3 例可被上游确认的 silent failure[17-20]；下文展开其中两例，第三例（栈金丝雀在多个 ISA 的 fallback 后端上函数返回时寄存器未清零，与 PR-96191[7] 同源）篇幅较短，在 5.3 节简述。</w:t>
+              <w:t xml:space="preserve">目前已在 GCC 多个版本（若干稳定版与一个本地构建的 master 快照）上对栈金丝雀、_FORTIFY_SOURCE、IBT 等部分防御机制做了实验，LLVM 侧同类实验纳入下一阶段。已完成实验在 GCC 上发现 3 例可被上游确认的静默失效[17-20]。下文展开其中两例，第三例（栈金丝雀在多个 ISA 的 fallback 后端上函数返回时寄存器未清零，与 PR-96191[7] 同源）篇幅较短，在 5.3 节简述。</w:t>
             </w:r>
           </w:p>
           <w:p>
@@ -3553,7 +3976,7 @@
                 <w:kern w:val="0"/>
                 <w:sz w:val="24"/>
               </w:rPr>
-              <w:t xml:space="preserve">_FORTIFY_SOURCE 是 GCC 与 glibc 配合的源代码加固机制。开启后，glibc 头文件在预处理阶段把 strcat 等危险接口重写为带 size 参数的 __strcat_chk，运行时据此检查目的缓冲区上限。GCC 的 strlen pass 进一步识别已知前缀长度的目的指针，将 __strcat_chk 改写为性能更优的 __stpcpy_chk，并把目的指针前移 strlen(dst) 字节。这里的安全不变量是：目的指针前移后，传给 __stpcpy_chk 的 size 参数必须由原始 objsize 减去 strlen(dst)，否则运行时上限就被静默放宽 strlen(dst) 字节。</w:t>
+              <w:t xml:space="preserve">_FORTIFY_SOURCE 是 GCC 与 glibc 配合的源代码加固机制[10]。开启后，glibc 头文件在预处理阶段把 strcat 等危险接口重写为带 size 参数的 __strcat_chk，运行时据此检查目的缓冲区上限。GCC 的 strlen pass 进一步识别已知前缀长度的目的指针，将 __strcat_chk 改写为性能更优的 __stpcpy_chk，并把目的指针前移 strlen(dst) 字节。这里的安全不变量是：目的指针前移后，传给 __stpcpy_chk 的 size 参数必须由原始 objsize 减去 strlen(dst)，否则运行时上限就被静默放宽 strlen(dst) 字节。</w:t>
             </w:r>
           </w:p>
           <w:p>
@@ -3571,7 +3994,7 @@
                 <w:kern w:val="0"/>
                 <w:sz w:val="24"/>
               </w:rPr>
-              <w:t xml:space="preserve">实测中，本方法构造的种子在该路径上稳定触发了 size 参数未相应减小的实例。反汇编层面 strcat → __strcat_chk → __stpcpy_chk 整条链条仍然出现，看似 FORTIFY 仍在生效，但"按 dst 剩余空间收紧上限"那一步已被丢弃。该缺陷自 GCC 4.7 起存在，跨越十余年未被发现；上报后已被确认（PR-125079[17]）并合入主分支，预计随 GCC 16.1 发布，开发团队同时计划向 GCC 13、14、15 回送补丁。这条路径与 2018 年的 PR-87672[6] 处于同一文件：当年的修复只覆盖了一个对称分支，另一支被遗漏至今——这本身就是第一章所述"矩阵同源遗漏"的又一例证。</w:t>
+              <w:t xml:space="preserve">本方法构造的种子在该路径上稳定触发了 size 参数未相应减小的实例。反汇编层面 strcat → __strcat_chk → __stpcpy_chk 整条链条仍然出现，看似 FORTIFY 仍在生效，但"按 dst 剩余空间收紧上限"那一步已被丢弃。该缺陷自 GCC 4.7 起存在，跨越十余年未被发现；上报后已被确认（PR-125079[17]）并合入主分支，预计随 GCC 16.1 发布，开发团队同时计划向 GCC 13、14、15 回送补丁。值得一提的是，这条路径与 2018 年的 PR-87672[6] 处于同一文件：当年的修复只覆盖了一个对称分支，另一支被遗漏至今，这本身就是第一章所述"矩阵同源遗漏"的又一例证。</w:t>
             </w:r>
           </w:p>
           <w:p>
@@ -3589,7 +4012,7 @@
                 <w:kern w:val="0"/>
                 <w:sz w:val="24"/>
               </w:rPr>
-              <w:t xml:space="preserve">预言机方面，本例命中"FORTIFY 调用点的 size 参数下界推断"不变量，证据为静态符号 + 反汇编，在静态阶段判定；该优化路径与 size 静默放宽的位置见图 7。</w:t>
+              <w:t xml:space="preserve">预言机方面，本例命中"FORTIFY 调用点的 size 参数下界推断"不变量，证据为静态符号与反汇编，在静态阶段判定。该优化路径与 size 被静默放宽的具体位置如下图 7 所示。</w:t>
             </w:r>
           </w:p>
           <w:p>
@@ -3640,106 +4063,33 @@
           <w:p>
             <w:pPr>
               <w:pStyle w:val="Normal"/>
-              <w:spacing w:lineRule="auto" w:line="300"/>
+              <w:spacing w:lineRule="auto" w:line="360"/>
               <w:jc w:val="center"/>
               <w:rPr>
                 <w:rFonts w:ascii="宋体" w:hAnsi="宋体" w:eastAsia="宋体"/>
-                <w:i/>
-                <w:sz w:val="20"/>
-              </w:rPr>
-            </w:pPr>
-            <w:r>
-              <w:rPr>
-                <w:rFonts w:ascii="宋体" w:hAnsi="宋体" w:eastAsia="宋体"/>
-                <w:i/>
-                <w:sz w:val="20"/>
-              </w:rPr>
-              <w:t>图 7  _FORTIFY_SOURCE 优化路径与 size 静默放宽</w:t>
-            </w:r>
-          </w:p>
-          <w:p>
-            <w:pPr>
-              <w:pStyle w:val="Normal"/>
-              <w:spacing w:lineRule="auto" w:line="360"/>
-              <w:rPr>
-                <w:sz w:val="24"/>
-              </w:rPr>
-            </w:pPr>
-          </w:p>
-          <w:p>
-            <w:pPr>
-              <w:pStyle w:val="Normal"/>
-              <w:spacing w:lineRule="auto" w:line="360"/>
-              <w:rPr>
                 <w:b/>
                 <w:bCs/>
-                <w:kern w:val="0"/>
-                <w:sz w:val="24"/>
-              </w:rPr>
-            </w:pPr>
-            <w:r>
-              <w:rPr>
+                <w:sz w:val="22"/>
+              </w:rPr>
+            </w:pPr>
+            <w:r>
+              <w:rPr>
+                <w:rFonts w:ascii="宋体" w:hAnsi="宋体" w:eastAsia="宋体"/>
                 <w:b/>
                 <w:bCs/>
-                <w:kern w:val="0"/>
-                <w:sz w:val="24"/>
-              </w:rPr>
-              <w:t>5.2 案例二：IBT 检查漏过 endbr 字节模式导致间接跳转保护被绕过</w:t>
-            </w:r>
-          </w:p>
-          <w:p>
-            <w:pPr>
-              <w:pStyle w:val="Normal"/>
-              <w:spacing w:lineRule="auto" w:line="360"/>
-              <w:ind w:firstLineChars="200" w:startChars="0" w:start="0" w:endChars="0" w:end="0"/>
-              <w:rPr>
-                <w:kern w:val="0"/>
-                <w:sz w:val="24"/>
-              </w:rPr>
-            </w:pPr>
-            <w:r>
-              <w:rPr>
-                <w:kern w:val="0"/>
-                <w:sz w:val="24"/>
-              </w:rPr>
-              <w:t xml:space="preserve">IBT（Indirect Branch Tracking）是 Intel CET 中针对间接跳转的保护机制：硬件要求间接跳转或调用的目标地址必须以 endbr 指令开头，否则触发异常。endbr 在二进制中是固定的四字节值（endbr64 = F3 0F 1E FA、endbr32 = F3 0F 1E FB），按设计只应作为合法间接跳转入口出现在代码段。如果这四个字节以其他形式出现——比如作为 movabsq 指令的 64 位立即数的一部分嵌入 .text——攻击者就可以把控制流劫持到该处，硬件会将其识别为合法 landing pad，IBT 语义被绕过。</w:t>
-            </w:r>
-          </w:p>
-          <w:p>
-            <w:pPr>
-              <w:pStyle w:val="Normal"/>
-              <w:spacing w:lineRule="auto" w:line="360"/>
-              <w:ind w:firstLineChars="200" w:startChars="0" w:start="0" w:endChars="0" w:end="0"/>
-              <w:rPr>
-                <w:kern w:val="0"/>
-                <w:sz w:val="24"/>
-              </w:rPr>
-            </w:pPr>
-            <w:r>
-              <w:rPr>
-                <w:kern w:val="0"/>
-                <w:sz w:val="24"/>
-              </w:rPr>
-              <w:t xml:space="preserve">GCC 在 x86 后端用 ix86_endbr_immediate_operand 谓词做字节级检测：当目标启用 IBT 时，谓词扫描立即数中是否存在 endbr 模式，含该模式的立即数会被拒绝（同源历史修复参见 PR-96350[8]）。本方法在该谓词实现中发现一个逻辑漏洞：扫描循环对"高位非零"的 64 位立即数提前退出，只要 endbr 字节排布在立即数高位，扫描就走不到对应位置。这类立即数被错误接受，进而在 .text 中嵌入了不受控的伪 landing pad。该缺陷已上报上游（PR-125084[18]），等待维护者回复。</w:t>
-            </w:r>
-          </w:p>
-          <w:p>
-            <w:pPr>
-              <w:pStyle w:val="Normal"/>
-              <w:spacing w:lineRule="auto" w:line="360"/>
-              <w:ind w:firstLineChars="200" w:startChars="0" w:start="0" w:endChars="0" w:end="0"/>
-              <w:rPr>
-                <w:kern w:val="0"/>
-                <w:sz w:val="24"/>
-              </w:rPr>
-            </w:pPr>
-            <w:r>
-              <w:rPr>
-                <w:kern w:val="0"/>
-                <w:sz w:val="24"/>
-              </w:rPr>
-              <w:t xml:space="preserve">预言机方面，本例命中"endbr 字节模式不应出现在非跳转目标的指令中"不变量，证据为代码段内 endbr 模式扫描，属静态指令流检查。</w:t>
-            </w:r>
+                <w:sz w:val="22"/>
+              </w:rPr>
+              <w:t>图 7  _FORTIFY_SOURCE 优化路径与 size 静默放宽</w:t>
+            </w:r>
+          </w:p>
+          <w:p>
+            <w:pPr>
+              <w:pStyle w:val="Normal"/>
+              <w:spacing w:lineRule="auto" w:line="360"/>
+              <w:rPr>
+                <w:sz w:val="24"/>
+              </w:rPr>
+            </w:pPr>
           </w:p>
           <w:p>
             <w:pPr>
@@ -3759,7 +4109,7 @@
                 <w:kern w:val="0"/>
                 <w:sz w:val="24"/>
               </w:rPr>
-              <w:t>5.3 案例三：多 ISA 下 canary 寄存器返回时未清零</w:t>
+              <w:t>5.2 案例二：IBT 检查漏过 endbr 字节模式导致间接跳转保护被绕过</w:t>
             </w:r>
           </w:p>
           <w:p>
@@ -3777,7 +4127,43 @@
                 <w:kern w:val="0"/>
                 <w:sz w:val="24"/>
               </w:rPr>
-              <w:t xml:space="preserve">本方法在 GCC 通用栈保护后端的 fallback 路径上还找到一例同类失效：MIPS、LoongArch、Xtensa、CSKY 等 ISA 的 fallback 后端未提供专用 epilogue 模板，函数返回时金丝雀寄存器未显式清零，进程级 __stack_chk_guard 值在调用者的可见寄存器中残留。该问题与 2020 年针对 AArch64 / ARM 的 PR-96191[7] 同源，当年修复未覆盖上述后端。本课题以 meta-bug PR-125045[19] 统一跟踪该家族在多 ISA 上的实例，其中 LoongArch 子例（PR-125049[20]）已被维护者确认并合入修复，其余 ISA 子例正在依次上报。</w:t>
+              <w:t xml:space="preserve">IBT 是 Intel CET 中针对间接跳转的保护机制[9]：硬件要求间接跳转或调用的目标地址必须以 endbr 指令开头，否则触发异常。endbr 在二进制中是固定的四字节值（endbr64 = F3 0F 1E FA、endbr32 = F3 0F 1E FB），按设计只应作为合法间接跳转入口出现在代码段。如果这四个字节以其他形式出现，例如作为 movabsq 指令的 64 位立即数的一部分嵌入 .text，攻击者就可以把控制流劫持到该处，硬件会将其识别为合法 landing pad，IBT 语义被绕过。</w:t>
+            </w:r>
+          </w:p>
+          <w:p>
+            <w:pPr>
+              <w:pStyle w:val="Normal"/>
+              <w:spacing w:lineRule="auto" w:line="360"/>
+              <w:ind w:firstLineChars="200" w:startChars="0" w:start="0" w:endChars="0" w:end="0"/>
+              <w:rPr>
+                <w:kern w:val="0"/>
+                <w:sz w:val="24"/>
+              </w:rPr>
+            </w:pPr>
+            <w:r>
+              <w:rPr>
+                <w:kern w:val="0"/>
+                <w:sz w:val="24"/>
+              </w:rPr>
+              <w:t xml:space="preserve">GCC 在 x86 后端用 ix86_endbr_immediate_operand 谓词做字节级检测：当目标启用 IBT 时，谓词扫描立即数中是否存在 endbr 模式，含该模式的立即数会被拒绝（同源历史修复参见 PR-96350[8]）。本方法在该谓词实现中发现一个逻辑漏洞：扫描循环对"高位非零"的 64 位立即数提前退出，只要 endbr 字节排布在立即数高位，扫描就走不到对应位置。这类立即数被错误接受，进而在 .text 中嵌入了不受控的伪 landing pad。该缺陷已上报上游（PR-125084[18]），等待维护者回复。</w:t>
+            </w:r>
+          </w:p>
+          <w:p>
+            <w:pPr>
+              <w:pStyle w:val="Normal"/>
+              <w:spacing w:lineRule="auto" w:line="360"/>
+              <w:ind w:firstLineChars="200" w:startChars="0" w:start="0" w:endChars="0" w:end="0"/>
+              <w:rPr>
+                <w:kern w:val="0"/>
+                <w:sz w:val="24"/>
+              </w:rPr>
+            </w:pPr>
+            <w:r>
+              <w:rPr>
+                <w:kern w:val="0"/>
+                <w:sz w:val="24"/>
+              </w:rPr>
+              <w:t xml:space="preserve">预言机方面，本例命中"endbr 字节模式不应出现在非跳转目标的指令中"不变量，证据为代码段内 endbr 模式扫描，属静态指令流检查。</w:t>
             </w:r>
           </w:p>
           <w:p>
@@ -3798,6 +4184,45 @@
                 <w:kern w:val="0"/>
                 <w:sz w:val="24"/>
               </w:rPr>
+              <w:t>5.3 案例三：多 ISA 下 canary 寄存器返回时未清零</w:t>
+            </w:r>
+          </w:p>
+          <w:p>
+            <w:pPr>
+              <w:pStyle w:val="Normal"/>
+              <w:spacing w:lineRule="auto" w:line="360"/>
+              <w:ind w:firstLineChars="200" w:startChars="0" w:start="0" w:endChars="0" w:end="0"/>
+              <w:rPr>
+                <w:kern w:val="0"/>
+                <w:sz w:val="24"/>
+              </w:rPr>
+            </w:pPr>
+            <w:r>
+              <w:rPr>
+                <w:kern w:val="0"/>
+                <w:sz w:val="24"/>
+              </w:rPr>
+              <w:t xml:space="preserve">本方法在 GCC 通用栈保护后端的 fallback 路径上还找到一例同类失效：MIPS、LoongArch、Xtensa、CSKY 等 ISA 的 fallback 后端未提供专用 epilogue 模板，函数返回时金丝雀寄存器未显式清零，进程级 __stack_chk_guard 值在调用者的可见寄存器中残留。该问题与 2020 年针对 AArch64 / ARM 的 PR-96191[7] 同源，当年修复未覆盖上述后端。本课题以 meta-bug PR-125045[19] 统一跟踪该家族在多 ISA 上的实例，其中 LoongArch 子例（PR-125049[20]）已被维护者确认并合入修复，其余 ISA 子例正在依次上报。</w:t>
+            </w:r>
+          </w:p>
+          <w:p>
+            <w:pPr>
+              <w:pStyle w:val="Normal"/>
+              <w:spacing w:lineRule="auto" w:line="360"/>
+              <w:rPr>
+                <w:b/>
+                <w:bCs/>
+                <w:kern w:val="0"/>
+                <w:sz w:val="24"/>
+              </w:rPr>
+            </w:pPr>
+            <w:r>
+              <w:rPr>
+                <w:b/>
+                <w:bCs/>
+                <w:kern w:val="0"/>
+                <w:sz w:val="24"/>
+              </w:rPr>
               <w:t>5.4 小结</w:t>
             </w:r>
           </w:p>
@@ -3816,7 +4241,7 @@
                 <w:kern w:val="0"/>
                 <w:sz w:val="24"/>
               </w:rPr>
-              <w:t xml:space="preserve">三例分别覆盖静态符号、动态行为、指令流字节模式三类不变量形态，共同特征是：二进制看起来带有保护，但编译器代码路径某一处的安全不变量已失去维护。方法在不修改编译器的前提下，通过约束求解与不变量预言机组合把这类差异在自动化流程中暴露出来。LLVM 侧实验预计在后续阶段以同一预言机框架补全。</w:t>
+              <w:t xml:space="preserve">三例分别对应静态符号、动态行为、指令流字节模式三类不变量证据形态，且具有同一个共同特征：二进制看起来仍然带有保护，但编译器代码路径某一处的安全不变量已失去维护。方法在不修改编译器的前提下，通过覆盖率引导的种子变异与不变量预言机的组合，把这类差异在自动化流程中暴露出来。LLVM 侧实验预计在后续阶段以同一预言机框架补全。</w:t>
             </w:r>
           </w:p>
           <w:p>
@@ -4228,6 +4653,25 @@
                 <w:sz w:val="24"/>
               </w:rPr>
               <w:t xml:space="preserve">[20] GNU Project. GCC Bugzilla PR 125049 — [loongarch] SSP fallback leaves __stack_chk_guard live in $r12 at `jr $r1`[EB/OL]. (2026)[2026-05-11]. https://gcc.gnu.org/bugzilla/show_bug.cgi?id=125049.</w:t>
+            </w:r>
+          </w:p>
+          <w:p>
+            <w:pPr>
+              <w:pStyle w:val="Normal"/>
+              <w:keepLines/>
+              <w:spacing w:lineRule="auto" w:line="360"/>
+              <w:jc w:val="start"/>
+              <w:rPr>
+                <w:kern w:val="0"/>
+                <w:sz w:val="24"/>
+              </w:rPr>
+            </w:pPr>
+            <w:r>
+              <w:rPr>
+                <w:kern w:val="0"/>
+                <w:sz w:val="24"/>
+              </w:rPr>
+              <w:t xml:space="preserve">[21] CVE Program. CVE Metrics — published vulnerabilities trend[EB/OL]. (2026)[2026-05-12]. https://www.cve.org/about/Metrics.</w:t>
             </w:r>
           </w:p>
         </w:tc>
@@ -4338,7 +4782,7 @@
                 <w:kern w:val="0"/>
                 <w:sz w:val="24"/>
               </w:rPr>
-              <w:t xml:space="preserve">理论分析涉及三方面：编译器主流防御机制的安全不变量及其证据形式、覆盖率与控制流图引导的目标基本块选择策略、大模型生成能力与预言机判定的耦合方式。预期产出包括：一套覆盖至少三种主流防御机制的不变量集合、一套可扩展的预言机框架、一个可面向 GCC 与 LLVM 跨架构运行的 fuzzer 原型；通过在 GCC 与 LLVM 主流版本上发现真实 silent failure 来验证有效性。硬件方面，开发与实验依托一台 64 位 Linux 工作站（不少于 32 GB 内存、百 GB 级 SSD），用于 GCC / LLVM 多版本本地构建、覆盖率数据缓存与跨架构 QEMU 用户态执行；大模型推理通过远程 API 完成，本机不需要独立 GPU。</w:t>
+              <w:t xml:space="preserve">理论分析对应技术路线的四个部分：编译器主流防御机制安全不变量的形式化与证据提炼、不变量到二进制与运行行为可判定检查器的工程化方法、覆盖率与控制流图引导的目标基本块挑选策略，以及大语言模型生成与预言机判定的耦合方式。预期产出包括：一套覆盖至少三种主流防御机制的安全不变量集合、一套可扩展的不变量预言机框架，以及一个可面向 GCC 与 LLVM 跨架构运行的 fuzzer 原型；并通过在 GCC 与 LLVM 主流版本上发现真实静默失效，验证方法的有效性与跨编译器迁移性。硬件方面，开发与实验依托一台 64 位 Linux 工作站（不少于 32 GB 内存与百 GB 级 SSD），用于 GCC / LLVM 多版本本地构建、覆盖率数据缓存与跨架构 QEMU 用户态执行；大语言模型推理通过远程 API 完成，本机不需要独立 GPU。</w:t>
             </w:r>
           </w:p>
         </w:tc>

</xml_diff>

<commit_message>
docs(proposal): refine thesis narrative and add examples
Clarify the proposal's research framing and methodology so the core argument reads more directly. Add supporting examples and sync the generated Word document with the chapter updates.
</commit_message>
<xml_diff>
--- a/docs/开题报告/DeFuzz-开题报告.docx
+++ b/docs/开题报告/DeFuzz-开题报告.docx
@@ -2400,7 +2400,7 @@
                 <w:kern w:val="0"/>
                 <w:sz w:val="24"/>
               </w:rPr>
-              <w:t xml:space="preserve">近十年来，被公开披露的安全漏洞数量持续攀升。截至 2025 年，CVE 漏洞库每年新登记的条目稳定在两万条以上，且仍在快速增长[21]。Microsoft、Google 等厂商陆续公开承认，仅依靠人工审计与安全编程规范并不足以彻底清除上层代码中的内存安全 Bug。在这一前提下，工业界与学术界把更多重心放到了"漏洞被触发后能否拦下攻击者"这一问题上：栈金丝雀（stack canary）、源代码加固（_FORTIFY_SOURCE）、间接跳转跟踪（indirect branch tracking, IBT）、控制流完整性（control-flow integrity, CFI）、指针认证（pointer authentication, PAC）、分支目标识别（branch target identification, BTI）、影子栈（shadow stack）等多项防御机制由编译器与运行时共同叠加部署，在漏洞被触发的瞬间承担起兜底防线的角色。</w:t>
+              <w:t xml:space="preserve">近十年来，被公开披露的安全漏洞数量持续攀升。截至 2025 年，CVE 漏洞库每年新登记的条目稳定在两万条以上，且仍在快速增长[21]。Microsoft、Google 等厂商陆续公开承认，仅依靠人工审计与安全编程规范并不足以彻底清除上层代码中的内存安全 Bug。因此，工业界与学术界将重心转向漏洞被触发后的拦截能力：栈金丝雀（stack canary）、源代码加固（_FORTIFY_SOURCE）、间接跳转跟踪（indirect branch tracking, IBT）、控制流完整性（control-flow integrity, CFI）、指针认证（pointer authentication, PAC）、分支目标识别（branch target identification, BTI）、影子栈（shadow stack）等多项防御机制由编译器与运行时共同叠加部署，在漏洞被触发的瞬间承担起兜底防线的角色。</w:t>
             </w:r>
           </w:p>
           <w:p>
@@ -2418,7 +2418,7 @@
                 <w:kern w:val="0"/>
                 <w:sz w:val="24"/>
               </w:rPr>
-              <w:t xml:space="preserve">由编译器承担的兜底机制有一个共同的工作模式：在编译期向二进制中插入检查指令、布局约束或元数据，使运行期一旦偏离预定义的合法行为即可被发现并立即终止程序。以栈金丝雀为例，编译器在易受溢出影响的栈帧中插入随机值哨位，并在函数返回前比对其是否被改写。由此可见，兜底防线的有效性不仅取决于编译器中前端、中端与后端能否生成对应代码，还取决于这些代码所依赖的指令集架构（instruction set architecture, ISA）假设是否成立。</w:t>
+              <w:t xml:space="preserve">由编译器承担的兜底机制有一个共同的工作模式：在编译期向二进制中插入检查指令、布局约束或元数据，使运行期一旦偏离预定义的合法行为即可被发现并立即终止程序。以栈金丝雀为例，编译器在易受溢出影响的栈帧中插入随机值哨位，并在函数返回前比对其是否被改写。兜底防线的有效性依赖于编译器各端能否正确生成代码，以及这些代码所依赖的指令集架构（instruction set architecture, ISA）假设是否成立。</w:t>
             </w:r>
           </w:p>
           <w:p>
@@ -2551,7 +2551,7 @@
                 <w:kern w:val="0"/>
                 <w:sz w:val="24"/>
               </w:rPr>
-              <w:t xml:space="preserve">CVE-2023-4039 直观地揭示了一个共性问题：编译器侧防御机制的有效性强依赖于具体 ISA 上的栈布局、寄存器分配与指令编码假设。一旦防御设计中的某项假设与某套 ISA 不一致，运行期保护就会悄然失效。这种失效具有"双重无声"特征：编译时不报错（工具链与功能测试都察觉不到），运行时也能产生正确的功能结果（程序行为也察觉不到），但其安全契约已经被打破。本课题把这种形态的失效称为静默失效（silent failure）——编译产物看起来仍然带着完整的防线，攻击者却能直接绕过它。</w:t>
+              <w:t xml:space="preserve">CVE-2023-4039 直观地揭示了一个共性问题：编译器侧防御机制的有效性强依赖于具体 ISA 上的栈布局、寄存器分配与指令编码假设。一旦防御设计中的某项假设与某套 ISA 不一致，运行期保护就会悄然失效。这种失效具有"双重无声"特征：编译时不报错（工具链与功能测试都察觉不到），运行时也能产生正确的功能结果（程序行为也察觉不到），但其安全契约已经被打破。本课题将这种形态的失效称为静默失效（silent failure）：编译产物看似带有完整防线，但攻击者可直接绕过。</w:t>
             </w:r>
           </w:p>
           <w:p>
@@ -2608,7 +2608,7 @@
                 <w:kern w:val="0"/>
                 <w:sz w:val="24"/>
               </w:rPr>
-              <w:t xml:space="preserve">第一是搜索空间巨大。如下图 2 所示，编译器需要在多种防御机制与多套 ISA 构成的二维空间中维护安全契约：纵向上至少包含栈金丝雀、_FORTIFY_SOURCE、IBT、CFI、BTI、PAC、影子栈等机制；横向上至少包含 x86-64、AArch64、RISC-V、LoongArch、MIPS、PowerPC 等架构。每个格点对应一份独立的中端 pass 或后端模板，调用约定、寄存器分配、指令编码上的任意细节都可能影响该机制能否兑现其安全契约。已确认的同源遗漏并不少见：与 CVE-2023-4039 同源的 PR-96191[7] 在 2020 年修复时仅覆盖 AArch64 / ARM，未触及 MIPS、LoongArch、Xtensa、CSKY 等 fallback 后端，因此同一类失效在这些架构上又静静地存在了若干年。本课题在初步实验阶段已向 GCC 上游报告并确认了多例此类同源失效[17-20]，第五章将给出具体案例。</w:t>
+              <w:t xml:space="preserve">第一是搜索空间巨大。如图 2 所示，编译器需要在多种防御机制与多套 ISA 构成的二维空间中维护安全契约：纵向上至少包含栈金丝雀、_FORTIFY_SOURCE、IBT、CFI、BTI、PAC、影子栈等机制；横向上至少包含 x86-64、AArch64、RISC-V、LoongArch、MIPS、PowerPC 等架构。每个格点对应一份独立的中端 pass 或后端模板，调用约定、寄存器分配、指令编码上的任意细节都可能影响该机制能否兑现其安全契约。已确认的同源遗漏并不少见：与 CVE-2023-4039 同源的 PR-96191[7] 在 2020 年修复时仅覆盖 AArch64 / ARM，未触及 MIPS、LoongArch、Xtensa、CSKY 等 fallback 后端，因此同一类失效在这些架构上又静静地存在了若干年。本课题在初步实验阶段已向 GCC 上游报告并确认了多例此类同源失效[17-20]，第五章将给出具体案例。</w:t>
             </w:r>
           </w:p>
           <w:p>
@@ -2702,7 +2702,7 @@
                 <w:kern w:val="0"/>
                 <w:sz w:val="24"/>
               </w:rPr>
-              <w:t xml:space="preserve">第二是失效难以判定。即便测试输入已把执行推进到防御机制相关代码路径，"防御是否仍满足其安全契约"也很难直接观察到：程序通常不会崩溃，与其他编译器的输出也保持一致，看似一切正常，而契约本身已经失守。本课题把每条防御机制运行期间必须始终成立的若干静态或动态性质统称为安全不变量（safety invariant，亦可理解为该机制的"安全规则"，例如金丝雀必须位于所有可被越界写入的栈对象与返回地址之间）。一旦这些性质被破坏，便对应一次静默失效。然而已有的自动化手段对此并不敏感：以差分输出或编译器崩溃为信号的工具（如 Csmith、YARPGen）几乎不会触发；覆盖率引导的模糊测试（fuzzing）虽然能把执行推进到相关代码路径，但本身并不携带判断该路径是否仍维护安全不变量的预言机（oracle）。这一判定空白决定了即便穷举搜索空间，也无法自动判别每一格点的状态。</w:t>
+              <w:t xml:space="preserve">第二是失效难以判定。即使测试输入推进到防御机制相关代码路径，"防御是否仍满足其安全契约"也很难直接观察到：程序通常不会崩溃，与其他编译器的输出也保持一致，看似一切正常，而契约本身已经失守。本课题将每条防御机制运行期间必须始终成立的若干静态或动态性质统称为安全不变量（safety invariant，亦可理解为该机制的"安全规则"，例如金丝雀必须位于所有可被越界写入的栈对象与返回地址之间）。一旦这些性质被破坏，便对应一次静默失效。然而已有的自动化手段对此并不敏感：以差分输出或编译器崩溃为信号的工具（如 Csmith、YARPGen）几乎不会触发；覆盖率引导的模糊测试（fuzzing）虽然能把执行推进到相关代码路径，但本身并不携带判断该路径是否仍维护安全不变量的预言机（oracle）。这一判定空白决定了即使穷举搜索空间，也无法自动判别每一格点的状态。</w:t>
             </w:r>
           </w:p>
           <w:p>
@@ -2720,7 +2720,7 @@
                 <w:kern w:val="0"/>
                 <w:sz w:val="24"/>
               </w:rPr>
-              <w:t xml:space="preserve">值得注意的是，搜索空间巨大也意味着 fuzzing 自身在该问题上同样面临覆盖效率的考验。本课题对此的应对思路是把推进目标显式限定在"防御机制相关代码"，让覆盖率反馈与大语言模型驱动的种子变异共同约束搜索方向，详见第三、四章。</w:t>
+              <w:t xml:space="preserve">同时，巨大的搜索空间也给 fuzzing 自身的覆盖效率带来了考验。本课题对此的应对思路是把推进目标显式限定在"防御机制相关代码"，让覆盖率反馈与大语言模型驱动的种子变异共同约束搜索方向，详见第三、四章。</w:t>
             </w:r>
           </w:p>
           <w:p>
@@ -2759,7 +2759,7 @@
                 <w:kern w:val="0"/>
                 <w:sz w:val="24"/>
               </w:rPr>
-              <w:t xml:space="preserve">编译器是绝大多数软件防御机制的实际载体，其在"防御机制 × ISA"二维矩阵上的静默失效会直接削弱整个软件生态的运行时安全保障。然而，现有自动化测试方法既未把搜索空间约束到防御机制相关代码，也未把安全不变量纳入判定体系。如果能把矩阵格点上的安全不变量翻译为可机器判定的检查器，并主动引导编译器走到相应代码路径，就既可暴露既有缺陷家族的同类变种，也有望在后续优化引入同类回归时及早发现。本研究以此为出发点，结合大语言模型的代码理解能力与覆盖率反馈，构建一种面向编译器防御机制脆弱性的分析方法。</w:t>
+              <w:t xml:space="preserve">编译器是绝大多数软件防御机制的实际载体，其在"防御机制 × ISA"二维矩阵上的静默失效会直接削弱整个软件生态的运行时安全保障。然而，现有自动化测试方法既未把搜索空间约束到防御机制相关代码，也未把安全不变量纳入判定体系。如果能把矩阵格点上的安全不变量翻译为可机器判定的检查器，并主动引导编译器走到相应代码路径，就既可暴露既有缺陷家族的同类变种，也有望在后续优化引入同类回归时及早发现。基于此，本研究结合大语言模型的代码理解能力与覆盖率反馈，构建面向编译器防御机制脆弱性的分析方法。</w:t>
             </w:r>
           </w:p>
           <w:p>
@@ -2790,7 +2790,7 @@
                 <w:kern w:val="0"/>
                 <w:sz w:val="24"/>
               </w:rPr>
-              <w:t>二、研究现状</w:t>
+              <w:t>二、研究现状（相关工作）</w:t>
             </w:r>
           </w:p>
           <w:p>
@@ -2811,7 +2811,7 @@
                 <w:kern w:val="0"/>
                 <w:sz w:val="24"/>
               </w:rPr>
-              <w:t>2.1 概述</w:t>
+              <w:t>2.1 综述与分类逻辑</w:t>
             </w:r>
           </w:p>
           <w:p>
@@ -2829,7 +2829,7 @@
                 <w:kern w:val="0"/>
                 <w:sz w:val="24"/>
               </w:rPr>
-              <w:t xml:space="preserve">第一章已说明，自动检测编译器防御机制的静默失效面临两个挑战：搜索空间巨大、失效难以判定。围绕这两条挑战梳理现有方法可以发现，此前的工作或针对其中之一做出推进，或停留在与编译器自身防御机制弱相关的常规缺陷上，目前尚未出现同时直面两条挑战的成熟方案。下文按这两个维度组织文献，并讨论各自的覆盖范围与遗留空白。</w:t>
+              <w:t xml:space="preserve">要在编译器中系统性地暴露此类静默失效，面临两个挑战：搜索空间巨大、失效难以判定。围绕这两条挑战梳理现有方法可以发现，此前的工作或针对其中之一做出推进，或停留在与编译器自身防御机制弱相关的常规缺陷上，目前尚未出现同时直面两条挑战的成熟方案。下文按这两个维度组织文献，并讨论各自的覆盖范围与遗留空白。</w:t>
             </w:r>
           </w:p>
           <w:p>
@@ -3144,7 +3144,7 @@
                 <w:kern w:val="0"/>
                 <w:sz w:val="24"/>
               </w:rPr>
-              <w:t xml:space="preserve">把研究现状放回第一章给出的两条挑战上，现有方法在搜索空间一侧已具备较成熟的覆盖率推进与大模型变异手段，但所有这些手段的推进目标都不针对防御机制相关代码；在失效判定一侧，所有主流预言机均建立在崩溃或可观察输出差异上，无法识别防御契约的静默失效。少数面向编译器自身防御机制的工作或局限于单一机制的差分测试，或停留在二进制层面的事后审计，难以反向定位到引入缺陷的编译器代码路径。本课题在第三、四章给出对应的解法：把每条防御机制的安全不变量翻译为可机器判定的检查器以填补预言机空白；在大模型与覆盖率联合驱动的种子生成主循环中，把目标基本块选择限定在防御机制相关代码区域，使搜索空间被显式压缩到矩阵中那些尚未触达的格点附近。</w:t>
+              <w:t xml:space="preserve">本研究整合现有模糊测试技术的优势，通过提炼跨架构的安全不变量构建专用预言机，并利用大语言模型结合覆盖率反馈实现精确变异，从而系统性暴露编译器在防御机制上的静默失效漏洞。本研究在第三、四章给出对应的解法：把每条防御机制的安全不变量翻译为可机器判定的检查器以填补预言机空白；在大模型与覆盖率联合驱动的种子生成主循环中，把目标基本块选择限定在防御机制相关代码区域，使搜索空间被显式压缩到矩阵中那些尚未触达的格点附近。</w:t>
             </w:r>
           </w:p>
           <w:p>
@@ -3286,7 +3286,7 @@
                 <w:kern w:val="0"/>
                 <w:sz w:val="24"/>
               </w:rPr>
-              <w:t xml:space="preserve">三个目标依次推进：(a) 提供事实基础，(b) 在此基础上构建原型，(c) 借助该原型完成实证。其依赖关系与对应的工作内容在 3.2 节中展开。</w:t>
+              <w:t xml:space="preserve">三个目标依次推进：(a) 提供事实基础，(b) 构建原型，(c) 完成实证验证。其依赖关系与工作内容详见 3.2 节。</w:t>
             </w:r>
           </w:p>
           <w:p>
@@ -3325,7 +3325,7 @@
                 <w:kern w:val="0"/>
                 <w:sz w:val="24"/>
               </w:rPr>
-              <w:t xml:space="preserve">为依次达成 3.1 节的三项目标，本课题划分为三部分工作，其相互依赖关系如下图 3 所示：不变量形式化是预言机与种子目标选择的事实基础；预言机为 fuzz 主循环提供安全判定接口；覆盖率驱动的种子生成则负责把测试输入推进到能触发不变量的代码路径上。</w:t>
+              <w:t xml:space="preserve">本课题分为三部分工作，相互依赖关系如图 3 所示：不变量形式化是预言机与种子目标选择的基础；预言机提供安全判定接口；覆盖率驱动的种子生成负责将测试输入推进到特定代码路径。</w:t>
             </w:r>
           </w:p>
           <w:p>
@@ -3437,7 +3437,7 @@
                 <w:kern w:val="0"/>
                 <w:sz w:val="24"/>
               </w:rPr>
-              <w:t xml:space="preserve">(2) 不变量到预言机的工程化落地。把 (1) 中的不变量翻译为可在二进制层面或运行行为上判定的检查器。框架将检查器分为静态与动态两类：静态检查通过 ELF 符号、指令流模式、属性 note 做断言式判定；动态检查通过受控执行（如对 buffer 填充长度做二分搜索）观察运行时行为。预言机判据完全建立在二进制和运行行为之上，与产生该二进制的具体编译器解耦，GCC 与 LLVM 产物共用同一套检查器。每个机制配置一个聚合器，任一检查器返回 Fail 即记机制级违例并附带证据；同时为每个机制记录开机制 / 关机制两套 flag profile，框架据此对同一颗种子做对照判定，避免与编译器自身缺省行为混淆。</w:t>
+              <w:t xml:space="preserve">(2) 不变量到预言机的工程化落地。将不变量翻译为二进制层面或运行行为上的检查器。框架将检查器分为静态与动态两类：静态检查通过 ELF 符号、指令流模式、属性 note 做断言式判定；动态检查通过受控执行（如对 buffer 填充长度做二分搜索）观察运行行为。预言机判据建立在二进制和运行行为之上，与产生该二进制的具体编译器解耦，GCC 与 LLVM 产物共用同一套检查器。每个机制配置一个聚合器，任一检查器返回 Fail 即记机制级违例并附带证据；同时为每个机制记录开机制/关机制两套 flag profile，框架据此对同一颗种子做对照判定，避免与编译器自身缺省行为混淆。</w:t>
             </w:r>
           </w:p>
           <w:p>
@@ -3455,7 +3455,7 @@
                 <w:kern w:val="0"/>
                 <w:sz w:val="24"/>
               </w:rPr>
-              <w:t xml:space="preserve">(3) 大语言模型与覆盖率联合驱动的种子生成。以 GCC 与 LLVM 中防御机制相关代码的源代码覆盖率为目标信号（GCC 侧 gcov，LLVM 侧 SanitizerCoverage 与 source-based coverage），结合控制流图按"未覆盖且与防御机制相关性高"的策略选取基本块作为变异目标，相关性由 CFG 后继分支数与所在代码区域的防御机制权重共同决定。每轮变异的流程是：构造目标上下文（目标函数源码、目标基本块标注、覆盖前驱的种子作为示例），调用大语言模型生成新 C 种子，编译产物再经覆盖率与预言机检查；结果分析阶段同时观察覆盖增量、是否命中目标、是否触发 bug 三个信号，任一为真即把种子纳入语料库。种子未命中目标时，通过轻量级调用追踪定位它与基线种子的发散点，把发散函数源码作为额外上下文回喂给变异提示，进入下一轮迭代。整个过程把覆盖率推进与安全契约判定统一在同一条主循环中，使大语言模型的生成始终被防御机制相关代码路径所牵引。</w:t>
+              <w:t xml:space="preserve">(3) 大语言模型与覆盖率联合驱动的种子生成。以 GCC 与 LLVM 中防御机制代码的源代码覆盖率为目标信号（GCC 侧 gcov，LLVM 侧 SanitizerCoverage 与 source-based coverage），结合控制流图按"未覆盖且与防御机制相关性高"的策略选取基本块作为变异目标，相关性由 CFG 后继分支数与所在代码区域的防御机制权重决定。每轮变异的流程是：构造目标上下文（目标函数源码、目标基本块标注、覆盖前驱的种子作为示例），调用大模型生成新 C 种子，编译产物经覆盖率与预言机检查；结果分析阶段同时观察覆盖增量、是否命中目标、是否触发 bug 三个信号，任一为真即把种子纳入语料库。种子未命中目标时，通过轻量级追踪定位其与基线种子的发散点，把发散函数源码作为额外上下文回喂给变异提示，进入下一轮迭代。该过程将覆盖率推进与安全契约判定统一在同一主循环中，确保大模型生成始终聚焦于防御机制代码路径。</w:t>
             </w:r>
           </w:p>
           <w:p>
@@ -3543,7 +3543,7 @@
                 <w:kern w:val="0"/>
                 <w:sz w:val="24"/>
               </w:rPr>
-              <w:t xml:space="preserve">系统以一条 fuzz 主循环为骨架，由 LLM 变异、编译器、预言机三个子系统加种子语料库、配置模块共同支撑，总体结构如下图 4 所示。Fuzz 引擎承担主循环调度与提示词组装两项职能，把当前覆盖率、目标基本块和已有种子拼装成提示词后交给 LLM 变异子系统调用远端模型，再把返回的新种子分发给后续环节。编译器子系统封装预先插桩的 GCC 与 LLVM 构建：GCC 侧通过 gcov 采集 .gcda 覆盖率数据，LLVM 侧通过 SanitizerCoverage 与 source-based coverage 采集 .profraw 数据，二者经统一接口归并为同构的"行级覆盖 → 种子 ID"映射，主循环对底层编译器无感知。预言机子系统按防御机制聚合不变量检查器，对每颗成功编译的种子做安全契约判定，判据建立在 ELF 二进制与运行行为之上，GCC 与 LLVM 产物共用同一套检查器。种子语料库持久化满足质量阈值的种子并维护家系信息。配置模块按"防御机制 · ISA · flag"三元组下发任务：把工具链选择（GCC / LLVM）与对应 flag 交给编译器子系统，把目标 ISA 对应的 QEMU 工具链交给预言机的执行层，使同一份种子可在不同后端上做对照实验，从而以可重复的方式覆盖第一章所述的"防御机制 × ISA"矩阵。</w:t>
+              <w:t xml:space="preserve">系统以一条 fuzz 主循环为骨干，由 LLM 变异、编译器、预言机三个子系统以及种子语料库、配置模块共同支撑，结构如图 4 所示。Fuzz 引擎承担主循环调度与提示词组装两项职能，将当前覆盖率、目标基本块和已有种子拼装成提示词交给 LLM 变异子系统，获取新种子后分发给后续环节。编译器子系统封装预先插桩的 GCC 与 LLVM 构建：GCC 侧通过 gcov 采集 .gcda 覆盖率数据，LLVM 侧通过 SanitizerCoverage 与 source-based coverage 采集 .profraw 数据，两者经统一接口归并为同构的"行级覆盖 → 种子 ID"映射，主循环对底层编译器无感知。预言机子系统按防御机制聚合不变量检查器，对每颗成功编译的种子做安全契约判定，判据建立在 ELF 二进制与运行行为之上，GCC 与 LLVM 产物共用同一套检查器。种子语料库持久化满足质量阈值的种子并维护家系信息。配置模块按"防御机制 · ISA · flag"三元组下发任务：把工具链选择（GCC / LLVM）与对应 flag 交给编译器子系统，把目标 ISA 对应的 QEMU 工具链交给预言机的执行层，使同一份种子可在不同后端上做对照实验，从而以可重复的方式覆盖第一章所述的"防御机制 × ISA"矩阵。</w:t>
             </w:r>
           </w:p>
           <w:p>
@@ -3658,7 +3658,7 @@
                 <w:kern w:val="0"/>
                 <w:sz w:val="24"/>
               </w:rPr>
-              <w:t xml:space="preserve">每个机制对应一个聚合器，下挂若干检查器，输入端把同一颗种子的源码、汇编与最终二进制一并交给检查器，判定流程如下图 5 所示。检查器分为静态与动态两类：静态检查器走汇编分析与字节检查路径，读 ELF 符号表、指令字节模式与 .note 段做断言式判定，例如确认间接跳转目标处的 ENDBR 字节、_chk 接口被正确链接；动态检查器以插桩检测和二分搜索为主要手段，通过受控执行观察运行时行为，典型做法是对溢出 buffer 的填充长度做二分搜索，定位 canary 触发的实际边界。每个检查器返回 Pass、Fail、Error 三态，Error 仅用于隔离基础设施故障，不参与机制级判定；聚合时任一 Fail 即视为机制级违例，并把触发证据回写到种子记录。对易与编译器缺省行为混淆的检查器，框架同时跑开机制与关机制两套 flag profile，比对两次判定的差异，确保 Pass / Fail 反映的是机制本身。预言机维护一份元信息缓存，复用二分搜索结果与动态符号查询，避免同一颗二进制被多次解析或执行。</w:t>
+              <w:t xml:space="preserve">每个机制对应一个聚合器，下挂若干检查器。判定流程如图 5 所示，检查器输入包括种子的源码、汇编与二进制文件。检查器分为静态与动态两类：静态检查器读取 ELF 符号表、指令字节模式与 .note 段做断言式判定，如确认间接跳转目标的 ENDBR 字节、_chk 接口正确链接；动态检查器通过受控执行观察运行行为，如通过二分搜索溢出缓冲区的填充长度来定位 canary 触发边界。每个检查器返回 Pass、Fail、Error 三态，Error 仅用于隔离基础设施故障；聚合时任一 Fail 即视为机制级违例，并回写触发证据至种子记录。对于易与编译器缺省行为混淆的检查器，框架会同时运行开机制与关机制两套配置，比对判定差异。预言机维护一份元信息缓存，复用二分搜索结果与动态符号查询，避免重复解析或执行同一二进制文件。</w:t>
             </w:r>
           </w:p>
           <w:p>
@@ -3773,7 +3773,7 @@
                 <w:kern w:val="0"/>
                 <w:sz w:val="24"/>
               </w:rPr>
-              <w:t xml:space="preserve">主循环的输入为当前覆盖率映射与编译器源码控制流图，单轮迭代过程如下图 6 所示。每轮先在未覆盖基本块中按相关性挑出一个目标，相关性由该基本块在 CFG 上的后继分支数和所属代码区域对防御机制的关联程度共同决定，使搜索集中在尚未触达且与防御逻辑相关的代码上。随后构造目标上下文：目标函数源码片段（来自当前所测的 GCC 或 LLVM 版本）、逐行覆盖标注、目标基本块位置，以及覆盖目标前驱的若干种子作为示例。提示词组装层把上下文拼接到基础变异提示词与机制契约要求之后，提交给大语言模型生成新 C 种子。编译失败时把错误信息与上一版源码反馈进入下一轮；编译成功后覆盖率分析器判断是否命中目标，预言机给出安全判定。结果分析阶段同时观察覆盖增量、是否命中目标、是否触发 bug 三个信号，任一为真即把该种子纳入语料库。种子未命中目标但带来新覆盖时，轻量级动态追踪定位它与基线种子在调用序列上的首个发散点，把发散函数源码作为额外上下文回喂提示词组装层，再次请求模型做精细变异。目标基本块全部覆盖后，主循环可切换到随机变异阶段，仅以预言机为持久化条件继续探索。</w:t>
+              <w:t xml:space="preserve">主循环的输入为当前覆盖率映射与编译器源码控制流图，单轮迭代过程如图 6 所示。每轮先在未覆盖基本块中按相关性挑出一个目标，相关性由该基本块在 CFG 上的后继分支数和所属代码区域对防御机制的关联程度共同决定，使搜索集中在未触达且与防御逻辑相关的代码上。随后构造目标上下文：目标函数源码片段、逐行覆盖标注、目标基本块位置，以及覆盖目标前驱的若干示例种子。提示词组装层将上下文与基础变异提示词、机制契约要求拼接，提交给大语言模型生成新 C 种子。编译失败时反馈错误信息进入下一轮；编译成功后覆盖率分析器判断命中情况，预言机给出安全判定。结果分析阶段同时观察覆盖增量、是否命中目标、是否触发 bug，任一为真即保存种子。种子未命中目标但带来新覆盖时，利用轻量动态追踪定位其与基线种子在调用序列上的首个发散点，将发散函数源码作为额外上下文反馈给变异提示，请求模型重新精细变异。目标基本块全部覆盖后，主循环可切换至随机变异阶段，仅以预言机为保存条件继续探索。</w:t>
             </w:r>
           </w:p>
           <w:p>
@@ -3937,7 +3937,7 @@
                 <w:kern w:val="0"/>
                 <w:sz w:val="24"/>
               </w:rPr>
-              <w:t xml:space="preserve">目前已在 GCC 多个版本（若干稳定版与一个本地构建的 master 快照）上对栈金丝雀、_FORTIFY_SOURCE、IBT 等部分防御机制做了实验，LLVM 侧同类实验纳入下一阶段。已完成实验在 GCC 上发现 3 例可被上游确认的静默失效[17-20]。下文展开其中两例，第三例（栈金丝雀在多个 ISA 的 fallback 后端上函数返回时寄存器未清零，与 PR-96191[7] 同源）篇幅较短，在 5.3 节简述。</w:t>
+              <w:t xml:space="preserve">目前已在 GCC 的多个版本上测试栈金丝雀、_FORTIFY_SOURCE、IBT 等防御机制，并在 GCC 上发现 3 例已获上游确认的静默失效[17-20]。LLVM 侧实验将在下一阶段进行。下文展开分析其中两例，并在 5.3 节简述第三例（多 ISA 上栈金丝雀寄存器泄露问题）。</w:t>
             </w:r>
           </w:p>
           <w:p>
@@ -3994,7 +3994,7 @@
                 <w:kern w:val="0"/>
                 <w:sz w:val="24"/>
               </w:rPr>
-              <w:t xml:space="preserve">本方法构造的种子在该路径上稳定触发了 size 参数未相应减小的实例。反汇编层面 strcat → __strcat_chk → __stpcpy_chk 整条链条仍然出现，看似 FORTIFY 仍在生效，但"按 dst 剩余空间收紧上限"那一步已被丢弃。该缺陷自 GCC 4.7 起存在，跨越十余年未被发现；上报后已被确认（PR-125079[17]）并合入主分支，预计随 GCC 16.1 发布，开发团队同时计划向 GCC 13、14、15 回送补丁。值得一提的是，这条路径与 2018 年的 PR-87672[6] 处于同一文件：当年的修复只覆盖了一个对称分支，另一支被遗漏至今，这本身就是第一章所述"矩阵同源遗漏"的又一例证。</w:t>
+              <w:t xml:space="preserve">本方法构造的种子在该路径上稳定触发了 size 参数未相应减小的实例。反汇编层面 strcat → __strcat_chk → __stpcpy_chk 整条链条仍然出现，看似 FORTIFY 仍在生效，但"按 dst 剩余空间收紧上限"那一步已被丢弃。上报后该缺陷已被确认（PR-125079[17]）并合入主分支，计划随 GCC 16.1 发布并回送至部分旧版本。该路径与 2018 年修复的 PR-87672[6] 位于同一文件，表明当年修复时遗漏了对称分支，是“矩阵同源遗漏”的实际例证。</w:t>
             </w:r>
           </w:p>
           <w:p>
@@ -4012,7 +4012,7 @@
                 <w:kern w:val="0"/>
                 <w:sz w:val="24"/>
               </w:rPr>
-              <w:t xml:space="preserve">预言机方面，本例命中"FORTIFY 调用点的 size 参数下界推断"不变量，证据为静态符号与反汇编，在静态阶段判定。该优化路径与 size 被静默放宽的具体位置如下图 7 所示。</w:t>
+              <w:t xml:space="preserve">该缺陷命中了"FORTIFY 调用点的 size 参数下界推断"不变量。判定证据为静态符号与反汇编。该优化路径与 size 被放宽的具体位置如图 7 所示。</w:t>
             </w:r>
           </w:p>
           <w:p>
@@ -4145,7 +4145,7 @@
                 <w:kern w:val="0"/>
                 <w:sz w:val="24"/>
               </w:rPr>
-              <w:t xml:space="preserve">GCC 在 x86 后端用 ix86_endbr_immediate_operand 谓词做字节级检测：当目标启用 IBT 时，谓词扫描立即数中是否存在 endbr 模式，含该模式的立即数会被拒绝（同源历史修复参见 PR-96350[8]）。本方法在该谓词实现中发现一个逻辑漏洞：扫描循环对"高位非零"的 64 位立即数提前退出，只要 endbr 字节排布在立即数高位，扫描就走不到对应位置。这类立即数被错误接受，进而在 .text 中嵌入了不受控的伪 landing pad。该缺陷已上报上游（PR-125084[18]），等待维护者回复。</w:t>
+              <w:t xml:space="preserve">GCC 在 x86 后端用 ix86_endbr_immediate_operand 谓词做字节级检测：当目标启用 IBT 时，谓词扫描立即数中是否存在 endbr 模式，含该模式的立即数会被拒绝（同源历史修复参见 PR-96350[8]）。测试发现该谓词存在逻辑漏洞：扫描循环对"高位非零"的 64 位立即数提前退出，只要 endbr 字节排布在立即数高位，扫描就无法到达对应位置。这类立即数被错误接受，进而在 .text 中嵌入了伪 landing pad。该缺陷已上报上游（PR-125084[18]），等待维护者回复。</w:t>
             </w:r>
           </w:p>
           <w:p>
@@ -4163,7 +4163,7 @@
                 <w:kern w:val="0"/>
                 <w:sz w:val="24"/>
               </w:rPr>
-              <w:t xml:space="preserve">预言机方面，本例命中"endbr 字节模式不应出现在非跳转目标的指令中"不变量，证据为代码段内 endbr 模式扫描，属静态指令流检查。</w:t>
+              <w:t xml:space="preserve">该例命中"endbr 字节模式不应出现在非跳转目标的指令中"不变量，证据为代码段内 endbr 模式扫描，属静态指令流检查。</w:t>
             </w:r>
           </w:p>
           <w:p>
@@ -4241,7 +4241,7 @@
                 <w:kern w:val="0"/>
                 <w:sz w:val="24"/>
               </w:rPr>
-              <w:t xml:space="preserve">三例分别对应静态符号、动态行为、指令流字节模式三类不变量证据形态，且具有同一个共同特征：二进制看起来仍然带有保护，但编译器代码路径某一处的安全不变量已失去维护。方法在不修改编译器的前提下，通过覆盖率引导的种子变异与不变量预言机的组合，把这类差异在自动化流程中暴露出来。LLVM 侧实验预计在后续阶段以同一预言机框架补全。</w:t>
+              <w:t xml:space="preserve">三例缺陷分别对应静态符号、动态行为、指令流字节模式三类不变量证据形态，共同特征是：二进制仍带有保护，但部分安全不变量已失效。本文方法在不修改编译器的前提下，通过变异与预言机的组合，将此类问题在自动化流程中暴露。LLVM 侧实验将在后续阶段以相同框架补全。</w:t>
             </w:r>
           </w:p>
           <w:p>
@@ -4782,7 +4782,25 @@
                 <w:kern w:val="0"/>
                 <w:sz w:val="24"/>
               </w:rPr>
-              <w:t xml:space="preserve">理论分析对应技术路线的四个部分：编译器主流防御机制安全不变量的形式化与证据提炼、不变量到二进制与运行行为可判定检查器的工程化方法、覆盖率与控制流图引导的目标基本块挑选策略，以及大语言模型生成与预言机判定的耦合方式。预期产出包括：一套覆盖至少三种主流防御机制的安全不变量集合、一套可扩展的不变量预言机框架，以及一个可面向 GCC 与 LLVM 跨架构运行的 fuzzer 原型；并通过在 GCC 与 LLVM 主流版本上发现真实静默失效，验证方法的有效性与跨编译器迁移性。硬件方面，开发与实验依托一台 64 位 Linux 工作站（不少于 32 GB 内存与百 GB 级 SSD），用于 GCC / LLVM 多版本本地构建、覆盖率数据缓存与跨架构 QEMU 用户态执行；大语言模型推理通过远程 API 完成，本机不需要独立 GPU。</w:t>
+              <w:t xml:space="preserve">理论分析对应技术路线的四个部分：编译器主流防御机制安全不变量的形式化与证据提炼、不变量预言机检查器的工程化方法、覆盖率与控制流图引导的目标基本块挑选策略，以及大语言模型生成与预言机判定的耦合方式。预期产出包括：覆盖至少三种主流防御机制的安全不变量集合、可扩展的不变量预言机框架，以及跨架构的 fuzzer 原型；并在 GCC 与 LLVM 上发现真实静默失效以验证方法的有效性与跨编译器迁移性。</w:t>
+            </w:r>
+          </w:p>
+          <w:p>
+            <w:pPr>
+              <w:pStyle w:val="Normal"/>
+              <w:spacing w:lineRule="auto" w:line="360"/>
+              <w:ind w:firstLineChars="200" w:startChars="0" w:start="0" w:endChars="0" w:end="0"/>
+              <w:rPr>
+                <w:kern w:val="0"/>
+                <w:sz w:val="24"/>
+              </w:rPr>
+            </w:pPr>
+            <w:r>
+              <w:rPr>
+                <w:kern w:val="0"/>
+                <w:sz w:val="24"/>
+              </w:rPr>
+              <w:t xml:space="preserve">硬件方面，开发与实验依托一台 64 位 Linux 工作站（不少于 32 GB 内存与百 GB 级 SSD），用于 GCC / LLVM 多版本本地构建、覆盖率数据缓存与跨架构 QEMU 用户态执行；大语言模型推理通过远程 API 完成，本机无需独立 GPU。</w:t>
             </w:r>
           </w:p>
         </w:tc>

</xml_diff>

<commit_message>
docs(proposal): revise chapters, add story_line.md and update docx
</commit_message>
<xml_diff>
--- a/docs/开题报告/DeFuzz-开题报告.docx
+++ b/docs/开题报告/DeFuzz-开题报告.docx
@@ -250,7 +250,6 @@
           <w:u w:val="single"/>
         </w:rPr>
         <w:tab/>
-        <w:tab/>
       </w:r>
       <w:r>
         <w:rPr>
@@ -259,9 +258,8 @@
           <w:kern w:val="2"/>
           <w:sz w:val="28"/>
           <w:u w:val="single"/>
-          <w:lang w:val="en-US" w:eastAsia="zh-CN"/>
-        </w:rPr>
-        <w:t xml:space="preserve">  </w:t>
+        </w:rPr>
+        <w:tab/>
       </w:r>
       <w:r>
         <w:rPr>
@@ -270,9 +268,9 @@
           <w:kern w:val="2"/>
           <w:sz w:val="28"/>
           <w:u w:val="single"/>
-          <w:lang w:eastAsia="zh-CN"/>
-        </w:rPr>
-        <w:t>专业硕士</w:t>
+          <w:lang w:val="en-US" w:eastAsia="zh-CN"/>
+        </w:rPr>
+        <w:t xml:space="preserve">  </w:t>
       </w:r>
       <w:r>
         <w:rPr>
@@ -281,9 +279,38 @@
           <w:kern w:val="2"/>
           <w:sz w:val="28"/>
           <w:u w:val="single"/>
+          <w:lang w:eastAsia="zh-CN"/>
+        </w:rPr>
+        <w:t>专业硕士</w:t>
+      </w:r>
+      <w:r>
+        <w:rPr>
+          <w:rFonts w:hint="eastAsia" w:ascii="宋体" w:hAnsi="宋体"/>
+          <w:spacing w:val="40"/>
+          <w:kern w:val="2"/>
+          <w:sz w:val="28"/>
+          <w:u w:val="single"/>
         </w:rPr>
         <w:tab/>
+      </w:r>
+      <w:r>
+        <w:rPr>
+          <w:rFonts w:hint="eastAsia" w:ascii="宋体" w:hAnsi="宋体"/>
+          <w:spacing w:val="40"/>
+          <w:kern w:val="2"/>
+          <w:sz w:val="28"/>
+          <w:u w:val="single"/>
+        </w:rPr>
         <w:tab/>
+      </w:r>
+      <w:r>
+        <w:rPr>
+          <w:rFonts w:hint="eastAsia" w:ascii="宋体" w:hAnsi="宋体"/>
+          <w:spacing w:val="40"/>
+          <w:kern w:val="2"/>
+          <w:sz w:val="28"/>
+          <w:u w:val="single"/>
+        </w:rPr>
         <w:tab/>
       </w:r>
       <w:r>
@@ -415,9 +442,45 @@
           <w:u w:val="single"/>
         </w:rPr>
         <w:tab/>
+      </w:r>
+      <w:r>
+        <w:rPr>
+          <w:rFonts w:hint="eastAsia" w:ascii="宋体" w:hAnsi="宋体"/>
+          <w:spacing w:val="40"/>
+          <w:kern w:val="2"/>
+          <w:sz w:val="28"/>
+          <w:u w:val="single"/>
+        </w:rPr>
         <w:tab/>
+      </w:r>
+      <w:r>
+        <w:rPr>
+          <w:rFonts w:hint="eastAsia" w:ascii="宋体" w:hAnsi="宋体"/>
+          <w:spacing w:val="40"/>
+          <w:kern w:val="2"/>
+          <w:sz w:val="28"/>
+          <w:u w:val="single"/>
+        </w:rPr>
         <w:t>电子信息</w:t>
+      </w:r>
+      <w:r>
+        <w:rPr>
+          <w:rFonts w:hint="eastAsia" w:ascii="宋体" w:hAnsi="宋体"/>
+          <w:spacing w:val="40"/>
+          <w:kern w:val="2"/>
+          <w:sz w:val="28"/>
+          <w:u w:val="single"/>
+        </w:rPr>
         <w:tab/>
+      </w:r>
+      <w:r>
+        <w:rPr>
+          <w:rFonts w:hint="eastAsia" w:ascii="宋体" w:hAnsi="宋体"/>
+          <w:spacing w:val="40"/>
+          <w:kern w:val="2"/>
+          <w:sz w:val="28"/>
+          <w:u w:val="single"/>
+        </w:rPr>
         <w:tab/>
       </w:r>
     </w:p>
@@ -477,7 +540,6 @@
           <w:u w:val="single"/>
         </w:rPr>
         <w:tab/>
-        <w:tab/>
       </w:r>
       <w:r>
         <w:rPr>
@@ -486,9 +548,8 @@
           <w:kern w:val="2"/>
           <w:sz w:val="28"/>
           <w:u w:val="single"/>
-          <w:lang w:val="en-US" w:eastAsia="zh-CN"/>
-        </w:rPr>
-        <w:t xml:space="preserve"> </w:t>
+        </w:rPr>
+        <w:tab/>
       </w:r>
       <w:r>
         <w:rPr>
@@ -497,9 +558,9 @@
           <w:kern w:val="2"/>
           <w:sz w:val="28"/>
           <w:u w:val="single"/>
-          <w:lang w:eastAsia="zh-CN"/>
-        </w:rPr>
-        <w:t>张景耀</w:t>
+          <w:lang w:val="en-US" w:eastAsia="zh-CN"/>
+        </w:rPr>
+        <w:t xml:space="preserve"> </w:t>
       </w:r>
       <w:r>
         <w:rPr>
@@ -508,12 +569,10 @@
           <w:kern w:val="2"/>
           <w:sz w:val="28"/>
           <w:u w:val="single"/>
-          <w:lang w:val="en-US" w:eastAsia="zh-CN"/>
-        </w:rPr>
-        <w:t xml:space="preserve">  </w:t>
-      </w:r>
-      <w:bookmarkStart w:id="0" w:name="_GoBack"/>
-      <w:bookmarkEnd w:id="0"/>
+          <w:lang w:eastAsia="zh-CN"/>
+        </w:rPr>
+        <w:t>张景耀</w:t>
+      </w:r>
       <w:r>
         <w:rPr>
           <w:rFonts w:hint="eastAsia" w:ascii="宋体" w:hAnsi="宋体"/>
@@ -521,8 +580,28 @@
           <w:kern w:val="2"/>
           <w:sz w:val="28"/>
           <w:u w:val="single"/>
+          <w:lang w:val="en-US" w:eastAsia="zh-CN"/>
+        </w:rPr>
+        <w:t xml:space="preserve">  </w:t>
+      </w:r>
+      <w:r>
+        <w:rPr>
+          <w:rFonts w:hint="eastAsia" w:ascii="宋体" w:hAnsi="宋体"/>
+          <w:spacing w:val="40"/>
+          <w:kern w:val="2"/>
+          <w:sz w:val="28"/>
+          <w:u w:val="single"/>
         </w:rPr>
         <w:tab/>
+      </w:r>
+      <w:r>
+        <w:rPr>
+          <w:rFonts w:hint="eastAsia" w:ascii="宋体" w:hAnsi="宋体"/>
+          <w:spacing w:val="40"/>
+          <w:kern w:val="2"/>
+          <w:sz w:val="28"/>
+          <w:u w:val="single"/>
+        </w:rPr>
         <w:tab/>
       </w:r>
       <w:r>
@@ -583,7 +662,6 @@
           <w:u w:val="single"/>
         </w:rPr>
         <w:tab/>
-        <w:tab/>
       </w:r>
       <w:r>
         <w:rPr>
@@ -592,9 +670,8 @@
           <w:kern w:val="2"/>
           <w:sz w:val="28"/>
           <w:u w:val="single"/>
-          <w:lang w:val="en-US" w:eastAsia="zh-CN"/>
-        </w:rPr>
-        <w:t xml:space="preserve"> </w:t>
+        </w:rPr>
+        <w:tab/>
       </w:r>
       <w:r>
         <w:rPr>
@@ -603,9 +680,9 @@
           <w:kern w:val="2"/>
           <w:sz w:val="28"/>
           <w:u w:val="single"/>
-          <w:lang w:eastAsia="zh-CN"/>
-        </w:rPr>
-        <w:t>徐坚皓</w:t>
+          <w:lang w:val="en-US" w:eastAsia="zh-CN"/>
+        </w:rPr>
+        <w:t xml:space="preserve"> </w:t>
       </w:r>
       <w:r>
         <w:rPr>
@@ -614,9 +691,9 @@
           <w:kern w:val="2"/>
           <w:sz w:val="28"/>
           <w:u w:val="single"/>
-          <w:lang w:val="en-US" w:eastAsia="zh-CN"/>
-        </w:rPr>
-        <w:t xml:space="preserve">  </w:t>
+          <w:lang w:eastAsia="zh-CN"/>
+        </w:rPr>
+        <w:t>徐坚皓</w:t>
       </w:r>
       <w:r>
         <w:rPr>
@@ -625,8 +702,28 @@
           <w:kern w:val="2"/>
           <w:sz w:val="28"/>
           <w:u w:val="single"/>
+          <w:lang w:val="en-US" w:eastAsia="zh-CN"/>
+        </w:rPr>
+        <w:t xml:space="preserve">  </w:t>
+      </w:r>
+      <w:r>
+        <w:rPr>
+          <w:rFonts w:hint="eastAsia" w:ascii="宋体" w:hAnsi="宋体"/>
+          <w:spacing w:val="40"/>
+          <w:kern w:val="2"/>
+          <w:sz w:val="28"/>
+          <w:u w:val="single"/>
         </w:rPr>
         <w:tab/>
+      </w:r>
+      <w:r>
+        <w:rPr>
+          <w:rFonts w:hint="eastAsia" w:ascii="宋体" w:hAnsi="宋体"/>
+          <w:spacing w:val="40"/>
+          <w:kern w:val="2"/>
+          <w:sz w:val="28"/>
+          <w:u w:val="single"/>
+        </w:rPr>
         <w:tab/>
       </w:r>
       <w:r>
@@ -685,6 +782,15 @@
           <w:u w:val="single"/>
         </w:rPr>
         <w:tab/>
+      </w:r>
+      <w:r>
+        <w:rPr>
+          <w:rFonts w:hint="eastAsia" w:ascii="宋体" w:hAnsi="宋体"/>
+          <w:spacing w:val="40"/>
+          <w:kern w:val="2"/>
+          <w:sz w:val="28"/>
+          <w:u w:val="single"/>
+        </w:rPr>
         <w:tab/>
       </w:r>
       <w:r>
@@ -791,7 +897,21 @@
           <w:u w:val="single"/>
         </w:rPr>
         <w:tab/>
+      </w:r>
+      <w:r>
+        <w:rPr>
+          <w:rFonts w:hint="eastAsia" w:ascii="宋体" w:hAnsi="宋体"/>
+          <w:sz w:val="28"/>
+          <w:u w:val="single"/>
+        </w:rPr>
         <w:tab/>
+      </w:r>
+      <w:r>
+        <w:rPr>
+          <w:rFonts w:hint="eastAsia" w:ascii="宋体" w:hAnsi="宋体"/>
+          <w:sz w:val="28"/>
+          <w:u w:val="single"/>
+        </w:rPr>
         <w:tab/>
       </w:r>
       <w:r>
@@ -818,6 +938,13 @@
           <w:u w:val="single"/>
         </w:rPr>
         <w:tab/>
+      </w:r>
+      <w:r>
+        <w:rPr>
+          <w:rFonts w:hint="eastAsia" w:ascii="宋体" w:hAnsi="宋体"/>
+          <w:sz w:val="28"/>
+          <w:u w:val="single"/>
+        </w:rPr>
         <w:tab/>
       </w:r>
       <w:r>
@@ -2344,9 +2471,8 @@
           </w:p>
           <w:p>
             <w:pPr>
-              <w:pStyle w:val="Normal"/>
               <w:widowControl/>
-              <w:jc w:val="start"/>
+              <w:jc w:val="left"/>
               <w:rPr>
                 <w:b/>
                 <w:bCs/>
@@ -2366,8 +2492,7 @@
           </w:p>
           <w:p>
             <w:pPr>
-              <w:pStyle w:val="Normal"/>
-              <w:spacing w:lineRule="auto" w:line="360"/>
+              <w:spacing w:line="360" w:lineRule="auto"/>
               <w:rPr>
                 <w:b/>
                 <w:bCs/>
@@ -2387,44 +2512,73 @@
           </w:p>
           <w:p>
             <w:pPr>
-              <w:pStyle w:val="Normal"/>
-              <w:spacing w:lineRule="auto" w:line="360"/>
-              <w:ind w:firstLineChars="200" w:startChars="0" w:start="0" w:endChars="0" w:end="0"/>
-              <w:rPr>
-                <w:kern w:val="0"/>
-                <w:sz w:val="24"/>
-              </w:rPr>
-            </w:pPr>
-            <w:r>
-              <w:rPr>
-                <w:kern w:val="0"/>
-                <w:sz w:val="24"/>
-              </w:rPr>
-              <w:t xml:space="preserve">近十年来，被公开披露的安全漏洞数量持续攀升。截至 2025 年，CVE 漏洞库每年新登记的条目稳定在两万条以上，且仍在快速增长[21]。Microsoft、Google 等厂商陆续公开承认，仅依靠人工审计与安全编程规范并不足以彻底清除上层代码中的内存安全 Bug。因此，工业界与学术界将重心转向漏洞被触发后的拦截能力：栈金丝雀（stack canary）、源代码加固（_FORTIFY_SOURCE）、间接跳转跟踪（indirect branch tracking, IBT）、控制流完整性（control-flow integrity, CFI）、指针认证（pointer authentication, PAC）、分支目标识别（branch target identification, BTI）、影子栈（shadow stack）等多项防御机制由编译器与运行时共同叠加部署，在漏洞被触发的瞬间承担起兜底防线的角色。</w:t>
-            </w:r>
-          </w:p>
-          <w:p>
-            <w:pPr>
-              <w:pStyle w:val="Normal"/>
-              <w:spacing w:lineRule="auto" w:line="360"/>
-              <w:ind w:firstLineChars="200" w:startChars="0" w:start="0" w:endChars="0" w:end="0"/>
-              <w:rPr>
-                <w:kern w:val="0"/>
-                <w:sz w:val="24"/>
-              </w:rPr>
-            </w:pPr>
-            <w:r>
-              <w:rPr>
-                <w:kern w:val="0"/>
-                <w:sz w:val="24"/>
-              </w:rPr>
-              <w:t xml:space="preserve">由编译器承担的兜底机制有一个共同的工作模式：在编译期向二进制中插入检查指令、布局约束或元数据，使运行期一旦偏离预定义的合法行为即可被发现并立即终止程序。以栈金丝雀为例，编译器在易受溢出影响的栈帧中插入随机值哨位，并在函数返回前比对其是否被改写。兜底防线的有效性依赖于编译器各端能否正确生成代码，以及这些代码所依赖的指令集架构（instruction set architecture, ISA）假设是否成立。</w:t>
-            </w:r>
-          </w:p>
-          <w:p>
-            <w:pPr>
-              <w:pStyle w:val="Normal"/>
-              <w:spacing w:lineRule="auto" w:line="360"/>
+              <w:spacing w:line="360" w:lineRule="auto"/>
+              <w:ind w:left="0" w:leftChars="0" w:right="0" w:rightChars="0" w:firstLineChars="200"/>
+              <w:rPr>
+                <w:kern w:val="0"/>
+                <w:sz w:val="24"/>
+              </w:rPr>
+            </w:pPr>
+            <w:r>
+              <w:rPr>
+                <w:kern w:val="0"/>
+                <w:sz w:val="24"/>
+              </w:rPr>
+              <w:t>近十年来，被公开披露的安全漏洞数量持续攀升。截至 2025 年，CVE 漏洞库每年新登记的条目稳定在两万条以上，且仍在快速增长[21]。Microsoft、Google 等厂商陆续公开承认，仅依靠人工审计与安全编程规范并不足以彻底清除上层代码中的内存安全 Bug[22][23]。因此，工业界与学术界将重心转向漏洞被触发后的拦截能力：栈金丝雀（stack canary）、源代码加固（_FORTIFY_SOURCE）、间接跳转跟踪（IBT）、控制流完整性（CFI）等多项防御机制由编译器与运行时共同叠加部署，在漏洞触发时承担起兜底防线的角色。</w:t>
+            </w:r>
+          </w:p>
+          <w:p>
+            <w:pPr>
+              <w:spacing w:line="360" w:lineRule="auto"/>
+              <w:ind w:left="0" w:leftChars="0" w:right="0" w:rightChars="0" w:firstLineChars="200"/>
+              <w:rPr>
+                <w:kern w:val="0"/>
+                <w:sz w:val="24"/>
+              </w:rPr>
+            </w:pPr>
+            <w:r>
+              <w:rPr>
+                <w:kern w:val="0"/>
+                <w:sz w:val="24"/>
+              </w:rPr>
+              <w:t>由编译器承担的兜底机制有一个共同的工作模式：在编译期向二进制中插入检查指令、布局约束或元数据，使运行期一旦偏离预定义的合法行为即可被发现并立即终止程序。以栈金丝雀为例，编译器在易受溢出影响的栈帧中</w:t>
+            </w:r>
+            <w:r>
+              <w:rPr>
+                <w:rFonts w:hint="eastAsia"/>
+                <w:kern w:val="0"/>
+                <w:sz w:val="24"/>
+                <w:lang w:eastAsia="zh-CN"/>
+              </w:rPr>
+              <w:t>，在函数返回地址和缓冲区之间</w:t>
+            </w:r>
+            <w:r>
+              <w:rPr>
+                <w:kern w:val="0"/>
+                <w:sz w:val="24"/>
+              </w:rPr>
+              <w:t>插入随机值</w:t>
+            </w:r>
+            <w:r>
+              <w:rPr>
+                <w:rFonts w:hint="eastAsia"/>
+                <w:kern w:val="0"/>
+                <w:sz w:val="24"/>
+                <w:lang w:eastAsia="zh-CN"/>
+              </w:rPr>
+              <w:t>哨兵</w:t>
+            </w:r>
+            <w:r>
+              <w:rPr>
+                <w:kern w:val="0"/>
+                <w:sz w:val="24"/>
+              </w:rPr>
+              <w:t>，并在函数返回前比对其是否被改写。兜底防线的有效性依赖于编译器各端能否正确生成代码，以及这些代码所依赖的指令集架构（instruction set architecture, ISA）假设是否成立。</w:t>
+            </w:r>
+          </w:p>
+          <w:p>
+            <w:pPr>
+              <w:spacing w:line="360" w:lineRule="auto"/>
               <w:rPr>
                 <w:b/>
                 <w:bCs/>
@@ -2444,33 +2598,46 @@
           </w:p>
           <w:p>
             <w:pPr>
-              <w:pStyle w:val="Normal"/>
-              <w:spacing w:lineRule="auto" w:line="360"/>
-              <w:ind w:firstLineChars="200" w:startChars="0" w:start="0" w:endChars="0" w:end="0"/>
-              <w:rPr>
-                <w:kern w:val="0"/>
-                <w:sz w:val="24"/>
-              </w:rPr>
-            </w:pPr>
-            <w:r>
-              <w:rPr>
-                <w:kern w:val="0"/>
-                <w:sz w:val="24"/>
-              </w:rPr>
-              <w:t xml:space="preserve">2023 年披露的 CVE-2023-4039[16] 是一个具有代表性的案例。GCC 在 AArch64 上的 -fstack-protector 选项长期失效：当函数使用变长数组（variable-length array, VLA）或 alloca 时，编译器把栈金丝雀放在 VLA 之上、保存的返回地址却落在 VLA 之下，越界写入会先于金丝雀检查改写返回地址，本应兜底的保护因此被绕过。该漏洞在 GCC 早期版本即已存在，直到 2023 年才由外部研究者系统分析并修复。这种 buggy 状态下的栈帧布局如下图 1 所示。</w:t>
-            </w:r>
-          </w:p>
-          <w:p>
-            <w:pPr>
-              <w:pStyle w:val="Normal"/>
-              <w:spacing w:lineRule="auto" w:line="360"/>
-              <w:jc w:val="center"/>
-            </w:pPr>
-            <w:r>
-              <w:rPr/>
+              <w:spacing w:line="360" w:lineRule="auto"/>
+              <w:ind w:left="0" w:leftChars="0" w:right="0" w:rightChars="0" w:firstLineChars="200"/>
+              <w:rPr>
+                <w:kern w:val="0"/>
+                <w:sz w:val="24"/>
+              </w:rPr>
+            </w:pPr>
+            <w:r>
+              <w:rPr>
+                <w:kern w:val="0"/>
+                <w:sz w:val="24"/>
+              </w:rPr>
+              <w:t>2023 年披露的 CVE-2023-4039[16] 是一个具有代表性的案例。GCC 在 AArch64 上的 -fstack-protector 选项长期失效：当函数使用变长数组（variable-length array, VLA）或 alloca 时，编译器把栈金丝雀放在 VLA 之上、保存的返回地址却落在</w:t>
+            </w:r>
+            <w:r>
+              <w:rPr>
+                <w:rFonts w:hint="eastAsia"/>
+                <w:kern w:val="0"/>
+                <w:sz w:val="24"/>
+                <w:lang w:eastAsia="zh-CN"/>
+              </w:rPr>
+              <w:t>栈金丝雀</w:t>
+            </w:r>
+            <w:r>
+              <w:rPr>
+                <w:kern w:val="0"/>
+                <w:sz w:val="24"/>
+              </w:rPr>
+              <w:t>之下，越界写入会先于金丝雀检查改写返回地址，本应兜底的保护因此被绕过。该漏洞在 GCC 早期版本即已存在，直到 2023 年才由外部研究者系统分析并修复。这种 buggy 状态下的栈帧布局如下图 1 所示。</w:t>
+            </w:r>
+          </w:p>
+          <w:p>
+            <w:pPr>
+              <w:spacing w:line="360" w:lineRule="auto"/>
+              <w:jc w:val="center"/>
+            </w:pPr>
+            <w:r>
               <w:drawing>
-                <wp:inline xmlns:wp="http://schemas.openxmlformats.org/drawingml/2006/wordprocessingDrawing" distT="0" distB="0" distL="0" distR="0">
-                  <wp:extent cx="4284090" cy="5326553"/>
+                <wp:inline distT="0" distB="0" distL="0" distR="0">
+                  <wp:extent cx="4283710" cy="5326380"/>
                   <wp:effectExtent l="0" t="0" r="0" b="0"/>
                   <wp:docPr id="21" name="Figure21"/>
                   <wp:cNvGraphicFramePr>
@@ -2480,11 +2647,13 @@
                     <a:graphicData uri="http://schemas.openxmlformats.org/drawingml/2006/picture">
                       <pic:pic xmlns:pic="http://schemas.openxmlformats.org/drawingml/2006/picture">
                         <pic:nvPicPr>
-                          <pic:cNvPr id="21" name="stack-layout.png"/>
-                          <pic:cNvPicPr/>
+                          <pic:cNvPr id="21" name="Figure21"/>
+                          <pic:cNvPicPr>
+                            <a:picLocks noChangeAspect="1"/>
+                          </pic:cNvPicPr>
                         </pic:nvPicPr>
                         <pic:blipFill>
-                          <a:blip xmlns:r="http://schemas.openxmlformats.org/officeDocument/2006/relationships" r:embed="rId21"/>
+                          <a:blip r:embed="rId6"/>
                           <a:stretch>
                             <a:fillRect/>
                           </a:stretch>
@@ -2507,8 +2676,7 @@
           </w:p>
           <w:p>
             <w:pPr>
-              <w:pStyle w:val="Normal"/>
-              <w:spacing w:lineRule="auto" w:line="360"/>
+              <w:spacing w:line="360" w:lineRule="auto"/>
               <w:jc w:val="center"/>
               <w:rPr>
                 <w:rFonts w:ascii="宋体" w:hAnsi="宋体" w:eastAsia="宋体"/>
@@ -2529,35 +2697,32 @@
           </w:p>
           <w:p>
             <w:pPr>
-              <w:pStyle w:val="Normal"/>
-              <w:spacing w:lineRule="auto" w:line="360"/>
-              <w:rPr>
-                <w:sz w:val="24"/>
-              </w:rPr>
-            </w:pPr>
-          </w:p>
-          <w:p>
-            <w:pPr>
-              <w:pStyle w:val="Normal"/>
-              <w:spacing w:lineRule="auto" w:line="360"/>
-              <w:ind w:firstLineChars="200" w:startChars="0" w:start="0" w:endChars="0" w:end="0"/>
-              <w:rPr>
-                <w:kern w:val="0"/>
-                <w:sz w:val="24"/>
-              </w:rPr>
-            </w:pPr>
-            <w:r>
-              <w:rPr>
-                <w:kern w:val="0"/>
-                <w:sz w:val="24"/>
-              </w:rPr>
-              <w:t xml:space="preserve">CVE-2023-4039 直观地揭示了一个共性问题：编译器侧防御机制的有效性强依赖于具体 ISA 上的栈布局、寄存器分配与指令编码假设。一旦防御设计中的某项假设与某套 ISA 不一致，运行期保护就会悄然失效。这种失效具有"双重无声"特征：编译时不报错（工具链与功能测试都察觉不到），运行时也能产生正确的功能结果（程序行为也察觉不到），但其安全契约已经被打破。本课题将这种形态的失效称为静默失效（silent failure）：编译产物看似带有完整防线，但攻击者可直接绕过。</w:t>
-            </w:r>
-          </w:p>
-          <w:p>
-            <w:pPr>
-              <w:pStyle w:val="Normal"/>
-              <w:spacing w:lineRule="auto" w:line="360"/>
+              <w:spacing w:line="360" w:lineRule="auto"/>
+              <w:rPr>
+                <w:sz w:val="24"/>
+              </w:rPr>
+            </w:pPr>
+          </w:p>
+          <w:p>
+            <w:pPr>
+              <w:spacing w:line="360" w:lineRule="auto"/>
+              <w:ind w:left="0" w:leftChars="0" w:right="0" w:rightChars="0" w:firstLineChars="200"/>
+              <w:rPr>
+                <w:kern w:val="0"/>
+                <w:sz w:val="24"/>
+              </w:rPr>
+            </w:pPr>
+            <w:r>
+              <w:rPr>
+                <w:kern w:val="0"/>
+                <w:sz w:val="24"/>
+              </w:rPr>
+              <w:t>CVE-2023-4039 直观地揭示了一个共性问题：编译器侧防御机制的有效性强依赖于具体 ISA 上的栈布局、寄存器分配与指令编码假设。一旦防御设计中的某项假设与某套 ISA 不一致，运行期保护就会悄然失效。这种失效具有"双重无声"特征：编译时不报错（工具链与功能测试都察觉不到），运行时也能产生正确的功能结果（程序行为也察觉不到），但其安全契约已经被打破。本课题将这种形态的失效称为静默失效（silent failure）：编译产物看似带有完整防线，但攻击者可直接绕过。</w:t>
+            </w:r>
+          </w:p>
+          <w:p>
+            <w:pPr>
+              <w:spacing w:line="360" w:lineRule="auto"/>
               <w:rPr>
                 <w:b/>
                 <w:bCs/>
@@ -2577,51 +2742,47 @@
           </w:p>
           <w:p>
             <w:pPr>
-              <w:pStyle w:val="Normal"/>
-              <w:spacing w:lineRule="auto" w:line="360"/>
-              <w:ind w:firstLineChars="200" w:startChars="0" w:start="0" w:endChars="0" w:end="0"/>
-              <w:rPr>
-                <w:kern w:val="0"/>
-                <w:sz w:val="24"/>
-              </w:rPr>
-            </w:pPr>
-            <w:r>
-              <w:rPr>
-                <w:kern w:val="0"/>
-                <w:sz w:val="24"/>
-              </w:rPr>
-              <w:t xml:space="preserve">要在编译器中系统性地暴露此类静默失效，本课题面临两个相互纠缠的挑战。</w:t>
-            </w:r>
-          </w:p>
-          <w:p>
-            <w:pPr>
-              <w:pStyle w:val="Normal"/>
-              <w:spacing w:lineRule="auto" w:line="360"/>
-              <w:ind w:firstLineChars="200" w:startChars="0" w:start="0" w:endChars="0" w:end="0"/>
-              <w:rPr>
-                <w:kern w:val="0"/>
-                <w:sz w:val="24"/>
-              </w:rPr>
-            </w:pPr>
-            <w:r>
-              <w:rPr>
-                <w:kern w:val="0"/>
-                <w:sz w:val="24"/>
-              </w:rPr>
-              <w:t xml:space="preserve">第一是搜索空间巨大。如图 2 所示，编译器需要在多种防御机制与多套 ISA 构成的二维空间中维护安全契约：纵向上至少包含栈金丝雀、_FORTIFY_SOURCE、IBT、CFI、BTI、PAC、影子栈等机制；横向上至少包含 x86-64、AArch64、RISC-V、LoongArch、MIPS、PowerPC 等架构。每个格点对应一份独立的中端 pass 或后端模板，调用约定、寄存器分配、指令编码上的任意细节都可能影响该机制能否兑现其安全契约。已确认的同源遗漏并不少见：与 CVE-2023-4039 同源的 PR-96191[7] 在 2020 年修复时仅覆盖 AArch64 / ARM，未触及 MIPS、LoongArch、Xtensa、CSKY 等 fallback 后端，因此同一类失效在这些架构上又静静地存在了若干年。本课题在初步实验阶段已向 GCC 上游报告并确认了多例此类同源失效[17-20]，第五章将给出具体案例。</w:t>
-            </w:r>
-          </w:p>
-          <w:p>
-            <w:pPr>
-              <w:pStyle w:val="Normal"/>
-              <w:spacing w:lineRule="auto" w:line="360"/>
-              <w:jc w:val="center"/>
-            </w:pPr>
-            <w:r>
-              <w:rPr/>
+              <w:spacing w:line="360" w:lineRule="auto"/>
+              <w:ind w:left="0" w:leftChars="0" w:right="0" w:rightChars="0" w:firstLineChars="200"/>
+              <w:rPr>
+                <w:kern w:val="0"/>
+                <w:sz w:val="24"/>
+              </w:rPr>
+            </w:pPr>
+            <w:r>
+              <w:rPr>
+                <w:kern w:val="0"/>
+                <w:sz w:val="24"/>
+              </w:rPr>
+              <w:t>要在编译器中系统性地暴露此类静默失效，本课题面临两个相互纠缠的挑战。</w:t>
+            </w:r>
+          </w:p>
+          <w:p>
+            <w:pPr>
+              <w:spacing w:line="360" w:lineRule="auto"/>
+              <w:ind w:left="0" w:leftChars="0" w:right="0" w:rightChars="0" w:firstLineChars="200"/>
+              <w:rPr>
+                <w:kern w:val="0"/>
+                <w:sz w:val="24"/>
+              </w:rPr>
+            </w:pPr>
+            <w:r>
+              <w:rPr>
+                <w:kern w:val="0"/>
+                <w:sz w:val="24"/>
+              </w:rPr>
+              <w:t>第一是搜索空间巨大。如图 2 所示，编译器需要在多种防御机制（如栈金丝雀、_FORTIFY_SOURCE、IBT、CFI 等）与多套 ISA（如 x86-64、AArch64、RISC-V、LoongArch 等）构成的二维空间中维护安全契约。每个格点对应独立的中端 pass 或后端模板，任何细节都可能影响机制是否生效。已确认的同源遗漏并不少见：与 CVE-2023-4039 同源的 PR-96191[7] 在 2020 年修复时仅覆盖部分架构，未触及多个 fallback 后端，导致同一失效在其他架构上静默存续多年。本课题在初步实验中已向 GCC 上游确认了多例此类同源失效[17-20]（见第五章）。</w:t>
+            </w:r>
+          </w:p>
+          <w:p>
+            <w:pPr>
+              <w:spacing w:line="360" w:lineRule="auto"/>
+              <w:jc w:val="center"/>
+            </w:pPr>
+            <w:r>
               <w:drawing>
-                <wp:inline xmlns:wp="http://schemas.openxmlformats.org/drawingml/2006/wordprocessingDrawing" distT="0" distB="0" distL="0" distR="0">
-                  <wp:extent cx="5385714" cy="2709687"/>
+                <wp:inline distT="0" distB="0" distL="0" distR="0">
+                  <wp:extent cx="5385435" cy="2709545"/>
                   <wp:effectExtent l="0" t="0" r="0" b="0"/>
                   <wp:docPr id="22" name="Figure22"/>
                   <wp:cNvGraphicFramePr>
@@ -2631,11 +2792,13 @@
                     <a:graphicData uri="http://schemas.openxmlformats.org/drawingml/2006/picture">
                       <pic:pic xmlns:pic="http://schemas.openxmlformats.org/drawingml/2006/picture">
                         <pic:nvPicPr>
-                          <pic:cNvPr id="22" name="defense-matrix.png"/>
-                          <pic:cNvPicPr/>
+                          <pic:cNvPr id="22" name="Figure22"/>
+                          <pic:cNvPicPr>
+                            <a:picLocks noChangeAspect="1"/>
+                          </pic:cNvPicPr>
                         </pic:nvPicPr>
                         <pic:blipFill>
-                          <a:blip xmlns:r="http://schemas.openxmlformats.org/officeDocument/2006/relationships" r:embed="rId22"/>
+                          <a:blip r:embed="rId7"/>
                           <a:stretch>
                             <a:fillRect/>
                           </a:stretch>
@@ -2658,8 +2821,7 @@
           </w:p>
           <w:p>
             <w:pPr>
-              <w:pStyle w:val="Normal"/>
-              <w:spacing w:lineRule="auto" w:line="360"/>
+              <w:spacing w:line="360" w:lineRule="auto"/>
               <w:jc w:val="center"/>
               <w:rPr>
                 <w:rFonts w:ascii="宋体" w:hAnsi="宋体" w:eastAsia="宋体"/>
@@ -2680,53 +2842,49 @@
           </w:p>
           <w:p>
             <w:pPr>
-              <w:pStyle w:val="Normal"/>
-              <w:spacing w:lineRule="auto" w:line="360"/>
-              <w:rPr>
-                <w:sz w:val="24"/>
-              </w:rPr>
-            </w:pPr>
-          </w:p>
-          <w:p>
-            <w:pPr>
-              <w:pStyle w:val="Normal"/>
-              <w:spacing w:lineRule="auto" w:line="360"/>
-              <w:ind w:firstLineChars="200" w:startChars="0" w:start="0" w:endChars="0" w:end="0"/>
-              <w:rPr>
-                <w:kern w:val="0"/>
-                <w:sz w:val="24"/>
-              </w:rPr>
-            </w:pPr>
-            <w:r>
-              <w:rPr>
-                <w:kern w:val="0"/>
-                <w:sz w:val="24"/>
-              </w:rPr>
-              <w:t xml:space="preserve">第二是失效难以判定。即使测试输入推进到防御机制相关代码路径，"防御是否仍满足其安全契约"也很难直接观察到：程序通常不会崩溃，与其他编译器的输出也保持一致，看似一切正常，而契约本身已经失守。本课题将每条防御机制运行期间必须始终成立的若干静态或动态性质统称为安全不变量（safety invariant，亦可理解为该机制的"安全规则"，例如金丝雀必须位于所有可被越界写入的栈对象与返回地址之间）。一旦这些性质被破坏，便对应一次静默失效。然而已有的自动化手段对此并不敏感：以差分输出或编译器崩溃为信号的工具（如 Csmith、YARPGen）几乎不会触发；覆盖率引导的模糊测试（fuzzing）虽然能把执行推进到相关代码路径，但本身并不携带判断该路径是否仍维护安全不变量的预言机（oracle）。这一判定空白决定了即使穷举搜索空间，也无法自动判别每一格点的状态。</w:t>
-            </w:r>
-          </w:p>
-          <w:p>
-            <w:pPr>
-              <w:pStyle w:val="Normal"/>
-              <w:spacing w:lineRule="auto" w:line="360"/>
-              <w:ind w:firstLineChars="200" w:startChars="0" w:start="0" w:endChars="0" w:end="0"/>
-              <w:rPr>
-                <w:kern w:val="0"/>
-                <w:sz w:val="24"/>
-              </w:rPr>
-            </w:pPr>
-            <w:r>
-              <w:rPr>
-                <w:kern w:val="0"/>
-                <w:sz w:val="24"/>
-              </w:rPr>
-              <w:t xml:space="preserve">同时，巨大的搜索空间也给 fuzzing 自身的覆盖效率带来了考验。本课题对此的应对思路是把推进目标显式限定在"防御机制相关代码"，让覆盖率反馈与大语言模型驱动的种子变异共同约束搜索方向，详见第三、四章。</w:t>
-            </w:r>
-          </w:p>
-          <w:p>
-            <w:pPr>
-              <w:pStyle w:val="Normal"/>
-              <w:spacing w:lineRule="auto" w:line="360"/>
+              <w:spacing w:line="360" w:lineRule="auto"/>
+              <w:rPr>
+                <w:sz w:val="24"/>
+              </w:rPr>
+            </w:pPr>
+          </w:p>
+          <w:p>
+            <w:pPr>
+              <w:spacing w:line="360" w:lineRule="auto"/>
+              <w:ind w:left="0" w:leftChars="0" w:right="0" w:rightChars="0" w:firstLineChars="200"/>
+              <w:rPr>
+                <w:kern w:val="0"/>
+                <w:sz w:val="24"/>
+              </w:rPr>
+            </w:pPr>
+            <w:r>
+              <w:rPr>
+                <w:kern w:val="0"/>
+                <w:sz w:val="24"/>
+              </w:rPr>
+              <w:t>第二是失效难以判定。即使测试推进到相关代码路径，"防御契约是否满足"也很难直接观察：程序不崩溃，多编译器输出一致，看似正常而契约已失守。本课题将防御机制运行期必须成立的静态或动态性质统称为安全不变量（safety invariant，即"安全规则"，如金丝雀必须位于易受攻击栈对象与返回地址之间）。破坏这些性质即发生静默失效。已有自动化手段对此不敏感：基于崩溃或差分输出的工具（如 Csmith、YARPGen）无法触发异常；覆盖率引导的模糊测试（fuzzing）也因缺乏相应的预言机（oracle）而无法判别每一格点的安全状态。</w:t>
+            </w:r>
+          </w:p>
+          <w:p>
+            <w:pPr>
+              <w:spacing w:line="360" w:lineRule="auto"/>
+              <w:ind w:left="0" w:leftChars="0" w:right="0" w:rightChars="0" w:firstLineChars="200"/>
+              <w:rPr>
+                <w:kern w:val="0"/>
+                <w:sz w:val="24"/>
+              </w:rPr>
+            </w:pPr>
+            <w:r>
+              <w:rPr>
+                <w:kern w:val="0"/>
+                <w:sz w:val="24"/>
+              </w:rPr>
+              <w:t>同时，巨大的搜索空间也给 fuzzing 自身的覆盖效率带来了考验。本课题对此的应对思路是把推进目标显式限定在"防御机制相关代码"，让覆盖率反馈与大语言模型驱动的种子变异共同约束搜索方向，详见第三、四章。</w:t>
+            </w:r>
+          </w:p>
+          <w:p>
+            <w:pPr>
+              <w:spacing w:line="360" w:lineRule="auto"/>
               <w:rPr>
                 <w:b/>
                 <w:bCs/>
@@ -2746,36 +2904,33 @@
           </w:p>
           <w:p>
             <w:pPr>
-              <w:pStyle w:val="Normal"/>
-              <w:spacing w:lineRule="auto" w:line="360"/>
-              <w:ind w:firstLineChars="200" w:startChars="0" w:start="0" w:endChars="0" w:end="0"/>
-              <w:rPr>
-                <w:kern w:val="0"/>
-                <w:sz w:val="24"/>
-              </w:rPr>
-            </w:pPr>
-            <w:r>
-              <w:rPr>
-                <w:kern w:val="0"/>
-                <w:sz w:val="24"/>
-              </w:rPr>
-              <w:t xml:space="preserve">编译器是绝大多数软件防御机制的实际载体，其在"防御机制 × ISA"二维矩阵上的静默失效会直接削弱整个软件生态的运行时安全保障。然而，现有自动化测试方法既未把搜索空间约束到防御机制相关代码，也未把安全不变量纳入判定体系。如果能把矩阵格点上的安全不变量翻译为可机器判定的检查器，并主动引导编译器走到相应代码路径，就既可暴露既有缺陷家族的同类变种，也有望在后续优化引入同类回归时及早发现。基于此，本研究结合大语言模型的代码理解能力与覆盖率反馈，构建面向编译器防御机制脆弱性的分析方法。</w:t>
-            </w:r>
-          </w:p>
-          <w:p>
-            <w:pPr>
-              <w:pStyle w:val="Normal"/>
-              <w:spacing w:lineRule="auto" w:line="360"/>
-              <w:rPr>
-                <w:sz w:val="24"/>
-              </w:rPr>
-            </w:pPr>
-          </w:p>
-          <w:p>
-            <w:pPr>
-              <w:pStyle w:val="Normal"/>
+              <w:spacing w:line="360" w:lineRule="auto"/>
+              <w:ind w:left="0" w:leftChars="0" w:right="0" w:rightChars="0" w:firstLineChars="200"/>
+              <w:rPr>
+                <w:kern w:val="0"/>
+                <w:sz w:val="24"/>
+              </w:rPr>
+            </w:pPr>
+            <w:r>
+              <w:rPr>
+                <w:kern w:val="0"/>
+                <w:sz w:val="24"/>
+              </w:rPr>
+              <w:t>编译器是绝大多数软件防御机制的实际载体，其在"防御机制 × ISA"二维矩阵上的静默失效会直接削弱整个软件生态的运行时安全保障。然而，现有自动化测试方法既未把搜索空间约束到防御机制相关代码，也未把安全不变量纳入判定体系。如果能把矩阵格点上的安全不变量翻译为可机器判定的检查器，并主动引导编译器走到相应代码路径，就既可暴露既有缺陷家族的同类变种，也有望在后续优化引入同类回归时及早发现。基于此，本研究结合大语言模型的代码理解能力与覆盖率反馈，构建面向编译器防御机制脆弱性的分析方法。</w:t>
+            </w:r>
+          </w:p>
+          <w:p>
+            <w:pPr>
+              <w:spacing w:line="360" w:lineRule="auto"/>
+              <w:rPr>
+                <w:sz w:val="24"/>
+              </w:rPr>
+            </w:pPr>
+          </w:p>
+          <w:p>
+            <w:pPr>
               <w:widowControl/>
-              <w:jc w:val="start"/>
+              <w:jc w:val="left"/>
               <w:rPr>
                 <w:b/>
                 <w:bCs/>
@@ -2790,13 +2945,12 @@
                 <w:kern w:val="0"/>
                 <w:sz w:val="24"/>
               </w:rPr>
-              <w:t>二、研究现状（相关工作）</w:t>
-            </w:r>
-          </w:p>
-          <w:p>
-            <w:pPr>
-              <w:pStyle w:val="Normal"/>
-              <w:spacing w:lineRule="auto" w:line="360"/>
+              <w:t>二、研究现状</w:t>
+            </w:r>
+          </w:p>
+          <w:p>
+            <w:pPr>
+              <w:spacing w:line="360" w:lineRule="auto"/>
               <w:rPr>
                 <w:b/>
                 <w:bCs/>
@@ -2816,44 +2970,41 @@
           </w:p>
           <w:p>
             <w:pPr>
-              <w:pStyle w:val="Normal"/>
-              <w:spacing w:lineRule="auto" w:line="360"/>
-              <w:ind w:firstLineChars="200" w:startChars="0" w:start="0" w:endChars="0" w:end="0"/>
-              <w:rPr>
-                <w:kern w:val="0"/>
-                <w:sz w:val="24"/>
-              </w:rPr>
-            </w:pPr>
-            <w:r>
-              <w:rPr>
-                <w:kern w:val="0"/>
-                <w:sz w:val="24"/>
-              </w:rPr>
-              <w:t xml:space="preserve">要在编译器中系统性地暴露此类静默失效，面临两个挑战：搜索空间巨大、失效难以判定。围绕这两条挑战梳理现有方法可以发现，此前的工作或针对其中之一做出推进，或停留在与编译器自身防御机制弱相关的常规缺陷上，目前尚未出现同时直面两条挑战的成熟方案。下文按这两个维度组织文献，并讨论各自的覆盖范围与遗留空白。</w:t>
-            </w:r>
-          </w:p>
-          <w:p>
-            <w:pPr>
-              <w:pStyle w:val="Normal"/>
-              <w:spacing w:lineRule="auto" w:line="360"/>
-              <w:ind w:firstLineChars="200" w:startChars="0" w:start="0" w:endChars="0" w:end="0"/>
-              <w:rPr>
-                <w:kern w:val="0"/>
-                <w:sz w:val="24"/>
-              </w:rPr>
-            </w:pPr>
-            <w:r>
-              <w:rPr>
-                <w:kern w:val="0"/>
-                <w:sz w:val="24"/>
-              </w:rPr>
-              <w:t xml:space="preserve">需要指出的是，模糊测试（fuzzing）并非解决该问题的唯一路径。静态分析、形式化验证、人工审计在原则上也可以参与判定一条防御机制是否在某 ISA 上仍维持其安全契约。然而，受限于安全契约本身缺乏统一的可形式化描述，以及防御机制实现散落在编译器中端 pass 与若干后端模板中的工程现实，目前与覆盖率证据耦合最紧、最容易把搜索空间显式收敛到目标代码区域的方案仍然是覆盖率引导的模糊测试。本章对相关工作的取舍即基于此判断。</w:t>
-            </w:r>
-          </w:p>
-          <w:p>
-            <w:pPr>
-              <w:pStyle w:val="Normal"/>
-              <w:spacing w:lineRule="auto" w:line="360"/>
+              <w:spacing w:line="360" w:lineRule="auto"/>
+              <w:ind w:left="0" w:leftChars="0" w:right="0" w:rightChars="0" w:firstLineChars="200"/>
+              <w:rPr>
+                <w:kern w:val="0"/>
+                <w:sz w:val="24"/>
+              </w:rPr>
+            </w:pPr>
+            <w:r>
+              <w:rPr>
+                <w:kern w:val="0"/>
+                <w:sz w:val="24"/>
+              </w:rPr>
+              <w:t>要在编译器中系统性地暴露此类静默失效，面临两个挑战：搜索空间巨大、失效难以判定。围绕这两条挑战梳理现有方法可以发现，此前的工作或针对其中之一做出推进，或停留在与编译器自身防御机制弱相关的常规缺陷上，目前尚未出现同时直面两条挑战的成熟方案。下文按这两个维度组织文献，并讨论各自的覆盖范围与遗留空白。</w:t>
+            </w:r>
+          </w:p>
+          <w:p>
+            <w:pPr>
+              <w:spacing w:line="360" w:lineRule="auto"/>
+              <w:ind w:left="0" w:leftChars="0" w:right="0" w:rightChars="0" w:firstLineChars="200"/>
+              <w:rPr>
+                <w:kern w:val="0"/>
+                <w:sz w:val="24"/>
+              </w:rPr>
+            </w:pPr>
+            <w:r>
+              <w:rPr>
+                <w:kern w:val="0"/>
+                <w:sz w:val="24"/>
+              </w:rPr>
+              <w:t>需要指出的是，模糊测试（fuzzing）并非解决该问题的唯一路径。静态分析、形式化验证、人工审计在原则上也可以参与判定一条防御机制是否在某 ISA 上仍维持其安全契约。然而，受限于安全契约本身缺乏统一的可形式化描述，以及防御机制实现散落在编译器中端 pass 与若干后端模板中的工程现实，目前与覆盖率证据耦合最紧、最容易把搜索空间显式收敛到目标代码区域的方案仍然是覆盖率引导的模糊测试。本章对相关工作的取舍即基于此判断。</w:t>
+            </w:r>
+          </w:p>
+          <w:p>
+            <w:pPr>
+              <w:spacing w:line="360" w:lineRule="auto"/>
               <w:rPr>
                 <w:b/>
                 <w:bCs/>
@@ -2873,116 +3024,125 @@
           </w:p>
           <w:p>
             <w:pPr>
-              <w:pStyle w:val="Normal"/>
-              <w:spacing w:lineRule="auto" w:line="360"/>
-              <w:ind w:firstLineChars="200" w:startChars="0" w:start="0" w:endChars="0" w:end="0"/>
-              <w:rPr>
-                <w:kern w:val="0"/>
-                <w:sz w:val="24"/>
-              </w:rPr>
-            </w:pPr>
-            <w:r>
-              <w:rPr>
-                <w:kern w:val="0"/>
-                <w:sz w:val="24"/>
-              </w:rPr>
-              <w:t xml:space="preserve">针对"如何把测试输入有目标地推到防御机制相关代码"的问题，现有方法大致可划分为四类。</w:t>
-            </w:r>
-          </w:p>
-          <w:p>
-            <w:pPr>
-              <w:pStyle w:val="Normal"/>
-              <w:spacing w:lineRule="auto" w:line="360"/>
-              <w:ind w:firstLineChars="200" w:startChars="0" w:start="0" w:endChars="0" w:end="0"/>
-              <w:rPr>
-                <w:kern w:val="0"/>
-                <w:sz w:val="24"/>
-              </w:rPr>
-            </w:pPr>
-            <w:r>
-              <w:rPr>
-                <w:kern w:val="0"/>
-                <w:sz w:val="24"/>
-              </w:rPr>
-              <w:t xml:space="preserve">随机生成与文法生成。Csmith[1] 与 YARPGen[2] 基于概率文法从空白合成不含未定义行为的 C 程序，再以差分输出驱动测试。这类方法对编译器整体覆盖良好，但生成过程不带任何防御机制的语义偏好，实测中很难自然落到栈金丝雀、IBT 等机制相关的代码路径上。</w:t>
-            </w:r>
-          </w:p>
-          <w:p>
-            <w:pPr>
-              <w:pStyle w:val="Normal"/>
-              <w:spacing w:lineRule="auto" w:line="360"/>
-              <w:ind w:firstLineChars="200" w:startChars="0" w:start="0" w:endChars="0" w:end="0"/>
-              <w:rPr>
-                <w:kern w:val="0"/>
-                <w:sz w:val="24"/>
-              </w:rPr>
-            </w:pPr>
-            <w:r>
-              <w:rPr>
-                <w:kern w:val="0"/>
-                <w:sz w:val="24"/>
-              </w:rPr>
-              <w:t xml:space="preserve">字节级覆盖率引导。AFL[3]、libFuzzer[4] 等以字节级覆盖率反馈为导向的工具被广泛用于编译器解析与优化组件。它们能感知"是否走入新代码"，但对生成程序的语法语义合法性约束有限，且覆盖率信号无差别对待所有代码区域，无法天然把推进目标限定到防御机制相关代码。</w:t>
-            </w:r>
-          </w:p>
-          <w:p>
-            <w:pPr>
-              <w:pStyle w:val="Normal"/>
-              <w:spacing w:lineRule="auto" w:line="360"/>
-              <w:ind w:firstLineChars="200" w:startChars="0" w:start="0" w:endChars="0" w:end="0"/>
-              <w:rPr>
-                <w:kern w:val="0"/>
-                <w:sz w:val="24"/>
-              </w:rPr>
-            </w:pPr>
-            <w:r>
-              <w:rPr>
-                <w:kern w:val="0"/>
-                <w:sz w:val="24"/>
-              </w:rPr>
-              <w:t xml:space="preserve">源码级语义保持变异。GrayC[14] 把覆盖率引导与一组保持语义合法性的源码级变异相结合，在覆盖率推进与缺陷发现率上均优于纯生成式工具；EMI 系列[11] 在已有种子的未执行区域做语义保持变换，可视作变异与变形预言机的组合。这类方法已具备相当强的工程实用性，但变异规则仍由人工先验定义，未利用目标代码自身的语义信息来引导变异方向。</w:t>
-            </w:r>
-          </w:p>
-          <w:p>
-            <w:pPr>
-              <w:pStyle w:val="Normal"/>
-              <w:spacing w:lineRule="auto" w:line="360"/>
-              <w:ind w:firstLineChars="200" w:startChars="0" w:start="0" w:endChars="0" w:end="0"/>
-              <w:rPr>
-                <w:kern w:val="0"/>
-                <w:sz w:val="24"/>
-              </w:rPr>
-            </w:pPr>
-            <w:r>
-              <w:rPr>
-                <w:kern w:val="0"/>
-                <w:sz w:val="24"/>
-              </w:rPr>
-              <w:t xml:space="preserve">大语言模型驱动的变异。WhiteFox[5] 从编译器优化 pass 源码出发，让大模型先归纳触发该优化的输入模式，再据此生成测试用例，使种子生成具备对编译器内部逻辑的感知；HLPFuzz[15] 进一步把大模型与覆盖率反馈耦合，按"未覆盖且后继最多"的策略选取目标基本块，把单基本块翻译为约束求解任务交由大模型完成，并通过渐进式上下文构建缓解注意力衰减。这条路线已经表明大模型可作为语义感知的变异引擎，但目前的工作所定义的目标仍是常规可达性——"让程序走到某个未覆盖位置"，并不关心目标路径所承担的安全契约。</w:t>
-            </w:r>
-          </w:p>
-          <w:p>
-            <w:pPr>
-              <w:pStyle w:val="Normal"/>
-              <w:spacing w:lineRule="auto" w:line="360"/>
-              <w:ind w:firstLineChars="200" w:startChars="0" w:start="0" w:endChars="0" w:end="0"/>
-              <w:rPr>
-                <w:kern w:val="0"/>
-                <w:sz w:val="24"/>
-              </w:rPr>
-            </w:pPr>
-            <w:r>
-              <w:rPr>
-                <w:kern w:val="0"/>
-                <w:sz w:val="24"/>
-              </w:rPr>
-              <w:t xml:space="preserve">综合来看，现有方法在搜索空间一侧已积累了较成熟的覆盖率推进手段，若能把"防御机制相关性"作为目标基本块挑选的额外维度并复用大语言模型的代码理解能力，就有望显著提高在防御机制 × ISA 矩阵中的有效采样密度。</w:t>
-            </w:r>
-          </w:p>
-          <w:p>
-            <w:pPr>
-              <w:pStyle w:val="Normal"/>
-              <w:spacing w:lineRule="auto" w:line="360"/>
+              <w:spacing w:line="360" w:lineRule="auto"/>
+              <w:ind w:left="0" w:leftChars="0" w:right="0" w:rightChars="0" w:firstLineChars="200"/>
+              <w:rPr>
+                <w:kern w:val="0"/>
+                <w:sz w:val="24"/>
+              </w:rPr>
+            </w:pPr>
+            <w:r>
+              <w:rPr>
+                <w:kern w:val="0"/>
+                <w:sz w:val="24"/>
+              </w:rPr>
+              <w:t>针对"如何把测试输入有目标地推到防御机制相关代码"的问题，现有方法大致可划分为四类。</w:t>
+            </w:r>
+          </w:p>
+          <w:p>
+            <w:pPr>
+              <w:spacing w:line="360" w:lineRule="auto"/>
+              <w:ind w:left="0" w:leftChars="0" w:right="0" w:rightChars="0" w:firstLineChars="200"/>
+              <w:rPr>
+                <w:kern w:val="0"/>
+                <w:sz w:val="24"/>
+              </w:rPr>
+            </w:pPr>
+            <w:r>
+              <w:rPr>
+                <w:kern w:val="0"/>
+                <w:sz w:val="24"/>
+              </w:rPr>
+              <w:t>随机生成与文法生成。Csmith[1] 与 YARPGen[2] 基于概率文法从空白合成不含未定义行为的 C 程序，再以差分输出驱动测试。这类方法对编译器整体覆盖良好，但生成过程不带任何防御机制的语义偏好，实测中很难自然落到栈金丝雀、IBT 等机制相关的代码路径上。</w:t>
+            </w:r>
+          </w:p>
+          <w:p>
+            <w:pPr>
+              <w:spacing w:line="360" w:lineRule="auto"/>
+              <w:ind w:left="0" w:leftChars="0" w:right="0" w:rightChars="0" w:firstLineChars="200"/>
+              <w:rPr>
+                <w:kern w:val="0"/>
+                <w:sz w:val="24"/>
+              </w:rPr>
+            </w:pPr>
+            <w:r>
+              <w:rPr>
+                <w:kern w:val="0"/>
+                <w:sz w:val="24"/>
+              </w:rPr>
+              <w:t>字节级覆盖率引导。AFL[3]、libFuzzer[4] 等以字节级覆盖率反馈为导向的工具被广泛用于编译器解析与优化组件。它们能感知"是否走入新代码"，但对生成程序的语法语义合法性约束有限，且覆盖率信号无差别对待所有代码区域，无法天然把推进目标限定到防御机制相关代码。</w:t>
+            </w:r>
+          </w:p>
+          <w:p>
+            <w:pPr>
+              <w:spacing w:line="360" w:lineRule="auto"/>
+              <w:ind w:left="0" w:leftChars="0" w:right="0" w:rightChars="0" w:firstLineChars="200"/>
+              <w:rPr>
+                <w:kern w:val="0"/>
+                <w:sz w:val="24"/>
+              </w:rPr>
+            </w:pPr>
+            <w:r>
+              <w:rPr>
+                <w:kern w:val="0"/>
+                <w:sz w:val="24"/>
+              </w:rPr>
+              <w:t>源码级语义保持变异。GrayC[14] 将覆盖率引导与一组保持语义合法性的源码级变异结合，在覆盖率推进与缺陷发现率上优于纯生成式工具；EMI 系列[11] 在种子的未执行区域做语义保持变换，可视作变异与变形预言机的组合。这类方法具备较强的工程实用性，但变异规则由人工定义，</w:t>
+            </w:r>
+            <w:r>
+              <w:rPr>
+                <w:rFonts w:hint="eastAsia"/>
+                <w:kern w:val="0"/>
+                <w:sz w:val="24"/>
+                <w:lang w:eastAsia="zh-CN"/>
+              </w:rPr>
+              <w:t>没有</w:t>
+            </w:r>
+            <w:r>
+              <w:rPr>
+                <w:kern w:val="0"/>
+                <w:sz w:val="24"/>
+              </w:rPr>
+              <w:t>利用目标代码自身的语义信息引导方向。</w:t>
+            </w:r>
+          </w:p>
+          <w:p>
+            <w:pPr>
+              <w:spacing w:line="360" w:lineRule="auto"/>
+              <w:ind w:left="0" w:leftChars="0" w:right="0" w:rightChars="0" w:firstLineChars="200"/>
+              <w:rPr>
+                <w:kern w:val="0"/>
+                <w:sz w:val="24"/>
+              </w:rPr>
+            </w:pPr>
+            <w:r>
+              <w:rPr>
+                <w:kern w:val="0"/>
+                <w:sz w:val="24"/>
+              </w:rPr>
+              <w:t>大语言模型驱动的变异。WhiteFox[5] 从优化 pass 源码出发，利用大模型归纳输入模式并生成测试用例，使种子生成具备对编译器内部逻辑的感知；HLPFuzz[15] 进一步将大模型与覆盖率反馈耦合，将未覆盖基本块翻译为约束求解任务交由大模型完成。这表明大模型可作为语义感知的变异引擎，但目前工作定义的目标仍是常规可达性（"走到某处代码"），并不关心目标路径所承担的安全契约。</w:t>
+            </w:r>
+          </w:p>
+          <w:p>
+            <w:pPr>
+              <w:spacing w:line="360" w:lineRule="auto"/>
+              <w:ind w:left="0" w:leftChars="0" w:right="0" w:rightChars="0" w:firstLineChars="200"/>
+              <w:rPr>
+                <w:kern w:val="0"/>
+                <w:sz w:val="24"/>
+              </w:rPr>
+            </w:pPr>
+            <w:r>
+              <w:rPr>
+                <w:kern w:val="0"/>
+                <w:sz w:val="24"/>
+              </w:rPr>
+              <w:t>综合来看，现有方法在搜索空间一侧已积累了较成熟的覆盖率推进手段，若能把"防御机制相关性"作为目标基本块挑选的额外维度并复用大语言模型的代码理解能力，就有望显著提高在防御机制 × ISA 矩阵中的有效采样密度。</w:t>
+            </w:r>
+          </w:p>
+          <w:p>
+            <w:pPr>
+              <w:spacing w:line="360" w:lineRule="auto"/>
               <w:rPr>
                 <w:b/>
                 <w:bCs/>
@@ -3002,116 +3162,109 @@
           </w:p>
           <w:p>
             <w:pPr>
-              <w:pStyle w:val="Normal"/>
-              <w:spacing w:lineRule="auto" w:line="360"/>
-              <w:ind w:firstLineChars="200" w:startChars="0" w:start="0" w:endChars="0" w:end="0"/>
-              <w:rPr>
-                <w:kern w:val="0"/>
-                <w:sz w:val="24"/>
-              </w:rPr>
-            </w:pPr>
-            <w:r>
-              <w:rPr>
-                <w:kern w:val="0"/>
-                <w:sz w:val="24"/>
-              </w:rPr>
-              <w:t xml:space="preserve">针对"如何判断一颗成功编译并运行的二进制是否仍满足防御机制安全契约"，现有预言机大致分为四类。</w:t>
-            </w:r>
-          </w:p>
-          <w:p>
-            <w:pPr>
-              <w:pStyle w:val="Normal"/>
-              <w:spacing w:lineRule="auto" w:line="360"/>
-              <w:ind w:firstLineChars="200" w:startChars="0" w:start="0" w:endChars="0" w:end="0"/>
-              <w:rPr>
-                <w:kern w:val="0"/>
-                <w:sz w:val="24"/>
-              </w:rPr>
-            </w:pPr>
-            <w:r>
-              <w:rPr>
-                <w:kern w:val="0"/>
-                <w:sz w:val="24"/>
-              </w:rPr>
-              <w:t xml:space="preserve">崩溃预言机[1,3,4] 以编译期或运行期的崩溃（ICE、断言、segfault、超时）为信号，是 AFL、libFuzzer 迁移到编译器后的默认选择。但静默失效的产物在编译期与运行期均不会崩溃，该类预言机本质上对其不可见。</w:t>
-            </w:r>
-          </w:p>
-          <w:p>
-            <w:pPr>
-              <w:pStyle w:val="Normal"/>
-              <w:spacing w:lineRule="auto" w:line="360"/>
-              <w:ind w:firstLineChars="200" w:startChars="0" w:start="0" w:endChars="0" w:end="0"/>
-              <w:rPr>
-                <w:kern w:val="0"/>
-                <w:sz w:val="24"/>
-              </w:rPr>
-            </w:pPr>
-            <w:r>
-              <w:rPr>
-                <w:kern w:val="0"/>
-                <w:sz w:val="24"/>
-              </w:rPr>
-              <w:t xml:space="preserve">差分预言机[1,2] 对若干编译器或同一编译器不同优化等级就同一程序的运行结果做交叉比对，差异即为 mis-compile。然而，静默失效的二进制功能行为与正常产物一致，不同编译器之间也保持一致输出，因此不会产生可观察的差异。</w:t>
-            </w:r>
-          </w:p>
-          <w:p>
-            <w:pPr>
-              <w:pStyle w:val="Normal"/>
-              <w:spacing w:lineRule="auto" w:line="360"/>
-              <w:ind w:firstLineChars="200" w:startChars="0" w:start="0" w:endChars="0" w:end="0"/>
-              <w:rPr>
-                <w:kern w:val="0"/>
-                <w:sz w:val="24"/>
-              </w:rPr>
-            </w:pPr>
-            <w:r>
-              <w:rPr>
-                <w:kern w:val="0"/>
-                <w:sz w:val="24"/>
-              </w:rPr>
-              <w:t xml:space="preserve">变形预言机以 Le 等提出的 EMI[11] 为代表，对同一输入下未执行的代码做删改，新程序应产生相同结果，差异即为 mis-compile。该类预言机围绕"语义保持"组织判据，仍然在功能输出层面观察，无法触及运行期防御契约。</w:t>
-            </w:r>
-          </w:p>
-          <w:p>
-            <w:pPr>
-              <w:pStyle w:val="Normal"/>
-              <w:spacing w:lineRule="auto" w:line="360"/>
-              <w:ind w:firstLineChars="200" w:startChars="0" w:start="0" w:endChars="0" w:end="0"/>
-              <w:rPr>
-                <w:kern w:val="0"/>
-                <w:sz w:val="24"/>
-              </w:rPr>
-            </w:pPr>
-            <w:r>
-              <w:rPr>
-                <w:kern w:val="0"/>
-                <w:sz w:val="24"/>
-              </w:rPr>
-              <w:t xml:space="preserve">Sanitizer 预言机借助 ASan、UBSan、MSan 把内存破坏与未定义行为转为显式信号；UBfuzz[12] 进一步用 crash-site mapping 反向定位 sanitizer 自身实现缺陷。Sanitizer 关心的是程序自身的内存安全与未定义行为，覆盖范围与"编译器内置防御机制是否仍生效"并不重叠：一颗带正确金丝雀检查、却把哨位放错位置的二进制，sanitizer 不会报告任何异常。面向子领域的复合预言机如 HirGen[13] 在 IR 层同时使用差分与变形以提高对深度学习编译器优化错误的敏感度，但同样不针对编译器自身的防御机制。</w:t>
-            </w:r>
-          </w:p>
-          <w:p>
-            <w:pPr>
-              <w:pStyle w:val="Normal"/>
-              <w:spacing w:lineRule="auto" w:line="360"/>
-              <w:ind w:firstLineChars="200" w:startChars="0" w:start="0" w:endChars="0" w:end="0"/>
-              <w:rPr>
-                <w:kern w:val="0"/>
-                <w:sz w:val="24"/>
-              </w:rPr>
-            </w:pPr>
-            <w:r>
-              <w:rPr>
-                <w:kern w:val="0"/>
-                <w:sz w:val="24"/>
-              </w:rPr>
-              <w:t xml:space="preserve">可以看到，现有预言机的判据全部建立在"崩溃"或"可观察输出差异"之上。当缺陷的形态是"代码正常编译运行、运行时保护已被静默削弱"时，它们均无法触发。这正是第一章所述判定空白的来源。</w:t>
-            </w:r>
-          </w:p>
-          <w:p>
-            <w:pPr>
-              <w:pStyle w:val="Normal"/>
-              <w:spacing w:lineRule="auto" w:line="360"/>
+              <w:spacing w:line="360" w:lineRule="auto"/>
+              <w:ind w:left="0" w:leftChars="0" w:right="0" w:rightChars="0" w:firstLineChars="200"/>
+              <w:rPr>
+                <w:kern w:val="0"/>
+                <w:sz w:val="24"/>
+              </w:rPr>
+            </w:pPr>
+            <w:r>
+              <w:rPr>
+                <w:kern w:val="0"/>
+                <w:sz w:val="24"/>
+              </w:rPr>
+              <w:t>针对"如何判断一颗成功编译并运行的二进制是否仍满足防御机制安全契约"，现有预言机大致分为四类。</w:t>
+            </w:r>
+          </w:p>
+          <w:p>
+            <w:pPr>
+              <w:spacing w:line="360" w:lineRule="auto"/>
+              <w:ind w:left="0" w:leftChars="0" w:right="0" w:rightChars="0" w:firstLineChars="200"/>
+              <w:rPr>
+                <w:kern w:val="0"/>
+                <w:sz w:val="24"/>
+              </w:rPr>
+            </w:pPr>
+            <w:r>
+              <w:rPr>
+                <w:kern w:val="0"/>
+                <w:sz w:val="24"/>
+              </w:rPr>
+              <w:t>崩溃预言机[1,3,4] 以编译期或运行期的崩溃（ICE、断言、segfault、超时）为信号，是 AFL、libFuzzer 迁移到编译器后的默认选择。但静默失效的产物在编译期与运行期均不会崩溃，该类预言机本质上对其不可见。</w:t>
+            </w:r>
+          </w:p>
+          <w:p>
+            <w:pPr>
+              <w:spacing w:line="360" w:lineRule="auto"/>
+              <w:ind w:left="0" w:leftChars="0" w:right="0" w:rightChars="0" w:firstLineChars="200"/>
+              <w:rPr>
+                <w:kern w:val="0"/>
+                <w:sz w:val="24"/>
+              </w:rPr>
+            </w:pPr>
+            <w:r>
+              <w:rPr>
+                <w:kern w:val="0"/>
+                <w:sz w:val="24"/>
+              </w:rPr>
+              <w:t>差分预言机[1,2] 对若干编译器或同一编译器不同优化等级就同一程序的运行结果做交叉比对，差异即为 mis-compile。然而，静默失效的二进制功能行为与正常产物一致，不同编译器之间也保持一致输出，因此不会产生可观察的差异。</w:t>
+            </w:r>
+          </w:p>
+          <w:p>
+            <w:pPr>
+              <w:spacing w:line="360" w:lineRule="auto"/>
+              <w:ind w:left="0" w:leftChars="0" w:right="0" w:rightChars="0" w:firstLineChars="200"/>
+              <w:rPr>
+                <w:kern w:val="0"/>
+                <w:sz w:val="24"/>
+              </w:rPr>
+            </w:pPr>
+            <w:r>
+              <w:rPr>
+                <w:kern w:val="0"/>
+                <w:sz w:val="24"/>
+              </w:rPr>
+              <w:t>变形预言机以 Le 等提出的 EMI[11] 为代表，对同一输入下未执行的代码做删改，新程序应产生相同结果，差异即为 mis-compile。该类预言机围绕"语义保持"组织判据，仍然在功能输出层面观察，无法触及运行期防御契约。</w:t>
+            </w:r>
+          </w:p>
+          <w:p>
+            <w:pPr>
+              <w:spacing w:line="360" w:lineRule="auto"/>
+              <w:ind w:left="0" w:leftChars="0" w:right="0" w:rightChars="0" w:firstLineChars="200"/>
+              <w:rPr>
+                <w:kern w:val="0"/>
+                <w:sz w:val="24"/>
+              </w:rPr>
+            </w:pPr>
+            <w:r>
+              <w:rPr>
+                <w:kern w:val="0"/>
+                <w:sz w:val="24"/>
+              </w:rPr>
+              <w:t>Sanitizer 预言机借助 ASan 等工具将内存破坏转为显式信号；UBfuzz[12] 进一步用反向定位来测试 sanitizer 自身实现缺陷。Sanitizer 关心程序自身的内存安全，其覆盖范围与"内置防御机制是否生效"不重叠。复合预言机如 HirGen[13] 虽在 IR 层结合差分与变形，但同样不针对编译器的防御机制。</w:t>
+            </w:r>
+          </w:p>
+          <w:p>
+            <w:pPr>
+              <w:spacing w:line="360" w:lineRule="auto"/>
+              <w:ind w:left="0" w:leftChars="0" w:right="0" w:rightChars="0" w:firstLineChars="200"/>
+              <w:rPr>
+                <w:kern w:val="0"/>
+                <w:sz w:val="24"/>
+              </w:rPr>
+            </w:pPr>
+            <w:r>
+              <w:rPr>
+                <w:kern w:val="0"/>
+                <w:sz w:val="24"/>
+              </w:rPr>
+              <w:t>可以看到，现有预言机的判据全部建立在"崩溃"或"可观察输出差异"之上。当缺陷的形态是"代码正常编译运行、运行时保护已被静默削弱"时，它们均无法触发。这正是第一章所述判定空白的来源。</w:t>
+            </w:r>
+          </w:p>
+          <w:p>
+            <w:pPr>
+              <w:spacing w:line="360" w:lineRule="auto"/>
               <w:rPr>
                 <w:b/>
                 <w:bCs/>
@@ -3131,36 +3284,33 @@
           </w:p>
           <w:p>
             <w:pPr>
-              <w:pStyle w:val="Normal"/>
-              <w:spacing w:lineRule="auto" w:line="360"/>
-              <w:ind w:firstLineChars="200" w:startChars="0" w:start="0" w:endChars="0" w:end="0"/>
-              <w:rPr>
-                <w:kern w:val="0"/>
-                <w:sz w:val="24"/>
-              </w:rPr>
-            </w:pPr>
-            <w:r>
-              <w:rPr>
-                <w:kern w:val="0"/>
-                <w:sz w:val="24"/>
-              </w:rPr>
-              <w:t xml:space="preserve">本研究整合现有模糊测试技术的优势，通过提炼跨架构的安全不变量构建专用预言机，并利用大语言模型结合覆盖率反馈实现精确变异，从而系统性暴露编译器在防御机制上的静默失效漏洞。本研究在第三、四章给出对应的解法：把每条防御机制的安全不变量翻译为可机器判定的检查器以填补预言机空白；在大模型与覆盖率联合驱动的种子生成主循环中，把目标基本块选择限定在防御机制相关代码区域，使搜索空间被显式压缩到矩阵中那些尚未触达的格点附近。</w:t>
-            </w:r>
-          </w:p>
-          <w:p>
-            <w:pPr>
-              <w:pStyle w:val="Normal"/>
-              <w:spacing w:lineRule="auto" w:line="360"/>
-              <w:rPr>
-                <w:sz w:val="24"/>
-              </w:rPr>
-            </w:pPr>
-          </w:p>
-          <w:p>
-            <w:pPr>
-              <w:pStyle w:val="Normal"/>
+              <w:spacing w:line="360" w:lineRule="auto"/>
+              <w:ind w:left="0" w:leftChars="0" w:right="0" w:rightChars="0" w:firstLineChars="200"/>
+              <w:rPr>
+                <w:kern w:val="0"/>
+                <w:sz w:val="24"/>
+              </w:rPr>
+            </w:pPr>
+            <w:r>
+              <w:rPr>
+                <w:kern w:val="0"/>
+                <w:sz w:val="24"/>
+              </w:rPr>
+              <w:t>本研究整合现有模糊测试技术的优势，通过提炼跨架构的安全不变量构建专用预言机，并利用大语言模型结合覆盖率反馈实现精确变异，从而系统性暴露编译器在防御机制上的静默失效漏洞。本研究在第三、四章给出对应的解法：把每条防御机制的安全不变量翻译为可机器判定的检查器以填补预言机空白；在大模型与覆盖率联合驱动的种子生成主循环中，把目标基本块选择限定在防御机制相关代码区域，使搜索空间被显式压缩到矩阵中那些尚未触达的格点附近。</w:t>
+            </w:r>
+          </w:p>
+          <w:p>
+            <w:pPr>
+              <w:spacing w:line="360" w:lineRule="auto"/>
+              <w:rPr>
+                <w:sz w:val="24"/>
+              </w:rPr>
+            </w:pPr>
+          </w:p>
+          <w:p>
+            <w:pPr>
               <w:widowControl/>
-              <w:jc w:val="start"/>
+              <w:jc w:val="left"/>
               <w:rPr>
                 <w:b/>
                 <w:bCs/>
@@ -3180,8 +3330,7 @@
           </w:p>
           <w:p>
             <w:pPr>
-              <w:pStyle w:val="Normal"/>
-              <w:spacing w:lineRule="auto" w:line="360"/>
+              <w:spacing w:line="360" w:lineRule="auto"/>
               <w:rPr>
                 <w:b/>
                 <w:bCs/>
@@ -3201,98 +3350,92 @@
           </w:p>
           <w:p>
             <w:pPr>
-              <w:pStyle w:val="Normal"/>
-              <w:spacing w:lineRule="auto" w:line="360"/>
-              <w:ind w:firstLineChars="200" w:startChars="0" w:start="0" w:endChars="0" w:end="0"/>
-              <w:rPr>
-                <w:kern w:val="0"/>
-                <w:sz w:val="24"/>
-              </w:rPr>
-            </w:pPr>
-            <w:r>
-              <w:rPr>
-                <w:kern w:val="0"/>
-                <w:sz w:val="24"/>
-              </w:rPr>
-              <w:t xml:space="preserve">本课题要构建一种面向编译器自身防御机制的脆弱性分析方法，并在 GCC 与 LLVM 上完成端到端验证。与以崩溃或差分输出为信号的传统编译器 fuzzer 不同，本方法以"防御机制是否仍满足其安全契约"为判据，自动暴露第一章所述的静默失效。具体目标分为以下三项：</w:t>
-            </w:r>
-          </w:p>
-          <w:p>
-            <w:pPr>
-              <w:pStyle w:val="Normal"/>
-              <w:spacing w:lineRule="auto" w:line="360"/>
-              <w:ind w:firstLineChars="200" w:startChars="0" w:start="0" w:endChars="0" w:end="0"/>
-              <w:rPr>
-                <w:kern w:val="0"/>
-                <w:sz w:val="24"/>
-              </w:rPr>
-            </w:pPr>
-            <w:r>
-              <w:rPr>
-                <w:kern w:val="0"/>
-                <w:sz w:val="24"/>
-              </w:rPr>
-              <w:t xml:space="preserve">(a) 形成一套覆盖主流防御机制的安全不变量集合，每条不变量具备可由二进制或运行行为判定的证据形式，在 GCC 与 LLVM 上保持一致的描述结构；</w:t>
-            </w:r>
-          </w:p>
-          <w:p>
-            <w:pPr>
-              <w:pStyle w:val="Normal"/>
-              <w:spacing w:lineRule="auto" w:line="360"/>
-              <w:ind w:firstLineChars="200" w:startChars="0" w:start="0" w:endChars="0" w:end="0"/>
-              <w:rPr>
-                <w:kern w:val="0"/>
-                <w:sz w:val="24"/>
-              </w:rPr>
-            </w:pPr>
-            <w:r>
-              <w:rPr>
-                <w:kern w:val="0"/>
-                <w:sz w:val="24"/>
-              </w:rPr>
-              <w:t xml:space="preserve">(b) 构建一个可同时面向 GCC 与 LLVM、跨架构运行的 fuzzer 原型，以防御机制相关代码的源代码覆盖率为推进信号，由大语言模型完成种子精细变异；</w:t>
-            </w:r>
-          </w:p>
-          <w:p>
-            <w:pPr>
-              <w:pStyle w:val="Normal"/>
-              <w:spacing w:lineRule="auto" w:line="360"/>
-              <w:ind w:firstLineChars="200" w:startChars="0" w:start="0" w:endChars="0" w:end="0"/>
-              <w:rPr>
-                <w:kern w:val="0"/>
-                <w:sz w:val="24"/>
-              </w:rPr>
-            </w:pPr>
-            <w:r>
-              <w:rPr>
-                <w:kern w:val="0"/>
-                <w:sz w:val="24"/>
-              </w:rPr>
-              <w:t xml:space="preserve">(c) 通过该原型在 GCC 与 LLVM 上发现可被上游确认的真实缺陷，验证方法的有效性与跨编译器迁移性。</w:t>
-            </w:r>
-          </w:p>
-          <w:p>
-            <w:pPr>
-              <w:pStyle w:val="Normal"/>
-              <w:spacing w:lineRule="auto" w:line="360"/>
-              <w:ind w:firstLineChars="200" w:startChars="0" w:start="0" w:endChars="0" w:end="0"/>
-              <w:rPr>
-                <w:kern w:val="0"/>
-                <w:sz w:val="24"/>
-              </w:rPr>
-            </w:pPr>
-            <w:r>
-              <w:rPr>
-                <w:kern w:val="0"/>
-                <w:sz w:val="24"/>
-              </w:rPr>
-              <w:t xml:space="preserve">三个目标依次推进：(a) 提供事实基础，(b) 构建原型，(c) 完成实证验证。其依赖关系与工作内容详见 3.2 节。</w:t>
-            </w:r>
-          </w:p>
-          <w:p>
-            <w:pPr>
-              <w:pStyle w:val="Normal"/>
-              <w:spacing w:lineRule="auto" w:line="360"/>
+              <w:spacing w:line="360" w:lineRule="auto"/>
+              <w:ind w:left="0" w:leftChars="0" w:right="0" w:rightChars="0" w:firstLineChars="200"/>
+              <w:rPr>
+                <w:kern w:val="0"/>
+                <w:sz w:val="24"/>
+              </w:rPr>
+            </w:pPr>
+            <w:r>
+              <w:rPr>
+                <w:kern w:val="0"/>
+                <w:sz w:val="24"/>
+              </w:rPr>
+              <w:t>本课题要构建一种面向编译器自身防御机制的脆弱性分析方法，并在 GCC 与 LLVM 上完成端到端验证。与以崩溃或差分输出为信号的传统编译器 fuzzer 不同，本方法以"防御机制是否仍满足其安全契约"为判据，自动暴露第一章所述的静默失效。具体目标分为以下三项：</w:t>
+            </w:r>
+          </w:p>
+          <w:p>
+            <w:pPr>
+              <w:spacing w:line="360" w:lineRule="auto"/>
+              <w:ind w:left="0" w:leftChars="0" w:right="0" w:rightChars="0" w:firstLineChars="200"/>
+              <w:rPr>
+                <w:kern w:val="0"/>
+                <w:sz w:val="24"/>
+              </w:rPr>
+            </w:pPr>
+            <w:r>
+              <w:rPr>
+                <w:kern w:val="0"/>
+                <w:sz w:val="24"/>
+              </w:rPr>
+              <w:t>(a) 形成一套覆盖主流防御机制的安全不变量集合，每条不变量具备可由二进制或运行行为判定的证据形式，在 GCC 与 LLVM 上保持一致的描述结构；</w:t>
+            </w:r>
+          </w:p>
+          <w:p>
+            <w:pPr>
+              <w:spacing w:line="360" w:lineRule="auto"/>
+              <w:ind w:left="0" w:leftChars="0" w:right="0" w:rightChars="0" w:firstLineChars="200"/>
+              <w:rPr>
+                <w:kern w:val="0"/>
+                <w:sz w:val="24"/>
+              </w:rPr>
+            </w:pPr>
+            <w:r>
+              <w:rPr>
+                <w:kern w:val="0"/>
+                <w:sz w:val="24"/>
+              </w:rPr>
+              <w:t>(b) 构建一个可同时面向 GCC 与 LLVM、跨架构运行的 fuzzer 原型，以防御机制相关代码的源代码覆盖率为推进信号，由大语言模型完成种子精细变异；</w:t>
+            </w:r>
+          </w:p>
+          <w:p>
+            <w:pPr>
+              <w:spacing w:line="360" w:lineRule="auto"/>
+              <w:ind w:left="0" w:leftChars="0" w:right="0" w:rightChars="0" w:firstLineChars="200"/>
+              <w:rPr>
+                <w:kern w:val="0"/>
+                <w:sz w:val="24"/>
+              </w:rPr>
+            </w:pPr>
+            <w:r>
+              <w:rPr>
+                <w:kern w:val="0"/>
+                <w:sz w:val="24"/>
+              </w:rPr>
+              <w:t>(c) 通过该原型在 GCC 与 LLVM 上发现可被上游确认的真实缺陷，验证方法的有效性与跨编译器迁移性。</w:t>
+            </w:r>
+          </w:p>
+          <w:p>
+            <w:pPr>
+              <w:spacing w:line="360" w:lineRule="auto"/>
+              <w:ind w:left="0" w:leftChars="0" w:right="0" w:rightChars="0" w:firstLineChars="200"/>
+              <w:rPr>
+                <w:kern w:val="0"/>
+                <w:sz w:val="24"/>
+              </w:rPr>
+            </w:pPr>
+            <w:r>
+              <w:rPr>
+                <w:kern w:val="0"/>
+                <w:sz w:val="24"/>
+              </w:rPr>
+              <w:t>三个目标依次推进：(a) 提供事实基础，(b) 构建原型，(c) 完成实证验证。其依赖关系与工作内容详见 3.2 节。</w:t>
+            </w:r>
+          </w:p>
+          <w:p>
+            <w:pPr>
+              <w:spacing w:line="360" w:lineRule="auto"/>
               <w:rPr>
                 <w:b/>
                 <w:bCs/>
@@ -3312,33 +3455,42 @@
           </w:p>
           <w:p>
             <w:pPr>
-              <w:pStyle w:val="Normal"/>
-              <w:spacing w:lineRule="auto" w:line="360"/>
-              <w:ind w:firstLineChars="200" w:startChars="0" w:start="0" w:endChars="0" w:end="0"/>
-              <w:rPr>
-                <w:kern w:val="0"/>
-                <w:sz w:val="24"/>
-              </w:rPr>
-            </w:pPr>
-            <w:r>
-              <w:rPr>
-                <w:kern w:val="0"/>
-                <w:sz w:val="24"/>
-              </w:rPr>
-              <w:t xml:space="preserve">本课题分为三部分工作，相互依赖关系如图 3 所示：不变量形式化是预言机与种子目标选择的基础；预言机提供安全判定接口；覆盖率驱动的种子生成负责将测试输入推进到特定代码路径。</w:t>
-            </w:r>
-          </w:p>
-          <w:p>
-            <w:pPr>
-              <w:pStyle w:val="Normal"/>
-              <w:spacing w:lineRule="auto" w:line="360"/>
-              <w:jc w:val="center"/>
-            </w:pPr>
-            <w:r>
-              <w:rPr/>
+              <w:spacing w:line="360" w:lineRule="auto"/>
+              <w:ind w:left="0" w:leftChars="0" w:right="0" w:rightChars="0" w:firstLineChars="200"/>
+              <w:rPr>
+                <w:kern w:val="0"/>
+                <w:sz w:val="24"/>
+              </w:rPr>
+            </w:pPr>
+            <w:r>
+              <w:rPr>
+                <w:kern w:val="0"/>
+                <w:sz w:val="24"/>
+              </w:rPr>
+              <w:t>本课题分为三部分工作，相互依赖关系如图 3 所示：不变量形式化是预言机与种子目标选择的基础；预言机提供安全判定接口；覆盖率驱动的种子生成负责将测试输入推进到特定代码路径。</w:t>
+            </w:r>
+          </w:p>
+          <w:p>
+            <w:pPr>
+              <w:spacing w:line="360" w:lineRule="auto"/>
+              <w:ind w:left="0" w:leftChars="0" w:right="0" w:rightChars="0" w:firstLineChars="200"/>
+              <w:rPr>
+                <w:kern w:val="0"/>
+                <w:sz w:val="24"/>
+              </w:rPr>
+            </w:pPr>
+            <w:bookmarkStart w:id="0" w:name="_GoBack"/>
+            <w:bookmarkEnd w:id="0"/>
+          </w:p>
+          <w:p>
+            <w:pPr>
+              <w:spacing w:line="360" w:lineRule="auto"/>
+              <w:jc w:val="center"/>
+            </w:pPr>
+            <w:r>
               <w:drawing>
-                <wp:inline xmlns:wp="http://schemas.openxmlformats.org/drawingml/2006/wordprocessingDrawing" distT="0" distB="0" distL="0" distR="0">
-                  <wp:extent cx="5385714" cy="1236021"/>
+                <wp:inline distT="0" distB="0" distL="0" distR="0">
+                  <wp:extent cx="5385435" cy="1235710"/>
                   <wp:effectExtent l="0" t="0" r="0" b="0"/>
                   <wp:docPr id="23" name="Figure23"/>
                   <wp:cNvGraphicFramePr>
@@ -3348,11 +3500,13 @@
                     <a:graphicData uri="http://schemas.openxmlformats.org/drawingml/2006/picture">
                       <pic:pic xmlns:pic="http://schemas.openxmlformats.org/drawingml/2006/picture">
                         <pic:nvPicPr>
-                          <pic:cNvPr id="23" name="pipeline.png"/>
-                          <pic:cNvPicPr/>
+                          <pic:cNvPr id="23" name="Figure23"/>
+                          <pic:cNvPicPr>
+                            <a:picLocks noChangeAspect="1"/>
+                          </pic:cNvPicPr>
                         </pic:nvPicPr>
                         <pic:blipFill>
-                          <a:blip xmlns:r="http://schemas.openxmlformats.org/officeDocument/2006/relationships" r:embed="rId23"/>
+                          <a:blip r:embed="rId8"/>
                           <a:stretch>
                             <a:fillRect/>
                           </a:stretch>
@@ -3375,8 +3529,7 @@
           </w:p>
           <w:p>
             <w:pPr>
-              <w:pStyle w:val="Normal"/>
-              <w:spacing w:lineRule="auto" w:line="360"/>
+              <w:spacing w:line="360" w:lineRule="auto"/>
               <w:jc w:val="center"/>
               <w:rPr>
                 <w:rFonts w:ascii="宋体" w:hAnsi="宋体" w:eastAsia="宋体"/>
@@ -3397,81 +3550,75 @@
           </w:p>
           <w:p>
             <w:pPr>
-              <w:pStyle w:val="Normal"/>
-              <w:spacing w:lineRule="auto" w:line="360"/>
-              <w:rPr>
-                <w:sz w:val="24"/>
-              </w:rPr>
-            </w:pPr>
-          </w:p>
-          <w:p>
-            <w:pPr>
-              <w:pStyle w:val="Normal"/>
-              <w:spacing w:lineRule="auto" w:line="360"/>
-              <w:ind w:firstLineChars="200" w:startChars="0" w:start="0" w:endChars="0" w:end="0"/>
-              <w:rPr>
-                <w:kern w:val="0"/>
-                <w:sz w:val="24"/>
-              </w:rPr>
-            </w:pPr>
-            <w:r>
-              <w:rPr>
-                <w:kern w:val="0"/>
-                <w:sz w:val="24"/>
-              </w:rPr>
-              <w:t xml:space="preserve">(1) 防御机制安全不变量的调研与形式化。针对栈金丝雀、_FORTIFY_SOURCE、IBT 等机制，从三类来源提炼其安全不变量：一是编译器源码中的注释与断言，例如 GCC 中 AArch64 后端关于 canary 槽位置关系的安全注释、ix86 关于 ENDBR 立即数禁止的谓词，以及 LLVM 中 lib/CodeGen/StackProtector 与 X86InstrInfo 等模块的对应实现；二是 GCC、LLVM 自身文档（Clang Command Line Reference、Attribute Reference、CFI Design 等）以及 glibc 与 ABI 文档对开关 flag、_chk 接口、CET ELF property 等的规定；三是已确认的历史 bug 与对应 patch，从修补点反推被违反的不变量。每条不变量按统一字段记录陈述、所属编译器与版本、证据片段、信息源及版本敏感性，便于机械检索与跨版本回归。</w:t>
-            </w:r>
-          </w:p>
-          <w:p>
-            <w:pPr>
-              <w:pStyle w:val="Normal"/>
-              <w:spacing w:lineRule="auto" w:line="360"/>
-              <w:ind w:firstLineChars="200" w:startChars="0" w:start="0" w:endChars="0" w:end="0"/>
-              <w:rPr>
-                <w:kern w:val="0"/>
-                <w:sz w:val="24"/>
-              </w:rPr>
-            </w:pPr>
-            <w:r>
-              <w:rPr>
-                <w:kern w:val="0"/>
-                <w:sz w:val="24"/>
-              </w:rPr>
-              <w:t xml:space="preserve">(2) 不变量到预言机的工程化落地。将不变量翻译为二进制层面或运行行为上的检查器。框架将检查器分为静态与动态两类：静态检查通过 ELF 符号、指令流模式、属性 note 做断言式判定；动态检查通过受控执行（如对 buffer 填充长度做二分搜索）观察运行行为。预言机判据建立在二进制和运行行为之上，与产生该二进制的具体编译器解耦，GCC 与 LLVM 产物共用同一套检查器。每个机制配置一个聚合器，任一检查器返回 Fail 即记机制级违例并附带证据；同时为每个机制记录开机制/关机制两套 flag profile，框架据此对同一颗种子做对照判定，避免与编译器自身缺省行为混淆。</w:t>
-            </w:r>
-          </w:p>
-          <w:p>
-            <w:pPr>
-              <w:pStyle w:val="Normal"/>
-              <w:spacing w:lineRule="auto" w:line="360"/>
-              <w:ind w:firstLineChars="200" w:startChars="0" w:start="0" w:endChars="0" w:end="0"/>
-              <w:rPr>
-                <w:kern w:val="0"/>
-                <w:sz w:val="24"/>
-              </w:rPr>
-            </w:pPr>
-            <w:r>
-              <w:rPr>
-                <w:kern w:val="0"/>
-                <w:sz w:val="24"/>
-              </w:rPr>
-              <w:t xml:space="preserve">(3) 大语言模型与覆盖率联合驱动的种子生成。以 GCC 与 LLVM 中防御机制代码的源代码覆盖率为目标信号（GCC 侧 gcov，LLVM 侧 SanitizerCoverage 与 source-based coverage），结合控制流图按"未覆盖且与防御机制相关性高"的策略选取基本块作为变异目标，相关性由 CFG 后继分支数与所在代码区域的防御机制权重决定。每轮变异的流程是：构造目标上下文（目标函数源码、目标基本块标注、覆盖前驱的种子作为示例），调用大模型生成新 C 种子，编译产物经覆盖率与预言机检查；结果分析阶段同时观察覆盖增量、是否命中目标、是否触发 bug 三个信号，任一为真即把种子纳入语料库。种子未命中目标时，通过轻量级追踪定位其与基线种子的发散点，把发散函数源码作为额外上下文回喂给变异提示，进入下一轮迭代。该过程将覆盖率推进与安全契约判定统一在同一主循环中，确保大模型生成始终聚焦于防御机制代码路径。</w:t>
-            </w:r>
-          </w:p>
-          <w:p>
-            <w:pPr>
-              <w:pStyle w:val="Normal"/>
-              <w:spacing w:lineRule="auto" w:line="360"/>
-              <w:rPr>
-                <w:sz w:val="24"/>
-              </w:rPr>
-            </w:pPr>
-          </w:p>
-          <w:p>
-            <w:pPr>
-              <w:pStyle w:val="Normal"/>
+              <w:spacing w:line="360" w:lineRule="auto"/>
+              <w:rPr>
+                <w:sz w:val="24"/>
+              </w:rPr>
+            </w:pPr>
+          </w:p>
+          <w:p>
+            <w:pPr>
+              <w:spacing w:line="360" w:lineRule="auto"/>
+              <w:ind w:left="0" w:leftChars="0" w:right="0" w:rightChars="0" w:firstLineChars="200"/>
+              <w:rPr>
+                <w:kern w:val="0"/>
+                <w:sz w:val="24"/>
+              </w:rPr>
+            </w:pPr>
+            <w:r>
+              <w:rPr>
+                <w:kern w:val="0"/>
+                <w:sz w:val="24"/>
+              </w:rPr>
+              <w:t>(1) 防御机制安全不变量的调研与形式化。针对栈金丝雀、_FORTIFY_SOURCE、IBT 等机制，从三类来源提炼其安全不变量：一是编译器源码中的注释与断言（如 GCC 中 AArch64 后端关于 canary 槽位置关系的注释，或 LLVM 中 StackProtector 模块的实现）；二是编译器及系统 ABI 官方文档对开关、接口、属性的规定；三是已确认的历史 bug 与修补点。每条不变量按统一字段记录其陈述、证据片段与版本敏感性，便于机械检索与回归。</w:t>
+            </w:r>
+          </w:p>
+          <w:p>
+            <w:pPr>
+              <w:spacing w:line="360" w:lineRule="auto"/>
+              <w:ind w:left="0" w:leftChars="0" w:right="0" w:rightChars="0" w:firstLineChars="200"/>
+              <w:rPr>
+                <w:kern w:val="0"/>
+                <w:sz w:val="24"/>
+              </w:rPr>
+            </w:pPr>
+            <w:r>
+              <w:rPr>
+                <w:kern w:val="0"/>
+                <w:sz w:val="24"/>
+              </w:rPr>
+              <w:t>(2) 不变量到预言机的工程化落地。将不变量翻译为二进制层面或运行行为上的检查器。框架将检查器分为静态与动态两类：静态检查通过 ELF 符号、指令流模式、属性 note 做断言式判定；动态检查通过受控执行（如对 buffer 填充长度做二分搜索）观察运行行为。预言机判据建立在二进制和运行行为之上，与产生该二进制的具体编译器解耦，GCC 与 LLVM 产物共用同一套检查器。每个机制配置一个聚合器，任一检查器返回 Fail 即记机制级违例并附带证据；同时为每个机制记录开机制/关机制两套 flag profile，框架据此对同一颗种子做对照判定，避免与编译器自身缺省行为混淆。</w:t>
+            </w:r>
+          </w:p>
+          <w:p>
+            <w:pPr>
+              <w:spacing w:line="360" w:lineRule="auto"/>
+              <w:ind w:left="0" w:leftChars="0" w:right="0" w:rightChars="0" w:firstLineChars="200"/>
+              <w:rPr>
+                <w:kern w:val="0"/>
+                <w:sz w:val="24"/>
+              </w:rPr>
+            </w:pPr>
+            <w:r>
+              <w:rPr>
+                <w:kern w:val="0"/>
+                <w:sz w:val="24"/>
+              </w:rPr>
+              <w:t>(3) 大语言模型与覆盖率联合驱动的种子生成。以编译器中防御机制的源代码覆盖率为目标信号，结合控制流图按"未覆盖且与防御机制相关性高"的策略选取基本块作为变异目标。每轮变异流程如下：构造目标上下文（含函数源码、基本块标注及示例种子），调用大模型生成新 C 种子，编译产物经预言机检查。若发现覆盖增量、命中目标或触发 bug，则保存种子。未命中目标但带来新覆盖的种子，将通过轻量级追踪定位发散点，回喂给模型进行下一轮精细变异。该过程确保了大模型生成始终聚焦于防御机制代码路径。</w:t>
+            </w:r>
+          </w:p>
+          <w:p>
+            <w:pPr>
+              <w:spacing w:line="360" w:lineRule="auto"/>
+              <w:rPr>
+                <w:sz w:val="24"/>
+              </w:rPr>
+            </w:pPr>
+          </w:p>
+          <w:p>
+            <w:pPr>
               <w:widowControl/>
-              <w:jc w:val="start"/>
+              <w:jc w:val="left"/>
               <w:rPr>
                 <w:b/>
                 <w:bCs/>
@@ -3491,26 +3638,24 @@
           </w:p>
           <w:p>
             <w:pPr>
-              <w:pStyle w:val="Normal"/>
-              <w:spacing w:lineRule="auto" w:line="360"/>
-              <w:ind w:firstLineChars="200" w:startChars="0" w:start="0" w:endChars="0" w:end="0"/>
-              <w:rPr>
-                <w:kern w:val="0"/>
-                <w:sz w:val="24"/>
-              </w:rPr>
-            </w:pPr>
-            <w:r>
-              <w:rPr>
-                <w:kern w:val="0"/>
-                <w:sz w:val="24"/>
-              </w:rPr>
-              <w:t xml:space="preserve">技术路线分为总体架构、防御机制不变量预言机框架、大语言模型驱动的种子变异主循环、跨架构与编译选项调度四部分，对应研究内容 (1)–(3) 的工程实现。GCC 上的初步验证证据见第五章。</w:t>
-            </w:r>
-          </w:p>
-          <w:p>
-            <w:pPr>
-              <w:pStyle w:val="Normal"/>
-              <w:spacing w:lineRule="auto" w:line="360"/>
+              <w:spacing w:line="360" w:lineRule="auto"/>
+              <w:ind w:left="0" w:leftChars="0" w:right="0" w:rightChars="0" w:firstLineChars="200"/>
+              <w:rPr>
+                <w:kern w:val="0"/>
+                <w:sz w:val="24"/>
+              </w:rPr>
+            </w:pPr>
+            <w:r>
+              <w:rPr>
+                <w:kern w:val="0"/>
+                <w:sz w:val="24"/>
+              </w:rPr>
+              <w:t>技术路线分为总体架构、防御机制不变量预言机框架、大语言模型驱动的种子变异主循环、跨架构与编译选项调度四部分，对应研究内容 (1)–(3) 的工程实现。GCC 上的初步验证证据见第五章。</w:t>
+            </w:r>
+          </w:p>
+          <w:p>
+            <w:pPr>
+              <w:spacing w:line="360" w:lineRule="auto"/>
               <w:rPr>
                 <w:b/>
                 <w:bCs/>
@@ -3530,33 +3675,30 @@
           </w:p>
           <w:p>
             <w:pPr>
-              <w:pStyle w:val="Normal"/>
-              <w:spacing w:lineRule="auto" w:line="360"/>
-              <w:ind w:firstLineChars="200" w:startChars="0" w:start="0" w:endChars="0" w:end="0"/>
-              <w:rPr>
-                <w:kern w:val="0"/>
-                <w:sz w:val="24"/>
-              </w:rPr>
-            </w:pPr>
-            <w:r>
-              <w:rPr>
-                <w:kern w:val="0"/>
-                <w:sz w:val="24"/>
-              </w:rPr>
-              <w:t xml:space="preserve">系统以一条 fuzz 主循环为骨干，由 LLM 变异、编译器、预言机三个子系统以及种子语料库、配置模块共同支撑，结构如图 4 所示。Fuzz 引擎承担主循环调度与提示词组装两项职能，将当前覆盖率、目标基本块和已有种子拼装成提示词交给 LLM 变异子系统，获取新种子后分发给后续环节。编译器子系统封装预先插桩的 GCC 与 LLVM 构建：GCC 侧通过 gcov 采集 .gcda 覆盖率数据，LLVM 侧通过 SanitizerCoverage 与 source-based coverage 采集 .profraw 数据，两者经统一接口归并为同构的"行级覆盖 → 种子 ID"映射，主循环对底层编译器无感知。预言机子系统按防御机制聚合不变量检查器，对每颗成功编译的种子做安全契约判定，判据建立在 ELF 二进制与运行行为之上，GCC 与 LLVM 产物共用同一套检查器。种子语料库持久化满足质量阈值的种子并维护家系信息。配置模块按"防御机制 · ISA · flag"三元组下发任务：把工具链选择（GCC / LLVM）与对应 flag 交给编译器子系统，把目标 ISA 对应的 QEMU 工具链交给预言机的执行层，使同一份种子可在不同后端上做对照实验，从而以可重复的方式覆盖第一章所述的"防御机制 × ISA"矩阵。</w:t>
-            </w:r>
-          </w:p>
-          <w:p>
-            <w:pPr>
-              <w:pStyle w:val="Normal"/>
-              <w:spacing w:lineRule="auto" w:line="360"/>
-              <w:jc w:val="center"/>
-            </w:pPr>
-            <w:r>
-              <w:rPr/>
+              <w:spacing w:line="360" w:lineRule="auto"/>
+              <w:ind w:left="0" w:leftChars="0" w:right="0" w:rightChars="0" w:firstLineChars="200"/>
+              <w:rPr>
+                <w:kern w:val="0"/>
+                <w:sz w:val="24"/>
+              </w:rPr>
+            </w:pPr>
+            <w:r>
+              <w:rPr>
+                <w:kern w:val="0"/>
+                <w:sz w:val="24"/>
+              </w:rPr>
+              <w:t>系统以一条 fuzz 主循环为骨干，由 LLM 变异、编译器、预言机三个子系统以及种子语料库、配置模块共同支撑，结构如图 4 所示。Fuzz 引擎承担主循环调度与提示词组装两项职能，将当前覆盖率、目标基本块和已有种子拼装成提示词交给 LLM 变异子系统，获取新种子后分发给后续环节。编译器子系统封装预先插桩的 GCC 与 LLVM，将底层差异数据（如 gcov 与 SanitizerCoverage）统一归并为同构的"行级覆盖 → 种子 ID"映射，主循环对此无感知。预言机子系统按防御机制聚合不变量检查器，对编译成功的种子进行安全契约判定。种子语料库持久化满足质量阈值的种子并维护家系信息。配置模块按"防御机制 · ISA · flag"三元组下发任务：把工具链选择（GCC / LLVM）与对应 flag 交给编译器子系统，把目标 ISA 对应的 QEMU 工具链交给预言机的执行层，使同一份种子可在不同后端上做对照实验，从而以可重复的方式覆盖第一章所述的"防御机制 × ISA"矩阵。</w:t>
+            </w:r>
+          </w:p>
+          <w:p>
+            <w:pPr>
+              <w:spacing w:line="360" w:lineRule="auto"/>
+              <w:jc w:val="center"/>
+            </w:pPr>
+            <w:r>
               <w:drawing>
-                <wp:inline xmlns:wp="http://schemas.openxmlformats.org/drawingml/2006/wordprocessingDrawing" distT="0" distB="0" distL="0" distR="0">
-                  <wp:extent cx="5385714" cy="2609079"/>
+                <wp:inline distT="0" distB="0" distL="0" distR="0">
+                  <wp:extent cx="5385435" cy="2608580"/>
                   <wp:effectExtent l="0" t="0" r="0" b="0"/>
                   <wp:docPr id="24" name="Figure24"/>
                   <wp:cNvGraphicFramePr>
@@ -3566,11 +3708,13 @@
                     <a:graphicData uri="http://schemas.openxmlformats.org/drawingml/2006/picture">
                       <pic:pic xmlns:pic="http://schemas.openxmlformats.org/drawingml/2006/picture">
                         <pic:nvPicPr>
-                          <pic:cNvPr id="24" name="architecture.png"/>
-                          <pic:cNvPicPr/>
+                          <pic:cNvPr id="24" name="Figure24"/>
+                          <pic:cNvPicPr>
+                            <a:picLocks noChangeAspect="1"/>
+                          </pic:cNvPicPr>
                         </pic:nvPicPr>
                         <pic:blipFill>
-                          <a:blip xmlns:r="http://schemas.openxmlformats.org/officeDocument/2006/relationships" r:embed="rId24"/>
+                          <a:blip r:embed="rId9"/>
                           <a:stretch>
                             <a:fillRect/>
                           </a:stretch>
@@ -3593,8 +3737,7 @@
           </w:p>
           <w:p>
             <w:pPr>
-              <w:pStyle w:val="Normal"/>
-              <w:spacing w:lineRule="auto" w:line="360"/>
+              <w:spacing w:line="360" w:lineRule="auto"/>
               <w:jc w:val="center"/>
               <w:rPr>
                 <w:rFonts w:ascii="宋体" w:hAnsi="宋体" w:eastAsia="宋体"/>
@@ -3615,17 +3758,15 @@
           </w:p>
           <w:p>
             <w:pPr>
-              <w:pStyle w:val="Normal"/>
-              <w:spacing w:lineRule="auto" w:line="360"/>
-              <w:rPr>
-                <w:sz w:val="24"/>
-              </w:rPr>
-            </w:pPr>
-          </w:p>
-          <w:p>
-            <w:pPr>
-              <w:pStyle w:val="Normal"/>
-              <w:spacing w:lineRule="auto" w:line="360"/>
+              <w:spacing w:line="360" w:lineRule="auto"/>
+              <w:rPr>
+                <w:sz w:val="24"/>
+              </w:rPr>
+            </w:pPr>
+          </w:p>
+          <w:p>
+            <w:pPr>
+              <w:spacing w:line="360" w:lineRule="auto"/>
               <w:rPr>
                 <w:b/>
                 <w:bCs/>
@@ -3645,33 +3786,30 @@
           </w:p>
           <w:p>
             <w:pPr>
-              <w:pStyle w:val="Normal"/>
-              <w:spacing w:lineRule="auto" w:line="360"/>
-              <w:ind w:firstLineChars="200" w:startChars="0" w:start="0" w:endChars="0" w:end="0"/>
-              <w:rPr>
-                <w:kern w:val="0"/>
-                <w:sz w:val="24"/>
-              </w:rPr>
-            </w:pPr>
-            <w:r>
-              <w:rPr>
-                <w:kern w:val="0"/>
-                <w:sz w:val="24"/>
-              </w:rPr>
-              <w:t xml:space="preserve">每个机制对应一个聚合器，下挂若干检查器。判定流程如图 5 所示，检查器输入包括种子的源码、汇编与二进制文件。检查器分为静态与动态两类：静态检查器读取 ELF 符号表、指令字节模式与 .note 段做断言式判定，如确认间接跳转目标的 ENDBR 字节、_chk 接口正确链接；动态检查器通过受控执行观察运行行为，如通过二分搜索溢出缓冲区的填充长度来定位 canary 触发边界。每个检查器返回 Pass、Fail、Error 三态，Error 仅用于隔离基础设施故障；聚合时任一 Fail 即视为机制级违例，并回写触发证据至种子记录。对于易与编译器缺省行为混淆的检查器，框架会同时运行开机制与关机制两套配置，比对判定差异。预言机维护一份元信息缓存，复用二分搜索结果与动态符号查询，避免重复解析或执行同一二进制文件。</w:t>
-            </w:r>
-          </w:p>
-          <w:p>
-            <w:pPr>
-              <w:pStyle w:val="Normal"/>
-              <w:spacing w:lineRule="auto" w:line="360"/>
-              <w:jc w:val="center"/>
-            </w:pPr>
-            <w:r>
-              <w:rPr/>
+              <w:spacing w:line="360" w:lineRule="auto"/>
+              <w:ind w:left="0" w:leftChars="0" w:right="0" w:rightChars="0" w:firstLineChars="200"/>
+              <w:rPr>
+                <w:kern w:val="0"/>
+                <w:sz w:val="24"/>
+              </w:rPr>
+            </w:pPr>
+            <w:r>
+              <w:rPr>
+                <w:kern w:val="0"/>
+                <w:sz w:val="24"/>
+              </w:rPr>
+              <w:t>每个机制对应一个聚合器，下挂若干检查器。判定流程如图 5 所示，检查器输入包括种子的源码、汇编与二进制文件。检查器分为两类：静态检查器通过 ELF 符号表、指令字节模式与 .note 段进行断言；动态检查器则通过受控执行（如二分搜索）观察运行期越界表现。每个检查器返回 Pass、Fail 或 Error，聚合时任一 Fail 即视为机制级违例，并回写触发证据。对于易与编译器缺省行为混淆的检查器，框架会同时运行开/关机制的两套配置进行比对。预言机还维护一份缓存以复用执行结果，避免重复解析。</w:t>
+            </w:r>
+          </w:p>
+          <w:p>
+            <w:pPr>
+              <w:spacing w:line="360" w:lineRule="auto"/>
+              <w:jc w:val="center"/>
+            </w:pPr>
+            <w:r>
               <w:drawing>
-                <wp:inline xmlns:wp="http://schemas.openxmlformats.org/drawingml/2006/wordprocessingDrawing" distT="0" distB="0" distL="0" distR="0">
-                  <wp:extent cx="4284090" cy="5612159"/>
+                <wp:inline distT="0" distB="0" distL="0" distR="0">
+                  <wp:extent cx="4283710" cy="5612130"/>
                   <wp:effectExtent l="0" t="0" r="0" b="0"/>
                   <wp:docPr id="25" name="Figure25"/>
                   <wp:cNvGraphicFramePr>
@@ -3681,11 +3819,13 @@
                     <a:graphicData uri="http://schemas.openxmlformats.org/drawingml/2006/picture">
                       <pic:pic xmlns:pic="http://schemas.openxmlformats.org/drawingml/2006/picture">
                         <pic:nvPicPr>
-                          <pic:cNvPr id="25" name="oracle-flow.png"/>
-                          <pic:cNvPicPr/>
+                          <pic:cNvPr id="25" name="Figure25"/>
+                          <pic:cNvPicPr>
+                            <a:picLocks noChangeAspect="1"/>
+                          </pic:cNvPicPr>
                         </pic:nvPicPr>
                         <pic:blipFill>
-                          <a:blip xmlns:r="http://schemas.openxmlformats.org/officeDocument/2006/relationships" r:embed="rId25"/>
+                          <a:blip r:embed="rId10"/>
                           <a:stretch>
                             <a:fillRect/>
                           </a:stretch>
@@ -3708,8 +3848,7 @@
           </w:p>
           <w:p>
             <w:pPr>
-              <w:pStyle w:val="Normal"/>
-              <w:spacing w:lineRule="auto" w:line="360"/>
+              <w:spacing w:line="360" w:lineRule="auto"/>
               <w:jc w:val="center"/>
               <w:rPr>
                 <w:rFonts w:ascii="宋体" w:hAnsi="宋体" w:eastAsia="宋体"/>
@@ -3730,17 +3869,15 @@
           </w:p>
           <w:p>
             <w:pPr>
-              <w:pStyle w:val="Normal"/>
-              <w:spacing w:lineRule="auto" w:line="360"/>
-              <w:rPr>
-                <w:sz w:val="24"/>
-              </w:rPr>
-            </w:pPr>
-          </w:p>
-          <w:p>
-            <w:pPr>
-              <w:pStyle w:val="Normal"/>
-              <w:spacing w:lineRule="auto" w:line="360"/>
+              <w:spacing w:line="360" w:lineRule="auto"/>
+              <w:rPr>
+                <w:sz w:val="24"/>
+              </w:rPr>
+            </w:pPr>
+          </w:p>
+          <w:p>
+            <w:pPr>
+              <w:spacing w:line="360" w:lineRule="auto"/>
               <w:rPr>
                 <w:b/>
                 <w:bCs/>
@@ -3760,33 +3897,30 @@
           </w:p>
           <w:p>
             <w:pPr>
-              <w:pStyle w:val="Normal"/>
-              <w:spacing w:lineRule="auto" w:line="360"/>
-              <w:ind w:firstLineChars="200" w:startChars="0" w:start="0" w:endChars="0" w:end="0"/>
-              <w:rPr>
-                <w:kern w:val="0"/>
-                <w:sz w:val="24"/>
-              </w:rPr>
-            </w:pPr>
-            <w:r>
-              <w:rPr>
-                <w:kern w:val="0"/>
-                <w:sz w:val="24"/>
-              </w:rPr>
-              <w:t xml:space="preserve">主循环的输入为当前覆盖率映射与编译器源码控制流图，单轮迭代过程如图 6 所示。每轮先在未覆盖基本块中按相关性挑出一个目标，相关性由该基本块在 CFG 上的后继分支数和所属代码区域对防御机制的关联程度共同决定，使搜索集中在未触达且与防御逻辑相关的代码上。随后构造目标上下文：目标函数源码片段、逐行覆盖标注、目标基本块位置，以及覆盖目标前驱的若干示例种子。提示词组装层将上下文与基础变异提示词、机制契约要求拼接，提交给大语言模型生成新 C 种子。编译失败时反馈错误信息进入下一轮；编译成功后覆盖率分析器判断命中情况，预言机给出安全判定。结果分析阶段同时观察覆盖增量、是否命中目标、是否触发 bug，任一为真即保存种子。种子未命中目标但带来新覆盖时，利用轻量动态追踪定位其与基线种子在调用序列上的首个发散点，将发散函数源码作为额外上下文反馈给变异提示，请求模型重新精细变异。目标基本块全部覆盖后，主循环可切换至随机变异阶段，仅以预言机为保存条件继续探索。</w:t>
-            </w:r>
-          </w:p>
-          <w:p>
-            <w:pPr>
-              <w:pStyle w:val="Normal"/>
-              <w:spacing w:lineRule="auto" w:line="360"/>
-              <w:jc w:val="center"/>
-            </w:pPr>
-            <w:r>
-              <w:rPr/>
+              <w:spacing w:line="360" w:lineRule="auto"/>
+              <w:ind w:left="0" w:leftChars="0" w:right="0" w:rightChars="0" w:firstLineChars="200"/>
+              <w:rPr>
+                <w:kern w:val="0"/>
+                <w:sz w:val="24"/>
+              </w:rPr>
+            </w:pPr>
+            <w:r>
+              <w:rPr>
+                <w:kern w:val="0"/>
+                <w:sz w:val="24"/>
+              </w:rPr>
+              <w:t>主循环的输入为当前覆盖率映射与编译器源码控制流图，单轮迭代过程如图 6 所示。每轮先在未覆盖基本块中按相关性挑出一个目标，相关性由该基本块在 CFG 上的后继分支数和所属代码区域对防御机制的关联程度共同决定，使搜索集中在未触达且与防御逻辑相关的代码上。随后构造目标上下文：目标函数源码片段、逐行覆盖标注、目标基本块位置，以及覆盖目标前驱的若干示例种子。提示词组装层将上下文与基础变异提示词、机制契约要求拼接，提交给大语言模型生成新 C 种子。编译失败时反馈错误信息进入下一轮；编译成功后覆盖率分析器判断命中情况，预言机给出安全判定。结果分析阶段同时观察覆盖增量、是否命中目标、是否触发 bug，任一为真即保存种子。种子未命中目标但带来新覆盖时，利用轻量动态追踪定位其与基线种子在调用序列上的首个发散点，将发散函数源码作为额外上下文反馈给变异提示，请求模型重新精细变异。目标基本块全部覆盖后，主循环可切换至随机变异阶段，仅以预言机为保存条件继续探索。</w:t>
+            </w:r>
+          </w:p>
+          <w:p>
+            <w:pPr>
+              <w:spacing w:line="360" w:lineRule="auto"/>
+              <w:jc w:val="center"/>
+            </w:pPr>
+            <w:r>
               <w:drawing>
-                <wp:inline xmlns:wp="http://schemas.openxmlformats.org/drawingml/2006/wordprocessingDrawing" distT="0" distB="0" distL="0" distR="0">
-                  <wp:extent cx="3501559" cy="6725183"/>
+                <wp:inline distT="0" distB="0" distL="0" distR="0">
+                  <wp:extent cx="3501390" cy="6724650"/>
                   <wp:effectExtent l="0" t="0" r="0" b="0"/>
                   <wp:docPr id="26" name="Figure26"/>
                   <wp:cNvGraphicFramePr>
@@ -3796,11 +3930,13 @@
                     <a:graphicData uri="http://schemas.openxmlformats.org/drawingml/2006/picture">
                       <pic:pic xmlns:pic="http://schemas.openxmlformats.org/drawingml/2006/picture">
                         <pic:nvPicPr>
-                          <pic:cNvPr id="26" name="main-loop.png"/>
-                          <pic:cNvPicPr/>
+                          <pic:cNvPr id="26" name="Figure26"/>
+                          <pic:cNvPicPr>
+                            <a:picLocks noChangeAspect="1"/>
+                          </pic:cNvPicPr>
                         </pic:nvPicPr>
                         <pic:blipFill>
-                          <a:blip xmlns:r="http://schemas.openxmlformats.org/officeDocument/2006/relationships" r:embed="rId26"/>
+                          <a:blip r:embed="rId11"/>
                           <a:stretch>
                             <a:fillRect/>
                           </a:stretch>
@@ -3823,8 +3959,7 @@
           </w:p>
           <w:p>
             <w:pPr>
-              <w:pStyle w:val="Normal"/>
-              <w:spacing w:lineRule="auto" w:line="360"/>
+              <w:spacing w:line="360" w:lineRule="auto"/>
               <w:jc w:val="center"/>
               <w:rPr>
                 <w:rFonts w:ascii="宋体" w:hAnsi="宋体" w:eastAsia="宋体"/>
@@ -3845,17 +3980,15 @@
           </w:p>
           <w:p>
             <w:pPr>
-              <w:pStyle w:val="Normal"/>
-              <w:spacing w:lineRule="auto" w:line="360"/>
-              <w:rPr>
-                <w:sz w:val="24"/>
-              </w:rPr>
-            </w:pPr>
-          </w:p>
-          <w:p>
-            <w:pPr>
-              <w:pStyle w:val="Normal"/>
-              <w:spacing w:lineRule="auto" w:line="360"/>
+              <w:spacing w:line="360" w:lineRule="auto"/>
+              <w:rPr>
+                <w:sz w:val="24"/>
+              </w:rPr>
+            </w:pPr>
+          </w:p>
+          <w:p>
+            <w:pPr>
+              <w:spacing w:line="360" w:lineRule="auto"/>
               <w:rPr>
                 <w:b/>
                 <w:bCs/>
@@ -3875,36 +4008,33 @@
           </w:p>
           <w:p>
             <w:pPr>
-              <w:pStyle w:val="Normal"/>
-              <w:spacing w:lineRule="auto" w:line="360"/>
-              <w:ind w:firstLineChars="200" w:startChars="0" w:start="0" w:endChars="0" w:end="0"/>
-              <w:rPr>
-                <w:kern w:val="0"/>
-                <w:sz w:val="24"/>
-              </w:rPr>
-            </w:pPr>
-            <w:r>
-              <w:rPr>
-                <w:kern w:val="0"/>
-                <w:sz w:val="24"/>
-              </w:rPr>
-              <w:t xml:space="preserve">配置模块把编译命令参数化为编译器（GCC / LLVM）、ISA、架构相关 flag、策略相关 flag profile 四元组，向编译器子系统下发工具链与 flag，向预言机执行层下发对应 ISA 的 QEMU 工具链，同一份种子据此分发给不同后端，目标二进制通过 QEMU 用户态执行。flag profile 同时包含开机制（如 -fstack-protector-strong）与关机制（如 -fno-stack-protector）两套，预言机据此对同一颗种子做对照判定；关机制产物仅用于交叉验证，不进入主语料库。GCC 与 LLVM 在防御机制 flag 拼写上的差异（如 -fcf-protection 对 -fsanitize=cfi）由 FlagScheduler 统一抽象为"机制级"配置，向上层屏蔽。BinaryInspector 屏蔽 ISA 差异：通过 Go 标准库读取 ELF 符号表与 .note 段，为检查器提供导入函数列表、ENDBR 字节模式扫描、栈布局采样等能力。</w:t>
-            </w:r>
-          </w:p>
-          <w:p>
-            <w:pPr>
-              <w:pStyle w:val="Normal"/>
-              <w:spacing w:lineRule="auto" w:line="360"/>
-              <w:rPr>
-                <w:sz w:val="24"/>
-              </w:rPr>
-            </w:pPr>
-          </w:p>
-          <w:p>
-            <w:pPr>
-              <w:pStyle w:val="Normal"/>
+              <w:spacing w:line="360" w:lineRule="auto"/>
+              <w:ind w:left="0" w:leftChars="0" w:right="0" w:rightChars="0" w:firstLineChars="200"/>
+              <w:rPr>
+                <w:kern w:val="0"/>
+                <w:sz w:val="24"/>
+              </w:rPr>
+            </w:pPr>
+            <w:r>
+              <w:rPr>
+                <w:kern w:val="0"/>
+                <w:sz w:val="24"/>
+              </w:rPr>
+              <w:t>配置模块将编译命令参数化为编译器、ISA、架构 flag、策略 flag 方案四元组，向子系统下发对应工具链，使同一种子可分发至不同后端经 QEMU 执行。策略方案包含开/关机制两套配置，供预言机对照判定。不同编译器间的 flag 拼写差异被统一抽象，而二进制解析层（BinaryInspector）则屏蔽了各 ISA 间的底层格式差异，为检查器提供通用判定能力。</w:t>
+            </w:r>
+          </w:p>
+          <w:p>
+            <w:pPr>
+              <w:spacing w:line="360" w:lineRule="auto"/>
+              <w:rPr>
+                <w:sz w:val="24"/>
+              </w:rPr>
+            </w:pPr>
+          </w:p>
+          <w:p>
+            <w:pPr>
               <w:widowControl/>
-              <w:jc w:val="start"/>
+              <w:jc w:val="left"/>
               <w:rPr>
                 <w:b/>
                 <w:bCs/>
@@ -3924,26 +4054,24 @@
           </w:p>
           <w:p>
             <w:pPr>
-              <w:pStyle w:val="Normal"/>
-              <w:spacing w:lineRule="auto" w:line="360"/>
-              <w:ind w:firstLineChars="200" w:startChars="0" w:start="0" w:endChars="0" w:end="0"/>
-              <w:rPr>
-                <w:kern w:val="0"/>
-                <w:sz w:val="24"/>
-              </w:rPr>
-            </w:pPr>
-            <w:r>
-              <w:rPr>
-                <w:kern w:val="0"/>
-                <w:sz w:val="24"/>
-              </w:rPr>
-              <w:t xml:space="preserve">目前已在 GCC 的多个版本上测试栈金丝雀、_FORTIFY_SOURCE、IBT 等防御机制，并在 GCC 上发现 3 例已获上游确认的静默失效[17-20]。LLVM 侧实验将在下一阶段进行。下文展开分析其中两例，并在 5.3 节简述第三例（多 ISA 上栈金丝雀寄存器泄露问题）。</w:t>
-            </w:r>
-          </w:p>
-          <w:p>
-            <w:pPr>
-              <w:pStyle w:val="Normal"/>
-              <w:spacing w:lineRule="auto" w:line="360"/>
+              <w:spacing w:line="360" w:lineRule="auto"/>
+              <w:ind w:left="0" w:leftChars="0" w:right="0" w:rightChars="0" w:firstLineChars="200"/>
+              <w:rPr>
+                <w:kern w:val="0"/>
+                <w:sz w:val="24"/>
+              </w:rPr>
+            </w:pPr>
+            <w:r>
+              <w:rPr>
+                <w:kern w:val="0"/>
+                <w:sz w:val="24"/>
+              </w:rPr>
+              <w:t>目前已在 GCC 的多个版本上测试栈金丝雀、_FORTIFY_SOURCE、IBT 等防御机制，并在 GCC 上发现 3 例已获上游确认的静默失效[17-20]。LLVM 侧实验将在下一阶段进行。下文展开分析其中两例，并在 5.3 节简述第三例（多 ISA 上栈金丝雀寄存器泄露问题）。</w:t>
+            </w:r>
+          </w:p>
+          <w:p>
+            <w:pPr>
+              <w:spacing w:line="360" w:lineRule="auto"/>
               <w:rPr>
                 <w:b/>
                 <w:bCs/>
@@ -3963,69 +4091,64 @@
           </w:p>
           <w:p>
             <w:pPr>
-              <w:pStyle w:val="Normal"/>
-              <w:spacing w:lineRule="auto" w:line="360"/>
-              <w:ind w:firstLineChars="200" w:startChars="0" w:start="0" w:endChars="0" w:end="0"/>
-              <w:rPr>
-                <w:kern w:val="0"/>
-                <w:sz w:val="24"/>
-              </w:rPr>
-            </w:pPr>
-            <w:r>
-              <w:rPr>
-                <w:kern w:val="0"/>
-                <w:sz w:val="24"/>
-              </w:rPr>
-              <w:t xml:space="preserve">_FORTIFY_SOURCE 是 GCC 与 glibc 配合的源代码加固机制[10]。开启后，glibc 头文件在预处理阶段把 strcat 等危险接口重写为带 size 参数的 __strcat_chk，运行时据此检查目的缓冲区上限。GCC 的 strlen pass 进一步识别已知前缀长度的目的指针，将 __strcat_chk 改写为性能更优的 __stpcpy_chk，并把目的指针前移 strlen(dst) 字节。这里的安全不变量是：目的指针前移后，传给 __stpcpy_chk 的 size 参数必须由原始 objsize 减去 strlen(dst)，否则运行时上限就被静默放宽 strlen(dst) 字节。</w:t>
-            </w:r>
-          </w:p>
-          <w:p>
-            <w:pPr>
-              <w:pStyle w:val="Normal"/>
-              <w:spacing w:lineRule="auto" w:line="360"/>
-              <w:ind w:firstLineChars="200" w:startChars="0" w:start="0" w:endChars="0" w:end="0"/>
-              <w:rPr>
-                <w:kern w:val="0"/>
-                <w:sz w:val="24"/>
-              </w:rPr>
-            </w:pPr>
-            <w:r>
-              <w:rPr>
-                <w:kern w:val="0"/>
-                <w:sz w:val="24"/>
-              </w:rPr>
-              <w:t xml:space="preserve">本方法构造的种子在该路径上稳定触发了 size 参数未相应减小的实例。反汇编层面 strcat → __strcat_chk → __stpcpy_chk 整条链条仍然出现，看似 FORTIFY 仍在生效，但"按 dst 剩余空间收紧上限"那一步已被丢弃。上报后该缺陷已被确认（PR-125079[17]）并合入主分支，计划随 GCC 16.1 发布并回送至部分旧版本。该路径与 2018 年修复的 PR-87672[6] 位于同一文件，表明当年修复时遗漏了对称分支，是“矩阵同源遗漏”的实际例证。</w:t>
-            </w:r>
-          </w:p>
-          <w:p>
-            <w:pPr>
-              <w:pStyle w:val="Normal"/>
-              <w:spacing w:lineRule="auto" w:line="360"/>
-              <w:ind w:firstLineChars="200" w:startChars="0" w:start="0" w:endChars="0" w:end="0"/>
-              <w:rPr>
-                <w:kern w:val="0"/>
-                <w:sz w:val="24"/>
-              </w:rPr>
-            </w:pPr>
-            <w:r>
-              <w:rPr>
-                <w:kern w:val="0"/>
-                <w:sz w:val="24"/>
-              </w:rPr>
-              <w:t xml:space="preserve">该缺陷命中了"FORTIFY 调用点的 size 参数下界推断"不变量。判定证据为静态符号与反汇编。该优化路径与 size 被放宽的具体位置如图 7 所示。</w:t>
-            </w:r>
-          </w:p>
-          <w:p>
-            <w:pPr>
-              <w:pStyle w:val="Normal"/>
-              <w:spacing w:lineRule="auto" w:line="360"/>
-              <w:jc w:val="center"/>
-            </w:pPr>
-            <w:r>
-              <w:rPr/>
+              <w:spacing w:line="360" w:lineRule="auto"/>
+              <w:ind w:left="0" w:leftChars="0" w:right="0" w:rightChars="0" w:firstLineChars="200"/>
+              <w:rPr>
+                <w:kern w:val="0"/>
+                <w:sz w:val="24"/>
+              </w:rPr>
+            </w:pPr>
+            <w:r>
+              <w:rPr>
+                <w:kern w:val="0"/>
+                <w:sz w:val="24"/>
+              </w:rPr>
+              <w:t>_FORTIFY_SOURCE 是 GCC 与 glibc 配合的源代码加固机制[10]。开启后，glibc 头文件在预处理阶段把 strcat 等危险接口重写为带 size 参数的 __strcat_chk，运行时据此检查目的缓冲区上限。GCC 的 strlen pass 进一步识别已知前缀长度的目的指针，将 __strcat_chk 改写为性能更优的 __stpcpy_chk，并把目的指针前移 strlen(dst) 字节。这里的安全不变量是：目的指针前移后，传给 __stpcpy_chk 的 size 参数必须由原始 objsize 减去 strlen(dst)，否则运行时上限就被静默放宽 strlen(dst) 字节。</w:t>
+            </w:r>
+          </w:p>
+          <w:p>
+            <w:pPr>
+              <w:spacing w:line="360" w:lineRule="auto"/>
+              <w:ind w:left="0" w:leftChars="0" w:right="0" w:rightChars="0" w:firstLineChars="200"/>
+              <w:rPr>
+                <w:kern w:val="0"/>
+                <w:sz w:val="24"/>
+              </w:rPr>
+            </w:pPr>
+            <w:r>
+              <w:rPr>
+                <w:kern w:val="0"/>
+                <w:sz w:val="24"/>
+              </w:rPr>
+              <w:t>本方法构造的种子在该路径上稳定触发了 size 参数未相应减小的实例。反汇编层面 strcat → __strcat_chk → __stpcpy_chk 链条仍然出现，看似 FORTIFY 仍在生效，但"按 dst 剩余空间收紧上限"这一步已被丢弃。上报后该缺陷已被确认（PR-125079[17]）并合入主分支。该路径与 2018 年修复的 PR-87672[6] 位于同一文件，表明当年修复时遗漏了对称分支。</w:t>
+            </w:r>
+          </w:p>
+          <w:p>
+            <w:pPr>
+              <w:spacing w:line="360" w:lineRule="auto"/>
+              <w:ind w:left="0" w:leftChars="0" w:right="0" w:rightChars="0" w:firstLineChars="200"/>
+              <w:rPr>
+                <w:kern w:val="0"/>
+                <w:sz w:val="24"/>
+              </w:rPr>
+            </w:pPr>
+            <w:r>
+              <w:rPr>
+                <w:kern w:val="0"/>
+                <w:sz w:val="24"/>
+              </w:rPr>
+              <w:t>该缺陷命中了"FORTIFY 调用点的 size 参数下界推断"不变量，判定证据为静态符号与反汇编。该位置如图 7 所示。</w:t>
+            </w:r>
+          </w:p>
+          <w:p>
+            <w:pPr>
+              <w:spacing w:line="360" w:lineRule="auto"/>
+              <w:jc w:val="center"/>
+            </w:pPr>
+            <w:r>
               <w:drawing>
-                <wp:inline xmlns:wp="http://schemas.openxmlformats.org/drawingml/2006/wordprocessingDrawing" distT="0" distB="0" distL="0" distR="0">
-                  <wp:extent cx="4284090" cy="6361875"/>
+                <wp:inline distT="0" distB="0" distL="0" distR="0">
+                  <wp:extent cx="4283710" cy="6361430"/>
                   <wp:effectExtent l="0" t="0" r="0" b="0"/>
                   <wp:docPr id="27" name="Figure27"/>
                   <wp:cNvGraphicFramePr>
@@ -4035,11 +4158,13 @@
                     <a:graphicData uri="http://schemas.openxmlformats.org/drawingml/2006/picture">
                       <pic:pic xmlns:pic="http://schemas.openxmlformats.org/drawingml/2006/picture">
                         <pic:nvPicPr>
-                          <pic:cNvPr id="27" name="fortify-path.png"/>
-                          <pic:cNvPicPr/>
+                          <pic:cNvPr id="27" name="Figure27"/>
+                          <pic:cNvPicPr>
+                            <a:picLocks noChangeAspect="1"/>
+                          </pic:cNvPicPr>
                         </pic:nvPicPr>
                         <pic:blipFill>
-                          <a:blip xmlns:r="http://schemas.openxmlformats.org/officeDocument/2006/relationships" r:embed="rId27"/>
+                          <a:blip r:embed="rId12"/>
                           <a:stretch>
                             <a:fillRect/>
                           </a:stretch>
@@ -4062,8 +4187,7 @@
           </w:p>
           <w:p>
             <w:pPr>
-              <w:pStyle w:val="Normal"/>
-              <w:spacing w:lineRule="auto" w:line="360"/>
+              <w:spacing w:line="360" w:lineRule="auto"/>
               <w:jc w:val="center"/>
               <w:rPr>
                 <w:rFonts w:ascii="宋体" w:hAnsi="宋体" w:eastAsia="宋体"/>
@@ -4084,17 +4208,15 @@
           </w:p>
           <w:p>
             <w:pPr>
-              <w:pStyle w:val="Normal"/>
-              <w:spacing w:lineRule="auto" w:line="360"/>
-              <w:rPr>
-                <w:sz w:val="24"/>
-              </w:rPr>
-            </w:pPr>
-          </w:p>
-          <w:p>
-            <w:pPr>
-              <w:pStyle w:val="Normal"/>
-              <w:spacing w:lineRule="auto" w:line="360"/>
+              <w:spacing w:line="360" w:lineRule="auto"/>
+              <w:rPr>
+                <w:sz w:val="24"/>
+              </w:rPr>
+            </w:pPr>
+          </w:p>
+          <w:p>
+            <w:pPr>
+              <w:spacing w:line="360" w:lineRule="auto"/>
               <w:rPr>
                 <w:b/>
                 <w:bCs/>
@@ -4114,62 +4236,58 @@
           </w:p>
           <w:p>
             <w:pPr>
-              <w:pStyle w:val="Normal"/>
-              <w:spacing w:lineRule="auto" w:line="360"/>
-              <w:ind w:firstLineChars="200" w:startChars="0" w:start="0" w:endChars="0" w:end="0"/>
-              <w:rPr>
-                <w:kern w:val="0"/>
-                <w:sz w:val="24"/>
-              </w:rPr>
-            </w:pPr>
-            <w:r>
-              <w:rPr>
-                <w:kern w:val="0"/>
-                <w:sz w:val="24"/>
-              </w:rPr>
-              <w:t xml:space="preserve">IBT 是 Intel CET 中针对间接跳转的保护机制[9]：硬件要求间接跳转或调用的目标地址必须以 endbr 指令开头，否则触发异常。endbr 在二进制中是固定的四字节值（endbr64 = F3 0F 1E FA、endbr32 = F3 0F 1E FB），按设计只应作为合法间接跳转入口出现在代码段。如果这四个字节以其他形式出现，例如作为 movabsq 指令的 64 位立即数的一部分嵌入 .text，攻击者就可以把控制流劫持到该处，硬件会将其识别为合法 landing pad，IBT 语义被绕过。</w:t>
-            </w:r>
-          </w:p>
-          <w:p>
-            <w:pPr>
-              <w:pStyle w:val="Normal"/>
-              <w:spacing w:lineRule="auto" w:line="360"/>
-              <w:ind w:firstLineChars="200" w:startChars="0" w:start="0" w:endChars="0" w:end="0"/>
-              <w:rPr>
-                <w:kern w:val="0"/>
-                <w:sz w:val="24"/>
-              </w:rPr>
-            </w:pPr>
-            <w:r>
-              <w:rPr>
-                <w:kern w:val="0"/>
-                <w:sz w:val="24"/>
-              </w:rPr>
-              <w:t xml:space="preserve">GCC 在 x86 后端用 ix86_endbr_immediate_operand 谓词做字节级检测：当目标启用 IBT 时，谓词扫描立即数中是否存在 endbr 模式，含该模式的立即数会被拒绝（同源历史修复参见 PR-96350[8]）。测试发现该谓词存在逻辑漏洞：扫描循环对"高位非零"的 64 位立即数提前退出，只要 endbr 字节排布在立即数高位，扫描就无法到达对应位置。这类立即数被错误接受，进而在 .text 中嵌入了伪 landing pad。该缺陷已上报上游（PR-125084[18]），等待维护者回复。</w:t>
-            </w:r>
-          </w:p>
-          <w:p>
-            <w:pPr>
-              <w:pStyle w:val="Normal"/>
-              <w:spacing w:lineRule="auto" w:line="360"/>
-              <w:ind w:firstLineChars="200" w:startChars="0" w:start="0" w:endChars="0" w:end="0"/>
-              <w:rPr>
-                <w:kern w:val="0"/>
-                <w:sz w:val="24"/>
-              </w:rPr>
-            </w:pPr>
-            <w:r>
-              <w:rPr>
-                <w:kern w:val="0"/>
-                <w:sz w:val="24"/>
-              </w:rPr>
-              <w:t xml:space="preserve">该例命中"endbr 字节模式不应出现在非跳转目标的指令中"不变量，证据为代码段内 endbr 模式扫描，属静态指令流检查。</w:t>
-            </w:r>
-          </w:p>
-          <w:p>
-            <w:pPr>
-              <w:pStyle w:val="Normal"/>
-              <w:spacing w:lineRule="auto" w:line="360"/>
+              <w:spacing w:line="360" w:lineRule="auto"/>
+              <w:ind w:left="0" w:leftChars="0" w:right="0" w:rightChars="0" w:firstLineChars="200"/>
+              <w:rPr>
+                <w:kern w:val="0"/>
+                <w:sz w:val="24"/>
+              </w:rPr>
+            </w:pPr>
+            <w:r>
+              <w:rPr>
+                <w:kern w:val="0"/>
+                <w:sz w:val="24"/>
+              </w:rPr>
+              <w:t>IBT 是 Intel CET 中针对间接跳转的保护机制[9]：硬件要求间接跳转或调用的目标地址必须以 endbr 指令开头，否则触发异常。endbr 在二进制中是固定的四字节值（endbr64 = F3 0F 1E FA、endbr32 = F3 0F 1E FB），按设计只应作为合法间接跳转入口出现在代码段。如果这四个字节以其他形式出现，例如作为 movabsq 指令的 64 位立即数的一部分嵌入 .text，攻击者就可以把控制流劫持到该处，硬件会将其识别为合法 landing pad，IBT 语义被绕过。</w:t>
+            </w:r>
+          </w:p>
+          <w:p>
+            <w:pPr>
+              <w:spacing w:line="360" w:lineRule="auto"/>
+              <w:ind w:left="0" w:leftChars="0" w:right="0" w:rightChars="0" w:firstLineChars="200"/>
+              <w:rPr>
+                <w:kern w:val="0"/>
+                <w:sz w:val="24"/>
+              </w:rPr>
+            </w:pPr>
+            <w:r>
+              <w:rPr>
+                <w:kern w:val="0"/>
+                <w:sz w:val="24"/>
+              </w:rPr>
+              <w:t>GCC 在 x86 后端用 ix86_endbr_immediate_operand 谓词做字节级检测：当目标启用 IBT 时，谓词扫描立即数中是否存在 endbr 模式，含该模式的立即数会被拒绝（同源历史修复参见 PR-96350[8]）。测试发现该谓词存在逻辑漏洞：扫描循环对"高位非零"的 64 位立即数提前退出，只要 endbr 字节排布在立即数高位，扫描就无法到达该位置。这类立即数被错误接受，进而在 .text 中嵌入了伪 landing pad。该缺陷已上报上游（PR-125084[18]），等待维护者回复。</w:t>
+            </w:r>
+          </w:p>
+          <w:p>
+            <w:pPr>
+              <w:spacing w:line="360" w:lineRule="auto"/>
+              <w:ind w:left="0" w:leftChars="0" w:right="0" w:rightChars="0" w:firstLineChars="200"/>
+              <w:rPr>
+                <w:kern w:val="0"/>
+                <w:sz w:val="24"/>
+              </w:rPr>
+            </w:pPr>
+            <w:r>
+              <w:rPr>
+                <w:kern w:val="0"/>
+                <w:sz w:val="24"/>
+              </w:rPr>
+              <w:t>该例命中"endbr 字节模式不应出现在非跳转目标的指令中"不变量，证据为代码段内 endbr 模式扫描，属静态指令流检查。</w:t>
+            </w:r>
+          </w:p>
+          <w:p>
+            <w:pPr>
+              <w:spacing w:line="360" w:lineRule="auto"/>
               <w:rPr>
                 <w:b/>
                 <w:bCs/>
@@ -4189,26 +4307,24 @@
           </w:p>
           <w:p>
             <w:pPr>
-              <w:pStyle w:val="Normal"/>
-              <w:spacing w:lineRule="auto" w:line="360"/>
-              <w:ind w:firstLineChars="200" w:startChars="0" w:start="0" w:endChars="0" w:end="0"/>
-              <w:rPr>
-                <w:kern w:val="0"/>
-                <w:sz w:val="24"/>
-              </w:rPr>
-            </w:pPr>
-            <w:r>
-              <w:rPr>
-                <w:kern w:val="0"/>
-                <w:sz w:val="24"/>
-              </w:rPr>
-              <w:t xml:space="preserve">本方法在 GCC 通用栈保护后端的 fallback 路径上还找到一例同类失效：MIPS、LoongArch、Xtensa、CSKY 等 ISA 的 fallback 后端未提供专用 epilogue 模板，函数返回时金丝雀寄存器未显式清零，进程级 __stack_chk_guard 值在调用者的可见寄存器中残留。该问题与 2020 年针对 AArch64 / ARM 的 PR-96191[7] 同源，当年修复未覆盖上述后端。本课题以 meta-bug PR-125045[19] 统一跟踪该家族在多 ISA 上的实例，其中 LoongArch 子例（PR-125049[20]）已被维护者确认并合入修复，其余 ISA 子例正在依次上报。</w:t>
-            </w:r>
-          </w:p>
-          <w:p>
-            <w:pPr>
-              <w:pStyle w:val="Normal"/>
-              <w:spacing w:lineRule="auto" w:line="360"/>
+              <w:spacing w:line="360" w:lineRule="auto"/>
+              <w:ind w:left="0" w:leftChars="0" w:right="0" w:rightChars="0" w:firstLineChars="200"/>
+              <w:rPr>
+                <w:kern w:val="0"/>
+                <w:sz w:val="24"/>
+              </w:rPr>
+            </w:pPr>
+            <w:r>
+              <w:rPr>
+                <w:kern w:val="0"/>
+                <w:sz w:val="24"/>
+              </w:rPr>
+              <w:t>本方法在 GCC 通用栈保护后端的 fallback 路径上找到一例同类失效：MIPS、LoongArch 等 ISA 的 fallback 后端未提供专用 epilogue 模板，函数返回时金丝雀寄存器未显式清零，进程级 __stack_chk_guard 值在寄存器中残留。该问题与 2020 年针对 AArch64 / ARM 的 PR-96191[7] 同源，当年修复未覆盖上述后端。本课题以 meta-bug PR-125045[19] 统一跟踪该家族，其中 LoongArch 子例（PR-125049[20]）已被维护者确认并合入修复，其余正依次上报。</w:t>
+            </w:r>
+          </w:p>
+          <w:p>
+            <w:pPr>
+              <w:spacing w:line="360" w:lineRule="auto"/>
               <w:rPr>
                 <w:b/>
                 <w:bCs/>
@@ -4228,36 +4344,33 @@
           </w:p>
           <w:p>
             <w:pPr>
-              <w:pStyle w:val="Normal"/>
-              <w:spacing w:lineRule="auto" w:line="360"/>
-              <w:ind w:firstLineChars="200" w:startChars="0" w:start="0" w:endChars="0" w:end="0"/>
-              <w:rPr>
-                <w:kern w:val="0"/>
-                <w:sz w:val="24"/>
-              </w:rPr>
-            </w:pPr>
-            <w:r>
-              <w:rPr>
-                <w:kern w:val="0"/>
-                <w:sz w:val="24"/>
-              </w:rPr>
-              <w:t xml:space="preserve">三例缺陷分别对应静态符号、动态行为、指令流字节模式三类不变量证据形态，共同特征是：二进制仍带有保护，但部分安全不变量已失效。本文方法在不修改编译器的前提下，通过变异与预言机的组合，将此类问题在自动化流程中暴露。LLVM 侧实验将在后续阶段以相同框架补全。</w:t>
-            </w:r>
-          </w:p>
-          <w:p>
-            <w:pPr>
-              <w:pStyle w:val="Normal"/>
-              <w:spacing w:lineRule="auto" w:line="360"/>
-              <w:rPr>
-                <w:sz w:val="24"/>
-              </w:rPr>
-            </w:pPr>
-          </w:p>
-          <w:p>
-            <w:pPr>
-              <w:pStyle w:val="Normal"/>
+              <w:spacing w:line="360" w:lineRule="auto"/>
+              <w:ind w:left="0" w:leftChars="0" w:right="0" w:rightChars="0" w:firstLineChars="200"/>
+              <w:rPr>
+                <w:kern w:val="0"/>
+                <w:sz w:val="24"/>
+              </w:rPr>
+            </w:pPr>
+            <w:r>
+              <w:rPr>
+                <w:kern w:val="0"/>
+                <w:sz w:val="24"/>
+              </w:rPr>
+              <w:t>上述三例缺陷共同说明：即使二进制仍带有保护，其底层依赖的部分安全不变量也可能已经失效。本文方法在不修改编译器的前提下，通过变异与预言机的组合成功将此类隐蔽问题暴露。</w:t>
+            </w:r>
+          </w:p>
+          <w:p>
+            <w:pPr>
+              <w:spacing w:line="360" w:lineRule="auto"/>
+              <w:rPr>
+                <w:sz w:val="24"/>
+              </w:rPr>
+            </w:pPr>
+          </w:p>
+          <w:p>
+            <w:pPr>
               <w:widowControl/>
-              <w:jc w:val="start"/>
+              <w:jc w:val="left"/>
               <w:rPr>
                 <w:b/>
                 <w:bCs/>
@@ -4277,401 +4390,416 @@
           </w:p>
           <w:p>
             <w:pPr>
-              <w:pStyle w:val="Normal"/>
               <w:keepLines/>
-              <w:spacing w:lineRule="auto" w:line="360"/>
-              <w:jc w:val="start"/>
-              <w:rPr>
-                <w:kern w:val="0"/>
-                <w:sz w:val="24"/>
-              </w:rPr>
-            </w:pPr>
-            <w:r>
-              <w:rPr>
-                <w:kern w:val="0"/>
-                <w:sz w:val="24"/>
-              </w:rPr>
-              <w:t xml:space="preserve">[1] Yang X, Chen Y, Eide E, et al. Finding and understanding bugs in C compilers[C]//Proceedings of the 32nd ACM SIGPLAN Conference on Programming Language Design and Implementation (PLDI). 2011: 283-294.</w:t>
-            </w:r>
-          </w:p>
-          <w:p>
-            <w:pPr>
-              <w:pStyle w:val="Normal"/>
+              <w:spacing w:line="360" w:lineRule="auto"/>
+              <w:jc w:val="left"/>
+              <w:rPr>
+                <w:kern w:val="0"/>
+                <w:sz w:val="24"/>
+              </w:rPr>
+            </w:pPr>
+            <w:r>
+              <w:rPr>
+                <w:kern w:val="0"/>
+                <w:sz w:val="24"/>
+              </w:rPr>
+              <w:t>[1] Yang X, Chen Y, Eide E, et al. Finding and understanding bugs in C compilers[C]//Proceedings of the 32nd ACM SIGPLAN Conference on Programming Language Design and Implementation (PLDI). 2011: 283-294.</w:t>
+            </w:r>
+          </w:p>
+          <w:p>
+            <w:pPr>
               <w:keepLines/>
-              <w:spacing w:lineRule="auto" w:line="360"/>
-              <w:jc w:val="start"/>
-              <w:rPr>
-                <w:kern w:val="0"/>
-                <w:sz w:val="24"/>
-              </w:rPr>
-            </w:pPr>
-            <w:r>
-              <w:rPr>
-                <w:kern w:val="0"/>
-                <w:sz w:val="24"/>
-              </w:rPr>
-              <w:t xml:space="preserve">[2] Livinskii V, Babokin D, Regehr J. Random testing for C and C++ compilers with YARPGen[C]//Proceedings of the ACM on Programming Languages (OOPSLA). 2020, 4: 1-25.</w:t>
-            </w:r>
-          </w:p>
-          <w:p>
-            <w:pPr>
-              <w:pStyle w:val="Normal"/>
+              <w:spacing w:line="360" w:lineRule="auto"/>
+              <w:jc w:val="left"/>
+              <w:rPr>
+                <w:kern w:val="0"/>
+                <w:sz w:val="24"/>
+              </w:rPr>
+            </w:pPr>
+            <w:r>
+              <w:rPr>
+                <w:kern w:val="0"/>
+                <w:sz w:val="24"/>
+              </w:rPr>
+              <w:t>[2] Livinskii V, Babokin D, Regehr J. Random testing for C and C++ compilers with YARPGen[C]//Proceedings of the ACM on Programming Languages (OOPSLA). 2020, 4: 1-25.</w:t>
+            </w:r>
+          </w:p>
+          <w:p>
+            <w:pPr>
               <w:keepLines/>
-              <w:spacing w:lineRule="auto" w:line="360"/>
-              <w:jc w:val="start"/>
-              <w:rPr>
-                <w:kern w:val="0"/>
-                <w:sz w:val="24"/>
-              </w:rPr>
-            </w:pPr>
-            <w:r>
-              <w:rPr>
-                <w:kern w:val="0"/>
-                <w:sz w:val="24"/>
-              </w:rPr>
-              <w:t xml:space="preserve">[3] Zalewski M. American Fuzzy Lop (AFL)[EB/OL]. (2014)[2026-02-15]. https://lcamtuf.coredump.cx/afl/.</w:t>
-            </w:r>
-          </w:p>
-          <w:p>
-            <w:pPr>
-              <w:pStyle w:val="Normal"/>
+              <w:spacing w:line="360" w:lineRule="auto"/>
+              <w:jc w:val="left"/>
+              <w:rPr>
+                <w:kern w:val="0"/>
+                <w:sz w:val="24"/>
+              </w:rPr>
+            </w:pPr>
+            <w:r>
+              <w:rPr>
+                <w:kern w:val="0"/>
+                <w:sz w:val="24"/>
+              </w:rPr>
+              <w:t>[3] Zalewski M. American Fuzzy Lop (AFL)[EB/OL]. (2014)[2026-02-15]. https://lcamtuf.coredump.cx/afl/.</w:t>
+            </w:r>
+          </w:p>
+          <w:p>
+            <w:pPr>
               <w:keepLines/>
-              <w:spacing w:lineRule="auto" w:line="360"/>
-              <w:jc w:val="start"/>
-              <w:rPr>
-                <w:kern w:val="0"/>
-                <w:sz w:val="24"/>
-              </w:rPr>
-            </w:pPr>
-            <w:r>
-              <w:rPr>
-                <w:kern w:val="0"/>
-                <w:sz w:val="24"/>
-              </w:rPr>
-              <w:t xml:space="preserve">[4] Serebryany K. Continuous fuzzing with libFuzzer and AddressSanitizer[C]//IEEE Cybersecurity Development (SecDev). 2016: 157.</w:t>
-            </w:r>
-          </w:p>
-          <w:p>
-            <w:pPr>
-              <w:pStyle w:val="Normal"/>
+              <w:spacing w:line="360" w:lineRule="auto"/>
+              <w:jc w:val="left"/>
+              <w:rPr>
+                <w:kern w:val="0"/>
+                <w:sz w:val="24"/>
+              </w:rPr>
+            </w:pPr>
+            <w:r>
+              <w:rPr>
+                <w:kern w:val="0"/>
+                <w:sz w:val="24"/>
+              </w:rPr>
+              <w:t>[4] Serebryany K. Continuous fuzzing with libFuzzer and AddressSanitizer[C]//IEEE Cybersecurity Development (SecDev). 2016: 157.</w:t>
+            </w:r>
+          </w:p>
+          <w:p>
+            <w:pPr>
               <w:keepLines/>
-              <w:spacing w:lineRule="auto" w:line="360"/>
-              <w:jc w:val="start"/>
-              <w:rPr>
-                <w:kern w:val="0"/>
-                <w:sz w:val="24"/>
-              </w:rPr>
-            </w:pPr>
-            <w:r>
-              <w:rPr>
-                <w:kern w:val="0"/>
-                <w:sz w:val="24"/>
-              </w:rPr>
-              <w:t xml:space="preserve">[5] Yang C, Deng Y, Lu R, et al. WhiteFox: White-box compiler fuzzing empowered by large language models[C]//Proceedings of the ACM on Programming Languages (OOPSLA). 2024.</w:t>
-            </w:r>
-          </w:p>
-          <w:p>
-            <w:pPr>
-              <w:pStyle w:val="Normal"/>
+              <w:spacing w:line="360" w:lineRule="auto"/>
+              <w:jc w:val="left"/>
+              <w:rPr>
+                <w:kern w:val="0"/>
+                <w:sz w:val="24"/>
+              </w:rPr>
+            </w:pPr>
+            <w:r>
+              <w:rPr>
+                <w:kern w:val="0"/>
+                <w:sz w:val="24"/>
+              </w:rPr>
+              <w:t>[5] Yang C, Deng Y, Lu R, et al. WhiteFox: White-box compiler fuzzing empowered by large language models[C]//Proceedings of the ACM on Programming Languages (OOPSLA). 2024.</w:t>
+            </w:r>
+          </w:p>
+          <w:p>
+            <w:pPr>
               <w:keepLines/>
-              <w:spacing w:lineRule="auto" w:line="360"/>
-              <w:jc w:val="start"/>
-              <w:rPr>
-                <w:kern w:val="0"/>
-                <w:sz w:val="24"/>
-              </w:rPr>
-            </w:pPr>
-            <w:r>
-              <w:rPr>
-                <w:kern w:val="0"/>
-                <w:sz w:val="24"/>
-              </w:rPr>
-              <w:t xml:space="preserve">[6] GNU Project. GCC Bugzilla PR 87672 — [9 regression] 81512c36 causes ICE in bootstrap stage 3 using "-D_FORTIFY_SOURCE=2"[EB/OL]. (2018)[2026-05-11]. https://gcc.gnu.org/bugzilla/show_bug.cgi?id=87672.</w:t>
-            </w:r>
-          </w:p>
-          <w:p>
-            <w:pPr>
-              <w:pStyle w:val="Normal"/>
+              <w:spacing w:line="360" w:lineRule="auto"/>
+              <w:jc w:val="left"/>
+              <w:rPr>
+                <w:kern w:val="0"/>
+                <w:sz w:val="24"/>
+              </w:rPr>
+            </w:pPr>
+            <w:r>
+              <w:rPr>
+                <w:kern w:val="0"/>
+                <w:sz w:val="24"/>
+              </w:rPr>
+              <w:t>[6] GNU Project. GCC Bugzilla PR 87672 — [9 regression] 81512c36 causes ICE in bootstrap stage 3 using "-D_FORTIFY_SOURCE=2"[EB/OL]. (2018)[2026-05-11]. https://gcc.gnu.org/bugzilla/show_bug.cgi?id=87672.</w:t>
+            </w:r>
+          </w:p>
+          <w:p>
+            <w:pPr>
               <w:keepLines/>
-              <w:spacing w:lineRule="auto" w:line="360"/>
-              <w:jc w:val="start"/>
-              <w:rPr>
-                <w:kern w:val="0"/>
-                <w:sz w:val="24"/>
-              </w:rPr>
-            </w:pPr>
-            <w:r>
-              <w:rPr>
-                <w:kern w:val="0"/>
-                <w:sz w:val="24"/>
-              </w:rPr>
-              <w:t xml:space="preserve">[7] GNU Project. GCC Bugzilla PR 96191 — aarch64 stack_protect_test canary leak[EB/OL]. (2020)[2026-05-11]. https://gcc.gnu.org/bugzilla/show_bug.cgi?id=96191.</w:t>
-            </w:r>
-          </w:p>
-          <w:p>
-            <w:pPr>
-              <w:pStyle w:val="Normal"/>
+              <w:spacing w:line="360" w:lineRule="auto"/>
+              <w:jc w:val="left"/>
+              <w:rPr>
+                <w:kern w:val="0"/>
+                <w:sz w:val="24"/>
+              </w:rPr>
+            </w:pPr>
+            <w:r>
+              <w:rPr>
+                <w:kern w:val="0"/>
+                <w:sz w:val="24"/>
+              </w:rPr>
+              <w:t>[7] GNU Project. GCC Bugzilla PR 96191 — aarch64 stack_protect_test canary leak[EB/OL]. (2020)[2026-05-11]. https://gcc.gnu.org/bugzilla/show_bug.cgi?id=96191.</w:t>
+            </w:r>
+          </w:p>
+          <w:p>
+            <w:pPr>
               <w:keepLines/>
-              <w:spacing w:lineRule="auto" w:line="360"/>
-              <w:jc w:val="start"/>
-              <w:rPr>
-                <w:kern w:val="0"/>
-                <w:sz w:val="24"/>
-              </w:rPr>
-            </w:pPr>
-            <w:r>
-              <w:rPr>
-                <w:kern w:val="0"/>
-                <w:sz w:val="24"/>
-              </w:rPr>
-              <w:t xml:space="preserve">[8] GNU Project. GCC Bugzilla PR 96350 — [cet] For ENDBR immediate, the binary would include a gadget that starts with a fake ENDBR64 opcode[EB/OL]. (2020)[2026-05-11]. https://gcc.gnu.org/bugzilla/show_bug.cgi?id=96350.</w:t>
-            </w:r>
-          </w:p>
-          <w:p>
-            <w:pPr>
-              <w:pStyle w:val="Normal"/>
+              <w:spacing w:line="360" w:lineRule="auto"/>
+              <w:jc w:val="left"/>
+              <w:rPr>
+                <w:kern w:val="0"/>
+                <w:sz w:val="24"/>
+              </w:rPr>
+            </w:pPr>
+            <w:r>
+              <w:rPr>
+                <w:kern w:val="0"/>
+                <w:sz w:val="24"/>
+              </w:rPr>
+              <w:t>[8] GNU Project. GCC Bugzilla PR 96350 — [cet] For ENDBR immediate, the binary would include a gadget that starts with a fake ENDBR64 opcode[EB/OL]. (2020)[2026-05-11]. https://gcc.gnu.org/bugzilla/show_bug.cgi?id=96350.</w:t>
+            </w:r>
+          </w:p>
+          <w:p>
+            <w:pPr>
               <w:keepLines/>
-              <w:spacing w:lineRule="auto" w:line="360"/>
-              <w:jc w:val="start"/>
-              <w:rPr>
-                <w:kern w:val="0"/>
-                <w:sz w:val="24"/>
-              </w:rPr>
-            </w:pPr>
-            <w:r>
-              <w:rPr>
-                <w:kern w:val="0"/>
-                <w:sz w:val="24"/>
-              </w:rPr>
-              <w:t xml:space="preserve">[9] Intel Corporation. Control-flow Enforcement Technology Specification[R/OL]. (2019)[2026-02-15]. https://www.intel.com/content/www/us/en/developer/articles/technical/technical-look-control-flow-enforcement-technology.html.</w:t>
-            </w:r>
-          </w:p>
-          <w:p>
-            <w:pPr>
-              <w:pStyle w:val="Normal"/>
+              <w:spacing w:line="360" w:lineRule="auto"/>
+              <w:jc w:val="left"/>
+              <w:rPr>
+                <w:kern w:val="0"/>
+                <w:sz w:val="24"/>
+              </w:rPr>
+            </w:pPr>
+            <w:r>
+              <w:rPr>
+                <w:kern w:val="0"/>
+                <w:sz w:val="24"/>
+              </w:rPr>
+              <w:t>[9] Intel Corporation. Control-flow Enforcement Technology Specification[R/OL]. (2019)[2026-02-15]. https://www.intel.com/content/www/us/en/developer/articles/technical/technical-look-control-flow-enforcement-technology.html.</w:t>
+            </w:r>
+          </w:p>
+          <w:p>
+            <w:pPr>
               <w:keepLines/>
-              <w:spacing w:lineRule="auto" w:line="360"/>
-              <w:jc w:val="start"/>
-              <w:rPr>
-                <w:kern w:val="0"/>
-                <w:sz w:val="24"/>
-              </w:rPr>
-            </w:pPr>
-            <w:r>
-              <w:rPr>
-                <w:kern w:val="0"/>
-                <w:sz w:val="24"/>
-              </w:rPr>
-              <w:t xml:space="preserve">[10] Free Software Foundation. The GNU C Library Reference Manual: Source Fortification[EB/OL]. (2024)[2026-02-15]. https://sourceware.org/glibc/manual/latest/html_node/Source-Fortification.html.</w:t>
-            </w:r>
-          </w:p>
-          <w:p>
-            <w:pPr>
-              <w:pStyle w:val="Normal"/>
+              <w:spacing w:line="360" w:lineRule="auto"/>
+              <w:jc w:val="left"/>
+              <w:rPr>
+                <w:kern w:val="0"/>
+                <w:sz w:val="24"/>
+              </w:rPr>
+            </w:pPr>
+            <w:r>
+              <w:rPr>
+                <w:kern w:val="0"/>
+                <w:sz w:val="24"/>
+              </w:rPr>
+              <w:t>[10] Free Software Foundation. The GNU C Library Reference Manual: Source Fortification[EB/OL]. (2024)[2026-02-15]. https://sourceware.org/glibc/manual/latest/html_node/Source-Fortification.html.</w:t>
+            </w:r>
+          </w:p>
+          <w:p>
+            <w:pPr>
               <w:keepLines/>
-              <w:spacing w:lineRule="auto" w:line="360"/>
-              <w:jc w:val="start"/>
-              <w:rPr>
-                <w:kern w:val="0"/>
-                <w:sz w:val="24"/>
-              </w:rPr>
-            </w:pPr>
-            <w:r>
-              <w:rPr>
-                <w:kern w:val="0"/>
-                <w:sz w:val="24"/>
-              </w:rPr>
-              <w:t xml:space="preserve">[11] Le V, Afshari M, Su Z. Compiler validation via equivalence modulo inputs[C]//Proceedings of the 35th ACM SIGPLAN Conference on Programming Language Design and Implementation (PLDI). 2014: 216-226.</w:t>
-            </w:r>
-          </w:p>
-          <w:p>
-            <w:pPr>
-              <w:pStyle w:val="Normal"/>
+              <w:spacing w:line="360" w:lineRule="auto"/>
+              <w:jc w:val="left"/>
+              <w:rPr>
+                <w:kern w:val="0"/>
+                <w:sz w:val="24"/>
+              </w:rPr>
+            </w:pPr>
+            <w:r>
+              <w:rPr>
+                <w:kern w:val="0"/>
+                <w:sz w:val="24"/>
+              </w:rPr>
+              <w:t>[11] Le V, Afshari M, Su Z. Compiler validation via equivalence modulo inputs[C]//Proceedings of the 35th ACM SIGPLAN Conference on Programming Language Design and Implementation (PLDI). 2014: 216-226.</w:t>
+            </w:r>
+          </w:p>
+          <w:p>
+            <w:pPr>
               <w:keepLines/>
-              <w:spacing w:lineRule="auto" w:line="360"/>
-              <w:jc w:val="start"/>
-              <w:rPr>
-                <w:kern w:val="0"/>
-                <w:sz w:val="24"/>
-              </w:rPr>
-            </w:pPr>
-            <w:r>
-              <w:rPr>
-                <w:kern w:val="0"/>
-                <w:sz w:val="24"/>
-              </w:rPr>
-              <w:t xml:space="preserve">[12] Li S, Su Z. UBfuzz: Finding bugs in sanitizer implementations[C]//Proceedings of the 29th ACM International Conference on Architectural Support for Programming Languages and Operating Systems (ASPLOS). 2024.</w:t>
-            </w:r>
-          </w:p>
-          <w:p>
-            <w:pPr>
-              <w:pStyle w:val="Normal"/>
+              <w:spacing w:line="360" w:lineRule="auto"/>
+              <w:jc w:val="left"/>
+              <w:rPr>
+                <w:kern w:val="0"/>
+                <w:sz w:val="24"/>
+              </w:rPr>
+            </w:pPr>
+            <w:r>
+              <w:rPr>
+                <w:kern w:val="0"/>
+                <w:sz w:val="24"/>
+              </w:rPr>
+              <w:t>[12] Li S, Su Z. UBfuzz: Finding bugs in sanitizer implementations[C]//Proceedings of the 29th ACM International Conference on Architectural Support for Programming Languages and Operating Systems (ASPLOS). 2024.</w:t>
+            </w:r>
+          </w:p>
+          <w:p>
+            <w:pPr>
               <w:keepLines/>
-              <w:spacing w:lineRule="auto" w:line="360"/>
-              <w:jc w:val="start"/>
-              <w:rPr>
-                <w:kern w:val="0"/>
-                <w:sz w:val="24"/>
-              </w:rPr>
-            </w:pPr>
-            <w:r>
-              <w:rPr>
-                <w:kern w:val="0"/>
-                <w:sz w:val="24"/>
-              </w:rPr>
-              <w:t xml:space="preserve">[13] Ma H, Shen Q, Tian Y, et al. Fuzzing deep learning compilers with HirGen[C]//Proceedings of the 32nd ACM SIGSOFT International Symposium on Software Testing and Analysis (ISSTA). 2023.</w:t>
-            </w:r>
-          </w:p>
-          <w:p>
-            <w:pPr>
-              <w:pStyle w:val="Normal"/>
+              <w:spacing w:line="360" w:lineRule="auto"/>
+              <w:jc w:val="left"/>
+              <w:rPr>
+                <w:kern w:val="0"/>
+                <w:sz w:val="24"/>
+              </w:rPr>
+            </w:pPr>
+            <w:r>
+              <w:rPr>
+                <w:kern w:val="0"/>
+                <w:sz w:val="24"/>
+              </w:rPr>
+              <w:t>[13] Ma H, Shen Q, Tian Y, et al. Fuzzing deep learning compilers with HirGen[C]//Proceedings of the 32nd ACM SIGSOFT International Symposium on Software Testing and Analysis (ISSTA). 2023.</w:t>
+            </w:r>
+          </w:p>
+          <w:p>
+            <w:pPr>
               <w:keepLines/>
-              <w:spacing w:lineRule="auto" w:line="360"/>
-              <w:jc w:val="start"/>
-              <w:rPr>
-                <w:kern w:val="0"/>
-                <w:sz w:val="24"/>
-              </w:rPr>
-            </w:pPr>
-            <w:r>
-              <w:rPr>
-                <w:kern w:val="0"/>
-                <w:sz w:val="24"/>
-              </w:rPr>
-              <w:t xml:space="preserve">[14] Even-Mendoza K, Sharma A, Donaldson A F, et al. GrayC: Greybox fuzzing of compilers and analysers for C[C]//Proceedings of the 32nd ACM SIGSOFT International Symposium on Software Testing and Analysis (ISSTA). 2023: 1219-1231.</w:t>
-            </w:r>
-          </w:p>
-          <w:p>
-            <w:pPr>
-              <w:pStyle w:val="Normal"/>
+              <w:spacing w:line="360" w:lineRule="auto"/>
+              <w:jc w:val="left"/>
+              <w:rPr>
+                <w:kern w:val="0"/>
+                <w:sz w:val="24"/>
+              </w:rPr>
+            </w:pPr>
+            <w:r>
+              <w:rPr>
+                <w:kern w:val="0"/>
+                <w:sz w:val="24"/>
+              </w:rPr>
+              <w:t>[14] Even-Mendoza K, Sharma A, Donaldson A F, et al. GrayC: Greybox fuzzing of compilers and analysers for C[C]//Proceedings of the 32nd ACM SIGSOFT International Symposium on Software Testing and Analysis (ISSTA). 2023: 1219-1231.</w:t>
+            </w:r>
+          </w:p>
+          <w:p>
+            <w:pPr>
               <w:keepLines/>
-              <w:spacing w:lineRule="auto" w:line="360"/>
-              <w:jc w:val="start"/>
-              <w:rPr>
-                <w:kern w:val="0"/>
-                <w:sz w:val="24"/>
-              </w:rPr>
-            </w:pPr>
-            <w:r>
-              <w:rPr>
-                <w:kern w:val="0"/>
-                <w:sz w:val="24"/>
-              </w:rPr>
-              <w:t xml:space="preserve">[15] Yang Y, Zhang H, Ren Z, et al. Hybrid language processor fuzzing via LLM-based constraint solving[C]//Proceedings of the 34th USENIX Security Symposium (USENIX Security). 2025.</w:t>
-            </w:r>
-          </w:p>
-          <w:p>
-            <w:pPr>
-              <w:pStyle w:val="Normal"/>
+              <w:spacing w:line="360" w:lineRule="auto"/>
+              <w:jc w:val="left"/>
+              <w:rPr>
+                <w:kern w:val="0"/>
+                <w:sz w:val="24"/>
+              </w:rPr>
+            </w:pPr>
+            <w:r>
+              <w:rPr>
+                <w:kern w:val="0"/>
+                <w:sz w:val="24"/>
+              </w:rPr>
+              <w:t>[15] Yang Y, Zhang H, Ren Z, et al. Hybrid language processor fuzzing via LLM-based constraint solving[C]//Proceedings of the 34th USENIX Security Symposium (USENIX Security). 2025.</w:t>
+            </w:r>
+          </w:p>
+          <w:p>
+            <w:pPr>
               <w:keepLines/>
-              <w:spacing w:lineRule="auto" w:line="360"/>
-              <w:jc w:val="start"/>
-              <w:rPr>
-                <w:kern w:val="0"/>
-                <w:sz w:val="24"/>
-              </w:rPr>
-            </w:pPr>
-            <w:r>
-              <w:rPr>
-                <w:kern w:val="0"/>
-                <w:sz w:val="24"/>
-              </w:rPr>
-              <w:t xml:space="preserve">[16] Meta Security. CVE-2023-4039: GCC's -fstack-protector fails to guard dynamic stack allocations on AArch64[EB/OL]. (2023)[2026-02-15]. https://rtx.meta.security/mitigation/2023/09/12/CVE-2023-4039.html.</w:t>
-            </w:r>
-          </w:p>
-          <w:p>
-            <w:pPr>
-              <w:pStyle w:val="Normal"/>
+              <w:spacing w:line="360" w:lineRule="auto"/>
+              <w:jc w:val="left"/>
+              <w:rPr>
+                <w:kern w:val="0"/>
+                <w:sz w:val="24"/>
+              </w:rPr>
+            </w:pPr>
+            <w:r>
+              <w:rPr>
+                <w:kern w:val="0"/>
+                <w:sz w:val="24"/>
+              </w:rPr>
+              <w:t>[16] Meta Security. CVE-2023-4039: GCC's -fstack-protector fails to guard dynamic stack allocations on AArch64[EB/OL]. (2023)[2026-02-15]. https://rtx.meta.security/mitigation/2023/09/12/CVE-2023-4039.html.</w:t>
+            </w:r>
+          </w:p>
+          <w:p>
+            <w:pPr>
               <w:keepLines/>
-              <w:spacing w:lineRule="auto" w:line="360"/>
-              <w:jc w:val="start"/>
-              <w:rPr>
-                <w:kern w:val="0"/>
-                <w:sz w:val="24"/>
-              </w:rPr>
-            </w:pPr>
-            <w:r>
-              <w:rPr>
-                <w:kern w:val="0"/>
-                <w:sz w:val="24"/>
-              </w:rPr>
-              <w:t xml:space="preserve">[17] GNU Project. GCC Bugzilla PR 125079 — [13/14/15 Regression] tree-ssa-strlen get_string_length: __strcat_chk -&gt; __stpcpy_chk drops bound subtract[EB/OL]. (2026)[2026-05-11]. https://gcc.gnu.org/bugzilla/show_bug.cgi?id=125079.</w:t>
-            </w:r>
-          </w:p>
-          <w:p>
-            <w:pPr>
-              <w:pStyle w:val="Normal"/>
+              <w:spacing w:line="360" w:lineRule="auto"/>
+              <w:jc w:val="left"/>
+              <w:rPr>
+                <w:kern w:val="0"/>
+                <w:sz w:val="24"/>
+              </w:rPr>
+            </w:pPr>
+            <w:r>
+              <w:rPr>
+                <w:kern w:val="0"/>
+                <w:sz w:val="24"/>
+              </w:rPr>
+              <w:t>[17] GNU Project. GCC Bugzilla PR 125079 — [13/14/15 Regression] tree-ssa-strlen get_string_length: __strcat_chk -&gt; __stpcpy_chk drops bound subtract[EB/OL]. (2026)[2026-05-11]. https://gcc.gnu.org/bugzilla/show_bug.cgi?id=125079.</w:t>
+            </w:r>
+          </w:p>
+          <w:p>
+            <w:pPr>
               <w:keepLines/>
-              <w:spacing w:lineRule="auto" w:line="360"/>
-              <w:jc w:val="start"/>
-              <w:rPr>
-                <w:kern w:val="0"/>
-                <w:sz w:val="24"/>
-              </w:rPr>
-            </w:pPr>
-            <w:r>
-              <w:rPr>
-                <w:kern w:val="0"/>
-                <w:sz w:val="24"/>
-              </w:rPr>
-              <w:t xml:space="preserve">[18] GNU Project. GCC Bugzilla PR 125084 — [target/i386] ix86_endbr_immediate_operand misses ENDBR pattern when upper bytes nonzero[EB/OL]. (2026)[2026-05-11]. https://gcc.gnu.org/bugzilla/show_bug.cgi?id=125084.</w:t>
-            </w:r>
-          </w:p>
-          <w:p>
-            <w:pPr>
-              <w:pStyle w:val="Normal"/>
+              <w:spacing w:line="360" w:lineRule="auto"/>
+              <w:jc w:val="left"/>
+              <w:rPr>
+                <w:kern w:val="0"/>
+                <w:sz w:val="24"/>
+              </w:rPr>
+            </w:pPr>
+            <w:r>
+              <w:rPr>
+                <w:kern w:val="0"/>
+                <w:sz w:val="24"/>
+              </w:rPr>
+              <w:t>[18] GNU Project. GCC Bugzilla PR 125084 — [target/i386] ix86_endbr_immediate_operand misses ENDBR pattern when upper bytes nonzero[EB/OL]. (2026)[2026-05-11]. https://gcc.gnu.org/bugzilla/show_bug.cgi?id=125084.</w:t>
+            </w:r>
+          </w:p>
+          <w:p>
+            <w:pPr>
               <w:keepLines/>
-              <w:spacing w:lineRule="auto" w:line="360"/>
-              <w:jc w:val="start"/>
-              <w:rPr>
-                <w:kern w:val="0"/>
-                <w:sz w:val="24"/>
-              </w:rPr>
-            </w:pPr>
-            <w:r>
-              <w:rPr>
-                <w:kern w:val="0"/>
-                <w:sz w:val="24"/>
-              </w:rPr>
-              <w:t xml:space="preserve">[19] GNU Project. GCC Bugzilla PR 125045 — [meta-bug] SSP fallback leaves canary in live GPR on many targets[EB/OL]. (2026)[2026-05-11]. https://gcc.gnu.org/bugzilla/show_bug.cgi?id=125045.</w:t>
-            </w:r>
-          </w:p>
-          <w:p>
-            <w:pPr>
-              <w:pStyle w:val="Normal"/>
+              <w:spacing w:line="360" w:lineRule="auto"/>
+              <w:jc w:val="left"/>
+              <w:rPr>
+                <w:kern w:val="0"/>
+                <w:sz w:val="24"/>
+              </w:rPr>
+            </w:pPr>
+            <w:r>
+              <w:rPr>
+                <w:kern w:val="0"/>
+                <w:sz w:val="24"/>
+              </w:rPr>
+              <w:t>[19] GNU Project. GCC Bugzilla PR 125045 — [meta-bug] SSP fallback leaves canary in live GPR on many targets[EB/OL]. (2026)[2026-05-11]. https://gcc.gnu.org/bugzilla/show_bug.cgi?id=125045.</w:t>
+            </w:r>
+          </w:p>
+          <w:p>
+            <w:pPr>
               <w:keepLines/>
-              <w:spacing w:lineRule="auto" w:line="360"/>
-              <w:jc w:val="start"/>
-              <w:rPr>
-                <w:kern w:val="0"/>
-                <w:sz w:val="24"/>
-              </w:rPr>
-            </w:pPr>
-            <w:r>
-              <w:rPr>
-                <w:kern w:val="0"/>
-                <w:sz w:val="24"/>
-              </w:rPr>
-              <w:t xml:space="preserve">[20] GNU Project. GCC Bugzilla PR 125049 — [loongarch] SSP fallback leaves __stack_chk_guard live in $r12 at `jr $r1`[EB/OL]. (2026)[2026-05-11]. https://gcc.gnu.org/bugzilla/show_bug.cgi?id=125049.</w:t>
-            </w:r>
-          </w:p>
-          <w:p>
-            <w:pPr>
-              <w:pStyle w:val="Normal"/>
+              <w:spacing w:line="360" w:lineRule="auto"/>
+              <w:jc w:val="left"/>
+              <w:rPr>
+                <w:kern w:val="0"/>
+                <w:sz w:val="24"/>
+              </w:rPr>
+            </w:pPr>
+            <w:r>
+              <w:rPr>
+                <w:kern w:val="0"/>
+                <w:sz w:val="24"/>
+              </w:rPr>
+              <w:t>[20] GNU Project. GCC Bugzilla PR 125049 — [loongarch] SSP fallback leaves __stack_chk_guard live in $r12 at `jr $r1`[EB/OL]. (2026)[2026-05-11]. https://gcc.gnu.org/bugzilla/show_bug.cgi?id=125049.</w:t>
+            </w:r>
+          </w:p>
+          <w:p>
+            <w:pPr>
               <w:keepLines/>
-              <w:spacing w:lineRule="auto" w:line="360"/>
-              <w:jc w:val="start"/>
-              <w:rPr>
-                <w:kern w:val="0"/>
-                <w:sz w:val="24"/>
-              </w:rPr>
-            </w:pPr>
-            <w:r>
-              <w:rPr>
-                <w:kern w:val="0"/>
-                <w:sz w:val="24"/>
-              </w:rPr>
-              <w:t xml:space="preserve">[21] CVE Program. CVE Metrics — published vulnerabilities trend[EB/OL]. (2026)[2026-05-12]. https://www.cve.org/about/Metrics.</w:t>
+              <w:spacing w:line="360" w:lineRule="auto"/>
+              <w:jc w:val="left"/>
+              <w:rPr>
+                <w:kern w:val="0"/>
+                <w:sz w:val="24"/>
+              </w:rPr>
+            </w:pPr>
+            <w:r>
+              <w:rPr>
+                <w:kern w:val="0"/>
+                <w:sz w:val="24"/>
+              </w:rPr>
+              <w:t>[21] CVE Program. CVE Metrics — published vulnerabilities trend[EB/OL]. (2026)[2026-05-12]. https://www.cve.org/about/Metrics.</w:t>
+            </w:r>
+          </w:p>
+          <w:p>
+            <w:pPr>
+              <w:keepLines/>
+              <w:spacing w:line="360" w:lineRule="auto"/>
+              <w:jc w:val="left"/>
+              <w:rPr>
+                <w:kern w:val="0"/>
+                <w:sz w:val="24"/>
+              </w:rPr>
+            </w:pPr>
+            <w:r>
+              <w:rPr>
+                <w:kern w:val="0"/>
+                <w:sz w:val="24"/>
+              </w:rPr>
+              <w:t>[22] Microsoft Security Response Center. Microsoft Security Response Center Blog[EB/OL]. (2023)[2026-05-13]. https://www.microsoft.com/en-us/msrc/blog.</w:t>
+            </w:r>
+          </w:p>
+          <w:p>
+            <w:pPr>
+              <w:keepLines/>
+              <w:spacing w:line="360" w:lineRule="auto"/>
+              <w:jc w:val="left"/>
+              <w:rPr>
+                <w:kern w:val="0"/>
+                <w:sz w:val="24"/>
+              </w:rPr>
+            </w:pPr>
+            <w:r>
+              <w:rPr>
+                <w:kern w:val="0"/>
+                <w:sz w:val="24"/>
+              </w:rPr>
+              <w:t>[23] Google Security Blog. Memory Safe Languages in Android 13[EB/OL]. (2022-12)[2026-05-13]. https://security.googleblog.com/2022/12/memory-safe-languages-in-android-13.html.</w:t>
             </w:r>
           </w:p>
         </w:tc>
@@ -4769,38 +4897,36 @@
           </w:tcPr>
           <w:p>
             <w:pPr>
-              <w:pStyle w:val="Normal"/>
-              <w:spacing w:lineRule="auto" w:line="360"/>
-              <w:ind w:firstLineChars="200" w:startChars="0" w:start="0" w:endChars="0" w:end="0"/>
-              <w:rPr>
-                <w:kern w:val="0"/>
-                <w:sz w:val="24"/>
-              </w:rPr>
-            </w:pPr>
-            <w:r>
-              <w:rPr>
-                <w:kern w:val="0"/>
-                <w:sz w:val="24"/>
-              </w:rPr>
-              <w:t xml:space="preserve">理论分析对应技术路线的四个部分：编译器主流防御机制安全不变量的形式化与证据提炼、不变量预言机检查器的工程化方法、覆盖率与控制流图引导的目标基本块挑选策略，以及大语言模型生成与预言机判定的耦合方式。预期产出包括：覆盖至少三种主流防御机制的安全不变量集合、可扩展的不变量预言机框架，以及跨架构的 fuzzer 原型；并在 GCC 与 LLVM 上发现真实静默失效以验证方法的有效性与跨编译器迁移性。</w:t>
-            </w:r>
-          </w:p>
-          <w:p>
-            <w:pPr>
-              <w:pStyle w:val="Normal"/>
-              <w:spacing w:lineRule="auto" w:line="360"/>
-              <w:ind w:firstLineChars="200" w:startChars="0" w:start="0" w:endChars="0" w:end="0"/>
-              <w:rPr>
-                <w:kern w:val="0"/>
-                <w:sz w:val="24"/>
-              </w:rPr>
-            </w:pPr>
-            <w:r>
-              <w:rPr>
-                <w:kern w:val="0"/>
-                <w:sz w:val="24"/>
-              </w:rPr>
-              <w:t xml:space="preserve">硬件方面，开发与实验依托一台 64 位 Linux 工作站（不少于 32 GB 内存与百 GB 级 SSD），用于 GCC / LLVM 多版本本地构建、覆盖率数据缓存与跨架构 QEMU 用户态执行；大语言模型推理通过远程 API 完成，本机无需独立 GPU。</w:t>
+              <w:spacing w:line="360" w:lineRule="auto"/>
+              <w:ind w:left="0" w:leftChars="0" w:right="0" w:rightChars="0" w:firstLineChars="200"/>
+              <w:rPr>
+                <w:kern w:val="0"/>
+                <w:sz w:val="24"/>
+              </w:rPr>
+            </w:pPr>
+            <w:r>
+              <w:rPr>
+                <w:kern w:val="0"/>
+                <w:sz w:val="24"/>
+              </w:rPr>
+              <w:t>理论分析对应技术路线的四个部分：编译器主流防御机制安全不变量的形式化与证据提炼、不变量预言机检查器的工程化方法、覆盖率与控制流图引导的目标基本块挑选策略，以及大语言模型生成与预言机判定的耦合方式。预期产出包括：覆盖至少三种主流防御机制的安全不变量集合、可扩展的不变量预言机框架，以及跨架构的 fuzzer 原型；并在 GCC 与 LLVM 上发现真实静默失效以验证方法的有效性与跨编译器迁移性。</w:t>
+            </w:r>
+          </w:p>
+          <w:p>
+            <w:pPr>
+              <w:spacing w:line="360" w:lineRule="auto"/>
+              <w:ind w:left="0" w:leftChars="0" w:right="0" w:rightChars="0" w:firstLineChars="200"/>
+              <w:rPr>
+                <w:kern w:val="0"/>
+                <w:sz w:val="24"/>
+              </w:rPr>
+            </w:pPr>
+            <w:r>
+              <w:rPr>
+                <w:kern w:val="0"/>
+                <w:sz w:val="24"/>
+              </w:rPr>
+              <w:t>硬件方面，开发与实验依托一台 64 位 Linux 工作站（不少于 32 GB 内存与百 GB 级 SSD），用于 GCC / LLVM 多版本本地构建、覆盖率数据缓存与跨架构 QEMU 用户态执行；大语言模型推理通过远程 API 完成，本机无需独立 GPU。</w:t>
             </w:r>
           </w:p>
         </w:tc>
@@ -4837,7 +4963,7 @@
       </w:tblPr>
       <w:tblGrid>
         <w:gridCol w:w="2124"/>
-        <w:gridCol w:w="5283"/>
+        <w:gridCol w:w="5282"/>
         <w:gridCol w:w="2349"/>
       </w:tblGrid>
       <w:tr>
@@ -4942,24 +5068,32 @@
         </w:tc>
       </w:tr>
       <w:tr>
+        <w:tblPrEx>
+          <w:tblCellMar>
+            <w:top w:w="0" w:type="dxa"/>
+            <w:left w:w="108" w:type="dxa"/>
+            <w:bottom w:w="0" w:type="dxa"/>
+            <w:right w:w="108" w:type="dxa"/>
+          </w:tblCellMar>
+        </w:tblPrEx>
         <w:trPr>
           <w:trHeight w:val="480" w:hRule="atLeast"/>
+          <w:jc w:val="center"/>
         </w:trPr>
         <w:tc>
           <w:tcPr>
             <w:tcW w:w="2077" w:type="dxa"/>
             <w:tcBorders>
-              <w:top w:val="single" w:sz="4" w:space="0" w:color="000000"/>
-              <w:start w:val="single" w:sz="4" w:space="0" w:color="000000"/>
-              <w:bottom w:val="single" w:sz="4" w:space="0" w:color="000000"/>
-              <w:end w:val="single" w:sz="4" w:space="0" w:color="000000"/>
+              <w:top w:val="single" w:color="000000" w:sz="4" w:space="0"/>
+              <w:left w:val="single" w:color="000000" w:sz="4" w:space="0"/>
+              <w:bottom w:val="single" w:color="000000" w:sz="4" w:space="0"/>
+              <w:right w:val="single" w:color="000000" w:sz="4" w:space="0"/>
             </w:tcBorders>
             <w:vAlign w:val="center"/>
           </w:tcPr>
           <w:p>
             <w:pPr>
-              <w:pStyle w:val="Normal"/>
-              <w:spacing w:lineRule="exact" w:line="320"/>
+              <w:spacing w:line="320" w:lineRule="exact"/>
               <w:jc w:val="center"/>
               <w:rPr>
                 <w:rFonts w:ascii="宋体" w:hAnsi="宋体" w:eastAsia="宋体"/>
@@ -4971,7 +5105,7 @@
                 <w:rFonts w:ascii="宋体" w:hAnsi="宋体" w:eastAsia="宋体"/>
                 <w:sz w:val="24"/>
               </w:rPr>
-              <w:t xml:space="preserve">2026.05-2026.07</w:t>
+              <w:t>2026.05-2026.07</w:t>
             </w:r>
           </w:p>
         </w:tc>
@@ -4979,17 +5113,16 @@
           <w:tcPr>
             <w:tcW w:w="5167" w:type="dxa"/>
             <w:tcBorders>
-              <w:top w:val="single" w:sz="4" w:space="0" w:color="000000"/>
-              <w:start w:val="single" w:sz="4" w:space="0" w:color="000000"/>
-              <w:bottom w:val="single" w:sz="4" w:space="0" w:color="000000"/>
-              <w:end w:val="single" w:sz="4" w:space="0" w:color="000000"/>
+              <w:top w:val="single" w:color="000000" w:sz="4" w:space="0"/>
+              <w:left w:val="single" w:color="000000" w:sz="4" w:space="0"/>
+              <w:bottom w:val="single" w:color="000000" w:sz="4" w:space="0"/>
+              <w:right w:val="single" w:color="000000" w:sz="4" w:space="0"/>
             </w:tcBorders>
             <w:vAlign w:val="center"/>
           </w:tcPr>
           <w:p>
             <w:pPr>
-              <w:pStyle w:val="Normal"/>
-              <w:spacing w:lineRule="exact" w:line="320"/>
+              <w:spacing w:line="320" w:lineRule="exact"/>
               <w:jc w:val="center"/>
               <w:rPr>
                 <w:rFonts w:ascii="宋体" w:hAnsi="宋体" w:eastAsia="宋体"/>
@@ -5001,7 +5134,7 @@
                 <w:rFonts w:ascii="宋体" w:hAnsi="宋体" w:eastAsia="宋体"/>
                 <w:sz w:val="24"/>
               </w:rPr>
-              <w:t xml:space="preserve">扩展不变量集合到 BTI / PAC、Shadow Stack、CFI 等机制，丰富预言机框架的静态与动态检查器</w:t>
+              <w:t>扩展不变量集合到 BTI / PAC、Shadow Stack、CFI 等机制，丰富预言机框架的静态与动态检查器</w:t>
             </w:r>
           </w:p>
         </w:tc>
@@ -5009,52 +5142,52 @@
           <w:tcPr>
             <w:tcW w:w="2297" w:type="dxa"/>
             <w:tcBorders>
-              <w:top w:val="single" w:sz="4" w:space="0" w:color="000000"/>
-              <w:start w:val="single" w:sz="4" w:space="0" w:color="000000"/>
-              <w:bottom w:val="single" w:sz="4" w:space="0" w:color="000000"/>
-              <w:end w:val="single" w:sz="4" w:space="0" w:color="000000"/>
+              <w:top w:val="single" w:color="000000" w:sz="4" w:space="0"/>
+              <w:left w:val="single" w:color="000000" w:sz="4" w:space="0"/>
+              <w:bottom w:val="single" w:color="000000" w:sz="4" w:space="0"/>
+              <w:right w:val="single" w:color="000000" w:sz="4" w:space="0"/>
             </w:tcBorders>
             <w:vAlign w:val="center"/>
           </w:tcPr>
           <w:p>
             <w:pPr>
-              <w:pStyle w:val="Normal"/>
-              <w:spacing w:lineRule="exact" w:line="320"/>
+              <w:spacing w:line="320" w:lineRule="exact"/>
               <w:jc w:val="center"/>
               <w:rPr>
                 <w:rFonts w:ascii="宋体" w:hAnsi="宋体" w:eastAsia="宋体"/>
                 <w:sz w:val="24"/>
               </w:rPr>
             </w:pPr>
-            <w:r>
-              <w:rPr>
-                <w:rFonts w:ascii="宋体" w:hAnsi="宋体" w:eastAsia="宋体"/>
-                <w:sz w:val="24"/>
-              </w:rPr>
-              <w:t xml:space="preserve"/>
-            </w:r>
           </w:p>
         </w:tc>
       </w:tr>
       <w:tr>
+        <w:tblPrEx>
+          <w:tblCellMar>
+            <w:top w:w="0" w:type="dxa"/>
+            <w:left w:w="108" w:type="dxa"/>
+            <w:bottom w:w="0" w:type="dxa"/>
+            <w:right w:w="108" w:type="dxa"/>
+          </w:tblCellMar>
+        </w:tblPrEx>
         <w:trPr>
           <w:trHeight w:val="480" w:hRule="atLeast"/>
+          <w:jc w:val="center"/>
         </w:trPr>
         <w:tc>
           <w:tcPr>
             <w:tcW w:w="2077" w:type="dxa"/>
             <w:tcBorders>
-              <w:top w:val="single" w:sz="4" w:space="0" w:color="000000"/>
-              <w:start w:val="single" w:sz="4" w:space="0" w:color="000000"/>
-              <w:bottom w:val="single" w:sz="4" w:space="0" w:color="000000"/>
-              <w:end w:val="single" w:sz="4" w:space="0" w:color="000000"/>
+              <w:top w:val="single" w:color="000000" w:sz="4" w:space="0"/>
+              <w:left w:val="single" w:color="000000" w:sz="4" w:space="0"/>
+              <w:bottom w:val="single" w:color="000000" w:sz="4" w:space="0"/>
+              <w:right w:val="single" w:color="000000" w:sz="4" w:space="0"/>
             </w:tcBorders>
             <w:vAlign w:val="center"/>
           </w:tcPr>
           <w:p>
             <w:pPr>
-              <w:pStyle w:val="Normal"/>
-              <w:spacing w:lineRule="exact" w:line="320"/>
+              <w:spacing w:line="320" w:lineRule="exact"/>
               <w:jc w:val="center"/>
               <w:rPr>
                 <w:rFonts w:ascii="宋体" w:hAnsi="宋体" w:eastAsia="宋体"/>
@@ -5066,7 +5199,7 @@
                 <w:rFonts w:ascii="宋体" w:hAnsi="宋体" w:eastAsia="宋体"/>
                 <w:sz w:val="24"/>
               </w:rPr>
-              <w:t xml:space="preserve">2026.07-2026.09</w:t>
+              <w:t>2026.07-2026.09</w:t>
             </w:r>
           </w:p>
         </w:tc>
@@ -5074,17 +5207,16 @@
           <w:tcPr>
             <w:tcW w:w="5167" w:type="dxa"/>
             <w:tcBorders>
-              <w:top w:val="single" w:sz="4" w:space="0" w:color="000000"/>
-              <w:start w:val="single" w:sz="4" w:space="0" w:color="000000"/>
-              <w:bottom w:val="single" w:sz="4" w:space="0" w:color="000000"/>
-              <w:end w:val="single" w:sz="4" w:space="0" w:color="000000"/>
+              <w:top w:val="single" w:color="000000" w:sz="4" w:space="0"/>
+              <w:left w:val="single" w:color="000000" w:sz="4" w:space="0"/>
+              <w:bottom w:val="single" w:color="000000" w:sz="4" w:space="0"/>
+              <w:right w:val="single" w:color="000000" w:sz="4" w:space="0"/>
             </w:tcBorders>
             <w:vAlign w:val="center"/>
           </w:tcPr>
           <w:p>
             <w:pPr>
-              <w:pStyle w:val="Normal"/>
-              <w:spacing w:lineRule="exact" w:line="320"/>
+              <w:spacing w:line="320" w:lineRule="exact"/>
               <w:jc w:val="center"/>
               <w:rPr>
                 <w:rFonts w:ascii="宋体" w:hAnsi="宋体" w:eastAsia="宋体"/>
@@ -5096,7 +5228,7 @@
                 <w:rFonts w:ascii="宋体" w:hAnsi="宋体" w:eastAsia="宋体"/>
                 <w:sz w:val="24"/>
               </w:rPr>
-              <w:t xml:space="preserve">把编译器子系统、覆盖率适配层、flag profile 扩展到 LLVM 工具链，对齐跨架构 / 跨编译器实验框架</w:t>
+              <w:t>把编译器子系统、覆盖率适配层、flag profile 扩展到 LLVM 工具链，对齐跨架构 / 跨编译器实验框架</w:t>
             </w:r>
           </w:p>
         </w:tc>
@@ -5104,52 +5236,52 @@
           <w:tcPr>
             <w:tcW w:w="2297" w:type="dxa"/>
             <w:tcBorders>
-              <w:top w:val="single" w:sz="4" w:space="0" w:color="000000"/>
-              <w:start w:val="single" w:sz="4" w:space="0" w:color="000000"/>
-              <w:bottom w:val="single" w:sz="4" w:space="0" w:color="000000"/>
-              <w:end w:val="single" w:sz="4" w:space="0" w:color="000000"/>
+              <w:top w:val="single" w:color="000000" w:sz="4" w:space="0"/>
+              <w:left w:val="single" w:color="000000" w:sz="4" w:space="0"/>
+              <w:bottom w:val="single" w:color="000000" w:sz="4" w:space="0"/>
+              <w:right w:val="single" w:color="000000" w:sz="4" w:space="0"/>
             </w:tcBorders>
             <w:vAlign w:val="center"/>
           </w:tcPr>
           <w:p>
             <w:pPr>
-              <w:pStyle w:val="Normal"/>
-              <w:spacing w:lineRule="exact" w:line="320"/>
+              <w:spacing w:line="320" w:lineRule="exact"/>
               <w:jc w:val="center"/>
               <w:rPr>
                 <w:rFonts w:ascii="宋体" w:hAnsi="宋体" w:eastAsia="宋体"/>
                 <w:sz w:val="24"/>
               </w:rPr>
             </w:pPr>
-            <w:r>
-              <w:rPr>
-                <w:rFonts w:ascii="宋体" w:hAnsi="宋体" w:eastAsia="宋体"/>
-                <w:sz w:val="24"/>
-              </w:rPr>
-              <w:t xml:space="preserve"/>
-            </w:r>
           </w:p>
         </w:tc>
       </w:tr>
       <w:tr>
+        <w:tblPrEx>
+          <w:tblCellMar>
+            <w:top w:w="0" w:type="dxa"/>
+            <w:left w:w="108" w:type="dxa"/>
+            <w:bottom w:w="0" w:type="dxa"/>
+            <w:right w:w="108" w:type="dxa"/>
+          </w:tblCellMar>
+        </w:tblPrEx>
         <w:trPr>
           <w:trHeight w:val="480" w:hRule="atLeast"/>
+          <w:jc w:val="center"/>
         </w:trPr>
         <w:tc>
           <w:tcPr>
             <w:tcW w:w="2077" w:type="dxa"/>
             <w:tcBorders>
-              <w:top w:val="single" w:sz="4" w:space="0" w:color="000000"/>
-              <w:start w:val="single" w:sz="4" w:space="0" w:color="000000"/>
-              <w:bottom w:val="single" w:sz="4" w:space="0" w:color="000000"/>
-              <w:end w:val="single" w:sz="4" w:space="0" w:color="000000"/>
+              <w:top w:val="single" w:color="000000" w:sz="4" w:space="0"/>
+              <w:left w:val="single" w:color="000000" w:sz="4" w:space="0"/>
+              <w:bottom w:val="single" w:color="000000" w:sz="4" w:space="0"/>
+              <w:right w:val="single" w:color="000000" w:sz="4" w:space="0"/>
             </w:tcBorders>
             <w:vAlign w:val="center"/>
           </w:tcPr>
           <w:p>
             <w:pPr>
-              <w:pStyle w:val="Normal"/>
-              <w:spacing w:lineRule="exact" w:line="320"/>
+              <w:spacing w:line="320" w:lineRule="exact"/>
               <w:jc w:val="center"/>
               <w:rPr>
                 <w:rFonts w:ascii="宋体" w:hAnsi="宋体" w:eastAsia="宋体"/>
@@ -5161,7 +5293,7 @@
                 <w:rFonts w:ascii="宋体" w:hAnsi="宋体" w:eastAsia="宋体"/>
                 <w:sz w:val="24"/>
               </w:rPr>
-              <w:t xml:space="preserve">2026.09-2026.12</w:t>
+              <w:t>2026.09-2026.12</w:t>
             </w:r>
           </w:p>
         </w:tc>
@@ -5169,17 +5301,16 @@
           <w:tcPr>
             <w:tcW w:w="5167" w:type="dxa"/>
             <w:tcBorders>
-              <w:top w:val="single" w:sz="4" w:space="0" w:color="000000"/>
-              <w:start w:val="single" w:sz="4" w:space="0" w:color="000000"/>
-              <w:bottom w:val="single" w:sz="4" w:space="0" w:color="000000"/>
-              <w:end w:val="single" w:sz="4" w:space="0" w:color="000000"/>
+              <w:top w:val="single" w:color="000000" w:sz="4" w:space="0"/>
+              <w:left w:val="single" w:color="000000" w:sz="4" w:space="0"/>
+              <w:bottom w:val="single" w:color="000000" w:sz="4" w:space="0"/>
+              <w:right w:val="single" w:color="000000" w:sz="4" w:space="0"/>
             </w:tcBorders>
             <w:vAlign w:val="center"/>
           </w:tcPr>
           <w:p>
             <w:pPr>
-              <w:pStyle w:val="Normal"/>
-              <w:spacing w:lineRule="exact" w:line="320"/>
+              <w:spacing w:line="320" w:lineRule="exact"/>
               <w:jc w:val="center"/>
               <w:rPr>
                 <w:rFonts w:ascii="宋体" w:hAnsi="宋体" w:eastAsia="宋体"/>
@@ -5191,7 +5322,7 @@
                 <w:rFonts w:ascii="宋体" w:hAnsi="宋体" w:eastAsia="宋体"/>
                 <w:sz w:val="24"/>
               </w:rPr>
-              <w:t xml:space="preserve">在 GCC 与 LLVM 多版本、多 ISA 上完成全机制端到端实验，持续推进上游缺陷上报闭环</w:t>
+              <w:t>在 GCC 与 LLVM 多版本、多 ISA 上完成全机制端到端实验，持续推进上游缺陷上报闭环</w:t>
             </w:r>
           </w:p>
         </w:tc>
@@ -5199,52 +5330,52 @@
           <w:tcPr>
             <w:tcW w:w="2297" w:type="dxa"/>
             <w:tcBorders>
-              <w:top w:val="single" w:sz="4" w:space="0" w:color="000000"/>
-              <w:start w:val="single" w:sz="4" w:space="0" w:color="000000"/>
-              <w:bottom w:val="single" w:sz="4" w:space="0" w:color="000000"/>
-              <w:end w:val="single" w:sz="4" w:space="0" w:color="000000"/>
+              <w:top w:val="single" w:color="000000" w:sz="4" w:space="0"/>
+              <w:left w:val="single" w:color="000000" w:sz="4" w:space="0"/>
+              <w:bottom w:val="single" w:color="000000" w:sz="4" w:space="0"/>
+              <w:right w:val="single" w:color="000000" w:sz="4" w:space="0"/>
             </w:tcBorders>
             <w:vAlign w:val="center"/>
           </w:tcPr>
           <w:p>
             <w:pPr>
-              <w:pStyle w:val="Normal"/>
-              <w:spacing w:lineRule="exact" w:line="320"/>
+              <w:spacing w:line="320" w:lineRule="exact"/>
               <w:jc w:val="center"/>
               <w:rPr>
                 <w:rFonts w:ascii="宋体" w:hAnsi="宋体" w:eastAsia="宋体"/>
                 <w:sz w:val="24"/>
               </w:rPr>
             </w:pPr>
-            <w:r>
-              <w:rPr>
-                <w:rFonts w:ascii="宋体" w:hAnsi="宋体" w:eastAsia="宋体"/>
-                <w:sz w:val="24"/>
-              </w:rPr>
-              <w:t xml:space="preserve"/>
-            </w:r>
           </w:p>
         </w:tc>
       </w:tr>
       <w:tr>
+        <w:tblPrEx>
+          <w:tblCellMar>
+            <w:top w:w="0" w:type="dxa"/>
+            <w:left w:w="108" w:type="dxa"/>
+            <w:bottom w:w="0" w:type="dxa"/>
+            <w:right w:w="108" w:type="dxa"/>
+          </w:tblCellMar>
+        </w:tblPrEx>
         <w:trPr>
           <w:trHeight w:val="480" w:hRule="atLeast"/>
+          <w:jc w:val="center"/>
         </w:trPr>
         <w:tc>
           <w:tcPr>
             <w:tcW w:w="2077" w:type="dxa"/>
             <w:tcBorders>
-              <w:top w:val="single" w:sz="4" w:space="0" w:color="000000"/>
-              <w:start w:val="single" w:sz="4" w:space="0" w:color="000000"/>
-              <w:bottom w:val="single" w:sz="4" w:space="0" w:color="000000"/>
-              <w:end w:val="single" w:sz="4" w:space="0" w:color="000000"/>
+              <w:top w:val="single" w:color="000000" w:sz="4" w:space="0"/>
+              <w:left w:val="single" w:color="000000" w:sz="4" w:space="0"/>
+              <w:bottom w:val="single" w:color="000000" w:sz="4" w:space="0"/>
+              <w:right w:val="single" w:color="000000" w:sz="4" w:space="0"/>
             </w:tcBorders>
             <w:vAlign w:val="center"/>
           </w:tcPr>
           <w:p>
             <w:pPr>
-              <w:pStyle w:val="Normal"/>
-              <w:spacing w:lineRule="exact" w:line="320"/>
+              <w:spacing w:line="320" w:lineRule="exact"/>
               <w:jc w:val="center"/>
               <w:rPr>
                 <w:rFonts w:ascii="宋体" w:hAnsi="宋体" w:eastAsia="宋体"/>
@@ -5256,7 +5387,7 @@
                 <w:rFonts w:ascii="宋体" w:hAnsi="宋体" w:eastAsia="宋体"/>
                 <w:sz w:val="24"/>
               </w:rPr>
-              <w:t xml:space="preserve">2026.12-2027.02</w:t>
+              <w:t>2026.12-2027.02</w:t>
             </w:r>
           </w:p>
         </w:tc>
@@ -5264,17 +5395,16 @@
           <w:tcPr>
             <w:tcW w:w="5167" w:type="dxa"/>
             <w:tcBorders>
-              <w:top w:val="single" w:sz="4" w:space="0" w:color="000000"/>
-              <w:start w:val="single" w:sz="4" w:space="0" w:color="000000"/>
-              <w:bottom w:val="single" w:sz="4" w:space="0" w:color="000000"/>
-              <w:end w:val="single" w:sz="4" w:space="0" w:color="000000"/>
+              <w:top w:val="single" w:color="000000" w:sz="4" w:space="0"/>
+              <w:left w:val="single" w:color="000000" w:sz="4" w:space="0"/>
+              <w:bottom w:val="single" w:color="000000" w:sz="4" w:space="0"/>
+              <w:right w:val="single" w:color="000000" w:sz="4" w:space="0"/>
             </w:tcBorders>
             <w:vAlign w:val="center"/>
           </w:tcPr>
           <w:p>
             <w:pPr>
-              <w:pStyle w:val="Normal"/>
-              <w:spacing w:lineRule="exact" w:line="320"/>
+              <w:spacing w:line="320" w:lineRule="exact"/>
               <w:jc w:val="center"/>
               <w:rPr>
                 <w:rFonts w:ascii="宋体" w:hAnsi="宋体" w:eastAsia="宋体"/>
@@ -5286,7 +5416,7 @@
                 <w:rFonts w:ascii="宋体" w:hAnsi="宋体" w:eastAsia="宋体"/>
                 <w:sz w:val="24"/>
               </w:rPr>
-              <w:t xml:space="preserve">与 Csmith、YARPGen、GrayC、HLPFuzz 等基线方法做对照评测，量化覆盖率推进与缺陷发现上的相对优势</w:t>
+              <w:t>与 Csmith、YARPGen、GrayC、HLPFuzz 等基线方法做对照评测，量化覆盖率推进与缺陷发现上的相对优势</w:t>
             </w:r>
           </w:p>
         </w:tc>
@@ -5294,52 +5424,52 @@
           <w:tcPr>
             <w:tcW w:w="2297" w:type="dxa"/>
             <w:tcBorders>
-              <w:top w:val="single" w:sz="4" w:space="0" w:color="000000"/>
-              <w:start w:val="single" w:sz="4" w:space="0" w:color="000000"/>
-              <w:bottom w:val="single" w:sz="4" w:space="0" w:color="000000"/>
-              <w:end w:val="single" w:sz="4" w:space="0" w:color="000000"/>
+              <w:top w:val="single" w:color="000000" w:sz="4" w:space="0"/>
+              <w:left w:val="single" w:color="000000" w:sz="4" w:space="0"/>
+              <w:bottom w:val="single" w:color="000000" w:sz="4" w:space="0"/>
+              <w:right w:val="single" w:color="000000" w:sz="4" w:space="0"/>
             </w:tcBorders>
             <w:vAlign w:val="center"/>
           </w:tcPr>
           <w:p>
             <w:pPr>
-              <w:pStyle w:val="Normal"/>
-              <w:spacing w:lineRule="exact" w:line="320"/>
+              <w:spacing w:line="320" w:lineRule="exact"/>
               <w:jc w:val="center"/>
               <w:rPr>
                 <w:rFonts w:ascii="宋体" w:hAnsi="宋体" w:eastAsia="宋体"/>
                 <w:sz w:val="24"/>
               </w:rPr>
             </w:pPr>
-            <w:r>
-              <w:rPr>
-                <w:rFonts w:ascii="宋体" w:hAnsi="宋体" w:eastAsia="宋体"/>
-                <w:sz w:val="24"/>
-              </w:rPr>
-              <w:t xml:space="preserve"/>
-            </w:r>
           </w:p>
         </w:tc>
       </w:tr>
       <w:tr>
+        <w:tblPrEx>
+          <w:tblCellMar>
+            <w:top w:w="0" w:type="dxa"/>
+            <w:left w:w="108" w:type="dxa"/>
+            <w:bottom w:w="0" w:type="dxa"/>
+            <w:right w:w="108" w:type="dxa"/>
+          </w:tblCellMar>
+        </w:tblPrEx>
         <w:trPr>
           <w:trHeight w:val="480" w:hRule="atLeast"/>
+          <w:jc w:val="center"/>
         </w:trPr>
         <w:tc>
           <w:tcPr>
             <w:tcW w:w="2077" w:type="dxa"/>
             <w:tcBorders>
-              <w:top w:val="single" w:sz="4" w:space="0" w:color="000000"/>
-              <w:start w:val="single" w:sz="4" w:space="0" w:color="000000"/>
-              <w:bottom w:val="single" w:sz="4" w:space="0" w:color="000000"/>
-              <w:end w:val="single" w:sz="4" w:space="0" w:color="000000"/>
+              <w:top w:val="single" w:color="000000" w:sz="4" w:space="0"/>
+              <w:left w:val="single" w:color="000000" w:sz="4" w:space="0"/>
+              <w:bottom w:val="single" w:color="000000" w:sz="4" w:space="0"/>
+              <w:right w:val="single" w:color="000000" w:sz="4" w:space="0"/>
             </w:tcBorders>
             <w:vAlign w:val="center"/>
           </w:tcPr>
           <w:p>
             <w:pPr>
-              <w:pStyle w:val="Normal"/>
-              <w:spacing w:lineRule="exact" w:line="320"/>
+              <w:spacing w:line="320" w:lineRule="exact"/>
               <w:jc w:val="center"/>
               <w:rPr>
                 <w:rFonts w:ascii="宋体" w:hAnsi="宋体" w:eastAsia="宋体"/>
@@ -5351,7 +5481,7 @@
                 <w:rFonts w:ascii="宋体" w:hAnsi="宋体" w:eastAsia="宋体"/>
                 <w:sz w:val="24"/>
               </w:rPr>
-              <w:t xml:space="preserve">2027.02-2027.04</w:t>
+              <w:t>2027.02-2027.04</w:t>
             </w:r>
           </w:p>
         </w:tc>
@@ -5359,17 +5489,16 @@
           <w:tcPr>
             <w:tcW w:w="5167" w:type="dxa"/>
             <w:tcBorders>
-              <w:top w:val="single" w:sz="4" w:space="0" w:color="000000"/>
-              <w:start w:val="single" w:sz="4" w:space="0" w:color="000000"/>
-              <w:bottom w:val="single" w:sz="4" w:space="0" w:color="000000"/>
-              <w:end w:val="single" w:sz="4" w:space="0" w:color="000000"/>
+              <w:top w:val="single" w:color="000000" w:sz="4" w:space="0"/>
+              <w:left w:val="single" w:color="000000" w:sz="4" w:space="0"/>
+              <w:bottom w:val="single" w:color="000000" w:sz="4" w:space="0"/>
+              <w:right w:val="single" w:color="000000" w:sz="4" w:space="0"/>
             </w:tcBorders>
             <w:vAlign w:val="center"/>
           </w:tcPr>
           <w:p>
             <w:pPr>
-              <w:pStyle w:val="Normal"/>
-              <w:spacing w:lineRule="exact" w:line="320"/>
+              <w:spacing w:line="320" w:lineRule="exact"/>
               <w:jc w:val="center"/>
               <w:rPr>
                 <w:rFonts w:ascii="宋体" w:hAnsi="宋体" w:eastAsia="宋体"/>
@@ -5381,7 +5510,7 @@
                 <w:rFonts w:ascii="宋体" w:hAnsi="宋体" w:eastAsia="宋体"/>
                 <w:sz w:val="24"/>
               </w:rPr>
-              <w:t xml:space="preserve">整理实验数据与图表，完成学位论文初稿，准备会议 / 期刊投稿</w:t>
+              <w:t>整理实验数据与图表，完成学位论文初稿，准备会议 / 期刊投稿</w:t>
             </w:r>
           </w:p>
         </w:tc>
@@ -5389,52 +5518,52 @@
           <w:tcPr>
             <w:tcW w:w="2297" w:type="dxa"/>
             <w:tcBorders>
-              <w:top w:val="single" w:sz="4" w:space="0" w:color="000000"/>
-              <w:start w:val="single" w:sz="4" w:space="0" w:color="000000"/>
-              <w:bottom w:val="single" w:sz="4" w:space="0" w:color="000000"/>
-              <w:end w:val="single" w:sz="4" w:space="0" w:color="000000"/>
+              <w:top w:val="single" w:color="000000" w:sz="4" w:space="0"/>
+              <w:left w:val="single" w:color="000000" w:sz="4" w:space="0"/>
+              <w:bottom w:val="single" w:color="000000" w:sz="4" w:space="0"/>
+              <w:right w:val="single" w:color="000000" w:sz="4" w:space="0"/>
             </w:tcBorders>
             <w:vAlign w:val="center"/>
           </w:tcPr>
           <w:p>
             <w:pPr>
-              <w:pStyle w:val="Normal"/>
-              <w:spacing w:lineRule="exact" w:line="320"/>
+              <w:spacing w:line="320" w:lineRule="exact"/>
               <w:jc w:val="center"/>
               <w:rPr>
                 <w:rFonts w:ascii="宋体" w:hAnsi="宋体" w:eastAsia="宋体"/>
                 <w:sz w:val="24"/>
               </w:rPr>
             </w:pPr>
-            <w:r>
-              <w:rPr>
-                <w:rFonts w:ascii="宋体" w:hAnsi="宋体" w:eastAsia="宋体"/>
-                <w:sz w:val="24"/>
-              </w:rPr>
-              <w:t xml:space="preserve"/>
-            </w:r>
           </w:p>
         </w:tc>
       </w:tr>
       <w:tr>
+        <w:tblPrEx>
+          <w:tblCellMar>
+            <w:top w:w="0" w:type="dxa"/>
+            <w:left w:w="108" w:type="dxa"/>
+            <w:bottom w:w="0" w:type="dxa"/>
+            <w:right w:w="108" w:type="dxa"/>
+          </w:tblCellMar>
+        </w:tblPrEx>
         <w:trPr>
           <w:trHeight w:val="480" w:hRule="atLeast"/>
+          <w:jc w:val="center"/>
         </w:trPr>
         <w:tc>
           <w:tcPr>
             <w:tcW w:w="2077" w:type="dxa"/>
             <w:tcBorders>
-              <w:top w:val="single" w:sz="4" w:space="0" w:color="000000"/>
-              <w:start w:val="single" w:sz="4" w:space="0" w:color="000000"/>
-              <w:bottom w:val="single" w:sz="4" w:space="0" w:color="000000"/>
-              <w:end w:val="single" w:sz="4" w:space="0" w:color="000000"/>
+              <w:top w:val="single" w:color="000000" w:sz="4" w:space="0"/>
+              <w:left w:val="single" w:color="000000" w:sz="4" w:space="0"/>
+              <w:bottom w:val="single" w:color="000000" w:sz="4" w:space="0"/>
+              <w:right w:val="single" w:color="000000" w:sz="4" w:space="0"/>
             </w:tcBorders>
             <w:vAlign w:val="center"/>
           </w:tcPr>
           <w:p>
             <w:pPr>
-              <w:pStyle w:val="Normal"/>
-              <w:spacing w:lineRule="exact" w:line="320"/>
+              <w:spacing w:line="320" w:lineRule="exact"/>
               <w:jc w:val="center"/>
               <w:rPr>
                 <w:rFonts w:ascii="宋体" w:hAnsi="宋体" w:eastAsia="宋体"/>
@@ -5446,7 +5575,7 @@
                 <w:rFonts w:ascii="宋体" w:hAnsi="宋体" w:eastAsia="宋体"/>
                 <w:sz w:val="24"/>
               </w:rPr>
-              <w:t xml:space="preserve">2027.04-2027.06</w:t>
+              <w:t>2027.04-2027.06</w:t>
             </w:r>
           </w:p>
         </w:tc>
@@ -5454,17 +5583,16 @@
           <w:tcPr>
             <w:tcW w:w="5167" w:type="dxa"/>
             <w:tcBorders>
-              <w:top w:val="single" w:sz="4" w:space="0" w:color="000000"/>
-              <w:start w:val="single" w:sz="4" w:space="0" w:color="000000"/>
-              <w:bottom w:val="single" w:sz="4" w:space="0" w:color="000000"/>
-              <w:end w:val="single" w:sz="4" w:space="0" w:color="000000"/>
+              <w:top w:val="single" w:color="000000" w:sz="4" w:space="0"/>
+              <w:left w:val="single" w:color="000000" w:sz="4" w:space="0"/>
+              <w:bottom w:val="single" w:color="000000" w:sz="4" w:space="0"/>
+              <w:right w:val="single" w:color="000000" w:sz="4" w:space="0"/>
             </w:tcBorders>
             <w:vAlign w:val="center"/>
           </w:tcPr>
           <w:p>
             <w:pPr>
-              <w:pStyle w:val="Normal"/>
-              <w:spacing w:lineRule="exact" w:line="320"/>
+              <w:spacing w:line="320" w:lineRule="exact"/>
               <w:jc w:val="center"/>
               <w:rPr>
                 <w:rFonts w:ascii="宋体" w:hAnsi="宋体" w:eastAsia="宋体"/>
@@ -5476,7 +5604,7 @@
                 <w:rFonts w:ascii="宋体" w:hAnsi="宋体" w:eastAsia="宋体"/>
                 <w:sz w:val="24"/>
               </w:rPr>
-              <w:t xml:space="preserve">学位论文修订、外审反馈处理、答辩材料准备</w:t>
+              <w:t>学位论文修订、外审反馈处理、答辩材料准备</w:t>
             </w:r>
           </w:p>
         </w:tc>
@@ -5484,52 +5612,52 @@
           <w:tcPr>
             <w:tcW w:w="2297" w:type="dxa"/>
             <w:tcBorders>
-              <w:top w:val="single" w:sz="4" w:space="0" w:color="000000"/>
-              <w:start w:val="single" w:sz="4" w:space="0" w:color="000000"/>
-              <w:bottom w:val="single" w:sz="4" w:space="0" w:color="000000"/>
-              <w:end w:val="single" w:sz="4" w:space="0" w:color="000000"/>
+              <w:top w:val="single" w:color="000000" w:sz="4" w:space="0"/>
+              <w:left w:val="single" w:color="000000" w:sz="4" w:space="0"/>
+              <w:bottom w:val="single" w:color="000000" w:sz="4" w:space="0"/>
+              <w:right w:val="single" w:color="000000" w:sz="4" w:space="0"/>
             </w:tcBorders>
             <w:vAlign w:val="center"/>
           </w:tcPr>
           <w:p>
             <w:pPr>
-              <w:pStyle w:val="Normal"/>
-              <w:spacing w:lineRule="exact" w:line="320"/>
+              <w:spacing w:line="320" w:lineRule="exact"/>
               <w:jc w:val="center"/>
               <w:rPr>
                 <w:rFonts w:ascii="宋体" w:hAnsi="宋体" w:eastAsia="宋体"/>
                 <w:sz w:val="24"/>
               </w:rPr>
             </w:pPr>
-            <w:r>
-              <w:rPr>
-                <w:rFonts w:ascii="宋体" w:hAnsi="宋体" w:eastAsia="宋体"/>
-                <w:sz w:val="24"/>
-              </w:rPr>
-              <w:t xml:space="preserve"/>
-            </w:r>
           </w:p>
         </w:tc>
       </w:tr>
       <w:tr>
+        <w:tblPrEx>
+          <w:tblCellMar>
+            <w:top w:w="0" w:type="dxa"/>
+            <w:left w:w="108" w:type="dxa"/>
+            <w:bottom w:w="0" w:type="dxa"/>
+            <w:right w:w="108" w:type="dxa"/>
+          </w:tblCellMar>
+        </w:tblPrEx>
         <w:trPr>
           <w:trHeight w:val="480" w:hRule="atLeast"/>
+          <w:jc w:val="center"/>
         </w:trPr>
         <w:tc>
           <w:tcPr>
             <w:tcW w:w="2077" w:type="dxa"/>
             <w:tcBorders>
-              <w:top w:val="single" w:sz="4" w:space="0" w:color="000000"/>
-              <w:start w:val="single" w:sz="4" w:space="0" w:color="000000"/>
-              <w:bottom w:val="single" w:sz="4" w:space="0" w:color="000000"/>
-              <w:end w:val="single" w:sz="4" w:space="0" w:color="000000"/>
+              <w:top w:val="single" w:color="000000" w:sz="4" w:space="0"/>
+              <w:left w:val="single" w:color="000000" w:sz="4" w:space="0"/>
+              <w:bottom w:val="single" w:color="000000" w:sz="4" w:space="0"/>
+              <w:right w:val="single" w:color="000000" w:sz="4" w:space="0"/>
             </w:tcBorders>
             <w:vAlign w:val="center"/>
           </w:tcPr>
           <w:p>
             <w:pPr>
-              <w:pStyle w:val="Normal"/>
-              <w:spacing w:lineRule="exact" w:line="320"/>
+              <w:spacing w:line="320" w:lineRule="exact"/>
               <w:jc w:val="center"/>
               <w:rPr>
                 <w:rFonts w:ascii="宋体" w:hAnsi="宋体" w:eastAsia="宋体"/>
@@ -5541,7 +5669,7 @@
                 <w:rFonts w:ascii="宋体" w:hAnsi="宋体" w:eastAsia="宋体"/>
                 <w:sz w:val="24"/>
               </w:rPr>
-              <w:t xml:space="preserve">2027.06</w:t>
+              <w:t>2027.06</w:t>
             </w:r>
           </w:p>
         </w:tc>
@@ -5549,17 +5677,16 @@
           <w:tcPr>
             <w:tcW w:w="5167" w:type="dxa"/>
             <w:tcBorders>
-              <w:top w:val="single" w:sz="4" w:space="0" w:color="000000"/>
-              <w:start w:val="single" w:sz="4" w:space="0" w:color="000000"/>
-              <w:bottom w:val="single" w:sz="4" w:space="0" w:color="000000"/>
-              <w:end w:val="single" w:sz="4" w:space="0" w:color="000000"/>
+              <w:top w:val="single" w:color="000000" w:sz="4" w:space="0"/>
+              <w:left w:val="single" w:color="000000" w:sz="4" w:space="0"/>
+              <w:bottom w:val="single" w:color="000000" w:sz="4" w:space="0"/>
+              <w:right w:val="single" w:color="000000" w:sz="4" w:space="0"/>
             </w:tcBorders>
             <w:vAlign w:val="center"/>
           </w:tcPr>
           <w:p>
             <w:pPr>
-              <w:pStyle w:val="Normal"/>
-              <w:spacing w:lineRule="exact" w:line="320"/>
+              <w:spacing w:line="320" w:lineRule="exact"/>
               <w:jc w:val="center"/>
               <w:rPr>
                 <w:rFonts w:ascii="宋体" w:hAnsi="宋体" w:eastAsia="宋体"/>
@@ -5571,7 +5698,7 @@
                 <w:rFonts w:ascii="宋体" w:hAnsi="宋体" w:eastAsia="宋体"/>
                 <w:sz w:val="24"/>
               </w:rPr>
-              <w:t xml:space="preserve">学位论文答辩</w:t>
+              <w:t>学位论文答辩</w:t>
             </w:r>
           </w:p>
         </w:tc>
@@ -5579,30 +5706,22 @@
           <w:tcPr>
             <w:tcW w:w="2297" w:type="dxa"/>
             <w:tcBorders>
-              <w:top w:val="single" w:sz="4" w:space="0" w:color="000000"/>
-              <w:start w:val="single" w:sz="4" w:space="0" w:color="000000"/>
-              <w:bottom w:val="single" w:sz="4" w:space="0" w:color="000000"/>
-              <w:end w:val="single" w:sz="4" w:space="0" w:color="000000"/>
+              <w:top w:val="single" w:color="000000" w:sz="4" w:space="0"/>
+              <w:left w:val="single" w:color="000000" w:sz="4" w:space="0"/>
+              <w:bottom w:val="single" w:color="000000" w:sz="4" w:space="0"/>
+              <w:right w:val="single" w:color="000000" w:sz="4" w:space="0"/>
             </w:tcBorders>
             <w:vAlign w:val="center"/>
           </w:tcPr>
           <w:p>
             <w:pPr>
-              <w:pStyle w:val="Normal"/>
-              <w:spacing w:lineRule="exact" w:line="320"/>
+              <w:spacing w:line="320" w:lineRule="exact"/>
               <w:jc w:val="center"/>
               <w:rPr>
                 <w:rFonts w:ascii="宋体" w:hAnsi="宋体" w:eastAsia="宋体"/>
                 <w:sz w:val="24"/>
               </w:rPr>
             </w:pPr>
-            <w:r>
-              <w:rPr>
-                <w:rFonts w:ascii="宋体" w:hAnsi="宋体" w:eastAsia="宋体"/>
-                <w:sz w:val="24"/>
-              </w:rPr>
-              <w:t xml:space="preserve"/>
-            </w:r>
           </w:p>
         </w:tc>
       </w:tr>
@@ -7276,8 +7395,8 @@
     <w:lsdException w:unhideWhenUsed="0" w:uiPriority="0" w:semiHidden="0" w:name="Normal Indent"/>
     <w:lsdException w:unhideWhenUsed="0" w:uiPriority="0" w:semiHidden="0" w:name="footnote text"/>
     <w:lsdException w:unhideWhenUsed="0" w:uiPriority="0" w:semiHidden="0" w:name="annotation text"/>
-    <w:lsdException w:unhideWhenUsed="0" w:uiPriority="0" w:semiHidden="0" w:name="header"/>
-    <w:lsdException w:unhideWhenUsed="0" w:uiPriority="0" w:semiHidden="0" w:name="footer"/>
+    <w:lsdException w:qFormat="1" w:unhideWhenUsed="0" w:uiPriority="0" w:semiHidden="0" w:name="header"/>
+    <w:lsdException w:qFormat="1" w:unhideWhenUsed="0" w:uiPriority="0" w:semiHidden="0" w:name="footer"/>
     <w:lsdException w:unhideWhenUsed="0" w:uiPriority="0" w:semiHidden="0" w:name="index heading"/>
     <w:lsdException w:qFormat="1" w:unhideWhenUsed="0" w:uiPriority="0" w:semiHidden="0" w:name="caption"/>
     <w:lsdException w:unhideWhenUsed="0" w:uiPriority="0" w:semiHidden="0" w:name="table of figures"/>
@@ -7286,7 +7405,7 @@
     <w:lsdException w:unhideWhenUsed="0" w:uiPriority="0" w:semiHidden="0" w:name="footnote reference"/>
     <w:lsdException w:unhideWhenUsed="0" w:uiPriority="0" w:semiHidden="0" w:name="annotation reference"/>
     <w:lsdException w:unhideWhenUsed="0" w:uiPriority="0" w:semiHidden="0" w:name="line number"/>
-    <w:lsdException w:unhideWhenUsed="0" w:uiPriority="0" w:semiHidden="0" w:name="page number"/>
+    <w:lsdException w:qFormat="1" w:unhideWhenUsed="0" w:uiPriority="0" w:semiHidden="0" w:name="page number"/>
     <w:lsdException w:unhideWhenUsed="0" w:uiPriority="0" w:semiHidden="0" w:name="endnote reference"/>
     <w:lsdException w:unhideWhenUsed="0" w:uiPriority="0" w:semiHidden="0" w:name="endnote text"/>
     <w:lsdException w:unhideWhenUsed="0" w:uiPriority="0" w:semiHidden="0" w:name="table of authorities"/>
@@ -7311,7 +7430,7 @@
     <w:lsdException w:unhideWhenUsed="0" w:uiPriority="0" w:semiHidden="0" w:name="Closing"/>
     <w:lsdException w:unhideWhenUsed="0" w:uiPriority="0" w:semiHidden="0" w:name="Signature"/>
     <w:lsdException w:qFormat="1" w:unhideWhenUsed="0" w:uiPriority="0" w:semiHidden="0" w:name="Default Paragraph Font"/>
-    <w:lsdException w:unhideWhenUsed="0" w:uiPriority="0" w:semiHidden="0" w:name="Body Text"/>
+    <w:lsdException w:qFormat="1" w:unhideWhenUsed="0" w:uiPriority="0" w:semiHidden="0" w:name="Body Text"/>
     <w:lsdException w:unhideWhenUsed="0" w:uiPriority="0" w:semiHidden="0" w:name="Body Text Indent"/>
     <w:lsdException w:unhideWhenUsed="0" w:uiPriority="0" w:semiHidden="0" w:name="List Continue"/>
     <w:lsdException w:unhideWhenUsed="0" w:uiPriority="0" w:semiHidden="0" w:name="List Continue 2"/>
@@ -7330,7 +7449,7 @@
     <w:lsdException w:unhideWhenUsed="0" w:uiPriority="0" w:semiHidden="0" w:name="Body Text Indent 2"/>
     <w:lsdException w:unhideWhenUsed="0" w:uiPriority="0" w:semiHidden="0" w:name="Body Text Indent 3"/>
     <w:lsdException w:unhideWhenUsed="0" w:uiPriority="0" w:semiHidden="0" w:name="Block Text"/>
-    <w:lsdException w:unhideWhenUsed="0" w:uiPriority="0" w:semiHidden="0" w:name="Hyperlink"/>
+    <w:lsdException w:qFormat="1" w:unhideWhenUsed="0" w:uiPriority="0" w:semiHidden="0" w:name="Hyperlink"/>
     <w:lsdException w:unhideWhenUsed="0" w:uiPriority="0" w:semiHidden="0" w:name="FollowedHyperlink"/>
     <w:lsdException w:qFormat="1" w:unhideWhenUsed="0" w:uiPriority="0" w:semiHidden="0" w:name="Strong"/>
     <w:lsdException w:qFormat="1" w:unhideWhenUsed="0" w:uiPriority="0" w:semiHidden="0" w:name="Emphasis"/>
@@ -7559,6 +7678,7 @@
   <w:style w:type="paragraph" w:styleId="3">
     <w:name w:val="Body Text"/>
     <w:basedOn w:val="1"/>
+    <w:qFormat/>
     <w:uiPriority w:val="0"/>
     <w:pPr>
       <w:spacing w:line="400" w:lineRule="exact"/>
@@ -7589,6 +7709,7 @@
   <w:style w:type="paragraph" w:styleId="5">
     <w:name w:val="footer"/>
     <w:basedOn w:val="1"/>
+    <w:qFormat/>
     <w:uiPriority w:val="0"/>
     <w:pPr>
       <w:tabs>
@@ -7606,6 +7727,7 @@
   <w:style w:type="paragraph" w:styleId="6">
     <w:name w:val="header"/>
     <w:basedOn w:val="1"/>
+    <w:qFormat/>
     <w:uiPriority w:val="0"/>
     <w:pPr>
       <w:pBdr>
@@ -7659,10 +7781,12 @@
   <w:style w:type="character" w:styleId="12">
     <w:name w:val="page number"/>
     <w:basedOn w:val="10"/>
+    <w:qFormat/>
     <w:uiPriority w:val="0"/>
   </w:style>
   <w:style w:type="character" w:styleId="13">
     <w:name w:val="Hyperlink"/>
+    <w:qFormat/>
     <w:uiPriority w:val="0"/>
     <w:rPr>
       <w:color w:val="0000FF"/>

</xml_diff>

<commit_message>
update(开题报告): change title style, resort refs
</commit_message>
<xml_diff>
--- a/docs/开题报告/DeFuzz-开题报告.docx
+++ b/docs/开题报告/DeFuzz-开题报告.docx
@@ -250,15 +250,6 @@
           <w:u w:val="single"/>
         </w:rPr>
         <w:tab/>
-      </w:r>
-      <w:r>
-        <w:rPr>
-          <w:rFonts w:hint="eastAsia" w:ascii="宋体" w:hAnsi="宋体"/>
-          <w:spacing w:val="40"/>
-          <w:kern w:val="2"/>
-          <w:sz w:val="28"/>
-          <w:u w:val="single"/>
-        </w:rPr>
         <w:tab/>
       </w:r>
       <w:r>
@@ -292,25 +283,7 @@
           <w:u w:val="single"/>
         </w:rPr>
         <w:tab/>
-      </w:r>
-      <w:r>
-        <w:rPr>
-          <w:rFonts w:hint="eastAsia" w:ascii="宋体" w:hAnsi="宋体"/>
-          <w:spacing w:val="40"/>
-          <w:kern w:val="2"/>
-          <w:sz w:val="28"/>
-          <w:u w:val="single"/>
-        </w:rPr>
         <w:tab/>
-      </w:r>
-      <w:r>
-        <w:rPr>
-          <w:rFonts w:hint="eastAsia" w:ascii="宋体" w:hAnsi="宋体"/>
-          <w:spacing w:val="40"/>
-          <w:kern w:val="2"/>
-          <w:sz w:val="28"/>
-          <w:u w:val="single"/>
-        </w:rPr>
         <w:tab/>
       </w:r>
       <w:r>
@@ -442,45 +415,9 @@
           <w:u w:val="single"/>
         </w:rPr>
         <w:tab/>
-      </w:r>
-      <w:r>
-        <w:rPr>
-          <w:rFonts w:hint="eastAsia" w:ascii="宋体" w:hAnsi="宋体"/>
-          <w:spacing w:val="40"/>
-          <w:kern w:val="2"/>
-          <w:sz w:val="28"/>
-          <w:u w:val="single"/>
-        </w:rPr>
         <w:tab/>
-      </w:r>
-      <w:r>
-        <w:rPr>
-          <w:rFonts w:hint="eastAsia" w:ascii="宋体" w:hAnsi="宋体"/>
-          <w:spacing w:val="40"/>
-          <w:kern w:val="2"/>
-          <w:sz w:val="28"/>
-          <w:u w:val="single"/>
-        </w:rPr>
         <w:t>电子信息</w:t>
-      </w:r>
-      <w:r>
-        <w:rPr>
-          <w:rFonts w:hint="eastAsia" w:ascii="宋体" w:hAnsi="宋体"/>
-          <w:spacing w:val="40"/>
-          <w:kern w:val="2"/>
-          <w:sz w:val="28"/>
-          <w:u w:val="single"/>
-        </w:rPr>
         <w:tab/>
-      </w:r>
-      <w:r>
-        <w:rPr>
-          <w:rFonts w:hint="eastAsia" w:ascii="宋体" w:hAnsi="宋体"/>
-          <w:spacing w:val="40"/>
-          <w:kern w:val="2"/>
-          <w:sz w:val="28"/>
-          <w:u w:val="single"/>
-        </w:rPr>
         <w:tab/>
       </w:r>
     </w:p>
@@ -540,15 +477,6 @@
           <w:u w:val="single"/>
         </w:rPr>
         <w:tab/>
-      </w:r>
-      <w:r>
-        <w:rPr>
-          <w:rFonts w:hint="eastAsia" w:ascii="宋体" w:hAnsi="宋体"/>
-          <w:spacing w:val="40"/>
-          <w:kern w:val="2"/>
-          <w:sz w:val="28"/>
-          <w:u w:val="single"/>
-        </w:rPr>
         <w:tab/>
       </w:r>
       <w:r>
@@ -584,6 +512,8 @@
         </w:rPr>
         <w:t xml:space="preserve">  </w:t>
       </w:r>
+      <w:bookmarkStart w:id="0" w:name="_GoBack"/>
+      <w:bookmarkEnd w:id="0"/>
       <w:r>
         <w:rPr>
           <w:rFonts w:hint="eastAsia" w:ascii="宋体" w:hAnsi="宋体"/>
@@ -593,15 +523,6 @@
           <w:u w:val="single"/>
         </w:rPr>
         <w:tab/>
-      </w:r>
-      <w:r>
-        <w:rPr>
-          <w:rFonts w:hint="eastAsia" w:ascii="宋体" w:hAnsi="宋体"/>
-          <w:spacing w:val="40"/>
-          <w:kern w:val="2"/>
-          <w:sz w:val="28"/>
-          <w:u w:val="single"/>
-        </w:rPr>
         <w:tab/>
       </w:r>
       <w:r>
@@ -662,15 +583,6 @@
           <w:u w:val="single"/>
         </w:rPr>
         <w:tab/>
-      </w:r>
-      <w:r>
-        <w:rPr>
-          <w:rFonts w:hint="eastAsia" w:ascii="宋体" w:hAnsi="宋体"/>
-          <w:spacing w:val="40"/>
-          <w:kern w:val="2"/>
-          <w:sz w:val="28"/>
-          <w:u w:val="single"/>
-        </w:rPr>
         <w:tab/>
       </w:r>
       <w:r>
@@ -715,15 +627,6 @@
           <w:u w:val="single"/>
         </w:rPr>
         <w:tab/>
-      </w:r>
-      <w:r>
-        <w:rPr>
-          <w:rFonts w:hint="eastAsia" w:ascii="宋体" w:hAnsi="宋体"/>
-          <w:spacing w:val="40"/>
-          <w:kern w:val="2"/>
-          <w:sz w:val="28"/>
-          <w:u w:val="single"/>
-        </w:rPr>
         <w:tab/>
       </w:r>
       <w:r>
@@ -782,15 +685,6 @@
           <w:u w:val="single"/>
         </w:rPr>
         <w:tab/>
-      </w:r>
-      <w:r>
-        <w:rPr>
-          <w:rFonts w:hint="eastAsia" w:ascii="宋体" w:hAnsi="宋体"/>
-          <w:spacing w:val="40"/>
-          <w:kern w:val="2"/>
-          <w:sz w:val="28"/>
-          <w:u w:val="single"/>
-        </w:rPr>
         <w:tab/>
       </w:r>
       <w:r>
@@ -897,21 +791,7 @@
           <w:u w:val="single"/>
         </w:rPr>
         <w:tab/>
-      </w:r>
-      <w:r>
-        <w:rPr>
-          <w:rFonts w:hint="eastAsia" w:ascii="宋体" w:hAnsi="宋体"/>
-          <w:sz w:val="28"/>
-          <w:u w:val="single"/>
-        </w:rPr>
         <w:tab/>
-      </w:r>
-      <w:r>
-        <w:rPr>
-          <w:rFonts w:hint="eastAsia" w:ascii="宋体" w:hAnsi="宋体"/>
-          <w:sz w:val="28"/>
-          <w:u w:val="single"/>
-        </w:rPr>
         <w:tab/>
       </w:r>
       <w:r>
@@ -938,13 +818,6 @@
           <w:u w:val="single"/>
         </w:rPr>
         <w:tab/>
-      </w:r>
-      <w:r>
-        <w:rPr>
-          <w:rFonts w:hint="eastAsia" w:ascii="宋体" w:hAnsi="宋体"/>
-          <w:sz w:val="28"/>
-          <w:u w:val="single"/>
-        </w:rPr>
         <w:tab/>
       </w:r>
       <w:r>
@@ -2471,8 +2344,9 @@
           </w:p>
           <w:p>
             <w:pPr>
+              <w:pStyle w:val="Normal"/>
               <w:widowControl/>
-              <w:jc w:val="left"/>
+              <w:jc w:val="start"/>
               <w:rPr>
                 <w:b/>
                 <w:bCs/>
@@ -2492,7 +2366,8 @@
           </w:p>
           <w:p>
             <w:pPr>
-              <w:spacing w:line="360" w:lineRule="auto"/>
+              <w:pStyle w:val="Normal"/>
+              <w:spacing w:lineRule="auto" w:line="360"/>
               <w:rPr>
                 <w:b/>
                 <w:bCs/>
@@ -2507,78 +2382,49 @@
                 <w:kern w:val="0"/>
                 <w:sz w:val="24"/>
               </w:rPr>
-              <w:t>1.1 漏洞过载年代下编译器防御机制的兜底地位</w:t>
-            </w:r>
-          </w:p>
-          <w:p>
-            <w:pPr>
-              <w:spacing w:line="360" w:lineRule="auto"/>
-              <w:ind w:left="0" w:leftChars="0" w:right="0" w:rightChars="0" w:firstLineChars="200"/>
-              <w:rPr>
-                <w:kern w:val="0"/>
-                <w:sz w:val="24"/>
-              </w:rPr>
-            </w:pPr>
-            <w:r>
-              <w:rPr>
-                <w:kern w:val="0"/>
-                <w:sz w:val="24"/>
-              </w:rPr>
-              <w:t>近十年来，被公开披露的安全漏洞数量持续攀升。截至 2025 年，CVE 漏洞库每年新登记的条目稳定在两万条以上，且仍在快速增长[21]。Microsoft、Google 等厂商陆续公开承认，仅依靠人工审计与安全编程规范并不足以彻底清除上层代码中的内存安全 Bug[22][23]。因此，工业界与学术界将重心转向漏洞被触发后的拦截能力：栈金丝雀（stack canary）、源代码加固（_FORTIFY_SOURCE）、间接跳转跟踪（IBT）、控制流完整性（CFI）等多项防御机制由编译器与运行时共同叠加部署，在漏洞触发时承担起兜底防线的角色。</w:t>
-            </w:r>
-          </w:p>
-          <w:p>
-            <w:pPr>
-              <w:spacing w:line="360" w:lineRule="auto"/>
-              <w:ind w:left="0" w:leftChars="0" w:right="0" w:rightChars="0" w:firstLineChars="200"/>
-              <w:rPr>
-                <w:kern w:val="0"/>
-                <w:sz w:val="24"/>
-              </w:rPr>
-            </w:pPr>
-            <w:r>
-              <w:rPr>
-                <w:kern w:val="0"/>
-                <w:sz w:val="24"/>
-              </w:rPr>
-              <w:t>由编译器承担的兜底机制有一个共同的工作模式：在编译期向二进制中插入检查指令、布局约束或元数据，使运行期一旦偏离预定义的合法行为即可被发现并立即终止程序。以栈金丝雀为例，编译器在易受溢出影响的栈帧中</w:t>
-            </w:r>
-            <w:r>
-              <w:rPr>
-                <w:rFonts w:hint="eastAsia"/>
-                <w:kern w:val="0"/>
-                <w:sz w:val="24"/>
-                <w:lang w:eastAsia="zh-CN"/>
-              </w:rPr>
-              <w:t>，在函数返回地址和缓冲区之间</w:t>
-            </w:r>
-            <w:r>
-              <w:rPr>
-                <w:kern w:val="0"/>
-                <w:sz w:val="24"/>
-              </w:rPr>
-              <w:t>插入随机值</w:t>
-            </w:r>
-            <w:r>
-              <w:rPr>
-                <w:rFonts w:hint="eastAsia"/>
-                <w:kern w:val="0"/>
-                <w:sz w:val="24"/>
-                <w:lang w:eastAsia="zh-CN"/>
-              </w:rPr>
-              <w:t>哨兵</w:t>
-            </w:r>
-            <w:r>
-              <w:rPr>
-                <w:kern w:val="0"/>
-                <w:sz w:val="24"/>
-              </w:rPr>
-              <w:t>，并在函数返回前比对其是否被改写。兜底防线的有效性依赖于编译器各端能否正确生成代码，以及这些代码所依赖的指令集架构（instruction set architecture, ISA）假设是否成立。</w:t>
-            </w:r>
-          </w:p>
-          <w:p>
-            <w:pPr>
-              <w:spacing w:line="360" w:lineRule="auto"/>
+              <w:t>1.1 编译器防御机制的兜底地位</w:t>
+            </w:r>
+          </w:p>
+          <w:p>
+            <w:pPr>
+              <w:pStyle w:val="Normal"/>
+              <w:spacing w:lineRule="auto" w:line="360"/>
+              <w:ind w:firstLineChars="200" w:startChars="0" w:start="0" w:endChars="0" w:end="0"/>
+              <w:rPr>
+                <w:kern w:val="0"/>
+                <w:sz w:val="24"/>
+              </w:rPr>
+            </w:pPr>
+            <w:r>
+              <w:rPr>
+                <w:kern w:val="0"/>
+                <w:sz w:val="24"/>
+              </w:rPr>
+              <w:t xml:space="preserve">近十年来，被公开披露的安全漏洞数量持续攀升。截至 2025 年，CVE 漏洞库每年新登记的条目稳定在两万条以上，且仍在快速增长[1]。Microsoft、Google 等厂商陆续公开承认，仅依靠人工审计与安全编程规范并不足以彻底清除上层代码中的内存安全 Bug[2][3]。因此，工业界与学术界将重心转向漏洞被触发后的拦截能力：栈金丝雀（stack canary）、源代码加固（_FORTIFY_SOURCE）、间接跳转跟踪（IBT）、控制流完整性（CFI）等多项防御机制由编译器与运行时共同叠加部署，在漏洞触发时承担起兜底防线的角色。</w:t>
+            </w:r>
+          </w:p>
+          <w:p>
+            <w:pPr>
+              <w:pStyle w:val="Normal"/>
+              <w:spacing w:lineRule="auto" w:line="360"/>
+              <w:ind w:firstLineChars="200" w:startChars="0" w:start="0" w:endChars="0" w:end="0"/>
+              <w:rPr>
+                <w:kern w:val="0"/>
+                <w:sz w:val="24"/>
+              </w:rPr>
+            </w:pPr>
+            <w:r>
+              <w:rPr>
+                <w:kern w:val="0"/>
+                <w:sz w:val="24"/>
+              </w:rPr>
+              <w:t xml:space="preserve">由编译器承担的兜底机制有一个共同的工作模式：在编译期向二进制中插入检查指令、布局约束或元数据，使运行期一旦偏离预定义的合法行为即可被发现并立即终止程序。以栈金丝雀为例，编译器在易受溢出影响的栈帧中，在函数返回地址和缓冲区之间插入随机值哨兵，并在函数返回前比对其是否被改写。兜底防线的有效性依赖于编译器各端能否正确生成代码，以及这些代码所依赖的指令集架构（instruction set architecture, ISA）假设是否成立。</w:t>
+            </w:r>
+          </w:p>
+          <w:p>
+            <w:pPr>
+              <w:pStyle w:val="Normal"/>
+              <w:spacing w:lineRule="auto" w:line="360"/>
               <w:rPr>
                 <w:b/>
                 <w:bCs/>
@@ -2593,51 +2439,38 @@
                 <w:kern w:val="0"/>
                 <w:sz w:val="24"/>
               </w:rPr>
-              <w:t>1.2 引子：CVE-2023-4039 揭示的跨架构脆弱性</w:t>
-            </w:r>
-          </w:p>
-          <w:p>
-            <w:pPr>
-              <w:spacing w:line="360" w:lineRule="auto"/>
-              <w:ind w:left="0" w:leftChars="0" w:right="0" w:rightChars="0" w:firstLineChars="200"/>
-              <w:rPr>
-                <w:kern w:val="0"/>
-                <w:sz w:val="24"/>
-              </w:rPr>
-            </w:pPr>
-            <w:r>
-              <w:rPr>
-                <w:kern w:val="0"/>
-                <w:sz w:val="24"/>
-              </w:rPr>
-              <w:t>2023 年披露的 CVE-2023-4039[16] 是一个具有代表性的案例。GCC 在 AArch64 上的 -fstack-protector 选项长期失效：当函数使用变长数组（variable-length array, VLA）或 alloca 时，编译器把栈金丝雀放在 VLA 之上、保存的返回地址却落在</w:t>
-            </w:r>
-            <w:r>
-              <w:rPr>
-                <w:rFonts w:hint="eastAsia"/>
-                <w:kern w:val="0"/>
-                <w:sz w:val="24"/>
-                <w:lang w:eastAsia="zh-CN"/>
-              </w:rPr>
-              <w:t>栈金丝雀</w:t>
-            </w:r>
-            <w:r>
-              <w:rPr>
-                <w:kern w:val="0"/>
-                <w:sz w:val="24"/>
-              </w:rPr>
-              <w:t>之下，越界写入会先于金丝雀检查改写返回地址，本应兜底的保护因此被绕过。该漏洞在 GCC 早期版本即已存在，直到 2023 年才由外部研究者系统分析并修复。这种 buggy 状态下的栈帧布局如下图 1 所示。</w:t>
-            </w:r>
-          </w:p>
-          <w:p>
-            <w:pPr>
-              <w:spacing w:line="360" w:lineRule="auto"/>
-              <w:jc w:val="center"/>
-            </w:pPr>
-            <w:r>
+              <w:t>1.2 跨架构脆弱性的典型案例</w:t>
+            </w:r>
+          </w:p>
+          <w:p>
+            <w:pPr>
+              <w:pStyle w:val="Normal"/>
+              <w:spacing w:lineRule="auto" w:line="360"/>
+              <w:ind w:firstLineChars="200" w:startChars="0" w:start="0" w:endChars="0" w:end="0"/>
+              <w:rPr>
+                <w:kern w:val="0"/>
+                <w:sz w:val="24"/>
+              </w:rPr>
+            </w:pPr>
+            <w:r>
+              <w:rPr>
+                <w:kern w:val="0"/>
+                <w:sz w:val="24"/>
+              </w:rPr>
+              <w:t xml:space="preserve">2023 年披露的 CVE-2023-4039[4] 是一个具有代表性的案例。GCC 在 AArch64 上的 -fstack-protector 选项长期失效：当函数使用变长数组（variable-length array, VLA）或 alloca 时，编译器把栈金丝雀放在 VLA 之上、保存的返回地址却落在栈金丝雀之下，越界写入会先于金丝雀检查改写返回地址，本应兜底的保护因此被绕过。该漏洞在 GCC 早期版本即已存在，直到 2023 年才由外部研究者系统分析并修复。这种 buggy 状态下的栈帧布局如下图 1 所示。</w:t>
+            </w:r>
+          </w:p>
+          <w:p>
+            <w:pPr>
+              <w:pStyle w:val="Normal"/>
+              <w:spacing w:lineRule="auto" w:line="360"/>
+              <w:jc w:val="center"/>
+            </w:pPr>
+            <w:r>
+              <w:rPr/>
               <w:drawing>
-                <wp:inline distT="0" distB="0" distL="0" distR="0">
-                  <wp:extent cx="4283710" cy="5326380"/>
+                <wp:inline xmlns:wp="http://schemas.openxmlformats.org/drawingml/2006/wordprocessingDrawing" distT="0" distB="0" distL="0" distR="0">
+                  <wp:extent cx="4284090" cy="5326553"/>
                   <wp:effectExtent l="0" t="0" r="0" b="0"/>
                   <wp:docPr id="21" name="Figure21"/>
                   <wp:cNvGraphicFramePr>
@@ -2647,13 +2480,11 @@
                     <a:graphicData uri="http://schemas.openxmlformats.org/drawingml/2006/picture">
                       <pic:pic xmlns:pic="http://schemas.openxmlformats.org/drawingml/2006/picture">
                         <pic:nvPicPr>
-                          <pic:cNvPr id="21" name="Figure21"/>
-                          <pic:cNvPicPr>
-                            <a:picLocks noChangeAspect="1"/>
-                          </pic:cNvPicPr>
+                          <pic:cNvPr id="21" name="stack-layout.png"/>
+                          <pic:cNvPicPr/>
                         </pic:nvPicPr>
                         <pic:blipFill>
-                          <a:blip r:embed="rId6"/>
+                          <a:blip xmlns:r="http://schemas.openxmlformats.org/officeDocument/2006/relationships" r:embed="rId21"/>
                           <a:stretch>
                             <a:fillRect/>
                           </a:stretch>
@@ -2676,7 +2507,8 @@
           </w:p>
           <w:p>
             <w:pPr>
-              <w:spacing w:line="360" w:lineRule="auto"/>
+              <w:pStyle w:val="Normal"/>
+              <w:spacing w:lineRule="auto" w:line="360"/>
               <w:jc w:val="center"/>
               <w:rPr>
                 <w:rFonts w:ascii="宋体" w:hAnsi="宋体" w:eastAsia="宋体"/>
@@ -2697,32 +2529,35 @@
           </w:p>
           <w:p>
             <w:pPr>
-              <w:spacing w:line="360" w:lineRule="auto"/>
-              <w:rPr>
-                <w:sz w:val="24"/>
-              </w:rPr>
-            </w:pPr>
-          </w:p>
-          <w:p>
-            <w:pPr>
-              <w:spacing w:line="360" w:lineRule="auto"/>
-              <w:ind w:left="0" w:leftChars="0" w:right="0" w:rightChars="0" w:firstLineChars="200"/>
-              <w:rPr>
-                <w:kern w:val="0"/>
-                <w:sz w:val="24"/>
-              </w:rPr>
-            </w:pPr>
-            <w:r>
-              <w:rPr>
-                <w:kern w:val="0"/>
-                <w:sz w:val="24"/>
-              </w:rPr>
-              <w:t>CVE-2023-4039 直观地揭示了一个共性问题：编译器侧防御机制的有效性强依赖于具体 ISA 上的栈布局、寄存器分配与指令编码假设。一旦防御设计中的某项假设与某套 ISA 不一致，运行期保护就会悄然失效。这种失效具有"双重无声"特征：编译时不报错（工具链与功能测试都察觉不到），运行时也能产生正确的功能结果（程序行为也察觉不到），但其安全契约已经被打破。本课题将这种形态的失效称为静默失效（silent failure）：编译产物看似带有完整防线，但攻击者可直接绕过。</w:t>
-            </w:r>
-          </w:p>
-          <w:p>
-            <w:pPr>
-              <w:spacing w:line="360" w:lineRule="auto"/>
+              <w:pStyle w:val="Normal"/>
+              <w:spacing w:lineRule="auto" w:line="360"/>
+              <w:rPr>
+                <w:sz w:val="24"/>
+              </w:rPr>
+            </w:pPr>
+          </w:p>
+          <w:p>
+            <w:pPr>
+              <w:pStyle w:val="Normal"/>
+              <w:spacing w:lineRule="auto" w:line="360"/>
+              <w:ind w:firstLineChars="200" w:startChars="0" w:start="0" w:endChars="0" w:end="0"/>
+              <w:rPr>
+                <w:kern w:val="0"/>
+                <w:sz w:val="24"/>
+              </w:rPr>
+            </w:pPr>
+            <w:r>
+              <w:rPr>
+                <w:kern w:val="0"/>
+                <w:sz w:val="24"/>
+              </w:rPr>
+              <w:t xml:space="preserve">CVE-2023-4039 直观地揭示了一个共性问题：编译器侧防御机制的有效性强依赖于具体 ISA 上的栈布局、寄存器分配与指令编码假设。一旦防御设计中的某项假设与某套 ISA 不一致，运行期保护就会悄然失效。这种失效具有"双重无声"特征：编译时不报错（工具链与功能测试都察觉不到），运行时也能产生正确的功能结果（程序行为也察觉不到），但其安全契约已经被打破。本课题将这种形态的失效称为静默失效（silent failure）：编译产物看似带有完整防线，但攻击者可直接绕过。</w:t>
+            </w:r>
+          </w:p>
+          <w:p>
+            <w:pPr>
+              <w:pStyle w:val="Normal"/>
+              <w:spacing w:lineRule="auto" w:line="360"/>
               <w:rPr>
                 <w:b/>
                 <w:bCs/>
@@ -2737,52 +2572,56 @@
                 <w:kern w:val="0"/>
                 <w:sz w:val="24"/>
               </w:rPr>
-              <w:t>1.3 核心挑战：搜索空间巨大且失效难以判定</w:t>
-            </w:r>
-          </w:p>
-          <w:p>
-            <w:pPr>
-              <w:spacing w:line="360" w:lineRule="auto"/>
-              <w:ind w:left="0" w:leftChars="0" w:right="0" w:rightChars="0" w:firstLineChars="200"/>
-              <w:rPr>
-                <w:kern w:val="0"/>
-                <w:sz w:val="24"/>
-              </w:rPr>
-            </w:pPr>
-            <w:r>
-              <w:rPr>
-                <w:kern w:val="0"/>
-                <w:sz w:val="24"/>
-              </w:rPr>
-              <w:t>要在编译器中系统性地暴露此类静默失效，本课题面临两个相互纠缠的挑战。</w:t>
-            </w:r>
-          </w:p>
-          <w:p>
-            <w:pPr>
-              <w:spacing w:line="360" w:lineRule="auto"/>
-              <w:ind w:left="0" w:leftChars="0" w:right="0" w:rightChars="0" w:firstLineChars="200"/>
-              <w:rPr>
-                <w:kern w:val="0"/>
-                <w:sz w:val="24"/>
-              </w:rPr>
-            </w:pPr>
-            <w:r>
-              <w:rPr>
-                <w:kern w:val="0"/>
-                <w:sz w:val="24"/>
-              </w:rPr>
-              <w:t>第一是搜索空间巨大。如图 2 所示，编译器需要在多种防御机制（如栈金丝雀、_FORTIFY_SOURCE、IBT、CFI 等）与多套 ISA（如 x86-64、AArch64、RISC-V、LoongArch 等）构成的二维空间中维护安全契约。每个格点对应独立的中端 pass 或后端模板，任何细节都可能影响机制是否生效。已确认的同源遗漏并不少见：与 CVE-2023-4039 同源的 PR-96191[7] 在 2020 年修复时仅覆盖部分架构，未触及多个 fallback 后端，导致同一失效在其他架构上静默存续多年。本课题在初步实验中已向 GCC 上游确认了多例此类同源失效[17-20]（见第五章）。</w:t>
-            </w:r>
-          </w:p>
-          <w:p>
-            <w:pPr>
-              <w:spacing w:line="360" w:lineRule="auto"/>
-              <w:jc w:val="center"/>
-            </w:pPr>
-            <w:r>
+              <w:t>1.3 核心挑战</w:t>
+            </w:r>
+          </w:p>
+          <w:p>
+            <w:pPr>
+              <w:pStyle w:val="Normal"/>
+              <w:spacing w:lineRule="auto" w:line="360"/>
+              <w:ind w:firstLineChars="200" w:startChars="0" w:start="0" w:endChars="0" w:end="0"/>
+              <w:rPr>
+                <w:kern w:val="0"/>
+                <w:sz w:val="24"/>
+              </w:rPr>
+            </w:pPr>
+            <w:r>
+              <w:rPr>
+                <w:kern w:val="0"/>
+                <w:sz w:val="24"/>
+              </w:rPr>
+              <w:t xml:space="preserve">要在编译器中系统性地暴露此类静默失效，本课题面临两个相互纠缠的挑战。</w:t>
+            </w:r>
+          </w:p>
+          <w:p>
+            <w:pPr>
+              <w:pStyle w:val="Normal"/>
+              <w:spacing w:lineRule="auto" w:line="360"/>
+              <w:ind w:firstLineChars="200" w:startChars="0" w:start="0" w:endChars="0" w:end="0"/>
+              <w:rPr>
+                <w:kern w:val="0"/>
+                <w:sz w:val="24"/>
+              </w:rPr>
+            </w:pPr>
+            <w:r>
+              <w:rPr>
+                <w:kern w:val="0"/>
+                <w:sz w:val="24"/>
+              </w:rPr>
+              <w:t xml:space="preserve">第一是搜索空间巨大。如图 2 所示，编译器需要在多种防御机制（如栈金丝雀、_FORTIFY_SOURCE、IBT、CFI 等）与多套 ISA（如 x86-64、AArch64、RISC-V、LoongArch 等）构成的二维空间中维护安全契约。每个格点对应独立的中端 pass 或后端模板，任何细节都可能影响机制是否生效。已确认的同源遗漏并不少见：与 CVE-2023-4039 同源的 PR-96191[5] 在 2020 年修复时仅覆盖部分架构，未触及多个 fallback 后端，导致同一失效在其他架构上静默存续多年。本课题在初步实验中已向 GCC 上游确认了多例此类同源失效[6-9]（见第五章）。</w:t>
+            </w:r>
+          </w:p>
+          <w:p>
+            <w:pPr>
+              <w:pStyle w:val="Normal"/>
+              <w:spacing w:lineRule="auto" w:line="360"/>
+              <w:jc w:val="center"/>
+            </w:pPr>
+            <w:r>
+              <w:rPr/>
               <w:drawing>
-                <wp:inline distT="0" distB="0" distL="0" distR="0">
-                  <wp:extent cx="5385435" cy="2709545"/>
+                <wp:inline xmlns:wp="http://schemas.openxmlformats.org/drawingml/2006/wordprocessingDrawing" distT="0" distB="0" distL="0" distR="0">
+                  <wp:extent cx="5385714" cy="2709687"/>
                   <wp:effectExtent l="0" t="0" r="0" b="0"/>
                   <wp:docPr id="22" name="Figure22"/>
                   <wp:cNvGraphicFramePr>
@@ -2792,13 +2631,11 @@
                     <a:graphicData uri="http://schemas.openxmlformats.org/drawingml/2006/picture">
                       <pic:pic xmlns:pic="http://schemas.openxmlformats.org/drawingml/2006/picture">
                         <pic:nvPicPr>
-                          <pic:cNvPr id="22" name="Figure22"/>
-                          <pic:cNvPicPr>
-                            <a:picLocks noChangeAspect="1"/>
-                          </pic:cNvPicPr>
+                          <pic:cNvPr id="22" name="defense-matrix.png"/>
+                          <pic:cNvPicPr/>
                         </pic:nvPicPr>
                         <pic:blipFill>
-                          <a:blip r:embed="rId7"/>
+                          <a:blip xmlns:r="http://schemas.openxmlformats.org/officeDocument/2006/relationships" r:embed="rId22"/>
                           <a:stretch>
                             <a:fillRect/>
                           </a:stretch>
@@ -2821,7 +2658,8 @@
           </w:p>
           <w:p>
             <w:pPr>
-              <w:spacing w:line="360" w:lineRule="auto"/>
+              <w:pStyle w:val="Normal"/>
+              <w:spacing w:lineRule="auto" w:line="360"/>
               <w:jc w:val="center"/>
               <w:rPr>
                 <w:rFonts w:ascii="宋体" w:hAnsi="宋体" w:eastAsia="宋体"/>
@@ -2842,49 +2680,53 @@
           </w:p>
           <w:p>
             <w:pPr>
-              <w:spacing w:line="360" w:lineRule="auto"/>
-              <w:rPr>
-                <w:sz w:val="24"/>
-              </w:rPr>
-            </w:pPr>
-          </w:p>
-          <w:p>
-            <w:pPr>
-              <w:spacing w:line="360" w:lineRule="auto"/>
-              <w:ind w:left="0" w:leftChars="0" w:right="0" w:rightChars="0" w:firstLineChars="200"/>
-              <w:rPr>
-                <w:kern w:val="0"/>
-                <w:sz w:val="24"/>
-              </w:rPr>
-            </w:pPr>
-            <w:r>
-              <w:rPr>
-                <w:kern w:val="0"/>
-                <w:sz w:val="24"/>
-              </w:rPr>
-              <w:t>第二是失效难以判定。即使测试推进到相关代码路径，"防御契约是否满足"也很难直接观察：程序不崩溃，多编译器输出一致，看似正常而契约已失守。本课题将防御机制运行期必须成立的静态或动态性质统称为安全不变量（safety invariant，即"安全规则"，如金丝雀必须位于易受攻击栈对象与返回地址之间）。破坏这些性质即发生静默失效。已有自动化手段对此不敏感：基于崩溃或差分输出的工具（如 Csmith、YARPGen）无法触发异常；覆盖率引导的模糊测试（fuzzing）也因缺乏相应的预言机（oracle）而无法判别每一格点的安全状态。</w:t>
-            </w:r>
-          </w:p>
-          <w:p>
-            <w:pPr>
-              <w:spacing w:line="360" w:lineRule="auto"/>
-              <w:ind w:left="0" w:leftChars="0" w:right="0" w:rightChars="0" w:firstLineChars="200"/>
-              <w:rPr>
-                <w:kern w:val="0"/>
-                <w:sz w:val="24"/>
-              </w:rPr>
-            </w:pPr>
-            <w:r>
-              <w:rPr>
-                <w:kern w:val="0"/>
-                <w:sz w:val="24"/>
-              </w:rPr>
-              <w:t>同时，巨大的搜索空间也给 fuzzing 自身的覆盖效率带来了考验。本课题对此的应对思路是把推进目标显式限定在"防御机制相关代码"，让覆盖率反馈与大语言模型驱动的种子变异共同约束搜索方向，详见第三、四章。</w:t>
-            </w:r>
-          </w:p>
-          <w:p>
-            <w:pPr>
-              <w:spacing w:line="360" w:lineRule="auto"/>
+              <w:pStyle w:val="Normal"/>
+              <w:spacing w:lineRule="auto" w:line="360"/>
+              <w:rPr>
+                <w:sz w:val="24"/>
+              </w:rPr>
+            </w:pPr>
+          </w:p>
+          <w:p>
+            <w:pPr>
+              <w:pStyle w:val="Normal"/>
+              <w:spacing w:lineRule="auto" w:line="360"/>
+              <w:ind w:firstLineChars="200" w:startChars="0" w:start="0" w:endChars="0" w:end="0"/>
+              <w:rPr>
+                <w:kern w:val="0"/>
+                <w:sz w:val="24"/>
+              </w:rPr>
+            </w:pPr>
+            <w:r>
+              <w:rPr>
+                <w:kern w:val="0"/>
+                <w:sz w:val="24"/>
+              </w:rPr>
+              <w:t xml:space="preserve">第二是失效难以判定。即使测试推进到相关代码路径，"防御契约是否满足"也很难直接观察：程序不崩溃，多编译器输出一致，看似正常而契约已失守。本课题将防御机制运行期必须成立的静态或动态性质统称为安全不变量（safety invariant，即"安全规则"，如金丝雀必须位于易受攻击栈对象与返回地址之间）。破坏这些性质即发生静默失效。已有自动化手段对此不敏感：基于崩溃或差分输出的工具（如 Csmith、YARPGen）无法触发异常；覆盖率引导的模糊测试（fuzzing）也因缺乏相应的预言机（oracle）而无法判别每一格点的安全状态。</w:t>
+            </w:r>
+          </w:p>
+          <w:p>
+            <w:pPr>
+              <w:pStyle w:val="Normal"/>
+              <w:spacing w:lineRule="auto" w:line="360"/>
+              <w:ind w:firstLineChars="200" w:startChars="0" w:start="0" w:endChars="0" w:end="0"/>
+              <w:rPr>
+                <w:kern w:val="0"/>
+                <w:sz w:val="24"/>
+              </w:rPr>
+            </w:pPr>
+            <w:r>
+              <w:rPr>
+                <w:kern w:val="0"/>
+                <w:sz w:val="24"/>
+              </w:rPr>
+              <w:t xml:space="preserve">同时，巨大的搜索空间也给 fuzzing 自身的覆盖效率带来了考验。本课题对此的应对思路是把推进目标显式限定在"防御机制相关代码"，让覆盖率反馈与大语言模型驱动的种子变异共同约束搜索方向，详见第三、四章。</w:t>
+            </w:r>
+          </w:p>
+          <w:p>
+            <w:pPr>
+              <w:pStyle w:val="Normal"/>
+              <w:spacing w:lineRule="auto" w:line="360"/>
               <w:rPr>
                 <w:b/>
                 <w:bCs/>
@@ -2904,33 +2746,36 @@
           </w:p>
           <w:p>
             <w:pPr>
-              <w:spacing w:line="360" w:lineRule="auto"/>
-              <w:ind w:left="0" w:leftChars="0" w:right="0" w:rightChars="0" w:firstLineChars="200"/>
-              <w:rPr>
-                <w:kern w:val="0"/>
-                <w:sz w:val="24"/>
-              </w:rPr>
-            </w:pPr>
-            <w:r>
-              <w:rPr>
-                <w:kern w:val="0"/>
-                <w:sz w:val="24"/>
-              </w:rPr>
-              <w:t>编译器是绝大多数软件防御机制的实际载体，其在"防御机制 × ISA"二维矩阵上的静默失效会直接削弱整个软件生态的运行时安全保障。然而，现有自动化测试方法既未把搜索空间约束到防御机制相关代码，也未把安全不变量纳入判定体系。如果能把矩阵格点上的安全不变量翻译为可机器判定的检查器，并主动引导编译器走到相应代码路径，就既可暴露既有缺陷家族的同类变种，也有望在后续优化引入同类回归时及早发现。基于此，本研究结合大语言模型的代码理解能力与覆盖率反馈，构建面向编译器防御机制脆弱性的分析方法。</w:t>
-            </w:r>
-          </w:p>
-          <w:p>
-            <w:pPr>
-              <w:spacing w:line="360" w:lineRule="auto"/>
-              <w:rPr>
-                <w:sz w:val="24"/>
-              </w:rPr>
-            </w:pPr>
-          </w:p>
-          <w:p>
-            <w:pPr>
+              <w:pStyle w:val="Normal"/>
+              <w:spacing w:lineRule="auto" w:line="360"/>
+              <w:ind w:firstLineChars="200" w:startChars="0" w:start="0" w:endChars="0" w:end="0"/>
+              <w:rPr>
+                <w:kern w:val="0"/>
+                <w:sz w:val="24"/>
+              </w:rPr>
+            </w:pPr>
+            <w:r>
+              <w:rPr>
+                <w:kern w:val="0"/>
+                <w:sz w:val="24"/>
+              </w:rPr>
+              <w:t xml:space="preserve">编译器是绝大多数软件防御机制的实际载体，其在"防御机制 × ISA"二维矩阵上的静默失效会直接削弱整个软件生态的运行时安全保障。然而，现有自动化测试方法既未把搜索空间约束到防御机制相关代码，也未把安全不变量纳入判定体系。如果能把矩阵格点上的安全不变量翻译为可机器判定的检查器，并主动引导编译器走到相应代码路径，就既可暴露既有缺陷家族的同类变种，也有望在后续优化引入同类回归时及早发现。基于此，本研究结合大语言模型的代码理解能力与覆盖率反馈，构建面向编译器防御机制脆弱性的分析方法。</w:t>
+            </w:r>
+          </w:p>
+          <w:p>
+            <w:pPr>
+              <w:pStyle w:val="Normal"/>
+              <w:spacing w:lineRule="auto" w:line="360"/>
+              <w:rPr>
+                <w:sz w:val="24"/>
+              </w:rPr>
+            </w:pPr>
+          </w:p>
+          <w:p>
+            <w:pPr>
+              <w:pStyle w:val="Normal"/>
               <w:widowControl/>
-              <w:jc w:val="left"/>
+              <w:jc w:val="start"/>
               <w:rPr>
                 <w:b/>
                 <w:bCs/>
@@ -2950,7 +2795,8 @@
           </w:p>
           <w:p>
             <w:pPr>
-              <w:spacing w:line="360" w:lineRule="auto"/>
+              <w:pStyle w:val="Normal"/>
+              <w:spacing w:lineRule="auto" w:line="360"/>
               <w:rPr>
                 <w:b/>
                 <w:bCs/>
@@ -2965,46 +2811,49 @@
                 <w:kern w:val="0"/>
                 <w:sz w:val="24"/>
               </w:rPr>
-              <w:t>2.1 综述与分类逻辑</w:t>
-            </w:r>
-          </w:p>
-          <w:p>
-            <w:pPr>
-              <w:spacing w:line="360" w:lineRule="auto"/>
-              <w:ind w:left="0" w:leftChars="0" w:right="0" w:rightChars="0" w:firstLineChars="200"/>
-              <w:rPr>
-                <w:kern w:val="0"/>
-                <w:sz w:val="24"/>
-              </w:rPr>
-            </w:pPr>
-            <w:r>
-              <w:rPr>
-                <w:kern w:val="0"/>
-                <w:sz w:val="24"/>
-              </w:rPr>
-              <w:t>要在编译器中系统性地暴露此类静默失效，面临两个挑战：搜索空间巨大、失效难以判定。围绕这两条挑战梳理现有方法可以发现，此前的工作或针对其中之一做出推进，或停留在与编译器自身防御机制弱相关的常规缺陷上，目前尚未出现同时直面两条挑战的成熟方案。下文按这两个维度组织文献，并讨论各自的覆盖范围与遗留空白。</w:t>
-            </w:r>
-          </w:p>
-          <w:p>
-            <w:pPr>
-              <w:spacing w:line="360" w:lineRule="auto"/>
-              <w:ind w:left="0" w:leftChars="0" w:right="0" w:rightChars="0" w:firstLineChars="200"/>
-              <w:rPr>
-                <w:kern w:val="0"/>
-                <w:sz w:val="24"/>
-              </w:rPr>
-            </w:pPr>
-            <w:r>
-              <w:rPr>
-                <w:kern w:val="0"/>
-                <w:sz w:val="24"/>
-              </w:rPr>
-              <w:t>需要指出的是，模糊测试（fuzzing）并非解决该问题的唯一路径。静态分析、形式化验证、人工审计在原则上也可以参与判定一条防御机制是否在某 ISA 上仍维持其安全契约。然而，受限于安全契约本身缺乏统一的可形式化描述，以及防御机制实现散落在编译器中端 pass 与若干后端模板中的工程现实，目前与覆盖率证据耦合最紧、最容易把搜索空间显式收敛到目标代码区域的方案仍然是覆盖率引导的模糊测试。本章对相关工作的取舍即基于此判断。</w:t>
-            </w:r>
-          </w:p>
-          <w:p>
-            <w:pPr>
-              <w:spacing w:line="360" w:lineRule="auto"/>
+              <w:t>2.1 文献分类思路</w:t>
+            </w:r>
+          </w:p>
+          <w:p>
+            <w:pPr>
+              <w:pStyle w:val="Normal"/>
+              <w:spacing w:lineRule="auto" w:line="360"/>
+              <w:ind w:firstLineChars="200" w:startChars="0" w:start="0" w:endChars="0" w:end="0"/>
+              <w:rPr>
+                <w:kern w:val="0"/>
+                <w:sz w:val="24"/>
+              </w:rPr>
+            </w:pPr>
+            <w:r>
+              <w:rPr>
+                <w:kern w:val="0"/>
+                <w:sz w:val="24"/>
+              </w:rPr>
+              <w:t xml:space="preserve">要在编译器中系统性地暴露此类静默失效，面临两个挑战：搜索空间巨大、失效难以判定。围绕这两条挑战梳理现有方法可以发现，此前的工作或针对其中之一做出推进，或停留在与编译器自身防御机制弱相关的常规缺陷上，目前尚未出现同时直面两条挑战的成熟方案。下文按这两个维度组织文献，并讨论各自的覆盖范围与遗留空白。</w:t>
+            </w:r>
+          </w:p>
+          <w:p>
+            <w:pPr>
+              <w:pStyle w:val="Normal"/>
+              <w:spacing w:lineRule="auto" w:line="360"/>
+              <w:ind w:firstLineChars="200" w:startChars="0" w:start="0" w:endChars="0" w:end="0"/>
+              <w:rPr>
+                <w:kern w:val="0"/>
+                <w:sz w:val="24"/>
+              </w:rPr>
+            </w:pPr>
+            <w:r>
+              <w:rPr>
+                <w:kern w:val="0"/>
+                <w:sz w:val="24"/>
+              </w:rPr>
+              <w:t xml:space="preserve">需要指出的是，模糊测试（fuzzing）并非解决该问题的唯一路径。静态分析、形式化验证、人工审计在原则上也可以参与判定一条防御机制是否在某 ISA 上仍维持其安全契约。然而，受限于安全契约本身缺乏统一的可形式化描述，以及防御机制实现散落在编译器中端 pass 与若干后端模板中的工程现实，目前与覆盖率证据耦合最紧、最容易把搜索空间显式收敛到目标代码区域的方案仍然是覆盖率引导的模糊测试。本章对相关工作的取舍即基于此判断。</w:t>
+            </w:r>
+          </w:p>
+          <w:p>
+            <w:pPr>
+              <w:pStyle w:val="Normal"/>
+              <w:spacing w:lineRule="auto" w:line="360"/>
               <w:rPr>
                 <w:b/>
                 <w:bCs/>
@@ -3019,130 +2868,121 @@
                 <w:kern w:val="0"/>
                 <w:sz w:val="24"/>
               </w:rPr>
-              <w:t>2.2 应对搜索空间挑战的现有工作</w:t>
-            </w:r>
-          </w:p>
-          <w:p>
-            <w:pPr>
-              <w:spacing w:line="360" w:lineRule="auto"/>
-              <w:ind w:left="0" w:leftChars="0" w:right="0" w:rightChars="0" w:firstLineChars="200"/>
-              <w:rPr>
-                <w:kern w:val="0"/>
-                <w:sz w:val="24"/>
-              </w:rPr>
-            </w:pPr>
-            <w:r>
-              <w:rPr>
-                <w:kern w:val="0"/>
-                <w:sz w:val="24"/>
-              </w:rPr>
-              <w:t>针对"如何把测试输入有目标地推到防御机制相关代码"的问题，现有方法大致可划分为四类。</w:t>
-            </w:r>
-          </w:p>
-          <w:p>
-            <w:pPr>
-              <w:spacing w:line="360" w:lineRule="auto"/>
-              <w:ind w:left="0" w:leftChars="0" w:right="0" w:rightChars="0" w:firstLineChars="200"/>
-              <w:rPr>
-                <w:kern w:val="0"/>
-                <w:sz w:val="24"/>
-              </w:rPr>
-            </w:pPr>
-            <w:r>
-              <w:rPr>
-                <w:kern w:val="0"/>
-                <w:sz w:val="24"/>
-              </w:rPr>
-              <w:t>随机生成与文法生成。Csmith[1] 与 YARPGen[2] 基于概率文法从空白合成不含未定义行为的 C 程序，再以差分输出驱动测试。这类方法对编译器整体覆盖良好，但生成过程不带任何防御机制的语义偏好，实测中很难自然落到栈金丝雀、IBT 等机制相关的代码路径上。</w:t>
-            </w:r>
-          </w:p>
-          <w:p>
-            <w:pPr>
-              <w:spacing w:line="360" w:lineRule="auto"/>
-              <w:ind w:left="0" w:leftChars="0" w:right="0" w:rightChars="0" w:firstLineChars="200"/>
-              <w:rPr>
-                <w:kern w:val="0"/>
-                <w:sz w:val="24"/>
-              </w:rPr>
-            </w:pPr>
-            <w:r>
-              <w:rPr>
-                <w:kern w:val="0"/>
-                <w:sz w:val="24"/>
-              </w:rPr>
-              <w:t>字节级覆盖率引导。AFL[3]、libFuzzer[4] 等以字节级覆盖率反馈为导向的工具被广泛用于编译器解析与优化组件。它们能感知"是否走入新代码"，但对生成程序的语法语义合法性约束有限，且覆盖率信号无差别对待所有代码区域，无法天然把推进目标限定到防御机制相关代码。</w:t>
-            </w:r>
-          </w:p>
-          <w:p>
-            <w:pPr>
-              <w:spacing w:line="360" w:lineRule="auto"/>
-              <w:ind w:left="0" w:leftChars="0" w:right="0" w:rightChars="0" w:firstLineChars="200"/>
-              <w:rPr>
-                <w:kern w:val="0"/>
-                <w:sz w:val="24"/>
-              </w:rPr>
-            </w:pPr>
-            <w:r>
-              <w:rPr>
-                <w:kern w:val="0"/>
-                <w:sz w:val="24"/>
-              </w:rPr>
-              <w:t>源码级语义保持变异。GrayC[14] 将覆盖率引导与一组保持语义合法性的源码级变异结合，在覆盖率推进与缺陷发现率上优于纯生成式工具；EMI 系列[11] 在种子的未执行区域做语义保持变换，可视作变异与变形预言机的组合。这类方法具备较强的工程实用性，但变异规则由人工定义，</w:t>
-            </w:r>
-            <w:r>
-              <w:rPr>
-                <w:rFonts w:hint="eastAsia"/>
-                <w:kern w:val="0"/>
-                <w:sz w:val="24"/>
-                <w:lang w:eastAsia="zh-CN"/>
-              </w:rPr>
-              <w:t>没有</w:t>
-            </w:r>
-            <w:r>
-              <w:rPr>
-                <w:kern w:val="0"/>
-                <w:sz w:val="24"/>
-              </w:rPr>
-              <w:t>利用目标代码自身的语义信息引导方向。</w:t>
-            </w:r>
-          </w:p>
-          <w:p>
-            <w:pPr>
-              <w:spacing w:line="360" w:lineRule="auto"/>
-              <w:ind w:left="0" w:leftChars="0" w:right="0" w:rightChars="0" w:firstLineChars="200"/>
-              <w:rPr>
-                <w:kern w:val="0"/>
-                <w:sz w:val="24"/>
-              </w:rPr>
-            </w:pPr>
-            <w:r>
-              <w:rPr>
-                <w:kern w:val="0"/>
-                <w:sz w:val="24"/>
-              </w:rPr>
-              <w:t>大语言模型驱动的变异。WhiteFox[5] 从优化 pass 源码出发，利用大模型归纳输入模式并生成测试用例，使种子生成具备对编译器内部逻辑的感知；HLPFuzz[15] 进一步将大模型与覆盖率反馈耦合，将未覆盖基本块翻译为约束求解任务交由大模型完成。这表明大模型可作为语义感知的变异引擎，但目前工作定义的目标仍是常规可达性（"走到某处代码"），并不关心目标路径所承担的安全契约。</w:t>
-            </w:r>
-          </w:p>
-          <w:p>
-            <w:pPr>
-              <w:spacing w:line="360" w:lineRule="auto"/>
-              <w:ind w:left="0" w:leftChars="0" w:right="0" w:rightChars="0" w:firstLineChars="200"/>
-              <w:rPr>
-                <w:kern w:val="0"/>
-                <w:sz w:val="24"/>
-              </w:rPr>
-            </w:pPr>
-            <w:r>
-              <w:rPr>
-                <w:kern w:val="0"/>
-                <w:sz w:val="24"/>
-              </w:rPr>
-              <w:t>综合来看，现有方法在搜索空间一侧已积累了较成熟的覆盖率推进手段，若能把"防御机制相关性"作为目标基本块挑选的额外维度并复用大语言模型的代码理解能力，就有望显著提高在防御机制 × ISA 矩阵中的有效采样密度。</w:t>
-            </w:r>
-          </w:p>
-          <w:p>
-            <w:pPr>
-              <w:spacing w:line="360" w:lineRule="auto"/>
+              <w:t>2.2 面向搜索空间的现有工作</w:t>
+            </w:r>
+          </w:p>
+          <w:p>
+            <w:pPr>
+              <w:pStyle w:val="Normal"/>
+              <w:spacing w:lineRule="auto" w:line="360"/>
+              <w:ind w:firstLineChars="200" w:startChars="0" w:start="0" w:endChars="0" w:end="0"/>
+              <w:rPr>
+                <w:kern w:val="0"/>
+                <w:sz w:val="24"/>
+              </w:rPr>
+            </w:pPr>
+            <w:r>
+              <w:rPr>
+                <w:kern w:val="0"/>
+                <w:sz w:val="24"/>
+              </w:rPr>
+              <w:t xml:space="preserve">针对"如何把测试输入有目标地推到防御机制相关代码"的问题，现有方法大致可划分为四类。</w:t>
+            </w:r>
+          </w:p>
+          <w:p>
+            <w:pPr>
+              <w:pStyle w:val="Normal"/>
+              <w:spacing w:lineRule="auto" w:line="360"/>
+              <w:ind w:firstLineChars="200" w:startChars="0" w:start="0" w:endChars="0" w:end="0"/>
+              <w:rPr>
+                <w:kern w:val="0"/>
+                <w:sz w:val="24"/>
+              </w:rPr>
+            </w:pPr>
+            <w:r>
+              <w:rPr>
+                <w:kern w:val="0"/>
+                <w:sz w:val="24"/>
+              </w:rPr>
+              <w:t xml:space="preserve">随机生成与文法生成。Csmith[10] 与 YARPGen[11] 基于概率文法从空白合成不含未定义行为的 C 程序，再以差分输出驱动测试。这类方法对编译器整体覆盖良好，但生成过程不带任何防御机制的语义偏好，实测中很难自然落到栈金丝雀、IBT 等机制相关的代码路径上。</w:t>
+            </w:r>
+          </w:p>
+          <w:p>
+            <w:pPr>
+              <w:pStyle w:val="Normal"/>
+              <w:spacing w:lineRule="auto" w:line="360"/>
+              <w:ind w:firstLineChars="200" w:startChars="0" w:start="0" w:endChars="0" w:end="0"/>
+              <w:rPr>
+                <w:kern w:val="0"/>
+                <w:sz w:val="24"/>
+              </w:rPr>
+            </w:pPr>
+            <w:r>
+              <w:rPr>
+                <w:kern w:val="0"/>
+                <w:sz w:val="24"/>
+              </w:rPr>
+              <w:t xml:space="preserve">字节级覆盖率引导。AFL[12]、libFuzzer[13] 等以字节级覆盖率反馈为导向的工具被广泛用于编译器解析与优化组件。它们能感知"是否走入新代码"，但对生成程序的语法语义合法性约束有限，且覆盖率信号无差别对待所有代码区域，无法天然把推进目标限定到防御机制相关代码。</w:t>
+            </w:r>
+          </w:p>
+          <w:p>
+            <w:pPr>
+              <w:pStyle w:val="Normal"/>
+              <w:spacing w:lineRule="auto" w:line="360"/>
+              <w:ind w:firstLineChars="200" w:startChars="0" w:start="0" w:endChars="0" w:end="0"/>
+              <w:rPr>
+                <w:kern w:val="0"/>
+                <w:sz w:val="24"/>
+              </w:rPr>
+            </w:pPr>
+            <w:r>
+              <w:rPr>
+                <w:kern w:val="0"/>
+                <w:sz w:val="24"/>
+              </w:rPr>
+              <w:t xml:space="preserve">源码级语义保持变异。GrayC[14] 将覆盖率引导与一组保持语义合法性的源码级变异结合，在覆盖率推进与缺陷发现率上优于纯生成式工具；EMI 系列[15] 在种子的未执行区域做语义保持变换，可视作变异与变形预言机的组合。这类方法具备较强的工程实用性，但变异规则由人工定义，没有利用目标代码自身的语义信息引导方向。</w:t>
+            </w:r>
+          </w:p>
+          <w:p>
+            <w:pPr>
+              <w:pStyle w:val="Normal"/>
+              <w:spacing w:lineRule="auto" w:line="360"/>
+              <w:ind w:firstLineChars="200" w:startChars="0" w:start="0" w:endChars="0" w:end="0"/>
+              <w:rPr>
+                <w:kern w:val="0"/>
+                <w:sz w:val="24"/>
+              </w:rPr>
+            </w:pPr>
+            <w:r>
+              <w:rPr>
+                <w:kern w:val="0"/>
+                <w:sz w:val="24"/>
+              </w:rPr>
+              <w:t xml:space="preserve">大语言模型驱动的变异。WhiteFox[16] 从优化 pass 源码出发，利用大模型归纳输入模式并生成测试用例，使种子生成具备对编译器内部逻辑的感知；HLPFuzz[17] 进一步将大模型与覆盖率反馈耦合，将未覆盖基本块翻译为约束求解任务交由大模型完成。这表明大模型可作为语义感知的变异引擎，但目前工作定义的目标仍是常规可达性（"走到某处代码"），并不关心目标路径所承担的安全契约。</w:t>
+            </w:r>
+          </w:p>
+          <w:p>
+            <w:pPr>
+              <w:pStyle w:val="Normal"/>
+              <w:spacing w:lineRule="auto" w:line="360"/>
+              <w:ind w:firstLineChars="200" w:startChars="0" w:start="0" w:endChars="0" w:end="0"/>
+              <w:rPr>
+                <w:kern w:val="0"/>
+                <w:sz w:val="24"/>
+              </w:rPr>
+            </w:pPr>
+            <w:r>
+              <w:rPr>
+                <w:kern w:val="0"/>
+                <w:sz w:val="24"/>
+              </w:rPr>
+              <w:t xml:space="preserve">综合来看，现有方法在搜索空间一侧已积累了较成熟的覆盖率推进手段，若能把"防御机制相关性"作为目标基本块挑选的额外维度并复用大语言模型的代码理解能力，就有望显著提高在防御机制 × ISA 矩阵中的有效采样密度。</w:t>
+            </w:r>
+          </w:p>
+          <w:p>
+            <w:pPr>
+              <w:pStyle w:val="Normal"/>
+              <w:spacing w:lineRule="auto" w:line="360"/>
               <w:rPr>
                 <w:b/>
                 <w:bCs/>
@@ -3157,114 +2997,121 @@
                 <w:kern w:val="0"/>
                 <w:sz w:val="24"/>
               </w:rPr>
-              <w:t>2.3 应对失效判定挑战的现有工作</w:t>
-            </w:r>
-          </w:p>
-          <w:p>
-            <w:pPr>
-              <w:spacing w:line="360" w:lineRule="auto"/>
-              <w:ind w:left="0" w:leftChars="0" w:right="0" w:rightChars="0" w:firstLineChars="200"/>
-              <w:rPr>
-                <w:kern w:val="0"/>
-                <w:sz w:val="24"/>
-              </w:rPr>
-            </w:pPr>
-            <w:r>
-              <w:rPr>
-                <w:kern w:val="0"/>
-                <w:sz w:val="24"/>
-              </w:rPr>
-              <w:t>针对"如何判断一颗成功编译并运行的二进制是否仍满足防御机制安全契约"，现有预言机大致分为四类。</w:t>
-            </w:r>
-          </w:p>
-          <w:p>
-            <w:pPr>
-              <w:spacing w:line="360" w:lineRule="auto"/>
-              <w:ind w:left="0" w:leftChars="0" w:right="0" w:rightChars="0" w:firstLineChars="200"/>
-              <w:rPr>
-                <w:kern w:val="0"/>
-                <w:sz w:val="24"/>
-              </w:rPr>
-            </w:pPr>
-            <w:r>
-              <w:rPr>
-                <w:kern w:val="0"/>
-                <w:sz w:val="24"/>
-              </w:rPr>
-              <w:t>崩溃预言机[1,3,4] 以编译期或运行期的崩溃（ICE、断言、segfault、超时）为信号，是 AFL、libFuzzer 迁移到编译器后的默认选择。但静默失效的产物在编译期与运行期均不会崩溃，该类预言机本质上对其不可见。</w:t>
-            </w:r>
-          </w:p>
-          <w:p>
-            <w:pPr>
-              <w:spacing w:line="360" w:lineRule="auto"/>
-              <w:ind w:left="0" w:leftChars="0" w:right="0" w:rightChars="0" w:firstLineChars="200"/>
-              <w:rPr>
-                <w:kern w:val="0"/>
-                <w:sz w:val="24"/>
-              </w:rPr>
-            </w:pPr>
-            <w:r>
-              <w:rPr>
-                <w:kern w:val="0"/>
-                <w:sz w:val="24"/>
-              </w:rPr>
-              <w:t>差分预言机[1,2] 对若干编译器或同一编译器不同优化等级就同一程序的运行结果做交叉比对，差异即为 mis-compile。然而，静默失效的二进制功能行为与正常产物一致，不同编译器之间也保持一致输出，因此不会产生可观察的差异。</w:t>
-            </w:r>
-          </w:p>
-          <w:p>
-            <w:pPr>
-              <w:spacing w:line="360" w:lineRule="auto"/>
-              <w:ind w:left="0" w:leftChars="0" w:right="0" w:rightChars="0" w:firstLineChars="200"/>
-              <w:rPr>
-                <w:kern w:val="0"/>
-                <w:sz w:val="24"/>
-              </w:rPr>
-            </w:pPr>
-            <w:r>
-              <w:rPr>
-                <w:kern w:val="0"/>
-                <w:sz w:val="24"/>
-              </w:rPr>
-              <w:t>变形预言机以 Le 等提出的 EMI[11] 为代表，对同一输入下未执行的代码做删改，新程序应产生相同结果，差异即为 mis-compile。该类预言机围绕"语义保持"组织判据，仍然在功能输出层面观察，无法触及运行期防御契约。</w:t>
-            </w:r>
-          </w:p>
-          <w:p>
-            <w:pPr>
-              <w:spacing w:line="360" w:lineRule="auto"/>
-              <w:ind w:left="0" w:leftChars="0" w:right="0" w:rightChars="0" w:firstLineChars="200"/>
-              <w:rPr>
-                <w:kern w:val="0"/>
-                <w:sz w:val="24"/>
-              </w:rPr>
-            </w:pPr>
-            <w:r>
-              <w:rPr>
-                <w:kern w:val="0"/>
-                <w:sz w:val="24"/>
-              </w:rPr>
-              <w:t>Sanitizer 预言机借助 ASan 等工具将内存破坏转为显式信号；UBfuzz[12] 进一步用反向定位来测试 sanitizer 自身实现缺陷。Sanitizer 关心程序自身的内存安全，其覆盖范围与"内置防御机制是否生效"不重叠。复合预言机如 HirGen[13] 虽在 IR 层结合差分与变形，但同样不针对编译器的防御机制。</w:t>
-            </w:r>
-          </w:p>
-          <w:p>
-            <w:pPr>
-              <w:spacing w:line="360" w:lineRule="auto"/>
-              <w:ind w:left="0" w:leftChars="0" w:right="0" w:rightChars="0" w:firstLineChars="200"/>
-              <w:rPr>
-                <w:kern w:val="0"/>
-                <w:sz w:val="24"/>
-              </w:rPr>
-            </w:pPr>
-            <w:r>
-              <w:rPr>
-                <w:kern w:val="0"/>
-                <w:sz w:val="24"/>
-              </w:rPr>
-              <w:t>可以看到，现有预言机的判据全部建立在"崩溃"或"可观察输出差异"之上。当缺陷的形态是"代码正常编译运行、运行时保护已被静默削弱"时，它们均无法触发。这正是第一章所述判定空白的来源。</w:t>
-            </w:r>
-          </w:p>
-          <w:p>
-            <w:pPr>
-              <w:spacing w:line="360" w:lineRule="auto"/>
+              <w:t>2.3 面向失效判定的现有工作</w:t>
+            </w:r>
+          </w:p>
+          <w:p>
+            <w:pPr>
+              <w:pStyle w:val="Normal"/>
+              <w:spacing w:lineRule="auto" w:line="360"/>
+              <w:ind w:firstLineChars="200" w:startChars="0" w:start="0" w:endChars="0" w:end="0"/>
+              <w:rPr>
+                <w:kern w:val="0"/>
+                <w:sz w:val="24"/>
+              </w:rPr>
+            </w:pPr>
+            <w:r>
+              <w:rPr>
+                <w:kern w:val="0"/>
+                <w:sz w:val="24"/>
+              </w:rPr>
+              <w:t xml:space="preserve">针对"如何判断一颗成功编译并运行的二进制是否仍满足防御机制安全契约"，现有预言机大致分为四类。</w:t>
+            </w:r>
+          </w:p>
+          <w:p>
+            <w:pPr>
+              <w:pStyle w:val="Normal"/>
+              <w:spacing w:lineRule="auto" w:line="360"/>
+              <w:ind w:firstLineChars="200" w:startChars="0" w:start="0" w:endChars="0" w:end="0"/>
+              <w:rPr>
+                <w:kern w:val="0"/>
+                <w:sz w:val="24"/>
+              </w:rPr>
+            </w:pPr>
+            <w:r>
+              <w:rPr>
+                <w:kern w:val="0"/>
+                <w:sz w:val="24"/>
+              </w:rPr>
+              <w:t xml:space="preserve">崩溃预言机[10,12,13] 以编译期或运行期的崩溃（ICE、断言、segfault、超时）为信号，是 AFL、libFuzzer 迁移到编译器后的默认选择。但静默失效的产物在编译期与运行期均不会崩溃，该类预言机本质上对其不可见。</w:t>
+            </w:r>
+          </w:p>
+          <w:p>
+            <w:pPr>
+              <w:pStyle w:val="Normal"/>
+              <w:spacing w:lineRule="auto" w:line="360"/>
+              <w:ind w:firstLineChars="200" w:startChars="0" w:start="0" w:endChars="0" w:end="0"/>
+              <w:rPr>
+                <w:kern w:val="0"/>
+                <w:sz w:val="24"/>
+              </w:rPr>
+            </w:pPr>
+            <w:r>
+              <w:rPr>
+                <w:kern w:val="0"/>
+                <w:sz w:val="24"/>
+              </w:rPr>
+              <w:t xml:space="preserve">差分预言机[10,11] 对若干编译器或同一编译器不同优化等级就同一程序的运行结果做交叉比对，差异即为 mis-compile。然而，静默失效的二进制功能行为与正常产物一致，不同编译器之间也保持一致输出，因此不会产生可观察的差异。</w:t>
+            </w:r>
+          </w:p>
+          <w:p>
+            <w:pPr>
+              <w:pStyle w:val="Normal"/>
+              <w:spacing w:lineRule="auto" w:line="360"/>
+              <w:ind w:firstLineChars="200" w:startChars="0" w:start="0" w:endChars="0" w:end="0"/>
+              <w:rPr>
+                <w:kern w:val="0"/>
+                <w:sz w:val="24"/>
+              </w:rPr>
+            </w:pPr>
+            <w:r>
+              <w:rPr>
+                <w:kern w:val="0"/>
+                <w:sz w:val="24"/>
+              </w:rPr>
+              <w:t xml:space="preserve">变形预言机以 Le 等提出的 EMI[15] 为代表，对同一输入下未执行的代码做删改，新程序应产生相同结果，差异即为 mis-compile。该类预言机围绕"语义保持"组织判据，仍然在功能输出层面观察，无法触及运行期防御契约。</w:t>
+            </w:r>
+          </w:p>
+          <w:p>
+            <w:pPr>
+              <w:pStyle w:val="Normal"/>
+              <w:spacing w:lineRule="auto" w:line="360"/>
+              <w:ind w:firstLineChars="200" w:startChars="0" w:start="0" w:endChars="0" w:end="0"/>
+              <w:rPr>
+                <w:kern w:val="0"/>
+                <w:sz w:val="24"/>
+              </w:rPr>
+            </w:pPr>
+            <w:r>
+              <w:rPr>
+                <w:kern w:val="0"/>
+                <w:sz w:val="24"/>
+              </w:rPr>
+              <w:t xml:space="preserve">Sanitizer 预言机借助 ASan 等工具将内存破坏转为显式信号；UBfuzz[18] 进一步用反向定位来测试 sanitizer 自身实现缺陷。Sanitizer 关心程序自身的内存安全，其覆盖范围与“内置防御机制是否生效”不重叠。复合预言机如 HirGen[19] 虽在 IR 层结合差分与变形，但同样不针对编译器的防御机制。</w:t>
+            </w:r>
+          </w:p>
+          <w:p>
+            <w:pPr>
+              <w:pStyle w:val="Normal"/>
+              <w:spacing w:lineRule="auto" w:line="360"/>
+              <w:ind w:firstLineChars="200" w:startChars="0" w:start="0" w:endChars="0" w:end="0"/>
+              <w:rPr>
+                <w:kern w:val="0"/>
+                <w:sz w:val="24"/>
+              </w:rPr>
+            </w:pPr>
+            <w:r>
+              <w:rPr>
+                <w:kern w:val="0"/>
+                <w:sz w:val="24"/>
+              </w:rPr>
+              <w:t xml:space="preserve">可以看到，现有预言机的判据全部建立在"崩溃"或"可观察输出差异"之上。当缺陷的形态是"代码正常编译运行、运行时保护已被静默削弱"时，它们均无法触发。这正是第一章所述判定空白的来源。</w:t>
+            </w:r>
+          </w:p>
+          <w:p>
+            <w:pPr>
+              <w:pStyle w:val="Normal"/>
+              <w:spacing w:lineRule="auto" w:line="360"/>
               <w:rPr>
                 <w:b/>
                 <w:bCs/>
@@ -3284,33 +3131,36 @@
           </w:p>
           <w:p>
             <w:pPr>
-              <w:spacing w:line="360" w:lineRule="auto"/>
-              <w:ind w:left="0" w:leftChars="0" w:right="0" w:rightChars="0" w:firstLineChars="200"/>
-              <w:rPr>
-                <w:kern w:val="0"/>
-                <w:sz w:val="24"/>
-              </w:rPr>
-            </w:pPr>
-            <w:r>
-              <w:rPr>
-                <w:kern w:val="0"/>
-                <w:sz w:val="24"/>
-              </w:rPr>
-              <w:t>本研究整合现有模糊测试技术的优势，通过提炼跨架构的安全不变量构建专用预言机，并利用大语言模型结合覆盖率反馈实现精确变异，从而系统性暴露编译器在防御机制上的静默失效漏洞。本研究在第三、四章给出对应的解法：把每条防御机制的安全不变量翻译为可机器判定的检查器以填补预言机空白；在大模型与覆盖率联合驱动的种子生成主循环中，把目标基本块选择限定在防御机制相关代码区域，使搜索空间被显式压缩到矩阵中那些尚未触达的格点附近。</w:t>
-            </w:r>
-          </w:p>
-          <w:p>
-            <w:pPr>
-              <w:spacing w:line="360" w:lineRule="auto"/>
-              <w:rPr>
-                <w:sz w:val="24"/>
-              </w:rPr>
-            </w:pPr>
-          </w:p>
-          <w:p>
-            <w:pPr>
+              <w:pStyle w:val="Normal"/>
+              <w:spacing w:lineRule="auto" w:line="360"/>
+              <w:ind w:firstLineChars="200" w:startChars="0" w:start="0" w:endChars="0" w:end="0"/>
+              <w:rPr>
+                <w:kern w:val="0"/>
+                <w:sz w:val="24"/>
+              </w:rPr>
+            </w:pPr>
+            <w:r>
+              <w:rPr>
+                <w:kern w:val="0"/>
+                <w:sz w:val="24"/>
+              </w:rPr>
+              <w:t xml:space="preserve">本研究整合现有模糊测试技术的优势，通过提炼跨架构的安全不变量构建专用预言机，并利用大语言模型结合覆盖率反馈实现精确变异，从而系统性暴露编译器在防御机制上的静默失效漏洞。本研究在第三、四章给出对应的解法：把每条防御机制的安全不变量翻译为可机器判定的检查器以填补预言机空白；在大模型与覆盖率联合驱动的种子生成主循环中，把目标基本块选择限定在防御机制相关代码区域，使搜索空间被显式压缩到矩阵中那些尚未触达的格点附近。</w:t>
+            </w:r>
+          </w:p>
+          <w:p>
+            <w:pPr>
+              <w:pStyle w:val="Normal"/>
+              <w:spacing w:lineRule="auto" w:line="360"/>
+              <w:rPr>
+                <w:sz w:val="24"/>
+              </w:rPr>
+            </w:pPr>
+          </w:p>
+          <w:p>
+            <w:pPr>
+              <w:pStyle w:val="Normal"/>
               <w:widowControl/>
-              <w:jc w:val="left"/>
+              <w:jc w:val="start"/>
               <w:rPr>
                 <w:b/>
                 <w:bCs/>
@@ -3330,7 +3180,8 @@
           </w:p>
           <w:p>
             <w:pPr>
-              <w:spacing w:line="360" w:lineRule="auto"/>
+              <w:pStyle w:val="Normal"/>
+              <w:spacing w:lineRule="auto" w:line="360"/>
               <w:rPr>
                 <w:b/>
                 <w:bCs/>
@@ -3350,92 +3201,98 @@
           </w:p>
           <w:p>
             <w:pPr>
-              <w:spacing w:line="360" w:lineRule="auto"/>
-              <w:ind w:left="0" w:leftChars="0" w:right="0" w:rightChars="0" w:firstLineChars="200"/>
-              <w:rPr>
-                <w:kern w:val="0"/>
-                <w:sz w:val="24"/>
-              </w:rPr>
-            </w:pPr>
-            <w:r>
-              <w:rPr>
-                <w:kern w:val="0"/>
-                <w:sz w:val="24"/>
-              </w:rPr>
-              <w:t>本课题要构建一种面向编译器自身防御机制的脆弱性分析方法，并在 GCC 与 LLVM 上完成端到端验证。与以崩溃或差分输出为信号的传统编译器 fuzzer 不同，本方法以"防御机制是否仍满足其安全契约"为判据，自动暴露第一章所述的静默失效。具体目标分为以下三项：</w:t>
-            </w:r>
-          </w:p>
-          <w:p>
-            <w:pPr>
-              <w:spacing w:line="360" w:lineRule="auto"/>
-              <w:ind w:left="0" w:leftChars="0" w:right="0" w:rightChars="0" w:firstLineChars="200"/>
-              <w:rPr>
-                <w:kern w:val="0"/>
-                <w:sz w:val="24"/>
-              </w:rPr>
-            </w:pPr>
-            <w:r>
-              <w:rPr>
-                <w:kern w:val="0"/>
-                <w:sz w:val="24"/>
-              </w:rPr>
-              <w:t>(a) 形成一套覆盖主流防御机制的安全不变量集合，每条不变量具备可由二进制或运行行为判定的证据形式，在 GCC 与 LLVM 上保持一致的描述结构；</w:t>
-            </w:r>
-          </w:p>
-          <w:p>
-            <w:pPr>
-              <w:spacing w:line="360" w:lineRule="auto"/>
-              <w:ind w:left="0" w:leftChars="0" w:right="0" w:rightChars="0" w:firstLineChars="200"/>
-              <w:rPr>
-                <w:kern w:val="0"/>
-                <w:sz w:val="24"/>
-              </w:rPr>
-            </w:pPr>
-            <w:r>
-              <w:rPr>
-                <w:kern w:val="0"/>
-                <w:sz w:val="24"/>
-              </w:rPr>
-              <w:t>(b) 构建一个可同时面向 GCC 与 LLVM、跨架构运行的 fuzzer 原型，以防御机制相关代码的源代码覆盖率为推进信号，由大语言模型完成种子精细变异；</w:t>
-            </w:r>
-          </w:p>
-          <w:p>
-            <w:pPr>
-              <w:spacing w:line="360" w:lineRule="auto"/>
-              <w:ind w:left="0" w:leftChars="0" w:right="0" w:rightChars="0" w:firstLineChars="200"/>
-              <w:rPr>
-                <w:kern w:val="0"/>
-                <w:sz w:val="24"/>
-              </w:rPr>
-            </w:pPr>
-            <w:r>
-              <w:rPr>
-                <w:kern w:val="0"/>
-                <w:sz w:val="24"/>
-              </w:rPr>
-              <w:t>(c) 通过该原型在 GCC 与 LLVM 上发现可被上游确认的真实缺陷，验证方法的有效性与跨编译器迁移性。</w:t>
-            </w:r>
-          </w:p>
-          <w:p>
-            <w:pPr>
-              <w:spacing w:line="360" w:lineRule="auto"/>
-              <w:ind w:left="0" w:leftChars="0" w:right="0" w:rightChars="0" w:firstLineChars="200"/>
-              <w:rPr>
-                <w:kern w:val="0"/>
-                <w:sz w:val="24"/>
-              </w:rPr>
-            </w:pPr>
-            <w:r>
-              <w:rPr>
-                <w:kern w:val="0"/>
-                <w:sz w:val="24"/>
-              </w:rPr>
-              <w:t>三个目标依次推进：(a) 提供事实基础，(b) 构建原型，(c) 完成实证验证。其依赖关系与工作内容详见 3.2 节。</w:t>
-            </w:r>
-          </w:p>
-          <w:p>
-            <w:pPr>
-              <w:spacing w:line="360" w:lineRule="auto"/>
+              <w:pStyle w:val="Normal"/>
+              <w:spacing w:lineRule="auto" w:line="360"/>
+              <w:ind w:firstLineChars="200" w:startChars="0" w:start="0" w:endChars="0" w:end="0"/>
+              <w:rPr>
+                <w:kern w:val="0"/>
+                <w:sz w:val="24"/>
+              </w:rPr>
+            </w:pPr>
+            <w:r>
+              <w:rPr>
+                <w:kern w:val="0"/>
+                <w:sz w:val="24"/>
+              </w:rPr>
+              <w:t xml:space="preserve">本课题要构建一种面向编译器自身防御机制的脆弱性分析方法，并在 GCC 与 LLVM 上完成端到端验证。与以崩溃或差分输出为信号的传统编译器 fuzzer 不同，本方法以"防御机制是否仍满足其安全契约"为判据，自动暴露第一章所述的静默失效。具体目标分为以下三项：</w:t>
+            </w:r>
+          </w:p>
+          <w:p>
+            <w:pPr>
+              <w:pStyle w:val="Normal"/>
+              <w:spacing w:lineRule="auto" w:line="360"/>
+              <w:ind w:firstLineChars="200" w:startChars="0" w:start="0" w:endChars="0" w:end="0"/>
+              <w:rPr>
+                <w:kern w:val="0"/>
+                <w:sz w:val="24"/>
+              </w:rPr>
+            </w:pPr>
+            <w:r>
+              <w:rPr>
+                <w:kern w:val="0"/>
+                <w:sz w:val="24"/>
+              </w:rPr>
+              <w:t xml:space="preserve">(a) 形成一套覆盖主流防御机制的安全不变量集合，每条不变量具备可由二进制或运行行为判定的证据形式，在 GCC 与 LLVM 上保持一致的描述结构；</w:t>
+            </w:r>
+          </w:p>
+          <w:p>
+            <w:pPr>
+              <w:pStyle w:val="Normal"/>
+              <w:spacing w:lineRule="auto" w:line="360"/>
+              <w:ind w:firstLineChars="200" w:startChars="0" w:start="0" w:endChars="0" w:end="0"/>
+              <w:rPr>
+                <w:kern w:val="0"/>
+                <w:sz w:val="24"/>
+              </w:rPr>
+            </w:pPr>
+            <w:r>
+              <w:rPr>
+                <w:kern w:val="0"/>
+                <w:sz w:val="24"/>
+              </w:rPr>
+              <w:t xml:space="preserve">(b) 构建一个可同时面向 GCC 与 LLVM、跨架构运行的 fuzzer 原型，以防御机制相关代码的源代码覆盖率为推进信号，由大语言模型完成种子精细变异；</w:t>
+            </w:r>
+          </w:p>
+          <w:p>
+            <w:pPr>
+              <w:pStyle w:val="Normal"/>
+              <w:spacing w:lineRule="auto" w:line="360"/>
+              <w:ind w:firstLineChars="200" w:startChars="0" w:start="0" w:endChars="0" w:end="0"/>
+              <w:rPr>
+                <w:kern w:val="0"/>
+                <w:sz w:val="24"/>
+              </w:rPr>
+            </w:pPr>
+            <w:r>
+              <w:rPr>
+                <w:kern w:val="0"/>
+                <w:sz w:val="24"/>
+              </w:rPr>
+              <w:t xml:space="preserve">(c) 通过该原型在 GCC 与 LLVM 上发现可被上游确认的真实缺陷，验证方法的有效性与跨编译器迁移性。</w:t>
+            </w:r>
+          </w:p>
+          <w:p>
+            <w:pPr>
+              <w:pStyle w:val="Normal"/>
+              <w:spacing w:lineRule="auto" w:line="360"/>
+              <w:ind w:firstLineChars="200" w:startChars="0" w:start="0" w:endChars="0" w:end="0"/>
+              <w:rPr>
+                <w:kern w:val="0"/>
+                <w:sz w:val="24"/>
+              </w:rPr>
+            </w:pPr>
+            <w:r>
+              <w:rPr>
+                <w:kern w:val="0"/>
+                <w:sz w:val="24"/>
+              </w:rPr>
+              <w:t xml:space="preserve">三个目标依次推进：(a) 提供事实基础，(b) 构建原型，(c) 完成实证验证。其依赖关系与工作内容详见 3.2 节。</w:t>
+            </w:r>
+          </w:p>
+          <w:p>
+            <w:pPr>
+              <w:pStyle w:val="Normal"/>
+              <w:spacing w:lineRule="auto" w:line="360"/>
               <w:rPr>
                 <w:b/>
                 <w:bCs/>
@@ -3455,42 +3312,33 @@
           </w:p>
           <w:p>
             <w:pPr>
-              <w:spacing w:line="360" w:lineRule="auto"/>
-              <w:ind w:left="0" w:leftChars="0" w:right="0" w:rightChars="0" w:firstLineChars="200"/>
-              <w:rPr>
-                <w:kern w:val="0"/>
-                <w:sz w:val="24"/>
-              </w:rPr>
-            </w:pPr>
-            <w:r>
-              <w:rPr>
-                <w:kern w:val="0"/>
-                <w:sz w:val="24"/>
-              </w:rPr>
-              <w:t>本课题分为三部分工作，相互依赖关系如图 3 所示：不变量形式化是预言机与种子目标选择的基础；预言机提供安全判定接口；覆盖率驱动的种子生成负责将测试输入推进到特定代码路径。</w:t>
-            </w:r>
-          </w:p>
-          <w:p>
-            <w:pPr>
-              <w:spacing w:line="360" w:lineRule="auto"/>
-              <w:ind w:left="0" w:leftChars="0" w:right="0" w:rightChars="0" w:firstLineChars="200"/>
-              <w:rPr>
-                <w:kern w:val="0"/>
-                <w:sz w:val="24"/>
-              </w:rPr>
-            </w:pPr>
-            <w:bookmarkStart w:id="0" w:name="_GoBack"/>
-            <w:bookmarkEnd w:id="0"/>
-          </w:p>
-          <w:p>
-            <w:pPr>
-              <w:spacing w:line="360" w:lineRule="auto"/>
-              <w:jc w:val="center"/>
-            </w:pPr>
-            <w:r>
+              <w:pStyle w:val="Normal"/>
+              <w:spacing w:lineRule="auto" w:line="360"/>
+              <w:ind w:firstLineChars="200" w:startChars="0" w:start="0" w:endChars="0" w:end="0"/>
+              <w:rPr>
+                <w:kern w:val="0"/>
+                <w:sz w:val="24"/>
+              </w:rPr>
+            </w:pPr>
+            <w:r>
+              <w:rPr>
+                <w:kern w:val="0"/>
+                <w:sz w:val="24"/>
+              </w:rPr>
+              <w:t xml:space="preserve">本课题分为三部分工作，相互依赖关系如图 3 所示：不变量形式化是预言机与种子目标选择的基础；预言机提供安全判定接口；覆盖率驱动的种子生成负责将测试输入推进到特定代码路径。</w:t>
+            </w:r>
+          </w:p>
+          <w:p>
+            <w:pPr>
+              <w:pStyle w:val="Normal"/>
+              <w:spacing w:lineRule="auto" w:line="360"/>
+              <w:jc w:val="center"/>
+            </w:pPr>
+            <w:r>
+              <w:rPr/>
               <w:drawing>
-                <wp:inline distT="0" distB="0" distL="0" distR="0">
-                  <wp:extent cx="5385435" cy="1235710"/>
+                <wp:inline xmlns:wp="http://schemas.openxmlformats.org/drawingml/2006/wordprocessingDrawing" distT="0" distB="0" distL="0" distR="0">
+                  <wp:extent cx="5385714" cy="1236021"/>
                   <wp:effectExtent l="0" t="0" r="0" b="0"/>
                   <wp:docPr id="23" name="Figure23"/>
                   <wp:cNvGraphicFramePr>
@@ -3500,13 +3348,11 @@
                     <a:graphicData uri="http://schemas.openxmlformats.org/drawingml/2006/picture">
                       <pic:pic xmlns:pic="http://schemas.openxmlformats.org/drawingml/2006/picture">
                         <pic:nvPicPr>
-                          <pic:cNvPr id="23" name="Figure23"/>
-                          <pic:cNvPicPr>
-                            <a:picLocks noChangeAspect="1"/>
-                          </pic:cNvPicPr>
+                          <pic:cNvPr id="23" name="pipeline.png"/>
+                          <pic:cNvPicPr/>
                         </pic:nvPicPr>
                         <pic:blipFill>
-                          <a:blip r:embed="rId8"/>
+                          <a:blip xmlns:r="http://schemas.openxmlformats.org/officeDocument/2006/relationships" r:embed="rId23"/>
                           <a:stretch>
                             <a:fillRect/>
                           </a:stretch>
@@ -3529,7 +3375,8 @@
           </w:p>
           <w:p>
             <w:pPr>
-              <w:spacing w:line="360" w:lineRule="auto"/>
+              <w:pStyle w:val="Normal"/>
+              <w:spacing w:lineRule="auto" w:line="360"/>
               <w:jc w:val="center"/>
               <w:rPr>
                 <w:rFonts w:ascii="宋体" w:hAnsi="宋体" w:eastAsia="宋体"/>
@@ -3550,75 +3397,81 @@
           </w:p>
           <w:p>
             <w:pPr>
-              <w:spacing w:line="360" w:lineRule="auto"/>
-              <w:rPr>
-                <w:sz w:val="24"/>
-              </w:rPr>
-            </w:pPr>
-          </w:p>
-          <w:p>
-            <w:pPr>
-              <w:spacing w:line="360" w:lineRule="auto"/>
-              <w:ind w:left="0" w:leftChars="0" w:right="0" w:rightChars="0" w:firstLineChars="200"/>
-              <w:rPr>
-                <w:kern w:val="0"/>
-                <w:sz w:val="24"/>
-              </w:rPr>
-            </w:pPr>
-            <w:r>
-              <w:rPr>
-                <w:kern w:val="0"/>
-                <w:sz w:val="24"/>
-              </w:rPr>
-              <w:t>(1) 防御机制安全不变量的调研与形式化。针对栈金丝雀、_FORTIFY_SOURCE、IBT 等机制，从三类来源提炼其安全不变量：一是编译器源码中的注释与断言（如 GCC 中 AArch64 后端关于 canary 槽位置关系的注释，或 LLVM 中 StackProtector 模块的实现）；二是编译器及系统 ABI 官方文档对开关、接口、属性的规定；三是已确认的历史 bug 与修补点。每条不变量按统一字段记录其陈述、证据片段与版本敏感性，便于机械检索与回归。</w:t>
-            </w:r>
-          </w:p>
-          <w:p>
-            <w:pPr>
-              <w:spacing w:line="360" w:lineRule="auto"/>
-              <w:ind w:left="0" w:leftChars="0" w:right="0" w:rightChars="0" w:firstLineChars="200"/>
-              <w:rPr>
-                <w:kern w:val="0"/>
-                <w:sz w:val="24"/>
-              </w:rPr>
-            </w:pPr>
-            <w:r>
-              <w:rPr>
-                <w:kern w:val="0"/>
-                <w:sz w:val="24"/>
-              </w:rPr>
-              <w:t>(2) 不变量到预言机的工程化落地。将不变量翻译为二进制层面或运行行为上的检查器。框架将检查器分为静态与动态两类：静态检查通过 ELF 符号、指令流模式、属性 note 做断言式判定；动态检查通过受控执行（如对 buffer 填充长度做二分搜索）观察运行行为。预言机判据建立在二进制和运行行为之上，与产生该二进制的具体编译器解耦，GCC 与 LLVM 产物共用同一套检查器。每个机制配置一个聚合器，任一检查器返回 Fail 即记机制级违例并附带证据；同时为每个机制记录开机制/关机制两套 flag profile，框架据此对同一颗种子做对照判定，避免与编译器自身缺省行为混淆。</w:t>
-            </w:r>
-          </w:p>
-          <w:p>
-            <w:pPr>
-              <w:spacing w:line="360" w:lineRule="auto"/>
-              <w:ind w:left="0" w:leftChars="0" w:right="0" w:rightChars="0" w:firstLineChars="200"/>
-              <w:rPr>
-                <w:kern w:val="0"/>
-                <w:sz w:val="24"/>
-              </w:rPr>
-            </w:pPr>
-            <w:r>
-              <w:rPr>
-                <w:kern w:val="0"/>
-                <w:sz w:val="24"/>
-              </w:rPr>
-              <w:t>(3) 大语言模型与覆盖率联合驱动的种子生成。以编译器中防御机制的源代码覆盖率为目标信号，结合控制流图按"未覆盖且与防御机制相关性高"的策略选取基本块作为变异目标。每轮变异流程如下：构造目标上下文（含函数源码、基本块标注及示例种子），调用大模型生成新 C 种子，编译产物经预言机检查。若发现覆盖增量、命中目标或触发 bug，则保存种子。未命中目标但带来新覆盖的种子，将通过轻量级追踪定位发散点，回喂给模型进行下一轮精细变异。该过程确保了大模型生成始终聚焦于防御机制代码路径。</w:t>
-            </w:r>
-          </w:p>
-          <w:p>
-            <w:pPr>
-              <w:spacing w:line="360" w:lineRule="auto"/>
-              <w:rPr>
-                <w:sz w:val="24"/>
-              </w:rPr>
-            </w:pPr>
-          </w:p>
-          <w:p>
-            <w:pPr>
+              <w:pStyle w:val="Normal"/>
+              <w:spacing w:lineRule="auto" w:line="360"/>
+              <w:rPr>
+                <w:sz w:val="24"/>
+              </w:rPr>
+            </w:pPr>
+          </w:p>
+          <w:p>
+            <w:pPr>
+              <w:pStyle w:val="Normal"/>
+              <w:spacing w:lineRule="auto" w:line="360"/>
+              <w:ind w:firstLineChars="200" w:startChars="0" w:start="0" w:endChars="0" w:end="0"/>
+              <w:rPr>
+                <w:kern w:val="0"/>
+                <w:sz w:val="24"/>
+              </w:rPr>
+            </w:pPr>
+            <w:r>
+              <w:rPr>
+                <w:kern w:val="0"/>
+                <w:sz w:val="24"/>
+              </w:rPr>
+              <w:t xml:space="preserve">(1) 防御机制安全不变量的调研与形式化。针对栈金丝雀、_FORTIFY_SOURCE、IBT 等机制，从三类来源提炼其安全不变量：一是编译器源码中的注释与断言（如 GCC 中 AArch64 后端关于 canary 槽位置关系的注释，或 LLVM 中 StackProtector 模块的实现）；二是编译器及系统 ABI 官方文档对开关、接口、属性的规定；三是已确认的历史 bug 与修补点。每条不变量按统一字段记录其陈述、证据片段与版本敏感性，便于机械检索与回归。</w:t>
+            </w:r>
+          </w:p>
+          <w:p>
+            <w:pPr>
+              <w:pStyle w:val="Normal"/>
+              <w:spacing w:lineRule="auto" w:line="360"/>
+              <w:ind w:firstLineChars="200" w:startChars="0" w:start="0" w:endChars="0" w:end="0"/>
+              <w:rPr>
+                <w:kern w:val="0"/>
+                <w:sz w:val="24"/>
+              </w:rPr>
+            </w:pPr>
+            <w:r>
+              <w:rPr>
+                <w:kern w:val="0"/>
+                <w:sz w:val="24"/>
+              </w:rPr>
+              <w:t xml:space="preserve">(2) 不变量到预言机的工程化落地。将不变量翻译为二进制层面或运行行为上的检查器。框架将检查器分为静态与动态两类：静态检查通过 ELF 符号、指令流模式、属性 note 做断言式判定；动态检查通过受控执行（如对 buffer 填充长度做二分搜索）观察运行行为。预言机判据建立在二进制和运行行为之上，与产生该二进制的具体编译器解耦，GCC 与 LLVM 产物共用同一套检查器。每个机制配置一个聚合器，任一检查器返回 Fail 即记机制级违例并附带证据；同时为每个机制记录开机制/关机制两套 flag profile，框架据此对同一颗种子做对照判定，避免与编译器自身缺省行为混淆。</w:t>
+            </w:r>
+          </w:p>
+          <w:p>
+            <w:pPr>
+              <w:pStyle w:val="Normal"/>
+              <w:spacing w:lineRule="auto" w:line="360"/>
+              <w:ind w:firstLineChars="200" w:startChars="0" w:start="0" w:endChars="0" w:end="0"/>
+              <w:rPr>
+                <w:kern w:val="0"/>
+                <w:sz w:val="24"/>
+              </w:rPr>
+            </w:pPr>
+            <w:r>
+              <w:rPr>
+                <w:kern w:val="0"/>
+                <w:sz w:val="24"/>
+              </w:rPr>
+              <w:t xml:space="preserve">(3) 大语言模型与覆盖率联合驱动的种子生成。以编译器中防御机制的源代码覆盖率为目标信号，结合控制流图按"未覆盖且与防御机制相关性高"的策略选取基本块作为变异目标。每轮变异流程如下：构造目标上下文（含函数源码、基本块标注及示例种子），调用大模型生成新 C 种子，编译产物经预言机检查。若发现覆盖增量、命中目标或触发 bug，则保存种子。未命中目标但带来新覆盖的种子，将通过轻量级追踪定位发散点，回喂给模型进行下一轮精细变异。该过程确保了大模型生成始终聚焦于防御机制代码路径。</w:t>
+            </w:r>
+          </w:p>
+          <w:p>
+            <w:pPr>
+              <w:pStyle w:val="Normal"/>
+              <w:spacing w:lineRule="auto" w:line="360"/>
+              <w:rPr>
+                <w:sz w:val="24"/>
+              </w:rPr>
+            </w:pPr>
+          </w:p>
+          <w:p>
+            <w:pPr>
+              <w:pStyle w:val="Normal"/>
               <w:widowControl/>
-              <w:jc w:val="left"/>
+              <w:jc w:val="start"/>
               <w:rPr>
                 <w:b/>
                 <w:bCs/>
@@ -3638,24 +3491,26 @@
           </w:p>
           <w:p>
             <w:pPr>
-              <w:spacing w:line="360" w:lineRule="auto"/>
-              <w:ind w:left="0" w:leftChars="0" w:right="0" w:rightChars="0" w:firstLineChars="200"/>
-              <w:rPr>
-                <w:kern w:val="0"/>
-                <w:sz w:val="24"/>
-              </w:rPr>
-            </w:pPr>
-            <w:r>
-              <w:rPr>
-                <w:kern w:val="0"/>
-                <w:sz w:val="24"/>
-              </w:rPr>
-              <w:t>技术路线分为总体架构、防御机制不变量预言机框架、大语言模型驱动的种子变异主循环、跨架构与编译选项调度四部分，对应研究内容 (1)–(3) 的工程实现。GCC 上的初步验证证据见第五章。</w:t>
-            </w:r>
-          </w:p>
-          <w:p>
-            <w:pPr>
-              <w:spacing w:line="360" w:lineRule="auto"/>
+              <w:pStyle w:val="Normal"/>
+              <w:spacing w:lineRule="auto" w:line="360"/>
+              <w:ind w:firstLineChars="200" w:startChars="0" w:start="0" w:endChars="0" w:end="0"/>
+              <w:rPr>
+                <w:kern w:val="0"/>
+                <w:sz w:val="24"/>
+              </w:rPr>
+            </w:pPr>
+            <w:r>
+              <w:rPr>
+                <w:kern w:val="0"/>
+                <w:sz w:val="24"/>
+              </w:rPr>
+              <w:t xml:space="preserve">技术路线分为总体架构、防御机制不变量预言机框架、大语言模型驱动的种子变异主循环、跨架构与编译选项调度四部分，对应研究内容 (1)–(3) 的工程实现。GCC 上的初步验证证据见第五章。</w:t>
+            </w:r>
+          </w:p>
+          <w:p>
+            <w:pPr>
+              <w:pStyle w:val="Normal"/>
+              <w:spacing w:lineRule="auto" w:line="360"/>
               <w:rPr>
                 <w:b/>
                 <w:bCs/>
@@ -3670,35 +3525,38 @@
                 <w:kern w:val="0"/>
                 <w:sz w:val="24"/>
               </w:rPr>
-              <w:t>1. 总体架构</w:t>
-            </w:r>
-          </w:p>
-          <w:p>
-            <w:pPr>
-              <w:spacing w:line="360" w:lineRule="auto"/>
-              <w:ind w:left="0" w:leftChars="0" w:right="0" w:rightChars="0" w:firstLineChars="200"/>
-              <w:rPr>
-                <w:kern w:val="0"/>
-                <w:sz w:val="24"/>
-              </w:rPr>
-            </w:pPr>
-            <w:r>
-              <w:rPr>
-                <w:kern w:val="0"/>
-                <w:sz w:val="24"/>
-              </w:rPr>
-              <w:t>系统以一条 fuzz 主循环为骨干，由 LLM 变异、编译器、预言机三个子系统以及种子语料库、配置模块共同支撑，结构如图 4 所示。Fuzz 引擎承担主循环调度与提示词组装两项职能，将当前覆盖率、目标基本块和已有种子拼装成提示词交给 LLM 变异子系统，获取新种子后分发给后续环节。编译器子系统封装预先插桩的 GCC 与 LLVM，将底层差异数据（如 gcov 与 SanitizerCoverage）统一归并为同构的"行级覆盖 → 种子 ID"映射，主循环对此无感知。预言机子系统按防御机制聚合不变量检查器，对编译成功的种子进行安全契约判定。种子语料库持久化满足质量阈值的种子并维护家系信息。配置模块按"防御机制 · ISA · flag"三元组下发任务：把工具链选择（GCC / LLVM）与对应 flag 交给编译器子系统，把目标 ISA 对应的 QEMU 工具链交给预言机的执行层，使同一份种子可在不同后端上做对照实验，从而以可重复的方式覆盖第一章所述的"防御机制 × ISA"矩阵。</w:t>
-            </w:r>
-          </w:p>
-          <w:p>
-            <w:pPr>
-              <w:spacing w:line="360" w:lineRule="auto"/>
-              <w:jc w:val="center"/>
-            </w:pPr>
-            <w:r>
+              <w:t>4.1 总体架构</w:t>
+            </w:r>
+          </w:p>
+          <w:p>
+            <w:pPr>
+              <w:pStyle w:val="Normal"/>
+              <w:spacing w:lineRule="auto" w:line="360"/>
+              <w:ind w:firstLineChars="200" w:startChars="0" w:start="0" w:endChars="0" w:end="0"/>
+              <w:rPr>
+                <w:kern w:val="0"/>
+                <w:sz w:val="24"/>
+              </w:rPr>
+            </w:pPr>
+            <w:r>
+              <w:rPr>
+                <w:kern w:val="0"/>
+                <w:sz w:val="24"/>
+              </w:rPr>
+              <w:t xml:space="preserve">系统以一条 fuzz 主循环为骨干，由 LLM 变异、编译器、预言机三个子系统以及种子语料库、配置模块共同支撑，结构如图 4 所示。Fuzz 引擎承担主循环调度与提示词组装两项职能，将当前覆盖率、目标基本块和已有种子拼装成提示词交给 LLM 变异子系统，获取新种子后分发给后续环节。编译器子系统封装预先插桩的 GCC 与 LLVM，将底层差异数据（如 gcov 与 SanitizerCoverage）统一归并为同构的"行级覆盖 → 种子 ID"映射，主循环对此无感知。预言机子系统按防御机制聚合不变量检查器，对编译成功的种子进行安全契约判定。种子语料库持久化满足质量阈值的种子并维护家系信息。配置模块按"防御机制 · ISA · flag"三元组下发任务：把工具链选择（GCC / LLVM）与对应 flag 交给编译器子系统，把目标 ISA 对应的 QEMU 工具链交给预言机的执行层，使同一份种子可在不同后端上做对照实验，从而以可重复的方式覆盖第一章所述的"防御机制 × ISA"矩阵。</w:t>
+            </w:r>
+          </w:p>
+          <w:p>
+            <w:pPr>
+              <w:pStyle w:val="Normal"/>
+              <w:spacing w:lineRule="auto" w:line="360"/>
+              <w:jc w:val="center"/>
+            </w:pPr>
+            <w:r>
+              <w:rPr/>
               <w:drawing>
-                <wp:inline distT="0" distB="0" distL="0" distR="0">
-                  <wp:extent cx="5385435" cy="2608580"/>
+                <wp:inline xmlns:wp="http://schemas.openxmlformats.org/drawingml/2006/wordprocessingDrawing" distT="0" distB="0" distL="0" distR="0">
+                  <wp:extent cx="5385714" cy="2609079"/>
                   <wp:effectExtent l="0" t="0" r="0" b="0"/>
                   <wp:docPr id="24" name="Figure24"/>
                   <wp:cNvGraphicFramePr>
@@ -3708,13 +3566,11 @@
                     <a:graphicData uri="http://schemas.openxmlformats.org/drawingml/2006/picture">
                       <pic:pic xmlns:pic="http://schemas.openxmlformats.org/drawingml/2006/picture">
                         <pic:nvPicPr>
-                          <pic:cNvPr id="24" name="Figure24"/>
-                          <pic:cNvPicPr>
-                            <a:picLocks noChangeAspect="1"/>
-                          </pic:cNvPicPr>
+                          <pic:cNvPr id="24" name="architecture.png"/>
+                          <pic:cNvPicPr/>
                         </pic:nvPicPr>
                         <pic:blipFill>
-                          <a:blip r:embed="rId9"/>
+                          <a:blip xmlns:r="http://schemas.openxmlformats.org/officeDocument/2006/relationships" r:embed="rId24"/>
                           <a:stretch>
                             <a:fillRect/>
                           </a:stretch>
@@ -3737,7 +3593,8 @@
           </w:p>
           <w:p>
             <w:pPr>
-              <w:spacing w:line="360" w:lineRule="auto"/>
+              <w:pStyle w:val="Normal"/>
+              <w:spacing w:lineRule="auto" w:line="360"/>
               <w:jc w:val="center"/>
               <w:rPr>
                 <w:rFonts w:ascii="宋体" w:hAnsi="宋体" w:eastAsia="宋体"/>
@@ -3758,15 +3615,17 @@
           </w:p>
           <w:p>
             <w:pPr>
-              <w:spacing w:line="360" w:lineRule="auto"/>
-              <w:rPr>
-                <w:sz w:val="24"/>
-              </w:rPr>
-            </w:pPr>
-          </w:p>
-          <w:p>
-            <w:pPr>
-              <w:spacing w:line="360" w:lineRule="auto"/>
+              <w:pStyle w:val="Normal"/>
+              <w:spacing w:lineRule="auto" w:line="360"/>
+              <w:rPr>
+                <w:sz w:val="24"/>
+              </w:rPr>
+            </w:pPr>
+          </w:p>
+          <w:p>
+            <w:pPr>
+              <w:pStyle w:val="Normal"/>
+              <w:spacing w:lineRule="auto" w:line="360"/>
               <w:rPr>
                 <w:b/>
                 <w:bCs/>
@@ -3781,35 +3640,38 @@
                 <w:kern w:val="0"/>
                 <w:sz w:val="24"/>
               </w:rPr>
-              <w:t>2. 防御机制不变量预言机框架</w:t>
-            </w:r>
-          </w:p>
-          <w:p>
-            <w:pPr>
-              <w:spacing w:line="360" w:lineRule="auto"/>
-              <w:ind w:left="0" w:leftChars="0" w:right="0" w:rightChars="0" w:firstLineChars="200"/>
-              <w:rPr>
-                <w:kern w:val="0"/>
-                <w:sz w:val="24"/>
-              </w:rPr>
-            </w:pPr>
-            <w:r>
-              <w:rPr>
-                <w:kern w:val="0"/>
-                <w:sz w:val="24"/>
-              </w:rPr>
-              <w:t>每个机制对应一个聚合器，下挂若干检查器。判定流程如图 5 所示，检查器输入包括种子的源码、汇编与二进制文件。检查器分为两类：静态检查器通过 ELF 符号表、指令字节模式与 .note 段进行断言；动态检查器则通过受控执行（如二分搜索）观察运行期越界表现。每个检查器返回 Pass、Fail 或 Error，聚合时任一 Fail 即视为机制级违例，并回写触发证据。对于易与编译器缺省行为混淆的检查器，框架会同时运行开/关机制的两套配置进行比对。预言机还维护一份缓存以复用执行结果，避免重复解析。</w:t>
-            </w:r>
-          </w:p>
-          <w:p>
-            <w:pPr>
-              <w:spacing w:line="360" w:lineRule="auto"/>
-              <w:jc w:val="center"/>
-            </w:pPr>
-            <w:r>
+              <w:t>4.2 防御机制不变量预言机框架</w:t>
+            </w:r>
+          </w:p>
+          <w:p>
+            <w:pPr>
+              <w:pStyle w:val="Normal"/>
+              <w:spacing w:lineRule="auto" w:line="360"/>
+              <w:ind w:firstLineChars="200" w:startChars="0" w:start="0" w:endChars="0" w:end="0"/>
+              <w:rPr>
+                <w:kern w:val="0"/>
+                <w:sz w:val="24"/>
+              </w:rPr>
+            </w:pPr>
+            <w:r>
+              <w:rPr>
+                <w:kern w:val="0"/>
+                <w:sz w:val="24"/>
+              </w:rPr>
+              <w:t xml:space="preserve">每个机制对应一个聚合器，下挂若干检查器。判定流程如图 5 所示，检查器输入包括种子的源码、汇编与二进制文件。检查器分为两类：静态检查器通过 ELF 符号表、指令字节模式与 .note 段进行断言；动态检查器则通过受控执行（如二分搜索）观察运行期越界表现。每个检查器返回 Pass、Fail 或 Error，聚合时任一 Fail 即视为机制级违例，并回写触发证据。对于易与编译器缺省行为混淆的检查器，框架会同时运行开/关机制的两套配置进行比对。预言机还维护一份缓存以复用执行结果，避免重复解析。</w:t>
+            </w:r>
+          </w:p>
+          <w:p>
+            <w:pPr>
+              <w:pStyle w:val="Normal"/>
+              <w:spacing w:lineRule="auto" w:line="360"/>
+              <w:jc w:val="center"/>
+            </w:pPr>
+            <w:r>
+              <w:rPr/>
               <w:drawing>
-                <wp:inline distT="0" distB="0" distL="0" distR="0">
-                  <wp:extent cx="4283710" cy="5612130"/>
+                <wp:inline xmlns:wp="http://schemas.openxmlformats.org/drawingml/2006/wordprocessingDrawing" distT="0" distB="0" distL="0" distR="0">
+                  <wp:extent cx="4284090" cy="5612159"/>
                   <wp:effectExtent l="0" t="0" r="0" b="0"/>
                   <wp:docPr id="25" name="Figure25"/>
                   <wp:cNvGraphicFramePr>
@@ -3819,13 +3681,11 @@
                     <a:graphicData uri="http://schemas.openxmlformats.org/drawingml/2006/picture">
                       <pic:pic xmlns:pic="http://schemas.openxmlformats.org/drawingml/2006/picture">
                         <pic:nvPicPr>
-                          <pic:cNvPr id="25" name="Figure25"/>
-                          <pic:cNvPicPr>
-                            <a:picLocks noChangeAspect="1"/>
-                          </pic:cNvPicPr>
+                          <pic:cNvPr id="25" name="oracle-flow.png"/>
+                          <pic:cNvPicPr/>
                         </pic:nvPicPr>
                         <pic:blipFill>
-                          <a:blip r:embed="rId10"/>
+                          <a:blip xmlns:r="http://schemas.openxmlformats.org/officeDocument/2006/relationships" r:embed="rId25"/>
                           <a:stretch>
                             <a:fillRect/>
                           </a:stretch>
@@ -3848,7 +3708,8 @@
           </w:p>
           <w:p>
             <w:pPr>
-              <w:spacing w:line="360" w:lineRule="auto"/>
+              <w:pStyle w:val="Normal"/>
+              <w:spacing w:lineRule="auto" w:line="360"/>
               <w:jc w:val="center"/>
               <w:rPr>
                 <w:rFonts w:ascii="宋体" w:hAnsi="宋体" w:eastAsia="宋体"/>
@@ -3869,15 +3730,17 @@
           </w:p>
           <w:p>
             <w:pPr>
-              <w:spacing w:line="360" w:lineRule="auto"/>
-              <w:rPr>
-                <w:sz w:val="24"/>
-              </w:rPr>
-            </w:pPr>
-          </w:p>
-          <w:p>
-            <w:pPr>
-              <w:spacing w:line="360" w:lineRule="auto"/>
+              <w:pStyle w:val="Normal"/>
+              <w:spacing w:lineRule="auto" w:line="360"/>
+              <w:rPr>
+                <w:sz w:val="24"/>
+              </w:rPr>
+            </w:pPr>
+          </w:p>
+          <w:p>
+            <w:pPr>
+              <w:pStyle w:val="Normal"/>
+              <w:spacing w:lineRule="auto" w:line="360"/>
               <w:rPr>
                 <w:b/>
                 <w:bCs/>
@@ -3892,35 +3755,38 @@
                 <w:kern w:val="0"/>
                 <w:sz w:val="24"/>
               </w:rPr>
-              <w:t>3. 大语言模型驱动的种子变异主循环</w:t>
-            </w:r>
-          </w:p>
-          <w:p>
-            <w:pPr>
-              <w:spacing w:line="360" w:lineRule="auto"/>
-              <w:ind w:left="0" w:leftChars="0" w:right="0" w:rightChars="0" w:firstLineChars="200"/>
-              <w:rPr>
-                <w:kern w:val="0"/>
-                <w:sz w:val="24"/>
-              </w:rPr>
-            </w:pPr>
-            <w:r>
-              <w:rPr>
-                <w:kern w:val="0"/>
-                <w:sz w:val="24"/>
-              </w:rPr>
-              <w:t>主循环的输入为当前覆盖率映射与编译器源码控制流图，单轮迭代过程如图 6 所示。每轮先在未覆盖基本块中按相关性挑出一个目标，相关性由该基本块在 CFG 上的后继分支数和所属代码区域对防御机制的关联程度共同决定，使搜索集中在未触达且与防御逻辑相关的代码上。随后构造目标上下文：目标函数源码片段、逐行覆盖标注、目标基本块位置，以及覆盖目标前驱的若干示例种子。提示词组装层将上下文与基础变异提示词、机制契约要求拼接，提交给大语言模型生成新 C 种子。编译失败时反馈错误信息进入下一轮；编译成功后覆盖率分析器判断命中情况，预言机给出安全判定。结果分析阶段同时观察覆盖增量、是否命中目标、是否触发 bug，任一为真即保存种子。种子未命中目标但带来新覆盖时，利用轻量动态追踪定位其与基线种子在调用序列上的首个发散点，将发散函数源码作为额外上下文反馈给变异提示，请求模型重新精细变异。目标基本块全部覆盖后，主循环可切换至随机变异阶段，仅以预言机为保存条件继续探索。</w:t>
-            </w:r>
-          </w:p>
-          <w:p>
-            <w:pPr>
-              <w:spacing w:line="360" w:lineRule="auto"/>
-              <w:jc w:val="center"/>
-            </w:pPr>
-            <w:r>
+              <w:t>4.3 大语言模型驱动的种子变异主循环</w:t>
+            </w:r>
+          </w:p>
+          <w:p>
+            <w:pPr>
+              <w:pStyle w:val="Normal"/>
+              <w:spacing w:lineRule="auto" w:line="360"/>
+              <w:ind w:firstLineChars="200" w:startChars="0" w:start="0" w:endChars="0" w:end="0"/>
+              <w:rPr>
+                <w:kern w:val="0"/>
+                <w:sz w:val="24"/>
+              </w:rPr>
+            </w:pPr>
+            <w:r>
+              <w:rPr>
+                <w:kern w:val="0"/>
+                <w:sz w:val="24"/>
+              </w:rPr>
+              <w:t xml:space="preserve">主循环的输入为当前覆盖率映射与编译器源码控制流图，单轮迭代过程如图 6 所示。每轮先在未覆盖基本块中按相关性挑出一个目标，相关性由该基本块在 CFG 上的后继分支数和所属代码区域对防御机制的关联程度共同决定，使搜索集中在未触达且与防御逻辑相关的代码上。随后构造目标上下文：目标函数源码片段、逐行覆盖标注、目标基本块位置，以及覆盖目标前驱的若干示例种子。提示词组装层将上下文与基础变异提示词、机制契约要求拼接，提交给大语言模型生成新 C 种子。编译失败时反馈错误信息进入下一轮；编译成功后覆盖率分析器判断命中情况，预言机给出安全判定。结果分析阶段同时观察覆盖增量、是否命中目标、是否触发 bug，任一为真即保存种子。种子未命中目标但带来新覆盖时，利用轻量动态追踪定位其与基线种子在调用序列上的首个发散点，将发散函数源码作为额外上下文反馈给变异提示，请求模型重新精细变异。目标基本块全部覆盖后，主循环可切换至随机变异阶段，仅以预言机为保存条件继续探索。</w:t>
+            </w:r>
+          </w:p>
+          <w:p>
+            <w:pPr>
+              <w:pStyle w:val="Normal"/>
+              <w:spacing w:lineRule="auto" w:line="360"/>
+              <w:jc w:val="center"/>
+            </w:pPr>
+            <w:r>
+              <w:rPr/>
               <w:drawing>
-                <wp:inline distT="0" distB="0" distL="0" distR="0">
-                  <wp:extent cx="3501390" cy="6724650"/>
+                <wp:inline xmlns:wp="http://schemas.openxmlformats.org/drawingml/2006/wordprocessingDrawing" distT="0" distB="0" distL="0" distR="0">
+                  <wp:extent cx="3501559" cy="6725183"/>
                   <wp:effectExtent l="0" t="0" r="0" b="0"/>
                   <wp:docPr id="26" name="Figure26"/>
                   <wp:cNvGraphicFramePr>
@@ -3930,13 +3796,11 @@
                     <a:graphicData uri="http://schemas.openxmlformats.org/drawingml/2006/picture">
                       <pic:pic xmlns:pic="http://schemas.openxmlformats.org/drawingml/2006/picture">
                         <pic:nvPicPr>
-                          <pic:cNvPr id="26" name="Figure26"/>
-                          <pic:cNvPicPr>
-                            <a:picLocks noChangeAspect="1"/>
-                          </pic:cNvPicPr>
+                          <pic:cNvPr id="26" name="main-loop.png"/>
+                          <pic:cNvPicPr/>
                         </pic:nvPicPr>
                         <pic:blipFill>
-                          <a:blip r:embed="rId11"/>
+                          <a:blip xmlns:r="http://schemas.openxmlformats.org/officeDocument/2006/relationships" r:embed="rId26"/>
                           <a:stretch>
                             <a:fillRect/>
                           </a:stretch>
@@ -3959,7 +3823,8 @@
           </w:p>
           <w:p>
             <w:pPr>
-              <w:spacing w:line="360" w:lineRule="auto"/>
+              <w:pStyle w:val="Normal"/>
+              <w:spacing w:lineRule="auto" w:line="360"/>
               <w:jc w:val="center"/>
               <w:rPr>
                 <w:rFonts w:ascii="宋体" w:hAnsi="宋体" w:eastAsia="宋体"/>
@@ -3980,15 +3845,17 @@
           </w:p>
           <w:p>
             <w:pPr>
-              <w:spacing w:line="360" w:lineRule="auto"/>
-              <w:rPr>
-                <w:sz w:val="24"/>
-              </w:rPr>
-            </w:pPr>
-          </w:p>
-          <w:p>
-            <w:pPr>
-              <w:spacing w:line="360" w:lineRule="auto"/>
+              <w:pStyle w:val="Normal"/>
+              <w:spacing w:lineRule="auto" w:line="360"/>
+              <w:rPr>
+                <w:sz w:val="24"/>
+              </w:rPr>
+            </w:pPr>
+          </w:p>
+          <w:p>
+            <w:pPr>
+              <w:pStyle w:val="Normal"/>
+              <w:spacing w:lineRule="auto" w:line="360"/>
               <w:rPr>
                 <w:b/>
                 <w:bCs/>
@@ -4003,38 +3870,41 @@
                 <w:kern w:val="0"/>
                 <w:sz w:val="24"/>
               </w:rPr>
-              <w:t>4. 跨架构与编译选项调度</w:t>
-            </w:r>
-          </w:p>
-          <w:p>
-            <w:pPr>
-              <w:spacing w:line="360" w:lineRule="auto"/>
-              <w:ind w:left="0" w:leftChars="0" w:right="0" w:rightChars="0" w:firstLineChars="200"/>
-              <w:rPr>
-                <w:kern w:val="0"/>
-                <w:sz w:val="24"/>
-              </w:rPr>
-            </w:pPr>
-            <w:r>
-              <w:rPr>
-                <w:kern w:val="0"/>
-                <w:sz w:val="24"/>
-              </w:rPr>
-              <w:t>配置模块将编译命令参数化为编译器、ISA、架构 flag、策略 flag 方案四元组，向子系统下发对应工具链，使同一种子可分发至不同后端经 QEMU 执行。策略方案包含开/关机制两套配置，供预言机对照判定。不同编译器间的 flag 拼写差异被统一抽象，而二进制解析层（BinaryInspector）则屏蔽了各 ISA 间的底层格式差异，为检查器提供通用判定能力。</w:t>
-            </w:r>
-          </w:p>
-          <w:p>
-            <w:pPr>
-              <w:spacing w:line="360" w:lineRule="auto"/>
-              <w:rPr>
-                <w:sz w:val="24"/>
-              </w:rPr>
-            </w:pPr>
-          </w:p>
-          <w:p>
-            <w:pPr>
+              <w:t>4.4 跨架构与编译选项调度</w:t>
+            </w:r>
+          </w:p>
+          <w:p>
+            <w:pPr>
+              <w:pStyle w:val="Normal"/>
+              <w:spacing w:lineRule="auto" w:line="360"/>
+              <w:ind w:firstLineChars="200" w:startChars="0" w:start="0" w:endChars="0" w:end="0"/>
+              <w:rPr>
+                <w:kern w:val="0"/>
+                <w:sz w:val="24"/>
+              </w:rPr>
+            </w:pPr>
+            <w:r>
+              <w:rPr>
+                <w:kern w:val="0"/>
+                <w:sz w:val="24"/>
+              </w:rPr>
+              <w:t xml:space="preserve">配置模块将编译命令参数化为编译器、ISA、架构 flag、策略 flag 方案四元组，向子系统下发对应工具链，使同一种子可分发至不同后端经 QEMU 执行。策略方案包含开/关机制两套配置，供预言机对照判定。不同编译器间的 flag 拼写差异被统一抽象，而二进制解析层（BinaryInspector）则屏蔽了各 ISA 间的底层格式差异，为检查器提供通用判定能力。</w:t>
+            </w:r>
+          </w:p>
+          <w:p>
+            <w:pPr>
+              <w:pStyle w:val="Normal"/>
+              <w:spacing w:lineRule="auto" w:line="360"/>
+              <w:rPr>
+                <w:sz w:val="24"/>
+              </w:rPr>
+            </w:pPr>
+          </w:p>
+          <w:p>
+            <w:pPr>
+              <w:pStyle w:val="Normal"/>
               <w:widowControl/>
-              <w:jc w:val="left"/>
+              <w:jc w:val="start"/>
               <w:rPr>
                 <w:b/>
                 <w:bCs/>
@@ -4054,24 +3924,26 @@
           </w:p>
           <w:p>
             <w:pPr>
-              <w:spacing w:line="360" w:lineRule="auto"/>
-              <w:ind w:left="0" w:leftChars="0" w:right="0" w:rightChars="0" w:firstLineChars="200"/>
-              <w:rPr>
-                <w:kern w:val="0"/>
-                <w:sz w:val="24"/>
-              </w:rPr>
-            </w:pPr>
-            <w:r>
-              <w:rPr>
-                <w:kern w:val="0"/>
-                <w:sz w:val="24"/>
-              </w:rPr>
-              <w:t>目前已在 GCC 的多个版本上测试栈金丝雀、_FORTIFY_SOURCE、IBT 等防御机制，并在 GCC 上发现 3 例已获上游确认的静默失效[17-20]。LLVM 侧实验将在下一阶段进行。下文展开分析其中两例，并在 5.3 节简述第三例（多 ISA 上栈金丝雀寄存器泄露问题）。</w:t>
-            </w:r>
-          </w:p>
-          <w:p>
-            <w:pPr>
-              <w:spacing w:line="360" w:lineRule="auto"/>
+              <w:pStyle w:val="Normal"/>
+              <w:spacing w:lineRule="auto" w:line="360"/>
+              <w:ind w:firstLineChars="200" w:startChars="0" w:start="0" w:endChars="0" w:end="0"/>
+              <w:rPr>
+                <w:kern w:val="0"/>
+                <w:sz w:val="24"/>
+              </w:rPr>
+            </w:pPr>
+            <w:r>
+              <w:rPr>
+                <w:kern w:val="0"/>
+                <w:sz w:val="24"/>
+              </w:rPr>
+              <w:t xml:space="preserve">目前已在 GCC 的多个版本上测试栈金丝雀、_FORTIFY_SOURCE、IBT 等防御机制，并在 GCC 上发现 3 例已获上游确认的静默失效[6-9]。LLVM 侧实验将在下一阶段进行。下文展开分析其中两例，并在 5.3 节简述第三例（多 ISA 上栈金丝雀寄存器泄露问题）。</w:t>
+            </w:r>
+          </w:p>
+          <w:p>
+            <w:pPr>
+              <w:pStyle w:val="Normal"/>
+              <w:spacing w:lineRule="auto" w:line="360"/>
               <w:rPr>
                 <w:b/>
                 <w:bCs/>
@@ -4086,69 +3958,74 @@
                 <w:kern w:val="0"/>
                 <w:sz w:val="24"/>
               </w:rPr>
-              <w:t>5.1 案例一：_FORTIFY_SOURCE 优化改写后运行时上限被静默放宽</w:t>
-            </w:r>
-          </w:p>
-          <w:p>
-            <w:pPr>
-              <w:spacing w:line="360" w:lineRule="auto"/>
-              <w:ind w:left="0" w:leftChars="0" w:right="0" w:rightChars="0" w:firstLineChars="200"/>
-              <w:rPr>
-                <w:kern w:val="0"/>
-                <w:sz w:val="24"/>
-              </w:rPr>
-            </w:pPr>
-            <w:r>
-              <w:rPr>
-                <w:kern w:val="0"/>
-                <w:sz w:val="24"/>
-              </w:rPr>
-              <w:t>_FORTIFY_SOURCE 是 GCC 与 glibc 配合的源代码加固机制[10]。开启后，glibc 头文件在预处理阶段把 strcat 等危险接口重写为带 size 参数的 __strcat_chk，运行时据此检查目的缓冲区上限。GCC 的 strlen pass 进一步识别已知前缀长度的目的指针，将 __strcat_chk 改写为性能更优的 __stpcpy_chk，并把目的指针前移 strlen(dst) 字节。这里的安全不变量是：目的指针前移后，传给 __stpcpy_chk 的 size 参数必须由原始 objsize 减去 strlen(dst)，否则运行时上限就被静默放宽 strlen(dst) 字节。</w:t>
-            </w:r>
-          </w:p>
-          <w:p>
-            <w:pPr>
-              <w:spacing w:line="360" w:lineRule="auto"/>
-              <w:ind w:left="0" w:leftChars="0" w:right="0" w:rightChars="0" w:firstLineChars="200"/>
-              <w:rPr>
-                <w:kern w:val="0"/>
-                <w:sz w:val="24"/>
-              </w:rPr>
-            </w:pPr>
-            <w:r>
-              <w:rPr>
-                <w:kern w:val="0"/>
-                <w:sz w:val="24"/>
-              </w:rPr>
-              <w:t>本方法构造的种子在该路径上稳定触发了 size 参数未相应减小的实例。反汇编层面 strcat → __strcat_chk → __stpcpy_chk 链条仍然出现，看似 FORTIFY 仍在生效，但"按 dst 剩余空间收紧上限"这一步已被丢弃。上报后该缺陷已被确认（PR-125079[17]）并合入主分支。该路径与 2018 年修复的 PR-87672[6] 位于同一文件，表明当年修复时遗漏了对称分支。</w:t>
-            </w:r>
-          </w:p>
-          <w:p>
-            <w:pPr>
-              <w:spacing w:line="360" w:lineRule="auto"/>
-              <w:ind w:left="0" w:leftChars="0" w:right="0" w:rightChars="0" w:firstLineChars="200"/>
-              <w:rPr>
-                <w:kern w:val="0"/>
-                <w:sz w:val="24"/>
-              </w:rPr>
-            </w:pPr>
-            <w:r>
-              <w:rPr>
-                <w:kern w:val="0"/>
-                <w:sz w:val="24"/>
-              </w:rPr>
-              <w:t>该缺陷命中了"FORTIFY 调用点的 size 参数下界推断"不变量，判定证据为静态符号与反汇编。该位置如图 7 所示。</w:t>
-            </w:r>
-          </w:p>
-          <w:p>
-            <w:pPr>
-              <w:spacing w:line="360" w:lineRule="auto"/>
-              <w:jc w:val="center"/>
-            </w:pPr>
-            <w:r>
+              <w:t>5.1 案例一：_FORTIFY_SOURCE 上限静默放宽</w:t>
+            </w:r>
+          </w:p>
+          <w:p>
+            <w:pPr>
+              <w:pStyle w:val="Normal"/>
+              <w:spacing w:lineRule="auto" w:line="360"/>
+              <w:ind w:firstLineChars="200" w:startChars="0" w:start="0" w:endChars="0" w:end="0"/>
+              <w:rPr>
+                <w:kern w:val="0"/>
+                <w:sz w:val="24"/>
+              </w:rPr>
+            </w:pPr>
+            <w:r>
+              <w:rPr>
+                <w:kern w:val="0"/>
+                <w:sz w:val="24"/>
+              </w:rPr>
+              <w:t xml:space="preserve">_FORTIFY_SOURCE 是 GCC 与 glibc 配合的源代码加固机制[20]。开启后，glibc 头文件在预处理阶段把 strcat 等危险接口重写为带 size 参数的 __strcat_chk，运行时据此检查目的缓冲区上限。GCC 的 strlen pass 进一步识别已知前缀长度的目的指针，将 __strcat_chk 改写为性能更优的 __stpcpy_chk，并把目的指针前移 strlen(dst) 字节。这里的安全不变量是：目的指针前移后，传给 __stpcpy_chk 的 size 参数必须由原始 objsize 减去 strlen(dst)，否则运行时上限就被静默放宽 strlen(dst) 字节。</w:t>
+            </w:r>
+          </w:p>
+          <w:p>
+            <w:pPr>
+              <w:pStyle w:val="Normal"/>
+              <w:spacing w:lineRule="auto" w:line="360"/>
+              <w:ind w:firstLineChars="200" w:startChars="0" w:start="0" w:endChars="0" w:end="0"/>
+              <w:rPr>
+                <w:kern w:val="0"/>
+                <w:sz w:val="24"/>
+              </w:rPr>
+            </w:pPr>
+            <w:r>
+              <w:rPr>
+                <w:kern w:val="0"/>
+                <w:sz w:val="24"/>
+              </w:rPr>
+              <w:t xml:space="preserve">本方法构造的种子在该路径上稳定触发了 size 参数未相应减小的实例。反汇编层面 strcat → __strcat_chk → __stpcpy_chk 链条仍然出现，看似 FORTIFY 仍在生效，但"按 dst 剩余空间收紧上限"这一步已被丢弃。上报后该缺陷已被确认（PR-125079[6]）并合入主分支。该路径与 2018 年修复的 PR-87672[21] 位于同一文件，表明当年修复时遗漏了对称分支。</w:t>
+            </w:r>
+          </w:p>
+          <w:p>
+            <w:pPr>
+              <w:pStyle w:val="Normal"/>
+              <w:spacing w:lineRule="auto" w:line="360"/>
+              <w:ind w:firstLineChars="200" w:startChars="0" w:start="0" w:endChars="0" w:end="0"/>
+              <w:rPr>
+                <w:kern w:val="0"/>
+                <w:sz w:val="24"/>
+              </w:rPr>
+            </w:pPr>
+            <w:r>
+              <w:rPr>
+                <w:kern w:val="0"/>
+                <w:sz w:val="24"/>
+              </w:rPr>
+              <w:t xml:space="preserve">该缺陷命中了"FORTIFY 调用点的 size 参数下界推断"不变量，判定证据为静态符号与反汇编。该位置如图 7 所示。</w:t>
+            </w:r>
+          </w:p>
+          <w:p>
+            <w:pPr>
+              <w:pStyle w:val="Normal"/>
+              <w:spacing w:lineRule="auto" w:line="360"/>
+              <w:jc w:val="center"/>
+            </w:pPr>
+            <w:r>
+              <w:rPr/>
               <w:drawing>
-                <wp:inline distT="0" distB="0" distL="0" distR="0">
-                  <wp:extent cx="4283710" cy="6361430"/>
+                <wp:inline xmlns:wp="http://schemas.openxmlformats.org/drawingml/2006/wordprocessingDrawing" distT="0" distB="0" distL="0" distR="0">
+                  <wp:extent cx="4284090" cy="6361875"/>
                   <wp:effectExtent l="0" t="0" r="0" b="0"/>
                   <wp:docPr id="27" name="Figure27"/>
                   <wp:cNvGraphicFramePr>
@@ -4158,13 +4035,11 @@
                     <a:graphicData uri="http://schemas.openxmlformats.org/drawingml/2006/picture">
                       <pic:pic xmlns:pic="http://schemas.openxmlformats.org/drawingml/2006/picture">
                         <pic:nvPicPr>
-                          <pic:cNvPr id="27" name="Figure27"/>
-                          <pic:cNvPicPr>
-                            <a:picLocks noChangeAspect="1"/>
-                          </pic:cNvPicPr>
+                          <pic:cNvPr id="27" name="fortify-path.png"/>
+                          <pic:cNvPicPr/>
                         </pic:nvPicPr>
                         <pic:blipFill>
-                          <a:blip r:embed="rId12"/>
+                          <a:blip xmlns:r="http://schemas.openxmlformats.org/officeDocument/2006/relationships" r:embed="rId27"/>
                           <a:stretch>
                             <a:fillRect/>
                           </a:stretch>
@@ -4187,7 +4062,8 @@
           </w:p>
           <w:p>
             <w:pPr>
-              <w:spacing w:line="360" w:lineRule="auto"/>
+              <w:pStyle w:val="Normal"/>
+              <w:spacing w:lineRule="auto" w:line="360"/>
               <w:jc w:val="center"/>
               <w:rPr>
                 <w:rFonts w:ascii="宋体" w:hAnsi="宋体" w:eastAsia="宋体"/>
@@ -4208,15 +4084,17 @@
           </w:p>
           <w:p>
             <w:pPr>
-              <w:spacing w:line="360" w:lineRule="auto"/>
-              <w:rPr>
-                <w:sz w:val="24"/>
-              </w:rPr>
-            </w:pPr>
-          </w:p>
-          <w:p>
-            <w:pPr>
-              <w:spacing w:line="360" w:lineRule="auto"/>
+              <w:pStyle w:val="Normal"/>
+              <w:spacing w:lineRule="auto" w:line="360"/>
+              <w:rPr>
+                <w:sz w:val="24"/>
+              </w:rPr>
+            </w:pPr>
+          </w:p>
+          <w:p>
+            <w:pPr>
+              <w:pStyle w:val="Normal"/>
+              <w:spacing w:lineRule="auto" w:line="360"/>
               <w:rPr>
                 <w:b/>
                 <w:bCs/>
@@ -4231,63 +4109,67 @@
                 <w:kern w:val="0"/>
                 <w:sz w:val="24"/>
               </w:rPr>
-              <w:t>5.2 案例二：IBT 检查漏过 endbr 字节模式导致间接跳转保护被绕过</w:t>
-            </w:r>
-          </w:p>
-          <w:p>
-            <w:pPr>
-              <w:spacing w:line="360" w:lineRule="auto"/>
-              <w:ind w:left="0" w:leftChars="0" w:right="0" w:rightChars="0" w:firstLineChars="200"/>
-              <w:rPr>
-                <w:kern w:val="0"/>
-                <w:sz w:val="24"/>
-              </w:rPr>
-            </w:pPr>
-            <w:r>
-              <w:rPr>
-                <w:kern w:val="0"/>
-                <w:sz w:val="24"/>
-              </w:rPr>
-              <w:t>IBT 是 Intel CET 中针对间接跳转的保护机制[9]：硬件要求间接跳转或调用的目标地址必须以 endbr 指令开头，否则触发异常。endbr 在二进制中是固定的四字节值（endbr64 = F3 0F 1E FA、endbr32 = F3 0F 1E FB），按设计只应作为合法间接跳转入口出现在代码段。如果这四个字节以其他形式出现，例如作为 movabsq 指令的 64 位立即数的一部分嵌入 .text，攻击者就可以把控制流劫持到该处，硬件会将其识别为合法 landing pad，IBT 语义被绕过。</w:t>
-            </w:r>
-          </w:p>
-          <w:p>
-            <w:pPr>
-              <w:spacing w:line="360" w:lineRule="auto"/>
-              <w:ind w:left="0" w:leftChars="0" w:right="0" w:rightChars="0" w:firstLineChars="200"/>
-              <w:rPr>
-                <w:kern w:val="0"/>
-                <w:sz w:val="24"/>
-              </w:rPr>
-            </w:pPr>
-            <w:r>
-              <w:rPr>
-                <w:kern w:val="0"/>
-                <w:sz w:val="24"/>
-              </w:rPr>
-              <w:t>GCC 在 x86 后端用 ix86_endbr_immediate_operand 谓词做字节级检测：当目标启用 IBT 时，谓词扫描立即数中是否存在 endbr 模式，含该模式的立即数会被拒绝（同源历史修复参见 PR-96350[8]）。测试发现该谓词存在逻辑漏洞：扫描循环对"高位非零"的 64 位立即数提前退出，只要 endbr 字节排布在立即数高位，扫描就无法到达该位置。这类立即数被错误接受，进而在 .text 中嵌入了伪 landing pad。该缺陷已上报上游（PR-125084[18]），等待维护者回复。</w:t>
-            </w:r>
-          </w:p>
-          <w:p>
-            <w:pPr>
-              <w:spacing w:line="360" w:lineRule="auto"/>
-              <w:ind w:left="0" w:leftChars="0" w:right="0" w:rightChars="0" w:firstLineChars="200"/>
-              <w:rPr>
-                <w:kern w:val="0"/>
-                <w:sz w:val="24"/>
-              </w:rPr>
-            </w:pPr>
-            <w:r>
-              <w:rPr>
-                <w:kern w:val="0"/>
-                <w:sz w:val="24"/>
-              </w:rPr>
-              <w:t>该例命中"endbr 字节模式不应出现在非跳转目标的指令中"不变量，证据为代码段内 endbr 模式扫描，属静态指令流检查。</w:t>
-            </w:r>
-          </w:p>
-          <w:p>
-            <w:pPr>
-              <w:spacing w:line="360" w:lineRule="auto"/>
+              <w:t>5.2 案例二：IBT 字节模式漏检</w:t>
+            </w:r>
+          </w:p>
+          <w:p>
+            <w:pPr>
+              <w:pStyle w:val="Normal"/>
+              <w:spacing w:lineRule="auto" w:line="360"/>
+              <w:ind w:firstLineChars="200" w:startChars="0" w:start="0" w:endChars="0" w:end="0"/>
+              <w:rPr>
+                <w:kern w:val="0"/>
+                <w:sz w:val="24"/>
+              </w:rPr>
+            </w:pPr>
+            <w:r>
+              <w:rPr>
+                <w:kern w:val="0"/>
+                <w:sz w:val="24"/>
+              </w:rPr>
+              <w:t xml:space="preserve">IBT 是 Intel CET 中针对间接跳转的保护机制[22]：硬件要求间接跳转或调用的目标地址必须以 endbr 指令开头，否则触发异常。endbr 在二进制中是固定的四字节值（endbr64 = F3 0F 1E FA、endbr32 = F3 0F 1E FB），按设计只应作为合法间接跳转入口出现在代码段。如果这四个字节以其他形式出现，例如作为 movabsq 指令的 64 位立即数的一部分嵌入 .text，攻击者就可以把控制流劫持到该处，硬件会将其识别为合法 landing pad，IBT 语义被绕过。</w:t>
+            </w:r>
+          </w:p>
+          <w:p>
+            <w:pPr>
+              <w:pStyle w:val="Normal"/>
+              <w:spacing w:lineRule="auto" w:line="360"/>
+              <w:ind w:firstLineChars="200" w:startChars="0" w:start="0" w:endChars="0" w:end="0"/>
+              <w:rPr>
+                <w:kern w:val="0"/>
+                <w:sz w:val="24"/>
+              </w:rPr>
+            </w:pPr>
+            <w:r>
+              <w:rPr>
+                <w:kern w:val="0"/>
+                <w:sz w:val="24"/>
+              </w:rPr>
+              <w:t xml:space="preserve">GCC 在 x86 后端用 ix86_endbr_immediate_operand 谓词做字节级检测：当目标启用 IBT 时，谓词扫描立即数中是否存在 endbr 模式，含该模式的立即数会被拒绝（同源历史修复参见 PR-96350[23]）。测试发现该谓词存在逻辑漏洞：扫描循环对"高位非零"的 64 位立即数提前退出，只要 endbr 字节排布在立即数高位，扫描就无法到达该位置。这类立即数被错误接受，进而在 .text 中嵌入了伪 landing pad。该缺陷已上报上游（PR-125084[7]），等待维护者回复。</w:t>
+            </w:r>
+          </w:p>
+          <w:p>
+            <w:pPr>
+              <w:pStyle w:val="Normal"/>
+              <w:spacing w:lineRule="auto" w:line="360"/>
+              <w:ind w:firstLineChars="200" w:startChars="0" w:start="0" w:endChars="0" w:end="0"/>
+              <w:rPr>
+                <w:kern w:val="0"/>
+                <w:sz w:val="24"/>
+              </w:rPr>
+            </w:pPr>
+            <w:r>
+              <w:rPr>
+                <w:kern w:val="0"/>
+                <w:sz w:val="24"/>
+              </w:rPr>
+              <w:t xml:space="preserve">该例命中"endbr 字节模式不应出现在非跳转目标的指令中"不变量，证据为代码段内 endbr 模式扫描，属静态指令流检查。</w:t>
+            </w:r>
+          </w:p>
+          <w:p>
+            <w:pPr>
+              <w:pStyle w:val="Normal"/>
+              <w:spacing w:lineRule="auto" w:line="360"/>
               <w:rPr>
                 <w:b/>
                 <w:bCs/>
@@ -4302,29 +4184,31 @@
                 <w:kern w:val="0"/>
                 <w:sz w:val="24"/>
               </w:rPr>
-              <w:t>5.3 案例三：多 ISA 下 canary 寄存器返回时未清零</w:t>
-            </w:r>
-          </w:p>
-          <w:p>
-            <w:pPr>
-              <w:spacing w:line="360" w:lineRule="auto"/>
-              <w:ind w:left="0" w:leftChars="0" w:right="0" w:rightChars="0" w:firstLineChars="200"/>
-              <w:rPr>
-                <w:kern w:val="0"/>
-                <w:sz w:val="24"/>
-              </w:rPr>
-            </w:pPr>
-            <w:r>
-              <w:rPr>
-                <w:kern w:val="0"/>
-                <w:sz w:val="24"/>
-              </w:rPr>
-              <w:t>本方法在 GCC 通用栈保护后端的 fallback 路径上找到一例同类失效：MIPS、LoongArch 等 ISA 的 fallback 后端未提供专用 epilogue 模板，函数返回时金丝雀寄存器未显式清零，进程级 __stack_chk_guard 值在寄存器中残留。该问题与 2020 年针对 AArch64 / ARM 的 PR-96191[7] 同源，当年修复未覆盖上述后端。本课题以 meta-bug PR-125045[19] 统一跟踪该家族，其中 LoongArch 子例（PR-125049[20]）已被维护者确认并合入修复，其余正依次上报。</w:t>
-            </w:r>
-          </w:p>
-          <w:p>
-            <w:pPr>
-              <w:spacing w:line="360" w:lineRule="auto"/>
+              <w:t>5.3 案例三：多 ISA 下 canary 寄存器残留</w:t>
+            </w:r>
+          </w:p>
+          <w:p>
+            <w:pPr>
+              <w:pStyle w:val="Normal"/>
+              <w:spacing w:lineRule="auto" w:line="360"/>
+              <w:ind w:firstLineChars="200" w:startChars="0" w:start="0" w:endChars="0" w:end="0"/>
+              <w:rPr>
+                <w:kern w:val="0"/>
+                <w:sz w:val="24"/>
+              </w:rPr>
+            </w:pPr>
+            <w:r>
+              <w:rPr>
+                <w:kern w:val="0"/>
+                <w:sz w:val="24"/>
+              </w:rPr>
+              <w:t xml:space="preserve">本方法在 GCC 通用栈保护后端的 fallback 路径上找到一例同类失效：MIPS、LoongArch 等 ISA 的 fallback 后端未提供专用 epilogue 模板，函数返回时金丝雀寄存器未显式清零，进程级 __stack_chk_guard 值在寄存器中残留。该问题与 2020 年针对 AArch64 / ARM 的 PR-96191[5] 同源，当年修复未覆盖上述后端。本课题以 meta-bug PR-125045[8] 统一跟踪该家族，其中 LoongArch 子例（PR-125049[9]）已被维护者确认并合入修复，其余正依次上报。</w:t>
+            </w:r>
+          </w:p>
+          <w:p>
+            <w:pPr>
+              <w:pStyle w:val="Normal"/>
+              <w:spacing w:lineRule="auto" w:line="360"/>
               <w:rPr>
                 <w:b/>
                 <w:bCs/>
@@ -4344,33 +4228,36 @@
           </w:p>
           <w:p>
             <w:pPr>
-              <w:spacing w:line="360" w:lineRule="auto"/>
-              <w:ind w:left="0" w:leftChars="0" w:right="0" w:rightChars="0" w:firstLineChars="200"/>
-              <w:rPr>
-                <w:kern w:val="0"/>
-                <w:sz w:val="24"/>
-              </w:rPr>
-            </w:pPr>
-            <w:r>
-              <w:rPr>
-                <w:kern w:val="0"/>
-                <w:sz w:val="24"/>
-              </w:rPr>
-              <w:t>上述三例缺陷共同说明：即使二进制仍带有保护，其底层依赖的部分安全不变量也可能已经失效。本文方法在不修改编译器的前提下，通过变异与预言机的组合成功将此类隐蔽问题暴露。</w:t>
-            </w:r>
-          </w:p>
-          <w:p>
-            <w:pPr>
-              <w:spacing w:line="360" w:lineRule="auto"/>
-              <w:rPr>
-                <w:sz w:val="24"/>
-              </w:rPr>
-            </w:pPr>
-          </w:p>
-          <w:p>
-            <w:pPr>
+              <w:pStyle w:val="Normal"/>
+              <w:spacing w:lineRule="auto" w:line="360"/>
+              <w:ind w:firstLineChars="200" w:startChars="0" w:start="0" w:endChars="0" w:end="0"/>
+              <w:rPr>
+                <w:kern w:val="0"/>
+                <w:sz w:val="24"/>
+              </w:rPr>
+            </w:pPr>
+            <w:r>
+              <w:rPr>
+                <w:kern w:val="0"/>
+                <w:sz w:val="24"/>
+              </w:rPr>
+              <w:t xml:space="preserve">上述三例缺陷共同说明：即使二进制仍带有保护，其底层依赖的部分安全不变量也可能已经失效。本文方法在不修改编译器的前提下，通过变异与预言机的组合成功将此类隐蔽问题暴露。</w:t>
+            </w:r>
+          </w:p>
+          <w:p>
+            <w:pPr>
+              <w:pStyle w:val="Normal"/>
+              <w:spacing w:lineRule="auto" w:line="360"/>
+              <w:rPr>
+                <w:sz w:val="24"/>
+              </w:rPr>
+            </w:pPr>
+          </w:p>
+          <w:p>
+            <w:pPr>
+              <w:pStyle w:val="Normal"/>
               <w:widowControl/>
-              <w:jc w:val="left"/>
+              <w:jc w:val="start"/>
               <w:rPr>
                 <w:b/>
                 <w:bCs/>
@@ -4390,416 +4277,439 @@
           </w:p>
           <w:p>
             <w:pPr>
+              <w:pStyle w:val="Normal"/>
               <w:keepLines/>
-              <w:spacing w:line="360" w:lineRule="auto"/>
-              <w:jc w:val="left"/>
-              <w:rPr>
-                <w:kern w:val="0"/>
-                <w:sz w:val="24"/>
-              </w:rPr>
-            </w:pPr>
-            <w:r>
-              <w:rPr>
-                <w:kern w:val="0"/>
-                <w:sz w:val="24"/>
-              </w:rPr>
-              <w:t>[1] Yang X, Chen Y, Eide E, et al. Finding and understanding bugs in C compilers[C]//Proceedings of the 32nd ACM SIGPLAN Conference on Programming Language Design and Implementation (PLDI). 2011: 283-294.</w:t>
-            </w:r>
-          </w:p>
-          <w:p>
-            <w:pPr>
+              <w:spacing w:lineRule="auto" w:line="360"/>
+              <w:jc w:val="start"/>
+              <w:rPr>
+                <w:kern w:val="0"/>
+                <w:sz w:val="24"/>
+              </w:rPr>
+            </w:pPr>
+            <w:r>
+              <w:rPr>
+                <w:kern w:val="0"/>
+                <w:sz w:val="24"/>
+              </w:rPr>
+              <w:t xml:space="preserve">[1] CVE Program. CVE Metrics — published vulnerabilities trend[EB/OL]. (2026)[2026-05-12]. https://www.cve.org/about/Metrics.</w:t>
+            </w:r>
+          </w:p>
+          <w:p>
+            <w:pPr>
+              <w:pStyle w:val="Normal"/>
               <w:keepLines/>
-              <w:spacing w:line="360" w:lineRule="auto"/>
-              <w:jc w:val="left"/>
-              <w:rPr>
-                <w:kern w:val="0"/>
-                <w:sz w:val="24"/>
-              </w:rPr>
-            </w:pPr>
-            <w:r>
-              <w:rPr>
-                <w:kern w:val="0"/>
-                <w:sz w:val="24"/>
-              </w:rPr>
-              <w:t>[2] Livinskii V, Babokin D, Regehr J. Random testing for C and C++ compilers with YARPGen[C]//Proceedings of the ACM on Programming Languages (OOPSLA). 2020, 4: 1-25.</w:t>
-            </w:r>
-          </w:p>
-          <w:p>
-            <w:pPr>
+              <w:spacing w:lineRule="auto" w:line="360"/>
+              <w:jc w:val="start"/>
+              <w:rPr>
+                <w:kern w:val="0"/>
+                <w:sz w:val="24"/>
+              </w:rPr>
+            </w:pPr>
+            <w:r>
+              <w:rPr>
+                <w:kern w:val="0"/>
+                <w:sz w:val="24"/>
+              </w:rPr>
+              <w:t xml:space="preserve">[2] Microsoft Security Response Center. Microsoft Security Response Center Blog[EB/OL]. (2023)[2026-05-13]. https://www.microsoft.com/en-us/msrc/blog.</w:t>
+            </w:r>
+          </w:p>
+          <w:p>
+            <w:pPr>
+              <w:pStyle w:val="Normal"/>
               <w:keepLines/>
-              <w:spacing w:line="360" w:lineRule="auto"/>
-              <w:jc w:val="left"/>
-              <w:rPr>
-                <w:kern w:val="0"/>
-                <w:sz w:val="24"/>
-              </w:rPr>
-            </w:pPr>
-            <w:r>
-              <w:rPr>
-                <w:kern w:val="0"/>
-                <w:sz w:val="24"/>
-              </w:rPr>
-              <w:t>[3] Zalewski M. American Fuzzy Lop (AFL)[EB/OL]. (2014)[2026-02-15]. https://lcamtuf.coredump.cx/afl/.</w:t>
-            </w:r>
-          </w:p>
-          <w:p>
-            <w:pPr>
+              <w:spacing w:lineRule="auto" w:line="360"/>
+              <w:jc w:val="start"/>
+              <w:rPr>
+                <w:kern w:val="0"/>
+                <w:sz w:val="24"/>
+              </w:rPr>
+            </w:pPr>
+            <w:r>
+              <w:rPr>
+                <w:kern w:val="0"/>
+                <w:sz w:val="24"/>
+              </w:rPr>
+              <w:t xml:space="preserve">[3] Google Security Blog. Memory Safe Languages in Android 13[EB/OL]. (2022-12)[2026-05-13]. https://security.googleblog.com/2022/12/memory-safe-languages-in-android-13.html.</w:t>
+            </w:r>
+          </w:p>
+          <w:p>
+            <w:pPr>
+              <w:pStyle w:val="Normal"/>
               <w:keepLines/>
-              <w:spacing w:line="360" w:lineRule="auto"/>
-              <w:jc w:val="left"/>
-              <w:rPr>
-                <w:kern w:val="0"/>
-                <w:sz w:val="24"/>
-              </w:rPr>
-            </w:pPr>
-            <w:r>
-              <w:rPr>
-                <w:kern w:val="0"/>
-                <w:sz w:val="24"/>
-              </w:rPr>
-              <w:t>[4] Serebryany K. Continuous fuzzing with libFuzzer and AddressSanitizer[C]//IEEE Cybersecurity Development (SecDev). 2016: 157.</w:t>
-            </w:r>
-          </w:p>
-          <w:p>
-            <w:pPr>
+              <w:spacing w:lineRule="auto" w:line="360"/>
+              <w:jc w:val="start"/>
+              <w:rPr>
+                <w:kern w:val="0"/>
+                <w:sz w:val="24"/>
+              </w:rPr>
+            </w:pPr>
+            <w:r>
+              <w:rPr>
+                <w:kern w:val="0"/>
+                <w:sz w:val="24"/>
+              </w:rPr>
+              <w:t xml:space="preserve">[4] Meta Security. CVE-2023-4039: GCC's -fstack-protector fails to guard dynamic stack allocations on AArch64[EB/OL]. (2023)[2026-02-15]. https://rtx.meta.security/mitigation/2023/09/12/CVE-2023-4039.html.</w:t>
+            </w:r>
+          </w:p>
+          <w:p>
+            <w:pPr>
+              <w:pStyle w:val="Normal"/>
               <w:keepLines/>
-              <w:spacing w:line="360" w:lineRule="auto"/>
-              <w:jc w:val="left"/>
-              <w:rPr>
-                <w:kern w:val="0"/>
-                <w:sz w:val="24"/>
-              </w:rPr>
-            </w:pPr>
-            <w:r>
-              <w:rPr>
-                <w:kern w:val="0"/>
-                <w:sz w:val="24"/>
-              </w:rPr>
-              <w:t>[5] Yang C, Deng Y, Lu R, et al. WhiteFox: White-box compiler fuzzing empowered by large language models[C]//Proceedings of the ACM on Programming Languages (OOPSLA). 2024.</w:t>
-            </w:r>
-          </w:p>
-          <w:p>
-            <w:pPr>
+              <w:spacing w:lineRule="auto" w:line="360"/>
+              <w:jc w:val="start"/>
+              <w:rPr>
+                <w:kern w:val="0"/>
+                <w:sz w:val="24"/>
+              </w:rPr>
+            </w:pPr>
+            <w:r>
+              <w:rPr>
+                <w:kern w:val="0"/>
+                <w:sz w:val="24"/>
+              </w:rPr>
+              <w:t xml:space="preserve">[5] GNU Project. GCC Bugzilla PR 96191 — aarch64 stack_protect_test canary leak[EB/OL]. (2020)[2026-05-11]. https://gcc.gnu.org/bugzilla/show_bug.cgi?id=96191.</w:t>
+            </w:r>
+          </w:p>
+          <w:p>
+            <w:pPr>
+              <w:pStyle w:val="Normal"/>
               <w:keepLines/>
-              <w:spacing w:line="360" w:lineRule="auto"/>
-              <w:jc w:val="left"/>
-              <w:rPr>
-                <w:kern w:val="0"/>
-                <w:sz w:val="24"/>
-              </w:rPr>
-            </w:pPr>
-            <w:r>
-              <w:rPr>
-                <w:kern w:val="0"/>
-                <w:sz w:val="24"/>
-              </w:rPr>
-              <w:t>[6] GNU Project. GCC Bugzilla PR 87672 — [9 regression] 81512c36 causes ICE in bootstrap stage 3 using "-D_FORTIFY_SOURCE=2"[EB/OL]. (2018)[2026-05-11]. https://gcc.gnu.org/bugzilla/show_bug.cgi?id=87672.</w:t>
-            </w:r>
-          </w:p>
-          <w:p>
-            <w:pPr>
+              <w:spacing w:lineRule="auto" w:line="360"/>
+              <w:jc w:val="start"/>
+              <w:rPr>
+                <w:kern w:val="0"/>
+                <w:sz w:val="24"/>
+              </w:rPr>
+            </w:pPr>
+            <w:r>
+              <w:rPr>
+                <w:kern w:val="0"/>
+                <w:sz w:val="24"/>
+              </w:rPr>
+              <w:t xml:space="preserve">[6] GNU Project. GCC Bugzilla PR 125079 — [13/14/15 Regression] tree-ssa-strlen get_string_length: __strcat_chk -&gt; __stpcpy_chk drops bound subtract[EB/OL]. (2026)[2026-05-11]. https://gcc.gnu.org/bugzilla/show_bug.cgi?id=125079.</w:t>
+            </w:r>
+          </w:p>
+          <w:p>
+            <w:pPr>
+              <w:pStyle w:val="Normal"/>
               <w:keepLines/>
-              <w:spacing w:line="360" w:lineRule="auto"/>
-              <w:jc w:val="left"/>
-              <w:rPr>
-                <w:kern w:val="0"/>
-                <w:sz w:val="24"/>
-              </w:rPr>
-            </w:pPr>
-            <w:r>
-              <w:rPr>
-                <w:kern w:val="0"/>
-                <w:sz w:val="24"/>
-              </w:rPr>
-              <w:t>[7] GNU Project. GCC Bugzilla PR 96191 — aarch64 stack_protect_test canary leak[EB/OL]. (2020)[2026-05-11]. https://gcc.gnu.org/bugzilla/show_bug.cgi?id=96191.</w:t>
-            </w:r>
-          </w:p>
-          <w:p>
-            <w:pPr>
+              <w:spacing w:lineRule="auto" w:line="360"/>
+              <w:jc w:val="start"/>
+              <w:rPr>
+                <w:kern w:val="0"/>
+                <w:sz w:val="24"/>
+              </w:rPr>
+            </w:pPr>
+            <w:r>
+              <w:rPr>
+                <w:kern w:val="0"/>
+                <w:sz w:val="24"/>
+              </w:rPr>
+              <w:t xml:space="preserve">[7] GNU Project. GCC Bugzilla PR 125084 — [target/i386] ix86_endbr_immediate_operand misses ENDBR pattern when upper bytes nonzero[EB/OL]. (2026)[2026-05-11]. https://gcc.gnu.org/bugzilla/show_bug.cgi?id=125084.</w:t>
+            </w:r>
+          </w:p>
+          <w:p>
+            <w:pPr>
+              <w:pStyle w:val="Normal"/>
               <w:keepLines/>
-              <w:spacing w:line="360" w:lineRule="auto"/>
-              <w:jc w:val="left"/>
-              <w:rPr>
-                <w:kern w:val="0"/>
-                <w:sz w:val="24"/>
-              </w:rPr>
-            </w:pPr>
-            <w:r>
-              <w:rPr>
-                <w:kern w:val="0"/>
-                <w:sz w:val="24"/>
-              </w:rPr>
-              <w:t>[8] GNU Project. GCC Bugzilla PR 96350 — [cet] For ENDBR immediate, the binary would include a gadget that starts with a fake ENDBR64 opcode[EB/OL]. (2020)[2026-05-11]. https://gcc.gnu.org/bugzilla/show_bug.cgi?id=96350.</w:t>
-            </w:r>
-          </w:p>
-          <w:p>
-            <w:pPr>
+              <w:spacing w:lineRule="auto" w:line="360"/>
+              <w:jc w:val="start"/>
+              <w:rPr>
+                <w:kern w:val="0"/>
+                <w:sz w:val="24"/>
+              </w:rPr>
+            </w:pPr>
+            <w:r>
+              <w:rPr>
+                <w:kern w:val="0"/>
+                <w:sz w:val="24"/>
+              </w:rPr>
+              <w:t xml:space="preserve">[8] GNU Project. GCC Bugzilla PR 125045 — [meta-bug] SSP fallback leaves canary in live GPR on many targets[EB/OL]. (2026)[2026-05-11]. https://gcc.gnu.org/bugzilla/show_bug.cgi?id=125045.</w:t>
+            </w:r>
+          </w:p>
+          <w:p>
+            <w:pPr>
+              <w:pStyle w:val="Normal"/>
               <w:keepLines/>
-              <w:spacing w:line="360" w:lineRule="auto"/>
-              <w:jc w:val="left"/>
-              <w:rPr>
-                <w:kern w:val="0"/>
-                <w:sz w:val="24"/>
-              </w:rPr>
-            </w:pPr>
-            <w:r>
-              <w:rPr>
-                <w:kern w:val="0"/>
-                <w:sz w:val="24"/>
-              </w:rPr>
-              <w:t>[9] Intel Corporation. Control-flow Enforcement Technology Specification[R/OL]. (2019)[2026-02-15]. https://www.intel.com/content/www/us/en/developer/articles/technical/technical-look-control-flow-enforcement-technology.html.</w:t>
-            </w:r>
-          </w:p>
-          <w:p>
-            <w:pPr>
+              <w:spacing w:lineRule="auto" w:line="360"/>
+              <w:jc w:val="start"/>
+              <w:rPr>
+                <w:kern w:val="0"/>
+                <w:sz w:val="24"/>
+              </w:rPr>
+            </w:pPr>
+            <w:r>
+              <w:rPr>
+                <w:kern w:val="0"/>
+                <w:sz w:val="24"/>
+              </w:rPr>
+              <w:t xml:space="preserve">[9] GNU Project. GCC Bugzilla PR 125049 — [loongarch] SSP fallback leaves __stack_chk_guard live in $r12 at `jr $r1`[EB/OL]. (2026)[2026-05-11]. https://gcc.gnu.org/bugzilla/show_bug.cgi?id=125049.</w:t>
+            </w:r>
+          </w:p>
+          <w:p>
+            <w:pPr>
+              <w:pStyle w:val="Normal"/>
               <w:keepLines/>
-              <w:spacing w:line="360" w:lineRule="auto"/>
-              <w:jc w:val="left"/>
-              <w:rPr>
-                <w:kern w:val="0"/>
-                <w:sz w:val="24"/>
-              </w:rPr>
-            </w:pPr>
-            <w:r>
-              <w:rPr>
-                <w:kern w:val="0"/>
-                <w:sz w:val="24"/>
-              </w:rPr>
-              <w:t>[10] Free Software Foundation. The GNU C Library Reference Manual: Source Fortification[EB/OL]. (2024)[2026-02-15]. https://sourceware.org/glibc/manual/latest/html_node/Source-Fortification.html.</w:t>
-            </w:r>
-          </w:p>
-          <w:p>
-            <w:pPr>
+              <w:spacing w:lineRule="auto" w:line="360"/>
+              <w:jc w:val="start"/>
+              <w:rPr>
+                <w:kern w:val="0"/>
+                <w:sz w:val="24"/>
+              </w:rPr>
+            </w:pPr>
+            <w:r>
+              <w:rPr>
+                <w:kern w:val="0"/>
+                <w:sz w:val="24"/>
+              </w:rPr>
+              <w:t xml:space="preserve">[10] Yang X, Chen Y, Eide E, et al. Finding and understanding bugs in C compilers[C]//Proceedings of the 32nd ACM SIGPLAN Conference on Programming Language Design and Implementation (PLDI). 2011: 283-294.</w:t>
+            </w:r>
+          </w:p>
+          <w:p>
+            <w:pPr>
+              <w:pStyle w:val="Normal"/>
               <w:keepLines/>
-              <w:spacing w:line="360" w:lineRule="auto"/>
-              <w:jc w:val="left"/>
-              <w:rPr>
-                <w:kern w:val="0"/>
-                <w:sz w:val="24"/>
-              </w:rPr>
-            </w:pPr>
-            <w:r>
-              <w:rPr>
-                <w:kern w:val="0"/>
-                <w:sz w:val="24"/>
-              </w:rPr>
-              <w:t>[11] Le V, Afshari M, Su Z. Compiler validation via equivalence modulo inputs[C]//Proceedings of the 35th ACM SIGPLAN Conference on Programming Language Design and Implementation (PLDI). 2014: 216-226.</w:t>
-            </w:r>
-          </w:p>
-          <w:p>
-            <w:pPr>
+              <w:spacing w:lineRule="auto" w:line="360"/>
+              <w:jc w:val="start"/>
+              <w:rPr>
+                <w:kern w:val="0"/>
+                <w:sz w:val="24"/>
+              </w:rPr>
+            </w:pPr>
+            <w:r>
+              <w:rPr>
+                <w:kern w:val="0"/>
+                <w:sz w:val="24"/>
+              </w:rPr>
+              <w:t xml:space="preserve">[11] Livinskii V, Babokin D, Regehr J. Random testing for C and C++ compilers with YARPGen[C]//Proceedings of the ACM on Programming Languages (OOPSLA). 2020, 4: 1-25.</w:t>
+            </w:r>
+          </w:p>
+          <w:p>
+            <w:pPr>
+              <w:pStyle w:val="Normal"/>
               <w:keepLines/>
-              <w:spacing w:line="360" w:lineRule="auto"/>
-              <w:jc w:val="left"/>
-              <w:rPr>
-                <w:kern w:val="0"/>
-                <w:sz w:val="24"/>
-              </w:rPr>
-            </w:pPr>
-            <w:r>
-              <w:rPr>
-                <w:kern w:val="0"/>
-                <w:sz w:val="24"/>
-              </w:rPr>
-              <w:t>[12] Li S, Su Z. UBfuzz: Finding bugs in sanitizer implementations[C]//Proceedings of the 29th ACM International Conference on Architectural Support for Programming Languages and Operating Systems (ASPLOS). 2024.</w:t>
-            </w:r>
-          </w:p>
-          <w:p>
-            <w:pPr>
+              <w:spacing w:lineRule="auto" w:line="360"/>
+              <w:jc w:val="start"/>
+              <w:rPr>
+                <w:kern w:val="0"/>
+                <w:sz w:val="24"/>
+              </w:rPr>
+            </w:pPr>
+            <w:r>
+              <w:rPr>
+                <w:kern w:val="0"/>
+                <w:sz w:val="24"/>
+              </w:rPr>
+              <w:t xml:space="preserve">[12] Zalewski M. American Fuzzy Lop (AFL)[EB/OL]. (2014)[2026-02-15]. https://lcamtuf.coredump.cx/afl/.</w:t>
+            </w:r>
+          </w:p>
+          <w:p>
+            <w:pPr>
+              <w:pStyle w:val="Normal"/>
               <w:keepLines/>
-              <w:spacing w:line="360" w:lineRule="auto"/>
-              <w:jc w:val="left"/>
-              <w:rPr>
-                <w:kern w:val="0"/>
-                <w:sz w:val="24"/>
-              </w:rPr>
-            </w:pPr>
-            <w:r>
-              <w:rPr>
-                <w:kern w:val="0"/>
-                <w:sz w:val="24"/>
-              </w:rPr>
-              <w:t>[13] Ma H, Shen Q, Tian Y, et al. Fuzzing deep learning compilers with HirGen[C]//Proceedings of the 32nd ACM SIGSOFT International Symposium on Software Testing and Analysis (ISSTA). 2023.</w:t>
-            </w:r>
-          </w:p>
-          <w:p>
-            <w:pPr>
+              <w:spacing w:lineRule="auto" w:line="360"/>
+              <w:jc w:val="start"/>
+              <w:rPr>
+                <w:kern w:val="0"/>
+                <w:sz w:val="24"/>
+              </w:rPr>
+            </w:pPr>
+            <w:r>
+              <w:rPr>
+                <w:kern w:val="0"/>
+                <w:sz w:val="24"/>
+              </w:rPr>
+              <w:t xml:space="preserve">[13] Serebryany K. Continuous fuzzing with libFuzzer and AddressSanitizer[C]//IEEE Cybersecurity Development (SecDev). 2016: 157.</w:t>
+            </w:r>
+          </w:p>
+          <w:p>
+            <w:pPr>
+              <w:pStyle w:val="Normal"/>
               <w:keepLines/>
-              <w:spacing w:line="360" w:lineRule="auto"/>
-              <w:jc w:val="left"/>
-              <w:rPr>
-                <w:kern w:val="0"/>
-                <w:sz w:val="24"/>
-              </w:rPr>
-            </w:pPr>
-            <w:r>
-              <w:rPr>
-                <w:kern w:val="0"/>
-                <w:sz w:val="24"/>
-              </w:rPr>
-              <w:t>[14] Even-Mendoza K, Sharma A, Donaldson A F, et al. GrayC: Greybox fuzzing of compilers and analysers for C[C]//Proceedings of the 32nd ACM SIGSOFT International Symposium on Software Testing and Analysis (ISSTA). 2023: 1219-1231.</w:t>
-            </w:r>
-          </w:p>
-          <w:p>
-            <w:pPr>
+              <w:spacing w:lineRule="auto" w:line="360"/>
+              <w:jc w:val="start"/>
+              <w:rPr>
+                <w:kern w:val="0"/>
+                <w:sz w:val="24"/>
+              </w:rPr>
+            </w:pPr>
+            <w:r>
+              <w:rPr>
+                <w:kern w:val="0"/>
+                <w:sz w:val="24"/>
+              </w:rPr>
+              <w:t xml:space="preserve">[14] Even-Mendoza K, Sharma A, Donaldson A F, et al. GrayC: Greybox fuzzing of compilers and analysers for C[C]//Proceedings of the 32nd ACM SIGSOFT International Symposium on Software Testing and Analysis (ISSTA). 2023: 1219-1231.</w:t>
+            </w:r>
+          </w:p>
+          <w:p>
+            <w:pPr>
+              <w:pStyle w:val="Normal"/>
               <w:keepLines/>
-              <w:spacing w:line="360" w:lineRule="auto"/>
-              <w:jc w:val="left"/>
-              <w:rPr>
-                <w:kern w:val="0"/>
-                <w:sz w:val="24"/>
-              </w:rPr>
-            </w:pPr>
-            <w:r>
-              <w:rPr>
-                <w:kern w:val="0"/>
-                <w:sz w:val="24"/>
-              </w:rPr>
-              <w:t>[15] Yang Y, Zhang H, Ren Z, et al. Hybrid language processor fuzzing via LLM-based constraint solving[C]//Proceedings of the 34th USENIX Security Symposium (USENIX Security). 2025.</w:t>
-            </w:r>
-          </w:p>
-          <w:p>
-            <w:pPr>
+              <w:spacing w:lineRule="auto" w:line="360"/>
+              <w:jc w:val="start"/>
+              <w:rPr>
+                <w:kern w:val="0"/>
+                <w:sz w:val="24"/>
+              </w:rPr>
+            </w:pPr>
+            <w:r>
+              <w:rPr>
+                <w:kern w:val="0"/>
+                <w:sz w:val="24"/>
+              </w:rPr>
+              <w:t xml:space="preserve">[15] Le V, Afshari M, Su Z. Compiler validation via equivalence modulo inputs[C]//Proceedings of the 35th ACM SIGPLAN Conference on Programming Language Design and Implementation (PLDI). 2014: 216-226.</w:t>
+            </w:r>
+          </w:p>
+          <w:p>
+            <w:pPr>
+              <w:pStyle w:val="Normal"/>
               <w:keepLines/>
-              <w:spacing w:line="360" w:lineRule="auto"/>
-              <w:jc w:val="left"/>
-              <w:rPr>
-                <w:kern w:val="0"/>
-                <w:sz w:val="24"/>
-              </w:rPr>
-            </w:pPr>
-            <w:r>
-              <w:rPr>
-                <w:kern w:val="0"/>
-                <w:sz w:val="24"/>
-              </w:rPr>
-              <w:t>[16] Meta Security. CVE-2023-4039: GCC's -fstack-protector fails to guard dynamic stack allocations on AArch64[EB/OL]. (2023)[2026-02-15]. https://rtx.meta.security/mitigation/2023/09/12/CVE-2023-4039.html.</w:t>
-            </w:r>
-          </w:p>
-          <w:p>
-            <w:pPr>
+              <w:spacing w:lineRule="auto" w:line="360"/>
+              <w:jc w:val="start"/>
+              <w:rPr>
+                <w:kern w:val="0"/>
+                <w:sz w:val="24"/>
+              </w:rPr>
+            </w:pPr>
+            <w:r>
+              <w:rPr>
+                <w:kern w:val="0"/>
+                <w:sz w:val="24"/>
+              </w:rPr>
+              <w:t xml:space="preserve">[16] Yang C, Deng Y, Lu R, et al. WhiteFox: White-box compiler fuzzing empowered by large language models[C]//Proceedings of the ACM on Programming Languages (OOPSLA). 2024.</w:t>
+            </w:r>
+          </w:p>
+          <w:p>
+            <w:pPr>
+              <w:pStyle w:val="Normal"/>
               <w:keepLines/>
-              <w:spacing w:line="360" w:lineRule="auto"/>
-              <w:jc w:val="left"/>
-              <w:rPr>
-                <w:kern w:val="0"/>
-                <w:sz w:val="24"/>
-              </w:rPr>
-            </w:pPr>
-            <w:r>
-              <w:rPr>
-                <w:kern w:val="0"/>
-                <w:sz w:val="24"/>
-              </w:rPr>
-              <w:t>[17] GNU Project. GCC Bugzilla PR 125079 — [13/14/15 Regression] tree-ssa-strlen get_string_length: __strcat_chk -&gt; __stpcpy_chk drops bound subtract[EB/OL]. (2026)[2026-05-11]. https://gcc.gnu.org/bugzilla/show_bug.cgi?id=125079.</w:t>
-            </w:r>
-          </w:p>
-          <w:p>
-            <w:pPr>
+              <w:spacing w:lineRule="auto" w:line="360"/>
+              <w:jc w:val="start"/>
+              <w:rPr>
+                <w:kern w:val="0"/>
+                <w:sz w:val="24"/>
+              </w:rPr>
+            </w:pPr>
+            <w:r>
+              <w:rPr>
+                <w:kern w:val="0"/>
+                <w:sz w:val="24"/>
+              </w:rPr>
+              <w:t xml:space="preserve">[17] Yang Y, Zhang H, Ren Z, et al. Hybrid language processor fuzzing via LLM-based constraint solving[C]//Proceedings of the 34th USENIX Security Symposium (USENIX Security). 2025.</w:t>
+            </w:r>
+          </w:p>
+          <w:p>
+            <w:pPr>
+              <w:pStyle w:val="Normal"/>
               <w:keepLines/>
-              <w:spacing w:line="360" w:lineRule="auto"/>
-              <w:jc w:val="left"/>
-              <w:rPr>
-                <w:kern w:val="0"/>
-                <w:sz w:val="24"/>
-              </w:rPr>
-            </w:pPr>
-            <w:r>
-              <w:rPr>
-                <w:kern w:val="0"/>
-                <w:sz w:val="24"/>
-              </w:rPr>
-              <w:t>[18] GNU Project. GCC Bugzilla PR 125084 — [target/i386] ix86_endbr_immediate_operand misses ENDBR pattern when upper bytes nonzero[EB/OL]. (2026)[2026-05-11]. https://gcc.gnu.org/bugzilla/show_bug.cgi?id=125084.</w:t>
-            </w:r>
-          </w:p>
-          <w:p>
-            <w:pPr>
+              <w:spacing w:lineRule="auto" w:line="360"/>
+              <w:jc w:val="start"/>
+              <w:rPr>
+                <w:kern w:val="0"/>
+                <w:sz w:val="24"/>
+              </w:rPr>
+            </w:pPr>
+            <w:r>
+              <w:rPr>
+                <w:kern w:val="0"/>
+                <w:sz w:val="24"/>
+              </w:rPr>
+              <w:t xml:space="preserve">[18] Li S, Su Z. UBfuzz: Finding bugs in sanitizer implementations[C]//Proceedings of the 29th ACM International Conference on Architectural Support for Programming Languages and Operating Systems (ASPLOS). 2024.</w:t>
+            </w:r>
+          </w:p>
+          <w:p>
+            <w:pPr>
+              <w:pStyle w:val="Normal"/>
               <w:keepLines/>
-              <w:spacing w:line="360" w:lineRule="auto"/>
-              <w:jc w:val="left"/>
-              <w:rPr>
-                <w:kern w:val="0"/>
-                <w:sz w:val="24"/>
-              </w:rPr>
-            </w:pPr>
-            <w:r>
-              <w:rPr>
-                <w:kern w:val="0"/>
-                <w:sz w:val="24"/>
-              </w:rPr>
-              <w:t>[19] GNU Project. GCC Bugzilla PR 125045 — [meta-bug] SSP fallback leaves canary in live GPR on many targets[EB/OL]. (2026)[2026-05-11]. https://gcc.gnu.org/bugzilla/show_bug.cgi?id=125045.</w:t>
-            </w:r>
-          </w:p>
-          <w:p>
-            <w:pPr>
+              <w:spacing w:lineRule="auto" w:line="360"/>
+              <w:jc w:val="start"/>
+              <w:rPr>
+                <w:kern w:val="0"/>
+                <w:sz w:val="24"/>
+              </w:rPr>
+            </w:pPr>
+            <w:r>
+              <w:rPr>
+                <w:kern w:val="0"/>
+                <w:sz w:val="24"/>
+              </w:rPr>
+              <w:t xml:space="preserve">[19] Ma H, Shen Q, Tian Y, et al. Fuzzing deep learning compilers with HirGen[C]//Proceedings of the 32nd ACM SIGSOFT International Symposium on Software Testing and Analysis (ISSTA). 2023.</w:t>
+            </w:r>
+          </w:p>
+          <w:p>
+            <w:pPr>
+              <w:pStyle w:val="Normal"/>
               <w:keepLines/>
-              <w:spacing w:line="360" w:lineRule="auto"/>
-              <w:jc w:val="left"/>
-              <w:rPr>
-                <w:kern w:val="0"/>
-                <w:sz w:val="24"/>
-              </w:rPr>
-            </w:pPr>
-            <w:r>
-              <w:rPr>
-                <w:kern w:val="0"/>
-                <w:sz w:val="24"/>
-              </w:rPr>
-              <w:t>[20] GNU Project. GCC Bugzilla PR 125049 — [loongarch] SSP fallback leaves __stack_chk_guard live in $r12 at `jr $r1`[EB/OL]. (2026)[2026-05-11]. https://gcc.gnu.org/bugzilla/show_bug.cgi?id=125049.</w:t>
-            </w:r>
-          </w:p>
-          <w:p>
-            <w:pPr>
+              <w:spacing w:lineRule="auto" w:line="360"/>
+              <w:jc w:val="start"/>
+              <w:rPr>
+                <w:kern w:val="0"/>
+                <w:sz w:val="24"/>
+              </w:rPr>
+            </w:pPr>
+            <w:r>
+              <w:rPr>
+                <w:kern w:val="0"/>
+                <w:sz w:val="24"/>
+              </w:rPr>
+              <w:t xml:space="preserve">[20] Free Software Foundation. The GNU C Library Reference Manual: Source Fortification[EB/OL]. (2024)[2026-02-15]. https://sourceware.org/glibc/manual/latest/html_node/Source-Fortification.html.</w:t>
+            </w:r>
+          </w:p>
+          <w:p>
+            <w:pPr>
+              <w:pStyle w:val="Normal"/>
               <w:keepLines/>
-              <w:spacing w:line="360" w:lineRule="auto"/>
-              <w:jc w:val="left"/>
-              <w:rPr>
-                <w:kern w:val="0"/>
-                <w:sz w:val="24"/>
-              </w:rPr>
-            </w:pPr>
-            <w:r>
-              <w:rPr>
-                <w:kern w:val="0"/>
-                <w:sz w:val="24"/>
-              </w:rPr>
-              <w:t>[21] CVE Program. CVE Metrics — published vulnerabilities trend[EB/OL]. (2026)[2026-05-12]. https://www.cve.org/about/Metrics.</w:t>
-            </w:r>
-          </w:p>
-          <w:p>
-            <w:pPr>
+              <w:spacing w:lineRule="auto" w:line="360"/>
+              <w:jc w:val="start"/>
+              <w:rPr>
+                <w:kern w:val="0"/>
+                <w:sz w:val="24"/>
+              </w:rPr>
+            </w:pPr>
+            <w:r>
+              <w:rPr>
+                <w:kern w:val="0"/>
+                <w:sz w:val="24"/>
+              </w:rPr>
+              <w:t xml:space="preserve">[21] GNU Project. GCC Bugzilla PR 87672 — [9 regression] 81512c36 causes ICE in bootstrap stage 3 using "-D_FORTIFY_SOURCE=2"[EB/OL]. (2018)[2026-05-11]. https://gcc.gnu.org/bugzilla/show_bug.cgi?id=87672.</w:t>
+            </w:r>
+          </w:p>
+          <w:p>
+            <w:pPr>
+              <w:pStyle w:val="Normal"/>
               <w:keepLines/>
-              <w:spacing w:line="360" w:lineRule="auto"/>
-              <w:jc w:val="left"/>
-              <w:rPr>
-                <w:kern w:val="0"/>
-                <w:sz w:val="24"/>
-              </w:rPr>
-            </w:pPr>
-            <w:r>
-              <w:rPr>
-                <w:kern w:val="0"/>
-                <w:sz w:val="24"/>
-              </w:rPr>
-              <w:t>[22] Microsoft Security Response Center. Microsoft Security Response Center Blog[EB/OL]. (2023)[2026-05-13]. https://www.microsoft.com/en-us/msrc/blog.</w:t>
-            </w:r>
-          </w:p>
-          <w:p>
-            <w:pPr>
+              <w:spacing w:lineRule="auto" w:line="360"/>
+              <w:jc w:val="start"/>
+              <w:rPr>
+                <w:kern w:val="0"/>
+                <w:sz w:val="24"/>
+              </w:rPr>
+            </w:pPr>
+            <w:r>
+              <w:rPr>
+                <w:kern w:val="0"/>
+                <w:sz w:val="24"/>
+              </w:rPr>
+              <w:t xml:space="preserve">[22] Intel Corporation. Control-flow Enforcement Technology Specification[R/OL]. (2019)[2026-02-15]. https://www.intel.com/content/www/us/en/developer/articles/technical/technical-look-control-flow-enforcement-technology.html.</w:t>
+            </w:r>
+          </w:p>
+          <w:p>
+            <w:pPr>
+              <w:pStyle w:val="Normal"/>
               <w:keepLines/>
-              <w:spacing w:line="360" w:lineRule="auto"/>
-              <w:jc w:val="left"/>
-              <w:rPr>
-                <w:kern w:val="0"/>
-                <w:sz w:val="24"/>
-              </w:rPr>
-            </w:pPr>
-            <w:r>
-              <w:rPr>
-                <w:kern w:val="0"/>
-                <w:sz w:val="24"/>
-              </w:rPr>
-              <w:t>[23] Google Security Blog. Memory Safe Languages in Android 13[EB/OL]. (2022-12)[2026-05-13]. https://security.googleblog.com/2022/12/memory-safe-languages-in-android-13.html.</w:t>
+              <w:spacing w:lineRule="auto" w:line="360"/>
+              <w:jc w:val="start"/>
+              <w:rPr>
+                <w:kern w:val="0"/>
+                <w:sz w:val="24"/>
+              </w:rPr>
+            </w:pPr>
+            <w:r>
+              <w:rPr>
+                <w:kern w:val="0"/>
+                <w:sz w:val="24"/>
+              </w:rPr>
+              <w:t xml:space="preserve">[23] GNU Project. GCC Bugzilla PR 96350 — [cet] For ENDBR immediate, the binary would include a gadget that starts with a fake ENDBR64 opcode[EB/OL]. (2020)[2026-05-11]. https://gcc.gnu.org/bugzilla/show_bug.cgi?id=96350.</w:t>
             </w:r>
           </w:p>
         </w:tc>
@@ -4897,36 +4807,38 @@
           </w:tcPr>
           <w:p>
             <w:pPr>
-              <w:spacing w:line="360" w:lineRule="auto"/>
-              <w:ind w:left="0" w:leftChars="0" w:right="0" w:rightChars="0" w:firstLineChars="200"/>
-              <w:rPr>
-                <w:kern w:val="0"/>
-                <w:sz w:val="24"/>
-              </w:rPr>
-            </w:pPr>
-            <w:r>
-              <w:rPr>
-                <w:kern w:val="0"/>
-                <w:sz w:val="24"/>
-              </w:rPr>
-              <w:t>理论分析对应技术路线的四个部分：编译器主流防御机制安全不变量的形式化与证据提炼、不变量预言机检查器的工程化方法、覆盖率与控制流图引导的目标基本块挑选策略，以及大语言模型生成与预言机判定的耦合方式。预期产出包括：覆盖至少三种主流防御机制的安全不变量集合、可扩展的不变量预言机框架，以及跨架构的 fuzzer 原型；并在 GCC 与 LLVM 上发现真实静默失效以验证方法的有效性与跨编译器迁移性。</w:t>
-            </w:r>
-          </w:p>
-          <w:p>
-            <w:pPr>
-              <w:spacing w:line="360" w:lineRule="auto"/>
-              <w:ind w:left="0" w:leftChars="0" w:right="0" w:rightChars="0" w:firstLineChars="200"/>
-              <w:rPr>
-                <w:kern w:val="0"/>
-                <w:sz w:val="24"/>
-              </w:rPr>
-            </w:pPr>
-            <w:r>
-              <w:rPr>
-                <w:kern w:val="0"/>
-                <w:sz w:val="24"/>
-              </w:rPr>
-              <w:t>硬件方面，开发与实验依托一台 64 位 Linux 工作站（不少于 32 GB 内存与百 GB 级 SSD），用于 GCC / LLVM 多版本本地构建、覆盖率数据缓存与跨架构 QEMU 用户态执行；大语言模型推理通过远程 API 完成，本机无需独立 GPU。</w:t>
+              <w:pStyle w:val="Normal"/>
+              <w:spacing w:lineRule="auto" w:line="360"/>
+              <w:ind w:firstLineChars="200" w:startChars="0" w:start="0" w:endChars="0" w:end="0"/>
+              <w:rPr>
+                <w:kern w:val="0"/>
+                <w:sz w:val="24"/>
+              </w:rPr>
+            </w:pPr>
+            <w:r>
+              <w:rPr>
+                <w:kern w:val="0"/>
+                <w:sz w:val="24"/>
+              </w:rPr>
+              <w:t xml:space="preserve">理论分析对应技术路线的四个部分：编译器主流防御机制安全不变量的形式化与证据提炼、不变量预言机检查器的工程化方法、覆盖率与控制流图引导的目标基本块挑选策略，以及大语言模型生成与预言机判定的耦合方式。预期产出包括：覆盖至少三种主流防御机制的安全不变量集合、可扩展的不变量预言机框架，以及跨架构的 fuzzer 原型；并在 GCC 与 LLVM 上发现真实静默失效以验证方法的有效性与跨编译器迁移性。</w:t>
+            </w:r>
+          </w:p>
+          <w:p>
+            <w:pPr>
+              <w:pStyle w:val="Normal"/>
+              <w:spacing w:lineRule="auto" w:line="360"/>
+              <w:ind w:firstLineChars="200" w:startChars="0" w:start="0" w:endChars="0" w:end="0"/>
+              <w:rPr>
+                <w:kern w:val="0"/>
+                <w:sz w:val="24"/>
+              </w:rPr>
+            </w:pPr>
+            <w:r>
+              <w:rPr>
+                <w:kern w:val="0"/>
+                <w:sz w:val="24"/>
+              </w:rPr>
+              <w:t xml:space="preserve">硬件方面，开发与实验依托一台 64 位 Linux 工作站（不少于 32 GB 内存与百 GB 级 SSD），用于 GCC / LLVM 多版本本地构建、覆盖率数据缓存与跨架构 QEMU 用户态执行；大语言模型推理通过远程 API 完成，本机无需独立 GPU。</w:t>
             </w:r>
           </w:p>
         </w:tc>
@@ -4963,7 +4875,7 @@
       </w:tblPr>
       <w:tblGrid>
         <w:gridCol w:w="2124"/>
-        <w:gridCol w:w="5282"/>
+        <w:gridCol w:w="5283"/>
         <w:gridCol w:w="2349"/>
       </w:tblGrid>
       <w:tr>
@@ -5068,32 +4980,24 @@
         </w:tc>
       </w:tr>
       <w:tr>
-        <w:tblPrEx>
-          <w:tblCellMar>
-            <w:top w:w="0" w:type="dxa"/>
-            <w:left w:w="108" w:type="dxa"/>
-            <w:bottom w:w="0" w:type="dxa"/>
-            <w:right w:w="108" w:type="dxa"/>
-          </w:tblCellMar>
-        </w:tblPrEx>
         <w:trPr>
           <w:trHeight w:val="480" w:hRule="atLeast"/>
-          <w:jc w:val="center"/>
         </w:trPr>
         <w:tc>
           <w:tcPr>
             <w:tcW w:w="2077" w:type="dxa"/>
             <w:tcBorders>
-              <w:top w:val="single" w:color="000000" w:sz="4" w:space="0"/>
-              <w:left w:val="single" w:color="000000" w:sz="4" w:space="0"/>
-              <w:bottom w:val="single" w:color="000000" w:sz="4" w:space="0"/>
-              <w:right w:val="single" w:color="000000" w:sz="4" w:space="0"/>
+              <w:top w:val="single" w:sz="4" w:space="0" w:color="000000"/>
+              <w:start w:val="single" w:sz="4" w:space="0" w:color="000000"/>
+              <w:bottom w:val="single" w:sz="4" w:space="0" w:color="000000"/>
+              <w:end w:val="single" w:sz="4" w:space="0" w:color="000000"/>
             </w:tcBorders>
             <w:vAlign w:val="center"/>
           </w:tcPr>
           <w:p>
             <w:pPr>
-              <w:spacing w:line="320" w:lineRule="exact"/>
+              <w:pStyle w:val="Normal"/>
+              <w:spacing w:lineRule="exact" w:line="320"/>
               <w:jc w:val="center"/>
               <w:rPr>
                 <w:rFonts w:ascii="宋体" w:hAnsi="宋体" w:eastAsia="宋体"/>
@@ -5105,7 +5009,7 @@
                 <w:rFonts w:ascii="宋体" w:hAnsi="宋体" w:eastAsia="宋体"/>
                 <w:sz w:val="24"/>
               </w:rPr>
-              <w:t>2026.05-2026.07</w:t>
+              <w:t xml:space="preserve">2026.05-2026.07</w:t>
             </w:r>
           </w:p>
         </w:tc>
@@ -5113,16 +5017,17 @@
           <w:tcPr>
             <w:tcW w:w="5167" w:type="dxa"/>
             <w:tcBorders>
-              <w:top w:val="single" w:color="000000" w:sz="4" w:space="0"/>
-              <w:left w:val="single" w:color="000000" w:sz="4" w:space="0"/>
-              <w:bottom w:val="single" w:color="000000" w:sz="4" w:space="0"/>
-              <w:right w:val="single" w:color="000000" w:sz="4" w:space="0"/>
+              <w:top w:val="single" w:sz="4" w:space="0" w:color="000000"/>
+              <w:start w:val="single" w:sz="4" w:space="0" w:color="000000"/>
+              <w:bottom w:val="single" w:sz="4" w:space="0" w:color="000000"/>
+              <w:end w:val="single" w:sz="4" w:space="0" w:color="000000"/>
             </w:tcBorders>
             <w:vAlign w:val="center"/>
           </w:tcPr>
           <w:p>
             <w:pPr>
-              <w:spacing w:line="320" w:lineRule="exact"/>
+              <w:pStyle w:val="Normal"/>
+              <w:spacing w:lineRule="exact" w:line="320"/>
               <w:jc w:val="center"/>
               <w:rPr>
                 <w:rFonts w:ascii="宋体" w:hAnsi="宋体" w:eastAsia="宋体"/>
@@ -5134,7 +5039,7 @@
                 <w:rFonts w:ascii="宋体" w:hAnsi="宋体" w:eastAsia="宋体"/>
                 <w:sz w:val="24"/>
               </w:rPr>
-              <w:t>扩展不变量集合到 BTI / PAC、Shadow Stack、CFI 等机制，丰富预言机框架的静态与动态检查器</w:t>
+              <w:t xml:space="preserve">扩展不变量集合到 BTI / PAC、Shadow Stack、CFI 等机制，丰富预言机框架的静态与动态检查器</w:t>
             </w:r>
           </w:p>
         </w:tc>
@@ -5142,52 +5047,52 @@
           <w:tcPr>
             <w:tcW w:w="2297" w:type="dxa"/>
             <w:tcBorders>
-              <w:top w:val="single" w:color="000000" w:sz="4" w:space="0"/>
-              <w:left w:val="single" w:color="000000" w:sz="4" w:space="0"/>
-              <w:bottom w:val="single" w:color="000000" w:sz="4" w:space="0"/>
-              <w:right w:val="single" w:color="000000" w:sz="4" w:space="0"/>
+              <w:top w:val="single" w:sz="4" w:space="0" w:color="000000"/>
+              <w:start w:val="single" w:sz="4" w:space="0" w:color="000000"/>
+              <w:bottom w:val="single" w:sz="4" w:space="0" w:color="000000"/>
+              <w:end w:val="single" w:sz="4" w:space="0" w:color="000000"/>
             </w:tcBorders>
             <w:vAlign w:val="center"/>
           </w:tcPr>
           <w:p>
             <w:pPr>
-              <w:spacing w:line="320" w:lineRule="exact"/>
+              <w:pStyle w:val="Normal"/>
+              <w:spacing w:lineRule="exact" w:line="320"/>
               <w:jc w:val="center"/>
               <w:rPr>
                 <w:rFonts w:ascii="宋体" w:hAnsi="宋体" w:eastAsia="宋体"/>
                 <w:sz w:val="24"/>
               </w:rPr>
             </w:pPr>
+            <w:r>
+              <w:rPr>
+                <w:rFonts w:ascii="宋体" w:hAnsi="宋体" w:eastAsia="宋体"/>
+                <w:sz w:val="24"/>
+              </w:rPr>
+              <w:t xml:space="preserve"/>
+            </w:r>
           </w:p>
         </w:tc>
       </w:tr>
       <w:tr>
-        <w:tblPrEx>
-          <w:tblCellMar>
-            <w:top w:w="0" w:type="dxa"/>
-            <w:left w:w="108" w:type="dxa"/>
-            <w:bottom w:w="0" w:type="dxa"/>
-            <w:right w:w="108" w:type="dxa"/>
-          </w:tblCellMar>
-        </w:tblPrEx>
         <w:trPr>
           <w:trHeight w:val="480" w:hRule="atLeast"/>
-          <w:jc w:val="center"/>
         </w:trPr>
         <w:tc>
           <w:tcPr>
             <w:tcW w:w="2077" w:type="dxa"/>
             <w:tcBorders>
-              <w:top w:val="single" w:color="000000" w:sz="4" w:space="0"/>
-              <w:left w:val="single" w:color="000000" w:sz="4" w:space="0"/>
-              <w:bottom w:val="single" w:color="000000" w:sz="4" w:space="0"/>
-              <w:right w:val="single" w:color="000000" w:sz="4" w:space="0"/>
+              <w:top w:val="single" w:sz="4" w:space="0" w:color="000000"/>
+              <w:start w:val="single" w:sz="4" w:space="0" w:color="000000"/>
+              <w:bottom w:val="single" w:sz="4" w:space="0" w:color="000000"/>
+              <w:end w:val="single" w:sz="4" w:space="0" w:color="000000"/>
             </w:tcBorders>
             <w:vAlign w:val="center"/>
           </w:tcPr>
           <w:p>
             <w:pPr>
-              <w:spacing w:line="320" w:lineRule="exact"/>
+              <w:pStyle w:val="Normal"/>
+              <w:spacing w:lineRule="exact" w:line="320"/>
               <w:jc w:val="center"/>
               <w:rPr>
                 <w:rFonts w:ascii="宋体" w:hAnsi="宋体" w:eastAsia="宋体"/>
@@ -5199,7 +5104,7 @@
                 <w:rFonts w:ascii="宋体" w:hAnsi="宋体" w:eastAsia="宋体"/>
                 <w:sz w:val="24"/>
               </w:rPr>
-              <w:t>2026.07-2026.09</w:t>
+              <w:t xml:space="preserve">2026.07-2026.09</w:t>
             </w:r>
           </w:p>
         </w:tc>
@@ -5207,16 +5112,17 @@
           <w:tcPr>
             <w:tcW w:w="5167" w:type="dxa"/>
             <w:tcBorders>
-              <w:top w:val="single" w:color="000000" w:sz="4" w:space="0"/>
-              <w:left w:val="single" w:color="000000" w:sz="4" w:space="0"/>
-              <w:bottom w:val="single" w:color="000000" w:sz="4" w:space="0"/>
-              <w:right w:val="single" w:color="000000" w:sz="4" w:space="0"/>
+              <w:top w:val="single" w:sz="4" w:space="0" w:color="000000"/>
+              <w:start w:val="single" w:sz="4" w:space="0" w:color="000000"/>
+              <w:bottom w:val="single" w:sz="4" w:space="0" w:color="000000"/>
+              <w:end w:val="single" w:sz="4" w:space="0" w:color="000000"/>
             </w:tcBorders>
             <w:vAlign w:val="center"/>
           </w:tcPr>
           <w:p>
             <w:pPr>
-              <w:spacing w:line="320" w:lineRule="exact"/>
+              <w:pStyle w:val="Normal"/>
+              <w:spacing w:lineRule="exact" w:line="320"/>
               <w:jc w:val="center"/>
               <w:rPr>
                 <w:rFonts w:ascii="宋体" w:hAnsi="宋体" w:eastAsia="宋体"/>
@@ -5228,7 +5134,7 @@
                 <w:rFonts w:ascii="宋体" w:hAnsi="宋体" w:eastAsia="宋体"/>
                 <w:sz w:val="24"/>
               </w:rPr>
-              <w:t>把编译器子系统、覆盖率适配层、flag profile 扩展到 LLVM 工具链，对齐跨架构 / 跨编译器实验框架</w:t>
+              <w:t xml:space="preserve">把编译器子系统、覆盖率适配层、flag profile 扩展到 LLVM 工具链，对齐跨架构 / 跨编译器实验框架</w:t>
             </w:r>
           </w:p>
         </w:tc>
@@ -5236,52 +5142,52 @@
           <w:tcPr>
             <w:tcW w:w="2297" w:type="dxa"/>
             <w:tcBorders>
-              <w:top w:val="single" w:color="000000" w:sz="4" w:space="0"/>
-              <w:left w:val="single" w:color="000000" w:sz="4" w:space="0"/>
-              <w:bottom w:val="single" w:color="000000" w:sz="4" w:space="0"/>
-              <w:right w:val="single" w:color="000000" w:sz="4" w:space="0"/>
+              <w:top w:val="single" w:sz="4" w:space="0" w:color="000000"/>
+              <w:start w:val="single" w:sz="4" w:space="0" w:color="000000"/>
+              <w:bottom w:val="single" w:sz="4" w:space="0" w:color="000000"/>
+              <w:end w:val="single" w:sz="4" w:space="0" w:color="000000"/>
             </w:tcBorders>
             <w:vAlign w:val="center"/>
           </w:tcPr>
           <w:p>
             <w:pPr>
-              <w:spacing w:line="320" w:lineRule="exact"/>
+              <w:pStyle w:val="Normal"/>
+              <w:spacing w:lineRule="exact" w:line="320"/>
               <w:jc w:val="center"/>
               <w:rPr>
                 <w:rFonts w:ascii="宋体" w:hAnsi="宋体" w:eastAsia="宋体"/>
                 <w:sz w:val="24"/>
               </w:rPr>
             </w:pPr>
+            <w:r>
+              <w:rPr>
+                <w:rFonts w:ascii="宋体" w:hAnsi="宋体" w:eastAsia="宋体"/>
+                <w:sz w:val="24"/>
+              </w:rPr>
+              <w:t xml:space="preserve"/>
+            </w:r>
           </w:p>
         </w:tc>
       </w:tr>
       <w:tr>
-        <w:tblPrEx>
-          <w:tblCellMar>
-            <w:top w:w="0" w:type="dxa"/>
-            <w:left w:w="108" w:type="dxa"/>
-            <w:bottom w:w="0" w:type="dxa"/>
-            <w:right w:w="108" w:type="dxa"/>
-          </w:tblCellMar>
-        </w:tblPrEx>
         <w:trPr>
           <w:trHeight w:val="480" w:hRule="atLeast"/>
-          <w:jc w:val="center"/>
         </w:trPr>
         <w:tc>
           <w:tcPr>
             <w:tcW w:w="2077" w:type="dxa"/>
             <w:tcBorders>
-              <w:top w:val="single" w:color="000000" w:sz="4" w:space="0"/>
-              <w:left w:val="single" w:color="000000" w:sz="4" w:space="0"/>
-              <w:bottom w:val="single" w:color="000000" w:sz="4" w:space="0"/>
-              <w:right w:val="single" w:color="000000" w:sz="4" w:space="0"/>
+              <w:top w:val="single" w:sz="4" w:space="0" w:color="000000"/>
+              <w:start w:val="single" w:sz="4" w:space="0" w:color="000000"/>
+              <w:bottom w:val="single" w:sz="4" w:space="0" w:color="000000"/>
+              <w:end w:val="single" w:sz="4" w:space="0" w:color="000000"/>
             </w:tcBorders>
             <w:vAlign w:val="center"/>
           </w:tcPr>
           <w:p>
             <w:pPr>
-              <w:spacing w:line="320" w:lineRule="exact"/>
+              <w:pStyle w:val="Normal"/>
+              <w:spacing w:lineRule="exact" w:line="320"/>
               <w:jc w:val="center"/>
               <w:rPr>
                 <w:rFonts w:ascii="宋体" w:hAnsi="宋体" w:eastAsia="宋体"/>
@@ -5293,7 +5199,7 @@
                 <w:rFonts w:ascii="宋体" w:hAnsi="宋体" w:eastAsia="宋体"/>
                 <w:sz w:val="24"/>
               </w:rPr>
-              <w:t>2026.09-2026.12</w:t>
+              <w:t xml:space="preserve">2026.09-2026.12</w:t>
             </w:r>
           </w:p>
         </w:tc>
@@ -5301,16 +5207,17 @@
           <w:tcPr>
             <w:tcW w:w="5167" w:type="dxa"/>
             <w:tcBorders>
-              <w:top w:val="single" w:color="000000" w:sz="4" w:space="0"/>
-              <w:left w:val="single" w:color="000000" w:sz="4" w:space="0"/>
-              <w:bottom w:val="single" w:color="000000" w:sz="4" w:space="0"/>
-              <w:right w:val="single" w:color="000000" w:sz="4" w:space="0"/>
+              <w:top w:val="single" w:sz="4" w:space="0" w:color="000000"/>
+              <w:start w:val="single" w:sz="4" w:space="0" w:color="000000"/>
+              <w:bottom w:val="single" w:sz="4" w:space="0" w:color="000000"/>
+              <w:end w:val="single" w:sz="4" w:space="0" w:color="000000"/>
             </w:tcBorders>
             <w:vAlign w:val="center"/>
           </w:tcPr>
           <w:p>
             <w:pPr>
-              <w:spacing w:line="320" w:lineRule="exact"/>
+              <w:pStyle w:val="Normal"/>
+              <w:spacing w:lineRule="exact" w:line="320"/>
               <w:jc w:val="center"/>
               <w:rPr>
                 <w:rFonts w:ascii="宋体" w:hAnsi="宋体" w:eastAsia="宋体"/>
@@ -5322,7 +5229,7 @@
                 <w:rFonts w:ascii="宋体" w:hAnsi="宋体" w:eastAsia="宋体"/>
                 <w:sz w:val="24"/>
               </w:rPr>
-              <w:t>在 GCC 与 LLVM 多版本、多 ISA 上完成全机制端到端实验，持续推进上游缺陷上报闭环</w:t>
+              <w:t xml:space="preserve">在 GCC 与 LLVM 多版本、多 ISA 上完成全机制端到端实验，持续推进上游缺陷上报闭环</w:t>
             </w:r>
           </w:p>
         </w:tc>
@@ -5330,52 +5237,52 @@
           <w:tcPr>
             <w:tcW w:w="2297" w:type="dxa"/>
             <w:tcBorders>
-              <w:top w:val="single" w:color="000000" w:sz="4" w:space="0"/>
-              <w:left w:val="single" w:color="000000" w:sz="4" w:space="0"/>
-              <w:bottom w:val="single" w:color="000000" w:sz="4" w:space="0"/>
-              <w:right w:val="single" w:color="000000" w:sz="4" w:space="0"/>
+              <w:top w:val="single" w:sz="4" w:space="0" w:color="000000"/>
+              <w:start w:val="single" w:sz="4" w:space="0" w:color="000000"/>
+              <w:bottom w:val="single" w:sz="4" w:space="0" w:color="000000"/>
+              <w:end w:val="single" w:sz="4" w:space="0" w:color="000000"/>
             </w:tcBorders>
             <w:vAlign w:val="center"/>
           </w:tcPr>
           <w:p>
             <w:pPr>
-              <w:spacing w:line="320" w:lineRule="exact"/>
+              <w:pStyle w:val="Normal"/>
+              <w:spacing w:lineRule="exact" w:line="320"/>
               <w:jc w:val="center"/>
               <w:rPr>
                 <w:rFonts w:ascii="宋体" w:hAnsi="宋体" w:eastAsia="宋体"/>
                 <w:sz w:val="24"/>
               </w:rPr>
             </w:pPr>
+            <w:r>
+              <w:rPr>
+                <w:rFonts w:ascii="宋体" w:hAnsi="宋体" w:eastAsia="宋体"/>
+                <w:sz w:val="24"/>
+              </w:rPr>
+              <w:t xml:space="preserve"/>
+            </w:r>
           </w:p>
         </w:tc>
       </w:tr>
       <w:tr>
-        <w:tblPrEx>
-          <w:tblCellMar>
-            <w:top w:w="0" w:type="dxa"/>
-            <w:left w:w="108" w:type="dxa"/>
-            <w:bottom w:w="0" w:type="dxa"/>
-            <w:right w:w="108" w:type="dxa"/>
-          </w:tblCellMar>
-        </w:tblPrEx>
         <w:trPr>
           <w:trHeight w:val="480" w:hRule="atLeast"/>
-          <w:jc w:val="center"/>
         </w:trPr>
         <w:tc>
           <w:tcPr>
             <w:tcW w:w="2077" w:type="dxa"/>
             <w:tcBorders>
-              <w:top w:val="single" w:color="000000" w:sz="4" w:space="0"/>
-              <w:left w:val="single" w:color="000000" w:sz="4" w:space="0"/>
-              <w:bottom w:val="single" w:color="000000" w:sz="4" w:space="0"/>
-              <w:right w:val="single" w:color="000000" w:sz="4" w:space="0"/>
+              <w:top w:val="single" w:sz="4" w:space="0" w:color="000000"/>
+              <w:start w:val="single" w:sz="4" w:space="0" w:color="000000"/>
+              <w:bottom w:val="single" w:sz="4" w:space="0" w:color="000000"/>
+              <w:end w:val="single" w:sz="4" w:space="0" w:color="000000"/>
             </w:tcBorders>
             <w:vAlign w:val="center"/>
           </w:tcPr>
           <w:p>
             <w:pPr>
-              <w:spacing w:line="320" w:lineRule="exact"/>
+              <w:pStyle w:val="Normal"/>
+              <w:spacing w:lineRule="exact" w:line="320"/>
               <w:jc w:val="center"/>
               <w:rPr>
                 <w:rFonts w:ascii="宋体" w:hAnsi="宋体" w:eastAsia="宋体"/>
@@ -5387,7 +5294,7 @@
                 <w:rFonts w:ascii="宋体" w:hAnsi="宋体" w:eastAsia="宋体"/>
                 <w:sz w:val="24"/>
               </w:rPr>
-              <w:t>2026.12-2027.02</w:t>
+              <w:t xml:space="preserve">2026.12-2027.02</w:t>
             </w:r>
           </w:p>
         </w:tc>
@@ -5395,16 +5302,17 @@
           <w:tcPr>
             <w:tcW w:w="5167" w:type="dxa"/>
             <w:tcBorders>
-              <w:top w:val="single" w:color="000000" w:sz="4" w:space="0"/>
-              <w:left w:val="single" w:color="000000" w:sz="4" w:space="0"/>
-              <w:bottom w:val="single" w:color="000000" w:sz="4" w:space="0"/>
-              <w:right w:val="single" w:color="000000" w:sz="4" w:space="0"/>
+              <w:top w:val="single" w:sz="4" w:space="0" w:color="000000"/>
+              <w:start w:val="single" w:sz="4" w:space="0" w:color="000000"/>
+              <w:bottom w:val="single" w:sz="4" w:space="0" w:color="000000"/>
+              <w:end w:val="single" w:sz="4" w:space="0" w:color="000000"/>
             </w:tcBorders>
             <w:vAlign w:val="center"/>
           </w:tcPr>
           <w:p>
             <w:pPr>
-              <w:spacing w:line="320" w:lineRule="exact"/>
+              <w:pStyle w:val="Normal"/>
+              <w:spacing w:lineRule="exact" w:line="320"/>
               <w:jc w:val="center"/>
               <w:rPr>
                 <w:rFonts w:ascii="宋体" w:hAnsi="宋体" w:eastAsia="宋体"/>
@@ -5416,7 +5324,7 @@
                 <w:rFonts w:ascii="宋体" w:hAnsi="宋体" w:eastAsia="宋体"/>
                 <w:sz w:val="24"/>
               </w:rPr>
-              <w:t>与 Csmith、YARPGen、GrayC、HLPFuzz 等基线方法做对照评测，量化覆盖率推进与缺陷发现上的相对优势</w:t>
+              <w:t xml:space="preserve">与 Csmith、YARPGen、GrayC、HLPFuzz 等基线方法做对照评测，量化覆盖率推进与缺陷发现上的相对优势</w:t>
             </w:r>
           </w:p>
         </w:tc>
@@ -5424,52 +5332,52 @@
           <w:tcPr>
             <w:tcW w:w="2297" w:type="dxa"/>
             <w:tcBorders>
-              <w:top w:val="single" w:color="000000" w:sz="4" w:space="0"/>
-              <w:left w:val="single" w:color="000000" w:sz="4" w:space="0"/>
-              <w:bottom w:val="single" w:color="000000" w:sz="4" w:space="0"/>
-              <w:right w:val="single" w:color="000000" w:sz="4" w:space="0"/>
+              <w:top w:val="single" w:sz="4" w:space="0" w:color="000000"/>
+              <w:start w:val="single" w:sz="4" w:space="0" w:color="000000"/>
+              <w:bottom w:val="single" w:sz="4" w:space="0" w:color="000000"/>
+              <w:end w:val="single" w:sz="4" w:space="0" w:color="000000"/>
             </w:tcBorders>
             <w:vAlign w:val="center"/>
           </w:tcPr>
           <w:p>
             <w:pPr>
-              <w:spacing w:line="320" w:lineRule="exact"/>
+              <w:pStyle w:val="Normal"/>
+              <w:spacing w:lineRule="exact" w:line="320"/>
               <w:jc w:val="center"/>
               <w:rPr>
                 <w:rFonts w:ascii="宋体" w:hAnsi="宋体" w:eastAsia="宋体"/>
                 <w:sz w:val="24"/>
               </w:rPr>
             </w:pPr>
+            <w:r>
+              <w:rPr>
+                <w:rFonts w:ascii="宋体" w:hAnsi="宋体" w:eastAsia="宋体"/>
+                <w:sz w:val="24"/>
+              </w:rPr>
+              <w:t xml:space="preserve"/>
+            </w:r>
           </w:p>
         </w:tc>
       </w:tr>
       <w:tr>
-        <w:tblPrEx>
-          <w:tblCellMar>
-            <w:top w:w="0" w:type="dxa"/>
-            <w:left w:w="108" w:type="dxa"/>
-            <w:bottom w:w="0" w:type="dxa"/>
-            <w:right w:w="108" w:type="dxa"/>
-          </w:tblCellMar>
-        </w:tblPrEx>
         <w:trPr>
           <w:trHeight w:val="480" w:hRule="atLeast"/>
-          <w:jc w:val="center"/>
         </w:trPr>
         <w:tc>
           <w:tcPr>
             <w:tcW w:w="2077" w:type="dxa"/>
             <w:tcBorders>
-              <w:top w:val="single" w:color="000000" w:sz="4" w:space="0"/>
-              <w:left w:val="single" w:color="000000" w:sz="4" w:space="0"/>
-              <w:bottom w:val="single" w:color="000000" w:sz="4" w:space="0"/>
-              <w:right w:val="single" w:color="000000" w:sz="4" w:space="0"/>
+              <w:top w:val="single" w:sz="4" w:space="0" w:color="000000"/>
+              <w:start w:val="single" w:sz="4" w:space="0" w:color="000000"/>
+              <w:bottom w:val="single" w:sz="4" w:space="0" w:color="000000"/>
+              <w:end w:val="single" w:sz="4" w:space="0" w:color="000000"/>
             </w:tcBorders>
             <w:vAlign w:val="center"/>
           </w:tcPr>
           <w:p>
             <w:pPr>
-              <w:spacing w:line="320" w:lineRule="exact"/>
+              <w:pStyle w:val="Normal"/>
+              <w:spacing w:lineRule="exact" w:line="320"/>
               <w:jc w:val="center"/>
               <w:rPr>
                 <w:rFonts w:ascii="宋体" w:hAnsi="宋体" w:eastAsia="宋体"/>
@@ -5481,7 +5389,7 @@
                 <w:rFonts w:ascii="宋体" w:hAnsi="宋体" w:eastAsia="宋体"/>
                 <w:sz w:val="24"/>
               </w:rPr>
-              <w:t>2027.02-2027.04</w:t>
+              <w:t xml:space="preserve">2027.02-2027.04</w:t>
             </w:r>
           </w:p>
         </w:tc>
@@ -5489,16 +5397,17 @@
           <w:tcPr>
             <w:tcW w:w="5167" w:type="dxa"/>
             <w:tcBorders>
-              <w:top w:val="single" w:color="000000" w:sz="4" w:space="0"/>
-              <w:left w:val="single" w:color="000000" w:sz="4" w:space="0"/>
-              <w:bottom w:val="single" w:color="000000" w:sz="4" w:space="0"/>
-              <w:right w:val="single" w:color="000000" w:sz="4" w:space="0"/>
+              <w:top w:val="single" w:sz="4" w:space="0" w:color="000000"/>
+              <w:start w:val="single" w:sz="4" w:space="0" w:color="000000"/>
+              <w:bottom w:val="single" w:sz="4" w:space="0" w:color="000000"/>
+              <w:end w:val="single" w:sz="4" w:space="0" w:color="000000"/>
             </w:tcBorders>
             <w:vAlign w:val="center"/>
           </w:tcPr>
           <w:p>
             <w:pPr>
-              <w:spacing w:line="320" w:lineRule="exact"/>
+              <w:pStyle w:val="Normal"/>
+              <w:spacing w:lineRule="exact" w:line="320"/>
               <w:jc w:val="center"/>
               <w:rPr>
                 <w:rFonts w:ascii="宋体" w:hAnsi="宋体" w:eastAsia="宋体"/>
@@ -5510,7 +5419,7 @@
                 <w:rFonts w:ascii="宋体" w:hAnsi="宋体" w:eastAsia="宋体"/>
                 <w:sz w:val="24"/>
               </w:rPr>
-              <w:t>整理实验数据与图表，完成学位论文初稿，准备会议 / 期刊投稿</w:t>
+              <w:t xml:space="preserve">整理实验数据与图表，完成学位论文初稿，准备会议 / 期刊投稿</w:t>
             </w:r>
           </w:p>
         </w:tc>
@@ -5518,52 +5427,52 @@
           <w:tcPr>
             <w:tcW w:w="2297" w:type="dxa"/>
             <w:tcBorders>
-              <w:top w:val="single" w:color="000000" w:sz="4" w:space="0"/>
-              <w:left w:val="single" w:color="000000" w:sz="4" w:space="0"/>
-              <w:bottom w:val="single" w:color="000000" w:sz="4" w:space="0"/>
-              <w:right w:val="single" w:color="000000" w:sz="4" w:space="0"/>
+              <w:top w:val="single" w:sz="4" w:space="0" w:color="000000"/>
+              <w:start w:val="single" w:sz="4" w:space="0" w:color="000000"/>
+              <w:bottom w:val="single" w:sz="4" w:space="0" w:color="000000"/>
+              <w:end w:val="single" w:sz="4" w:space="0" w:color="000000"/>
             </w:tcBorders>
             <w:vAlign w:val="center"/>
           </w:tcPr>
           <w:p>
             <w:pPr>
-              <w:spacing w:line="320" w:lineRule="exact"/>
+              <w:pStyle w:val="Normal"/>
+              <w:spacing w:lineRule="exact" w:line="320"/>
               <w:jc w:val="center"/>
               <w:rPr>
                 <w:rFonts w:ascii="宋体" w:hAnsi="宋体" w:eastAsia="宋体"/>
                 <w:sz w:val="24"/>
               </w:rPr>
             </w:pPr>
+            <w:r>
+              <w:rPr>
+                <w:rFonts w:ascii="宋体" w:hAnsi="宋体" w:eastAsia="宋体"/>
+                <w:sz w:val="24"/>
+              </w:rPr>
+              <w:t xml:space="preserve"/>
+            </w:r>
           </w:p>
         </w:tc>
       </w:tr>
       <w:tr>
-        <w:tblPrEx>
-          <w:tblCellMar>
-            <w:top w:w="0" w:type="dxa"/>
-            <w:left w:w="108" w:type="dxa"/>
-            <w:bottom w:w="0" w:type="dxa"/>
-            <w:right w:w="108" w:type="dxa"/>
-          </w:tblCellMar>
-        </w:tblPrEx>
         <w:trPr>
           <w:trHeight w:val="480" w:hRule="atLeast"/>
-          <w:jc w:val="center"/>
         </w:trPr>
         <w:tc>
           <w:tcPr>
             <w:tcW w:w="2077" w:type="dxa"/>
             <w:tcBorders>
-              <w:top w:val="single" w:color="000000" w:sz="4" w:space="0"/>
-              <w:left w:val="single" w:color="000000" w:sz="4" w:space="0"/>
-              <w:bottom w:val="single" w:color="000000" w:sz="4" w:space="0"/>
-              <w:right w:val="single" w:color="000000" w:sz="4" w:space="0"/>
+              <w:top w:val="single" w:sz="4" w:space="0" w:color="000000"/>
+              <w:start w:val="single" w:sz="4" w:space="0" w:color="000000"/>
+              <w:bottom w:val="single" w:sz="4" w:space="0" w:color="000000"/>
+              <w:end w:val="single" w:sz="4" w:space="0" w:color="000000"/>
             </w:tcBorders>
             <w:vAlign w:val="center"/>
           </w:tcPr>
           <w:p>
             <w:pPr>
-              <w:spacing w:line="320" w:lineRule="exact"/>
+              <w:pStyle w:val="Normal"/>
+              <w:spacing w:lineRule="exact" w:line="320"/>
               <w:jc w:val="center"/>
               <w:rPr>
                 <w:rFonts w:ascii="宋体" w:hAnsi="宋体" w:eastAsia="宋体"/>
@@ -5575,7 +5484,7 @@
                 <w:rFonts w:ascii="宋体" w:hAnsi="宋体" w:eastAsia="宋体"/>
                 <w:sz w:val="24"/>
               </w:rPr>
-              <w:t>2027.04-2027.06</w:t>
+              <w:t xml:space="preserve">2027.04-2027.06</w:t>
             </w:r>
           </w:p>
         </w:tc>
@@ -5583,16 +5492,17 @@
           <w:tcPr>
             <w:tcW w:w="5167" w:type="dxa"/>
             <w:tcBorders>
-              <w:top w:val="single" w:color="000000" w:sz="4" w:space="0"/>
-              <w:left w:val="single" w:color="000000" w:sz="4" w:space="0"/>
-              <w:bottom w:val="single" w:color="000000" w:sz="4" w:space="0"/>
-              <w:right w:val="single" w:color="000000" w:sz="4" w:space="0"/>
+              <w:top w:val="single" w:sz="4" w:space="0" w:color="000000"/>
+              <w:start w:val="single" w:sz="4" w:space="0" w:color="000000"/>
+              <w:bottom w:val="single" w:sz="4" w:space="0" w:color="000000"/>
+              <w:end w:val="single" w:sz="4" w:space="0" w:color="000000"/>
             </w:tcBorders>
             <w:vAlign w:val="center"/>
           </w:tcPr>
           <w:p>
             <w:pPr>
-              <w:spacing w:line="320" w:lineRule="exact"/>
+              <w:pStyle w:val="Normal"/>
+              <w:spacing w:lineRule="exact" w:line="320"/>
               <w:jc w:val="center"/>
               <w:rPr>
                 <w:rFonts w:ascii="宋体" w:hAnsi="宋体" w:eastAsia="宋体"/>
@@ -5604,7 +5514,7 @@
                 <w:rFonts w:ascii="宋体" w:hAnsi="宋体" w:eastAsia="宋体"/>
                 <w:sz w:val="24"/>
               </w:rPr>
-              <w:t>学位论文修订、外审反馈处理、答辩材料准备</w:t>
+              <w:t xml:space="preserve">学位论文修订、外审反馈处理、答辩材料准备</w:t>
             </w:r>
           </w:p>
         </w:tc>
@@ -5612,52 +5522,52 @@
           <w:tcPr>
             <w:tcW w:w="2297" w:type="dxa"/>
             <w:tcBorders>
-              <w:top w:val="single" w:color="000000" w:sz="4" w:space="0"/>
-              <w:left w:val="single" w:color="000000" w:sz="4" w:space="0"/>
-              <w:bottom w:val="single" w:color="000000" w:sz="4" w:space="0"/>
-              <w:right w:val="single" w:color="000000" w:sz="4" w:space="0"/>
+              <w:top w:val="single" w:sz="4" w:space="0" w:color="000000"/>
+              <w:start w:val="single" w:sz="4" w:space="0" w:color="000000"/>
+              <w:bottom w:val="single" w:sz="4" w:space="0" w:color="000000"/>
+              <w:end w:val="single" w:sz="4" w:space="0" w:color="000000"/>
             </w:tcBorders>
             <w:vAlign w:val="center"/>
           </w:tcPr>
           <w:p>
             <w:pPr>
-              <w:spacing w:line="320" w:lineRule="exact"/>
+              <w:pStyle w:val="Normal"/>
+              <w:spacing w:lineRule="exact" w:line="320"/>
               <w:jc w:val="center"/>
               <w:rPr>
                 <w:rFonts w:ascii="宋体" w:hAnsi="宋体" w:eastAsia="宋体"/>
                 <w:sz w:val="24"/>
               </w:rPr>
             </w:pPr>
+            <w:r>
+              <w:rPr>
+                <w:rFonts w:ascii="宋体" w:hAnsi="宋体" w:eastAsia="宋体"/>
+                <w:sz w:val="24"/>
+              </w:rPr>
+              <w:t xml:space="preserve"/>
+            </w:r>
           </w:p>
         </w:tc>
       </w:tr>
       <w:tr>
-        <w:tblPrEx>
-          <w:tblCellMar>
-            <w:top w:w="0" w:type="dxa"/>
-            <w:left w:w="108" w:type="dxa"/>
-            <w:bottom w:w="0" w:type="dxa"/>
-            <w:right w:w="108" w:type="dxa"/>
-          </w:tblCellMar>
-        </w:tblPrEx>
         <w:trPr>
           <w:trHeight w:val="480" w:hRule="atLeast"/>
-          <w:jc w:val="center"/>
         </w:trPr>
         <w:tc>
           <w:tcPr>
             <w:tcW w:w="2077" w:type="dxa"/>
             <w:tcBorders>
-              <w:top w:val="single" w:color="000000" w:sz="4" w:space="0"/>
-              <w:left w:val="single" w:color="000000" w:sz="4" w:space="0"/>
-              <w:bottom w:val="single" w:color="000000" w:sz="4" w:space="0"/>
-              <w:right w:val="single" w:color="000000" w:sz="4" w:space="0"/>
+              <w:top w:val="single" w:sz="4" w:space="0" w:color="000000"/>
+              <w:start w:val="single" w:sz="4" w:space="0" w:color="000000"/>
+              <w:bottom w:val="single" w:sz="4" w:space="0" w:color="000000"/>
+              <w:end w:val="single" w:sz="4" w:space="0" w:color="000000"/>
             </w:tcBorders>
             <w:vAlign w:val="center"/>
           </w:tcPr>
           <w:p>
             <w:pPr>
-              <w:spacing w:line="320" w:lineRule="exact"/>
+              <w:pStyle w:val="Normal"/>
+              <w:spacing w:lineRule="exact" w:line="320"/>
               <w:jc w:val="center"/>
               <w:rPr>
                 <w:rFonts w:ascii="宋体" w:hAnsi="宋体" w:eastAsia="宋体"/>
@@ -5669,7 +5579,7 @@
                 <w:rFonts w:ascii="宋体" w:hAnsi="宋体" w:eastAsia="宋体"/>
                 <w:sz w:val="24"/>
               </w:rPr>
-              <w:t>2027.06</w:t>
+              <w:t xml:space="preserve">2027.06</w:t>
             </w:r>
           </w:p>
         </w:tc>
@@ -5677,16 +5587,17 @@
           <w:tcPr>
             <w:tcW w:w="5167" w:type="dxa"/>
             <w:tcBorders>
-              <w:top w:val="single" w:color="000000" w:sz="4" w:space="0"/>
-              <w:left w:val="single" w:color="000000" w:sz="4" w:space="0"/>
-              <w:bottom w:val="single" w:color="000000" w:sz="4" w:space="0"/>
-              <w:right w:val="single" w:color="000000" w:sz="4" w:space="0"/>
+              <w:top w:val="single" w:sz="4" w:space="0" w:color="000000"/>
+              <w:start w:val="single" w:sz="4" w:space="0" w:color="000000"/>
+              <w:bottom w:val="single" w:sz="4" w:space="0" w:color="000000"/>
+              <w:end w:val="single" w:sz="4" w:space="0" w:color="000000"/>
             </w:tcBorders>
             <w:vAlign w:val="center"/>
           </w:tcPr>
           <w:p>
             <w:pPr>
-              <w:spacing w:line="320" w:lineRule="exact"/>
+              <w:pStyle w:val="Normal"/>
+              <w:spacing w:lineRule="exact" w:line="320"/>
               <w:jc w:val="center"/>
               <w:rPr>
                 <w:rFonts w:ascii="宋体" w:hAnsi="宋体" w:eastAsia="宋体"/>
@@ -5698,7 +5609,7 @@
                 <w:rFonts w:ascii="宋体" w:hAnsi="宋体" w:eastAsia="宋体"/>
                 <w:sz w:val="24"/>
               </w:rPr>
-              <w:t>学位论文答辩</w:t>
+              <w:t xml:space="preserve">学位论文答辩</w:t>
             </w:r>
           </w:p>
         </w:tc>
@@ -5706,22 +5617,30 @@
           <w:tcPr>
             <w:tcW w:w="2297" w:type="dxa"/>
             <w:tcBorders>
-              <w:top w:val="single" w:color="000000" w:sz="4" w:space="0"/>
-              <w:left w:val="single" w:color="000000" w:sz="4" w:space="0"/>
-              <w:bottom w:val="single" w:color="000000" w:sz="4" w:space="0"/>
-              <w:right w:val="single" w:color="000000" w:sz="4" w:space="0"/>
+              <w:top w:val="single" w:sz="4" w:space="0" w:color="000000"/>
+              <w:start w:val="single" w:sz="4" w:space="0" w:color="000000"/>
+              <w:bottom w:val="single" w:sz="4" w:space="0" w:color="000000"/>
+              <w:end w:val="single" w:sz="4" w:space="0" w:color="000000"/>
             </w:tcBorders>
             <w:vAlign w:val="center"/>
           </w:tcPr>
           <w:p>
             <w:pPr>
-              <w:spacing w:line="320" w:lineRule="exact"/>
+              <w:pStyle w:val="Normal"/>
+              <w:spacing w:lineRule="exact" w:line="320"/>
               <w:jc w:val="center"/>
               <w:rPr>
                 <w:rFonts w:ascii="宋体" w:hAnsi="宋体" w:eastAsia="宋体"/>
                 <w:sz w:val="24"/>
               </w:rPr>
             </w:pPr>
+            <w:r>
+              <w:rPr>
+                <w:rFonts w:ascii="宋体" w:hAnsi="宋体" w:eastAsia="宋体"/>
+                <w:sz w:val="24"/>
+              </w:rPr>
+              <w:t xml:space="preserve"/>
+            </w:r>
           </w:p>
         </w:tc>
       </w:tr>
@@ -7395,8 +7314,8 @@
     <w:lsdException w:unhideWhenUsed="0" w:uiPriority="0" w:semiHidden="0" w:name="Normal Indent"/>
     <w:lsdException w:unhideWhenUsed="0" w:uiPriority="0" w:semiHidden="0" w:name="footnote text"/>
     <w:lsdException w:unhideWhenUsed="0" w:uiPriority="0" w:semiHidden="0" w:name="annotation text"/>
-    <w:lsdException w:qFormat="1" w:unhideWhenUsed="0" w:uiPriority="0" w:semiHidden="0" w:name="header"/>
-    <w:lsdException w:qFormat="1" w:unhideWhenUsed="0" w:uiPriority="0" w:semiHidden="0" w:name="footer"/>
+    <w:lsdException w:unhideWhenUsed="0" w:uiPriority="0" w:semiHidden="0" w:name="header"/>
+    <w:lsdException w:unhideWhenUsed="0" w:uiPriority="0" w:semiHidden="0" w:name="footer"/>
     <w:lsdException w:unhideWhenUsed="0" w:uiPriority="0" w:semiHidden="0" w:name="index heading"/>
     <w:lsdException w:qFormat="1" w:unhideWhenUsed="0" w:uiPriority="0" w:semiHidden="0" w:name="caption"/>
     <w:lsdException w:unhideWhenUsed="0" w:uiPriority="0" w:semiHidden="0" w:name="table of figures"/>
@@ -7405,7 +7324,7 @@
     <w:lsdException w:unhideWhenUsed="0" w:uiPriority="0" w:semiHidden="0" w:name="footnote reference"/>
     <w:lsdException w:unhideWhenUsed="0" w:uiPriority="0" w:semiHidden="0" w:name="annotation reference"/>
     <w:lsdException w:unhideWhenUsed="0" w:uiPriority="0" w:semiHidden="0" w:name="line number"/>
-    <w:lsdException w:qFormat="1" w:unhideWhenUsed="0" w:uiPriority="0" w:semiHidden="0" w:name="page number"/>
+    <w:lsdException w:unhideWhenUsed="0" w:uiPriority="0" w:semiHidden="0" w:name="page number"/>
     <w:lsdException w:unhideWhenUsed="0" w:uiPriority="0" w:semiHidden="0" w:name="endnote reference"/>
     <w:lsdException w:unhideWhenUsed="0" w:uiPriority="0" w:semiHidden="0" w:name="endnote text"/>
     <w:lsdException w:unhideWhenUsed="0" w:uiPriority="0" w:semiHidden="0" w:name="table of authorities"/>
@@ -7430,7 +7349,7 @@
     <w:lsdException w:unhideWhenUsed="0" w:uiPriority="0" w:semiHidden="0" w:name="Closing"/>
     <w:lsdException w:unhideWhenUsed="0" w:uiPriority="0" w:semiHidden="0" w:name="Signature"/>
     <w:lsdException w:qFormat="1" w:unhideWhenUsed="0" w:uiPriority="0" w:semiHidden="0" w:name="Default Paragraph Font"/>
-    <w:lsdException w:qFormat="1" w:unhideWhenUsed="0" w:uiPriority="0" w:semiHidden="0" w:name="Body Text"/>
+    <w:lsdException w:unhideWhenUsed="0" w:uiPriority="0" w:semiHidden="0" w:name="Body Text"/>
     <w:lsdException w:unhideWhenUsed="0" w:uiPriority="0" w:semiHidden="0" w:name="Body Text Indent"/>
     <w:lsdException w:unhideWhenUsed="0" w:uiPriority="0" w:semiHidden="0" w:name="List Continue"/>
     <w:lsdException w:unhideWhenUsed="0" w:uiPriority="0" w:semiHidden="0" w:name="List Continue 2"/>
@@ -7449,7 +7368,7 @@
     <w:lsdException w:unhideWhenUsed="0" w:uiPriority="0" w:semiHidden="0" w:name="Body Text Indent 2"/>
     <w:lsdException w:unhideWhenUsed="0" w:uiPriority="0" w:semiHidden="0" w:name="Body Text Indent 3"/>
     <w:lsdException w:unhideWhenUsed="0" w:uiPriority="0" w:semiHidden="0" w:name="Block Text"/>
-    <w:lsdException w:qFormat="1" w:unhideWhenUsed="0" w:uiPriority="0" w:semiHidden="0" w:name="Hyperlink"/>
+    <w:lsdException w:unhideWhenUsed="0" w:uiPriority="0" w:semiHidden="0" w:name="Hyperlink"/>
     <w:lsdException w:unhideWhenUsed="0" w:uiPriority="0" w:semiHidden="0" w:name="FollowedHyperlink"/>
     <w:lsdException w:qFormat="1" w:unhideWhenUsed="0" w:uiPriority="0" w:semiHidden="0" w:name="Strong"/>
     <w:lsdException w:qFormat="1" w:unhideWhenUsed="0" w:uiPriority="0" w:semiHidden="0" w:name="Emphasis"/>
@@ -7678,7 +7597,6 @@
   <w:style w:type="paragraph" w:styleId="3">
     <w:name w:val="Body Text"/>
     <w:basedOn w:val="1"/>
-    <w:qFormat/>
     <w:uiPriority w:val="0"/>
     <w:pPr>
       <w:spacing w:line="400" w:lineRule="exact"/>
@@ -7709,7 +7627,6 @@
   <w:style w:type="paragraph" w:styleId="5">
     <w:name w:val="footer"/>
     <w:basedOn w:val="1"/>
-    <w:qFormat/>
     <w:uiPriority w:val="0"/>
     <w:pPr>
       <w:tabs>
@@ -7727,7 +7644,6 @@
   <w:style w:type="paragraph" w:styleId="6">
     <w:name w:val="header"/>
     <w:basedOn w:val="1"/>
-    <w:qFormat/>
     <w:uiPriority w:val="0"/>
     <w:pPr>
       <w:pBdr>
@@ -7781,12 +7697,10 @@
   <w:style w:type="character" w:styleId="12">
     <w:name w:val="page number"/>
     <w:basedOn w:val="10"/>
-    <w:qFormat/>
     <w:uiPriority w:val="0"/>
   </w:style>
   <w:style w:type="character" w:styleId="13">
     <w:name w:val="Hyperlink"/>
-    <w:qFormat/>
     <w:uiPriority w:val="0"/>
     <w:rPr>
       <w:color w:val="0000FF"/>

</xml_diff>

<commit_message>
update(开题报告): bigger pic font, update chapter
</commit_message>
<xml_diff>
--- a/docs/开题报告/DeFuzz-开题报告.docx
+++ b/docs/开题报告/DeFuzz-开题报告.docx
@@ -250,7 +250,6 @@
           <w:u w:val="single"/>
         </w:rPr>
         <w:tab/>
-        <w:tab/>
       </w:r>
       <w:r>
         <w:rPr>
@@ -259,9 +258,8 @@
           <w:kern w:val="2"/>
           <w:sz w:val="28"/>
           <w:u w:val="single"/>
-          <w:lang w:val="en-US" w:eastAsia="zh-CN"/>
-        </w:rPr>
-        <w:t xml:space="preserve">  </w:t>
+        </w:rPr>
+        <w:tab/>
       </w:r>
       <w:r>
         <w:rPr>
@@ -270,9 +268,9 @@
           <w:kern w:val="2"/>
           <w:sz w:val="28"/>
           <w:u w:val="single"/>
-          <w:lang w:eastAsia="zh-CN"/>
-        </w:rPr>
-        <w:t>专业硕士</w:t>
+          <w:lang w:val="en-US" w:eastAsia="zh-CN"/>
+        </w:rPr>
+        <w:t xml:space="preserve">  </w:t>
       </w:r>
       <w:r>
         <w:rPr>
@@ -281,9 +279,38 @@
           <w:kern w:val="2"/>
           <w:sz w:val="28"/>
           <w:u w:val="single"/>
+          <w:lang w:eastAsia="zh-CN"/>
+        </w:rPr>
+        <w:t>专业硕士</w:t>
+      </w:r>
+      <w:r>
+        <w:rPr>
+          <w:rFonts w:hint="eastAsia" w:ascii="宋体" w:hAnsi="宋体"/>
+          <w:spacing w:val="40"/>
+          <w:kern w:val="2"/>
+          <w:sz w:val="28"/>
+          <w:u w:val="single"/>
         </w:rPr>
         <w:tab/>
+      </w:r>
+      <w:r>
+        <w:rPr>
+          <w:rFonts w:hint="eastAsia" w:ascii="宋体" w:hAnsi="宋体"/>
+          <w:spacing w:val="40"/>
+          <w:kern w:val="2"/>
+          <w:sz w:val="28"/>
+          <w:u w:val="single"/>
+        </w:rPr>
         <w:tab/>
+      </w:r>
+      <w:r>
+        <w:rPr>
+          <w:rFonts w:hint="eastAsia" w:ascii="宋体" w:hAnsi="宋体"/>
+          <w:spacing w:val="40"/>
+          <w:kern w:val="2"/>
+          <w:sz w:val="28"/>
+          <w:u w:val="single"/>
+        </w:rPr>
         <w:tab/>
       </w:r>
       <w:r>
@@ -415,9 +442,45 @@
           <w:u w:val="single"/>
         </w:rPr>
         <w:tab/>
+      </w:r>
+      <w:r>
+        <w:rPr>
+          <w:rFonts w:hint="eastAsia" w:ascii="宋体" w:hAnsi="宋体"/>
+          <w:spacing w:val="40"/>
+          <w:kern w:val="2"/>
+          <w:sz w:val="28"/>
+          <w:u w:val="single"/>
+        </w:rPr>
         <w:tab/>
+      </w:r>
+      <w:r>
+        <w:rPr>
+          <w:rFonts w:hint="eastAsia" w:ascii="宋体" w:hAnsi="宋体"/>
+          <w:spacing w:val="40"/>
+          <w:kern w:val="2"/>
+          <w:sz w:val="28"/>
+          <w:u w:val="single"/>
+        </w:rPr>
         <w:t>电子信息</w:t>
+      </w:r>
+      <w:r>
+        <w:rPr>
+          <w:rFonts w:hint="eastAsia" w:ascii="宋体" w:hAnsi="宋体"/>
+          <w:spacing w:val="40"/>
+          <w:kern w:val="2"/>
+          <w:sz w:val="28"/>
+          <w:u w:val="single"/>
+        </w:rPr>
         <w:tab/>
+      </w:r>
+      <w:r>
+        <w:rPr>
+          <w:rFonts w:hint="eastAsia" w:ascii="宋体" w:hAnsi="宋体"/>
+          <w:spacing w:val="40"/>
+          <w:kern w:val="2"/>
+          <w:sz w:val="28"/>
+          <w:u w:val="single"/>
+        </w:rPr>
         <w:tab/>
       </w:r>
     </w:p>
@@ -477,7 +540,6 @@
           <w:u w:val="single"/>
         </w:rPr>
         <w:tab/>
-        <w:tab/>
       </w:r>
       <w:r>
         <w:rPr>
@@ -486,9 +548,8 @@
           <w:kern w:val="2"/>
           <w:sz w:val="28"/>
           <w:u w:val="single"/>
-          <w:lang w:val="en-US" w:eastAsia="zh-CN"/>
-        </w:rPr>
-        <w:t xml:space="preserve"> </w:t>
+        </w:rPr>
+        <w:tab/>
       </w:r>
       <w:r>
         <w:rPr>
@@ -497,9 +558,9 @@
           <w:kern w:val="2"/>
           <w:sz w:val="28"/>
           <w:u w:val="single"/>
-          <w:lang w:eastAsia="zh-CN"/>
-        </w:rPr>
-        <w:t>张景耀</w:t>
+          <w:lang w:val="en-US" w:eastAsia="zh-CN"/>
+        </w:rPr>
+        <w:t xml:space="preserve"> </w:t>
       </w:r>
       <w:r>
         <w:rPr>
@@ -508,12 +569,10 @@
           <w:kern w:val="2"/>
           <w:sz w:val="28"/>
           <w:u w:val="single"/>
-          <w:lang w:val="en-US" w:eastAsia="zh-CN"/>
-        </w:rPr>
-        <w:t xml:space="preserve">  </w:t>
-      </w:r>
-      <w:bookmarkStart w:id="0" w:name="_GoBack"/>
-      <w:bookmarkEnd w:id="0"/>
+          <w:lang w:eastAsia="zh-CN"/>
+        </w:rPr>
+        <w:t>张景耀</w:t>
+      </w:r>
       <w:r>
         <w:rPr>
           <w:rFonts w:hint="eastAsia" w:ascii="宋体" w:hAnsi="宋体"/>
@@ -521,8 +580,28 @@
           <w:kern w:val="2"/>
           <w:sz w:val="28"/>
           <w:u w:val="single"/>
+          <w:lang w:val="en-US" w:eastAsia="zh-CN"/>
+        </w:rPr>
+        <w:t xml:space="preserve">  </w:t>
+      </w:r>
+      <w:r>
+        <w:rPr>
+          <w:rFonts w:hint="eastAsia" w:ascii="宋体" w:hAnsi="宋体"/>
+          <w:spacing w:val="40"/>
+          <w:kern w:val="2"/>
+          <w:sz w:val="28"/>
+          <w:u w:val="single"/>
         </w:rPr>
         <w:tab/>
+      </w:r>
+      <w:r>
+        <w:rPr>
+          <w:rFonts w:hint="eastAsia" w:ascii="宋体" w:hAnsi="宋体"/>
+          <w:spacing w:val="40"/>
+          <w:kern w:val="2"/>
+          <w:sz w:val="28"/>
+          <w:u w:val="single"/>
+        </w:rPr>
         <w:tab/>
       </w:r>
       <w:r>
@@ -583,7 +662,6 @@
           <w:u w:val="single"/>
         </w:rPr>
         <w:tab/>
-        <w:tab/>
       </w:r>
       <w:r>
         <w:rPr>
@@ -592,9 +670,8 @@
           <w:kern w:val="2"/>
           <w:sz w:val="28"/>
           <w:u w:val="single"/>
-          <w:lang w:val="en-US" w:eastAsia="zh-CN"/>
-        </w:rPr>
-        <w:t xml:space="preserve"> </w:t>
+        </w:rPr>
+        <w:tab/>
       </w:r>
       <w:r>
         <w:rPr>
@@ -603,9 +680,9 @@
           <w:kern w:val="2"/>
           <w:sz w:val="28"/>
           <w:u w:val="single"/>
-          <w:lang w:eastAsia="zh-CN"/>
-        </w:rPr>
-        <w:t>徐坚皓</w:t>
+          <w:lang w:val="en-US" w:eastAsia="zh-CN"/>
+        </w:rPr>
+        <w:t xml:space="preserve"> </w:t>
       </w:r>
       <w:r>
         <w:rPr>
@@ -614,9 +691,9 @@
           <w:kern w:val="2"/>
           <w:sz w:val="28"/>
           <w:u w:val="single"/>
-          <w:lang w:val="en-US" w:eastAsia="zh-CN"/>
-        </w:rPr>
-        <w:t xml:space="preserve">  </w:t>
+          <w:lang w:eastAsia="zh-CN"/>
+        </w:rPr>
+        <w:t>徐坚皓</w:t>
       </w:r>
       <w:r>
         <w:rPr>
@@ -625,8 +702,28 @@
           <w:kern w:val="2"/>
           <w:sz w:val="28"/>
           <w:u w:val="single"/>
+          <w:lang w:val="en-US" w:eastAsia="zh-CN"/>
+        </w:rPr>
+        <w:t xml:space="preserve">  </w:t>
+      </w:r>
+      <w:r>
+        <w:rPr>
+          <w:rFonts w:hint="eastAsia" w:ascii="宋体" w:hAnsi="宋体"/>
+          <w:spacing w:val="40"/>
+          <w:kern w:val="2"/>
+          <w:sz w:val="28"/>
+          <w:u w:val="single"/>
         </w:rPr>
         <w:tab/>
+      </w:r>
+      <w:r>
+        <w:rPr>
+          <w:rFonts w:hint="eastAsia" w:ascii="宋体" w:hAnsi="宋体"/>
+          <w:spacing w:val="40"/>
+          <w:kern w:val="2"/>
+          <w:sz w:val="28"/>
+          <w:u w:val="single"/>
+        </w:rPr>
         <w:tab/>
       </w:r>
       <w:r>
@@ -685,6 +782,15 @@
           <w:u w:val="single"/>
         </w:rPr>
         <w:tab/>
+      </w:r>
+      <w:r>
+        <w:rPr>
+          <w:rFonts w:hint="eastAsia" w:ascii="宋体" w:hAnsi="宋体"/>
+          <w:spacing w:val="40"/>
+          <w:kern w:val="2"/>
+          <w:sz w:val="28"/>
+          <w:u w:val="single"/>
+        </w:rPr>
         <w:tab/>
       </w:r>
       <w:r>
@@ -791,7 +897,21 @@
           <w:u w:val="single"/>
         </w:rPr>
         <w:tab/>
+      </w:r>
+      <w:r>
+        <w:rPr>
+          <w:rFonts w:hint="eastAsia" w:ascii="宋体" w:hAnsi="宋体"/>
+          <w:sz w:val="28"/>
+          <w:u w:val="single"/>
+        </w:rPr>
         <w:tab/>
+      </w:r>
+      <w:r>
+        <w:rPr>
+          <w:rFonts w:hint="eastAsia" w:ascii="宋体" w:hAnsi="宋体"/>
+          <w:sz w:val="28"/>
+          <w:u w:val="single"/>
+        </w:rPr>
         <w:tab/>
       </w:r>
       <w:r>
@@ -818,6 +938,13 @@
           <w:u w:val="single"/>
         </w:rPr>
         <w:tab/>
+      </w:r>
+      <w:r>
+        <w:rPr>
+          <w:rFonts w:hint="eastAsia" w:ascii="宋体" w:hAnsi="宋体"/>
+          <w:sz w:val="28"/>
+          <w:u w:val="single"/>
+        </w:rPr>
         <w:tab/>
       </w:r>
       <w:r>
@@ -2344,9 +2471,8 @@
           </w:p>
           <w:p>
             <w:pPr>
-              <w:pStyle w:val="Normal"/>
               <w:widowControl/>
-              <w:jc w:val="start"/>
+              <w:jc w:val="left"/>
               <w:rPr>
                 <w:b/>
                 <w:bCs/>
@@ -2366,8 +2492,7 @@
           </w:p>
           <w:p>
             <w:pPr>
-              <w:pStyle w:val="Normal"/>
-              <w:spacing w:lineRule="auto" w:line="360"/>
+              <w:spacing w:line="360" w:lineRule="auto"/>
               <w:rPr>
                 <w:b/>
                 <w:bCs/>
@@ -2387,44 +2512,102 @@
           </w:p>
           <w:p>
             <w:pPr>
-              <w:pStyle w:val="Normal"/>
-              <w:spacing w:lineRule="auto" w:line="360"/>
-              <w:ind w:firstLineChars="200" w:startChars="0" w:start="0" w:endChars="0" w:end="0"/>
-              <w:rPr>
-                <w:kern w:val="0"/>
-                <w:sz w:val="24"/>
-              </w:rPr>
-            </w:pPr>
-            <w:r>
-              <w:rPr>
-                <w:kern w:val="0"/>
-                <w:sz w:val="24"/>
-              </w:rPr>
-              <w:t xml:space="preserve">近十年来，被公开披露的安全漏洞数量持续攀升。截至 2025 年，CVE 漏洞库每年新登记的条目稳定在两万条以上，且仍在快速增长[1]。Microsoft、Google 等厂商陆续公开承认，仅依靠人工审计与安全编程规范并不足以彻底清除上层代码中的内存安全 Bug[2][3]。因此，工业界与学术界将重心转向漏洞被触发后的拦截能力：栈金丝雀（stack canary）、源代码加固（_FORTIFY_SOURCE）、间接跳转跟踪（IBT）、控制流完整性（CFI）等多项防御机制由编译器与运行时共同叠加部署，在漏洞触发时承担起兜底防线的角色。</w:t>
-            </w:r>
-          </w:p>
-          <w:p>
-            <w:pPr>
-              <w:pStyle w:val="Normal"/>
-              <w:spacing w:lineRule="auto" w:line="360"/>
-              <w:ind w:firstLineChars="200" w:startChars="0" w:start="0" w:endChars="0" w:end="0"/>
-              <w:rPr>
-                <w:kern w:val="0"/>
-                <w:sz w:val="24"/>
-              </w:rPr>
-            </w:pPr>
-            <w:r>
-              <w:rPr>
-                <w:kern w:val="0"/>
-                <w:sz w:val="24"/>
-              </w:rPr>
-              <w:t xml:space="preserve">由编译器承担的兜底机制有一个共同的工作模式：在编译期向二进制中插入检查指令、布局约束或元数据，使运行期一旦偏离预定义的合法行为即可被发现并立即终止程序。以栈金丝雀为例，编译器在易受溢出影响的栈帧中，在函数返回地址和缓冲区之间插入随机值哨兵，并在函数返回前比对其是否被改写。兜底防线的有效性依赖于编译器各端能否正确生成代码，以及这些代码所依赖的指令集架构（instruction set architecture, ISA）假设是否成立。</w:t>
-            </w:r>
-          </w:p>
-          <w:p>
-            <w:pPr>
-              <w:pStyle w:val="Normal"/>
-              <w:spacing w:lineRule="auto" w:line="360"/>
+              <w:spacing w:line="360" w:lineRule="auto"/>
+              <w:ind w:left="0" w:leftChars="0" w:right="0" w:rightChars="0" w:firstLineChars="200"/>
+              <w:rPr>
+                <w:kern w:val="0"/>
+                <w:sz w:val="24"/>
+              </w:rPr>
+            </w:pPr>
+            <w:r>
+              <w:rPr>
+                <w:kern w:val="0"/>
+                <w:sz w:val="24"/>
+              </w:rPr>
+              <w:t>近十年来，被公开披露的安全漏洞数量持续攀升。截至 2025 年，CVE 漏洞库每年新登记的条目稳定在两万条以上，且仍在快速增长[1]。Microsoft、Google 等厂商陆续公开承认，仅依靠人工审计与安全编程规范并不足以彻底清除上层代码中的内存安全 Bug[2][3]。因此，</w:t>
+            </w:r>
+            <w:r>
+              <w:rPr>
+                <w:rFonts w:hint="eastAsia"/>
+                <w:kern w:val="0"/>
+                <w:sz w:val="24"/>
+              </w:rPr>
+              <w:t>漏洞触发后的拦截与防御</w:t>
+            </w:r>
+            <w:r>
+              <w:rPr>
+                <w:rFonts w:hint="eastAsia"/>
+                <w:kern w:val="0"/>
+                <w:sz w:val="24"/>
+                <w:lang w:eastAsia="zh-CN"/>
+              </w:rPr>
+              <w:t>变得越发</w:t>
+            </w:r>
+            <w:r>
+              <w:rPr>
+                <w:rFonts w:hint="eastAsia"/>
+                <w:kern w:val="0"/>
+                <w:sz w:val="24"/>
+              </w:rPr>
+              <w:t>重要</w:t>
+            </w:r>
+            <w:r>
+              <w:rPr>
+                <w:kern w:val="0"/>
+                <w:sz w:val="24"/>
+              </w:rPr>
+              <w:t>：栈金丝雀（stack canary）、源代码加固（_FORTIFY_SOURCE）、间接跳转跟踪（IBT）、控制流完整性（CFI）等多项防御机制由编译器与运行时共同叠加部署，在漏洞触发时承担起兜底防线的角色。</w:t>
+            </w:r>
+          </w:p>
+          <w:p>
+            <w:pPr>
+              <w:spacing w:line="360" w:lineRule="auto"/>
+              <w:ind w:left="0" w:leftChars="0" w:right="0" w:rightChars="0" w:firstLineChars="200"/>
+              <w:rPr>
+                <w:kern w:val="0"/>
+                <w:sz w:val="24"/>
+              </w:rPr>
+            </w:pPr>
+            <w:r>
+              <w:rPr>
+                <w:kern w:val="0"/>
+                <w:sz w:val="24"/>
+              </w:rPr>
+              <w:t>由编译器承担的防御机制有一个共同的工作模式：在编译期向二进制中插入检查指令、布局约束或元数据，使运行期一旦偏离预定义的合法行为即可被发现并立即终止程序。以栈金丝雀为例，编译器在易受溢出影响的栈帧中，在函数返回地址和缓冲区之间插入随机值哨兵，并在函数返回前比对其是否被改写。</w:t>
+            </w:r>
+          </w:p>
+          <w:p>
+            <w:pPr>
+              <w:spacing w:line="360" w:lineRule="auto"/>
+              <w:ind w:left="0" w:leftChars="0" w:right="0" w:rightChars="0" w:firstLineChars="200"/>
+              <w:rPr>
+                <w:kern w:val="0"/>
+                <w:sz w:val="24"/>
+              </w:rPr>
+            </w:pPr>
+            <w:r>
+              <w:rPr>
+                <w:rFonts w:hint="eastAsia"/>
+                <w:kern w:val="0"/>
+                <w:sz w:val="24"/>
+                <w:lang w:eastAsia="zh-CN"/>
+              </w:rPr>
+              <w:t>然而，防御机制自身也是由代码实现，其也会有实现漏洞。且</w:t>
+            </w:r>
+            <w:bookmarkStart w:id="0" w:name="_GoBack"/>
+            <w:bookmarkEnd w:id="0"/>
+            <w:r>
+              <w:rPr>
+                <w:rFonts w:hint="eastAsia"/>
+                <w:kern w:val="0"/>
+                <w:sz w:val="24"/>
+              </w:rPr>
+              <w:t>防御机制的有效性不仅依赖代码实现的正确性，更与底层的指令集架构（instruction set architecture, ISA）紧密相关。在当前 ISA 种类不断增多的背景下，跨架构的攻击面显著扩大，保证编译器防御实现的严谨性变得更加关键。</w:t>
+            </w:r>
+          </w:p>
+          <w:p>
+            <w:pPr>
+              <w:spacing w:line="360" w:lineRule="auto"/>
               <w:rPr>
                 <w:b/>
                 <w:bCs/>
@@ -2444,33 +2627,30 @@
           </w:p>
           <w:p>
             <w:pPr>
-              <w:pStyle w:val="Normal"/>
-              <w:spacing w:lineRule="auto" w:line="360"/>
-              <w:ind w:firstLineChars="200" w:startChars="0" w:start="0" w:endChars="0" w:end="0"/>
-              <w:rPr>
-                <w:kern w:val="0"/>
-                <w:sz w:val="24"/>
-              </w:rPr>
-            </w:pPr>
-            <w:r>
-              <w:rPr>
-                <w:kern w:val="0"/>
-                <w:sz w:val="24"/>
-              </w:rPr>
-              <w:t xml:space="preserve">2023 年披露的 CVE-2023-4039[4] 是一个具有代表性的案例。GCC 在 AArch64 上的 -fstack-protector 选项长期失效：当函数使用变长数组（variable-length array, VLA）或 alloca 时，编译器把栈金丝雀放在 VLA 之上、保存的返回地址却落在栈金丝雀之下，越界写入会先于金丝雀检查改写返回地址，本应兜底的保护因此被绕过。该漏洞在 GCC 早期版本即已存在，直到 2023 年才由外部研究者系统分析并修复。这种 buggy 状态下的栈帧布局如下图 1 所示。</w:t>
-            </w:r>
-          </w:p>
-          <w:p>
-            <w:pPr>
-              <w:pStyle w:val="Normal"/>
-              <w:spacing w:lineRule="auto" w:line="360"/>
-              <w:jc w:val="center"/>
-            </w:pPr>
-            <w:r>
-              <w:rPr/>
+              <w:spacing w:line="360" w:lineRule="auto"/>
+              <w:ind w:left="0" w:leftChars="0" w:right="0" w:rightChars="0" w:firstLineChars="200"/>
+              <w:rPr>
+                <w:kern w:val="0"/>
+                <w:sz w:val="24"/>
+              </w:rPr>
+            </w:pPr>
+            <w:r>
+              <w:rPr>
+                <w:kern w:val="0"/>
+                <w:sz w:val="24"/>
+              </w:rPr>
+              <w:t>2023 年披露的 CVE-2023-4039[4] 是一个具有代表性的案例。GCC 在 AArch64 上的 -fstack-protector 选项长期失效：当函数使用变长数组（variable-length array, VLA）或 alloca 时，编译器把栈金丝雀放在 VLA 之上、保存的返回地址却落在栈金丝雀之下，越界写入会先于金丝雀检查改写返回地址，本应兜底的保护因此被绕过。该漏洞在 GCC 早期版本即已存在，直到 2023 年才由外部研究者系统分析并修复。这种 buggy 状态下的栈帧布局如下图 1 所示。</w:t>
+            </w:r>
+          </w:p>
+          <w:p>
+            <w:pPr>
+              <w:spacing w:line="360" w:lineRule="auto"/>
+              <w:jc w:val="center"/>
+            </w:pPr>
+            <w:r>
               <w:drawing>
-                <wp:inline xmlns:wp="http://schemas.openxmlformats.org/drawingml/2006/wordprocessingDrawing" distT="0" distB="0" distL="0" distR="0">
-                  <wp:extent cx="4284090" cy="5326553"/>
+                <wp:inline distT="0" distB="0" distL="0" distR="0">
+                  <wp:extent cx="4283710" cy="5326380"/>
                   <wp:effectExtent l="0" t="0" r="0" b="0"/>
                   <wp:docPr id="21" name="Figure21"/>
                   <wp:cNvGraphicFramePr>
@@ -2480,11 +2660,13 @@
                     <a:graphicData uri="http://schemas.openxmlformats.org/drawingml/2006/picture">
                       <pic:pic xmlns:pic="http://schemas.openxmlformats.org/drawingml/2006/picture">
                         <pic:nvPicPr>
-                          <pic:cNvPr id="21" name="stack-layout.png"/>
-                          <pic:cNvPicPr/>
+                          <pic:cNvPr id="21" name="Figure21"/>
+                          <pic:cNvPicPr>
+                            <a:picLocks noChangeAspect="1"/>
+                          </pic:cNvPicPr>
                         </pic:nvPicPr>
                         <pic:blipFill>
-                          <a:blip xmlns:r="http://schemas.openxmlformats.org/officeDocument/2006/relationships" r:embed="rId21"/>
+                          <a:blip r:embed="rId6"/>
                           <a:stretch>
                             <a:fillRect/>
                           </a:stretch>
@@ -2507,8 +2689,7 @@
           </w:p>
           <w:p>
             <w:pPr>
-              <w:pStyle w:val="Normal"/>
-              <w:spacing w:lineRule="auto" w:line="360"/>
+              <w:spacing w:line="360" w:lineRule="auto"/>
               <w:jc w:val="center"/>
               <w:rPr>
                 <w:rFonts w:ascii="宋体" w:hAnsi="宋体" w:eastAsia="宋体"/>
@@ -2529,35 +2710,32 @@
           </w:p>
           <w:p>
             <w:pPr>
-              <w:pStyle w:val="Normal"/>
-              <w:spacing w:lineRule="auto" w:line="360"/>
-              <w:rPr>
-                <w:sz w:val="24"/>
-              </w:rPr>
-            </w:pPr>
-          </w:p>
-          <w:p>
-            <w:pPr>
-              <w:pStyle w:val="Normal"/>
-              <w:spacing w:lineRule="auto" w:line="360"/>
-              <w:ind w:firstLineChars="200" w:startChars="0" w:start="0" w:endChars="0" w:end="0"/>
-              <w:rPr>
-                <w:kern w:val="0"/>
-                <w:sz w:val="24"/>
-              </w:rPr>
-            </w:pPr>
-            <w:r>
-              <w:rPr>
-                <w:kern w:val="0"/>
-                <w:sz w:val="24"/>
-              </w:rPr>
-              <w:t xml:space="preserve">CVE-2023-4039 直观地揭示了一个共性问题：编译器侧防御机制的有效性强依赖于具体 ISA 上的栈布局、寄存器分配与指令编码假设。一旦防御设计中的某项假设与某套 ISA 不一致，运行期保护就会悄然失效。这种失效具有"双重无声"特征：编译时不报错（工具链与功能测试都察觉不到），运行时也能产生正确的功能结果（程序行为也察觉不到），但其安全契约已经被打破。本课题将这种形态的失效称为静默失效（silent failure）：编译产物看似带有完整防线，但攻击者可直接绕过。</w:t>
-            </w:r>
-          </w:p>
-          <w:p>
-            <w:pPr>
-              <w:pStyle w:val="Normal"/>
-              <w:spacing w:lineRule="auto" w:line="360"/>
+              <w:spacing w:line="360" w:lineRule="auto"/>
+              <w:rPr>
+                <w:sz w:val="24"/>
+              </w:rPr>
+            </w:pPr>
+          </w:p>
+          <w:p>
+            <w:pPr>
+              <w:spacing w:line="360" w:lineRule="auto"/>
+              <w:ind w:left="0" w:leftChars="0" w:right="0" w:rightChars="0" w:firstLineChars="200"/>
+              <w:rPr>
+                <w:kern w:val="0"/>
+                <w:sz w:val="24"/>
+              </w:rPr>
+            </w:pPr>
+            <w:r>
+              <w:rPr>
+                <w:kern w:val="0"/>
+                <w:sz w:val="24"/>
+              </w:rPr>
+              <w:t>CVE-2023-4039 直观地揭示了一个共性问题：防御机制的有效性除了依赖代码实现的正确性之外，也强依赖于具体 ISA 上的栈布局、寄存器分配与指令编码设计。一旦防御设计中的某项假设与某套 ISA 不一致，运行期保护就会悄然失效。这种失效具有"双重无声"特征：编译时不报错（工具链与功能测试都察觉不到），运行时也能产生正确的功能结果（程序行为也察觉不到），但其安全契约已经被打破。本课题将这种形态的失效称为静默失效（silent failure）：编译产物看似带有完整防线，但攻击者可直接绕过。</w:t>
+            </w:r>
+          </w:p>
+          <w:p>
+            <w:pPr>
+              <w:spacing w:line="360" w:lineRule="auto"/>
               <w:rPr>
                 <w:b/>
                 <w:bCs/>
@@ -2577,51 +2755,47 @@
           </w:p>
           <w:p>
             <w:pPr>
-              <w:pStyle w:val="Normal"/>
-              <w:spacing w:lineRule="auto" w:line="360"/>
-              <w:ind w:firstLineChars="200" w:startChars="0" w:start="0" w:endChars="0" w:end="0"/>
-              <w:rPr>
-                <w:kern w:val="0"/>
-                <w:sz w:val="24"/>
-              </w:rPr>
-            </w:pPr>
-            <w:r>
-              <w:rPr>
-                <w:kern w:val="0"/>
-                <w:sz w:val="24"/>
-              </w:rPr>
-              <w:t xml:space="preserve">要在编译器中系统性地暴露此类静默失效，本课题面临两个相互纠缠的挑战。</w:t>
-            </w:r>
-          </w:p>
-          <w:p>
-            <w:pPr>
-              <w:pStyle w:val="Normal"/>
-              <w:spacing w:lineRule="auto" w:line="360"/>
-              <w:ind w:firstLineChars="200" w:startChars="0" w:start="0" w:endChars="0" w:end="0"/>
-              <w:rPr>
-                <w:kern w:val="0"/>
-                <w:sz w:val="24"/>
-              </w:rPr>
-            </w:pPr>
-            <w:r>
-              <w:rPr>
-                <w:kern w:val="0"/>
-                <w:sz w:val="24"/>
-              </w:rPr>
-              <w:t xml:space="preserve">第一是搜索空间巨大。如图 2 所示，编译器需要在多种防御机制（如栈金丝雀、_FORTIFY_SOURCE、IBT、CFI 等）与多套 ISA（如 x86-64、AArch64、RISC-V、LoongArch 等）构成的二维空间中维护安全契约。每个格点对应独立的中端 pass 或后端模板，任何细节都可能影响机制是否生效。已确认的同源遗漏并不少见：与 CVE-2023-4039 同源的 PR-96191[5] 在 2020 年修复时仅覆盖部分架构，未触及多个 fallback 后端，导致同一失效在其他架构上静默存续多年。本课题在初步实验中已向 GCC 上游确认了多例此类同源失效[6-9]（见第五章）。</w:t>
-            </w:r>
-          </w:p>
-          <w:p>
-            <w:pPr>
-              <w:pStyle w:val="Normal"/>
-              <w:spacing w:lineRule="auto" w:line="360"/>
-              <w:jc w:val="center"/>
-            </w:pPr>
-            <w:r>
-              <w:rPr/>
+              <w:spacing w:line="360" w:lineRule="auto"/>
+              <w:ind w:left="0" w:leftChars="0" w:right="0" w:rightChars="0" w:firstLineChars="200"/>
+              <w:rPr>
+                <w:kern w:val="0"/>
+                <w:sz w:val="24"/>
+              </w:rPr>
+            </w:pPr>
+            <w:r>
+              <w:rPr>
+                <w:kern w:val="0"/>
+                <w:sz w:val="24"/>
+              </w:rPr>
+              <w:t>要在编译器中系统性地暴露此类静默失效，本课题面临两个相互纠缠的挑战。</w:t>
+            </w:r>
+          </w:p>
+          <w:p>
+            <w:pPr>
+              <w:spacing w:line="360" w:lineRule="auto"/>
+              <w:ind w:left="0" w:leftChars="0" w:right="0" w:rightChars="0" w:firstLineChars="200"/>
+              <w:rPr>
+                <w:kern w:val="0"/>
+                <w:sz w:val="24"/>
+              </w:rPr>
+            </w:pPr>
+            <w:r>
+              <w:rPr>
+                <w:kern w:val="0"/>
+                <w:sz w:val="24"/>
+              </w:rPr>
+              <w:t>第一是搜索空间巨大。如图 2 所示，编译器需要在多种防御机制（如栈金丝雀、_FORTIFY_SOURCE、IBT、CFI 等）与多套 ISA（如 x86-64、AArch64、RISC-V、LoongArch 等）构成的二维空间中维护安全契约。每个格点对应独立的中端 pass 或后端模板，任何细节都可能影响机制是否生效。已确认的同源遗漏并不少见：与 CVE-2023-4039 同源的 PR-96191[5] 在 2020 年修复时仅覆盖部分架构，未触及多个 fallback 后端，导致同一失效在其他架构上静默存续多年。本课题在初步实验中已向 GCC 上游确认了多例此类同源失效[6-9]（见第五章）。</w:t>
+            </w:r>
+          </w:p>
+          <w:p>
+            <w:pPr>
+              <w:spacing w:line="360" w:lineRule="auto"/>
+              <w:jc w:val="center"/>
+            </w:pPr>
+            <w:r>
               <w:drawing>
-                <wp:inline xmlns:wp="http://schemas.openxmlformats.org/drawingml/2006/wordprocessingDrawing" distT="0" distB="0" distL="0" distR="0">
-                  <wp:extent cx="5385714" cy="2709687"/>
+                <wp:inline distT="0" distB="0" distL="0" distR="0">
+                  <wp:extent cx="5385435" cy="2709545"/>
                   <wp:effectExtent l="0" t="0" r="0" b="0"/>
                   <wp:docPr id="22" name="Figure22"/>
                   <wp:cNvGraphicFramePr>
@@ -2631,11 +2805,13 @@
                     <a:graphicData uri="http://schemas.openxmlformats.org/drawingml/2006/picture">
                       <pic:pic xmlns:pic="http://schemas.openxmlformats.org/drawingml/2006/picture">
                         <pic:nvPicPr>
-                          <pic:cNvPr id="22" name="defense-matrix.png"/>
-                          <pic:cNvPicPr/>
+                          <pic:cNvPr id="22" name="Figure22"/>
+                          <pic:cNvPicPr>
+                            <a:picLocks noChangeAspect="1"/>
+                          </pic:cNvPicPr>
                         </pic:nvPicPr>
                         <pic:blipFill>
-                          <a:blip xmlns:r="http://schemas.openxmlformats.org/officeDocument/2006/relationships" r:embed="rId22"/>
+                          <a:blip r:embed="rId7"/>
                           <a:stretch>
                             <a:fillRect/>
                           </a:stretch>
@@ -2658,8 +2834,7 @@
           </w:p>
           <w:p>
             <w:pPr>
-              <w:pStyle w:val="Normal"/>
-              <w:spacing w:lineRule="auto" w:line="360"/>
+              <w:spacing w:line="360" w:lineRule="auto"/>
               <w:jc w:val="center"/>
               <w:rPr>
                 <w:rFonts w:ascii="宋体" w:hAnsi="宋体" w:eastAsia="宋体"/>
@@ -2680,53 +2855,49 @@
           </w:p>
           <w:p>
             <w:pPr>
-              <w:pStyle w:val="Normal"/>
-              <w:spacing w:lineRule="auto" w:line="360"/>
-              <w:rPr>
-                <w:sz w:val="24"/>
-              </w:rPr>
-            </w:pPr>
-          </w:p>
-          <w:p>
-            <w:pPr>
-              <w:pStyle w:val="Normal"/>
-              <w:spacing w:lineRule="auto" w:line="360"/>
-              <w:ind w:firstLineChars="200" w:startChars="0" w:start="0" w:endChars="0" w:end="0"/>
-              <w:rPr>
-                <w:kern w:val="0"/>
-                <w:sz w:val="24"/>
-              </w:rPr>
-            </w:pPr>
-            <w:r>
-              <w:rPr>
-                <w:kern w:val="0"/>
-                <w:sz w:val="24"/>
-              </w:rPr>
-              <w:t xml:space="preserve">第二是失效难以判定。即使测试推进到相关代码路径，"防御契约是否满足"也很难直接观察：程序不崩溃，多编译器输出一致，看似正常而契约已失守。本课题将防御机制运行期必须成立的静态或动态性质统称为安全不变量（safety invariant，即"安全规则"，如金丝雀必须位于易受攻击栈对象与返回地址之间）。破坏这些性质即发生静默失效。已有自动化手段对此不敏感：基于崩溃或差分输出的工具（如 Csmith、YARPGen）无法触发异常；覆盖率引导的模糊测试（fuzzing）也因缺乏相应的预言机（oracle）而无法判别每一格点的安全状态。</w:t>
-            </w:r>
-          </w:p>
-          <w:p>
-            <w:pPr>
-              <w:pStyle w:val="Normal"/>
-              <w:spacing w:lineRule="auto" w:line="360"/>
-              <w:ind w:firstLineChars="200" w:startChars="0" w:start="0" w:endChars="0" w:end="0"/>
-              <w:rPr>
-                <w:kern w:val="0"/>
-                <w:sz w:val="24"/>
-              </w:rPr>
-            </w:pPr>
-            <w:r>
-              <w:rPr>
-                <w:kern w:val="0"/>
-                <w:sz w:val="24"/>
-              </w:rPr>
-              <w:t xml:space="preserve">同时，巨大的搜索空间也给 fuzzing 自身的覆盖效率带来了考验。本课题对此的应对思路是把推进目标显式限定在"防御机制相关代码"，让覆盖率反馈与大语言模型驱动的种子变异共同约束搜索方向，详见第三、四章。</w:t>
-            </w:r>
-          </w:p>
-          <w:p>
-            <w:pPr>
-              <w:pStyle w:val="Normal"/>
-              <w:spacing w:lineRule="auto" w:line="360"/>
+              <w:spacing w:line="360" w:lineRule="auto"/>
+              <w:rPr>
+                <w:sz w:val="24"/>
+              </w:rPr>
+            </w:pPr>
+          </w:p>
+          <w:p>
+            <w:pPr>
+              <w:spacing w:line="360" w:lineRule="auto"/>
+              <w:ind w:left="0" w:leftChars="0" w:right="0" w:rightChars="0" w:firstLineChars="200"/>
+              <w:rPr>
+                <w:kern w:val="0"/>
+                <w:sz w:val="24"/>
+              </w:rPr>
+            </w:pPr>
+            <w:r>
+              <w:rPr>
+                <w:kern w:val="0"/>
+                <w:sz w:val="24"/>
+              </w:rPr>
+              <w:t>第二是失效难以判定。即使测试推进到相关代码路径，"防御契约是否满足"也很难直接观察：程序不崩溃，多编译器输出一致，看似正常而契约已失守。本课题将防御机制运行期必须成立的静态或动态性质统称为安全不变量（safety invariant，即"安全规则"，如金丝雀必须位于易受攻击栈对象与返回地址之间）。破坏这些性质即发生静默失效。已有自动化手段对此不敏感：基于崩溃或差分输出的工具（如 Csmith、YARPGen）无法触发异常；覆盖率引导的模糊测试（fuzzing）也因缺乏相应的预言机（oracle）而无法判别每一格点的安全状态。</w:t>
+            </w:r>
+          </w:p>
+          <w:p>
+            <w:pPr>
+              <w:spacing w:line="360" w:lineRule="auto"/>
+              <w:ind w:left="0" w:leftChars="0" w:right="0" w:rightChars="0" w:firstLineChars="200"/>
+              <w:rPr>
+                <w:kern w:val="0"/>
+                <w:sz w:val="24"/>
+              </w:rPr>
+            </w:pPr>
+            <w:r>
+              <w:rPr>
+                <w:kern w:val="0"/>
+                <w:sz w:val="24"/>
+              </w:rPr>
+              <w:t>同时，巨大的搜索空间也给 fuzzing 自身的覆盖效率带来了考验。本课题对此的应对思路是把推进目标显式限定在"防御机制相关代码"，让覆盖率反馈与大语言模型驱动的种子变异共同约束搜索方向，详见第三、四章。</w:t>
+            </w:r>
+          </w:p>
+          <w:p>
+            <w:pPr>
+              <w:spacing w:line="360" w:lineRule="auto"/>
               <w:rPr>
                 <w:b/>
                 <w:bCs/>
@@ -2746,36 +2917,33 @@
           </w:p>
           <w:p>
             <w:pPr>
-              <w:pStyle w:val="Normal"/>
-              <w:spacing w:lineRule="auto" w:line="360"/>
-              <w:ind w:firstLineChars="200" w:startChars="0" w:start="0" w:endChars="0" w:end="0"/>
-              <w:rPr>
-                <w:kern w:val="0"/>
-                <w:sz w:val="24"/>
-              </w:rPr>
-            </w:pPr>
-            <w:r>
-              <w:rPr>
-                <w:kern w:val="0"/>
-                <w:sz w:val="24"/>
-              </w:rPr>
-              <w:t xml:space="preserve">编译器是绝大多数软件防御机制的实际载体，其在"防御机制 × ISA"二维矩阵上的静默失效会直接削弱整个软件生态的运行时安全保障。然而，现有自动化测试方法既未把搜索空间约束到防御机制相关代码，也未把安全不变量纳入判定体系。如果能把矩阵格点上的安全不变量翻译为可机器判定的检查器，并主动引导编译器走到相应代码路径，就既可暴露既有缺陷家族的同类变种，也有望在后续优化引入同类回归时及早发现。基于此，本研究结合大语言模型的代码理解能力与覆盖率反馈，构建面向编译器防御机制脆弱性的分析方法。</w:t>
-            </w:r>
-          </w:p>
-          <w:p>
-            <w:pPr>
-              <w:pStyle w:val="Normal"/>
-              <w:spacing w:lineRule="auto" w:line="360"/>
-              <w:rPr>
-                <w:sz w:val="24"/>
-              </w:rPr>
-            </w:pPr>
-          </w:p>
-          <w:p>
-            <w:pPr>
-              <w:pStyle w:val="Normal"/>
+              <w:spacing w:line="360" w:lineRule="auto"/>
+              <w:ind w:left="0" w:leftChars="0" w:right="0" w:rightChars="0" w:firstLineChars="200"/>
+              <w:rPr>
+                <w:kern w:val="0"/>
+                <w:sz w:val="24"/>
+              </w:rPr>
+            </w:pPr>
+            <w:r>
+              <w:rPr>
+                <w:kern w:val="0"/>
+                <w:sz w:val="24"/>
+              </w:rPr>
+              <w:t>编译器是绝大多数软件防御机制的实际载体，其在"防御机制 × ISA"二维矩阵上的静默失效会直接削弱整个软件生态的运行时安全保障。然而，现有自动化测试方法既未把搜索空间约束到防御机制相关代码，也未把安全不变量纳入判定体系。如果能把矩阵格点上的安全不变量翻译为可机器判定的检查器，并主动引导编译器走到相应代码路径，就既可暴露既有缺陷家族的同类变种，也有望在后续优化引入同类回归时及早发现。基于此，本研究结合大语言模型的代码理解能力与覆盖率反馈，构建面向编译器防御机制脆弱性的分析方法。</w:t>
+            </w:r>
+          </w:p>
+          <w:p>
+            <w:pPr>
+              <w:spacing w:line="360" w:lineRule="auto"/>
+              <w:rPr>
+                <w:sz w:val="24"/>
+              </w:rPr>
+            </w:pPr>
+          </w:p>
+          <w:p>
+            <w:pPr>
               <w:widowControl/>
-              <w:jc w:val="start"/>
+              <w:jc w:val="left"/>
               <w:rPr>
                 <w:b/>
                 <w:bCs/>
@@ -2795,8 +2963,7 @@
           </w:p>
           <w:p>
             <w:pPr>
-              <w:pStyle w:val="Normal"/>
-              <w:spacing w:lineRule="auto" w:line="360"/>
+              <w:spacing w:line="360" w:lineRule="auto"/>
               <w:rPr>
                 <w:b/>
                 <w:bCs/>
@@ -2816,44 +2983,41 @@
           </w:p>
           <w:p>
             <w:pPr>
-              <w:pStyle w:val="Normal"/>
-              <w:spacing w:lineRule="auto" w:line="360"/>
-              <w:ind w:firstLineChars="200" w:startChars="0" w:start="0" w:endChars="0" w:end="0"/>
-              <w:rPr>
-                <w:kern w:val="0"/>
-                <w:sz w:val="24"/>
-              </w:rPr>
-            </w:pPr>
-            <w:r>
-              <w:rPr>
-                <w:kern w:val="0"/>
-                <w:sz w:val="24"/>
-              </w:rPr>
-              <w:t xml:space="preserve">要在编译器中系统性地暴露此类静默失效，面临两个挑战：搜索空间巨大、失效难以判定。围绕这两条挑战梳理现有方法可以发现，此前的工作或针对其中之一做出推进，或停留在与编译器自身防御机制弱相关的常规缺陷上，目前尚未出现同时直面两条挑战的成熟方案。下文按这两个维度组织文献，并讨论各自的覆盖范围与遗留空白。</w:t>
-            </w:r>
-          </w:p>
-          <w:p>
-            <w:pPr>
-              <w:pStyle w:val="Normal"/>
-              <w:spacing w:lineRule="auto" w:line="360"/>
-              <w:ind w:firstLineChars="200" w:startChars="0" w:start="0" w:endChars="0" w:end="0"/>
-              <w:rPr>
-                <w:kern w:val="0"/>
-                <w:sz w:val="24"/>
-              </w:rPr>
-            </w:pPr>
-            <w:r>
-              <w:rPr>
-                <w:kern w:val="0"/>
-                <w:sz w:val="24"/>
-              </w:rPr>
-              <w:t xml:space="preserve">需要指出的是，模糊测试（fuzzing）并非解决该问题的唯一路径。静态分析、形式化验证、人工审计在原则上也可以参与判定一条防御机制是否在某 ISA 上仍维持其安全契约。然而，受限于安全契约本身缺乏统一的可形式化描述，以及防御机制实现散落在编译器中端 pass 与若干后端模板中的工程现实，目前与覆盖率证据耦合最紧、最容易把搜索空间显式收敛到目标代码区域的方案仍然是覆盖率引导的模糊测试。本章对相关工作的取舍即基于此判断。</w:t>
-            </w:r>
-          </w:p>
-          <w:p>
-            <w:pPr>
-              <w:pStyle w:val="Normal"/>
-              <w:spacing w:lineRule="auto" w:line="360"/>
+              <w:spacing w:line="360" w:lineRule="auto"/>
+              <w:ind w:left="0" w:leftChars="0" w:right="0" w:rightChars="0" w:firstLineChars="200"/>
+              <w:rPr>
+                <w:kern w:val="0"/>
+                <w:sz w:val="24"/>
+              </w:rPr>
+            </w:pPr>
+            <w:r>
+              <w:rPr>
+                <w:kern w:val="0"/>
+                <w:sz w:val="24"/>
+              </w:rPr>
+              <w:t>要在编译器中系统性地暴露此类静默失效，面临两个挑战：搜索空间巨大、失效难以判定。围绕这两条挑战梳理现有方法可以发现，此前的工作或针对其中之一做出推进，或停留在与编译器自身防御机制弱相关的常规缺陷上，目前尚未出现同时直面两条挑战的成熟方案。下文按这两个维度组织文献，并讨论各自的覆盖范围与遗留空白。</w:t>
+            </w:r>
+          </w:p>
+          <w:p>
+            <w:pPr>
+              <w:spacing w:line="360" w:lineRule="auto"/>
+              <w:ind w:left="0" w:leftChars="0" w:right="0" w:rightChars="0" w:firstLineChars="200"/>
+              <w:rPr>
+                <w:kern w:val="0"/>
+                <w:sz w:val="24"/>
+              </w:rPr>
+            </w:pPr>
+            <w:r>
+              <w:rPr>
+                <w:kern w:val="0"/>
+                <w:sz w:val="24"/>
+              </w:rPr>
+              <w:t>需要指出的是，模糊测试（fuzzing）并非解决该问题的唯一路径。静态分析、形式化验证、人工审计在原则上也可以参与判定一条防御机制是否在某 ISA 上仍维持其安全契约。然而，受限于安全契约本身缺乏统一的可形式化描述，以及防御机制实现散落在编译器中端 pass 与若干后端模板中的工程现实，目前与覆盖率证据耦合最紧、最容易把搜索空间显式收敛到目标代码区域的方案仍然是覆盖率引导的模糊测试。本章对相关工作的取舍即基于此判断。</w:t>
+            </w:r>
+          </w:p>
+          <w:p>
+            <w:pPr>
+              <w:spacing w:line="360" w:lineRule="auto"/>
               <w:rPr>
                 <w:b/>
                 <w:bCs/>
@@ -2868,121 +3032,114 @@
                 <w:kern w:val="0"/>
                 <w:sz w:val="24"/>
               </w:rPr>
-              <w:t>2.2 面向搜索空间的现有工作</w:t>
-            </w:r>
-          </w:p>
-          <w:p>
-            <w:pPr>
-              <w:pStyle w:val="Normal"/>
-              <w:spacing w:lineRule="auto" w:line="360"/>
-              <w:ind w:firstLineChars="200" w:startChars="0" w:start="0" w:endChars="0" w:end="0"/>
-              <w:rPr>
-                <w:kern w:val="0"/>
-                <w:sz w:val="24"/>
-              </w:rPr>
-            </w:pPr>
-            <w:r>
-              <w:rPr>
-                <w:kern w:val="0"/>
-                <w:sz w:val="24"/>
-              </w:rPr>
-              <w:t xml:space="preserve">针对"如何把测试输入有目标地推到防御机制相关代码"的问题，现有方法大致可划分为四类。</w:t>
-            </w:r>
-          </w:p>
-          <w:p>
-            <w:pPr>
-              <w:pStyle w:val="Normal"/>
-              <w:spacing w:lineRule="auto" w:line="360"/>
-              <w:ind w:firstLineChars="200" w:startChars="0" w:start="0" w:endChars="0" w:end="0"/>
-              <w:rPr>
-                <w:kern w:val="0"/>
-                <w:sz w:val="24"/>
-              </w:rPr>
-            </w:pPr>
-            <w:r>
-              <w:rPr>
-                <w:kern w:val="0"/>
-                <w:sz w:val="24"/>
-              </w:rPr>
-              <w:t xml:space="preserve">随机生成与文法生成。Csmith[10] 与 YARPGen[11] 基于概率文法从空白合成不含未定义行为的 C 程序，再以差分输出驱动测试。这类方法对编译器整体覆盖良好，但生成过程不带任何防御机制的语义偏好，实测中很难自然落到栈金丝雀、IBT 等机制相关的代码路径上。</w:t>
-            </w:r>
-          </w:p>
-          <w:p>
-            <w:pPr>
-              <w:pStyle w:val="Normal"/>
-              <w:spacing w:lineRule="auto" w:line="360"/>
-              <w:ind w:firstLineChars="200" w:startChars="0" w:start="0" w:endChars="0" w:end="0"/>
-              <w:rPr>
-                <w:kern w:val="0"/>
-                <w:sz w:val="24"/>
-              </w:rPr>
-            </w:pPr>
-            <w:r>
-              <w:rPr>
-                <w:kern w:val="0"/>
-                <w:sz w:val="24"/>
-              </w:rPr>
-              <w:t xml:space="preserve">字节级覆盖率引导。AFL[12]、libFuzzer[13] 等以字节级覆盖率反馈为导向的工具被广泛用于编译器解析与优化组件。它们能感知"是否走入新代码"，但对生成程序的语法语义合法性约束有限，且覆盖率信号无差别对待所有代码区域，无法天然把推进目标限定到防御机制相关代码。</w:t>
-            </w:r>
-          </w:p>
-          <w:p>
-            <w:pPr>
-              <w:pStyle w:val="Normal"/>
-              <w:spacing w:lineRule="auto" w:line="360"/>
-              <w:ind w:firstLineChars="200" w:startChars="0" w:start="0" w:endChars="0" w:end="0"/>
-              <w:rPr>
-                <w:kern w:val="0"/>
-                <w:sz w:val="24"/>
-              </w:rPr>
-            </w:pPr>
-            <w:r>
-              <w:rPr>
-                <w:kern w:val="0"/>
-                <w:sz w:val="24"/>
-              </w:rPr>
-              <w:t xml:space="preserve">源码级语义保持变异。GrayC[14] 将覆盖率引导与一组保持语义合法性的源码级变异结合，在覆盖率推进与缺陷发现率上优于纯生成式工具；EMI 系列[15] 在种子的未执行区域做语义保持变换，可视作变异与变形预言机的组合。这类方法具备较强的工程实用性，但变异规则由人工定义，没有利用目标代码自身的语义信息引导方向。</w:t>
-            </w:r>
-          </w:p>
-          <w:p>
-            <w:pPr>
-              <w:pStyle w:val="Normal"/>
-              <w:spacing w:lineRule="auto" w:line="360"/>
-              <w:ind w:firstLineChars="200" w:startChars="0" w:start="0" w:endChars="0" w:end="0"/>
-              <w:rPr>
-                <w:kern w:val="0"/>
-                <w:sz w:val="24"/>
-              </w:rPr>
-            </w:pPr>
-            <w:r>
-              <w:rPr>
-                <w:kern w:val="0"/>
-                <w:sz w:val="24"/>
-              </w:rPr>
-              <w:t xml:space="preserve">大语言模型驱动的变异。WhiteFox[16] 从优化 pass 源码出发，利用大模型归纳输入模式并生成测试用例，使种子生成具备对编译器内部逻辑的感知；HLPFuzz[17] 进一步将大模型与覆盖率反馈耦合，将未覆盖基本块翻译为约束求解任务交由大模型完成。这表明大模型可作为语义感知的变异引擎，但目前工作定义的目标仍是常规可达性（"走到某处代码"），并不关心目标路径所承担的安全契约。</w:t>
-            </w:r>
-          </w:p>
-          <w:p>
-            <w:pPr>
-              <w:pStyle w:val="Normal"/>
-              <w:spacing w:lineRule="auto" w:line="360"/>
-              <w:ind w:firstLineChars="200" w:startChars="0" w:start="0" w:endChars="0" w:end="0"/>
-              <w:rPr>
-                <w:kern w:val="0"/>
-                <w:sz w:val="24"/>
-              </w:rPr>
-            </w:pPr>
-            <w:r>
-              <w:rPr>
-                <w:kern w:val="0"/>
-                <w:sz w:val="24"/>
-              </w:rPr>
-              <w:t xml:space="preserve">综合来看，现有方法在搜索空间一侧已积累了较成熟的覆盖率推进手段，若能把"防御机制相关性"作为目标基本块挑选的额外维度并复用大语言模型的代码理解能力，就有望显著提高在防御机制 × ISA 矩阵中的有效采样密度。</w:t>
-            </w:r>
-          </w:p>
-          <w:p>
-            <w:pPr>
-              <w:pStyle w:val="Normal"/>
-              <w:spacing w:lineRule="auto" w:line="360"/>
+              <w:t>2.2 面向防御机制的测试输入生成研究</w:t>
+            </w:r>
+          </w:p>
+          <w:p>
+            <w:pPr>
+              <w:spacing w:line="360" w:lineRule="auto"/>
+              <w:ind w:left="0" w:leftChars="0" w:right="0" w:rightChars="0" w:firstLineChars="200"/>
+              <w:rPr>
+                <w:kern w:val="0"/>
+                <w:sz w:val="24"/>
+              </w:rPr>
+            </w:pPr>
+            <w:r>
+              <w:rPr>
+                <w:kern w:val="0"/>
+                <w:sz w:val="24"/>
+              </w:rPr>
+              <w:t>针对"如何把测试输入有目标地推到防御机制相关代码"的问题，现有方法大致可划分为四类。</w:t>
+            </w:r>
+          </w:p>
+          <w:p>
+            <w:pPr>
+              <w:spacing w:line="360" w:lineRule="auto"/>
+              <w:ind w:left="0" w:leftChars="0" w:right="0" w:rightChars="0" w:firstLineChars="200"/>
+              <w:rPr>
+                <w:kern w:val="0"/>
+                <w:sz w:val="24"/>
+              </w:rPr>
+            </w:pPr>
+            <w:r>
+              <w:rPr>
+                <w:kern w:val="0"/>
+                <w:sz w:val="24"/>
+              </w:rPr>
+              <w:t>随机生成与文法生成。Csmith[10] 与 YARPGen[11] 基于概率文法从空白合成不含未定义行为的 C 程序，再以差分输出驱动测试。这类方法对编译器整体覆盖良好，但生成过程不带任何防御机制的语义偏好，实测中很难自然落到栈金丝雀、IBT 等机制相关的代码路径上。</w:t>
+            </w:r>
+          </w:p>
+          <w:p>
+            <w:pPr>
+              <w:spacing w:line="360" w:lineRule="auto"/>
+              <w:ind w:left="0" w:leftChars="0" w:right="0" w:rightChars="0" w:firstLineChars="200"/>
+              <w:rPr>
+                <w:kern w:val="0"/>
+                <w:sz w:val="24"/>
+              </w:rPr>
+            </w:pPr>
+            <w:r>
+              <w:rPr>
+                <w:kern w:val="0"/>
+                <w:sz w:val="24"/>
+              </w:rPr>
+              <w:t>字节级覆盖率引导。AFL[12]、libFuzzer[13] 等以字节级覆盖率反馈为导向的工具被广泛用于编译器解析与优化组件。它们能感知"是否走入新代码"，但对生成程序的语法语义合法性约束有限，且覆盖率信号无差别对待所有代码区域，无法天然把推进目标限定到防御机制相关代码。</w:t>
+            </w:r>
+          </w:p>
+          <w:p>
+            <w:pPr>
+              <w:spacing w:line="360" w:lineRule="auto"/>
+              <w:ind w:left="0" w:leftChars="0" w:right="0" w:rightChars="0" w:firstLineChars="200"/>
+              <w:rPr>
+                <w:kern w:val="0"/>
+                <w:sz w:val="24"/>
+              </w:rPr>
+            </w:pPr>
+            <w:r>
+              <w:rPr>
+                <w:kern w:val="0"/>
+                <w:sz w:val="24"/>
+              </w:rPr>
+              <w:t>源码级语义保持变异。GrayC[14] 将覆盖率引导与一组保持语义合法性的源码级变异结合，在覆盖率推进与缺陷发现率上优于纯生成式工具；EMI 系列[15] 在种子的未执行区域做语义保持变换，可视作变异与变形预言机的组合。这类方法具备较强的工程实用性，但变异规则由人工定义，没有利用目标代码自身的语义信息引导方向。</w:t>
+            </w:r>
+          </w:p>
+          <w:p>
+            <w:pPr>
+              <w:spacing w:line="360" w:lineRule="auto"/>
+              <w:ind w:left="0" w:leftChars="0" w:right="0" w:rightChars="0" w:firstLineChars="200"/>
+              <w:rPr>
+                <w:kern w:val="0"/>
+                <w:sz w:val="24"/>
+              </w:rPr>
+            </w:pPr>
+            <w:r>
+              <w:rPr>
+                <w:kern w:val="0"/>
+                <w:sz w:val="24"/>
+              </w:rPr>
+              <w:t>大语言模型驱动的变异。WhiteFox[16] 从优化 pass 源码出发，利用大模型归纳输入模式并生成测试用例，使种子生成具备对编译器内部逻辑的感知；HLPFuzz[17] 进一步将大模型与覆盖率反馈耦合，将未覆盖基本块翻译为约束求解任务交由大模型完成。这表明大模型可作为语义感知的变异引擎，但目前工作定义的目标仍是常规可达性（"走到某处代码"），并不关心目标路径所承担的安全契约。</w:t>
+            </w:r>
+          </w:p>
+          <w:p>
+            <w:pPr>
+              <w:spacing w:line="360" w:lineRule="auto"/>
+              <w:ind w:left="0" w:leftChars="0" w:right="0" w:rightChars="0" w:firstLineChars="200"/>
+              <w:rPr>
+                <w:kern w:val="0"/>
+                <w:sz w:val="24"/>
+              </w:rPr>
+            </w:pPr>
+            <w:r>
+              <w:rPr>
+                <w:kern w:val="0"/>
+                <w:sz w:val="24"/>
+              </w:rPr>
+              <w:t>综合来看，现有方法在搜索空间一侧已积累了较成熟的覆盖率推进手段，若能把"防御机制相关性"作为目标基本块挑选的额外维度并复用大语言模型的代码理解能力，就有望显著提高在防御机制 × ISA 矩阵中的有效采样密度。</w:t>
+            </w:r>
+          </w:p>
+          <w:p>
+            <w:pPr>
+              <w:spacing w:line="360" w:lineRule="auto"/>
               <w:rPr>
                 <w:b/>
                 <w:bCs/>
@@ -2997,121 +3154,114 @@
                 <w:kern w:val="0"/>
                 <w:sz w:val="24"/>
               </w:rPr>
-              <w:t>2.3 面向失效判定的现有工作</w:t>
-            </w:r>
-          </w:p>
-          <w:p>
-            <w:pPr>
-              <w:pStyle w:val="Normal"/>
-              <w:spacing w:lineRule="auto" w:line="360"/>
-              <w:ind w:firstLineChars="200" w:startChars="0" w:start="0" w:endChars="0" w:end="0"/>
-              <w:rPr>
-                <w:kern w:val="0"/>
-                <w:sz w:val="24"/>
-              </w:rPr>
-            </w:pPr>
-            <w:r>
-              <w:rPr>
-                <w:kern w:val="0"/>
-                <w:sz w:val="24"/>
-              </w:rPr>
-              <w:t xml:space="preserve">针对"如何判断一颗成功编译并运行的二进制是否仍满足防御机制安全契约"，现有预言机大致分为四类。</w:t>
-            </w:r>
-          </w:p>
-          <w:p>
-            <w:pPr>
-              <w:pStyle w:val="Normal"/>
-              <w:spacing w:lineRule="auto" w:line="360"/>
-              <w:ind w:firstLineChars="200" w:startChars="0" w:start="0" w:endChars="0" w:end="0"/>
-              <w:rPr>
-                <w:kern w:val="0"/>
-                <w:sz w:val="24"/>
-              </w:rPr>
-            </w:pPr>
-            <w:r>
-              <w:rPr>
-                <w:kern w:val="0"/>
-                <w:sz w:val="24"/>
-              </w:rPr>
-              <w:t xml:space="preserve">崩溃预言机[10,12,13] 以编译期或运行期的崩溃（ICE、断言、segfault、超时）为信号，是 AFL、libFuzzer 迁移到编译器后的默认选择。但静默失效的产物在编译期与运行期均不会崩溃，该类预言机本质上对其不可见。</w:t>
-            </w:r>
-          </w:p>
-          <w:p>
-            <w:pPr>
-              <w:pStyle w:val="Normal"/>
-              <w:spacing w:lineRule="auto" w:line="360"/>
-              <w:ind w:firstLineChars="200" w:startChars="0" w:start="0" w:endChars="0" w:end="0"/>
-              <w:rPr>
-                <w:kern w:val="0"/>
-                <w:sz w:val="24"/>
-              </w:rPr>
-            </w:pPr>
-            <w:r>
-              <w:rPr>
-                <w:kern w:val="0"/>
-                <w:sz w:val="24"/>
-              </w:rPr>
-              <w:t xml:space="preserve">差分预言机[10,11] 对若干编译器或同一编译器不同优化等级就同一程序的运行结果做交叉比对，差异即为 mis-compile。然而，静默失效的二进制功能行为与正常产物一致，不同编译器之间也保持一致输出，因此不会产生可观察的差异。</w:t>
-            </w:r>
-          </w:p>
-          <w:p>
-            <w:pPr>
-              <w:pStyle w:val="Normal"/>
-              <w:spacing w:lineRule="auto" w:line="360"/>
-              <w:ind w:firstLineChars="200" w:startChars="0" w:start="0" w:endChars="0" w:end="0"/>
-              <w:rPr>
-                <w:kern w:val="0"/>
-                <w:sz w:val="24"/>
-              </w:rPr>
-            </w:pPr>
-            <w:r>
-              <w:rPr>
-                <w:kern w:val="0"/>
-                <w:sz w:val="24"/>
-              </w:rPr>
-              <w:t xml:space="preserve">变形预言机以 Le 等提出的 EMI[15] 为代表，对同一输入下未执行的代码做删改，新程序应产生相同结果，差异即为 mis-compile。该类预言机围绕"语义保持"组织判据，仍然在功能输出层面观察，无法触及运行期防御契约。</w:t>
-            </w:r>
-          </w:p>
-          <w:p>
-            <w:pPr>
-              <w:pStyle w:val="Normal"/>
-              <w:spacing w:lineRule="auto" w:line="360"/>
-              <w:ind w:firstLineChars="200" w:startChars="0" w:start="0" w:endChars="0" w:end="0"/>
-              <w:rPr>
-                <w:kern w:val="0"/>
-                <w:sz w:val="24"/>
-              </w:rPr>
-            </w:pPr>
-            <w:r>
-              <w:rPr>
-                <w:kern w:val="0"/>
-                <w:sz w:val="24"/>
-              </w:rPr>
-              <w:t xml:space="preserve">Sanitizer 预言机借助 ASan 等工具将内存破坏转为显式信号；UBfuzz[18] 进一步用反向定位来测试 sanitizer 自身实现缺陷。Sanitizer 关心程序自身的内存安全，其覆盖范围与“内置防御机制是否生效”不重叠。复合预言机如 HirGen[19] 虽在 IR 层结合差分与变形，但同样不针对编译器的防御机制。</w:t>
-            </w:r>
-          </w:p>
-          <w:p>
-            <w:pPr>
-              <w:pStyle w:val="Normal"/>
-              <w:spacing w:lineRule="auto" w:line="360"/>
-              <w:ind w:firstLineChars="200" w:startChars="0" w:start="0" w:endChars="0" w:end="0"/>
-              <w:rPr>
-                <w:kern w:val="0"/>
-                <w:sz w:val="24"/>
-              </w:rPr>
-            </w:pPr>
-            <w:r>
-              <w:rPr>
-                <w:kern w:val="0"/>
-                <w:sz w:val="24"/>
-              </w:rPr>
-              <w:t xml:space="preserve">可以看到，现有预言机的判据全部建立在"崩溃"或"可观察输出差异"之上。当缺陷的形态是"代码正常编译运行、运行时保护已被静默削弱"时，它们均无法触发。这正是第一章所述判定空白的来源。</w:t>
-            </w:r>
-          </w:p>
-          <w:p>
-            <w:pPr>
-              <w:pStyle w:val="Normal"/>
-              <w:spacing w:lineRule="auto" w:line="360"/>
+              <w:t>2.3 识别静默失效的测试预言机研究</w:t>
+            </w:r>
+          </w:p>
+          <w:p>
+            <w:pPr>
+              <w:spacing w:line="360" w:lineRule="auto"/>
+              <w:ind w:left="0" w:leftChars="0" w:right="0" w:rightChars="0" w:firstLineChars="200"/>
+              <w:rPr>
+                <w:kern w:val="0"/>
+                <w:sz w:val="24"/>
+              </w:rPr>
+            </w:pPr>
+            <w:r>
+              <w:rPr>
+                <w:kern w:val="0"/>
+                <w:sz w:val="24"/>
+              </w:rPr>
+              <w:t>针对"如何判断一颗成功编译并运行的二进制是否仍满足防御机制安全契约"，现有预言机大致分为四类。</w:t>
+            </w:r>
+          </w:p>
+          <w:p>
+            <w:pPr>
+              <w:spacing w:line="360" w:lineRule="auto"/>
+              <w:ind w:left="0" w:leftChars="0" w:right="0" w:rightChars="0" w:firstLineChars="200"/>
+              <w:rPr>
+                <w:kern w:val="0"/>
+                <w:sz w:val="24"/>
+              </w:rPr>
+            </w:pPr>
+            <w:r>
+              <w:rPr>
+                <w:kern w:val="0"/>
+                <w:sz w:val="24"/>
+              </w:rPr>
+              <w:t>崩溃预言机[10,12,13] 以编译期或运行期的崩溃（ICE、断言、segfault、超时）为信号，是 AFL、libFuzzer 迁移到编译器后的默认选择。但静默失效的产物在编译期与运行期均不会崩溃，该类预言机本质上对其不可见。</w:t>
+            </w:r>
+          </w:p>
+          <w:p>
+            <w:pPr>
+              <w:spacing w:line="360" w:lineRule="auto"/>
+              <w:ind w:left="0" w:leftChars="0" w:right="0" w:rightChars="0" w:firstLineChars="200"/>
+              <w:rPr>
+                <w:kern w:val="0"/>
+                <w:sz w:val="24"/>
+              </w:rPr>
+            </w:pPr>
+            <w:r>
+              <w:rPr>
+                <w:kern w:val="0"/>
+                <w:sz w:val="24"/>
+              </w:rPr>
+              <w:t>差分预言机[10,11] 对若干编译器或同一编译器不同优化等级就同一程序的运行结果做交叉比对，差异即为 mis-compile。然而，静默失效的二进制功能行为与正常产物一致，不同编译器之间也保持一致输出，因此不会产生可观察的差异。</w:t>
+            </w:r>
+          </w:p>
+          <w:p>
+            <w:pPr>
+              <w:spacing w:line="360" w:lineRule="auto"/>
+              <w:ind w:left="0" w:leftChars="0" w:right="0" w:rightChars="0" w:firstLineChars="200"/>
+              <w:rPr>
+                <w:kern w:val="0"/>
+                <w:sz w:val="24"/>
+              </w:rPr>
+            </w:pPr>
+            <w:r>
+              <w:rPr>
+                <w:kern w:val="0"/>
+                <w:sz w:val="24"/>
+              </w:rPr>
+              <w:t>变形预言机以 Le 等提出的 EMI[15] 为代表，对同一输入下未执行的代码做删改，新程序应产生相同结果，差异即为 mis-compile。该类预言机围绕"语义保持"组织判据，仍然在功能输出层面观察，无法触及运行期防御契约。</w:t>
+            </w:r>
+          </w:p>
+          <w:p>
+            <w:pPr>
+              <w:spacing w:line="360" w:lineRule="auto"/>
+              <w:ind w:left="0" w:leftChars="0" w:right="0" w:rightChars="0" w:firstLineChars="200"/>
+              <w:rPr>
+                <w:kern w:val="0"/>
+                <w:sz w:val="24"/>
+              </w:rPr>
+            </w:pPr>
+            <w:r>
+              <w:rPr>
+                <w:kern w:val="0"/>
+                <w:sz w:val="24"/>
+              </w:rPr>
+              <w:t>Sanitizer 预言机借助 ASan 等工具将内存破坏转为显式信号；UBfuzz[18] 进一步用反向定位来测试 sanitizer 自身实现缺陷。Sanitizer 关心程序自身的内存安全，其覆盖范围与“内置防御机制是否生效”不重叠。复合预言机如 HirGen[19] 虽在 IR 层结合差分与变形，但同样不针对编译器的防御机制。</w:t>
+            </w:r>
+          </w:p>
+          <w:p>
+            <w:pPr>
+              <w:spacing w:line="360" w:lineRule="auto"/>
+              <w:ind w:left="0" w:leftChars="0" w:right="0" w:rightChars="0" w:firstLineChars="200"/>
+              <w:rPr>
+                <w:kern w:val="0"/>
+                <w:sz w:val="24"/>
+              </w:rPr>
+            </w:pPr>
+            <w:r>
+              <w:rPr>
+                <w:kern w:val="0"/>
+                <w:sz w:val="24"/>
+              </w:rPr>
+              <w:t>可以看到，现有预言机的判据全部建立在"崩溃"或"可观察输出差异"之上。当缺陷的形态是"代码正常编译运行、运行时保护已被静默削弱"时，它们均无法触发。这正是第一章所述判定空白的来源。</w:t>
+            </w:r>
+          </w:p>
+          <w:p>
+            <w:pPr>
+              <w:spacing w:line="360" w:lineRule="auto"/>
               <w:rPr>
                 <w:b/>
                 <w:bCs/>
@@ -3131,36 +3281,33 @@
           </w:p>
           <w:p>
             <w:pPr>
-              <w:pStyle w:val="Normal"/>
-              <w:spacing w:lineRule="auto" w:line="360"/>
-              <w:ind w:firstLineChars="200" w:startChars="0" w:start="0" w:endChars="0" w:end="0"/>
-              <w:rPr>
-                <w:kern w:val="0"/>
-                <w:sz w:val="24"/>
-              </w:rPr>
-            </w:pPr>
-            <w:r>
-              <w:rPr>
-                <w:kern w:val="0"/>
-                <w:sz w:val="24"/>
-              </w:rPr>
-              <w:t xml:space="preserve">本研究整合现有模糊测试技术的优势，通过提炼跨架构的安全不变量构建专用预言机，并利用大语言模型结合覆盖率反馈实现精确变异，从而系统性暴露编译器在防御机制上的静默失效漏洞。本研究在第三、四章给出对应的解法：把每条防御机制的安全不变量翻译为可机器判定的检查器以填补预言机空白；在大模型与覆盖率联合驱动的种子生成主循环中，把目标基本块选择限定在防御机制相关代码区域，使搜索空间被显式压缩到矩阵中那些尚未触达的格点附近。</w:t>
-            </w:r>
-          </w:p>
-          <w:p>
-            <w:pPr>
-              <w:pStyle w:val="Normal"/>
-              <w:spacing w:lineRule="auto" w:line="360"/>
-              <w:rPr>
-                <w:sz w:val="24"/>
-              </w:rPr>
-            </w:pPr>
-          </w:p>
-          <w:p>
-            <w:pPr>
-              <w:pStyle w:val="Normal"/>
+              <w:spacing w:line="360" w:lineRule="auto"/>
+              <w:ind w:left="0" w:leftChars="0" w:right="0" w:rightChars="0" w:firstLineChars="200"/>
+              <w:rPr>
+                <w:kern w:val="0"/>
+                <w:sz w:val="24"/>
+              </w:rPr>
+            </w:pPr>
+            <w:r>
+              <w:rPr>
+                <w:kern w:val="0"/>
+                <w:sz w:val="24"/>
+              </w:rPr>
+              <w:t>本研究整合现有模糊测试技术的优势，通过提炼跨架构的安全不变量构建专用预言机，并利用大语言模型结合覆盖率反馈实现精确变异，从而系统性暴露编译器在防御机制上的静默失效漏洞。本研究在第三、四章给出对应的解法：把每条防御机制的安全不变量翻译为可机器判定的检查器以填补预言机空白；在大模型与覆盖率联合驱动的种子生成主循环中，把目标基本块选择限定在防御机制相关代码区域，使搜索空间被显式压缩到矩阵中那些尚未触达的格点附近。</w:t>
+            </w:r>
+          </w:p>
+          <w:p>
+            <w:pPr>
+              <w:spacing w:line="360" w:lineRule="auto"/>
+              <w:rPr>
+                <w:sz w:val="24"/>
+              </w:rPr>
+            </w:pPr>
+          </w:p>
+          <w:p>
+            <w:pPr>
               <w:widowControl/>
-              <w:jc w:val="start"/>
+              <w:jc w:val="left"/>
               <w:rPr>
                 <w:b/>
                 <w:bCs/>
@@ -3180,8 +3327,7 @@
           </w:p>
           <w:p>
             <w:pPr>
-              <w:pStyle w:val="Normal"/>
-              <w:spacing w:lineRule="auto" w:line="360"/>
+              <w:spacing w:line="360" w:lineRule="auto"/>
               <w:rPr>
                 <w:b/>
                 <w:bCs/>
@@ -3201,98 +3347,92 @@
           </w:p>
           <w:p>
             <w:pPr>
-              <w:pStyle w:val="Normal"/>
-              <w:spacing w:lineRule="auto" w:line="360"/>
-              <w:ind w:firstLineChars="200" w:startChars="0" w:start="0" w:endChars="0" w:end="0"/>
-              <w:rPr>
-                <w:kern w:val="0"/>
-                <w:sz w:val="24"/>
-              </w:rPr>
-            </w:pPr>
-            <w:r>
-              <w:rPr>
-                <w:kern w:val="0"/>
-                <w:sz w:val="24"/>
-              </w:rPr>
-              <w:t xml:space="preserve">本课题要构建一种面向编译器自身防御机制的脆弱性分析方法，并在 GCC 与 LLVM 上完成端到端验证。与以崩溃或差分输出为信号的传统编译器 fuzzer 不同，本方法以"防御机制是否仍满足其安全契约"为判据，自动暴露第一章所述的静默失效。具体目标分为以下三项：</w:t>
-            </w:r>
-          </w:p>
-          <w:p>
-            <w:pPr>
-              <w:pStyle w:val="Normal"/>
-              <w:spacing w:lineRule="auto" w:line="360"/>
-              <w:ind w:firstLineChars="200" w:startChars="0" w:start="0" w:endChars="0" w:end="0"/>
-              <w:rPr>
-                <w:kern w:val="0"/>
-                <w:sz w:val="24"/>
-              </w:rPr>
-            </w:pPr>
-            <w:r>
-              <w:rPr>
-                <w:kern w:val="0"/>
-                <w:sz w:val="24"/>
-              </w:rPr>
-              <w:t xml:space="preserve">(a) 形成一套覆盖主流防御机制的安全不变量集合，每条不变量具备可由二进制或运行行为判定的证据形式，在 GCC 与 LLVM 上保持一致的描述结构；</w:t>
-            </w:r>
-          </w:p>
-          <w:p>
-            <w:pPr>
-              <w:pStyle w:val="Normal"/>
-              <w:spacing w:lineRule="auto" w:line="360"/>
-              <w:ind w:firstLineChars="200" w:startChars="0" w:start="0" w:endChars="0" w:end="0"/>
-              <w:rPr>
-                <w:kern w:val="0"/>
-                <w:sz w:val="24"/>
-              </w:rPr>
-            </w:pPr>
-            <w:r>
-              <w:rPr>
-                <w:kern w:val="0"/>
-                <w:sz w:val="24"/>
-              </w:rPr>
-              <w:t xml:space="preserve">(b) 构建一个可同时面向 GCC 与 LLVM、跨架构运行的 fuzzer 原型，以防御机制相关代码的源代码覆盖率为推进信号，由大语言模型完成种子精细变异；</w:t>
-            </w:r>
-          </w:p>
-          <w:p>
-            <w:pPr>
-              <w:pStyle w:val="Normal"/>
-              <w:spacing w:lineRule="auto" w:line="360"/>
-              <w:ind w:firstLineChars="200" w:startChars="0" w:start="0" w:endChars="0" w:end="0"/>
-              <w:rPr>
-                <w:kern w:val="0"/>
-                <w:sz w:val="24"/>
-              </w:rPr>
-            </w:pPr>
-            <w:r>
-              <w:rPr>
-                <w:kern w:val="0"/>
-                <w:sz w:val="24"/>
-              </w:rPr>
-              <w:t xml:space="preserve">(c) 通过该原型在 GCC 与 LLVM 上发现可被上游确认的真实缺陷，验证方法的有效性与跨编译器迁移性。</w:t>
-            </w:r>
-          </w:p>
-          <w:p>
-            <w:pPr>
-              <w:pStyle w:val="Normal"/>
-              <w:spacing w:lineRule="auto" w:line="360"/>
-              <w:ind w:firstLineChars="200" w:startChars="0" w:start="0" w:endChars="0" w:end="0"/>
-              <w:rPr>
-                <w:kern w:val="0"/>
-                <w:sz w:val="24"/>
-              </w:rPr>
-            </w:pPr>
-            <w:r>
-              <w:rPr>
-                <w:kern w:val="0"/>
-                <w:sz w:val="24"/>
-              </w:rPr>
-              <w:t xml:space="preserve">三个目标依次推进：(a) 提供事实基础，(b) 构建原型，(c) 完成实证验证。其依赖关系与工作内容详见 3.2 节。</w:t>
-            </w:r>
-          </w:p>
-          <w:p>
-            <w:pPr>
-              <w:pStyle w:val="Normal"/>
-              <w:spacing w:lineRule="auto" w:line="360"/>
+              <w:spacing w:line="360" w:lineRule="auto"/>
+              <w:ind w:left="0" w:leftChars="0" w:right="0" w:rightChars="0" w:firstLineChars="200"/>
+              <w:rPr>
+                <w:kern w:val="0"/>
+                <w:sz w:val="24"/>
+              </w:rPr>
+            </w:pPr>
+            <w:r>
+              <w:rPr>
+                <w:kern w:val="0"/>
+                <w:sz w:val="24"/>
+              </w:rPr>
+              <w:t>本课题要构建一种面向编译器自身防御机制的脆弱性分析方法，并在 GCC 与 LLVM 上完成端到端验证。与以崩溃或差分输出为信号的传统编译器 fuzzer 不同，本方法以"防御机制是否仍满足其安全契约"为判据，自动暴露第一章所述的静默失效。具体目标分为以下三项：</w:t>
+            </w:r>
+          </w:p>
+          <w:p>
+            <w:pPr>
+              <w:spacing w:line="360" w:lineRule="auto"/>
+              <w:ind w:left="0" w:leftChars="0" w:right="0" w:rightChars="0" w:firstLineChars="200"/>
+              <w:rPr>
+                <w:kern w:val="0"/>
+                <w:sz w:val="24"/>
+              </w:rPr>
+            </w:pPr>
+            <w:r>
+              <w:rPr>
+                <w:kern w:val="0"/>
+                <w:sz w:val="24"/>
+              </w:rPr>
+              <w:t>(a) 形成一套覆盖主流防御机制的安全不变量集合，每条不变量具备可由二进制或运行行为判定的证据形式，在 GCC 与 LLVM 上保持一致的描述结构；</w:t>
+            </w:r>
+          </w:p>
+          <w:p>
+            <w:pPr>
+              <w:spacing w:line="360" w:lineRule="auto"/>
+              <w:ind w:left="0" w:leftChars="0" w:right="0" w:rightChars="0" w:firstLineChars="200"/>
+              <w:rPr>
+                <w:kern w:val="0"/>
+                <w:sz w:val="24"/>
+              </w:rPr>
+            </w:pPr>
+            <w:r>
+              <w:rPr>
+                <w:kern w:val="0"/>
+                <w:sz w:val="24"/>
+              </w:rPr>
+              <w:t>(b) 构建一个可同时面向 GCC 与 LLVM、跨架构运行的 fuzzer 原型，以防御机制相关代码的源代码覆盖率为推进信号，由大语言模型完成种子精细变异；</w:t>
+            </w:r>
+          </w:p>
+          <w:p>
+            <w:pPr>
+              <w:spacing w:line="360" w:lineRule="auto"/>
+              <w:ind w:left="0" w:leftChars="0" w:right="0" w:rightChars="0" w:firstLineChars="200"/>
+              <w:rPr>
+                <w:kern w:val="0"/>
+                <w:sz w:val="24"/>
+              </w:rPr>
+            </w:pPr>
+            <w:r>
+              <w:rPr>
+                <w:kern w:val="0"/>
+                <w:sz w:val="24"/>
+              </w:rPr>
+              <w:t>(c) 通过该原型在 GCC 与 LLVM 上发现可被上游确认的真实缺陷，验证方法的有效性与跨编译器迁移性。</w:t>
+            </w:r>
+          </w:p>
+          <w:p>
+            <w:pPr>
+              <w:spacing w:line="360" w:lineRule="auto"/>
+              <w:ind w:left="0" w:leftChars="0" w:right="0" w:rightChars="0" w:firstLineChars="200"/>
+              <w:rPr>
+                <w:kern w:val="0"/>
+                <w:sz w:val="24"/>
+              </w:rPr>
+            </w:pPr>
+            <w:r>
+              <w:rPr>
+                <w:kern w:val="0"/>
+                <w:sz w:val="24"/>
+              </w:rPr>
+              <w:t>三个目标依次推进：(a) 提供事实基础，(b) 构建原型，(c) 完成实证验证。其依赖关系与工作内容详见 3.2 节。</w:t>
+            </w:r>
+          </w:p>
+          <w:p>
+            <w:pPr>
+              <w:spacing w:line="360" w:lineRule="auto"/>
               <w:rPr>
                 <w:b/>
                 <w:bCs/>
@@ -3312,33 +3452,30 @@
           </w:p>
           <w:p>
             <w:pPr>
-              <w:pStyle w:val="Normal"/>
-              <w:spacing w:lineRule="auto" w:line="360"/>
-              <w:ind w:firstLineChars="200" w:startChars="0" w:start="0" w:endChars="0" w:end="0"/>
-              <w:rPr>
-                <w:kern w:val="0"/>
-                <w:sz w:val="24"/>
-              </w:rPr>
-            </w:pPr>
-            <w:r>
-              <w:rPr>
-                <w:kern w:val="0"/>
-                <w:sz w:val="24"/>
-              </w:rPr>
-              <w:t xml:space="preserve">本课题分为三部分工作，相互依赖关系如图 3 所示：不变量形式化是预言机与种子目标选择的基础；预言机提供安全判定接口；覆盖率驱动的种子生成负责将测试输入推进到特定代码路径。</w:t>
-            </w:r>
-          </w:p>
-          <w:p>
-            <w:pPr>
-              <w:pStyle w:val="Normal"/>
-              <w:spacing w:lineRule="auto" w:line="360"/>
-              <w:jc w:val="center"/>
-            </w:pPr>
-            <w:r>
-              <w:rPr/>
+              <w:spacing w:line="360" w:lineRule="auto"/>
+              <w:ind w:left="0" w:leftChars="0" w:right="0" w:rightChars="0" w:firstLineChars="200"/>
+              <w:rPr>
+                <w:kern w:val="0"/>
+                <w:sz w:val="24"/>
+              </w:rPr>
+            </w:pPr>
+            <w:r>
+              <w:rPr>
+                <w:kern w:val="0"/>
+                <w:sz w:val="24"/>
+              </w:rPr>
+              <w:t>本课题分为三部分工作，相互依赖关系如图 3 所示：不变量形式化是预言机与种子目标选择的基础；预言机提供安全判定接口；覆盖率驱动的种子生成负责将测试输入推进到特定代码路径。</w:t>
+            </w:r>
+          </w:p>
+          <w:p>
+            <w:pPr>
+              <w:spacing w:line="360" w:lineRule="auto"/>
+              <w:jc w:val="center"/>
+            </w:pPr>
+            <w:r>
               <w:drawing>
-                <wp:inline xmlns:wp="http://schemas.openxmlformats.org/drawingml/2006/wordprocessingDrawing" distT="0" distB="0" distL="0" distR="0">
-                  <wp:extent cx="5385714" cy="1236021"/>
+                <wp:inline distT="0" distB="0" distL="0" distR="0">
+                  <wp:extent cx="5385435" cy="1251585"/>
                   <wp:effectExtent l="0" t="0" r="0" b="0"/>
                   <wp:docPr id="23" name="Figure23"/>
                   <wp:cNvGraphicFramePr>
@@ -3348,11 +3485,13 @@
                     <a:graphicData uri="http://schemas.openxmlformats.org/drawingml/2006/picture">
                       <pic:pic xmlns:pic="http://schemas.openxmlformats.org/drawingml/2006/picture">
                         <pic:nvPicPr>
-                          <pic:cNvPr id="23" name="pipeline.png"/>
-                          <pic:cNvPicPr/>
+                          <pic:cNvPr id="23" name="Figure23"/>
+                          <pic:cNvPicPr>
+                            <a:picLocks noChangeAspect="1"/>
+                          </pic:cNvPicPr>
                         </pic:nvPicPr>
                         <pic:blipFill>
-                          <a:blip xmlns:r="http://schemas.openxmlformats.org/officeDocument/2006/relationships" r:embed="rId23"/>
+                          <a:blip r:embed="rId8"/>
                           <a:stretch>
                             <a:fillRect/>
                           </a:stretch>
@@ -3360,7 +3499,7 @@
                         <pic:spPr>
                           <a:xfrm>
                             <a:off x="0" y="0"/>
-                            <a:ext cx="5385714" cy="1236021"/>
+                            <a:ext cx="5385714" cy="1252178"/>
                           </a:xfrm>
                           <a:prstGeom prst="rect">
                             <a:avLst/>
@@ -3375,8 +3514,7 @@
           </w:p>
           <w:p>
             <w:pPr>
-              <w:pStyle w:val="Normal"/>
-              <w:spacing w:lineRule="auto" w:line="360"/>
+              <w:spacing w:line="360" w:lineRule="auto"/>
               <w:jc w:val="center"/>
               <w:rPr>
                 <w:rFonts w:ascii="宋体" w:hAnsi="宋体" w:eastAsia="宋体"/>
@@ -3397,81 +3535,75 @@
           </w:p>
           <w:p>
             <w:pPr>
-              <w:pStyle w:val="Normal"/>
-              <w:spacing w:lineRule="auto" w:line="360"/>
-              <w:rPr>
-                <w:sz w:val="24"/>
-              </w:rPr>
-            </w:pPr>
-          </w:p>
-          <w:p>
-            <w:pPr>
-              <w:pStyle w:val="Normal"/>
-              <w:spacing w:lineRule="auto" w:line="360"/>
-              <w:ind w:firstLineChars="200" w:startChars="0" w:start="0" w:endChars="0" w:end="0"/>
-              <w:rPr>
-                <w:kern w:val="0"/>
-                <w:sz w:val="24"/>
-              </w:rPr>
-            </w:pPr>
-            <w:r>
-              <w:rPr>
-                <w:kern w:val="0"/>
-                <w:sz w:val="24"/>
-              </w:rPr>
-              <w:t xml:space="preserve">(1) 防御机制安全不变量的调研与形式化。针对栈金丝雀、_FORTIFY_SOURCE、IBT 等机制，从三类来源提炼其安全不变量：一是编译器源码中的注释与断言（如 GCC 中 AArch64 后端关于 canary 槽位置关系的注释，或 LLVM 中 StackProtector 模块的实现）；二是编译器及系统 ABI 官方文档对开关、接口、属性的规定；三是已确认的历史 bug 与修补点。每条不变量按统一字段记录其陈述、证据片段与版本敏感性，便于机械检索与回归。</w:t>
-            </w:r>
-          </w:p>
-          <w:p>
-            <w:pPr>
-              <w:pStyle w:val="Normal"/>
-              <w:spacing w:lineRule="auto" w:line="360"/>
-              <w:ind w:firstLineChars="200" w:startChars="0" w:start="0" w:endChars="0" w:end="0"/>
-              <w:rPr>
-                <w:kern w:val="0"/>
-                <w:sz w:val="24"/>
-              </w:rPr>
-            </w:pPr>
-            <w:r>
-              <w:rPr>
-                <w:kern w:val="0"/>
-                <w:sz w:val="24"/>
-              </w:rPr>
-              <w:t xml:space="preserve">(2) 不变量到预言机的工程化落地。将不变量翻译为二进制层面或运行行为上的检查器。框架将检查器分为静态与动态两类：静态检查通过 ELF 符号、指令流模式、属性 note 做断言式判定；动态检查通过受控执行（如对 buffer 填充长度做二分搜索）观察运行行为。预言机判据建立在二进制和运行行为之上，与产生该二进制的具体编译器解耦，GCC 与 LLVM 产物共用同一套检查器。每个机制配置一个聚合器，任一检查器返回 Fail 即记机制级违例并附带证据；同时为每个机制记录开机制/关机制两套 flag profile，框架据此对同一颗种子做对照判定，避免与编译器自身缺省行为混淆。</w:t>
-            </w:r>
-          </w:p>
-          <w:p>
-            <w:pPr>
-              <w:pStyle w:val="Normal"/>
-              <w:spacing w:lineRule="auto" w:line="360"/>
-              <w:ind w:firstLineChars="200" w:startChars="0" w:start="0" w:endChars="0" w:end="0"/>
-              <w:rPr>
-                <w:kern w:val="0"/>
-                <w:sz w:val="24"/>
-              </w:rPr>
-            </w:pPr>
-            <w:r>
-              <w:rPr>
-                <w:kern w:val="0"/>
-                <w:sz w:val="24"/>
-              </w:rPr>
-              <w:t xml:space="preserve">(3) 大语言模型与覆盖率联合驱动的种子生成。以编译器中防御机制的源代码覆盖率为目标信号，结合控制流图按"未覆盖且与防御机制相关性高"的策略选取基本块作为变异目标。每轮变异流程如下：构造目标上下文（含函数源码、基本块标注及示例种子），调用大模型生成新 C 种子，编译产物经预言机检查。若发现覆盖增量、命中目标或触发 bug，则保存种子。未命中目标但带来新覆盖的种子，将通过轻量级追踪定位发散点，回喂给模型进行下一轮精细变异。该过程确保了大模型生成始终聚焦于防御机制代码路径。</w:t>
-            </w:r>
-          </w:p>
-          <w:p>
-            <w:pPr>
-              <w:pStyle w:val="Normal"/>
-              <w:spacing w:lineRule="auto" w:line="360"/>
-              <w:rPr>
-                <w:sz w:val="24"/>
-              </w:rPr>
-            </w:pPr>
-          </w:p>
-          <w:p>
-            <w:pPr>
-              <w:pStyle w:val="Normal"/>
+              <w:spacing w:line="360" w:lineRule="auto"/>
+              <w:rPr>
+                <w:sz w:val="24"/>
+              </w:rPr>
+            </w:pPr>
+          </w:p>
+          <w:p>
+            <w:pPr>
+              <w:spacing w:line="360" w:lineRule="auto"/>
+              <w:ind w:left="0" w:leftChars="0" w:right="0" w:rightChars="0" w:firstLineChars="200"/>
+              <w:rPr>
+                <w:kern w:val="0"/>
+                <w:sz w:val="24"/>
+              </w:rPr>
+            </w:pPr>
+            <w:r>
+              <w:rPr>
+                <w:kern w:val="0"/>
+                <w:sz w:val="24"/>
+              </w:rPr>
+              <w:t>(1) 防御机制安全不变量的调研与形式化。针对栈金丝雀、_FORTIFY_SOURCE、IBT 等机制，从三类来源提炼其安全不变量：一是编译器源码中的注释与断言（如 GCC 中 AArch64 后端关于 canary 槽位置关系的注释，或 LLVM 中 StackProtector 模块的实现）；二是编译器及系统 ABI 官方文档对开关、接口、属性的规定；三是已确认的历史 bug 与修补点。每条不变量按统一字段记录其陈述、证据片段与版本敏感性，便于机械检索与回归。</w:t>
+            </w:r>
+          </w:p>
+          <w:p>
+            <w:pPr>
+              <w:spacing w:line="360" w:lineRule="auto"/>
+              <w:ind w:left="0" w:leftChars="0" w:right="0" w:rightChars="0" w:firstLineChars="200"/>
+              <w:rPr>
+                <w:kern w:val="0"/>
+                <w:sz w:val="24"/>
+              </w:rPr>
+            </w:pPr>
+            <w:r>
+              <w:rPr>
+                <w:kern w:val="0"/>
+                <w:sz w:val="24"/>
+              </w:rPr>
+              <w:t>(2) 不变量到预言机的工程化落地。将不变量翻译为二进制层面或运行行为上的检查器。框架将检查器分为静态与动态两类：静态检查通过 ELF 符号、指令流模式、属性 note 做断言式判定；动态检查通过受控执行（如对 buffer 填充长度做二分搜索）观察运行行为。预言机判据建立在二进制和运行行为之上，与产生该二进制的具体编译器解耦，GCC 与 LLVM 产物共用同一套检查器。每个机制配置一个聚合器，任一检查器返回 Fail 即记机制级违例并附带证据；同时为每个机制记录开机制/关机制两套 flag profile，框架据此对同一颗种子做对照判定，避免与编译器自身缺省行为混淆。</w:t>
+            </w:r>
+          </w:p>
+          <w:p>
+            <w:pPr>
+              <w:spacing w:line="360" w:lineRule="auto"/>
+              <w:ind w:left="0" w:leftChars="0" w:right="0" w:rightChars="0" w:firstLineChars="200"/>
+              <w:rPr>
+                <w:kern w:val="0"/>
+                <w:sz w:val="24"/>
+              </w:rPr>
+            </w:pPr>
+            <w:r>
+              <w:rPr>
+                <w:kern w:val="0"/>
+                <w:sz w:val="24"/>
+              </w:rPr>
+              <w:t>(3) 大语言模型与覆盖率联合驱动的种子生成。以编译器中防御机制的源代码覆盖率为目标信号，结合控制流图按"未覆盖且与防御机制相关性高"的策略选取基本块作为变异目标。每轮变异流程如下：构造目标上下文（含函数源码、基本块标注及示例种子），调用大模型生成新 C 种子，编译产物经预言机检查。若发现覆盖增量、命中目标或触发 bug，则保存种子。未命中目标但带来新覆盖的种子，将通过轻量级追踪定位发散点，回喂给模型进行下一轮精细变异。该过程确保了大模型生成始终聚焦于防御机制代码路径。</w:t>
+            </w:r>
+          </w:p>
+          <w:p>
+            <w:pPr>
+              <w:spacing w:line="360" w:lineRule="auto"/>
+              <w:rPr>
+                <w:sz w:val="24"/>
+              </w:rPr>
+            </w:pPr>
+          </w:p>
+          <w:p>
+            <w:pPr>
               <w:widowControl/>
-              <w:jc w:val="start"/>
+              <w:jc w:val="left"/>
               <w:rPr>
                 <w:b/>
                 <w:bCs/>
@@ -3491,26 +3623,24 @@
           </w:p>
           <w:p>
             <w:pPr>
-              <w:pStyle w:val="Normal"/>
-              <w:spacing w:lineRule="auto" w:line="360"/>
-              <w:ind w:firstLineChars="200" w:startChars="0" w:start="0" w:endChars="0" w:end="0"/>
-              <w:rPr>
-                <w:kern w:val="0"/>
-                <w:sz w:val="24"/>
-              </w:rPr>
-            </w:pPr>
-            <w:r>
-              <w:rPr>
-                <w:kern w:val="0"/>
-                <w:sz w:val="24"/>
-              </w:rPr>
-              <w:t xml:space="preserve">技术路线分为总体架构、防御机制不变量预言机框架、大语言模型驱动的种子变异主循环、跨架构与编译选项调度四部分，对应研究内容 (1)–(3) 的工程实现。GCC 上的初步验证证据见第五章。</w:t>
-            </w:r>
-          </w:p>
-          <w:p>
-            <w:pPr>
-              <w:pStyle w:val="Normal"/>
-              <w:spacing w:lineRule="auto" w:line="360"/>
+              <w:spacing w:line="360" w:lineRule="auto"/>
+              <w:ind w:left="0" w:leftChars="0" w:right="0" w:rightChars="0" w:firstLineChars="200"/>
+              <w:rPr>
+                <w:kern w:val="0"/>
+                <w:sz w:val="24"/>
+              </w:rPr>
+            </w:pPr>
+            <w:r>
+              <w:rPr>
+                <w:kern w:val="0"/>
+                <w:sz w:val="24"/>
+              </w:rPr>
+              <w:t>技术路线分为总体架构、防御机制不变量预言机框架、大语言模型驱动的种子变异主循环、跨架构与编译选项调度四部分，对应研究内容 (1)–(3) 的工程实现。GCC 上的初步验证证据见第五章。</w:t>
+            </w:r>
+          </w:p>
+          <w:p>
+            <w:pPr>
+              <w:spacing w:line="360" w:lineRule="auto"/>
               <w:rPr>
                 <w:b/>
                 <w:bCs/>
@@ -3530,33 +3660,30 @@
           </w:p>
           <w:p>
             <w:pPr>
-              <w:pStyle w:val="Normal"/>
-              <w:spacing w:lineRule="auto" w:line="360"/>
-              <w:ind w:firstLineChars="200" w:startChars="0" w:start="0" w:endChars="0" w:end="0"/>
-              <w:rPr>
-                <w:kern w:val="0"/>
-                <w:sz w:val="24"/>
-              </w:rPr>
-            </w:pPr>
-            <w:r>
-              <w:rPr>
-                <w:kern w:val="0"/>
-                <w:sz w:val="24"/>
-              </w:rPr>
-              <w:t xml:space="preserve">系统以一条 fuzz 主循环为骨干，由 LLM 变异、编译器、预言机三个子系统以及种子语料库、配置模块共同支撑，结构如图 4 所示。Fuzz 引擎承担主循环调度与提示词组装两项职能，将当前覆盖率、目标基本块和已有种子拼装成提示词交给 LLM 变异子系统，获取新种子后分发给后续环节。编译器子系统封装预先插桩的 GCC 与 LLVM，将底层差异数据（如 gcov 与 SanitizerCoverage）统一归并为同构的"行级覆盖 → 种子 ID"映射，主循环对此无感知。预言机子系统按防御机制聚合不变量检查器，对编译成功的种子进行安全契约判定。种子语料库持久化满足质量阈值的种子并维护家系信息。配置模块按"防御机制 · ISA · flag"三元组下发任务：把工具链选择（GCC / LLVM）与对应 flag 交给编译器子系统，把目标 ISA 对应的 QEMU 工具链交给预言机的执行层，使同一份种子可在不同后端上做对照实验，从而以可重复的方式覆盖第一章所述的"防御机制 × ISA"矩阵。</w:t>
-            </w:r>
-          </w:p>
-          <w:p>
-            <w:pPr>
-              <w:pStyle w:val="Normal"/>
-              <w:spacing w:lineRule="auto" w:line="360"/>
-              <w:jc w:val="center"/>
-            </w:pPr>
-            <w:r>
-              <w:rPr/>
+              <w:spacing w:line="360" w:lineRule="auto"/>
+              <w:ind w:left="0" w:leftChars="0" w:right="0" w:rightChars="0" w:firstLineChars="200"/>
+              <w:rPr>
+                <w:kern w:val="0"/>
+                <w:sz w:val="24"/>
+              </w:rPr>
+            </w:pPr>
+            <w:r>
+              <w:rPr>
+                <w:kern w:val="0"/>
+                <w:sz w:val="24"/>
+              </w:rPr>
+              <w:t>系统以一条 fuzz 主循环为骨干，由 LLM 变异、编译器、预言机三个子系统以及种子语料库、配置模块共同支撑，结构如图 4 所示。Fuzz 引擎承担主循环调度与提示词组装两项职能，将当前覆盖率、目标基本块和已有种子拼装成提示词交给 LLM 变异子系统，获取新种子后分发给后续环节。编译器子系统封装预先插桩的 GCC 与 LLVM，将底层差异数据（如 gcov 与 SanitizerCoverage）统一归并为同构的"行级覆盖 → 种子 ID"映射，主循环对此无感知。预言机子系统按防御机制聚合不变量检查器，对编译成功的种子进行安全契约判定。种子语料库持久化满足质量阈值的种子并维护家系信息。配置模块按"防御机制 · ISA · flag"三元组下发任务：把工具链选择（GCC / LLVM）与对应 flag 交给编译器子系统，把目标 ISA 对应的 QEMU 工具链交给预言机的执行层，使同一份种子可在不同后端上做对照实验，从而以可重复的方式覆盖第一章所述的"防御机制 × ISA"矩阵。</w:t>
+            </w:r>
+          </w:p>
+          <w:p>
+            <w:pPr>
+              <w:spacing w:line="360" w:lineRule="auto"/>
+              <w:jc w:val="center"/>
+            </w:pPr>
+            <w:r>
               <w:drawing>
-                <wp:inline xmlns:wp="http://schemas.openxmlformats.org/drawingml/2006/wordprocessingDrawing" distT="0" distB="0" distL="0" distR="0">
-                  <wp:extent cx="5385714" cy="2609079"/>
+                <wp:inline distT="0" distB="0" distL="0" distR="0">
+                  <wp:extent cx="5385435" cy="2461895"/>
                   <wp:effectExtent l="0" t="0" r="0" b="0"/>
                   <wp:docPr id="24" name="Figure24"/>
                   <wp:cNvGraphicFramePr>
@@ -3566,11 +3693,13 @@
                     <a:graphicData uri="http://schemas.openxmlformats.org/drawingml/2006/picture">
                       <pic:pic xmlns:pic="http://schemas.openxmlformats.org/drawingml/2006/picture">
                         <pic:nvPicPr>
-                          <pic:cNvPr id="24" name="architecture.png"/>
-                          <pic:cNvPicPr/>
+                          <pic:cNvPr id="24" name="Figure24"/>
+                          <pic:cNvPicPr>
+                            <a:picLocks noChangeAspect="1"/>
+                          </pic:cNvPicPr>
                         </pic:nvPicPr>
                         <pic:blipFill>
-                          <a:blip xmlns:r="http://schemas.openxmlformats.org/officeDocument/2006/relationships" r:embed="rId24"/>
+                          <a:blip r:embed="rId9"/>
                           <a:stretch>
                             <a:fillRect/>
                           </a:stretch>
@@ -3578,7 +3707,7 @@
                         <pic:spPr>
                           <a:xfrm>
                             <a:off x="0" y="0"/>
-                            <a:ext cx="5385714" cy="2609079"/>
+                            <a:ext cx="5385714" cy="2462468"/>
                           </a:xfrm>
                           <a:prstGeom prst="rect">
                             <a:avLst/>
@@ -3593,8 +3722,7 @@
           </w:p>
           <w:p>
             <w:pPr>
-              <w:pStyle w:val="Normal"/>
-              <w:spacing w:lineRule="auto" w:line="360"/>
+              <w:spacing w:line="360" w:lineRule="auto"/>
               <w:jc w:val="center"/>
               <w:rPr>
                 <w:rFonts w:ascii="宋体" w:hAnsi="宋体" w:eastAsia="宋体"/>
@@ -3615,17 +3743,15 @@
           </w:p>
           <w:p>
             <w:pPr>
-              <w:pStyle w:val="Normal"/>
-              <w:spacing w:lineRule="auto" w:line="360"/>
-              <w:rPr>
-                <w:sz w:val="24"/>
-              </w:rPr>
-            </w:pPr>
-          </w:p>
-          <w:p>
-            <w:pPr>
-              <w:pStyle w:val="Normal"/>
-              <w:spacing w:lineRule="auto" w:line="360"/>
+              <w:spacing w:line="360" w:lineRule="auto"/>
+              <w:rPr>
+                <w:sz w:val="24"/>
+              </w:rPr>
+            </w:pPr>
+          </w:p>
+          <w:p>
+            <w:pPr>
+              <w:spacing w:line="360" w:lineRule="auto"/>
               <w:rPr>
                 <w:b/>
                 <w:bCs/>
@@ -3645,33 +3771,30 @@
           </w:p>
           <w:p>
             <w:pPr>
-              <w:pStyle w:val="Normal"/>
-              <w:spacing w:lineRule="auto" w:line="360"/>
-              <w:ind w:firstLineChars="200" w:startChars="0" w:start="0" w:endChars="0" w:end="0"/>
-              <w:rPr>
-                <w:kern w:val="0"/>
-                <w:sz w:val="24"/>
-              </w:rPr>
-            </w:pPr>
-            <w:r>
-              <w:rPr>
-                <w:kern w:val="0"/>
-                <w:sz w:val="24"/>
-              </w:rPr>
-              <w:t xml:space="preserve">每个机制对应一个聚合器，下挂若干检查器。判定流程如图 5 所示，检查器输入包括种子的源码、汇编与二进制文件。检查器分为两类：静态检查器通过 ELF 符号表、指令字节模式与 .note 段进行断言；动态检查器则通过受控执行（如二分搜索）观察运行期越界表现。每个检查器返回 Pass、Fail 或 Error，聚合时任一 Fail 即视为机制级违例，并回写触发证据。对于易与编译器缺省行为混淆的检查器，框架会同时运行开/关机制的两套配置进行比对。预言机还维护一份缓存以复用执行结果，避免重复解析。</w:t>
-            </w:r>
-          </w:p>
-          <w:p>
-            <w:pPr>
-              <w:pStyle w:val="Normal"/>
-              <w:spacing w:lineRule="auto" w:line="360"/>
-              <w:jc w:val="center"/>
-            </w:pPr>
-            <w:r>
-              <w:rPr/>
+              <w:spacing w:line="360" w:lineRule="auto"/>
+              <w:ind w:left="0" w:leftChars="0" w:right="0" w:rightChars="0" w:firstLineChars="200"/>
+              <w:rPr>
+                <w:kern w:val="0"/>
+                <w:sz w:val="24"/>
+              </w:rPr>
+            </w:pPr>
+            <w:r>
+              <w:rPr>
+                <w:kern w:val="0"/>
+                <w:sz w:val="24"/>
+              </w:rPr>
+              <w:t>每个机制对应一个聚合器，下挂若干检查器。判定流程如图 5 所示，检查器输入包括种子的源码、汇编与二进制文件。检查器分为两类：静态检查器通过 ELF 符号表、指令字节模式与 .note 段进行断言；动态检查器则通过受控执行（如二分搜索）观察运行期越界表现。每个检查器返回 Pass、Fail 或 Error，聚合时任一 Fail 即视为机制级违例，并回写触发证据。对于易与编译器缺省行为混淆的检查器，框架会同时运行开/关机制的两套配置进行比对。预言机还维护一份缓存以复用执行结果，避免重复解析。</w:t>
+            </w:r>
+          </w:p>
+          <w:p>
+            <w:pPr>
+              <w:spacing w:line="360" w:lineRule="auto"/>
+              <w:jc w:val="center"/>
+            </w:pPr>
+            <w:r>
               <w:drawing>
-                <wp:inline xmlns:wp="http://schemas.openxmlformats.org/drawingml/2006/wordprocessingDrawing" distT="0" distB="0" distL="0" distR="0">
-                  <wp:extent cx="4284090" cy="5612159"/>
+                <wp:inline distT="0" distB="0" distL="0" distR="0">
+                  <wp:extent cx="4283710" cy="5612130"/>
                   <wp:effectExtent l="0" t="0" r="0" b="0"/>
                   <wp:docPr id="25" name="Figure25"/>
                   <wp:cNvGraphicFramePr>
@@ -3681,11 +3804,13 @@
                     <a:graphicData uri="http://schemas.openxmlformats.org/drawingml/2006/picture">
                       <pic:pic xmlns:pic="http://schemas.openxmlformats.org/drawingml/2006/picture">
                         <pic:nvPicPr>
-                          <pic:cNvPr id="25" name="oracle-flow.png"/>
-                          <pic:cNvPicPr/>
+                          <pic:cNvPr id="25" name="Figure25"/>
+                          <pic:cNvPicPr>
+                            <a:picLocks noChangeAspect="1"/>
+                          </pic:cNvPicPr>
                         </pic:nvPicPr>
                         <pic:blipFill>
-                          <a:blip xmlns:r="http://schemas.openxmlformats.org/officeDocument/2006/relationships" r:embed="rId25"/>
+                          <a:blip r:embed="rId10"/>
                           <a:stretch>
                             <a:fillRect/>
                           </a:stretch>
@@ -3708,8 +3833,7 @@
           </w:p>
           <w:p>
             <w:pPr>
-              <w:pStyle w:val="Normal"/>
-              <w:spacing w:lineRule="auto" w:line="360"/>
+              <w:spacing w:line="360" w:lineRule="auto"/>
               <w:jc w:val="center"/>
               <w:rPr>
                 <w:rFonts w:ascii="宋体" w:hAnsi="宋体" w:eastAsia="宋体"/>
@@ -3730,17 +3854,15 @@
           </w:p>
           <w:p>
             <w:pPr>
-              <w:pStyle w:val="Normal"/>
-              <w:spacing w:lineRule="auto" w:line="360"/>
-              <w:rPr>
-                <w:sz w:val="24"/>
-              </w:rPr>
-            </w:pPr>
-          </w:p>
-          <w:p>
-            <w:pPr>
-              <w:pStyle w:val="Normal"/>
-              <w:spacing w:lineRule="auto" w:line="360"/>
+              <w:spacing w:line="360" w:lineRule="auto"/>
+              <w:rPr>
+                <w:sz w:val="24"/>
+              </w:rPr>
+            </w:pPr>
+          </w:p>
+          <w:p>
+            <w:pPr>
+              <w:spacing w:line="360" w:lineRule="auto"/>
               <w:rPr>
                 <w:b/>
                 <w:bCs/>
@@ -3760,33 +3882,30 @@
           </w:p>
           <w:p>
             <w:pPr>
-              <w:pStyle w:val="Normal"/>
-              <w:spacing w:lineRule="auto" w:line="360"/>
-              <w:ind w:firstLineChars="200" w:startChars="0" w:start="0" w:endChars="0" w:end="0"/>
-              <w:rPr>
-                <w:kern w:val="0"/>
-                <w:sz w:val="24"/>
-              </w:rPr>
-            </w:pPr>
-            <w:r>
-              <w:rPr>
-                <w:kern w:val="0"/>
-                <w:sz w:val="24"/>
-              </w:rPr>
-              <w:t xml:space="preserve">主循环的输入为当前覆盖率映射与编译器源码控制流图，单轮迭代过程如图 6 所示。每轮先在未覆盖基本块中按相关性挑出一个目标，相关性由该基本块在 CFG 上的后继分支数和所属代码区域对防御机制的关联程度共同决定，使搜索集中在未触达且与防御逻辑相关的代码上。随后构造目标上下文：目标函数源码片段、逐行覆盖标注、目标基本块位置，以及覆盖目标前驱的若干示例种子。提示词组装层将上下文与基础变异提示词、机制契约要求拼接，提交给大语言模型生成新 C 种子。编译失败时反馈错误信息进入下一轮；编译成功后覆盖率分析器判断命中情况，预言机给出安全判定。结果分析阶段同时观察覆盖增量、是否命中目标、是否触发 bug，任一为真即保存种子。种子未命中目标但带来新覆盖时，利用轻量动态追踪定位其与基线种子在调用序列上的首个发散点，将发散函数源码作为额外上下文反馈给变异提示，请求模型重新精细变异。目标基本块全部覆盖后，主循环可切换至随机变异阶段，仅以预言机为保存条件继续探索。</w:t>
-            </w:r>
-          </w:p>
-          <w:p>
-            <w:pPr>
-              <w:pStyle w:val="Normal"/>
-              <w:spacing w:lineRule="auto" w:line="360"/>
-              <w:jc w:val="center"/>
-            </w:pPr>
-            <w:r>
-              <w:rPr/>
+              <w:spacing w:line="360" w:lineRule="auto"/>
+              <w:ind w:left="0" w:leftChars="0" w:right="0" w:rightChars="0" w:firstLineChars="200"/>
+              <w:rPr>
+                <w:kern w:val="0"/>
+                <w:sz w:val="24"/>
+              </w:rPr>
+            </w:pPr>
+            <w:r>
+              <w:rPr>
+                <w:kern w:val="0"/>
+                <w:sz w:val="24"/>
+              </w:rPr>
+              <w:t>主循环的输入为当前覆盖率映射与编译器源码控制流图，单轮迭代过程如图 6 所示。每轮先在未覆盖基本块中按相关性挑出一个目标，相关性由该基本块在 CFG 上的后继分支数和所属代码区域对防御机制的关联程度共同决定，使搜索集中在未触达且与防御逻辑相关的代码上。随后构造目标上下文：目标函数源码片段、逐行覆盖标注、目标基本块位置，以及覆盖目标前驱的若干示例种子。提示词组装层将上下文与基础变异提示词、机制契约要求拼接，提交给大语言模型生成新 C 种子。编译失败时反馈错误信息进入下一轮；编译成功后覆盖率分析器判断命中情况，预言机给出安全判定。结果分析阶段同时观察覆盖增量、是否命中目标、是否触发 bug，任一为真即保存种子。种子未命中目标但带来新覆盖时，利用轻量动态追踪定位其与基线种子在调用序列上的首个发散点，将发散函数源码作为额外上下文反馈给变异提示，请求模型重新精细变异。目标基本块全部覆盖后，主循环可切换至随机变异阶段，仅以预言机为保存条件继续探索。</w:t>
+            </w:r>
+          </w:p>
+          <w:p>
+            <w:pPr>
+              <w:spacing w:line="360" w:lineRule="auto"/>
+              <w:jc w:val="center"/>
+            </w:pPr>
+            <w:r>
               <w:drawing>
-                <wp:inline xmlns:wp="http://schemas.openxmlformats.org/drawingml/2006/wordprocessingDrawing" distT="0" distB="0" distL="0" distR="0">
-                  <wp:extent cx="3501559" cy="6725183"/>
+                <wp:inline distT="0" distB="0" distL="0" distR="0">
+                  <wp:extent cx="4139565" cy="6724650"/>
                   <wp:effectExtent l="0" t="0" r="0" b="0"/>
                   <wp:docPr id="26" name="Figure26"/>
                   <wp:cNvGraphicFramePr>
@@ -3796,11 +3915,13 @@
                     <a:graphicData uri="http://schemas.openxmlformats.org/drawingml/2006/picture">
                       <pic:pic xmlns:pic="http://schemas.openxmlformats.org/drawingml/2006/picture">
                         <pic:nvPicPr>
-                          <pic:cNvPr id="26" name="main-loop.png"/>
-                          <pic:cNvPicPr/>
+                          <pic:cNvPr id="26" name="Figure26"/>
+                          <pic:cNvPicPr>
+                            <a:picLocks noChangeAspect="1"/>
+                          </pic:cNvPicPr>
                         </pic:nvPicPr>
                         <pic:blipFill>
-                          <a:blip xmlns:r="http://schemas.openxmlformats.org/officeDocument/2006/relationships" r:embed="rId26"/>
+                          <a:blip r:embed="rId11"/>
                           <a:stretch>
                             <a:fillRect/>
                           </a:stretch>
@@ -3808,7 +3929,7 @@
                         <pic:spPr>
                           <a:xfrm>
                             <a:off x="0" y="0"/>
-                            <a:ext cx="3501559" cy="6725183"/>
+                            <a:ext cx="4140166" cy="6725183"/>
                           </a:xfrm>
                           <a:prstGeom prst="rect">
                             <a:avLst/>
@@ -3823,8 +3944,7 @@
           </w:p>
           <w:p>
             <w:pPr>
-              <w:pStyle w:val="Normal"/>
-              <w:spacing w:lineRule="auto" w:line="360"/>
+              <w:spacing w:line="360" w:lineRule="auto"/>
               <w:jc w:val="center"/>
               <w:rPr>
                 <w:rFonts w:ascii="宋体" w:hAnsi="宋体" w:eastAsia="宋体"/>
@@ -3845,17 +3965,15 @@
           </w:p>
           <w:p>
             <w:pPr>
-              <w:pStyle w:val="Normal"/>
-              <w:spacing w:lineRule="auto" w:line="360"/>
-              <w:rPr>
-                <w:sz w:val="24"/>
-              </w:rPr>
-            </w:pPr>
-          </w:p>
-          <w:p>
-            <w:pPr>
-              <w:pStyle w:val="Normal"/>
-              <w:spacing w:lineRule="auto" w:line="360"/>
+              <w:spacing w:line="360" w:lineRule="auto"/>
+              <w:rPr>
+                <w:sz w:val="24"/>
+              </w:rPr>
+            </w:pPr>
+          </w:p>
+          <w:p>
+            <w:pPr>
+              <w:spacing w:line="360" w:lineRule="auto"/>
               <w:rPr>
                 <w:b/>
                 <w:bCs/>
@@ -3875,36 +3993,33 @@
           </w:p>
           <w:p>
             <w:pPr>
-              <w:pStyle w:val="Normal"/>
-              <w:spacing w:lineRule="auto" w:line="360"/>
-              <w:ind w:firstLineChars="200" w:startChars="0" w:start="0" w:endChars="0" w:end="0"/>
-              <w:rPr>
-                <w:kern w:val="0"/>
-                <w:sz w:val="24"/>
-              </w:rPr>
-            </w:pPr>
-            <w:r>
-              <w:rPr>
-                <w:kern w:val="0"/>
-                <w:sz w:val="24"/>
-              </w:rPr>
-              <w:t xml:space="preserve">配置模块将编译命令参数化为编译器、ISA、架构 flag、策略 flag 方案四元组，向子系统下发对应工具链，使同一种子可分发至不同后端经 QEMU 执行。策略方案包含开/关机制两套配置，供预言机对照判定。不同编译器间的 flag 拼写差异被统一抽象，而二进制解析层（BinaryInspector）则屏蔽了各 ISA 间的底层格式差异，为检查器提供通用判定能力。</w:t>
-            </w:r>
-          </w:p>
-          <w:p>
-            <w:pPr>
-              <w:pStyle w:val="Normal"/>
-              <w:spacing w:lineRule="auto" w:line="360"/>
-              <w:rPr>
-                <w:sz w:val="24"/>
-              </w:rPr>
-            </w:pPr>
-          </w:p>
-          <w:p>
-            <w:pPr>
-              <w:pStyle w:val="Normal"/>
+              <w:spacing w:line="360" w:lineRule="auto"/>
+              <w:ind w:left="0" w:leftChars="0" w:right="0" w:rightChars="0" w:firstLineChars="200"/>
+              <w:rPr>
+                <w:kern w:val="0"/>
+                <w:sz w:val="24"/>
+              </w:rPr>
+            </w:pPr>
+            <w:r>
+              <w:rPr>
+                <w:kern w:val="0"/>
+                <w:sz w:val="24"/>
+              </w:rPr>
+              <w:t>配置模块将编译命令参数化为编译器、ISA、架构 flag、策略 flag 方案四元组，向子系统下发对应工具链，使同一种子可分发至不同后端经 QEMU 执行。策略方案包含开/关机制两套配置，供预言机对照判定。不同编译器间的 flag 拼写差异被统一抽象，而二进制解析层（BinaryInspector）则屏蔽了各 ISA 间的底层格式差异，为检查器提供通用判定能力。</w:t>
+            </w:r>
+          </w:p>
+          <w:p>
+            <w:pPr>
+              <w:spacing w:line="360" w:lineRule="auto"/>
+              <w:rPr>
+                <w:sz w:val="24"/>
+              </w:rPr>
+            </w:pPr>
+          </w:p>
+          <w:p>
+            <w:pPr>
               <w:widowControl/>
-              <w:jc w:val="start"/>
+              <w:jc w:val="left"/>
               <w:rPr>
                 <w:b/>
                 <w:bCs/>
@@ -3924,26 +4039,24 @@
           </w:p>
           <w:p>
             <w:pPr>
-              <w:pStyle w:val="Normal"/>
-              <w:spacing w:lineRule="auto" w:line="360"/>
-              <w:ind w:firstLineChars="200" w:startChars="0" w:start="0" w:endChars="0" w:end="0"/>
-              <w:rPr>
-                <w:kern w:val="0"/>
-                <w:sz w:val="24"/>
-              </w:rPr>
-            </w:pPr>
-            <w:r>
-              <w:rPr>
-                <w:kern w:val="0"/>
-                <w:sz w:val="24"/>
-              </w:rPr>
-              <w:t xml:space="preserve">目前已在 GCC 的多个版本上测试栈金丝雀、_FORTIFY_SOURCE、IBT 等防御机制，并在 GCC 上发现 3 例已获上游确认的静默失效[6-9]。LLVM 侧实验将在下一阶段进行。下文展开分析其中两例，并在 5.3 节简述第三例（多 ISA 上栈金丝雀寄存器泄露问题）。</w:t>
-            </w:r>
-          </w:p>
-          <w:p>
-            <w:pPr>
-              <w:pStyle w:val="Normal"/>
-              <w:spacing w:lineRule="auto" w:line="360"/>
+              <w:spacing w:line="360" w:lineRule="auto"/>
+              <w:ind w:left="0" w:leftChars="0" w:right="0" w:rightChars="0" w:firstLineChars="200"/>
+              <w:rPr>
+                <w:kern w:val="0"/>
+                <w:sz w:val="24"/>
+              </w:rPr>
+            </w:pPr>
+            <w:r>
+              <w:rPr>
+                <w:kern w:val="0"/>
+                <w:sz w:val="24"/>
+              </w:rPr>
+              <w:t>目前已在 GCC 的多个版本上测试栈金丝雀、_FORTIFY_SOURCE、IBT 等防御机制，并在 GCC 上发现 3 例已获上游确认的静默失效[6-9]。LLVM 侧实验将在下一阶段进行。下文展开分析其中两例，并在 5.3 节简述第三例（多 ISA 上栈金丝雀寄存器泄露问题）。</w:t>
+            </w:r>
+          </w:p>
+          <w:p>
+            <w:pPr>
+              <w:spacing w:line="360" w:lineRule="auto"/>
               <w:rPr>
                 <w:b/>
                 <w:bCs/>
@@ -3963,69 +4076,64 @@
           </w:p>
           <w:p>
             <w:pPr>
-              <w:pStyle w:val="Normal"/>
-              <w:spacing w:lineRule="auto" w:line="360"/>
-              <w:ind w:firstLineChars="200" w:startChars="0" w:start="0" w:endChars="0" w:end="0"/>
-              <w:rPr>
-                <w:kern w:val="0"/>
-                <w:sz w:val="24"/>
-              </w:rPr>
-            </w:pPr>
-            <w:r>
-              <w:rPr>
-                <w:kern w:val="0"/>
-                <w:sz w:val="24"/>
-              </w:rPr>
-              <w:t xml:space="preserve">_FORTIFY_SOURCE 是 GCC 与 glibc 配合的源代码加固机制[20]。开启后，glibc 头文件在预处理阶段把 strcat 等危险接口重写为带 size 参数的 __strcat_chk，运行时据此检查目的缓冲区上限。GCC 的 strlen pass 进一步识别已知前缀长度的目的指针，将 __strcat_chk 改写为性能更优的 __stpcpy_chk，并把目的指针前移 strlen(dst) 字节。这里的安全不变量是：目的指针前移后，传给 __stpcpy_chk 的 size 参数必须由原始 objsize 减去 strlen(dst)，否则运行时上限就被静默放宽 strlen(dst) 字节。</w:t>
-            </w:r>
-          </w:p>
-          <w:p>
-            <w:pPr>
-              <w:pStyle w:val="Normal"/>
-              <w:spacing w:lineRule="auto" w:line="360"/>
-              <w:ind w:firstLineChars="200" w:startChars="0" w:start="0" w:endChars="0" w:end="0"/>
-              <w:rPr>
-                <w:kern w:val="0"/>
-                <w:sz w:val="24"/>
-              </w:rPr>
-            </w:pPr>
-            <w:r>
-              <w:rPr>
-                <w:kern w:val="0"/>
-                <w:sz w:val="24"/>
-              </w:rPr>
-              <w:t xml:space="preserve">本方法构造的种子在该路径上稳定触发了 size 参数未相应减小的实例。反汇编层面 strcat → __strcat_chk → __stpcpy_chk 链条仍然出现，看似 FORTIFY 仍在生效，但"按 dst 剩余空间收紧上限"这一步已被丢弃。上报后该缺陷已被确认（PR-125079[6]）并合入主分支。该路径与 2018 年修复的 PR-87672[21] 位于同一文件，表明当年修复时遗漏了对称分支。</w:t>
-            </w:r>
-          </w:p>
-          <w:p>
-            <w:pPr>
-              <w:pStyle w:val="Normal"/>
-              <w:spacing w:lineRule="auto" w:line="360"/>
-              <w:ind w:firstLineChars="200" w:startChars="0" w:start="0" w:endChars="0" w:end="0"/>
-              <w:rPr>
-                <w:kern w:val="0"/>
-                <w:sz w:val="24"/>
-              </w:rPr>
-            </w:pPr>
-            <w:r>
-              <w:rPr>
-                <w:kern w:val="0"/>
-                <w:sz w:val="24"/>
-              </w:rPr>
-              <w:t xml:space="preserve">该缺陷命中了"FORTIFY 调用点的 size 参数下界推断"不变量，判定证据为静态符号与反汇编。该位置如图 7 所示。</w:t>
-            </w:r>
-          </w:p>
-          <w:p>
-            <w:pPr>
-              <w:pStyle w:val="Normal"/>
-              <w:spacing w:lineRule="auto" w:line="360"/>
-              <w:jc w:val="center"/>
-            </w:pPr>
-            <w:r>
-              <w:rPr/>
+              <w:spacing w:line="360" w:lineRule="auto"/>
+              <w:ind w:left="0" w:leftChars="0" w:right="0" w:rightChars="0" w:firstLineChars="200"/>
+              <w:rPr>
+                <w:kern w:val="0"/>
+                <w:sz w:val="24"/>
+              </w:rPr>
+            </w:pPr>
+            <w:r>
+              <w:rPr>
+                <w:kern w:val="0"/>
+                <w:sz w:val="24"/>
+              </w:rPr>
+              <w:t>_FORTIFY_SOURCE 是 GCC 与 glibc 配合的源代码加固机制[20]。开启后，glibc 头文件在预处理阶段把 strcat 等危险接口重写为带 size 参数的 __strcat_chk，运行时据此检查目的缓冲区上限。GCC 的 strlen pass 进一步识别已知前缀长度的目的指针，将 __strcat_chk 改写为性能更优的 __stpcpy_chk，并把目的指针前移 strlen(dst) 字节。这里的安全不变量是：目的指针前移后，传给 __stpcpy_chk 的 size 参数必须由原始 objsize 减去 strlen(dst)，否则运行时上限就被静默放宽 strlen(dst) 字节。</w:t>
+            </w:r>
+          </w:p>
+          <w:p>
+            <w:pPr>
+              <w:spacing w:line="360" w:lineRule="auto"/>
+              <w:ind w:left="0" w:leftChars="0" w:right="0" w:rightChars="0" w:firstLineChars="200"/>
+              <w:rPr>
+                <w:kern w:val="0"/>
+                <w:sz w:val="24"/>
+              </w:rPr>
+            </w:pPr>
+            <w:r>
+              <w:rPr>
+                <w:kern w:val="0"/>
+                <w:sz w:val="24"/>
+              </w:rPr>
+              <w:t>本方法构造的种子在该路径上稳定触发了 size 参数未相应减小的实例。反汇编层面 strcat → __strcat_chk → __stpcpy_chk 链条仍然出现，看似 FORTIFY 仍在生效，但"按 dst 剩余空间收紧上限"这一步已被丢弃。上报后该缺陷已被确认（PR-125079[6]）并合入主分支。该路径与 2018 年修复的 PR-87672[21] 位于同一文件，表明当年修复时遗漏了对称分支。</w:t>
+            </w:r>
+          </w:p>
+          <w:p>
+            <w:pPr>
+              <w:spacing w:line="360" w:lineRule="auto"/>
+              <w:ind w:left="0" w:leftChars="0" w:right="0" w:rightChars="0" w:firstLineChars="200"/>
+              <w:rPr>
+                <w:kern w:val="0"/>
+                <w:sz w:val="24"/>
+              </w:rPr>
+            </w:pPr>
+            <w:r>
+              <w:rPr>
+                <w:kern w:val="0"/>
+                <w:sz w:val="24"/>
+              </w:rPr>
+              <w:t>该缺陷命中了"FORTIFY 调用点的 size 参数下界推断"不变量，判定证据为静态符号与反汇编。该位置如图 7 所示。</w:t>
+            </w:r>
+          </w:p>
+          <w:p>
+            <w:pPr>
+              <w:spacing w:line="360" w:lineRule="auto"/>
+              <w:jc w:val="center"/>
+            </w:pPr>
+            <w:r>
               <w:drawing>
-                <wp:inline xmlns:wp="http://schemas.openxmlformats.org/drawingml/2006/wordprocessingDrawing" distT="0" distB="0" distL="0" distR="0">
-                  <wp:extent cx="4284090" cy="6361875"/>
+                <wp:inline distT="0" distB="0" distL="0" distR="0">
+                  <wp:extent cx="4283710" cy="6361430"/>
                   <wp:effectExtent l="0" t="0" r="0" b="0"/>
                   <wp:docPr id="27" name="Figure27"/>
                   <wp:cNvGraphicFramePr>
@@ -4035,11 +4143,13 @@
                     <a:graphicData uri="http://schemas.openxmlformats.org/drawingml/2006/picture">
                       <pic:pic xmlns:pic="http://schemas.openxmlformats.org/drawingml/2006/picture">
                         <pic:nvPicPr>
-                          <pic:cNvPr id="27" name="fortify-path.png"/>
-                          <pic:cNvPicPr/>
+                          <pic:cNvPr id="27" name="Figure27"/>
+                          <pic:cNvPicPr>
+                            <a:picLocks noChangeAspect="1"/>
+                          </pic:cNvPicPr>
                         </pic:nvPicPr>
                         <pic:blipFill>
-                          <a:blip xmlns:r="http://schemas.openxmlformats.org/officeDocument/2006/relationships" r:embed="rId27"/>
+                          <a:blip r:embed="rId12"/>
                           <a:stretch>
                             <a:fillRect/>
                           </a:stretch>
@@ -4062,8 +4172,7 @@
           </w:p>
           <w:p>
             <w:pPr>
-              <w:pStyle w:val="Normal"/>
-              <w:spacing w:lineRule="auto" w:line="360"/>
+              <w:spacing w:line="360" w:lineRule="auto"/>
               <w:jc w:val="center"/>
               <w:rPr>
                 <w:rFonts w:ascii="宋体" w:hAnsi="宋体" w:eastAsia="宋体"/>
@@ -4084,17 +4193,15 @@
           </w:p>
           <w:p>
             <w:pPr>
-              <w:pStyle w:val="Normal"/>
-              <w:spacing w:lineRule="auto" w:line="360"/>
-              <w:rPr>
-                <w:sz w:val="24"/>
-              </w:rPr>
-            </w:pPr>
-          </w:p>
-          <w:p>
-            <w:pPr>
-              <w:pStyle w:val="Normal"/>
-              <w:spacing w:lineRule="auto" w:line="360"/>
+              <w:spacing w:line="360" w:lineRule="auto"/>
+              <w:rPr>
+                <w:sz w:val="24"/>
+              </w:rPr>
+            </w:pPr>
+          </w:p>
+          <w:p>
+            <w:pPr>
+              <w:spacing w:line="360" w:lineRule="auto"/>
               <w:rPr>
                 <w:b/>
                 <w:bCs/>
@@ -4114,62 +4221,58 @@
           </w:p>
           <w:p>
             <w:pPr>
-              <w:pStyle w:val="Normal"/>
-              <w:spacing w:lineRule="auto" w:line="360"/>
-              <w:ind w:firstLineChars="200" w:startChars="0" w:start="0" w:endChars="0" w:end="0"/>
-              <w:rPr>
-                <w:kern w:val="0"/>
-                <w:sz w:val="24"/>
-              </w:rPr>
-            </w:pPr>
-            <w:r>
-              <w:rPr>
-                <w:kern w:val="0"/>
-                <w:sz w:val="24"/>
-              </w:rPr>
-              <w:t xml:space="preserve">IBT 是 Intel CET 中针对间接跳转的保护机制[22]：硬件要求间接跳转或调用的目标地址必须以 endbr 指令开头，否则触发异常。endbr 在二进制中是固定的四字节值（endbr64 = F3 0F 1E FA、endbr32 = F3 0F 1E FB），按设计只应作为合法间接跳转入口出现在代码段。如果这四个字节以其他形式出现，例如作为 movabsq 指令的 64 位立即数的一部分嵌入 .text，攻击者就可以把控制流劫持到该处，硬件会将其识别为合法 landing pad，IBT 语义被绕过。</w:t>
-            </w:r>
-          </w:p>
-          <w:p>
-            <w:pPr>
-              <w:pStyle w:val="Normal"/>
-              <w:spacing w:lineRule="auto" w:line="360"/>
-              <w:ind w:firstLineChars="200" w:startChars="0" w:start="0" w:endChars="0" w:end="0"/>
-              <w:rPr>
-                <w:kern w:val="0"/>
-                <w:sz w:val="24"/>
-              </w:rPr>
-            </w:pPr>
-            <w:r>
-              <w:rPr>
-                <w:kern w:val="0"/>
-                <w:sz w:val="24"/>
-              </w:rPr>
-              <w:t xml:space="preserve">GCC 在 x86 后端用 ix86_endbr_immediate_operand 谓词做字节级检测：当目标启用 IBT 时，谓词扫描立即数中是否存在 endbr 模式，含该模式的立即数会被拒绝（同源历史修复参见 PR-96350[23]）。测试发现该谓词存在逻辑漏洞：扫描循环对"高位非零"的 64 位立即数提前退出，只要 endbr 字节排布在立即数高位，扫描就无法到达该位置。这类立即数被错误接受，进而在 .text 中嵌入了伪 landing pad。该缺陷已上报上游（PR-125084[7]），等待维护者回复。</w:t>
-            </w:r>
-          </w:p>
-          <w:p>
-            <w:pPr>
-              <w:pStyle w:val="Normal"/>
-              <w:spacing w:lineRule="auto" w:line="360"/>
-              <w:ind w:firstLineChars="200" w:startChars="0" w:start="0" w:endChars="0" w:end="0"/>
-              <w:rPr>
-                <w:kern w:val="0"/>
-                <w:sz w:val="24"/>
-              </w:rPr>
-            </w:pPr>
-            <w:r>
-              <w:rPr>
-                <w:kern w:val="0"/>
-                <w:sz w:val="24"/>
-              </w:rPr>
-              <w:t xml:space="preserve">该例命中"endbr 字节模式不应出现在非跳转目标的指令中"不变量，证据为代码段内 endbr 模式扫描，属静态指令流检查。</w:t>
-            </w:r>
-          </w:p>
-          <w:p>
-            <w:pPr>
-              <w:pStyle w:val="Normal"/>
-              <w:spacing w:lineRule="auto" w:line="360"/>
+              <w:spacing w:line="360" w:lineRule="auto"/>
+              <w:ind w:left="0" w:leftChars="0" w:right="0" w:rightChars="0" w:firstLineChars="200"/>
+              <w:rPr>
+                <w:kern w:val="0"/>
+                <w:sz w:val="24"/>
+              </w:rPr>
+            </w:pPr>
+            <w:r>
+              <w:rPr>
+                <w:kern w:val="0"/>
+                <w:sz w:val="24"/>
+              </w:rPr>
+              <w:t>IBT 是 Intel CET 中针对间接跳转的保护机制[22]：硬件要求间接跳转或调用的目标地址必须以 endbr 指令开头，否则触发异常。endbr 在二进制中是固定的四字节值（endbr64 = F3 0F 1E FA、endbr32 = F3 0F 1E FB），按设计只应作为合法间接跳转入口出现在代码段。如果这四个字节以其他形式出现，例如作为 movabsq 指令的 64 位立即数的一部分嵌入 .text，攻击者就可以把控制流劫持到该处，硬件会将其识别为合法 landing pad，IBT 语义被绕过。</w:t>
+            </w:r>
+          </w:p>
+          <w:p>
+            <w:pPr>
+              <w:spacing w:line="360" w:lineRule="auto"/>
+              <w:ind w:left="0" w:leftChars="0" w:right="0" w:rightChars="0" w:firstLineChars="200"/>
+              <w:rPr>
+                <w:kern w:val="0"/>
+                <w:sz w:val="24"/>
+              </w:rPr>
+            </w:pPr>
+            <w:r>
+              <w:rPr>
+                <w:kern w:val="0"/>
+                <w:sz w:val="24"/>
+              </w:rPr>
+              <w:t>GCC 在 x86 后端用 ix86_endbr_immediate_operand 谓词做字节级检测：当目标启用 IBT 时，谓词扫描立即数中是否存在 endbr 模式，含该模式的立即数会被拒绝（同源历史修复参见 PR-96350[23]）。测试发现该谓词存在逻辑漏洞：扫描循环对"高位非零"的 64 位立即数提前退出，只要 endbr 字节排布在立即数高位，扫描就无法到达该位置。这类立即数被错误接受，进而在 .text 中嵌入了伪 landing pad。该缺陷已上报上游（PR-125084[7]），等待维护者回复。</w:t>
+            </w:r>
+          </w:p>
+          <w:p>
+            <w:pPr>
+              <w:spacing w:line="360" w:lineRule="auto"/>
+              <w:ind w:left="0" w:leftChars="0" w:right="0" w:rightChars="0" w:firstLineChars="200"/>
+              <w:rPr>
+                <w:kern w:val="0"/>
+                <w:sz w:val="24"/>
+              </w:rPr>
+            </w:pPr>
+            <w:r>
+              <w:rPr>
+                <w:kern w:val="0"/>
+                <w:sz w:val="24"/>
+              </w:rPr>
+              <w:t>该例命中"endbr 字节模式不应出现在非跳转目标的指令中"不变量，证据为代码段内 endbr 模式扫描，属静态指令流检查。</w:t>
+            </w:r>
+          </w:p>
+          <w:p>
+            <w:pPr>
+              <w:spacing w:line="360" w:lineRule="auto"/>
               <w:rPr>
                 <w:b/>
                 <w:bCs/>
@@ -4189,26 +4292,24 @@
           </w:p>
           <w:p>
             <w:pPr>
-              <w:pStyle w:val="Normal"/>
-              <w:spacing w:lineRule="auto" w:line="360"/>
-              <w:ind w:firstLineChars="200" w:startChars="0" w:start="0" w:endChars="0" w:end="0"/>
-              <w:rPr>
-                <w:kern w:val="0"/>
-                <w:sz w:val="24"/>
-              </w:rPr>
-            </w:pPr>
-            <w:r>
-              <w:rPr>
-                <w:kern w:val="0"/>
-                <w:sz w:val="24"/>
-              </w:rPr>
-              <w:t xml:space="preserve">本方法在 GCC 通用栈保护后端的 fallback 路径上找到一例同类失效：MIPS、LoongArch 等 ISA 的 fallback 后端未提供专用 epilogue 模板，函数返回时金丝雀寄存器未显式清零，进程级 __stack_chk_guard 值在寄存器中残留。该问题与 2020 年针对 AArch64 / ARM 的 PR-96191[5] 同源，当年修复未覆盖上述后端。本课题以 meta-bug PR-125045[8] 统一跟踪该家族，其中 LoongArch 子例（PR-125049[9]）已被维护者确认并合入修复，其余正依次上报。</w:t>
-            </w:r>
-          </w:p>
-          <w:p>
-            <w:pPr>
-              <w:pStyle w:val="Normal"/>
-              <w:spacing w:lineRule="auto" w:line="360"/>
+              <w:spacing w:line="360" w:lineRule="auto"/>
+              <w:ind w:left="0" w:leftChars="0" w:right="0" w:rightChars="0" w:firstLineChars="200"/>
+              <w:rPr>
+                <w:kern w:val="0"/>
+                <w:sz w:val="24"/>
+              </w:rPr>
+            </w:pPr>
+            <w:r>
+              <w:rPr>
+                <w:kern w:val="0"/>
+                <w:sz w:val="24"/>
+              </w:rPr>
+              <w:t>本方法在 GCC 通用栈保护后端的 fallback 路径上找到一例同类失效：MIPS、LoongArch 等 ISA 的 fallback 后端未提供专用 epilogue 模板，函数返回时金丝雀寄存器未显式清零，进程级 __stack_chk_guard 值在寄存器中残留。该问题与 2020 年针对 AArch64 / ARM 的 PR-96191[5] 同源，当年修复未覆盖上述后端。本课题以 meta-bug PR-125045[8] 统一跟踪该家族，其中 LoongArch 子例（PR-125049[9]）已被维护者确认并合入修复，其余正依次上报。</w:t>
+            </w:r>
+          </w:p>
+          <w:p>
+            <w:pPr>
+              <w:spacing w:line="360" w:lineRule="auto"/>
               <w:rPr>
                 <w:b/>
                 <w:bCs/>
@@ -4228,36 +4329,33 @@
           </w:p>
           <w:p>
             <w:pPr>
-              <w:pStyle w:val="Normal"/>
-              <w:spacing w:lineRule="auto" w:line="360"/>
-              <w:ind w:firstLineChars="200" w:startChars="0" w:start="0" w:endChars="0" w:end="0"/>
-              <w:rPr>
-                <w:kern w:val="0"/>
-                <w:sz w:val="24"/>
-              </w:rPr>
-            </w:pPr>
-            <w:r>
-              <w:rPr>
-                <w:kern w:val="0"/>
-                <w:sz w:val="24"/>
-              </w:rPr>
-              <w:t xml:space="preserve">上述三例缺陷共同说明：即使二进制仍带有保护，其底层依赖的部分安全不变量也可能已经失效。本文方法在不修改编译器的前提下，通过变异与预言机的组合成功将此类隐蔽问题暴露。</w:t>
-            </w:r>
-          </w:p>
-          <w:p>
-            <w:pPr>
-              <w:pStyle w:val="Normal"/>
-              <w:spacing w:lineRule="auto" w:line="360"/>
-              <w:rPr>
-                <w:sz w:val="24"/>
-              </w:rPr>
-            </w:pPr>
-          </w:p>
-          <w:p>
-            <w:pPr>
-              <w:pStyle w:val="Normal"/>
+              <w:spacing w:line="360" w:lineRule="auto"/>
+              <w:ind w:left="0" w:leftChars="0" w:right="0" w:rightChars="0" w:firstLineChars="200"/>
+              <w:rPr>
+                <w:kern w:val="0"/>
+                <w:sz w:val="24"/>
+              </w:rPr>
+            </w:pPr>
+            <w:r>
+              <w:rPr>
+                <w:kern w:val="0"/>
+                <w:sz w:val="24"/>
+              </w:rPr>
+              <w:t>上述三例缺陷共同说明：即使二进制仍带有保护，其底层依赖的部分安全不变量也可能已经失效。本文方法在不修改编译器的前提下，通过变异与预言机的组合成功将此类隐蔽问题暴露。</w:t>
+            </w:r>
+          </w:p>
+          <w:p>
+            <w:pPr>
+              <w:spacing w:line="360" w:lineRule="auto"/>
+              <w:rPr>
+                <w:sz w:val="24"/>
+              </w:rPr>
+            </w:pPr>
+          </w:p>
+          <w:p>
+            <w:pPr>
               <w:widowControl/>
-              <w:jc w:val="start"/>
+              <w:jc w:val="left"/>
               <w:rPr>
                 <w:b/>
                 <w:bCs/>
@@ -4277,439 +4375,416 @@
           </w:p>
           <w:p>
             <w:pPr>
-              <w:pStyle w:val="Normal"/>
               <w:keepLines/>
-              <w:spacing w:lineRule="auto" w:line="360"/>
-              <w:jc w:val="start"/>
-              <w:rPr>
-                <w:kern w:val="0"/>
-                <w:sz w:val="24"/>
-              </w:rPr>
-            </w:pPr>
-            <w:r>
-              <w:rPr>
-                <w:kern w:val="0"/>
-                <w:sz w:val="24"/>
-              </w:rPr>
-              <w:t xml:space="preserve">[1] CVE Program. CVE Metrics — published vulnerabilities trend[EB/OL]. (2026)[2026-05-12]. https://www.cve.org/about/Metrics.</w:t>
-            </w:r>
-          </w:p>
-          <w:p>
-            <w:pPr>
-              <w:pStyle w:val="Normal"/>
+              <w:spacing w:line="360" w:lineRule="auto"/>
+              <w:jc w:val="left"/>
+              <w:rPr>
+                <w:kern w:val="0"/>
+                <w:sz w:val="24"/>
+              </w:rPr>
+            </w:pPr>
+            <w:r>
+              <w:rPr>
+                <w:kern w:val="0"/>
+                <w:sz w:val="24"/>
+              </w:rPr>
+              <w:t>[1] CVE Program. CVE Metrics — published vulnerabilities trend[EB/OL]. (2026)[2026-05-12]. https://www.cve.org/about/Metrics.</w:t>
+            </w:r>
+          </w:p>
+          <w:p>
+            <w:pPr>
               <w:keepLines/>
-              <w:spacing w:lineRule="auto" w:line="360"/>
-              <w:jc w:val="start"/>
-              <w:rPr>
-                <w:kern w:val="0"/>
-                <w:sz w:val="24"/>
-              </w:rPr>
-            </w:pPr>
-            <w:r>
-              <w:rPr>
-                <w:kern w:val="0"/>
-                <w:sz w:val="24"/>
-              </w:rPr>
-              <w:t xml:space="preserve">[2] Microsoft Security Response Center. Microsoft Security Response Center Blog[EB/OL]. (2023)[2026-05-13]. https://www.microsoft.com/en-us/msrc/blog.</w:t>
-            </w:r>
-          </w:p>
-          <w:p>
-            <w:pPr>
-              <w:pStyle w:val="Normal"/>
+              <w:spacing w:line="360" w:lineRule="auto"/>
+              <w:jc w:val="left"/>
+              <w:rPr>
+                <w:kern w:val="0"/>
+                <w:sz w:val="24"/>
+              </w:rPr>
+            </w:pPr>
+            <w:r>
+              <w:rPr>
+                <w:kern w:val="0"/>
+                <w:sz w:val="24"/>
+              </w:rPr>
+              <w:t>[2] Microsoft Security Response Center. Microsoft Security Response Center Blog[EB/OL]. (2023)[2026-05-13]. https://www.microsoft.com/en-us/msrc/blog.</w:t>
+            </w:r>
+          </w:p>
+          <w:p>
+            <w:pPr>
               <w:keepLines/>
-              <w:spacing w:lineRule="auto" w:line="360"/>
-              <w:jc w:val="start"/>
-              <w:rPr>
-                <w:kern w:val="0"/>
-                <w:sz w:val="24"/>
-              </w:rPr>
-            </w:pPr>
-            <w:r>
-              <w:rPr>
-                <w:kern w:val="0"/>
-                <w:sz w:val="24"/>
-              </w:rPr>
-              <w:t xml:space="preserve">[3] Google Security Blog. Memory Safe Languages in Android 13[EB/OL]. (2022-12)[2026-05-13]. https://security.googleblog.com/2022/12/memory-safe-languages-in-android-13.html.</w:t>
-            </w:r>
-          </w:p>
-          <w:p>
-            <w:pPr>
-              <w:pStyle w:val="Normal"/>
+              <w:spacing w:line="360" w:lineRule="auto"/>
+              <w:jc w:val="left"/>
+              <w:rPr>
+                <w:kern w:val="0"/>
+                <w:sz w:val="24"/>
+              </w:rPr>
+            </w:pPr>
+            <w:r>
+              <w:rPr>
+                <w:kern w:val="0"/>
+                <w:sz w:val="24"/>
+              </w:rPr>
+              <w:t>[3] Google Security Blog. Memory Safe Languages in Android 13[EB/OL]. (2022-12)[2026-05-13]. https://security.googleblog.com/2022/12/memory-safe-languages-in-android-13.html.</w:t>
+            </w:r>
+          </w:p>
+          <w:p>
+            <w:pPr>
               <w:keepLines/>
-              <w:spacing w:lineRule="auto" w:line="360"/>
-              <w:jc w:val="start"/>
-              <w:rPr>
-                <w:kern w:val="0"/>
-                <w:sz w:val="24"/>
-              </w:rPr>
-            </w:pPr>
-            <w:r>
-              <w:rPr>
-                <w:kern w:val="0"/>
-                <w:sz w:val="24"/>
-              </w:rPr>
-              <w:t xml:space="preserve">[4] Meta Security. CVE-2023-4039: GCC's -fstack-protector fails to guard dynamic stack allocations on AArch64[EB/OL]. (2023)[2026-02-15]. https://rtx.meta.security/mitigation/2023/09/12/CVE-2023-4039.html.</w:t>
-            </w:r>
-          </w:p>
-          <w:p>
-            <w:pPr>
-              <w:pStyle w:val="Normal"/>
+              <w:spacing w:line="360" w:lineRule="auto"/>
+              <w:jc w:val="left"/>
+              <w:rPr>
+                <w:kern w:val="0"/>
+                <w:sz w:val="24"/>
+              </w:rPr>
+            </w:pPr>
+            <w:r>
+              <w:rPr>
+                <w:kern w:val="0"/>
+                <w:sz w:val="24"/>
+              </w:rPr>
+              <w:t>[4] Meta Security. CVE-2023-4039: GCC's -fstack-protector fails to guard dynamic stack allocations on AArch64[EB/OL]. (2023)[2026-02-15]. https://rtx.meta.security/mitigation/2023/09/12/CVE-2023-4039.html.</w:t>
+            </w:r>
+          </w:p>
+          <w:p>
+            <w:pPr>
               <w:keepLines/>
-              <w:spacing w:lineRule="auto" w:line="360"/>
-              <w:jc w:val="start"/>
-              <w:rPr>
-                <w:kern w:val="0"/>
-                <w:sz w:val="24"/>
-              </w:rPr>
-            </w:pPr>
-            <w:r>
-              <w:rPr>
-                <w:kern w:val="0"/>
-                <w:sz w:val="24"/>
-              </w:rPr>
-              <w:t xml:space="preserve">[5] GNU Project. GCC Bugzilla PR 96191 — aarch64 stack_protect_test canary leak[EB/OL]. (2020)[2026-05-11]. https://gcc.gnu.org/bugzilla/show_bug.cgi?id=96191.</w:t>
-            </w:r>
-          </w:p>
-          <w:p>
-            <w:pPr>
-              <w:pStyle w:val="Normal"/>
+              <w:spacing w:line="360" w:lineRule="auto"/>
+              <w:jc w:val="left"/>
+              <w:rPr>
+                <w:kern w:val="0"/>
+                <w:sz w:val="24"/>
+              </w:rPr>
+            </w:pPr>
+            <w:r>
+              <w:rPr>
+                <w:kern w:val="0"/>
+                <w:sz w:val="24"/>
+              </w:rPr>
+              <w:t>[5] GNU Project. GCC Bugzilla PR 96191 — aarch64 stack_protect_test canary leak[EB/OL]. (2020)[2026-05-11]. https://gcc.gnu.org/bugzilla/show_bug.cgi?id=96191.</w:t>
+            </w:r>
+          </w:p>
+          <w:p>
+            <w:pPr>
               <w:keepLines/>
-              <w:spacing w:lineRule="auto" w:line="360"/>
-              <w:jc w:val="start"/>
-              <w:rPr>
-                <w:kern w:val="0"/>
-                <w:sz w:val="24"/>
-              </w:rPr>
-            </w:pPr>
-            <w:r>
-              <w:rPr>
-                <w:kern w:val="0"/>
-                <w:sz w:val="24"/>
-              </w:rPr>
-              <w:t xml:space="preserve">[6] GNU Project. GCC Bugzilla PR 125079 — [13/14/15 Regression] tree-ssa-strlen get_string_length: __strcat_chk -&gt; __stpcpy_chk drops bound subtract[EB/OL]. (2026)[2026-05-11]. https://gcc.gnu.org/bugzilla/show_bug.cgi?id=125079.</w:t>
-            </w:r>
-          </w:p>
-          <w:p>
-            <w:pPr>
-              <w:pStyle w:val="Normal"/>
+              <w:spacing w:line="360" w:lineRule="auto"/>
+              <w:jc w:val="left"/>
+              <w:rPr>
+                <w:kern w:val="0"/>
+                <w:sz w:val="24"/>
+              </w:rPr>
+            </w:pPr>
+            <w:r>
+              <w:rPr>
+                <w:kern w:val="0"/>
+                <w:sz w:val="24"/>
+              </w:rPr>
+              <w:t>[6] GNU Project. GCC Bugzilla PR 125079 — [13/14/15 Regression] tree-ssa-strlen get_string_length: __strcat_chk -&gt; __stpcpy_chk drops bound subtract[EB/OL]. (2026)[2026-05-11]. https://gcc.gnu.org/bugzilla/show_bug.cgi?id=125079.</w:t>
+            </w:r>
+          </w:p>
+          <w:p>
+            <w:pPr>
               <w:keepLines/>
-              <w:spacing w:lineRule="auto" w:line="360"/>
-              <w:jc w:val="start"/>
-              <w:rPr>
-                <w:kern w:val="0"/>
-                <w:sz w:val="24"/>
-              </w:rPr>
-            </w:pPr>
-            <w:r>
-              <w:rPr>
-                <w:kern w:val="0"/>
-                <w:sz w:val="24"/>
-              </w:rPr>
-              <w:t xml:space="preserve">[7] GNU Project. GCC Bugzilla PR 125084 — [target/i386] ix86_endbr_immediate_operand misses ENDBR pattern when upper bytes nonzero[EB/OL]. (2026)[2026-05-11]. https://gcc.gnu.org/bugzilla/show_bug.cgi?id=125084.</w:t>
-            </w:r>
-          </w:p>
-          <w:p>
-            <w:pPr>
-              <w:pStyle w:val="Normal"/>
+              <w:spacing w:line="360" w:lineRule="auto"/>
+              <w:jc w:val="left"/>
+              <w:rPr>
+                <w:kern w:val="0"/>
+                <w:sz w:val="24"/>
+              </w:rPr>
+            </w:pPr>
+            <w:r>
+              <w:rPr>
+                <w:kern w:val="0"/>
+                <w:sz w:val="24"/>
+              </w:rPr>
+              <w:t>[7] GNU Project. GCC Bugzilla PR 125084 — [target/i386] ix86_endbr_immediate_operand misses ENDBR pattern when upper bytes nonzero[EB/OL]. (2026)[2026-05-11]. https://gcc.gnu.org/bugzilla/show_bug.cgi?id=125084.</w:t>
+            </w:r>
+          </w:p>
+          <w:p>
+            <w:pPr>
               <w:keepLines/>
-              <w:spacing w:lineRule="auto" w:line="360"/>
-              <w:jc w:val="start"/>
-              <w:rPr>
-                <w:kern w:val="0"/>
-                <w:sz w:val="24"/>
-              </w:rPr>
-            </w:pPr>
-            <w:r>
-              <w:rPr>
-                <w:kern w:val="0"/>
-                <w:sz w:val="24"/>
-              </w:rPr>
-              <w:t xml:space="preserve">[8] GNU Project. GCC Bugzilla PR 125045 — [meta-bug] SSP fallback leaves canary in live GPR on many targets[EB/OL]. (2026)[2026-05-11]. https://gcc.gnu.org/bugzilla/show_bug.cgi?id=125045.</w:t>
-            </w:r>
-          </w:p>
-          <w:p>
-            <w:pPr>
-              <w:pStyle w:val="Normal"/>
+              <w:spacing w:line="360" w:lineRule="auto"/>
+              <w:jc w:val="left"/>
+              <w:rPr>
+                <w:kern w:val="0"/>
+                <w:sz w:val="24"/>
+              </w:rPr>
+            </w:pPr>
+            <w:r>
+              <w:rPr>
+                <w:kern w:val="0"/>
+                <w:sz w:val="24"/>
+              </w:rPr>
+              <w:t>[8] GNU Project. GCC Bugzilla PR 125045 — [meta-bug] SSP fallback leaves canary in live GPR on many targets[EB/OL]. (2026)[2026-05-11]. https://gcc.gnu.org/bugzilla/show_bug.cgi?id=125045.</w:t>
+            </w:r>
+          </w:p>
+          <w:p>
+            <w:pPr>
               <w:keepLines/>
-              <w:spacing w:lineRule="auto" w:line="360"/>
-              <w:jc w:val="start"/>
-              <w:rPr>
-                <w:kern w:val="0"/>
-                <w:sz w:val="24"/>
-              </w:rPr>
-            </w:pPr>
-            <w:r>
-              <w:rPr>
-                <w:kern w:val="0"/>
-                <w:sz w:val="24"/>
-              </w:rPr>
-              <w:t xml:space="preserve">[9] GNU Project. GCC Bugzilla PR 125049 — [loongarch] SSP fallback leaves __stack_chk_guard live in $r12 at `jr $r1`[EB/OL]. (2026)[2026-05-11]. https://gcc.gnu.org/bugzilla/show_bug.cgi?id=125049.</w:t>
-            </w:r>
-          </w:p>
-          <w:p>
-            <w:pPr>
-              <w:pStyle w:val="Normal"/>
+              <w:spacing w:line="360" w:lineRule="auto"/>
+              <w:jc w:val="left"/>
+              <w:rPr>
+                <w:kern w:val="0"/>
+                <w:sz w:val="24"/>
+              </w:rPr>
+            </w:pPr>
+            <w:r>
+              <w:rPr>
+                <w:kern w:val="0"/>
+                <w:sz w:val="24"/>
+              </w:rPr>
+              <w:t>[9] GNU Project. GCC Bugzilla PR 125049 — [loongarch] SSP fallback leaves __stack_chk_guard live in $r12 at `jr $r1`[EB/OL]. (2026)[2026-05-11]. https://gcc.gnu.org/bugzilla/show_bug.cgi?id=125049.</w:t>
+            </w:r>
+          </w:p>
+          <w:p>
+            <w:pPr>
               <w:keepLines/>
-              <w:spacing w:lineRule="auto" w:line="360"/>
-              <w:jc w:val="start"/>
-              <w:rPr>
-                <w:kern w:val="0"/>
-                <w:sz w:val="24"/>
-              </w:rPr>
-            </w:pPr>
-            <w:r>
-              <w:rPr>
-                <w:kern w:val="0"/>
-                <w:sz w:val="24"/>
-              </w:rPr>
-              <w:t xml:space="preserve">[10] Yang X, Chen Y, Eide E, et al. Finding and understanding bugs in C compilers[C]//Proceedings of the 32nd ACM SIGPLAN Conference on Programming Language Design and Implementation (PLDI). 2011: 283-294.</w:t>
-            </w:r>
-          </w:p>
-          <w:p>
-            <w:pPr>
-              <w:pStyle w:val="Normal"/>
+              <w:spacing w:line="360" w:lineRule="auto"/>
+              <w:jc w:val="left"/>
+              <w:rPr>
+                <w:kern w:val="0"/>
+                <w:sz w:val="24"/>
+              </w:rPr>
+            </w:pPr>
+            <w:r>
+              <w:rPr>
+                <w:kern w:val="0"/>
+                <w:sz w:val="24"/>
+              </w:rPr>
+              <w:t>[10] Yang X, Chen Y, Eide E, et al. Finding and understanding bugs in C compilers[C]//Proceedings of the 32nd ACM SIGPLAN Conference on Programming Language Design and Implementation (PLDI). 2011: 283-294.</w:t>
+            </w:r>
+          </w:p>
+          <w:p>
+            <w:pPr>
               <w:keepLines/>
-              <w:spacing w:lineRule="auto" w:line="360"/>
-              <w:jc w:val="start"/>
-              <w:rPr>
-                <w:kern w:val="0"/>
-                <w:sz w:val="24"/>
-              </w:rPr>
-            </w:pPr>
-            <w:r>
-              <w:rPr>
-                <w:kern w:val="0"/>
-                <w:sz w:val="24"/>
-              </w:rPr>
-              <w:t xml:space="preserve">[11] Livinskii V, Babokin D, Regehr J. Random testing for C and C++ compilers with YARPGen[C]//Proceedings of the ACM on Programming Languages (OOPSLA). 2020, 4: 1-25.</w:t>
-            </w:r>
-          </w:p>
-          <w:p>
-            <w:pPr>
-              <w:pStyle w:val="Normal"/>
+              <w:spacing w:line="360" w:lineRule="auto"/>
+              <w:jc w:val="left"/>
+              <w:rPr>
+                <w:kern w:val="0"/>
+                <w:sz w:val="24"/>
+              </w:rPr>
+            </w:pPr>
+            <w:r>
+              <w:rPr>
+                <w:kern w:val="0"/>
+                <w:sz w:val="24"/>
+              </w:rPr>
+              <w:t>[11] Livinskii V, Babokin D, Regehr J. Random testing for C and C++ compilers with YARPGen[C]//Proceedings of the ACM on Programming Languages (OOPSLA). 2020, 4: 1-25.</w:t>
+            </w:r>
+          </w:p>
+          <w:p>
+            <w:pPr>
               <w:keepLines/>
-              <w:spacing w:lineRule="auto" w:line="360"/>
-              <w:jc w:val="start"/>
-              <w:rPr>
-                <w:kern w:val="0"/>
-                <w:sz w:val="24"/>
-              </w:rPr>
-            </w:pPr>
-            <w:r>
-              <w:rPr>
-                <w:kern w:val="0"/>
-                <w:sz w:val="24"/>
-              </w:rPr>
-              <w:t xml:space="preserve">[12] Zalewski M. American Fuzzy Lop (AFL)[EB/OL]. (2014)[2026-02-15]. https://lcamtuf.coredump.cx/afl/.</w:t>
-            </w:r>
-          </w:p>
-          <w:p>
-            <w:pPr>
-              <w:pStyle w:val="Normal"/>
+              <w:spacing w:line="360" w:lineRule="auto"/>
+              <w:jc w:val="left"/>
+              <w:rPr>
+                <w:kern w:val="0"/>
+                <w:sz w:val="24"/>
+              </w:rPr>
+            </w:pPr>
+            <w:r>
+              <w:rPr>
+                <w:kern w:val="0"/>
+                <w:sz w:val="24"/>
+              </w:rPr>
+              <w:t>[12] Zalewski M. American Fuzzy Lop (AFL)[EB/OL]. (2014)[2026-02-15]. https://lcamtuf.coredump.cx/afl/.</w:t>
+            </w:r>
+          </w:p>
+          <w:p>
+            <w:pPr>
               <w:keepLines/>
-              <w:spacing w:lineRule="auto" w:line="360"/>
-              <w:jc w:val="start"/>
-              <w:rPr>
-                <w:kern w:val="0"/>
-                <w:sz w:val="24"/>
-              </w:rPr>
-            </w:pPr>
-            <w:r>
-              <w:rPr>
-                <w:kern w:val="0"/>
-                <w:sz w:val="24"/>
-              </w:rPr>
-              <w:t xml:space="preserve">[13] Serebryany K. Continuous fuzzing with libFuzzer and AddressSanitizer[C]//IEEE Cybersecurity Development (SecDev). 2016: 157.</w:t>
-            </w:r>
-          </w:p>
-          <w:p>
-            <w:pPr>
-              <w:pStyle w:val="Normal"/>
+              <w:spacing w:line="360" w:lineRule="auto"/>
+              <w:jc w:val="left"/>
+              <w:rPr>
+                <w:kern w:val="0"/>
+                <w:sz w:val="24"/>
+              </w:rPr>
+            </w:pPr>
+            <w:r>
+              <w:rPr>
+                <w:kern w:val="0"/>
+                <w:sz w:val="24"/>
+              </w:rPr>
+              <w:t>[13] Serebryany K. Continuous fuzzing with libFuzzer and AddressSanitizer[C]//IEEE Cybersecurity Development (SecDev). 2016: 157.</w:t>
+            </w:r>
+          </w:p>
+          <w:p>
+            <w:pPr>
               <w:keepLines/>
-              <w:spacing w:lineRule="auto" w:line="360"/>
-              <w:jc w:val="start"/>
-              <w:rPr>
-                <w:kern w:val="0"/>
-                <w:sz w:val="24"/>
-              </w:rPr>
-            </w:pPr>
-            <w:r>
-              <w:rPr>
-                <w:kern w:val="0"/>
-                <w:sz w:val="24"/>
-              </w:rPr>
-              <w:t xml:space="preserve">[14] Even-Mendoza K, Sharma A, Donaldson A F, et al. GrayC: Greybox fuzzing of compilers and analysers for C[C]//Proceedings of the 32nd ACM SIGSOFT International Symposium on Software Testing and Analysis (ISSTA). 2023: 1219-1231.</w:t>
-            </w:r>
-          </w:p>
-          <w:p>
-            <w:pPr>
-              <w:pStyle w:val="Normal"/>
+              <w:spacing w:line="360" w:lineRule="auto"/>
+              <w:jc w:val="left"/>
+              <w:rPr>
+                <w:kern w:val="0"/>
+                <w:sz w:val="24"/>
+              </w:rPr>
+            </w:pPr>
+            <w:r>
+              <w:rPr>
+                <w:kern w:val="0"/>
+                <w:sz w:val="24"/>
+              </w:rPr>
+              <w:t>[14] Even-Mendoza K, Sharma A, Donaldson A F, et al. GrayC: Greybox fuzzing of compilers and analysers for C[C]//Proceedings of the 32nd ACM SIGSOFT International Symposium on Software Testing and Analysis (ISSTA). 2023: 1219-1231.</w:t>
+            </w:r>
+          </w:p>
+          <w:p>
+            <w:pPr>
               <w:keepLines/>
-              <w:spacing w:lineRule="auto" w:line="360"/>
-              <w:jc w:val="start"/>
-              <w:rPr>
-                <w:kern w:val="0"/>
-                <w:sz w:val="24"/>
-              </w:rPr>
-            </w:pPr>
-            <w:r>
-              <w:rPr>
-                <w:kern w:val="0"/>
-                <w:sz w:val="24"/>
-              </w:rPr>
-              <w:t xml:space="preserve">[15] Le V, Afshari M, Su Z. Compiler validation via equivalence modulo inputs[C]//Proceedings of the 35th ACM SIGPLAN Conference on Programming Language Design and Implementation (PLDI). 2014: 216-226.</w:t>
-            </w:r>
-          </w:p>
-          <w:p>
-            <w:pPr>
-              <w:pStyle w:val="Normal"/>
+              <w:spacing w:line="360" w:lineRule="auto"/>
+              <w:jc w:val="left"/>
+              <w:rPr>
+                <w:kern w:val="0"/>
+                <w:sz w:val="24"/>
+              </w:rPr>
+            </w:pPr>
+            <w:r>
+              <w:rPr>
+                <w:kern w:val="0"/>
+                <w:sz w:val="24"/>
+              </w:rPr>
+              <w:t>[15] Le V, Afshari M, Su Z. Compiler validation via equivalence modulo inputs[C]//Proceedings of the 35th ACM SIGPLAN Conference on Programming Language Design and Implementation (PLDI). 2014: 216-226.</w:t>
+            </w:r>
+          </w:p>
+          <w:p>
+            <w:pPr>
               <w:keepLines/>
-              <w:spacing w:lineRule="auto" w:line="360"/>
-              <w:jc w:val="start"/>
-              <w:rPr>
-                <w:kern w:val="0"/>
-                <w:sz w:val="24"/>
-              </w:rPr>
-            </w:pPr>
-            <w:r>
-              <w:rPr>
-                <w:kern w:val="0"/>
-                <w:sz w:val="24"/>
-              </w:rPr>
-              <w:t xml:space="preserve">[16] Yang C, Deng Y, Lu R, et al. WhiteFox: White-box compiler fuzzing empowered by large language models[C]//Proceedings of the ACM on Programming Languages (OOPSLA). 2024.</w:t>
-            </w:r>
-          </w:p>
-          <w:p>
-            <w:pPr>
-              <w:pStyle w:val="Normal"/>
+              <w:spacing w:line="360" w:lineRule="auto"/>
+              <w:jc w:val="left"/>
+              <w:rPr>
+                <w:kern w:val="0"/>
+                <w:sz w:val="24"/>
+              </w:rPr>
+            </w:pPr>
+            <w:r>
+              <w:rPr>
+                <w:kern w:val="0"/>
+                <w:sz w:val="24"/>
+              </w:rPr>
+              <w:t>[16] Yang C, Deng Y, Lu R, et al. WhiteFox: White-box compiler fuzzing empowered by large language models[C]//Proceedings of the ACM on Programming Languages (OOPSLA). 2024.</w:t>
+            </w:r>
+          </w:p>
+          <w:p>
+            <w:pPr>
               <w:keepLines/>
-              <w:spacing w:lineRule="auto" w:line="360"/>
-              <w:jc w:val="start"/>
-              <w:rPr>
-                <w:kern w:val="0"/>
-                <w:sz w:val="24"/>
-              </w:rPr>
-            </w:pPr>
-            <w:r>
-              <w:rPr>
-                <w:kern w:val="0"/>
-                <w:sz w:val="24"/>
-              </w:rPr>
-              <w:t xml:space="preserve">[17] Yang Y, Zhang H, Ren Z, et al. Hybrid language processor fuzzing via LLM-based constraint solving[C]//Proceedings of the 34th USENIX Security Symposium (USENIX Security). 2025.</w:t>
-            </w:r>
-          </w:p>
-          <w:p>
-            <w:pPr>
-              <w:pStyle w:val="Normal"/>
+              <w:spacing w:line="360" w:lineRule="auto"/>
+              <w:jc w:val="left"/>
+              <w:rPr>
+                <w:kern w:val="0"/>
+                <w:sz w:val="24"/>
+              </w:rPr>
+            </w:pPr>
+            <w:r>
+              <w:rPr>
+                <w:kern w:val="0"/>
+                <w:sz w:val="24"/>
+              </w:rPr>
+              <w:t>[17] Yang Y, Zhang H, Ren Z, et al. Hybrid language processor fuzzing via LLM-based constraint solving[C]//Proceedings of the 34th USENIX Security Symposium (USENIX Security). 2025.</w:t>
+            </w:r>
+          </w:p>
+          <w:p>
+            <w:pPr>
               <w:keepLines/>
-              <w:spacing w:lineRule="auto" w:line="360"/>
-              <w:jc w:val="start"/>
-              <w:rPr>
-                <w:kern w:val="0"/>
-                <w:sz w:val="24"/>
-              </w:rPr>
-            </w:pPr>
-            <w:r>
-              <w:rPr>
-                <w:kern w:val="0"/>
-                <w:sz w:val="24"/>
-              </w:rPr>
-              <w:t xml:space="preserve">[18] Li S, Su Z. UBfuzz: Finding bugs in sanitizer implementations[C]//Proceedings of the 29th ACM International Conference on Architectural Support for Programming Languages and Operating Systems (ASPLOS). 2024.</w:t>
-            </w:r>
-          </w:p>
-          <w:p>
-            <w:pPr>
-              <w:pStyle w:val="Normal"/>
+              <w:spacing w:line="360" w:lineRule="auto"/>
+              <w:jc w:val="left"/>
+              <w:rPr>
+                <w:kern w:val="0"/>
+                <w:sz w:val="24"/>
+              </w:rPr>
+            </w:pPr>
+            <w:r>
+              <w:rPr>
+                <w:kern w:val="0"/>
+                <w:sz w:val="24"/>
+              </w:rPr>
+              <w:t>[18] Li S, Su Z. UBfuzz: Finding bugs in sanitizer implementations[C]//Proceedings of the 29th ACM International Conference on Architectural Support for Programming Languages and Operating Systems (ASPLOS). 2024.</w:t>
+            </w:r>
+          </w:p>
+          <w:p>
+            <w:pPr>
               <w:keepLines/>
-              <w:spacing w:lineRule="auto" w:line="360"/>
-              <w:jc w:val="start"/>
-              <w:rPr>
-                <w:kern w:val="0"/>
-                <w:sz w:val="24"/>
-              </w:rPr>
-            </w:pPr>
-            <w:r>
-              <w:rPr>
-                <w:kern w:val="0"/>
-                <w:sz w:val="24"/>
-              </w:rPr>
-              <w:t xml:space="preserve">[19] Ma H, Shen Q, Tian Y, et al. Fuzzing deep learning compilers with HirGen[C]//Proceedings of the 32nd ACM SIGSOFT International Symposium on Software Testing and Analysis (ISSTA). 2023.</w:t>
-            </w:r>
-          </w:p>
-          <w:p>
-            <w:pPr>
-              <w:pStyle w:val="Normal"/>
+              <w:spacing w:line="360" w:lineRule="auto"/>
+              <w:jc w:val="left"/>
+              <w:rPr>
+                <w:kern w:val="0"/>
+                <w:sz w:val="24"/>
+              </w:rPr>
+            </w:pPr>
+            <w:r>
+              <w:rPr>
+                <w:kern w:val="0"/>
+                <w:sz w:val="24"/>
+              </w:rPr>
+              <w:t>[19] Ma H, Shen Q, Tian Y, et al. Fuzzing deep learning compilers with HirGen[C]//Proceedings of the 32nd ACM SIGSOFT International Symposium on Software Testing and Analysis (ISSTA). 2023.</w:t>
+            </w:r>
+          </w:p>
+          <w:p>
+            <w:pPr>
               <w:keepLines/>
-              <w:spacing w:lineRule="auto" w:line="360"/>
-              <w:jc w:val="start"/>
-              <w:rPr>
-                <w:kern w:val="0"/>
-                <w:sz w:val="24"/>
-              </w:rPr>
-            </w:pPr>
-            <w:r>
-              <w:rPr>
-                <w:kern w:val="0"/>
-                <w:sz w:val="24"/>
-              </w:rPr>
-              <w:t xml:space="preserve">[20] Free Software Foundation. The GNU C Library Reference Manual: Source Fortification[EB/OL]. (2024)[2026-02-15]. https://sourceware.org/glibc/manual/latest/html_node/Source-Fortification.html.</w:t>
-            </w:r>
-          </w:p>
-          <w:p>
-            <w:pPr>
-              <w:pStyle w:val="Normal"/>
+              <w:spacing w:line="360" w:lineRule="auto"/>
+              <w:jc w:val="left"/>
+              <w:rPr>
+                <w:kern w:val="0"/>
+                <w:sz w:val="24"/>
+              </w:rPr>
+            </w:pPr>
+            <w:r>
+              <w:rPr>
+                <w:kern w:val="0"/>
+                <w:sz w:val="24"/>
+              </w:rPr>
+              <w:t>[20] Free Software Foundation. The GNU C Library Reference Manual: Source Fortification[EB/OL]. (2024)[2026-02-15]. https://sourceware.org/glibc/manual/latest/html_node/Source-Fortification.html.</w:t>
+            </w:r>
+          </w:p>
+          <w:p>
+            <w:pPr>
               <w:keepLines/>
-              <w:spacing w:lineRule="auto" w:line="360"/>
-              <w:jc w:val="start"/>
-              <w:rPr>
-                <w:kern w:val="0"/>
-                <w:sz w:val="24"/>
-              </w:rPr>
-            </w:pPr>
-            <w:r>
-              <w:rPr>
-                <w:kern w:val="0"/>
-                <w:sz w:val="24"/>
-              </w:rPr>
-              <w:t xml:space="preserve">[21] GNU Project. GCC Bugzilla PR 87672 — [9 regression] 81512c36 causes ICE in bootstrap stage 3 using "-D_FORTIFY_SOURCE=2"[EB/OL]. (2018)[2026-05-11]. https://gcc.gnu.org/bugzilla/show_bug.cgi?id=87672.</w:t>
-            </w:r>
-          </w:p>
-          <w:p>
-            <w:pPr>
-              <w:pStyle w:val="Normal"/>
+              <w:spacing w:line="360" w:lineRule="auto"/>
+              <w:jc w:val="left"/>
+              <w:rPr>
+                <w:kern w:val="0"/>
+                <w:sz w:val="24"/>
+              </w:rPr>
+            </w:pPr>
+            <w:r>
+              <w:rPr>
+                <w:kern w:val="0"/>
+                <w:sz w:val="24"/>
+              </w:rPr>
+              <w:t>[21] GNU Project. GCC Bugzilla PR 87672 — [9 regression] 81512c36 causes ICE in bootstrap stage 3 using "-D_FORTIFY_SOURCE=2"[EB/OL]. (2018)[2026-05-11]. https://gcc.gnu.org/bugzilla/show_bug.cgi?id=87672.</w:t>
+            </w:r>
+          </w:p>
+          <w:p>
+            <w:pPr>
               <w:keepLines/>
-              <w:spacing w:lineRule="auto" w:line="360"/>
-              <w:jc w:val="start"/>
-              <w:rPr>
-                <w:kern w:val="0"/>
-                <w:sz w:val="24"/>
-              </w:rPr>
-            </w:pPr>
-            <w:r>
-              <w:rPr>
-                <w:kern w:val="0"/>
-                <w:sz w:val="24"/>
-              </w:rPr>
-              <w:t xml:space="preserve">[22] Intel Corporation. Control-flow Enforcement Technology Specification[R/OL]. (2019)[2026-02-15]. https://www.intel.com/content/www/us/en/developer/articles/technical/technical-look-control-flow-enforcement-technology.html.</w:t>
-            </w:r>
-          </w:p>
-          <w:p>
-            <w:pPr>
-              <w:pStyle w:val="Normal"/>
+              <w:spacing w:line="360" w:lineRule="auto"/>
+              <w:jc w:val="left"/>
+              <w:rPr>
+                <w:kern w:val="0"/>
+                <w:sz w:val="24"/>
+              </w:rPr>
+            </w:pPr>
+            <w:r>
+              <w:rPr>
+                <w:kern w:val="0"/>
+                <w:sz w:val="24"/>
+              </w:rPr>
+              <w:t>[22] Intel Corporation. Control-flow Enforcement Technology Specification[R/OL]. (2019)[2026-02-15]. https://www.intel.com/content/www/us/en/developer/articles/technical/technical-look-control-flow-enforcement-technology.html.</w:t>
+            </w:r>
+          </w:p>
+          <w:p>
+            <w:pPr>
               <w:keepLines/>
-              <w:spacing w:lineRule="auto" w:line="360"/>
-              <w:jc w:val="start"/>
-              <w:rPr>
-                <w:kern w:val="0"/>
-                <w:sz w:val="24"/>
-              </w:rPr>
-            </w:pPr>
-            <w:r>
-              <w:rPr>
-                <w:kern w:val="0"/>
-                <w:sz w:val="24"/>
-              </w:rPr>
-              <w:t xml:space="preserve">[23] GNU Project. GCC Bugzilla PR 96350 — [cet] For ENDBR immediate, the binary would include a gadget that starts with a fake ENDBR64 opcode[EB/OL]. (2020)[2026-05-11]. https://gcc.gnu.org/bugzilla/show_bug.cgi?id=96350.</w:t>
+              <w:spacing w:line="360" w:lineRule="auto"/>
+              <w:jc w:val="left"/>
+              <w:rPr>
+                <w:kern w:val="0"/>
+                <w:sz w:val="24"/>
+              </w:rPr>
+            </w:pPr>
+            <w:r>
+              <w:rPr>
+                <w:kern w:val="0"/>
+                <w:sz w:val="24"/>
+              </w:rPr>
+              <w:t>[23] GNU Project. GCC Bugzilla PR 96350 — [cet] For ENDBR immediate, the binary would include a gadget that starts with a fake ENDBR64 opcode[EB/OL]. (2020)[2026-05-11]. https://gcc.gnu.org/bugzilla/show_bug.cgi?id=96350.</w:t>
             </w:r>
           </w:p>
         </w:tc>
@@ -4807,38 +4882,36 @@
           </w:tcPr>
           <w:p>
             <w:pPr>
-              <w:pStyle w:val="Normal"/>
-              <w:spacing w:lineRule="auto" w:line="360"/>
-              <w:ind w:firstLineChars="200" w:startChars="0" w:start="0" w:endChars="0" w:end="0"/>
-              <w:rPr>
-                <w:kern w:val="0"/>
-                <w:sz w:val="24"/>
-              </w:rPr>
-            </w:pPr>
-            <w:r>
-              <w:rPr>
-                <w:kern w:val="0"/>
-                <w:sz w:val="24"/>
-              </w:rPr>
-              <w:t xml:space="preserve">理论分析对应技术路线的四个部分：编译器主流防御机制安全不变量的形式化与证据提炼、不变量预言机检查器的工程化方法、覆盖率与控制流图引导的目标基本块挑选策略，以及大语言模型生成与预言机判定的耦合方式。预期产出包括：覆盖至少三种主流防御机制的安全不变量集合、可扩展的不变量预言机框架，以及跨架构的 fuzzer 原型；并在 GCC 与 LLVM 上发现真实静默失效以验证方法的有效性与跨编译器迁移性。</w:t>
-            </w:r>
-          </w:p>
-          <w:p>
-            <w:pPr>
-              <w:pStyle w:val="Normal"/>
-              <w:spacing w:lineRule="auto" w:line="360"/>
-              <w:ind w:firstLineChars="200" w:startChars="0" w:start="0" w:endChars="0" w:end="0"/>
-              <w:rPr>
-                <w:kern w:val="0"/>
-                <w:sz w:val="24"/>
-              </w:rPr>
-            </w:pPr>
-            <w:r>
-              <w:rPr>
-                <w:kern w:val="0"/>
-                <w:sz w:val="24"/>
-              </w:rPr>
-              <w:t xml:space="preserve">硬件方面，开发与实验依托一台 64 位 Linux 工作站（不少于 32 GB 内存与百 GB 级 SSD），用于 GCC / LLVM 多版本本地构建、覆盖率数据缓存与跨架构 QEMU 用户态执行；大语言模型推理通过远程 API 完成，本机无需独立 GPU。</w:t>
+              <w:spacing w:line="360" w:lineRule="auto"/>
+              <w:ind w:left="0" w:leftChars="0" w:right="0" w:rightChars="0" w:firstLineChars="200"/>
+              <w:rPr>
+                <w:kern w:val="0"/>
+                <w:sz w:val="24"/>
+              </w:rPr>
+            </w:pPr>
+            <w:r>
+              <w:rPr>
+                <w:kern w:val="0"/>
+                <w:sz w:val="24"/>
+              </w:rPr>
+              <w:t>理论分析对应技术路线的四个部分：编译器主流防御机制安全不变量的形式化与证据提炼、不变量预言机检查器的工程化方法、覆盖率与控制流图引导的目标基本块挑选策略，以及大语言模型生成与预言机判定的耦合方式。预期产出包括：覆盖至少三种主流防御机制的安全不变量集合、可扩展的不变量预言机框架，以及跨架构的 fuzzer 原型；并在 GCC 与 LLVM 上发现真实静默失效以验证方法的有效性与跨编译器迁移性。</w:t>
+            </w:r>
+          </w:p>
+          <w:p>
+            <w:pPr>
+              <w:spacing w:line="360" w:lineRule="auto"/>
+              <w:ind w:left="0" w:leftChars="0" w:right="0" w:rightChars="0" w:firstLineChars="200"/>
+              <w:rPr>
+                <w:kern w:val="0"/>
+                <w:sz w:val="24"/>
+              </w:rPr>
+            </w:pPr>
+            <w:r>
+              <w:rPr>
+                <w:kern w:val="0"/>
+                <w:sz w:val="24"/>
+              </w:rPr>
+              <w:t>硬件方面，开发与实验依托一台 64 位 Linux 工作站（不少于 32 GB 内存与百 GB 级 SSD），用于 GCC / LLVM 多版本本地构建、覆盖率数据缓存与跨架构 QEMU 用户态执行；大语言模型推理通过远程 API 完成，本机无需独立 GPU。</w:t>
             </w:r>
           </w:p>
         </w:tc>
@@ -4875,7 +4948,7 @@
       </w:tblPr>
       <w:tblGrid>
         <w:gridCol w:w="2124"/>
-        <w:gridCol w:w="5283"/>
+        <w:gridCol w:w="5282"/>
         <w:gridCol w:w="2349"/>
       </w:tblGrid>
       <w:tr>
@@ -4980,24 +5053,32 @@
         </w:tc>
       </w:tr>
       <w:tr>
+        <w:tblPrEx>
+          <w:tblCellMar>
+            <w:top w:w="0" w:type="dxa"/>
+            <w:left w:w="108" w:type="dxa"/>
+            <w:bottom w:w="0" w:type="dxa"/>
+            <w:right w:w="108" w:type="dxa"/>
+          </w:tblCellMar>
+        </w:tblPrEx>
         <w:trPr>
           <w:trHeight w:val="480" w:hRule="atLeast"/>
+          <w:jc w:val="center"/>
         </w:trPr>
         <w:tc>
           <w:tcPr>
             <w:tcW w:w="2077" w:type="dxa"/>
             <w:tcBorders>
-              <w:top w:val="single" w:sz="4" w:space="0" w:color="000000"/>
-              <w:start w:val="single" w:sz="4" w:space="0" w:color="000000"/>
-              <w:bottom w:val="single" w:sz="4" w:space="0" w:color="000000"/>
-              <w:end w:val="single" w:sz="4" w:space="0" w:color="000000"/>
+              <w:top w:val="single" w:color="000000" w:sz="4" w:space="0"/>
+              <w:left w:val="single" w:color="000000" w:sz="4" w:space="0"/>
+              <w:bottom w:val="single" w:color="000000" w:sz="4" w:space="0"/>
+              <w:right w:val="single" w:color="000000" w:sz="4" w:space="0"/>
             </w:tcBorders>
             <w:vAlign w:val="center"/>
           </w:tcPr>
           <w:p>
             <w:pPr>
-              <w:pStyle w:val="Normal"/>
-              <w:spacing w:lineRule="exact" w:line="320"/>
+              <w:spacing w:line="320" w:lineRule="exact"/>
               <w:jc w:val="center"/>
               <w:rPr>
                 <w:rFonts w:ascii="宋体" w:hAnsi="宋体" w:eastAsia="宋体"/>
@@ -5009,7 +5090,7 @@
                 <w:rFonts w:ascii="宋体" w:hAnsi="宋体" w:eastAsia="宋体"/>
                 <w:sz w:val="24"/>
               </w:rPr>
-              <w:t xml:space="preserve">2026.05-2026.07</w:t>
+              <w:t>2026.05-2026.07</w:t>
             </w:r>
           </w:p>
         </w:tc>
@@ -5017,17 +5098,16 @@
           <w:tcPr>
             <w:tcW w:w="5167" w:type="dxa"/>
             <w:tcBorders>
-              <w:top w:val="single" w:sz="4" w:space="0" w:color="000000"/>
-              <w:start w:val="single" w:sz="4" w:space="0" w:color="000000"/>
-              <w:bottom w:val="single" w:sz="4" w:space="0" w:color="000000"/>
-              <w:end w:val="single" w:sz="4" w:space="0" w:color="000000"/>
+              <w:top w:val="single" w:color="000000" w:sz="4" w:space="0"/>
+              <w:left w:val="single" w:color="000000" w:sz="4" w:space="0"/>
+              <w:bottom w:val="single" w:color="000000" w:sz="4" w:space="0"/>
+              <w:right w:val="single" w:color="000000" w:sz="4" w:space="0"/>
             </w:tcBorders>
             <w:vAlign w:val="center"/>
           </w:tcPr>
           <w:p>
             <w:pPr>
-              <w:pStyle w:val="Normal"/>
-              <w:spacing w:lineRule="exact" w:line="320"/>
+              <w:spacing w:line="320" w:lineRule="exact"/>
               <w:jc w:val="center"/>
               <w:rPr>
                 <w:rFonts w:ascii="宋体" w:hAnsi="宋体" w:eastAsia="宋体"/>
@@ -5039,7 +5119,7 @@
                 <w:rFonts w:ascii="宋体" w:hAnsi="宋体" w:eastAsia="宋体"/>
                 <w:sz w:val="24"/>
               </w:rPr>
-              <w:t xml:space="preserve">扩展不变量集合到 BTI / PAC、Shadow Stack、CFI 等机制，丰富预言机框架的静态与动态检查器</w:t>
+              <w:t>扩展不变量集合到 BTI / PAC、Shadow Stack、CFI 等机制，丰富预言机框架的静态与动态检查器</w:t>
             </w:r>
           </w:p>
         </w:tc>
@@ -5047,52 +5127,52 @@
           <w:tcPr>
             <w:tcW w:w="2297" w:type="dxa"/>
             <w:tcBorders>
-              <w:top w:val="single" w:sz="4" w:space="0" w:color="000000"/>
-              <w:start w:val="single" w:sz="4" w:space="0" w:color="000000"/>
-              <w:bottom w:val="single" w:sz="4" w:space="0" w:color="000000"/>
-              <w:end w:val="single" w:sz="4" w:space="0" w:color="000000"/>
+              <w:top w:val="single" w:color="000000" w:sz="4" w:space="0"/>
+              <w:left w:val="single" w:color="000000" w:sz="4" w:space="0"/>
+              <w:bottom w:val="single" w:color="000000" w:sz="4" w:space="0"/>
+              <w:right w:val="single" w:color="000000" w:sz="4" w:space="0"/>
             </w:tcBorders>
             <w:vAlign w:val="center"/>
           </w:tcPr>
           <w:p>
             <w:pPr>
-              <w:pStyle w:val="Normal"/>
-              <w:spacing w:lineRule="exact" w:line="320"/>
+              <w:spacing w:line="320" w:lineRule="exact"/>
               <w:jc w:val="center"/>
               <w:rPr>
                 <w:rFonts w:ascii="宋体" w:hAnsi="宋体" w:eastAsia="宋体"/>
                 <w:sz w:val="24"/>
               </w:rPr>
             </w:pPr>
-            <w:r>
-              <w:rPr>
-                <w:rFonts w:ascii="宋体" w:hAnsi="宋体" w:eastAsia="宋体"/>
-                <w:sz w:val="24"/>
-              </w:rPr>
-              <w:t xml:space="preserve"/>
-            </w:r>
           </w:p>
         </w:tc>
       </w:tr>
       <w:tr>
+        <w:tblPrEx>
+          <w:tblCellMar>
+            <w:top w:w="0" w:type="dxa"/>
+            <w:left w:w="108" w:type="dxa"/>
+            <w:bottom w:w="0" w:type="dxa"/>
+            <w:right w:w="108" w:type="dxa"/>
+          </w:tblCellMar>
+        </w:tblPrEx>
         <w:trPr>
           <w:trHeight w:val="480" w:hRule="atLeast"/>
+          <w:jc w:val="center"/>
         </w:trPr>
         <w:tc>
           <w:tcPr>
             <w:tcW w:w="2077" w:type="dxa"/>
             <w:tcBorders>
-              <w:top w:val="single" w:sz="4" w:space="0" w:color="000000"/>
-              <w:start w:val="single" w:sz="4" w:space="0" w:color="000000"/>
-              <w:bottom w:val="single" w:sz="4" w:space="0" w:color="000000"/>
-              <w:end w:val="single" w:sz="4" w:space="0" w:color="000000"/>
+              <w:top w:val="single" w:color="000000" w:sz="4" w:space="0"/>
+              <w:left w:val="single" w:color="000000" w:sz="4" w:space="0"/>
+              <w:bottom w:val="single" w:color="000000" w:sz="4" w:space="0"/>
+              <w:right w:val="single" w:color="000000" w:sz="4" w:space="0"/>
             </w:tcBorders>
             <w:vAlign w:val="center"/>
           </w:tcPr>
           <w:p>
             <w:pPr>
-              <w:pStyle w:val="Normal"/>
-              <w:spacing w:lineRule="exact" w:line="320"/>
+              <w:spacing w:line="320" w:lineRule="exact"/>
               <w:jc w:val="center"/>
               <w:rPr>
                 <w:rFonts w:ascii="宋体" w:hAnsi="宋体" w:eastAsia="宋体"/>
@@ -5104,7 +5184,7 @@
                 <w:rFonts w:ascii="宋体" w:hAnsi="宋体" w:eastAsia="宋体"/>
                 <w:sz w:val="24"/>
               </w:rPr>
-              <w:t xml:space="preserve">2026.07-2026.09</w:t>
+              <w:t>2026.07-2026.09</w:t>
             </w:r>
           </w:p>
         </w:tc>
@@ -5112,17 +5192,16 @@
           <w:tcPr>
             <w:tcW w:w="5167" w:type="dxa"/>
             <w:tcBorders>
-              <w:top w:val="single" w:sz="4" w:space="0" w:color="000000"/>
-              <w:start w:val="single" w:sz="4" w:space="0" w:color="000000"/>
-              <w:bottom w:val="single" w:sz="4" w:space="0" w:color="000000"/>
-              <w:end w:val="single" w:sz="4" w:space="0" w:color="000000"/>
+              <w:top w:val="single" w:color="000000" w:sz="4" w:space="0"/>
+              <w:left w:val="single" w:color="000000" w:sz="4" w:space="0"/>
+              <w:bottom w:val="single" w:color="000000" w:sz="4" w:space="0"/>
+              <w:right w:val="single" w:color="000000" w:sz="4" w:space="0"/>
             </w:tcBorders>
             <w:vAlign w:val="center"/>
           </w:tcPr>
           <w:p>
             <w:pPr>
-              <w:pStyle w:val="Normal"/>
-              <w:spacing w:lineRule="exact" w:line="320"/>
+              <w:spacing w:line="320" w:lineRule="exact"/>
               <w:jc w:val="center"/>
               <w:rPr>
                 <w:rFonts w:ascii="宋体" w:hAnsi="宋体" w:eastAsia="宋体"/>
@@ -5134,7 +5213,7 @@
                 <w:rFonts w:ascii="宋体" w:hAnsi="宋体" w:eastAsia="宋体"/>
                 <w:sz w:val="24"/>
               </w:rPr>
-              <w:t xml:space="preserve">把编译器子系统、覆盖率适配层、flag profile 扩展到 LLVM 工具链，对齐跨架构 / 跨编译器实验框架</w:t>
+              <w:t>把编译器子系统、覆盖率适配层、flag profile 扩展到 LLVM 工具链，对齐跨架构 / 跨编译器实验框架</w:t>
             </w:r>
           </w:p>
         </w:tc>
@@ -5142,52 +5221,52 @@
           <w:tcPr>
             <w:tcW w:w="2297" w:type="dxa"/>
             <w:tcBorders>
-              <w:top w:val="single" w:sz="4" w:space="0" w:color="000000"/>
-              <w:start w:val="single" w:sz="4" w:space="0" w:color="000000"/>
-              <w:bottom w:val="single" w:sz="4" w:space="0" w:color="000000"/>
-              <w:end w:val="single" w:sz="4" w:space="0" w:color="000000"/>
+              <w:top w:val="single" w:color="000000" w:sz="4" w:space="0"/>
+              <w:left w:val="single" w:color="000000" w:sz="4" w:space="0"/>
+              <w:bottom w:val="single" w:color="000000" w:sz="4" w:space="0"/>
+              <w:right w:val="single" w:color="000000" w:sz="4" w:space="0"/>
             </w:tcBorders>
             <w:vAlign w:val="center"/>
           </w:tcPr>
           <w:p>
             <w:pPr>
-              <w:pStyle w:val="Normal"/>
-              <w:spacing w:lineRule="exact" w:line="320"/>
+              <w:spacing w:line="320" w:lineRule="exact"/>
               <w:jc w:val="center"/>
               <w:rPr>
                 <w:rFonts w:ascii="宋体" w:hAnsi="宋体" w:eastAsia="宋体"/>
                 <w:sz w:val="24"/>
               </w:rPr>
             </w:pPr>
-            <w:r>
-              <w:rPr>
-                <w:rFonts w:ascii="宋体" w:hAnsi="宋体" w:eastAsia="宋体"/>
-                <w:sz w:val="24"/>
-              </w:rPr>
-              <w:t xml:space="preserve"/>
-            </w:r>
           </w:p>
         </w:tc>
       </w:tr>
       <w:tr>
+        <w:tblPrEx>
+          <w:tblCellMar>
+            <w:top w:w="0" w:type="dxa"/>
+            <w:left w:w="108" w:type="dxa"/>
+            <w:bottom w:w="0" w:type="dxa"/>
+            <w:right w:w="108" w:type="dxa"/>
+          </w:tblCellMar>
+        </w:tblPrEx>
         <w:trPr>
           <w:trHeight w:val="480" w:hRule="atLeast"/>
+          <w:jc w:val="center"/>
         </w:trPr>
         <w:tc>
           <w:tcPr>
             <w:tcW w:w="2077" w:type="dxa"/>
             <w:tcBorders>
-              <w:top w:val="single" w:sz="4" w:space="0" w:color="000000"/>
-              <w:start w:val="single" w:sz="4" w:space="0" w:color="000000"/>
-              <w:bottom w:val="single" w:sz="4" w:space="0" w:color="000000"/>
-              <w:end w:val="single" w:sz="4" w:space="0" w:color="000000"/>
+              <w:top w:val="single" w:color="000000" w:sz="4" w:space="0"/>
+              <w:left w:val="single" w:color="000000" w:sz="4" w:space="0"/>
+              <w:bottom w:val="single" w:color="000000" w:sz="4" w:space="0"/>
+              <w:right w:val="single" w:color="000000" w:sz="4" w:space="0"/>
             </w:tcBorders>
             <w:vAlign w:val="center"/>
           </w:tcPr>
           <w:p>
             <w:pPr>
-              <w:pStyle w:val="Normal"/>
-              <w:spacing w:lineRule="exact" w:line="320"/>
+              <w:spacing w:line="320" w:lineRule="exact"/>
               <w:jc w:val="center"/>
               <w:rPr>
                 <w:rFonts w:ascii="宋体" w:hAnsi="宋体" w:eastAsia="宋体"/>
@@ -5199,7 +5278,7 @@
                 <w:rFonts w:ascii="宋体" w:hAnsi="宋体" w:eastAsia="宋体"/>
                 <w:sz w:val="24"/>
               </w:rPr>
-              <w:t xml:space="preserve">2026.09-2026.12</w:t>
+              <w:t>2026.09-2026.12</w:t>
             </w:r>
           </w:p>
         </w:tc>
@@ -5207,17 +5286,16 @@
           <w:tcPr>
             <w:tcW w:w="5167" w:type="dxa"/>
             <w:tcBorders>
-              <w:top w:val="single" w:sz="4" w:space="0" w:color="000000"/>
-              <w:start w:val="single" w:sz="4" w:space="0" w:color="000000"/>
-              <w:bottom w:val="single" w:sz="4" w:space="0" w:color="000000"/>
-              <w:end w:val="single" w:sz="4" w:space="0" w:color="000000"/>
+              <w:top w:val="single" w:color="000000" w:sz="4" w:space="0"/>
+              <w:left w:val="single" w:color="000000" w:sz="4" w:space="0"/>
+              <w:bottom w:val="single" w:color="000000" w:sz="4" w:space="0"/>
+              <w:right w:val="single" w:color="000000" w:sz="4" w:space="0"/>
             </w:tcBorders>
             <w:vAlign w:val="center"/>
           </w:tcPr>
           <w:p>
             <w:pPr>
-              <w:pStyle w:val="Normal"/>
-              <w:spacing w:lineRule="exact" w:line="320"/>
+              <w:spacing w:line="320" w:lineRule="exact"/>
               <w:jc w:val="center"/>
               <w:rPr>
                 <w:rFonts w:ascii="宋体" w:hAnsi="宋体" w:eastAsia="宋体"/>
@@ -5229,7 +5307,7 @@
                 <w:rFonts w:ascii="宋体" w:hAnsi="宋体" w:eastAsia="宋体"/>
                 <w:sz w:val="24"/>
               </w:rPr>
-              <w:t xml:space="preserve">在 GCC 与 LLVM 多版本、多 ISA 上完成全机制端到端实验，持续推进上游缺陷上报闭环</w:t>
+              <w:t>在 GCC 与 LLVM 多版本、多 ISA 上完成全机制端到端实验，持续推进上游缺陷上报闭环</w:t>
             </w:r>
           </w:p>
         </w:tc>
@@ -5237,52 +5315,52 @@
           <w:tcPr>
             <w:tcW w:w="2297" w:type="dxa"/>
             <w:tcBorders>
-              <w:top w:val="single" w:sz="4" w:space="0" w:color="000000"/>
-              <w:start w:val="single" w:sz="4" w:space="0" w:color="000000"/>
-              <w:bottom w:val="single" w:sz="4" w:space="0" w:color="000000"/>
-              <w:end w:val="single" w:sz="4" w:space="0" w:color="000000"/>
+              <w:top w:val="single" w:color="000000" w:sz="4" w:space="0"/>
+              <w:left w:val="single" w:color="000000" w:sz="4" w:space="0"/>
+              <w:bottom w:val="single" w:color="000000" w:sz="4" w:space="0"/>
+              <w:right w:val="single" w:color="000000" w:sz="4" w:space="0"/>
             </w:tcBorders>
             <w:vAlign w:val="center"/>
           </w:tcPr>
           <w:p>
             <w:pPr>
-              <w:pStyle w:val="Normal"/>
-              <w:spacing w:lineRule="exact" w:line="320"/>
+              <w:spacing w:line="320" w:lineRule="exact"/>
               <w:jc w:val="center"/>
               <w:rPr>
                 <w:rFonts w:ascii="宋体" w:hAnsi="宋体" w:eastAsia="宋体"/>
                 <w:sz w:val="24"/>
               </w:rPr>
             </w:pPr>
-            <w:r>
-              <w:rPr>
-                <w:rFonts w:ascii="宋体" w:hAnsi="宋体" w:eastAsia="宋体"/>
-                <w:sz w:val="24"/>
-              </w:rPr>
-              <w:t xml:space="preserve"/>
-            </w:r>
           </w:p>
         </w:tc>
       </w:tr>
       <w:tr>
+        <w:tblPrEx>
+          <w:tblCellMar>
+            <w:top w:w="0" w:type="dxa"/>
+            <w:left w:w="108" w:type="dxa"/>
+            <w:bottom w:w="0" w:type="dxa"/>
+            <w:right w:w="108" w:type="dxa"/>
+          </w:tblCellMar>
+        </w:tblPrEx>
         <w:trPr>
           <w:trHeight w:val="480" w:hRule="atLeast"/>
+          <w:jc w:val="center"/>
         </w:trPr>
         <w:tc>
           <w:tcPr>
             <w:tcW w:w="2077" w:type="dxa"/>
             <w:tcBorders>
-              <w:top w:val="single" w:sz="4" w:space="0" w:color="000000"/>
-              <w:start w:val="single" w:sz="4" w:space="0" w:color="000000"/>
-              <w:bottom w:val="single" w:sz="4" w:space="0" w:color="000000"/>
-              <w:end w:val="single" w:sz="4" w:space="0" w:color="000000"/>
+              <w:top w:val="single" w:color="000000" w:sz="4" w:space="0"/>
+              <w:left w:val="single" w:color="000000" w:sz="4" w:space="0"/>
+              <w:bottom w:val="single" w:color="000000" w:sz="4" w:space="0"/>
+              <w:right w:val="single" w:color="000000" w:sz="4" w:space="0"/>
             </w:tcBorders>
             <w:vAlign w:val="center"/>
           </w:tcPr>
           <w:p>
             <w:pPr>
-              <w:pStyle w:val="Normal"/>
-              <w:spacing w:lineRule="exact" w:line="320"/>
+              <w:spacing w:line="320" w:lineRule="exact"/>
               <w:jc w:val="center"/>
               <w:rPr>
                 <w:rFonts w:ascii="宋体" w:hAnsi="宋体" w:eastAsia="宋体"/>
@@ -5294,7 +5372,7 @@
                 <w:rFonts w:ascii="宋体" w:hAnsi="宋体" w:eastAsia="宋体"/>
                 <w:sz w:val="24"/>
               </w:rPr>
-              <w:t xml:space="preserve">2026.12-2027.02</w:t>
+              <w:t>2026.12-2027.02</w:t>
             </w:r>
           </w:p>
         </w:tc>
@@ -5302,17 +5380,16 @@
           <w:tcPr>
             <w:tcW w:w="5167" w:type="dxa"/>
             <w:tcBorders>
-              <w:top w:val="single" w:sz="4" w:space="0" w:color="000000"/>
-              <w:start w:val="single" w:sz="4" w:space="0" w:color="000000"/>
-              <w:bottom w:val="single" w:sz="4" w:space="0" w:color="000000"/>
-              <w:end w:val="single" w:sz="4" w:space="0" w:color="000000"/>
+              <w:top w:val="single" w:color="000000" w:sz="4" w:space="0"/>
+              <w:left w:val="single" w:color="000000" w:sz="4" w:space="0"/>
+              <w:bottom w:val="single" w:color="000000" w:sz="4" w:space="0"/>
+              <w:right w:val="single" w:color="000000" w:sz="4" w:space="0"/>
             </w:tcBorders>
             <w:vAlign w:val="center"/>
           </w:tcPr>
           <w:p>
             <w:pPr>
-              <w:pStyle w:val="Normal"/>
-              <w:spacing w:lineRule="exact" w:line="320"/>
+              <w:spacing w:line="320" w:lineRule="exact"/>
               <w:jc w:val="center"/>
               <w:rPr>
                 <w:rFonts w:ascii="宋体" w:hAnsi="宋体" w:eastAsia="宋体"/>
@@ -5324,7 +5401,7 @@
                 <w:rFonts w:ascii="宋体" w:hAnsi="宋体" w:eastAsia="宋体"/>
                 <w:sz w:val="24"/>
               </w:rPr>
-              <w:t xml:space="preserve">与 Csmith、YARPGen、GrayC、HLPFuzz 等基线方法做对照评测，量化覆盖率推进与缺陷发现上的相对优势</w:t>
+              <w:t>与 Csmith、YARPGen、GrayC、HLPFuzz 等基线方法做对照评测，量化覆盖率推进与缺陷发现上的相对优势</w:t>
             </w:r>
           </w:p>
         </w:tc>
@@ -5332,52 +5409,52 @@
           <w:tcPr>
             <w:tcW w:w="2297" w:type="dxa"/>
             <w:tcBorders>
-              <w:top w:val="single" w:sz="4" w:space="0" w:color="000000"/>
-              <w:start w:val="single" w:sz="4" w:space="0" w:color="000000"/>
-              <w:bottom w:val="single" w:sz="4" w:space="0" w:color="000000"/>
-              <w:end w:val="single" w:sz="4" w:space="0" w:color="000000"/>
+              <w:top w:val="single" w:color="000000" w:sz="4" w:space="0"/>
+              <w:left w:val="single" w:color="000000" w:sz="4" w:space="0"/>
+              <w:bottom w:val="single" w:color="000000" w:sz="4" w:space="0"/>
+              <w:right w:val="single" w:color="000000" w:sz="4" w:space="0"/>
             </w:tcBorders>
             <w:vAlign w:val="center"/>
           </w:tcPr>
           <w:p>
             <w:pPr>
-              <w:pStyle w:val="Normal"/>
-              <w:spacing w:lineRule="exact" w:line="320"/>
+              <w:spacing w:line="320" w:lineRule="exact"/>
               <w:jc w:val="center"/>
               <w:rPr>
                 <w:rFonts w:ascii="宋体" w:hAnsi="宋体" w:eastAsia="宋体"/>
                 <w:sz w:val="24"/>
               </w:rPr>
             </w:pPr>
-            <w:r>
-              <w:rPr>
-                <w:rFonts w:ascii="宋体" w:hAnsi="宋体" w:eastAsia="宋体"/>
-                <w:sz w:val="24"/>
-              </w:rPr>
-              <w:t xml:space="preserve"/>
-            </w:r>
           </w:p>
         </w:tc>
       </w:tr>
       <w:tr>
+        <w:tblPrEx>
+          <w:tblCellMar>
+            <w:top w:w="0" w:type="dxa"/>
+            <w:left w:w="108" w:type="dxa"/>
+            <w:bottom w:w="0" w:type="dxa"/>
+            <w:right w:w="108" w:type="dxa"/>
+          </w:tblCellMar>
+        </w:tblPrEx>
         <w:trPr>
           <w:trHeight w:val="480" w:hRule="atLeast"/>
+          <w:jc w:val="center"/>
         </w:trPr>
         <w:tc>
           <w:tcPr>
             <w:tcW w:w="2077" w:type="dxa"/>
             <w:tcBorders>
-              <w:top w:val="single" w:sz="4" w:space="0" w:color="000000"/>
-              <w:start w:val="single" w:sz="4" w:space="0" w:color="000000"/>
-              <w:bottom w:val="single" w:sz="4" w:space="0" w:color="000000"/>
-              <w:end w:val="single" w:sz="4" w:space="0" w:color="000000"/>
+              <w:top w:val="single" w:color="000000" w:sz="4" w:space="0"/>
+              <w:left w:val="single" w:color="000000" w:sz="4" w:space="0"/>
+              <w:bottom w:val="single" w:color="000000" w:sz="4" w:space="0"/>
+              <w:right w:val="single" w:color="000000" w:sz="4" w:space="0"/>
             </w:tcBorders>
             <w:vAlign w:val="center"/>
           </w:tcPr>
           <w:p>
             <w:pPr>
-              <w:pStyle w:val="Normal"/>
-              <w:spacing w:lineRule="exact" w:line="320"/>
+              <w:spacing w:line="320" w:lineRule="exact"/>
               <w:jc w:val="center"/>
               <w:rPr>
                 <w:rFonts w:ascii="宋体" w:hAnsi="宋体" w:eastAsia="宋体"/>
@@ -5389,7 +5466,7 @@
                 <w:rFonts w:ascii="宋体" w:hAnsi="宋体" w:eastAsia="宋体"/>
                 <w:sz w:val="24"/>
               </w:rPr>
-              <w:t xml:space="preserve">2027.02-2027.04</w:t>
+              <w:t>2027.02-2027.04</w:t>
             </w:r>
           </w:p>
         </w:tc>
@@ -5397,17 +5474,16 @@
           <w:tcPr>
             <w:tcW w:w="5167" w:type="dxa"/>
             <w:tcBorders>
-              <w:top w:val="single" w:sz="4" w:space="0" w:color="000000"/>
-              <w:start w:val="single" w:sz="4" w:space="0" w:color="000000"/>
-              <w:bottom w:val="single" w:sz="4" w:space="0" w:color="000000"/>
-              <w:end w:val="single" w:sz="4" w:space="0" w:color="000000"/>
+              <w:top w:val="single" w:color="000000" w:sz="4" w:space="0"/>
+              <w:left w:val="single" w:color="000000" w:sz="4" w:space="0"/>
+              <w:bottom w:val="single" w:color="000000" w:sz="4" w:space="0"/>
+              <w:right w:val="single" w:color="000000" w:sz="4" w:space="0"/>
             </w:tcBorders>
             <w:vAlign w:val="center"/>
           </w:tcPr>
           <w:p>
             <w:pPr>
-              <w:pStyle w:val="Normal"/>
-              <w:spacing w:lineRule="exact" w:line="320"/>
+              <w:spacing w:line="320" w:lineRule="exact"/>
               <w:jc w:val="center"/>
               <w:rPr>
                 <w:rFonts w:ascii="宋体" w:hAnsi="宋体" w:eastAsia="宋体"/>
@@ -5419,7 +5495,7 @@
                 <w:rFonts w:ascii="宋体" w:hAnsi="宋体" w:eastAsia="宋体"/>
                 <w:sz w:val="24"/>
               </w:rPr>
-              <w:t xml:space="preserve">整理实验数据与图表，完成学位论文初稿，准备会议 / 期刊投稿</w:t>
+              <w:t>整理实验数据与图表，完成学位论文初稿，准备会议 / 期刊投稿</w:t>
             </w:r>
           </w:p>
         </w:tc>
@@ -5427,52 +5503,52 @@
           <w:tcPr>
             <w:tcW w:w="2297" w:type="dxa"/>
             <w:tcBorders>
-              <w:top w:val="single" w:sz="4" w:space="0" w:color="000000"/>
-              <w:start w:val="single" w:sz="4" w:space="0" w:color="000000"/>
-              <w:bottom w:val="single" w:sz="4" w:space="0" w:color="000000"/>
-              <w:end w:val="single" w:sz="4" w:space="0" w:color="000000"/>
+              <w:top w:val="single" w:color="000000" w:sz="4" w:space="0"/>
+              <w:left w:val="single" w:color="000000" w:sz="4" w:space="0"/>
+              <w:bottom w:val="single" w:color="000000" w:sz="4" w:space="0"/>
+              <w:right w:val="single" w:color="000000" w:sz="4" w:space="0"/>
             </w:tcBorders>
             <w:vAlign w:val="center"/>
           </w:tcPr>
           <w:p>
             <w:pPr>
-              <w:pStyle w:val="Normal"/>
-              <w:spacing w:lineRule="exact" w:line="320"/>
+              <w:spacing w:line="320" w:lineRule="exact"/>
               <w:jc w:val="center"/>
               <w:rPr>
                 <w:rFonts w:ascii="宋体" w:hAnsi="宋体" w:eastAsia="宋体"/>
                 <w:sz w:val="24"/>
               </w:rPr>
             </w:pPr>
-            <w:r>
-              <w:rPr>
-                <w:rFonts w:ascii="宋体" w:hAnsi="宋体" w:eastAsia="宋体"/>
-                <w:sz w:val="24"/>
-              </w:rPr>
-              <w:t xml:space="preserve"/>
-            </w:r>
           </w:p>
         </w:tc>
       </w:tr>
       <w:tr>
+        <w:tblPrEx>
+          <w:tblCellMar>
+            <w:top w:w="0" w:type="dxa"/>
+            <w:left w:w="108" w:type="dxa"/>
+            <w:bottom w:w="0" w:type="dxa"/>
+            <w:right w:w="108" w:type="dxa"/>
+          </w:tblCellMar>
+        </w:tblPrEx>
         <w:trPr>
           <w:trHeight w:val="480" w:hRule="atLeast"/>
+          <w:jc w:val="center"/>
         </w:trPr>
         <w:tc>
           <w:tcPr>
             <w:tcW w:w="2077" w:type="dxa"/>
             <w:tcBorders>
-              <w:top w:val="single" w:sz="4" w:space="0" w:color="000000"/>
-              <w:start w:val="single" w:sz="4" w:space="0" w:color="000000"/>
-              <w:bottom w:val="single" w:sz="4" w:space="0" w:color="000000"/>
-              <w:end w:val="single" w:sz="4" w:space="0" w:color="000000"/>
+              <w:top w:val="single" w:color="000000" w:sz="4" w:space="0"/>
+              <w:left w:val="single" w:color="000000" w:sz="4" w:space="0"/>
+              <w:bottom w:val="single" w:color="000000" w:sz="4" w:space="0"/>
+              <w:right w:val="single" w:color="000000" w:sz="4" w:space="0"/>
             </w:tcBorders>
             <w:vAlign w:val="center"/>
           </w:tcPr>
           <w:p>
             <w:pPr>
-              <w:pStyle w:val="Normal"/>
-              <w:spacing w:lineRule="exact" w:line="320"/>
+              <w:spacing w:line="320" w:lineRule="exact"/>
               <w:jc w:val="center"/>
               <w:rPr>
                 <w:rFonts w:ascii="宋体" w:hAnsi="宋体" w:eastAsia="宋体"/>
@@ -5484,7 +5560,7 @@
                 <w:rFonts w:ascii="宋体" w:hAnsi="宋体" w:eastAsia="宋体"/>
                 <w:sz w:val="24"/>
               </w:rPr>
-              <w:t xml:space="preserve">2027.04-2027.06</w:t>
+              <w:t>2027.04-2027.06</w:t>
             </w:r>
           </w:p>
         </w:tc>
@@ -5492,17 +5568,16 @@
           <w:tcPr>
             <w:tcW w:w="5167" w:type="dxa"/>
             <w:tcBorders>
-              <w:top w:val="single" w:sz="4" w:space="0" w:color="000000"/>
-              <w:start w:val="single" w:sz="4" w:space="0" w:color="000000"/>
-              <w:bottom w:val="single" w:sz="4" w:space="0" w:color="000000"/>
-              <w:end w:val="single" w:sz="4" w:space="0" w:color="000000"/>
+              <w:top w:val="single" w:color="000000" w:sz="4" w:space="0"/>
+              <w:left w:val="single" w:color="000000" w:sz="4" w:space="0"/>
+              <w:bottom w:val="single" w:color="000000" w:sz="4" w:space="0"/>
+              <w:right w:val="single" w:color="000000" w:sz="4" w:space="0"/>
             </w:tcBorders>
             <w:vAlign w:val="center"/>
           </w:tcPr>
           <w:p>
             <w:pPr>
-              <w:pStyle w:val="Normal"/>
-              <w:spacing w:lineRule="exact" w:line="320"/>
+              <w:spacing w:line="320" w:lineRule="exact"/>
               <w:jc w:val="center"/>
               <w:rPr>
                 <w:rFonts w:ascii="宋体" w:hAnsi="宋体" w:eastAsia="宋体"/>
@@ -5514,7 +5589,7 @@
                 <w:rFonts w:ascii="宋体" w:hAnsi="宋体" w:eastAsia="宋体"/>
                 <w:sz w:val="24"/>
               </w:rPr>
-              <w:t xml:space="preserve">学位论文修订、外审反馈处理、答辩材料准备</w:t>
+              <w:t>学位论文修订、外审反馈处理、答辩材料准备</w:t>
             </w:r>
           </w:p>
         </w:tc>
@@ -5522,52 +5597,52 @@
           <w:tcPr>
             <w:tcW w:w="2297" w:type="dxa"/>
             <w:tcBorders>
-              <w:top w:val="single" w:sz="4" w:space="0" w:color="000000"/>
-              <w:start w:val="single" w:sz="4" w:space="0" w:color="000000"/>
-              <w:bottom w:val="single" w:sz="4" w:space="0" w:color="000000"/>
-              <w:end w:val="single" w:sz="4" w:space="0" w:color="000000"/>
+              <w:top w:val="single" w:color="000000" w:sz="4" w:space="0"/>
+              <w:left w:val="single" w:color="000000" w:sz="4" w:space="0"/>
+              <w:bottom w:val="single" w:color="000000" w:sz="4" w:space="0"/>
+              <w:right w:val="single" w:color="000000" w:sz="4" w:space="0"/>
             </w:tcBorders>
             <w:vAlign w:val="center"/>
           </w:tcPr>
           <w:p>
             <w:pPr>
-              <w:pStyle w:val="Normal"/>
-              <w:spacing w:lineRule="exact" w:line="320"/>
+              <w:spacing w:line="320" w:lineRule="exact"/>
               <w:jc w:val="center"/>
               <w:rPr>
                 <w:rFonts w:ascii="宋体" w:hAnsi="宋体" w:eastAsia="宋体"/>
                 <w:sz w:val="24"/>
               </w:rPr>
             </w:pPr>
-            <w:r>
-              <w:rPr>
-                <w:rFonts w:ascii="宋体" w:hAnsi="宋体" w:eastAsia="宋体"/>
-                <w:sz w:val="24"/>
-              </w:rPr>
-              <w:t xml:space="preserve"/>
-            </w:r>
           </w:p>
         </w:tc>
       </w:tr>
       <w:tr>
+        <w:tblPrEx>
+          <w:tblCellMar>
+            <w:top w:w="0" w:type="dxa"/>
+            <w:left w:w="108" w:type="dxa"/>
+            <w:bottom w:w="0" w:type="dxa"/>
+            <w:right w:w="108" w:type="dxa"/>
+          </w:tblCellMar>
+        </w:tblPrEx>
         <w:trPr>
           <w:trHeight w:val="480" w:hRule="atLeast"/>
+          <w:jc w:val="center"/>
         </w:trPr>
         <w:tc>
           <w:tcPr>
             <w:tcW w:w="2077" w:type="dxa"/>
             <w:tcBorders>
-              <w:top w:val="single" w:sz="4" w:space="0" w:color="000000"/>
-              <w:start w:val="single" w:sz="4" w:space="0" w:color="000000"/>
-              <w:bottom w:val="single" w:sz="4" w:space="0" w:color="000000"/>
-              <w:end w:val="single" w:sz="4" w:space="0" w:color="000000"/>
+              <w:top w:val="single" w:color="000000" w:sz="4" w:space="0"/>
+              <w:left w:val="single" w:color="000000" w:sz="4" w:space="0"/>
+              <w:bottom w:val="single" w:color="000000" w:sz="4" w:space="0"/>
+              <w:right w:val="single" w:color="000000" w:sz="4" w:space="0"/>
             </w:tcBorders>
             <w:vAlign w:val="center"/>
           </w:tcPr>
           <w:p>
             <w:pPr>
-              <w:pStyle w:val="Normal"/>
-              <w:spacing w:lineRule="exact" w:line="320"/>
+              <w:spacing w:line="320" w:lineRule="exact"/>
               <w:jc w:val="center"/>
               <w:rPr>
                 <w:rFonts w:ascii="宋体" w:hAnsi="宋体" w:eastAsia="宋体"/>
@@ -5579,7 +5654,7 @@
                 <w:rFonts w:ascii="宋体" w:hAnsi="宋体" w:eastAsia="宋体"/>
                 <w:sz w:val="24"/>
               </w:rPr>
-              <w:t xml:space="preserve">2027.06</w:t>
+              <w:t>2027.06</w:t>
             </w:r>
           </w:p>
         </w:tc>
@@ -5587,17 +5662,16 @@
           <w:tcPr>
             <w:tcW w:w="5167" w:type="dxa"/>
             <w:tcBorders>
-              <w:top w:val="single" w:sz="4" w:space="0" w:color="000000"/>
-              <w:start w:val="single" w:sz="4" w:space="0" w:color="000000"/>
-              <w:bottom w:val="single" w:sz="4" w:space="0" w:color="000000"/>
-              <w:end w:val="single" w:sz="4" w:space="0" w:color="000000"/>
+              <w:top w:val="single" w:color="000000" w:sz="4" w:space="0"/>
+              <w:left w:val="single" w:color="000000" w:sz="4" w:space="0"/>
+              <w:bottom w:val="single" w:color="000000" w:sz="4" w:space="0"/>
+              <w:right w:val="single" w:color="000000" w:sz="4" w:space="0"/>
             </w:tcBorders>
             <w:vAlign w:val="center"/>
           </w:tcPr>
           <w:p>
             <w:pPr>
-              <w:pStyle w:val="Normal"/>
-              <w:spacing w:lineRule="exact" w:line="320"/>
+              <w:spacing w:line="320" w:lineRule="exact"/>
               <w:jc w:val="center"/>
               <w:rPr>
                 <w:rFonts w:ascii="宋体" w:hAnsi="宋体" w:eastAsia="宋体"/>
@@ -5609,7 +5683,7 @@
                 <w:rFonts w:ascii="宋体" w:hAnsi="宋体" w:eastAsia="宋体"/>
                 <w:sz w:val="24"/>
               </w:rPr>
-              <w:t xml:space="preserve">学位论文答辩</w:t>
+              <w:t>学位论文答辩</w:t>
             </w:r>
           </w:p>
         </w:tc>
@@ -5617,30 +5691,22 @@
           <w:tcPr>
             <w:tcW w:w="2297" w:type="dxa"/>
             <w:tcBorders>
-              <w:top w:val="single" w:sz="4" w:space="0" w:color="000000"/>
-              <w:start w:val="single" w:sz="4" w:space="0" w:color="000000"/>
-              <w:bottom w:val="single" w:sz="4" w:space="0" w:color="000000"/>
-              <w:end w:val="single" w:sz="4" w:space="0" w:color="000000"/>
+              <w:top w:val="single" w:color="000000" w:sz="4" w:space="0"/>
+              <w:left w:val="single" w:color="000000" w:sz="4" w:space="0"/>
+              <w:bottom w:val="single" w:color="000000" w:sz="4" w:space="0"/>
+              <w:right w:val="single" w:color="000000" w:sz="4" w:space="0"/>
             </w:tcBorders>
             <w:vAlign w:val="center"/>
           </w:tcPr>
           <w:p>
             <w:pPr>
-              <w:pStyle w:val="Normal"/>
-              <w:spacing w:lineRule="exact" w:line="320"/>
+              <w:spacing w:line="320" w:lineRule="exact"/>
               <w:jc w:val="center"/>
               <w:rPr>
                 <w:rFonts w:ascii="宋体" w:hAnsi="宋体" w:eastAsia="宋体"/>
                 <w:sz w:val="24"/>
               </w:rPr>
             </w:pPr>
-            <w:r>
-              <w:rPr>
-                <w:rFonts w:ascii="宋体" w:hAnsi="宋体" w:eastAsia="宋体"/>
-                <w:sz w:val="24"/>
-              </w:rPr>
-              <w:t xml:space="preserve"/>
-            </w:r>
           </w:p>
         </w:tc>
       </w:tr>
@@ -7277,7 +7343,7 @@
   <w:docDefaults>
     <w:rPrDefault>
       <w:rPr>
-        <w:rFonts w:ascii="Liberation Serif" w:hAnsi="Liberation Serif" w:eastAsia="Source Han Serif CN" w:cs="Noto Sans Devanagari"/>
+        <w:rFonts w:ascii="Times New Roman" w:hAnsi="Times New Roman" w:eastAsia="宋体" w:cs="Times New Roman"/>
       </w:rPr>
     </w:rPrDefault>
     <w:pPrDefault/>
@@ -7314,7 +7380,7 @@
     <w:lsdException w:unhideWhenUsed="0" w:uiPriority="0" w:semiHidden="0" w:name="Normal Indent"/>
     <w:lsdException w:unhideWhenUsed="0" w:uiPriority="0" w:semiHidden="0" w:name="footnote text"/>
     <w:lsdException w:unhideWhenUsed="0" w:uiPriority="0" w:semiHidden="0" w:name="annotation text"/>
-    <w:lsdException w:unhideWhenUsed="0" w:uiPriority="0" w:semiHidden="0" w:name="header"/>
+    <w:lsdException w:qFormat="1" w:unhideWhenUsed="0" w:uiPriority="0" w:semiHidden="0" w:name="header"/>
     <w:lsdException w:unhideWhenUsed="0" w:uiPriority="0" w:semiHidden="0" w:name="footer"/>
     <w:lsdException w:unhideWhenUsed="0" w:uiPriority="0" w:semiHidden="0" w:name="index heading"/>
     <w:lsdException w:qFormat="1" w:unhideWhenUsed="0" w:uiPriority="0" w:semiHidden="0" w:name="caption"/>
@@ -7324,13 +7390,13 @@
     <w:lsdException w:unhideWhenUsed="0" w:uiPriority="0" w:semiHidden="0" w:name="footnote reference"/>
     <w:lsdException w:unhideWhenUsed="0" w:uiPriority="0" w:semiHidden="0" w:name="annotation reference"/>
     <w:lsdException w:unhideWhenUsed="0" w:uiPriority="0" w:semiHidden="0" w:name="line number"/>
-    <w:lsdException w:unhideWhenUsed="0" w:uiPriority="0" w:semiHidden="0" w:name="page number"/>
+    <w:lsdException w:qFormat="1" w:unhideWhenUsed="0" w:uiPriority="0" w:semiHidden="0" w:name="page number"/>
     <w:lsdException w:unhideWhenUsed="0" w:uiPriority="0" w:semiHidden="0" w:name="endnote reference"/>
     <w:lsdException w:unhideWhenUsed="0" w:uiPriority="0" w:semiHidden="0" w:name="endnote text"/>
     <w:lsdException w:unhideWhenUsed="0" w:uiPriority="0" w:semiHidden="0" w:name="table of authorities"/>
     <w:lsdException w:unhideWhenUsed="0" w:uiPriority="0" w:semiHidden="0" w:name="macro"/>
     <w:lsdException w:unhideWhenUsed="0" w:uiPriority="0" w:semiHidden="0" w:name="toa heading"/>
-    <w:lsdException w:unhideWhenUsed="0" w:uiPriority="0" w:semiHidden="0" w:name="List"/>
+    <w:lsdException w:qFormat="1" w:unhideWhenUsed="0" w:uiPriority="0" w:semiHidden="0" w:name="List"/>
     <w:lsdException w:unhideWhenUsed="0" w:uiPriority="0" w:semiHidden="0" w:name="List Bullet"/>
     <w:lsdException w:unhideWhenUsed="0" w:uiPriority="0" w:semiHidden="0" w:name="List Number"/>
     <w:lsdException w:unhideWhenUsed="0" w:uiPriority="0" w:semiHidden="0" w:name="List 2"/>
@@ -7368,7 +7434,7 @@
     <w:lsdException w:unhideWhenUsed="0" w:uiPriority="0" w:semiHidden="0" w:name="Body Text Indent 2"/>
     <w:lsdException w:unhideWhenUsed="0" w:uiPriority="0" w:semiHidden="0" w:name="Body Text Indent 3"/>
     <w:lsdException w:unhideWhenUsed="0" w:uiPriority="0" w:semiHidden="0" w:name="Block Text"/>
-    <w:lsdException w:unhideWhenUsed="0" w:uiPriority="0" w:semiHidden="0" w:name="Hyperlink"/>
+    <w:lsdException w:qFormat="1" w:unhideWhenUsed="0" w:uiPriority="0" w:semiHidden="0" w:name="Hyperlink"/>
     <w:lsdException w:unhideWhenUsed="0" w:uiPriority="0" w:semiHidden="0" w:name="FollowedHyperlink"/>
     <w:lsdException w:qFormat="1" w:unhideWhenUsed="0" w:uiPriority="0" w:semiHidden="0" w:name="Strong"/>
     <w:lsdException w:qFormat="1" w:unhideWhenUsed="0" w:uiPriority="0" w:semiHidden="0" w:name="Emphasis"/>
@@ -7386,7 +7452,7 @@
     <w:lsdException w:unhideWhenUsed="0" w:uiPriority="0" w:semiHidden="0" w:name="HTML Sample"/>
     <w:lsdException w:unhideWhenUsed="0" w:uiPriority="0" w:semiHidden="0" w:name="HTML Typewriter"/>
     <w:lsdException w:unhideWhenUsed="0" w:uiPriority="0" w:semiHidden="0" w:name="HTML Variable"/>
-    <w:lsdException w:unhideWhenUsed="0" w:uiPriority="0" w:name="Normal Table"/>
+    <w:lsdException w:qFormat="1" w:unhideWhenUsed="0" w:uiPriority="0" w:name="Normal Table"/>
     <w:lsdException w:unhideWhenUsed="0" w:uiPriority="0" w:semiHidden="0" w:name="annotation subject"/>
     <w:lsdException w:unhideWhenUsed="0" w:uiPriority="0" w:semiHidden="0" w:name="Table Simple 1"/>
     <w:lsdException w:unhideWhenUsed="0" w:uiPriority="0" w:semiHidden="0" w:name="Table Simple 2"/>
@@ -7584,6 +7650,7 @@
   <w:style w:type="table" w:default="1" w:styleId="9">
     <w:name w:val="Normal Table"/>
     <w:semiHidden/>
+    <w:qFormat/>
     <w:uiPriority w:val="0"/>
     <w:tblPr>
       <w:tblCellMar>
@@ -7644,6 +7711,7 @@
   <w:style w:type="paragraph" w:styleId="6">
     <w:name w:val="header"/>
     <w:basedOn w:val="1"/>
+    <w:qFormat/>
     <w:uiPriority w:val="0"/>
     <w:pPr>
       <w:pBdr>
@@ -7664,6 +7732,7 @@
   <w:style w:type="paragraph" w:styleId="7">
     <w:name w:val="List"/>
     <w:basedOn w:val="3"/>
+    <w:qFormat/>
     <w:uiPriority w:val="0"/>
     <w:rPr>
       <w:rFonts w:cs="Noto Sans Devanagari"/>
@@ -7697,10 +7766,12 @@
   <w:style w:type="character" w:styleId="12">
     <w:name w:val="page number"/>
     <w:basedOn w:val="10"/>
+    <w:qFormat/>
     <w:uiPriority w:val="0"/>
   </w:style>
   <w:style w:type="character" w:styleId="13">
     <w:name w:val="Hyperlink"/>
+    <w:qFormat/>
     <w:uiPriority w:val="0"/>
     <w:rPr>
       <w:color w:val="0000FF"/>

</xml_diff>

<commit_message>
update(开题答辩): refine defense deck and sync report exports
</commit_message>
<xml_diff>
--- a/docs/开题报告/DeFuzz-开题报告.docx
+++ b/docs/开题报告/DeFuzz-开题报告.docx
@@ -250,15 +250,6 @@
           <w:u w:val="single"/>
         </w:rPr>
         <w:tab/>
-      </w:r>
-      <w:r>
-        <w:rPr>
-          <w:rFonts w:hint="eastAsia" w:ascii="宋体" w:hAnsi="宋体"/>
-          <w:spacing w:val="40"/>
-          <w:kern w:val="2"/>
-          <w:sz w:val="28"/>
-          <w:u w:val="single"/>
-        </w:rPr>
         <w:tab/>
       </w:r>
       <w:r>
@@ -292,25 +283,7 @@
           <w:u w:val="single"/>
         </w:rPr>
         <w:tab/>
-      </w:r>
-      <w:r>
-        <w:rPr>
-          <w:rFonts w:hint="eastAsia" w:ascii="宋体" w:hAnsi="宋体"/>
-          <w:spacing w:val="40"/>
-          <w:kern w:val="2"/>
-          <w:sz w:val="28"/>
-          <w:u w:val="single"/>
-        </w:rPr>
         <w:tab/>
-      </w:r>
-      <w:r>
-        <w:rPr>
-          <w:rFonts w:hint="eastAsia" w:ascii="宋体" w:hAnsi="宋体"/>
-          <w:spacing w:val="40"/>
-          <w:kern w:val="2"/>
-          <w:sz w:val="28"/>
-          <w:u w:val="single"/>
-        </w:rPr>
         <w:tab/>
       </w:r>
       <w:r>
@@ -442,45 +415,9 @@
           <w:u w:val="single"/>
         </w:rPr>
         <w:tab/>
-      </w:r>
-      <w:r>
-        <w:rPr>
-          <w:rFonts w:hint="eastAsia" w:ascii="宋体" w:hAnsi="宋体"/>
-          <w:spacing w:val="40"/>
-          <w:kern w:val="2"/>
-          <w:sz w:val="28"/>
-          <w:u w:val="single"/>
-        </w:rPr>
         <w:tab/>
-      </w:r>
-      <w:r>
-        <w:rPr>
-          <w:rFonts w:hint="eastAsia" w:ascii="宋体" w:hAnsi="宋体"/>
-          <w:spacing w:val="40"/>
-          <w:kern w:val="2"/>
-          <w:sz w:val="28"/>
-          <w:u w:val="single"/>
-        </w:rPr>
         <w:t>电子信息</w:t>
-      </w:r>
-      <w:r>
-        <w:rPr>
-          <w:rFonts w:hint="eastAsia" w:ascii="宋体" w:hAnsi="宋体"/>
-          <w:spacing w:val="40"/>
-          <w:kern w:val="2"/>
-          <w:sz w:val="28"/>
-          <w:u w:val="single"/>
-        </w:rPr>
         <w:tab/>
-      </w:r>
-      <w:r>
-        <w:rPr>
-          <w:rFonts w:hint="eastAsia" w:ascii="宋体" w:hAnsi="宋体"/>
-          <w:spacing w:val="40"/>
-          <w:kern w:val="2"/>
-          <w:sz w:val="28"/>
-          <w:u w:val="single"/>
-        </w:rPr>
         <w:tab/>
       </w:r>
     </w:p>
@@ -540,15 +477,6 @@
           <w:u w:val="single"/>
         </w:rPr>
         <w:tab/>
-      </w:r>
-      <w:r>
-        <w:rPr>
-          <w:rFonts w:hint="eastAsia" w:ascii="宋体" w:hAnsi="宋体"/>
-          <w:spacing w:val="40"/>
-          <w:kern w:val="2"/>
-          <w:sz w:val="28"/>
-          <w:u w:val="single"/>
-        </w:rPr>
         <w:tab/>
       </w:r>
       <w:r>
@@ -584,6 +512,8 @@
         </w:rPr>
         <w:t xml:space="preserve">  </w:t>
       </w:r>
+      <w:bookmarkStart w:id="0" w:name="_GoBack"/>
+      <w:bookmarkEnd w:id="0"/>
       <w:r>
         <w:rPr>
           <w:rFonts w:hint="eastAsia" w:ascii="宋体" w:hAnsi="宋体"/>
@@ -593,15 +523,6 @@
           <w:u w:val="single"/>
         </w:rPr>
         <w:tab/>
-      </w:r>
-      <w:r>
-        <w:rPr>
-          <w:rFonts w:hint="eastAsia" w:ascii="宋体" w:hAnsi="宋体"/>
-          <w:spacing w:val="40"/>
-          <w:kern w:val="2"/>
-          <w:sz w:val="28"/>
-          <w:u w:val="single"/>
-        </w:rPr>
         <w:tab/>
       </w:r>
       <w:r>
@@ -662,15 +583,6 @@
           <w:u w:val="single"/>
         </w:rPr>
         <w:tab/>
-      </w:r>
-      <w:r>
-        <w:rPr>
-          <w:rFonts w:hint="eastAsia" w:ascii="宋体" w:hAnsi="宋体"/>
-          <w:spacing w:val="40"/>
-          <w:kern w:val="2"/>
-          <w:sz w:val="28"/>
-          <w:u w:val="single"/>
-        </w:rPr>
         <w:tab/>
       </w:r>
       <w:r>
@@ -715,15 +627,6 @@
           <w:u w:val="single"/>
         </w:rPr>
         <w:tab/>
-      </w:r>
-      <w:r>
-        <w:rPr>
-          <w:rFonts w:hint="eastAsia" w:ascii="宋体" w:hAnsi="宋体"/>
-          <w:spacing w:val="40"/>
-          <w:kern w:val="2"/>
-          <w:sz w:val="28"/>
-          <w:u w:val="single"/>
-        </w:rPr>
         <w:tab/>
       </w:r>
       <w:r>
@@ -782,15 +685,6 @@
           <w:u w:val="single"/>
         </w:rPr>
         <w:tab/>
-      </w:r>
-      <w:r>
-        <w:rPr>
-          <w:rFonts w:hint="eastAsia" w:ascii="宋体" w:hAnsi="宋体"/>
-          <w:spacing w:val="40"/>
-          <w:kern w:val="2"/>
-          <w:sz w:val="28"/>
-          <w:u w:val="single"/>
-        </w:rPr>
         <w:tab/>
       </w:r>
       <w:r>
@@ -897,21 +791,7 @@
           <w:u w:val="single"/>
         </w:rPr>
         <w:tab/>
-      </w:r>
-      <w:r>
-        <w:rPr>
-          <w:rFonts w:hint="eastAsia" w:ascii="宋体" w:hAnsi="宋体"/>
-          <w:sz w:val="28"/>
-          <w:u w:val="single"/>
-        </w:rPr>
         <w:tab/>
-      </w:r>
-      <w:r>
-        <w:rPr>
-          <w:rFonts w:hint="eastAsia" w:ascii="宋体" w:hAnsi="宋体"/>
-          <w:sz w:val="28"/>
-          <w:u w:val="single"/>
-        </w:rPr>
         <w:tab/>
       </w:r>
       <w:r>
@@ -938,13 +818,6 @@
           <w:u w:val="single"/>
         </w:rPr>
         <w:tab/>
-      </w:r>
-      <w:r>
-        <w:rPr>
-          <w:rFonts w:hint="eastAsia" w:ascii="宋体" w:hAnsi="宋体"/>
-          <w:sz w:val="28"/>
-          <w:u w:val="single"/>
-        </w:rPr>
         <w:tab/>
       </w:r>
       <w:r>
@@ -2471,8 +2344,9 @@
           </w:p>
           <w:p>
             <w:pPr>
+              <w:pStyle w:val="Normal"/>
               <w:widowControl/>
-              <w:jc w:val="left"/>
+              <w:jc w:val="start"/>
               <w:rPr>
                 <w:b/>
                 <w:bCs/>
@@ -2492,7 +2366,8 @@
           </w:p>
           <w:p>
             <w:pPr>
-              <w:spacing w:line="360" w:lineRule="auto"/>
+              <w:pStyle w:val="Normal"/>
+              <w:spacing w:lineRule="auto" w:line="360"/>
               <w:rPr>
                 <w:b/>
                 <w:bCs/>
@@ -2512,102 +2387,62 @@
           </w:p>
           <w:p>
             <w:pPr>
-              <w:spacing w:line="360" w:lineRule="auto"/>
-              <w:ind w:left="0" w:leftChars="0" w:right="0" w:rightChars="0" w:firstLineChars="200"/>
-              <w:rPr>
-                <w:kern w:val="0"/>
-                <w:sz w:val="24"/>
-              </w:rPr>
-            </w:pPr>
-            <w:r>
-              <w:rPr>
-                <w:kern w:val="0"/>
-                <w:sz w:val="24"/>
-              </w:rPr>
-              <w:t>近十年来，被公开披露的安全漏洞数量持续攀升。截至 2025 年，CVE 漏洞库每年新登记的条目稳定在两万条以上，且仍在快速增长[1]。Microsoft、Google 等厂商陆续公开承认，仅依靠人工审计与安全编程规范并不足以彻底清除上层代码中的内存安全 Bug[2][3]。因此，</w:t>
-            </w:r>
-            <w:r>
-              <w:rPr>
-                <w:rFonts w:hint="eastAsia"/>
-                <w:kern w:val="0"/>
-                <w:sz w:val="24"/>
-              </w:rPr>
-              <w:t>漏洞触发后的拦截与防御</w:t>
-            </w:r>
-            <w:r>
-              <w:rPr>
-                <w:rFonts w:hint="eastAsia"/>
-                <w:kern w:val="0"/>
-                <w:sz w:val="24"/>
-                <w:lang w:eastAsia="zh-CN"/>
-              </w:rPr>
-              <w:t>变得越发</w:t>
-            </w:r>
-            <w:r>
-              <w:rPr>
-                <w:rFonts w:hint="eastAsia"/>
-                <w:kern w:val="0"/>
-                <w:sz w:val="24"/>
-              </w:rPr>
-              <w:t>重要</w:t>
-            </w:r>
-            <w:r>
-              <w:rPr>
-                <w:kern w:val="0"/>
-                <w:sz w:val="24"/>
-              </w:rPr>
-              <w:t>：栈金丝雀（stack canary）、源代码加固（_FORTIFY_SOURCE）、间接跳转跟踪（IBT）、控制流完整性（CFI）等多项防御机制由编译器与运行时共同叠加部署，在漏洞触发时承担起兜底防线的角色。</w:t>
-            </w:r>
-          </w:p>
-          <w:p>
-            <w:pPr>
-              <w:spacing w:line="360" w:lineRule="auto"/>
-              <w:ind w:left="0" w:leftChars="0" w:right="0" w:rightChars="0" w:firstLineChars="200"/>
-              <w:rPr>
-                <w:kern w:val="0"/>
-                <w:sz w:val="24"/>
-              </w:rPr>
-            </w:pPr>
-            <w:r>
-              <w:rPr>
-                <w:kern w:val="0"/>
-                <w:sz w:val="24"/>
-              </w:rPr>
-              <w:t>由编译器承担的防御机制有一个共同的工作模式：在编译期向二进制中插入检查指令、布局约束或元数据，使运行期一旦偏离预定义的合法行为即可被发现并立即终止程序。以栈金丝雀为例，编译器在易受溢出影响的栈帧中，在函数返回地址和缓冲区之间插入随机值哨兵，并在函数返回前比对其是否被改写。</w:t>
-            </w:r>
-          </w:p>
-          <w:p>
-            <w:pPr>
-              <w:spacing w:line="360" w:lineRule="auto"/>
-              <w:ind w:left="0" w:leftChars="0" w:right="0" w:rightChars="0" w:firstLineChars="200"/>
-              <w:rPr>
-                <w:kern w:val="0"/>
-                <w:sz w:val="24"/>
-              </w:rPr>
-            </w:pPr>
-            <w:r>
-              <w:rPr>
-                <w:rFonts w:hint="eastAsia"/>
-                <w:kern w:val="0"/>
-                <w:sz w:val="24"/>
-                <w:lang w:eastAsia="zh-CN"/>
-              </w:rPr>
-              <w:t>然而，防御机制自身也是由代码实现，其也会有实现漏洞。且</w:t>
-            </w:r>
-            <w:bookmarkStart w:id="0" w:name="_GoBack"/>
-            <w:bookmarkEnd w:id="0"/>
-            <w:r>
-              <w:rPr>
-                <w:rFonts w:hint="eastAsia"/>
-                <w:kern w:val="0"/>
-                <w:sz w:val="24"/>
-              </w:rPr>
-              <w:t>防御机制的有效性不仅依赖代码实现的正确性，更与底层的指令集架构（instruction set architecture, ISA）紧密相关。在当前 ISA 种类不断增多的背景下，跨架构的攻击面显著扩大，保证编译器防御实现的严谨性变得更加关键。</w:t>
-            </w:r>
-          </w:p>
-          <w:p>
-            <w:pPr>
-              <w:spacing w:line="360" w:lineRule="auto"/>
+              <w:pStyle w:val="Normal"/>
+              <w:spacing w:lineRule="auto" w:line="360"/>
+              <w:ind w:firstLineChars="200" w:startChars="0" w:start="0" w:endChars="0" w:end="0"/>
+              <w:rPr>
+                <w:kern w:val="0"/>
+                <w:sz w:val="24"/>
+              </w:rPr>
+            </w:pPr>
+            <w:r>
+              <w:rPr>
+                <w:kern w:val="0"/>
+                <w:sz w:val="24"/>
+              </w:rPr>
+              <w:t xml:space="preserve">近十年来，被公开披露的安全漏洞数量持续攀升。截至 2025 年，CVE 漏洞库每年新登记的条目稳定在两万条以上，且仍在快速增长[1]。Microsoft、Google 等厂商陆续公开承认，仅依靠人工审计与安全编程规范并不足以彻底清除上层代码中的内存安全 Bug[2][3]。因此，漏洞触发后的拦截与防御变得越发重要：栈金丝雀（stack canary）、源代码加固（_FORTIFY_SOURCE）、间接跳转跟踪（IBT）、控制流完整性（CFI）等多项防御机制由编译器与运行时共同叠加部署，在漏洞触发时承担起兜底防线的角色。</w:t>
+            </w:r>
+          </w:p>
+          <w:p>
+            <w:pPr>
+              <w:pStyle w:val="Normal"/>
+              <w:spacing w:lineRule="auto" w:line="360"/>
+              <w:ind w:firstLineChars="200" w:startChars="0" w:start="0" w:endChars="0" w:end="0"/>
+              <w:rPr>
+                <w:kern w:val="0"/>
+                <w:sz w:val="24"/>
+              </w:rPr>
+            </w:pPr>
+            <w:r>
+              <w:rPr>
+                <w:kern w:val="0"/>
+                <w:sz w:val="24"/>
+              </w:rPr>
+              <w:t xml:space="preserve">由编译器承担的防御机制有一个共同的工作模式：在编译期向二进制中插入检查指令、布局约束或元数据，使运行期一旦偏离预定义的合法行为即可被发现并立即终止程序。以栈金丝雀为例，编译器在易受溢出影响的栈帧中，在函数返回地址和缓冲区之间插入随机值哨兵，并在函数返回前比对其是否被改写。</w:t>
+            </w:r>
+          </w:p>
+          <w:p>
+            <w:pPr>
+              <w:pStyle w:val="Normal"/>
+              <w:spacing w:lineRule="auto" w:line="360"/>
+              <w:ind w:firstLineChars="200" w:startChars="0" w:start="0" w:endChars="0" w:end="0"/>
+              <w:rPr>
+                <w:kern w:val="0"/>
+                <w:sz w:val="24"/>
+              </w:rPr>
+            </w:pPr>
+            <w:r>
+              <w:rPr>
+                <w:kern w:val="0"/>
+                <w:sz w:val="24"/>
+              </w:rPr>
+              <w:t xml:space="preserve">然而，防御机制自身也是由代码实现，其也会有实现漏洞。且防御机制的有效性不仅依赖代码实现的正确性，更与底层的指令集架构（instruction set architecture, ISA）紧密相关。在当前 ISA 种类不断增多的背景下，跨架构的攻击面显著扩大，保证编译器防御实现的严谨性变得更加关键。</w:t>
+            </w:r>
+          </w:p>
+          <w:p>
+            <w:pPr>
+              <w:pStyle w:val="Normal"/>
+              <w:spacing w:lineRule="auto" w:line="360"/>
               <w:rPr>
                 <w:b/>
                 <w:bCs/>
@@ -2627,30 +2462,33 @@
           </w:p>
           <w:p>
             <w:pPr>
-              <w:spacing w:line="360" w:lineRule="auto"/>
-              <w:ind w:left="0" w:leftChars="0" w:right="0" w:rightChars="0" w:firstLineChars="200"/>
-              <w:rPr>
-                <w:kern w:val="0"/>
-                <w:sz w:val="24"/>
-              </w:rPr>
-            </w:pPr>
-            <w:r>
-              <w:rPr>
-                <w:kern w:val="0"/>
-                <w:sz w:val="24"/>
-              </w:rPr>
-              <w:t>2023 年披露的 CVE-2023-4039[4] 是一个具有代表性的案例。GCC 在 AArch64 上的 -fstack-protector 选项长期失效：当函数使用变长数组（variable-length array, VLA）或 alloca 时，编译器把栈金丝雀放在 VLA 之上、保存的返回地址却落在栈金丝雀之下，越界写入会先于金丝雀检查改写返回地址，本应兜底的保护因此被绕过。该漏洞在 GCC 早期版本即已存在，直到 2023 年才由外部研究者系统分析并修复。这种 buggy 状态下的栈帧布局如下图 1 所示。</w:t>
-            </w:r>
-          </w:p>
-          <w:p>
-            <w:pPr>
-              <w:spacing w:line="360" w:lineRule="auto"/>
-              <w:jc w:val="center"/>
-            </w:pPr>
-            <w:r>
+              <w:pStyle w:val="Normal"/>
+              <w:spacing w:lineRule="auto" w:line="360"/>
+              <w:ind w:firstLineChars="200" w:startChars="0" w:start="0" w:endChars="0" w:end="0"/>
+              <w:rPr>
+                <w:kern w:val="0"/>
+                <w:sz w:val="24"/>
+              </w:rPr>
+            </w:pPr>
+            <w:r>
+              <w:rPr>
+                <w:kern w:val="0"/>
+                <w:sz w:val="24"/>
+              </w:rPr>
+              <w:t xml:space="preserve">2023 年披露的 CVE-2023-4039[4] 是一个具有代表性的案例。GCC 在 AArch64 上的 -fstack-protector 选项长期失效：当函数使用变长数组（variable-length array, VLA）或 alloca 时，编译器把栈金丝雀放在 VLA 之上、保存的返回地址却落在栈金丝雀之下，越界写入会先于金丝雀检查改写返回地址，本应兜底的保护因此被绕过。该漏洞在 GCC 早期版本即已存在，直到 2023 年才由外部研究者系统分析并修复。这种 buggy 状态下的栈帧布局如下图 1 所示。</w:t>
+            </w:r>
+          </w:p>
+          <w:p>
+            <w:pPr>
+              <w:pStyle w:val="Normal"/>
+              <w:spacing w:lineRule="auto" w:line="360"/>
+              <w:jc w:val="center"/>
+            </w:pPr>
+            <w:r>
+              <w:rPr/>
               <w:drawing>
-                <wp:inline distT="0" distB="0" distL="0" distR="0">
-                  <wp:extent cx="4283710" cy="5326380"/>
+                <wp:inline xmlns:wp="http://schemas.openxmlformats.org/drawingml/2006/wordprocessingDrawing" distT="0" distB="0" distL="0" distR="0">
+                  <wp:extent cx="4284090" cy="5326553"/>
                   <wp:effectExtent l="0" t="0" r="0" b="0"/>
                   <wp:docPr id="21" name="Figure21"/>
                   <wp:cNvGraphicFramePr>
@@ -2660,13 +2498,11 @@
                     <a:graphicData uri="http://schemas.openxmlformats.org/drawingml/2006/picture">
                       <pic:pic xmlns:pic="http://schemas.openxmlformats.org/drawingml/2006/picture">
                         <pic:nvPicPr>
-                          <pic:cNvPr id="21" name="Figure21"/>
-                          <pic:cNvPicPr>
-                            <a:picLocks noChangeAspect="1"/>
-                          </pic:cNvPicPr>
+                          <pic:cNvPr id="21" name="stack-layout.png"/>
+                          <pic:cNvPicPr/>
                         </pic:nvPicPr>
                         <pic:blipFill>
-                          <a:blip r:embed="rId6"/>
+                          <a:blip xmlns:r="http://schemas.openxmlformats.org/officeDocument/2006/relationships" r:embed="rId21"/>
                           <a:stretch>
                             <a:fillRect/>
                           </a:stretch>
@@ -2689,7 +2525,8 @@
           </w:p>
           <w:p>
             <w:pPr>
-              <w:spacing w:line="360" w:lineRule="auto"/>
+              <w:pStyle w:val="Normal"/>
+              <w:spacing w:lineRule="auto" w:line="360"/>
               <w:jc w:val="center"/>
               <w:rPr>
                 <w:rFonts w:ascii="宋体" w:hAnsi="宋体" w:eastAsia="宋体"/>
@@ -2710,32 +2547,35 @@
           </w:p>
           <w:p>
             <w:pPr>
-              <w:spacing w:line="360" w:lineRule="auto"/>
-              <w:rPr>
-                <w:sz w:val="24"/>
-              </w:rPr>
-            </w:pPr>
-          </w:p>
-          <w:p>
-            <w:pPr>
-              <w:spacing w:line="360" w:lineRule="auto"/>
-              <w:ind w:left="0" w:leftChars="0" w:right="0" w:rightChars="0" w:firstLineChars="200"/>
-              <w:rPr>
-                <w:kern w:val="0"/>
-                <w:sz w:val="24"/>
-              </w:rPr>
-            </w:pPr>
-            <w:r>
-              <w:rPr>
-                <w:kern w:val="0"/>
-                <w:sz w:val="24"/>
-              </w:rPr>
-              <w:t>CVE-2023-4039 直观地揭示了一个共性问题：防御机制的有效性除了依赖代码实现的正确性之外，也强依赖于具体 ISA 上的栈布局、寄存器分配与指令编码设计。一旦防御设计中的某项假设与某套 ISA 不一致，运行期保护就会悄然失效。这种失效具有"双重无声"特征：编译时不报错（工具链与功能测试都察觉不到），运行时也能产生正确的功能结果（程序行为也察觉不到），但其安全契约已经被打破。本课题将这种形态的失效称为静默失效（silent failure）：编译产物看似带有完整防线，但攻击者可直接绕过。</w:t>
-            </w:r>
-          </w:p>
-          <w:p>
-            <w:pPr>
-              <w:spacing w:line="360" w:lineRule="auto"/>
+              <w:pStyle w:val="Normal"/>
+              <w:spacing w:lineRule="auto" w:line="360"/>
+              <w:rPr>
+                <w:sz w:val="24"/>
+              </w:rPr>
+            </w:pPr>
+          </w:p>
+          <w:p>
+            <w:pPr>
+              <w:pStyle w:val="Normal"/>
+              <w:spacing w:lineRule="auto" w:line="360"/>
+              <w:ind w:firstLineChars="200" w:startChars="0" w:start="0" w:endChars="0" w:end="0"/>
+              <w:rPr>
+                <w:kern w:val="0"/>
+                <w:sz w:val="24"/>
+              </w:rPr>
+            </w:pPr>
+            <w:r>
+              <w:rPr>
+                <w:kern w:val="0"/>
+                <w:sz w:val="24"/>
+              </w:rPr>
+              <w:t xml:space="preserve">CVE-2023-4039 直观地揭示了一个共性问题：防御机制的有效性除了依赖代码实现的正确性之外，也强依赖于具体 ISA 上的栈布局、寄存器分配与指令编码设计。一旦防御设计中的某项假设与某套 ISA 不一致，运行期保护就会悄然失效。这种失效具有"双重无声"特征：编译时不报错（工具链与功能测试都察觉不到），运行时也能产生正确的功能结果（程序行为也察觉不到），但其安全契约已经被打破。本课题将这种形态的失效称为静默失效（silent failure）：编译产物看似带有完整防线，但攻击者可直接绕过。</w:t>
+            </w:r>
+          </w:p>
+          <w:p>
+            <w:pPr>
+              <w:pStyle w:val="Normal"/>
+              <w:spacing w:lineRule="auto" w:line="360"/>
               <w:rPr>
                 <w:b/>
                 <w:bCs/>
@@ -2755,47 +2595,51 @@
           </w:p>
           <w:p>
             <w:pPr>
-              <w:spacing w:line="360" w:lineRule="auto"/>
-              <w:ind w:left="0" w:leftChars="0" w:right="0" w:rightChars="0" w:firstLineChars="200"/>
-              <w:rPr>
-                <w:kern w:val="0"/>
-                <w:sz w:val="24"/>
-              </w:rPr>
-            </w:pPr>
-            <w:r>
-              <w:rPr>
-                <w:kern w:val="0"/>
-                <w:sz w:val="24"/>
-              </w:rPr>
-              <w:t>要在编译器中系统性地暴露此类静默失效，本课题面临两个相互纠缠的挑战。</w:t>
-            </w:r>
-          </w:p>
-          <w:p>
-            <w:pPr>
-              <w:spacing w:line="360" w:lineRule="auto"/>
-              <w:ind w:left="0" w:leftChars="0" w:right="0" w:rightChars="0" w:firstLineChars="200"/>
-              <w:rPr>
-                <w:kern w:val="0"/>
-                <w:sz w:val="24"/>
-              </w:rPr>
-            </w:pPr>
-            <w:r>
-              <w:rPr>
-                <w:kern w:val="0"/>
-                <w:sz w:val="24"/>
-              </w:rPr>
-              <w:t>第一是搜索空间巨大。如图 2 所示，编译器需要在多种防御机制（如栈金丝雀、_FORTIFY_SOURCE、IBT、CFI 等）与多套 ISA（如 x86-64、AArch64、RISC-V、LoongArch 等）构成的二维空间中维护安全契约。每个格点对应独立的中端 pass 或后端模板，任何细节都可能影响机制是否生效。已确认的同源遗漏并不少见：与 CVE-2023-4039 同源的 PR-96191[5] 在 2020 年修复时仅覆盖部分架构，未触及多个 fallback 后端，导致同一失效在其他架构上静默存续多年。本课题在初步实验中已向 GCC 上游确认了多例此类同源失效[6-9]（见第五章）。</w:t>
-            </w:r>
-          </w:p>
-          <w:p>
-            <w:pPr>
-              <w:spacing w:line="360" w:lineRule="auto"/>
-              <w:jc w:val="center"/>
-            </w:pPr>
-            <w:r>
+              <w:pStyle w:val="Normal"/>
+              <w:spacing w:lineRule="auto" w:line="360"/>
+              <w:ind w:firstLineChars="200" w:startChars="0" w:start="0" w:endChars="0" w:end="0"/>
+              <w:rPr>
+                <w:kern w:val="0"/>
+                <w:sz w:val="24"/>
+              </w:rPr>
+            </w:pPr>
+            <w:r>
+              <w:rPr>
+                <w:kern w:val="0"/>
+                <w:sz w:val="24"/>
+              </w:rPr>
+              <w:t xml:space="preserve">要在编译器中系统性地暴露此类静默失效，本课题面临两个相互纠缠的挑战。</w:t>
+            </w:r>
+          </w:p>
+          <w:p>
+            <w:pPr>
+              <w:pStyle w:val="Normal"/>
+              <w:spacing w:lineRule="auto" w:line="360"/>
+              <w:ind w:firstLineChars="200" w:startChars="0" w:start="0" w:endChars="0" w:end="0"/>
+              <w:rPr>
+                <w:kern w:val="0"/>
+                <w:sz w:val="24"/>
+              </w:rPr>
+            </w:pPr>
+            <w:r>
+              <w:rPr>
+                <w:kern w:val="0"/>
+                <w:sz w:val="24"/>
+              </w:rPr>
+              <w:t xml:space="preserve">第一是搜索空间巨大。如图 2 所示，编译器需要在多种防御机制（如栈金丝雀、_FORTIFY_SOURCE、IBT、CFI 等）与多套 ISA（如 x86-64、AArch64、RISC-V、LoongArch 等）构成的二维空间中维护安全契约。每个格点对应独立的中端 pass 或后端模板，任何细节都可能影响机制是否生效。已确认的同源遗漏并不少见：与 CVE-2023-4039 同源的 PR-96191[5] 在 2020 年修复时仅覆盖部分架构，未触及多个 fallback 后端，导致同一失效在其他架构上静默存续多年。本课题在初步实验中已向 GCC 上游确认了多例此类同源失效[6-9]（见第五章）。</w:t>
+            </w:r>
+          </w:p>
+          <w:p>
+            <w:pPr>
+              <w:pStyle w:val="Normal"/>
+              <w:spacing w:lineRule="auto" w:line="360"/>
+              <w:jc w:val="center"/>
+            </w:pPr>
+            <w:r>
+              <w:rPr/>
               <w:drawing>
-                <wp:inline distT="0" distB="0" distL="0" distR="0">
-                  <wp:extent cx="5385435" cy="2709545"/>
+                <wp:inline xmlns:wp="http://schemas.openxmlformats.org/drawingml/2006/wordprocessingDrawing" distT="0" distB="0" distL="0" distR="0">
+                  <wp:extent cx="5385714" cy="2709687"/>
                   <wp:effectExtent l="0" t="0" r="0" b="0"/>
                   <wp:docPr id="22" name="Figure22"/>
                   <wp:cNvGraphicFramePr>
@@ -2805,13 +2649,11 @@
                     <a:graphicData uri="http://schemas.openxmlformats.org/drawingml/2006/picture">
                       <pic:pic xmlns:pic="http://schemas.openxmlformats.org/drawingml/2006/picture">
                         <pic:nvPicPr>
-                          <pic:cNvPr id="22" name="Figure22"/>
-                          <pic:cNvPicPr>
-                            <a:picLocks noChangeAspect="1"/>
-                          </pic:cNvPicPr>
+                          <pic:cNvPr id="22" name="defense-matrix.png"/>
+                          <pic:cNvPicPr/>
                         </pic:nvPicPr>
                         <pic:blipFill>
-                          <a:blip r:embed="rId7"/>
+                          <a:blip xmlns:r="http://schemas.openxmlformats.org/officeDocument/2006/relationships" r:embed="rId22"/>
                           <a:stretch>
                             <a:fillRect/>
                           </a:stretch>
@@ -2834,7 +2676,8 @@
           </w:p>
           <w:p>
             <w:pPr>
-              <w:spacing w:line="360" w:lineRule="auto"/>
+              <w:pStyle w:val="Normal"/>
+              <w:spacing w:lineRule="auto" w:line="360"/>
               <w:jc w:val="center"/>
               <w:rPr>
                 <w:rFonts w:ascii="宋体" w:hAnsi="宋体" w:eastAsia="宋体"/>
@@ -2855,49 +2698,53 @@
           </w:p>
           <w:p>
             <w:pPr>
-              <w:spacing w:line="360" w:lineRule="auto"/>
-              <w:rPr>
-                <w:sz w:val="24"/>
-              </w:rPr>
-            </w:pPr>
-          </w:p>
-          <w:p>
-            <w:pPr>
-              <w:spacing w:line="360" w:lineRule="auto"/>
-              <w:ind w:left="0" w:leftChars="0" w:right="0" w:rightChars="0" w:firstLineChars="200"/>
-              <w:rPr>
-                <w:kern w:val="0"/>
-                <w:sz w:val="24"/>
-              </w:rPr>
-            </w:pPr>
-            <w:r>
-              <w:rPr>
-                <w:kern w:val="0"/>
-                <w:sz w:val="24"/>
-              </w:rPr>
-              <w:t>第二是失效难以判定。即使测试推进到相关代码路径，"防御契约是否满足"也很难直接观察：程序不崩溃，多编译器输出一致，看似正常而契约已失守。本课题将防御机制运行期必须成立的静态或动态性质统称为安全不变量（safety invariant，即"安全规则"，如金丝雀必须位于易受攻击栈对象与返回地址之间）。破坏这些性质即发生静默失效。已有自动化手段对此不敏感：基于崩溃或差分输出的工具（如 Csmith、YARPGen）无法触发异常；覆盖率引导的模糊测试（fuzzing）也因缺乏相应的预言机（oracle）而无法判别每一格点的安全状态。</w:t>
-            </w:r>
-          </w:p>
-          <w:p>
-            <w:pPr>
-              <w:spacing w:line="360" w:lineRule="auto"/>
-              <w:ind w:left="0" w:leftChars="0" w:right="0" w:rightChars="0" w:firstLineChars="200"/>
-              <w:rPr>
-                <w:kern w:val="0"/>
-                <w:sz w:val="24"/>
-              </w:rPr>
-            </w:pPr>
-            <w:r>
-              <w:rPr>
-                <w:kern w:val="0"/>
-                <w:sz w:val="24"/>
-              </w:rPr>
-              <w:t>同时，巨大的搜索空间也给 fuzzing 自身的覆盖效率带来了考验。本课题对此的应对思路是把推进目标显式限定在"防御机制相关代码"，让覆盖率反馈与大语言模型驱动的种子变异共同约束搜索方向，详见第三、四章。</w:t>
-            </w:r>
-          </w:p>
-          <w:p>
-            <w:pPr>
-              <w:spacing w:line="360" w:lineRule="auto"/>
+              <w:pStyle w:val="Normal"/>
+              <w:spacing w:lineRule="auto" w:line="360"/>
+              <w:rPr>
+                <w:sz w:val="24"/>
+              </w:rPr>
+            </w:pPr>
+          </w:p>
+          <w:p>
+            <w:pPr>
+              <w:pStyle w:val="Normal"/>
+              <w:spacing w:lineRule="auto" w:line="360"/>
+              <w:ind w:firstLineChars="200" w:startChars="0" w:start="0" w:endChars="0" w:end="0"/>
+              <w:rPr>
+                <w:kern w:val="0"/>
+                <w:sz w:val="24"/>
+              </w:rPr>
+            </w:pPr>
+            <w:r>
+              <w:rPr>
+                <w:kern w:val="0"/>
+                <w:sz w:val="24"/>
+              </w:rPr>
+              <w:t xml:space="preserve">第二是失效难以判定。即使测试推进到相关代码路径，"防御契约是否满足"也很难直接观察：程序不崩溃，多编译器输出一致，看似正常而契约已失守。本课题将防御机制运行期必须成立的静态或动态性质统称为安全不变量（safety invariant，即"安全规则"，如金丝雀必须位于易受攻击栈对象与返回地址之间）。破坏这些性质即发生静默失效。已有自动化手段对此不敏感：基于崩溃或差分输出的工具（如 Csmith、YARPGen）无法触发异常；覆盖率引导的模糊测试（fuzzing）也因缺乏相应的预言机（oracle）而无法判别每一格点的安全状态。</w:t>
+            </w:r>
+          </w:p>
+          <w:p>
+            <w:pPr>
+              <w:pStyle w:val="Normal"/>
+              <w:spacing w:lineRule="auto" w:line="360"/>
+              <w:ind w:firstLineChars="200" w:startChars="0" w:start="0" w:endChars="0" w:end="0"/>
+              <w:rPr>
+                <w:kern w:val="0"/>
+                <w:sz w:val="24"/>
+              </w:rPr>
+            </w:pPr>
+            <w:r>
+              <w:rPr>
+                <w:kern w:val="0"/>
+                <w:sz w:val="24"/>
+              </w:rPr>
+              <w:t xml:space="preserve">同时，巨大的搜索空间也给 fuzzing 自身的覆盖效率带来了考验。本课题对此的应对思路是把推进目标显式限定在"防御机制相关代码"，让覆盖率反馈与大语言模型驱动的种子变异共同约束搜索方向，详见第三、四章。</w:t>
+            </w:r>
+          </w:p>
+          <w:p>
+            <w:pPr>
+              <w:pStyle w:val="Normal"/>
+              <w:spacing w:lineRule="auto" w:line="360"/>
               <w:rPr>
                 <w:b/>
                 <w:bCs/>
@@ -2917,33 +2764,36 @@
           </w:p>
           <w:p>
             <w:pPr>
-              <w:spacing w:line="360" w:lineRule="auto"/>
-              <w:ind w:left="0" w:leftChars="0" w:right="0" w:rightChars="0" w:firstLineChars="200"/>
-              <w:rPr>
-                <w:kern w:val="0"/>
-                <w:sz w:val="24"/>
-              </w:rPr>
-            </w:pPr>
-            <w:r>
-              <w:rPr>
-                <w:kern w:val="0"/>
-                <w:sz w:val="24"/>
-              </w:rPr>
-              <w:t>编译器是绝大多数软件防御机制的实际载体，其在"防御机制 × ISA"二维矩阵上的静默失效会直接削弱整个软件生态的运行时安全保障。然而，现有自动化测试方法既未把搜索空间约束到防御机制相关代码，也未把安全不变量纳入判定体系。如果能把矩阵格点上的安全不变量翻译为可机器判定的检查器，并主动引导编译器走到相应代码路径，就既可暴露既有缺陷家族的同类变种，也有望在后续优化引入同类回归时及早发现。基于此，本研究结合大语言模型的代码理解能力与覆盖率反馈，构建面向编译器防御机制脆弱性的分析方法。</w:t>
-            </w:r>
-          </w:p>
-          <w:p>
-            <w:pPr>
-              <w:spacing w:line="360" w:lineRule="auto"/>
-              <w:rPr>
-                <w:sz w:val="24"/>
-              </w:rPr>
-            </w:pPr>
-          </w:p>
-          <w:p>
-            <w:pPr>
+              <w:pStyle w:val="Normal"/>
+              <w:spacing w:lineRule="auto" w:line="360"/>
+              <w:ind w:firstLineChars="200" w:startChars="0" w:start="0" w:endChars="0" w:end="0"/>
+              <w:rPr>
+                <w:kern w:val="0"/>
+                <w:sz w:val="24"/>
+              </w:rPr>
+            </w:pPr>
+            <w:r>
+              <w:rPr>
+                <w:kern w:val="0"/>
+                <w:sz w:val="24"/>
+              </w:rPr>
+              <w:t xml:space="preserve">编译器是绝大多数软件防御机制的实际载体，其在"防御机制 × ISA"二维矩阵上的静默失效会直接削弱整个软件生态的运行时安全保障。然而，现有自动化测试方法既未把搜索空间约束到防御机制相关代码，也未把安全不变量纳入判定体系。如果能把矩阵格点上的安全不变量翻译为可机器判定的检查器，并主动引导编译器走到相应代码路径，就既可暴露既有缺陷家族的同类变种，也有望在后续优化引入同类回归时及早发现。基于此，本研究结合大语言模型的代码理解能力与覆盖率反馈，构建面向编译器防御机制脆弱性的分析方法。</w:t>
+            </w:r>
+          </w:p>
+          <w:p>
+            <w:pPr>
+              <w:pStyle w:val="Normal"/>
+              <w:spacing w:lineRule="auto" w:line="360"/>
+              <w:rPr>
+                <w:sz w:val="24"/>
+              </w:rPr>
+            </w:pPr>
+          </w:p>
+          <w:p>
+            <w:pPr>
+              <w:pStyle w:val="Normal"/>
               <w:widowControl/>
-              <w:jc w:val="left"/>
+              <w:jc w:val="start"/>
               <w:rPr>
                 <w:b/>
                 <w:bCs/>
@@ -2963,7 +2813,8 @@
           </w:p>
           <w:p>
             <w:pPr>
-              <w:spacing w:line="360" w:lineRule="auto"/>
+              <w:pStyle w:val="Normal"/>
+              <w:spacing w:lineRule="auto" w:line="360"/>
               <w:rPr>
                 <w:b/>
                 <w:bCs/>
@@ -2983,41 +2834,44 @@
           </w:p>
           <w:p>
             <w:pPr>
-              <w:spacing w:line="360" w:lineRule="auto"/>
-              <w:ind w:left="0" w:leftChars="0" w:right="0" w:rightChars="0" w:firstLineChars="200"/>
-              <w:rPr>
-                <w:kern w:val="0"/>
-                <w:sz w:val="24"/>
-              </w:rPr>
-            </w:pPr>
-            <w:r>
-              <w:rPr>
-                <w:kern w:val="0"/>
-                <w:sz w:val="24"/>
-              </w:rPr>
-              <w:t>要在编译器中系统性地暴露此类静默失效，面临两个挑战：搜索空间巨大、失效难以判定。围绕这两条挑战梳理现有方法可以发现，此前的工作或针对其中之一做出推进，或停留在与编译器自身防御机制弱相关的常规缺陷上，目前尚未出现同时直面两条挑战的成熟方案。下文按这两个维度组织文献，并讨论各自的覆盖范围与遗留空白。</w:t>
-            </w:r>
-          </w:p>
-          <w:p>
-            <w:pPr>
-              <w:spacing w:line="360" w:lineRule="auto"/>
-              <w:ind w:left="0" w:leftChars="0" w:right="0" w:rightChars="0" w:firstLineChars="200"/>
-              <w:rPr>
-                <w:kern w:val="0"/>
-                <w:sz w:val="24"/>
-              </w:rPr>
-            </w:pPr>
-            <w:r>
-              <w:rPr>
-                <w:kern w:val="0"/>
-                <w:sz w:val="24"/>
-              </w:rPr>
-              <w:t>需要指出的是，模糊测试（fuzzing）并非解决该问题的唯一路径。静态分析、形式化验证、人工审计在原则上也可以参与判定一条防御机制是否在某 ISA 上仍维持其安全契约。然而，受限于安全契约本身缺乏统一的可形式化描述，以及防御机制实现散落在编译器中端 pass 与若干后端模板中的工程现实，目前与覆盖率证据耦合最紧、最容易把搜索空间显式收敛到目标代码区域的方案仍然是覆盖率引导的模糊测试。本章对相关工作的取舍即基于此判断。</w:t>
-            </w:r>
-          </w:p>
-          <w:p>
-            <w:pPr>
-              <w:spacing w:line="360" w:lineRule="auto"/>
+              <w:pStyle w:val="Normal"/>
+              <w:spacing w:lineRule="auto" w:line="360"/>
+              <w:ind w:firstLineChars="200" w:startChars="0" w:start="0" w:endChars="0" w:end="0"/>
+              <w:rPr>
+                <w:kern w:val="0"/>
+                <w:sz w:val="24"/>
+              </w:rPr>
+            </w:pPr>
+            <w:r>
+              <w:rPr>
+                <w:kern w:val="0"/>
+                <w:sz w:val="24"/>
+              </w:rPr>
+              <w:t xml:space="preserve">要在编译器中系统性地暴露此类静默失效，面临两个挑战：搜索空间巨大、失效难以判定。围绕这两条挑战梳理现有方法可以发现，此前的工作或针对其中之一做出推进，或停留在与编译器自身防御机制弱相关的常规缺陷上，目前尚未出现同时直面两条挑战的成熟方案。下文按这两个维度组织文献，并讨论各自的覆盖范围与遗留空白。</w:t>
+            </w:r>
+          </w:p>
+          <w:p>
+            <w:pPr>
+              <w:pStyle w:val="Normal"/>
+              <w:spacing w:lineRule="auto" w:line="360"/>
+              <w:ind w:firstLineChars="200" w:startChars="0" w:start="0" w:endChars="0" w:end="0"/>
+              <w:rPr>
+                <w:kern w:val="0"/>
+                <w:sz w:val="24"/>
+              </w:rPr>
+            </w:pPr>
+            <w:r>
+              <w:rPr>
+                <w:kern w:val="0"/>
+                <w:sz w:val="24"/>
+              </w:rPr>
+              <w:t xml:space="preserve">需要指出的是，模糊测试（fuzzing）并非解决该问题的唯一路径。静态分析、形式化验证、人工审计在原则上也可以参与判定一条防御机制是否在某 ISA 上仍维持其安全契约。然而，受限于安全契约本身缺乏统一的可形式化描述，以及防御机制实现散落在编译器中端 pass 与若干后端模板中的工程现实，目前与覆盖率证据耦合最紧、最容易把搜索空间显式收敛到目标代码区域的方案仍然是覆盖率引导的模糊测试。本章对相关工作的取舍即基于此判断。</w:t>
+            </w:r>
+          </w:p>
+          <w:p>
+            <w:pPr>
+              <w:pStyle w:val="Normal"/>
+              <w:spacing w:lineRule="auto" w:line="360"/>
               <w:rPr>
                 <w:b/>
                 <w:bCs/>
@@ -3037,109 +2891,116 @@
           </w:p>
           <w:p>
             <w:pPr>
-              <w:spacing w:line="360" w:lineRule="auto"/>
-              <w:ind w:left="0" w:leftChars="0" w:right="0" w:rightChars="0" w:firstLineChars="200"/>
-              <w:rPr>
-                <w:kern w:val="0"/>
-                <w:sz w:val="24"/>
-              </w:rPr>
-            </w:pPr>
-            <w:r>
-              <w:rPr>
-                <w:kern w:val="0"/>
-                <w:sz w:val="24"/>
-              </w:rPr>
-              <w:t>针对"如何把测试输入有目标地推到防御机制相关代码"的问题，现有方法大致可划分为四类。</w:t>
-            </w:r>
-          </w:p>
-          <w:p>
-            <w:pPr>
-              <w:spacing w:line="360" w:lineRule="auto"/>
-              <w:ind w:left="0" w:leftChars="0" w:right="0" w:rightChars="0" w:firstLineChars="200"/>
-              <w:rPr>
-                <w:kern w:val="0"/>
-                <w:sz w:val="24"/>
-              </w:rPr>
-            </w:pPr>
-            <w:r>
-              <w:rPr>
-                <w:kern w:val="0"/>
-                <w:sz w:val="24"/>
-              </w:rPr>
-              <w:t>随机生成与文法生成。Csmith[10] 与 YARPGen[11] 基于概率文法从空白合成不含未定义行为的 C 程序，再以差分输出驱动测试。这类方法对编译器整体覆盖良好，但生成过程不带任何防御机制的语义偏好，实测中很难自然落到栈金丝雀、IBT 等机制相关的代码路径上。</w:t>
-            </w:r>
-          </w:p>
-          <w:p>
-            <w:pPr>
-              <w:spacing w:line="360" w:lineRule="auto"/>
-              <w:ind w:left="0" w:leftChars="0" w:right="0" w:rightChars="0" w:firstLineChars="200"/>
-              <w:rPr>
-                <w:kern w:val="0"/>
-                <w:sz w:val="24"/>
-              </w:rPr>
-            </w:pPr>
-            <w:r>
-              <w:rPr>
-                <w:kern w:val="0"/>
-                <w:sz w:val="24"/>
-              </w:rPr>
-              <w:t>字节级覆盖率引导。AFL[12]、libFuzzer[13] 等以字节级覆盖率反馈为导向的工具被广泛用于编译器解析与优化组件。它们能感知"是否走入新代码"，但对生成程序的语法语义合法性约束有限，且覆盖率信号无差别对待所有代码区域，无法天然把推进目标限定到防御机制相关代码。</w:t>
-            </w:r>
-          </w:p>
-          <w:p>
-            <w:pPr>
-              <w:spacing w:line="360" w:lineRule="auto"/>
-              <w:ind w:left="0" w:leftChars="0" w:right="0" w:rightChars="0" w:firstLineChars="200"/>
-              <w:rPr>
-                <w:kern w:val="0"/>
-                <w:sz w:val="24"/>
-              </w:rPr>
-            </w:pPr>
-            <w:r>
-              <w:rPr>
-                <w:kern w:val="0"/>
-                <w:sz w:val="24"/>
-              </w:rPr>
-              <w:t>源码级语义保持变异。GrayC[14] 将覆盖率引导与一组保持语义合法性的源码级变异结合，在覆盖率推进与缺陷发现率上优于纯生成式工具；EMI 系列[15] 在种子的未执行区域做语义保持变换，可视作变异与变形预言机的组合。这类方法具备较强的工程实用性，但变异规则由人工定义，没有利用目标代码自身的语义信息引导方向。</w:t>
-            </w:r>
-          </w:p>
-          <w:p>
-            <w:pPr>
-              <w:spacing w:line="360" w:lineRule="auto"/>
-              <w:ind w:left="0" w:leftChars="0" w:right="0" w:rightChars="0" w:firstLineChars="200"/>
-              <w:rPr>
-                <w:kern w:val="0"/>
-                <w:sz w:val="24"/>
-              </w:rPr>
-            </w:pPr>
-            <w:r>
-              <w:rPr>
-                <w:kern w:val="0"/>
-                <w:sz w:val="24"/>
-              </w:rPr>
-              <w:t>大语言模型驱动的变异。WhiteFox[16] 从优化 pass 源码出发，利用大模型归纳输入模式并生成测试用例，使种子生成具备对编译器内部逻辑的感知；HLPFuzz[17] 进一步将大模型与覆盖率反馈耦合，将未覆盖基本块翻译为约束求解任务交由大模型完成。这表明大模型可作为语义感知的变异引擎，但目前工作定义的目标仍是常规可达性（"走到某处代码"），并不关心目标路径所承担的安全契约。</w:t>
-            </w:r>
-          </w:p>
-          <w:p>
-            <w:pPr>
-              <w:spacing w:line="360" w:lineRule="auto"/>
-              <w:ind w:left="0" w:leftChars="0" w:right="0" w:rightChars="0" w:firstLineChars="200"/>
-              <w:rPr>
-                <w:kern w:val="0"/>
-                <w:sz w:val="24"/>
-              </w:rPr>
-            </w:pPr>
-            <w:r>
-              <w:rPr>
-                <w:kern w:val="0"/>
-                <w:sz w:val="24"/>
-              </w:rPr>
-              <w:t>综合来看，现有方法在搜索空间一侧已积累了较成熟的覆盖率推进手段，若能把"防御机制相关性"作为目标基本块挑选的额外维度并复用大语言模型的代码理解能力，就有望显著提高在防御机制 × ISA 矩阵中的有效采样密度。</w:t>
-            </w:r>
-          </w:p>
-          <w:p>
-            <w:pPr>
-              <w:spacing w:line="360" w:lineRule="auto"/>
+              <w:pStyle w:val="Normal"/>
+              <w:spacing w:lineRule="auto" w:line="360"/>
+              <w:ind w:firstLineChars="200" w:startChars="0" w:start="0" w:endChars="0" w:end="0"/>
+              <w:rPr>
+                <w:kern w:val="0"/>
+                <w:sz w:val="24"/>
+              </w:rPr>
+            </w:pPr>
+            <w:r>
+              <w:rPr>
+                <w:kern w:val="0"/>
+                <w:sz w:val="24"/>
+              </w:rPr>
+              <w:t xml:space="preserve">针对"如何把测试输入有目标地推到防御机制相关代码"的问题，现有方法大致可划分为四类。</w:t>
+            </w:r>
+          </w:p>
+          <w:p>
+            <w:pPr>
+              <w:pStyle w:val="Normal"/>
+              <w:spacing w:lineRule="auto" w:line="360"/>
+              <w:ind w:firstLineChars="200" w:startChars="0" w:start="0" w:endChars="0" w:end="0"/>
+              <w:rPr>
+                <w:kern w:val="0"/>
+                <w:sz w:val="24"/>
+              </w:rPr>
+            </w:pPr>
+            <w:r>
+              <w:rPr>
+                <w:kern w:val="0"/>
+                <w:sz w:val="24"/>
+              </w:rPr>
+              <w:t xml:space="preserve">随机生成与文法生成。Csmith[10] 与 YARPGen[11] 基于概率文法从空白合成不含未定义行为的 C 程序，再以差分输出驱动测试。这类方法对编译器整体覆盖良好，但生成过程不带任何防御机制的语义偏好，实测中很难自然落到栈金丝雀、IBT 等机制相关的代码路径上。</w:t>
+            </w:r>
+          </w:p>
+          <w:p>
+            <w:pPr>
+              <w:pStyle w:val="Normal"/>
+              <w:spacing w:lineRule="auto" w:line="360"/>
+              <w:ind w:firstLineChars="200" w:startChars="0" w:start="0" w:endChars="0" w:end="0"/>
+              <w:rPr>
+                <w:kern w:val="0"/>
+                <w:sz w:val="24"/>
+              </w:rPr>
+            </w:pPr>
+            <w:r>
+              <w:rPr>
+                <w:kern w:val="0"/>
+                <w:sz w:val="24"/>
+              </w:rPr>
+              <w:t xml:space="preserve">字节级覆盖率引导。AFL[12]、libFuzzer[13] 等以字节级覆盖率反馈为导向的工具被广泛用于编译器解析与优化组件。它们能感知"是否走入新代码"，但对生成程序的语法语义合法性约束有限，且覆盖率信号无差别对待所有代码区域，无法天然把推进目标限定到防御机制相关代码。</w:t>
+            </w:r>
+          </w:p>
+          <w:p>
+            <w:pPr>
+              <w:pStyle w:val="Normal"/>
+              <w:spacing w:lineRule="auto" w:line="360"/>
+              <w:ind w:firstLineChars="200" w:startChars="0" w:start="0" w:endChars="0" w:end="0"/>
+              <w:rPr>
+                <w:kern w:val="0"/>
+                <w:sz w:val="24"/>
+              </w:rPr>
+            </w:pPr>
+            <w:r>
+              <w:rPr>
+                <w:kern w:val="0"/>
+                <w:sz w:val="24"/>
+              </w:rPr>
+              <w:t xml:space="preserve">源码级语义保持变异。GrayC[14] 将覆盖率引导与一组保持语义合法性的源码级变异结合，在覆盖率推进与缺陷发现率上优于纯生成式工具；EMI 系列[15] 在种子的未执行区域做语义保持变换，可视作变异与变形预言机的组合。这类方法具备较强的工程实用性，但变异规则由人工定义，没有利用目标代码自身的语义信息引导方向。</w:t>
+            </w:r>
+          </w:p>
+          <w:p>
+            <w:pPr>
+              <w:pStyle w:val="Normal"/>
+              <w:spacing w:lineRule="auto" w:line="360"/>
+              <w:ind w:firstLineChars="200" w:startChars="0" w:start="0" w:endChars="0" w:end="0"/>
+              <w:rPr>
+                <w:kern w:val="0"/>
+                <w:sz w:val="24"/>
+              </w:rPr>
+            </w:pPr>
+            <w:r>
+              <w:rPr>
+                <w:kern w:val="0"/>
+                <w:sz w:val="24"/>
+              </w:rPr>
+              <w:t xml:space="preserve">大语言模型驱动的变异。WhiteFox[16] 从优化 pass 源码出发，利用大模型归纳输入模式并生成测试用例，使种子生成具备对编译器内部逻辑的感知；HLPFuzz[17] 进一步将大模型与覆盖率反馈耦合，将未覆盖基本块翻译为约束求解任务交由大模型完成。这表明大模型可作为语义感知的变异引擎，但目前工作定义的目标仍是常规可达性（"走到某处代码"），并不关心目标路径所承担的安全契约。</w:t>
+            </w:r>
+          </w:p>
+          <w:p>
+            <w:pPr>
+              <w:pStyle w:val="Normal"/>
+              <w:spacing w:lineRule="auto" w:line="360"/>
+              <w:ind w:firstLineChars="200" w:startChars="0" w:start="0" w:endChars="0" w:end="0"/>
+              <w:rPr>
+                <w:kern w:val="0"/>
+                <w:sz w:val="24"/>
+              </w:rPr>
+            </w:pPr>
+            <w:r>
+              <w:rPr>
+                <w:kern w:val="0"/>
+                <w:sz w:val="24"/>
+              </w:rPr>
+              <w:t xml:space="preserve">综合来看，现有方法在搜索空间一侧已积累了较成熟的覆盖率推进手段，若能把"防御机制相关性"作为目标基本块挑选的额外维度并复用大语言模型的代码理解能力，就有望显著提高在防御机制 × ISA 矩阵中的有效采样密度。</w:t>
+            </w:r>
+          </w:p>
+          <w:p>
+            <w:pPr>
+              <w:pStyle w:val="Normal"/>
+              <w:spacing w:lineRule="auto" w:line="360"/>
               <w:rPr>
                 <w:b/>
                 <w:bCs/>
@@ -3159,109 +3020,116 @@
           </w:p>
           <w:p>
             <w:pPr>
-              <w:spacing w:line="360" w:lineRule="auto"/>
-              <w:ind w:left="0" w:leftChars="0" w:right="0" w:rightChars="0" w:firstLineChars="200"/>
-              <w:rPr>
-                <w:kern w:val="0"/>
-                <w:sz w:val="24"/>
-              </w:rPr>
-            </w:pPr>
-            <w:r>
-              <w:rPr>
-                <w:kern w:val="0"/>
-                <w:sz w:val="24"/>
-              </w:rPr>
-              <w:t>针对"如何判断一颗成功编译并运行的二进制是否仍满足防御机制安全契约"，现有预言机大致分为四类。</w:t>
-            </w:r>
-          </w:p>
-          <w:p>
-            <w:pPr>
-              <w:spacing w:line="360" w:lineRule="auto"/>
-              <w:ind w:left="0" w:leftChars="0" w:right="0" w:rightChars="0" w:firstLineChars="200"/>
-              <w:rPr>
-                <w:kern w:val="0"/>
-                <w:sz w:val="24"/>
-              </w:rPr>
-            </w:pPr>
-            <w:r>
-              <w:rPr>
-                <w:kern w:val="0"/>
-                <w:sz w:val="24"/>
-              </w:rPr>
-              <w:t>崩溃预言机[10,12,13] 以编译期或运行期的崩溃（ICE、断言、segfault、超时）为信号，是 AFL、libFuzzer 迁移到编译器后的默认选择。但静默失效的产物在编译期与运行期均不会崩溃，该类预言机本质上对其不可见。</w:t>
-            </w:r>
-          </w:p>
-          <w:p>
-            <w:pPr>
-              <w:spacing w:line="360" w:lineRule="auto"/>
-              <w:ind w:left="0" w:leftChars="0" w:right="0" w:rightChars="0" w:firstLineChars="200"/>
-              <w:rPr>
-                <w:kern w:val="0"/>
-                <w:sz w:val="24"/>
-              </w:rPr>
-            </w:pPr>
-            <w:r>
-              <w:rPr>
-                <w:kern w:val="0"/>
-                <w:sz w:val="24"/>
-              </w:rPr>
-              <w:t>差分预言机[10,11] 对若干编译器或同一编译器不同优化等级就同一程序的运行结果做交叉比对，差异即为 mis-compile。然而，静默失效的二进制功能行为与正常产物一致，不同编译器之间也保持一致输出，因此不会产生可观察的差异。</w:t>
-            </w:r>
-          </w:p>
-          <w:p>
-            <w:pPr>
-              <w:spacing w:line="360" w:lineRule="auto"/>
-              <w:ind w:left="0" w:leftChars="0" w:right="0" w:rightChars="0" w:firstLineChars="200"/>
-              <w:rPr>
-                <w:kern w:val="0"/>
-                <w:sz w:val="24"/>
-              </w:rPr>
-            </w:pPr>
-            <w:r>
-              <w:rPr>
-                <w:kern w:val="0"/>
-                <w:sz w:val="24"/>
-              </w:rPr>
-              <w:t>变形预言机以 Le 等提出的 EMI[15] 为代表，对同一输入下未执行的代码做删改，新程序应产生相同结果，差异即为 mis-compile。该类预言机围绕"语义保持"组织判据，仍然在功能输出层面观察，无法触及运行期防御契约。</w:t>
-            </w:r>
-          </w:p>
-          <w:p>
-            <w:pPr>
-              <w:spacing w:line="360" w:lineRule="auto"/>
-              <w:ind w:left="0" w:leftChars="0" w:right="0" w:rightChars="0" w:firstLineChars="200"/>
-              <w:rPr>
-                <w:kern w:val="0"/>
-                <w:sz w:val="24"/>
-              </w:rPr>
-            </w:pPr>
-            <w:r>
-              <w:rPr>
-                <w:kern w:val="0"/>
-                <w:sz w:val="24"/>
-              </w:rPr>
-              <w:t>Sanitizer 预言机借助 ASan 等工具将内存破坏转为显式信号；UBfuzz[18] 进一步用反向定位来测试 sanitizer 自身实现缺陷。Sanitizer 关心程序自身的内存安全，其覆盖范围与“内置防御机制是否生效”不重叠。复合预言机如 HirGen[19] 虽在 IR 层结合差分与变形，但同样不针对编译器的防御机制。</w:t>
-            </w:r>
-          </w:p>
-          <w:p>
-            <w:pPr>
-              <w:spacing w:line="360" w:lineRule="auto"/>
-              <w:ind w:left="0" w:leftChars="0" w:right="0" w:rightChars="0" w:firstLineChars="200"/>
-              <w:rPr>
-                <w:kern w:val="0"/>
-                <w:sz w:val="24"/>
-              </w:rPr>
-            </w:pPr>
-            <w:r>
-              <w:rPr>
-                <w:kern w:val="0"/>
-                <w:sz w:val="24"/>
-              </w:rPr>
-              <w:t>可以看到，现有预言机的判据全部建立在"崩溃"或"可观察输出差异"之上。当缺陷的形态是"代码正常编译运行、运行时保护已被静默削弱"时，它们均无法触发。这正是第一章所述判定空白的来源。</w:t>
-            </w:r>
-          </w:p>
-          <w:p>
-            <w:pPr>
-              <w:spacing w:line="360" w:lineRule="auto"/>
+              <w:pStyle w:val="Normal"/>
+              <w:spacing w:lineRule="auto" w:line="360"/>
+              <w:ind w:firstLineChars="200" w:startChars="0" w:start="0" w:endChars="0" w:end="0"/>
+              <w:rPr>
+                <w:kern w:val="0"/>
+                <w:sz w:val="24"/>
+              </w:rPr>
+            </w:pPr>
+            <w:r>
+              <w:rPr>
+                <w:kern w:val="0"/>
+                <w:sz w:val="24"/>
+              </w:rPr>
+              <w:t xml:space="preserve">针对"如何判断一颗成功编译并运行的二进制是否仍满足防御机制安全契约"，现有预言机大致分为四类。</w:t>
+            </w:r>
+          </w:p>
+          <w:p>
+            <w:pPr>
+              <w:pStyle w:val="Normal"/>
+              <w:spacing w:lineRule="auto" w:line="360"/>
+              <w:ind w:firstLineChars="200" w:startChars="0" w:start="0" w:endChars="0" w:end="0"/>
+              <w:rPr>
+                <w:kern w:val="0"/>
+                <w:sz w:val="24"/>
+              </w:rPr>
+            </w:pPr>
+            <w:r>
+              <w:rPr>
+                <w:kern w:val="0"/>
+                <w:sz w:val="24"/>
+              </w:rPr>
+              <w:t xml:space="preserve">崩溃预言机[10,12,13] 以编译期或运行期的崩溃（ICE、断言、segfault、超时）为信号，是 AFL、libFuzzer 迁移到编译器后的默认选择。但静默失效的产物在编译期与运行期均不会崩溃，该类预言机本质上对其不可见。</w:t>
+            </w:r>
+          </w:p>
+          <w:p>
+            <w:pPr>
+              <w:pStyle w:val="Normal"/>
+              <w:spacing w:lineRule="auto" w:line="360"/>
+              <w:ind w:firstLineChars="200" w:startChars="0" w:start="0" w:endChars="0" w:end="0"/>
+              <w:rPr>
+                <w:kern w:val="0"/>
+                <w:sz w:val="24"/>
+              </w:rPr>
+            </w:pPr>
+            <w:r>
+              <w:rPr>
+                <w:kern w:val="0"/>
+                <w:sz w:val="24"/>
+              </w:rPr>
+              <w:t xml:space="preserve">差分预言机[10,11] 对若干编译器或同一编译器不同优化等级就同一程序的运行结果做交叉比对，差异即为 mis-compile。然而，静默失效的二进制功能行为与正常产物一致，不同编译器之间也保持一致输出，因此不会产生可观察的差异。</w:t>
+            </w:r>
+          </w:p>
+          <w:p>
+            <w:pPr>
+              <w:pStyle w:val="Normal"/>
+              <w:spacing w:lineRule="auto" w:line="360"/>
+              <w:ind w:firstLineChars="200" w:startChars="0" w:start="0" w:endChars="0" w:end="0"/>
+              <w:rPr>
+                <w:kern w:val="0"/>
+                <w:sz w:val="24"/>
+              </w:rPr>
+            </w:pPr>
+            <w:r>
+              <w:rPr>
+                <w:kern w:val="0"/>
+                <w:sz w:val="24"/>
+              </w:rPr>
+              <w:t xml:space="preserve">变形预言机以 Le 等提出的 EMI[15] 为代表，对同一输入下未执行的代码做删改，新程序应产生相同结果，差异即为 mis-compile。该类预言机围绕"语义保持"组织判据，仍然在功能输出层面观察，无法触及运行期防御契约。</w:t>
+            </w:r>
+          </w:p>
+          <w:p>
+            <w:pPr>
+              <w:pStyle w:val="Normal"/>
+              <w:spacing w:lineRule="auto" w:line="360"/>
+              <w:ind w:firstLineChars="200" w:startChars="0" w:start="0" w:endChars="0" w:end="0"/>
+              <w:rPr>
+                <w:kern w:val="0"/>
+                <w:sz w:val="24"/>
+              </w:rPr>
+            </w:pPr>
+            <w:r>
+              <w:rPr>
+                <w:kern w:val="0"/>
+                <w:sz w:val="24"/>
+              </w:rPr>
+              <w:t xml:space="preserve">Sanitizer 预言机借助 ASan 等工具将内存破坏转为显式信号；UBfuzz[18] 进一步用反向定位来测试 sanitizer 自身实现缺陷。Sanitizer 关心程序自身的内存安全，其覆盖范围与“内置防御机制是否生效”不重叠。复合预言机如 HirGen[19] 虽在 IR 层结合差分与变形，但同样不针对编译器的防御机制。</w:t>
+            </w:r>
+          </w:p>
+          <w:p>
+            <w:pPr>
+              <w:pStyle w:val="Normal"/>
+              <w:spacing w:lineRule="auto" w:line="360"/>
+              <w:ind w:firstLineChars="200" w:startChars="0" w:start="0" w:endChars="0" w:end="0"/>
+              <w:rPr>
+                <w:kern w:val="0"/>
+                <w:sz w:val="24"/>
+              </w:rPr>
+            </w:pPr>
+            <w:r>
+              <w:rPr>
+                <w:kern w:val="0"/>
+                <w:sz w:val="24"/>
+              </w:rPr>
+              <w:t xml:space="preserve">可以看到，现有预言机的判据全部建立在"崩溃"或"可观察输出差异"之上。当缺陷的形态是"代码正常编译运行、运行时保护已被静默削弱"时，它们均无法触发。这正是第一章所述判定空白的来源。</w:t>
+            </w:r>
+          </w:p>
+          <w:p>
+            <w:pPr>
+              <w:pStyle w:val="Normal"/>
+              <w:spacing w:lineRule="auto" w:line="360"/>
               <w:rPr>
                 <w:b/>
                 <w:bCs/>
@@ -3281,33 +3149,36 @@
           </w:p>
           <w:p>
             <w:pPr>
-              <w:spacing w:line="360" w:lineRule="auto"/>
-              <w:ind w:left="0" w:leftChars="0" w:right="0" w:rightChars="0" w:firstLineChars="200"/>
-              <w:rPr>
-                <w:kern w:val="0"/>
-                <w:sz w:val="24"/>
-              </w:rPr>
-            </w:pPr>
-            <w:r>
-              <w:rPr>
-                <w:kern w:val="0"/>
-                <w:sz w:val="24"/>
-              </w:rPr>
-              <w:t>本研究整合现有模糊测试技术的优势，通过提炼跨架构的安全不变量构建专用预言机，并利用大语言模型结合覆盖率反馈实现精确变异，从而系统性暴露编译器在防御机制上的静默失效漏洞。本研究在第三、四章给出对应的解法：把每条防御机制的安全不变量翻译为可机器判定的检查器以填补预言机空白；在大模型与覆盖率联合驱动的种子生成主循环中，把目标基本块选择限定在防御机制相关代码区域，使搜索空间被显式压缩到矩阵中那些尚未触达的格点附近。</w:t>
-            </w:r>
-          </w:p>
-          <w:p>
-            <w:pPr>
-              <w:spacing w:line="360" w:lineRule="auto"/>
-              <w:rPr>
-                <w:sz w:val="24"/>
-              </w:rPr>
-            </w:pPr>
-          </w:p>
-          <w:p>
-            <w:pPr>
+              <w:pStyle w:val="Normal"/>
+              <w:spacing w:lineRule="auto" w:line="360"/>
+              <w:ind w:firstLineChars="200" w:startChars="0" w:start="0" w:endChars="0" w:end="0"/>
+              <w:rPr>
+                <w:kern w:val="0"/>
+                <w:sz w:val="24"/>
+              </w:rPr>
+            </w:pPr>
+            <w:r>
+              <w:rPr>
+                <w:kern w:val="0"/>
+                <w:sz w:val="24"/>
+              </w:rPr>
+              <w:t xml:space="preserve">本研究整合现有模糊测试技术的优势，通过提炼跨架构的安全不变量构建专用预言机，并利用大语言模型结合覆盖率反馈实现精确变异，从而系统性暴露编译器在防御机制上的静默失效漏洞。本研究在第三、四章给出对应的解法：把每条防御机制的安全不变量翻译为可机器判定的检查器以填补预言机空白；在大模型与覆盖率联合驱动的种子生成主循环中，把目标基本块选择限定在防御机制相关代码区域，使搜索空间被显式压缩到矩阵中那些尚未触达的格点附近。</w:t>
+            </w:r>
+          </w:p>
+          <w:p>
+            <w:pPr>
+              <w:pStyle w:val="Normal"/>
+              <w:spacing w:lineRule="auto" w:line="360"/>
+              <w:rPr>
+                <w:sz w:val="24"/>
+              </w:rPr>
+            </w:pPr>
+          </w:p>
+          <w:p>
+            <w:pPr>
+              <w:pStyle w:val="Normal"/>
               <w:widowControl/>
-              <w:jc w:val="left"/>
+              <w:jc w:val="start"/>
               <w:rPr>
                 <w:b/>
                 <w:bCs/>
@@ -3327,7 +3198,8 @@
           </w:p>
           <w:p>
             <w:pPr>
-              <w:spacing w:line="360" w:lineRule="auto"/>
+              <w:pStyle w:val="Normal"/>
+              <w:spacing w:lineRule="auto" w:line="360"/>
               <w:rPr>
                 <w:b/>
                 <w:bCs/>
@@ -3347,92 +3219,98 @@
           </w:p>
           <w:p>
             <w:pPr>
-              <w:spacing w:line="360" w:lineRule="auto"/>
-              <w:ind w:left="0" w:leftChars="0" w:right="0" w:rightChars="0" w:firstLineChars="200"/>
-              <w:rPr>
-                <w:kern w:val="0"/>
-                <w:sz w:val="24"/>
-              </w:rPr>
-            </w:pPr>
-            <w:r>
-              <w:rPr>
-                <w:kern w:val="0"/>
-                <w:sz w:val="24"/>
-              </w:rPr>
-              <w:t>本课题要构建一种面向编译器自身防御机制的脆弱性分析方法，并在 GCC 与 LLVM 上完成端到端验证。与以崩溃或差分输出为信号的传统编译器 fuzzer 不同，本方法以"防御机制是否仍满足其安全契约"为判据，自动暴露第一章所述的静默失效。具体目标分为以下三项：</w:t>
-            </w:r>
-          </w:p>
-          <w:p>
-            <w:pPr>
-              <w:spacing w:line="360" w:lineRule="auto"/>
-              <w:ind w:left="0" w:leftChars="0" w:right="0" w:rightChars="0" w:firstLineChars="200"/>
-              <w:rPr>
-                <w:kern w:val="0"/>
-                <w:sz w:val="24"/>
-              </w:rPr>
-            </w:pPr>
-            <w:r>
-              <w:rPr>
-                <w:kern w:val="0"/>
-                <w:sz w:val="24"/>
-              </w:rPr>
-              <w:t>(a) 形成一套覆盖主流防御机制的安全不变量集合，每条不变量具备可由二进制或运行行为判定的证据形式，在 GCC 与 LLVM 上保持一致的描述结构；</w:t>
-            </w:r>
-          </w:p>
-          <w:p>
-            <w:pPr>
-              <w:spacing w:line="360" w:lineRule="auto"/>
-              <w:ind w:left="0" w:leftChars="0" w:right="0" w:rightChars="0" w:firstLineChars="200"/>
-              <w:rPr>
-                <w:kern w:val="0"/>
-                <w:sz w:val="24"/>
-              </w:rPr>
-            </w:pPr>
-            <w:r>
-              <w:rPr>
-                <w:kern w:val="0"/>
-                <w:sz w:val="24"/>
-              </w:rPr>
-              <w:t>(b) 构建一个可同时面向 GCC 与 LLVM、跨架构运行的 fuzzer 原型，以防御机制相关代码的源代码覆盖率为推进信号，由大语言模型完成种子精细变异；</w:t>
-            </w:r>
-          </w:p>
-          <w:p>
-            <w:pPr>
-              <w:spacing w:line="360" w:lineRule="auto"/>
-              <w:ind w:left="0" w:leftChars="0" w:right="0" w:rightChars="0" w:firstLineChars="200"/>
-              <w:rPr>
-                <w:kern w:val="0"/>
-                <w:sz w:val="24"/>
-              </w:rPr>
-            </w:pPr>
-            <w:r>
-              <w:rPr>
-                <w:kern w:val="0"/>
-                <w:sz w:val="24"/>
-              </w:rPr>
-              <w:t>(c) 通过该原型在 GCC 与 LLVM 上发现可被上游确认的真实缺陷，验证方法的有效性与跨编译器迁移性。</w:t>
-            </w:r>
-          </w:p>
-          <w:p>
-            <w:pPr>
-              <w:spacing w:line="360" w:lineRule="auto"/>
-              <w:ind w:left="0" w:leftChars="0" w:right="0" w:rightChars="0" w:firstLineChars="200"/>
-              <w:rPr>
-                <w:kern w:val="0"/>
-                <w:sz w:val="24"/>
-              </w:rPr>
-            </w:pPr>
-            <w:r>
-              <w:rPr>
-                <w:kern w:val="0"/>
-                <w:sz w:val="24"/>
-              </w:rPr>
-              <w:t>三个目标依次推进：(a) 提供事实基础，(b) 构建原型，(c) 完成实证验证。其依赖关系与工作内容详见 3.2 节。</w:t>
-            </w:r>
-          </w:p>
-          <w:p>
-            <w:pPr>
-              <w:spacing w:line="360" w:lineRule="auto"/>
+              <w:pStyle w:val="Normal"/>
+              <w:spacing w:lineRule="auto" w:line="360"/>
+              <w:ind w:firstLineChars="200" w:startChars="0" w:start="0" w:endChars="0" w:end="0"/>
+              <w:rPr>
+                <w:kern w:val="0"/>
+                <w:sz w:val="24"/>
+              </w:rPr>
+            </w:pPr>
+            <w:r>
+              <w:rPr>
+                <w:kern w:val="0"/>
+                <w:sz w:val="24"/>
+              </w:rPr>
+              <w:t xml:space="preserve">本课题要构建一种面向编译器自身防御机制的脆弱性分析方法，并在 GCC 与 LLVM 上完成端到端验证。与以崩溃或差分输出为信号的传统编译器 fuzzer 不同，本方法以"防御机制是否仍满足其安全契约"为判据，自动暴露第一章所述的静默失效。具体目标分为以下三项：</w:t>
+            </w:r>
+          </w:p>
+          <w:p>
+            <w:pPr>
+              <w:pStyle w:val="Normal"/>
+              <w:spacing w:lineRule="auto" w:line="360"/>
+              <w:ind w:firstLineChars="200" w:startChars="0" w:start="0" w:endChars="0" w:end="0"/>
+              <w:rPr>
+                <w:kern w:val="0"/>
+                <w:sz w:val="24"/>
+              </w:rPr>
+            </w:pPr>
+            <w:r>
+              <w:rPr>
+                <w:kern w:val="0"/>
+                <w:sz w:val="24"/>
+              </w:rPr>
+              <w:t xml:space="preserve">(a) 形成一套覆盖主流防御机制的安全不变量集合，每条不变量具备可由二进制或运行行为判定的证据形式，在 GCC 与 LLVM 上保持一致的描述结构；</w:t>
+            </w:r>
+          </w:p>
+          <w:p>
+            <w:pPr>
+              <w:pStyle w:val="Normal"/>
+              <w:spacing w:lineRule="auto" w:line="360"/>
+              <w:ind w:firstLineChars="200" w:startChars="0" w:start="0" w:endChars="0" w:end="0"/>
+              <w:rPr>
+                <w:kern w:val="0"/>
+                <w:sz w:val="24"/>
+              </w:rPr>
+            </w:pPr>
+            <w:r>
+              <w:rPr>
+                <w:kern w:val="0"/>
+                <w:sz w:val="24"/>
+              </w:rPr>
+              <w:t xml:space="preserve">(b) 构建一个可同时面向 GCC 与 LLVM、跨架构运行的 fuzzer 原型，以防御机制相关代码的源代码覆盖率为推进信号，由大语言模型完成种子精细变异；</w:t>
+            </w:r>
+          </w:p>
+          <w:p>
+            <w:pPr>
+              <w:pStyle w:val="Normal"/>
+              <w:spacing w:lineRule="auto" w:line="360"/>
+              <w:ind w:firstLineChars="200" w:startChars="0" w:start="0" w:endChars="0" w:end="0"/>
+              <w:rPr>
+                <w:kern w:val="0"/>
+                <w:sz w:val="24"/>
+              </w:rPr>
+            </w:pPr>
+            <w:r>
+              <w:rPr>
+                <w:kern w:val="0"/>
+                <w:sz w:val="24"/>
+              </w:rPr>
+              <w:t xml:space="preserve">(c) 通过该原型在 GCC 与 LLVM 上发现可被上游确认的真实缺陷，验证方法的有效性与跨编译器迁移性。</w:t>
+            </w:r>
+          </w:p>
+          <w:p>
+            <w:pPr>
+              <w:pStyle w:val="Normal"/>
+              <w:spacing w:lineRule="auto" w:line="360"/>
+              <w:ind w:firstLineChars="200" w:startChars="0" w:start="0" w:endChars="0" w:end="0"/>
+              <w:rPr>
+                <w:kern w:val="0"/>
+                <w:sz w:val="24"/>
+              </w:rPr>
+            </w:pPr>
+            <w:r>
+              <w:rPr>
+                <w:kern w:val="0"/>
+                <w:sz w:val="24"/>
+              </w:rPr>
+              <w:t xml:space="preserve">三个目标依次推进：(a) 提供事实基础，(b) 构建原型，(c) 完成实证验证。其依赖关系与工作内容详见 3.2 节。</w:t>
+            </w:r>
+          </w:p>
+          <w:p>
+            <w:pPr>
+              <w:pStyle w:val="Normal"/>
+              <w:spacing w:lineRule="auto" w:line="360"/>
               <w:rPr>
                 <w:b/>
                 <w:bCs/>
@@ -3452,30 +3330,33 @@
           </w:p>
           <w:p>
             <w:pPr>
-              <w:spacing w:line="360" w:lineRule="auto"/>
-              <w:ind w:left="0" w:leftChars="0" w:right="0" w:rightChars="0" w:firstLineChars="200"/>
-              <w:rPr>
-                <w:kern w:val="0"/>
-                <w:sz w:val="24"/>
-              </w:rPr>
-            </w:pPr>
-            <w:r>
-              <w:rPr>
-                <w:kern w:val="0"/>
-                <w:sz w:val="24"/>
-              </w:rPr>
-              <w:t>本课题分为三部分工作，相互依赖关系如图 3 所示：不变量形式化是预言机与种子目标选择的基础；预言机提供安全判定接口；覆盖率驱动的种子生成负责将测试输入推进到特定代码路径。</w:t>
-            </w:r>
-          </w:p>
-          <w:p>
-            <w:pPr>
-              <w:spacing w:line="360" w:lineRule="auto"/>
-              <w:jc w:val="center"/>
-            </w:pPr>
-            <w:r>
+              <w:pStyle w:val="Normal"/>
+              <w:spacing w:lineRule="auto" w:line="360"/>
+              <w:ind w:firstLineChars="200" w:startChars="0" w:start="0" w:endChars="0" w:end="0"/>
+              <w:rPr>
+                <w:kern w:val="0"/>
+                <w:sz w:val="24"/>
+              </w:rPr>
+            </w:pPr>
+            <w:r>
+              <w:rPr>
+                <w:kern w:val="0"/>
+                <w:sz w:val="24"/>
+              </w:rPr>
+              <w:t xml:space="preserve">本课题分为三部分工作，相互依赖关系如图 3 所示：不变量形式化是预言机与种子目标选择的基础；预言机提供安全判定接口；覆盖率驱动的种子生成负责将测试输入推进到特定代码路径。</w:t>
+            </w:r>
+          </w:p>
+          <w:p>
+            <w:pPr>
+              <w:pStyle w:val="Normal"/>
+              <w:spacing w:lineRule="auto" w:line="360"/>
+              <w:jc w:val="center"/>
+            </w:pPr>
+            <w:r>
+              <w:rPr/>
               <w:drawing>
-                <wp:inline distT="0" distB="0" distL="0" distR="0">
-                  <wp:extent cx="5385435" cy="1251585"/>
+                <wp:inline xmlns:wp="http://schemas.openxmlformats.org/drawingml/2006/wordprocessingDrawing" distT="0" distB="0" distL="0" distR="0">
+                  <wp:extent cx="5385714" cy="1252178"/>
                   <wp:effectExtent l="0" t="0" r="0" b="0"/>
                   <wp:docPr id="23" name="Figure23"/>
                   <wp:cNvGraphicFramePr>
@@ -3485,13 +3366,11 @@
                     <a:graphicData uri="http://schemas.openxmlformats.org/drawingml/2006/picture">
                       <pic:pic xmlns:pic="http://schemas.openxmlformats.org/drawingml/2006/picture">
                         <pic:nvPicPr>
-                          <pic:cNvPr id="23" name="Figure23"/>
-                          <pic:cNvPicPr>
-                            <a:picLocks noChangeAspect="1"/>
-                          </pic:cNvPicPr>
+                          <pic:cNvPr id="23" name="pipeline.png"/>
+                          <pic:cNvPicPr/>
                         </pic:nvPicPr>
                         <pic:blipFill>
-                          <a:blip r:embed="rId8"/>
+                          <a:blip xmlns:r="http://schemas.openxmlformats.org/officeDocument/2006/relationships" r:embed="rId23"/>
                           <a:stretch>
                             <a:fillRect/>
                           </a:stretch>
@@ -3514,7 +3393,8 @@
           </w:p>
           <w:p>
             <w:pPr>
-              <w:spacing w:line="360" w:lineRule="auto"/>
+              <w:pStyle w:val="Normal"/>
+              <w:spacing w:lineRule="auto" w:line="360"/>
               <w:jc w:val="center"/>
               <w:rPr>
                 <w:rFonts w:ascii="宋体" w:hAnsi="宋体" w:eastAsia="宋体"/>
@@ -3535,75 +3415,81 @@
           </w:p>
           <w:p>
             <w:pPr>
-              <w:spacing w:line="360" w:lineRule="auto"/>
-              <w:rPr>
-                <w:sz w:val="24"/>
-              </w:rPr>
-            </w:pPr>
-          </w:p>
-          <w:p>
-            <w:pPr>
-              <w:spacing w:line="360" w:lineRule="auto"/>
-              <w:ind w:left="0" w:leftChars="0" w:right="0" w:rightChars="0" w:firstLineChars="200"/>
-              <w:rPr>
-                <w:kern w:val="0"/>
-                <w:sz w:val="24"/>
-              </w:rPr>
-            </w:pPr>
-            <w:r>
-              <w:rPr>
-                <w:kern w:val="0"/>
-                <w:sz w:val="24"/>
-              </w:rPr>
-              <w:t>(1) 防御机制安全不变量的调研与形式化。针对栈金丝雀、_FORTIFY_SOURCE、IBT 等机制，从三类来源提炼其安全不变量：一是编译器源码中的注释与断言（如 GCC 中 AArch64 后端关于 canary 槽位置关系的注释，或 LLVM 中 StackProtector 模块的实现）；二是编译器及系统 ABI 官方文档对开关、接口、属性的规定；三是已确认的历史 bug 与修补点。每条不变量按统一字段记录其陈述、证据片段与版本敏感性，便于机械检索与回归。</w:t>
-            </w:r>
-          </w:p>
-          <w:p>
-            <w:pPr>
-              <w:spacing w:line="360" w:lineRule="auto"/>
-              <w:ind w:left="0" w:leftChars="0" w:right="0" w:rightChars="0" w:firstLineChars="200"/>
-              <w:rPr>
-                <w:kern w:val="0"/>
-                <w:sz w:val="24"/>
-              </w:rPr>
-            </w:pPr>
-            <w:r>
-              <w:rPr>
-                <w:kern w:val="0"/>
-                <w:sz w:val="24"/>
-              </w:rPr>
-              <w:t>(2) 不变量到预言机的工程化落地。将不变量翻译为二进制层面或运行行为上的检查器。框架将检查器分为静态与动态两类：静态检查通过 ELF 符号、指令流模式、属性 note 做断言式判定；动态检查通过受控执行（如对 buffer 填充长度做二分搜索）观察运行行为。预言机判据建立在二进制和运行行为之上，与产生该二进制的具体编译器解耦，GCC 与 LLVM 产物共用同一套检查器。每个机制配置一个聚合器，任一检查器返回 Fail 即记机制级违例并附带证据；同时为每个机制记录开机制/关机制两套 flag profile，框架据此对同一颗种子做对照判定，避免与编译器自身缺省行为混淆。</w:t>
-            </w:r>
-          </w:p>
-          <w:p>
-            <w:pPr>
-              <w:spacing w:line="360" w:lineRule="auto"/>
-              <w:ind w:left="0" w:leftChars="0" w:right="0" w:rightChars="0" w:firstLineChars="200"/>
-              <w:rPr>
-                <w:kern w:val="0"/>
-                <w:sz w:val="24"/>
-              </w:rPr>
-            </w:pPr>
-            <w:r>
-              <w:rPr>
-                <w:kern w:val="0"/>
-                <w:sz w:val="24"/>
-              </w:rPr>
-              <w:t>(3) 大语言模型与覆盖率联合驱动的种子生成。以编译器中防御机制的源代码覆盖率为目标信号，结合控制流图按"未覆盖且与防御机制相关性高"的策略选取基本块作为变异目标。每轮变异流程如下：构造目标上下文（含函数源码、基本块标注及示例种子），调用大模型生成新 C 种子，编译产物经预言机检查。若发现覆盖增量、命中目标或触发 bug，则保存种子。未命中目标但带来新覆盖的种子，将通过轻量级追踪定位发散点，回喂给模型进行下一轮精细变异。该过程确保了大模型生成始终聚焦于防御机制代码路径。</w:t>
-            </w:r>
-          </w:p>
-          <w:p>
-            <w:pPr>
-              <w:spacing w:line="360" w:lineRule="auto"/>
-              <w:rPr>
-                <w:sz w:val="24"/>
-              </w:rPr>
-            </w:pPr>
-          </w:p>
-          <w:p>
-            <w:pPr>
+              <w:pStyle w:val="Normal"/>
+              <w:spacing w:lineRule="auto" w:line="360"/>
+              <w:rPr>
+                <w:sz w:val="24"/>
+              </w:rPr>
+            </w:pPr>
+          </w:p>
+          <w:p>
+            <w:pPr>
+              <w:pStyle w:val="Normal"/>
+              <w:spacing w:lineRule="auto" w:line="360"/>
+              <w:ind w:firstLineChars="200" w:startChars="0" w:start="0" w:endChars="0" w:end="0"/>
+              <w:rPr>
+                <w:kern w:val="0"/>
+                <w:sz w:val="24"/>
+              </w:rPr>
+            </w:pPr>
+            <w:r>
+              <w:rPr>
+                <w:kern w:val="0"/>
+                <w:sz w:val="24"/>
+              </w:rPr>
+              <w:t xml:space="preserve">(1) 防御机制安全不变量的调研与形式化。针对栈金丝雀、_FORTIFY_SOURCE、IBT 等机制，从三类来源提炼其安全不变量：一是编译器源码中的注释与断言（如 GCC 中 AArch64 后端关于 canary 槽位置关系的注释，或 LLVM 中 StackProtector 模块的实现）；二是编译器及系统 ABI 官方文档对开关、接口、属性的规定；三是已确认的历史 bug 与修补点。每条不变量按统一字段记录其陈述、证据片段与版本敏感性，便于机械检索与回归。</w:t>
+            </w:r>
+          </w:p>
+          <w:p>
+            <w:pPr>
+              <w:pStyle w:val="Normal"/>
+              <w:spacing w:lineRule="auto" w:line="360"/>
+              <w:ind w:firstLineChars="200" w:startChars="0" w:start="0" w:endChars="0" w:end="0"/>
+              <w:rPr>
+                <w:kern w:val="0"/>
+                <w:sz w:val="24"/>
+              </w:rPr>
+            </w:pPr>
+            <w:r>
+              <w:rPr>
+                <w:kern w:val="0"/>
+                <w:sz w:val="24"/>
+              </w:rPr>
+              <w:t xml:space="preserve">(2) 不变量到预言机的工程化落地。将不变量翻译为二进制层面或运行行为上的检查器。框架将检查器分为静态与动态两类：静态检查通过 ELF 符号、指令流模式、属性 note 做断言式判定；动态检查通过受控执行（如对 buffer 填充长度做二分搜索）观察运行行为。预言机判据建立在二进制和运行行为之上，与产生该二进制的具体编译器解耦，GCC 与 LLVM 产物共用同一套检查器。每个机制配置一个聚合器，任一检查器返回 Fail 即记机制级违例并附带证据；同时为每个机制记录开机制/关机制两套 flag profile，框架据此对同一颗种子做对照判定，避免与编译器自身缺省行为混淆。</w:t>
+            </w:r>
+          </w:p>
+          <w:p>
+            <w:pPr>
+              <w:pStyle w:val="Normal"/>
+              <w:spacing w:lineRule="auto" w:line="360"/>
+              <w:ind w:firstLineChars="200" w:startChars="0" w:start="0" w:endChars="0" w:end="0"/>
+              <w:rPr>
+                <w:kern w:val="0"/>
+                <w:sz w:val="24"/>
+              </w:rPr>
+            </w:pPr>
+            <w:r>
+              <w:rPr>
+                <w:kern w:val="0"/>
+                <w:sz w:val="24"/>
+              </w:rPr>
+              <w:t xml:space="preserve">(3) 大语言模型与覆盖率联合驱动的种子生成。以编译器中防御机制的源代码覆盖率为目标信号，结合控制流图按"未覆盖且与防御机制相关性高"的策略选取基本块作为变异目标。每轮变异流程如下：构造目标上下文（含函数源码、基本块标注及示例种子），调用大模型生成新 C 种子，编译产物经预言机检查。若发现覆盖增量、命中目标或触发 bug，则保存种子。未命中目标但带来新覆盖的种子，将通过轻量级追踪定位发散点，回喂给模型进行下一轮精细变异。该过程确保了大模型生成始终聚焦于防御机制代码路径。</w:t>
+            </w:r>
+          </w:p>
+          <w:p>
+            <w:pPr>
+              <w:pStyle w:val="Normal"/>
+              <w:spacing w:lineRule="auto" w:line="360"/>
+              <w:rPr>
+                <w:sz w:val="24"/>
+              </w:rPr>
+            </w:pPr>
+          </w:p>
+          <w:p>
+            <w:pPr>
+              <w:pStyle w:val="Normal"/>
               <w:widowControl/>
-              <w:jc w:val="left"/>
+              <w:jc w:val="start"/>
               <w:rPr>
                 <w:b/>
                 <w:bCs/>
@@ -3623,24 +3509,26 @@
           </w:p>
           <w:p>
             <w:pPr>
-              <w:spacing w:line="360" w:lineRule="auto"/>
-              <w:ind w:left="0" w:leftChars="0" w:right="0" w:rightChars="0" w:firstLineChars="200"/>
-              <w:rPr>
-                <w:kern w:val="0"/>
-                <w:sz w:val="24"/>
-              </w:rPr>
-            </w:pPr>
-            <w:r>
-              <w:rPr>
-                <w:kern w:val="0"/>
-                <w:sz w:val="24"/>
-              </w:rPr>
-              <w:t>技术路线分为总体架构、防御机制不变量预言机框架、大语言模型驱动的种子变异主循环、跨架构与编译选项调度四部分，对应研究内容 (1)–(3) 的工程实现。GCC 上的初步验证证据见第五章。</w:t>
-            </w:r>
-          </w:p>
-          <w:p>
-            <w:pPr>
-              <w:spacing w:line="360" w:lineRule="auto"/>
+              <w:pStyle w:val="Normal"/>
+              <w:spacing w:lineRule="auto" w:line="360"/>
+              <w:ind w:firstLineChars="200" w:startChars="0" w:start="0" w:endChars="0" w:end="0"/>
+              <w:rPr>
+                <w:kern w:val="0"/>
+                <w:sz w:val="24"/>
+              </w:rPr>
+            </w:pPr>
+            <w:r>
+              <w:rPr>
+                <w:kern w:val="0"/>
+                <w:sz w:val="24"/>
+              </w:rPr>
+              <w:t xml:space="preserve">技术路线分为总体架构、防御机制不变量预言机框架、大语言模型驱动的种子变异主循环、跨架构与编译选项调度四部分，对应研究内容 (1)–(3) 的工程实现。GCC 上的初步验证证据见第五章。</w:t>
+            </w:r>
+          </w:p>
+          <w:p>
+            <w:pPr>
+              <w:pStyle w:val="Normal"/>
+              <w:spacing w:lineRule="auto" w:line="360"/>
               <w:rPr>
                 <w:b/>
                 <w:bCs/>
@@ -3660,30 +3548,33 @@
           </w:p>
           <w:p>
             <w:pPr>
-              <w:spacing w:line="360" w:lineRule="auto"/>
-              <w:ind w:left="0" w:leftChars="0" w:right="0" w:rightChars="0" w:firstLineChars="200"/>
-              <w:rPr>
-                <w:kern w:val="0"/>
-                <w:sz w:val="24"/>
-              </w:rPr>
-            </w:pPr>
-            <w:r>
-              <w:rPr>
-                <w:kern w:val="0"/>
-                <w:sz w:val="24"/>
-              </w:rPr>
-              <w:t>系统以一条 fuzz 主循环为骨干，由 LLM 变异、编译器、预言机三个子系统以及种子语料库、配置模块共同支撑，结构如图 4 所示。Fuzz 引擎承担主循环调度与提示词组装两项职能，将当前覆盖率、目标基本块和已有种子拼装成提示词交给 LLM 变异子系统，获取新种子后分发给后续环节。编译器子系统封装预先插桩的 GCC 与 LLVM，将底层差异数据（如 gcov 与 SanitizerCoverage）统一归并为同构的"行级覆盖 → 种子 ID"映射，主循环对此无感知。预言机子系统按防御机制聚合不变量检查器，对编译成功的种子进行安全契约判定。种子语料库持久化满足质量阈值的种子并维护家系信息。配置模块按"防御机制 · ISA · flag"三元组下发任务：把工具链选择（GCC / LLVM）与对应 flag 交给编译器子系统，把目标 ISA 对应的 QEMU 工具链交给预言机的执行层，使同一份种子可在不同后端上做对照实验，从而以可重复的方式覆盖第一章所述的"防御机制 × ISA"矩阵。</w:t>
-            </w:r>
-          </w:p>
-          <w:p>
-            <w:pPr>
-              <w:spacing w:line="360" w:lineRule="auto"/>
-              <w:jc w:val="center"/>
-            </w:pPr>
-            <w:r>
+              <w:pStyle w:val="Normal"/>
+              <w:spacing w:lineRule="auto" w:line="360"/>
+              <w:ind w:firstLineChars="200" w:startChars="0" w:start="0" w:endChars="0" w:end="0"/>
+              <w:rPr>
+                <w:kern w:val="0"/>
+                <w:sz w:val="24"/>
+              </w:rPr>
+            </w:pPr>
+            <w:r>
+              <w:rPr>
+                <w:kern w:val="0"/>
+                <w:sz w:val="24"/>
+              </w:rPr>
+              <w:t xml:space="preserve">系统以一条 fuzz 主循环为骨干，由 LLM 变异、编译器、预言机三个子系统以及种子语料库、配置模块共同支撑，结构如图 4 所示。Fuzz 引擎承担主循环调度与提示词组装两项职能，将当前覆盖率、目标基本块和已有种子拼装成提示词交给 LLM 变异子系统，获取新种子后分发给后续环节。编译器子系统封装预先插桩的 GCC 与 LLVM，将底层差异数据（如 gcov 与 SanitizerCoverage）统一归并为同构的"行级覆盖 → 种子 ID"映射，主循环对此无感知。预言机子系统按防御机制聚合不变量检查器，对编译成功的种子进行安全契约判定。种子语料库持久化满足质量阈值的种子并维护家系信息。配置模块按"防御机制 · ISA · flag"三元组下发任务：把工具链选择（GCC / LLVM）与对应 flag 交给编译器子系统，把目标 ISA 对应的 QEMU 工具链交给预言机的执行层，使同一份种子可在不同后端上做对照实验，从而以可重复的方式覆盖第一章所述的"防御机制 × ISA"矩阵。</w:t>
+            </w:r>
+          </w:p>
+          <w:p>
+            <w:pPr>
+              <w:pStyle w:val="Normal"/>
+              <w:spacing w:lineRule="auto" w:line="360"/>
+              <w:jc w:val="center"/>
+            </w:pPr>
+            <w:r>
+              <w:rPr/>
               <w:drawing>
-                <wp:inline distT="0" distB="0" distL="0" distR="0">
-                  <wp:extent cx="5385435" cy="2461895"/>
+                <wp:inline xmlns:wp="http://schemas.openxmlformats.org/drawingml/2006/wordprocessingDrawing" distT="0" distB="0" distL="0" distR="0">
+                  <wp:extent cx="5385714" cy="2462468"/>
                   <wp:effectExtent l="0" t="0" r="0" b="0"/>
                   <wp:docPr id="24" name="Figure24"/>
                   <wp:cNvGraphicFramePr>
@@ -3693,13 +3584,11 @@
                     <a:graphicData uri="http://schemas.openxmlformats.org/drawingml/2006/picture">
                       <pic:pic xmlns:pic="http://schemas.openxmlformats.org/drawingml/2006/picture">
                         <pic:nvPicPr>
-                          <pic:cNvPr id="24" name="Figure24"/>
-                          <pic:cNvPicPr>
-                            <a:picLocks noChangeAspect="1"/>
-                          </pic:cNvPicPr>
+                          <pic:cNvPr id="24" name="architecture.png"/>
+                          <pic:cNvPicPr/>
                         </pic:nvPicPr>
                         <pic:blipFill>
-                          <a:blip r:embed="rId9"/>
+                          <a:blip xmlns:r="http://schemas.openxmlformats.org/officeDocument/2006/relationships" r:embed="rId24"/>
                           <a:stretch>
                             <a:fillRect/>
                           </a:stretch>
@@ -3722,7 +3611,8 @@
           </w:p>
           <w:p>
             <w:pPr>
-              <w:spacing w:line="360" w:lineRule="auto"/>
+              <w:pStyle w:val="Normal"/>
+              <w:spacing w:lineRule="auto" w:line="360"/>
               <w:jc w:val="center"/>
               <w:rPr>
                 <w:rFonts w:ascii="宋体" w:hAnsi="宋体" w:eastAsia="宋体"/>
@@ -3743,15 +3633,17 @@
           </w:p>
           <w:p>
             <w:pPr>
-              <w:spacing w:line="360" w:lineRule="auto"/>
-              <w:rPr>
-                <w:sz w:val="24"/>
-              </w:rPr>
-            </w:pPr>
-          </w:p>
-          <w:p>
-            <w:pPr>
-              <w:spacing w:line="360" w:lineRule="auto"/>
+              <w:pStyle w:val="Normal"/>
+              <w:spacing w:lineRule="auto" w:line="360"/>
+              <w:rPr>
+                <w:sz w:val="24"/>
+              </w:rPr>
+            </w:pPr>
+          </w:p>
+          <w:p>
+            <w:pPr>
+              <w:pStyle w:val="Normal"/>
+              <w:spacing w:lineRule="auto" w:line="360"/>
               <w:rPr>
                 <w:b/>
                 <w:bCs/>
@@ -3771,30 +3663,33 @@
           </w:p>
           <w:p>
             <w:pPr>
-              <w:spacing w:line="360" w:lineRule="auto"/>
-              <w:ind w:left="0" w:leftChars="0" w:right="0" w:rightChars="0" w:firstLineChars="200"/>
-              <w:rPr>
-                <w:kern w:val="0"/>
-                <w:sz w:val="24"/>
-              </w:rPr>
-            </w:pPr>
-            <w:r>
-              <w:rPr>
-                <w:kern w:val="0"/>
-                <w:sz w:val="24"/>
-              </w:rPr>
-              <w:t>每个机制对应一个聚合器，下挂若干检查器。判定流程如图 5 所示，检查器输入包括种子的源码、汇编与二进制文件。检查器分为两类：静态检查器通过 ELF 符号表、指令字节模式与 .note 段进行断言；动态检查器则通过受控执行（如二分搜索）观察运行期越界表现。每个检查器返回 Pass、Fail 或 Error，聚合时任一 Fail 即视为机制级违例，并回写触发证据。对于易与编译器缺省行为混淆的检查器，框架会同时运行开/关机制的两套配置进行比对。预言机还维护一份缓存以复用执行结果，避免重复解析。</w:t>
-            </w:r>
-          </w:p>
-          <w:p>
-            <w:pPr>
-              <w:spacing w:line="360" w:lineRule="auto"/>
-              <w:jc w:val="center"/>
-            </w:pPr>
-            <w:r>
+              <w:pStyle w:val="Normal"/>
+              <w:spacing w:lineRule="auto" w:line="360"/>
+              <w:ind w:firstLineChars="200" w:startChars="0" w:start="0" w:endChars="0" w:end="0"/>
+              <w:rPr>
+                <w:kern w:val="0"/>
+                <w:sz w:val="24"/>
+              </w:rPr>
+            </w:pPr>
+            <w:r>
+              <w:rPr>
+                <w:kern w:val="0"/>
+                <w:sz w:val="24"/>
+              </w:rPr>
+              <w:t xml:space="preserve">每个机制对应一个聚合器，下挂若干检查器。判定流程如图 5 所示，检查器输入包括种子的源码、汇编与二进制文件。检查器分为两类：静态检查器通过 ELF 符号表、指令字节模式与 .note 段进行断言；动态检查器则通过受控执行（如二分搜索）观察运行期越界表现。每个检查器返回 Pass、Fail 或 Error，聚合时任一 Fail 即视为机制级违例，并回写触发证据。对于易与编译器缺省行为混淆的检查器，框架会同时运行开/关机制的两套配置进行比对。预言机还维护一份缓存以复用执行结果，避免重复解析。</w:t>
+            </w:r>
+          </w:p>
+          <w:p>
+            <w:pPr>
+              <w:pStyle w:val="Normal"/>
+              <w:spacing w:lineRule="auto" w:line="360"/>
+              <w:jc w:val="center"/>
+            </w:pPr>
+            <w:r>
+              <w:rPr/>
               <w:drawing>
-                <wp:inline distT="0" distB="0" distL="0" distR="0">
-                  <wp:extent cx="4283710" cy="5612130"/>
+                <wp:inline xmlns:wp="http://schemas.openxmlformats.org/drawingml/2006/wordprocessingDrawing" distT="0" distB="0" distL="0" distR="0">
+                  <wp:extent cx="4284090" cy="5612159"/>
                   <wp:effectExtent l="0" t="0" r="0" b="0"/>
                   <wp:docPr id="25" name="Figure25"/>
                   <wp:cNvGraphicFramePr>
@@ -3804,13 +3699,11 @@
                     <a:graphicData uri="http://schemas.openxmlformats.org/drawingml/2006/picture">
                       <pic:pic xmlns:pic="http://schemas.openxmlformats.org/drawingml/2006/picture">
                         <pic:nvPicPr>
-                          <pic:cNvPr id="25" name="Figure25"/>
-                          <pic:cNvPicPr>
-                            <a:picLocks noChangeAspect="1"/>
-                          </pic:cNvPicPr>
+                          <pic:cNvPr id="25" name="oracle-flow.png"/>
+                          <pic:cNvPicPr/>
                         </pic:nvPicPr>
                         <pic:blipFill>
-                          <a:blip r:embed="rId10"/>
+                          <a:blip xmlns:r="http://schemas.openxmlformats.org/officeDocument/2006/relationships" r:embed="rId25"/>
                           <a:stretch>
                             <a:fillRect/>
                           </a:stretch>
@@ -3833,7 +3726,8 @@
           </w:p>
           <w:p>
             <w:pPr>
-              <w:spacing w:line="360" w:lineRule="auto"/>
+              <w:pStyle w:val="Normal"/>
+              <w:spacing w:lineRule="auto" w:line="360"/>
               <w:jc w:val="center"/>
               <w:rPr>
                 <w:rFonts w:ascii="宋体" w:hAnsi="宋体" w:eastAsia="宋体"/>
@@ -3854,15 +3748,17 @@
           </w:p>
           <w:p>
             <w:pPr>
-              <w:spacing w:line="360" w:lineRule="auto"/>
-              <w:rPr>
-                <w:sz w:val="24"/>
-              </w:rPr>
-            </w:pPr>
-          </w:p>
-          <w:p>
-            <w:pPr>
-              <w:spacing w:line="360" w:lineRule="auto"/>
+              <w:pStyle w:val="Normal"/>
+              <w:spacing w:lineRule="auto" w:line="360"/>
+              <w:rPr>
+                <w:sz w:val="24"/>
+              </w:rPr>
+            </w:pPr>
+          </w:p>
+          <w:p>
+            <w:pPr>
+              <w:pStyle w:val="Normal"/>
+              <w:spacing w:lineRule="auto" w:line="360"/>
               <w:rPr>
                 <w:b/>
                 <w:bCs/>
@@ -3882,30 +3778,33 @@
           </w:p>
           <w:p>
             <w:pPr>
-              <w:spacing w:line="360" w:lineRule="auto"/>
-              <w:ind w:left="0" w:leftChars="0" w:right="0" w:rightChars="0" w:firstLineChars="200"/>
-              <w:rPr>
-                <w:kern w:val="0"/>
-                <w:sz w:val="24"/>
-              </w:rPr>
-            </w:pPr>
-            <w:r>
-              <w:rPr>
-                <w:kern w:val="0"/>
-                <w:sz w:val="24"/>
-              </w:rPr>
-              <w:t>主循环的输入为当前覆盖率映射与编译器源码控制流图，单轮迭代过程如图 6 所示。每轮先在未覆盖基本块中按相关性挑出一个目标，相关性由该基本块在 CFG 上的后继分支数和所属代码区域对防御机制的关联程度共同决定，使搜索集中在未触达且与防御逻辑相关的代码上。随后构造目标上下文：目标函数源码片段、逐行覆盖标注、目标基本块位置，以及覆盖目标前驱的若干示例种子。提示词组装层将上下文与基础变异提示词、机制契约要求拼接，提交给大语言模型生成新 C 种子。编译失败时反馈错误信息进入下一轮；编译成功后覆盖率分析器判断命中情况，预言机给出安全判定。结果分析阶段同时观察覆盖增量、是否命中目标、是否触发 bug，任一为真即保存种子。种子未命中目标但带来新覆盖时，利用轻量动态追踪定位其与基线种子在调用序列上的首个发散点，将发散函数源码作为额外上下文反馈给变异提示，请求模型重新精细变异。目标基本块全部覆盖后，主循环可切换至随机变异阶段，仅以预言机为保存条件继续探索。</w:t>
-            </w:r>
-          </w:p>
-          <w:p>
-            <w:pPr>
-              <w:spacing w:line="360" w:lineRule="auto"/>
-              <w:jc w:val="center"/>
-            </w:pPr>
-            <w:r>
+              <w:pStyle w:val="Normal"/>
+              <w:spacing w:lineRule="auto" w:line="360"/>
+              <w:ind w:firstLineChars="200" w:startChars="0" w:start="0" w:endChars="0" w:end="0"/>
+              <w:rPr>
+                <w:kern w:val="0"/>
+                <w:sz w:val="24"/>
+              </w:rPr>
+            </w:pPr>
+            <w:r>
+              <w:rPr>
+                <w:kern w:val="0"/>
+                <w:sz w:val="24"/>
+              </w:rPr>
+              <w:t xml:space="preserve">主循环的输入为当前覆盖率映射与编译器源码控制流图，单轮迭代过程如图 6 所示。每轮先在未覆盖基本块中按相关性挑出一个目标，相关性由该基本块在 CFG 上的后继分支数和所属代码区域对防御机制的关联程度共同决定，使搜索集中在未触达且与防御逻辑相关的代码上。随后构造目标上下文：目标函数源码片段、逐行覆盖标注、目标基本块位置，以及覆盖目标前驱的若干示例种子。提示词组装层将上下文与基础变异提示词、机制契约要求拼接，提交给大语言模型生成新 C 种子。编译失败时反馈错误信息进入下一轮；编译成功后覆盖率分析器判断命中情况，预言机给出安全判定。结果分析阶段同时观察覆盖增量、是否命中目标、是否触发 bug，任一为真即保存种子。种子未命中目标但带来新覆盖时，利用轻量动态追踪定位其与基线种子在调用序列上的首个发散点，将发散函数源码作为额外上下文反馈给变异提示，请求模型重新精细变异。目标基本块全部覆盖后，主循环可切换至随机变异阶段，仅以预言机为保存条件继续探索。</w:t>
+            </w:r>
+          </w:p>
+          <w:p>
+            <w:pPr>
+              <w:pStyle w:val="Normal"/>
+              <w:spacing w:lineRule="auto" w:line="360"/>
+              <w:jc w:val="center"/>
+            </w:pPr>
+            <w:r>
+              <w:rPr/>
               <w:drawing>
-                <wp:inline distT="0" distB="0" distL="0" distR="0">
-                  <wp:extent cx="4139565" cy="6724650"/>
+                <wp:inline xmlns:wp="http://schemas.openxmlformats.org/drawingml/2006/wordprocessingDrawing" distT="0" distB="0" distL="0" distR="0">
+                  <wp:extent cx="4140166" cy="6725183"/>
                   <wp:effectExtent l="0" t="0" r="0" b="0"/>
                   <wp:docPr id="26" name="Figure26"/>
                   <wp:cNvGraphicFramePr>
@@ -3915,13 +3814,11 @@
                     <a:graphicData uri="http://schemas.openxmlformats.org/drawingml/2006/picture">
                       <pic:pic xmlns:pic="http://schemas.openxmlformats.org/drawingml/2006/picture">
                         <pic:nvPicPr>
-                          <pic:cNvPr id="26" name="Figure26"/>
-                          <pic:cNvPicPr>
-                            <a:picLocks noChangeAspect="1"/>
-                          </pic:cNvPicPr>
+                          <pic:cNvPr id="26" name="main-loop.png"/>
+                          <pic:cNvPicPr/>
                         </pic:nvPicPr>
                         <pic:blipFill>
-                          <a:blip r:embed="rId11"/>
+                          <a:blip xmlns:r="http://schemas.openxmlformats.org/officeDocument/2006/relationships" r:embed="rId26"/>
                           <a:stretch>
                             <a:fillRect/>
                           </a:stretch>
@@ -3944,7 +3841,8 @@
           </w:p>
           <w:p>
             <w:pPr>
-              <w:spacing w:line="360" w:lineRule="auto"/>
+              <w:pStyle w:val="Normal"/>
+              <w:spacing w:lineRule="auto" w:line="360"/>
               <w:jc w:val="center"/>
               <w:rPr>
                 <w:rFonts w:ascii="宋体" w:hAnsi="宋体" w:eastAsia="宋体"/>
@@ -3965,15 +3863,17 @@
           </w:p>
           <w:p>
             <w:pPr>
-              <w:spacing w:line="360" w:lineRule="auto"/>
-              <w:rPr>
-                <w:sz w:val="24"/>
-              </w:rPr>
-            </w:pPr>
-          </w:p>
-          <w:p>
-            <w:pPr>
-              <w:spacing w:line="360" w:lineRule="auto"/>
+              <w:pStyle w:val="Normal"/>
+              <w:spacing w:lineRule="auto" w:line="360"/>
+              <w:rPr>
+                <w:sz w:val="24"/>
+              </w:rPr>
+            </w:pPr>
+          </w:p>
+          <w:p>
+            <w:pPr>
+              <w:pStyle w:val="Normal"/>
+              <w:spacing w:lineRule="auto" w:line="360"/>
               <w:rPr>
                 <w:b/>
                 <w:bCs/>
@@ -3993,33 +3893,36 @@
           </w:p>
           <w:p>
             <w:pPr>
-              <w:spacing w:line="360" w:lineRule="auto"/>
-              <w:ind w:left="0" w:leftChars="0" w:right="0" w:rightChars="0" w:firstLineChars="200"/>
-              <w:rPr>
-                <w:kern w:val="0"/>
-                <w:sz w:val="24"/>
-              </w:rPr>
-            </w:pPr>
-            <w:r>
-              <w:rPr>
-                <w:kern w:val="0"/>
-                <w:sz w:val="24"/>
-              </w:rPr>
-              <w:t>配置模块将编译命令参数化为编译器、ISA、架构 flag、策略 flag 方案四元组，向子系统下发对应工具链，使同一种子可分发至不同后端经 QEMU 执行。策略方案包含开/关机制两套配置，供预言机对照判定。不同编译器间的 flag 拼写差异被统一抽象，而二进制解析层（BinaryInspector）则屏蔽了各 ISA 间的底层格式差异，为检查器提供通用判定能力。</w:t>
-            </w:r>
-          </w:p>
-          <w:p>
-            <w:pPr>
-              <w:spacing w:line="360" w:lineRule="auto"/>
-              <w:rPr>
-                <w:sz w:val="24"/>
-              </w:rPr>
-            </w:pPr>
-          </w:p>
-          <w:p>
-            <w:pPr>
+              <w:pStyle w:val="Normal"/>
+              <w:spacing w:lineRule="auto" w:line="360"/>
+              <w:ind w:firstLineChars="200" w:startChars="0" w:start="0" w:endChars="0" w:end="0"/>
+              <w:rPr>
+                <w:kern w:val="0"/>
+                <w:sz w:val="24"/>
+              </w:rPr>
+            </w:pPr>
+            <w:r>
+              <w:rPr>
+                <w:kern w:val="0"/>
+                <w:sz w:val="24"/>
+              </w:rPr>
+              <w:t xml:space="preserve">配置模块将编译命令参数化为编译器、ISA、架构 flag、策略 flag 方案四元组，向子系统下发对应工具链，使同一种子可分发至不同后端经 QEMU 执行。策略方案包含开/关机制两套配置，供预言机对照判定。不同编译器间的 flag 拼写差异被统一抽象，而二进制解析层（BinaryInspector）则屏蔽了各 ISA 间的底层格式差异，为检查器提供通用判定能力。</w:t>
+            </w:r>
+          </w:p>
+          <w:p>
+            <w:pPr>
+              <w:pStyle w:val="Normal"/>
+              <w:spacing w:lineRule="auto" w:line="360"/>
+              <w:rPr>
+                <w:sz w:val="24"/>
+              </w:rPr>
+            </w:pPr>
+          </w:p>
+          <w:p>
+            <w:pPr>
+              <w:pStyle w:val="Normal"/>
               <w:widowControl/>
-              <w:jc w:val="left"/>
+              <w:jc w:val="start"/>
               <w:rPr>
                 <w:b/>
                 <w:bCs/>
@@ -4039,24 +3942,26 @@
           </w:p>
           <w:p>
             <w:pPr>
-              <w:spacing w:line="360" w:lineRule="auto"/>
-              <w:ind w:left="0" w:leftChars="0" w:right="0" w:rightChars="0" w:firstLineChars="200"/>
-              <w:rPr>
-                <w:kern w:val="0"/>
-                <w:sz w:val="24"/>
-              </w:rPr>
-            </w:pPr>
-            <w:r>
-              <w:rPr>
-                <w:kern w:val="0"/>
-                <w:sz w:val="24"/>
-              </w:rPr>
-              <w:t>目前已在 GCC 的多个版本上测试栈金丝雀、_FORTIFY_SOURCE、IBT 等防御机制，并在 GCC 上发现 3 例已获上游确认的静默失效[6-9]。LLVM 侧实验将在下一阶段进行。下文展开分析其中两例，并在 5.3 节简述第三例（多 ISA 上栈金丝雀寄存器泄露问题）。</w:t>
-            </w:r>
-          </w:p>
-          <w:p>
-            <w:pPr>
-              <w:spacing w:line="360" w:lineRule="auto"/>
+              <w:pStyle w:val="Normal"/>
+              <w:spacing w:lineRule="auto" w:line="360"/>
+              <w:ind w:firstLineChars="200" w:startChars="0" w:start="0" w:endChars="0" w:end="0"/>
+              <w:rPr>
+                <w:kern w:val="0"/>
+                <w:sz w:val="24"/>
+              </w:rPr>
+            </w:pPr>
+            <w:r>
+              <w:rPr>
+                <w:kern w:val="0"/>
+                <w:sz w:val="24"/>
+              </w:rPr>
+              <w:t xml:space="preserve">目前已在 GCC 的多个版本上测试栈金丝雀、_FORTIFY_SOURCE、IBT 等防御机制，并在 GCC 上发现 3 例已获上游确认的静默失效[6-9]。LLVM 侧实验将在下一阶段进行。下文展开分析其中两例，并在 5.3 节简述第三例（多 ISA 上栈金丝雀寄存器泄露问题）。</w:t>
+            </w:r>
+          </w:p>
+          <w:p>
+            <w:pPr>
+              <w:pStyle w:val="Normal"/>
+              <w:spacing w:lineRule="auto" w:line="360"/>
               <w:rPr>
                 <w:b/>
                 <w:bCs/>
@@ -4076,64 +3981,69 @@
           </w:p>
           <w:p>
             <w:pPr>
-              <w:spacing w:line="360" w:lineRule="auto"/>
-              <w:ind w:left="0" w:leftChars="0" w:right="0" w:rightChars="0" w:firstLineChars="200"/>
-              <w:rPr>
-                <w:kern w:val="0"/>
-                <w:sz w:val="24"/>
-              </w:rPr>
-            </w:pPr>
-            <w:r>
-              <w:rPr>
-                <w:kern w:val="0"/>
-                <w:sz w:val="24"/>
-              </w:rPr>
-              <w:t>_FORTIFY_SOURCE 是 GCC 与 glibc 配合的源代码加固机制[20]。开启后，glibc 头文件在预处理阶段把 strcat 等危险接口重写为带 size 参数的 __strcat_chk，运行时据此检查目的缓冲区上限。GCC 的 strlen pass 进一步识别已知前缀长度的目的指针，将 __strcat_chk 改写为性能更优的 __stpcpy_chk，并把目的指针前移 strlen(dst) 字节。这里的安全不变量是：目的指针前移后，传给 __stpcpy_chk 的 size 参数必须由原始 objsize 减去 strlen(dst)，否则运行时上限就被静默放宽 strlen(dst) 字节。</w:t>
-            </w:r>
-          </w:p>
-          <w:p>
-            <w:pPr>
-              <w:spacing w:line="360" w:lineRule="auto"/>
-              <w:ind w:left="0" w:leftChars="0" w:right="0" w:rightChars="0" w:firstLineChars="200"/>
-              <w:rPr>
-                <w:kern w:val="0"/>
-                <w:sz w:val="24"/>
-              </w:rPr>
-            </w:pPr>
-            <w:r>
-              <w:rPr>
-                <w:kern w:val="0"/>
-                <w:sz w:val="24"/>
-              </w:rPr>
-              <w:t>本方法构造的种子在该路径上稳定触发了 size 参数未相应减小的实例。反汇编层面 strcat → __strcat_chk → __stpcpy_chk 链条仍然出现，看似 FORTIFY 仍在生效，但"按 dst 剩余空间收紧上限"这一步已被丢弃。上报后该缺陷已被确认（PR-125079[6]）并合入主分支。该路径与 2018 年修复的 PR-87672[21] 位于同一文件，表明当年修复时遗漏了对称分支。</w:t>
-            </w:r>
-          </w:p>
-          <w:p>
-            <w:pPr>
-              <w:spacing w:line="360" w:lineRule="auto"/>
-              <w:ind w:left="0" w:leftChars="0" w:right="0" w:rightChars="0" w:firstLineChars="200"/>
-              <w:rPr>
-                <w:kern w:val="0"/>
-                <w:sz w:val="24"/>
-              </w:rPr>
-            </w:pPr>
-            <w:r>
-              <w:rPr>
-                <w:kern w:val="0"/>
-                <w:sz w:val="24"/>
-              </w:rPr>
-              <w:t>该缺陷命中了"FORTIFY 调用点的 size 参数下界推断"不变量，判定证据为静态符号与反汇编。该位置如图 7 所示。</w:t>
-            </w:r>
-          </w:p>
-          <w:p>
-            <w:pPr>
-              <w:spacing w:line="360" w:lineRule="auto"/>
-              <w:jc w:val="center"/>
-            </w:pPr>
-            <w:r>
+              <w:pStyle w:val="Normal"/>
+              <w:spacing w:lineRule="auto" w:line="360"/>
+              <w:ind w:firstLineChars="200" w:startChars="0" w:start="0" w:endChars="0" w:end="0"/>
+              <w:rPr>
+                <w:kern w:val="0"/>
+                <w:sz w:val="24"/>
+              </w:rPr>
+            </w:pPr>
+            <w:r>
+              <w:rPr>
+                <w:kern w:val="0"/>
+                <w:sz w:val="24"/>
+              </w:rPr>
+              <w:t xml:space="preserve">_FORTIFY_SOURCE 是 GCC 与 glibc 配合的源代码加固机制[20]。开启后，glibc 头文件在预处理阶段把 strcat 等危险接口重写为带 size 参数的 __strcat_chk，运行时据此检查目的缓冲区上限。GCC 的 strlen pass 进一步识别已知前缀长度的目的指针，将 __strcat_chk 改写为性能更优的 __stpcpy_chk，并把目的指针前移 strlen(dst) 字节。这里的安全不变量是：目的指针前移后，传给 __stpcpy_chk 的 size 参数必须由原始 objsize 减去 strlen(dst)，否则运行时上限就被静默放宽 strlen(dst) 字节。</w:t>
+            </w:r>
+          </w:p>
+          <w:p>
+            <w:pPr>
+              <w:pStyle w:val="Normal"/>
+              <w:spacing w:lineRule="auto" w:line="360"/>
+              <w:ind w:firstLineChars="200" w:startChars="0" w:start="0" w:endChars="0" w:end="0"/>
+              <w:rPr>
+                <w:kern w:val="0"/>
+                <w:sz w:val="24"/>
+              </w:rPr>
+            </w:pPr>
+            <w:r>
+              <w:rPr>
+                <w:kern w:val="0"/>
+                <w:sz w:val="24"/>
+              </w:rPr>
+              <w:t xml:space="preserve">本方法构造的种子在该路径上稳定触发了 size 参数未相应减小的实例。反汇编层面 strcat → __strcat_chk → __stpcpy_chk 链条仍然出现，看似 FORTIFY 仍在生效，但"按 dst 剩余空间收紧上限"这一步已被丢弃。上报后该缺陷已被确认（PR-125079[6]）并合入主分支。该路径与 2018 年修复的 PR-87672[21] 位于同一文件，表明当年修复时遗漏了对称分支。</w:t>
+            </w:r>
+          </w:p>
+          <w:p>
+            <w:pPr>
+              <w:pStyle w:val="Normal"/>
+              <w:spacing w:lineRule="auto" w:line="360"/>
+              <w:ind w:firstLineChars="200" w:startChars="0" w:start="0" w:endChars="0" w:end="0"/>
+              <w:rPr>
+                <w:kern w:val="0"/>
+                <w:sz w:val="24"/>
+              </w:rPr>
+            </w:pPr>
+            <w:r>
+              <w:rPr>
+                <w:kern w:val="0"/>
+                <w:sz w:val="24"/>
+              </w:rPr>
+              <w:t xml:space="preserve">该缺陷命中了"FORTIFY 调用点的 size 参数下界推断"不变量，判定证据为静态符号与反汇编。该位置如图 7 所示。</w:t>
+            </w:r>
+          </w:p>
+          <w:p>
+            <w:pPr>
+              <w:pStyle w:val="Normal"/>
+              <w:spacing w:lineRule="auto" w:line="360"/>
+              <w:jc w:val="center"/>
+            </w:pPr>
+            <w:r>
+              <w:rPr/>
               <w:drawing>
-                <wp:inline distT="0" distB="0" distL="0" distR="0">
-                  <wp:extent cx="4283710" cy="6361430"/>
+                <wp:inline xmlns:wp="http://schemas.openxmlformats.org/drawingml/2006/wordprocessingDrawing" distT="0" distB="0" distL="0" distR="0">
+                  <wp:extent cx="4284090" cy="6361875"/>
                   <wp:effectExtent l="0" t="0" r="0" b="0"/>
                   <wp:docPr id="27" name="Figure27"/>
                   <wp:cNvGraphicFramePr>
@@ -4143,13 +4053,11 @@
                     <a:graphicData uri="http://schemas.openxmlformats.org/drawingml/2006/picture">
                       <pic:pic xmlns:pic="http://schemas.openxmlformats.org/drawingml/2006/picture">
                         <pic:nvPicPr>
-                          <pic:cNvPr id="27" name="Figure27"/>
-                          <pic:cNvPicPr>
-                            <a:picLocks noChangeAspect="1"/>
-                          </pic:cNvPicPr>
+                          <pic:cNvPr id="27" name="fortify-path.png"/>
+                          <pic:cNvPicPr/>
                         </pic:nvPicPr>
                         <pic:blipFill>
-                          <a:blip r:embed="rId12"/>
+                          <a:blip xmlns:r="http://schemas.openxmlformats.org/officeDocument/2006/relationships" r:embed="rId27"/>
                           <a:stretch>
                             <a:fillRect/>
                           </a:stretch>
@@ -4172,7 +4080,8 @@
           </w:p>
           <w:p>
             <w:pPr>
-              <w:spacing w:line="360" w:lineRule="auto"/>
+              <w:pStyle w:val="Normal"/>
+              <w:spacing w:lineRule="auto" w:line="360"/>
               <w:jc w:val="center"/>
               <w:rPr>
                 <w:rFonts w:ascii="宋体" w:hAnsi="宋体" w:eastAsia="宋体"/>
@@ -4193,15 +4102,17 @@
           </w:p>
           <w:p>
             <w:pPr>
-              <w:spacing w:line="360" w:lineRule="auto"/>
-              <w:rPr>
-                <w:sz w:val="24"/>
-              </w:rPr>
-            </w:pPr>
-          </w:p>
-          <w:p>
-            <w:pPr>
-              <w:spacing w:line="360" w:lineRule="auto"/>
+              <w:pStyle w:val="Normal"/>
+              <w:spacing w:lineRule="auto" w:line="360"/>
+              <w:rPr>
+                <w:sz w:val="24"/>
+              </w:rPr>
+            </w:pPr>
+          </w:p>
+          <w:p>
+            <w:pPr>
+              <w:pStyle w:val="Normal"/>
+              <w:spacing w:lineRule="auto" w:line="360"/>
               <w:rPr>
                 <w:b/>
                 <w:bCs/>
@@ -4221,58 +4132,62 @@
           </w:p>
           <w:p>
             <w:pPr>
-              <w:spacing w:line="360" w:lineRule="auto"/>
-              <w:ind w:left="0" w:leftChars="0" w:right="0" w:rightChars="0" w:firstLineChars="200"/>
-              <w:rPr>
-                <w:kern w:val="0"/>
-                <w:sz w:val="24"/>
-              </w:rPr>
-            </w:pPr>
-            <w:r>
-              <w:rPr>
-                <w:kern w:val="0"/>
-                <w:sz w:val="24"/>
-              </w:rPr>
-              <w:t>IBT 是 Intel CET 中针对间接跳转的保护机制[22]：硬件要求间接跳转或调用的目标地址必须以 endbr 指令开头，否则触发异常。endbr 在二进制中是固定的四字节值（endbr64 = F3 0F 1E FA、endbr32 = F3 0F 1E FB），按设计只应作为合法间接跳转入口出现在代码段。如果这四个字节以其他形式出现，例如作为 movabsq 指令的 64 位立即数的一部分嵌入 .text，攻击者就可以把控制流劫持到该处，硬件会将其识别为合法 landing pad，IBT 语义被绕过。</w:t>
-            </w:r>
-          </w:p>
-          <w:p>
-            <w:pPr>
-              <w:spacing w:line="360" w:lineRule="auto"/>
-              <w:ind w:left="0" w:leftChars="0" w:right="0" w:rightChars="0" w:firstLineChars="200"/>
-              <w:rPr>
-                <w:kern w:val="0"/>
-                <w:sz w:val="24"/>
-              </w:rPr>
-            </w:pPr>
-            <w:r>
-              <w:rPr>
-                <w:kern w:val="0"/>
-                <w:sz w:val="24"/>
-              </w:rPr>
-              <w:t>GCC 在 x86 后端用 ix86_endbr_immediate_operand 谓词做字节级检测：当目标启用 IBT 时，谓词扫描立即数中是否存在 endbr 模式，含该模式的立即数会被拒绝（同源历史修复参见 PR-96350[23]）。测试发现该谓词存在逻辑漏洞：扫描循环对"高位非零"的 64 位立即数提前退出，只要 endbr 字节排布在立即数高位，扫描就无法到达该位置。这类立即数被错误接受，进而在 .text 中嵌入了伪 landing pad。该缺陷已上报上游（PR-125084[7]），等待维护者回复。</w:t>
-            </w:r>
-          </w:p>
-          <w:p>
-            <w:pPr>
-              <w:spacing w:line="360" w:lineRule="auto"/>
-              <w:ind w:left="0" w:leftChars="0" w:right="0" w:rightChars="0" w:firstLineChars="200"/>
-              <w:rPr>
-                <w:kern w:val="0"/>
-                <w:sz w:val="24"/>
-              </w:rPr>
-            </w:pPr>
-            <w:r>
-              <w:rPr>
-                <w:kern w:val="0"/>
-                <w:sz w:val="24"/>
-              </w:rPr>
-              <w:t>该例命中"endbr 字节模式不应出现在非跳转目标的指令中"不变量，证据为代码段内 endbr 模式扫描，属静态指令流检查。</w:t>
-            </w:r>
-          </w:p>
-          <w:p>
-            <w:pPr>
-              <w:spacing w:line="360" w:lineRule="auto"/>
+              <w:pStyle w:val="Normal"/>
+              <w:spacing w:lineRule="auto" w:line="360"/>
+              <w:ind w:firstLineChars="200" w:startChars="0" w:start="0" w:endChars="0" w:end="0"/>
+              <w:rPr>
+                <w:kern w:val="0"/>
+                <w:sz w:val="24"/>
+              </w:rPr>
+            </w:pPr>
+            <w:r>
+              <w:rPr>
+                <w:kern w:val="0"/>
+                <w:sz w:val="24"/>
+              </w:rPr>
+              <w:t xml:space="preserve">IBT 是 Intel CET 中针对间接跳转的保护机制[22]：硬件要求间接跳转或调用的目标地址必须以 endbr 指令开头，否则触发异常。endbr 在二进制中是固定的四字节值（endbr64 = F3 0F 1E FA、endbr32 = F3 0F 1E FB），按设计只应作为合法间接跳转入口出现在代码段。如果这四个字节以其他形式出现，例如作为 movabsq 指令的 64 位立即数的一部分嵌入 .text，攻击者就可以把控制流劫持到该处，硬件会将其识别为合法 landing pad，IBT 语义被绕过。</w:t>
+            </w:r>
+          </w:p>
+          <w:p>
+            <w:pPr>
+              <w:pStyle w:val="Normal"/>
+              <w:spacing w:lineRule="auto" w:line="360"/>
+              <w:ind w:firstLineChars="200" w:startChars="0" w:start="0" w:endChars="0" w:end="0"/>
+              <w:rPr>
+                <w:kern w:val="0"/>
+                <w:sz w:val="24"/>
+              </w:rPr>
+            </w:pPr>
+            <w:r>
+              <w:rPr>
+                <w:kern w:val="0"/>
+                <w:sz w:val="24"/>
+              </w:rPr>
+              <w:t xml:space="preserve">GCC 在 x86 后端用 ix86_endbr_immediate_operand 谓词做字节级检测：当目标启用 IBT 时，谓词扫描立即数中是否存在 endbr 模式，含该模式的立即数会被拒绝（同源历史修复参见 PR-96350[23]）。测试发现该谓词存在逻辑漏洞：扫描循环对"高位非零"的 64 位立即数提前退出，只要 endbr 字节排布在立即数高位，扫描就无法到达该位置。这类立即数被错误接受，进而在 .text 中嵌入了伪 landing pad。该缺陷已上报上游（PR-125084[7]），等待维护者回复。</w:t>
+            </w:r>
+          </w:p>
+          <w:p>
+            <w:pPr>
+              <w:pStyle w:val="Normal"/>
+              <w:spacing w:lineRule="auto" w:line="360"/>
+              <w:ind w:firstLineChars="200" w:startChars="0" w:start="0" w:endChars="0" w:end="0"/>
+              <w:rPr>
+                <w:kern w:val="0"/>
+                <w:sz w:val="24"/>
+              </w:rPr>
+            </w:pPr>
+            <w:r>
+              <w:rPr>
+                <w:kern w:val="0"/>
+                <w:sz w:val="24"/>
+              </w:rPr>
+              <w:t xml:space="preserve">该例命中"endbr 字节模式不应出现在非跳转目标的指令中"不变量，证据为代码段内 endbr 模式扫描，属静态指令流检查。</w:t>
+            </w:r>
+          </w:p>
+          <w:p>
+            <w:pPr>
+              <w:pStyle w:val="Normal"/>
+              <w:spacing w:lineRule="auto" w:line="360"/>
               <w:rPr>
                 <w:b/>
                 <w:bCs/>
@@ -4292,24 +4207,26 @@
           </w:p>
           <w:p>
             <w:pPr>
-              <w:spacing w:line="360" w:lineRule="auto"/>
-              <w:ind w:left="0" w:leftChars="0" w:right="0" w:rightChars="0" w:firstLineChars="200"/>
-              <w:rPr>
-                <w:kern w:val="0"/>
-                <w:sz w:val="24"/>
-              </w:rPr>
-            </w:pPr>
-            <w:r>
-              <w:rPr>
-                <w:kern w:val="0"/>
-                <w:sz w:val="24"/>
-              </w:rPr>
-              <w:t>本方法在 GCC 通用栈保护后端的 fallback 路径上找到一例同类失效：MIPS、LoongArch 等 ISA 的 fallback 后端未提供专用 epilogue 模板，函数返回时金丝雀寄存器未显式清零，进程级 __stack_chk_guard 值在寄存器中残留。该问题与 2020 年针对 AArch64 / ARM 的 PR-96191[5] 同源，当年修复未覆盖上述后端。本课题以 meta-bug PR-125045[8] 统一跟踪该家族，其中 LoongArch 子例（PR-125049[9]）已被维护者确认并合入修复，其余正依次上报。</w:t>
-            </w:r>
-          </w:p>
-          <w:p>
-            <w:pPr>
-              <w:spacing w:line="360" w:lineRule="auto"/>
+              <w:pStyle w:val="Normal"/>
+              <w:spacing w:lineRule="auto" w:line="360"/>
+              <w:ind w:firstLineChars="200" w:startChars="0" w:start="0" w:endChars="0" w:end="0"/>
+              <w:rPr>
+                <w:kern w:val="0"/>
+                <w:sz w:val="24"/>
+              </w:rPr>
+            </w:pPr>
+            <w:r>
+              <w:rPr>
+                <w:kern w:val="0"/>
+                <w:sz w:val="24"/>
+              </w:rPr>
+              <w:t xml:space="preserve">本方法在 GCC 通用栈保护后端的 fallback 路径上找到一例同类失效：MIPS、LoongArch 等 ISA 的 fallback 后端未提供专用 epilogue 模板，函数返回时金丝雀寄存器未显式清零，进程级 __stack_chk_guard 值在寄存器中残留。该问题与 2020 年针对 AArch64 / ARM 的 PR-96191[5] 同源，当年修复未覆盖上述后端。本课题以 meta-bug PR-125045[8] 统一跟踪该家族，其中 LoongArch 子例（PR-125049[9]）已被维护者确认并合入修复，其余正依次上报。</w:t>
+            </w:r>
+          </w:p>
+          <w:p>
+            <w:pPr>
+              <w:pStyle w:val="Normal"/>
+              <w:spacing w:lineRule="auto" w:line="360"/>
               <w:rPr>
                 <w:b/>
                 <w:bCs/>
@@ -4329,33 +4246,36 @@
           </w:p>
           <w:p>
             <w:pPr>
-              <w:spacing w:line="360" w:lineRule="auto"/>
-              <w:ind w:left="0" w:leftChars="0" w:right="0" w:rightChars="0" w:firstLineChars="200"/>
-              <w:rPr>
-                <w:kern w:val="0"/>
-                <w:sz w:val="24"/>
-              </w:rPr>
-            </w:pPr>
-            <w:r>
-              <w:rPr>
-                <w:kern w:val="0"/>
-                <w:sz w:val="24"/>
-              </w:rPr>
-              <w:t>上述三例缺陷共同说明：即使二进制仍带有保护，其底层依赖的部分安全不变量也可能已经失效。本文方法在不修改编译器的前提下，通过变异与预言机的组合成功将此类隐蔽问题暴露。</w:t>
-            </w:r>
-          </w:p>
-          <w:p>
-            <w:pPr>
-              <w:spacing w:line="360" w:lineRule="auto"/>
-              <w:rPr>
-                <w:sz w:val="24"/>
-              </w:rPr>
-            </w:pPr>
-          </w:p>
-          <w:p>
-            <w:pPr>
+              <w:pStyle w:val="Normal"/>
+              <w:spacing w:lineRule="auto" w:line="360"/>
+              <w:ind w:firstLineChars="200" w:startChars="0" w:start="0" w:endChars="0" w:end="0"/>
+              <w:rPr>
+                <w:kern w:val="0"/>
+                <w:sz w:val="24"/>
+              </w:rPr>
+            </w:pPr>
+            <w:r>
+              <w:rPr>
+                <w:kern w:val="0"/>
+                <w:sz w:val="24"/>
+              </w:rPr>
+              <w:t xml:space="preserve">上述三例缺陷共同说明：即使二进制仍带有保护，其底层依赖的部分安全不变量也可能已经失效。本文方法在不修改编译器的前提下，通过变异与预言机的组合成功将此类隐蔽问题暴露。</w:t>
+            </w:r>
+          </w:p>
+          <w:p>
+            <w:pPr>
+              <w:pStyle w:val="Normal"/>
+              <w:spacing w:lineRule="auto" w:line="360"/>
+              <w:rPr>
+                <w:sz w:val="24"/>
+              </w:rPr>
+            </w:pPr>
+          </w:p>
+          <w:p>
+            <w:pPr>
+              <w:pStyle w:val="Normal"/>
               <w:widowControl/>
-              <w:jc w:val="left"/>
+              <w:jc w:val="start"/>
               <w:rPr>
                 <w:b/>
                 <w:bCs/>
@@ -4375,416 +4295,439 @@
           </w:p>
           <w:p>
             <w:pPr>
+              <w:pStyle w:val="Normal"/>
               <w:keepLines/>
-              <w:spacing w:line="360" w:lineRule="auto"/>
-              <w:jc w:val="left"/>
-              <w:rPr>
-                <w:kern w:val="0"/>
-                <w:sz w:val="24"/>
-              </w:rPr>
-            </w:pPr>
-            <w:r>
-              <w:rPr>
-                <w:kern w:val="0"/>
-                <w:sz w:val="24"/>
-              </w:rPr>
-              <w:t>[1] CVE Program. CVE Metrics — published vulnerabilities trend[EB/OL]. (2026)[2026-05-12]. https://www.cve.org/about/Metrics.</w:t>
-            </w:r>
-          </w:p>
-          <w:p>
-            <w:pPr>
+              <w:spacing w:lineRule="auto" w:line="360"/>
+              <w:jc w:val="start"/>
+              <w:rPr>
+                <w:kern w:val="0"/>
+                <w:sz w:val="24"/>
+              </w:rPr>
+            </w:pPr>
+            <w:r>
+              <w:rPr>
+                <w:kern w:val="0"/>
+                <w:sz w:val="24"/>
+              </w:rPr>
+              <w:t xml:space="preserve">[1] CVE Program. CVE Metrics — published vulnerabilities trend[EB/OL]. (2026)[2026-05-12]. https://www.cve.org/about/Metrics.</w:t>
+            </w:r>
+          </w:p>
+          <w:p>
+            <w:pPr>
+              <w:pStyle w:val="Normal"/>
               <w:keepLines/>
-              <w:spacing w:line="360" w:lineRule="auto"/>
-              <w:jc w:val="left"/>
-              <w:rPr>
-                <w:kern w:val="0"/>
-                <w:sz w:val="24"/>
-              </w:rPr>
-            </w:pPr>
-            <w:r>
-              <w:rPr>
-                <w:kern w:val="0"/>
-                <w:sz w:val="24"/>
-              </w:rPr>
-              <w:t>[2] Microsoft Security Response Center. Microsoft Security Response Center Blog[EB/OL]. (2023)[2026-05-13]. https://www.microsoft.com/en-us/msrc/blog.</w:t>
-            </w:r>
-          </w:p>
-          <w:p>
-            <w:pPr>
+              <w:spacing w:lineRule="auto" w:line="360"/>
+              <w:jc w:val="start"/>
+              <w:rPr>
+                <w:kern w:val="0"/>
+                <w:sz w:val="24"/>
+              </w:rPr>
+            </w:pPr>
+            <w:r>
+              <w:rPr>
+                <w:kern w:val="0"/>
+                <w:sz w:val="24"/>
+              </w:rPr>
+              <w:t xml:space="preserve">[2] Microsoft Security Response Center. Microsoft Security Response Center Blog[EB/OL]. (2023)[2026-05-13]. https://www.microsoft.com/en-us/msrc/blog.</w:t>
+            </w:r>
+          </w:p>
+          <w:p>
+            <w:pPr>
+              <w:pStyle w:val="Normal"/>
               <w:keepLines/>
-              <w:spacing w:line="360" w:lineRule="auto"/>
-              <w:jc w:val="left"/>
-              <w:rPr>
-                <w:kern w:val="0"/>
-                <w:sz w:val="24"/>
-              </w:rPr>
-            </w:pPr>
-            <w:r>
-              <w:rPr>
-                <w:kern w:val="0"/>
-                <w:sz w:val="24"/>
-              </w:rPr>
-              <w:t>[3] Google Security Blog. Memory Safe Languages in Android 13[EB/OL]. (2022-12)[2026-05-13]. https://security.googleblog.com/2022/12/memory-safe-languages-in-android-13.html.</w:t>
-            </w:r>
-          </w:p>
-          <w:p>
-            <w:pPr>
+              <w:spacing w:lineRule="auto" w:line="360"/>
+              <w:jc w:val="start"/>
+              <w:rPr>
+                <w:kern w:val="0"/>
+                <w:sz w:val="24"/>
+              </w:rPr>
+            </w:pPr>
+            <w:r>
+              <w:rPr>
+                <w:kern w:val="0"/>
+                <w:sz w:val="24"/>
+              </w:rPr>
+              <w:t xml:space="preserve">[3] Google Security Blog. Memory Safe Languages in Android 13[EB/OL]. (2022-12)[2026-05-13]. https://security.googleblog.com/2022/12/memory-safe-languages-in-android-13.html.</w:t>
+            </w:r>
+          </w:p>
+          <w:p>
+            <w:pPr>
+              <w:pStyle w:val="Normal"/>
               <w:keepLines/>
-              <w:spacing w:line="360" w:lineRule="auto"/>
-              <w:jc w:val="left"/>
-              <w:rPr>
-                <w:kern w:val="0"/>
-                <w:sz w:val="24"/>
-              </w:rPr>
-            </w:pPr>
-            <w:r>
-              <w:rPr>
-                <w:kern w:val="0"/>
-                <w:sz w:val="24"/>
-              </w:rPr>
-              <w:t>[4] Meta Security. CVE-2023-4039: GCC's -fstack-protector fails to guard dynamic stack allocations on AArch64[EB/OL]. (2023)[2026-02-15]. https://rtx.meta.security/mitigation/2023/09/12/CVE-2023-4039.html.</w:t>
-            </w:r>
-          </w:p>
-          <w:p>
-            <w:pPr>
+              <w:spacing w:lineRule="auto" w:line="360"/>
+              <w:jc w:val="start"/>
+              <w:rPr>
+                <w:kern w:val="0"/>
+                <w:sz w:val="24"/>
+              </w:rPr>
+            </w:pPr>
+            <w:r>
+              <w:rPr>
+                <w:kern w:val="0"/>
+                <w:sz w:val="24"/>
+              </w:rPr>
+              <w:t xml:space="preserve">[4] Meta Security. CVE-2023-4039: GCC's -fstack-protector fails to guard dynamic stack allocations on AArch64[EB/OL]. (2023)[2026-02-15]. https://rtx.meta.security/mitigation/2023/09/12/CVE-2023-4039.html.</w:t>
+            </w:r>
+          </w:p>
+          <w:p>
+            <w:pPr>
+              <w:pStyle w:val="Normal"/>
               <w:keepLines/>
-              <w:spacing w:line="360" w:lineRule="auto"/>
-              <w:jc w:val="left"/>
-              <w:rPr>
-                <w:kern w:val="0"/>
-                <w:sz w:val="24"/>
-              </w:rPr>
-            </w:pPr>
-            <w:r>
-              <w:rPr>
-                <w:kern w:val="0"/>
-                <w:sz w:val="24"/>
-              </w:rPr>
-              <w:t>[5] GNU Project. GCC Bugzilla PR 96191 — aarch64 stack_protect_test canary leak[EB/OL]. (2020)[2026-05-11]. https://gcc.gnu.org/bugzilla/show_bug.cgi?id=96191.</w:t>
-            </w:r>
-          </w:p>
-          <w:p>
-            <w:pPr>
+              <w:spacing w:lineRule="auto" w:line="360"/>
+              <w:jc w:val="start"/>
+              <w:rPr>
+                <w:kern w:val="0"/>
+                <w:sz w:val="24"/>
+              </w:rPr>
+            </w:pPr>
+            <w:r>
+              <w:rPr>
+                <w:kern w:val="0"/>
+                <w:sz w:val="24"/>
+              </w:rPr>
+              <w:t xml:space="preserve">[5] GNU Project. GCC Bugzilla PR 96191 — aarch64 stack_protect_test canary leak[EB/OL]. (2020)[2026-05-11]. https://gcc.gnu.org/bugzilla/show_bug.cgi?id=96191.</w:t>
+            </w:r>
+          </w:p>
+          <w:p>
+            <w:pPr>
+              <w:pStyle w:val="Normal"/>
               <w:keepLines/>
-              <w:spacing w:line="360" w:lineRule="auto"/>
-              <w:jc w:val="left"/>
-              <w:rPr>
-                <w:kern w:val="0"/>
-                <w:sz w:val="24"/>
-              </w:rPr>
-            </w:pPr>
-            <w:r>
-              <w:rPr>
-                <w:kern w:val="0"/>
-                <w:sz w:val="24"/>
-              </w:rPr>
-              <w:t>[6] GNU Project. GCC Bugzilla PR 125079 — [13/14/15 Regression] tree-ssa-strlen get_string_length: __strcat_chk -&gt; __stpcpy_chk drops bound subtract[EB/OL]. (2026)[2026-05-11]. https://gcc.gnu.org/bugzilla/show_bug.cgi?id=125079.</w:t>
-            </w:r>
-          </w:p>
-          <w:p>
-            <w:pPr>
+              <w:spacing w:lineRule="auto" w:line="360"/>
+              <w:jc w:val="start"/>
+              <w:rPr>
+                <w:kern w:val="0"/>
+                <w:sz w:val="24"/>
+              </w:rPr>
+            </w:pPr>
+            <w:r>
+              <w:rPr>
+                <w:kern w:val="0"/>
+                <w:sz w:val="24"/>
+              </w:rPr>
+              <w:t xml:space="preserve">[6] GNU Project. GCC Bugzilla PR 125079 — [13/14/15 Regression] tree-ssa-strlen get_string_length: __strcat_chk -&gt; __stpcpy_chk drops bound subtract[EB/OL]. (2026)[2026-05-11]. https://gcc.gnu.org/bugzilla/show_bug.cgi?id=125079.</w:t>
+            </w:r>
+          </w:p>
+          <w:p>
+            <w:pPr>
+              <w:pStyle w:val="Normal"/>
               <w:keepLines/>
-              <w:spacing w:line="360" w:lineRule="auto"/>
-              <w:jc w:val="left"/>
-              <w:rPr>
-                <w:kern w:val="0"/>
-                <w:sz w:val="24"/>
-              </w:rPr>
-            </w:pPr>
-            <w:r>
-              <w:rPr>
-                <w:kern w:val="0"/>
-                <w:sz w:val="24"/>
-              </w:rPr>
-              <w:t>[7] GNU Project. GCC Bugzilla PR 125084 — [target/i386] ix86_endbr_immediate_operand misses ENDBR pattern when upper bytes nonzero[EB/OL]. (2026)[2026-05-11]. https://gcc.gnu.org/bugzilla/show_bug.cgi?id=125084.</w:t>
-            </w:r>
-          </w:p>
-          <w:p>
-            <w:pPr>
+              <w:spacing w:lineRule="auto" w:line="360"/>
+              <w:jc w:val="start"/>
+              <w:rPr>
+                <w:kern w:val="0"/>
+                <w:sz w:val="24"/>
+              </w:rPr>
+            </w:pPr>
+            <w:r>
+              <w:rPr>
+                <w:kern w:val="0"/>
+                <w:sz w:val="24"/>
+              </w:rPr>
+              <w:t xml:space="preserve">[7] GNU Project. GCC Bugzilla PR 125084 — [target/i386] ix86_endbr_immediate_operand misses ENDBR pattern when upper bytes nonzero[EB/OL]. (2026)[2026-05-11]. https://gcc.gnu.org/bugzilla/show_bug.cgi?id=125084.</w:t>
+            </w:r>
+          </w:p>
+          <w:p>
+            <w:pPr>
+              <w:pStyle w:val="Normal"/>
               <w:keepLines/>
-              <w:spacing w:line="360" w:lineRule="auto"/>
-              <w:jc w:val="left"/>
-              <w:rPr>
-                <w:kern w:val="0"/>
-                <w:sz w:val="24"/>
-              </w:rPr>
-            </w:pPr>
-            <w:r>
-              <w:rPr>
-                <w:kern w:val="0"/>
-                <w:sz w:val="24"/>
-              </w:rPr>
-              <w:t>[8] GNU Project. GCC Bugzilla PR 125045 — [meta-bug] SSP fallback leaves canary in live GPR on many targets[EB/OL]. (2026)[2026-05-11]. https://gcc.gnu.org/bugzilla/show_bug.cgi?id=125045.</w:t>
-            </w:r>
-          </w:p>
-          <w:p>
-            <w:pPr>
+              <w:spacing w:lineRule="auto" w:line="360"/>
+              <w:jc w:val="start"/>
+              <w:rPr>
+                <w:kern w:val="0"/>
+                <w:sz w:val="24"/>
+              </w:rPr>
+            </w:pPr>
+            <w:r>
+              <w:rPr>
+                <w:kern w:val="0"/>
+                <w:sz w:val="24"/>
+              </w:rPr>
+              <w:t xml:space="preserve">[8] GNU Project. GCC Bugzilla PR 125045 — [meta-bug] SSP fallback leaves canary in live GPR on many targets[EB/OL]. (2026)[2026-05-11]. https://gcc.gnu.org/bugzilla/show_bug.cgi?id=125045.</w:t>
+            </w:r>
+          </w:p>
+          <w:p>
+            <w:pPr>
+              <w:pStyle w:val="Normal"/>
               <w:keepLines/>
-              <w:spacing w:line="360" w:lineRule="auto"/>
-              <w:jc w:val="left"/>
-              <w:rPr>
-                <w:kern w:val="0"/>
-                <w:sz w:val="24"/>
-              </w:rPr>
-            </w:pPr>
-            <w:r>
-              <w:rPr>
-                <w:kern w:val="0"/>
-                <w:sz w:val="24"/>
-              </w:rPr>
-              <w:t>[9] GNU Project. GCC Bugzilla PR 125049 — [loongarch] SSP fallback leaves __stack_chk_guard live in $r12 at `jr $r1`[EB/OL]. (2026)[2026-05-11]. https://gcc.gnu.org/bugzilla/show_bug.cgi?id=125049.</w:t>
-            </w:r>
-          </w:p>
-          <w:p>
-            <w:pPr>
+              <w:spacing w:lineRule="auto" w:line="360"/>
+              <w:jc w:val="start"/>
+              <w:rPr>
+                <w:kern w:val="0"/>
+                <w:sz w:val="24"/>
+              </w:rPr>
+            </w:pPr>
+            <w:r>
+              <w:rPr>
+                <w:kern w:val="0"/>
+                <w:sz w:val="24"/>
+              </w:rPr>
+              <w:t xml:space="preserve">[9] GNU Project. GCC Bugzilla PR 125049 — [loongarch] SSP fallback leaves __stack_chk_guard live in $r12 at `jr $r1`[EB/OL]. (2026)[2026-05-11]. https://gcc.gnu.org/bugzilla/show_bug.cgi?id=125049.</w:t>
+            </w:r>
+          </w:p>
+          <w:p>
+            <w:pPr>
+              <w:pStyle w:val="Normal"/>
               <w:keepLines/>
-              <w:spacing w:line="360" w:lineRule="auto"/>
-              <w:jc w:val="left"/>
-              <w:rPr>
-                <w:kern w:val="0"/>
-                <w:sz w:val="24"/>
-              </w:rPr>
-            </w:pPr>
-            <w:r>
-              <w:rPr>
-                <w:kern w:val="0"/>
-                <w:sz w:val="24"/>
-              </w:rPr>
-              <w:t>[10] Yang X, Chen Y, Eide E, et al. Finding and understanding bugs in C compilers[C]//Proceedings of the 32nd ACM SIGPLAN Conference on Programming Language Design and Implementation (PLDI). 2011: 283-294.</w:t>
-            </w:r>
-          </w:p>
-          <w:p>
-            <w:pPr>
+              <w:spacing w:lineRule="auto" w:line="360"/>
+              <w:jc w:val="start"/>
+              <w:rPr>
+                <w:kern w:val="0"/>
+                <w:sz w:val="24"/>
+              </w:rPr>
+            </w:pPr>
+            <w:r>
+              <w:rPr>
+                <w:kern w:val="0"/>
+                <w:sz w:val="24"/>
+              </w:rPr>
+              <w:t xml:space="preserve">[10] Yang X, Chen Y, Eide E, et al. Finding and understanding bugs in C compilers[C]//Proceedings of the 32nd ACM SIGPLAN Conference on Programming Language Design and Implementation (PLDI). 2011: 283-294.</w:t>
+            </w:r>
+          </w:p>
+          <w:p>
+            <w:pPr>
+              <w:pStyle w:val="Normal"/>
               <w:keepLines/>
-              <w:spacing w:line="360" w:lineRule="auto"/>
-              <w:jc w:val="left"/>
-              <w:rPr>
-                <w:kern w:val="0"/>
-                <w:sz w:val="24"/>
-              </w:rPr>
-            </w:pPr>
-            <w:r>
-              <w:rPr>
-                <w:kern w:val="0"/>
-                <w:sz w:val="24"/>
-              </w:rPr>
-              <w:t>[11] Livinskii V, Babokin D, Regehr J. Random testing for C and C++ compilers with YARPGen[C]//Proceedings of the ACM on Programming Languages (OOPSLA). 2020, 4: 1-25.</w:t>
-            </w:r>
-          </w:p>
-          <w:p>
-            <w:pPr>
+              <w:spacing w:lineRule="auto" w:line="360"/>
+              <w:jc w:val="start"/>
+              <w:rPr>
+                <w:kern w:val="0"/>
+                <w:sz w:val="24"/>
+              </w:rPr>
+            </w:pPr>
+            <w:r>
+              <w:rPr>
+                <w:kern w:val="0"/>
+                <w:sz w:val="24"/>
+              </w:rPr>
+              <w:t xml:space="preserve">[11] Livinskii V, Babokin D, Regehr J. Random testing for C and C++ compilers with YARPGen[C]//Proceedings of the ACM on Programming Languages (OOPSLA). 2020, 4: 1-25.</w:t>
+            </w:r>
+          </w:p>
+          <w:p>
+            <w:pPr>
+              <w:pStyle w:val="Normal"/>
               <w:keepLines/>
-              <w:spacing w:line="360" w:lineRule="auto"/>
-              <w:jc w:val="left"/>
-              <w:rPr>
-                <w:kern w:val="0"/>
-                <w:sz w:val="24"/>
-              </w:rPr>
-            </w:pPr>
-            <w:r>
-              <w:rPr>
-                <w:kern w:val="0"/>
-                <w:sz w:val="24"/>
-              </w:rPr>
-              <w:t>[12] Zalewski M. American Fuzzy Lop (AFL)[EB/OL]. (2014)[2026-02-15]. https://lcamtuf.coredump.cx/afl/.</w:t>
-            </w:r>
-          </w:p>
-          <w:p>
-            <w:pPr>
+              <w:spacing w:lineRule="auto" w:line="360"/>
+              <w:jc w:val="start"/>
+              <w:rPr>
+                <w:kern w:val="0"/>
+                <w:sz w:val="24"/>
+              </w:rPr>
+            </w:pPr>
+            <w:r>
+              <w:rPr>
+                <w:kern w:val="0"/>
+                <w:sz w:val="24"/>
+              </w:rPr>
+              <w:t xml:space="preserve">[12] Zalewski M. American Fuzzy Lop (AFL)[EB/OL]. (2014)[2026-02-15]. https://lcamtuf.coredump.cx/afl/.</w:t>
+            </w:r>
+          </w:p>
+          <w:p>
+            <w:pPr>
+              <w:pStyle w:val="Normal"/>
               <w:keepLines/>
-              <w:spacing w:line="360" w:lineRule="auto"/>
-              <w:jc w:val="left"/>
-              <w:rPr>
-                <w:kern w:val="0"/>
-                <w:sz w:val="24"/>
-              </w:rPr>
-            </w:pPr>
-            <w:r>
-              <w:rPr>
-                <w:kern w:val="0"/>
-                <w:sz w:val="24"/>
-              </w:rPr>
-              <w:t>[13] Serebryany K. Continuous fuzzing with libFuzzer and AddressSanitizer[C]//IEEE Cybersecurity Development (SecDev). 2016: 157.</w:t>
-            </w:r>
-          </w:p>
-          <w:p>
-            <w:pPr>
+              <w:spacing w:lineRule="auto" w:line="360"/>
+              <w:jc w:val="start"/>
+              <w:rPr>
+                <w:kern w:val="0"/>
+                <w:sz w:val="24"/>
+              </w:rPr>
+            </w:pPr>
+            <w:r>
+              <w:rPr>
+                <w:kern w:val="0"/>
+                <w:sz w:val="24"/>
+              </w:rPr>
+              <w:t xml:space="preserve">[13] Serebryany K. Continuous fuzzing with libFuzzer and AddressSanitizer[C]//IEEE Cybersecurity Development (SecDev). 2016: 157.</w:t>
+            </w:r>
+          </w:p>
+          <w:p>
+            <w:pPr>
+              <w:pStyle w:val="Normal"/>
               <w:keepLines/>
-              <w:spacing w:line="360" w:lineRule="auto"/>
-              <w:jc w:val="left"/>
-              <w:rPr>
-                <w:kern w:val="0"/>
-                <w:sz w:val="24"/>
-              </w:rPr>
-            </w:pPr>
-            <w:r>
-              <w:rPr>
-                <w:kern w:val="0"/>
-                <w:sz w:val="24"/>
-              </w:rPr>
-              <w:t>[14] Even-Mendoza K, Sharma A, Donaldson A F, et al. GrayC: Greybox fuzzing of compilers and analysers for C[C]//Proceedings of the 32nd ACM SIGSOFT International Symposium on Software Testing and Analysis (ISSTA). 2023: 1219-1231.</w:t>
-            </w:r>
-          </w:p>
-          <w:p>
-            <w:pPr>
+              <w:spacing w:lineRule="auto" w:line="360"/>
+              <w:jc w:val="start"/>
+              <w:rPr>
+                <w:kern w:val="0"/>
+                <w:sz w:val="24"/>
+              </w:rPr>
+            </w:pPr>
+            <w:r>
+              <w:rPr>
+                <w:kern w:val="0"/>
+                <w:sz w:val="24"/>
+              </w:rPr>
+              <w:t xml:space="preserve">[14] Even-Mendoza K, Sharma A, Donaldson A F, et al. GrayC: Greybox fuzzing of compilers and analysers for C[C]//Proceedings of the 32nd ACM SIGSOFT International Symposium on Software Testing and Analysis (ISSTA). 2023: 1219-1231.</w:t>
+            </w:r>
+          </w:p>
+          <w:p>
+            <w:pPr>
+              <w:pStyle w:val="Normal"/>
               <w:keepLines/>
-              <w:spacing w:line="360" w:lineRule="auto"/>
-              <w:jc w:val="left"/>
-              <w:rPr>
-                <w:kern w:val="0"/>
-                <w:sz w:val="24"/>
-              </w:rPr>
-            </w:pPr>
-            <w:r>
-              <w:rPr>
-                <w:kern w:val="0"/>
-                <w:sz w:val="24"/>
-              </w:rPr>
-              <w:t>[15] Le V, Afshari M, Su Z. Compiler validation via equivalence modulo inputs[C]//Proceedings of the 35th ACM SIGPLAN Conference on Programming Language Design and Implementation (PLDI). 2014: 216-226.</w:t>
-            </w:r>
-          </w:p>
-          <w:p>
-            <w:pPr>
+              <w:spacing w:lineRule="auto" w:line="360"/>
+              <w:jc w:val="start"/>
+              <w:rPr>
+                <w:kern w:val="0"/>
+                <w:sz w:val="24"/>
+              </w:rPr>
+            </w:pPr>
+            <w:r>
+              <w:rPr>
+                <w:kern w:val="0"/>
+                <w:sz w:val="24"/>
+              </w:rPr>
+              <w:t xml:space="preserve">[15] Le V, Afshari M, Su Z. Compiler validation via equivalence modulo inputs[C]//Proceedings of the 35th ACM SIGPLAN Conference on Programming Language Design and Implementation (PLDI). 2014: 216-226.</w:t>
+            </w:r>
+          </w:p>
+          <w:p>
+            <w:pPr>
+              <w:pStyle w:val="Normal"/>
               <w:keepLines/>
-              <w:spacing w:line="360" w:lineRule="auto"/>
-              <w:jc w:val="left"/>
-              <w:rPr>
-                <w:kern w:val="0"/>
-                <w:sz w:val="24"/>
-              </w:rPr>
-            </w:pPr>
-            <w:r>
-              <w:rPr>
-                <w:kern w:val="0"/>
-                <w:sz w:val="24"/>
-              </w:rPr>
-              <w:t>[16] Yang C, Deng Y, Lu R, et al. WhiteFox: White-box compiler fuzzing empowered by large language models[C]//Proceedings of the ACM on Programming Languages (OOPSLA). 2024.</w:t>
-            </w:r>
-          </w:p>
-          <w:p>
-            <w:pPr>
+              <w:spacing w:lineRule="auto" w:line="360"/>
+              <w:jc w:val="start"/>
+              <w:rPr>
+                <w:kern w:val="0"/>
+                <w:sz w:val="24"/>
+              </w:rPr>
+            </w:pPr>
+            <w:r>
+              <w:rPr>
+                <w:kern w:val="0"/>
+                <w:sz w:val="24"/>
+              </w:rPr>
+              <w:t xml:space="preserve">[16] Yang C, Deng Y, Lu R, et al. WhiteFox: White-box compiler fuzzing empowered by large language models[C]//Proceedings of the ACM on Programming Languages (OOPSLA). 2024.</w:t>
+            </w:r>
+          </w:p>
+          <w:p>
+            <w:pPr>
+              <w:pStyle w:val="Normal"/>
               <w:keepLines/>
-              <w:spacing w:line="360" w:lineRule="auto"/>
-              <w:jc w:val="left"/>
-              <w:rPr>
-                <w:kern w:val="0"/>
-                <w:sz w:val="24"/>
-              </w:rPr>
-            </w:pPr>
-            <w:r>
-              <w:rPr>
-                <w:kern w:val="0"/>
-                <w:sz w:val="24"/>
-              </w:rPr>
-              <w:t>[17] Yang Y, Zhang H, Ren Z, et al. Hybrid language processor fuzzing via LLM-based constraint solving[C]//Proceedings of the 34th USENIX Security Symposium (USENIX Security). 2025.</w:t>
-            </w:r>
-          </w:p>
-          <w:p>
-            <w:pPr>
+              <w:spacing w:lineRule="auto" w:line="360"/>
+              <w:jc w:val="start"/>
+              <w:rPr>
+                <w:kern w:val="0"/>
+                <w:sz w:val="24"/>
+              </w:rPr>
+            </w:pPr>
+            <w:r>
+              <w:rPr>
+                <w:kern w:val="0"/>
+                <w:sz w:val="24"/>
+              </w:rPr>
+              <w:t xml:space="preserve">[17] Yang Y, Zhang H, Ren Z, et al. Hybrid language processor fuzzing via LLM-based constraint solving[C]//Proceedings of the 34th USENIX Security Symposium (USENIX Security). 2025.</w:t>
+            </w:r>
+          </w:p>
+          <w:p>
+            <w:pPr>
+              <w:pStyle w:val="Normal"/>
               <w:keepLines/>
-              <w:spacing w:line="360" w:lineRule="auto"/>
-              <w:jc w:val="left"/>
-              <w:rPr>
-                <w:kern w:val="0"/>
-                <w:sz w:val="24"/>
-              </w:rPr>
-            </w:pPr>
-            <w:r>
-              <w:rPr>
-                <w:kern w:val="0"/>
-                <w:sz w:val="24"/>
-              </w:rPr>
-              <w:t>[18] Li S, Su Z. UBfuzz: Finding bugs in sanitizer implementations[C]//Proceedings of the 29th ACM International Conference on Architectural Support for Programming Languages and Operating Systems (ASPLOS). 2024.</w:t>
-            </w:r>
-          </w:p>
-          <w:p>
-            <w:pPr>
+              <w:spacing w:lineRule="auto" w:line="360"/>
+              <w:jc w:val="start"/>
+              <w:rPr>
+                <w:kern w:val="0"/>
+                <w:sz w:val="24"/>
+              </w:rPr>
+            </w:pPr>
+            <w:r>
+              <w:rPr>
+                <w:kern w:val="0"/>
+                <w:sz w:val="24"/>
+              </w:rPr>
+              <w:t xml:space="preserve">[18] Li S, Su Z. UBfuzz: Finding bugs in sanitizer implementations[C]//Proceedings of the 29th ACM International Conference on Architectural Support for Programming Languages and Operating Systems (ASPLOS). 2024.</w:t>
+            </w:r>
+          </w:p>
+          <w:p>
+            <w:pPr>
+              <w:pStyle w:val="Normal"/>
               <w:keepLines/>
-              <w:spacing w:line="360" w:lineRule="auto"/>
-              <w:jc w:val="left"/>
-              <w:rPr>
-                <w:kern w:val="0"/>
-                <w:sz w:val="24"/>
-              </w:rPr>
-            </w:pPr>
-            <w:r>
-              <w:rPr>
-                <w:kern w:val="0"/>
-                <w:sz w:val="24"/>
-              </w:rPr>
-              <w:t>[19] Ma H, Shen Q, Tian Y, et al. Fuzzing deep learning compilers with HirGen[C]//Proceedings of the 32nd ACM SIGSOFT International Symposium on Software Testing and Analysis (ISSTA). 2023.</w:t>
-            </w:r>
-          </w:p>
-          <w:p>
-            <w:pPr>
+              <w:spacing w:lineRule="auto" w:line="360"/>
+              <w:jc w:val="start"/>
+              <w:rPr>
+                <w:kern w:val="0"/>
+                <w:sz w:val="24"/>
+              </w:rPr>
+            </w:pPr>
+            <w:r>
+              <w:rPr>
+                <w:kern w:val="0"/>
+                <w:sz w:val="24"/>
+              </w:rPr>
+              <w:t xml:space="preserve">[19] Ma H, Shen Q, Tian Y, et al. Fuzzing deep learning compilers with HirGen[C]//Proceedings of the 32nd ACM SIGSOFT International Symposium on Software Testing and Analysis (ISSTA). 2023.</w:t>
+            </w:r>
+          </w:p>
+          <w:p>
+            <w:pPr>
+              <w:pStyle w:val="Normal"/>
               <w:keepLines/>
-              <w:spacing w:line="360" w:lineRule="auto"/>
-              <w:jc w:val="left"/>
-              <w:rPr>
-                <w:kern w:val="0"/>
-                <w:sz w:val="24"/>
-              </w:rPr>
-            </w:pPr>
-            <w:r>
-              <w:rPr>
-                <w:kern w:val="0"/>
-                <w:sz w:val="24"/>
-              </w:rPr>
-              <w:t>[20] Free Software Foundation. The GNU C Library Reference Manual: Source Fortification[EB/OL]. (2024)[2026-02-15]. https://sourceware.org/glibc/manual/latest/html_node/Source-Fortification.html.</w:t>
-            </w:r>
-          </w:p>
-          <w:p>
-            <w:pPr>
+              <w:spacing w:lineRule="auto" w:line="360"/>
+              <w:jc w:val="start"/>
+              <w:rPr>
+                <w:kern w:val="0"/>
+                <w:sz w:val="24"/>
+              </w:rPr>
+            </w:pPr>
+            <w:r>
+              <w:rPr>
+                <w:kern w:val="0"/>
+                <w:sz w:val="24"/>
+              </w:rPr>
+              <w:t xml:space="preserve">[20] Free Software Foundation. The GNU C Library Reference Manual: Source Fortification[EB/OL]. (2024)[2026-02-15]. https://sourceware.org/glibc/manual/latest/html_node/Source-Fortification.html.</w:t>
+            </w:r>
+          </w:p>
+          <w:p>
+            <w:pPr>
+              <w:pStyle w:val="Normal"/>
               <w:keepLines/>
-              <w:spacing w:line="360" w:lineRule="auto"/>
-              <w:jc w:val="left"/>
-              <w:rPr>
-                <w:kern w:val="0"/>
-                <w:sz w:val="24"/>
-              </w:rPr>
-            </w:pPr>
-            <w:r>
-              <w:rPr>
-                <w:kern w:val="0"/>
-                <w:sz w:val="24"/>
-              </w:rPr>
-              <w:t>[21] GNU Project. GCC Bugzilla PR 87672 — [9 regression] 81512c36 causes ICE in bootstrap stage 3 using "-D_FORTIFY_SOURCE=2"[EB/OL]. (2018)[2026-05-11]. https://gcc.gnu.org/bugzilla/show_bug.cgi?id=87672.</w:t>
-            </w:r>
-          </w:p>
-          <w:p>
-            <w:pPr>
+              <w:spacing w:lineRule="auto" w:line="360"/>
+              <w:jc w:val="start"/>
+              <w:rPr>
+                <w:kern w:val="0"/>
+                <w:sz w:val="24"/>
+              </w:rPr>
+            </w:pPr>
+            <w:r>
+              <w:rPr>
+                <w:kern w:val="0"/>
+                <w:sz w:val="24"/>
+              </w:rPr>
+              <w:t xml:space="preserve">[21] GNU Project. GCC Bugzilla PR 87672 — [9 regression] 81512c36 causes ICE in bootstrap stage 3 using "-D_FORTIFY_SOURCE=2"[EB/OL]. (2018)[2026-05-11]. https://gcc.gnu.org/bugzilla/show_bug.cgi?id=87672.</w:t>
+            </w:r>
+          </w:p>
+          <w:p>
+            <w:pPr>
+              <w:pStyle w:val="Normal"/>
               <w:keepLines/>
-              <w:spacing w:line="360" w:lineRule="auto"/>
-              <w:jc w:val="left"/>
-              <w:rPr>
-                <w:kern w:val="0"/>
-                <w:sz w:val="24"/>
-              </w:rPr>
-            </w:pPr>
-            <w:r>
-              <w:rPr>
-                <w:kern w:val="0"/>
-                <w:sz w:val="24"/>
-              </w:rPr>
-              <w:t>[22] Intel Corporation. Control-flow Enforcement Technology Specification[R/OL]. (2019)[2026-02-15]. https://www.intel.com/content/www/us/en/developer/articles/technical/technical-look-control-flow-enforcement-technology.html.</w:t>
-            </w:r>
-          </w:p>
-          <w:p>
-            <w:pPr>
+              <w:spacing w:lineRule="auto" w:line="360"/>
+              <w:jc w:val="start"/>
+              <w:rPr>
+                <w:kern w:val="0"/>
+                <w:sz w:val="24"/>
+              </w:rPr>
+            </w:pPr>
+            <w:r>
+              <w:rPr>
+                <w:kern w:val="0"/>
+                <w:sz w:val="24"/>
+              </w:rPr>
+              <w:t xml:space="preserve">[22] Intel Corporation. Control-flow Enforcement Technology Specification[R/OL]. (2019)[2026-02-15]. https://www.intel.com/content/www/us/en/developer/articles/technical/technical-look-control-flow-enforcement-technology.html.</w:t>
+            </w:r>
+          </w:p>
+          <w:p>
+            <w:pPr>
+              <w:pStyle w:val="Normal"/>
               <w:keepLines/>
-              <w:spacing w:line="360" w:lineRule="auto"/>
-              <w:jc w:val="left"/>
-              <w:rPr>
-                <w:kern w:val="0"/>
-                <w:sz w:val="24"/>
-              </w:rPr>
-            </w:pPr>
-            <w:r>
-              <w:rPr>
-                <w:kern w:val="0"/>
-                <w:sz w:val="24"/>
-              </w:rPr>
-              <w:t>[23] GNU Project. GCC Bugzilla PR 96350 — [cet] For ENDBR immediate, the binary would include a gadget that starts with a fake ENDBR64 opcode[EB/OL]. (2020)[2026-05-11]. https://gcc.gnu.org/bugzilla/show_bug.cgi?id=96350.</w:t>
+              <w:spacing w:lineRule="auto" w:line="360"/>
+              <w:jc w:val="start"/>
+              <w:rPr>
+                <w:kern w:val="0"/>
+                <w:sz w:val="24"/>
+              </w:rPr>
+            </w:pPr>
+            <w:r>
+              <w:rPr>
+                <w:kern w:val="0"/>
+                <w:sz w:val="24"/>
+              </w:rPr>
+              <w:t xml:space="preserve">[23] GNU Project. GCC Bugzilla PR 96350 — [cet] For ENDBR immediate, the binary would include a gadget that starts with a fake ENDBR64 opcode[EB/OL]. (2020)[2026-05-11]. https://gcc.gnu.org/bugzilla/show_bug.cgi?id=96350.</w:t>
             </w:r>
           </w:p>
         </w:tc>
@@ -4882,36 +4825,38 @@
           </w:tcPr>
           <w:p>
             <w:pPr>
-              <w:spacing w:line="360" w:lineRule="auto"/>
-              <w:ind w:left="0" w:leftChars="0" w:right="0" w:rightChars="0" w:firstLineChars="200"/>
-              <w:rPr>
-                <w:kern w:val="0"/>
-                <w:sz w:val="24"/>
-              </w:rPr>
-            </w:pPr>
-            <w:r>
-              <w:rPr>
-                <w:kern w:val="0"/>
-                <w:sz w:val="24"/>
-              </w:rPr>
-              <w:t>理论分析对应技术路线的四个部分：编译器主流防御机制安全不变量的形式化与证据提炼、不变量预言机检查器的工程化方法、覆盖率与控制流图引导的目标基本块挑选策略，以及大语言模型生成与预言机判定的耦合方式。预期产出包括：覆盖至少三种主流防御机制的安全不变量集合、可扩展的不变量预言机框架，以及跨架构的 fuzzer 原型；并在 GCC 与 LLVM 上发现真实静默失效以验证方法的有效性与跨编译器迁移性。</w:t>
-            </w:r>
-          </w:p>
-          <w:p>
-            <w:pPr>
-              <w:spacing w:line="360" w:lineRule="auto"/>
-              <w:ind w:left="0" w:leftChars="0" w:right="0" w:rightChars="0" w:firstLineChars="200"/>
-              <w:rPr>
-                <w:kern w:val="0"/>
-                <w:sz w:val="24"/>
-              </w:rPr>
-            </w:pPr>
-            <w:r>
-              <w:rPr>
-                <w:kern w:val="0"/>
-                <w:sz w:val="24"/>
-              </w:rPr>
-              <w:t>硬件方面，开发与实验依托一台 64 位 Linux 工作站（不少于 32 GB 内存与百 GB 级 SSD），用于 GCC / LLVM 多版本本地构建、覆盖率数据缓存与跨架构 QEMU 用户态执行；大语言模型推理通过远程 API 完成，本机无需独立 GPU。</w:t>
+              <w:pStyle w:val="Normal"/>
+              <w:spacing w:lineRule="auto" w:line="360"/>
+              <w:ind w:firstLineChars="200" w:startChars="0" w:start="0" w:endChars="0" w:end="0"/>
+              <w:rPr>
+                <w:kern w:val="0"/>
+                <w:sz w:val="24"/>
+              </w:rPr>
+            </w:pPr>
+            <w:r>
+              <w:rPr>
+                <w:kern w:val="0"/>
+                <w:sz w:val="24"/>
+              </w:rPr>
+              <w:t xml:space="preserve">理论分析对应技术路线的四个部分：编译器主流防御机制安全不变量的形式化与证据提炼、不变量预言机检查器的工程化方法、覆盖率与控制流图引导的目标基本块挑选策略，以及大语言模型生成与预言机判定的耦合方式。预期产出包括：覆盖至少三种主流防御机制的安全不变量集合、可扩展的不变量预言机框架，以及跨架构的 fuzzer 原型；并在 GCC 与 LLVM 上发现真实静默失效以验证方法的有效性与跨编译器迁移性。</w:t>
+            </w:r>
+          </w:p>
+          <w:p>
+            <w:pPr>
+              <w:pStyle w:val="Normal"/>
+              <w:spacing w:lineRule="auto" w:line="360"/>
+              <w:ind w:firstLineChars="200" w:startChars="0" w:start="0" w:endChars="0" w:end="0"/>
+              <w:rPr>
+                <w:kern w:val="0"/>
+                <w:sz w:val="24"/>
+              </w:rPr>
+            </w:pPr>
+            <w:r>
+              <w:rPr>
+                <w:kern w:val="0"/>
+                <w:sz w:val="24"/>
+              </w:rPr>
+              <w:t xml:space="preserve">硬件方面，开发与实验依托一台 64 位 Linux 工作站（不少于 32 GB 内存与百 GB 级 SSD），用于 GCC / LLVM 多版本本地构建、覆盖率数据缓存与跨架构 QEMU 用户态执行；大语言模型推理通过远程 API 完成，本机无需独立 GPU。</w:t>
             </w:r>
           </w:p>
         </w:tc>
@@ -4948,7 +4893,7 @@
       </w:tblPr>
       <w:tblGrid>
         <w:gridCol w:w="2124"/>
-        <w:gridCol w:w="5282"/>
+        <w:gridCol w:w="5283"/>
         <w:gridCol w:w="2349"/>
       </w:tblGrid>
       <w:tr>
@@ -5053,32 +4998,24 @@
         </w:tc>
       </w:tr>
       <w:tr>
-        <w:tblPrEx>
-          <w:tblCellMar>
-            <w:top w:w="0" w:type="dxa"/>
-            <w:left w:w="108" w:type="dxa"/>
-            <w:bottom w:w="0" w:type="dxa"/>
-            <w:right w:w="108" w:type="dxa"/>
-          </w:tblCellMar>
-        </w:tblPrEx>
         <w:trPr>
           <w:trHeight w:val="480" w:hRule="atLeast"/>
-          <w:jc w:val="center"/>
         </w:trPr>
         <w:tc>
           <w:tcPr>
             <w:tcW w:w="2077" w:type="dxa"/>
             <w:tcBorders>
-              <w:top w:val="single" w:color="000000" w:sz="4" w:space="0"/>
-              <w:left w:val="single" w:color="000000" w:sz="4" w:space="0"/>
-              <w:bottom w:val="single" w:color="000000" w:sz="4" w:space="0"/>
-              <w:right w:val="single" w:color="000000" w:sz="4" w:space="0"/>
+              <w:top w:val="single" w:sz="4" w:space="0" w:color="000000"/>
+              <w:start w:val="single" w:sz="4" w:space="0" w:color="000000"/>
+              <w:bottom w:val="single" w:sz="4" w:space="0" w:color="000000"/>
+              <w:end w:val="single" w:sz="4" w:space="0" w:color="000000"/>
             </w:tcBorders>
             <w:vAlign w:val="center"/>
           </w:tcPr>
           <w:p>
             <w:pPr>
-              <w:spacing w:line="320" w:lineRule="exact"/>
+              <w:pStyle w:val="Normal"/>
+              <w:spacing w:lineRule="exact" w:line="320"/>
               <w:jc w:val="center"/>
               <w:rPr>
                 <w:rFonts w:ascii="宋体" w:hAnsi="宋体" w:eastAsia="宋体"/>
@@ -5090,7 +5027,7 @@
                 <w:rFonts w:ascii="宋体" w:hAnsi="宋体" w:eastAsia="宋体"/>
                 <w:sz w:val="24"/>
               </w:rPr>
-              <w:t>2026.05-2026.07</w:t>
+              <w:t xml:space="preserve">2026.05-2026.07</w:t>
             </w:r>
           </w:p>
         </w:tc>
@@ -5098,16 +5035,17 @@
           <w:tcPr>
             <w:tcW w:w="5167" w:type="dxa"/>
             <w:tcBorders>
-              <w:top w:val="single" w:color="000000" w:sz="4" w:space="0"/>
-              <w:left w:val="single" w:color="000000" w:sz="4" w:space="0"/>
-              <w:bottom w:val="single" w:color="000000" w:sz="4" w:space="0"/>
-              <w:right w:val="single" w:color="000000" w:sz="4" w:space="0"/>
+              <w:top w:val="single" w:sz="4" w:space="0" w:color="000000"/>
+              <w:start w:val="single" w:sz="4" w:space="0" w:color="000000"/>
+              <w:bottom w:val="single" w:sz="4" w:space="0" w:color="000000"/>
+              <w:end w:val="single" w:sz="4" w:space="0" w:color="000000"/>
             </w:tcBorders>
             <w:vAlign w:val="center"/>
           </w:tcPr>
           <w:p>
             <w:pPr>
-              <w:spacing w:line="320" w:lineRule="exact"/>
+              <w:pStyle w:val="Normal"/>
+              <w:spacing w:lineRule="exact" w:line="320"/>
               <w:jc w:val="center"/>
               <w:rPr>
                 <w:rFonts w:ascii="宋体" w:hAnsi="宋体" w:eastAsia="宋体"/>
@@ -5119,7 +5057,7 @@
                 <w:rFonts w:ascii="宋体" w:hAnsi="宋体" w:eastAsia="宋体"/>
                 <w:sz w:val="24"/>
               </w:rPr>
-              <w:t>扩展不变量集合到 BTI / PAC、Shadow Stack、CFI 等机制，丰富预言机框架的静态与动态检查器</w:t>
+              <w:t xml:space="preserve">扩展不变量集合到 BTI / PAC、Shadow Stack、CFI 等机制，丰富预言机框架的静态与动态检查器</w:t>
             </w:r>
           </w:p>
         </w:tc>
@@ -5127,52 +5065,52 @@
           <w:tcPr>
             <w:tcW w:w="2297" w:type="dxa"/>
             <w:tcBorders>
-              <w:top w:val="single" w:color="000000" w:sz="4" w:space="0"/>
-              <w:left w:val="single" w:color="000000" w:sz="4" w:space="0"/>
-              <w:bottom w:val="single" w:color="000000" w:sz="4" w:space="0"/>
-              <w:right w:val="single" w:color="000000" w:sz="4" w:space="0"/>
+              <w:top w:val="single" w:sz="4" w:space="0" w:color="000000"/>
+              <w:start w:val="single" w:sz="4" w:space="0" w:color="000000"/>
+              <w:bottom w:val="single" w:sz="4" w:space="0" w:color="000000"/>
+              <w:end w:val="single" w:sz="4" w:space="0" w:color="000000"/>
             </w:tcBorders>
             <w:vAlign w:val="center"/>
           </w:tcPr>
           <w:p>
             <w:pPr>
-              <w:spacing w:line="320" w:lineRule="exact"/>
+              <w:pStyle w:val="Normal"/>
+              <w:spacing w:lineRule="exact" w:line="320"/>
               <w:jc w:val="center"/>
               <w:rPr>
                 <w:rFonts w:ascii="宋体" w:hAnsi="宋体" w:eastAsia="宋体"/>
                 <w:sz w:val="24"/>
               </w:rPr>
             </w:pPr>
+            <w:r>
+              <w:rPr>
+                <w:rFonts w:ascii="宋体" w:hAnsi="宋体" w:eastAsia="宋体"/>
+                <w:sz w:val="24"/>
+              </w:rPr>
+              <w:t xml:space="preserve"/>
+            </w:r>
           </w:p>
         </w:tc>
       </w:tr>
       <w:tr>
-        <w:tblPrEx>
-          <w:tblCellMar>
-            <w:top w:w="0" w:type="dxa"/>
-            <w:left w:w="108" w:type="dxa"/>
-            <w:bottom w:w="0" w:type="dxa"/>
-            <w:right w:w="108" w:type="dxa"/>
-          </w:tblCellMar>
-        </w:tblPrEx>
         <w:trPr>
           <w:trHeight w:val="480" w:hRule="atLeast"/>
-          <w:jc w:val="center"/>
         </w:trPr>
         <w:tc>
           <w:tcPr>
             <w:tcW w:w="2077" w:type="dxa"/>
             <w:tcBorders>
-              <w:top w:val="single" w:color="000000" w:sz="4" w:space="0"/>
-              <w:left w:val="single" w:color="000000" w:sz="4" w:space="0"/>
-              <w:bottom w:val="single" w:color="000000" w:sz="4" w:space="0"/>
-              <w:right w:val="single" w:color="000000" w:sz="4" w:space="0"/>
+              <w:top w:val="single" w:sz="4" w:space="0" w:color="000000"/>
+              <w:start w:val="single" w:sz="4" w:space="0" w:color="000000"/>
+              <w:bottom w:val="single" w:sz="4" w:space="0" w:color="000000"/>
+              <w:end w:val="single" w:sz="4" w:space="0" w:color="000000"/>
             </w:tcBorders>
             <w:vAlign w:val="center"/>
           </w:tcPr>
           <w:p>
             <w:pPr>
-              <w:spacing w:line="320" w:lineRule="exact"/>
+              <w:pStyle w:val="Normal"/>
+              <w:spacing w:lineRule="exact" w:line="320"/>
               <w:jc w:val="center"/>
               <w:rPr>
                 <w:rFonts w:ascii="宋体" w:hAnsi="宋体" w:eastAsia="宋体"/>
@@ -5184,7 +5122,7 @@
                 <w:rFonts w:ascii="宋体" w:hAnsi="宋体" w:eastAsia="宋体"/>
                 <w:sz w:val="24"/>
               </w:rPr>
-              <w:t>2026.07-2026.09</w:t>
+              <w:t xml:space="preserve">2026.07-2026.09</w:t>
             </w:r>
           </w:p>
         </w:tc>
@@ -5192,16 +5130,17 @@
           <w:tcPr>
             <w:tcW w:w="5167" w:type="dxa"/>
             <w:tcBorders>
-              <w:top w:val="single" w:color="000000" w:sz="4" w:space="0"/>
-              <w:left w:val="single" w:color="000000" w:sz="4" w:space="0"/>
-              <w:bottom w:val="single" w:color="000000" w:sz="4" w:space="0"/>
-              <w:right w:val="single" w:color="000000" w:sz="4" w:space="0"/>
+              <w:top w:val="single" w:sz="4" w:space="0" w:color="000000"/>
+              <w:start w:val="single" w:sz="4" w:space="0" w:color="000000"/>
+              <w:bottom w:val="single" w:sz="4" w:space="0" w:color="000000"/>
+              <w:end w:val="single" w:sz="4" w:space="0" w:color="000000"/>
             </w:tcBorders>
             <w:vAlign w:val="center"/>
           </w:tcPr>
           <w:p>
             <w:pPr>
-              <w:spacing w:line="320" w:lineRule="exact"/>
+              <w:pStyle w:val="Normal"/>
+              <w:spacing w:lineRule="exact" w:line="320"/>
               <w:jc w:val="center"/>
               <w:rPr>
                 <w:rFonts w:ascii="宋体" w:hAnsi="宋体" w:eastAsia="宋体"/>
@@ -5213,7 +5152,7 @@
                 <w:rFonts w:ascii="宋体" w:hAnsi="宋体" w:eastAsia="宋体"/>
                 <w:sz w:val="24"/>
               </w:rPr>
-              <w:t>把编译器子系统、覆盖率适配层、flag profile 扩展到 LLVM 工具链，对齐跨架构 / 跨编译器实验框架</w:t>
+              <w:t xml:space="preserve">把编译器子系统、覆盖率适配层、flag profile 扩展到 LLVM 工具链，对齐跨架构 / 跨编译器实验框架</w:t>
             </w:r>
           </w:p>
         </w:tc>
@@ -5221,52 +5160,52 @@
           <w:tcPr>
             <w:tcW w:w="2297" w:type="dxa"/>
             <w:tcBorders>
-              <w:top w:val="single" w:color="000000" w:sz="4" w:space="0"/>
-              <w:left w:val="single" w:color="000000" w:sz="4" w:space="0"/>
-              <w:bottom w:val="single" w:color="000000" w:sz="4" w:space="0"/>
-              <w:right w:val="single" w:color="000000" w:sz="4" w:space="0"/>
+              <w:top w:val="single" w:sz="4" w:space="0" w:color="000000"/>
+              <w:start w:val="single" w:sz="4" w:space="0" w:color="000000"/>
+              <w:bottom w:val="single" w:sz="4" w:space="0" w:color="000000"/>
+              <w:end w:val="single" w:sz="4" w:space="0" w:color="000000"/>
             </w:tcBorders>
             <w:vAlign w:val="center"/>
           </w:tcPr>
           <w:p>
             <w:pPr>
-              <w:spacing w:line="320" w:lineRule="exact"/>
+              <w:pStyle w:val="Normal"/>
+              <w:spacing w:lineRule="exact" w:line="320"/>
               <w:jc w:val="center"/>
               <w:rPr>
                 <w:rFonts w:ascii="宋体" w:hAnsi="宋体" w:eastAsia="宋体"/>
                 <w:sz w:val="24"/>
               </w:rPr>
             </w:pPr>
+            <w:r>
+              <w:rPr>
+                <w:rFonts w:ascii="宋体" w:hAnsi="宋体" w:eastAsia="宋体"/>
+                <w:sz w:val="24"/>
+              </w:rPr>
+              <w:t xml:space="preserve"/>
+            </w:r>
           </w:p>
         </w:tc>
       </w:tr>
       <w:tr>
-        <w:tblPrEx>
-          <w:tblCellMar>
-            <w:top w:w="0" w:type="dxa"/>
-            <w:left w:w="108" w:type="dxa"/>
-            <w:bottom w:w="0" w:type="dxa"/>
-            <w:right w:w="108" w:type="dxa"/>
-          </w:tblCellMar>
-        </w:tblPrEx>
         <w:trPr>
           <w:trHeight w:val="480" w:hRule="atLeast"/>
-          <w:jc w:val="center"/>
         </w:trPr>
         <w:tc>
           <w:tcPr>
             <w:tcW w:w="2077" w:type="dxa"/>
             <w:tcBorders>
-              <w:top w:val="single" w:color="000000" w:sz="4" w:space="0"/>
-              <w:left w:val="single" w:color="000000" w:sz="4" w:space="0"/>
-              <w:bottom w:val="single" w:color="000000" w:sz="4" w:space="0"/>
-              <w:right w:val="single" w:color="000000" w:sz="4" w:space="0"/>
+              <w:top w:val="single" w:sz="4" w:space="0" w:color="000000"/>
+              <w:start w:val="single" w:sz="4" w:space="0" w:color="000000"/>
+              <w:bottom w:val="single" w:sz="4" w:space="0" w:color="000000"/>
+              <w:end w:val="single" w:sz="4" w:space="0" w:color="000000"/>
             </w:tcBorders>
             <w:vAlign w:val="center"/>
           </w:tcPr>
           <w:p>
             <w:pPr>
-              <w:spacing w:line="320" w:lineRule="exact"/>
+              <w:pStyle w:val="Normal"/>
+              <w:spacing w:lineRule="exact" w:line="320"/>
               <w:jc w:val="center"/>
               <w:rPr>
                 <w:rFonts w:ascii="宋体" w:hAnsi="宋体" w:eastAsia="宋体"/>
@@ -5278,7 +5217,7 @@
                 <w:rFonts w:ascii="宋体" w:hAnsi="宋体" w:eastAsia="宋体"/>
                 <w:sz w:val="24"/>
               </w:rPr>
-              <w:t>2026.09-2026.12</w:t>
+              <w:t xml:space="preserve">2026.09-2026.12</w:t>
             </w:r>
           </w:p>
         </w:tc>
@@ -5286,16 +5225,17 @@
           <w:tcPr>
             <w:tcW w:w="5167" w:type="dxa"/>
             <w:tcBorders>
-              <w:top w:val="single" w:color="000000" w:sz="4" w:space="0"/>
-              <w:left w:val="single" w:color="000000" w:sz="4" w:space="0"/>
-              <w:bottom w:val="single" w:color="000000" w:sz="4" w:space="0"/>
-              <w:right w:val="single" w:color="000000" w:sz="4" w:space="0"/>
+              <w:top w:val="single" w:sz="4" w:space="0" w:color="000000"/>
+              <w:start w:val="single" w:sz="4" w:space="0" w:color="000000"/>
+              <w:bottom w:val="single" w:sz="4" w:space="0" w:color="000000"/>
+              <w:end w:val="single" w:sz="4" w:space="0" w:color="000000"/>
             </w:tcBorders>
             <w:vAlign w:val="center"/>
           </w:tcPr>
           <w:p>
             <w:pPr>
-              <w:spacing w:line="320" w:lineRule="exact"/>
+              <w:pStyle w:val="Normal"/>
+              <w:spacing w:lineRule="exact" w:line="320"/>
               <w:jc w:val="center"/>
               <w:rPr>
                 <w:rFonts w:ascii="宋体" w:hAnsi="宋体" w:eastAsia="宋体"/>
@@ -5307,7 +5247,7 @@
                 <w:rFonts w:ascii="宋体" w:hAnsi="宋体" w:eastAsia="宋体"/>
                 <w:sz w:val="24"/>
               </w:rPr>
-              <w:t>在 GCC 与 LLVM 多版本、多 ISA 上完成全机制端到端实验，持续推进上游缺陷上报闭环</w:t>
+              <w:t xml:space="preserve">在 GCC 与 LLVM 多版本、多 ISA 上完成全机制端到端实验，持续推进上游缺陷上报闭环</w:t>
             </w:r>
           </w:p>
         </w:tc>
@@ -5315,52 +5255,52 @@
           <w:tcPr>
             <w:tcW w:w="2297" w:type="dxa"/>
             <w:tcBorders>
-              <w:top w:val="single" w:color="000000" w:sz="4" w:space="0"/>
-              <w:left w:val="single" w:color="000000" w:sz="4" w:space="0"/>
-              <w:bottom w:val="single" w:color="000000" w:sz="4" w:space="0"/>
-              <w:right w:val="single" w:color="000000" w:sz="4" w:space="0"/>
+              <w:top w:val="single" w:sz="4" w:space="0" w:color="000000"/>
+              <w:start w:val="single" w:sz="4" w:space="0" w:color="000000"/>
+              <w:bottom w:val="single" w:sz="4" w:space="0" w:color="000000"/>
+              <w:end w:val="single" w:sz="4" w:space="0" w:color="000000"/>
             </w:tcBorders>
             <w:vAlign w:val="center"/>
           </w:tcPr>
           <w:p>
             <w:pPr>
-              <w:spacing w:line="320" w:lineRule="exact"/>
+              <w:pStyle w:val="Normal"/>
+              <w:spacing w:lineRule="exact" w:line="320"/>
               <w:jc w:val="center"/>
               <w:rPr>
                 <w:rFonts w:ascii="宋体" w:hAnsi="宋体" w:eastAsia="宋体"/>
                 <w:sz w:val="24"/>
               </w:rPr>
             </w:pPr>
+            <w:r>
+              <w:rPr>
+                <w:rFonts w:ascii="宋体" w:hAnsi="宋体" w:eastAsia="宋体"/>
+                <w:sz w:val="24"/>
+              </w:rPr>
+              <w:t xml:space="preserve"/>
+            </w:r>
           </w:p>
         </w:tc>
       </w:tr>
       <w:tr>
-        <w:tblPrEx>
-          <w:tblCellMar>
-            <w:top w:w="0" w:type="dxa"/>
-            <w:left w:w="108" w:type="dxa"/>
-            <w:bottom w:w="0" w:type="dxa"/>
-            <w:right w:w="108" w:type="dxa"/>
-          </w:tblCellMar>
-        </w:tblPrEx>
         <w:trPr>
           <w:trHeight w:val="480" w:hRule="atLeast"/>
-          <w:jc w:val="center"/>
         </w:trPr>
         <w:tc>
           <w:tcPr>
             <w:tcW w:w="2077" w:type="dxa"/>
             <w:tcBorders>
-              <w:top w:val="single" w:color="000000" w:sz="4" w:space="0"/>
-              <w:left w:val="single" w:color="000000" w:sz="4" w:space="0"/>
-              <w:bottom w:val="single" w:color="000000" w:sz="4" w:space="0"/>
-              <w:right w:val="single" w:color="000000" w:sz="4" w:space="0"/>
+              <w:top w:val="single" w:sz="4" w:space="0" w:color="000000"/>
+              <w:start w:val="single" w:sz="4" w:space="0" w:color="000000"/>
+              <w:bottom w:val="single" w:sz="4" w:space="0" w:color="000000"/>
+              <w:end w:val="single" w:sz="4" w:space="0" w:color="000000"/>
             </w:tcBorders>
             <w:vAlign w:val="center"/>
           </w:tcPr>
           <w:p>
             <w:pPr>
-              <w:spacing w:line="320" w:lineRule="exact"/>
+              <w:pStyle w:val="Normal"/>
+              <w:spacing w:lineRule="exact" w:line="320"/>
               <w:jc w:val="center"/>
               <w:rPr>
                 <w:rFonts w:ascii="宋体" w:hAnsi="宋体" w:eastAsia="宋体"/>
@@ -5372,7 +5312,7 @@
                 <w:rFonts w:ascii="宋体" w:hAnsi="宋体" w:eastAsia="宋体"/>
                 <w:sz w:val="24"/>
               </w:rPr>
-              <w:t>2026.12-2027.02</w:t>
+              <w:t xml:space="preserve">2026.12-2027.02</w:t>
             </w:r>
           </w:p>
         </w:tc>
@@ -5380,16 +5320,17 @@
           <w:tcPr>
             <w:tcW w:w="5167" w:type="dxa"/>
             <w:tcBorders>
-              <w:top w:val="single" w:color="000000" w:sz="4" w:space="0"/>
-              <w:left w:val="single" w:color="000000" w:sz="4" w:space="0"/>
-              <w:bottom w:val="single" w:color="000000" w:sz="4" w:space="0"/>
-              <w:right w:val="single" w:color="000000" w:sz="4" w:space="0"/>
+              <w:top w:val="single" w:sz="4" w:space="0" w:color="000000"/>
+              <w:start w:val="single" w:sz="4" w:space="0" w:color="000000"/>
+              <w:bottom w:val="single" w:sz="4" w:space="0" w:color="000000"/>
+              <w:end w:val="single" w:sz="4" w:space="0" w:color="000000"/>
             </w:tcBorders>
             <w:vAlign w:val="center"/>
           </w:tcPr>
           <w:p>
             <w:pPr>
-              <w:spacing w:line="320" w:lineRule="exact"/>
+              <w:pStyle w:val="Normal"/>
+              <w:spacing w:lineRule="exact" w:line="320"/>
               <w:jc w:val="center"/>
               <w:rPr>
                 <w:rFonts w:ascii="宋体" w:hAnsi="宋体" w:eastAsia="宋体"/>
@@ -5401,7 +5342,7 @@
                 <w:rFonts w:ascii="宋体" w:hAnsi="宋体" w:eastAsia="宋体"/>
                 <w:sz w:val="24"/>
               </w:rPr>
-              <w:t>与 Csmith、YARPGen、GrayC、HLPFuzz 等基线方法做对照评测，量化覆盖率推进与缺陷发现上的相对优势</w:t>
+              <w:t xml:space="preserve">与 Csmith、YARPGen、GrayC、HLPFuzz 等基线方法做对照评测，量化覆盖率推进与缺陷发现上的相对优势</w:t>
             </w:r>
           </w:p>
         </w:tc>
@@ -5409,52 +5350,52 @@
           <w:tcPr>
             <w:tcW w:w="2297" w:type="dxa"/>
             <w:tcBorders>
-              <w:top w:val="single" w:color="000000" w:sz="4" w:space="0"/>
-              <w:left w:val="single" w:color="000000" w:sz="4" w:space="0"/>
-              <w:bottom w:val="single" w:color="000000" w:sz="4" w:space="0"/>
-              <w:right w:val="single" w:color="000000" w:sz="4" w:space="0"/>
+              <w:top w:val="single" w:sz="4" w:space="0" w:color="000000"/>
+              <w:start w:val="single" w:sz="4" w:space="0" w:color="000000"/>
+              <w:bottom w:val="single" w:sz="4" w:space="0" w:color="000000"/>
+              <w:end w:val="single" w:sz="4" w:space="0" w:color="000000"/>
             </w:tcBorders>
             <w:vAlign w:val="center"/>
           </w:tcPr>
           <w:p>
             <w:pPr>
-              <w:spacing w:line="320" w:lineRule="exact"/>
+              <w:pStyle w:val="Normal"/>
+              <w:spacing w:lineRule="exact" w:line="320"/>
               <w:jc w:val="center"/>
               <w:rPr>
                 <w:rFonts w:ascii="宋体" w:hAnsi="宋体" w:eastAsia="宋体"/>
                 <w:sz w:val="24"/>
               </w:rPr>
             </w:pPr>
+            <w:r>
+              <w:rPr>
+                <w:rFonts w:ascii="宋体" w:hAnsi="宋体" w:eastAsia="宋体"/>
+                <w:sz w:val="24"/>
+              </w:rPr>
+              <w:t xml:space="preserve"/>
+            </w:r>
           </w:p>
         </w:tc>
       </w:tr>
       <w:tr>
-        <w:tblPrEx>
-          <w:tblCellMar>
-            <w:top w:w="0" w:type="dxa"/>
-            <w:left w:w="108" w:type="dxa"/>
-            <w:bottom w:w="0" w:type="dxa"/>
-            <w:right w:w="108" w:type="dxa"/>
-          </w:tblCellMar>
-        </w:tblPrEx>
         <w:trPr>
           <w:trHeight w:val="480" w:hRule="atLeast"/>
-          <w:jc w:val="center"/>
         </w:trPr>
         <w:tc>
           <w:tcPr>
             <w:tcW w:w="2077" w:type="dxa"/>
             <w:tcBorders>
-              <w:top w:val="single" w:color="000000" w:sz="4" w:space="0"/>
-              <w:left w:val="single" w:color="000000" w:sz="4" w:space="0"/>
-              <w:bottom w:val="single" w:color="000000" w:sz="4" w:space="0"/>
-              <w:right w:val="single" w:color="000000" w:sz="4" w:space="0"/>
+              <w:top w:val="single" w:sz="4" w:space="0" w:color="000000"/>
+              <w:start w:val="single" w:sz="4" w:space="0" w:color="000000"/>
+              <w:bottom w:val="single" w:sz="4" w:space="0" w:color="000000"/>
+              <w:end w:val="single" w:sz="4" w:space="0" w:color="000000"/>
             </w:tcBorders>
             <w:vAlign w:val="center"/>
           </w:tcPr>
           <w:p>
             <w:pPr>
-              <w:spacing w:line="320" w:lineRule="exact"/>
+              <w:pStyle w:val="Normal"/>
+              <w:spacing w:lineRule="exact" w:line="320"/>
               <w:jc w:val="center"/>
               <w:rPr>
                 <w:rFonts w:ascii="宋体" w:hAnsi="宋体" w:eastAsia="宋体"/>
@@ -5466,7 +5407,7 @@
                 <w:rFonts w:ascii="宋体" w:hAnsi="宋体" w:eastAsia="宋体"/>
                 <w:sz w:val="24"/>
               </w:rPr>
-              <w:t>2027.02-2027.04</w:t>
+              <w:t xml:space="preserve">2027.02-2027.04</w:t>
             </w:r>
           </w:p>
         </w:tc>
@@ -5474,16 +5415,17 @@
           <w:tcPr>
             <w:tcW w:w="5167" w:type="dxa"/>
             <w:tcBorders>
-              <w:top w:val="single" w:color="000000" w:sz="4" w:space="0"/>
-              <w:left w:val="single" w:color="000000" w:sz="4" w:space="0"/>
-              <w:bottom w:val="single" w:color="000000" w:sz="4" w:space="0"/>
-              <w:right w:val="single" w:color="000000" w:sz="4" w:space="0"/>
+              <w:top w:val="single" w:sz="4" w:space="0" w:color="000000"/>
+              <w:start w:val="single" w:sz="4" w:space="0" w:color="000000"/>
+              <w:bottom w:val="single" w:sz="4" w:space="0" w:color="000000"/>
+              <w:end w:val="single" w:sz="4" w:space="0" w:color="000000"/>
             </w:tcBorders>
             <w:vAlign w:val="center"/>
           </w:tcPr>
           <w:p>
             <w:pPr>
-              <w:spacing w:line="320" w:lineRule="exact"/>
+              <w:pStyle w:val="Normal"/>
+              <w:spacing w:lineRule="exact" w:line="320"/>
               <w:jc w:val="center"/>
               <w:rPr>
                 <w:rFonts w:ascii="宋体" w:hAnsi="宋体" w:eastAsia="宋体"/>
@@ -5495,7 +5437,7 @@
                 <w:rFonts w:ascii="宋体" w:hAnsi="宋体" w:eastAsia="宋体"/>
                 <w:sz w:val="24"/>
               </w:rPr>
-              <w:t>整理实验数据与图表，完成学位论文初稿，准备会议 / 期刊投稿</w:t>
+              <w:t xml:space="preserve">整理实验数据与图表，完成学位论文初稿，准备会议 / 期刊投稿</w:t>
             </w:r>
           </w:p>
         </w:tc>
@@ -5503,52 +5445,52 @@
           <w:tcPr>
             <w:tcW w:w="2297" w:type="dxa"/>
             <w:tcBorders>
-              <w:top w:val="single" w:color="000000" w:sz="4" w:space="0"/>
-              <w:left w:val="single" w:color="000000" w:sz="4" w:space="0"/>
-              <w:bottom w:val="single" w:color="000000" w:sz="4" w:space="0"/>
-              <w:right w:val="single" w:color="000000" w:sz="4" w:space="0"/>
+              <w:top w:val="single" w:sz="4" w:space="0" w:color="000000"/>
+              <w:start w:val="single" w:sz="4" w:space="0" w:color="000000"/>
+              <w:bottom w:val="single" w:sz="4" w:space="0" w:color="000000"/>
+              <w:end w:val="single" w:sz="4" w:space="0" w:color="000000"/>
             </w:tcBorders>
             <w:vAlign w:val="center"/>
           </w:tcPr>
           <w:p>
             <w:pPr>
-              <w:spacing w:line="320" w:lineRule="exact"/>
+              <w:pStyle w:val="Normal"/>
+              <w:spacing w:lineRule="exact" w:line="320"/>
               <w:jc w:val="center"/>
               <w:rPr>
                 <w:rFonts w:ascii="宋体" w:hAnsi="宋体" w:eastAsia="宋体"/>
                 <w:sz w:val="24"/>
               </w:rPr>
             </w:pPr>
+            <w:r>
+              <w:rPr>
+                <w:rFonts w:ascii="宋体" w:hAnsi="宋体" w:eastAsia="宋体"/>
+                <w:sz w:val="24"/>
+              </w:rPr>
+              <w:t xml:space="preserve"/>
+            </w:r>
           </w:p>
         </w:tc>
       </w:tr>
       <w:tr>
-        <w:tblPrEx>
-          <w:tblCellMar>
-            <w:top w:w="0" w:type="dxa"/>
-            <w:left w:w="108" w:type="dxa"/>
-            <w:bottom w:w="0" w:type="dxa"/>
-            <w:right w:w="108" w:type="dxa"/>
-          </w:tblCellMar>
-        </w:tblPrEx>
         <w:trPr>
           <w:trHeight w:val="480" w:hRule="atLeast"/>
-          <w:jc w:val="center"/>
         </w:trPr>
         <w:tc>
           <w:tcPr>
             <w:tcW w:w="2077" w:type="dxa"/>
             <w:tcBorders>
-              <w:top w:val="single" w:color="000000" w:sz="4" w:space="0"/>
-              <w:left w:val="single" w:color="000000" w:sz="4" w:space="0"/>
-              <w:bottom w:val="single" w:color="000000" w:sz="4" w:space="0"/>
-              <w:right w:val="single" w:color="000000" w:sz="4" w:space="0"/>
+              <w:top w:val="single" w:sz="4" w:space="0" w:color="000000"/>
+              <w:start w:val="single" w:sz="4" w:space="0" w:color="000000"/>
+              <w:bottom w:val="single" w:sz="4" w:space="0" w:color="000000"/>
+              <w:end w:val="single" w:sz="4" w:space="0" w:color="000000"/>
             </w:tcBorders>
             <w:vAlign w:val="center"/>
           </w:tcPr>
           <w:p>
             <w:pPr>
-              <w:spacing w:line="320" w:lineRule="exact"/>
+              <w:pStyle w:val="Normal"/>
+              <w:spacing w:lineRule="exact" w:line="320"/>
               <w:jc w:val="center"/>
               <w:rPr>
                 <w:rFonts w:ascii="宋体" w:hAnsi="宋体" w:eastAsia="宋体"/>
@@ -5560,7 +5502,7 @@
                 <w:rFonts w:ascii="宋体" w:hAnsi="宋体" w:eastAsia="宋体"/>
                 <w:sz w:val="24"/>
               </w:rPr>
-              <w:t>2027.04-2027.06</w:t>
+              <w:t xml:space="preserve">2027.04-2027.06</w:t>
             </w:r>
           </w:p>
         </w:tc>
@@ -5568,16 +5510,17 @@
           <w:tcPr>
             <w:tcW w:w="5167" w:type="dxa"/>
             <w:tcBorders>
-              <w:top w:val="single" w:color="000000" w:sz="4" w:space="0"/>
-              <w:left w:val="single" w:color="000000" w:sz="4" w:space="0"/>
-              <w:bottom w:val="single" w:color="000000" w:sz="4" w:space="0"/>
-              <w:right w:val="single" w:color="000000" w:sz="4" w:space="0"/>
+              <w:top w:val="single" w:sz="4" w:space="0" w:color="000000"/>
+              <w:start w:val="single" w:sz="4" w:space="0" w:color="000000"/>
+              <w:bottom w:val="single" w:sz="4" w:space="0" w:color="000000"/>
+              <w:end w:val="single" w:sz="4" w:space="0" w:color="000000"/>
             </w:tcBorders>
             <w:vAlign w:val="center"/>
           </w:tcPr>
           <w:p>
             <w:pPr>
-              <w:spacing w:line="320" w:lineRule="exact"/>
+              <w:pStyle w:val="Normal"/>
+              <w:spacing w:lineRule="exact" w:line="320"/>
               <w:jc w:val="center"/>
               <w:rPr>
                 <w:rFonts w:ascii="宋体" w:hAnsi="宋体" w:eastAsia="宋体"/>
@@ -5589,7 +5532,7 @@
                 <w:rFonts w:ascii="宋体" w:hAnsi="宋体" w:eastAsia="宋体"/>
                 <w:sz w:val="24"/>
               </w:rPr>
-              <w:t>学位论文修订、外审反馈处理、答辩材料准备</w:t>
+              <w:t xml:space="preserve">学位论文修订、外审反馈处理、答辩材料准备</w:t>
             </w:r>
           </w:p>
         </w:tc>
@@ -5597,52 +5540,52 @@
           <w:tcPr>
             <w:tcW w:w="2297" w:type="dxa"/>
             <w:tcBorders>
-              <w:top w:val="single" w:color="000000" w:sz="4" w:space="0"/>
-              <w:left w:val="single" w:color="000000" w:sz="4" w:space="0"/>
-              <w:bottom w:val="single" w:color="000000" w:sz="4" w:space="0"/>
-              <w:right w:val="single" w:color="000000" w:sz="4" w:space="0"/>
+              <w:top w:val="single" w:sz="4" w:space="0" w:color="000000"/>
+              <w:start w:val="single" w:sz="4" w:space="0" w:color="000000"/>
+              <w:bottom w:val="single" w:sz="4" w:space="0" w:color="000000"/>
+              <w:end w:val="single" w:sz="4" w:space="0" w:color="000000"/>
             </w:tcBorders>
             <w:vAlign w:val="center"/>
           </w:tcPr>
           <w:p>
             <w:pPr>
-              <w:spacing w:line="320" w:lineRule="exact"/>
+              <w:pStyle w:val="Normal"/>
+              <w:spacing w:lineRule="exact" w:line="320"/>
               <w:jc w:val="center"/>
               <w:rPr>
                 <w:rFonts w:ascii="宋体" w:hAnsi="宋体" w:eastAsia="宋体"/>
                 <w:sz w:val="24"/>
               </w:rPr>
             </w:pPr>
+            <w:r>
+              <w:rPr>
+                <w:rFonts w:ascii="宋体" w:hAnsi="宋体" w:eastAsia="宋体"/>
+                <w:sz w:val="24"/>
+              </w:rPr>
+              <w:t xml:space="preserve"/>
+            </w:r>
           </w:p>
         </w:tc>
       </w:tr>
       <w:tr>
-        <w:tblPrEx>
-          <w:tblCellMar>
-            <w:top w:w="0" w:type="dxa"/>
-            <w:left w:w="108" w:type="dxa"/>
-            <w:bottom w:w="0" w:type="dxa"/>
-            <w:right w:w="108" w:type="dxa"/>
-          </w:tblCellMar>
-        </w:tblPrEx>
         <w:trPr>
           <w:trHeight w:val="480" w:hRule="atLeast"/>
-          <w:jc w:val="center"/>
         </w:trPr>
         <w:tc>
           <w:tcPr>
             <w:tcW w:w="2077" w:type="dxa"/>
             <w:tcBorders>
-              <w:top w:val="single" w:color="000000" w:sz="4" w:space="0"/>
-              <w:left w:val="single" w:color="000000" w:sz="4" w:space="0"/>
-              <w:bottom w:val="single" w:color="000000" w:sz="4" w:space="0"/>
-              <w:right w:val="single" w:color="000000" w:sz="4" w:space="0"/>
+              <w:top w:val="single" w:sz="4" w:space="0" w:color="000000"/>
+              <w:start w:val="single" w:sz="4" w:space="0" w:color="000000"/>
+              <w:bottom w:val="single" w:sz="4" w:space="0" w:color="000000"/>
+              <w:end w:val="single" w:sz="4" w:space="0" w:color="000000"/>
             </w:tcBorders>
             <w:vAlign w:val="center"/>
           </w:tcPr>
           <w:p>
             <w:pPr>
-              <w:spacing w:line="320" w:lineRule="exact"/>
+              <w:pStyle w:val="Normal"/>
+              <w:spacing w:lineRule="exact" w:line="320"/>
               <w:jc w:val="center"/>
               <w:rPr>
                 <w:rFonts w:ascii="宋体" w:hAnsi="宋体" w:eastAsia="宋体"/>
@@ -5654,7 +5597,7 @@
                 <w:rFonts w:ascii="宋体" w:hAnsi="宋体" w:eastAsia="宋体"/>
                 <w:sz w:val="24"/>
               </w:rPr>
-              <w:t>2027.06</w:t>
+              <w:t xml:space="preserve">2027.06</w:t>
             </w:r>
           </w:p>
         </w:tc>
@@ -5662,16 +5605,17 @@
           <w:tcPr>
             <w:tcW w:w="5167" w:type="dxa"/>
             <w:tcBorders>
-              <w:top w:val="single" w:color="000000" w:sz="4" w:space="0"/>
-              <w:left w:val="single" w:color="000000" w:sz="4" w:space="0"/>
-              <w:bottom w:val="single" w:color="000000" w:sz="4" w:space="0"/>
-              <w:right w:val="single" w:color="000000" w:sz="4" w:space="0"/>
+              <w:top w:val="single" w:sz="4" w:space="0" w:color="000000"/>
+              <w:start w:val="single" w:sz="4" w:space="0" w:color="000000"/>
+              <w:bottom w:val="single" w:sz="4" w:space="0" w:color="000000"/>
+              <w:end w:val="single" w:sz="4" w:space="0" w:color="000000"/>
             </w:tcBorders>
             <w:vAlign w:val="center"/>
           </w:tcPr>
           <w:p>
             <w:pPr>
-              <w:spacing w:line="320" w:lineRule="exact"/>
+              <w:pStyle w:val="Normal"/>
+              <w:spacing w:lineRule="exact" w:line="320"/>
               <w:jc w:val="center"/>
               <w:rPr>
                 <w:rFonts w:ascii="宋体" w:hAnsi="宋体" w:eastAsia="宋体"/>
@@ -5683,7 +5627,7 @@
                 <w:rFonts w:ascii="宋体" w:hAnsi="宋体" w:eastAsia="宋体"/>
                 <w:sz w:val="24"/>
               </w:rPr>
-              <w:t>学位论文答辩</w:t>
+              <w:t xml:space="preserve">学位论文答辩</w:t>
             </w:r>
           </w:p>
         </w:tc>
@@ -5691,22 +5635,30 @@
           <w:tcPr>
             <w:tcW w:w="2297" w:type="dxa"/>
             <w:tcBorders>
-              <w:top w:val="single" w:color="000000" w:sz="4" w:space="0"/>
-              <w:left w:val="single" w:color="000000" w:sz="4" w:space="0"/>
-              <w:bottom w:val="single" w:color="000000" w:sz="4" w:space="0"/>
-              <w:right w:val="single" w:color="000000" w:sz="4" w:space="0"/>
+              <w:top w:val="single" w:sz="4" w:space="0" w:color="000000"/>
+              <w:start w:val="single" w:sz="4" w:space="0" w:color="000000"/>
+              <w:bottom w:val="single" w:sz="4" w:space="0" w:color="000000"/>
+              <w:end w:val="single" w:sz="4" w:space="0" w:color="000000"/>
             </w:tcBorders>
             <w:vAlign w:val="center"/>
           </w:tcPr>
           <w:p>
             <w:pPr>
-              <w:spacing w:line="320" w:lineRule="exact"/>
+              <w:pStyle w:val="Normal"/>
+              <w:spacing w:lineRule="exact" w:line="320"/>
               <w:jc w:val="center"/>
               <w:rPr>
                 <w:rFonts w:ascii="宋体" w:hAnsi="宋体" w:eastAsia="宋体"/>
                 <w:sz w:val="24"/>
               </w:rPr>
             </w:pPr>
+            <w:r>
+              <w:rPr>
+                <w:rFonts w:ascii="宋体" w:hAnsi="宋体" w:eastAsia="宋体"/>
+                <w:sz w:val="24"/>
+              </w:rPr>
+              <w:t xml:space="preserve"/>
+            </w:r>
           </w:p>
         </w:tc>
       </w:tr>
@@ -7343,7 +7295,7 @@
   <w:docDefaults>
     <w:rPrDefault>
       <w:rPr>
-        <w:rFonts w:ascii="Times New Roman" w:hAnsi="Times New Roman" w:eastAsia="宋体" w:cs="Times New Roman"/>
+        <w:rFonts w:ascii="Liberation Serif" w:hAnsi="Liberation Serif" w:eastAsia="Source Han Serif CN" w:cs="Noto Sans Devanagari"/>
       </w:rPr>
     </w:rPrDefault>
     <w:pPrDefault/>
@@ -7380,7 +7332,7 @@
     <w:lsdException w:unhideWhenUsed="0" w:uiPriority="0" w:semiHidden="0" w:name="Normal Indent"/>
     <w:lsdException w:unhideWhenUsed="0" w:uiPriority="0" w:semiHidden="0" w:name="footnote text"/>
     <w:lsdException w:unhideWhenUsed="0" w:uiPriority="0" w:semiHidden="0" w:name="annotation text"/>
-    <w:lsdException w:qFormat="1" w:unhideWhenUsed="0" w:uiPriority="0" w:semiHidden="0" w:name="header"/>
+    <w:lsdException w:unhideWhenUsed="0" w:uiPriority="0" w:semiHidden="0" w:name="header"/>
     <w:lsdException w:unhideWhenUsed="0" w:uiPriority="0" w:semiHidden="0" w:name="footer"/>
     <w:lsdException w:unhideWhenUsed="0" w:uiPriority="0" w:semiHidden="0" w:name="index heading"/>
     <w:lsdException w:qFormat="1" w:unhideWhenUsed="0" w:uiPriority="0" w:semiHidden="0" w:name="caption"/>
@@ -7390,13 +7342,13 @@
     <w:lsdException w:unhideWhenUsed="0" w:uiPriority="0" w:semiHidden="0" w:name="footnote reference"/>
     <w:lsdException w:unhideWhenUsed="0" w:uiPriority="0" w:semiHidden="0" w:name="annotation reference"/>
     <w:lsdException w:unhideWhenUsed="0" w:uiPriority="0" w:semiHidden="0" w:name="line number"/>
-    <w:lsdException w:qFormat="1" w:unhideWhenUsed="0" w:uiPriority="0" w:semiHidden="0" w:name="page number"/>
+    <w:lsdException w:unhideWhenUsed="0" w:uiPriority="0" w:semiHidden="0" w:name="page number"/>
     <w:lsdException w:unhideWhenUsed="0" w:uiPriority="0" w:semiHidden="0" w:name="endnote reference"/>
     <w:lsdException w:unhideWhenUsed="0" w:uiPriority="0" w:semiHidden="0" w:name="endnote text"/>
     <w:lsdException w:unhideWhenUsed="0" w:uiPriority="0" w:semiHidden="0" w:name="table of authorities"/>
     <w:lsdException w:unhideWhenUsed="0" w:uiPriority="0" w:semiHidden="0" w:name="macro"/>
     <w:lsdException w:unhideWhenUsed="0" w:uiPriority="0" w:semiHidden="0" w:name="toa heading"/>
-    <w:lsdException w:qFormat="1" w:unhideWhenUsed="0" w:uiPriority="0" w:semiHidden="0" w:name="List"/>
+    <w:lsdException w:unhideWhenUsed="0" w:uiPriority="0" w:semiHidden="0" w:name="List"/>
     <w:lsdException w:unhideWhenUsed="0" w:uiPriority="0" w:semiHidden="0" w:name="List Bullet"/>
     <w:lsdException w:unhideWhenUsed="0" w:uiPriority="0" w:semiHidden="0" w:name="List Number"/>
     <w:lsdException w:unhideWhenUsed="0" w:uiPriority="0" w:semiHidden="0" w:name="List 2"/>
@@ -7434,7 +7386,7 @@
     <w:lsdException w:unhideWhenUsed="0" w:uiPriority="0" w:semiHidden="0" w:name="Body Text Indent 2"/>
     <w:lsdException w:unhideWhenUsed="0" w:uiPriority="0" w:semiHidden="0" w:name="Body Text Indent 3"/>
     <w:lsdException w:unhideWhenUsed="0" w:uiPriority="0" w:semiHidden="0" w:name="Block Text"/>
-    <w:lsdException w:qFormat="1" w:unhideWhenUsed="0" w:uiPriority="0" w:semiHidden="0" w:name="Hyperlink"/>
+    <w:lsdException w:unhideWhenUsed="0" w:uiPriority="0" w:semiHidden="0" w:name="Hyperlink"/>
     <w:lsdException w:unhideWhenUsed="0" w:uiPriority="0" w:semiHidden="0" w:name="FollowedHyperlink"/>
     <w:lsdException w:qFormat="1" w:unhideWhenUsed="0" w:uiPriority="0" w:semiHidden="0" w:name="Strong"/>
     <w:lsdException w:qFormat="1" w:unhideWhenUsed="0" w:uiPriority="0" w:semiHidden="0" w:name="Emphasis"/>
@@ -7452,7 +7404,7 @@
     <w:lsdException w:unhideWhenUsed="0" w:uiPriority="0" w:semiHidden="0" w:name="HTML Sample"/>
     <w:lsdException w:unhideWhenUsed="0" w:uiPriority="0" w:semiHidden="0" w:name="HTML Typewriter"/>
     <w:lsdException w:unhideWhenUsed="0" w:uiPriority="0" w:semiHidden="0" w:name="HTML Variable"/>
-    <w:lsdException w:qFormat="1" w:unhideWhenUsed="0" w:uiPriority="0" w:name="Normal Table"/>
+    <w:lsdException w:unhideWhenUsed="0" w:uiPriority="0" w:name="Normal Table"/>
     <w:lsdException w:unhideWhenUsed="0" w:uiPriority="0" w:semiHidden="0" w:name="annotation subject"/>
     <w:lsdException w:unhideWhenUsed="0" w:uiPriority="0" w:semiHidden="0" w:name="Table Simple 1"/>
     <w:lsdException w:unhideWhenUsed="0" w:uiPriority="0" w:semiHidden="0" w:name="Table Simple 2"/>
@@ -7650,7 +7602,6 @@
   <w:style w:type="table" w:default="1" w:styleId="9">
     <w:name w:val="Normal Table"/>
     <w:semiHidden/>
-    <w:qFormat/>
     <w:uiPriority w:val="0"/>
     <w:tblPr>
       <w:tblCellMar>
@@ -7711,7 +7662,6 @@
   <w:style w:type="paragraph" w:styleId="6">
     <w:name w:val="header"/>
     <w:basedOn w:val="1"/>
-    <w:qFormat/>
     <w:uiPriority w:val="0"/>
     <w:pPr>
       <w:pBdr>
@@ -7732,7 +7682,6 @@
   <w:style w:type="paragraph" w:styleId="7">
     <w:name w:val="List"/>
     <w:basedOn w:val="3"/>
-    <w:qFormat/>
     <w:uiPriority w:val="0"/>
     <w:rPr>
       <w:rFonts w:cs="Noto Sans Devanagari"/>
@@ -7766,12 +7715,10 @@
   <w:style w:type="character" w:styleId="12">
     <w:name w:val="page number"/>
     <w:basedOn w:val="10"/>
-    <w:qFormat/>
     <w:uiPriority w:val="0"/>
   </w:style>
   <w:style w:type="character" w:styleId="13">
     <w:name w:val="Hyperlink"/>
-    <w:qFormat/>
     <w:uiPriority w:val="0"/>
     <w:rPr>
       <w:color w:val="0000FF"/>

</xml_diff>

<commit_message>
docs(proposal): rewrite technical route
Co-authored-by: TRAE CLI <traecli@bytedance.com>
</commit_message>
<xml_diff>
--- a/docs/开题报告/DeFuzz-开题报告.docx
+++ b/docs/开题报告/DeFuzz-开题报告.docx
@@ -3522,7 +3522,7 @@
                 <w:kern w:val="0"/>
                 <w:sz w:val="24"/>
               </w:rPr>
-              <w:t xml:space="preserve">技术路线分为总体架构、防御机制不变量预言机框架、大语言模型驱动的种子变异主循环、跨架构与编译选项调度四部分，对应研究内容 (1)–(3) 的工程实现。GCC 上的初步验证证据见第五章。</w:t>
+              <w:t xml:space="preserve">技术路线分为离线知识构建和在线缺陷搜索，整体结构如图 4 所示。离线阶段从编译器源码、ABI 与机制规范、历史缺陷及补丁中生成并核验安全不变量，再将其转换为可程序化验证的检查器；在线阶段以“不变量—检查器”对及其适用 ISA 为基本调度单元，由显式编排的智能体闭环构造测试种子，再由确定性工具链完成编译、覆盖率测量和缺陷判定。大语言模型（LLM）负责提出候选和调整搜索方向，不直接给出最终缺陷结论；最终结论必须落到可复现的二进制或运行时证据上。</w:t>
             </w:r>
           </w:p>
           <w:p>
@@ -3543,7 +3543,7 @@
                 <w:kern w:val="0"/>
                 <w:sz w:val="24"/>
               </w:rPr>
-              <w:t>4.1 总体架构</w:t>
+              <w:t>4.1 语料驱动的不变量生成与总体架构</w:t>
             </w:r>
           </w:p>
           <w:p>
@@ -3561,7 +3561,43 @@
                 <w:kern w:val="0"/>
                 <w:sz w:val="24"/>
               </w:rPr>
-              <w:t xml:space="preserve">系统以一条 fuzz 主循环为骨干，由 LLM 变异、编译器、预言机三个子系统以及种子语料库、配置模块共同支撑，结构如图 4 所示。Fuzz 引擎承担主循环调度与提示词组装两项职能，将当前覆盖率、目标基本块和已有种子拼装成提示词交给 LLM 变异子系统，获取新种子后分发给后续环节。编译器子系统封装预先插桩的 GCC 与 LLVM，将底层差异数据（如 gcov 与 SanitizerCoverage）统一归并为同构的"行级覆盖 → 种子 ID"映射，主循环对此无感知。预言机子系统按防御机制聚合不变量检查器，对编译成功的种子进行安全契约判定。种子语料库持久化满足质量阈值的种子并维护家系信息。配置模块按"防御机制 · ISA · flag"三元组下发任务：把工具链选择（GCC / LLVM）与对应 flag 交给编译器子系统，把目标 ISA 对应的 QEMU 工具链交给预言机的执行层，使同一份种子可在不同后端上做对照实验，从而以可重复的方式覆盖第一章所述的"防御机制 × ISA"矩阵。</w:t>
+              <w:t xml:space="preserve">不变量生成采用分段思维链（Chain-of-Thought，CoT）审阅与基于历史缺陷的检索增强生成（Retrieval-Augmented Generation，RAG）两条互补路径。第一条路径把规模较大的语料按机制、编译阶段和函数边界切分，要求 LLM 通过分步推理依次识别防御目标、成立条件、应保持的安全属性及属性破坏后的可观测现象，粗提候选不变量。分段处理使模型能够逐块覆盖长语料，但单纯阅读仍难以自动聚合散落在不同文件、补丁和后端中的同类根因，因此该路径主要承担广覆盖的候选发现，不把模型输出直接视为有效不变量。</w:t>
+            </w:r>
+          </w:p>
+          <w:p>
+            <w:pPr>
+              <w:pStyle w:val="Normal"/>
+              <w:spacing w:lineRule="auto" w:line="360"/>
+              <w:ind w:firstLineChars="200" w:startChars="0" w:start="0" w:endChars="0" w:end="0"/>
+              <w:rPr>
+                <w:kern w:val="0"/>
+                <w:sz w:val="24"/>
+              </w:rPr>
+            </w:pPr>
+            <w:r>
+              <w:rPr>
+                <w:kern w:val="0"/>
+                <w:sz w:val="24"/>
+              </w:rPr>
+              <w:t xml:space="preserve">第二条路径以已确认历史缺陷的根因为检索探针。系统先从缺陷报告、补丁及相关源码中抽取与机制名称和具体符号解耦的根因签名，再到 GCC、LLVM 及其不同目标后端的语料中检索结构或语义相似的实现片段。LLM 只在召回结果内判断根因是否同构，并把后端特定的缺陷描述泛化为包含前置条件、安全属性和可观测违例的候选不变量。历史根因进入探针库后，系统可据此定向检索其他后端中的潜在同源实现，再对召回结果逐项复核，不再完全依赖模型在全量阅读时偶然建立关联。RAG 不承担验证职责，它用于优先检索与已知缺陷同根因的实现。研究过程中发现的零日缺陷（0-day）先保存复现条件、检查器证据、最小化样例和受影响后端；经人工复核或上游确认后，再将已确认根因、补丁及回归测试（若已有）写入历史缺陷库，作为新的检索探针。</w:t>
+            </w:r>
+          </w:p>
+          <w:p>
+            <w:pPr>
+              <w:pStyle w:val="Normal"/>
+              <w:spacing w:lineRule="auto" w:line="360"/>
+              <w:ind w:firstLineChars="200" w:startChars="0" w:start="0" w:endChars="0" w:end="0"/>
+              <w:rPr>
+                <w:kern w:val="0"/>
+                <w:sz w:val="24"/>
+              </w:rPr>
+            </w:pPr>
+            <w:r>
+              <w:rPr>
+                <w:kern w:val="0"/>
+                <w:sz w:val="24"/>
+              </w:rPr>
+              <w:t xml:space="preserve">两条路径产生的候选统一进入证据核验与去重环节。系统要求每条候选能够回指具体语料，并检查其陈述是否由证据支持、是否与已有规则重复。通过筛选后，不变量以统一结构写入知识库，记录机制、编译器与版本、适用 ISA、前置条件、属性陈述、违例现象和证据来源。离线生成的知识库与在线智能体闭环（Agent Loop）由确定性服务连接：Python 编排层负责固定流程和版本化共享状态，Go 核心负责构建、覆盖率采集、检查器执行和元数据查询。</w:t>
             </w:r>
           </w:p>
           <w:p>
@@ -3574,7 +3610,7 @@
               <w:rPr/>
               <w:drawing>
                 <wp:inline xmlns:wp="http://schemas.openxmlformats.org/drawingml/2006/wordprocessingDrawing" distT="0" distB="0" distL="0" distR="0">
-                  <wp:extent cx="5385714" cy="2462468"/>
+                  <wp:extent cx="5385714" cy="3018991"/>
                   <wp:effectExtent l="0" t="0" r="0" b="0"/>
                   <wp:docPr id="24" name="Figure24"/>
                   <wp:cNvGraphicFramePr>
@@ -3596,7 +3632,7 @@
                         <pic:spPr>
                           <a:xfrm>
                             <a:off x="0" y="0"/>
-                            <a:ext cx="5385714" cy="2462468"/>
+                            <a:ext cx="5385714" cy="3018991"/>
                           </a:xfrm>
                           <a:prstGeom prst="rect">
                             <a:avLst/>
@@ -3628,7 +3664,7 @@
                 <w:bCs/>
                 <w:sz w:val="22"/>
               </w:rPr>
-              <w:t>图 4  DeFuzz 总体架构</w:t>
+              <w:t>图 4  DeFuzz 技术路线总体架构</w:t>
             </w:r>
           </w:p>
           <w:p>
@@ -3658,7 +3694,7 @@
                 <w:kern w:val="0"/>
                 <w:sz w:val="24"/>
               </w:rPr>
-              <w:t>4.2 防御机制不变量预言机框架</w:t>
+              <w:t>4.2 不变量到程序化检查器的转换</w:t>
             </w:r>
           </w:p>
           <w:p>
@@ -3676,7 +3712,25 @@
                 <w:kern w:val="0"/>
                 <w:sz w:val="24"/>
               </w:rPr>
-              <w:t xml:space="preserve">每个机制对应一个聚合器，下挂若干检查器。判定流程如图 5 所示，检查器输入包括种子的源码、汇编与二进制文件。检查器分为两类：静态检查器通过 ELF 符号表、指令字节模式与 .note 段进行断言；动态检查器则通过受控执行（如二分搜索）观察运行期越界表现。每个检查器返回 Pass、Fail 或 Error，聚合时任一 Fail 即视为机制级违例，并回写触发证据。对于易与编译器缺省行为混淆的检查器，框架会同时运行开/关机制的两套配置进行比对。预言机还维护一份缓存以复用执行结果，避免重复解析。</w:t>
+              <w:t xml:space="preserve">候选不变量只有被转换为可重复执行的检查器（checker）后，才能进入缺陷搜索。转换时先区分安全属性的可观测位置。若仅检查未执行的编译产物即可作出判断，例如 ELF 符号与节、指令序列、属性 note 或栈帧布局，则实现为静态检查器；若必须运行程序并观察退出状态、保护触发结果、寄存器或内存状态，则实现为动态检查器，并在需要时通过 QEMU 执行目标 ISA 的产物。同一条不变量同时具有静态线索和更精确的动态证据时，拆分为两个检查器，避免用启发式信号代替确定性结论。</w:t>
+            </w:r>
+          </w:p>
+          <w:p>
+            <w:pPr>
+              <w:pStyle w:val="Normal"/>
+              <w:spacing w:lineRule="auto" w:line="360"/>
+              <w:ind w:firstLineChars="200" w:startChars="0" w:start="0" w:endChars="0" w:end="0"/>
+              <w:rPr>
+                <w:kern w:val="0"/>
+                <w:sz w:val="24"/>
+              </w:rPr>
+            </w:pPr>
+            <w:r>
+              <w:rPr>
+                <w:kern w:val="0"/>
+                <w:sz w:val="24"/>
+              </w:rPr>
+              <w:t xml:space="preserve">每个检查器登记唯一 ID、所属不变量、检查类别、适用 ISA 集合、编译选项和证据格式，形成“不变量—检查器”对。执行结果采用 Pass、Fail、NotApplicable 和 Error 四态：Pass 表示当前样例满足不变量，Fail 表示观察到确定性违例，NotApplicable 表示机制未启用或样例未满足前置条件，Error 仅表示工具链或执行环境异常。聚合器只把具有确定性证据的 Fail 作为缺陷候选；NotApplicable 与 Error 保留在诊断记录中，但不产生最终缺陷结论。当现有程序化检查器因 ISA 支持不足而无法判定时，LLM 仅可依据反汇编和符号信息生成待复核候选，后续仍需补充可复现证据。对于可能与编译器默认行为混淆的属性，检查器使用开启与关闭机制的编译选项配置（flag profile）做对照。重复的反汇编、解析或运行结果由单轮缓存复用。判定流程如图 5 所示。</w:t>
             </w:r>
           </w:p>
           <w:p>
@@ -3689,7 +3743,7 @@
               <w:rPr/>
               <w:drawing>
                 <wp:inline xmlns:wp="http://schemas.openxmlformats.org/drawingml/2006/wordprocessingDrawing" distT="0" distB="0" distL="0" distR="0">
-                  <wp:extent cx="4284090" cy="5612159"/>
+                  <wp:extent cx="4284090" cy="5174569"/>
                   <wp:effectExtent l="0" t="0" r="0" b="0"/>
                   <wp:docPr id="25" name="Figure25"/>
                   <wp:cNvGraphicFramePr>
@@ -3711,7 +3765,7 @@
                         <pic:spPr>
                           <a:xfrm>
                             <a:off x="0" y="0"/>
-                            <a:ext cx="4284090" cy="5612159"/>
+                            <a:ext cx="4284090" cy="5174569"/>
                           </a:xfrm>
                           <a:prstGeom prst="rect">
                             <a:avLst/>
@@ -3743,7 +3797,7 @@
                 <w:bCs/>
                 <w:sz w:val="22"/>
               </w:rPr>
-              <w:t>图 5  防御机制不变量预言机判定流程</w:t>
+              <w:t>图 5  不变量到程序化检查器的转换与判定流程</w:t>
             </w:r>
           </w:p>
           <w:p>
@@ -3773,7 +3827,7 @@
                 <w:kern w:val="0"/>
                 <w:sz w:val="24"/>
               </w:rPr>
-              <w:t>4.3 大语言模型驱动的种子变异主循环</w:t>
+              <w:t>4.3 面向不变量—检查器对的 Agent Loop</w:t>
             </w:r>
           </w:p>
           <w:p>
@@ -3791,7 +3845,25 @@
                 <w:kern w:val="0"/>
                 <w:sz w:val="24"/>
               </w:rPr>
-              <w:t xml:space="preserve">主循环的输入为当前覆盖率映射与编译器源码控制流图，单轮迭代过程如图 6 所示。每轮先在未覆盖基本块中按相关性挑出一个目标，相关性由该基本块在 CFG 上的后继分支数和所属代码区域对防御机制的关联程度共同决定，使搜索集中在未触达且与防御逻辑相关的代码上。随后构造目标上下文：目标函数源码片段、逐行覆盖标注、目标基本块位置，以及覆盖目标前驱的若干示例种子。提示词组装层将上下文与基础变异提示词、机制契约要求拼接，提交给大语言模型生成新 C 种子。编译失败时反馈错误信息进入下一轮；编译成功后覆盖率分析器判断命中情况，预言机给出安全判定。结果分析阶段同时观察覆盖增量、是否命中目标、是否触发 bug，任一为真即保存种子。种子未命中目标但带来新覆盖时，利用轻量动态追踪定位其与基线种子在调用序列上的首个发散点，将发散函数源码作为额外上下文反馈给变异提示，请求模型重新精细变异。目标基本块全部覆盖后，主循环可切换至随机变异阶段，仅以预言机为保存条件继续探索。</w:t>
+              <w:t xml:space="preserve">在线搜索不让 LLM 自由选择不变量或 ISA。调度器从检查器目录中依次取出一个“不变量—检查器”对，锁定其声明的适用 ISA，并在固定轮数或时间预算内运行一个定向搜索任务。在该任务的多轮迭代中，目标“不变量—检查器”对及其适用 ISA 保持不变；预算耗尽后，调度游标再推进到下一项。每轮只有一个主目标，低成本静态检查器可作为常开旁路执行，但不改变种子生成目标。这样的调度使系统能够依次遍历已有检查能力，而不是依赖模型偏好选择容易的目标。</w:t>
+            </w:r>
+          </w:p>
+          <w:p>
+            <w:pPr>
+              <w:pStyle w:val="Normal"/>
+              <w:spacing w:lineRule="auto" w:line="360"/>
+              <w:ind w:firstLineChars="200" w:startChars="0" w:start="0" w:endChars="0" w:end="0"/>
+              <w:rPr>
+                <w:kern w:val="0"/>
+                <w:sz w:val="24"/>
+              </w:rPr>
+            </w:pPr>
+            <w:r>
+              <w:rPr>
+                <w:kern w:val="0"/>
+                <w:sz w:val="24"/>
+              </w:rPr>
+              <w:t xml:space="preserve">生成智能体（Generator）读取当前不变量、检查器约束、适用 ISA、已有种子及前轮反馈，构造试图违反该不变量的 C 种子。随后，固定流水线按对应工具链完成编译和覆盖率测量，路由层为目标检查器展开全部适用 ISA；具备工具链的单元进入编译和检查，缺少工具链的单元记录为 Error。覆盖率只用于描述搜索是否接近目标实现，缺陷判定仍由检查器负责。若结果为 Pass 或 NotApplicable，反馈智能体（Feedback）根据覆盖变化、聚合判定及本轮检查器信息生成下一轮提示；Error 单独保留为环境或工具链诊断信息，不产生缺陷结论，并由预算规则决定继续当前目标或推进游标。若检查器返回 Fail，最小化智能体（Minimizer）在保持同一检查器持续失败的约束下缩减种子，并由确定性的编译与检查器在每次删改后复验，直至得到便于人工确认的最小复现。图 6 给出了这一闭环。</w:t>
             </w:r>
           </w:p>
           <w:p>
@@ -3804,7 +3876,7 @@
               <w:rPr/>
               <w:drawing>
                 <wp:inline xmlns:wp="http://schemas.openxmlformats.org/drawingml/2006/wordprocessingDrawing" distT="0" distB="0" distL="0" distR="0">
-                  <wp:extent cx="4140166" cy="6725183"/>
+                  <wp:extent cx="4284090" cy="5127521"/>
                   <wp:effectExtent l="0" t="0" r="0" b="0"/>
                   <wp:docPr id="26" name="Figure26"/>
                   <wp:cNvGraphicFramePr>
@@ -3826,7 +3898,7 @@
                         <pic:spPr>
                           <a:xfrm>
                             <a:off x="0" y="0"/>
-                            <a:ext cx="4140166" cy="6725183"/>
+                            <a:ext cx="4284090" cy="5127521"/>
                           </a:xfrm>
                           <a:prstGeom prst="rect">
                             <a:avLst/>
@@ -3858,7 +3930,7 @@
                 <w:bCs/>
                 <w:sz w:val="22"/>
               </w:rPr>
-              <w:t>图 6  大语言模型驱动的种子变异主循环</w:t>
+              <w:t>图 6  面向不变量—检查器对的智能体闭环</w:t>
             </w:r>
           </w:p>
           <w:p>
@@ -3888,7 +3960,7 @@
                 <w:kern w:val="0"/>
                 <w:sz w:val="24"/>
               </w:rPr>
-              <w:t>4.4 跨架构与编译选项调度</w:t>
+              <w:t>4.4 跨 ISA 调度、结果留痕与知识回流</w:t>
             </w:r>
           </w:p>
           <w:p>
@@ -3906,7 +3978,25 @@
                 <w:kern w:val="0"/>
                 <w:sz w:val="24"/>
               </w:rPr>
-              <w:t xml:space="preserve">配置模块将编译命令参数化为编译器、ISA、架构 flag、策略 flag 方案四元组，向子系统下发对应工具链，使同一种子可分发至不同后端经 QEMU 执行。策略方案包含开/关机制两套配置，供预言机对照判定。不同编译器间的 flag 拼写差异被统一抽象，而二进制解析层（BinaryInspector）则屏蔽了各 ISA 间的底层格式差异，为检查器提供通用判定能力。</w:t>
+              <w:t xml:space="preserve">ISA 适配由检查器元数据决定，而不是由生成智能体临时猜测。单 ISA 检查器只下发到对应工具链；跨 ISA 检查器绑定完整的目标集合，同一种子需要在这些后端上编译和执行后才能进行差分判定。配置层拟统一管理编译器版本、ISA、机制开关、运行器和超时，使工具链差异由确定性构建层处理，而不交给智能体临时判断。当前原型已实现基于 ISA 的 GCC 工具链配置，后续将按同一接口接入 LLVM。对成本很低的静态检查可以默认执行，对动态或跨 ISA 检查则按照绑定关系展开，从而减少与当前不变量无关的笛卡尔积任务，同时保留同一安全契约在不同 ISA 上的差异信号。</w:t>
+            </w:r>
+          </w:p>
+          <w:p>
+            <w:pPr>
+              <w:pStyle w:val="Normal"/>
+              <w:spacing w:lineRule="auto" w:line="360"/>
+              <w:ind w:firstLineChars="200" w:startChars="0" w:start="0" w:endChars="0" w:end="0"/>
+              <w:rPr>
+                <w:kern w:val="0"/>
+                <w:sz w:val="24"/>
+              </w:rPr>
+            </w:pPr>
+            <w:r>
+              <w:rPr>
+                <w:kern w:val="0"/>
+                <w:sz w:val="24"/>
+              </w:rPr>
+              <w:t xml:space="preserve">每轮运行都在版本化共享状态和环境清单中记录目标不变量、检查器 ID、代码版本 Git SHA、检查器目录快照、ISA 与工具链、编译参数、种子家系、覆盖率、四态判定、反馈内容、最小化过程和最终证据。Generator、Feedback 与 Minimizer 之间不直接传递自由文本，而是由编排器读写这些结构化状态，因此任一缺陷可以沿着种子、构建产物和检查器证据回溯，实验也可以从指定检查点重放。经人工或上游确认的新缺陷随后进入历史缺陷库，成为下一轮 RAG 的探针，并据此补充或修订不变量与检查器，使已确认根因能够用于后续检索和回归检查。</w:t>
             </w:r>
           </w:p>
           <w:p>
@@ -6973,7 +7063,7 @@
         </mc:Choice>
         <mc:Fallback>
           <w:pict>
-            <v:shape id="Frame1" o:spid="_x0000_s1026" o:spt="202" type="#_x0000_t202" style="position:absolute;left:0pt;margin-top:0.05pt;height:10.35pt;width:9.05pt;mso-position-horizontal:center;mso-position-horizontal-relative:margin;mso-wrap-distance-bottom:0pt;mso-wrap-distance-left:0pt;mso-wrap-distance-right:0pt;mso-wrap-distance-top:0pt;z-index:251659264;mso-width-relative:page;mso-height-relative:page;" fillcolor="#FFFFFF" filled="t" stroked="f" coordsize="21600,21600" o:allowincell="f" o:gfxdata="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">
+            <v:shape id="Frame1" o:spid="_x0000_s1026" o:spt="202" type="#_x0000_t202" style="position:absolute;left:0pt;margin-top:0.05pt;height:10.35pt;width:9.05pt;mso-position-horizontal:center;mso-position-horizontal-relative:margin;mso-wrap-distance-bottom:0pt;mso-wrap-distance-left:0pt;mso-wrap-distance-right:0pt;mso-wrap-distance-top:0pt;z-index:251659264;mso-width-relative:page;mso-height-relative:page;" fillcolor="#FFFFFF" filled="t" stroked="f" coordsize="21600,21600" o:allowincell="f" o:gfxdata="UEsDBAoAAAAAAIdO4kAAAAAAAAAAAAAAAAAEAAAAZHJzL1BLAwQUAAAACACHTuJA4Bwc1tEAAAAD AQAADwAAAGRycy9kb3ducmV2LnhtbE2PzU7DMBCE70i8g7VI3KjdIEEI2VRqK7gi0kq9uvE2jhKv o9j94e1xTnBazc5q5ttydXODuNAUOs8Iy4UCQdx403GLsN99POUgQtRs9OCZEH4owKq6vyt1YfyV v+lSx1akEA6FRrAxjoWUobHkdFj4kTh5Jz85HZOcWmkmfU3hbpCZUi/S6Y5Tg9UjbSw1fX12CM9f 2eshfNbbzXigtz4P6/7EFvHxYaneQUS6xb9jmPETOlSJ6ejPbIIYENIjcd6K2cvTPCJkKgdZlfI/ e/ULUEsDBBQAAAAIAIdO4kC4PwPPygEAALMDAAAOAAAAZHJzL2Uyb0RvYy54bWytU8GO0zAQvSPx D5bvNM22i6BqugKqIiQESAsf4Dh2Y8n2WGO3Sf+esdN0V8tlD+Rgz9jjN/PeTLYPo7PsrDAa8A2v F0vOlJfQGX9s+J/fh3cfOItJ+E5Y8KrhFxX5w+7tm+0QNuoOerCdQkYgPm6G0PA+pbCpqih75URc QFCeLjWgE4lcPFYdioHQna3ulsv31QDYBQSpYqTT/XTJr4j4GkDQ2ki1B3lyyqcJFZUViSjF3oTI d6VarZVMP7WOKjHbcGKaykpJyG7zWu22YnNEEXojryWI15TwgpMTxlPSG9ReJMFOaP6BckYiRNBp IcFVE5GiCLGoly+0eexFUIULSR3DTfT4/2Dlj/MvZKZr+IozLxw1/IC01VmZIcQNBTwGCknjZxhp XubzSIeZ8KjR5Z2oMLonXS83XdWYmMyP6vXH1T1nkq7qVb1e32eU6ulxwJi+KnAsGw1HaltRU5y/ xzSFziE5VwRruoOxtjh4bL9YZGdBLT6Ub3prQy+m09JmShen0JL6GUaVeU58spXGdrySb6G7EHf7 zZPkeXxmA2ejnQ3hZQ80WFPhHj6dEmhTis+gExJlzg71stRwnbs8LM/9EvX0r+3+AlBLAwQKAAAA AACHTuJAAAAAAAAAAAAAAAAABgAAAF9yZWxzL1BLAwQUAAAACACHTuJAihRmPNEAAACUAQAACwAA AF9yZWxzLy5yZWxzpZDBasMwDIbvg72D0X1xmsMYo04vo9Br6R7A2IpjGltGMtn69vMOg2X0tqN+ oe8T//7wmRa1IkukbGDX9aAwO/IxBwPvl+PTCyipNnu7UEYDNxQ4jI8P+zMutrYjmWMR1ShZDMy1 lletxc2YrHRUMLfNRJxsbSMHXay72oB66Ptnzb8ZMG6Y6uQN8MkPoC630sx/2Ck6JqGpdo6SpmmK 7h5VB7Zlju7INuEbuUazHLAa8CwaB2pZ134EfV+/+6fe00c+47rVfoeM649Xb7ocvwBQSwMEFAAA AAgAh07iQH7m5SD3AAAA4QEAABMAAABbQ29udGVudF9UeXBlc10ueG1slZFBTsMwEEX3SNzB8hYl TrtACCXpgrRLQKgcYGRPEotkbHlMaG+Pk7YbRJFY2jP/vye73BzGQUwY2Dqq5CovpEDSzljqKvm+ 32UPUnAEMjA4wkoekeWmvr0p90ePLFKauJJ9jP5RKdY9jsC580hp0rowQkzH0CkP+gM6VOuiuFfa UUSKWZw7ZF022MLnEMX2kK5PJgEHluLptDizKgneD1ZDTKZqIvODkp0JeUouO9xbz3dJQ6pfCfPk OuCce0lPE6xB8QohPsOYNJQJrIz7ooBT/nfJbDly5trWasybwE2KveF0sbrWjmvXOP3f8u2SunSr 5YPqb1BLAQIUABQAAAAIAIdO4kB+5uUg9wAAAOEBAAATAAAAAAAAAAEAIAAAADQEAABbQ29udGVu dF9UeXBlc10ueG1sUEsBAhQACgAAAAAAh07iQAAAAAAAAAAAAAAAAAYAAAAAAAAAAAAQAAAAFgMA AF9yZWxzL1BLAQIUABQAAAAIAIdO4kCKFGY80QAAAJQBAAALAAAAAAAAAAEAIAAAADoDAABfcmVs cy8ucmVsc1BLAQIUAAoAAAAAAIdO4kAAAAAAAAAAAAAAAAAEAAAAAAAAAAAAEAAAAAAAAABkcnMv UEsBAhQAFAAAAAgAh07iQOAcHNbRAAAAAwEAAA8AAAAAAAAAAQAgAAAAIgAAAGRycy9kb3ducmV2 LnhtbFBLAQIUABQAAAAIAIdO4kC4PwPPygEAALMDAAAOAAAAAAAAAAEAIAAAACABAABkcnMvZTJv RG9jLnhtbFBLBQYAAAAABgAGAFkBAABcBQAAAAA= ">
               <v:fill on="t" opacity="0f" focussize="0,0"/>
               <v:stroke on="f"/>
               <v:imagedata o:title=""/>

</xml_diff>

<commit_message>
Revert "docs(proposal): rewrite technical route"
This reverts commit 341d6589395710737317a3670be2d7dfca378ec7.

Co-authored-by: TRAE CLI <traecli@bytedance.com>
</commit_message>
<xml_diff>
--- a/docs/开题报告/DeFuzz-开题报告.docx
+++ b/docs/开题报告/DeFuzz-开题报告.docx
@@ -3522,7 +3522,7 @@
                 <w:kern w:val="0"/>
                 <w:sz w:val="24"/>
               </w:rPr>
-              <w:t xml:space="preserve">技术路线分为离线知识构建和在线缺陷搜索，整体结构如图 4 所示。离线阶段从编译器源码、ABI 与机制规范、历史缺陷及补丁中生成并核验安全不变量，再将其转换为可程序化验证的检查器；在线阶段以“不变量—检查器”对及其适用 ISA 为基本调度单元，由显式编排的智能体闭环构造测试种子，再由确定性工具链完成编译、覆盖率测量和缺陷判定。大语言模型（LLM）负责提出候选和调整搜索方向，不直接给出最终缺陷结论；最终结论必须落到可复现的二进制或运行时证据上。</w:t>
+              <w:t xml:space="preserve">技术路线分为总体架构、防御机制不变量预言机框架、大语言模型驱动的种子变异主循环、跨架构与编译选项调度四部分，对应研究内容 (1)–(3) 的工程实现。GCC 上的初步验证证据见第五章。</w:t>
             </w:r>
           </w:p>
           <w:p>
@@ -3543,7 +3543,7 @@
                 <w:kern w:val="0"/>
                 <w:sz w:val="24"/>
               </w:rPr>
-              <w:t>4.1 语料驱动的不变量生成与总体架构</w:t>
+              <w:t>4.1 总体架构</w:t>
             </w:r>
           </w:p>
           <w:p>
@@ -3561,43 +3561,7 @@
                 <w:kern w:val="0"/>
                 <w:sz w:val="24"/>
               </w:rPr>
-              <w:t xml:space="preserve">不变量生成采用分段思维链（Chain-of-Thought，CoT）审阅与基于历史缺陷的检索增强生成（Retrieval-Augmented Generation，RAG）两条互补路径。第一条路径把规模较大的语料按机制、编译阶段和函数边界切分，要求 LLM 通过分步推理依次识别防御目标、成立条件、应保持的安全属性及属性破坏后的可观测现象，粗提候选不变量。分段处理使模型能够逐块覆盖长语料，但单纯阅读仍难以自动聚合散落在不同文件、补丁和后端中的同类根因，因此该路径主要承担广覆盖的候选发现，不把模型输出直接视为有效不变量。</w:t>
-            </w:r>
-          </w:p>
-          <w:p>
-            <w:pPr>
-              <w:pStyle w:val="Normal"/>
-              <w:spacing w:lineRule="auto" w:line="360"/>
-              <w:ind w:firstLineChars="200" w:startChars="0" w:start="0" w:endChars="0" w:end="0"/>
-              <w:rPr>
-                <w:kern w:val="0"/>
-                <w:sz w:val="24"/>
-              </w:rPr>
-            </w:pPr>
-            <w:r>
-              <w:rPr>
-                <w:kern w:val="0"/>
-                <w:sz w:val="24"/>
-              </w:rPr>
-              <w:t xml:space="preserve">第二条路径以已确认历史缺陷的根因为检索探针。系统先从缺陷报告、补丁及相关源码中抽取与机制名称和具体符号解耦的根因签名，再到 GCC、LLVM 及其不同目标后端的语料中检索结构或语义相似的实现片段。LLM 只在召回结果内判断根因是否同构，并把后端特定的缺陷描述泛化为包含前置条件、安全属性和可观测违例的候选不变量。历史根因进入探针库后，系统可据此定向检索其他后端中的潜在同源实现，再对召回结果逐项复核，不再完全依赖模型在全量阅读时偶然建立关联。RAG 不承担验证职责，它用于优先检索与已知缺陷同根因的实现。研究过程中发现的零日缺陷（0-day）先保存复现条件、检查器证据、最小化样例和受影响后端；经人工复核或上游确认后，再将已确认根因、补丁及回归测试（若已有）写入历史缺陷库，作为新的检索探针。</w:t>
-            </w:r>
-          </w:p>
-          <w:p>
-            <w:pPr>
-              <w:pStyle w:val="Normal"/>
-              <w:spacing w:lineRule="auto" w:line="360"/>
-              <w:ind w:firstLineChars="200" w:startChars="0" w:start="0" w:endChars="0" w:end="0"/>
-              <w:rPr>
-                <w:kern w:val="0"/>
-                <w:sz w:val="24"/>
-              </w:rPr>
-            </w:pPr>
-            <w:r>
-              <w:rPr>
-                <w:kern w:val="0"/>
-                <w:sz w:val="24"/>
-              </w:rPr>
-              <w:t xml:space="preserve">两条路径产生的候选统一进入证据核验与去重环节。系统要求每条候选能够回指具体语料，并检查其陈述是否由证据支持、是否与已有规则重复。通过筛选后，不变量以统一结构写入知识库，记录机制、编译器与版本、适用 ISA、前置条件、属性陈述、违例现象和证据来源。离线生成的知识库与在线智能体闭环（Agent Loop）由确定性服务连接：Python 编排层负责固定流程和版本化共享状态，Go 核心负责构建、覆盖率采集、检查器执行和元数据查询。</w:t>
+              <w:t xml:space="preserve">系统以一条 fuzz 主循环为骨干，由 LLM 变异、编译器、预言机三个子系统以及种子语料库、配置模块共同支撑，结构如图 4 所示。Fuzz 引擎承担主循环调度与提示词组装两项职能，将当前覆盖率、目标基本块和已有种子拼装成提示词交给 LLM 变异子系统，获取新种子后分发给后续环节。编译器子系统封装预先插桩的 GCC 与 LLVM，将底层差异数据（如 gcov 与 SanitizerCoverage）统一归并为同构的"行级覆盖 → 种子 ID"映射，主循环对此无感知。预言机子系统按防御机制聚合不变量检查器，对编译成功的种子进行安全契约判定。种子语料库持久化满足质量阈值的种子并维护家系信息。配置模块按"防御机制 · ISA · flag"三元组下发任务：把工具链选择（GCC / LLVM）与对应 flag 交给编译器子系统，把目标 ISA 对应的 QEMU 工具链交给预言机的执行层，使同一份种子可在不同后端上做对照实验，从而以可重复的方式覆盖第一章所述的"防御机制 × ISA"矩阵。</w:t>
             </w:r>
           </w:p>
           <w:p>
@@ -3610,7 +3574,7 @@
               <w:rPr/>
               <w:drawing>
                 <wp:inline xmlns:wp="http://schemas.openxmlformats.org/drawingml/2006/wordprocessingDrawing" distT="0" distB="0" distL="0" distR="0">
-                  <wp:extent cx="5385714" cy="3018991"/>
+                  <wp:extent cx="5385714" cy="2462468"/>
                   <wp:effectExtent l="0" t="0" r="0" b="0"/>
                   <wp:docPr id="24" name="Figure24"/>
                   <wp:cNvGraphicFramePr>
@@ -3632,7 +3596,7 @@
                         <pic:spPr>
                           <a:xfrm>
                             <a:off x="0" y="0"/>
-                            <a:ext cx="5385714" cy="3018991"/>
+                            <a:ext cx="5385714" cy="2462468"/>
                           </a:xfrm>
                           <a:prstGeom prst="rect">
                             <a:avLst/>
@@ -3664,7 +3628,7 @@
                 <w:bCs/>
                 <w:sz w:val="22"/>
               </w:rPr>
-              <w:t>图 4  DeFuzz 技术路线总体架构</w:t>
+              <w:t>图 4  DeFuzz 总体架构</w:t>
             </w:r>
           </w:p>
           <w:p>
@@ -3694,7 +3658,7 @@
                 <w:kern w:val="0"/>
                 <w:sz w:val="24"/>
               </w:rPr>
-              <w:t>4.2 不变量到程序化检查器的转换</w:t>
+              <w:t>4.2 防御机制不变量预言机框架</w:t>
             </w:r>
           </w:p>
           <w:p>
@@ -3712,25 +3676,7 @@
                 <w:kern w:val="0"/>
                 <w:sz w:val="24"/>
               </w:rPr>
-              <w:t xml:space="preserve">候选不变量只有被转换为可重复执行的检查器（checker）后，才能进入缺陷搜索。转换时先区分安全属性的可观测位置。若仅检查未执行的编译产物即可作出判断，例如 ELF 符号与节、指令序列、属性 note 或栈帧布局，则实现为静态检查器；若必须运行程序并观察退出状态、保护触发结果、寄存器或内存状态，则实现为动态检查器，并在需要时通过 QEMU 执行目标 ISA 的产物。同一条不变量同时具有静态线索和更精确的动态证据时，拆分为两个检查器，避免用启发式信号代替确定性结论。</w:t>
-            </w:r>
-          </w:p>
-          <w:p>
-            <w:pPr>
-              <w:pStyle w:val="Normal"/>
-              <w:spacing w:lineRule="auto" w:line="360"/>
-              <w:ind w:firstLineChars="200" w:startChars="0" w:start="0" w:endChars="0" w:end="0"/>
-              <w:rPr>
-                <w:kern w:val="0"/>
-                <w:sz w:val="24"/>
-              </w:rPr>
-            </w:pPr>
-            <w:r>
-              <w:rPr>
-                <w:kern w:val="0"/>
-                <w:sz w:val="24"/>
-              </w:rPr>
-              <w:t xml:space="preserve">每个检查器登记唯一 ID、所属不变量、检查类别、适用 ISA 集合、编译选项和证据格式，形成“不变量—检查器”对。执行结果采用 Pass、Fail、NotApplicable 和 Error 四态：Pass 表示当前样例满足不变量，Fail 表示观察到确定性违例，NotApplicable 表示机制未启用或样例未满足前置条件，Error 仅表示工具链或执行环境异常。聚合器只把具有确定性证据的 Fail 作为缺陷候选；NotApplicable 与 Error 保留在诊断记录中，但不产生最终缺陷结论。当现有程序化检查器因 ISA 支持不足而无法判定时，LLM 仅可依据反汇编和符号信息生成待复核候选，后续仍需补充可复现证据。对于可能与编译器默认行为混淆的属性，检查器使用开启与关闭机制的编译选项配置（flag profile）做对照。重复的反汇编、解析或运行结果由单轮缓存复用。判定流程如图 5 所示。</w:t>
+              <w:t xml:space="preserve">每个机制对应一个聚合器，下挂若干检查器。判定流程如图 5 所示，检查器输入包括种子的源码、汇编与二进制文件。检查器分为两类：静态检查器通过 ELF 符号表、指令字节模式与 .note 段进行断言；动态检查器则通过受控执行（如二分搜索）观察运行期越界表现。每个检查器返回 Pass、Fail 或 Error，聚合时任一 Fail 即视为机制级违例，并回写触发证据。对于易与编译器缺省行为混淆的检查器，框架会同时运行开/关机制的两套配置进行比对。预言机还维护一份缓存以复用执行结果，避免重复解析。</w:t>
             </w:r>
           </w:p>
           <w:p>
@@ -3743,7 +3689,7 @@
               <w:rPr/>
               <w:drawing>
                 <wp:inline xmlns:wp="http://schemas.openxmlformats.org/drawingml/2006/wordprocessingDrawing" distT="0" distB="0" distL="0" distR="0">
-                  <wp:extent cx="4284090" cy="5174569"/>
+                  <wp:extent cx="4284090" cy="5612159"/>
                   <wp:effectExtent l="0" t="0" r="0" b="0"/>
                   <wp:docPr id="25" name="Figure25"/>
                   <wp:cNvGraphicFramePr>
@@ -3765,7 +3711,7 @@
                         <pic:spPr>
                           <a:xfrm>
                             <a:off x="0" y="0"/>
-                            <a:ext cx="4284090" cy="5174569"/>
+                            <a:ext cx="4284090" cy="5612159"/>
                           </a:xfrm>
                           <a:prstGeom prst="rect">
                             <a:avLst/>
@@ -3797,7 +3743,7 @@
                 <w:bCs/>
                 <w:sz w:val="22"/>
               </w:rPr>
-              <w:t>图 5  不变量到程序化检查器的转换与判定流程</w:t>
+              <w:t>图 5  防御机制不变量预言机判定流程</w:t>
             </w:r>
           </w:p>
           <w:p>
@@ -3827,7 +3773,7 @@
                 <w:kern w:val="0"/>
                 <w:sz w:val="24"/>
               </w:rPr>
-              <w:t>4.3 面向不变量—检查器对的 Agent Loop</w:t>
+              <w:t>4.3 大语言模型驱动的种子变异主循环</w:t>
             </w:r>
           </w:p>
           <w:p>
@@ -3845,25 +3791,7 @@
                 <w:kern w:val="0"/>
                 <w:sz w:val="24"/>
               </w:rPr>
-              <w:t xml:space="preserve">在线搜索不让 LLM 自由选择不变量或 ISA。调度器从检查器目录中依次取出一个“不变量—检查器”对，锁定其声明的适用 ISA，并在固定轮数或时间预算内运行一个定向搜索任务。在该任务的多轮迭代中，目标“不变量—检查器”对及其适用 ISA 保持不变；预算耗尽后，调度游标再推进到下一项。每轮只有一个主目标，低成本静态检查器可作为常开旁路执行，但不改变种子生成目标。这样的调度使系统能够依次遍历已有检查能力，而不是依赖模型偏好选择容易的目标。</w:t>
-            </w:r>
-          </w:p>
-          <w:p>
-            <w:pPr>
-              <w:pStyle w:val="Normal"/>
-              <w:spacing w:lineRule="auto" w:line="360"/>
-              <w:ind w:firstLineChars="200" w:startChars="0" w:start="0" w:endChars="0" w:end="0"/>
-              <w:rPr>
-                <w:kern w:val="0"/>
-                <w:sz w:val="24"/>
-              </w:rPr>
-            </w:pPr>
-            <w:r>
-              <w:rPr>
-                <w:kern w:val="0"/>
-                <w:sz w:val="24"/>
-              </w:rPr>
-              <w:t xml:space="preserve">生成智能体（Generator）读取当前不变量、检查器约束、适用 ISA、已有种子及前轮反馈，构造试图违反该不变量的 C 种子。随后，固定流水线按对应工具链完成编译和覆盖率测量，路由层为目标检查器展开全部适用 ISA；具备工具链的单元进入编译和检查，缺少工具链的单元记录为 Error。覆盖率只用于描述搜索是否接近目标实现，缺陷判定仍由检查器负责。若结果为 Pass 或 NotApplicable，反馈智能体（Feedback）根据覆盖变化、聚合判定及本轮检查器信息生成下一轮提示；Error 单独保留为环境或工具链诊断信息，不产生缺陷结论，并由预算规则决定继续当前目标或推进游标。若检查器返回 Fail，最小化智能体（Minimizer）在保持同一检查器持续失败的约束下缩减种子，并由确定性的编译与检查器在每次删改后复验，直至得到便于人工确认的最小复现。图 6 给出了这一闭环。</w:t>
+              <w:t xml:space="preserve">主循环的输入为当前覆盖率映射与编译器源码控制流图，单轮迭代过程如图 6 所示。每轮先在未覆盖基本块中按相关性挑出一个目标，相关性由该基本块在 CFG 上的后继分支数和所属代码区域对防御机制的关联程度共同决定，使搜索集中在未触达且与防御逻辑相关的代码上。随后构造目标上下文：目标函数源码片段、逐行覆盖标注、目标基本块位置，以及覆盖目标前驱的若干示例种子。提示词组装层将上下文与基础变异提示词、机制契约要求拼接，提交给大语言模型生成新 C 种子。编译失败时反馈错误信息进入下一轮；编译成功后覆盖率分析器判断命中情况，预言机给出安全判定。结果分析阶段同时观察覆盖增量、是否命中目标、是否触发 bug，任一为真即保存种子。种子未命中目标但带来新覆盖时，利用轻量动态追踪定位其与基线种子在调用序列上的首个发散点，将发散函数源码作为额外上下文反馈给变异提示，请求模型重新精细变异。目标基本块全部覆盖后，主循环可切换至随机变异阶段，仅以预言机为保存条件继续探索。</w:t>
             </w:r>
           </w:p>
           <w:p>
@@ -3876,7 +3804,7 @@
               <w:rPr/>
               <w:drawing>
                 <wp:inline xmlns:wp="http://schemas.openxmlformats.org/drawingml/2006/wordprocessingDrawing" distT="0" distB="0" distL="0" distR="0">
-                  <wp:extent cx="4284090" cy="5127521"/>
+                  <wp:extent cx="4140166" cy="6725183"/>
                   <wp:effectExtent l="0" t="0" r="0" b="0"/>
                   <wp:docPr id="26" name="Figure26"/>
                   <wp:cNvGraphicFramePr>
@@ -3898,7 +3826,7 @@
                         <pic:spPr>
                           <a:xfrm>
                             <a:off x="0" y="0"/>
-                            <a:ext cx="4284090" cy="5127521"/>
+                            <a:ext cx="4140166" cy="6725183"/>
                           </a:xfrm>
                           <a:prstGeom prst="rect">
                             <a:avLst/>
@@ -3930,7 +3858,7 @@
                 <w:bCs/>
                 <w:sz w:val="22"/>
               </w:rPr>
-              <w:t>图 6  面向不变量—检查器对的智能体闭环</w:t>
+              <w:t>图 6  大语言模型驱动的种子变异主循环</w:t>
             </w:r>
           </w:p>
           <w:p>
@@ -3960,7 +3888,7 @@
                 <w:kern w:val="0"/>
                 <w:sz w:val="24"/>
               </w:rPr>
-              <w:t>4.4 跨 ISA 调度、结果留痕与知识回流</w:t>
+              <w:t>4.4 跨架构与编译选项调度</w:t>
             </w:r>
           </w:p>
           <w:p>
@@ -3978,25 +3906,7 @@
                 <w:kern w:val="0"/>
                 <w:sz w:val="24"/>
               </w:rPr>
-              <w:t xml:space="preserve">ISA 适配由检查器元数据决定，而不是由生成智能体临时猜测。单 ISA 检查器只下发到对应工具链；跨 ISA 检查器绑定完整的目标集合，同一种子需要在这些后端上编译和执行后才能进行差分判定。配置层拟统一管理编译器版本、ISA、机制开关、运行器和超时，使工具链差异由确定性构建层处理，而不交给智能体临时判断。当前原型已实现基于 ISA 的 GCC 工具链配置，后续将按同一接口接入 LLVM。对成本很低的静态检查可以默认执行，对动态或跨 ISA 检查则按照绑定关系展开，从而减少与当前不变量无关的笛卡尔积任务，同时保留同一安全契约在不同 ISA 上的差异信号。</w:t>
-            </w:r>
-          </w:p>
-          <w:p>
-            <w:pPr>
-              <w:pStyle w:val="Normal"/>
-              <w:spacing w:lineRule="auto" w:line="360"/>
-              <w:ind w:firstLineChars="200" w:startChars="0" w:start="0" w:endChars="0" w:end="0"/>
-              <w:rPr>
-                <w:kern w:val="0"/>
-                <w:sz w:val="24"/>
-              </w:rPr>
-            </w:pPr>
-            <w:r>
-              <w:rPr>
-                <w:kern w:val="0"/>
-                <w:sz w:val="24"/>
-              </w:rPr>
-              <w:t xml:space="preserve">每轮运行都在版本化共享状态和环境清单中记录目标不变量、检查器 ID、代码版本 Git SHA、检查器目录快照、ISA 与工具链、编译参数、种子家系、覆盖率、四态判定、反馈内容、最小化过程和最终证据。Generator、Feedback 与 Minimizer 之间不直接传递自由文本，而是由编排器读写这些结构化状态，因此任一缺陷可以沿着种子、构建产物和检查器证据回溯，实验也可以从指定检查点重放。经人工或上游确认的新缺陷随后进入历史缺陷库，成为下一轮 RAG 的探针，并据此补充或修订不变量与检查器，使已确认根因能够用于后续检索和回归检查。</w:t>
+              <w:t xml:space="preserve">配置模块将编译命令参数化为编译器、ISA、架构 flag、策略 flag 方案四元组，向子系统下发对应工具链，使同一种子可分发至不同后端经 QEMU 执行。策略方案包含开/关机制两套配置，供预言机对照判定。不同编译器间的 flag 拼写差异被统一抽象，而二进制解析层（BinaryInspector）则屏蔽了各 ISA 间的底层格式差异，为检查器提供通用判定能力。</w:t>
             </w:r>
           </w:p>
           <w:p>
@@ -7063,7 +6973,7 @@
         </mc:Choice>
         <mc:Fallback>
           <w:pict>
-            <v:shape id="Frame1" o:spid="_x0000_s1026" o:spt="202" type="#_x0000_t202" style="position:absolute;left:0pt;margin-top:0.05pt;height:10.35pt;width:9.05pt;mso-position-horizontal:center;mso-position-horizontal-relative:margin;mso-wrap-distance-bottom:0pt;mso-wrap-distance-left:0pt;mso-wrap-distance-right:0pt;mso-wrap-distance-top:0pt;z-index:251659264;mso-width-relative:page;mso-height-relative:page;" fillcolor="#FFFFFF" filled="t" stroked="f" coordsize="21600,21600" o:allowincell="f" o:gfxdata="UEsDBAoAAAAAAIdO4kAAAAAAAAAAAAAAAAAEAAAAZHJzL1BLAwQUAAAACACHTuJA4Bwc1tEAAAAD AQAADwAAAGRycy9kb3ducmV2LnhtbE2PzU7DMBCE70i8g7VI3KjdIEEI2VRqK7gi0kq9uvE2jhKv o9j94e1xTnBazc5q5ttydXODuNAUOs8Iy4UCQdx403GLsN99POUgQtRs9OCZEH4owKq6vyt1YfyV v+lSx1akEA6FRrAxjoWUobHkdFj4kTh5Jz85HZOcWmkmfU3hbpCZUi/S6Y5Tg9UjbSw1fX12CM9f 2eshfNbbzXigtz4P6/7EFvHxYaneQUS6xb9jmPETOlSJ6ejPbIIYENIjcd6K2cvTPCJkKgdZlfI/ e/ULUEsDBBQAAAAIAIdO4kC4PwPPygEAALMDAAAOAAAAZHJzL2Uyb0RvYy54bWytU8GO0zAQvSPx D5bvNM22i6BqugKqIiQESAsf4Dh2Y8n2WGO3Sf+esdN0V8tlD+Rgz9jjN/PeTLYPo7PsrDAa8A2v F0vOlJfQGX9s+J/fh3cfOItJ+E5Y8KrhFxX5w+7tm+0QNuoOerCdQkYgPm6G0PA+pbCpqih75URc QFCeLjWgE4lcPFYdioHQna3ulsv31QDYBQSpYqTT/XTJr4j4GkDQ2ki1B3lyyqcJFZUViSjF3oTI d6VarZVMP7WOKjHbcGKaykpJyG7zWu22YnNEEXojryWI15TwgpMTxlPSG9ReJMFOaP6BckYiRNBp IcFVE5GiCLGoly+0eexFUIULSR3DTfT4/2Dlj/MvZKZr+IozLxw1/IC01VmZIcQNBTwGCknjZxhp XubzSIeZ8KjR5Z2oMLonXS83XdWYmMyP6vXH1T1nkq7qVb1e32eU6ulxwJi+KnAsGw1HaltRU5y/ xzSFziE5VwRruoOxtjh4bL9YZGdBLT6Ub3prQy+m09JmShen0JL6GUaVeU58spXGdrySb6G7EHf7 zZPkeXxmA2ejnQ3hZQ80WFPhHj6dEmhTis+gExJlzg71stRwnbs8LM/9EvX0r+3+AlBLAwQKAAAA AACHTuJAAAAAAAAAAAAAAAAABgAAAF9yZWxzL1BLAwQUAAAACACHTuJAihRmPNEAAACUAQAACwAA AF9yZWxzLy5yZWxzpZDBasMwDIbvg72D0X1xmsMYo04vo9Br6R7A2IpjGltGMtn69vMOg2X0tqN+ oe8T//7wmRa1IkukbGDX9aAwO/IxBwPvl+PTCyipNnu7UEYDNxQ4jI8P+zMutrYjmWMR1ShZDMy1 lletxc2YrHRUMLfNRJxsbSMHXay72oB66Ptnzb8ZMG6Y6uQN8MkPoC630sx/2Ck6JqGpdo6SpmmK 7h5VB7Zlju7INuEbuUazHLAa8CwaB2pZ134EfV+/+6fe00c+47rVfoeM649Xb7ocvwBQSwMEFAAA AAgAh07iQH7m5SD3AAAA4QEAABMAAABbQ29udGVudF9UeXBlc10ueG1slZFBTsMwEEX3SNzB8hYl TrtACCXpgrRLQKgcYGRPEotkbHlMaG+Pk7YbRJFY2jP/vye73BzGQUwY2Dqq5CovpEDSzljqKvm+ 32UPUnAEMjA4wkoekeWmvr0p90ePLFKauJJ9jP5RKdY9jsC580hp0rowQkzH0CkP+gM6VOuiuFfa UUSKWZw7ZF022MLnEMX2kK5PJgEHluLptDizKgneD1ZDTKZqIvODkp0JeUouO9xbz3dJQ6pfCfPk OuCce0lPE6xB8QohPsOYNJQJrIz7ooBT/nfJbDly5trWasybwE2KveF0sbrWjmvXOP3f8u2SunSr 5YPqb1BLAQIUABQAAAAIAIdO4kB+5uUg9wAAAOEBAAATAAAAAAAAAAEAIAAAADQEAABbQ29udGVu dF9UeXBlc10ueG1sUEsBAhQACgAAAAAAh07iQAAAAAAAAAAAAAAAAAYAAAAAAAAAAAAQAAAAFgMA AF9yZWxzL1BLAQIUABQAAAAIAIdO4kCKFGY80QAAAJQBAAALAAAAAAAAAAEAIAAAADoDAABfcmVs cy8ucmVsc1BLAQIUAAoAAAAAAIdO4kAAAAAAAAAAAAAAAAAEAAAAAAAAAAAAEAAAAAAAAABkcnMv UEsBAhQAFAAAAAgAh07iQOAcHNbRAAAAAwEAAA8AAAAAAAAAAQAgAAAAIgAAAGRycy9kb3ducmV2 LnhtbFBLAQIUABQAAAAIAIdO4kC4PwPPygEAALMDAAAOAAAAAAAAAAEAIAAAACABAABkcnMvZTJv RG9jLnhtbFBLBQYAAAAABgAGAFkBAABcBQAAAAA= ">
+            <v:shape id="Frame1" o:spid="_x0000_s1026" o:spt="202" type="#_x0000_t202" style="position:absolute;left:0pt;margin-top:0.05pt;height:10.35pt;width:9.05pt;mso-position-horizontal:center;mso-position-horizontal-relative:margin;mso-wrap-distance-bottom:0pt;mso-wrap-distance-left:0pt;mso-wrap-distance-right:0pt;mso-wrap-distance-top:0pt;z-index:251659264;mso-width-relative:page;mso-height-relative:page;" fillcolor="#FFFFFF" filled="t" stroked="f" coordsize="21600,21600" o:allowincell="f" o:gfxdata="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">
               <v:fill on="t" opacity="0f" focussize="0,0"/>
               <v:stroke on="f"/>
               <v:imagedata o:title=""/>

</xml_diff>